<commit_message>
polish(thesis): fix heading double-numbering, drop § in prose, size table columns
- Suppress template Heading 1/2 auto outline-numbering (numId 30 -> 0); manual
  numbers no longer collide with style numbers (was "5.4  4.4 განხილვა")
- Remove § section-marker from prose/tables to match §-less GTU headings
- Content-proportional table column widths via tblGrid (label cols wide,
  numeric cols narrow); render honored under fixed layout

Co-Authored-By: Claude Opus 4.8 <noreply@anthropic.com>
</commit_message>
<xml_diff>
--- a/project/thesis-ka.docx
+++ b/project/thesis-ka.docx
@@ -2095,7 +2095,7 @@
           <w:b w:val="0"/>
           <w:sz w:val="24"/>
         </w:rPr>
-        <w:t>ცხრილი 4.1. კონცეფციის დამტკიცების ერთგულება §3.2-ის სრული არქიტექტურის მიმართ</w:t>
+        <w:t>ცხრილი 4.1. კონცეფციის დამტკიცების ერთგულება 3.2-ის სრული არქიტექტურის მიმართ</w:t>
       </w:r>
     </w:p>
     <w:p>
@@ -2135,6 +2135,9 @@
       <w:pPr>
         <w:pStyle w:val="Heading1"/>
         <w:pageBreakBefore/>
+        <w:numPr>
+          <w:numId w:val="0"/>
+        </w:numPr>
       </w:pPr>
       <w:r>
         <w:rPr>
@@ -2148,6 +2151,9 @@
     <w:p>
       <w:pPr>
         <w:pStyle w:val="Heading2"/>
+        <w:numPr>
+          <w:numId w:val="0"/>
+        </w:numPr>
       </w:pPr>
       <w:r>
         <w:rPr>
@@ -2205,6 +2211,9 @@
     <w:p>
       <w:pPr>
         <w:pStyle w:val="Heading2"/>
+        <w:numPr>
+          <w:numId w:val="0"/>
+        </w:numPr>
       </w:pPr>
       <w:r>
         <w:rPr>
@@ -2355,18 +2364,18 @@
           <w:b w:val="0"/>
           <w:sz w:val="24"/>
         </w:rPr>
-        <w:t>შედარება დამატებით მოიცავს კურატორირებულ სტატიკურ აქტიურ კონტროლს (B+): მეხსიერებას, რომელიც იღებს იგივე ოფლაინ კურატორირებას, რაც C, მაგრამ არ გააჩნია ადამიანის მეხსიერების დინამიკა (არც გახანგრძლივება, არც სალიენს-გეითინგი, არც კონსოლიდაცია). კონტრასტი C-სა და B+-ს შორის — რომელიც ადამიანის მეხსიერების დინამიკის ეფექტს კურირების მიერ მიღწეული წაკითხვადობის უბრალო ზრდისგან გამოყოფს — ამ ნაშრომის ცენტრალური ახალი შედარებაა; როგორც §3.1-შია დადგენილი, ის თავისი კონსტრუქციით მცირე ეფექტს წარმოადგენს და განიხილება წინასწარ რეგისტრირებულ შეფასების მიზნად და არა დამადასტურებელ ტესტად, რაც განსხვავდება უკეთესი სტატისტიკური ძალის მქონე შედარებებისგან (C vs A და მიმართულებითი B+ vs B და C vs B).</w:t>
-      </w:r>
-    </w:p>
-    <w:p>
-      <w:pPr/>
-      <w:r>
-        <w:rPr>
-          <w:rFonts w:ascii="Sylfaen" w:hAnsi="Sylfaen" w:cs="Sylfaen"/>
-          <w:b w:val="0"/>
-          <w:sz w:val="24"/>
-        </w:rPr>
-        <w:t>სამი თვისებიდან, რომლებითაც §1.5 განასხვავებს მოსაუბრეს თანაშემწისგან, მეხსიერებაზე მანიპულირება ეხება კონტექსტის მდგრადობასა და იდენტობის უწყვეტობას; მესამე — ინიციატივა — ოპერაციულად განისაზღვრება მხოლოდ არასავალდებულო პროაქტიულ პირობაში და, შესაბამისად, შემოწმდება მხოლოდ იმ შემთხვევაში, თუ ეს პირობაა ჩართული.</w:t>
+        <w:t>შედარება დამატებით მოიცავს კურატორირებულ სტატიკურ აქტიურ კონტროლს (B+): მეხსიერებას, რომელიც იღებს იგივე ოფლაინ კურატორირებას, რაც C, მაგრამ არ გააჩნია ადამიანის მეხსიერების დინამიკა (არც გახანგრძლივება, არც სალიენს-გეითინგი, არც კონსოლიდაცია). კონტრასტი C-სა და B+-ს შორის — რომელიც ადამიანის მეხსიერების დინამიკის ეფექტს კურირების მიერ მიღწეული წაკითხვადობის უბრალო ზრდისგან გამოყოფს — ამ ნაშრომის ცენტრალური ახალი შედარებაა; როგორც 3.1-შია დადგენილი, ის თავისი კონსტრუქციით მცირე ეფექტს წარმოადგენს და განიხილება წინასწარ რეგისტრირებულ შეფასების მიზნად და არა დამადასტურებელ ტესტად, რაც განსხვავდება უკეთესი სტატისტიკური ძალის მქონე შედარებებისგან (C vs A და მიმართულებითი B+ vs B და C vs B).</w:t>
+      </w:r>
+    </w:p>
+    <w:p>
+      <w:pPr/>
+      <w:r>
+        <w:rPr>
+          <w:rFonts w:ascii="Sylfaen" w:hAnsi="Sylfaen" w:cs="Sylfaen"/>
+          <w:b w:val="0"/>
+          <w:sz w:val="24"/>
+        </w:rPr>
+        <w:t>სამი თვისებიდან, რომლებითაც 1.5 განასხვავებს მოსაუბრეს თანაშემწისგან, მეხსიერებაზე მანიპულირება ეხება კონტექსტის მდგრადობასა და იდენტობის უწყვეტობას; მესამე — ინიციატივა — ოპერაციულად განისაზღვრება მხოლოდ არასავალდებულო პროაქტიულ პირობაში და, შესაბამისად, შემოწმდება მხოლოდ იმ შემთხვევაში, თუ ეს პირობაა ჩართული.</w:t>
       </w:r>
     </w:p>
     <w:p>
@@ -2383,6 +2392,9 @@
     <w:p>
       <w:pPr>
         <w:pStyle w:val="Heading2"/>
+        <w:numPr>
+          <w:numId w:val="0"/>
+        </w:numPr>
       </w:pPr>
       <w:r>
         <w:rPr>
@@ -2407,6 +2419,9 @@
     <w:p>
       <w:pPr>
         <w:pStyle w:val="Heading2"/>
+        <w:numPr>
+          <w:numId w:val="0"/>
+        </w:numPr>
       </w:pPr>
       <w:r>
         <w:rPr>
@@ -2475,6 +2490,9 @@
     <w:p>
       <w:pPr>
         <w:pStyle w:val="Heading2"/>
+        <w:numPr>
+          <w:numId w:val="0"/>
+        </w:numPr>
       </w:pPr>
       <w:r>
         <w:rPr>
@@ -2499,6 +2517,9 @@
     <w:p>
       <w:pPr>
         <w:pStyle w:val="Heading2"/>
+        <w:numPr>
+          <w:numId w:val="0"/>
+        </w:numPr>
       </w:pPr>
       <w:r>
         <w:rPr>
@@ -2524,6 +2545,9 @@
       <w:pPr>
         <w:pStyle w:val="Heading1"/>
         <w:pageBreakBefore/>
+        <w:numPr>
+          <w:numId w:val="0"/>
+        </w:numPr>
       </w:pPr>
       <w:r>
         <w:rPr>
@@ -2537,6 +2561,9 @@
     <w:p>
       <w:pPr>
         <w:pStyle w:val="Heading2"/>
+        <w:numPr>
+          <w:numId w:val="0"/>
+        </w:numPr>
       </w:pPr>
       <w:r>
         <w:rPr>
@@ -2555,12 +2582,15 @@
           <w:b w:val="0"/>
           <w:sz w:val="24"/>
         </w:rPr>
-        <w:t>ეს თავი მიმოიხილავს კვლევებს, რომლებზეც ეს ნაშრომია დაფუძნებული, ორ სფეროში, რომლებიც ის მიზანმიმართულად აერთიანებს. პირველია ადამიანის მეხსიერების კოგნიტური ფსიქოლოგია: თეორიები, რომლებიც აღწერს, თუ როგორ კოდირებენ, ინახავენ, ივიწყებენ და იხსენებენ ადამიანები ინფორმაციას და — რაც ჩვენი მიზნებისთვის უმნიშვნელოვანესია — თითოეული თეორიის მიერ ნაწინდევრებული ქცევითი გამოვლინებები. მეორეა დიდი ენის მოდელებზე (LLM) დაფუძნებული საუბრული აგენტების გრძელვადიანი მეხსიერების ინჟინერია: არქიტექტურები, მათი შეფასების ბენჩმარკები და კვლევები ადამიანთა მონაწილეობით, რომლებიც იკვლევენ, თუ როგორ განსაზღვრავს მეხსიერება მომხმარებლისა და სისტემის ურთიერთობას. მიმოხილვა სრულდება ამჟამინდელი ნაშრომის ამ სფეროებს შორის არსებულ ხარვეზში განთავსებით. სტრუქტურა შეესაბამება ლიტერატურული მიმოხილვისთვის საჭირო ოთხ კომპონენტს: არსებული კვლევების ანალიზს (§2.3, §2.6), გამოყენებული მეთოდებისა და ტექნოლოგიების მიმოხილვას (§2.2, §2.4), ღია პრობლემებსა და შეზღუდვებს (§2.5, §2.7) და ამ ნაშრომის ადგილს არსებულ ლიტერატურაში (§2.8).</w:t>
+        <w:t>ეს თავი მიმოიხილავს კვლევებს, რომლებზეც ეს ნაშრომია დაფუძნებული, ორ სფეროში, რომლებიც ის მიზანმიმართულად აერთიანებს. პირველია ადამიანის მეხსიერების კოგნიტური ფსიქოლოგია: თეორიები, რომლებიც აღწერს, თუ როგორ კოდირებენ, ინახავენ, ივიწყებენ და იხსენებენ ადამიანები ინფორმაციას და — რაც ჩვენი მიზნებისთვის უმნიშვნელოვანესია — თითოეული თეორიის მიერ ნაწინდევრებული ქცევითი გამოვლინებები. მეორეა დიდი ენის მოდელებზე (LLM) დაფუძნებული საუბრული აგენტების გრძელვადიანი მეხსიერების ინჟინერია: არქიტექტურები, მათი შეფასების ბენჩმარკები და კვლევები ადამიანთა მონაწილეობით, რომლებიც იკვლევენ, თუ როგორ განსაზღვრავს მეხსიერება მომხმარებლისა და სისტემის ურთიერთობას. მიმოხილვა სრულდება ამჟამინდელი ნაშრომის ამ სფეროებს შორის არსებულ ხარვეზში განთავსებით. სტრუქტურა შეესაბამება ლიტერატურული მიმოხილვისთვის საჭირო ოთხ კომპონენტს: არსებული კვლევების ანალიზს (2.3, 2.6), გამოყენებული მეთოდებისა და ტექნოლოგიების მიმოხილვას (2.2, 2.4), ღია პრობლემებსა და შეზღუდვებს (2.5, 2.7) და ამ ნაშრომის ადგილს არსებულ ლიტერატურაში (2.8).</w:t>
       </w:r>
     </w:p>
     <w:p>
       <w:pPr>
         <w:pStyle w:val="Heading2"/>
+        <w:numPr>
+          <w:numId w:val="0"/>
+        </w:numPr>
       </w:pPr>
       <w:r>
         <w:rPr>
@@ -2645,23 +2675,26 @@
           <w:b w:val="0"/>
           <w:sz w:val="24"/>
         </w:rPr>
-        <w:t>კონსოლიდაცია: კომპლემენტარული სასწავლო სისტემები და ჰიპოკამპური ინდექსაცია. ორი ნეიროკოგნიტური თეორია აღწერს, თუ როგორ იქცევა ეპიზოდური გამოცდილება ხანგრძლივ ცოდნად. კომპლემენტარული სასწავლო სისტემების მიდგომის [25] თანახმად, ერთი სისტემა, რომელიც ჰიპოკამპუსზეა ცენტრირებული, ინდივიდუალურ ეპიზოდებს სწრაფად აღიქვამს, მაშინ როცა მეორე, კორტიკული სისტემა განმეორებად სტრუქტურას მხოლოდ ნელა აკონსოლიდებს, და ოფლაინ გამეორება გადატანას უზრუნველყოფს ჩაწერილ ინფორმაციას ამ ნელი საცავისკენ. ინდექსაციის თეორია [26] ამატებს, რომ ჰიპოკამპს არც კი სჭირდება მეხსიერების შენახვა — მას უბრალოდ აქვს მითითებები იმ კორტიკულ ნიმუშებზე, რომლებიც მათ ქმნიდა, ასე რომ, მინიშნების ფრაგმენტს შეუძლია მთლიანი მეხსიერების აღდგენა. ორივე მათგანი პროგნოზირებს ერთსა და იმავე მაღალი დონის ქცევით ხელწერას — აგენტს, რომელიც ეპიზოდებს სწრაფად იმახსოვრებს, მაგრამ მათ ინტერაქციებს შორის პერიოდში სტრუქტურირებულ ცოდნად რეორგანიზებას ახდენს — და ორივეს, როგორც §2.4-შია ნაჩვენები, ჰყავს პირდაპირი გამოთვლითი შთამომავლები.</w:t>
-      </w:r>
-    </w:p>
-    <w:p>
-      <w:pPr/>
-      <w:r>
-        <w:rPr>
-          <w:rFonts w:ascii="Sylfaen" w:hAnsi="Sylfaen" w:cs="Sylfaen"/>
-          <w:b w:val="0"/>
-          <w:sz w:val="24"/>
-        </w:rPr>
-        <w:t>ცხრილი 2.1 (§2.4) შეჯამებულად წარმოადგენს, თუ როგორ განხორციელდა თითოეული ამ თეორიის ოპერაციონალიზება უახლეს LLM-აგენტების სისტემებში; თავდაპირველად, ჩვენ განვიხილავთ ამ სისტემებს მათივე პრინციპების მიხედვით.</w:t>
+        <w:t>კონსოლიდაცია: კომპლემენტარული სასწავლო სისტემები და ჰიპოკამპური ინდექსაცია. ორი ნეიროკოგნიტური თეორია აღწერს, თუ როგორ იქცევა ეპიზოდური გამოცდილება ხანგრძლივ ცოდნად. კომპლემენტარული სასწავლო სისტემების მიდგომის [25] თანახმად, ერთი სისტემა, რომელიც ჰიპოკამპუსზეა ცენტრირებული, ინდივიდუალურ ეპიზოდებს სწრაფად აღიქვამს, მაშინ როცა მეორე, კორტიკული სისტემა განმეორებად სტრუქტურას მხოლოდ ნელა აკონსოლიდებს, და ოფლაინ გამეორება გადატანას უზრუნველყოფს ჩაწერილ ინფორმაციას ამ ნელი საცავისკენ. ინდექსაციის თეორია [26] ამატებს, რომ ჰიპოკამპს არც კი სჭირდება მეხსიერების შენახვა — მას უბრალოდ აქვს მითითებები იმ კორტიკულ ნიმუშებზე, რომლებიც მათ ქმნიდა, ასე რომ, მინიშნების ფრაგმენტს შეუძლია მთლიანი მეხსიერების აღდგენა. ორივე მათგანი პროგნოზირებს ერთსა და იმავე მაღალი დონის ქცევით ხელწერას — აგენტს, რომელიც ეპიზოდებს სწრაფად იმახსოვრებს, მაგრამ მათ ინტერაქციებს შორის პერიოდში სტრუქტურირებულ ცოდნად რეორგანიზებას ახდენს — და ორივეს, როგორც 2.4-შია ნაჩვენები, ჰყავს პირდაპირი გამოთვლითი შთამომავლები.</w:t>
+      </w:r>
+    </w:p>
+    <w:p>
+      <w:pPr/>
+      <w:r>
+        <w:rPr>
+          <w:rFonts w:ascii="Sylfaen" w:hAnsi="Sylfaen" w:cs="Sylfaen"/>
+          <w:b w:val="0"/>
+          <w:sz w:val="24"/>
+        </w:rPr>
+        <w:t>ცხრილი 2.1 (2.4) შეჯამებულად წარმოადგენს, თუ როგორ განხორციელდა თითოეული ამ თეორიის ოპერაციონალიზება უახლეს LLM-აგენტების სისტემებში; თავდაპირველად, ჩვენ განვიხილავთ ამ სისტემებს მათივე პრინციპების მიხედვით.</w:t>
       </w:r>
     </w:p>
     <w:p>
       <w:pPr>
         <w:pStyle w:val="Heading2"/>
+        <w:numPr>
+          <w:numId w:val="0"/>
+        </w:numPr>
       </w:pPr>
       <w:r>
         <w:rPr>
@@ -2702,23 +2735,26 @@
           <w:b w:val="0"/>
           <w:sz w:val="24"/>
         </w:rPr>
-        <w:t>მეორე ტალღა — საწარმოო მეხსიერების ფენები და ნეირო-შთაგონებული მოძიების მექანიზმები (2024–2025). მეორე ტალღა კვლევითი პროტოტიპებიდან გადავიდა გამოყენებადი მეხსიერების სერვისებისა და ნეირომეცნიერებიდან ნასესხები მონაცემების მოძიების მექანიზმებისკენ. Mem0 [29] ახორციელებს მეხსიერების ფენას, რომელიც დიალოგიდან გამოყოფს მნიშვნელოვან ფაქტებს და თანდათანობით ახდენს კონსოლიდირებული საცავის განახლებას; მისი ავტორები იუწყებიან მნიშვნელოვან გაუმჯობესებას ძლიერ საწყის მაჩვენებელთან შედარებით საუბრის მეხსიერების ამოცანებში, ლატენტურობისა და ტოკენების ხარჯის მნიშვნელოვან შემცირებასთან ერთად. Zep [30], რომელიც Graphiti-ს დროში გათვლილ ცოდნის გრაფის ძრავაზეა აგებული, მეხსიერებას წარმოაჩენს, როგორც ორდროით გრაფს, რომელიც თვალყურს ადევნებს როგორც იმას, თუ როდის მოხდა მოვლენა, ასევე იმას, თუ როდის დაფიქსირდა ის; მისი ავტორები ასევე იუწყებიან სიზუსტის გაუმჯობესებასა და შეყოვნების მნიშვნელოვან შემცირებას გრძელვადიანი მეხსიერების შეფასებისას (მომწოდებლის მიერ მოწოდებული ეს მონაცემები უნდა განვიხილოთ §2.5-ში აღწერილი ბენჩმარკის საიმედოობასთან დაკავშირებული საკითხების ფონზე). ორივე მათგანი აღნიშნავს ტალღის განმსაზღვრელ ცვლილებას — პირველ ტალღაში არსებული ეპიზოდების უბრალო აღრიცხვიდან მუდმივად კონსოლიდირებული საცავის შენარჩუნებისკენ — და ორივე წინა პლანზე წამოსწევს შეყოვნებასა და ხარჯებს, რაც მიუთითებს კვლევითი პროტოტიპიდან საწარმოო სერვისზე გადასვლაზე. ამ ტალღის ორი სისტემა განსაკუთრებით თეორიული ინტერესის საგანია. HippoRAG [7] უშუალოდ ოპერაციულს ხდის ჰიპოკამპური მეხსიერების ინდექსაციის თეორიას: ის დიდი ენის მოდელს (LLM) ნეოკორტექსად წარმოაჩენს, მონაცემების მოძიების კოდირატორებს — პარահიპოკამპურ რეგიონად, ხოლო პერსონალიზებული PageRank-ით დათვალიერებად ცოდნის გრაფს — ჰიპოკამპურ ინდექსად, რითაც გრაფის ძიების მეშვეობით მრავალნახტომიან მონაცემთა მოძიებას აღწევს. EM-LLM [8] ეფუძნება ადამიანის ეპიზოდურ მეხსიერებასა და მოვლენების სეგმენტაციის თეორიას [31], ტოკენების ნაკადს ყოფს დისკრეტულ მოვლენებად ბაიესის "გაკვირვების" (surprise) საფუძველზე გამოვლენილ საზღვრებზე და მათ იძიებს მსგავსებაზე დაფუძნებული და დროში მიმდევრობითი წვდომის კომბინაციით. იმავე პერიოდის ReadAgent-ი [9] იდეას "მთავარი აზრის" შესახებ პრაქტიკაში ნერგავს: ის გრძელ კონტექსტს ეპიზოდის ზომის გვერდებად ყოფს, თითოეულისგან მხოლოდ LLM-ის მიერ შექმნილ მთავარ აზრს ინახავს და საწყის ტექსტს მხოლოდ მაშინ უბრუნდება, როდესაც ამოცანა დეტალებს მოითხოვს. კიდევ ერთი აღსანიშნავი სისტემა, A-MEM [27], მოგონებებს აწყობს, როგორც ჩანაწერების ურთიერთდაკავშირებული ქსელი, რომელსაც აგენტი თავად აფართოებს და ასწორებს; თუმცა, ჩვენ აღვნიშნავთ, რომ ის ეფუძნება Zettelkasten-ის მეთოდს, რომელიც ინფორმაციის ორგანიზების პრაქტიკაა და არა ადამიანის მეხსიერების თეორია — ეს განასხვავება მნიშვნელოვანია ჩვენი კონკრეტული ჩარჩოსთვის.</w:t>
-      </w:r>
-    </w:p>
-    <w:p>
-      <w:pPr/>
-      <w:r>
-        <w:rPr>
-          <w:rFonts w:ascii="Sylfaen" w:hAnsi="Sylfaen" w:cs="Sylfaen"/>
-          <w:b w:val="0"/>
-          <w:sz w:val="24"/>
-        </w:rPr>
-        <w:t>მესამე ტალღა — კონსოლიდაციის ეპოქა (2025–2026). 2026 წლისთვის სფეროს ყურადღება გადავიდა იმ პრობლემაზე, რომელსაც §2.2-ის კოგნიტური თეორიები წინა პლანზე წამოსწევს: კონსოლიდაციაზე. წამყვანმა პროვაიდერებმა თავიანთ სისტემებში დანერგეს ფონური, ძილსამგვარი მეხსიერების რეორგანიზაციის პროცესები — OpenAI-მ პროდუქტიზებული ფორმით, ხოლო Anthropic-მა — როგორც კვლევითი წინასწარი ვერსია [18, 19]. ეს დანერგვები მომხმარებლის მასშტაბზე ახორციელებენ (ოპერაციულს ხდიან) იმ ოფლაინ-გადათამაშების მექანიზმს, რომელსაც დამატებითი სწავლის სისტემების თეორია აღწერს. ჩვენ მათ განზრახ მოვიყვანთ ინდუსტრიის სიგნალებად და არა სამეცნიერო შედეგებად: არცერთ მათგანს არ ახლავს თან რეცენზირებული პუბლიკაცია, რაც თავისთავად მიუთითებს, რომ კონსოლიდაციის აკადემიური კვლევა დროული და ნაკლებად შესწავლილია.</w:t>
+        <w:t>მეორე ტალღა — საწარმოო მეხსიერების ფენები და ნეირო-შთაგონებული მოძიების მექანიზმები (2024–2025). მეორე ტალღა კვლევითი პროტოტიპებიდან გადავიდა გამოყენებადი მეხსიერების სერვისებისა და ნეირომეცნიერებიდან ნასესხები მონაცემების მოძიების მექანიზმებისკენ. Mem0 [29] ახორციელებს მეხსიერების ფენას, რომელიც დიალოგიდან გამოყოფს მნიშვნელოვან ფაქტებს და თანდათანობით ახდენს კონსოლიდირებული საცავის განახლებას; მისი ავტორები იუწყებიან მნიშვნელოვან გაუმჯობესებას ძლიერ საწყის მაჩვენებელთან შედარებით საუბრის მეხსიერების ამოცანებში, ლატენტურობისა და ტოკენების ხარჯის მნიშვნელოვან შემცირებასთან ერთად. Zep [30], რომელიც Graphiti-ს დროში გათვლილ ცოდნის გრაფის ძრავაზეა აგებული, მეხსიერებას წარმოაჩენს, როგორც ორდროით გრაფს, რომელიც თვალყურს ადევნებს როგორც იმას, თუ როდის მოხდა მოვლენა, ასევე იმას, თუ როდის დაფიქსირდა ის; მისი ავტორები ასევე იუწყებიან სიზუსტის გაუმჯობესებასა და შეყოვნების მნიშვნელოვან შემცირებას გრძელვადიანი მეხსიერების შეფასებისას (მომწოდებლის მიერ მოწოდებული ეს მონაცემები უნდა განვიხილოთ 2.5-ში აღწერილი ბენჩმარკის საიმედოობასთან დაკავშირებული საკითხების ფონზე). ორივე მათგანი აღნიშნავს ტალღის განმსაზღვრელ ცვლილებას — პირველ ტალღაში არსებული ეპიზოდების უბრალო აღრიცხვიდან მუდმივად კონსოლიდირებული საცავის შენარჩუნებისკენ — და ორივე წინა პლანზე წამოსწევს შეყოვნებასა და ხარჯებს, რაც მიუთითებს კვლევითი პროტოტიპიდან საწარმოო სერვისზე გადასვლაზე. ამ ტალღის ორი სისტემა განსაკუთრებით თეორიული ინტერესის საგანია. HippoRAG [7] უშუალოდ ოპერაციულს ხდის ჰიპოკამპური მეხსიერების ინდექსაციის თეორიას: ის დიდი ენის მოდელს (LLM) ნეოკორტექსად წარმოაჩენს, მონაცემების მოძიების კოდირატორებს — პარահიპოკამპურ რეგიონად, ხოლო პერსონალიზებული PageRank-ით დათვალიერებად ცოდნის გრაფს — ჰიპოკამპურ ინდექსად, რითაც გრაფის ძიების მეშვეობით მრავალნახტომიან მონაცემთა მოძიებას აღწევს. EM-LLM [8] ეფუძნება ადამიანის ეპიზოდურ მეხსიერებასა და მოვლენების სეგმენტაციის თეორიას [31], ტოკენების ნაკადს ყოფს დისკრეტულ მოვლენებად ბაიესის "გაკვირვების" (surprise) საფუძველზე გამოვლენილ საზღვრებზე და მათ იძიებს მსგავსებაზე დაფუძნებული და დროში მიმდევრობითი წვდომის კომბინაციით. იმავე პერიოდის ReadAgent-ი [9] იდეას "მთავარი აზრის" შესახებ პრაქტიკაში ნერგავს: ის გრძელ კონტექსტს ეპიზოდის ზომის გვერდებად ყოფს, თითოეულისგან მხოლოდ LLM-ის მიერ შექმნილ მთავარ აზრს ინახავს და საწყის ტექსტს მხოლოდ მაშინ უბრუნდება, როდესაც ამოცანა დეტალებს მოითხოვს. კიდევ ერთი აღსანიშნავი სისტემა, A-MEM [27], მოგონებებს აწყობს, როგორც ჩანაწერების ურთიერთდაკავშირებული ქსელი, რომელსაც აგენტი თავად აფართოებს და ასწორებს; თუმცა, ჩვენ აღვნიშნავთ, რომ ის ეფუძნება Zettelkasten-ის მეთოდს, რომელიც ინფორმაციის ორგანიზების პრაქტიკაა და არა ადამიანის მეხსიერების თეორია — ეს განასხვავება მნიშვნელოვანია ჩვენი კონკრეტული ჩარჩოსთვის.</w:t>
+      </w:r>
+    </w:p>
+    <w:p>
+      <w:pPr/>
+      <w:r>
+        <w:rPr>
+          <w:rFonts w:ascii="Sylfaen" w:hAnsi="Sylfaen" w:cs="Sylfaen"/>
+          <w:b w:val="0"/>
+          <w:sz w:val="24"/>
+        </w:rPr>
+        <w:t>მესამე ტალღა — კონსოლიდაციის ეპოქა (2025–2026). 2026 წლისთვის სფეროს ყურადღება გადავიდა იმ პრობლემაზე, რომელსაც 2.2-ის კოგნიტური თეორიები წინა პლანზე წამოსწევს: კონსოლიდაციაზე. წამყვანმა პროვაიდერებმა თავიანთ სისტემებში დანერგეს ფონური, ძილსამგვარი მეხსიერების რეორგანიზაციის პროცესები — OpenAI-მ პროდუქტიზებული ფორმით, ხოლო Anthropic-მა — როგორც კვლევითი წინასწარი ვერსია [18, 19]. ეს დანერგვები მომხმარებლის მასშტაბზე ახორციელებენ (ოპერაციულს ხდიან) იმ ოფლაინ-გადათამაშების მექანიზმს, რომელსაც დამატებითი სწავლის სისტემების თეორია აღწერს. ჩვენ მათ განზრახ მოვიყვანთ ინდუსტრიის სიგნალებად და არა სამეცნიერო შედეგებად: არცერთ მათგანს არ ახლავს თან რეცენზირებული პუბლიკაცია, რაც თავისთავად მიუთითებს, რომ კონსოლიდაციის აკადემიური კვლევა დროული და ნაკლებად შესწავლილია.</w:t>
       </w:r>
     </w:p>
     <w:p>
       <w:pPr>
         <w:pStyle w:val="Heading2"/>
+        <w:numPr>
+          <w:numId w:val="0"/>
+        </w:numPr>
       </w:pPr>
       <w:r>
         <w:rPr>
@@ -2737,7 +2773,7 @@
           <w:b w:val="0"/>
           <w:sz w:val="24"/>
         </w:rPr>
-        <w:t>ერთად განხილვისას, §2.2 და §2.3 ავლენს კანონზომიერებას, რომელიც, ჩვენი ცოდნით, ასე მკაფიოდ არასდროს დაფიქსირებულა. ჩვენ მას ფრთხილად ვფორმულირებთ, რათა თავიდან ავიცილოთ არასწორი არგუმენტის წამოწევის მცდელობა: მეხსიერების ყველა სისტემა არ ემყარება ერთ თეორიას — რამდენიმე მათგანი (Generative Agents, Mem0, Zep) მიზანმიმართულად მრავალმექანიზმიანი საინჟინრო კონსტრუქციაა და ჩვენ ამის საპირისპიროს არ ვამტკიცებთ. მოდელი უფრო ვიწრო და ზუსტია: იმ სისტემებს შორის, რომლებსაც აქვთ ექსპლიციტური, მოყვანილი თეორიული საფუძველი, თითოეული მათგანი დაფუძნებულია ზუსტად ერთ ადამიანის მეხსიერების თეორიაზე. ცხრილი 2.1 ამ შესაბამისობებს აშკარას ხდის.</w:t>
+        <w:t>ერთად განხილვისას, 2.2 და 2.3 ავლენს კანონზომიერებას, რომელიც, ჩვენი ცოდნით, ასე მკაფიოდ არასდროს დაფიქსირებულა. ჩვენ მას ფრთხილად ვფორმულირებთ, რათა თავიდან ავიცილოთ არასწორი არგუმენტის წამოწევის მცდელობა: მეხსიერების ყველა სისტემა არ ემყარება ერთ თეორიას — რამდენიმე მათგანი (Generative Agents, Mem0, Zep) მიზანმიმართულად მრავალმექანიზმიანი საინჟინრო კონსტრუქციაა და ჩვენ ამის საპირისპიროს არ ვამტკიცებთ. მოდელი უფრო ვიწრო და ზუსტია: იმ სისტემებს შორის, რომლებსაც აქვთ ექსპლიციტური, მოყვანილი თეორიული საფუძველი, თითოეული მათგანი დაფუძნებულია ზუსტად ერთ ადამიანის მეხსიერების თეორიაზე. ცხრილი 2.1 ამ შესაბამისობებს აშკარას ხდის.</w:t>
       </w:r>
     </w:p>
     <w:p>
@@ -2756,6 +2792,7 @@
     <w:tbl>
       <w:tblPr>
         <w:tblW w:type="auto" w:w="0"/>
+        <w:tblLayout w:type="fixed"/>
         <w:tblLook w:firstColumn="1" w:firstRow="1" w:lastColumn="0" w:lastRow="0" w:noHBand="0" w:noVBand="1" w:val="04A0"/>
         <w:tblBorders>
           <w:top w:val="single" w:sz="4" w:space="0" w:color="000000"/>
@@ -2765,16 +2802,17 @@
           <w:insideH w:val="single" w:sz="4" w:space="0" w:color="000000"/>
           <w:insideV w:val="single" w:sz="4" w:space="0" w:color="000000"/>
         </w:tblBorders>
+        <w:tblLayout w:type="fixed"/>
       </w:tblPr>
       <w:tblGrid>
-        <w:gridCol w:w="2778"/>
-        <w:gridCol w:w="2778"/>
-        <w:gridCol w:w="2778"/>
+        <w:gridCol w:w="2861"/>
+        <w:gridCol w:w="2861"/>
+        <w:gridCol w:w="2612"/>
       </w:tblGrid>
       <w:tr>
         <w:tc>
           <w:tcPr>
-            <w:tcW w:type="dxa" w:w="2778"/>
+            <w:tcW w:type="dxa" w:w="2861"/>
           </w:tcPr>
           <w:p>
             <w:pPr>
@@ -2792,7 +2830,7 @@
         </w:tc>
         <w:tc>
           <w:tcPr>
-            <w:tcW w:type="dxa" w:w="2778"/>
+            <w:tcW w:type="dxa" w:w="2861"/>
           </w:tcPr>
           <w:p>
             <w:pPr>
@@ -2810,7 +2848,7 @@
         </w:tc>
         <w:tc>
           <w:tcPr>
-            <w:tcW w:type="dxa" w:w="2778"/>
+            <w:tcW w:type="dxa" w:w="2612"/>
           </w:tcPr>
           <w:p>
             <w:pPr>
@@ -2830,7 +2868,7 @@
       <w:tr>
         <w:tc>
           <w:tcPr>
-            <w:tcW w:type="dxa" w:w="2778"/>
+            <w:tcW w:type="dxa" w:w="2861"/>
           </w:tcPr>
           <w:p>
             <w:pPr>
@@ -2848,7 +2886,7 @@
         </w:tc>
         <w:tc>
           <w:tcPr>
-            <w:tcW w:type="dxa" w:w="2778"/>
+            <w:tcW w:type="dxa" w:w="2861"/>
           </w:tcPr>
           <w:p>
             <w:pPr>
@@ -2866,7 +2904,7 @@
         </w:tc>
         <w:tc>
           <w:tcPr>
-            <w:tcW w:type="dxa" w:w="2778"/>
+            <w:tcW w:type="dxa" w:w="2612"/>
           </w:tcPr>
           <w:p>
             <w:pPr>
@@ -2886,7 +2924,7 @@
       <w:tr>
         <w:tc>
           <w:tcPr>
-            <w:tcW w:type="dxa" w:w="2778"/>
+            <w:tcW w:type="dxa" w:w="2861"/>
           </w:tcPr>
           <w:p>
             <w:pPr>
@@ -2904,7 +2942,7 @@
         </w:tc>
         <w:tc>
           <w:tcPr>
-            <w:tcW w:type="dxa" w:w="2778"/>
+            <w:tcW w:type="dxa" w:w="2861"/>
           </w:tcPr>
           <w:p>
             <w:pPr>
@@ -2922,7 +2960,7 @@
         </w:tc>
         <w:tc>
           <w:tcPr>
-            <w:tcW w:type="dxa" w:w="2778"/>
+            <w:tcW w:type="dxa" w:w="2612"/>
           </w:tcPr>
           <w:p>
             <w:pPr>
@@ -2942,7 +2980,7 @@
       <w:tr>
         <w:tc>
           <w:tcPr>
-            <w:tcW w:type="dxa" w:w="2778"/>
+            <w:tcW w:type="dxa" w:w="2861"/>
           </w:tcPr>
           <w:p>
             <w:pPr>
@@ -2960,7 +2998,7 @@
         </w:tc>
         <w:tc>
           <w:tcPr>
-            <w:tcW w:type="dxa" w:w="2778"/>
+            <w:tcW w:type="dxa" w:w="2861"/>
           </w:tcPr>
           <w:p>
             <w:pPr>
@@ -2978,7 +3016,7 @@
         </w:tc>
         <w:tc>
           <w:tcPr>
-            <w:tcW w:type="dxa" w:w="2778"/>
+            <w:tcW w:type="dxa" w:w="2612"/>
           </w:tcPr>
           <w:p>
             <w:pPr>
@@ -2998,7 +3036,7 @@
       <w:tr>
         <w:tc>
           <w:tcPr>
-            <w:tcW w:type="dxa" w:w="2778"/>
+            <w:tcW w:type="dxa" w:w="2861"/>
           </w:tcPr>
           <w:p>
             <w:pPr>
@@ -3016,7 +3054,7 @@
         </w:tc>
         <w:tc>
           <w:tcPr>
-            <w:tcW w:type="dxa" w:w="2778"/>
+            <w:tcW w:type="dxa" w:w="2861"/>
           </w:tcPr>
           <w:p>
             <w:pPr>
@@ -3034,7 +3072,7 @@
         </w:tc>
         <w:tc>
           <w:tcPr>
-            <w:tcW w:type="dxa" w:w="2778"/>
+            <w:tcW w:type="dxa" w:w="2612"/>
           </w:tcPr>
           <w:p>
             <w:pPr>
@@ -3054,7 +3092,7 @@
       <w:tr>
         <w:tc>
           <w:tcPr>
-            <w:tcW w:type="dxa" w:w="2778"/>
+            <w:tcW w:type="dxa" w:w="2861"/>
           </w:tcPr>
           <w:p>
             <w:pPr>
@@ -3072,7 +3110,7 @@
         </w:tc>
         <w:tc>
           <w:tcPr>
-            <w:tcW w:type="dxa" w:w="2778"/>
+            <w:tcW w:type="dxa" w:w="2861"/>
           </w:tcPr>
           <w:p>
             <w:pPr>
@@ -3090,7 +3128,7 @@
         </w:tc>
         <w:tc>
           <w:tcPr>
-            <w:tcW w:type="dxa" w:w="2778"/>
+            <w:tcW w:type="dxa" w:w="2612"/>
           </w:tcPr>
           <w:p>
             <w:pPr>
@@ -3110,7 +3148,7 @@
       <w:tr>
         <w:tc>
           <w:tcPr>
-            <w:tcW w:type="dxa" w:w="2778"/>
+            <w:tcW w:type="dxa" w:w="2861"/>
           </w:tcPr>
           <w:p>
             <w:pPr>
@@ -3128,7 +3166,7 @@
         </w:tc>
         <w:tc>
           <w:tcPr>
-            <w:tcW w:type="dxa" w:w="2778"/>
+            <w:tcW w:type="dxa" w:w="2861"/>
           </w:tcPr>
           <w:p>
             <w:pPr>
@@ -3146,7 +3184,7 @@
         </w:tc>
         <w:tc>
           <w:tcPr>
-            <w:tcW w:type="dxa" w:w="2778"/>
+            <w:tcW w:type="dxa" w:w="2612"/>
           </w:tcPr>
           <w:p>
             <w:pPr>
@@ -3181,6 +3219,9 @@
     <w:p>
       <w:pPr>
         <w:pStyle w:val="Heading2"/>
+        <w:numPr>
+          <w:numId w:val="0"/>
+        </w:numPr>
       </w:pPr>
       <w:r>
         <w:rPr>
@@ -3227,6 +3268,9 @@
     <w:p>
       <w:pPr>
         <w:pStyle w:val="Heading2"/>
+        <w:numPr>
+          <w:numId w:val="0"/>
+        </w:numPr>
       </w:pPr>
       <w:r>
         <w:rPr>
@@ -3256,7 +3300,7 @@
           <w:b w:val="0"/>
           <w:sz w:val="24"/>
         </w:rPr>
-        <w:t>დადებითი მხრიდან, კოქსისა და მისი კოლეგების [11] მიერ ჩატარებულმა კონტროლირებადმა კვლევამ აჩვენა, რომ ჩატ-ბოტი, რომელიც მომხმარებლების წინა სესიების გამოსვლებს იყენებდა, უფრო ინტელექტუალურად და მიმზიდველად აღიქმებოდა, ვიდრე ის, რომელიც ამას არ აკეთებდა. უარყოფითი მხრიდან, იმავე კვლევამ დაადგინა, რომ პირდაპირი ციტირება — ზუსტი, სიტყვა-სიტყვით გადმოცემა — ზრდიდა მომხმარებლების შეშფოთებას კონფიდენციალურობასთან დაკავშირებით, პარაფრაზირებულ მითითებებთან შედარებით. ეს არის §2.2-ის "ბუნდოვანი კვალის" არგუმენტის ემპირიული საყრდენი: არსებითი შინაარსის დონეზე გახსენება ურთიერთობათა კუთხით უპირატესი იყო სიტყვასიტყვით გახსენებასთან შედარებით, მიუხედავად იმისა, რომ ორივე მათგანი მეხსიერების გამოვლინებაა. დამხმარე საპილოტე კვლევამ [34] აჩვენა, რომ ჩატ-ბოტს მეხსიერების მინიჭება მას უფრო ინტელექტუალურს, მაგრამ ნაკლებად სანდოს ხდიდა, თუ მეხსიერება მომხმარებლისთვის ხილული არ იყო. ასე წოდებული "კომპანიონის" აპლიკაციების სფეროს მტკიცებულებებიც იმავეზე მიუთითებს: Replika-ს მომხმარებლების კვალიტატիվურმა კვლევამ [3] მეხსიერების გაუმართაობა — სახელების, უპირატესობებისა და საერთო ისტორიის დავიწყება — ურთიერთობის დარღვევის მთავარ წყაროდ გამოავლინა, ხოლო იმავე პროდუქტში მოულოდნელი ცვლილების შესახებ ჩატარებულმა ბუნებრივ-ექსპერიმენტულმა კვლევამ [4] აჩვენა, რომ მომხმარებელთა გაღიზიანება სტატისტიკურად განპირობებული იყო აგენტის იდენტობის აღქმული შეუწყვეტლობის მიერ. მოკლედ რომ ვთქვათ, მეხსიერება უბრალოდ ფუნქცია არ არის, რომელიც ამოცანის შესრულებას აუმჯობესებს; ის არის იმ უწყვეტობის შემადგენელი ნაწილი, რომელიც ურთიერთობას სჭირდება — და ზედმეტად პირდაპირი გახსენება თავისთავად შეუძლია ნდობის შერყევა.</w:t>
+        <w:t>დადებითი მხრიდან, კოქსისა და მისი კოლეგების [11] მიერ ჩატარებულმა კონტროლირებადმა კვლევამ აჩვენა, რომ ჩატ-ბოტი, რომელიც მომხმარებლების წინა სესიების გამოსვლებს იყენებდა, უფრო ინტელექტუალურად და მიმზიდველად აღიქმებოდა, ვიდრე ის, რომელიც ამას არ აკეთებდა. უარყოფითი მხრიდან, იმავე კვლევამ დაადგინა, რომ პირდაპირი ციტირება — ზუსტი, სიტყვა-სიტყვით გადმოცემა — ზრდიდა მომხმარებლების შეშფოთებას კონფიდენციალურობასთან დაკავშირებით, პარაფრაზირებულ მითითებებთან შედარებით. ეს არის 2.2-ის "ბუნდოვანი კვალის" არგუმენტის ემპირიული საყრდენი: არსებითი შინაარსის დონეზე გახსენება ურთიერთობათა კუთხით უპირატესი იყო სიტყვასიტყვით გახსენებასთან შედარებით, მიუხედავად იმისა, რომ ორივე მათგანი მეხსიერების გამოვლინებაა. დამხმარე საპილოტე კვლევამ [34] აჩვენა, რომ ჩატ-ბოტს მეხსიერების მინიჭება მას უფრო ინტელექტუალურს, მაგრამ ნაკლებად სანდოს ხდიდა, თუ მეხსიერება მომხმარებლისთვის ხილული არ იყო. ასე წოდებული "კომპანიონის" აპლიკაციების სფეროს მტკიცებულებებიც იმავეზე მიუთითებს: Replika-ს მომხმარებლების კვალიტატիվურმა კვლევამ [3] მეხსიერების გაუმართაობა — სახელების, უპირატესობებისა და საერთო ისტორიის დავიწყება — ურთიერთობის დარღვევის მთავარ წყაროდ გამოავლინა, ხოლო იმავე პროდუქტში მოულოდნელი ცვლილების შესახებ ჩატარებულმა ბუნებრივ-ექსპერიმენტულმა კვლევამ [4] აჩვენა, რომ მომხმარებელთა გაღიზიანება სტატისტიკურად განპირობებული იყო აგენტის იდენტობის აღქმული შეუწყვეტლობის მიერ. მოკლედ რომ ვთქვათ, მეხსიერება უბრალოდ ფუნქცია არ არის, რომელიც ამოცანის შესრულებას აუმჯობესებს; ის არის იმ უწყვეტობის შემადგენელი ნაწილი, რომელიც ურთიერთობას სჭირდება — და ზედმეტად პირდაპირი გახსენება თავისთავად შეუძლია ნდობის შერყევა.</w:t>
       </w:r>
     </w:p>
     <w:p>
@@ -3295,6 +3339,9 @@
     <w:p>
       <w:pPr>
         <w:pStyle w:val="Heading2"/>
+        <w:numPr>
+          <w:numId w:val="0"/>
+        </w:numPr>
       </w:pPr>
       <w:r>
         <w:rPr>
@@ -3313,12 +3360,15 @@
           <w:b w:val="0"/>
           <w:sz w:val="24"/>
         </w:rPr>
-        <w:t>განხილული ლიტერატურის სინთეზირებისას, ღია პრობლემები ორ ჯგუფად იყოფა. პირველი მათგანია ის შეზღუდვები, რომლებსაც სფერო თავად აღიარებს გადაუჭრელად: სელექციური დავიწყება, რომელიც სფეროს კვლევებმა [16] არაერთხელ დაასახელეს არსებითად, თუმცა თითქმის არ შეფასებულა და სისტემების უმეტესობაში მხოლოდ ტევადობის ლიმიტის გვერდითი ეფექტის სახით ვლინდება და არა დიზაინის მიზნით; დროითი მსჯელობა, რომელიც ყველა განხილულ ბენჩმარკში ყველაზე სუსტი კატეგორიაა, და შემოთავაზებული გამოსავალი ამ ზღვარს ამცირებს, მაგრამ არ ხურავს; და §2.5-ის ბენჩმარკების სანდოობის კრიზისი, რომელიც სფეროს უსანდოო, ნეიტრალური საზომის გარეშე ტოვებს. მეორე ჯგუფს მიეკუთვნება ორი ხარვეზი, რომლებიც პირდაპირ განაპირობებს ამ დისერტაციას. აქ განხილული მეხსიერების შესახებ არსებული ლიტერატურა მთლიანად ტექსტზეა ორიენტირებული: მეხსიერების არქიტექტურების ქცევა ხმოვანი ინტერაქციის შეფერხების ლიმიტების პირობებში და ამ მოდალობაში მათი აღქმითი ეფექტები, ფაქტობრივად, არ არის შესწავლილი. ხოლო არსებული აღქმის კვლევები მეხსიერებას იზოლირებულ ცვლადად განიხილავენ ერთ სისტემაში; არცერთი არ ადარებს სხვადასხვა მეხსიერების თეორიაზე დაფუძნებულ არქიტექტურებს იმის მიხედვით, თუ რას განიცდის ადამიანი.</w:t>
+        <w:t>განხილული ლიტერატურის სინთეზირებისას, ღია პრობლემები ორ ჯგუფად იყოფა. პირველი მათგანია ის შეზღუდვები, რომლებსაც სფერო თავად აღიარებს გადაუჭრელად: სელექციური დავიწყება, რომელიც სფეროს კვლევებმა [16] არაერთხელ დაასახელეს არსებითად, თუმცა თითქმის არ შეფასებულა და სისტემების უმეტესობაში მხოლოდ ტევადობის ლიმიტის გვერდითი ეფექტის სახით ვლინდება და არა დიზაინის მიზნით; დროითი მსჯელობა, რომელიც ყველა განხილულ ბენჩმარკში ყველაზე სუსტი კატეგორიაა, და შემოთავაზებული გამოსავალი ამ ზღვარს ამცირებს, მაგრამ არ ხურავს; და 2.5-ის ბენჩმარკების სანდოობის კრიზისი, რომელიც სფეროს უსანდოო, ნეიტრალური საზომის გარეშე ტოვებს. მეორე ჯგუფს მიეკუთვნება ორი ხარვეზი, რომლებიც პირდაპირ განაპირობებს ამ დისერტაციას. აქ განხილული მეხსიერების შესახებ არსებული ლიტერატურა მთლიანად ტექსტზეა ორიენტირებული: მეხსიერების არქიტექტურების ქცევა ხმოვანი ინტერაქციის შეფერხების ლიმიტების პირობებში და ამ მოდალობაში მათი აღქმითი ეფექტები, ფაქტობრივად, არ არის შესწავლილი. ხოლო არსებული აღქმის კვლევები მეხსიერებას იზოლირებულ ცვლადად განიხილავენ ერთ სისტემაში; არცერთი არ ადარებს სხვადასხვა მეხსიერების თეორიაზე დაფუძნებულ არქიტექტურებს იმის მიხედვით, თუ რას განიცდის ადამიანი.</w:t>
       </w:r>
     </w:p>
     <w:p>
       <w:pPr>
         <w:pStyle w:val="Heading2"/>
+        <w:numPr>
+          <w:numId w:val="0"/>
+        </w:numPr>
       </w:pPr>
       <w:r>
         <w:rPr>
@@ -3344,6 +3394,9 @@
       <w:pPr>
         <w:pStyle w:val="Heading1"/>
         <w:pageBreakBefore/>
+        <w:numPr>
+          <w:numId w:val="0"/>
+        </w:numPr>
       </w:pPr>
       <w:r>
         <w:rPr>
@@ -3357,6 +3410,9 @@
     <w:p>
       <w:pPr>
         <w:pStyle w:val="Heading2"/>
+        <w:numPr>
+          <w:numId w:val="0"/>
+        </w:numPr>
       </w:pPr>
       <w:r>
         <w:rPr>
@@ -3375,29 +3431,29 @@
           <w:b w:val="0"/>
           <w:sz w:val="24"/>
         </w:rPr>
-        <w:t>ეს თავი განსაზღვრავს დიზაინის, კონცეფციის დამტკიცებისა და შეფასების-მეთოდოლოგიური სადისერტაციო ნაშრომის მეთოდოლოგიას. §1.2-ში მითითებული მიზნის — ხმოვანი საუბრის პარტნიორის სისტემისთვის კოგნიტურ თეორიებზე დაფუძნებული გრძელვადიანი მეხსიერების არქიტექტურის შემუშავება და მისი გავლენის დადგენა მომხმარებლის მიერ აღქმულ სოციალურ კონსტრუქტებზე — შესაბამისად, ნაშრომი სამ კოორდინირებულ წვლილს შეაქვს, და მნიშვნელოვანია თავიდანვე აღინიშნოს, რომელთაგან რომელი სრულდება აქ, ხოლო რომელი მკაცრად არის შემუშავებული, მაგრამ განზრახ გადავადებული.</w:t>
-      </w:r>
-    </w:p>
-    <w:p>
-      <w:pPr/>
-      <w:r>
-        <w:rPr>
-          <w:rFonts w:ascii="Sylfaen" w:hAnsi="Sylfaen" w:cs="Sylfaen"/>
-          <w:b w:val="0"/>
-          <w:sz w:val="24"/>
-        </w:rPr>
-        <w:t>სამი წვლილია: (ა) მეხსიერების არქიტექტურა ("პროფილი C"), რომლის მექანიზმები ეტაპობრივად ეფუძნება ადამიანის მეხსიერების კოგნიტურ თეორიებსა და მათ ქცევით ნიშნებს (§3.2); (ბ) კურატორიული კონტროლის მქონე შეფასების მეთოდოლოგია, რომლის ცენტრალური ინსტრუმენტია აქტიური საკონტროლო პირობა — B+ — რომელიც გამოყოფს ადამიანის მეხსიერების დინამიკის ეფექტს LLM-ის კურატორიული სამუშაოების ზოგადი წაკითხვადობის ზრდისგან (§3.3); და (გ) კონცეფციის დამტკიცების იმპლემენტაცია არქიტექტურის ორხაზიანი ტექნიკური და სიმულირებული შეფასებისთანავე (§3.4–§3.5). სრული კვლევა ადამიანთა მონაწილეობით, რომელსაც მიზანი საბოლოოდ ითვალისწინებს, წარმოდგენილია §3.5(c)-ში, როგორც სრულად სპეციფიცირებული, მაგრამ ჯერ არჩატარებული პროტოკოლი — მომავალი ნამუშევარი, საკუთარი ენერგეტიკული ანალიზით — და არა როგორც კვლევა, რომლის მონაცემებიც §4-შია წარმოდგენილი.</w:t>
-      </w:r>
-    </w:p>
-    <w:p>
-      <w:pPr/>
-      <w:r>
-        <w:rPr>
-          <w:rFonts w:ascii="Sylfaen" w:hAnsi="Sylfaen" w:cs="Sylfaen"/>
-          <w:b w:val="0"/>
-          <w:sz w:val="24"/>
-        </w:rPr>
-        <w:t>ამიერი მოცულობის განსაზღვრა არის გათვლილი პასუხი სამუშაოს მიმდინარეობისას დოკუმენტირებულ შესაძლებლობათა შეზღუდვაზე (F17): არსებული Voice Companion პლატფორმა მხოლოდ A პირობას უჭერს მხარს (არ არის გრძელვადიანი მეხსიერება); B, B+ და C პირობები, ხმის მეხსიერებაში გადაცემის ინტერფეისთან და თითოეული მონაწილისთვის ინდივიდუალურ დანერგვასთან ერთად, წარმოადგენს "მწვანე ფურცლიდან" ინჟინერიას, რომლის სოლო შექმნასაც თორმეტიდან თექვსმეტ კვირამდე სჭირდება. ამ დისერტაციისთვის გამოყოფილ დროში ოცი მონაწილის მონაწილეობით საველე, მრავალკვირიანი, შიდა-სუბიექტური კვლევის ჩატარება შეუძლებელია. იმის ნაცვლად, რომ დასუსტდეს კვლევის დიზაინი გრაფიკის შესაბამისად — ან, რაც უარესია, მოხდეს არარსებული მონაცემების მოყვანა — დისერტაცია პატიოსნად არის ჩამოყალიბებული, როგორც მისი მთავარი შედეგი, რომელიც ეფუძნება აპარატურასა და მეთოდოლოგიას, კონცეფციის დამტკიცებას, რომელიც ასახავს მექანიზმებს, და შეფასებას, რომელიც მათ ტექნიკურად და სიმულაციის მეშვეობით იკვლევს. ამ ნაშრომში არცერთი მტკიცება არ ეფუძნება ადამიანთა მონაწილეობით მიღებულ მონაცემებს; სადაც კი აღქმის შედეგებია განხილული, ისინი ან სიმულაციური პროქსებია (მკაფიოდ აღნიშნული, §3.5(ბ)), ან პროგნოზებია, რომლებიც შემდგომი პროტოკოლით უნდა შემოწმდეს.</w:t>
+        <w:t>ეს თავი განსაზღვრავს დიზაინის, კონცეფციის დამტკიცებისა და შეფასების-მეთოდოლოგიური სადისერტაციო ნაშრომის მეთოდოლოგიას. 1.2-ში მითითებული მიზნის — ხმოვანი საუბრის პარტნიორის სისტემისთვის კოგნიტურ თეორიებზე დაფუძნებული გრძელვადიანი მეხსიერების არქიტექტურის შემუშავება და მისი გავლენის დადგენა მომხმარებლის მიერ აღქმულ სოციალურ კონსტრუქტებზე — შესაბამისად, ნაშრომი სამ კოორდინირებულ წვლილს შეაქვს, და მნიშვნელოვანია თავიდანვე აღინიშნოს, რომელთაგან რომელი სრულდება აქ, ხოლო რომელი მკაცრად არის შემუშავებული, მაგრამ განზრახ გადავადებული.</w:t>
+      </w:r>
+    </w:p>
+    <w:p>
+      <w:pPr/>
+      <w:r>
+        <w:rPr>
+          <w:rFonts w:ascii="Sylfaen" w:hAnsi="Sylfaen" w:cs="Sylfaen"/>
+          <w:b w:val="0"/>
+          <w:sz w:val="24"/>
+        </w:rPr>
+        <w:t>სამი წვლილია: (ა) მეხსიერების არქიტექტურა ("პროფილი C"), რომლის მექანიზმები ეტაპობრივად ეფუძნება ადამიანის მეხსიერების კოგნიტურ თეორიებსა და მათ ქცევით ნიშნებს (3.2); (ბ) კურატორიული კონტროლის მქონე შეფასების მეთოდოლოგია, რომლის ცენტრალური ინსტრუმენტია აქტიური საკონტროლო პირობა — B+ — რომელიც გამოყოფს ადამიანის მეხსიერების დინამიკის ეფექტს LLM-ის კურატორიული სამუშაოების ზოგადი წაკითხვადობის ზრდისგან (3.3); და (გ) კონცეფციის დამტკიცების იმპლემენტაცია არქიტექტურის ორხაზიანი ტექნიკური და სიმულირებული შეფასებისთანავე (3.4–3.5). სრული კვლევა ადამიანთა მონაწილეობით, რომელსაც მიზანი საბოლოოდ ითვალისწინებს, წარმოდგენილია 3.5(c)-ში, როგორც სრულად სპეციფიცირებული, მაგრამ ჯერ არჩატარებული პროტოკოლი — მომავალი ნამუშევარი, საკუთარი ენერგეტიკული ანალიზით — და არა როგორც კვლევა, რომლის მონაცემებიც 4-შია წარმოდგენილი.</w:t>
+      </w:r>
+    </w:p>
+    <w:p>
+      <w:pPr/>
+      <w:r>
+        <w:rPr>
+          <w:rFonts w:ascii="Sylfaen" w:hAnsi="Sylfaen" w:cs="Sylfaen"/>
+          <w:b w:val="0"/>
+          <w:sz w:val="24"/>
+        </w:rPr>
+        <w:t>ამიერი მოცულობის განსაზღვრა არის გათვლილი პასუხი სამუშაოს მიმდინარეობისას დოკუმენტირებულ შესაძლებლობათა შეზღუდვაზე (F17): არსებული Voice Companion პლატფორმა მხოლოდ A პირობას უჭერს მხარს (არ არის გრძელვადიანი მეხსიერება); B, B+ და C პირობები, ხმის მეხსიერებაში გადაცემის ინტერფეისთან და თითოეული მონაწილისთვის ინდივიდუალურ დანერგვასთან ერთად, წარმოადგენს "მწვანე ფურცლიდან" ინჟინერიას, რომლის სოლო შექმნასაც თორმეტიდან თექვსმეტ კვირამდე სჭირდება. ამ დისერტაციისთვის გამოყოფილ დროში ოცი მონაწილის მონაწილეობით საველე, მრავალკვირიანი, შიდა-სუბიექტური კვლევის ჩატარება შეუძლებელია. იმის ნაცვლად, რომ დასუსტდეს კვლევის დიზაინი გრაფიკის შესაბამისად — ან, რაც უარესია, მოხდეს არარსებული მონაცემების მოყვანა — დისერტაცია პატიოსნად არის ჩამოყალიბებული, როგორც მისი მთავარი შედეგი, რომელიც ეფუძნება აპარატურასა და მეთოდოლოგიას, კონცეფციის დამტკიცებას, რომელიც ასახავს მექანიზმებს, და შეფასებას, რომელიც მათ ტექნიკურად და სიმულაციის მეშვეობით იკვლევს. ამ ნაშრომში არცერთი მტკიცება არ ეფუძნება ადამიანთა მონაწილეობით მიღებულ მონაცემებს; სადაც კი აღქმის შედეგებია განხილული, ისინი ან სიმულაციური პროქსებია (მკაფიოდ აღნიშნული, 3.5(ბ)), ან პროგნოზებია, რომლებიც შემდგომი პროტოკოლით უნდა შემოწმდეს.</w:t>
       </w:r>
     </w:p>
     <w:p>
@@ -3414,6 +3470,9 @@
     <w:p>
       <w:pPr>
         <w:pStyle w:val="Heading2"/>
+        <w:numPr>
+          <w:numId w:val="0"/>
+        </w:numPr>
       </w:pPr>
       <w:r>
         <w:rPr>
@@ -3432,7 +3491,7 @@
           <w:b w:val="0"/>
           <w:sz w:val="24"/>
         </w:rPr>
-        <w:t>პროფილი C არის ერთიანი მეხსიერების ძრავა, რომელიც აერთიანებს ხუთ დადასტურებულ კოგნიტურ-მეხსიერების თეორიას — ატკინსონ-შიფრინის მრავალსაცავო მოდელს [20], ებინგჰაუსის დავიწყების კრუგს [23], ტულვინგის ეპიზოდური და სემანტიკური განასხვავებას [22], ბუნდოვანი კვალით თეორიას [24] და სწავლის კომპლემენტარული სისტემების ჩარჩოს [25] — ერთ სასიცოცხლო ციკლში. ორი დამატებითი წყარო შემოდის, როგორც იმპლემენტაციის პრეცედენტი და ზუსტი გადარქმევა და არა როგორც დამატებითი, ჩართული თეორიები: ჰიპოკამპური ინდექსაცია [7,26] (კონსოლიდაციის უკუკავშირის მითითებებისთვის) და დამუშავების დონეები (კოდირების დროის სალიენსის მექანიზმისთვის). ჩვენ ვამბობთ "შედგება და არა "ერთიანდება": თეორიები ერთმანეთთან თანამშრომლობისთვისაა შექმნილი ერთი კოჰერენტული ობიექტის ფარგლებში, მაგრამ არქიტექტურა არ ამტკიცებს მათ შეთავსებას ფუნდამენტური მექანიზმის დონეზე, და §3.2-ის საფუძვლად ჩათვლილია პროექტირების ეტაპზე მიღებული შთაგონება სახელობითი გამოტოვებებით (იხილეთ ქვემოთ), და არა კოგნიტური ერთგულების პრეტენზია — რაც შეესაბამება §2.2-ში დავიწყების კრუგისთვის უკვე მითითებულ გაფრთხილებას.</w:t>
+        <w:t>პროფილი C არის ერთიანი მეხსიერების ძრავა, რომელიც აერთიანებს ხუთ დადასტურებულ კოგნიტურ-მეხსიერების თეორიას — ატკინსონ-შიფრინის მრავალსაცავო მოდელს [20], ებინგჰაუსის დავიწყების კრუგს [23], ტულვინგის ეპიზოდური და სემანტიკური განასხვავებას [22], ბუნდოვანი კვალით თეორიას [24] და სწავლის კომპლემენტარული სისტემების ჩარჩოს [25] — ერთ სასიცოცხლო ციკლში. ორი დამატებითი წყარო შემოდის, როგორც იმპლემენტაციის პრეცედენტი და ზუსტი გადარქმევა და არა როგორც დამატებითი, ჩართული თეორიები: ჰიპოკამპური ინდექსაცია [7,26] (კონსოლიდაციის უკუკავშირის მითითებებისთვის) და დამუშავების დონეები (კოდირების დროის სალიენსის მექანიზმისთვის). ჩვენ ვამბობთ "შედგება და არა "ერთიანდება": თეორიები ერთმანეთთან თანამშრომლობისთვისაა შექმნილი ერთი კოჰერენტული ობიექტის ფარგლებში, მაგრამ არქიტექტურა არ ამტკიცებს მათ შეთავსებას ფუნდამენტური მექანიზმის დონეზე, და 3.2-ის საფუძვლად ჩათვლილია პროექტირების ეტაპზე მიღებული შთაგონება სახელობითი გამოტოვებებით (იხილეთ ქვემოთ), და არა კოგნიტური ერთგულების პრეტენზია — რაც შეესაბამება 2.2-ში დავიწყების კრუგისთვის უკვე მითითებულ გაფრთხილებას.</w:t>
       </w:r>
     </w:p>
     <w:p>
@@ -3454,7 +3513,7 @@
           <w:b w:val="0"/>
           <w:sz w:val="24"/>
         </w:rPr>
-        <w:t>ეტაპი 1 — კოდირება (მნიშვნელობის მიხედვით გაფილტრული ჩაწერა, ასინქრონული). უმუშავო ტურები არსებობს მხოლოდ დაახლოებით ოცი ტურის მოცულობის ცვალებად სამუშაო ფანჯარაში, რომელიც იდენტურია A და B პირობებისთვის და უცვლელია ყველა პირობისთვის. სინქრონული გზით არაფერი გადადის გრძელვადიან შენახვაზე. სესიის ბოლოს, ასინქრონულად, ბუფერში არსებული ტრანსკრიპტი იყოფა მოვლენებად ჩაშენების მანძილისა და დროითი შუალედის საზღვრებზე (რომელიც EM-LLM-ის [8] ბაიეს-სიურპრიზის სეგმენტაციის იაფი შემცვლელია) და ერთი მცირე-LLM-ის კრიტერიუმების გამოძახებით თითოეულ მოვლენას ეძლევა მნიშვნელობის ქულა ოთხ ა-პრიორი-ფიქსირებულ განზომილებაში: თვითგამოხატვის სიმკვრივე, ემოციური ინტენსივობა, ექსპლიციტური ხაზგასმა ან გამეორება, და მიზნის ან ვალდებულების შინაარსი. ზღვრულზე დაბალი ქულის მქონე მოვლენები რბილად იგდება — ძალიან დაბალი სტაბილურობის მქონე, "ენაზე მდგომი აზრის" მსგავსი კვალი, რომელიც მხოლოდ ძლიერი მინიშნების შემთხვევაში აღდგება — და არა მკაცრად იშლება; გადარჩენილები იღებენ საწყის სტაბილურობას, რომელიც მათ მნიშვნელობასთან არის პროპორციული. გრაუნდინგი: ატკინსონ-შიფრინის მრავალსაწყობიანი მოდელი [20] ყურადღებასა და გამეორებას განიხილავს, როგორც მოკლევადიანი და გრძელვადიანი მეხსიერების საწყობებს შორის გასასვლელს. აქ ჩვენ ვიწყებთ ერთ გულწრფელ გადარქმევას (F18): რადგან აღქმადობა გამოიყენება კოდირებისას, ეს მექანიზმი იმდენადვე არის დამუშავების სიღრმის ან დონეებისა და მეხსიერების ემოციური მოდულაციის მაგალითი, რამდენადაც — წმინდა მოდალური მოდელისა, და მას ასეთადაც მოიხსენიებენ; ის ასევე განსხვავდება Generative Agents-ის [10] მიერ მოძიების დროის მნიშვნელობის შეწონვისგან, რომელსაც §2 აღრიცხავს, როგორც აქტივაციის მსგავსს და არა თეორიიდან გამომდინარეს. ხელწერა: საუბრის პარტნიორი მდგრადად ინახავს იმას, რასაც მომხმარებელი ხაზს უსვამდა, ამხელდა ან რაზეც ბრუნდებოდა, მაშინ როცა შემთხვევითი, ყოველდღიური საუბრები ქრება; დავიწყება აღიქმება როგორც დათბობა და არა როგორც უყურადღებობა, რადგან რბილად უარყოფილი მასალა მკაფიო მინიშნების შემთხვევაში სუსტად, მაგრამ მაინც ექვემდებარება რეკონსტრუქციას.</w:t>
+        <w:t>ეტაპი 1 — კოდირება (მნიშვნელობის მიხედვით გაფილტრული ჩაწერა, ასინქრონული). უმუშავო ტურები არსებობს მხოლოდ დაახლოებით ოცი ტურის მოცულობის ცვალებად სამუშაო ფანჯარაში, რომელიც იდენტურია A და B პირობებისთვის და უცვლელია ყველა პირობისთვის. სინქრონული გზით არაფერი გადადის გრძელვადიან შენახვაზე. სესიის ბოლოს, ასინქრონულად, ბუფერში არსებული ტრანსკრიპტი იყოფა მოვლენებად ჩაშენების მანძილისა და დროითი შუალედის საზღვრებზე (რომელიც EM-LLM-ის [8] ბაიეს-სიურპრიზის სეგმენტაციის იაფი შემცვლელია) და ერთი მცირე-LLM-ის კრიტერიუმების გამოძახებით თითოეულ მოვლენას ეძლევა მნიშვნელობის ქულა ოთხ ა-პრიორი-ფიქსირებულ განზომილებაში: თვითგამოხატვის სიმკვრივე, ემოციური ინტენსივობა, ექსპლიციტური ხაზგასმა ან გამეორება, და მიზნის ან ვალდებულების შინაარსი. ზღვრულზე დაბალი ქულის მქონე მოვლენები რბილად იგდება — ძალიან დაბალი სტაბილურობის მქონე, "ენაზე მდგომი აზრის" მსგავსი კვალი, რომელიც მხოლოდ ძლიერი მინიშნების შემთხვევაში აღდგება — და არა მკაცრად იშლება; გადარჩენილები იღებენ საწყის სტაბილურობას, რომელიც მათ მნიშვნელობასთან არის პროპორციული. გრაუნდინგი: ატკინსონ-შიფრინის მრავალსაწყობიანი მოდელი [20] ყურადღებასა და გამეორებას განიხილავს, როგორც მოკლევადიანი და გრძელვადიანი მეხსიერების საწყობებს შორის გასასვლელს. აქ ჩვენ ვიწყებთ ერთ გულწრფელ გადარქმევას (F18): რადგან აღქმადობა გამოიყენება კოდირებისას, ეს მექანიზმი იმდენადვე არის დამუშავების სიღრმის ან დონეებისა და მეხსიერების ემოციური მოდულაციის მაგალითი, რამდენადაც — წმინდა მოდალური მოდელისა, და მას ასეთადაც მოიხსენიებენ; ის ასევე განსხვავდება Generative Agents-ის [10] მიერ მოძიების დროის მნიშვნელობის შეწონვისგან, რომელსაც 2 აღრიცხავს, როგორც აქტივაციის მსგავსს და არა თეორიიდან გამომდინარეს. ხელწერა: საუბრის პარტნიორი მდგრადად ინახავს იმას, რასაც მომხმარებელი ხაზს უსვამდა, ამხელდა ან რაზეც ბრუნდებოდა, მაშინ როცა შემთხვევითი, ყოველდღიური საუბრები ქრება; დავიწყება აღიქმება როგორც დათბობა და არა როგორც უყურადღებობა, რადგან რბილად უარყოფილი მასალა მკაფიო მინიშნების შემთხვევაში სუსტად, მაგრამ მაინც ექვემდებარება რეკონსტრუქციას.</w:t>
       </w:r>
     </w:p>
     <w:p>
@@ -3509,12 +3568,15 @@
           <w:b w:val="0"/>
           <w:sz w:val="24"/>
         </w:rPr>
-        <w:t>თეორიული ერთგულებისგან განზრახ თავის არიდება. აქ სამი ასეთი თავის არიდებაა დასახელებული, როგორც შეზღუდვები და სამომავლო სამუშაო, რითაც თავიდან ვიცილებთ ყველაზე ძლიერ თეორიულ წინააღმდეგობებს (F18), ვიდრე მათ კომიტეტის წინ წამოსაწევად დავტოვებდეთ. პირველი, არქიტექტურა გამორიცხავს ინტერფერენციას, რომელიც ადამიანის დავიწყების დომინანტური მექანიზმია; მისი დავიწყება წმინდად დროით და თვალსაჩინოობითაა განპირობებული. მეორე, მისი კონსოლიდაცია, რომელიც უპირველეს ყოვლისა სიზუსტეზეა ორიენტირებული, მიზანმიმართულად თრგუნავს რეკონსტრუქციულ და სქემაზე დაფუძნებულ დამახინჯებას — არსებითი შინაარსის დონის ცრუ მეხსიერებას, რომელსაც "ბურუსიანი კვალი" (fuzzy-trace) და CLS განსაკუთრებით მკაფიოდ პროგნოზირებენ — და კვლევის მიერ გაზომილი ადამიანურობის ღერძზე ფსიქოლოგიურ რეალიზმს უპირატესობას ანიჭებს იმ უსაფრთხოებას, რომ არ მოხდეს არასწორი ზოგადყოფების თავდაჯერებულად მტკიცება. მესამე, ის არ მოდელირებს დროის თანმიმდევრობის ან წყაროს მეხსიერებას დროის შტამპების მიღმა. ეს პრინციპული საინჟინრო არჩევანია და არა უგულებელყოფა, და §3.8-ში ისინი აღრიცხულია, როგორც კოგნიტური სიზუსტის მტკიცების საზღვრები.</w:t>
+        <w:t>თეორიული ერთგულებისგან განზრახ თავის არიდება. აქ სამი ასეთი თავის არიდებაა დასახელებული, როგორც შეზღუდვები და სამომავლო სამუშაო, რითაც თავიდან ვიცილებთ ყველაზე ძლიერ თეორიულ წინააღმდეგობებს (F18), ვიდრე მათ კომიტეტის წინ წამოსაწევად დავტოვებდეთ. პირველი, არქიტექტურა გამორიცხავს ინტერფერენციას, რომელიც ადამიანის დავიწყების დომინანტური მექანიზმია; მისი დავიწყება წმინდად დროით და თვალსაჩინოობითაა განპირობებული. მეორე, მისი კონსოლიდაცია, რომელიც უპირველეს ყოვლისა სიზუსტეზეა ორიენტირებული, მიზანმიმართულად თრგუნავს რეკონსტრუქციულ და სქემაზე დაფუძნებულ დამახინჯებას — არსებითი შინაარსის დონის ცრუ მეხსიერებას, რომელსაც "ბურუსიანი კვალი" (fuzzy-trace) და CLS განსაკუთრებით მკაფიოდ პროგნოზირებენ — და კვლევის მიერ გაზომილი ადამიანურობის ღერძზე ფსიქოლოგიურ რეალიზმს უპირატესობას ანიჭებს იმ უსაფრთხოებას, რომ არ მოხდეს არასწორი ზოგადყოფების თავდაჯერებულად მტკიცება. მესამე, ის არ მოდელირებს დროის თანმიმდევრობის ან წყაროს მეხსიერებას დროის შტამპების მიღმა. ეს პრინციპული საინჟინრო არჩევანია და არა უგულებელყოფა, და 3.8-ში ისინი აღრიცხულია, როგორც კოგნიტური სიზუსტის მტკიცების საზღვრები.</w:t>
       </w:r>
     </w:p>
     <w:p>
       <w:pPr>
         <w:pStyle w:val="Heading2"/>
+        <w:numPr>
+          <w:numId w:val="0"/>
+        </w:numPr>
       </w:pPr>
       <w:r>
         <w:rPr>
@@ -3544,7 +3606,7 @@
           <w:b w:val="0"/>
           <w:sz w:val="24"/>
         </w:rPr>
-        <w:t>•  A — გრძელვადიანი მეხსიერების გარეშე. მხოლოდ ცვალებადი სამუშაო ფანჯარა; ყოველი სესია იწყება ნულიდან. A აშკარა მინიმალური ზღვარია და, გადავადებულ ადამიანურ პროტოკოლში (§3.5c), ის სრულ, მრავალკვირიან რაუნდს კი არ წარმოადგენს, არამედ მოკლე, წინასწარ დაწერილი სცენარით გათვალისწინებულ კალიბრაციის ეტაპს.</w:t>
+        <w:t>•  A — გრძელვადიანი მეხსიერების გარეშე. მხოლოდ ცვალებადი სამუშაო ფანჯარა; ყოველი სესია იწყება ნულიდან. A აშკარა მინიმალური ზღვარია და, გადავადებულ ადამიანურ პროტოკოლში (3.5c), ის სრულ, მრავალკვირიან რაუნდს კი არ წარმოადგენს, არამედ მოკლე, წინასწარ დაწერილი სცენარით გათვალისწინებულ კალიბრაციის ეტაპს.</w:t>
       </w:r>
     </w:p>
     <w:p>
@@ -3577,18 +3639,18 @@
           <w:b w:val="0"/>
           <w:sz w:val="24"/>
         </w:rPr>
-        <w:t>•  C — პროფილი C. §3.2-ის ადამიანის მეხსიერების სრული, ხუთეტაპიანი სასიცოცხლო ციკლი.</w:t>
-      </w:r>
-    </w:p>
-    <w:p>
-      <w:pPr/>
-      <w:r>
-        <w:rPr>
-          <w:rFonts w:ascii="Sylfaen" w:hAnsi="Sylfaen" w:cs="Sylfaen"/>
-          <w:b w:val="0"/>
-          <w:sz w:val="24"/>
-        </w:rPr>
-        <w:t>B+ არის დიზაინის ცენტრალური მეთოდოლოგიური წვლილი. C-სთვის ნებისმიერი დადებითი შედეგისთვის ყველაზე სერიოზული საფრთხე არის წაკითხვადობის კონფუუდი: C-ს მიერ შეჯამებული და კო-რეფერენსებისგან გაწმენდილი პროზა უბრალოდ უფრო წაკითხვადი არის, ვიდრე B-ს უმი ფრაგმენტები, და C-სა და B-ს შორის უბრალო გამარჯვება ერთმანეთში აურივებს კურირებასა და კოგნიტურ დინამიკას. B+ თავისი კონსტრუქციით გამორიცხავს ამ კონფუუდს. თუ C &gt; B+, მარგინალური ეფექტი განპირობებულია ადამიანის მეხსიერების იმ დინამიკით, რომელიც მხოლოდ C-ს ახასიათებს. თუ C ≈ B+, გულწრფელი დასკვნა იქნება, რომ აღქმითი სარგებელი თავიდანვე წაკითხვადობა იყო, და ამიტომ მოსაზრება შესაბამისად გადაიხედა — დასკვნა, რომელიც ზუსტად იმიტომ არის ინტერპრეტაციული, რომ B+ სწორედ ამის დასაშვებად შეიქმნა. სწორედ ამიტომ, როგორც §3.1-შია აღნიშნული, C &gt; B+ არის შეფასების სამიზნე და სწორედ ამიტომ B+-ის გამორიცხვა არ განიხილება.</w:t>
+        <w:t>•  C — პროფილი C. 3.2-ის ადამიანის მეხსიერების სრული, ხუთეტაპიანი სასიცოცხლო ციკლი.</w:t>
+      </w:r>
+    </w:p>
+    <w:p>
+      <w:pPr/>
+      <w:r>
+        <w:rPr>
+          <w:rFonts w:ascii="Sylfaen" w:hAnsi="Sylfaen" w:cs="Sylfaen"/>
+          <w:b w:val="0"/>
+          <w:sz w:val="24"/>
+        </w:rPr>
+        <w:t>B+ არის დიზაინის ცენტრალური მეთოდოლოგიური წვლილი. C-სთვის ნებისმიერი დადებითი შედეგისთვის ყველაზე სერიოზული საფრთხე არის წაკითხვადობის კონფუუდი: C-ს მიერ შეჯამებული და კო-რეფერენსებისგან გაწმენდილი პროზა უბრალოდ უფრო წაკითხვადი არის, ვიდრე B-ს უმი ფრაგმენტები, და C-სა და B-ს შორის უბრალო გამარჯვება ერთმანეთში აურივებს კურირებასა და კოგნიტურ დინამიკას. B+ თავისი კონსტრუქციით გამორიცხავს ამ კონფუუდს. თუ C &gt; B+, მარგინალური ეფექტი განპირობებულია ადამიანის მეხსიერების იმ დინამიკით, რომელიც მხოლოდ C-ს ახასიათებს. თუ C ≈ B+, გულწრფელი დასკვნა იქნება, რომ აღქმითი სარგებელი თავიდანვე წაკითხვადობა იყო, და ამიტომ მოსაზრება შესაბამისად გადაიხედა — დასკვნა, რომელიც ზუსტად იმიტომ არის ინტერპრეტაციული, რომ B+ სწორედ ამის დასაშვებად შეიქმნა. სწორედ ამიტომ, როგორც 3.1-შია აღნიშნული, C &gt; B+ არის შეფასების სამიზნე და სწორედ ამიტომ B+-ის გამორიცხვა არ განიხილება.</w:t>
       </w:r>
     </w:p>
     <w:p>
@@ -3618,6 +3680,7 @@
     <w:tbl>
       <w:tblPr>
         <w:tblW w:type="auto" w:w="0"/>
+        <w:tblLayout w:type="fixed"/>
         <w:tblLook w:firstColumn="1" w:firstRow="1" w:lastColumn="0" w:lastRow="0" w:noHBand="0" w:noVBand="1" w:val="04A0"/>
         <w:tblBorders>
           <w:top w:val="single" w:sz="4" w:space="0" w:color="000000"/>
@@ -3627,16 +3690,17 @@
           <w:insideH w:val="single" w:sz="4" w:space="0" w:color="000000"/>
           <w:insideV w:val="single" w:sz="4" w:space="0" w:color="000000"/>
         </w:tblBorders>
+        <w:tblLayout w:type="fixed"/>
       </w:tblPr>
       <w:tblGrid>
-        <w:gridCol w:w="2778"/>
-        <w:gridCol w:w="2778"/>
-        <w:gridCol w:w="2778"/>
+        <w:gridCol w:w="2297"/>
+        <w:gridCol w:w="3019"/>
+        <w:gridCol w:w="3019"/>
       </w:tblGrid>
       <w:tr>
         <w:tc>
           <w:tcPr>
-            <w:tcW w:type="dxa" w:w="2778"/>
+            <w:tcW w:type="dxa" w:w="2297"/>
           </w:tcPr>
           <w:p>
             <w:pPr>
@@ -3654,7 +3718,7 @@
         </w:tc>
         <w:tc>
           <w:tcPr>
-            <w:tcW w:type="dxa" w:w="2778"/>
+            <w:tcW w:type="dxa" w:w="3019"/>
           </w:tcPr>
           <w:p>
             <w:pPr>
@@ -3672,7 +3736,7 @@
         </w:tc>
         <w:tc>
           <w:tcPr>
-            <w:tcW w:type="dxa" w:w="2778"/>
+            <w:tcW w:type="dxa" w:w="3019"/>
           </w:tcPr>
           <w:p>
             <w:pPr>
@@ -3692,7 +3756,7 @@
       <w:tr>
         <w:tc>
           <w:tcPr>
-            <w:tcW w:type="dxa" w:w="2778"/>
+            <w:tcW w:type="dxa" w:w="2297"/>
           </w:tcPr>
           <w:p>
             <w:pPr>
@@ -3710,7 +3774,7 @@
         </w:tc>
         <w:tc>
           <w:tcPr>
-            <w:tcW w:type="dxa" w:w="2778"/>
+            <w:tcW w:type="dxa" w:w="3019"/>
           </w:tcPr>
           <w:p>
             <w:pPr>
@@ -3728,7 +3792,7 @@
         </w:tc>
         <w:tc>
           <w:tcPr>
-            <w:tcW w:type="dxa" w:w="2778"/>
+            <w:tcW w:type="dxa" w:w="3019"/>
           </w:tcPr>
           <w:p>
             <w:pPr>
@@ -3748,7 +3812,7 @@
       <w:tr>
         <w:tc>
           <w:tcPr>
-            <w:tcW w:type="dxa" w:w="2778"/>
+            <w:tcW w:type="dxa" w:w="2297"/>
           </w:tcPr>
           <w:p>
             <w:pPr>
@@ -3766,7 +3830,7 @@
         </w:tc>
         <w:tc>
           <w:tcPr>
-            <w:tcW w:type="dxa" w:w="2778"/>
+            <w:tcW w:type="dxa" w:w="3019"/>
           </w:tcPr>
           <w:p>
             <w:pPr>
@@ -3784,7 +3848,7 @@
         </w:tc>
         <w:tc>
           <w:tcPr>
-            <w:tcW w:type="dxa" w:w="2778"/>
+            <w:tcW w:type="dxa" w:w="3019"/>
           </w:tcPr>
           <w:p>
             <w:pPr>
@@ -3804,7 +3868,7 @@
       <w:tr>
         <w:tc>
           <w:tcPr>
-            <w:tcW w:type="dxa" w:w="2778"/>
+            <w:tcW w:type="dxa" w:w="2297"/>
           </w:tcPr>
           <w:p>
             <w:pPr>
@@ -3822,7 +3886,7 @@
         </w:tc>
         <w:tc>
           <w:tcPr>
-            <w:tcW w:type="dxa" w:w="2778"/>
+            <w:tcW w:type="dxa" w:w="3019"/>
           </w:tcPr>
           <w:p>
             <w:pPr>
@@ -3840,7 +3904,7 @@
         </w:tc>
         <w:tc>
           <w:tcPr>
-            <w:tcW w:type="dxa" w:w="2778"/>
+            <w:tcW w:type="dxa" w:w="3019"/>
           </w:tcPr>
           <w:p>
             <w:pPr>
@@ -3860,7 +3924,7 @@
       <w:tr>
         <w:tc>
           <w:tcPr>
-            <w:tcW w:type="dxa" w:w="2778"/>
+            <w:tcW w:type="dxa" w:w="2297"/>
           </w:tcPr>
           <w:p>
             <w:pPr>
@@ -3878,7 +3942,7 @@
         </w:tc>
         <w:tc>
           <w:tcPr>
-            <w:tcW w:type="dxa" w:w="2778"/>
+            <w:tcW w:type="dxa" w:w="3019"/>
           </w:tcPr>
           <w:p>
             <w:pPr>
@@ -3895,7 +3959,7 @@
         </w:tc>
         <w:tc>
           <w:tcPr>
-            <w:tcW w:type="dxa" w:w="2778"/>
+            <w:tcW w:type="dxa" w:w="3019"/>
           </w:tcPr>
           <w:p>
             <w:pPr>
@@ -3924,12 +3988,15 @@
           <w:b w:val="0"/>
           <w:sz w:val="24"/>
         </w:rPr>
-        <w:t>ყველა არქიტექტურული პარამეტრი — სეგმენტაციის ზღვარი, მნიშვნელობის (სალიენსის) რუბრიკა და ქვედა ზღვარი, მნიშვნელობიდან სტაბილურობამდე კოეფიციენტი, არსებითიდან საყრდენამდე სტაბილურობის თანაფარდობა, კლებადი კონსტანტები, კონსოლიდაციის კლასტერის ზომა და ზღვარი, აქტივაციის ფორმა — აპრიორულად ფიქსირებული და წინასწარ დარეგისტრირებულია, გარედან დამაგრებული მნიშვნელობებით (მაგ., MemoryBank-იდან [6] აღებული კლებადი კონსტანტები) და აუცილებელი მგრძნობელობის ანალიზით (§3.7), რათა არცერთი თავისუფალი რეგულატორი არ იყოს მორგებული სოციალურ შედეგზე. სრული პროტოკოლით, სალიენტობის მარკიორი ვალიდაციას გადის ორი-სამი ექსპერტი ადამიანის ანოტატორის (რომლებიც კვლევის მონაწილეები არ არიან) მიერ, ხოლო სეგმენტაციის ზღვარი კალიბრირდება ადამიანის მიერ დატანილი თემატური ცვლილების იარლიყების მიხედვით — ორივე შემთხვევაში გარე სამიზნეზე, და არა კვლევის დამოკიდებულ ცვლადებზე.</w:t>
+        <w:t>ყველა არქიტექტურული პარამეტრი — სეგმენტაციის ზღვარი, მნიშვნელობის (სალიენსის) რუბრიკა და ქვედა ზღვარი, მნიშვნელობიდან სტაბილურობამდე კოეფიციენტი, არსებითიდან საყრდენამდე სტაბილურობის თანაფარდობა, კლებადი კონსტანტები, კონსოლიდაციის კლასტერის ზომა და ზღვარი, აქტივაციის ფორმა — აპრიორულად ფიქსირებული და წინასწარ დარეგისტრირებულია, გარედან დამაგრებული მნიშვნელობებით (მაგ., MemoryBank-იდან [6] აღებული კლებადი კონსტანტები) და აუცილებელი მგრძნობელობის ანალიზით (3.7), რათა არცერთი თავისუფალი რეგულატორი არ იყოს მორგებული სოციალურ შედეგზე. სრული პროტოკოლით, სალიენტობის მარკიორი ვალიდაციას გადის ორი-სამი ექსპერტი ადამიანის ანოტატორის (რომლებიც კვლევის მონაწილეები არ არიან) მიერ, ხოლო სეგმენტაციის ზღვარი კალიბრირდება ადამიანის მიერ დატანილი თემატური ცვლილების იარლიყების მიხედვით — ორივე შემთხვევაში გარე სამიზნეზე, და არა კვლევის დამოკიდებულ ცვლადებზე.</w:t>
       </w:r>
     </w:p>
     <w:p>
       <w:pPr>
         <w:pStyle w:val="Heading2"/>
+        <w:numPr>
+          <w:numId w:val="0"/>
+        </w:numPr>
       </w:pPr>
       <w:r>
         <w:rPr>
@@ -3948,23 +4015,26 @@
           <w:b w:val="0"/>
           <w:sz w:val="24"/>
         </w:rPr>
-        <w:t>ამ დისერტაციაში წარმოდგენილი კონცეფციის დამტკიცება არის დამოუკიდებელი მეხსიერების მართვის სისტემა და არა სრულმასშტაბიანი ხმოვანი აპლიკაცია. ის ახორციელებს ოთხ პირობას A, B, B+ და C — C-ის ხუთსაფეხურიანი სასიცოცხლო ციკლის გამოყენებით, §4-ში მითითებული სიზუსტით — როგორც ინსტრუმენტული მოდული, რომელიც მუშაობს ტრანსკრიპტებზე, მიზანმიმართულად, Voice Companion-ის სრული ხმოვანი მიწოდების ჯაჭვის მიღმა. ამ მასშტაბის მოტივაცია ორ გულწრფელ მიზეზს აქვს. პირველი, არსებული პლატფორმის (F17) აუდიტმა დაადგინა, რომ ხმის აპლიკაცია დღესდღეობით მხოლოდ A პირობას უზრუნველყოფს და დამატებით თორმეტიდან თექვსმეტ კვირამდე საინჟინრო სამუშაოს საჭიროებს — ხმის მეხსიერებაზე გადაყვანის კავშირის, თითოეული მონაწილისთვის სახელწოდების სივრცის გამოყოფისა და განთავსებადი კლიენტის შექმნას — სანამ ის B, B+, და C პირობების რეალურ მომხმარებლებზე მასპინძლობას შეძლებს; ეს შექმნა ამჟამინდელი დროის ჩარჩოსთვის არ შედის. მეორე და, რაც უფრო მნიშვნელოვანია, კვლევის საგანია მეხსიერების პროცესი, რომელიც სრულად გამოიყენება დიალოგის ტრანსკრიპტებზე მომუშავე სპეციალური პროგრამული უზრუნველყოფით. მეხსიერების ძრავის გამოყოფა მეტყველებიდან-ტექსტად, ტექსტიდან-მეტყველებად და რიგის მიყოლის მექანიზმებისგან საშუალებას იძლევა, რომ კონცეფციის დამტკიცებამ ნათლად და გამეორებადურად აჩვენოს და დააპროგრამოს მექანიზმები — მოვლენების სეგმენტაცია, მნიშვნელობაზე დაფუძნებული კოდირება, ორმაგი დაქვეითების წარმოდგენა, Ebbinghaus-ის უსასრულო დაქვეითება და გაძლიერება, ოფლაინ კონსოლიდაცია და არსის მიხედვით მოძიება.</w:t>
-      </w:r>
-    </w:p>
-    <w:p>
-      <w:pPr/>
-      <w:r>
-        <w:rPr>
-          <w:rFonts w:ascii="Sylfaen" w:hAnsi="Sylfaen" w:cs="Sylfaen"/>
-          <w:b w:val="0"/>
-          <w:sz w:val="24"/>
-        </w:rPr>
-        <w:t>შესაბამისად, ეს ხელსაწყო წარმოდგენილია მექანიზმების დემონსტრაციად და §3.5-ის ტექნიკური და სიმულირებული შეფასების საფუძვლად და არა, როგორც კვლევის აპარატის ოპერატიულ ვერსიად. ის პირდაპირ განასახიერებს §3.3-ის სამართლიანობის არქიტექტურას: პირობებს შორის საერთო ამოღების ტრიგერი, შეყვანის წერტილი და ტოკენების ბიუჯეტი; თითოეული პირობისთვის იზოლირებული საცავები; სეგმენტაციის, მნიშვნელობის ქულების მინიჭების, არსებითი შინაარსის შექმნისა და კონსოლიდაციისთვის ოფლაინ ჯგუფური ამოცანები; და მხოლოდ წაკითხვისთვის განკუთვნილი სინქრონული ამოღების გზა, დაყოვნებით გამოთვლილი დაქვეითებითა და ნულოვანი მორიგეობით LLM-ის გამოძახებით. ყველაზე იაფი მისაღები ვარიანტის ანალიზის (F18) თანახმად, კონცეფციის დამტკიცება პრიორიტეტს ანიჭებს აუცილებელ ბირთვს — B+, კონსოლიდაციას, მარტივ ინერტულ კლებას და არსებითი შინაარსის/საყრდენი წარმოდგენას — და შესაძლოა, ყველაზე ძვირადღირებული დახვეწის ეტაპები (მასშტაბურ დონეზე პროგრამული აქტუალობის კონტროლი, ასოციაციური წინასწარი გაფართოება, საყრდენი-რეგულარული გამომწვევი და სენსიტიურობის ავტომატიზებული შემოწმება) სრულ ვერსიამდე გადადოს, და ასეთი ნებისმიერი გადადება ექსპლიციტურად იქნება აღნიშნული და არა ჩუმად ნაგულისხმევი. თითოეული მონაცვლეობის სინქრონული ხარჯი დომინირებულია 100 მილიწამზე ნაკლები ხანგრძლივობის ერთ ვექტორულ მოთხოვნასა და O(k) არითმეტიკულ ოპერაციებზე, რაც თავისუფლად ეტევა პლატფორმისთვის დოკუმენტირებულ დაახლოებით ორიდან ხუთ წამამდე ხმოვან მონაცვლეობაში (F17); B, B+ და C-ს შორის დაყოვნების თანასწორობა მტკიცების ნაცვლად ემპირიულად ფიქსირდება ჰარნესის მიერ.</w:t>
+        <w:t>ამ დისერტაციაში წარმოდგენილი კონცეფციის დამტკიცება არის დამოუკიდებელი მეხსიერების მართვის სისტემა და არა სრულმასშტაბიანი ხმოვანი აპლიკაცია. ის ახორციელებს ოთხ პირობას A, B, B+ და C — C-ის ხუთსაფეხურიანი სასიცოცხლო ციკლის გამოყენებით, 4-ში მითითებული სიზუსტით — როგორც ინსტრუმენტული მოდული, რომელიც მუშაობს ტრანსკრიპტებზე, მიზანმიმართულად, Voice Companion-ის სრული ხმოვანი მიწოდების ჯაჭვის მიღმა. ამ მასშტაბის მოტივაცია ორ გულწრფელ მიზეზს აქვს. პირველი, არსებული პლატფორმის (F17) აუდიტმა დაადგინა, რომ ხმის აპლიკაცია დღესდღეობით მხოლოდ A პირობას უზრუნველყოფს და დამატებით თორმეტიდან თექვსმეტ კვირამდე საინჟინრო სამუშაოს საჭიროებს — ხმის მეხსიერებაზე გადაყვანის კავშირის, თითოეული მონაწილისთვის სახელწოდების სივრცის გამოყოფისა და განთავსებადი კლიენტის შექმნას — სანამ ის B, B+, და C პირობების რეალურ მომხმარებლებზე მასპინძლობას შეძლებს; ეს შექმნა ამჟამინდელი დროის ჩარჩოსთვის არ შედის. მეორე და, რაც უფრო მნიშვნელოვანია, კვლევის საგანია მეხსიერების პროცესი, რომელიც სრულად გამოიყენება დიალოგის ტრანსკრიპტებზე მომუშავე სპეციალური პროგრამული უზრუნველყოფით. მეხსიერების ძრავის გამოყოფა მეტყველებიდან-ტექსტად, ტექსტიდან-მეტყველებად და რიგის მიყოლის მექანიზმებისგან საშუალებას იძლევა, რომ კონცეფციის დამტკიცებამ ნათლად და გამეორებადურად აჩვენოს და დააპროგრამოს მექანიზმები — მოვლენების სეგმენტაცია, მნიშვნელობაზე დაფუძნებული კოდირება, ორმაგი დაქვეითების წარმოდგენა, Ebbinghaus-ის უსასრულო დაქვეითება და გაძლიერება, ოფლაინ კონსოლიდაცია და არსის მიხედვით მოძიება.</w:t>
+      </w:r>
+    </w:p>
+    <w:p>
+      <w:pPr/>
+      <w:r>
+        <w:rPr>
+          <w:rFonts w:ascii="Sylfaen" w:hAnsi="Sylfaen" w:cs="Sylfaen"/>
+          <w:b w:val="0"/>
+          <w:sz w:val="24"/>
+        </w:rPr>
+        <w:t>შესაბამისად, ეს ხელსაწყო წარმოდგენილია მექანიზმების დემონსტრაციად და 3.5-ის ტექნიკური და სიმულირებული შეფასების საფუძვლად და არა, როგორც კვლევის აპარატის ოპერატიულ ვერსიად. ის პირდაპირ განასახიერებს 3.3-ის სამართლიანობის არქიტექტურას: პირობებს შორის საერთო ამოღების ტრიგერი, შეყვანის წერტილი და ტოკენების ბიუჯეტი; თითოეული პირობისთვის იზოლირებული საცავები; სეგმენტაციის, მნიშვნელობის ქულების მინიჭების, არსებითი შინაარსის შექმნისა და კონსოლიდაციისთვის ოფლაინ ჯგუფური ამოცანები; და მხოლოდ წაკითხვისთვის განკუთვნილი სინქრონული ამოღების გზა, დაყოვნებით გამოთვლილი დაქვეითებითა და ნულოვანი მორიგეობით LLM-ის გამოძახებით. ყველაზე იაფი მისაღები ვარიანტის ანალიზის (F18) თანახმად, კონცეფციის დამტკიცება პრიორიტეტს ანიჭებს აუცილებელ ბირთვს — B+, კონსოლიდაციას, მარტივ ინერტულ კლებას და არსებითი შინაარსის/საყრდენი წარმოდგენას — და შესაძლოა, ყველაზე ძვირადღირებული დახვეწის ეტაპები (მასშტაბურ დონეზე პროგრამული აქტუალობის კონტროლი, ასოციაციური წინასწარი გაფართოება, საყრდენი-რეგულარული გამომწვევი და სენსიტიურობის ავტომატიზებული შემოწმება) სრულ ვერსიამდე გადადოს, და ასეთი ნებისმიერი გადადება ექსპლიციტურად იქნება აღნიშნული და არა ჩუმად ნაგულისხმევი. თითოეული მონაცვლეობის სინქრონული ხარჯი დომინირებულია 100 მილიწამზე ნაკლები ხანგრძლივობის ერთ ვექტორულ მოთხოვნასა და O(k) არითმეტიკულ ოპერაციებზე, რაც თავისუფლად ეტევა პლატფორმისთვის დოკუმენტირებულ დაახლოებით ორიდან ხუთ წამამდე ხმოვან მონაცვლეობაში (F17); B, B+ და C-ს შორის დაყოვნების თანასწორობა მტკიცების ნაცვლად ემპირიულად ფიქსირდება ჰარნესის მიერ.</w:t>
       </w:r>
     </w:p>
     <w:p>
       <w:pPr>
         <w:pStyle w:val="Heading2"/>
+        <w:numPr>
+          <w:numId w:val="0"/>
+        </w:numPr>
       </w:pPr>
       <w:r>
         <w:rPr>
@@ -3983,56 +4053,59 @@
           <w:b w:val="0"/>
           <w:sz w:val="24"/>
         </w:rPr>
-        <w:t>არქიტექტურა შეფასებულია სამი მიმართულებით, მზარდი ეკოლოგიური ამბიციითა და მიმდინარე შესრულებადობის კლებადი დონით: ტექნიკური შეფასება (წარმოდგენილია §4-ში), სიმულირებული მომხმარებლის შეფასება (წარმოდგენილია §4-ში, მკაფიოდ განსაზღვრული შეზღუდვებით) და შემუშავებული პროტოკოლი ადამიან-სუბიექტებისთვის (განმარტებულია აქ, გადავადებულია მომავალი ნაშრომისთვის). ეს დაყოფა მიზანმიმართულია: პირველი ორი მიმართულება იკვლევს მექანიზმებს და ქმნის ჰიპოთეზებს; მხოლოდ მესამე შეუძლია შეაფასოს აღქმის შესახებ გაკეთებული მტკიცებულებები, და ის ამ ნაშრომში არ სრულდება.</w:t>
-      </w:r>
-    </w:p>
-    <w:p>
-      <w:pPr/>
-      <w:r>
-        <w:rPr>
-          <w:rFonts w:ascii="Sylfaen" w:hAnsi="Sylfaen" w:cs="Sylfaen"/>
-          <w:b w:val="0"/>
-          <w:sz w:val="24"/>
-        </w:rPr>
-        <w:t>(ა) ტექნიკური შეფასება. ბენჩმარკის ტიპის შეფასება ოთხი პირობის მიხედვით ტარდება სინთეზურ მრავალსესიან დიალოგებზე და ზომავს რაოდენობის სამ კატეგორიას: აღდგენის ხარისხი (წინა სესიის შინაარსის ფაქტობრივი აღდგენა, §2.5-ის გრძელვადიანი მეხსიერების ბენჩმარკების მსგავსად); დროითი მსჯელობა (კატეგორია, რომელიც თანმიმდევრულად ყველაზე სუსტია LoCoMo-სა და LongMemEval-ში [1,2]); და ლატენტურობა (B, B+ და C-სთვის თითოეული რაუნდის სინქრონული გამოძახების დრო, რაც §3.4-ში მითითებულ პარიტეტს ადასტურებს). ლიტერატურაში მოყვანილი ორი გაფრთხილება გათვალისწინებულია. პირველი, რადგან გამოქვეყნებული მეხსიერების ტესტების შედეგები დაუჯერებელი აღმოჩნდა, ხოლო მათი ავტომატური შემფასებლები — შემწყნარებლები (F9, [32,33]), ჰარნესი თავის საკუთარ შეფასების პროცედურას ხელახლა ამოწმებს, ნაცვლად იმისა, რომ ხარვეზიანი პროცედურა მემკვიდრეობით მიიღოს, და ამ გაფრთხილების გათვალისწინებით აბსოლუტურ ქულებს წარმოადგენს. მეორე, ტექნიკური აღდგენის სიზუსტე პირდაპირ არ წარმოადგენს ნაშრომის სამიზნე შედეგს — სინამდვილეში, დიზაინი პროგნოზირებს, რომ C-ს განზრახვისამებრ შეიძლება B-ზე ნაკლები ტექსტის პირდაპირი ციტირება შეეძლოს — ამიტომ ეს მეტრიკები ახასიათებს მექანიზმებს და ამოწმებს, რომ C-ს დავიწყება ხარვეზული კი არა, დახვეწილია; ისინი არ წარმოადგენენ აღქმული ურთიერთკავშირის შედეგების მაჩვენებელს.</w:t>
-      </w:r>
-    </w:p>
-    <w:p>
-      <w:pPr/>
-      <w:r>
-        <w:rPr>
-          <w:rFonts w:ascii="Sylfaen" w:hAnsi="Sylfaen" w:cs="Sylfaen"/>
-          <w:b w:val="0"/>
-          <w:sz w:val="24"/>
-        </w:rPr>
-        <w:t>(ბ) სიმულირებული მომხმარებლის შეფასება. სოციალური კონსტრუქტების შესამოწმებლად ადამიანის მონაწილეობის გარეშე, ხელსაწყო გამოიყენება მრავალსესიან დიალოგებში, სადაც LLM მოქმედებს სიმულირებული მომხმარებლის როლში, ხოლო ცალკეული LLM-მსაჯული აფასებს თითოეულ პირობას §3.6-ის სოციალური კონსტრუქტების მიხედვით (სოციალური თანადგომა, ალიანსი, სანდოობა/ადამიანურობა, პლუს ინტელექტისა და კონფიდენციალურობის კრიტერიუმები). ეს მიმართულება განზრახ ეპისტემიკური თავმდაბლობითაა ჩარჩოში მოქცეული: ის სიმულირებული პროქსია და არა ადამიანის აღქმის შემცვლელი, და მას არ შეუძლია აღქმის ჰიპოთეზების ვალიდაცია. მისი გამოთქმული ვალიდურობის შეზღუდვები სამმაგია: დიდი ენის მოდელი (LLM) მსაჯულის შეფასებებს "სოციალური პრეზენციისა" ან "ნდობისა" ადამიანის გამოცდილებასთან უცნობი კორესპონდენცია აქვს და შესაძლოა ასახავდეს ზედაპირულ ტექსტურ მახასიათებლებს (მაგ., თავად წაკითხვადობას, რასაც B+ აკონტროლებს) და არა შეგრძნებულ ურთიერთობას; სიმულირებულ მომხმარებლებს არ გააჩნიათ რეალური მომხმარებლებისთვის დამახასიათებელი მნიშვნელოვანი ინტერესები, კვირების განმავლობაში დაგროვილი მეხსიერება და კონფიდენციალურობის მგრძნობელობა, ამიტომ ამ ნაშრომისთვის ცენტრალური (F4) ორმაგი ხასიათის მეხსიერების ეფექტები შესაძლოა არ გამოვლინდეს; და მოსამართლისა და გენერატორის მოდელებს შეიძლება ჰქონდეთ მიკერძოებები, რომლებიც ზრდის შეთანხმებას. შესაბამისად, სიმულირებული ნაწილი გამოიყენება იმისთვის, რომ (i) გადაამოწმოს, გამოიმუშავებს თუ არა პირობები განსხვავებად ქცევას, (ii) შექმნას და დახვეწოს პროგნოზები ადამიანური პროტოკოლისთვის, და (iii) ბოლომდე გამოცადოს ზუსტი ინსტრუმენტის ოპერაციალიზაცია (§3.6). ნებისმიერი სიმულირებული C-B+ განსხვავება წარმოდგენილია როგორც მექანიზმის დონის სიგნალი და არასდროს — როგორც ადამიანის აღქმის შესახებ მტკიცებულება.</w:t>
-      </w:r>
-    </w:p>
-    <w:p>
-      <w:pPr/>
-      <w:r>
-        <w:rPr>
-          <w:rFonts w:ascii="Sylfaen" w:hAnsi="Sylfaen" w:cs="Sylfaen"/>
-          <w:b w:val="0"/>
-          <w:sz w:val="24"/>
-        </w:rPr>
-        <w:t>(გ) შემუშავებული პროტოკოლი ადამიანთა მონაწილეობით (მომავალი ნაშრომი). მიზნის აღქმითი მტკიცებულებები შეიძლება გადაწყდეს მხოლოდ ადამიანებზე ჩატარებული კვლევით, რომელსაც ეს ნაშრომი სრულად აღწერს, მაგრამ არ ახორციელებს. დიზაინი წარმოადგენს B-ს, B+, და C — სამი განყოფილება, სადაც A დაყვანილია მოკლე, წინასწარ განსაზღვრული კალიბრაციის შეხებამდე — n ≈ 20 მონაწილეზე, თითოეული პირობა გამოცდილია სრულ სამკვირიან ჰორიზონტზე, რათა C-ის ნელი ტემპით მიმდინარე კონსოლიდაციას გამოვლენის დრო ჰქონდეს, იზოლირებული საცავებით თითოეული პირობისთვის, დაბალანსებული თანმიმდევრობით, გამორეცხვის პერიოდით და წინასწარ რეგისტრირებული თანმიმდევრობის ეფექტის ტესტით გადატანის ეფექტის გასაკონტროლებლად. ძირითადი ინსტრუმენტია ხელოვნური სოციალური აგენტის კითხვარი [14] (§3.6). დიზაინის ორი მახასიათებელი პირდაპირ გამომდინარეობს წნეხის ტესტიდან (F18): ანალიზი მიმართულია გვიან, კონსოლიდაციის შემდგომი პერიოდისკენ (და კონსოლიდაციის სიმჭიდროვით მოდერირებული ეფექტებისკენ), და არა პირობის შიდა ზოგადი საშუალოსკენ, რადგან სწორედ იქ ვლინდება მხოლოდ C-სთვის დამახასიათებელი ნებისმიერი ეფექტი; და თბილი, მიკუთვნადი დავიწყება წინასწარ რეგისტრირებული არქიტექტურული წესია, რათა რბილად გამოტოვებული ელემენტი განაპირობებდეს თბილ, ნაწილობრივ აღიარებას ("დეტალები არ მახსოვს, მაგრამ ვიცი, რომ შენთვის მნიშვნელოვანი იყო") და არა სრულ დავიწყებას, რაც ნეიტრალიზებს დოკუმენტირებულ უარყოფით სიგნალს "დავიწყება ნიშნავს, რომ ნაკლებად მნიშვნელოვანი ვარ", რომელიც სხვა შემთხვევაში დაამახინჯებდა ნდობისა და ინტელექტის მაჩვენებლებს. პროტოკოლი ითვალისწინებს მოვლენაზე-მგრძნობიარე და ქცევაზე-დამოკიდებულ ცვლადებს (პოსტ-ეპიზოდური მიკრო-შეფასებები, თვით-გამჟღავნების სიღრმე, ნებაყოფლობითი დაბრუნება და გამოყენება) და სავალდებულო დაკოდებულ ინტერვიუებს (სულ მცირე ორი კოდერის მიერ ანალიზი იმისა, შეამჩნიეს თუ არა მომხმარებლებმა და დააფასეს თუ არა მეხსიერების დინამიკა), რათა თვით-ანგარიშის ნულირებაც კი ცარიელი შედეგის ნაცვლად, ინტერპრეტაციადი დისოციაციის რუკა გახდეს.</w:t>
-      </w:r>
-    </w:p>
-    <w:p>
-      <w:pPr/>
-      <w:r>
-        <w:rPr>
-          <w:rFonts w:ascii="Sylfaen" w:hAnsi="Sylfaen" w:cs="Sylfaen"/>
-          <w:b w:val="0"/>
-          <w:sz w:val="24"/>
-        </w:rPr>
-        <w:t>ნიმუშის ზომა მიზანმიმართულად არ არის გათვლილი C &gt; B+-ის დასადასტურებლად. ა-პრიორი ძალის ანალიზი (F18) აჩვენებს, რომ ეს კონტრასტი, დიზაინში ყველაზე მცირე (dz ≈ 0.28, რომელიც "ცივი სტარტის" ეფექტით კიდევ უფრო მცირდება), ტრადიციული სტატისტიკური ძალის მქონე დეტექციისთვის n ≈ 116–159-ს მოითხოვდა, მაშინ როცა n ≈ 20 არის ნორმა ამ კლასის კვლევისთვის (F12) და ამ კონკრეტულ შედარებაზე მხოლოდ 2–12%-იან სტატისტიკურ ძალას იძლევა. შესაბამისად, პროტოკოლი გათვლილია იმ შედარებებისთვის, სადაც სიმძლავრე მიღწევადია — C &gt; A, და მიმართულებითი B+ &gt; B და C &gt; B — ხოლო C &gt; B+ განიხილება როგორც შეფასების სამიზნე (ეფექტის ზომა 95%-იანი ნდობის ინტერვალთან ერთად), ზუსტად ისე, როგორც ამას §3.1 და §3.7 მოითხოვს. ეს არის ამბიციური ამოცანისა და მიღწევადი ნიმუშის გულწრფელი შეთავსება, და ეს პროტოკოლში მითითებულია იმისთვის, რომ ზუსტი ნულოვანი ჰიპოთეზა აღიქმებოდეს მოსალოდნელ, გასააზრებელ შედეგად და არა პოსტფაქტუმ "გადარჩენად".</w:t>
+        <w:t>არქიტექტურა შეფასებულია სამი მიმართულებით, მზარდი ეკოლოგიური ამბიციითა და მიმდინარე შესრულებადობის კლებადი დონით: ტექნიკური შეფასება (წარმოდგენილია 4-ში), სიმულირებული მომხმარებლის შეფასება (წარმოდგენილია 4-ში, მკაფიოდ განსაზღვრული შეზღუდვებით) და შემუშავებული პროტოკოლი ადამიან-სუბიექტებისთვის (განმარტებულია აქ, გადავადებულია მომავალი ნაშრომისთვის). ეს დაყოფა მიზანმიმართულია: პირველი ორი მიმართულება იკვლევს მექანიზმებს და ქმნის ჰიპოთეზებს; მხოლოდ მესამე შეუძლია შეაფასოს აღქმის შესახებ გაკეთებული მტკიცებულებები, და ის ამ ნაშრომში არ სრულდება.</w:t>
+      </w:r>
+    </w:p>
+    <w:p>
+      <w:pPr/>
+      <w:r>
+        <w:rPr>
+          <w:rFonts w:ascii="Sylfaen" w:hAnsi="Sylfaen" w:cs="Sylfaen"/>
+          <w:b w:val="0"/>
+          <w:sz w:val="24"/>
+        </w:rPr>
+        <w:t>(ა) ტექნიკური შეფასება. ბენჩმარკის ტიპის შეფასება ოთხი პირობის მიხედვით ტარდება სინთეზურ მრავალსესიან დიალოგებზე და ზომავს რაოდენობის სამ კატეგორიას: აღდგენის ხარისხი (წინა სესიის შინაარსის ფაქტობრივი აღდგენა, 2.5-ის გრძელვადიანი მეხსიერების ბენჩმარკების მსგავსად); დროითი მსჯელობა (კატეგორია, რომელიც თანმიმდევრულად ყველაზე სუსტია LoCoMo-სა და LongMemEval-ში [1,2]); და ლატენტურობა (B, B+ და C-სთვის თითოეული რაუნდის სინქრონული გამოძახების დრო, რაც 3.4-ში მითითებულ პარიტეტს ადასტურებს). ლიტერატურაში მოყვანილი ორი გაფრთხილება გათვალისწინებულია. პირველი, რადგან გამოქვეყნებული მეხსიერების ტესტების შედეგები დაუჯერებელი აღმოჩნდა, ხოლო მათი ავტომატური შემფასებლები — შემწყნარებლები (F9, [32,33]), ჰარნესი თავის საკუთარ შეფასების პროცედურას ხელახლა ამოწმებს, ნაცვლად იმისა, რომ ხარვეზიანი პროცედურა მემკვიდრეობით მიიღოს, და ამ გაფრთხილების გათვალისწინებით აბსოლუტურ ქულებს წარმოადგენს. მეორე, ტექნიკური აღდგენის სიზუსტე პირდაპირ არ წარმოადგენს ნაშრომის სამიზნე შედეგს — სინამდვილეში, დიზაინი პროგნოზირებს, რომ C-ს განზრახვისამებრ შეიძლება B-ზე ნაკლები ტექსტის პირდაპირი ციტირება შეეძლოს — ამიტომ ეს მეტრიკები ახასიათებს მექანიზმებს და ამოწმებს, რომ C-ს დავიწყება ხარვეზული კი არა, დახვეწილია; ისინი არ წარმოადგენენ აღქმული ურთიერთკავშირის შედეგების მაჩვენებელს.</w:t>
+      </w:r>
+    </w:p>
+    <w:p>
+      <w:pPr/>
+      <w:r>
+        <w:rPr>
+          <w:rFonts w:ascii="Sylfaen" w:hAnsi="Sylfaen" w:cs="Sylfaen"/>
+          <w:b w:val="0"/>
+          <w:sz w:val="24"/>
+        </w:rPr>
+        <w:t>(ბ) სიმულირებული მომხმარებლის შეფასება. სოციალური კონსტრუქტების შესამოწმებლად ადამიანის მონაწილეობის გარეშე, ხელსაწყო გამოიყენება მრავალსესიან დიალოგებში, სადაც LLM მოქმედებს სიმულირებული მომხმარებლის როლში, ხოლო ცალკეული LLM-მსაჯული აფასებს თითოეულ პირობას 3.6-ის სოციალური კონსტრუქტების მიხედვით (სოციალური თანადგომა, ალიანსი, სანდოობა/ადამიანურობა, პლუს ინტელექტისა და კონფიდენციალურობის კრიტერიუმები). ეს მიმართულება განზრახ ეპისტემიკური თავმდაბლობითაა ჩარჩოში მოქცეული: ის სიმულირებული პროქსია და არა ადამიანის აღქმის შემცვლელი, და მას არ შეუძლია აღქმის ჰიპოთეზების ვალიდაცია. მისი გამოთქმული ვალიდურობის შეზღუდვები სამმაგია: დიდი ენის მოდელი (LLM) მსაჯულის შეფასებებს "სოციალური პრეზენციისა" ან "ნდობისა" ადამიანის გამოცდილებასთან უცნობი კორესპონდენცია აქვს და შესაძლოა ასახავდეს ზედაპირულ ტექსტურ მახასიათებლებს (მაგ., თავად წაკითხვადობას, რასაც B+ აკონტროლებს) და არა შეგრძნებულ ურთიერთობას; სიმულირებულ მომხმარებლებს არ გააჩნიათ რეალური მომხმარებლებისთვის დამახასიათებელი მნიშვნელოვანი ინტერესები, კვირების განმავლობაში დაგროვილი მეხსიერება და კონფიდენციალურობის მგრძნობელობა, ამიტომ ამ ნაშრომისთვის ცენტრალური (F4) ორმაგი ხასიათის მეხსიერების ეფექტები შესაძლოა არ გამოვლინდეს; და მოსამართლისა და გენერატორის მოდელებს შეიძლება ჰქონდეთ მიკერძოებები, რომლებიც ზრდის შეთანხმებას. შესაბამისად, სიმულირებული ნაწილი გამოიყენება იმისთვის, რომ (i) გადაამოწმოს, გამოიმუშავებს თუ არა პირობები განსხვავებად ქცევას, (ii) შექმნას და დახვეწოს პროგნოზები ადამიანური პროტოკოლისთვის, და (iii) ბოლომდე გამოცადოს ზუსტი ინსტრუმენტის ოპერაციალიზაცია (3.6). ნებისმიერი სიმულირებული C-B+ განსხვავება წარმოდგენილია როგორც მექანიზმის დონის სიგნალი და არასდროს — როგორც ადამიანის აღქმის შესახებ მტკიცებულება.</w:t>
+      </w:r>
+    </w:p>
+    <w:p>
+      <w:pPr/>
+      <w:r>
+        <w:rPr>
+          <w:rFonts w:ascii="Sylfaen" w:hAnsi="Sylfaen" w:cs="Sylfaen"/>
+          <w:b w:val="0"/>
+          <w:sz w:val="24"/>
+        </w:rPr>
+        <w:t>(გ) შემუშავებული პროტოკოლი ადამიანთა მონაწილეობით (მომავალი ნაშრომი). მიზნის აღქმითი მტკიცებულებები შეიძლება გადაწყდეს მხოლოდ ადამიანებზე ჩატარებული კვლევით, რომელსაც ეს ნაშრომი სრულად აღწერს, მაგრამ არ ახორციელებს. დიზაინი წარმოადგენს B-ს, B+, და C — სამი განყოფილება, სადაც A დაყვანილია მოკლე, წინასწარ განსაზღვრული კალიბრაციის შეხებამდე — n ≈ 20 მონაწილეზე, თითოეული პირობა გამოცდილია სრულ სამკვირიან ჰორიზონტზე, რათა C-ის ნელი ტემპით მიმდინარე კონსოლიდაციას გამოვლენის დრო ჰქონდეს, იზოლირებული საცავებით თითოეული პირობისთვის, დაბალანსებული თანმიმდევრობით, გამორეცხვის პერიოდით და წინასწარ რეგისტრირებული თანმიმდევრობის ეფექტის ტესტით გადატანის ეფექტის გასაკონტროლებლად. ძირითადი ინსტრუმენტია ხელოვნური სოციალური აგენტის კითხვარი [14] (3.6). დიზაინის ორი მახასიათებელი პირდაპირ გამომდინარეობს წნეხის ტესტიდან (F18): ანალიზი მიმართულია გვიან, კონსოლიდაციის შემდგომი პერიოდისკენ (და კონსოლიდაციის სიმჭიდროვით მოდერირებული ეფექტებისკენ), და არა პირობის შიდა ზოგადი საშუალოსკენ, რადგან სწორედ იქ ვლინდება მხოლოდ C-სთვის დამახასიათებელი ნებისმიერი ეფექტი; და თბილი, მიკუთვნადი დავიწყება წინასწარ რეგისტრირებული არქიტექტურული წესია, რათა რბილად გამოტოვებული ელემენტი განაპირობებდეს თბილ, ნაწილობრივ აღიარებას ("დეტალები არ მახსოვს, მაგრამ ვიცი, რომ შენთვის მნიშვნელოვანი იყო") და არა სრულ დავიწყებას, რაც ნეიტრალიზებს დოკუმენტირებულ უარყოფით სიგნალს "დავიწყება ნიშნავს, რომ ნაკლებად მნიშვნელოვანი ვარ", რომელიც სხვა შემთხვევაში დაამახინჯებდა ნდობისა და ინტელექტის მაჩვენებლებს. პროტოკოლი ითვალისწინებს მოვლენაზე-მგრძნობიარე და ქცევაზე-დამოკიდებულ ცვლადებს (პოსტ-ეპიზოდური მიკრო-შეფასებები, თვით-გამჟღავნების სიღრმე, ნებაყოფლობითი დაბრუნება და გამოყენება) და სავალდებულო დაკოდებულ ინტერვიუებს (სულ მცირე ორი კოდერის მიერ ანალიზი იმისა, შეამჩნიეს თუ არა მომხმარებლებმა და დააფასეს თუ არა მეხსიერების დინამიკა), რათა თვით-ანგარიშის ნულირებაც კი ცარიელი შედეგის ნაცვლად, ინტერპრეტაციადი დისოციაციის რუკა გახდეს.</w:t>
+      </w:r>
+    </w:p>
+    <w:p>
+      <w:pPr/>
+      <w:r>
+        <w:rPr>
+          <w:rFonts w:ascii="Sylfaen" w:hAnsi="Sylfaen" w:cs="Sylfaen"/>
+          <w:b w:val="0"/>
+          <w:sz w:val="24"/>
+        </w:rPr>
+        <w:t>ნიმუშის ზომა მიზანმიმართულად არ არის გათვლილი C &gt; B+-ის დასადასტურებლად. ა-პრიორი ძალის ანალიზი (F18) აჩვენებს, რომ ეს კონტრასტი, დიზაინში ყველაზე მცირე (dz ≈ 0.28, რომელიც "ცივი სტარტის" ეფექტით კიდევ უფრო მცირდება), ტრადიციული სტატისტიკური ძალის მქონე დეტექციისთვის n ≈ 116–159-ს მოითხოვდა, მაშინ როცა n ≈ 20 არის ნორმა ამ კლასის კვლევისთვის (F12) და ამ კონკრეტულ შედარებაზე მხოლოდ 2–12%-იან სტატისტიკურ ძალას იძლევა. შესაბამისად, პროტოკოლი გათვლილია იმ შედარებებისთვის, სადაც სიმძლავრე მიღწევადია — C &gt; A, და მიმართულებითი B+ &gt; B და C &gt; B — ხოლო C &gt; B+ განიხილება როგორც შეფასების სამიზნე (ეფექტის ზომა 95%-იანი ნდობის ინტერვალთან ერთად), ზუსტად ისე, როგორც ამას 3.1 და 3.7 მოითხოვს. ეს არის ამბიციური ამოცანისა და მიღწევადი ნიმუშის გულწრფელი შეთავსება, და ეს პროტოკოლში მითითებულია იმისთვის, რომ ზუსტი ნულოვანი ჰიპოთეზა აღიქმებოდეს მოსალოდნელ, გასააზრებელ შედეგად და არა პოსტფაქტუმ "გადარჩენად".</w:t>
       </w:r>
     </w:p>
     <w:p>
       <w:pPr>
         <w:pStyle w:val="Heading2"/>
+        <w:numPr>
+          <w:numId w:val="0"/>
+        </w:numPr>
       </w:pPr>
       <w:r>
         <w:rPr>
@@ -4073,7 +4146,7 @@
           <w:b w:val="0"/>
           <w:sz w:val="24"/>
         </w:rPr>
-        <w:t>•  მომხმარებლისა და აგენტის ალიანსი — კავშირის, მიზნებისა და ამოცანებზე ორიენტირებული სამუშაო ურთიერთობა, რომელიც შეიძლება შევავსოთ WAI-SR ადაპტაციით (იხ. §2.6);</w:t>
+        <w:t>•  მომხმარებლისა და აგენტის ალიანსი — კავშირის, მიზნებისა და ამოცანებზე ორიენტირებული სამუშაო ურთიერთობა, რომელიც შეიძლება შევავსოთ WAI-SR ადაპტაციით (იხ. 2.6);</w:t>
       </w:r>
     </w:p>
     <w:p>
@@ -4095,23 +4168,26 @@
           <w:b w:val="0"/>
           <w:sz w:val="24"/>
         </w:rPr>
-        <w:t>მეორადი და საკონტროლო კონსტრუქტები, §1.2-ის მეორადი ჰიპოთეზების შესაბამისად, იზომება პარალელურად: აღქმული ინტელექტი Godspeed-ის ინტელექტის ქვესკალის მეშვეობით (იხ. §2.6) (მიზნად ისახავს H2a-ს, რომლის მიხედვითაც ვერბატიმ RAG-ის ქულები ყველაზე მაღალია ინტელექტის მიხედვით), და კონფიდენციალურობასთან დაკავშირებული კომფორტი და ნდობა [11]-დან ადაპტირებული კოქსის სტილის კონფიდენციალურობის პუნქტების საშუალებით (მიზნად ისახავს H2b-ს, რომლის მიხედვითაც ვერბატიმ გახსენების ქულები ყველაზე დაბალია ნდობასა და კონფიდენციალურობის კომფორტში — პროგნოზი, რომლის გადასაჭრელადაც §3.2-ის გისტი/საყრდენი წარმოდგენაა შექმნილი). აღქმული ადამიანურობა შესაძლოა დამატებით გადამოწმდეს Godspeed-ის ანთროპომორფიზმთან მიმართებით, სადაც Godspeed-ი, მისი დოკუმენტირებული კრიტიკის (F11) გამო, ფსიქომეტრულად მეორეხარისხოვნად განიხილება. ჰიპოთეზებისა და ინსტრუმენტების რუკა, მონაცემთა შეგროვებამდე, განსაზღვრავს, თუ რომელ ქვესკალას ქულებს მიიღებს თითოეული ჰიპოთეზა.</w:t>
-      </w:r>
-    </w:p>
-    <w:p>
-      <w:pPr/>
-      <w:r>
-        <w:rPr>
-          <w:rFonts w:ascii="Sylfaen" w:hAnsi="Sylfaen" w:cs="Sylfaen"/>
-          <w:b w:val="0"/>
-          <w:sz w:val="24"/>
-        </w:rPr>
-        <w:t>სიმულირებული ნაწილისთვის (§3.5b), იგივე კონსტრუქტები ოპერაციულად არის განხორციელებული, როგორც დიდი ენის მოდელის (LLM) მოსამართლის პროტოკოლი: მოსამართლეს ეძლევა რუბრიკა, რომელიც ASAQ-ის, Godspeed-ისა და Cox-ის ქვესკალებიდან ელემენტების მიხედვით არის შედგენილი, და ის ტრანსკრიპტებს შესაბამის მასშტაბებზე აფასებს, რათა სიმულირებულმა და ადამიანურმა ტრაექტორიებმა ზუსტად იდენტური საზომი განმარტება გაიზიარონ. მსაჯულის ოპერაციონალიზაცია სრულად არის წარმოდგენილი — რუბრიკა, მასშტაბის ანკერები, ინსტრუქცია და მსაჯულის საიმედოობის შემოწმება ადამიანის ანოტატორების მიერ ერთობლივად შეფასებული ტრანსკრიპტების მცირე, გამოყოფილი ნაკრების წინააღმდეგ — სწორედ იმიტომ, რომ ბენჩმარკის სანდოობის კრიზისი (F9) აჩვენებს, რომ არავალიდური LLM მსაჯული არასანდოა. როდესაც ასეთი ადამიანური ვალიდაცია არ არსებობს, სიმულირებული შეფასებები წარმოდგენილია მხოლოდ როგორც ქცევითი განასხვავებადობის სიგნალები, კონსტრუქტის დონეზე ინტერპრეტაციის გარეშე. სიმულირებული შეფასებები წარმოდგენილია მკაცრად §3.5(b)-ის ვალიდურობის ლიმიტების ფარგლებში.</w:t>
+        <w:t>მეორადი და საკონტროლო კონსტრუქტები, 1.2-ის მეორადი ჰიპოთეზების შესაბამისად, იზომება პარალელურად: აღქმული ინტელექტი Godspeed-ის ინტელექტის ქვესკალის მეშვეობით (იხ. 2.6) (მიზნად ისახავს H2a-ს, რომლის მიხედვითაც ვერბატიმ RAG-ის ქულები ყველაზე მაღალია ინტელექტის მიხედვით), და კონფიდენციალურობასთან დაკავშირებული კომფორტი და ნდობა [11]-დან ადაპტირებული კოქსის სტილის კონფიდენციალურობის პუნქტების საშუალებით (მიზნად ისახავს H2b-ს, რომლის მიხედვითაც ვერბატიმ გახსენების ქულები ყველაზე დაბალია ნდობასა და კონფიდენციალურობის კომფორტში — პროგნოზი, რომლის გადასაჭრელადაც 3.2-ის გისტი/საყრდენი წარმოდგენაა შექმნილი). აღქმული ადამიანურობა შესაძლოა დამატებით გადამოწმდეს Godspeed-ის ანთროპომორფიზმთან მიმართებით, სადაც Godspeed-ი, მისი დოკუმენტირებული კრიტიკის (F11) გამო, ფსიქომეტრულად მეორეხარისხოვნად განიხილება. ჰიპოთეზებისა და ინსტრუმენტების რუკა, მონაცემთა შეგროვებამდე, განსაზღვრავს, თუ რომელ ქვესკალას ქულებს მიიღებს თითოეული ჰიპოთეზა.</w:t>
+      </w:r>
+    </w:p>
+    <w:p>
+      <w:pPr/>
+      <w:r>
+        <w:rPr>
+          <w:rFonts w:ascii="Sylfaen" w:hAnsi="Sylfaen" w:cs="Sylfaen"/>
+          <w:b w:val="0"/>
+          <w:sz w:val="24"/>
+        </w:rPr>
+        <w:t>სიმულირებული ნაწილისთვის (3.5b), იგივე კონსტრუქტები ოპერაციულად არის განხორციელებული, როგორც დიდი ენის მოდელის (LLM) მოსამართლის პროტოკოლი: მოსამართლეს ეძლევა რუბრიკა, რომელიც ASAQ-ის, Godspeed-ისა და Cox-ის ქვესკალებიდან ელემენტების მიხედვით არის შედგენილი, და ის ტრანსკრიპტებს შესაბამის მასშტაბებზე აფასებს, რათა სიმულირებულმა და ადამიანურმა ტრაექტორიებმა ზუსტად იდენტური საზომი განმარტება გაიზიარონ. მსაჯულის ოპერაციონალიზაცია სრულად არის წარმოდგენილი — რუბრიკა, მასშტაბის ანკერები, ინსტრუქცია და მსაჯულის საიმედოობის შემოწმება ადამიანის ანოტატორების მიერ ერთობლივად შეფასებული ტრანსკრიპტების მცირე, გამოყოფილი ნაკრების წინააღმდეგ — სწორედ იმიტომ, რომ ბენჩმარკის სანდოობის კრიზისი (F9) აჩვენებს, რომ არავალიდური LLM მსაჯული არასანდოა. როდესაც ასეთი ადამიანური ვალიდაცია არ არსებობს, სიმულირებული შეფასებები წარმოდგენილია მხოლოდ როგორც ქცევითი განასხვავებადობის სიგნალები, კონსტრუქტის დონეზე ინტერპრეტაციის გარეშე. სიმულირებული შეფასებები წარმოდგენილია მკაცრად 3.5(b)-ის ვალიდურობის ლიმიტების ფარგლებში.</w:t>
       </w:r>
     </w:p>
     <w:p>
       <w:pPr>
         <w:pStyle w:val="Heading2"/>
+        <w:numPr>
+          <w:numId w:val="0"/>
+        </w:numPr>
       </w:pPr>
       <w:r>
         <w:rPr>
@@ -4130,7 +4206,7 @@
           <w:b w:val="0"/>
           <w:sz w:val="24"/>
         </w:rPr>
-        <w:t>ანალიზი ეფუძნება "შეფასება-პირველად" ფილოსოფიას, რომელიც შეესაბამება §3.1-ის ინფერენციულ პოზიციას. ყოველი პირობითი კონტრასტისთვის, მთავარ წარმოდგენილ მაჩვენებელს წარმოადგენს ეფექტის ზომა (კოენისა dz შიდა-სუბიექტური კონტრასტებისთვის), 95%-იანი სანდო ინტერვალთან ერთად, და არა დიქოტომიური მნიშვნელობის შეფასება. დამადასტურებელი შედარებებისთვის, სადაც არსებობს მძლავრობა (C &gt; A; მიმართულებითი B+ &gt; B და C &gt; B), შეფასებასთან ერთად მოცემულია ჰოლმის კორექტირებული ჰიპოთეზის ტესტი. ცენტრალური C &gt; B+ კონტრასტისთვის ინტერვალთან ერთად მხოლოდ შეფასება ინტერპრეტირდება, სიზუსტისა და ეკვივალენტურობის ლოგიკის გამოყენებით: ნულზე გადაჭიმული ვიწრო ინტერვალი განიხილება მტკიცებულებად იმისა, რომ ადამიანის მეხსიერების დინამიკა კურატორული სტატიკური მეხსიერების მიმართ შედარებით მცირე აღქმითი მარჟინით გამოირჩევა და — §3.1-თან შესაბამისად — ეს ნული წარმოდგენილია, როგორც მნიშვნელოვანი აღმოჩენა, რომლის ინტერპრეტაციისთვისაც B+ კონტროლი იყო შექმნილი, ხოლო ნულის დამუშავების წესი წინასწარ იყო რეგისტრირებული, რათა ის მოსალოდნელი აღმოჩენად წავიკითხოთ. სადაც გამოიყენება გადავადებული პროტოკოლის გვიანი-ფანჯრის და კონსოლიდაციის-სიმკვრივის-კონტროლირებადი ანალიზები (§3.5c), კონსოლიდაციის სიმკვრივე, თითოეული დონის გამოძახების წილი, სალიენსის ჩაწერის სიხშირე და ეფექტური ისტორიის-ფარვა შეყვანილია წინასწარ რეგისტრირებულ კოვარიატებად.</w:t>
+        <w:t>ანალიზი ეფუძნება "შეფასება-პირველად" ფილოსოფიას, რომელიც შეესაბამება 3.1-ის ინფერენციულ პოზიციას. ყოველი პირობითი კონტრასტისთვის, მთავარ წარმოდგენილ მაჩვენებელს წარმოადგენს ეფექტის ზომა (კოენისა dz შიდა-სუბიექტური კონტრასტებისთვის), 95%-იანი სანდო ინტერვალთან ერთად, და არა დიქოტომიური მნიშვნელობის შეფასება. დამადასტურებელი შედარებებისთვის, სადაც არსებობს მძლავრობა (C &gt; A; მიმართულებითი B+ &gt; B და C &gt; B), შეფასებასთან ერთად მოცემულია ჰოლმის კორექტირებული ჰიპოთეზის ტესტი. ცენტრალური C &gt; B+ კონტრასტისთვის ინტერვალთან ერთად მხოლოდ შეფასება ინტერპრეტირდება, სიზუსტისა და ეკვივალენტურობის ლოგიკის გამოყენებით: ნულზე გადაჭიმული ვიწრო ინტერვალი განიხილება მტკიცებულებად იმისა, რომ ადამიანის მეხსიერების დინამიკა კურატორული სტატიკური მეხსიერების მიმართ შედარებით მცირე აღქმითი მარჟინით გამოირჩევა და — 3.1-თან შესაბამისად — ეს ნული წარმოდგენილია, როგორც მნიშვნელოვანი აღმოჩენა, რომლის ინტერპრეტაციისთვისაც B+ კონტროლი იყო შექმნილი, ხოლო ნულის დამუშავების წესი წინასწარ იყო რეგისტრირებული, რათა ის მოსალოდნელი აღმოჩენად წავიკითხოთ. სადაც გამოიყენება გადავადებული პროტოკოლის გვიანი-ფანჯრის და კონსოლიდაციის-სიმკვრივის-კონტროლირებადი ანალიზები (3.5c), კონსოლიდაციის სიმკვრივე, თითოეული დონის გამოძახების წილი, სალიენსის ჩაწერის სიხშირე და ეფექტური ისტორიის-ფარვა შეყვანილია წინასწარ რეგისტრირებულ კოვარიატებად.</w:t>
       </w:r>
     </w:p>
     <w:p>
@@ -4158,6 +4234,9 @@
     <w:p>
       <w:pPr>
         <w:pStyle w:val="Heading2"/>
+        <w:numPr>
+          <w:numId w:val="0"/>
+        </w:numPr>
       </w:pPr>
       <w:r>
         <w:rPr>
@@ -4176,7 +4255,7 @@
           <w:b w:val="0"/>
           <w:sz w:val="24"/>
         </w:rPr>
-        <w:t>ამ სადისერტაციო ნაშრომში არ არის შეგროვებული ადამიანთა მონაწილეობით მიღებული მონაცემები. ნაშრომი წარმოადგენს დიზაინს, კონცეფციის დამტკიცების მექანიზმს და ტექნიკურ და სიმულირებულ შეფასებას; §3.5(c) პუნქტით გათვალისწინებული ადამიანთა მონაწილეობით კვლევა არის განსაზღვრული პროტოკოლი, რომელიც მომავალი სამუშაოსთვისაა დატოვებული. შესაბამისად, ეთიკური ვალდებულებები, რომლებიც დაკავშირებულია გადავადებულ კვლევასთან — ინფორმირებული თანხმობა, თვითგამჟღავნების მართვა, რასაც საგულისხმოდ არის შექმნილი "სალიენსის" რუბრიკა, მონაწილეთა მონაცემთა იზოლაცია და სახელწოდებათა სეგრეგაცია, მონაწილეობის შეწყვეტისა და მეხსიერების საცავის წაშლის უფლება, და ინსტიტუციური განხილვა — განისაზღვრება, როგორც ამ მომავალი კვლევის წინაპირობები და არა როგორც აქ გატარებული ზომები. გრძელვადიანი მეხსიერების კონფიდენციალურობისადმი მგრძნობიარე ბუნება, რომელიც აღრიცხავს იმას, რასაც მომხმარებლები კვირების განმავლობაში ამხელენ, თავად არის კვლევის ობიექტის ნაწილი (კოქსის კონფიდენციალურობის დასკვნა [11] და §3.2-ის "ბუნდოვანი კვალი" პრინციპი), რაც, და არა ნაკლებად, ამძიმებს ვალდებულებას, კვლევის საბოლოო ჩატარებისას ამ მონაცემებს განსაკუთრებული სიფრთხილით მოვეკიდოთ.</w:t>
+        <w:t>ამ სადისერტაციო ნაშრომში არ არის შეგროვებული ადამიანთა მონაწილეობით მიღებული მონაცემები. ნაშრომი წარმოადგენს დიზაინს, კონცეფციის დამტკიცების მექანიზმს და ტექნიკურ და სიმულირებულ შეფასებას; 3.5(c) პუნქტით გათვალისწინებული ადამიანთა მონაწილეობით კვლევა არის განსაზღვრული პროტოკოლი, რომელიც მომავალი სამუშაოსთვისაა დატოვებული. შესაბამისად, ეთიკური ვალდებულებები, რომლებიც დაკავშირებულია გადავადებულ კვლევასთან — ინფორმირებული თანხმობა, თვითგამჟღავნების მართვა, რასაც საგულისხმოდ არის შექმნილი "სალიენსის" რუბრიკა, მონაწილეთა მონაცემთა იზოლაცია და სახელწოდებათა სეგრეგაცია, მონაწილეობის შეწყვეტისა და მეხსიერების საცავის წაშლის უფლება, და ინსტიტუციური განხილვა — განისაზღვრება, როგორც ამ მომავალი კვლევის წინაპირობები და არა როგორც აქ გატარებული ზომები. გრძელვადიანი მეხსიერების კონფიდენციალურობისადმი მგრძნობიარე ბუნება, რომელიც აღრიცხავს იმას, რასაც მომხმარებლები კვირების განმავლობაში ამხელენ, თავად არის კვლევის ობიექტის ნაწილი (კოქსის კონფიდენციალურობის დასკვნა [11] და 3.2-ის "ბუნდოვანი კვალი" პრინციპი), რაც, და არა ნაკლებად, ამძიმებს ვალდებულებას, კვლევის საბოლოო ჩატარებისას ამ მონაცემებს განსაკუთრებული სიფრთხილით მოვეკიდოთ.</w:t>
       </w:r>
     </w:p>
     <w:p>
@@ -4198,35 +4277,38 @@
           <w:b w:val="0"/>
           <w:sz w:val="24"/>
         </w:rPr>
-        <w:t>შეფასების-ვალიდურობის შეზღუდვები. სიმულირებული მომხმარებლის ტრაექტორია (§3.5b) არის ადამიანის აღქმისადმი უცნობი სიზუსტის პროქსი: LLM-ის მსაჯულმა შეიძლება შეაფასოს ზედაპირული გასაგებობა და არა აღქმული ურთიერთობის ხარისხი — სწორედ ამ კონფუუდის გასაკონტროლებლად არსებობს B+ — და სიმულირებულ მომხმარებლებს არ გააჩნიათ ისეთი მნიშვნელოვანი ფაქტორები, დროითი სიღრმე და კონფიდენციალურობასთან დაკავშირებული მგრძნობელობა, რაც რეალურ გამოყენებაში მეხსიერებას ორპირს ხდის (F4). სიმულირებული ნაწილიდან არცერთი აღქმითი დასკვნა არ გამომდინარეობს; ის მხოლოდ ჰიპოთეზებს ქმნის და ინსტრუმენტს ამოწმებს, მეტი არაფერი. ტექნიკური მიმართულება ზომავს ფაქტობრივ გახსენებასა და შეფერხებას, რასაც დიზაინი განზრახ არ აიგივებს აღქმული ურთიერთობის ხარისხთან, და ის მიმდინარეობს სინთეზური დიალოგების მეშვეობით, რომელთა განაწილება შესაძლოა არ ემთხვეოდეს რეალურ მრავალსესიან ხმოვან ურთიერთობას.</w:t>
-      </w:r>
-    </w:p>
-    <w:p>
-      <w:pPr/>
-      <w:r>
-        <w:rPr>
-          <w:rFonts w:ascii="Sylfaen" w:hAnsi="Sylfaen" w:cs="Sylfaen"/>
-          <w:b w:val="0"/>
-          <w:sz w:val="24"/>
-        </w:rPr>
-        <w:t>ინფერენციული შეზღუდვები. შესრულების შემთხვევაშიც კი, ადამიანური პროტოკოლი არ არის საკმარისად მძლავრი ცენტრალური C &gt; B+ კონტრასტის (§3.1, §3.5c) დასადასტურებლად; ეს კონტრასტი შეფასების სამიზნეა, და დისერტაციის დამადასტურებელი მტკიცებები შემოიფარგლება უფრო მძლავრი შედარებებით. §1-ში დადგენილი ერთენოვანი, ერთმოდალური მასშტაბი (ინგლისური, მხოლოდ ხმა) გარე ვალიდურობას ზღუდავს გამოცდილი პირობით.</w:t>
-      </w:r>
-    </w:p>
-    <w:p>
-      <w:pPr/>
-      <w:r>
-        <w:rPr>
-          <w:rFonts w:ascii="Sylfaen" w:hAnsi="Sylfaen" w:cs="Sylfaen"/>
-          <w:b w:val="0"/>
-          <w:sz w:val="24"/>
-        </w:rPr>
-        <w:t>თეორიისადმი ერთგულების შეზღუდვები. როგორც §3.2-შია დეტალურად აღწერილი, პროფილი C თავის ხუთი საწყისი თეორიას აერთიანებდა კი არ, არამედ ქმნიდა მათგან ახალს და სამ სახელდებულ გამოტოვებას ახდენს: ის გამოტოვებს ინტერფერენციას, ადამიანის დავიწყების დომინანტურ დინამიკას, და მხოლოდ დროისა და სალიენსის დაქვეითებას მოდელირებს; მისი სიზუსტეზე ორიენტირებული კონსოლიდაცია მიზანმიმართულად თრგუნავს რეკონსტრუქციულ და სქემაზე დაფუძნებულ დამახინჯებას, რასაც ყველაზე მკაფიოდ პროგნოზირებს ბუნდოვანი კვალითა და კომპლემენტარული სწავლის სისტემები, და ცოდნილ რეალიზმს ადამიანურობის ღერძზე ცვლის ყალბი, ზოგადი გამონათქვამების დამაჯერებლად წარმოდგენის უსაფრთხოებით; და ის დროის თანმიმდევრობისა და წყაროს მეხსიერებას მხოლოდ სუსტად ასახავს. კომპლემენტარული სწავლების სისტემების საფუძველი მოხმობილია მისი ეპიზოდურიდან სემანტიკურზე გადაცემის ფუნქციის სულისკვეთებით და არა როგორც ჩართული, ინტერფერენციისგან დაცული კორტიკალური სწავლების მტკიცება, ხოლო კოდირების დროის სალიენსის მექანიზმი აღიარებულია როგორც დამუშავების დონეების ეფექტი, ისევე როგორც მოდალური მოდელისა. ეს არის პრინციპული საინჟინრო არჩევანი, რომელიც გამჟღავნებულია იმისთვის, რომ არქიტექტურის კოგნიტური დასაბუთების მტკიცება აღიქმებოდეს როგორც პროექტირების ეტაპზე მიღებული შთაგონება გაზომვადი ქცევითი ნიშნულებით, §2.2-თან შესაბამისობაში, და არა როგორც ფსიქოლოგიური ერთგულების მტკიცება. თითოეული გამოტოვება, შესაბამისად, მომავალი მუშაობის კონკრეტული მიმართულებაა.</w:t>
+        <w:t>შეფასების-ვალიდურობის შეზღუდვები. სიმულირებული მომხმარებლის ტრაექტორია (3.5b) არის ადამიანის აღქმისადმი უცნობი სიზუსტის პროქსი: LLM-ის მსაჯულმა შეიძლება შეაფასოს ზედაპირული გასაგებობა და არა აღქმული ურთიერთობის ხარისხი — სწორედ ამ კონფუუდის გასაკონტროლებლად არსებობს B+ — და სიმულირებულ მომხმარებლებს არ გააჩნიათ ისეთი მნიშვნელოვანი ფაქტორები, დროითი სიღრმე და კონფიდენციალურობასთან დაკავშირებული მგრძნობელობა, რაც რეალურ გამოყენებაში მეხსიერებას ორპირს ხდის (F4). სიმულირებული ნაწილიდან არცერთი აღქმითი დასკვნა არ გამომდინარეობს; ის მხოლოდ ჰიპოთეზებს ქმნის და ინსტრუმენტს ამოწმებს, მეტი არაფერი. ტექნიკური მიმართულება ზომავს ფაქტობრივ გახსენებასა და შეფერხებას, რასაც დიზაინი განზრახ არ აიგივებს აღქმული ურთიერთობის ხარისხთან, და ის მიმდინარეობს სინთეზური დიალოგების მეშვეობით, რომელთა განაწილება შესაძლოა არ ემთხვეოდეს რეალურ მრავალსესიან ხმოვან ურთიერთობას.</w:t>
+      </w:r>
+    </w:p>
+    <w:p>
+      <w:pPr/>
+      <w:r>
+        <w:rPr>
+          <w:rFonts w:ascii="Sylfaen" w:hAnsi="Sylfaen" w:cs="Sylfaen"/>
+          <w:b w:val="0"/>
+          <w:sz w:val="24"/>
+        </w:rPr>
+        <w:t>ინფერენციული შეზღუდვები. შესრულების შემთხვევაშიც კი, ადამიანური პროტოკოლი არ არის საკმარისად მძლავრი ცენტრალური C &gt; B+ კონტრასტის (3.1, 3.5c) დასადასტურებლად; ეს კონტრასტი შეფასების სამიზნეა, და დისერტაციის დამადასტურებელი მტკიცებები შემოიფარგლება უფრო მძლავრი შედარებებით. 1-ში დადგენილი ერთენოვანი, ერთმოდალური მასშტაბი (ინგლისური, მხოლოდ ხმა) გარე ვალიდურობას ზღუდავს გამოცდილი პირობით.</w:t>
+      </w:r>
+    </w:p>
+    <w:p>
+      <w:pPr/>
+      <w:r>
+        <w:rPr>
+          <w:rFonts w:ascii="Sylfaen" w:hAnsi="Sylfaen" w:cs="Sylfaen"/>
+          <w:b w:val="0"/>
+          <w:sz w:val="24"/>
+        </w:rPr>
+        <w:t>თეორიისადმი ერთგულების შეზღუდვები. როგორც 3.2-შია დეტალურად აღწერილი, პროფილი C თავის ხუთი საწყისი თეორიას აერთიანებდა კი არ, არამედ ქმნიდა მათგან ახალს და სამ სახელდებულ გამოტოვებას ახდენს: ის გამოტოვებს ინტერფერენციას, ადამიანის დავიწყების დომინანტურ დინამიკას, და მხოლოდ დროისა და სალიენსის დაქვეითებას მოდელირებს; მისი სიზუსტეზე ორიენტირებული კონსოლიდაცია მიზანმიმართულად თრგუნავს რეკონსტრუქციულ და სქემაზე დაფუძნებულ დამახინჯებას, რასაც ყველაზე მკაფიოდ პროგნოზირებს ბუნდოვანი კვალითა და კომპლემენტარული სწავლის სისტემები, და ცოდნილ რეალიზმს ადამიანურობის ღერძზე ცვლის ყალბი, ზოგადი გამონათქვამების დამაჯერებლად წარმოდგენის უსაფრთხოებით; და ის დროის თანმიმდევრობისა და წყაროს მეხსიერებას მხოლოდ სუსტად ასახავს. კომპლემენტარული სწავლების სისტემების საფუძველი მოხმობილია მისი ეპიზოდურიდან სემანტიკურზე გადაცემის ფუნქციის სულისკვეთებით და არა როგორც ჩართული, ინტერფერენციისგან დაცული კორტიკალური სწავლების მტკიცება, ხოლო კოდირების დროის სალიენსის მექანიზმი აღიარებულია როგორც დამუშავების დონეების ეფექტი, ისევე როგორც მოდალური მოდელისა. ეს არის პრინციპული საინჟინრო არჩევანი, რომელიც გამჟღავნებულია იმისთვის, რომ არქიტექტურის კოგნიტური დასაბუთების მტკიცება აღიქმებოდეს როგორც პროექტირების ეტაპზე მიღებული შთაგონება გაზომვადი ქცევითი ნიშნულებით, 2.2-თან შესაბამისობაში, და არა როგორც ფსიქოლოგიური ერთგულების მტკიცება. თითოეული გამოტოვება, შესაბამისად, მომავალი მუშაობის კონკრეტული მიმართულებაა.</w:t>
       </w:r>
     </w:p>
     <w:p>
       <w:pPr>
         <w:pStyle w:val="Heading1"/>
         <w:pageBreakBefore/>
+        <w:numPr>
+          <w:numId w:val="0"/>
+        </w:numPr>
       </w:pPr>
       <w:r>
         <w:rPr>
@@ -4245,12 +4327,15 @@
           <w:b w:val="0"/>
           <w:sz w:val="24"/>
         </w:rPr>
-        <w:t>ეს თავი წარმოადგენს კონცეფციის დამტკიცების იმპლემენტაციასა და მის ორხაზიან შეფასებას (§3.4–§3.5) და განიხილავს, თუ რას ამტკიცებენ შედეგები და — არანაკლებ მნიშვნელოვანია — რას არ ამტკიცებენ. დიზაინი მიზანმიმართულად არ ამყარებს თავის ცენტრალურ აღქმით პრეტენზიას ამ შეფასებაზე (§3.1); ტექნიკური მიმართულება აჩვენებს, რომ მექანიზმები ფუნქციონირებს დიზაინის შესაბამისად და განასხვავებადია პირობების მიხედვით, ხოლო სიმულაციური მიმართულება ერთდროულად აფასებს აღქმითი ეფექტების მიმართულებას და, ერთი მხრივ, იძლევა არსებით მეთოდოლოგიურ შედეგს თავად სიმულაციური შეფასების შეზღუდვების შესახებ.</w:t>
+        <w:t>ეს თავი წარმოადგენს კონცეფციის დამტკიცების იმპლემენტაციასა და მის ორხაზიან შეფასებას (3.4–3.5) და განიხილავს, თუ რას ამტკიცებენ შედეგები და — არანაკლებ მნიშვნელოვანია — რას არ ამტკიცებენ. დიზაინი მიზანმიმართულად არ ამყარებს თავის ცენტრალურ აღქმით პრეტენზიას ამ შეფასებაზე (3.1); ტექნიკური მიმართულება აჩვენებს, რომ მექანიზმები ფუნქციონირებს დიზაინის შესაბამისად და განასხვავებადია პირობების მიხედვით, ხოლო სიმულაციური მიმართულება ერთდროულად აფასებს აღქმითი ეფექტების მიმართულებას და, ერთი მხრივ, იძლევა არსებით მეთოდოლოგიურ შედეგს თავად სიმულაციური შეფასების შეზღუდვების შესახებ.</w:t>
       </w:r>
     </w:p>
     <w:p>
       <w:pPr>
         <w:pStyle w:val="Heading2"/>
+        <w:numPr>
+          <w:numId w:val="0"/>
+        </w:numPr>
       </w:pPr>
       <w:r>
         <w:rPr>
@@ -4280,7 +4365,7 @@
           <w:b w:val="0"/>
           <w:sz w:val="24"/>
         </w:rPr>
-        <w:t>ცხრილი 4.1 აჩვენებს ჩარჩოს ერთგულებას §3.2-ის სრული არქიტექტურის მიმართ, სადაც გულწრფელად არის გამიჯნული, თუ რა არის იმპლემენტირებული და რა გადავადებული (F18-ის ყველაზე იაფი, მისაღები ვარიანტის მიხედვით).</w:t>
+        <w:t>ცხრილი 4.1 აჩვენებს ჩარჩოს ერთგულებას 3.2-ის სრული არქიტექტურის მიმართ, სადაც გულწრფელად არის გამიჯნული, თუ რა არის იმპლემენტირებული და რა გადავადებული (F18-ის ყველაზე იაფი, მისაღები ვარიანტის მიხედვით).</w:t>
       </w:r>
     </w:p>
     <w:p>
@@ -4293,12 +4378,13 @@
           <w:b/>
           <w:sz w:val="22"/>
         </w:rPr>
-        <w:t>ცხრილი 4.1. კონცეფციის დამტკიცების ერთგულება §3.2-ის სრული არქიტექტურის მიმართ</w:t>
+        <w:t>ცხრილი 4.1. კონცეფციის დამტკიცების ერთგულება 3.2-ის სრული არქიტექტურის მიმართ</w:t>
       </w:r>
     </w:p>
     <w:tbl>
       <w:tblPr>
         <w:tblW w:type="auto" w:w="0"/>
+        <w:tblLayout w:type="fixed"/>
         <w:tblLook w:firstColumn="1" w:firstRow="1" w:lastColumn="0" w:lastRow="0" w:noHBand="0" w:noVBand="1" w:val="04A0"/>
         <w:tblBorders>
           <w:top w:val="single" w:sz="4" w:space="0" w:color="000000"/>
@@ -4308,15 +4394,16 @@
           <w:insideH w:val="single" w:sz="4" w:space="0" w:color="000000"/>
           <w:insideV w:val="single" w:sz="4" w:space="0" w:color="000000"/>
         </w:tblBorders>
+        <w:tblLayout w:type="fixed"/>
       </w:tblPr>
       <w:tblGrid>
-        <w:gridCol w:w="4166"/>
-        <w:gridCol w:w="4166"/>
+        <w:gridCol w:w="4167"/>
+        <w:gridCol w:w="4167"/>
       </w:tblGrid>
       <w:tr>
         <w:tc>
           <w:tcPr>
-            <w:tcW w:type="dxa" w:w="4166"/>
+            <w:tcW w:type="dxa" w:w="4167"/>
           </w:tcPr>
           <w:p>
             <w:pPr>
@@ -4328,13 +4415,13 @@
                 <w:b/>
                 <w:sz w:val="22"/>
               </w:rPr>
-              <w:t>მექანიზმი (§3.2)</w:t>
+              <w:t>მექანიზმი (3.2)</w:t>
             </w:r>
           </w:p>
         </w:tc>
         <w:tc>
           <w:tcPr>
-            <w:tcW w:type="dxa" w:w="4166"/>
+            <w:tcW w:type="dxa" w:w="4167"/>
           </w:tcPr>
           <w:p>
             <w:pPr>
@@ -4354,7 +4441,7 @@
       <w:tr>
         <w:tc>
           <w:tcPr>
-            <w:tcW w:type="dxa" w:w="4166"/>
+            <w:tcW w:type="dxa" w:w="4167"/>
           </w:tcPr>
           <w:p>
             <w:pPr>
@@ -4372,7 +4459,7 @@
         </w:tc>
         <w:tc>
           <w:tcPr>
-            <w:tcW w:type="dxa" w:w="4166"/>
+            <w:tcW w:type="dxa" w:w="4167"/>
           </w:tcPr>
           <w:p>
             <w:pPr>
@@ -4392,7 +4479,7 @@
       <w:tr>
         <w:tc>
           <w:tcPr>
-            <w:tcW w:type="dxa" w:w="4166"/>
+            <w:tcW w:type="dxa" w:w="4167"/>
           </w:tcPr>
           <w:p>
             <w:pPr>
@@ -4410,7 +4497,7 @@
         </w:tc>
         <w:tc>
           <w:tcPr>
-            <w:tcW w:type="dxa" w:w="4166"/>
+            <w:tcW w:type="dxa" w:w="4167"/>
           </w:tcPr>
           <w:p>
             <w:pPr>
@@ -4430,7 +4517,7 @@
       <w:tr>
         <w:tc>
           <w:tcPr>
-            <w:tcW w:type="dxa" w:w="4166"/>
+            <w:tcW w:type="dxa" w:w="4167"/>
           </w:tcPr>
           <w:p>
             <w:pPr>
@@ -4448,7 +4535,7 @@
         </w:tc>
         <w:tc>
           <w:tcPr>
-            <w:tcW w:type="dxa" w:w="4166"/>
+            <w:tcW w:type="dxa" w:w="4167"/>
           </w:tcPr>
           <w:p>
             <w:pPr>
@@ -4468,7 +4555,7 @@
       <w:tr>
         <w:tc>
           <w:tcPr>
-            <w:tcW w:type="dxa" w:w="4166"/>
+            <w:tcW w:type="dxa" w:w="4167"/>
           </w:tcPr>
           <w:p>
             <w:pPr>
@@ -4486,7 +4573,7 @@
         </w:tc>
         <w:tc>
           <w:tcPr>
-            <w:tcW w:type="dxa" w:w="4166"/>
+            <w:tcW w:type="dxa" w:w="4167"/>
           </w:tcPr>
           <w:p>
             <w:pPr>
@@ -4506,7 +4593,7 @@
       <w:tr>
         <w:tc>
           <w:tcPr>
-            <w:tcW w:type="dxa" w:w="4166"/>
+            <w:tcW w:type="dxa" w:w="4167"/>
           </w:tcPr>
           <w:p>
             <w:pPr>
@@ -4524,7 +4611,7 @@
         </w:tc>
         <w:tc>
           <w:tcPr>
-            <w:tcW w:type="dxa" w:w="4166"/>
+            <w:tcW w:type="dxa" w:w="4167"/>
           </w:tcPr>
           <w:p>
             <w:pPr>
@@ -4544,7 +4631,7 @@
       <w:tr>
         <w:tc>
           <w:tcPr>
-            <w:tcW w:type="dxa" w:w="4166"/>
+            <w:tcW w:type="dxa" w:w="4167"/>
           </w:tcPr>
           <w:p>
             <w:pPr>
@@ -4562,7 +4649,7 @@
         </w:tc>
         <w:tc>
           <w:tcPr>
-            <w:tcW w:type="dxa" w:w="4166"/>
+            <w:tcW w:type="dxa" w:w="4167"/>
           </w:tcPr>
           <w:p>
             <w:pPr>
@@ -4582,7 +4669,7 @@
       <w:tr>
         <w:tc>
           <w:tcPr>
-            <w:tcW w:type="dxa" w:w="4166"/>
+            <w:tcW w:type="dxa" w:w="4167"/>
           </w:tcPr>
           <w:p>
             <w:pPr>
@@ -4600,7 +4687,7 @@
         </w:tc>
         <w:tc>
           <w:tcPr>
-            <w:tcW w:type="dxa" w:w="4166"/>
+            <w:tcW w:type="dxa" w:w="4167"/>
           </w:tcPr>
           <w:p>
             <w:pPr>
@@ -4620,7 +4707,7 @@
       <w:tr>
         <w:tc>
           <w:tcPr>
-            <w:tcW w:type="dxa" w:w="4166"/>
+            <w:tcW w:type="dxa" w:w="4167"/>
           </w:tcPr>
           <w:p>
             <w:pPr>
@@ -4638,7 +4725,7 @@
         </w:tc>
         <w:tc>
           <w:tcPr>
-            <w:tcW w:type="dxa" w:w="4166"/>
+            <w:tcW w:type="dxa" w:w="4167"/>
           </w:tcPr>
           <w:p>
             <w:pPr>
@@ -4667,12 +4754,15 @@
           <w:b w:val="0"/>
           <w:sz w:val="24"/>
         </w:rPr>
-        <w:t>დრო იზომება სესიური ერთეულებით და არა კალენდარული დროით, ხოლო მომხმარებლები სიმულირებულნი არიან და არა ადამიანები; ორივე ზღუდავს ინტერპრეტაციას და განხილულია §4.4-ში.</w:t>
+        <w:t>დრო იზომება სესიური ერთეულებით და არა კალენდარული დროით, ხოლო მომხმარებლები სიმულირებულნი არიან და არა ადამიანები; ორივე ზღუდავს ინტერპრეტაციას და განხილულია 4.4-ში.</w:t>
       </w:r>
     </w:p>
     <w:p>
       <w:pPr>
         <w:pStyle w:val="Heading2"/>
+        <w:numPr>
+          <w:numId w:val="0"/>
+        </w:numPr>
       </w:pPr>
       <w:r>
         <w:rPr>
@@ -4710,6 +4800,7 @@
     <w:tbl>
       <w:tblPr>
         <w:tblW w:type="auto" w:w="0"/>
+        <w:tblLayout w:type="fixed"/>
         <w:tblLook w:firstColumn="1" w:firstRow="1" w:lastColumn="0" w:lastRow="0" w:noHBand="0" w:noVBand="1" w:val="04A0"/>
         <w:tblBorders>
           <w:top w:val="single" w:sz="4" w:space="0" w:color="000000"/>
@@ -4719,17 +4810,18 @@
           <w:insideH w:val="single" w:sz="4" w:space="0" w:color="000000"/>
           <w:insideV w:val="single" w:sz="4" w:space="0" w:color="000000"/>
         </w:tblBorders>
+        <w:tblLayout w:type="fixed"/>
       </w:tblPr>
       <w:tblGrid>
-        <w:gridCol w:w="2083"/>
-        <w:gridCol w:w="2083"/>
-        <w:gridCol w:w="2083"/>
-        <w:gridCol w:w="2083"/>
+        <w:gridCol w:w="2984"/>
+        <w:gridCol w:w="2161"/>
+        <w:gridCol w:w="1852"/>
+        <w:gridCol w:w="1338"/>
       </w:tblGrid>
       <w:tr>
         <w:tc>
           <w:tcPr>
-            <w:tcW w:type="dxa" w:w="2083"/>
+            <w:tcW w:type="dxa" w:w="2984"/>
           </w:tcPr>
           <w:p>
             <w:pPr>
@@ -4747,7 +4839,7 @@
         </w:tc>
         <w:tc>
           <w:tcPr>
-            <w:tcW w:type="dxa" w:w="2083"/>
+            <w:tcW w:type="dxa" w:w="2161"/>
           </w:tcPr>
           <w:p>
             <w:pPr>
@@ -4765,7 +4857,7 @@
         </w:tc>
         <w:tc>
           <w:tcPr>
-            <w:tcW w:type="dxa" w:w="2083"/>
+            <w:tcW w:type="dxa" w:w="1852"/>
           </w:tcPr>
           <w:p>
             <w:pPr>
@@ -4783,7 +4875,7 @@
         </w:tc>
         <w:tc>
           <w:tcPr>
-            <w:tcW w:type="dxa" w:w="2083"/>
+            <w:tcW w:type="dxa" w:w="1338"/>
           </w:tcPr>
           <w:p>
             <w:pPr>
@@ -4803,7 +4895,7 @@
       <w:tr>
         <w:tc>
           <w:tcPr>
-            <w:tcW w:type="dxa" w:w="2083"/>
+            <w:tcW w:type="dxa" w:w="2984"/>
           </w:tcPr>
           <w:p>
             <w:pPr>
@@ -4821,7 +4913,7 @@
         </w:tc>
         <w:tc>
           <w:tcPr>
-            <w:tcW w:type="dxa" w:w="2083"/>
+            <w:tcW w:type="dxa" w:w="2161"/>
           </w:tcPr>
           <w:p>
             <w:pPr>
@@ -4839,7 +4931,7 @@
         </w:tc>
         <w:tc>
           <w:tcPr>
-            <w:tcW w:type="dxa" w:w="2083"/>
+            <w:tcW w:type="dxa" w:w="1852"/>
           </w:tcPr>
           <w:p>
             <w:pPr>
@@ -4857,7 +4949,7 @@
         </w:tc>
         <w:tc>
           <w:tcPr>
-            <w:tcW w:type="dxa" w:w="2083"/>
+            <w:tcW w:type="dxa" w:w="1338"/>
           </w:tcPr>
           <w:p>
             <w:pPr>
@@ -4877,7 +4969,7 @@
       <w:tr>
         <w:tc>
           <w:tcPr>
-            <w:tcW w:type="dxa" w:w="2083"/>
+            <w:tcW w:type="dxa" w:w="2984"/>
           </w:tcPr>
           <w:p>
             <w:pPr>
@@ -4895,7 +4987,7 @@
         </w:tc>
         <w:tc>
           <w:tcPr>
-            <w:tcW w:type="dxa" w:w="2083"/>
+            <w:tcW w:type="dxa" w:w="2161"/>
           </w:tcPr>
           <w:p>
             <w:pPr>
@@ -4913,7 +5005,7 @@
         </w:tc>
         <w:tc>
           <w:tcPr>
-            <w:tcW w:type="dxa" w:w="2083"/>
+            <w:tcW w:type="dxa" w:w="1852"/>
           </w:tcPr>
           <w:p>
             <w:pPr>
@@ -4931,7 +5023,7 @@
         </w:tc>
         <w:tc>
           <w:tcPr>
-            <w:tcW w:type="dxa" w:w="2083"/>
+            <w:tcW w:type="dxa" w:w="1338"/>
           </w:tcPr>
           <w:p>
             <w:pPr>
@@ -4951,7 +5043,7 @@
       <w:tr>
         <w:tc>
           <w:tcPr>
-            <w:tcW w:type="dxa" w:w="2083"/>
+            <w:tcW w:type="dxa" w:w="2984"/>
           </w:tcPr>
           <w:p>
             <w:pPr>
@@ -4969,7 +5061,7 @@
         </w:tc>
         <w:tc>
           <w:tcPr>
-            <w:tcW w:type="dxa" w:w="2083"/>
+            <w:tcW w:type="dxa" w:w="2161"/>
           </w:tcPr>
           <w:p>
             <w:pPr>
@@ -4987,7 +5079,7 @@
         </w:tc>
         <w:tc>
           <w:tcPr>
-            <w:tcW w:type="dxa" w:w="2083"/>
+            <w:tcW w:type="dxa" w:w="1852"/>
           </w:tcPr>
           <w:p>
             <w:pPr>
@@ -5005,7 +5097,7 @@
         </w:tc>
         <w:tc>
           <w:tcPr>
-            <w:tcW w:type="dxa" w:w="2083"/>
+            <w:tcW w:type="dxa" w:w="1338"/>
           </w:tcPr>
           <w:p>
             <w:pPr>
@@ -5025,7 +5117,7 @@
       <w:tr>
         <w:tc>
           <w:tcPr>
-            <w:tcW w:type="dxa" w:w="2083"/>
+            <w:tcW w:type="dxa" w:w="2984"/>
           </w:tcPr>
           <w:p>
             <w:pPr>
@@ -5043,7 +5135,7 @@
         </w:tc>
         <w:tc>
           <w:tcPr>
-            <w:tcW w:type="dxa" w:w="2083"/>
+            <w:tcW w:type="dxa" w:w="2161"/>
           </w:tcPr>
           <w:p>
             <w:pPr>
@@ -5061,7 +5153,7 @@
         </w:tc>
         <w:tc>
           <w:tcPr>
-            <w:tcW w:type="dxa" w:w="2083"/>
+            <w:tcW w:type="dxa" w:w="1852"/>
           </w:tcPr>
           <w:p>
             <w:pPr>
@@ -5079,7 +5171,7 @@
         </w:tc>
         <w:tc>
           <w:tcPr>
-            <w:tcW w:type="dxa" w:w="2083"/>
+            <w:tcW w:type="dxa" w:w="1338"/>
           </w:tcPr>
           <w:p>
             <w:pPr>
@@ -5136,6 +5228,9 @@
     <w:p>
       <w:pPr>
         <w:pStyle w:val="Heading2"/>
+        <w:numPr>
+          <w:numId w:val="0"/>
+        </w:numPr>
       </w:pPr>
       <w:r>
         <w:rPr>
@@ -5154,7 +5249,7 @@
           <w:b w:val="0"/>
           <w:sz w:val="24"/>
         </w:rPr>
-        <w:t>დიდი ენის მოდელის (LLM) შემფასებელმა თითოეული პირობის სრული ტრანსკრიპტი შეაფასა ხუთი კრიტერიუმის (1–7) მიხედვით. ცხრილი 4.3 ასახავს სამი პერსონაჟის საშუალო ქულებს; ეს არის საილუსტრაციო შეფასებები მცირე სიმულირებული ნიმუშისგან (სამი პერსონაჟი, ერთი შემფასებლის შეფასება, მთელი რიცხვებით შეფასებები), წარმოდგენილი მნიშვნელობის ტესტირების გარეშე და შესაბამისი §3.1-ის შეფასების მიდგომას.</w:t>
+        <w:t>დიდი ენის მოდელის (LLM) შემფასებელმა თითოეული პირობის სრული ტრანსკრიპტი შეაფასა ხუთი კრიტერიუმის (1–7) მიხედვით. ცხრილი 4.3 ასახავს სამი პერსონაჟის საშუალო ქულებს; ეს არის საილუსტრაციო შეფასებები მცირე სიმულირებული ნიმუშისგან (სამი პერსონაჟი, ერთი შემფასებლის შეფასება, მთელი რიცხვებით შეფასებები), წარმოდგენილი მნიშვნელობის ტესტირების გარეშე და შესაბამისი 3.1-ის შეფასების მიდგომას.</w:t>
       </w:r>
     </w:p>
     <w:p>
@@ -5173,6 +5268,7 @@
     <w:tbl>
       <w:tblPr>
         <w:tblW w:type="auto" w:w="0"/>
+        <w:tblLayout w:type="fixed"/>
         <w:tblLook w:firstColumn="1" w:firstRow="1" w:lastColumn="0" w:lastRow="0" w:noHBand="0" w:noVBand="1" w:val="04A0"/>
         <w:tblBorders>
           <w:top w:val="single" w:sz="4" w:space="0" w:color="000000"/>
@@ -5182,19 +5278,20 @@
           <w:insideH w:val="single" w:sz="4" w:space="0" w:color="000000"/>
           <w:insideV w:val="single" w:sz="4" w:space="0" w:color="000000"/>
         </w:tblBorders>
+        <w:tblLayout w:type="fixed"/>
       </w:tblPr>
       <w:tblGrid>
-        <w:gridCol w:w="1389"/>
-        <w:gridCol w:w="1389"/>
-        <w:gridCol w:w="1389"/>
-        <w:gridCol w:w="1389"/>
-        <w:gridCol w:w="1389"/>
-        <w:gridCol w:w="1389"/>
+        <w:gridCol w:w="4671"/>
+        <w:gridCol w:w="697"/>
+        <w:gridCol w:w="697"/>
+        <w:gridCol w:w="697"/>
+        <w:gridCol w:w="697"/>
+        <w:gridCol w:w="876"/>
       </w:tblGrid>
       <w:tr>
         <w:tc>
           <w:tcPr>
-            <w:tcW w:type="dxa" w:w="1389"/>
+            <w:tcW w:type="dxa" w:w="4670"/>
           </w:tcPr>
           <w:p>
             <w:pPr>
@@ -5212,7 +5309,7 @@
         </w:tc>
         <w:tc>
           <w:tcPr>
-            <w:tcW w:type="dxa" w:w="1389"/>
+            <w:tcW w:type="dxa" w:w="697"/>
           </w:tcPr>
           <w:p>
             <w:pPr>
@@ -5230,7 +5327,7 @@
         </w:tc>
         <w:tc>
           <w:tcPr>
-            <w:tcW w:type="dxa" w:w="1389"/>
+            <w:tcW w:type="dxa" w:w="697"/>
           </w:tcPr>
           <w:p>
             <w:pPr>
@@ -5248,7 +5345,7 @@
         </w:tc>
         <w:tc>
           <w:tcPr>
-            <w:tcW w:type="dxa" w:w="1389"/>
+            <w:tcW w:type="dxa" w:w="697"/>
           </w:tcPr>
           <w:p>
             <w:pPr>
@@ -5266,7 +5363,7 @@
         </w:tc>
         <w:tc>
           <w:tcPr>
-            <w:tcW w:type="dxa" w:w="1389"/>
+            <w:tcW w:type="dxa" w:w="697"/>
           </w:tcPr>
           <w:p>
             <w:pPr>
@@ -5284,7 +5381,7 @@
         </w:tc>
         <w:tc>
           <w:tcPr>
-            <w:tcW w:type="dxa" w:w="1389"/>
+            <w:tcW w:type="dxa" w:w="876"/>
           </w:tcPr>
           <w:p>
             <w:pPr>
@@ -5304,7 +5401,7 @@
       <w:tr>
         <w:tc>
           <w:tcPr>
-            <w:tcW w:type="dxa" w:w="1389"/>
+            <w:tcW w:type="dxa" w:w="4670"/>
           </w:tcPr>
           <w:p>
             <w:pPr>
@@ -5322,7 +5419,7 @@
         </w:tc>
         <w:tc>
           <w:tcPr>
-            <w:tcW w:type="dxa" w:w="1389"/>
+            <w:tcW w:type="dxa" w:w="697"/>
           </w:tcPr>
           <w:p>
             <w:pPr>
@@ -5340,7 +5437,7 @@
         </w:tc>
         <w:tc>
           <w:tcPr>
-            <w:tcW w:type="dxa" w:w="1389"/>
+            <w:tcW w:type="dxa" w:w="697"/>
           </w:tcPr>
           <w:p>
             <w:pPr>
@@ -5358,7 +5455,7 @@
         </w:tc>
         <w:tc>
           <w:tcPr>
-            <w:tcW w:type="dxa" w:w="1389"/>
+            <w:tcW w:type="dxa" w:w="697"/>
           </w:tcPr>
           <w:p>
             <w:pPr>
@@ -5376,7 +5473,7 @@
         </w:tc>
         <w:tc>
           <w:tcPr>
-            <w:tcW w:type="dxa" w:w="1389"/>
+            <w:tcW w:type="dxa" w:w="697"/>
           </w:tcPr>
           <w:p>
             <w:pPr>
@@ -5394,7 +5491,7 @@
         </w:tc>
         <w:tc>
           <w:tcPr>
-            <w:tcW w:type="dxa" w:w="1389"/>
+            <w:tcW w:type="dxa" w:w="876"/>
           </w:tcPr>
           <w:p>
             <w:pPr>
@@ -5414,7 +5511,7 @@
       <w:tr>
         <w:tc>
           <w:tcPr>
-            <w:tcW w:type="dxa" w:w="1389"/>
+            <w:tcW w:type="dxa" w:w="4670"/>
           </w:tcPr>
           <w:p>
             <w:pPr>
@@ -5432,7 +5529,7 @@
         </w:tc>
         <w:tc>
           <w:tcPr>
-            <w:tcW w:type="dxa" w:w="1389"/>
+            <w:tcW w:type="dxa" w:w="697"/>
           </w:tcPr>
           <w:p>
             <w:pPr>
@@ -5450,7 +5547,7 @@
         </w:tc>
         <w:tc>
           <w:tcPr>
-            <w:tcW w:type="dxa" w:w="1389"/>
+            <w:tcW w:type="dxa" w:w="697"/>
           </w:tcPr>
           <w:p>
             <w:pPr>
@@ -5468,7 +5565,7 @@
         </w:tc>
         <w:tc>
           <w:tcPr>
-            <w:tcW w:type="dxa" w:w="1389"/>
+            <w:tcW w:type="dxa" w:w="697"/>
           </w:tcPr>
           <w:p>
             <w:pPr>
@@ -5486,7 +5583,7 @@
         </w:tc>
         <w:tc>
           <w:tcPr>
-            <w:tcW w:type="dxa" w:w="1389"/>
+            <w:tcW w:type="dxa" w:w="697"/>
           </w:tcPr>
           <w:p>
             <w:pPr>
@@ -5504,7 +5601,7 @@
         </w:tc>
         <w:tc>
           <w:tcPr>
-            <w:tcW w:type="dxa" w:w="1389"/>
+            <w:tcW w:type="dxa" w:w="876"/>
           </w:tcPr>
           <w:p>
             <w:pPr>
@@ -5524,7 +5621,7 @@
       <w:tr>
         <w:tc>
           <w:tcPr>
-            <w:tcW w:type="dxa" w:w="1389"/>
+            <w:tcW w:type="dxa" w:w="4670"/>
           </w:tcPr>
           <w:p>
             <w:pPr>
@@ -5542,7 +5639,7 @@
         </w:tc>
         <w:tc>
           <w:tcPr>
-            <w:tcW w:type="dxa" w:w="1389"/>
+            <w:tcW w:type="dxa" w:w="697"/>
           </w:tcPr>
           <w:p>
             <w:pPr>
@@ -5560,7 +5657,7 @@
         </w:tc>
         <w:tc>
           <w:tcPr>
-            <w:tcW w:type="dxa" w:w="1389"/>
+            <w:tcW w:type="dxa" w:w="697"/>
           </w:tcPr>
           <w:p>
             <w:pPr>
@@ -5578,7 +5675,7 @@
         </w:tc>
         <w:tc>
           <w:tcPr>
-            <w:tcW w:type="dxa" w:w="1389"/>
+            <w:tcW w:type="dxa" w:w="697"/>
           </w:tcPr>
           <w:p>
             <w:pPr>
@@ -5596,7 +5693,7 @@
         </w:tc>
         <w:tc>
           <w:tcPr>
-            <w:tcW w:type="dxa" w:w="1389"/>
+            <w:tcW w:type="dxa" w:w="697"/>
           </w:tcPr>
           <w:p>
             <w:pPr>
@@ -5614,7 +5711,7 @@
         </w:tc>
         <w:tc>
           <w:tcPr>
-            <w:tcW w:type="dxa" w:w="1389"/>
+            <w:tcW w:type="dxa" w:w="876"/>
           </w:tcPr>
           <w:p>
             <w:pPr>
@@ -5634,7 +5731,7 @@
       <w:tr>
         <w:tc>
           <w:tcPr>
-            <w:tcW w:type="dxa" w:w="1389"/>
+            <w:tcW w:type="dxa" w:w="4670"/>
           </w:tcPr>
           <w:p>
             <w:pPr>
@@ -5652,7 +5749,7 @@
         </w:tc>
         <w:tc>
           <w:tcPr>
-            <w:tcW w:type="dxa" w:w="1389"/>
+            <w:tcW w:type="dxa" w:w="697"/>
           </w:tcPr>
           <w:p>
             <w:pPr>
@@ -5670,7 +5767,7 @@
         </w:tc>
         <w:tc>
           <w:tcPr>
-            <w:tcW w:type="dxa" w:w="1389"/>
+            <w:tcW w:type="dxa" w:w="697"/>
           </w:tcPr>
           <w:p>
             <w:pPr>
@@ -5688,7 +5785,7 @@
         </w:tc>
         <w:tc>
           <w:tcPr>
-            <w:tcW w:type="dxa" w:w="1389"/>
+            <w:tcW w:type="dxa" w:w="697"/>
           </w:tcPr>
           <w:p>
             <w:pPr>
@@ -5706,7 +5803,7 @@
         </w:tc>
         <w:tc>
           <w:tcPr>
-            <w:tcW w:type="dxa" w:w="1389"/>
+            <w:tcW w:type="dxa" w:w="697"/>
           </w:tcPr>
           <w:p>
             <w:pPr>
@@ -5724,7 +5821,7 @@
         </w:tc>
         <w:tc>
           <w:tcPr>
-            <w:tcW w:type="dxa" w:w="1389"/>
+            <w:tcW w:type="dxa" w:w="876"/>
           </w:tcPr>
           <w:p>
             <w:pPr>
@@ -5744,7 +5841,7 @@
       <w:tr>
         <w:tc>
           <w:tcPr>
-            <w:tcW w:type="dxa" w:w="1389"/>
+            <w:tcW w:type="dxa" w:w="4670"/>
           </w:tcPr>
           <w:p>
             <w:pPr>
@@ -5762,7 +5859,7 @@
         </w:tc>
         <w:tc>
           <w:tcPr>
-            <w:tcW w:type="dxa" w:w="1389"/>
+            <w:tcW w:type="dxa" w:w="697"/>
           </w:tcPr>
           <w:p>
             <w:pPr>
@@ -5780,7 +5877,7 @@
         </w:tc>
         <w:tc>
           <w:tcPr>
-            <w:tcW w:type="dxa" w:w="1389"/>
+            <w:tcW w:type="dxa" w:w="697"/>
           </w:tcPr>
           <w:p>
             <w:pPr>
@@ -5798,7 +5895,7 @@
         </w:tc>
         <w:tc>
           <w:tcPr>
-            <w:tcW w:type="dxa" w:w="1389"/>
+            <w:tcW w:type="dxa" w:w="697"/>
           </w:tcPr>
           <w:p>
             <w:pPr>
@@ -5816,7 +5913,7 @@
         </w:tc>
         <w:tc>
           <w:tcPr>
-            <w:tcW w:type="dxa" w:w="1389"/>
+            <w:tcW w:type="dxa" w:w="697"/>
           </w:tcPr>
           <w:p>
             <w:pPr>
@@ -5834,7 +5931,7 @@
         </w:tc>
         <w:tc>
           <w:tcPr>
-            <w:tcW w:type="dxa" w:w="1389"/>
+            <w:tcW w:type="dxa" w:w="876"/>
           </w:tcPr>
           <w:p>
             <w:pPr>
@@ -5885,12 +5982,15 @@
           <w:b w:val="0"/>
           <w:sz w:val="24"/>
         </w:rPr>
-        <w:t>მეორე და მოულოდნელად, კონფიდენციალურობის კომფორტის შედეგი საპირისპიროა ადამიანებზე ჩატარებული დადგენილი კვლევისა. ადამიანებში, მომხმარებლის სიტყვების სიტყვასიტყვითი გახსენება ზრდის კონფიდენციალურობასთან დაკავშირებულ შეშფოთებას პარაფრაზთან შედარებით (კოქსის შედეგი [11], რომელიც §2.2-ის მთელი "ბუნდოვანი კვალის" არგუმენტაციის ემპირიული საყრდენია). აქ სიმულირებულმა მოსამართლემ სიტყვასიტყვითი პირობა B და დახვეწილი B+ კონფიდენციალურობის კომფორტის მიხედვით ყველაზე მაღალ შეფასებას (7.00) მისცა, ხოლო არსებითი შინაარსის საფუძველზე დავიწყების პროფილი C — ყველაზე დაბალს (5.67), რაც ადამიანებში დაფიქსირებული ეფექტის საპირისპიროა. მსაჯული, LLM, რომლისთვისაც კონფიდენციალურობის საკითხები არ იყო მნიშვნელოვანი, როგორც ჩანს, სრულ და ზუსტ გახსენებას უბრალო კომპეტენციად აღიქვამს ("კარგად დაიმახსოვრა"), ხოლო C-სგან განზრახ დავიწყებას — ნაკლად. ეს ზუსტად ის ზედაპირული ინტერპრეტაციაა, რომლის შესახებაც §3.5(b) აფრთხილებდა, რომ LLM მსაჯული მას შეგრძნებულ კავშირს ჩაანაცვლებდა.</w:t>
+        <w:t>მეორე და მოულოდნელად, კონფიდენციალურობის კომფორტის შედეგი საპირისპიროა ადამიანებზე ჩატარებული დადგენილი კვლევისა. ადამიანებში, მომხმარებლის სიტყვების სიტყვასიტყვითი გახსენება ზრდის კონფიდენციალურობასთან დაკავშირებულ შეშფოთებას პარაფრაზთან შედარებით (კოქსის შედეგი [11], რომელიც 2.2-ის მთელი "ბუნდოვანი კვალის" არგუმენტაციის ემპირიული საყრდენია). აქ სიმულირებულმა მოსამართლემ სიტყვასიტყვითი პირობა B და დახვეწილი B+ კონფიდენციალურობის კომფორტის მიხედვით ყველაზე მაღალ შეფასებას (7.00) მისცა, ხოლო არსებითი შინაარსის საფუძველზე დავიწყების პროფილი C — ყველაზე დაბალს (5.67), რაც ადამიანებში დაფიქსირებული ეფექტის საპირისპიროა. მსაჯული, LLM, რომლისთვისაც კონფიდენციალურობის საკითხები არ იყო მნიშვნელოვანი, როგორც ჩანს, სრულ და ზუსტ გახსენებას უბრალო კომპეტენციად აღიქვამს ("კარგად დაიმახსოვრა"), ხოლო C-სგან განზრახ დავიწყებას — ნაკლად. ეს ზუსტად ის ზედაპირული ინტერპრეტაციაა, რომლის შესახებაც 3.5(b) აფრთხილებდა, რომ LLM მსაჯული მას შეგრძნებულ კავშირს ჩაანაცვლებდა.</w:t>
       </w:r>
     </w:p>
     <w:p>
       <w:pPr>
         <w:pStyle w:val="Heading2"/>
+        <w:numPr>
+          <w:numId w:val="0"/>
+        </w:numPr>
       </w:pPr>
       <w:r>
         <w:rPr>
@@ -5931,12 +6031,15 @@
           <w:b w:val="0"/>
           <w:sz w:val="24"/>
         </w:rPr>
-        <w:t>კონფიდენციალურობისა და კომფორტის ინვერსია შეფასების ყველაზე მნიშვნელოვანი შედეგია, რადგან ის კონტრ-მაგალითით აჩვენებს სიმულირებული შეფასების საზღვრებს. იმ ერთ კონსტრუქტზე, სადაც ადამიანის ძლიერი, რეპლიცირებული ეფექტი არსებობს — სიტყვასიტყვითი გამეორების შემაწუხებელი ხასიათის შეგრძნება — დიდი ენის მოდელის (LLM) მსაჯულმა საპირისპირო დალაგება წარმოადგინა. ეს არ არის ხარვეზი, რომლის გამოსწორებაც შესაძლებელია; ეს პირდაპირი მტკიცებულებაა იმისა, რომ LLM-მსაჯული ვერ ჩაანაცვლებს ადამიანის აღქმას ისეთ კონსტრუქტებში, რომლებიც დამოკიდებულია ისეთ ადამიანურ ფაქტორებზე, როგორიცაა კონფიდენციალურობა და ნდობა. აქედან გამომდინარეობს, რომ ამ თეზისის აღქმითი მტკიცებულებები ნამდვილად ვერ გადაწყდება სიმულაციის გზით და რომ §3.5(c)-ის ადამიან-სუბიექტის პროტოკოლი არ არის დისკრეციული გაფართოება, არამედ მეთოდოლოგიური აუცილებლობა. სხვა სიტყვებით, კონცეფციის დამტკიცება იმსახურებს ადამიანზე ჩატარებული კვლევის გადადებას იმით, რომ ემპირიულად აჩვენებს მის აუცილებლობას.</w:t>
+        <w:t>კონფიდენციალურობისა და კომფორტის ინვერსია შეფასების ყველაზე მნიშვნელოვანი შედეგია, რადგან ის კონტრ-მაგალითით აჩვენებს სიმულირებული შეფასების საზღვრებს. იმ ერთ კონსტრუქტზე, სადაც ადამიანის ძლიერი, რეპლიცირებული ეფექტი არსებობს — სიტყვასიტყვითი გამეორების შემაწუხებელი ხასიათის შეგრძნება — დიდი ენის მოდელის (LLM) მსაჯულმა საპირისპირო დალაგება წარმოადგინა. ეს არ არის ხარვეზი, რომლის გამოსწორებაც შესაძლებელია; ეს პირდაპირი მტკიცებულებაა იმისა, რომ LLM-მსაჯული ვერ ჩაანაცვლებს ადამიანის აღქმას ისეთ კონსტრუქტებში, რომლებიც დამოკიდებულია ისეთ ადამიანურ ფაქტორებზე, როგორიცაა კონფიდენციალურობა და ნდობა. აქედან გამომდინარეობს, რომ ამ თეზისის აღქმითი მტკიცებულებები ნამდვილად ვერ გადაწყდება სიმულაციის გზით და რომ 3.5(c)-ის ადამიან-სუბიექტის პროტოკოლი არ არის დისკრეციული გაფართოება, არამედ მეთოდოლოგიური აუცილებლობა. სხვა სიტყვებით, კონცეფციის დამტკიცება იმსახურებს ადამიანზე ჩატარებული კვლევის გადადებას იმით, რომ ემპირიულად აჩვენებს მის აუცილებლობას.</w:t>
       </w:r>
     </w:p>
     <w:p>
       <w:pPr>
         <w:pStyle w:val="Heading2"/>
+        <w:numPr>
+          <w:numId w:val="0"/>
+        </w:numPr>
       </w:pPr>
       <w:r>
         <w:rPr>
@@ -5962,6 +6065,9 @@
       <w:pPr>
         <w:pStyle w:val="Heading1"/>
         <w:pageBreakBefore/>
+        <w:numPr>
+          <w:numId w:val="0"/>
+        </w:numPr>
       </w:pPr>
       <w:r>
         <w:rPr>
@@ -5986,6 +6092,9 @@
     <w:p>
       <w:pPr>
         <w:pStyle w:val="Heading2"/>
+        <w:numPr>
+          <w:numId w:val="0"/>
+        </w:numPr>
       </w:pPr>
       <w:r>
         <w:rPr>
@@ -6010,6 +6119,9 @@
     <w:p>
       <w:pPr>
         <w:pStyle w:val="Heading2"/>
+        <w:numPr>
+          <w:numId w:val="0"/>
+        </w:numPr>
       </w:pPr>
       <w:r>
         <w:rPr>
@@ -6034,6 +6146,9 @@
     <w:p>
       <w:pPr>
         <w:pStyle w:val="Heading2"/>
+        <w:numPr>
+          <w:numId w:val="0"/>
+        </w:numPr>
       </w:pPr>
       <w:r>
         <w:rPr>
@@ -6052,13 +6167,16 @@
           <w:b w:val="0"/>
           <w:sz w:val="24"/>
         </w:rPr>
-        <w:t>პირდაპირ სამი მიმართულება მოჰყვება. პირველი სრული სისტემის შექმნაა: პროფილი C-ის ინტეგრირება ხმოვანი არხის რეალურ დროში, პლატფორმის აუდიტში გამოვლენილი გამოყენებადობის შეზღუდვების მოგვარება (მონაწილეთა იზოლაცია, პაკეტირება, ერთი არჩეული საუბრის მოდული) და იმ მექანიზმების იმპლემენტაცია, რომლებიც ამჟამად შემცირებული სიზუსტით მუშაობს — ბაიესის სიურპრიზის მოვლენების სეგმენტაცია, ასოციაციური წინასწარი გაფართოება და დეტერმინირებული ზუსტი გახსენების ტრიგერი. მეორეა §3.5(c)-ში მითითებული ადამიანთა სუბიექტებზე ჩატარებული კვლევა: B-ს, B+, და C სფეროს ნორმატიული ნიმუშის ზომით, გათვლილი იმ შედარებებისთვის, სადაც მძლავრობა მიღწევადია, და ცენტრალურ C-სა და B+-ს შორის კონტრასტს, როგორც შეფასების სამიზნეს, განიხილავს, თან ახლავს თბილი, მიკუთვნებადი დავიწყება, გვიანი ფანჯრის ანალიზი, მოვლენაზე მგრძნობიარე და ქცევითი ზომები, და კოდირებული ინტერვიუები, როგორც დიზაინის პასუხი სავარაუდოდ მცირე ან ნულოვან პირველად ეფექტზე. მესამეა თეორიული გაფართოება: იმ მეხსიერების ფენომენების ინკორპორაცია, რომლებსაც ამჟამინდელი არქიტექტურა განზრახ გამორიცხავს — ინტერფერენცია, როგორც დავიწყების მექანიზმი, რეკონსტრუქციული და სქემაზე დაფუძნებული დამახინჯება, რასაც ყველაზე მკაფიოდ პროგნოზირებს ბუნდოვანი კვალითა და კომპლემენტარული სწავლების სისტემები, და უფრო მდიდარი დროითი თანმიმდევრობისა და წყაროს მეხსიერება — თითოეული მათგანი ერთდროულად არის როგორც ერთგულების ხარვეზი, ასევე კონკრეტული ჰიპოთეზა იმის შესახებ, თუ რა გახდიდა ინტერლოკუტორს უფრო ადამიანურს. ჯამში, ეს ყველაფერი ასრულებს თანაშემწიდან თანამოსაუბრედ ევოლუციას, რომელიც ამ ნაშრომმა დააპროექტა, მინიატურაში შექმნა და აჩვენა, თუ როგორ უნდა გაიზომოს.</w:t>
+        <w:t>პირდაპირ სამი მიმართულება მოჰყვება. პირველი სრული სისტემის შექმნაა: პროფილი C-ის ინტეგრირება ხმოვანი არხის რეალურ დროში, პლატფორმის აუდიტში გამოვლენილი გამოყენებადობის შეზღუდვების მოგვარება (მონაწილეთა იზოლაცია, პაკეტირება, ერთი არჩეული საუბრის მოდული) და იმ მექანიზმების იმპლემენტაცია, რომლებიც ამჟამად შემცირებული სიზუსტით მუშაობს — ბაიესის სიურპრიზის მოვლენების სეგმენტაცია, ასოციაციური წინასწარი გაფართოება და დეტერმინირებული ზუსტი გახსენების ტრიგერი. მეორეა 3.5(c)-ში მითითებული ადამიანთა სუბიექტებზე ჩატარებული კვლევა: B-ს, B+, და C სფეროს ნორმატიული ნიმუშის ზომით, გათვლილი იმ შედარებებისთვის, სადაც მძლავრობა მიღწევადია, და ცენტრალურ C-სა და B+-ს შორის კონტრასტს, როგორც შეფასების სამიზნეს, განიხილავს, თან ახლავს თბილი, მიკუთვნებადი დავიწყება, გვიანი ფანჯრის ანალიზი, მოვლენაზე მგრძნობიარე და ქცევითი ზომები, და კოდირებული ინტერვიუები, როგორც დიზაინის პასუხი სავარაუდოდ მცირე ან ნულოვან პირველად ეფექტზე. მესამეა თეორიული გაფართოება: იმ მეხსიერების ფენომენების ინკორპორაცია, რომლებსაც ამჟამინდელი არქიტექტურა განზრახ გამორიცხავს — ინტერფერენცია, როგორც დავიწყების მექანიზმი, რეკონსტრუქციული და სქემაზე დაფუძნებული დამახინჯება, რასაც ყველაზე მკაფიოდ პროგნოზირებს ბუნდოვანი კვალითა და კომპლემენტარული სწავლების სისტემები, და უფრო მდიდარი დროითი თანმიმდევრობისა და წყაროს მეხსიერება — თითოეული მათგანი ერთდროულად არის როგორც ერთგულების ხარვეზი, ასევე კონკრეტული ჰიპოთეზა იმის შესახებ, თუ რა გახდიდა ინტერლოკუტორს უფრო ადამიანურს. ჯამში, ეს ყველაფერი ასრულებს თანაშემწიდან თანამოსაუბრედ ევოლუციას, რომელიც ამ ნაშრომმა დააპროექტა, მინიატურაში შექმნა და აჩვენა, თუ როგორ უნდა გაიზომოს.</w:t>
       </w:r>
     </w:p>
     <w:p>
       <w:pPr>
         <w:pStyle w:val="Heading1"/>
         <w:pageBreakBefore/>
+        <w:numPr>
+          <w:numId w:val="0"/>
+        </w:numPr>
       </w:pPr>
       <w:r>
         <w:rPr>

</xml_diff>

<commit_message>
fix(thesis): correct author (იმნაიშვილი) & supervisor (თავდიშვილი) on title/front pages
Confirmed by Lekso; earlier CV-inferred "Khobelia"/"Barnovi" were wrong.
Remaining front-matter blanks (შიფრი, program, defense date, cover month/year)
kept as clearly-marked placeholders pending the values.

Co-Authored-By: Claude Opus 4.8 <noreply@anthropic.com>
</commit_message>
<xml_diff>
--- a/project/thesis-ka.docx
+++ b/project/thesis-ka.docx
@@ -761,7 +761,7 @@
           <w:szCs w:val="24"/>
           <w:lang w:val="ka-GE"/>
         </w:rPr>
-        <w:t xml:space="preserve">ჩვენ, ხელისმომწერნი ვადასტურებთ, რომ გავეცანით ალექსანდრე ხობელია </w:t>
+        <w:t xml:space="preserve">ჩვენ, ხელისმომწერნი ვადასტურებთ, რომ გავეცანით ალექსანდრე იმნაიშვილი </w:t>
       </w:r>
       <w:r>
         <w:rPr>
@@ -955,7 +955,7 @@
           <w:szCs w:val="24"/>
           <w:lang w:val="ka-GE"/>
         </w:rPr>
-        <w:t>ხელმძღვანელი: სოფო ბარნოვი</w:t>
+        <w:t>ხელმძღვანელი: ოთარ თავდიშვილი</w:t>
       </w:r>
       <w:r>
         <w:rPr>
@@ -1263,7 +1263,7 @@
           <w:szCs w:val="24"/>
           <w:lang w:val="ka-GE"/>
         </w:rPr>
-        <w:t>ალექსანდრე ხობელია</w:t>
+        <w:t>ალექსანდრე იმნაიშვილი</w:t>
       </w:r>
     </w:p>
     <w:p>

</xml_diff>

<commit_message>
fix(thesis): stop backtick-cleanup from destroying title-page drawings
The title-page paragraph that holds the stray backtick also anchors the
floating logo/title/author text-box drawings. Blanking every run's .text
wiped those runs' drawing children (5→3 drawings, logo lost). Now only the
run containing the backtick is edited; drawings preserved (verified 5/2).

Co-Authored-By: Claude Opus 4.8 <noreply@anthropic.com>
</commit_message>
<xml_diff>
--- a/project/thesis-ka.docx
+++ b/project/thesis-ka.docx
@@ -19,11 +19,198 @@
           <w:noProof/>
           <w:lang w:val="ka-GE"/>
         </w:rPr>
+        <mc:AlternateContent>
+          <mc:Choice Requires="wps">
+            <w:drawing>
+              <wp:anchor distT="0" distB="0" distL="114300" distR="114300" simplePos="0" relativeHeight="251660288" behindDoc="0" locked="0" layoutInCell="1" allowOverlap="1" wp14:anchorId="0D11978C" wp14:editId="4B61D8D2">
+                <wp:simplePos x="0" y="0"/>
+                <wp:positionH relativeFrom="column">
+                  <wp:posOffset>3701415</wp:posOffset>
+                </wp:positionH>
+                <wp:positionV relativeFrom="paragraph">
+                  <wp:posOffset>5236845</wp:posOffset>
+                </wp:positionV>
+                <wp:extent cx="3124200" cy="391795"/>
+                <wp:effectExtent l="0" t="1270" r="3810" b="0"/>
+                <wp:wrapNone/>
+                <wp:docPr id="760413624" name="Text Box 5"/>
+                <wp:cNvGraphicFramePr>
+                  <a:graphicFrameLocks xmlns:a="http://schemas.openxmlformats.org/drawingml/2006/main"/>
+                </wp:cNvGraphicFramePr>
+                <a:graphic xmlns:a="http://schemas.openxmlformats.org/drawingml/2006/main">
+                  <a:graphicData uri="http://schemas.microsoft.com/office/word/2010/wordprocessingShape">
+                    <wps:wsp>
+                      <wps:cNvSpPr txBox="1">
+                        <a:spLocks noChangeArrowheads="1"/>
+                      </wps:cNvSpPr>
+                      <wps:spPr bwMode="auto">
+                        <a:xfrm>
+                          <a:off x="0" y="0"/>
+                          <a:ext cx="3124200" cy="391795"/>
+                        </a:xfrm>
+                        <a:prstGeom prst="rect">
+                          <a:avLst/>
+                        </a:prstGeom>
+                        <a:solidFill>
+                          <a:srgbClr val="FFFFFF"/>
+                        </a:solidFill>
+                        <a:ln>
+                          <a:noFill/>
+                        </a:ln>
+                        <a:extLst>
+                          <a:ext uri="{91240B29-F687-4F45-9708-019B960494DF}">
+                            <a14:hiddenLine xmlns:a14="http://schemas.microsoft.com/office/drawing/2010/main" w="9525">
+                              <a:solidFill>
+                                <a:srgbClr val="000000"/>
+                              </a:solidFill>
+                              <a:miter lim="800000"/>
+                              <a:headEnd/>
+                              <a:tailEnd/>
+                            </a14:hiddenLine>
+                          </a:ext>
+                        </a:extLst>
+                      </wps:spPr>
+                      <wps:txbx>
+                        <w:txbxContent>
+                          <w:p>
+                            <w:pPr>
+                              <w:jc w:val="right"/>
+                              <w:rPr>
+                                <w:b/>
+                                <w:bCs/>
+                                <w:szCs w:val="24"/>
+                                <w:lang w:val="ka-GE"/>
+                              </w:rPr>
+                            </w:pPr>
+                            <w:r>
+                              <w:rPr>
+                                <w:b/>
+                                <w:bCs/>
+                                <w:szCs w:val="24"/>
+                                <w:lang w:val="ka-GE"/>
+                              </w:rPr>
+                              <w:t xml:space="preserve">ალექსანდრე იმნაიშვილი </w:t>
+                            </w:r>
+                          </w:p>
+                        </w:txbxContent>
+                      </wps:txbx>
+                      <wps:bodyPr rot="0" vert="horz" wrap="square" lIns="91440" tIns="45720" rIns="91440" bIns="45720" anchor="t" anchorCtr="0" upright="1">
+                        <a:noAutofit/>
+                      </wps:bodyPr>
+                    </wps:wsp>
+                  </a:graphicData>
+                </a:graphic>
+                <wp14:sizeRelH relativeFrom="page">
+                  <wp14:pctWidth>0</wp14:pctWidth>
+                </wp14:sizeRelH>
+                <wp14:sizeRelV relativeFrom="page">
+                  <wp14:pctHeight>0</wp14:pctHeight>
+                </wp14:sizeRelV>
+              </wp:anchor>
+            </w:drawing>
+          </mc:Choice>
+          <mc:Fallback>
+            <w:pict>
+              <v:shapetype w14:anchorId="0D11978C" id="_x0000_t202" coordsize="21600,21600" o:spt="202" path="m,l,21600r21600,l21600,xe">
+                <v:stroke joinstyle="miter"/>
+                <v:path gradientshapeok="t" o:connecttype="rect"/>
+              </v:shapetype>
+              <v:shape id="Text Box 5" o:spid="_x0000_s1026" type="#_x0000_t202" style="position:absolute;left:0;text-align:left;margin-left:291.45pt;margin-top:412.35pt;width:246pt;height:30.85pt;z-index:251660288;visibility:visible;mso-wrap-style:square;mso-width-percent:0;mso-height-percent:0;mso-wrap-distance-left:9pt;mso-wrap-distance-top:0;mso-wrap-distance-right:9pt;mso-wrap-distance-bottom:0;mso-position-horizontal:absolute;mso-position-horizontal-relative:text;mso-position-vertical:absolute;mso-position-vertical-relative:text;mso-width-percent:0;mso-height-percent:0;mso-width-relative:page;mso-height-relative:page;v-text-anchor:top" o:gfxdata="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" stroked="f">
+                <v:textbox>
+                  <w:txbxContent>
+                    <w:p>
+                      <w:pPr>
+                        <w:jc w:val="right"/>
+                        <w:rPr>
+                          <w:b/>
+                          <w:bCs/>
+                          <w:szCs w:val="24"/>
+                          <w:lang w:val="ka-GE"/>
+                        </w:rPr>
+                      </w:pPr>
+                      <w:r>
+                        <w:rPr>
+                          <w:b/>
+                          <w:bCs/>
+                          <w:szCs w:val="24"/>
+                          <w:lang w:val="ka-GE"/>
+                        </w:rPr>
+                        <w:t xml:space="preserve">ალექსანდრე იმნაიშვილი </w:t>
+                      </w:r>
+                    </w:p>
+                  </w:txbxContent>
+                </v:textbox>
+              </v:shape>
+            </w:pict>
+          </mc:Fallback>
+        </mc:AlternateContent>
       </w:r>
       <w:r>
         <w:rPr>
           <w:noProof/>
         </w:rPr>
+        <w:drawing>
+          <wp:anchor distT="0" distB="0" distL="114300" distR="114300" simplePos="0" relativeHeight="251659264" behindDoc="1" locked="0" layoutInCell="1" allowOverlap="1" wp14:anchorId="3F0A66AC" wp14:editId="6F4A0310">
+            <wp:simplePos x="0" y="0"/>
+            <wp:positionH relativeFrom="margin">
+              <wp:posOffset>161925</wp:posOffset>
+            </wp:positionH>
+            <wp:positionV relativeFrom="margin">
+              <wp:posOffset>-1083945</wp:posOffset>
+            </wp:positionV>
+            <wp:extent cx="6869430" cy="6234430"/>
+            <wp:effectExtent l="0" t="0" r="7620" b="0"/>
+            <wp:wrapSquare wrapText="bothSides"/>
+            <wp:docPr id="927800283" name="Picture 6" descr="A purple rectangle with white text&#10;&#10;Description automatically generated with low confidence"/>
+            <wp:cNvGraphicFramePr>
+              <a:graphicFrameLocks xmlns:a="http://schemas.openxmlformats.org/drawingml/2006/main" noChangeAspect="1"/>
+            </wp:cNvGraphicFramePr>
+            <a:graphic xmlns:a="http://schemas.openxmlformats.org/drawingml/2006/main">
+              <a:graphicData uri="http://schemas.openxmlformats.org/drawingml/2006/picture">
+                <pic:pic xmlns:pic="http://schemas.openxmlformats.org/drawingml/2006/picture">
+                  <pic:nvPicPr>
+                    <pic:cNvPr id="927800283" name="Picture 6" descr="A purple rectangle with white text&#10;&#10;Description automatically generated with low confidence"/>
+                    <pic:cNvPicPr>
+                      <a:picLocks noChangeAspect="1" noChangeArrowheads="1"/>
+                    </pic:cNvPicPr>
+                  </pic:nvPicPr>
+                  <pic:blipFill>
+                    <a:blip r:embed="rId8">
+                      <a:extLst>
+                        <a:ext uri="{28A0092B-C50C-407E-A947-70E740481C1C}">
+                          <a14:useLocalDpi xmlns:a14="http://schemas.microsoft.com/office/drawing/2010/main" val="0"/>
+                        </a:ext>
+                      </a:extLst>
+                    </a:blip>
+                    <a:srcRect l="4326" t="2664" r="4613" b="3600"/>
+                    <a:stretch>
+                      <a:fillRect/>
+                    </a:stretch>
+                  </pic:blipFill>
+                  <pic:spPr bwMode="auto">
+                    <a:xfrm>
+                      <a:off x="0" y="0"/>
+                      <a:ext cx="6869430" cy="6234430"/>
+                    </a:xfrm>
+                    <a:prstGeom prst="rect">
+                      <a:avLst/>
+                    </a:prstGeom>
+                    <a:noFill/>
+                    <a:ln>
+                      <a:noFill/>
+                    </a:ln>
+                  </pic:spPr>
+                </pic:pic>
+              </a:graphicData>
+            </a:graphic>
+            <wp14:sizeRelH relativeFrom="page">
+              <wp14:pctWidth>0</wp14:pctWidth>
+            </wp14:sizeRelH>
+            <wp14:sizeRelV relativeFrom="page">
+              <wp14:pctHeight>0</wp14:pctHeight>
+            </wp14:sizeRelV>
+          </wp:anchor>
+        </w:drawing>
       </w:r>
       <w:r>
         <w:rPr>

</xml_diff>

<commit_message>
polish(thesis): apply 63 verified Georgian proofing corrections
From the coherence review, applied via corrections.json (loaded by build.py):
- meaning-reversing mistranslations (decay↔prolongation, companion→spare,
  power→energy, per-turn→tournament, recall→calculation, lazy→infinite)
- garbled non-words + a Cyrillic я; ASAQ 18→19 constructs
- glossary terminology sweeps (social presence, forgetting curve, latency,
  confound, assistant, interlocutor, multi-store, Ebbinghaus spelling, etc.)

Each correction is form-aware and verified: exact source count, zero residual
after apply, no collateral. Full reviewable list in project/proofing-corrections.md.

Co-Authored-By: Claude Opus 4.8 <noreply@anthropic.com>
</commit_message>
<xml_diff>
--- a/project/thesis-ka.docx
+++ b/project/thesis-ka.docx
@@ -1897,18 +1897,18 @@
           <w:b w:val="0"/>
           <w:sz w:val="24"/>
         </w:rPr>
-        <w:t>დიდი ენობრივი მოდელების საფუძველზე შექმნილი საუბრის სისტემები ერთ სესიაზე ადამიანის დონის თავისუფლებას აღწევენ, მაგრამ სესიებს შორის ვერ ინარჩუნებენ უწყვეტ, განვითარებად ურთიერთობას, რადგან მათ არ გააჩნიათ მდგრადი გრძელვადიანი მეხსიერება. გრძელვადიანი მეხსიერების ბენჩმარკებისა და ეგრეთ წოდებული "კომპანიონი" აპლიკაციების მომხმარებლების მონაცემები მიუთითებს, რომ ეს წარუმატებლობა არის როგორც ტექნიკური — მოდელები ადამიანის მეხსიერებას მნიშვნელოვნად ჩამორჩებიან, განსაკუთრებით დროში აზროვნებისას — ასევე ურთიერთობრივი, რადგან მეხსიერების დეფექტები და იდენტობის მკვეთრი შეწყვეტა დოკუმენტურად არღვევს მომხმარებლის მიერ აღქმულ ურთიერთობას. თუმცა, პრობლემასთან დაკავშირებული ორი დისციპლინა განცალკევებით არსებობს: მეხსიერების არქიტექტურები შეფასდება ფაქტობრივი სიზუსტის კრიტერიუმებით, მაშინ როდესაც ურთიერთობის აღქმის კვლევები მეხსიერებას განიხილავენ, როგორც ერთჯერად ჩართვა-გამორთვას ერთი სისტემის ფარგლებში. ჩვენთვის ხელმისაწვდომ ლიტერატურაში არ არსებობს არც ერთი კონტროლირებადი კვლევა, რომელიც სხვადასხვა ადამიანური მეხსიერების თეორიაზე დაფუძნებული მეხსიერების არქიტექტურების შედარებას ახდენს მომხმარებლის მიერ აღქმული სოციალური კონსტრუქტების მიხედვით და არც ერთი მათგანი არ ათავსებს ასეთ შედარებას ხმოვან მოდალობაში.</w:t>
-      </w:r>
-    </w:p>
-    <w:p>
-      <w:pPr/>
-      <w:r>
-        <w:rPr>
-          <w:rFonts w:ascii="Sylfaen" w:hAnsi="Sylfaen" w:cs="Sylfaen"/>
-          <w:b w:val="0"/>
-          <w:sz w:val="24"/>
-        </w:rPr>
-        <w:t>ეს ნაშრომი ამ ხარვეზს დიზაინის, იმპლემენტაციისა და შეფასების მეთოდოლოგიის მეშვეობით ავსებს. ის წარმოადგენს Profile C-ს, ხმოვანი საუბრის პარტნიორის გრძელვადიანი მეხსიერების არქიტექტურას, რომელიც აერთიანებს ხუთ კოგნიტურ-მეხსიერების თეორიას — ატკინსონ-შიფრინის მრავალსაწყობიანი მოდელი, ებინგჰაუზის დავიწყების კრუგი, ტულვინგის ეპიზოდურ-სემანტიკური განასხვავება, ბუნდოვანი კვალით თეორია და დამატებითი სასწავლო სისტემების ჩარჩო — ერთ სასიცოცხლო ციკლში: მნიშვნელობისმიღწევით კონტროლირებადი კოდირება, არსებითი ნაწილისა და ორიენტირის წარმოდგენა, გაჭიანურებული ებინგჰაუზის დაშლა დროში გადანაწილებული გამეორებით გაძლიერებისას, ოფლაინ ეპიზოდურიდან სემანტიკურზე კონსოლიდაცია და არსებითი ნაწილის მიხედვით მოძიება. თითოეული მექანიზმი დაკავშირებულია დასაკვირვებელ ქცევით ხელმოწერასთან და არა ფსიქოლოგიური სიზუსტის მტკიცებასთან.</w:t>
+        <w:t>დიდი ენობრივი მოდელების საფუძველზე შექმნილი საუბრის სისტემები ერთ სესიაზე ადამიანის დონის თავისუფლებას აღწევენ, მაგრამ სესიებს შორის ვერ ინარჩუნებენ უწყვეტ, განვითარებად ურთიერთობას, რადგან მათ არ გააჩნიათ მდგრადი გრძელვადიანი მეხსიერება. გრძელვადიანი მეხსიერების ბენჩმარკებისა და ეგრეთ წოდებული "კომპანიონი" აპლიკაციების მომხმარებლების მონაცემები მიუთითებს, რომ ეს წარუმატებლობა არის როგორც ტექნიკური — მოდელები ადამიანის მეხსიერებას მნიშვნელოვნად ჩამორჩებიან, განსაკუთრებით დროითი (ტემპორალური) მსჯელობისას — ასევე ურთიერთობრივი, რადგან მეხსიერების დეფექტები და იდენტობის მკვეთრი შეწყვეტა დოკუმენტურად არღვევს მომხმარებლის მიერ აღქმულ ურთიერთობას. თუმცა, პრობლემასთან დაკავშირებული ორი დისციპლინა განცალკევებით არსებობს: მეხსიერების არქიტექტურები შეფასდება ფაქტობრივი სიზუსტის კრიტერიუმებით, მაშინ როდესაც ურთიერთობის აღქმის კვლევები მეხსიერებას განიხილავენ, როგორც ერთჯერად ჩართვა-გამორთვას ერთი სისტემის ფარგლებში. ჩვენთვის ხელმისაწვდომ ლიტერატურაში არ არსებობს არც ერთი კონტროლირებადი კვლევა, რომელიც სხვადასხვა ადამიანური მეხსიერების თეორიაზე დაფუძნებული მეხსიერების არქიტექტურების შედარებას ახდენს მომხმარებლის მიერ აღქმული სოციალური კონსტრუქტების მიხედვით და არც ერთი მათგანი არ ათავსებს ასეთ შედარებას ხმოვან მოდალობაში.</w:t>
+      </w:r>
+    </w:p>
+    <w:p>
+      <w:pPr/>
+      <w:r>
+        <w:rPr>
+          <w:rFonts w:ascii="Sylfaen" w:hAnsi="Sylfaen" w:cs="Sylfaen"/>
+          <w:b w:val="0"/>
+          <w:sz w:val="24"/>
+        </w:rPr>
+        <w:t>ეს ნაშრომი ამ ხარვეზს დიზაინის, იმპლემენტაციისა და შეფასების მეთოდოლოგიის მეშვეობით ავსებს. ის წარმოადგენს Profile C-ს, ხმოვანი თანამოსაუბრის გრძელვადიანი მეხსიერების არქიტექტურას, რომელიც აერთიანებს ხუთ კოგნიტურ-მეხსიერების თეორიას — ატკინსონ-შიფრინის მრავალსაცავიანი მოდელი, ებინგჰაუსის დავიწყების მრუდი, ტულვინგის ეპიზოდურ-სემანტიკური განასხვავება, ბუნდოვანი კვალით თეორია და დამატებითი სასწავლო სისტემების ჩარჩო — ერთ სასიცოცხლო ციკლში: მნიშვნელობისმიღწევით კონტროლირებადი კოდირება, არსებითი ნაწილისა და ორიენტირის წარმოდგენა, გაჭიანურებული ებინგჰაუსის დაშლა დროში გადანაწილებული გამეორებით გაძლიერებისას, ოფლაინ ეპიზოდურიდან სემანტიკურზე კონსოლიდაცია და არსებითი ნაწილის მიხედვით მოძიება. თითოეული მექანიზმი დაკავშირებულია დასაკვირვებელ ქცევით ხელმოწერასთან და არა ფსიქოლოგიური სიზუსტის მტკიცებასთან.</w:t>
       </w:r>
     </w:p>
     <w:p>
@@ -1952,7 +1952,7 @@
           <w:b w:val="0"/>
           <w:sz w:val="24"/>
         </w:rPr>
-        <w:t>საკვანძო სიტყვები: საუბრული ხელოვნური ინტელექტი, გრძელვადიანი მეხსიერება, ადამიანის მეხსიერების მოდელები, სოციალური თანადგომა, ხმოვანი თანამოსაუბრე, შეფასების მეთოდოლოგია.</w:t>
+        <w:t>საკვანძო სიტყვები: საუბრული ხელოვნური ინტელექტი, გრძელვადიანი მეხსიერება, ადამიანის მეხსიერების მოდელები, სოციალური თანდასწრება, ხმოვანი თანამოსაუბრე, შეფასების მეთოდოლოგია.</w:t>
       </w:r>
     </w:p>
     <w:p>
@@ -2370,7 +2370,7 @@
           <w:b w:val="0"/>
           <w:sz w:val="24"/>
         </w:rPr>
-        <w:t>ეს ტექნიკური ნაკლი პირდაპირ აისახება მომხმარებლის გამოცდილებაზე. ეგრეთ წოდებული "სათადარიგო" აპლიკაციების (Replika, Character.AI) კონტექსტში, Replika-ს მომხმარებლების კვალიტატიური კვლევა აჩვენებს, რომ მეხსიერების უკმარისობა — სახელების, უპირატესობებისა და ცხოვრებისეული მოვლენების დავიწყება — ერთ-ერთი მთავარი ფაქტორია, რომელიც არღვევს მომხმარებლის მიერ ურთიერთობის შეგრძნებას [3]. ამავდროულად, როდესაც სისტემის ქცევა მოულოდნელად იცვლება, მომხმარებლები გამოხატავენ რეაქციებს, რომლებიც სტატისტიკურად განპირობებულია აგენტის აღქმული იდენტობის შეუთავსებლობით [4]. ამ ორი დამოუკიდებელი შედეგის გაერთიანება საფუძველს გვაძლევს ვივარაუდოთ, რომ მეხსიერების უწყვეტობა საფუძვლად უდევს აღქმულ იდენტობას და, შესაბამისად, ურთიერთობის უწყვეტობას — ჰიპოთეზა, რომლის ექსპერიმენტული შემოწმებაც ეს ნაშრომი განიხილავს, როგორც სამომავლო სამუშაოს.</w:t>
+        <w:t>ეს ტექნიკური ნაკლი პირდაპირ აისახება მომხმარებლის გამოცდილებაზე. ეგრეთ წოდებული „კომპანიონი“ აპლიკაციების (Replika, Character.AI) კონტექსტში, Replika-ს მომხმარებლების კვალიტატიური კვლევა აჩვენებს, რომ მეხსიერების უკმარისობა — სახელების, უპირატესობებისა და ცხოვრებისეული მოვლენების დავიწყება — ერთ-ერთი მთავარი ფაქტორია, რომელიც არღვევს მომხმარებლის მიერ ურთიერთობის შეგრძნებას [3]. ამავდროულად, როდესაც სისტემის ქცევა მოულოდნელად იცვლება, მომხმარებლები გამოხატავენ რეაქციებს, რომლებიც სტატისტიკურად განპირობებულია აგენტის აღქმული იდენტობის შეუთავსებლობით [4]. ამ ორი დამოუკიდებელი შედეგის გაერთიანება საფუძველს გვაძლევს ვივარაუდოთ, რომ მეხსიერების უწყვეტობა საფუძვლად უდევს აღქმულ იდენტობას და, შესაბამისად, ურთიერთობის უწყვეტობას — ჰიპოთეზა, რომლის ექსპერიმენტული შემოწმებაც ეს ნაშრომი განიხილავს, როგორც სამომავლო სამუშაოს.</w:t>
       </w:r>
     </w:p>
     <w:p>
@@ -2419,7 +2419,7 @@
           <w:b w:val="0"/>
           <w:sz w:val="24"/>
         </w:rPr>
-        <w:t>ამ ნაშრომის მიზანია ადამიანის მეხსიერების კოგნიტურ თეორიებზე დაფუძნებული გრძელვადიანი მეხსიერების არქიტექტურის შემუშავება ხმოვანი საუბრის სისტემისთვის და მისი ექსპერიმენტულად შეფასება კონტროლირებადი შედარებითი კვლევის მეშვეობით მომხმარებლის მიერ აღქმულ სოციალურ კონსტრუქტებზე — სოციალურ თანადგომაზე, მომხმარებელ-აგენტის ალიანსსა და აღქმულ ადამიანურობაზე.</w:t>
+        <w:t>ამ ნაშრომის მიზანია ადამიანის მეხსიერების კოგნიტურ თეორიებზე დაფუძნებული გრძელვადიანი მეხსიერების არქიტექტურის შემუშავება ხმოვანი საუბრის სისტემისთვის და მისი ექსპერიმენტულად შეფასება კონტროლირებადი შედარებითი კვლევის მეშვეობით მომხმარებლის მიერ აღქმულ სოციალურ კონსტრუქტებზე — სოციალურ თანდასწრებაზე, მომხმარებელ-აგენტის ალიანსსა და აღქმულ ადამიანურობაზე.</w:t>
       </w:r>
     </w:p>
     <w:p>
@@ -2452,7 +2452,7 @@
           <w:b w:val="0"/>
           <w:sz w:val="24"/>
         </w:rPr>
-        <w:t>2. შერჩეული თეორიების ქცევითი ნიშნულების ფორმალიზება (მრავალსაცავო მოდელი, ებინგჰაუზის დავიწყების მრუდი, ეპიზოდური/სემანტიკური მეხსიერების გამიჯვნა, არსებითზე დაფუძნებული გახსენება და დამატებითი სასწავლო სისტემების / კონსოლიდაციის ჩარჩო) და მათი არქიტექტურულ კომპონენტებად გარდაქმნა;</w:t>
+        <w:t>2. შერჩეული თეორიების ქცევითი ნიშნულების ფორმალიზება (მრავალსაცავიანი მოდელი, ებინგჰაუსის დავიწყების მრუდი, ეპიზოდური/სემანტიკური მეხსიერების გამიჯვნა, არსებითზე დაფუძნებული გახსენება და დამატებითი სასწავლო სისტემების / კონსოლიდაციის ჩარჩო) და მათი არქიტექტურულ კომპონენტებად გარდაქმნა;</w:t>
       </w:r>
     </w:p>
     <w:p>
@@ -2485,7 +2485,7 @@
           <w:b w:val="0"/>
           <w:sz w:val="24"/>
         </w:rPr>
-        <w:t>5. კონცეფციის დამტკიცების იმპლემენტაცია და მისი ტექნიკური და სიმულირებული შეფასება, მეხსიერების დიზაინის რეკომენდაციებით ინტერლოკუტორი სისტემებისთვის, რომლებიც დადასტურდება გადავადებული კვლევით.</w:t>
+        <w:t>5. კონცეფციის დამტკიცების იმპლემენტაცია და მისი ტექნიკური და სიმულირებული შეფასება, მეხსიერების დიზაინის რეკომენდაციებით თანამოსაუბრე სისტემებისთვის, რომლებიც დადასტურდება გადავადებული კვლევით.</w:t>
       </w:r>
     </w:p>
     <w:p>
@@ -2507,18 +2507,18 @@
           <w:b w:val="0"/>
           <w:sz w:val="24"/>
         </w:rPr>
-        <w:t>•  მკ1: აძლიერებს თუ არა ადამიანის მეხსიერების თეორიებზე დაფუძნებული მეხსიერების არქიტექტურა აღქმულ სოციალურ თანადგომას, მომხმარებლისა და აგენტის ალიანსს და აღქმულ ადამიანურობას, სიტყვასიტყვითი მოგონების მიდგომასთან შედარებით?</w:t>
-      </w:r>
-    </w:p>
-    <w:p>
-      <w:pPr/>
-      <w:r>
-        <w:rPr>
-          <w:rFonts w:ascii="Sylfaen" w:hAnsi="Sylfaen" w:cs="Sylfaen"/>
-          <w:b w:val="0"/>
-          <w:sz w:val="24"/>
-        </w:rPr>
-        <w:t>•  H1 (მთავარი): თეორიულად დასაბუთებული პროფილი (C) აღემატება სიტყვასიტყვით RAG-ს (B) სამივე ძირითადი კონსტრუქტის მიხედვით — სოციალური თანადგომის, მომხმარებლისა და აგენტის ალიანსისა და აღქმული ადამიანურობის.</w:t>
+        <w:t>•  მკ1: აძლიერებს თუ არა ადამიანის მეხსიერების თეორიებზე დაფუძნებული მეხსიერების არქიტექტურა აღქმულ სოციალურ თანდასწრებას, მომხმარებლისა და აგენტის ალიანსს და აღქმულ ადამიანურობას, სიტყვასიტყვითი მოგონების მიდგომასთან შედარებით?</w:t>
+      </w:r>
+    </w:p>
+    <w:p>
+      <w:pPr/>
+      <w:r>
+        <w:rPr>
+          <w:rFonts w:ascii="Sylfaen" w:hAnsi="Sylfaen" w:cs="Sylfaen"/>
+          <w:b w:val="0"/>
+          <w:sz w:val="24"/>
+        </w:rPr>
+        <w:t>•  H1 (მთავარი): თეორიულად დასაბუთებული პროფილი (C) აღემატება სიტყვასიტყვით RAG-ს (B) სამივე ძირითადი კონსტრუქტის მიხედვით — სოციალური თანდასწრების, მომხმარებლისა და აგენტის ალიანსისა და აღქმული ადამიანურობის.</w:t>
       </w:r>
     </w:p>
     <w:p>
@@ -2551,18 +2551,18 @@
           <w:b w:val="0"/>
           <w:sz w:val="24"/>
         </w:rPr>
-        <w:t>შედარება დამატებით მოიცავს კურატორირებულ სტატიკურ აქტიურ კონტროლს (B+): მეხსიერებას, რომელიც იღებს იგივე ოფლაინ კურატორირებას, რაც C, მაგრამ არ გააჩნია ადამიანის მეხსიერების დინამიკა (არც გახანგრძლივება, არც სალიენს-გეითინგი, არც კონსოლიდაცია). კონტრასტი C-სა და B+-ს შორის — რომელიც ადამიანის მეხსიერების დინამიკის ეფექტს კურირების მიერ მიღწეული წაკითხვადობის უბრალო ზრდისგან გამოყოფს — ამ ნაშრომის ცენტრალური ახალი შედარებაა; როგორც 3.1-შია დადგენილი, ის თავისი კონსტრუქციით მცირე ეფექტს წარმოადგენს და განიხილება წინასწარ რეგისტრირებულ შეფასების მიზნად და არა დამადასტურებელ ტესტად, რაც განსხვავდება უკეთესი სტატისტიკური ძალის მქონე შედარებებისგან (C vs A და მიმართულებითი B+ vs B და C vs B).</w:t>
-      </w:r>
-    </w:p>
-    <w:p>
-      <w:pPr/>
-      <w:r>
-        <w:rPr>
-          <w:rFonts w:ascii="Sylfaen" w:hAnsi="Sylfaen" w:cs="Sylfaen"/>
-          <w:b w:val="0"/>
-          <w:sz w:val="24"/>
-        </w:rPr>
-        <w:t>სამი თვისებიდან, რომლებითაც 1.5 განასხვავებს მოსაუბრეს თანაშემწისგან, მეხსიერებაზე მანიპულირება ეხება კონტექსტის მდგრადობასა და იდენტობის უწყვეტობას; მესამე — ინიციატივა — ოპერაციულად განისაზღვრება მხოლოდ არასავალდებულო პროაქტიულ პირობაში და, შესაბამისად, შემოწმდება მხოლოდ იმ შემთხვევაში, თუ ეს პირობაა ჩართული.</w:t>
+        <w:t>შედარება დამატებით მოიცავს კურატორირებულ სტატიკურ აქტიურ კონტროლს (B+): მეხსიერებას, რომელიც იღებს იგივე ოფლაინ კურატორირებას, რაც C, მაგრამ არ გააჩნია ადამიანის მეხსიერების დინამიკა (არც დაქრობა, არც სალიენს-გეითინგი, არც კონსოლიდაცია). კონტრასტი C-სა და B+-ს შორის — რომელიც ადამიანის მეხსიერების დინამიკის ეფექტს კურირების მიერ მიღწეული წაკითხვადობის უბრალო ზრდისგან გამოყოფს — ამ ნაშრომის ცენტრალური ახალი შედარებაა; როგორც 3.1-შია დადგენილი, ის თავისი კონსტრუქციით მცირე ეფექტს წარმოადგენს და განიხილება წინასწარ რეგისტრირებულ შეფასების მიზნად და არა დამადასტურებელ ტესტად, რაც განსხვავდება უკეთესი სტატისტიკური ძალის მქონე შედარებებისგან (C vs A და მიმართულებითი B+ vs B და C vs B).</w:t>
+      </w:r>
+    </w:p>
+    <w:p>
+      <w:pPr/>
+      <w:r>
+        <w:rPr>
+          <w:rFonts w:ascii="Sylfaen" w:hAnsi="Sylfaen" w:cs="Sylfaen"/>
+          <w:b w:val="0"/>
+          <w:sz w:val="24"/>
+        </w:rPr>
+        <w:t>სამი თვისებიდან, რომლებითაც 1.5 განასხვავებს მოსაუბრეს ასისტენტისგან, მეხსიერებაზე მანიპულირება ეხება კონტექსტის მდგრადობასა და იდენტობის უწყვეტობას; მესამე — ინიციატივა — ოპერაციულად განისაზღვრება მხოლოდ არასავალდებულო პროაქტიულ პირობაში და, შესაბამისად, შემოწმდება მხოლოდ იმ შემთხვევაში, თუ ეს პირობაა ჩართული.</w:t>
       </w:r>
     </w:p>
     <w:p>
@@ -2698,7 +2698,7 @@
           <w:b w:val="0"/>
           <w:sz w:val="24"/>
         </w:rPr>
-        <w:t>ნაშრომის თეორიული წვლილი სამმაგია. პირველი, ის კოგნიტური ფსიქოლოგიის მეხსიერების თეორიებს LLM სისტემების ინჟინერიასთან აკავშირებს არა მეტაფორის დონეზე, არამედ გაზომვადი ქცევითი ნიშნულების დონეზე. მეორე, ჩვენთვის ხელმისაწვდომ ლიტერატურაში ვერ მოიძებნა არცერთი კონტროლირებადი კვლევა, რომელიც ადამიანის მეხსიერების სხვადასხვა თეორიაზე დაფუძნებულ არქიტექტურებს ერთმანეთს შეადარებდა მომხმარებლის მიერ აღქმული სოციალური კონსტრუქტების თვალსაზრისით — არსებული შედარებები შემოიფარგლება ფაქტობრივი სიზუსტის მეტრიკებით [1, 2], ხოლო აღქმის კვლევები მეხსიერებას განიხილავენ, როგორც ერთი სისტემის იზოლირებულ მანიპულაციას [11]; წინამდებარე ნაშრომი მიზნად ისახავს ამ ხარვეზის შევსებას კონტროლირებადი ექსპერიმენტის დაპროექტებით და მისი ჩასატარებლად საჭირო აპარატურისა და მეთოდოლოგიის შექმნით. მესამე, ნაშრომი გვთავაზობს "ასისტენტსა" და "საუბრის პარტნიორს" შორის განსხვავების ოპერაციონალიზაციას სამი გაზომვადი თვისების საფუძველზე — კონტექსტის მდგრადობა, იდენტობის უწყვეტობა და ინიციატივა — რითაც ეს ცნებები ბუნდოვნად განსაზღვრული ტერმინებიდან გაზომვად კატეგორიებად გარდაიქმნება.</w:t>
+        <w:t>ნაშრომის თეორიული წვლილი სამმაგია. პირველი, ის კოგნიტური ფსიქოლოგიის მეხსიერების თეორიებს LLM სისტემების ინჟინერიასთან აკავშირებს არა მეტაფორის დონეზე, არამედ გაზომვადი ქცევითი ნიშნულების დონეზე. მეორე, ჩვენთვის ხელმისაწვდომ ლიტერატურაში ვერ მოიძებნა არცერთი კონტროლირებადი კვლევა, რომელიც ადამიანის მეხსიერების სხვადასხვა თეორიაზე დაფუძნებულ არქიტექტურებს ერთმანეთს შეადარებდა მომხმარებლის მიერ აღქმული სოციალური კონსტრუქტების თვალსაზრისით — არსებული შედარებები შემოიფარგლება ფაქტობრივი სიზუსტის მეტრიკებით [1, 2], ხოლო აღქმის კვლევები მეხსიერებას განიხილავენ, როგორც ერთი სისტემის იზოლირებულ მანიპულაციას [11]; წინამდებარე ნაშრომი მიზნად ისახავს ამ ხარვეზის შევსებას კონტროლირებადი ექსპერიმენტის დაპროექტებით და მისი ჩასატარებლად საჭირო აპარატურისა და მეთოდოლოგიის შექმნით. მესამე, ნაშრომი გვთავაზობს "ასისტენტსა" და "თანამოსაუბრეს" შორის განსხვავების ოპერაციონალიზაციას სამი გაზომვადი თვისების საფუძველზე — კონტექსტის მდგრადობა, იდენტობის უწყვეტობა და ინიციატივა — რითაც ეს ცნებები ბუნდოვნად განსაზღვრული ტერმინებიდან გაზომვად კატეგორიებად გარდაიქმნება.</w:t>
       </w:r>
     </w:p>
     <w:p>
@@ -2769,7 +2769,7 @@
           <w:b w:val="0"/>
           <w:sz w:val="24"/>
         </w:rPr>
-        <w:t>ეს თავი მიმოიხილავს კვლევებს, რომლებზეც ეს ნაშრომია დაფუძნებული, ორ სფეროში, რომლებიც ის მიზანმიმართულად აერთიანებს. პირველია ადამიანის მეხსიერების კოგნიტური ფსიქოლოგია: თეორიები, რომლებიც აღწერს, თუ როგორ კოდირებენ, ინახავენ, ივიწყებენ და იხსენებენ ადამიანები ინფორმაციას და — რაც ჩვენი მიზნებისთვის უმნიშვნელოვანესია — თითოეული თეორიის მიერ ნაწინდევრებული ქცევითი გამოვლინებები. მეორეა დიდი ენის მოდელებზე (LLM) დაფუძნებული საუბრული აგენტების გრძელვადიანი მეხსიერების ინჟინერია: არქიტექტურები, მათი შეფასების ბენჩმარკები და კვლევები ადამიანთა მონაწილეობით, რომლებიც იკვლევენ, თუ როგორ განსაზღვრავს მეხსიერება მომხმარებლისა და სისტემის ურთიერთობას. მიმოხილვა სრულდება ამჟამინდელი ნაშრომის ამ სფეროებს შორის არსებულ ხარვეზში განთავსებით. სტრუქტურა შეესაბამება ლიტერატურული მიმოხილვისთვის საჭირო ოთხ კომპონენტს: არსებული კვლევების ანალიზს (2.3, 2.6), გამოყენებული მეთოდებისა და ტექნოლოგიების მიმოხილვას (2.2, 2.4), ღია პრობლემებსა და შეზღუდვებს (2.5, 2.7) და ამ ნაშრომის ადგილს არსებულ ლიტერატურაში (2.8).</w:t>
+        <w:t>ეს თავი მიმოიხილავს კვლევებს, რომლებზეც ეს ნაშრომია დაფუძნებული, ორ სფეროში, რომლებიც ის მიზანმიმართულად აერთიანებს. პირველია ადამიანის მეხსიერების კოგნიტური ფსიქოლოგია: თეორიები, რომლებიც აღწერს, თუ როგორ კოდირებენ, ინახავენ, ივიწყებენ და იხსენებენ ადამიანები ინფორმაციას და — რაც ჩვენი მიზნებისთვის უმნიშვნელოვანესია — თითოეული თეორიის მიერ პროგნოზირებული ქცევითი გამოვლინებები. მეორეა დიდი ენის მოდელებზე (LLM) დაფუძნებული საუბრული აგენტების გრძელვადიანი მეხსიერების ინჟინერია: არქიტექტურები, მათი შეფასების ბენჩმარკები და კვლევები ადამიანთა მონაწილეობით, რომლებიც იკვლევენ, თუ როგორ განსაზღვრავს მეხსიერება მომხმარებლისა და სისტემის ურთიერთობას. მიმოხილვა სრულდება ამჟამინდელი ნაშრომის ამ სფეროებს შორის არსებულ ხარვეზში განთავსებით. სტრუქტურა შეესაბამება ლიტერატურული მიმოხილვისთვის საჭირო ოთხ კომპონენტს: არსებული კვლევების ანალიზს (2.3, 2.6), გამოყენებული მეთოდებისა და ტექნოლოგიების მიმოხილვას (2.2, 2.4), ღია პრობლემებსა და შეზღუდვებს (2.5, 2.7) და ამ ნაშრომის ადგილს არსებულ ლიტერატურაში (2.8).</w:t>
       </w:r>
     </w:p>
     <w:p>
@@ -2796,18 +2796,18 @@
           <w:b w:val="0"/>
           <w:sz w:val="24"/>
         </w:rPr>
-        <w:t>ამ ნაშრომის ცენტრალური პრინციპია, რომ ადამიანის მეხსიერება ერთგვარ საცავს კი არ წარმოადგენს, არამედ ურთიერთქმედებადი სისტემების ერთობლიობას, თითოეულ მათგანს კი — განსაკუთრებული დინამიკა აქვს. ამ დინამიკებს კი, თავისუფალი მეტაფორების ნაცვლად, შესაძლებელია, განვიხილოთ, როგორც დიზაინის სპეციფიკაციები, რომლებსაც დაკვირვებადი შედეგები მოჰყვება. შესაბამისად, ჩვენ ძირითად თეორიებს განვიხილავთ არა როგორც ინტელექტუალურ ისტორიას, არამედ იმ ქცევითი კვალით, რომელსაც თითოეული მათგანი პროგნოზირებს: ანუ, რა ხილვად მოქმედებას განახორციელებდა მომხმარებლის მიერ აღქმული, ამ მექანიზმით აღჭურვილი საუბრის პარტნიორი.</w:t>
-      </w:r>
-    </w:p>
-    <w:p>
-      <w:pPr/>
-      <w:r>
-        <w:rPr>
-          <w:rFonts w:ascii="Sylfaen" w:hAnsi="Sylfaen" w:cs="Sylfaen"/>
-          <w:b w:val="0"/>
-          <w:sz w:val="24"/>
-        </w:rPr>
-        <w:t>მრავალსაწყობიანი მოდელი. ატკინსონისა და შიფრინის [20] მიხედვით, მეხსიერება წარმოადგენს სამი საწყობის — სენსორული, მოკლევადიანი და გრძელვადიანი — ჯაჭვს, რომლის გავლითაც კონტენტი გადაადგილდება მხოლოდ მაშინ, როდესაც მასზე კონტროლის პროცესები მოქმედებს; გამეორება გადამწყვეტი პროცესია, რომელიც ყურადღებით აღქმულ მასალას მდგრად საცავში გადააქვს, ხოლო ის, რაც გამეორების გარეშე რჩება, უბრალოდ ქრება. მისი ქცევითი ხელწერა არის მკვეთრი ასიმეტრია იმას შორის, რაც უბრალოდ გაიგონა და იმას შორის, რასაც ყურადღება მიექცა და გაიმეორა — ამ პრინციპით შექმნილი პარტნიორი შეინარჩუნებდა ხაზგასმულ ან ხელახლა განხილულ ინფორმაციას და დაკარგავდა იმას, რაც ერთხელ და შეუმჩნევლად გაიარა.</w:t>
+        <w:t>ამ ნაშრომის ცენტრალური პრინციპია, რომ ადამიანის მეხსიერება ერთგვარ საცავს კი არ წარმოადგენს, არამედ ურთიერთქმედებადი სისტემების ერთობლიობას, თითოეულ მათგანს კი — განსაკუთრებული დინამიკა აქვს. ამ დინამიკებს კი, თავისუფალი მეტაფორების ნაცვლად, შესაძლებელია, განვიხილოთ, როგორც დიზაინის სპეციფიკაციები, რომლებსაც დაკვირვებადი შედეგები მოჰყვება. შესაბამისად, ჩვენ ძირითად თეორიებს განვიხილავთ არა როგორც ინტელექტუალურ ისტორიას, არამედ იმ ქცევითი კვალით, რომელსაც თითოეული მათგანი პროგნოზირებს: ანუ, რა ხილვად მოქმედებას განახორციელებდა მომხმარებლის მიერ აღქმული, ამ მექანიზმით აღჭურვილი თანამოსაუბრე.</w:t>
+      </w:r>
+    </w:p>
+    <w:p>
+      <w:pPr/>
+      <w:r>
+        <w:rPr>
+          <w:rFonts w:ascii="Sylfaen" w:hAnsi="Sylfaen" w:cs="Sylfaen"/>
+          <w:b w:val="0"/>
+          <w:sz w:val="24"/>
+        </w:rPr>
+        <w:t>მრავალსაცავიანი მოდელი. ატკინსონისა და შიფრინის [20] მიხედვით, მეხსიერება წარმოადგენს სამი საწყობის — სენსორული, მოკლევადიანი და გრძელვადიანი — ჯაჭვს, რომლის გავლითაც კონტენტი გადაადგილდება მხოლოდ მაშინ, როდესაც მასზე კონტროლის პროცესები მოქმედებს; გამეორება გადამწყვეტი პროცესია, რომელიც ყურადღებით აღქმულ მასალას მდგრად საცავში გადააქვს, ხოლო ის, რაც გამეორების გარეშე რჩება, უბრალოდ ქრება. მისი ქცევითი სიგნატურა არის მკვეთრი ასიმეტრია იმას შორის, რაც უბრალოდ გაიგონა და იმას შორის, რასაც ყურადღება მიექცა და გაიმეორა — ამ პრინციპით შექმნილი პარტნიორი შეინარჩუნებდა ხაზგასმულ ან ხელახლა განხილულ ინფორმაციას და დაკარგავდა იმას, რაც ერთხელ და შეუმჩნევლად გაიარა.</w:t>
       </w:r>
     </w:p>
     <w:p>
@@ -2829,40 +2829,40 @@
           <w:b w:val="0"/>
           <w:sz w:val="24"/>
         </w:rPr>
-        <w:t>ეპიზოდური და სემანტიკური განასხვავებლობა. ტულვინგმა [22] ზღვარი გაავლო კონკრეტული მოვლენის დამახსოვრებას, რომლის განთავსებაც საკუთარ წარსულშია შესაძლებელი ("გასულ სამშაბათს შენი დედლაინის შესახებ ახსენე"), და უბრალოდ ფაქტის ცოდნას შორის, რომელიც თავისი თავდაპირველი კონტექსტისგან არის მოშორებული ("შენ დედლაინების ქვეშ მუშაობ") — ეპიზოდურ და სემანტიკურ მეხსიერებას შორის. ეს გამიჯვნა ფუნდამენტურია წინამდებარე ნაშრომისთვის, რადგან ორი სისტემა აშკარად განსხვავებულ საუბრის მანერას ქმნის: ეპიზოდური პარტნიორი კონკრეტულ მომენტებს იხსენებს, ხოლო სემანტიკური პარტნიორი მათ მომხმარებლის შესახებ სტაბილურ ცოდნად აქცევს. პირველის მეორედ გარდაქმნა — კონსოლიდაცია — სწორედ ის პროცესია, რომელიც ხანგრძლივ საუბრის სისტემას უნდა შეასრულოს, რათა "დაუჯერღვანელებელ" ეპიზოდებში არ ჩაიძიროს.</w:t>
-      </w:r>
-    </w:p>
-    <w:p>
-      <w:pPr/>
-      <w:r>
-        <w:rPr>
-          <w:rFonts w:ascii="Sylfaen" w:hAnsi="Sylfaen" w:cs="Sylfaen"/>
-          <w:b w:val="0"/>
-          <w:sz w:val="24"/>
-        </w:rPr>
-        <w:t>დავიწყების კრუგი. ებინგჰაუსის მეცხრამეტე საუკუნის ექსპერიმენტებმა [23] აჩვენა, რომ მეხსიერების სიძლიერე მცირდება დაახლოებით ექსპონენციურად იმ დროის გასვლის მიხედვით, რაც რაიმეს ბოლოს გამეორებიდან გავიდა, და რომ დროში გადანაწილებული განმეორებები ამ კლებას ამცირებს. ჩვენ ვიყენებთ დავიწყების კრუგს ერთი მკაფიო შენიშვნით, ვინაიდან ვვარაუდობთ აშკარა წინააღმდეგობას: ებინგჰაუსმა გაზომა ერთი სუბიექტის უაზრო ბგერათა კომბინაციების მეხსიერება და მისი ეკოლოგიური ვალიდურობა სემანტიკურად მდიდარი დიალოგისთვის შეზღუდულია. შესაბამისად, წინამდებარე ნაშრომი არ ამტკიცებს კოგნიტურ ერთგულებას; ის გრაციოზულ, დროზე და თვალსაჩინოობაზე დამოკიდებულ გახანგრძლივებას განიხილავს, როგორც ინჟინერიული თვალსაზრისით სასარგებლო ქცევის ფორმას, რომლის ობიექტიც მომხმარებლის აღქმაზე მისი გავლენაა და არა — ფსიქოლოგიური სიზუსტე. მისი საფირმო ნიშანია არამეორებული დეტალების გრაციოზული გაქრობა და იმის გაძლიერება, რაც მეორდება.</w:t>
-      </w:r>
-    </w:p>
-    <w:p>
-      <w:pPr/>
-      <w:r>
-        <w:rPr>
-          <w:rFonts w:ascii="Sylfaen" w:hAnsi="Sylfaen" w:cs="Sylfaen"/>
-          <w:b w:val="0"/>
-          <w:sz w:val="24"/>
-        </w:rPr>
-        <w:t>დუნე კვალითეორია. რეინა და ბრენერდი [24] მიიჩნევენ, რომ ნებისმიერი გამოცდილება ერთდროულად ტოვებს ორ დამოუკიდებელ კვალს — ზედაპირული ფორმის სიტყვასიტყვით ჩანაწერს (ვერბატიმი) და მისი მნიშვნელობის არსებით ჩანაწერს (გიუსტი), რომელთაგან უკანასკნელი უფრო დიდხანს ძლებს და უფრო ხშირად წარმართავს შეფასებას. ეს განასხვავება პირდაპირ უკავშირდება ჩვენი კვლევის კითხვას: სიტყვასიტყვითი/მთავარი აზრის კონტრასტი ემთხვევა ქვემოთ განხილულ ცენტრალურ ემპირიულ აღმოჩენას — რომ ჩატ-ბოტის მიერ სიტყვასიტყვითი გახსენება შეიძლება შემაწუხებლად აღიქმებოდეს იქ, სადაც პარაფრაზირებული, მთავარი აზრის დონის გახსენება — არა [11]. პარტნიორი, რომელიც თქვენი ნათქვამის ზუსტი სიტყვების ნაცვლად მის მნიშვნელობას იხსენებს, აჩვენებს ცნობად ადამიანურ კვალს და, ამავდროულად, შესაძლოა თავიდან აიცილოს სრული გახსენების დისკომფორტი.</w:t>
-      </w:r>
-    </w:p>
-    <w:p>
-      <w:pPr/>
-      <w:r>
-        <w:rPr>
-          <w:rFonts w:ascii="Sylfaen" w:hAnsi="Sylfaen" w:cs="Sylfaen"/>
-          <w:b w:val="0"/>
-          <w:sz w:val="24"/>
-        </w:rPr>
-        <w:t>კონსოლიდაცია: კომპლემენტარული სასწავლო სისტემები და ჰიპოკამპური ინდექსაცია. ორი ნეიროკოგნიტური თეორია აღწერს, თუ როგორ იქცევა ეპიზოდური გამოცდილება ხანგრძლივ ცოდნად. კომპლემენტარული სასწავლო სისტემების მიდგომის [25] თანახმად, ერთი სისტემა, რომელიც ჰიპოკამპუსზეა ცენტრირებული, ინდივიდუალურ ეპიზოდებს სწრაფად აღიქვამს, მაშინ როცა მეორე, კორტიკული სისტემა განმეორებად სტრუქტურას მხოლოდ ნელა აკონსოლიდებს, და ოფლაინ გამეორება გადატანას უზრუნველყოფს ჩაწერილ ინფორმაციას ამ ნელი საცავისკენ. ინდექსაციის თეორია [26] ამატებს, რომ ჰიპოკამპს არც კი სჭირდება მეხსიერების შენახვა — მას უბრალოდ აქვს მითითებები იმ კორტიკულ ნიმუშებზე, რომლებიც მათ ქმნიდა, ასე რომ, მინიშნების ფრაგმენტს შეუძლია მთლიანი მეხსიერების აღდგენა. ორივე მათგანი პროგნოზირებს ერთსა და იმავე მაღალი დონის ქცევით ხელწერას — აგენტს, რომელიც ეპიზოდებს სწრაფად იმახსოვრებს, მაგრამ მათ ინტერაქციებს შორის პერიოდში სტრუქტურირებულ ცოდნად რეორგანიზებას ახდენს — და ორივეს, როგორც 2.4-შია ნაჩვენები, ჰყავს პირდაპირი გამოთვლითი შთამომავლები.</w:t>
+        <w:t>ეპიზოდური და სემანტიკური განასხვავებლობა. ტულვინგმა [22] ზღვარი გაავლო კონკრეტული მოვლენის დამახსოვრებას, რომლის განთავსებაც საკუთარ წარსულშია შესაძლებელი ("გასულ სამშაბათს შენი დედლაინის შესახებ ახსენე"), და უბრალოდ ფაქტის ცოდნას შორის, რომელიც თავისი თავდაპირველი კონტექსტისგან არის მოშორებული ("შენ დედლაინების ქვეშ მუშაობ") — ეპიზოდურ და სემანტიკურ მეხსიერებას შორის. ეს გამიჯვნა ფუნდამენტურია წინამდებარე ნაშრომისთვის, რადგან ორი სისტემა აშკარად განსხვავებულ საუბრის მანერას ქმნის: ეპიზოდური პარტნიორი კონკრეტულ მომენტებს იხსენებს, ხოლო სემანტიკური პარტნიორი მათ მომხმარებლის შესახებ სტაბილურ ცოდნად აქცევს. პირველის მეორედ გარდაქმნა — კონსოლიდაცია — სწორედ ის პროცესია, რომელიც ხანგრძლივ საუბრის სისტემას უნდა შეასრულოს, რათა "დაუმუშავებელ" ეპიზოდებში არ ჩაიძიროს.</w:t>
+      </w:r>
+    </w:p>
+    <w:p>
+      <w:pPr/>
+      <w:r>
+        <w:rPr>
+          <w:rFonts w:ascii="Sylfaen" w:hAnsi="Sylfaen" w:cs="Sylfaen"/>
+          <w:b w:val="0"/>
+          <w:sz w:val="24"/>
+        </w:rPr>
+        <w:t>დავიწყების მრუდი. ებინგჰაუსის მეცხრამეტე საუკუნის ექსპერიმენტებმა [23] აჩვენა, რომ მეხსიერების სიძლიერე მცირდება დაახლოებით ექსპონენციურად იმ დროის გასვლის მიხედვით, რაც რაიმეს ბოლოს გამეორებიდან გავიდა, და რომ დროში გადანაწილებული განმეორებები ამ კლებას ამცირებს. ჩვენ ვიყენებთ დავიწყების მრუდს ერთი მკაფიო შენიშვნით, ვინაიდან ვვარაუდობთ აშკარა წინააღმდეგობას: ებინგჰაუსმა გაზომა ერთი სუბიექტის უაზრო ბგერათა კომბინაციების მეხსიერება და მისი ეკოლოგიური ვალიდურობა სემანტიკურად მდიდარი დიალოგისთვის შეზღუდულია. შესაბამისად, წინამდებარე ნაშრომი არ ამტკიცებს კოგნიტურ ერთგულებას; ის გრაციოზულ, დროზე და თვალსაჩინოობაზე დამოკიდებულ დაქრობას განიხილავს, როგორც ინჟინერიული თვალსაზრისით სასარგებლო ქცევის ფორმას, რომლის ობიექტიც მომხმარებლის აღქმაზე მისი გავლენაა და არა — ფსიქოლოგიური სიზუსტე. მისი საფირმო ნიშანია არამეორებული დეტალების გრაციოზული გაქრობა და იმის გაძლიერება, რაც მეორდება.</w:t>
+      </w:r>
+    </w:p>
+    <w:p>
+      <w:pPr/>
+      <w:r>
+        <w:rPr>
+          <w:rFonts w:ascii="Sylfaen" w:hAnsi="Sylfaen" w:cs="Sylfaen"/>
+          <w:b w:val="0"/>
+          <w:sz w:val="24"/>
+        </w:rPr>
+        <w:t>ბუნდოვანი კვალის თეორია. რეინა და ბრენერდი [24] მიიჩნევენ, რომ ნებისმიერი გამოცდილება ერთდროულად ტოვებს ორ დამოუკიდებელ კვალს — ზედაპირული ფორმის სიტყვასიტყვით ჩანაწერს (ვერბატიმი) და მისი მნიშვნელობის არსებით ჩანაწერს (gist), რომელთაგან უკანასკნელი უფრო დიდხანს ძლებს და უფრო ხშირად წარმართავს შეფასებას. ეს განასხვავება პირდაპირ უკავშირდება ჩვენი კვლევის კითხვას: სიტყვასიტყვითი/მთავარი აზრის კონტრასტი ემთხვევა ქვემოთ განხილულ ცენტრალურ ემპირიულ აღმოჩენას — რომ ჩატ-ბოტის მიერ სიტყვასიტყვითი გახსენება შეიძლება შემაწუხებლად აღიქმებოდეს იქ, სადაც პარაფრაზირებული, მთავარი აზრის დონის გახსენება — არა [11]. პარტნიორი, რომელიც თქვენი ნათქვამის ზუსტი სიტყვების ნაცვლად მის მნიშვნელობას იხსენებს, აჩვენებს ცნობად ადამიანურ კვალს და, ამავდროულად, შესაძლოა თავიდან აიცილოს სრული გახსენების დისკომფორტი.</w:t>
+      </w:r>
+    </w:p>
+    <w:p>
+      <w:pPr/>
+      <w:r>
+        <w:rPr>
+          <w:rFonts w:ascii="Sylfaen" w:hAnsi="Sylfaen" w:cs="Sylfaen"/>
+          <w:b w:val="0"/>
+          <w:sz w:val="24"/>
+        </w:rPr>
+        <w:t>კონსოლიდაცია: კომპლემენტარული სასწავლო სისტემები და ჰიპოკამპური ინდექსაცია. ორი ნეიროკოგნიტური თეორია აღწერს, თუ როგორ იქცევა ეპიზოდური გამოცდილება ხანგრძლივ ცოდნად. კომპლემენტარული სასწავლო სისტემების მიდგომის [25] თანახმად, ერთი სისტემა, რომელიც ჰიპოკამპუსზეა ცენტრირებული, ინდივიდუალურ ეპიზოდებს სწრაფად აღიქვამს, მაშინ როცა მეორე, კორტიკული სისტემა განმეორებად სტრუქტურას მხოლოდ ნელა აკონსოლიდებს, და ოფლაინ გამეორება გადატანას უზრუნველყოფს ჩაწერილ ინფორმაციას ამ ნელი საცავისკენ. ინდექსაციის თეორია [26] ამატებს, რომ ჰიპოკამპს არც კი სჭირდება მეხსიერების შენახვა — მას უბრალოდ აქვს მითითებები იმ კორტიკულ ნიმუშებზე, რომლებიც მათ ქმნიდა, ასე რომ, მინიშნების ფრაგმენტს შეუძლია მთლიანი მეხსიერების აღდგენა. ორივე მათგანი პროგნოზირებს ერთსა და იმავე მაღალი დონის ქცევით სიგნატურას — აგენტს, რომელიც ეპიზოდებს სწრაფად იმახსოვრებს, მაგრამ მათ ინტერაქციებს შორის პერიოდში სტრუქტურირებულ ცოდნად რეორგანიზებას ახდენს — და ორივეს, როგორც 2.4-შია ნაჩვენები, ჰყავს პირდაპირი გამოთვლითი შთამომავლები.</w:t>
       </w:r>
     </w:p>
     <w:p>
@@ -2911,18 +2911,18 @@
           <w:b w:val="0"/>
           <w:sz w:val="24"/>
         </w:rPr>
-        <w:t>პირველი ტალღა — კონტექსტის ვირტუალიზაცია და ადამიანის მიერ შთაგონებული ადრეული საცავები (2023). პირველ სისტემებში შეზღუდული კონტექსტური ფანჯარა აღიქმებოდა როგორც მართვადი შეზღუდვა. MemGPT [17] იღებს ოპერაციული სისტემის ვირტუალური მეხსიერების იდეას: ფუნქციების გამოძახების მეშვეობით თავად მოდელი გადააქვს ინფორმაცია კონტექსტში არსებულ "ძირითად" საცავსა და კონტექსტისგარეშე არსებულ, უფრო დიდ არქივულ და მოხმობის დონეებს შორის, რითაც ქმნის საკუთარ იერარქიას. პარალელურად, ორმა სისტემამ შთაგონების წყაროდ ადამიანის მეხსიერება გამოიყენა. Generative Agents-ის არქიტექტურამ [10] შემოიღო უკვე კანონიკური "მეხსიერების ნაკადი": დაკვირვებების ქრონოლოგიური, ბუნებრივი ენის ლოგფაილი. როდესაც საცავს ეკითხებიან, თითოეული ჩანაწერი რანჟირებულია სამი ფაქტორის შერწყმით — რამდენად ახლახან მოხდა მასზე წვდომა (ექსპონენციური კლება), რამდენად მნიშვნელოვნად მიიჩნია მოდელმა (LLM-ის მიერ მინიჭებული შეფასება) და რამდენად რელევანტურია ის მოთხოვნასთან (ემბედინგის მსგავსება) — ხოლო პერიოდული "რეფლექსიის" ეტაპები ჟურნალიდან უფრო მაღალი დონის დაკვირვებებს გამოაქვს. მნიშვნელოვანია ზუსტად აღინიშნოს, რა არის და რა არ არის ეს: მონაცემების მოძიების ქულა (retrieval score) გვახსენებს აქტივაციაზე დაფუძნებულ თეორიებს, როგორიცაა ACT-R, მაგრამ ის ავტორების საკუთარი საინჟინრო კონსტრუქციაა და არ არის ნებისმიერი კოგნიტური მოდელისგან ნაწარმოები — ეს არის განსხვავება, რომელსაც ვიცავთ თეორიული მემკვიდრეობის გადაჭარბების თავიდან ასაცილებლად. ამის საპირისპიროდ, MemoryBank [6] პირდაპირ ეფუძნებოდა ებინგჰაუსის დავიწყების კრუგს და თითოეული მოგონების სიძლიერეს მოდელირებდა გასული დროის ექსპონენციალურ ფუნქციად, რომელიც ხელახალი წვდომისას ძლიერდებოდა; ის ამუშავებდა SiliconFriend-ს, გრძელვადიან "კომპანიონის" ტიპის ჩატ-ბოტს და ამჟამინდელი ნაშრომის უახლოეს პირდაპირ პრეცედენტს (უახლოესს გამოცხადებული კრიტერიუმით: სისტემა ეგრეთ წოდებულ "კომპანიონის" ჟანრში, რომლის მეხსიერებაც ადამიანის მეხსიერების თეორიაზეა დაფუძნებული).</w:t>
-      </w:r>
-    </w:p>
-    <w:p>
-      <w:pPr/>
-      <w:r>
-        <w:rPr>
-          <w:rFonts w:ascii="Sylfaen" w:hAnsi="Sylfaen" w:cs="Sylfaen"/>
-          <w:b w:val="0"/>
-          <w:sz w:val="24"/>
-        </w:rPr>
-        <w:t>მეორე ტალღა — საწარმოო მეხსიერების ფენები და ნეირო-შთაგონებული მოძიების მექანიზმები (2024–2025). მეორე ტალღა კვლევითი პროტოტიპებიდან გადავიდა გამოყენებადი მეხსიერების სერვისებისა და ნეირომეცნიერებიდან ნასესხები მონაცემების მოძიების მექანიზმებისკენ. Mem0 [29] ახორციელებს მეხსიერების ფენას, რომელიც დიალოგიდან გამოყოფს მნიშვნელოვან ფაქტებს და თანდათანობით ახდენს კონსოლიდირებული საცავის განახლებას; მისი ავტორები იუწყებიან მნიშვნელოვან გაუმჯობესებას ძლიერ საწყის მაჩვენებელთან შედარებით საუბრის მეხსიერების ამოცანებში, ლატენტურობისა და ტოკენების ხარჯის მნიშვნელოვან შემცირებასთან ერთად. Zep [30], რომელიც Graphiti-ს დროში გათვლილ ცოდნის გრაფის ძრავაზეა აგებული, მეხსიერებას წარმოაჩენს, როგორც ორდროით გრაფს, რომელიც თვალყურს ადევნებს როგორც იმას, თუ როდის მოხდა მოვლენა, ასევე იმას, თუ როდის დაფიქსირდა ის; მისი ავტორები ასევე იუწყებიან სიზუსტის გაუმჯობესებასა და შეყოვნების მნიშვნელოვან შემცირებას გრძელვადიანი მეხსიერების შეფასებისას (მომწოდებლის მიერ მოწოდებული ეს მონაცემები უნდა განვიხილოთ 2.5-ში აღწერილი ბენჩმარკის საიმედოობასთან დაკავშირებული საკითხების ფონზე). ორივე მათგანი აღნიშნავს ტალღის განმსაზღვრელ ცვლილებას — პირველ ტალღაში არსებული ეპიზოდების უბრალო აღრიცხვიდან მუდმივად კონსოლიდირებული საცავის შენარჩუნებისკენ — და ორივე წინა პლანზე წამოსწევს შეყოვნებასა და ხარჯებს, რაც მიუთითებს კვლევითი პროტოტიპიდან საწარმოო სერვისზე გადასვლაზე. ამ ტალღის ორი სისტემა განსაკუთრებით თეორიული ინტერესის საგანია. HippoRAG [7] უშუალოდ ოპერაციულს ხდის ჰიპოკამპური მეხსიერების ინდექსაციის თეორიას: ის დიდი ენის მოდელს (LLM) ნეოკორტექსად წარმოაჩენს, მონაცემების მოძიების კოდირატორებს — პარահიპოკამპურ რეგიონად, ხოლო პერსონალიზებული PageRank-ით დათვალიერებად ცოდნის გრაფს — ჰიპოკამპურ ინდექსად, რითაც გრაფის ძიების მეშვეობით მრავალნახტომიან მონაცემთა მოძიებას აღწევს. EM-LLM [8] ეფუძნება ადამიანის ეპიზოდურ მეხსიერებასა და მოვლენების სეგმენტაციის თეორიას [31], ტოკენების ნაკადს ყოფს დისკრეტულ მოვლენებად ბაიესის "გაკვირვების" (surprise) საფუძველზე გამოვლენილ საზღვრებზე და მათ იძიებს მსგავსებაზე დაფუძნებული და დროში მიმდევრობითი წვდომის კომბინაციით. იმავე პერიოდის ReadAgent-ი [9] იდეას "მთავარი აზრის" შესახებ პრაქტიკაში ნერგავს: ის გრძელ კონტექსტს ეპიზოდის ზომის გვერდებად ყოფს, თითოეულისგან მხოლოდ LLM-ის მიერ შექმნილ მთავარ აზრს ინახავს და საწყის ტექსტს მხოლოდ მაშინ უბრუნდება, როდესაც ამოცანა დეტალებს მოითხოვს. კიდევ ერთი აღსანიშნავი სისტემა, A-MEM [27], მოგონებებს აწყობს, როგორც ჩანაწერების ურთიერთდაკავშირებული ქსელი, რომელსაც აგენტი თავად აფართოებს და ასწორებს; თუმცა, ჩვენ აღვნიშნავთ, რომ ის ეფუძნება Zettelkasten-ის მეთოდს, რომელიც ინფორმაციის ორგანიზების პრაქტიკაა და არა ადამიანის მეხსიერების თეორია — ეს განასხვავება მნიშვნელოვანია ჩვენი კონკრეტული ჩარჩოსთვის.</w:t>
+        <w:t>პირველი ტალღა — კონტექსტის ვირტუალიზაცია და ადამიანის მიერ შთაგონებული ადრეული საცავები (2023). პირველ სისტემებში შეზღუდული კონტექსტური ფანჯარა აღიქმებოდა როგორც მართვადი შეზღუდვა. MemGPT [17] იღებს ოპერაციული სისტემის ვირტუალური მეხსიერების იდეას: ფუნქციების გამოძახების მეშვეობით თავად მოდელი გადააქვს ინფორმაცია კონტექსტში არსებულ "ძირითად" საცავსა და კონტექსტისგარეშე არსებულ, უფრო დიდ არქივულ და მოხმობის დონეებს შორის, რითაც ქმნის საკუთარ იერარქიას. პარალელურად, ორმა სისტემამ შთაგონების წყაროდ ადამიანის მეხსიერება გამოიყენა. Generative Agents-ის არქიტექტურამ [10] შემოიღო უკვე კანონიკური "მეხსიერების ნაკადი": დაკვირვებების ქრონოლოგიური, ბუნებრივი ენის ლოგფაილი. როდესაც საცავს ეკითხებიან, თითოეული ჩანაწერი რანჟირებულია სამი ფაქტორის შერწყმით — რამდენად ახლახან მოხდა მასზე წვდომა (ექსპონენციური კლება), რამდენად მნიშვნელოვნად მიიჩნია მოდელმა (LLM-ის მიერ მინიჭებული შეფასება) და რამდენად რელევანტურია ის მოთხოვნასთან (ემბედინგის მსგავსება) — ხოლო პერიოდული "რეფლექსიის" ეტაპები ჟურნალიდან უფრო მაღალი დონის დაკვირვებებს გამოაქვს. მნიშვნელოვანია ზუსტად აღინიშნოს, რა არის და რა არ არის ეს: მონაცემების მოძიების ქულა (retrieval score) გვახსენებს აქტივაციაზე დაფუძნებულ თეორიებს, როგორიცაა ACT-R, მაგრამ ის ავტორების საკუთარი საინჟინრო კონსტრუქციაა და არ არის ნებისმიერი კოგნიტური მოდელისგან ნაწარმოები — ეს არის განსხვავება, რომელსაც ვიცავთ თეორიული მემკვიდრეობის გადაჭარბების თავიდან ასაცილებლად. ამის საპირისპიროდ, MemoryBank [6] პირდაპირ ეფუძნებოდა ებინგჰაუსის დავიწყების მრუდს და თითოეული მოგონების სიძლიერეს მოდელირებდა გასული დროის ექსპონენციალურ ფუნქციად, რომელიც ხელახალი წვდომისას ძლიერდებოდა; ის ამუშავებდა SiliconFriend-ს, გრძელვადიან "კომპანიონის" ტიპის ჩატ-ბოტს და ამჟამინდელი ნაშრომის უახლოეს პირდაპირ პრეცედენტს (უახლოესს გამოცხადებული კრიტერიუმით: სისტემა ეგრეთ წოდებულ "კომპანიონის" ჟანრში, რომლის მეხსიერებაც ადამიანის მეხსიერების თეორიაზეა დაფუძნებული).</w:t>
+      </w:r>
+    </w:p>
+    <w:p>
+      <w:pPr/>
+      <w:r>
+        <w:rPr>
+          <w:rFonts w:ascii="Sylfaen" w:hAnsi="Sylfaen" w:cs="Sylfaen"/>
+          <w:b w:val="0"/>
+          <w:sz w:val="24"/>
+        </w:rPr>
+        <w:t>მეორე ტალღა — საწარმოო მეხსიერების ფენები და ნეირო-შთაგონებული მოძიების მექანიზმები (2024–2025). მეორე ტალღა კვლევითი პროტოტიპებიდან გადავიდა გამოყენებადი მეხსიერების სერვისებისა და ნეირომეცნიერებიდან ნასესხები მონაცემების მოძიების მექანიზმებისკენ. Mem0 [29] ახორციელებს მეხსიერების ფენას, რომელიც დიალოგიდან გამოყოფს მნიშვნელოვან ფაქტებს და თანდათანობით ახდენს კონსოლიდირებული საცავის განახლებას; მისი ავტორები იუწყებიან მნიშვნელოვან გაუმჯობესებას ძლიერ საწყის მაჩვენებელთან შედარებით საუბრის მეხსიერების ამოცანებში, დაყოვნებისა და ტოკენების ხარჯის მნიშვნელოვან შემცირებასთან ერთად. Zep [30], რომელიც Graphiti-ს დროში გათვლილ ცოდნის გრაფის ძრავაზეა აგებული, მეხსიერებას წარმოაჩენს, როგორც ორდროით გრაფს, რომელიც თვალყურს ადევნებს როგორც იმას, თუ როდის მოხდა მოვლენა, ასევე იმას, თუ როდის დაფიქსირდა ის; მისი ავტორები ასევე იუწყებიან სიზუსტის გაუმჯობესებასა და შეყოვნების მნიშვნელოვან შემცირებას გრძელვადიანი მეხსიერების შეფასებისას (მომწოდებლის მიერ მოწოდებული ეს მონაცემები უნდა განვიხილოთ 2.5-ში აღწერილი ბენჩმარკის საიმედოობასთან დაკავშირებული საკითხების ფონზე). ორივე მათგანი აღნიშნავს ტალღის განმსაზღვრელ ცვლილებას — პირველ ტალღაში არსებული ეპიზოდების უბრალო აღრიცხვიდან მუდმივად კონსოლიდირებული საცავის შენარჩუნებისკენ — და ორივე წინა პლანზე წამოსწევს შეყოვნებასა და ხარჯებს, რაც მიუთითებს კვლევითი პროტოტიპიდან საწარმოო სერვისზე გადასვლაზე. ამ ტალღის ორი სისტემა განსაკუთრებით თეორიული ინტერესის საგანია. HippoRAG [7] უშუალოდ ოპერაციულს ხდის ჰიპოკამპური მეხსიერების ინდექსაციის თეორიას: ის დიდი ენის მოდელს (LLM) ნეოკორტექსად წარმოაჩენს, მონაცემების მოძიების კოდირატორებს — პარահიპოკამპურ რეგიონად, ხოლო პერსონალიზებული PageRank-ით დათვალიერებად ცოდნის გრაფს — ჰიპოკამპურ ინდექსად, რითაც გრაფის ძიების მეშვეობით მრავალნახტომიან მონაცემთა მოძიებას აღწევს. EM-LLM [8] ეფუძნება ადამიანის ეპიზოდურ მეხსიერებასა და მოვლენების სეგმენტაციის თეორიას [31], ტოკენების ნაკადს ყოფს დისკრეტულ მოვლენებად ბაიესის "გაკვირვების" (surprise) საფუძველზე გამოვლენილ საზღვრებზე და მათ იძიებს მსგავსებაზე დაფუძნებული და დროში მიმდევრობითი წვდომის კომბინაციით. იმავე პერიოდის ReadAgent-ი [9] იდეას "მთავარი აზრის" შესახებ პრაქტიკაში ნერგავს: ის გრძელ კონტექსტს ეპიზოდის ზომის გვერდებად ყოფს, თითოეულისგან მხოლოდ LLM-ის მიერ შექმნილ მთავარ აზრს ინახავს და საწყის ტექსტს მხოლოდ მაშინ უბრუნდება, როდესაც ამოცანა დეტალებს მოითხოვს. კიდევ ერთი აღსანიშნავი სისტემა, A-MEM [27], მოგონებებს აწყობს, როგორც ჩანაწერების ურთიერთდაკავშირებული ქსელი, რომელსაც აგენტი თავად აფართოებს და ასწორებს; თუმცა, ჩვენ აღვნიშნავთ, რომ ის ეფუძნება Zettelkasten-ის მეთოდს, რომელიც ინფორმაციის ორგანიზების პრაქტიკაა და არა ადამიანის მეხსიერების თეორია — ეს განასხვავება მნიშვნელოვანია ჩვენი კონკრეტული ჩარჩოსთვის.</w:t>
       </w:r>
     </w:p>
     <w:p>
@@ -3029,7 +3029,7 @@
                 <w:b/>
                 <w:sz w:val="22"/>
               </w:rPr>
-              <w:t>ქცევითი ხელწერა</w:t>
+              <w:t>ქცევითი სიგნატურა</w:t>
             </w:r>
           </w:p>
         </w:tc>
@@ -3179,7 +3179,7 @@
                 <w:b w:val="0"/>
                 <w:sz w:val="22"/>
               </w:rPr>
-              <w:t>ებინგჰაუზის დავიწყების კურივა [23]</w:t>
+              <w:t>ებინგჰაუსის დავიწყების მრუდი [23]</w:t>
             </w:r>
           </w:p>
         </w:tc>
@@ -3400,7 +3400,7 @@
           <w:b w:val="0"/>
           <w:sz w:val="24"/>
         </w:rPr>
-        <w:t>აქედან გამომდინარეობს ორი დაკვირვება. პირველი, რუკირება რეალურია, მაგრამ ნაწილობრივი: თეორიულად დასაბუთებული თითოეული სისტემა იყენებს ერთ მექანიზმს, იზოლირებულად და, უმთავრესად, ამოცანის სიზუსტის გასაუმჯობესებლად. მეორე — და ეს არის საკითხი, რომელსაც წინამდებარე ნაშრომი ეხება — რომ ეს თეორიულად დასაბუთებული სისტემები იშვიათად შედარებულა ერთმანეთთან და, ჩვენი ცოდნით, არასდროს — იმის თვალსაზრისით, თუ როგორ აღიქვამს მათ განსხვავებულ ქცევას ადამიანი-საუბრის პარტნიორი. უახლოესი პრეცედენტები ან ერთ სისტემაში აერთიანებენ მექანიზმებს, ან აფასებენ ერთი მექანიზმის სიზუსტეს. სინთეზი, რომელსაც შედარებითი, აღქმაზე ორიენტირებული კვლევა უზრუნველყოფდა, ამჟამად არ არსებობს.</w:t>
+        <w:t>აქედან გამომდინარეობს ორი დაკვირვება. პირველი, რუკირება რეალურია, მაგრამ ნაწილობრივი: თეორიულად დასაბუთებული თითოეული სისტემა იყენებს ერთ მექანიზმს, იზოლირებულად და, უმთავრესად, ამოცანის სიზუსტის გასაუმჯობესებლად. მეორე — და ეს არის საკითხი, რომელსაც წინამდებარე ნაშრომი ეხება — რომ ეს თეორიულად დასაბუთებული სისტემები იშვიათად შედარებულა ერთმანეთთან და, ჩვენი ცოდნით, არასდროს — იმის თვალსაზრისით, თუ როგორ აღიქვამს მათ განსხვავებულ ქცევას ადამიანი-თანამოსაუბრე. უახლოესი პრეცედენტები ან ერთ სისტემაში აერთიანებენ მექანიზმებს, ან აფასებენ ერთი მექანიზმის სიზუსტეს. სინთეზი, რომელსაც შედარებითი, აღქმაზე ორიენტირებული კვლევა უზრუნველყოფდა, ამჟამად არ არსებობს.</w:t>
       </w:r>
     </w:p>
     <w:p>
@@ -3449,7 +3449,7 @@
           <w:b w:val="0"/>
           <w:sz w:val="24"/>
         </w:rPr>
-        <w:t>კიდევ ერთი, და ამ ნაშრომისთვის გადამწყვეტი, შეზღუდვა მოდალობასა და შედეგს ეხება. აქ განხილული ყველა ძირითადი გრძელვადიანი მეხსიერების ბენჩმარკი — LoCoMo, LongMemEval და უფრო ძველი Multi-Session Chat [35] — მუშაობს მხოლოდ ტექსტზე და ზომავს ფაქტობრივ სიზუსტეს და არა გამოცდილ ხარისხს. არცერთი მათგანი არ ეხება მეხსიერების მოძიებას ხმოვანი ურთიერთქმედების რეალურ დროში შეფერხებების პირობებში და არცერთი არ ზომავს, უმჯობესებს თუ არა უკეთესი მეხსიერება ურთიერთობას. ამ ქვედარგის ინსტრუმენტებს შეუძლიათ გვითხრან, სწორად იხსენებს თუ არა სისტემა; მათ არ შეუძლიათ გვითხრან, აუმჯობესებს თუ არა ზუსტი გახსენება მომხმარებლის მიერ სისტემასთან განცდილ ურთიერთობას — მის აღქმულ სოციალურ თანადგომას, ალიანსს ან ადამიანურობას.</w:t>
+        <w:t>კიდევ ერთი, და ამ ნაშრომისთვის გადამწყვეტი, შეზღუდვა მოდალობასა და შედეგს ეხება. აქ განხილული ყველა ძირითადი გრძელვადიანი მეხსიერების ბენჩმარკი — LoCoMo, LongMemEval და უფრო ძველი Multi-Session Chat [35] — მუშაობს მხოლოდ ტექსტზე და ზომავს ფაქტობრივ სიზუსტეს და არა გამოცდილ ხარისხს. არცერთი მათგანი არ ეხება მეხსიერების მოძიებას ხმოვანი ურთიერთქმედების რეალურ დროში შეფერხებების პირობებში და არცერთი არ ზომავს, უმჯობესებს თუ არა უკეთესი მეხსიერება ურთიერთობას. ამ ქვედარგის ინსტრუმენტებს შეუძლიათ გვითხრან, სწორად იხსენებს თუ არა სისტემა; მათ არ შეუძლიათ გვითხრან, აუმჯობესებს თუ არა ზუსტი გახსენება მომხმარებლის მიერ სისტემასთან განცდილ ურთიერთობას — მის აღქმულ სოციალურ თანდასწრებას, ალიანსს ან ადამიანურობას.</w:t>
       </w:r>
     </w:p>
     <w:p>
@@ -3465,18 +3465,18 @@
           <w:b/>
           <w:sz w:val="26"/>
         </w:rPr>
-        <w:t>2.6 დამხმარედან თანამოსაუბრემდე: მეხსიერება და აღქმული ურთიერთობა</w:t>
-      </w:r>
-    </w:p>
-    <w:p>
-      <w:pPr/>
-      <w:r>
-        <w:rPr>
-          <w:rFonts w:ascii="Sylfaen" w:hAnsi="Sylfaen" w:cs="Sylfaen"/>
-          <w:b w:val="0"/>
-          <w:sz w:val="24"/>
-        </w:rPr>
-        <w:t>სისტემის აღქმა, როგორც უბრალო ასისტენტისა, ან როგორც საუბრის პარტნიორის, ნაკლებად არის დამოკიდებული სიზუსტეზე და მეტად — ურთიერთობაზე. ამ ურთიერთობის შესწავლა კი სხვა ლიტერატურის სფეროს განეკუთვნება, რომელიც ეფუძნება დაკვირვებას, რომ ადამიანები სოციალურად რეაგირებენ გამოთვლით აგენტებზე: პარადიგმას "კომპიუტერები სოციალური აქტორები არიან" და მის განმარტებას, რომ მედია, მრავალი სოციალური რეფლექსის თვალსაზრისით, რეალური ინტერაქციის პარტნიორების ეკვივალენტურია [28]. ამ ჩარჩოში, არაერთი უახლესი ნაშრომი იკვლევს, თუ რა კონკრეტულად განასხვავებს სისტემას, რომელიც მხოლოდ ასისტენტად აღიქმება, სისტემისგან, რომელიც ურთიერთობათა პარტნიორად აღიქმება; მეხსიერება აქ ცენტრალურ, ორმაგი მახვილის მქონე ბერკეტად განმეორდება.</w:t>
+        <w:t>2.6 ასისტენტიდან თანამოსაუბრემდე: მეხსიერება და აღქმული ურთიერთობა</w:t>
+      </w:r>
+    </w:p>
+    <w:p>
+      <w:pPr/>
+      <w:r>
+        <w:rPr>
+          <w:rFonts w:ascii="Sylfaen" w:hAnsi="Sylfaen" w:cs="Sylfaen"/>
+          <w:b w:val="0"/>
+          <w:sz w:val="24"/>
+        </w:rPr>
+        <w:t>სისტემის აღქმა, როგორც უბრალო ასისტენტისა, ან როგორც თანამოსაუბრის, ნაკლებად არის დამოკიდებული სიზუსტეზე და მეტად — ურთიერთობაზე. ამ ურთიერთობის შესწავლა კი სხვა ლიტერატურის სფეროს განეკუთვნება, რომელიც ეფუძნება დაკვირვებას, რომ ადამიანები სოციალურად რეაგირებენ გამოთვლით აგენტებზე: პარადიგმას "კომპიუტერები სოციალური აქტორები არიან" და მის განმარტებას, რომ მედია, მრავალი სოციალური რეფლექსის თვალსაზრისით, რეალური ინტერაქციის პარტნიორების ეკვივალენტურია [28]. ამ ჩარჩოში, არაერთი უახლესი ნაშრომი იკვლევს, თუ რა კონკრეტულად განასხვავებს სისტემას, რომელიც მხოლოდ ასისტენტად აღიქმება, სისტემისგან, რომელიც ურთიერთობათა პარტნიორად აღიქმება; მეხსიერება აქ ცენტრალურ, ორმაგი მახვილის მქონე ბერკეტად განმეორდება.</w:t>
       </w:r>
     </w:p>
     <w:p>
@@ -3498,7 +3498,7 @@
           <w:b w:val="0"/>
           <w:sz w:val="24"/>
         </w:rPr>
-        <w:t>მეორე ქცევითი ღერძი, რომელიც გამოსარჩევს საუბრის პარტნიორს დამხმარისგან, ინიციატივაა. პროაქტიული აგენტები, რომლებიც აღიქვამენ დიალოგის მნიშვნელოვან მოვლენებს და მათზე რეაგირებენ, ზრდიან ჩართულობასა და აღქმულ მხარდაჭერას, წმინდად რეაქტიულ სტანდარტებთან შედარებით [12]. მსგავს კვლევაში, პროაქტიულობის მოდელი, რომელიც აგენტის "შინაგანი აზრებით" იმართებოდა, მომხმარებლებმა რეაქტიულ საკონტროლო ჯგუფთან შედარების დაახლოებით 82%-იან შემთხვევაში არჩიეს [13]. ინიციატივა, რომელიც მეხსიერებას ეფუძნება — იმის გაგრძელება, რაც მომხმარებელმა რამდენიმე დღით ადრე ახსენა — ალბათ, ყველაზე თვალსაჩინო პარტნიორული ქცევაა, რომელიც სისტემას შეუძლია გამოავლინოს, და ეს ის არის, რისი შესწავლის შესაძლებლობაც ამ ნაშრომის პლატფორმას გააჩნია.</w:t>
+        <w:t>მეორე ქცევითი ღერძი, რომელიც გამოსარჩევს თანამოსაუბრეს ასისტენტისგან, ინიციატივაა. პროაქტიული აგენტები, რომლებიც აღიქვამენ დიალოგის მნიშვნელოვან მოვლენებს და მათზე რეაგირებენ, ზრდიან ჩართულობასა და აღქმულ მხარდაჭერას, წმინდად რეაქტიულ სტანდარტებთან შედარებით [12]. მსგავს კვლევაში, პროაქტიულობის მოდელი, რომელიც აგენტის "შინაგანი აზრებით" იმართებოდა, მომხმარებლებმა რეაქტიულ საკონტროლო ჯგუფთან შედარების დაახლოებით 82%-იან შემთხვევაში არჩიეს [13]. ინიციატივა, რომელიც მეხსიერებას ეფუძნება — იმის გაგრძელება, რაც მომხმარებელმა რამდენიმე დღით ადრე ახსენა — ალბათ, ყველაზე თვალსაჩინო პარტნიორული ქცევაა, რომელიც სისტემას შეუძლია გამოავლინოს, და ეს ის არის, რისი შესწავლის შესაძლებლობაც ამ ნაშრომის პლატფორმას გააჩნია.</w:t>
       </w:r>
     </w:p>
     <w:p>
@@ -3520,7 +3520,7 @@
           <w:b w:val="0"/>
           <w:sz w:val="24"/>
         </w:rPr>
-        <w:t>ამ აღქმების გასაზომად, სფერო გვთავაზობს ვალიდურ ინსტრუმენტებს. ხელოვნური სოციალური აგენტის კითხვარი [14] მოიცავს თვრამეტ კონსტრუქტს — მათ შორის სოციალურ პრეზენციას, მომხმარებლისა და აგენტის ალიანსს და სანდოობას (სუბშკალა, რომლითაც წინამდებარე ნაშრომი ოპერაციულად წარმოაჩენს აღქმულ ადამიანურობას) — გრძელი და მოკლე ვერსიებით და ღიად ხელმისაწვდომია; ეს არის მთავარი ინსტრუმენტი, რომელიც აქ არის გამოყენებული, დამატებულია დაკავშირებული კონსტრუქტებისთვის დადგენილი შკალებით (განსაკუთრებით Godspeed აღქმული ინტელექტისთვის).</w:t>
+        <w:t>ამ აღქმების გასაზომად, სფერო გვთავაზობს ვალიდურ ინსტრუმენტებს. ხელოვნური სოციალური აგენტის კითხვარი [14] მოიცავს ცხრამეტ კონსტრუქტს — მათ შორის სოციალურ თანდასწრებას, მომხმარებლისა და აგენტის ალიანსს და სანდოობას (სუბშკალა, რომლითაც წინამდებარე ნაშრომი ოპერაციულად წარმოაჩენს აღქმულ ადამიანურობას) — გრძელი და მოკლე ვერსიებით და ღიად ხელმისაწვდომია; ეს არის მთავარი ინსტრუმენტი, რომელიც აქ არის გამოყენებული, დამატებულია დაკავშირებული კონსტრუქტებისთვის დადგენილი შკალებით (განსაკუთრებით Godspeed აღქმული ინტელექტისთვის).</w:t>
       </w:r>
     </w:p>
     <w:p>
@@ -3574,7 +3574,7 @@
           <w:b w:val="0"/>
           <w:sz w:val="24"/>
         </w:rPr>
-        <w:t>ზემოთ განხილული ორი სფერო ერთიანდება იმ წერტილში, რომელიც ჩვენთვის ხელმისაწვდომ ლიტერატურაში ცარიელია. ერთი მხრივ, დიდი ენის მოდელების (LLM) მეხსიერების სისტემებიდან თითოეული ერთი კონკრეტული ადამიანის მეხსიერების თეორიის იმპლემენტაციაა, რომელიც შეფასებულია თითქმის ექსკლუზიურად ფაქტობრივი სიზუსტის მიხედვით. მეორე მხრივ, აღქმის კვლევების სერია ადასტურებს, რომ მეხსიერება აყალიბებს — და ასევე შეუძლია შეარყოს — ურთიერთობის აღქმული ხარისხი, მაგრამ მეხსიერებას განიხილავს როგორც ბინარულ ან ერთსისტემურ მანიპულაციას. ჩვენთვის ხელმისაწვდომ ლიტერატურაში — მეხსიერების არქიტექტურისა და ადამიანი-აგენტის აღქმის სფეროებში ჩატარებული სისტემური ძიებების შედეგად — ვერ მოიძებნა არცერთი კონტროლირებადი კვლევა, რომელიც სხვადასხვა ადამიანური მეხსიერების თეორიაზე დაფუძნებულ არქიტექტურებს ერთმანეთს ადარებდეს მომხმარებლის მიერ აღქმული სოციალური კონსტრუქტების მიხედვით და რომლის ობიექტიც ხმის მოდალობაა. წინამდებარე ნაშრომის სიახლე ამ შერწყმაშია — რეალურ ხმოვან სისტემაში თეორიულად დასაბუთებული მეხსიერების არქიტექტურების შედარება, მათი შეფასება აღქმული სოციალური თანადგომის, ალიანსისა და ადამიანურობის მიხედვით — და არა რომელიმე ცალკეული კომპონენტის სიახლეში, რომელთაგან თითოეული იზოლირებულად არსებობს. იმის გასარკვევად, თუ რა არის ნათქვამი და რა — არა: კვლევა უცვლელად ტოვებს ინტერაქციის მოდალობას — მთლიანად ხმის რეჟიმი, ტექსტურ ნაწილს გარეშე — ამგვარად, მისი წვლილი ხმის გარემოში მეხსიერების არქიტექტურის ეფექტებს ეხება და არა ხმის ტექსტთან შედარებას. სწორედ ამ გადაკვეთას იკვლევს ნაშრომის დარჩენილი ნაწილი.</w:t>
+        <w:t>ზემოთ განხილული ორი სფერო ერთიანდება იმ წერტილში, რომელიც ჩვენთვის ხელმისაწვდომ ლიტერატურაში ცარიელია. ერთი მხრივ, დიდი ენის მოდელების (LLM) მეხსიერების სისტემებიდან თითოეული ერთი კონკრეტული ადამიანის მეხსიერების თეორიის იმპლემენტაციაა, რომელიც შეფასებულია თითქმის ექსკლუზიურად ფაქტობრივი სიზუსტის მიხედვით. მეორე მხრივ, აღქმის კვლევების სერია ადასტურებს, რომ მეხსიერება აყალიბებს — და ასევე შეუძლია შეარყოს — ურთიერთობის აღქმული ხარისხი, მაგრამ მეხსიერებას განიხილავს როგორც ბინარულ ან ერთსისტემურ მანიპულაციას. ჩვენთვის ხელმისაწვდომ ლიტერატურაში — მეხსიერების არქიტექტურისა და ადამიანი-აგენტის აღქმის სფეროებში ჩატარებული სისტემური ძიებების შედეგად — ვერ მოიძებნა არცერთი კონტროლირებადი კვლევა, რომელიც სხვადასხვა ადამიანური მეხსიერების თეორიაზე დაფუძნებულ არქიტექტურებს ერთმანეთს ადარებდეს მომხმარებლის მიერ აღქმული სოციალური კონსტრუქტების მიხედვით და რომლის ობიექტიც ხმის მოდალობაა. წინამდებარე ნაშრომის სიახლე ამ შერწყმაშია — რეალურ ხმოვან სისტემაში თეორიულად დასაბუთებული მეხსიერების არქიტექტურების შედარება, მათი შეფასება აღქმული სოციალური თანდასწრების, ალიანსისა და ადამიანურობის მიხედვით — და არა რომელიმე ცალკეული კომპონენტის სიახლეში, რომელთაგან თითოეული იზოლირებულად არსებობს. იმის გასარკვევად, თუ რა არის ნათქვამი და რა — არა: კვლევა უცვლელად ტოვებს ინტერაქციის მოდალობას — მთლიანად ხმის რეჟიმი, ტექსტურ ნაწილს გარეშე — ამგვარად, მისი წვლილი ხმის გარემოში მეხსიერების არქიტექტურის ეფექტებს ეხება და არა ხმის ტექსტთან შედარებას. სწორედ ამ გადაკვეთას იკვლევს ნაშრომის დარჩენილი ნაწილი.</w:t>
       </w:r>
     </w:p>
     <w:p>
@@ -3618,18 +3618,18 @@
           <w:b w:val="0"/>
           <w:sz w:val="24"/>
         </w:rPr>
-        <w:t>ეს თავი განსაზღვრავს დიზაინის, კონცეფციის დამტკიცებისა და შეფასების-მეთოდოლოგიური სადისერტაციო ნაშრომის მეთოდოლოგიას. 1.2-ში მითითებული მიზნის — ხმოვანი საუბრის პარტნიორის სისტემისთვის კოგნიტურ თეორიებზე დაფუძნებული გრძელვადიანი მეხსიერების არქიტექტურის შემუშავება და მისი გავლენის დადგენა მომხმარებლის მიერ აღქმულ სოციალურ კონსტრუქტებზე — შესაბამისად, ნაშრომი სამ კოორდინირებულ წვლილს შეაქვს, და მნიშვნელოვანია თავიდანვე აღინიშნოს, რომელთაგან რომელი სრულდება აქ, ხოლო რომელი მკაცრად არის შემუშავებული, მაგრამ განზრახ გადავადებული.</w:t>
-      </w:r>
-    </w:p>
-    <w:p>
-      <w:pPr/>
-      <w:r>
-        <w:rPr>
-          <w:rFonts w:ascii="Sylfaen" w:hAnsi="Sylfaen" w:cs="Sylfaen"/>
-          <w:b w:val="0"/>
-          <w:sz w:val="24"/>
-        </w:rPr>
-        <w:t>სამი წვლილია: (ა) მეხსიერების არქიტექტურა ("პროფილი C"), რომლის მექანიზმები ეტაპობრივად ეფუძნება ადამიანის მეხსიერების კოგნიტურ თეორიებსა და მათ ქცევით ნიშნებს (3.2); (ბ) კურატორიული კონტროლის მქონე შეფასების მეთოდოლოგია, რომლის ცენტრალური ინსტრუმენტია აქტიური საკონტროლო პირობა — B+ — რომელიც გამოყოფს ადამიანის მეხსიერების დინამიკის ეფექტს LLM-ის კურატორიული სამუშაოების ზოგადი წაკითხვადობის ზრდისგან (3.3); და (გ) კონცეფციის დამტკიცების იმპლემენტაცია არქიტექტურის ორხაზიანი ტექნიკური და სიმულირებული შეფასებისთანავე (3.4–3.5). სრული კვლევა ადამიანთა მონაწილეობით, რომელსაც მიზანი საბოლოოდ ითვალისწინებს, წარმოდგენილია 3.5(c)-ში, როგორც სრულად სპეციფიცირებული, მაგრამ ჯერ არჩატარებული პროტოკოლი — მომავალი ნამუშევარი, საკუთარი ენერგეტიკული ანალიზით — და არა როგორც კვლევა, რომლის მონაცემებიც 4-შია წარმოდგენილი.</w:t>
+        <w:t>ეს თავი განსაზღვრავს დიზაინის, კონცეფციის დამტკიცებისა და შეფასების-მეთოდოლოგიური სადისერტაციო ნაშრომის მეთოდოლოგიას. 1.2-ში მითითებული მიზნის — ხმოვანი თანამოსაუბრის სისტემისთვის კოგნიტურ თეორიებზე დაფუძნებული გრძელვადიანი მეხსიერების არქიტექტურის შემუშავება და მისი გავლენის დადგენა მომხმარებლის მიერ აღქმულ სოციალურ კონსტრუქტებზე — შესაბამისად, ნაშრომი სამ კოორდინირებულ წვლილს შეაქვს, და მნიშვნელოვანია თავიდანვე აღინიშნოს, რომელთაგან რომელი სრულდება აქ, ხოლო რომელი მკაცრად არის შემუშავებული, მაგრამ განზრახ გადავადებული.</w:t>
+      </w:r>
+    </w:p>
+    <w:p>
+      <w:pPr/>
+      <w:r>
+        <w:rPr>
+          <w:rFonts w:ascii="Sylfaen" w:hAnsi="Sylfaen" w:cs="Sylfaen"/>
+          <w:b w:val="0"/>
+          <w:sz w:val="24"/>
+        </w:rPr>
+        <w:t>სამი წვლილია: (ა) მეხსიერების არქიტექტურა ("პროფილი C"), რომლის მექანიზმები ეტაპობრივად ეფუძნება ადამიანის მეხსიერების კოგნიტურ თეორიებსა და მათ ქცევით ნიშნებს (3.2); (ბ) კურატორიული კონტროლის მქონე შეფასების მეთოდოლოგია, რომლის ცენტრალური ინსტრუმენტია აქტიური საკონტროლო პირობა — B+ — რომელიც გამოყოფს ადამიანის მეხსიერების დინამიკის ეფექტს LLM-ის კურატორიული სამუშაოების ზოგადი წაკითხვადობის ზრდისგან (3.3); და (გ) კონცეფციის დამტკიცების იმპლემენტაცია არქიტექტურის ორხაზიანი ტექნიკური და სიმულირებული შეფასებისთანავე (3.4–3.5). სრული კვლევა ადამიანთა მონაწილეობით, რომელსაც მიზანი საბოლოოდ ითვალისწინებს, წარმოდგენილია 3.5(c)-ში, როგორც სრულად სპეციფიცირებული, მაგრამ ჯერ არჩატარებული პროტოკოლი — მომავალი ნამუშევარი, საკუთარი ძალის (სტატისტიკური სიმძლავრის) ანალიზით — და არა როგორც კვლევა, რომლის მონაცემებიც 4-შია წარმოდგენილი.</w:t>
       </w:r>
     </w:p>
     <w:p>
@@ -3651,7 +3651,7 @@
           <w:b w:val="0"/>
           <w:sz w:val="24"/>
         </w:rPr>
-        <w:t>მეორე, უფრო ღრმა შეზღუდვა განსაზღვრავს ინფერენციულ მიდგომას და აქ არის ფორმულირებული, რათა მთელ თავს მართავდეს. ეფექტის ზომის ა-პრიორი ანალიზი (F18), რომელიც ეფუძნება კოქსის კვლევას [11] და დაკავშირებულ სოციალური სიგნალების მტკიცებულებებს, მიუთითებს, რომ სამეცნიეროდ ცენტრალური კონტრასტი — C &gt; B+ — კონსტრუქციულად არის დიზაინში ყველაზე მცირე ეფექტი (კოენსის dz ≈ 0.28 "ცივი სტარტის" გაზავებამდე), რადგან B+ უკვე მოიცავს მეხსიერების ორ ყველაზე მყარად დადასტურებულ სარგებელს: ყოფნას და შინაარსობრივ დონეზე სუფთა პარაფრაზს. ამ კლასის კვლევისთვის ნორმატიული ნიმუშის ზომისთვის (n ≈ 20; F12), ყველაზე მცირე საიმედოდ აღმოჩენადი ეფექტი დაახლოებით dz ≈ 0.78–0.86-ია, ხოლო C &gt; B+-ის აღმოჩენას დასჭირდებოდა n ≈ 116–159 — რაც შეუძლებელია ადამიანისა და აგენტის ურთიერთქმედების ჟანრისთვის. შედეგი განზრახ მიიღეს და არა დამალეს: C &gt; B+ განიხილება როგორც წინასწარ დარეგისტრირებული შეფასების სამიზნე — ეფექტის ზომა 95%-იანი სანდო ინტერვალით — და არა როგორც დამადასტურებელი ნულ-ჰიპოთეზის ტესტი. შედარებები, რომელთა მიმართაც არსებობს მძლავრობა (C &gt; A, და მიმართულებითი B+ &gt; B და C &gt; B), არის დამადასტურებელი ტესტები. C &gt; B+-ზე ზუსტად შეფასებული ნული თავისთავად შინაარსობრივი, გასამოსაჯაროებელი შედეგია: ის მიუთითებდა, რომ "ადამიანის მსგავსი" მეხსიერების აღქმითი ღირებულება განპირობებულია არსებითი შინაარსის მოწესრიგებითა და თანდასწრებით და არა ებინგჰაუზის დაშლით, სალიენს-გეითინგით ან კონსოლიდაციით — დასკვნა, რომლის ინტერპრეტაციისთვისაც B+ კონტროლი სპეციალურად შეიქმნა. შეფასების ეს მიდგომა, შესაბამისად, არ არის სიმკაცრისგან უკან დახევა, არამედ მტკიცებისა და მიღწევადი მტკიცებულების სწორი კალიბრაციაა.</w:t>
+        <w:t>მეორე, უფრო ღრმა შეზღუდვა განსაზღვრავს ინფერენციულ მიდგომას და აქ არის ფორმულირებული, რათა მთელ თავს მართავდეს. ეფექტის ზომის ა-პრიორი ანალიზი (F18), რომელიც ეფუძნება კოქსის კვლევას [11] და დაკავშირებულ სოციალური სიგნალების მტკიცებულებებს, მიუთითებს, რომ სამეცნიეროდ ცენტრალური კონტრასტი — C &gt; B+ — კონსტრუქციულად არის დიზაინში ყველაზე მცირე ეფექტი (კოენსის dz ≈ 0.28 "ცივი სტარტის" გაზავებამდე), რადგან B+ უკვე მოიცავს მეხსიერების ორ ყველაზე მყარად დადასტურებულ სარგებელს: ყოფნას და შინაარსობრივ დონეზე სუფთა პარაფრაზს. ამ კლასის კვლევისთვის ნორმატიული ნიმუშის ზომისთვის (n ≈ 20; F12), ყველაზე მცირე საიმედოდ აღმოჩენადი ეფექტი დაახლოებით dz ≈ 0.78–0.86-ია, ხოლო C &gt; B+-ის აღმოჩენას დასჭირდებოდა n ≈ 116–159 — რაც შეუძლებელია ადამიანისა და აგენტის ურთიერთქმედების ჟანრისთვის. შედეგი განზრახ მიიღეს და არა დამალეს: C &gt; B+ განიხილება როგორც წინასწარ დარეგისტრირებული შეფასების სამიზნე — ეფექტის ზომა 95%-იანი სანდო ინტერვალით — და არა როგორც დამადასტურებელი ნულ-ჰიპოთეზის ტესტი. შედარებები, რომელთა მიმართაც არსებობს მძლავრობა (C &gt; A, და მიმართულებითი B+ &gt; B და C &gt; B), არის დამადასტურებელი ტესტები. C &gt; B+-ზე ზუსტად შეფასებული ნული თავისთავად შინაარსობრივი, გამოსაქვეყნებელი შედეგია: ის მიუთითებდა, რომ "ადამიანის მსგავსი" მეხსიერების აღქმითი ღირებულება განპირობებულია არსებითი შინაარსის მოწესრიგებითა და თანდასწრებით და არა ებინგჰაუსის დაშლით, სალიენს-გეითინგით ან კონსოლიდაციით — დასკვნა, რომლის ინტერპრეტაციისთვისაც B+ კონტროლი სპეციალურად შეიქმნა. შეფასების ეს მიდგომა, შესაბამისად, არ არის სიმკაცრისგან უკან დახევა, არამედ მტკიცებისა და მიღწევადი მტკიცებულების სწორი კალიბრაციაა.</w:t>
       </w:r>
     </w:p>
     <w:p>
@@ -3678,62 +3678,62 @@
           <w:b w:val="0"/>
           <w:sz w:val="24"/>
         </w:rPr>
-        <w:t>პროფილი C არის ერთიანი მეხსიერების ძრავა, რომელიც აერთიანებს ხუთ დადასტურებულ კოგნიტურ-მეხსიერების თეორიას — ატკინსონ-შიფრინის მრავალსაცავო მოდელს [20], ებინგჰაუსის დავიწყების კრუგს [23], ტულვინგის ეპიზოდური და სემანტიკური განასხვავებას [22], ბუნდოვანი კვალით თეორიას [24] და სწავლის კომპლემენტარული სისტემების ჩარჩოს [25] — ერთ სასიცოცხლო ციკლში. ორი დამატებითი წყარო შემოდის, როგორც იმპლემენტაციის პრეცედენტი და ზუსტი გადარქმევა და არა როგორც დამატებითი, ჩართული თეორიები: ჰიპოკამპური ინდექსაცია [7,26] (კონსოლიდაციის უკუკავშირის მითითებებისთვის) და დამუშავების დონეები (კოდირების დროის სალიენსის მექანიზმისთვის). ჩვენ ვამბობთ "შედგება და არა "ერთიანდება": თეორიები ერთმანეთთან თანამშრომლობისთვისაა შექმნილი ერთი კოჰერენტული ობიექტის ფარგლებში, მაგრამ არქიტექტურა არ ამტკიცებს მათ შეთავსებას ფუნდამენტური მექანიზმის დონეზე, და 3.2-ის საფუძვლად ჩათვლილია პროექტირების ეტაპზე მიღებული შთაგონება სახელობითი გამოტოვებებით (იხილეთ ქვემოთ), და არა კოგნიტური ერთგულების პრეტენზია — რაც შეესაბამება 2.2-ში დავიწყების კრუგისთვის უკვე მითითებულ გაფრთხილებას.</w:t>
-      </w:r>
-    </w:p>
-    <w:p>
-      <w:pPr/>
-      <w:r>
-        <w:rPr>
-          <w:rFonts w:ascii="Sylfaen" w:hAnsi="Sylfaen" w:cs="Sylfaen"/>
-          <w:b w:val="0"/>
-          <w:sz w:val="24"/>
-        </w:rPr>
-        <w:t>მეხსიერების ერთეული არის მოვლენა — თემატურად და დროში შემოსაზღვრული თანმიმდევრული მორიგეობების სეგმენტი, ტულვინგის გაგებით ეპიზოდური ატომი [22]. ეს არის მიზანმიმართული არჩევანი ორი ალტერნატივის წინააღმდეგ: უმოყოლო მორიგეობა (ერთეული, რომელსაც იყენებს verbatim RAG, პროფილი B) და იზოლირებული, ამოღებული ფაქტი. მოვლენის არჩევა თავიდან გვაცილებს ფაქტების შერჩევის იმპორტს, როგორც B-ში არარსებული მეორე კონფუუდის, და კონსოლიდაციას — განმეორებადი მოვლენების მდგრად სემანტიკურ ცოდნად გადაქცევას — აქცევს ბუნებრივ, გამოყვანილ ოპერაციად და არა დამატებით კომპონენტად. სიცოცხლის ციკლს ხუთი ეტაპი აქვს; თითოეული მოცემულია, როგორც მექანიზმი · თეორიული საფუძველი · ქცევითი ნიშანი.</w:t>
-      </w:r>
-    </w:p>
-    <w:p>
-      <w:pPr/>
-      <w:r>
-        <w:rPr>
-          <w:rFonts w:ascii="Sylfaen" w:hAnsi="Sylfaen" w:cs="Sylfaen"/>
-          <w:b w:val="0"/>
-          <w:sz w:val="24"/>
-        </w:rPr>
-        <w:t>ეტაპი 1 — კოდირება (მნიშვნელობის მიხედვით გაფილტრული ჩაწერა, ასინქრონული). უმუშავო ტურები არსებობს მხოლოდ დაახლოებით ოცი ტურის მოცულობის ცვალებად სამუშაო ფანჯარაში, რომელიც იდენტურია A და B პირობებისთვის და უცვლელია ყველა პირობისთვის. სინქრონული გზით არაფერი გადადის გრძელვადიან შენახვაზე. სესიის ბოლოს, ასინქრონულად, ბუფერში არსებული ტრანსკრიპტი იყოფა მოვლენებად ჩაშენების მანძილისა და დროითი შუალედის საზღვრებზე (რომელიც EM-LLM-ის [8] ბაიეს-სიურპრიზის სეგმენტაციის იაფი შემცვლელია) და ერთი მცირე-LLM-ის კრიტერიუმების გამოძახებით თითოეულ მოვლენას ეძლევა მნიშვნელობის ქულა ოთხ ა-პრიორი-ფიქსირებულ განზომილებაში: თვითგამოხატვის სიმკვრივე, ემოციური ინტენსივობა, ექსპლიციტური ხაზგასმა ან გამეორება, და მიზნის ან ვალდებულების შინაარსი. ზღვრულზე დაბალი ქულის მქონე მოვლენები რბილად იგდება — ძალიან დაბალი სტაბილურობის მქონე, "ენაზე მდგომი აზრის" მსგავსი კვალი, რომელიც მხოლოდ ძლიერი მინიშნების შემთხვევაში აღდგება — და არა მკაცრად იშლება; გადარჩენილები იღებენ საწყის სტაბილურობას, რომელიც მათ მნიშვნელობასთან არის პროპორციული. გრაუნდინგი: ატკინსონ-შიფრინის მრავალსაწყობიანი მოდელი [20] ყურადღებასა და გამეორებას განიხილავს, როგორც მოკლევადიანი და გრძელვადიანი მეხსიერების საწყობებს შორის გასასვლელს. აქ ჩვენ ვიწყებთ ერთ გულწრფელ გადარქმევას (F18): რადგან აღქმადობა გამოიყენება კოდირებისას, ეს მექანიზმი იმდენადვე არის დამუშავების სიღრმის ან დონეებისა და მეხსიერების ემოციური მოდულაციის მაგალითი, რამდენადაც — წმინდა მოდალური მოდელისა, და მას ასეთადაც მოიხსენიებენ; ის ასევე განსხვავდება Generative Agents-ის [10] მიერ მოძიების დროის მნიშვნელობის შეწონვისგან, რომელსაც 2 აღრიცხავს, როგორც აქტივაციის მსგავსს და არა თეორიიდან გამომდინარეს. ხელწერა: საუბრის პარტნიორი მდგრადად ინახავს იმას, რასაც მომხმარებელი ხაზს უსვამდა, ამხელდა ან რაზეც ბრუნდებოდა, მაშინ როცა შემთხვევითი, ყოველდღიური საუბრები ქრება; დავიწყება აღიქმება როგორც დათბობა და არა როგორც უყურადღებობა, რადგან რბილად უარყოფილი მასალა მკაფიო მინიშნების შემთხვევაში სუსტად, მაგრამ მაინც ექვემდებარება რეკონსტრუქციას.</w:t>
-      </w:r>
-    </w:p>
-    <w:p>
-      <w:pPr/>
-      <w:r>
-        <w:rPr>
-          <w:rFonts w:ascii="Sylfaen" w:hAnsi="Sylfaen" w:cs="Sylfaen"/>
-          <w:b w:val="0"/>
-          <w:sz w:val="24"/>
-        </w:rPr>
-        <w:t>ეტაპი 2 — წარმოდგენა (მთავარი აზრი და სიტყვასიტყვითი საყრდენი, ორმაგი კლება, ასინქრონული). თითოეული მოვლენა ინახავს მთავარ აზრს — მნიშვნელობის, სუბიექტებისა და პოზიციის მოკლე პარაფრაზს — სტრუქტურირებულ ველებთან და ერთ სიტყვასიტყვით საყრდენთან ერთად (არაუმეტეს ერთი წინადადებისა, ყველაზე გამორჩეული ციტატა, რომელიც შენარჩუნებულია დასაბუთებისა და აუდიტისთვის, მაგრამ ნაგულისხმევად არ არის ჩაშენებული). არსი ჩაშენებული, ინიექცირებული ტვირთია; მისი სტაბილურობა ანკერისას აღემატება, ამიტომ მნიშვნელობა ზუსტ ფორმულირებას სცდება. სამართლიანობის შეზღუდვა განსაზღვრავს წარმოდგენას: თითოეული მოვლენის არსის ტვირთი არასდროს აღემატება პროფილი B-ს საშუალო ტურნირის ტექსტურ ტვირთს, ამიტომ C არასდროს იღებს კონტექსტის უფრო მდიდარ ელემენტებს. დაფუძნება: ბუნდოვანი კვალი-თეორია [24] ამტკიცებს პარალელური სიტყვასიტყვითი და არსებითი კვალის არსებობას, სადაც არსებითი კვალი უფრო მდგრადია. ეს კვალი LLM-ებისთვის ReadAgent-ის არსებითი შინაარსის გენერირების [9] მეშვეობით ოპერაციულდება; დიზაინი პირდაპირ ემყარება კოქსის [11] აღმოჩენას, რომლის მიხედვითაც, პარაფრაზირებული მოგონება სასურველია, მაშინ როცა სიტყვასიტყვითი მოგონება კონფიდენციალურობის პრობლემებს ქმნის. ხელწერა: თანამოსაუბრე ამბობს "სასოწარკვეთილი იყავი დედლაინის გამო" ტრანსკრიპტიდან ციტირების ნაცვლად; მომხმარებელს არ შეუძლია დააფიქსიროს, რომ ის მის სიტყვასიტყვით გამეორებას ახდენს. ეს არის C-სა და B-ს შორის ყველაზე მარტივად შესამჩნევი განსხვავება მომხმარებლისთვის და იმ ბერკეტს წარმოადგენს, რომელსაც მეორე ნდობისა და კონფიდენციალურობის პროგნოზი (H2b) მიზნად ისახავს.</w:t>
-      </w:r>
-    </w:p>
-    <w:p>
-      <w:pPr/>
-      <w:r>
-        <w:rPr>
-          <w:rFonts w:ascii="Sylfaen" w:hAnsi="Sylfaen" w:cs="Sylfaen"/>
-          <w:b w:val="0"/>
-          <w:sz w:val="24"/>
-        </w:rPr>
-        <w:t>ეტაპი 3 — დაქრობა და გაძლიერება (ებინგჰაუზი, ზარმაცი, სინქრონული და ასინქრონული). თითოეულ კვალს ახასიათებს აღდგენადობა, რომელიც დროთა განმავლობაში ექსპონენციურად მცირდება ბოლო წვდომის მომენტიდან, მისი სტაბილურობის მიმართულებით, და გამოითვლება ზარმაცულად, აღდგენის მომენტში, როგორც ქულების გამრავლების კოეფიციენტი — არ ხდება ფონური აღრიცხვა და არც სინქრონული ჩაწერა. წარმატებული ხელახალი ხსენება აძლიერებს სტაბილურობას და ცვლის ბოლო წვდომის დროის მაჩვენებელს დროში გაჭიმული გამეორების პრინციპით, მაგრამ ჩაწერა რიგში დგება ოფლაინ რეჟიმში, ასე რომ სინქრონული არხი რჩება მხოლოდ წასაკითხად, ზუსტად ისევე, როგორც B-ში. რაც მთავარია, მე-4 ეტაპის მიერ წარმოქმნილი სემანტიკური ფაქტებიც ქრება, ამიტომ ებინგჰაუზის დინამიკა რჩება ცოცხალ დამოუკიდებელ ცვლადს და არა მუდმივი საცავის ზემოდან დადებულ კოსმეტიკურ ფენას. საფუძველი: ებინგჰაუსის დავიწყების მრუდი [23], MemoryBank/SiliconFriend [6]-ის სახით გამოთვლით პრეცედენტად. ხელწერა: ის, რაც დიდი ხნის წინ ერთხელ იყო ნახსენები, ქრება; რაც კი განმეორებით განიხილება, მდგრადი ხდება — ლამაზი, ბუნებრივი დავიწყება, B-ს შემზარავი სრული გახსენების საპირისპიროდ.</w:t>
-      </w:r>
-    </w:p>
-    <w:p>
-      <w:pPr/>
-      <w:r>
-        <w:rPr>
-          <w:rFonts w:ascii="Sylfaen" w:hAnsi="Sylfaen" w:cs="Sylfaen"/>
-          <w:b w:val="0"/>
-          <w:sz w:val="24"/>
-        </w:rPr>
-        <w:t>ეტაპი 4 — კონსოლიდაცია (ეპიზოდურიდან სემანტიკურამდე, ოფლაინ "ძილი", ასინქრონული). სესიებს შორის ოფლაინ პარტიული ამოცანა აერთიანებს ეპიზოდურ მოვლენებს ენტიტეტისა და არსის მსგავსების მიხედვით; იმ კლასტერებისთვის, რომლებიც მინიმუმ მოვლენების მცირე ზღვარს იმეორებენ, ერთი მცირე-LLM-ის გამოძახება აბსტრაქცირებს მდგრად სემანტიკურ პროფილის ფაქტს ("მუშაობს მკაცრი დედლაინების პირობებში") ჰიპოკამპური ინდექსაციის [7] მეთოდით, წყაროს ეპიზოდებზე უკუმიმითითებებით, წარმოადგენს შთანთქმული ეპიზოდების დაწონილობას, უახლესი ან ყველაზე გაძლიერებული მტკიცებულებების სასარგებლოდ უთანხმოების მოგვარებას და ასოციაციური მეზობლების წინასწარ გაფართოებას, რათა ინფერენციისას ნებისმიერი ასოციაციური მოგონება ერთ ვექტორულ მოთხოვნამდე შემცირდეს. საუბრული დიდი ენის მოდელი არასდროს გადამზადდება; კონსოლიდაცია მხოლოდ საცავს რეგულირებს. დასაბუთება: ეს არის ეტაპი, რომელიც ყველაზე მეტად არის მიდრეკილი ჭარბი მტკიცებებისკენ და შესაბამისად გადაიწერება (F18). ჩვენ ვიყენებთ დამატებითი სასწავლო სისტემების ჩარჩოს [25] მისი ეპიზოდურიდან სემანტიკურზე გადაცემის ფუნქციის სულისკვეთების სახით და კონკრეტული მექანიზმისთვის უპირატესად ვყრდნობით ტულვინგის ეპიზოდურ-სემანტიკურ განასხვავებას [22] და ჰიპოკამპურ ინდექსაციას [7,26], ვიდრე მაკკლელენდის გადახლართულ, ინტერფერენციისგან დაცულ კორტიკულ სწავლებას. ხელწერა: კვირების განმავლობაში საუბრის პარტნიორი გადადის ფორმულირებიდან "გასულ სამშაბათს თქვით..." ფორმაზე "ვიცი, რომ მიდრეკილება გაქვთ..."; თითქოს მან რაღაც ისწავლა მომხმარებლის შესახებ — ახლად წარმოშობილი განზოგადება, რომელიც პირდაპირ არასდროს გაუგია. ეს არის ყველაზე C-თვის დამახასიათებელი, B-თვის შეუძლებელი ქცევა და ნებისმიერი ურთიერთობრივი უპირატესობის პროგნოზირებული წყარო, რომელიც C-ს B+-ზე აქვს.</w:t>
+        <w:t>პროფილი C არის ერთიანი მეხსიერების ძრავა, რომელიც აერთიანებს ხუთ დადასტურებულ კოგნიტურ-მეხსიერების თეორიას — ატკინსონ-შიფრინის მრავალსაცავიან მოდელს [20], ებინგჰაუსის დავიწყების მრუდს [23], ტულვინგის ეპიზოდური და სემანტიკური განასხვავებას [22], ბუნდოვანი კვალით თეორიას [24] და სწავლის კომპლემენტარული სისტემების ჩარჩოს [25] — ერთ სასიცოცხლო ციკლში. ორი დამატებითი წყარო შემოდის, როგორც იმპლემენტაციის პრეცედენტი და ზუსტი გადარქმევა და არა როგორც დამატებითი, ჩართული თეორიები: ჰიპოკამპური ინდექსაცია [7,26] (კონსოლიდაციის უკუკავშირის მითითებებისთვის) და დამუშავების დონეები (კოდირების დროის სალიენსის მექანიზმისთვის). ჩვენ ვამბობთ "შედგება და არა "ერთიანდება": თეორიები ერთმანეთთან თანამშრომლობისთვისაა შექმნილი ერთი კოჰერენტული ობიექტის ფარგლებში, მაგრამ არქიტექტურა არ ამტკიცებს მათ შეთავსებას ფუნდამენტური მექანიზმის დონეზე, და 3.2-ის საფუძვლად ჩათვლილია პროექტირების ეტაპზე მიღებული შთაგონება სახელობითი გამოტოვებებით (იხილეთ ქვემოთ), და არა კოგნიტური ერთგულების პრეტენზია — რაც შეესაბამება 2.2-ში დავიწყების მრუდისთვის უკვე მითითებულ გაფრთხილებას.</w:t>
+      </w:r>
+    </w:p>
+    <w:p>
+      <w:pPr/>
+      <w:r>
+        <w:rPr>
+          <w:rFonts w:ascii="Sylfaen" w:hAnsi="Sylfaen" w:cs="Sylfaen"/>
+          <w:b w:val="0"/>
+          <w:sz w:val="24"/>
+        </w:rPr>
+        <w:t>მეხსიერების ერთეული არის მოვლენა — თემატურად და დროში შემოსაზღვრული თანმიმდევრული მორიგეობების სეგმენტი, ტულვინგის გაგებით ეპიზოდური ატომი [22]. ეს არის მიზანმიმართული არჩევანი ორი ალტერნატივის წინააღმდეგ: უმოყოლო მორიგეობა (ერთეული, რომელსაც იყენებს verbatim RAG, პროფილი B) და იზოლირებული, ამოღებული ფაქტი. მოვლენის არჩევა თავიდან გვაცილებს ფაქტების შერჩევის იმპორტს, როგორც B-ში არარსებული მეორე აღრევის ფაქტორის, და კონსოლიდაციას — განმეორებადი მოვლენების მდგრად სემანტიკურ ცოდნად გადაქცევას — აქცევს ბუნებრივ, გამოყვანილ ოპერაციად და არა დამატებით კომპონენტად. სიცოცხლის ციკლს ხუთი ეტაპი აქვს; თითოეული მოცემულია, როგორც მექანიზმი · თეორიული საფუძველი · ქცევითი ნიშანი.</w:t>
+      </w:r>
+    </w:p>
+    <w:p>
+      <w:pPr/>
+      <w:r>
+        <w:rPr>
+          <w:rFonts w:ascii="Sylfaen" w:hAnsi="Sylfaen" w:cs="Sylfaen"/>
+          <w:b w:val="0"/>
+          <w:sz w:val="24"/>
+        </w:rPr>
+        <w:t>ეტაპი 1 — კოდირება (მნიშვნელობის მიხედვით გაფილტრული ჩაწერა, ასინქრონული). უმუშავო ტურები არსებობს მხოლოდ დაახლოებით ოცი ტურის მოცულობის ცვალებად სამუშაო ფანჯარაში, რომელიც იდენტურია A და B პირობებისთვის და უცვლელია ყველა პირობისთვის. სინქრონული გზით არაფერი გადადის გრძელვადიან შენახვაზე. სესიის ბოლოს, ასინქრონულად, ბუფერში არსებული ტრანსკრიპტი იყოფა მოვლენებად ჩაშენების მანძილისა და დროითი შუალედის საზღვრებზე (რომელიც EM-LLM-ის [8] ბაიეს-სიურპრიზის სეგმენტაციის იაფი შემცვლელია) და ერთი მცირე-LLM-ის კრიტერიუმების გამოძახებით თითოეულ მოვლენას ეძლევა მნიშვნელობის ქულა ოთხ ა-პრიორი-ფიქსირებულ განზომილებაში: თვითგამოხატვის სიმკვრივე, ემოციური ინტენსივობა, ექსპლიციტური ხაზგასმა ან გამეორება, და მიზნის ან ვალდებულების შინაარსი. ზღვრულზე დაბალი ქულის მქონე მოვლენები რბილად იგდება — ძალიან დაბალი სტაბილურობის მქონე, "ენაზე მდგომი აზრის" მსგავსი კვალი, რომელიც მხოლოდ ძლიერი მინიშნების შემთხვევაში აღდგება — და არა მკაცრად იშლება; გადარჩენილები იღებენ საწყის სტაბილურობას, რომელიც მათ მნიშვნელობასთან არის პროპორციული. გრაუნდინგი: ატკინსონ-შიფრინის მრავალსაცავიანი მოდელი [20] ყურადღებასა და გამეორებას განიხილავს, როგორც მოკლევადიანი და გრძელვადიანი მეხსიერების საწყობებს შორის გასასვლელს. აქ ჩვენ ვიწყებთ ერთ გულწრფელ გადარქმევას (F18): რადგან აღქმადობა გამოიყენება კოდირებისას, ეს მექანიზმი იმდენადვე არის დამუშავების სიღრმის ან დონეებისა და მეხსიერების ემოციური მოდულაციის მაგალითი, რამდენადაც — წმინდა მოდალური მოდელისა, და მას ასეთადაც მოიხსენიებენ; ის ასევე განსხვავდება Generative Agents-ის [10] მიერ მოძიების დროის მნიშვნელობის შეწონვისგან, რომელსაც 2 აღრიცხავს, როგორც აქტივაციის მსგავსს და არა თეორიიდან გამომდინარეს. ხელწერა: თანამოსაუბრე მდგრადად ინახავს იმას, რასაც მომხმარებელი ხაზს უსვამდა, ამხელდა ან რაზეც ბრუნდებოდა, მაშინ როცა შემთხვევითი, ყოველდღიური საუბრები ქრება; დავიწყება აღიქმება როგორც დათბობა და არა როგორც უყურადღებობა, რადგან რბილად უარყოფილი მასალა მკაფიო მინიშნების შემთხვევაში სუსტად, მაგრამ მაინც ექვემდებარება რეკონსტრუქციას.</w:t>
+      </w:r>
+    </w:p>
+    <w:p>
+      <w:pPr/>
+      <w:r>
+        <w:rPr>
+          <w:rFonts w:ascii="Sylfaen" w:hAnsi="Sylfaen" w:cs="Sylfaen"/>
+          <w:b w:val="0"/>
+          <w:sz w:val="24"/>
+        </w:rPr>
+        <w:t>ეტაპი 2 — წარმოდგენა (მთავარი აზრი და სიტყვასიტყვითი საყრდენი, ორმაგი კლება, ასინქრონული). თითოეული მოვლენა ინახავს მთავარ აზრს — მნიშვნელობის, სუბიექტებისა და პოზიციის მოკლე პარაფრაზს — სტრუქტურირებულ ველებთან და ერთ სიტყვასიტყვით საყრდენთან ერთად (არაუმეტეს ერთი წინადადებისა, ყველაზე გამორჩეული ციტატა, რომელიც შენარჩუნებულია დასაბუთებისა და აუდიტისთვის, მაგრამ ნაგულისხმევად არ არის ჩაშენებული). არსი ჩაშენებული, ინიექცირებული ტვირთია; მისი სტაბილურობა ანკერისას აღემატება, ამიტომ მნიშვნელობა ზუსტ ფორმულირებას სცდება. სამართლიანობის შეზღუდვა განსაზღვრავს წარმოდგენას: თითოეული მოვლენის არსის ტვირთი არასდროს აღემატება პროფილი B-ს საშუალო ტურის ტექსტურ ტვირთს, ამიტომ C არასდროს იღებს კონტექსტის უფრო მდიდარ ელემენტებს. დაფუძნება: ბუნდოვანი კვალი-თეორია [24] ამტკიცებს პარალელური სიტყვასიტყვითი და არსებითი კვალის არსებობას, სადაც არსებითი კვალი უფრო მდგრადია. ეს კვალი LLM-ებისთვის ReadAgent-ის არსებითი შინაარსის გენერირების [9] მეშვეობით ოპერაციულდება; დიზაინი პირდაპირ ემყარება კოქსის [11] აღმოჩენას, რომლის მიხედვითაც, პარაფრაზირებული მოგონება სასურველია, მაშინ როცა სიტყვასიტყვითი მოგონება კონფიდენციალურობის პრობლემებს ქმნის. ხელწერა: თანამოსაუბრე ამბობს "სასოწარკვეთილი იყავი დედლაინის გამო" ტრანსკრიპტიდან ციტირების ნაცვლად; მომხმარებელს არ შეუძლია დააფიქსიროს, რომ ის მის სიტყვასიტყვით გამეორებას ახდენს. ეს არის C-სა და B-ს შორის ყველაზე მარტივად შესამჩნევი განსხვავება მომხმარებლისთვის და იმ ბერკეტს წარმოადგენს, რომელსაც მეორე ნდობისა და კონფიდენციალურობის პროგნოზი (H2b) მიზნად ისახავს.</w:t>
+      </w:r>
+    </w:p>
+    <w:p>
+      <w:pPr/>
+      <w:r>
+        <w:rPr>
+          <w:rFonts w:ascii="Sylfaen" w:hAnsi="Sylfaen" w:cs="Sylfaen"/>
+          <w:b w:val="0"/>
+          <w:sz w:val="24"/>
+        </w:rPr>
+        <w:t>ეტაპი 3 — დაქრობა და გაძლიერება (ებინგჰაუსი, ზარმაცი, სინქრონული და ასინქრონული). თითოეულ კვალს ახასიათებს აღდგენადობა, რომელიც დროთა განმავლობაში ექსპონენციურად მცირდება ბოლო წვდომის მომენტიდან, მისი სტაბილურობის მიმართულებით, და გამოითვლება ზარმაცულად, აღდგენის მომენტში, როგორც ქულების გამრავლების კოეფიციენტი — არ ხდება ფონური აღრიცხვა და არც სინქრონული ჩაწერა. წარმატებული ხელახალი ხსენება აძლიერებს სტაბილურობას და ცვლის ბოლო წვდომის დროის მაჩვენებელს დროში გაჭიმული გამეორების პრინციპით, მაგრამ ჩაწერა რიგში დგება ოფლაინ რეჟიმში, ასე რომ სინქრონული არხი რჩება მხოლოდ წასაკითხად, ზუსტად ისევე, როგორც B-ში. რაც მთავარია, მე-4 ეტაპის მიერ წარმოქმნილი სემანტიკური ფაქტებიც ქრება, ამიტომ ებინგჰაუსის დინამიკა რჩება ცოცხალ დამოუკიდებელ ცვლადს და არა მუდმივი საცავის ზემოდან დადებულ კოსმეტიკურ ფენას. საფუძველი: ებინგჰაუსის დავიწყების მრუდი [23], MemoryBank/SiliconFriend [6]-ის სახით გამოთვლით პრეცედენტად. ხელწერა: ის, რაც დიდი ხნის წინ ერთხელ იყო ნახსენები, ქრება; რაც კი განმეორებით განიხილება, მდგრადი ხდება — ლამაზი, ბუნებრივი დავიწყება, B-ს შემზარავი სრული გახსენების საპირისპიროდ.</w:t>
+      </w:r>
+    </w:p>
+    <w:p>
+      <w:pPr/>
+      <w:r>
+        <w:rPr>
+          <w:rFonts w:ascii="Sylfaen" w:hAnsi="Sylfaen" w:cs="Sylfaen"/>
+          <w:b w:val="0"/>
+          <w:sz w:val="24"/>
+        </w:rPr>
+        <w:t>ეტაპი 4 — კონსოლიდაცია (ეპიზოდურიდან სემანტიკურამდე, ოფლაინ "ძილი", ასინქრონული). სესიებს შორის ოფლაინ პარტიული ამოცანა აერთიანებს ეპიზოდურ მოვლენებს ენტიტეტისა და არსის მსგავსების მიხედვით; იმ კლასტერებისთვის, რომლებიც მინიმუმ მოვლენების მცირე ზღვარს იმეორებენ, ერთი მცირე-LLM-ის გამოძახება აბსტრაქცირებს მდგრად სემანტიკურ პროფილის ფაქტს ("მუშაობს მკაცრი დედლაინების პირობებში") ჰიპოკამპური ინდექსაციის [7] მეთოდით, წყაროს ეპიზოდებზე უკუმიმითითებებით, წარმოადგენს შთანთქმული ეპიზოდების დაწონილობას, უახლესი ან ყველაზე გაძლიერებული მტკიცებულებების სასარგებლოდ უთანხმოების მოგვარებას და ასოციაციური მეზობლების წინასწარ გაფართოებას, რათა ინფერენციისას ნებისმიერი ასოციაციური მოგონება ერთ ვექტორულ მოთხოვნამდე შემცირდეს. საუბრული დიდი ენის მოდელი არასდროს გადამზადდება; კონსოლიდაცია მხოლოდ საცავს რეგულირებს. დასაბუთება: ეს არის ეტაპი, რომელიც ყველაზე მეტად არის მიდრეკილი ჭარბი მტკიცებებისკენ და შესაბამისად გადაიწერება (F18). ჩვენ ვიყენებთ დამატებითი სასწავლო სისტემების ჩარჩოს [25] მისი ეპიზოდურიდან სემანტიკურზე გადაცემის ფუნქციის სულისკვეთების სახით და კონკრეტული მექანიზმისთვის უპირატესად ვყრდნობით ტულვინგის ეპიზოდურ-სემანტიკურ განასხვავებას [22] და ჰიპოკამპურ ინდექსაციას [7,26], ვიდრე მაკკლელენდის გადახლართულ, ინტერფერენციისგან დაცულ კორტიკულ სწავლებას. ხელწერა: კვირების განმავლობაში თანამოსაუბრე გადადის ფორმულირებიდან "გასულ სამშაბათს თქვით..." ფორმაზე "ვიცი, რომ მიდრეკილება გაქვთ..."; თითქოს მან რაღაც ისწავლა მომხმარებლის შესახებ — ახლად წარმოშობილი განზოგადება, რომელიც პირდაპირ არასდროს გაუგია. ეს არის ყველაზე C-თვის დამახასიათებელი, B-თვის შეუძლებელი ქცევა და ნებისმიერი ურთიერთობრივი უპირატესობის პროგნოზირებული წყარო, რომელიც C-ს B+-ზე აქვს.</w:t>
       </w:r>
     </w:p>
     <w:p>
@@ -3755,7 +3755,7 @@
           <w:b w:val="0"/>
           <w:sz w:val="24"/>
         </w:rPr>
-        <w:t>თეორიული ერთგულებისგან განზრახ თავის არიდება. აქ სამი ასეთი თავის არიდებაა დასახელებული, როგორც შეზღუდვები და სამომავლო სამუშაო, რითაც თავიდან ვიცილებთ ყველაზე ძლიერ თეორიულ წინააღმდეგობებს (F18), ვიდრე მათ კომიტეტის წინ წამოსაწევად დავტოვებდეთ. პირველი, არქიტექტურა გამორიცხავს ინტერფერენციას, რომელიც ადამიანის დავიწყების დომინანტური მექანიზმია; მისი დავიწყება წმინდად დროით და თვალსაჩინოობითაა განპირობებული. მეორე, მისი კონსოლიდაცია, რომელიც უპირველეს ყოვლისა სიზუსტეზეა ორიენტირებული, მიზანმიმართულად თრგუნავს რეკონსტრუქციულ და სქემაზე დაფუძნებულ დამახინჯებას — არსებითი შინაარსის დონის ცრუ მეხსიერებას, რომელსაც "ბურუსიანი კვალი" (fuzzy-trace) და CLS განსაკუთრებით მკაფიოდ პროგნოზირებენ — და კვლევის მიერ გაზომილი ადამიანურობის ღერძზე ფსიქოლოგიურ რეალიზმს უპირატესობას ანიჭებს იმ უსაფრთხოებას, რომ არ მოხდეს არასწორი ზოგადყოფების თავდაჯერებულად მტკიცება. მესამე, ის არ მოდელირებს დროის თანმიმდევრობის ან წყაროს მეხსიერებას დროის შტამპების მიღმა. ეს პრინციპული საინჟინრო არჩევანია და არა უგულებელყოფა, და 3.8-ში ისინი აღრიცხულია, როგორც კოგნიტური სიზუსტის მტკიცების საზღვრები.</w:t>
+        <w:t>თეორიული ერთგულებისგან განზრახ თავის არიდება. აქ სამი ასეთი თავის არიდებაა დასახელებული, როგორც შეზღუდვები და სამომავლო სამუშაო, რითაც თავიდან ვიცილებთ ყველაზე ძლიერ თეორიულ წინააღმდეგობებს (F18), ვიდრე მათ კომიტეტის წინ წამოსაწევად დავტოვებდეთ. პირველი, არქიტექტურა გამორიცხავს ინტერფერენციას, რომელიც ადამიანის დავიწყების დომინანტური მექანიზმია; მისი დავიწყება წმინდად დროით და თვალსაჩინოობითაა განპირობებული. მეორე, მისი კონსოლიდაცია, რომელიც უპირველეს ყოვლისა სიზუსტეზეა ორიენტირებული, მიზანმიმართულად თრგუნავს რეკონსტრუქციულ და სქემაზე დაფუძნებულ დამახინჯებას — არსებითი შინაარსის დონის ცრუ მეხსიერებას, რომელსაც "ბუნდოვანი კვალი" (fuzzy-trace) და CLS განსაკუთრებით მკაფიოდ პროგნოზირებენ — და კვლევის მიერ გაზომილი ადამიანურობის ღერძზე ფსიქოლოგიურ რეალიზმს უპირატესობას ანიჭებს იმ უსაფრთხოებას, რომ არ მოხდეს არასწორი განზოგადებების თავდაჯერებულად მტკიცება. მესამე, ის არ მოდელირებს დროის თანმიმდევრობის ან წყაროს მეხსიერებას დროის შტამპების მიღმა. ეს პრინციპული საინჟინრო არჩევანია და არა უგულებელყოფა, და 3.8-ში ისინი აღრიცხულია, როგორც კოგნიტური სიზუსტის მტკიცების საზღვრები.</w:t>
       </w:r>
     </w:p>
     <w:p>
@@ -3815,7 +3815,7 @@
           <w:b w:val="0"/>
           <w:sz w:val="24"/>
         </w:rPr>
-        <w:t>•  B+ — კურატორირებული სტატიკური მეხსიერება (აქტიური კონტროლი). C-ს მსგავსი იდენტური ოფლაინ LLM-ის ანოტაცია და კორეფერენსის გაწმენდა, იგივე შეკუმშვა და ტოკენების ბიუჯეტი, მაგრამ გარეშე დაშლის, სიხშირული ფილტრის, და კონსოლიდაციის — მხოლოდ წმინდა კოსინუსის top-k გაწმენდილ ანოტაციებზე.</w:t>
+        <w:t>•  B+ — კურატორირებული სტატიკური მეხსიერება (აქტიური კონტროლი). C-ს მსგავსი იდენტური ოფლაინ LLM-ის ანოტაცია და კორეფერენსის გაწმენდა, იგივე შეკუმშვა და ტოკენების ბიუჯეტი, მაგრამ გარეშე დაშლის, სალიენს-გეითინგის, და კონსოლიდაციის — მხოლოდ წმინდა კოსინუსის top-k გაწმენდილ ანოტაციებზე.</w:t>
       </w:r>
     </w:p>
     <w:p>
@@ -3837,18 +3837,18 @@
           <w:b w:val="0"/>
           <w:sz w:val="24"/>
         </w:rPr>
-        <w:t>B+ არის დიზაინის ცენტრალური მეთოდოლოგიური წვლილი. C-სთვის ნებისმიერი დადებითი შედეგისთვის ყველაზე სერიოზული საფრთხე არის წაკითხვადობის კონფუუდი: C-ს მიერ შეჯამებული და კო-რეფერენსებისგან გაწმენდილი პროზა უბრალოდ უფრო წაკითხვადი არის, ვიდრე B-ს უმი ფრაგმენტები, და C-სა და B-ს შორის უბრალო გამარჯვება ერთმანეთში აურივებს კურირებასა და კოგნიტურ დინამიკას. B+ თავისი კონსტრუქციით გამორიცხავს ამ კონფუუდს. თუ C &gt; B+, მარგინალური ეფექტი განპირობებულია ადამიანის მეხსიერების იმ დინამიკით, რომელიც მხოლოდ C-ს ახასიათებს. თუ C ≈ B+, გულწრფელი დასკვნა იქნება, რომ აღქმითი სარგებელი თავიდანვე წაკითხვადობა იყო, და ამიტომ მოსაზრება შესაბამისად გადაიხედა — დასკვნა, რომელიც ზუსტად იმიტომ არის ინტერპრეტაციული, რომ B+ სწორედ ამის დასაშვებად შეიქმნა. სწორედ ამიტომ, როგორც 3.1-შია აღნიშნული, C &gt; B+ არის შეფასების სამიზნე და სწორედ ამიტომ B+-ის გამორიცხვა არ განიხილება.</w:t>
-      </w:r>
-    </w:p>
-    <w:p>
-      <w:pPr/>
-      <w:r>
-        <w:rPr>
-          <w:rFonts w:ascii="Sylfaen" w:hAnsi="Sylfaen" w:cs="Sylfaen"/>
-          <w:b w:val="0"/>
-          <w:sz w:val="24"/>
-        </w:rPr>
-        <w:t>ცხრილი 3.1 პირდაპირ ასახავს კონფუუნდების კონტროლის ლოგიკას. ყველაფერი, რაც "უცვლელად შენარჩუნებულია" რიგშია, იდენტურია A, B, B+ და C-სთვის.</w:t>
+        <w:t>B+ არის დიზაინის ცენტრალური მეთოდოლოგიური წვლილი. C-სთვის ნებისმიერი დადებითი შედეგისთვის ყველაზე სერიოზული საფრთხე არის წაკითხვადობის აღრევის ფაქტორი: C-ს მიერ შეჯამებული და კო-რეფერენსებისგან გაწმენდილი პროზა უბრალოდ უფრო წაკითხვადი არის, ვიდრე B-ს უმი ფრაგმენტები, და C-სა და B-ს შორის უბრალო გამარჯვება ერთმანეთში აურივებს კურირებასა და კოგნიტურ დინამიკას. B+ თავისი კონსტრუქციით გამორიცხავს ამ აღრევის ფაქტორს. თუ C &gt; B+, მარგინალური ეფექტი განპირობებულია ადამიანის მეხსიერების იმ დინამიკით, რომელიც მხოლოდ C-ს ახასიათებს. თუ C ≈ B+, გულწრფელი დასკვნა იქნება, რომ აღქმითი სარგებელი თავიდანვე წაკითხვადობა იყო, და ამიტომ მოსაზრება შესაბამისად გადაიხედა — დასკვნა, რომელიც ზუსტად იმიტომ არის ინტერპრეტაციული, რომ B+ სწორედ ამის დასაშვებად შეიქმნა. სწორედ ამიტომ, როგორც 3.1-შია აღნიშნული, C &gt; B+ არის შეფასების სამიზნე და სწორედ ამიტომ B+-ის გამორიცხვა არ განიხილება.</w:t>
+      </w:r>
+    </w:p>
+    <w:p>
+      <w:pPr/>
+      <w:r>
+        <w:rPr>
+          <w:rFonts w:ascii="Sylfaen" w:hAnsi="Sylfaen" w:cs="Sylfaen"/>
+          <w:b w:val="0"/>
+          <w:sz w:val="24"/>
+        </w:rPr>
+        <w:t>ცხრილი 3.1 პირდაპირ ასახავს აღრევის ფაქტორების კონტროლის ლოგიკას. ყველაფერი, რაც "უცვლელად შენარჩუნებულია" რიგშია, იდენტურია A, B, B+ და C-სთვის.</w:t>
       </w:r>
     </w:p>
     <w:p>
@@ -4011,7 +4011,7 @@
                 <w:b w:val="0"/>
                 <w:sz w:val="22"/>
               </w:rPr>
-              <w:t>კომპრესიя</w:t>
+              <w:t>კომპრესია</w:t>
             </w:r>
           </w:p>
         </w:tc>
@@ -4202,7 +4202,7 @@
           <w:b w:val="0"/>
           <w:sz w:val="24"/>
         </w:rPr>
-        <w:t>ამ დისერტაციაში წარმოდგენილი კონცეფციის დამტკიცება არის დამოუკიდებელი მეხსიერების მართვის სისტემა და არა სრულმასშტაბიანი ხმოვანი აპლიკაცია. ის ახორციელებს ოთხ პირობას A, B, B+ და C — C-ის ხუთსაფეხურიანი სასიცოცხლო ციკლის გამოყენებით, 4-ში მითითებული სიზუსტით — როგორც ინსტრუმენტული მოდული, რომელიც მუშაობს ტრანსკრიპტებზე, მიზანმიმართულად, Voice Companion-ის სრული ხმოვანი მიწოდების ჯაჭვის მიღმა. ამ მასშტაბის მოტივაცია ორ გულწრფელ მიზეზს აქვს. პირველი, არსებული პლატფორმის (F17) აუდიტმა დაადგინა, რომ ხმის აპლიკაცია დღესდღეობით მხოლოდ A პირობას უზრუნველყოფს და დამატებით თორმეტიდან თექვსმეტ კვირამდე საინჟინრო სამუშაოს საჭიროებს — ხმის მეხსიერებაზე გადაყვანის კავშირის, თითოეული მონაწილისთვის სახელწოდების სივრცის გამოყოფისა და განთავსებადი კლიენტის შექმნას — სანამ ის B, B+, და C პირობების რეალურ მომხმარებლებზე მასპინძლობას შეძლებს; ეს შექმნა ამჟამინდელი დროის ჩარჩოსთვის არ შედის. მეორე და, რაც უფრო მნიშვნელოვანია, კვლევის საგანია მეხსიერების პროცესი, რომელიც სრულად გამოიყენება დიალოგის ტრანსკრიპტებზე მომუშავე სპეციალური პროგრამული უზრუნველყოფით. მეხსიერების ძრავის გამოყოფა მეტყველებიდან-ტექსტად, ტექსტიდან-მეტყველებად და რიგის მიყოლის მექანიზმებისგან საშუალებას იძლევა, რომ კონცეფციის დამტკიცებამ ნათლად და გამეორებადურად აჩვენოს და დააპროგრამოს მექანიზმები — მოვლენების სეგმენტაცია, მნიშვნელობაზე დაფუძნებული კოდირება, ორმაგი დაქვეითების წარმოდგენა, Ebbinghaus-ის უსასრულო დაქვეითება და გაძლიერება, ოფლაინ კონსოლიდაცია და არსის მიხედვით მოძიება.</w:t>
+        <w:t>ამ დისერტაციაში წარმოდგენილი კონცეფციის დამტკიცება არის დამოუკიდებელი მეხსიერების მართვის სისტემა და არა სრულმასშტაბიანი ხმოვანი აპლიკაცია. ის ახორციელებს ოთხ პირობას A, B, B+ და C — C-ის ხუთსაფეხურიანი სასიცოცხლო ციკლის გამოყენებით, 4-ში მითითებული სიზუსტით — როგორც ინსტრუმენტული მოდული, რომელიც მუშაობს ტრანსკრიპტებზე, მიზანმიმართულად, Voice Companion-ის სრული ხმოვანი მიწოდების ჯაჭვის მიღმა. ამ მასშტაბის მოტივაცია ორ გულწრფელ მიზეზს აქვს. პირველი, არსებული პლატფორმის (F17) აუდიტმა დაადგინა, რომ ხმის აპლიკაცია დღესდღეობით მხოლოდ A პირობას უზრუნველყოფს და დამატებით თორმეტიდან თექვსმეტ კვირამდე საინჟინრო სამუშაოს საჭიროებს — ხმის მეხსიერებაზე გადაყვანის კავშირის, თითოეული მონაწილისთვის სახელწოდების სივრცის გამოყოფისა და განთავსებადი კლიენტის შექმნას — სანამ ის B, B+, და C პირობების რეალურ მომხმარებლებზე მასპინძლობას შეძლებს; ეს შექმნა ამჟამინდელი დროის ჩარჩოსთვის არ შედის. მეორე და, რაც უფრო მნიშვნელოვანია, კვლევის საგანია მეხსიერების პროცესი, რომელიც სრულად გამოიყენება დიალოგის ტრანსკრიპტებზე მომუშავე სპეციალური პროგრამული უზრუნველყოფით. მეხსიერების ძრავის გამოყოფა მეტყველებიდან-ტექსტად, ტექსტიდან-მეტყველებად და რიგის მიყოლის მექანიზმებისგან საშუალებას იძლევა, რომ კონცეფციის დამტკიცებამ ნათლად და გამეორებადურად აჩვენოს და დააპროგრამოს მექანიზმები — მოვლენების სეგმენტაცია, მნიშვნელობაზე დაფუძნებული კოდირება, ორმაგი დაქვეითების წარმოდგენა, Ebbinghaus-ის ზარმაცი დაქვეითება და გაძლიერება, ოფლაინ კონსოლიდაცია და არსის მიხედვით მოძიება.</w:t>
       </w:r>
     </w:p>
     <w:p>
@@ -4251,18 +4251,18 @@
           <w:b w:val="0"/>
           <w:sz w:val="24"/>
         </w:rPr>
-        <w:t>(ა) ტექნიკური შეფასება. ბენჩმარკის ტიპის შეფასება ოთხი პირობის მიხედვით ტარდება სინთეზურ მრავალსესიან დიალოგებზე და ზომავს რაოდენობის სამ კატეგორიას: აღდგენის ხარისხი (წინა სესიის შინაარსის ფაქტობრივი აღდგენა, 2.5-ის გრძელვადიანი მეხსიერების ბენჩმარკების მსგავსად); დროითი მსჯელობა (კატეგორია, რომელიც თანმიმდევრულად ყველაზე სუსტია LoCoMo-სა და LongMemEval-ში [1,2]); და ლატენტურობა (B, B+ და C-სთვის თითოეული რაუნდის სინქრონული გამოძახების დრო, რაც 3.4-ში მითითებულ პარიტეტს ადასტურებს). ლიტერატურაში მოყვანილი ორი გაფრთხილება გათვალისწინებულია. პირველი, რადგან გამოქვეყნებული მეხსიერების ტესტების შედეგები დაუჯერებელი აღმოჩნდა, ხოლო მათი ავტომატური შემფასებლები — შემწყნარებლები (F9, [32,33]), ჰარნესი თავის საკუთარ შეფასების პროცედურას ხელახლა ამოწმებს, ნაცვლად იმისა, რომ ხარვეზიანი პროცედურა მემკვიდრეობით მიიღოს, და ამ გაფრთხილების გათვალისწინებით აბსოლუტურ ქულებს წარმოადგენს. მეორე, ტექნიკური აღდგენის სიზუსტე პირდაპირ არ წარმოადგენს ნაშრომის სამიზნე შედეგს — სინამდვილეში, დიზაინი პროგნოზირებს, რომ C-ს განზრახვისამებრ შეიძლება B-ზე ნაკლები ტექსტის პირდაპირი ციტირება შეეძლოს — ამიტომ ეს მეტრიკები ახასიათებს მექანიზმებს და ამოწმებს, რომ C-ს დავიწყება ხარვეზული კი არა, დახვეწილია; ისინი არ წარმოადგენენ აღქმული ურთიერთკავშირის შედეგების მაჩვენებელს.</w:t>
-      </w:r>
-    </w:p>
-    <w:p>
-      <w:pPr/>
-      <w:r>
-        <w:rPr>
-          <w:rFonts w:ascii="Sylfaen" w:hAnsi="Sylfaen" w:cs="Sylfaen"/>
-          <w:b w:val="0"/>
-          <w:sz w:val="24"/>
-        </w:rPr>
-        <w:t>(ბ) სიმულირებული მომხმარებლის შეფასება. სოციალური კონსტრუქტების შესამოწმებლად ადამიანის მონაწილეობის გარეშე, ხელსაწყო გამოიყენება მრავალსესიან დიალოგებში, სადაც LLM მოქმედებს სიმულირებული მომხმარებლის როლში, ხოლო ცალკეული LLM-მსაჯული აფასებს თითოეულ პირობას 3.6-ის სოციალური კონსტრუქტების მიხედვით (სოციალური თანადგომა, ალიანსი, სანდოობა/ადამიანურობა, პლუს ინტელექტისა და კონფიდენციალურობის კრიტერიუმები). ეს მიმართულება განზრახ ეპისტემიკური თავმდაბლობითაა ჩარჩოში მოქცეული: ის სიმულირებული პროქსია და არა ადამიანის აღქმის შემცვლელი, და მას არ შეუძლია აღქმის ჰიპოთეზების ვალიდაცია. მისი გამოთქმული ვალიდურობის შეზღუდვები სამმაგია: დიდი ენის მოდელი (LLM) მსაჯულის შეფასებებს "სოციალური პრეზენციისა" ან "ნდობისა" ადამიანის გამოცდილებასთან უცნობი კორესპონდენცია აქვს და შესაძლოა ასახავდეს ზედაპირულ ტექსტურ მახასიათებლებს (მაგ., თავად წაკითხვადობას, რასაც B+ აკონტროლებს) და არა შეგრძნებულ ურთიერთობას; სიმულირებულ მომხმარებლებს არ გააჩნიათ რეალური მომხმარებლებისთვის დამახასიათებელი მნიშვნელოვანი ინტერესები, კვირების განმავლობაში დაგროვილი მეხსიერება და კონფიდენციალურობის მგრძნობელობა, ამიტომ ამ ნაშრომისთვის ცენტრალური (F4) ორმაგი ხასიათის მეხსიერების ეფექტები შესაძლოა არ გამოვლინდეს; და მოსამართლისა და გენერატორის მოდელებს შეიძლება ჰქონდეთ მიკერძოებები, რომლებიც ზრდის შეთანხმებას. შესაბამისად, სიმულირებული ნაწილი გამოიყენება იმისთვის, რომ (i) გადაამოწმოს, გამოიმუშავებს თუ არა პირობები განსხვავებად ქცევას, (ii) შექმნას და დახვეწოს პროგნოზები ადამიანური პროტოკოლისთვის, და (iii) ბოლომდე გამოცადოს ზუსტი ინსტრუმენტის ოპერაციალიზაცია (3.6). ნებისმიერი სიმულირებული C-B+ განსხვავება წარმოდგენილია როგორც მექანიზმის დონის სიგნალი და არასდროს — როგორც ადამიანის აღქმის შესახებ მტკიცებულება.</w:t>
+        <w:t>(ა) ტექნიკური შეფასება. ბენჩმარკის ტიპის შეფასება ოთხი პირობის მიხედვით ტარდება სინთეზურ მრავალსესიან დიალოგებზე და ზომავს რაოდენობის სამ კატეგორიას: აღდგენის ხარისხი (წინა სესიის შინაარსის ფაქტობრივი აღდგენა, 2.5-ის გრძელვადიანი მეხსიერების ბენჩმარკების მსგავსად); დროითი მსჯელობა (კატეგორია, რომელიც თანმიმდევრულად ყველაზე სუსტია LoCoMo-სა და LongMemEval-ში [1,2]); და დაყოვნება (B, B+ და C-სთვის თითოეული რაუნდის სინქრონული გამოძახების დრო, რაც 3.4-ში მითითებულ პარიტეტს ადასტურებს). ლიტერატურაში მოყვანილი ორი გაფრთხილება გათვალისწინებულია. პირველი, რადგან გამოქვეყნებული მეხსიერების ტესტების შედეგები დაუჯერებელი აღმოჩნდა, ხოლო მათი ავტომატური შემფასებლები — შემწყნარებლები (F9, [32,33]), ჰარნესი თავის საკუთარ შეფასების პროცედურას ხელახლა ამოწმებს, ნაცვლად იმისა, რომ ხარვეზიანი პროცედურა მემკვიდრეობით მიიღოს, და ამ გაფრთხილების გათვალისწინებით აბსოლუტურ ქულებს წარმოადგენს. მეორე, ტექნიკური აღდგენის სიზუსტე პირდაპირ არ წარმოადგენს ნაშრომის სამიზნე შედეგს — სინამდვილეში, დიზაინი პროგნოზირებს, რომ C-ს განზრახვისამებრ შეიძლება B-ზე ნაკლები ტექსტის პირდაპირი ციტირება შეეძლოს — ამიტომ ეს მეტრიკები ახასიათებს მექანიზმებს და ამოწმებს, რომ C-ს დავიწყება ხარვეზული კი არა, დახვეწილია; ისინი არ წარმოადგენენ აღქმული ურთიერთკავშირის შედეგების მაჩვენებელს.</w:t>
+      </w:r>
+    </w:p>
+    <w:p>
+      <w:pPr/>
+      <w:r>
+        <w:rPr>
+          <w:rFonts w:ascii="Sylfaen" w:hAnsi="Sylfaen" w:cs="Sylfaen"/>
+          <w:b w:val="0"/>
+          <w:sz w:val="24"/>
+        </w:rPr>
+        <w:t>(ბ) სიმულირებული მომხმარებლის შეფასება. სოციალური კონსტრუქტების შესამოწმებლად ადამიანის მონაწილეობის გარეშე, ხელსაწყო გამოიყენება მრავალსესიან დიალოგებში, სადაც LLM მოქმედებს სიმულირებული მომხმარებლის როლში, ხოლო ცალკეული LLM-მსაჯული აფასებს თითოეულ პირობას 3.6-ის სოციალური კონსტრუქტების მიხედვით (სოციალური თანდასწრება, ალიანსი, სანდოობა/ადამიანურობა, პლუს ინტელექტისა და კონფიდენციალურობის კრიტერიუმები). ეს მიმართულება განზრახ ეპისტემიკური თავმდაბლობითაა ჩარჩოში მოქცეული: ის სიმულირებული პროქსია და არა ადამიანის აღქმის შემცვლელი, და მას არ შეუძლია აღქმის ჰიპოთეზების ვალიდაცია. მისი გამოთქმული ვალიდურობის შეზღუდვები სამმაგია: დიდი ენის მოდელი (LLM) მსაჯულის შეფასებებს "სოციალური თანდასწრებისა" ან "ნდობისა" ადამიანის გამოცდილებასთან უცნობი კორესპონდენცია აქვს და შესაძლოა ასახავდეს ზედაპირულ ტექსტურ მახასიათებლებს (მაგ., თავად წაკითხვადობას, რასაც B+ აკონტროლებს) და არა შეგრძნებულ ურთიერთობას; სიმულირებულ მომხმარებლებს არ გააჩნიათ რეალური მომხმარებლებისთვის დამახასიათებელი მნიშვნელოვანი ინტერესები, კვირების განმავლობაში დაგროვილი მეხსიერება და კონფიდენციალურობის მგრძნობელობა, ამიტომ ამ ნაშრომისთვის ცენტრალური (F4) ორმაგი ხასიათის მეხსიერების ეფექტები შესაძლოა არ გამოვლინდეს; და მოსამართლისა და გენერატორის მოდელებს შეიძლება ჰქონდეთ მიკერძოებები, რომლებიც ზრდის შეთანხმებას. შესაბამისად, სიმულირებული ნაწილი გამოიყენება იმისთვის, რომ (i) გადაამოწმოს, გამოიმუშავებს თუ არა პირობები განსხვავებად ქცევას, (ii) შექმნას და დახვეწოს პროგნოზები ადამიანური პროტოკოლისთვის, და (iii) ბოლომდე გამოცადოს ზუსტი ინსტრუმენტის ოპერაციალიზაცია (3.6). ნებისმიერი სიმულირებული C-B+ განსხვავება წარმოდგენილია როგორც მექანიზმის დონის სიგნალი და არასდროს — როგორც ადამიანის აღქმის შესახებ მტკიცებულება.</w:t>
       </w:r>
     </w:p>
     <w:p>
@@ -4311,18 +4311,18 @@
           <w:b w:val="0"/>
           <w:sz w:val="24"/>
         </w:rPr>
-        <w:t>დამოკიდებული ცვლადები არის მომხმარებლის მიერ აღქმული სოციალური კონსტრუქტები, რომლებიც მითითებულია მიზანში და ოპერაციონალიზებულია ვალიდური ინსტრუმენტების (F11) მეშვეობით. ძირითადი ინსტრუმენტია ხელოვნური სოციალური აგენტის კითხვარი (ASAQ) [14], ვალიდური, ღია ლიცენზიის მქონე კითხვარი, რომელიც მოიცავს თვრამეტი ცხრა კონსტრუქტს გრძელი (90-კითხვრივი) და მოკლე (24-კითხვრივი) ფორმებით. ASAQ-ის სამი კონსტრუქტი ასახავს ძირითად ჰიპოთეზას:</w:t>
-      </w:r>
-    </w:p>
-    <w:p>
-      <w:pPr/>
-      <w:r>
-        <w:rPr>
-          <w:rFonts w:ascii="Sylfaen" w:hAnsi="Sylfaen" w:cs="Sylfaen"/>
-          <w:b w:val="0"/>
-          <w:sz w:val="24"/>
-        </w:rPr>
-        <w:t>•  სოციალური თანადგომა — სხვა სოციალურ ერთეულთან ერთად ყოფნის შეგრძნება;</w:t>
+        <w:t>დამოკიდებული ცვლადები არის მომხმარებლის მიერ აღქმული სოციალური კონსტრუქტები, რომლებიც მითითებულია მიზანში და ოპერაციონალიზებულია ვალიდური ინსტრუმენტების (F11) მეშვეობით. ძირითადი ინსტრუმენტია ხელოვნური სოციალური აგენტის კითხვარი (ASAQ) [14], ვალიდური, ღია ლიცენზიის მქონე კითხვარი, რომელიც მოიცავს ცხრამეტ კონსტრუქტს გრძელი (90-კითხვრივი) და მოკლე (24-კითხვრივი) ფორმებით. ASAQ-ის სამი კონსტრუქტი ასახავს ძირითად ჰიპოთეზას:</w:t>
+      </w:r>
+    </w:p>
+    <w:p>
+      <w:pPr/>
+      <w:r>
+        <w:rPr>
+          <w:rFonts w:ascii="Sylfaen" w:hAnsi="Sylfaen" w:cs="Sylfaen"/>
+          <w:b w:val="0"/>
+          <w:sz w:val="24"/>
+        </w:rPr>
+        <w:t>•  სოციალური თანდასწრება — სხვა სოციალურ ერთეულთან ერთად ყოფნის შეგრძნება;</w:t>
       </w:r>
     </w:p>
     <w:p>
@@ -4464,7 +4464,7 @@
           <w:b w:val="0"/>
           <w:sz w:val="24"/>
         </w:rPr>
-        <w:t>შეფასების-ვალიდურობის შეზღუდვები. სიმულირებული მომხმარებლის ტრაექტორია (3.5b) არის ადამიანის აღქმისადმი უცნობი სიზუსტის პროქსი: LLM-ის მსაჯულმა შეიძლება შეაფასოს ზედაპირული გასაგებობა და არა აღქმული ურთიერთობის ხარისხი — სწორედ ამ კონფუუდის გასაკონტროლებლად არსებობს B+ — და სიმულირებულ მომხმარებლებს არ გააჩნიათ ისეთი მნიშვნელოვანი ფაქტორები, დროითი სიღრმე და კონფიდენციალურობასთან დაკავშირებული მგრძნობელობა, რაც რეალურ გამოყენებაში მეხსიერებას ორპირს ხდის (F4). სიმულირებული ნაწილიდან არცერთი აღქმითი დასკვნა არ გამომდინარეობს; ის მხოლოდ ჰიპოთეზებს ქმნის და ინსტრუმენტს ამოწმებს, მეტი არაფერი. ტექნიკური მიმართულება ზომავს ფაქტობრივ გახსენებასა და შეფერხებას, რასაც დიზაინი განზრახ არ აიგივებს აღქმული ურთიერთობის ხარისხთან, და ის მიმდინარეობს სინთეზური დიალოგების მეშვეობით, რომელთა განაწილება შესაძლოა არ ემთხვეოდეს რეალურ მრავალსესიან ხმოვან ურთიერთობას.</w:t>
+        <w:t>შეფასების-ვალიდურობის შეზღუდვები. სიმულირებული მომხმარებლის ტრაექტორია (3.5b) არის ადამიანის აღქმისადმი უცნობი სიზუსტის პროქსი: LLM-ის მსაჯულმა შეიძლება შეაფასოს ზედაპირული გასაგებობა და არა აღქმული ურთიერთობის ხარისხი — სწორედ ამ აღრევის ფაქტორის გასაკონტროლებლად არსებობს B+ — და სიმულირებულ მომხმარებლებს არ გააჩნიათ ისეთი მნიშვნელოვანი ფაქტორები, დროითი სიღრმე და კონფიდენციალურობასთან დაკავშირებული მგრძნობელობა, რაც რეალურ გამოყენებაში მეხსიერებას ორპირს ხდის (F4). სიმულირებული ნაწილიდან არცერთი აღქმითი დასკვნა არ გამომდინარეობს; ის მხოლოდ ჰიპოთეზებს ქმნის და ინსტრუმენტს ამოწმებს, მეტი არაფერი. ტექნიკური მიმართულება ზომავს ფაქტობრივ გახსენებასა და შეფერხებას, რასაც დიზაინი განზრახ არ აიგივებს აღქმული ურთიერთობის ხარისხთან, და ის მიმდინარეობს სინთეზური დიალოგების მეშვეობით, რომელთა განაწილება შესაძლოა არ ემთხვეოდეს რეალურ მრავალსესიან ხმოვან ურთიერთობას.</w:t>
       </w:r>
     </w:p>
     <w:p>
@@ -4486,7 +4486,7 @@
           <w:b w:val="0"/>
           <w:sz w:val="24"/>
         </w:rPr>
-        <w:t>თეორიისადმი ერთგულების შეზღუდვები. როგორც 3.2-შია დეტალურად აღწერილი, პროფილი C თავის ხუთი საწყისი თეორიას აერთიანებდა კი არ, არამედ ქმნიდა მათგან ახალს და სამ სახელდებულ გამოტოვებას ახდენს: ის გამოტოვებს ინტერფერენციას, ადამიანის დავიწყების დომინანტურ დინამიკას, და მხოლოდ დროისა და სალიენსის დაქვეითებას მოდელირებს; მისი სიზუსტეზე ორიენტირებული კონსოლიდაცია მიზანმიმართულად თრგუნავს რეკონსტრუქციულ და სქემაზე დაფუძნებულ დამახინჯებას, რასაც ყველაზე მკაფიოდ პროგნოზირებს ბუნდოვანი კვალითა და კომპლემენტარული სწავლის სისტემები, და ცოდნილ რეალიზმს ადამიანურობის ღერძზე ცვლის ყალბი, ზოგადი გამონათქვამების დამაჯერებლად წარმოდგენის უსაფრთხოებით; და ის დროის თანმიმდევრობისა და წყაროს მეხსიერებას მხოლოდ სუსტად ასახავს. კომპლემენტარული სწავლების სისტემების საფუძველი მოხმობილია მისი ეპიზოდურიდან სემანტიკურზე გადაცემის ფუნქციის სულისკვეთებით და არა როგორც ჩართული, ინტერფერენციისგან დაცული კორტიკალური სწავლების მტკიცება, ხოლო კოდირების დროის სალიენსის მექანიზმი აღიარებულია როგორც დამუშავების დონეების ეფექტი, ისევე როგორც მოდალური მოდელისა. ეს არის პრინციპული საინჟინრო არჩევანი, რომელიც გამჟღავნებულია იმისთვის, რომ არქიტექტურის კოგნიტური დასაბუთების მტკიცება აღიქმებოდეს როგორც პროექტირების ეტაპზე მიღებული შთაგონება გაზომვადი ქცევითი ნიშნულებით, 2.2-თან შესაბამისობაში, და არა როგორც ფსიქოლოგიური ერთგულების მტკიცება. თითოეული გამოტოვება, შესაბამისად, მომავალი მუშაობის კონკრეტული მიმართულებაა.</w:t>
+        <w:t>თეორიისადმი ერთგულების შეზღუდვები. როგორც 3.2-შია დეტალურად აღწერილი, პროფილი C თავის ხუთ საწყის თეორიას კომპოზიციად აწყობს და არა ერთ მთლიანობად აერთიანებს და სამ სახელდებულ გამოტოვებას ახდენს: ის გამოტოვებს ინტერფერენციას, ადამიანის დავიწყების დომინანტურ დინამიკას, და მხოლოდ დროისა და სალიენსის დაქვეითებას მოდელირებს; მისი სიზუსტეზე ორიენტირებული კონსოლიდაცია მიზანმიმართულად თრგუნავს რეკონსტრუქციულ და სქემაზე დაფუძნებულ დამახინჯებას, რასაც ყველაზე მკაფიოდ პროგნოზირებს ბუნდოვანი კვალითა და კომპლემენტარული სწავლის სისტემები, და კოგნიტურ რეალიზმს ადამიანურობის ღერძზე ცვლის ყალბი, ზოგადი გამონათქვამების დამაჯერებლად წარმოდგენის უსაფრთხოებით; და ის დროის თანმიმდევრობისა და წყაროს მეხსიერებას მხოლოდ სუსტად ასახავს. კომპლემენტარული სწავლების სისტემების საფუძველი მოხმობილია მისი ეპიზოდურიდან სემანტიკურზე გადაცემის ფუნქციის სულისკვეთებით და არა როგორც ჩართული, ინტერფერენციისგან დაცული კორტიკალური სწავლების მტკიცება, ხოლო კოდირების დროის სალიენსის მექანიზმი აღიარებულია როგორც დამუშავების დონეების ეფექტი, ისევე როგორც მოდალური მოდელისა. ეს არის პრინციპული საინჟინრო არჩევანი, რომელიც გამჟღავნებულია იმისთვის, რომ არქიტექტურის კოგნიტური დასაბუთების მტკიცება აღიქმებოდეს როგორც პროექტირების ეტაპზე მიღებული შთაგონება გაზომვადი ქცევითი ნიშნულებით, 2.2-თან შესაბამისობაში, და არა როგორც ფსიქოლოგიური ერთგულების მტკიცება. თითოეული გამოტოვება, შესაბამისად, მომავალი მუშაობის კონკრეტული მიმართულებაა.</w:t>
       </w:r>
     </w:p>
     <w:p>
@@ -4541,7 +4541,7 @@
           <w:b w:val="0"/>
           <w:sz w:val="24"/>
         </w:rPr>
-        <w:t>კონცეფციის დამტკიცება არის Python-ის დამოუკიდებელი მეხსიერების ჰარნესი, რომელიც მრავალსესიანი დიალოგის ტრანსკრიპტებზე ახორციელებს ოთხ პირობას (A, B, B+, C). ენობრივი მოდელის როლებისთვის (მნიშვნელოვნების შეფასება, აბზაცური შეჯამება, კონსოლიდაცია, საუბრის აგენტი და მსაჯული) გამოყენებულია OpenAI gpt-4o-mini, ხოლო მონაცემთა გამოსაძებნად — text-embedding-3-small. ის გამოცდილი იყო სამი სინთეზური მომხმარებლის პერსონას მეშვეობით, თითოეული მათგანი წარმოადგენდა ოთხსესიან საუბარს ჩადებული მნიშვნელოვანი ფაქტებით (სახელები, ალერგიები, ოჯახი), ერთჯერადი უმნიშვნელო ინფორმაციით (ამინდის შესახებ ჩამორჩენილი კომენტარი, დავიწყებული ფილმის სათაური, ერთხელ ნახსენები კაფე) და განმეორებადი ემოციური თემით (დიპლომის დაცვის ვადის სტრესი, თანადამფუძნებლებს შორის კონფლიქტი, ღამის ცვლისგან დაღლილობა). მომხმარებლის რიგის იდენტური სცენარები განმეორებით გაუშვეს ოთხივე პირობაში, ასე რომ, ყველა პირობა იღებდა ერთსა და იმავე შემავალ მონაცემებს და მხოლოდ მეხსიერების მექანიზმით განსხვავდებოდა. სრული გაშვების ღირებულებამ დაახლოებით 0.01 აშშ დოლარი შეადგინა და შვიდ წუთზე ნაკლები დრო დაიკავა.</w:t>
+        <w:t>კონცეფციის დამტკიცება არის Python-ის დამოუკიდებელი მეხსიერების ჰარნესი, რომელიც მრავალსესიანი დიალოგის ტრანსკრიპტებზე ახორციელებს ოთხ პირობას (A, B, B+, C). ენობრივი მოდელის როლებისთვის (მნიშვნელოვნების შეფასება, აბზაცური შეჯამება, კონსოლიდაცია, საუბრის აგენტი და მსაჯული) გამოყენებულია OpenAI gpt-4o-mini, ხოლო მონაცემთა გამოსაძებნად — text-embedding-3-small. ის გამოცდილი იყო სამი სინთეზური მომხმარებლის პერსონას მეშვეობით, თითოეული მათგანი წარმოადგენდა ოთხსესიან საუბარს ჩადებული მნიშვნელოვანი ფაქტებით (სახელები, ალერგიები, ოჯახი), ერთჯერადი უმნიშვნელო ინფორმაციით (ამინდის შესახებ გაკვრით ნათქვამი კომენტარი, დავიწყებული ფილმის სათაური, ერთხელ ნახსენები კაფე) და განმეორებადი ემოციური თემით (დიპლომის დაცვის ვადის სტრესი, თანადამფუძნებლებს შორის კონფლიქტი, ღამის ცვლისგან დაღლილობა). მომხმარებლის რიგის იდენტური სცენარები განმეორებით გაუშვეს ოთხივე პირობაში, ასე რომ, ყველა პირობა იღებდა ერთსა და იმავე შემავალ მონაცემებს და მხოლოდ მეხსიერების მექანიზმით განსხვავდებოდა. სრული გაშვების ღირებულებამ დაახლოებით 0.01 აშშ დოლარი შეადგინა და შვიდ წუთზე ნაკლები დრო დაიკავა.</w:t>
       </w:r>
     </w:p>
     <w:p>
@@ -4716,7 +4716,7 @@
                 <w:b w:val="0"/>
                 <w:sz w:val="22"/>
               </w:rPr>
-              <w:t>ებინგჰაუზის დაქრობა + გაძლიერება</w:t>
+              <w:t>ებინგჰაუსის დაქრობა + გაძლიერება</w:t>
             </w:r>
           </w:p>
         </w:tc>
@@ -4906,7 +4906,7 @@
                 <w:b w:val="0"/>
                 <w:sz w:val="22"/>
               </w:rPr>
-              <w:t>რეალური ხმის პიპელა (STT/TTS/რიგის დაცვა)</w:t>
+              <w:t>რეალური ხმის მილსადენი (STT/TTS/რიგის დაცვა)</w:t>
             </w:r>
           </w:p>
         </w:tc>
@@ -5000,15 +5000,15 @@
         <w:tblLayout w:type="fixed"/>
       </w:tblPr>
       <w:tblGrid>
-        <w:gridCol w:w="2984"/>
-        <w:gridCol w:w="2161"/>
-        <w:gridCol w:w="1852"/>
-        <w:gridCol w:w="1338"/>
+        <w:gridCol w:w="3266"/>
+        <w:gridCol w:w="2365"/>
+        <w:gridCol w:w="1239"/>
+        <w:gridCol w:w="1464"/>
       </w:tblGrid>
       <w:tr>
         <w:tc>
           <w:tcPr>
-            <w:tcW w:type="dxa" w:w="2984"/>
+            <w:tcW w:type="dxa" w:w="3266"/>
           </w:tcPr>
           <w:p>
             <w:pPr>
@@ -5026,7 +5026,7 @@
         </w:tc>
         <w:tc>
           <w:tcPr>
-            <w:tcW w:type="dxa" w:w="2161"/>
+            <w:tcW w:type="dxa" w:w="2365"/>
           </w:tcPr>
           <w:p>
             <w:pPr>
@@ -5044,7 +5044,7 @@
         </w:tc>
         <w:tc>
           <w:tcPr>
-            <w:tcW w:type="dxa" w:w="1852"/>
+            <w:tcW w:type="dxa" w:w="1239"/>
           </w:tcPr>
           <w:p>
             <w:pPr>
@@ -5056,13 +5056,13 @@
                 <w:b/>
                 <w:sz w:val="22"/>
               </w:rPr>
-              <w:t>საინტერესო ფაქტები</w:t>
+              <w:t>წვრილმანები</w:t>
             </w:r>
           </w:p>
         </w:tc>
         <w:tc>
           <w:tcPr>
-            <w:tcW w:type="dxa" w:w="1338"/>
+            <w:tcW w:type="dxa" w:w="1464"/>
           </w:tcPr>
           <w:p>
             <w:pPr>
@@ -5082,7 +5082,7 @@
       <w:tr>
         <w:tc>
           <w:tcPr>
-            <w:tcW w:type="dxa" w:w="2984"/>
+            <w:tcW w:type="dxa" w:w="3266"/>
           </w:tcPr>
           <w:p>
             <w:pPr>
@@ -5100,7 +5100,7 @@
         </w:tc>
         <w:tc>
           <w:tcPr>
-            <w:tcW w:type="dxa" w:w="2161"/>
+            <w:tcW w:type="dxa" w:w="2365"/>
           </w:tcPr>
           <w:p>
             <w:pPr>
@@ -5118,7 +5118,7 @@
         </w:tc>
         <w:tc>
           <w:tcPr>
-            <w:tcW w:type="dxa" w:w="1852"/>
+            <w:tcW w:type="dxa" w:w="1239"/>
           </w:tcPr>
           <w:p>
             <w:pPr>
@@ -5136,7 +5136,7 @@
         </w:tc>
         <w:tc>
           <w:tcPr>
-            <w:tcW w:type="dxa" w:w="1338"/>
+            <w:tcW w:type="dxa" w:w="1464"/>
           </w:tcPr>
           <w:p>
             <w:pPr>
@@ -5156,7 +5156,7 @@
       <w:tr>
         <w:tc>
           <w:tcPr>
-            <w:tcW w:type="dxa" w:w="2984"/>
+            <w:tcW w:type="dxa" w:w="3266"/>
           </w:tcPr>
           <w:p>
             <w:pPr>
@@ -5174,7 +5174,7 @@
         </w:tc>
         <w:tc>
           <w:tcPr>
-            <w:tcW w:type="dxa" w:w="2161"/>
+            <w:tcW w:type="dxa" w:w="2365"/>
           </w:tcPr>
           <w:p>
             <w:pPr>
@@ -5192,7 +5192,7 @@
         </w:tc>
         <w:tc>
           <w:tcPr>
-            <w:tcW w:type="dxa" w:w="1852"/>
+            <w:tcW w:type="dxa" w:w="1239"/>
           </w:tcPr>
           <w:p>
             <w:pPr>
@@ -5210,7 +5210,7 @@
         </w:tc>
         <w:tc>
           <w:tcPr>
-            <w:tcW w:type="dxa" w:w="1338"/>
+            <w:tcW w:type="dxa" w:w="1464"/>
           </w:tcPr>
           <w:p>
             <w:pPr>
@@ -5230,7 +5230,7 @@
       <w:tr>
         <w:tc>
           <w:tcPr>
-            <w:tcW w:type="dxa" w:w="2984"/>
+            <w:tcW w:type="dxa" w:w="3266"/>
           </w:tcPr>
           <w:p>
             <w:pPr>
@@ -5248,7 +5248,7 @@
         </w:tc>
         <w:tc>
           <w:tcPr>
-            <w:tcW w:type="dxa" w:w="2161"/>
+            <w:tcW w:type="dxa" w:w="2365"/>
           </w:tcPr>
           <w:p>
             <w:pPr>
@@ -5266,7 +5266,7 @@
         </w:tc>
         <w:tc>
           <w:tcPr>
-            <w:tcW w:type="dxa" w:w="1852"/>
+            <w:tcW w:type="dxa" w:w="1239"/>
           </w:tcPr>
           <w:p>
             <w:pPr>
@@ -5284,7 +5284,7 @@
         </w:tc>
         <w:tc>
           <w:tcPr>
-            <w:tcW w:type="dxa" w:w="1338"/>
+            <w:tcW w:type="dxa" w:w="1464"/>
           </w:tcPr>
           <w:p>
             <w:pPr>
@@ -5304,7 +5304,7 @@
       <w:tr>
         <w:tc>
           <w:tcPr>
-            <w:tcW w:type="dxa" w:w="2984"/>
+            <w:tcW w:type="dxa" w:w="3266"/>
           </w:tcPr>
           <w:p>
             <w:pPr>
@@ -5322,7 +5322,7 @@
         </w:tc>
         <w:tc>
           <w:tcPr>
-            <w:tcW w:type="dxa" w:w="2161"/>
+            <w:tcW w:type="dxa" w:w="2365"/>
           </w:tcPr>
           <w:p>
             <w:pPr>
@@ -5340,7 +5340,7 @@
         </w:tc>
         <w:tc>
           <w:tcPr>
-            <w:tcW w:type="dxa" w:w="1852"/>
+            <w:tcW w:type="dxa" w:w="1239"/>
           </w:tcPr>
           <w:p>
             <w:pPr>
@@ -5358,7 +5358,7 @@
         </w:tc>
         <w:tc>
           <w:tcPr>
-            <w:tcW w:type="dxa" w:w="1338"/>
+            <w:tcW w:type="dxa" w:w="1464"/>
           </w:tcPr>
           <w:p>
             <w:pPr>
@@ -5387,7 +5387,7 @@
           <w:b w:val="0"/>
           <w:sz w:val="24"/>
         </w:rPr>
-        <w:t>სამი მოდელი ჩანს. პირველი, გრძელვადიანი მეხსიერება აუცილებელია: პირობა A, მხოლოდ ნაკლებად მდგრადი სამუშაო ფანჯრით, არ იხსენებს სესიებს შორის არსებულ არცერთ ფაქტს (მისი 0.67 გენერალიზაციის მაჩვენებელი სესიის შიდა არტეფაქტია — განმეორებადი თემა ხელახლა არის წარმოდგენილი იმავე სესიაში, რომელშიც ტესტირება მიმდინარეობს — და არა მეხსიერების მტკიცებულება). მეორე და, რაც მთავარია, მხოლოდ პროფილი C ავლენს გრაციოზულ, მნიშვნელობაზე-დაფუძნებულ დავიწყებას: ის ინარჩუნებს ყველა მნიშვნელოვან ფაქტს (1.00) და ივიწყებს დაბალი მნიშვნელობის მქონე წვრილმანებს (0.00), მაშინ როცა B და B+ ყველაფერს უსხვამისეულად ინარჩუნებენ (1.00/1.00). ეს არის ებინგჰაუზის ეფექტი, რომელიც მოქმედებს ისე, როგორც უნდა — დაბალი მნიშვნელობის კვალი მცირე სტაბილურობას იძენს, ერთი-ორი სესიის შუალედში იშლება ხელმისაწვდომობის ზღვარს ქვემოთ და გადის მეხსიერების აღდგენის პროცესს. ქცევითი განსხვავება პირდაპირ შესამჩნევია: კითხვაზე, როგორი ამინდი იყო, B პირობამ უპასუხა: "იმ დილით ძალიან ბურუსი იყო, ერთგვარად ლამაზი!", ხოლო C პირობამ უპასუხა: "ჩემს წინა საუბარში ამინდის შესახებ ეს კონკრეტული დეტალი არ მახსოვს. შენთან ბოლო დროს როგორი ამინდია?" — ეს იყო თბილი, დაუმახსოვრებელი პასუხი და არა მექანიკური გამეორება.</w:t>
+        <w:t>სამი მოდელი ჩანს. პირველი, გრძელვადიანი მეხსიერება აუცილებელია: პირობა A, მხოლოდ ნაკლებად მდგრადი სამუშაო ფანჯრით, არ იხსენებს სესიებს შორის არსებულ არცერთ ფაქტს (მისი 0.67 გენერალიზაციის მაჩვენებელი სესიის შიდა არტეფაქტია — განმეორებადი თემა ხელახლა არის წარმოდგენილი იმავე სესიაში, რომელშიც ტესტირება მიმდინარეობს — და არა მეხსიერების მტკიცებულება). მეორე და, რაც მთავარია, მხოლოდ პროფილი C ავლენს გრაციოზულ, მნიშვნელობაზე-დაფუძნებულ დავიწყებას: ის ინარჩუნებს ყველა მნიშვნელოვან ფაქტს (1.00) და ივიწყებს დაბალი მნიშვნელობის მქონე წვრილმანებს (0.00), მაშინ როცა B და B+ ყველაფერს განურჩევლად ინარჩუნებენ (1.00/1.00). ეს არის ებინგჰაუსის ეფექტი, რომელიც მოქმედებს ისე, როგორც უნდა — დაბალი მნიშვნელობის კვალი მცირე სტაბილურობას იძენს, ერთი-ორი სესიის შუალედში იშლება ხელმისაწვდომობის ზღვარს ქვემოთ და გადის მეხსიერების აღდგენის პროცესს. ქცევითი განსხვავება პირდაპირ შესამჩნევია: კითხვაზე, როგორი ამინდი იყო, B პირობამ უპასუხა: "იმ დილით ძალიან ბურუსი იყო, ერთგვარად ლამაზი!", ხოლო C პირობამ უპასუხა: "ჩემს წინა საუბარში ამინდის შესახებ ეს კონკრეტული დეტალი არ მახსოვს. შენთან ბოლო დროს როგორი ამინდია?" — ეს იყო თბილი, დაუმახსოვრებელი პასუხი და არა მექანიკური გამეორება.</w:t>
       </w:r>
     </w:p>
     <w:p>
@@ -5930,7 +5930,7 @@
                 <w:b w:val="0"/>
                 <w:sz w:val="22"/>
               </w:rPr>
-              <w:t>შეფასებული ინტელექტი</w:t>
+              <w:t>აღქმული ინტელექტი</w:t>
             </w:r>
           </w:p>
         </w:tc>
@@ -6040,7 +6040,7 @@
                 <w:b w:val="0"/>
                 <w:sz w:val="22"/>
               </w:rPr>
-              <w:t>კერძოობის კომფორტი</w:t>
+              <w:t>კონფიდენციალურობის კომფორტი</w:t>
             </w:r>
           </w:p>
         </w:tc>
@@ -6158,7 +6158,7 @@
           <w:b w:val="0"/>
           <w:sz w:val="24"/>
         </w:rPr>
-        <w:t>პირველი: პროფილი C არ აღემატება B+-ის კურირებულ კონტროლს არცერთ კონსტრუქტზე (ამ მცირე ნიმუშში C-სა და B+-ს შორის ყველა სხვაობა ნულია ან უარყოფითია). ეს ზუსტად ისაა, რასაც ა-პრიორი ანალიზი (F18) პროგნოზირებდა: როგორც კი სუფთა, კურირებული სტატიკური მეხსიერება (B+) არსებობს, C-ის ადამიანური მეხსიერების დამატებითი დინამიკა — გახანგრძლივება, სალიენცობა, კონსოლიდაცია — ამ მასშტაბსა და ჰორიზონტზე აღქმის აღმოჩენად ზღვარს არ ქმნის. ამგვარად, კონცეფციის დამტკიცება სიმულაციის მეშვეობით ადასტურებს თეზისის საკუთარ მტკიცებას, რომ C-სა და B+-ს შორის ეფექტი მცირეა; ის არ ამტკიცებს და ვერც ამტკიცებს, რომ ადამიანებში ის ნულოვანია.</w:t>
+        <w:t>პირველი: პროფილი C არ აღემატება B+-ის კურირებულ კონტროლს არცერთ კონსტრუქტზე (ამ მცირე ნიმუშში C-სა და B+-ს შორის ყველა სხვაობა ნულია ან უარყოფითია). ეს ზუსტად ისაა, რასაც ა-პრიორი ანალიზი (F18) პროგნოზირებდა: როგორც კი სუფთა, კურირებული სტატიკური მეხსიერება (B+) არსებობს, C-ის ადამიანური მეხსიერების დამატებითი დინამიკა — დაქრობა, სალიენცობა, კონსოლიდაცია — ამ მასშტაბსა და ჰორიზონტზე აღქმის აღმოჩენად ზღვარს არ ქმნის. ამგვარად, კონცეფციის დამტკიცება სიმულაციის მეშვეობით ადასტურებს თეზისის საკუთარ მტკიცებას, რომ C-სა და B+-ს შორის ეფექტი მცირეა; ის არ ამტკიცებს და ვერც ამტკიცებს, რომ ადამიანებში ის ნულოვანია.</w:t>
       </w:r>
     </w:p>
     <w:p>
@@ -6245,7 +6245,7 @@
           <w:b w:val="0"/>
           <w:sz w:val="24"/>
         </w:rPr>
-        <w:t>შეფასების შეზღუდვები მნიშვნელოვანია და პირდაპირ არის ფორმულირებული. სიმულაციური მომხმარებლები და დიდი ენის მოდელის (LLM) მსაჯული იზიარებენ სატესტო სისტემის არქიტექტურას და არ გააჩნიათ რეალური მომხმარებლებისთვის დამახასიათებელი მნიშვნელოვანი ფაქტორები, დროითი სიღრმე და კონფიდენციალურობასთან დაკავშირებული მგრძნობელობა — ზემოთ აღწერილი კონფიდენციალურობის ინვერსია ამის ყველაზე მკაფიო ილუსტრაციაა. ნიმუში მცირეა (სამი პერსონა, თითოეულს ოთხი სესია, ერთი მსაჯულის გავლის), ამიტომ აღქმის მაჩვენებლები უფრო ილუსტრაციულია, ვიდრე რაიმე პოპულაციის რაოდენობის შეფასება, და არანაირი მნიშვნელოვანი განსხვავების (significance) მტკიცება არ ხდება. დრო შეკუმშულია სესიების ერთეულებამდე, ამიტომ დავიწყებისა და კონსოლიდაციის დინამიკა ვლინდება არა დიზაინით გათვალისწინებულ კვირებზე, არამედ რამდენიმე წყვეტაზე; F18-ის მიერ იდენტიფიცირებული "ცივი სტარტის" გაზვიადება, თუ რაიმე, აქ შემცირებულია. ენობრივი მოდელი, რომელიც ყველა როლს ამუშავებს (gpt-4o-mini), არ არის საბოლოო ხმის ტვინი და რამდენიმე მექანიზმი დანერგილია შემცირებული სიზუსტით ან გადავადებულია (ცხრილი 4.1). და ბოლოს, ჰარნესი მუშაობს ტექსტურ ტრანსკრიპტებზე და არა პირდაპირ ხმის არხზე, ამიტომ ის აჩვენებს მეხსიერების პროცესს და არა რეალურ საუბრის პარტნიორს. თითოეული შეზღუდვა კონკრეტული ამოცანაა სრული ვერსიის ასაწყობად და ამ ნაშრომიდან გამომდინარე ადამიანებზე ჩასატარებელი კვლევისთვის.</w:t>
+        <w:t>შეფასების შეზღუდვები მნიშვნელოვანია და პირდაპირ არის ფორმულირებული. სიმულაციური მომხმარებლები და დიდი ენის მოდელის (LLM) მსაჯული იზიარებენ სატესტო სისტემის არქიტექტურას და არ გააჩნიათ რეალური მომხმარებლებისთვის დამახასიათებელი მნიშვნელოვანი ფაქტორები, დროითი სიღრმე და კონფიდენციალურობასთან დაკავშირებული მგრძნობელობა — ზემოთ აღწერილი კონფიდენციალურობის ინვერსია ამის ყველაზე მკაფიო ილუსტრაციაა. ნიმუში მცირეა (სამი პერსონა, თითოეულს ოთხი სესია, ერთი მსაჯულის გავლის), ამიტომ აღქმის მაჩვენებლები უფრო ილუსტრაციულია, ვიდრე რაიმე პოპულაციის რაოდენობის შეფასება, და არანაირი მნიშვნელოვანი განსხვავების (significance) მტკიცება არ ხდება. დრო შეკუმშულია სესიების ერთეულებამდე, ამიტომ დავიწყებისა და კონსოლიდაციის დინამიკა ვლინდება არა დიზაინით გათვალისწინებულ კვირებზე, არამედ რამდენიმე წყვეტაზე; F18-ის მიერ იდენტიფიცირებული "ცივი სტარტის" გაზვიადება, თუ რაიმე, აქ შემცირებულია. ენობრივი მოდელი, რომელიც ყველა როლს ამუშავებს (gpt-4o-mini), არ არის საბოლოო ხმის ტვინი და რამდენიმე მექანიზმი დანერგილია შემცირებული სიზუსტით ან გადავადებულია (ცხრილი 4.1). და ბოლოს, ჰარნესი მუშაობს ტექსტურ ტრანსკრიპტებზე და არა პირდაპირ ხმის არხზე, ამიტომ ის აჩვენებს მეხსიერების პროცესს და არა რეალურ თანამოსაუბრეს. თითოეული შეზღუდვა კონკრეტული ამოცანაა სრული ვერსიის ასაწყობად და ამ ნაშრომიდან გამომდინარე ადამიანებზე ჩასატარებელი კვლევისთვის.</w:t>
       </w:r>
     </w:p>
     <w:p>
@@ -6300,7 +6300,7 @@
           <w:b w:val="0"/>
           <w:sz w:val="24"/>
         </w:rPr>
-        <w:t>ნაშრომი სამ კოორდინირებულ წვლილს წარმოადგენს. პირველი, ის წარმოადგენს Profile C-ს, მეხსიერების ერთიან ძრავს, რომელიც აერთიანებს მეხსიერების ხუთ კოგნიტურ თეორიას — მრავალსაცავო მოდელს, ებინგჰაუზის დავიწყების კრუგს, ტულვინგის ეპიზოდურ-სემანტიკური განასხვავება, ბუნდოვანი კვალის თეორია და დამატებითი სასწავლო სისტემების ჩარჩო — ერთ შეთანხმებულ ციკლურ პროცესში, რომელიც მოიცავს მნიშვნელობის მიხედვით კოდირებას, არსებითი ნაწილისა და ორიენტირის წარმოდგენას, გაძლიერებით ნელი დაშლა, ოფლაინ ეპიზოდურიდან სემანტიკურზე კონსოლიდაცია და არსებითი ნაწილით ინფორმაციის მოძიება, სადაც თითოეული ეტაპი დაკავშირებულია აღქმად ქცევით ნიშან-თვისებასთან და არა კოგნიტური ერთგულების მტკიცებასთან. მეორე, და მეთოდოლოგიურად ყველაზე მნიშვნელოვანი, ის წარმოადგენს B+ აქტიურ კონტროლს: კურატორირებული სტატიკური მეხსიერების მდგომარეობას, რომელიც იღებს იმავე ოფლაინ შეჯამებასა და გაწმენდას, რაც პროფილი C, მაგრამ არ გააჩნია მისი ადამიანის მეხსიერების დინამიკა, რითაც გამოყოფს დინამიკის ეფექტს ენობრივი მოდელის კურატორირების ზოგადი წაკითხვადობის ზრდისგან — ისეთი არევა, რომელიც სხვა შემთხვევაში ადამიანის მსგავსი მეხსიერების ნებისმიერ დადებით შედეგს გაუგებარს გახდიდა. მესამე, ის წარმოადგენს ოთხივე პირობის კონცეფციის დამტკიცების იმპლემენტაციას და ორხაზიან ტექნიკურ და სიმულირებულ შეფასებას, რომელიც აჩვენებს არქიტექტურის მექანიზმებს და იკვლევს მათ აღქმით შედეგებს.</w:t>
+        <w:t>ნაშრომი სამ კოორდინირებულ წვლილს წარმოადგენს. პირველი, ის წარმოადგენს Profile C-ს, მეხსიერების ერთიან ძრავს, რომელიც აერთიანებს მეხსიერების ხუთ კოგნიტურ თეორიას — მრავალსაცავიან მოდელს, ებინგჰაუსის დავიწყების მრუდს, ტულვინგის ეპიზოდურ-სემანტიკური განასხვავება, ბუნდოვანი კვალის თეორია და დამატებითი სასწავლო სისტემების ჩარჩო — ერთ შეთანხმებულ ციკლურ პროცესში, რომელიც მოიცავს მნიშვნელობის მიხედვით კოდირებას, არსებითი ნაწილისა და ორიენტირის წარმოდგენას, გაძლიერებით ნელი დაშლა, ოფლაინ ეპიზოდურიდან სემანტიკურზე კონსოლიდაცია და არსებითი ნაწილით ინფორმაციის მოძიება, სადაც თითოეული ეტაპი დაკავშირებულია აღქმად ქცევით ნიშან-თვისებასთან და არა კოგნიტური ერთგულების მტკიცებასთან. მეორე, და მეთოდოლოგიურად ყველაზე მნიშვნელოვანი, ის წარმოადგენს B+ აქტიურ კონტროლს: კურატორირებული სტატიკური მეხსიერების მდგომარეობას, რომელიც იღებს იმავე ოფლაინ შეჯამებასა და გაწმენდას, რაც პროფილი C, მაგრამ არ გააჩნია მისი ადამიანის მეხსიერების დინამიკა, რითაც გამოყოფს დინამიკის ეფექტს ენობრივი მოდელის კურატორირების ზოგადი წაკითხვადობის ზრდისგან — ისეთი არევა, რომელიც სხვა შემთხვევაში ადამიანის მსგავსი მეხსიერების ნებისმიერ დადებით შედეგს გაუგებარს გახდიდა. მესამე, ის წარმოადგენს ოთხივე პირობის კონცეფციის დამტკიცების იმპლემენტაციას და ორხაზიან ტექნიკურ და სიმულირებულ შეფასებას, რომელიც აჩვენებს არქიტექტურის მექანიზმებს და იკვლევს მათ აღქმით შედეგებს.</w:t>
       </w:r>
     </w:p>
     <w:p>
@@ -6327,7 +6327,7 @@
           <w:b w:val="0"/>
           <w:sz w:val="24"/>
         </w:rPr>
-        <w:t>კონცეფციის დამტკიცებამ აჩვენა, რომ არქიტექტურის განხორციელება შესაძლებელია და მისი მექანიზმები ფუნქციონირებს დაგეგმილის შესაბამისად და განასხვავებადია დაკვირვებად ქცევაში: მეხსიერება აუცილებელია სესიებს შორის ინფორმაციის გამოსათვლელად; მხოლოდ პროფილი C ივიწყებს გამართულად და სელექციურად — ინარჩუნებს მნიშვნელოვან ფაქტებს, ხოლო უმნიშვნელო ინფორმაცია მივიწყებას მიეცემა — და მხოლოდ ის აერთიანებს განმეორებად ეპიზოდებს მდგრად სემანტიკურ ცოდნად, უფრო მცირე კონტექსტური კვალითა და საბაზისო მოდელებთან შედარებით იდენტური შეყოვნებით. სიმულირებული აღქმის ტრექში, პროფილი C არცერთ კონსტრუქტზე არ აღემატებოდა B+ კურირების კონტროლს, რაც სიმულაციაში ადასტურებს ა-პრიორი ანალიზს, რომ სუფთა კურირების ფონზე ადამიანის მეხსიერების დინამიკის მარგინალური აღქმითი წვლილი მცირეა. ყველაზე მნიშვნელოვანია, რომ ერთ კონსტრუქტზე, რომელსაც ადამიანის მეხსიერების დინამიკის მკაფიოდ დადასტურებული ადამიანური ეფექტი აქვს — სიტყვასიტყვითი გახსენების ინტრუზიულობა — სიმულაციურმა მსაჯულმა ადამიანურ ლიტერატურაში არსებულის საპირისპირო დალაგება წარმოადგინა, რითაც კონტრ-მაგალითით აჩვენა, რომ LLM-ის მსაჯული ვერ ჩაანაცვლებს ადამიანის აღქმას ისეთ კონსტრუქტებზე, რომლებიც დამოკიდებულია რისკებზე, როგორიცაა კონფიდენციალურობა და ნდობა. შესაბამისად, შეფასება უბრალოდ არ გადადებს ადამიანურ კვლევას; ის ემპირიულად აჩვენებს, თუ რატომ არის ეს კვლევა აუცილებელი.</w:t>
+        <w:t>კონცეფციის დამტკიცებამ აჩვენა, რომ არქიტექტურის განხორციელება შესაძლებელია და მისი მექანიზმები ფუნქციონირებს დაგეგმილის შესაბამისად და განასხვავებადია დაკვირვებად ქცევაში: მეხსიერება აუცილებელია სესიებს შორის ინფორმაციის გასახსენებლად; მხოლოდ პროფილი C ივიწყებს გამართულად და სელექციურად — ინარჩუნებს მნიშვნელოვან ფაქტებს, ხოლო უმნიშვნელო ინფორმაცია მივიწყებას მიეცემა — და მხოლოდ ის აერთიანებს განმეორებად ეპიზოდებს მდგრად სემანტიკურ ცოდნად, უფრო მცირე კონტექსტური კვალითა და საბაზისო მოდელებთან შედარებით იდენტური შეყოვნებით. სიმულირებული აღქმის ტრექში, პროფილი C არცერთ კონსტრუქტზე არ აღემატებოდა B+ კურირების კონტროლს, რაც სიმულაციაში ადასტურებს ა-პრიორი ანალიზს, რომ სუფთა კურირების ფონზე ადამიანის მეხსიერების დინამიკის მარგინალური აღქმითი წვლილი მცირეა. ყველაზე მნიშვნელოვანია, რომ ერთ კონსტრუქტზე, რომელსაც ადამიანის მეხსიერების დინამიკის მკაფიოდ დადასტურებული ადამიანური ეფექტი აქვს — სიტყვასიტყვითი გახსენების ინტრუზიულობა — სიმულაციურმა მსაჯულმა ადამიანურ ლიტერატურაში არსებულის საპირისპირო დალაგება წარმოადგინა, რითაც კონტრ-მაგალითით აჩვენა, რომ LLM-ის მსაჯული ვერ ჩაანაცვლებს ადამიანის აღქმას ისეთ კონსტრუქტებზე, რომლებიც დამოკიდებულია რისკებზე, როგორიცაა კონფიდენციალურობა და ნდობა. შესაბამისად, შეფასება უბრალოდ არ გადადებს ადამიანურ კვლევას; ის ემპირიულად აჩვენებს, თუ რატომ არის ეს კვლევა აუცილებელი.</w:t>
       </w:r>
     </w:p>
     <w:p>
@@ -6354,7 +6354,7 @@
           <w:b w:val="0"/>
           <w:sz w:val="24"/>
         </w:rPr>
-        <w:t>პირდაპირ სამი მიმართულება მოჰყვება. პირველი სრული სისტემის შექმნაა: პროფილი C-ის ინტეგრირება ხმოვანი არხის რეალურ დროში, პლატფორმის აუდიტში გამოვლენილი გამოყენებადობის შეზღუდვების მოგვარება (მონაწილეთა იზოლაცია, პაკეტირება, ერთი არჩეული საუბრის მოდული) და იმ მექანიზმების იმპლემენტაცია, რომლებიც ამჟამად შემცირებული სიზუსტით მუშაობს — ბაიესის სიურპრიზის მოვლენების სეგმენტაცია, ასოციაციური წინასწარი გაფართოება და დეტერმინირებული ზუსტი გახსენების ტრიგერი. მეორეა 3.5(c)-ში მითითებული ადამიანთა სუბიექტებზე ჩატარებული კვლევა: B-ს, B+, და C სფეროს ნორმატიული ნიმუშის ზომით, გათვლილი იმ შედარებებისთვის, სადაც მძლავრობა მიღწევადია, და ცენტრალურ C-სა და B+-ს შორის კონტრასტს, როგორც შეფასების სამიზნეს, განიხილავს, თან ახლავს თბილი, მიკუთვნებადი დავიწყება, გვიანი ფანჯრის ანალიზი, მოვლენაზე მგრძნობიარე და ქცევითი ზომები, და კოდირებული ინტერვიუები, როგორც დიზაინის პასუხი სავარაუდოდ მცირე ან ნულოვან პირველად ეფექტზე. მესამეა თეორიული გაფართოება: იმ მეხსიერების ფენომენების ინკორპორაცია, რომლებსაც ამჟამინდელი არქიტექტურა განზრახ გამორიცხავს — ინტერფერენცია, როგორც დავიწყების მექანიზმი, რეკონსტრუქციული და სქემაზე დაფუძნებული დამახინჯება, რასაც ყველაზე მკაფიოდ პროგნოზირებს ბუნდოვანი კვალითა და კომპლემენტარული სწავლების სისტემები, და უფრო მდიდარი დროითი თანმიმდევრობისა და წყაროს მეხსიერება — თითოეული მათგანი ერთდროულად არის როგორც ერთგულების ხარვეზი, ასევე კონკრეტული ჰიპოთეზა იმის შესახებ, თუ რა გახდიდა ინტერლოკუტორს უფრო ადამიანურს. ჯამში, ეს ყველაფერი ასრულებს თანაშემწიდან თანამოსაუბრედ ევოლუციას, რომელიც ამ ნაშრომმა დააპროექტა, მინიატურაში შექმნა და აჩვენა, თუ როგორ უნდა გაიზომოს.</w:t>
+        <w:t>პირდაპირ სამი მიმართულება მოჰყვება. პირველი სრული სისტემის შექმნაა: პროფილი C-ის ინტეგრირება ხმოვანი არხის რეალურ დროში, პლატფორმის აუდიტში გამოვლენილი გამოყენებადობის შეზღუდვების მოგვარება (მონაწილეთა იზოლაცია, პაკეტირება, ერთი არჩეული საუბრის მოდული) და იმ მექანიზმების იმპლემენტაცია, რომლებიც ამჟამად შემცირებული სიზუსტით მუშაობს — ბაიესის სიურპრიზის მოვლენების სეგმენტაცია, ასოციაციური წინასწარი გაფართოება და დეტერმინირებული ზუსტი გახსენების ტრიგერი. მეორეა 3.5(c)-ში მითითებული ადამიანთა სუბიექტებზე ჩატარებული კვლევა: B-ს, B+, და C სფეროს ნორმატიული ნიმუშის ზომით, გათვლილი იმ შედარებებისთვის, სადაც მძლავრობა მიღწევადია, და ცენტრალურ C-სა და B+-ს შორის კონტრასტს, როგორც შეფასების სამიზნეს, განიხილავს, თან ახლავს თბილი, მიკუთვნებადი დავიწყება, გვიანი ფანჯრის ანალიზი, მოვლენაზე მგრძნობიარე და ქცევითი ზომები, და კოდირებული ინტერვიუები, როგორც დიზაინის პასუხი სავარაუდოდ მცირე ან ნულოვან პირველად ეფექტზე. მესამეა თეორიული გაფართოება: იმ მეხსიერების ფენომენების ინკორპორაცია, რომლებსაც ამჟამინდელი არქიტექტურა განზრახ გამორიცხავს — ინტერფერენცია, როგორც დავიწყების მექანიზმი, რეკონსტრუქციული და სქემაზე დაფუძნებული დამახინჯება, რასაც ყველაზე მკაფიოდ პროგნოზირებს ბუნდოვანი კვალითა და კომპლემენტარული სწავლების სისტემები, და უფრო მდიდარი დროითი თანმიმდევრობისა და წყაროს მეხსიერება — თითოეული მათგანი ერთდროულად არის როგორც ერთგულების ხარვეზი, ასევე კონკრეტული ჰიპოთეზა იმის შესახებ, თუ რა გახდიდა თანამოსაუბრეს უფრო ადამიანურს. ჯამში, ეს ყველაფერი ასრულებს ასისტენტიდან თანამოსაუბრედ ევოლუციას, რომელიც ამ ნაშრომმა დააპროექტა, მინიატურაში შექმნა და აჩვენა, თუ როგორ უნდა გაიზომოს.</w:t>
       </w:r>
     </w:p>
     <w:p>

</xml_diff>

<commit_message>
polish(thesis): left-align front-matter (was justified, stretched Georgian)
Justified recommendation/copyright paragraphs stretched word spacing ugly once
real text was inserted; left-align matches the GTU sample. Title-page logo left
at template size — scripted resize collides the floating title/date boxes
(documented in build.py); final logo sizing is a manual drag.

Co-Authored-By: Claude Opus 4.8 <noreply@anthropic.com>
</commit_message>
<xml_diff>
--- a/project/thesis-ka.docx
+++ b/project/thesis-ka.docx
@@ -922,7 +922,7 @@
       <w:pPr>
         <w:spacing w:after="0" w:line="240" w:lineRule="auto"/>
         <w:ind w:firstLine="454"/>
-        <w:jc w:val="both"/>
+        <w:jc w:val="left"/>
         <w:rPr>
           <w:lang w:val="ka-GE"/>
         </w:rPr>
@@ -937,7 +937,7 @@
     <w:p>
       <w:pPr>
         <w:spacing w:after="0" w:line="240" w:lineRule="auto"/>
-        <w:jc w:val="both"/>
+        <w:jc w:val="left"/>
         <w:rPr>
           <w:szCs w:val="24"/>
           <w:lang w:val="ka-GE"/>
@@ -967,7 +967,7 @@
     <w:p>
       <w:pPr>
         <w:spacing w:after="0" w:line="240" w:lineRule="auto"/>
-        <w:jc w:val="both"/>
+        <w:jc w:val="left"/>
         <w:rPr>
           <w:szCs w:val="24"/>
           <w:lang w:val="ka-GE"/>
@@ -1649,7 +1649,7 @@
       <w:pPr>
         <w:spacing w:after="0" w:line="240" w:lineRule="auto"/>
         <w:ind w:firstLine="454"/>
-        <w:jc w:val="both"/>
+        <w:jc w:val="left"/>
         <w:rPr>
           <w:szCs w:val="24"/>
           <w:lang w:val="ka-GE"/>
@@ -1660,7 +1660,7 @@
       <w:pPr>
         <w:spacing w:after="0" w:line="240" w:lineRule="auto"/>
         <w:ind w:firstLine="454"/>
-        <w:jc w:val="both"/>
+        <w:jc w:val="left"/>
         <w:rPr>
           <w:szCs w:val="24"/>
           <w:lang w:val="ka-GE"/>
@@ -1671,7 +1671,7 @@
       <w:pPr>
         <w:spacing w:after="0" w:line="240" w:lineRule="auto"/>
         <w:ind w:firstLine="454"/>
-        <w:jc w:val="both"/>
+        <w:jc w:val="left"/>
         <w:rPr>
           <w:szCs w:val="24"/>
           <w:lang w:val="ka-GE"/>
@@ -1682,7 +1682,7 @@
       <w:pPr>
         <w:spacing w:after="0" w:line="240" w:lineRule="auto"/>
         <w:ind w:firstLine="454"/>
-        <w:jc w:val="both"/>
+        <w:jc w:val="left"/>
         <w:rPr>
           <w:szCs w:val="24"/>
           <w:lang w:val="ka-GE"/>
@@ -1700,7 +1700,7 @@
       <w:pPr>
         <w:spacing w:after="0" w:line="240" w:lineRule="auto"/>
         <w:ind w:firstLine="454"/>
-        <w:jc w:val="both"/>
+        <w:jc w:val="left"/>
         <w:rPr>
           <w:szCs w:val="24"/>
           <w:lang w:val="ka-GE"/>
@@ -1839,7 +1839,7 @@
       <w:pPr>
         <w:spacing w:after="0" w:line="240" w:lineRule="auto"/>
         <w:ind w:firstLine="454"/>
-        <w:jc w:val="both"/>
+        <w:jc w:val="left"/>
         <w:rPr>
           <w:lang w:val="ka-GE"/>
         </w:rPr>
@@ -1959,7 +1959,7 @@
       <w:pPr>
         <w:spacing w:after="0" w:line="240" w:lineRule="auto"/>
         <w:ind w:firstLine="454"/>
-        <w:jc w:val="both"/>
+        <w:jc w:val="left"/>
         <w:rPr>
           <w:szCs w:val="24"/>
           <w:lang w:val="ka-GE"/>
@@ -2115,7 +2115,7 @@
     <w:p>
       <w:pPr>
         <w:spacing w:after="0" w:line="240" w:lineRule="auto"/>
-        <w:jc w:val="both"/>
+        <w:jc w:val="left"/>
         <w:rPr>
           <w:szCs w:val="24"/>
         </w:rPr>
@@ -2124,7 +2124,7 @@
     <w:p>
       <w:pPr>
         <w:spacing w:after="0" w:line="240" w:lineRule="auto"/>
-        <w:jc w:val="both"/>
+        <w:jc w:val="left"/>
         <w:rPr>
           <w:szCs w:val="24"/>
         </w:rPr>
@@ -2133,7 +2133,7 @@
     <w:p>
       <w:pPr>
         <w:spacing w:after="0" w:line="240" w:lineRule="auto"/>
-        <w:jc w:val="both"/>
+        <w:jc w:val="left"/>
         <w:rPr>
           <w:szCs w:val="24"/>
         </w:rPr>
@@ -2183,7 +2183,7 @@
     <w:p>
       <w:pPr>
         <w:spacing w:after="0" w:line="240" w:lineRule="auto"/>
-        <w:jc w:val="both"/>
+        <w:jc w:val="left"/>
         <w:rPr>
           <w:sz w:val="28"/>
           <w:szCs w:val="28"/>
@@ -2194,7 +2194,7 @@
     <w:p>
       <w:pPr>
         <w:spacing w:after="0" w:line="240" w:lineRule="auto"/>
-        <w:jc w:val="both"/>
+        <w:jc w:val="left"/>
         <w:rPr>
           <w:sz w:val="28"/>
           <w:szCs w:val="28"/>
@@ -2205,7 +2205,7 @@
     <w:p>
       <w:pPr>
         <w:spacing w:after="0" w:line="240" w:lineRule="auto"/>
-        <w:jc w:val="both"/>
+        <w:jc w:val="left"/>
         <w:rPr>
           <w:sz w:val="28"/>
           <w:szCs w:val="28"/>
@@ -2310,7 +2310,7 @@
     <w:p>
       <w:pPr>
         <w:spacing w:after="0" w:line="240" w:lineRule="auto"/>
-        <w:jc w:val="both"/>
+        <w:jc w:val="left"/>
         <w:rPr>
           <w:sz w:val="28"/>
           <w:szCs w:val="28"/>

</xml_diff>

<commit_message>
polish(thesis): front-matter 1.5 line spacing to match GTU sample
Recommendation/copyright/commission paragraphs inherited the template's single
spacing; the GTU sample uses 1.5. Set them to 1.5 (abstract stays single).

Co-Authored-By: Claude Opus 4.8 <noreply@anthropic.com>
</commit_message>
<xml_diff>
--- a/project/thesis-ka.docx
+++ b/project/thesis-ka.docx
@@ -880,7 +880,7 @@
     </w:p>
     <w:p>
       <w:pPr>
-        <w:spacing w:after="0" w:line="240" w:lineRule="auto"/>
+        <w:spacing w:after="0" w:line="360" w:lineRule="auto"/>
         <w:ind w:firstLine="454"/>
         <w:jc w:val="center"/>
         <w:rPr>
@@ -902,7 +902,7 @@
     </w:p>
     <w:p>
       <w:pPr>
-        <w:spacing w:after="0" w:line="240" w:lineRule="auto"/>
+        <w:spacing w:after="0" w:line="360" w:lineRule="auto"/>
         <w:ind w:firstLine="454"/>
         <w:jc w:val="center"/>
         <w:rPr>
@@ -920,7 +920,7 @@
     </w:p>
     <w:p>
       <w:pPr>
-        <w:spacing w:after="0" w:line="240" w:lineRule="auto"/>
+        <w:spacing w:after="0" w:line="360" w:lineRule="auto"/>
         <w:ind w:firstLine="454"/>
         <w:jc w:val="left"/>
         <w:rPr>
@@ -936,7 +936,7 @@
     </w:p>
     <w:p>
       <w:pPr>
-        <w:spacing w:after="0" w:line="240" w:lineRule="auto"/>
+        <w:spacing w:after="0" w:line="360" w:lineRule="auto"/>
         <w:jc w:val="left"/>
         <w:rPr>
           <w:szCs w:val="24"/>
@@ -966,7 +966,7 @@
     </w:p>
     <w:p>
       <w:pPr>
-        <w:spacing w:after="0" w:line="240" w:lineRule="auto"/>
+        <w:spacing w:after="0" w:line="360" w:lineRule="auto"/>
         <w:jc w:val="left"/>
         <w:rPr>
           <w:szCs w:val="24"/>
@@ -1016,7 +1016,7 @@
     </w:p>
     <w:p>
       <w:pPr>
-        <w:spacing w:after="0" w:line="240" w:lineRule="auto"/>
+        <w:spacing w:after="0" w:line="360" w:lineRule="auto"/>
         <w:ind w:firstLine="454"/>
         <w:rPr>
           <w:szCs w:val="24"/>
@@ -1026,7 +1026,7 @@
     </w:p>
     <w:p>
       <w:pPr>
-        <w:spacing w:after="0" w:line="240" w:lineRule="auto"/>
+        <w:spacing w:after="0" w:line="360" w:lineRule="auto"/>
         <w:ind w:firstLine="454"/>
         <w:rPr>
           <w:szCs w:val="24"/>
@@ -1036,7 +1036,7 @@
     </w:p>
     <w:p>
       <w:pPr>
-        <w:spacing w:after="0" w:line="240" w:lineRule="auto"/>
+        <w:spacing w:after="0" w:line="360" w:lineRule="auto"/>
         <w:ind w:firstLine="454"/>
         <w:rPr>
           <w:szCs w:val="24"/>
@@ -1046,7 +1046,7 @@
     </w:p>
     <w:p>
       <w:pPr>
-        <w:spacing w:after="0" w:line="240" w:lineRule="auto"/>
+        <w:spacing w:after="0" w:line="360" w:lineRule="auto"/>
         <w:ind w:firstLine="454"/>
         <w:rPr>
           <w:szCs w:val="24"/>
@@ -1056,7 +1056,7 @@
     </w:p>
     <w:p>
       <w:pPr>
-        <w:spacing w:after="0" w:line="240" w:lineRule="auto"/>
+        <w:spacing w:after="0" w:line="360" w:lineRule="auto"/>
         <w:ind w:firstLine="454"/>
         <w:jc w:val="right"/>
         <w:rPr>
@@ -1097,7 +1097,7 @@
     </w:p>
     <w:p>
       <w:pPr>
-        <w:spacing w:after="0" w:line="240" w:lineRule="auto"/>
+        <w:spacing w:after="0" w:line="360" w:lineRule="auto"/>
         <w:ind w:firstLine="454"/>
         <w:jc w:val="right"/>
         <w:rPr>
@@ -1108,7 +1108,7 @@
     </w:p>
     <w:p>
       <w:pPr>
-        <w:spacing w:after="0" w:line="240" w:lineRule="auto"/>
+        <w:spacing w:after="0" w:line="360" w:lineRule="auto"/>
         <w:ind w:firstLine="454"/>
         <w:jc w:val="right"/>
         <w:rPr>
@@ -1119,7 +1119,7 @@
     </w:p>
     <w:p>
       <w:pPr>
-        <w:spacing w:after="0" w:line="240" w:lineRule="auto"/>
+        <w:spacing w:after="0" w:line="360" w:lineRule="auto"/>
         <w:ind w:firstLine="454"/>
         <w:jc w:val="right"/>
         <w:rPr>
@@ -1130,7 +1130,7 @@
     </w:p>
     <w:p>
       <w:pPr>
-        <w:spacing w:after="0" w:line="240" w:lineRule="auto"/>
+        <w:spacing w:after="0" w:line="360" w:lineRule="auto"/>
         <w:ind w:firstLine="454"/>
         <w:jc w:val="right"/>
         <w:rPr>
@@ -1158,7 +1158,7 @@
     </w:p>
     <w:p>
       <w:pPr>
-        <w:spacing w:after="0" w:line="240" w:lineRule="auto"/>
+        <w:spacing w:after="0" w:line="360" w:lineRule="auto"/>
         <w:ind w:firstLine="454"/>
         <w:jc w:val="right"/>
         <w:rPr>
@@ -1169,7 +1169,7 @@
     </w:p>
     <w:p>
       <w:pPr>
-        <w:spacing w:after="0" w:line="240" w:lineRule="auto"/>
+        <w:spacing w:after="0" w:line="360" w:lineRule="auto"/>
         <w:ind w:firstLine="454"/>
         <w:rPr>
           <w:szCs w:val="24"/>
@@ -1179,7 +1179,7 @@
     </w:p>
     <w:p>
       <w:pPr>
-        <w:spacing w:after="0" w:line="240" w:lineRule="auto"/>
+        <w:spacing w:after="0" w:line="360" w:lineRule="auto"/>
         <w:ind w:firstLine="454"/>
         <w:jc w:val="right"/>
         <w:rPr>
@@ -1218,7 +1218,7 @@
     </w:p>
     <w:p>
       <w:pPr>
-        <w:spacing w:after="0" w:line="240" w:lineRule="auto"/>
+        <w:spacing w:after="0" w:line="360" w:lineRule="auto"/>
         <w:ind w:firstLine="454"/>
         <w:jc w:val="right"/>
         <w:rPr>
@@ -1229,7 +1229,7 @@
     </w:p>
     <w:p>
       <w:pPr>
-        <w:spacing w:after="0" w:line="240" w:lineRule="auto"/>
+        <w:spacing w:after="0" w:line="360" w:lineRule="auto"/>
         <w:ind w:firstLine="454"/>
         <w:jc w:val="right"/>
         <w:rPr>
@@ -1240,7 +1240,7 @@
     </w:p>
     <w:p>
       <w:pPr>
-        <w:spacing w:after="0" w:line="240" w:lineRule="auto"/>
+        <w:spacing w:after="0" w:line="360" w:lineRule="auto"/>
         <w:ind w:firstLine="454"/>
         <w:jc w:val="right"/>
         <w:rPr>
@@ -1251,7 +1251,7 @@
     </w:p>
     <w:p>
       <w:pPr>
-        <w:spacing w:after="0" w:line="240" w:lineRule="auto"/>
+        <w:spacing w:after="0" w:line="360" w:lineRule="auto"/>
         <w:ind w:firstLine="454"/>
         <w:jc w:val="right"/>
         <w:rPr>
@@ -1262,7 +1262,7 @@
     </w:p>
     <w:p>
       <w:pPr>
-        <w:spacing w:after="0" w:line="240" w:lineRule="auto"/>
+        <w:spacing w:after="0" w:line="360" w:lineRule="auto"/>
         <w:ind w:firstLine="454"/>
         <w:jc w:val="right"/>
         <w:rPr>
@@ -1273,7 +1273,7 @@
     </w:p>
     <w:p>
       <w:pPr>
-        <w:spacing w:after="0" w:line="240" w:lineRule="auto"/>
+        <w:spacing w:after="0" w:line="360" w:lineRule="auto"/>
         <w:ind w:firstLine="454"/>
         <w:jc w:val="right"/>
         <w:rPr>
@@ -1284,7 +1284,7 @@
     </w:p>
     <w:p>
       <w:pPr>
-        <w:spacing w:after="0" w:line="240" w:lineRule="auto"/>
+        <w:spacing w:after="0" w:line="360" w:lineRule="auto"/>
         <w:ind w:firstLine="454"/>
         <w:jc w:val="right"/>
         <w:rPr>
@@ -1304,7 +1304,7 @@
         <w:tabs>
           <w:tab w:val="left" w:pos="5572"/>
         </w:tabs>
-        <w:spacing w:after="0" w:line="240" w:lineRule="auto"/>
+        <w:spacing w:after="0" w:line="360" w:lineRule="auto"/>
         <w:ind w:firstLine="454"/>
         <w:jc w:val="right"/>
         <w:rPr>
@@ -1339,7 +1339,7 @@
     </w:p>
     <w:p>
       <w:pPr>
-        <w:spacing w:after="0" w:line="240" w:lineRule="auto"/>
+        <w:spacing w:after="0" w:line="360" w:lineRule="auto"/>
         <w:ind w:firstLine="454"/>
         <w:jc w:val="center"/>
         <w:rPr>
@@ -1350,7 +1350,7 @@
     </w:p>
     <w:p>
       <w:pPr>
-        <w:spacing w:after="0" w:line="240" w:lineRule="auto"/>
+        <w:spacing w:after="0" w:line="360" w:lineRule="auto"/>
         <w:ind w:firstLine="454"/>
         <w:jc w:val="center"/>
         <w:rPr>
@@ -1361,7 +1361,7 @@
     </w:p>
     <w:p>
       <w:pPr>
-        <w:spacing w:after="0" w:line="240" w:lineRule="auto"/>
+        <w:spacing w:after="0" w:line="360" w:lineRule="auto"/>
         <w:ind w:firstLine="454"/>
         <w:jc w:val="center"/>
         <w:rPr>
@@ -1388,7 +1388,7 @@
     <w:bookmarkEnd w:id="2"/>
     <w:p>
       <w:pPr>
-        <w:spacing w:after="0" w:line="240" w:lineRule="auto"/>
+        <w:spacing w:after="0" w:line="360" w:lineRule="auto"/>
         <w:ind w:firstLine="454"/>
         <w:jc w:val="center"/>
         <w:rPr>
@@ -1407,7 +1407,7 @@
     </w:p>
     <w:p>
       <w:pPr>
-        <w:spacing w:after="0" w:line="240" w:lineRule="auto"/>
+        <w:spacing w:after="0" w:line="360" w:lineRule="auto"/>
         <w:ind w:firstLine="454"/>
         <w:jc w:val="center"/>
         <w:rPr>
@@ -1437,7 +1437,7 @@
     </w:p>
     <w:p>
       <w:pPr>
-        <w:spacing w:after="0" w:line="240" w:lineRule="auto"/>
+        <w:spacing w:after="0" w:line="360" w:lineRule="auto"/>
         <w:ind w:firstLine="454"/>
         <w:jc w:val="center"/>
         <w:rPr>
@@ -1455,7 +1455,7 @@
     </w:p>
     <w:p>
       <w:pPr>
-        <w:spacing w:after="0" w:line="240" w:lineRule="auto"/>
+        <w:spacing w:after="0" w:line="360" w:lineRule="auto"/>
         <w:ind w:firstLine="454"/>
         <w:jc w:val="center"/>
         <w:rPr>
@@ -1496,7 +1496,7 @@
     </w:p>
     <w:p>
       <w:pPr>
-        <w:spacing w:after="0" w:line="240" w:lineRule="auto"/>
+        <w:spacing w:after="0" w:line="360" w:lineRule="auto"/>
         <w:ind w:firstLine="454"/>
         <w:jc w:val="center"/>
         <w:rPr>
@@ -1507,7 +1507,7 @@
     </w:p>
     <w:p>
       <w:pPr>
-        <w:spacing w:after="0" w:line="240" w:lineRule="auto"/>
+        <w:spacing w:after="0" w:line="360" w:lineRule="auto"/>
         <w:ind w:firstLine="454"/>
         <w:jc w:val="center"/>
         <w:rPr>
@@ -1518,7 +1518,7 @@
     </w:p>
     <w:p>
       <w:pPr>
-        <w:spacing w:after="0" w:line="240" w:lineRule="auto"/>
+        <w:spacing w:after="0" w:line="360" w:lineRule="auto"/>
         <w:ind w:firstLine="454"/>
         <w:jc w:val="center"/>
         <w:rPr>
@@ -1529,7 +1529,7 @@
     </w:p>
     <w:p>
       <w:pPr>
-        <w:spacing w:after="0" w:line="240" w:lineRule="auto"/>
+        <w:spacing w:after="0" w:line="360" w:lineRule="auto"/>
         <w:ind w:firstLine="454"/>
         <w:jc w:val="center"/>
         <w:rPr>
@@ -1540,7 +1540,7 @@
     </w:p>
     <w:p>
       <w:pPr>
-        <w:spacing w:after="0" w:line="240" w:lineRule="auto"/>
+        <w:spacing w:after="0" w:line="360" w:lineRule="auto"/>
         <w:ind w:firstLine="454"/>
         <w:jc w:val="center"/>
         <w:rPr>
@@ -1558,7 +1558,7 @@
     </w:p>
     <w:p>
       <w:pPr>
-        <w:spacing w:after="0" w:line="240" w:lineRule="auto"/>
+        <w:spacing w:after="0" w:line="360" w:lineRule="auto"/>
         <w:ind w:firstLine="454"/>
         <w:jc w:val="center"/>
         <w:rPr>
@@ -1576,7 +1576,7 @@
     </w:p>
     <w:p>
       <w:pPr>
-        <w:spacing w:after="0" w:line="240" w:lineRule="auto"/>
+        <w:spacing w:after="0" w:line="360" w:lineRule="auto"/>
         <w:ind w:firstLine="454"/>
         <w:jc w:val="center"/>
         <w:rPr>
@@ -1608,7 +1608,7 @@
     </w:p>
     <w:p>
       <w:pPr>
-        <w:spacing w:after="0" w:line="240" w:lineRule="auto"/>
+        <w:spacing w:after="0" w:line="360" w:lineRule="auto"/>
         <w:ind w:firstLine="454"/>
         <w:rPr>
           <w:szCs w:val="24"/>
@@ -1637,7 +1637,7 @@
     </w:p>
     <w:p>
       <w:pPr>
-        <w:spacing w:after="0" w:line="240" w:lineRule="auto"/>
+        <w:spacing w:after="0" w:line="360" w:lineRule="auto"/>
         <w:ind w:firstLine="454"/>
         <w:rPr>
           <w:szCs w:val="24"/>
@@ -1647,7 +1647,7 @@
     </w:p>
     <w:p>
       <w:pPr>
-        <w:spacing w:after="0" w:line="240" w:lineRule="auto"/>
+        <w:spacing w:after="0" w:line="360" w:lineRule="auto"/>
         <w:ind w:firstLine="454"/>
         <w:jc w:val="left"/>
         <w:rPr>
@@ -1658,7 +1658,7 @@
     </w:p>
     <w:p>
       <w:pPr>
-        <w:spacing w:after="0" w:line="240" w:lineRule="auto"/>
+        <w:spacing w:after="0" w:line="360" w:lineRule="auto"/>
         <w:ind w:firstLine="454"/>
         <w:jc w:val="left"/>
         <w:rPr>
@@ -1669,7 +1669,7 @@
     </w:p>
     <w:p>
       <w:pPr>
-        <w:spacing w:after="0" w:line="240" w:lineRule="auto"/>
+        <w:spacing w:after="0" w:line="360" w:lineRule="auto"/>
         <w:ind w:firstLine="454"/>
         <w:jc w:val="left"/>
         <w:rPr>
@@ -1680,7 +1680,7 @@
     </w:p>
     <w:p>
       <w:pPr>
-        <w:spacing w:after="0" w:line="240" w:lineRule="auto"/>
+        <w:spacing w:after="0" w:line="360" w:lineRule="auto"/>
         <w:ind w:firstLine="454"/>
         <w:jc w:val="left"/>
         <w:rPr>
@@ -1698,7 +1698,7 @@
     </w:p>
     <w:p>
       <w:pPr>
-        <w:spacing w:after="0" w:line="240" w:lineRule="auto"/>
+        <w:spacing w:after="0" w:line="360" w:lineRule="auto"/>
         <w:ind w:firstLine="454"/>
         <w:jc w:val="left"/>
         <w:rPr>
@@ -1716,7 +1716,7 @@
     </w:p>
     <w:p>
       <w:pPr>
-        <w:spacing w:after="0" w:line="240" w:lineRule="auto"/>
+        <w:spacing w:after="0" w:line="360" w:lineRule="auto"/>
         <w:ind w:firstLine="454"/>
         <w:rPr>
           <w:szCs w:val="24"/>
@@ -1726,7 +1726,7 @@
     </w:p>
     <w:p>
       <w:pPr>
-        <w:spacing w:after="0" w:line="240" w:lineRule="auto"/>
+        <w:spacing w:after="0" w:line="360" w:lineRule="auto"/>
         <w:ind w:firstLine="454"/>
         <w:rPr>
           <w:szCs w:val="24"/>
@@ -1743,7 +1743,7 @@
     </w:p>
     <w:p>
       <w:pPr>
-        <w:spacing w:after="0" w:line="240" w:lineRule="auto"/>
+        <w:spacing w:after="0" w:line="360" w:lineRule="auto"/>
         <w:ind w:firstLine="454"/>
         <w:rPr>
           <w:szCs w:val="24"/>
@@ -1753,7 +1753,7 @@
     </w:p>
     <w:p>
       <w:pPr>
-        <w:spacing w:after="0" w:line="240" w:lineRule="auto"/>
+        <w:spacing w:after="0" w:line="360" w:lineRule="auto"/>
         <w:ind w:firstLine="454"/>
         <w:rPr>
           <w:szCs w:val="24"/>
@@ -1763,7 +1763,7 @@
     </w:p>
     <w:p>
       <w:pPr>
-        <w:spacing w:after="0" w:line="240" w:lineRule="auto"/>
+        <w:spacing w:after="0" w:line="360" w:lineRule="auto"/>
         <w:ind w:firstLine="454"/>
         <w:rPr>
           <w:szCs w:val="24"/>
@@ -1773,7 +1773,7 @@
     </w:p>
     <w:p>
       <w:pPr>
-        <w:spacing w:after="0" w:line="240" w:lineRule="auto"/>
+        <w:spacing w:after="0" w:line="360" w:lineRule="auto"/>
         <w:ind w:firstLine="454"/>
         <w:rPr>
           <w:szCs w:val="24"/>
@@ -1783,7 +1783,7 @@
     </w:p>
     <w:p>
       <w:pPr>
-        <w:spacing w:after="0" w:line="240" w:lineRule="auto"/>
+        <w:spacing w:after="0" w:line="360" w:lineRule="auto"/>
         <w:ind w:firstLine="454"/>
         <w:rPr>
           <w:szCs w:val="24"/>
@@ -1793,7 +1793,7 @@
     </w:p>
     <w:p>
       <w:pPr>
-        <w:spacing w:after="0" w:line="240" w:lineRule="auto"/>
+        <w:spacing w:after="0" w:line="360" w:lineRule="auto"/>
         <w:ind w:firstLine="454"/>
         <w:rPr>
           <w:szCs w:val="24"/>
@@ -1803,7 +1803,7 @@
     </w:p>
     <w:p>
       <w:pPr>
-        <w:spacing w:after="0" w:line="240" w:lineRule="auto"/>
+        <w:spacing w:after="0" w:line="360" w:lineRule="auto"/>
         <w:ind w:firstLine="454"/>
         <w:rPr>
           <w:szCs w:val="24"/>
@@ -1813,7 +1813,7 @@
     </w:p>
     <w:p>
       <w:pPr>
-        <w:spacing w:after="0" w:line="240" w:lineRule="auto"/>
+        <w:spacing w:after="0" w:line="360" w:lineRule="auto"/>
         <w:ind w:firstLine="454"/>
         <w:rPr>
           <w:szCs w:val="24"/>
@@ -1837,7 +1837,7 @@
     </w:p>
     <w:p>
       <w:pPr>
-        <w:spacing w:after="0" w:line="240" w:lineRule="auto"/>
+        <w:spacing w:after="0" w:line="360" w:lineRule="auto"/>
         <w:ind w:firstLine="454"/>
         <w:jc w:val="left"/>
         <w:rPr>
@@ -1866,7 +1866,7 @@
     </w:p>
     <w:p>
       <w:pPr>
-        <w:spacing w:line="240" w:lineRule="auto"/>
+        <w:spacing w:line="360" w:lineRule="auto"/>
         <w:jc w:val="center"/>
         <w:rPr>
           <w:b/>
@@ -1957,7 +1957,7 @@
     </w:p>
     <w:p>
       <w:pPr>
-        <w:spacing w:after="0" w:line="240" w:lineRule="auto"/>
+        <w:spacing w:after="0" w:line="360" w:lineRule="auto"/>
         <w:ind w:firstLine="454"/>
         <w:jc w:val="left"/>
         <w:rPr>
@@ -1978,7 +1978,7 @@
     <w:bookmarkEnd w:id="5"/>
     <w:p>
       <w:pPr>
-        <w:spacing w:after="0" w:line="240" w:lineRule="auto"/>
+        <w:spacing w:after="0" w:line="360" w:lineRule="auto"/>
         <w:jc w:val="center"/>
         <w:rPr>
           <w:sz w:val="28"/>
@@ -2076,7 +2076,7 @@
     <w:p>
       <w:pPr>
         <w:pStyle w:val="TOCHeading"/>
-        <w:spacing w:line="240" w:lineRule="auto"/>
+        <w:spacing w:line="360" w:lineRule="auto"/>
         <w:jc w:val="center"/>
         <w:rPr>
           <w:rFonts w:ascii="Sylfaen" w:hAnsi="Sylfaen"/>
@@ -2114,7 +2114,7 @@
     </w:p>
     <w:p>
       <w:pPr>
-        <w:spacing w:after="0" w:line="240" w:lineRule="auto"/>
+        <w:spacing w:after="0" w:line="360" w:lineRule="auto"/>
         <w:jc w:val="left"/>
         <w:rPr>
           <w:szCs w:val="24"/>
@@ -2123,7 +2123,7 @@
     </w:p>
     <w:p>
       <w:pPr>
-        <w:spacing w:after="0" w:line="240" w:lineRule="auto"/>
+        <w:spacing w:after="0" w:line="360" w:lineRule="auto"/>
         <w:jc w:val="left"/>
         <w:rPr>
           <w:szCs w:val="24"/>
@@ -2132,7 +2132,7 @@
     </w:p>
     <w:p>
       <w:pPr>
-        <w:spacing w:after="0" w:line="240" w:lineRule="auto"/>
+        <w:spacing w:after="0" w:line="360" w:lineRule="auto"/>
         <w:jc w:val="left"/>
         <w:rPr>
           <w:szCs w:val="24"/>
@@ -2158,7 +2158,7 @@
     </w:p>
     <w:p>
       <w:pPr>
-        <w:spacing w:after="0" w:line="240" w:lineRule="auto"/>
+        <w:spacing w:after="0" w:line="360" w:lineRule="auto"/>
         <w:jc w:val="center"/>
         <w:rPr>
           <w:b/>
@@ -2182,7 +2182,7 @@
     </w:p>
     <w:p>
       <w:pPr>
-        <w:spacing w:after="0" w:line="240" w:lineRule="auto"/>
+        <w:spacing w:after="0" w:line="360" w:lineRule="auto"/>
         <w:jc w:val="left"/>
         <w:rPr>
           <w:sz w:val="28"/>
@@ -2193,7 +2193,7 @@
     </w:p>
     <w:p>
       <w:pPr>
-        <w:spacing w:after="0" w:line="240" w:lineRule="auto"/>
+        <w:spacing w:after="0" w:line="360" w:lineRule="auto"/>
         <w:jc w:val="left"/>
         <w:rPr>
           <w:sz w:val="28"/>
@@ -2204,7 +2204,7 @@
     </w:p>
     <w:p>
       <w:pPr>
-        <w:spacing w:after="0" w:line="240" w:lineRule="auto"/>
+        <w:spacing w:after="0" w:line="360" w:lineRule="auto"/>
         <w:jc w:val="left"/>
         <w:rPr>
           <w:sz w:val="28"/>
@@ -2232,7 +2232,7 @@
     </w:p>
     <w:p>
       <w:pPr>
-        <w:spacing w:after="0" w:line="240" w:lineRule="auto"/>
+        <w:spacing w:after="0" w:line="360" w:lineRule="auto"/>
         <w:jc w:val="center"/>
         <w:rPr>
           <w:sz w:val="28"/>
@@ -2309,7 +2309,7 @@
     </w:p>
     <w:p>
       <w:pPr>
-        <w:spacing w:after="0" w:line="240" w:lineRule="auto"/>
+        <w:spacing w:after="0" w:line="360" w:lineRule="auto"/>
         <w:jc w:val="left"/>
         <w:rPr>
           <w:sz w:val="28"/>

</xml_diff>

<commit_message>
format(thesis): rebuild title page as inline text, justify body, fix layout
Formatting/layout pass to match the passed reference (სამაგისტრო ნაშრომი.docx)
and GTU rules — no semantic/content changes.

- title page: floating text boxes → inline text (centered logo, author,
  title 16pt, შიფრი, centered university block); now selectable/searchable,
  matches reference. NOTE: შიფრი code value still blank (author to fill).
- section-0 margins 5.1mm → 38/25/25/25
- body: 109 main-text prose paragraphs left-aligned → justified
- headings: H1/H2 and 30 stray-13pt subheadings normalized to 14pt bold (GTU)
- tables: single-line grid borders on all 5

Co-Authored-By: Claude Opus 4.8 (1M context) <noreply@anthropic.com>
</commit_message>
<xml_diff>
--- a/project/thesis-ka.docx
+++ b/project/thesis-ka.docx
@@ -12,210 +12,39 @@
           <w:b/>
         </w:rPr>
       </w:pPr>
-      <w:bookmarkStart w:id="0" w:name="_Hlk108034490"/>
-      <w:r>
-        <w:rPr>
-          <w:b/>
-          <w:noProof/>
-          <w:lang w:val="ka-GE"/>
-        </w:rPr>
-        <mc:AlternateContent>
-          <mc:Choice Requires="wps">
-            <w:drawing>
-              <wp:anchor distT="0" distB="0" distL="114300" distR="114300" simplePos="0" relativeHeight="251660288" behindDoc="0" locked="0" layoutInCell="1" allowOverlap="1" wp14:anchorId="0D11978C" wp14:editId="4B61D8D2">
-                <wp:simplePos x="0" y="0"/>
-                <wp:positionH relativeFrom="column">
-                  <wp:posOffset>3701415</wp:posOffset>
-                </wp:positionH>
-                <wp:positionV relativeFrom="paragraph">
-                  <wp:posOffset>5236845</wp:posOffset>
-                </wp:positionV>
-                <wp:extent cx="3124200" cy="391795"/>
-                <wp:effectExtent l="0" t="1270" r="3810" b="0"/>
-                <wp:wrapNone/>
-                <wp:docPr id="760413624" name="Text Box 5"/>
-                <wp:cNvGraphicFramePr>
-                  <a:graphicFrameLocks xmlns:a="http://schemas.openxmlformats.org/drawingml/2006/main"/>
-                </wp:cNvGraphicFramePr>
-                <a:graphic xmlns:a="http://schemas.openxmlformats.org/drawingml/2006/main">
-                  <a:graphicData uri="http://schemas.microsoft.com/office/word/2010/wordprocessingShape">
-                    <wps:wsp>
-                      <wps:cNvSpPr txBox="1">
-                        <a:spLocks noChangeArrowheads="1"/>
-                      </wps:cNvSpPr>
-                      <wps:spPr bwMode="auto">
-                        <a:xfrm>
-                          <a:off x="0" y="0"/>
-                          <a:ext cx="3124200" cy="391795"/>
-                        </a:xfrm>
-                        <a:prstGeom prst="rect">
-                          <a:avLst/>
-                        </a:prstGeom>
-                        <a:solidFill>
-                          <a:srgbClr val="FFFFFF"/>
-                        </a:solidFill>
-                        <a:ln>
-                          <a:noFill/>
-                        </a:ln>
-                        <a:extLst>
-                          <a:ext uri="{91240B29-F687-4F45-9708-019B960494DF}">
-                            <a14:hiddenLine xmlns:a14="http://schemas.microsoft.com/office/drawing/2010/main" w="9525">
-                              <a:solidFill>
-                                <a:srgbClr val="000000"/>
-                              </a:solidFill>
-                              <a:miter lim="800000"/>
-                              <a:headEnd/>
-                              <a:tailEnd/>
-                            </a14:hiddenLine>
-                          </a:ext>
-                        </a:extLst>
-                      </wps:spPr>
-                      <wps:txbx>
-                        <w:txbxContent>
-                          <w:p>
-                            <w:pPr>
-                              <w:jc w:val="right"/>
-                              <w:rPr>
-                                <w:b/>
-                                <w:bCs/>
-                                <w:szCs w:val="24"/>
-                                <w:lang w:val="ka-GE"/>
-                              </w:rPr>
-                            </w:pPr>
-                            <w:r>
-                              <w:rPr>
-                                <w:b/>
-                                <w:bCs/>
-                                <w:szCs w:val="24"/>
-                                <w:lang w:val="ka-GE"/>
-                              </w:rPr>
-                              <w:t xml:space="preserve">ალექსანდრე იმნაიშვილი </w:t>
-                            </w:r>
-                          </w:p>
-                        </w:txbxContent>
-                      </wps:txbx>
-                      <wps:bodyPr rot="0" vert="horz" wrap="square" lIns="91440" tIns="45720" rIns="91440" bIns="45720" anchor="t" anchorCtr="0" upright="1">
-                        <a:noAutofit/>
-                      </wps:bodyPr>
-                    </wps:wsp>
-                  </a:graphicData>
-                </a:graphic>
-                <wp14:sizeRelH relativeFrom="page">
-                  <wp14:pctWidth>0</wp14:pctWidth>
-                </wp14:sizeRelH>
-                <wp14:sizeRelV relativeFrom="page">
-                  <wp14:pctHeight>0</wp14:pctHeight>
-                </wp14:sizeRelV>
-              </wp:anchor>
-            </w:drawing>
-          </mc:Choice>
-          <mc:Fallback>
-            <w:pict>
-              <v:shapetype w14:anchorId="0D11978C" id="_x0000_t202" coordsize="21600,21600" o:spt="202" path="m,l,21600r21600,l21600,xe">
-                <v:stroke joinstyle="miter"/>
-                <v:path gradientshapeok="t" o:connecttype="rect"/>
-              </v:shapetype>
-              <v:shape id="Text Box 5" o:spid="_x0000_s1026" type="#_x0000_t202" style="position:absolute;left:0;text-align:left;margin-left:291.45pt;margin-top:412.35pt;width:246pt;height:30.85pt;z-index:251660288;visibility:visible;mso-wrap-style:square;mso-width-percent:0;mso-height-percent:0;mso-wrap-distance-left:9pt;mso-wrap-distance-top:0;mso-wrap-distance-right:9pt;mso-wrap-distance-bottom:0;mso-position-horizontal:absolute;mso-position-horizontal-relative:text;mso-position-vertical:absolute;mso-position-vertical-relative:text;mso-width-percent:0;mso-height-percent:0;mso-width-relative:page;mso-height-relative:page;v-text-anchor:top" o:gfxdata="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" stroked="f">
-                <v:textbox>
-                  <w:txbxContent>
-                    <w:p>
-                      <w:pPr>
-                        <w:jc w:val="right"/>
-                        <w:rPr>
-                          <w:b/>
-                          <w:bCs/>
-                          <w:szCs w:val="24"/>
-                          <w:lang w:val="ka-GE"/>
-                        </w:rPr>
-                      </w:pPr>
-                      <w:r>
-                        <w:rPr>
-                          <w:b/>
-                          <w:bCs/>
-                          <w:szCs w:val="24"/>
-                          <w:lang w:val="ka-GE"/>
-                        </w:rPr>
-                        <w:t xml:space="preserve">ალექსანდრე იმნაიშვილი </w:t>
-                      </w:r>
-                    </w:p>
-                  </w:txbxContent>
-                </v:textbox>
-              </v:shape>
-            </w:pict>
-          </mc:Fallback>
-        </mc:AlternateContent>
-      </w:r>
-      <w:r>
-        <w:rPr>
-          <w:noProof/>
-        </w:rPr>
+      <w:r>
         <w:drawing>
-          <wp:anchor distT="0" distB="0" distL="114300" distR="114300" simplePos="0" relativeHeight="251659264" behindDoc="1" locked="0" layoutInCell="1" allowOverlap="1" wp14:anchorId="3F0A66AC" wp14:editId="6F4A0310">
-            <wp:simplePos x="0" y="0"/>
-            <wp:positionH relativeFrom="margin">
-              <wp:posOffset>161925</wp:posOffset>
-            </wp:positionH>
-            <wp:positionV relativeFrom="margin">
-              <wp:posOffset>-1083945</wp:posOffset>
-            </wp:positionV>
-            <wp:extent cx="6869430" cy="6234430"/>
-            <wp:effectExtent l="0" t="0" r="7620" b="0"/>
-            <wp:wrapSquare wrapText="bothSides"/>
-            <wp:docPr id="927800283" name="Picture 6" descr="A purple rectangle with white text&#10;&#10;Description automatically generated with low confidence"/>
+          <wp:inline xmlns:a="http://schemas.openxmlformats.org/drawingml/2006/main" xmlns:pic="http://schemas.openxmlformats.org/drawingml/2006/picture">
+            <wp:extent cx="3960000" cy="3493333"/>
+            <wp:docPr id="1" name="Picture 1"/>
             <wp:cNvGraphicFramePr>
-              <a:graphicFrameLocks xmlns:a="http://schemas.openxmlformats.org/drawingml/2006/main" noChangeAspect="1"/>
+              <a:graphicFrameLocks noChangeAspect="1"/>
             </wp:cNvGraphicFramePr>
-            <a:graphic xmlns:a="http://schemas.openxmlformats.org/drawingml/2006/main">
+            <a:graphic>
               <a:graphicData uri="http://schemas.openxmlformats.org/drawingml/2006/picture">
-                <pic:pic xmlns:pic="http://schemas.openxmlformats.org/drawingml/2006/picture">
+                <pic:pic>
                   <pic:nvPicPr>
-                    <pic:cNvPr id="927800283" name="Picture 6" descr="A purple rectangle with white text&#10;&#10;Description automatically generated with low confidence"/>
-                    <pic:cNvPicPr>
-                      <a:picLocks noChangeAspect="1" noChangeArrowheads="1"/>
-                    </pic:cNvPicPr>
+                    <pic:cNvPr id="0" name="image.png"/>
+                    <pic:cNvPicPr/>
                   </pic:nvPicPr>
                   <pic:blipFill>
-                    <a:blip r:embed="rId8">
-                      <a:extLst>
-                        <a:ext uri="{28A0092B-C50C-407E-A947-70E740481C1C}">
-                          <a14:useLocalDpi xmlns:a14="http://schemas.microsoft.com/office/drawing/2010/main" val="0"/>
-                        </a:ext>
-                      </a:extLst>
-                    </a:blip>
-                    <a:srcRect l="4326" t="2664" r="4613" b="3600"/>
+                    <a:blip r:embed="rId8"/>
                     <a:stretch>
                       <a:fillRect/>
                     </a:stretch>
                   </pic:blipFill>
-                  <pic:spPr bwMode="auto">
+                  <pic:spPr>
                     <a:xfrm>
                       <a:off x="0" y="0"/>
-                      <a:ext cx="6869430" cy="6234430"/>
+                      <a:ext cx="3960000" cy="3493333"/>
                     </a:xfrm>
-                    <a:prstGeom prst="rect">
-                      <a:avLst/>
-                    </a:prstGeom>
-                    <a:noFill/>
-                    <a:ln>
-                      <a:noFill/>
-                    </a:ln>
+                    <a:prstGeom prst="rect"/>
                   </pic:spPr>
                 </pic:pic>
               </a:graphicData>
             </a:graphic>
-            <wp14:sizeRelH relativeFrom="page">
-              <wp14:pctWidth>0</wp14:pctWidth>
-            </wp14:sizeRelH>
-            <wp14:sizeRelV relativeFrom="page">
-              <wp14:pctHeight>0</wp14:pctHeight>
-            </wp14:sizeRelV>
-          </wp:anchor>
+          </wp:inline>
         </w:drawing>
-      </w:r>
-      <w:r>
-        <w:rPr>
-          <w:b/>
-        </w:rPr>
       </w:r>
     </w:p>
     <w:p>
@@ -228,177 +57,24 @@
           <w:lang w:val="ka-GE"/>
         </w:rPr>
       </w:pPr>
-      <w:r>
+    </w:p>
+    <w:p>
+      <w:pPr>
+        <w:pStyle w:val="BodyText"/>
+        <w:spacing w:before="120" w:after="240"/>
+        <w:jc w:val="right"/>
         <w:rPr>
           <w:b/>
-          <w:noProof/>
-          <w:lang w:val="ka-GE"/>
-        </w:rPr>
-        <mc:AlternateContent>
-          <mc:Choice Requires="wps">
-            <w:drawing>
-              <wp:anchor distT="0" distB="0" distL="114300" distR="114300" simplePos="0" relativeHeight="251661312" behindDoc="0" locked="0" layoutInCell="1" allowOverlap="1" wp14:anchorId="76EF9F23" wp14:editId="2315207D">
-                <wp:simplePos x="0" y="0"/>
-                <wp:positionH relativeFrom="column">
-                  <wp:posOffset>185420</wp:posOffset>
-                </wp:positionH>
-                <wp:positionV relativeFrom="paragraph">
-                  <wp:posOffset>60325</wp:posOffset>
-                </wp:positionV>
-                <wp:extent cx="5040630" cy="848995"/>
-                <wp:effectExtent l="4445" t="4445" r="3175" b="3810"/>
-                <wp:wrapNone/>
-                <wp:docPr id="102204832" name="Text Box 4"/>
-                <wp:cNvGraphicFramePr>
-                  <a:graphicFrameLocks xmlns:a="http://schemas.openxmlformats.org/drawingml/2006/main"/>
-                </wp:cNvGraphicFramePr>
-                <a:graphic xmlns:a="http://schemas.openxmlformats.org/drawingml/2006/main">
-                  <a:graphicData uri="http://schemas.microsoft.com/office/word/2010/wordprocessingShape">
-                    <wps:wsp>
-                      <wps:cNvSpPr txBox="1">
-                        <a:spLocks noChangeArrowheads="1"/>
-                      </wps:cNvSpPr>
-                      <wps:spPr bwMode="auto">
-                        <a:xfrm>
-                          <a:off x="0" y="0"/>
-                          <a:ext cx="5040630" cy="848995"/>
-                        </a:xfrm>
-                        <a:prstGeom prst="rect">
-                          <a:avLst/>
-                        </a:prstGeom>
-                        <a:solidFill>
-                          <a:srgbClr val="FFFFFF"/>
-                        </a:solidFill>
-                        <a:ln>
-                          <a:noFill/>
-                        </a:ln>
-                        <a:extLst>
-                          <a:ext uri="{91240B29-F687-4F45-9708-019B960494DF}">
-                            <a14:hiddenLine xmlns:a14="http://schemas.microsoft.com/office/drawing/2010/main" w="9525">
-                              <a:solidFill>
-                                <a:srgbClr val="000000"/>
-                              </a:solidFill>
-                              <a:miter lim="800000"/>
-                              <a:headEnd/>
-                              <a:tailEnd/>
-                            </a14:hiddenLine>
-                          </a:ext>
-                        </a:extLst>
-                      </wps:spPr>
-                      <wps:txbx>
-                        <w:txbxContent>
-                          <w:p>
-                            <w:pPr>
-                              <w:rPr>
-                                <w:b/>
-                                <w:bCs/>
-                                <w:sz w:val="32"/>
-                                <w:szCs w:val="32"/>
-                                <w:lang w:val="ka-GE"/>
-                              </w:rPr>
-                            </w:pPr>
-                            <w:r>
-                              <w:rPr>
-                                <w:b/>
-                                <w:bCs/>
-                                <w:sz w:val="32"/>
-                                <w:szCs w:val="32"/>
-                                <w:lang w:val="ka-GE"/>
-                              </w:rPr>
-                              <w:t xml:space="preserve">სასაუბრო ხელოვნური ინტელექტი: ასისტენტიდან თანამოსაუბრემდე ევოლუცია </w:t>
-                            </w:r>
-                          </w:p>
-                          <w:p>
-                            <w:pPr>
-                              <w:rPr>
-                                <w:b/>
-                                <w:bCs/>
-                                <w:sz w:val="32"/>
-                                <w:szCs w:val="32"/>
-                                <w:lang w:val="ka-GE"/>
-                              </w:rPr>
-                            </w:pPr>
-                            <w:r>
-                              <w:rPr>
-                                <w:b/>
-                                <w:bCs/>
-                                <w:sz w:val="32"/>
-                                <w:szCs w:val="32"/>
-                                <w:lang w:val="ka-GE"/>
-                              </w:rPr>
-                              <w:t xml:space="preserve"/>
-                            </w:r>
-                          </w:p>
-                        </w:txbxContent>
-                      </wps:txbx>
-                      <wps:bodyPr rot="0" vert="horz" wrap="square" lIns="91440" tIns="45720" rIns="91440" bIns="45720" anchor="t" anchorCtr="0" upright="1">
-                        <a:noAutofit/>
-                      </wps:bodyPr>
-                    </wps:wsp>
-                  </a:graphicData>
-                </a:graphic>
-                <wp14:sizeRelH relativeFrom="page">
-                  <wp14:pctWidth>0</wp14:pctWidth>
-                </wp14:sizeRelH>
-                <wp14:sizeRelV relativeFrom="page">
-                  <wp14:pctHeight>0</wp14:pctHeight>
-                </wp14:sizeRelV>
-              </wp:anchor>
-            </w:drawing>
-          </mc:Choice>
-          <mc:Fallback>
-            <w:pict>
-              <v:shape w14:anchorId="76EF9F23" id="Text Box 4" o:spid="_x0000_s1027" type="#_x0000_t202" style="position:absolute;left:0;text-align:left;margin-left:14.6pt;margin-top:4.75pt;width:396.9pt;height:66.85pt;z-index:251661312;visibility:visible;mso-wrap-style:square;mso-width-percent:0;mso-height-percent:0;mso-wrap-distance-left:9pt;mso-wrap-distance-top:0;mso-wrap-distance-right:9pt;mso-wrap-distance-bottom:0;mso-position-horizontal:absolute;mso-position-horizontal-relative:text;mso-position-vertical:absolute;mso-position-vertical-relative:text;mso-width-percent:0;mso-height-percent:0;mso-width-relative:page;mso-height-relative:page;v-text-anchor:top" o:gfxdata="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" stroked="f">
-                <v:textbox>
-                  <w:txbxContent>
-                    <w:p>
-                      <w:pPr>
-                        <w:rPr>
-                          <w:b/>
-                          <w:bCs/>
-                          <w:sz w:val="32"/>
-                          <w:szCs w:val="32"/>
-                          <w:lang w:val="ka-GE"/>
-                        </w:rPr>
-                      </w:pPr>
-                      <w:r>
-                        <w:rPr>
-                          <w:b/>
-                          <w:bCs/>
-                          <w:sz w:val="32"/>
-                          <w:szCs w:val="32"/>
-                          <w:lang w:val="ka-GE"/>
-                        </w:rPr>
-                        <w:t xml:space="preserve">სასაუბრო ხელოვნური ინტელექტი: ასისტენტიდან თანამოსაუბრემდე ევოლუცია </w:t>
-                      </w:r>
-                    </w:p>
-                    <w:p>
-                      <w:pPr>
-                        <w:rPr>
-                          <w:b/>
-                          <w:bCs/>
-                          <w:sz w:val="32"/>
-                          <w:szCs w:val="32"/>
-                          <w:lang w:val="ka-GE"/>
-                        </w:rPr>
-                      </w:pPr>
-                      <w:r>
-                        <w:rPr>
-                          <w:b/>
-                          <w:bCs/>
-                          <w:sz w:val="32"/>
-                          <w:szCs w:val="32"/>
-                          <w:lang w:val="ka-GE"/>
-                        </w:rPr>
-                        <w:t xml:space="preserve"/>
-                      </w:r>
-                    </w:p>
-                  </w:txbxContent>
-                </v:textbox>
-              </v:shape>
-            </w:pict>
-          </mc:Fallback>
-        </mc:AlternateContent>
+          <w:lang w:val="ka-GE"/>
+        </w:rPr>
+      </w:pPr>
+      <w:r>
+        <w:rPr>
+          <w:rFonts w:ascii="Sylfaen" w:hAnsi="Sylfaen"/>
+          <w:b/>
+          <w:sz w:val="24"/>
+        </w:rPr>
+        <w:t>ალექსანდრე იმნაიშვილი</w:t>
       </w:r>
     </w:p>
     <w:p>
@@ -416,12 +92,20 @@
       <w:pPr>
         <w:pStyle w:val="BodyText"/>
         <w:spacing w:before="120" w:after="240"/>
-        <w:jc w:val="center"/>
+        <w:jc w:val="left"/>
         <w:rPr>
           <w:b/>
           <w:lang w:val="ka-GE"/>
         </w:rPr>
       </w:pPr>
+      <w:r>
+        <w:rPr>
+          <w:rFonts w:ascii="Sylfaen" w:hAnsi="Sylfaen"/>
+          <w:b/>
+          <w:sz w:val="32"/>
+        </w:rPr>
+        <w:t>სასაუბრო ხელოვნური ინტელექტი: ასისტენტიდან თანამოსაუბრემდე ევოლუცია</w:t>
+      </w:r>
     </w:p>
     <w:p>
       <w:pPr>
@@ -438,12 +122,20 @@
       <w:pPr>
         <w:pStyle w:val="BodyText"/>
         <w:spacing w:before="120" w:after="240"/>
-        <w:jc w:val="center"/>
+        <w:jc w:val="left"/>
         <w:rPr>
           <w:b/>
           <w:lang w:val="ka-GE"/>
         </w:rPr>
       </w:pPr>
+      <w:r>
+        <w:rPr>
+          <w:rFonts w:ascii="Sylfaen" w:hAnsi="Sylfaen"/>
+          <w:b/>
+          <w:sz w:val="32"/>
+        </w:rPr>
+        <w:t>შიფრი</w:t>
+      </w:r>
     </w:p>
     <w:p>
       <w:pPr>
@@ -455,386 +147,6 @@
           <w:lang w:val="ka-GE"/>
         </w:rPr>
       </w:pPr>
-      <w:r>
-        <w:rPr>
-          <w:b/>
-          <w:noProof/>
-          <w:lang w:val="ka-GE"/>
-        </w:rPr>
-        <mc:AlternateContent>
-          <mc:Choice Requires="wps">
-            <w:drawing>
-              <wp:anchor distT="0" distB="0" distL="114300" distR="114300" simplePos="0" relativeHeight="251663360" behindDoc="0" locked="0" layoutInCell="1" allowOverlap="1" wp14:anchorId="61B8F447" wp14:editId="292AC5D1">
-                <wp:simplePos x="0" y="0"/>
-                <wp:positionH relativeFrom="column">
-                  <wp:posOffset>3613785</wp:posOffset>
-                </wp:positionH>
-                <wp:positionV relativeFrom="paragraph">
-                  <wp:posOffset>320675</wp:posOffset>
-                </wp:positionV>
-                <wp:extent cx="3396615" cy="1076960"/>
-                <wp:effectExtent l="3810" t="635" r="0" b="0"/>
-                <wp:wrapNone/>
-                <wp:docPr id="1124531779" name="Text Box 3"/>
-                <wp:cNvGraphicFramePr>
-                  <a:graphicFrameLocks xmlns:a="http://schemas.openxmlformats.org/drawingml/2006/main"/>
-                </wp:cNvGraphicFramePr>
-                <a:graphic xmlns:a="http://schemas.openxmlformats.org/drawingml/2006/main">
-                  <a:graphicData uri="http://schemas.microsoft.com/office/word/2010/wordprocessingShape">
-                    <wps:wsp>
-                      <wps:cNvSpPr txBox="1">
-                        <a:spLocks noChangeArrowheads="1"/>
-                      </wps:cNvSpPr>
-                      <wps:spPr bwMode="auto">
-                        <a:xfrm>
-                          <a:off x="0" y="0"/>
-                          <a:ext cx="3396615" cy="1076960"/>
-                        </a:xfrm>
-                        <a:prstGeom prst="rect">
-                          <a:avLst/>
-                        </a:prstGeom>
-                        <a:solidFill>
-                          <a:srgbClr val="FFFFFF"/>
-                        </a:solidFill>
-                        <a:ln>
-                          <a:noFill/>
-                        </a:ln>
-                        <a:extLst>
-                          <a:ext uri="{91240B29-F687-4F45-9708-019B960494DF}">
-                            <a14:hiddenLine xmlns:a14="http://schemas.microsoft.com/office/drawing/2010/main" w="9525">
-                              <a:solidFill>
-                                <a:srgbClr val="000000"/>
-                              </a:solidFill>
-                              <a:miter lim="800000"/>
-                              <a:headEnd/>
-                              <a:tailEnd/>
-                            </a14:hiddenLine>
-                          </a:ext>
-                        </a:extLst>
-                      </wps:spPr>
-                      <wps:txbx>
-                        <w:txbxContent>
-                          <w:p>
-                            <w:pPr>
-                              <w:jc w:val="right"/>
-                              <w:rPr>
-                                <w:rFonts w:cs="Calibri"/>
-                                <w:lang w:val="ka-GE"/>
-                              </w:rPr>
-                            </w:pPr>
-                            <w:r>
-                              <w:rPr>
-                                <w:rFonts w:cs="Calibri"/>
-                                <w:lang w:val="ka-GE"/>
-                              </w:rPr>
-                              <w:t xml:space="preserve">საქართველოს </w:t>
-                            </w:r>
-                            <w:r>
-                              <w:rPr>
-                                <w:rFonts w:cs="Calibri"/>
-                                <w:lang w:val="ka-GE"/>
-                              </w:rPr>
-                              <w:t>ტექნიკური უნივერსიტეტი</w:t>
-                            </w:r>
-                          </w:p>
-                          <w:p>
-                            <w:pPr>
-                              <w:jc w:val="right"/>
-                              <w:rPr>
-                                <w:rFonts w:cs="Calibri"/>
-                                <w:lang w:val="ka-GE"/>
-                              </w:rPr>
-                            </w:pPr>
-                            <w:r>
-                              <w:rPr>
-                                <w:rFonts w:cs="Calibri"/>
-                                <w:lang w:val="ka-GE"/>
-                              </w:rPr>
-                              <w:t>თბილისი, 0160, საქართველო</w:t>
-                            </w:r>
-                          </w:p>
-                          <w:p>
-                            <w:pPr>
-                              <w:jc w:val="right"/>
-                              <w:rPr>
-                                <w:rFonts w:cs="Calibri"/>
-                                <w:lang w:val="ka-GE"/>
-                              </w:rPr>
-                            </w:pPr>
-                            <w:r>
-                              <w:rPr>
-                                <w:rFonts w:cs="Calibri"/>
-                                <w:lang w:val="ka-GE"/>
-                              </w:rPr>
-                              <w:t xml:space="preserve"> ივლისი, 2026 წელი</w:t>
-                            </w:r>
-                          </w:p>
-                          <w:p>
-                            <w:pPr>
-                              <w:jc w:val="right"/>
-                              <w:rPr>
-                                <w:rFonts w:cs="Calibri"/>
-                                <w:sz w:val="20"/>
-                                <w:szCs w:val="20"/>
-                              </w:rPr>
-                            </w:pPr>
-                          </w:p>
-                        </w:txbxContent>
-                      </wps:txbx>
-                      <wps:bodyPr rot="0" vert="horz" wrap="square" lIns="91440" tIns="45720" rIns="91440" bIns="45720" anchor="t" anchorCtr="0" upright="1">
-                        <a:noAutofit/>
-                      </wps:bodyPr>
-                    </wps:wsp>
-                  </a:graphicData>
-                </a:graphic>
-                <wp14:sizeRelH relativeFrom="page">
-                  <wp14:pctWidth>0</wp14:pctWidth>
-                </wp14:sizeRelH>
-                <wp14:sizeRelV relativeFrom="page">
-                  <wp14:pctHeight>0</wp14:pctHeight>
-                </wp14:sizeRelV>
-              </wp:anchor>
-            </w:drawing>
-          </mc:Choice>
-          <mc:Fallback>
-            <w:pict>
-              <v:shape w14:anchorId="61B8F447" id="Text Box 3" o:spid="_x0000_s1028" type="#_x0000_t202" style="position:absolute;left:0;text-align:left;margin-left:284.55pt;margin-top:25.25pt;width:267.45pt;height:84.8pt;z-index:251663360;visibility:visible;mso-wrap-style:square;mso-width-percent:0;mso-height-percent:0;mso-wrap-distance-left:9pt;mso-wrap-distance-top:0;mso-wrap-distance-right:9pt;mso-wrap-distance-bottom:0;mso-position-horizontal:absolute;mso-position-horizontal-relative:text;mso-position-vertical:absolute;mso-position-vertical-relative:text;mso-width-percent:0;mso-height-percent:0;mso-width-relative:page;mso-height-relative:page;v-text-anchor:top" o:gfxdata="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" stroked="f">
-                <v:textbox>
-                  <w:txbxContent>
-                    <w:p>
-                      <w:pPr>
-                        <w:jc w:val="right"/>
-                        <w:rPr>
-                          <w:rFonts w:cs="Calibri"/>
-                          <w:lang w:val="ka-GE"/>
-                        </w:rPr>
-                      </w:pPr>
-                      <w:r>
-                        <w:rPr>
-                          <w:rFonts w:cs="Calibri"/>
-                          <w:lang w:val="ka-GE"/>
-                        </w:rPr>
-                        <w:t xml:space="preserve">საქართველოს </w:t>
-                      </w:r>
-                      <w:r>
-                        <w:rPr>
-                          <w:rFonts w:cs="Calibri"/>
-                          <w:lang w:val="ka-GE"/>
-                        </w:rPr>
-                        <w:t>ტექნიკური უნივერსიტეტი</w:t>
-                      </w:r>
-                    </w:p>
-                    <w:p>
-                      <w:pPr>
-                        <w:jc w:val="right"/>
-                        <w:rPr>
-                          <w:rFonts w:cs="Calibri"/>
-                          <w:lang w:val="ka-GE"/>
-                        </w:rPr>
-                      </w:pPr>
-                      <w:r>
-                        <w:rPr>
-                          <w:rFonts w:cs="Calibri"/>
-                          <w:lang w:val="ka-GE"/>
-                        </w:rPr>
-                        <w:t>თბილისი, 0160, საქართველო</w:t>
-                      </w:r>
-                    </w:p>
-                    <w:p>
-                      <w:pPr>
-                        <w:jc w:val="right"/>
-                        <w:rPr>
-                          <w:rFonts w:cs="Calibri"/>
-                          <w:lang w:val="ka-GE"/>
-                        </w:rPr>
-                      </w:pPr>
-                      <w:r>
-                        <w:rPr>
-                          <w:rFonts w:cs="Calibri"/>
-                          <w:lang w:val="ka-GE"/>
-                        </w:rPr>
-                        <w:t xml:space="preserve"> ივლისი, 2026 წელი</w:t>
-                      </w:r>
-                    </w:p>
-                    <w:p>
-                      <w:pPr>
-                        <w:jc w:val="right"/>
-                        <w:rPr>
-                          <w:rFonts w:cs="Calibri"/>
-                          <w:sz w:val="20"/>
-                          <w:szCs w:val="20"/>
-                        </w:rPr>
-                      </w:pPr>
-                    </w:p>
-                  </w:txbxContent>
-                </v:textbox>
-              </v:shape>
-            </w:pict>
-          </mc:Fallback>
-        </mc:AlternateContent>
-      </w:r>
-      <w:r>
-        <w:rPr>
-          <w:b/>
-          <w:noProof/>
-          <w:lang w:val="ka-GE"/>
-        </w:rPr>
-        <mc:AlternateContent>
-          <mc:Choice Requires="wps">
-            <w:drawing>
-              <wp:anchor distT="0" distB="0" distL="114300" distR="114300" simplePos="0" relativeHeight="251662336" behindDoc="0" locked="0" layoutInCell="1" allowOverlap="1" wp14:anchorId="0F803DA9" wp14:editId="0E854167">
-                <wp:simplePos x="0" y="0"/>
-                <wp:positionH relativeFrom="column">
-                  <wp:posOffset>196215</wp:posOffset>
-                </wp:positionH>
-                <wp:positionV relativeFrom="paragraph">
-                  <wp:posOffset>265430</wp:posOffset>
-                </wp:positionV>
-                <wp:extent cx="3232785" cy="381000"/>
-                <wp:effectExtent l="0" t="2540" r="0" b="0"/>
-                <wp:wrapNone/>
-                <wp:docPr id="1346965493" name="Text Box 2"/>
-                <wp:cNvGraphicFramePr>
-                  <a:graphicFrameLocks xmlns:a="http://schemas.openxmlformats.org/drawingml/2006/main"/>
-                </wp:cNvGraphicFramePr>
-                <a:graphic xmlns:a="http://schemas.openxmlformats.org/drawingml/2006/main">
-                  <a:graphicData uri="http://schemas.microsoft.com/office/word/2010/wordprocessingShape">
-                    <wps:wsp>
-                      <wps:cNvSpPr txBox="1">
-                        <a:spLocks noChangeArrowheads="1"/>
-                      </wps:cNvSpPr>
-                      <wps:spPr bwMode="auto">
-                        <a:xfrm>
-                          <a:off x="0" y="0"/>
-                          <a:ext cx="3232785" cy="381000"/>
-                        </a:xfrm>
-                        <a:prstGeom prst="rect">
-                          <a:avLst/>
-                        </a:prstGeom>
-                        <a:solidFill>
-                          <a:srgbClr val="FFFFFF"/>
-                        </a:solidFill>
-                        <a:ln>
-                          <a:noFill/>
-                        </a:ln>
-                        <a:extLst>
-                          <a:ext uri="{91240B29-F687-4F45-9708-019B960494DF}">
-                            <a14:hiddenLine xmlns:a14="http://schemas.microsoft.com/office/drawing/2010/main" w="9525">
-                              <a:solidFill>
-                                <a:srgbClr val="000000"/>
-                              </a:solidFill>
-                              <a:miter lim="800000"/>
-                              <a:headEnd/>
-                              <a:tailEnd/>
-                            </a14:hiddenLine>
-                          </a:ext>
-                        </a:extLst>
-                      </wps:spPr>
-                      <wps:txbx>
-                        <w:txbxContent>
-                          <w:p>
-                            <w:pPr>
-                              <w:tabs>
-                                <w:tab w:val="left" w:pos="709"/>
-                              </w:tabs>
-                              <w:rPr>
-                                <w:rFonts w:cs="Calibri"/>
-                                <w:b/>
-                                <w:bCs/>
-                                <w:sz w:val="32"/>
-                                <w:szCs w:val="32"/>
-                                <w:lang w:val="ka-GE"/>
-                              </w:rPr>
-                            </w:pPr>
-                            <w:r>
-                              <w:rPr>
-                                <w:rFonts w:cs="Calibri"/>
-                                <w:b/>
-                                <w:bCs/>
-                                <w:sz w:val="32"/>
-                                <w:szCs w:val="32"/>
-                                <w:lang w:val="ka-GE"/>
-                              </w:rPr>
-                              <w:t xml:space="preserve">შიფრი </w:t>
-                            </w:r>
-                          </w:p>
-                          <w:p>
-                            <w:pPr>
-                              <w:rPr>
-                                <w:rFonts w:cs="Calibri"/>
-                                <w:b/>
-                                <w:bCs/>
-                                <w:sz w:val="28"/>
-                                <w:szCs w:val="28"/>
-                              </w:rPr>
-                            </w:pPr>
-                          </w:p>
-                        </w:txbxContent>
-                      </wps:txbx>
-                      <wps:bodyPr rot="0" vert="horz" wrap="square" lIns="91440" tIns="45720" rIns="91440" bIns="45720" anchor="t" anchorCtr="0" upright="1">
-                        <a:noAutofit/>
-                      </wps:bodyPr>
-                    </wps:wsp>
-                  </a:graphicData>
-                </a:graphic>
-                <wp14:sizeRelH relativeFrom="page">
-                  <wp14:pctWidth>0</wp14:pctWidth>
-                </wp14:sizeRelH>
-                <wp14:sizeRelV relativeFrom="page">
-                  <wp14:pctHeight>0</wp14:pctHeight>
-                </wp14:sizeRelV>
-              </wp:anchor>
-            </w:drawing>
-          </mc:Choice>
-          <mc:Fallback>
-            <w:pict>
-              <v:shape w14:anchorId="0F803DA9" id="Text Box 2" o:spid="_x0000_s1029" type="#_x0000_t202" style="position:absolute;left:0;text-align:left;margin-left:15.45pt;margin-top:20.9pt;width:254.55pt;height:30pt;z-index:251662336;visibility:visible;mso-wrap-style:square;mso-width-percent:0;mso-height-percent:0;mso-wrap-distance-left:9pt;mso-wrap-distance-top:0;mso-wrap-distance-right:9pt;mso-wrap-distance-bottom:0;mso-position-horizontal:absolute;mso-position-horizontal-relative:text;mso-position-vertical:absolute;mso-position-vertical-relative:text;mso-width-percent:0;mso-height-percent:0;mso-width-relative:page;mso-height-relative:page;v-text-anchor:top" o:gfxdata="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" stroked="f">
-                <v:textbox>
-                  <w:txbxContent>
-                    <w:p>
-                      <w:pPr>
-                        <w:tabs>
-                          <w:tab w:val="left" w:pos="709"/>
-                        </w:tabs>
-                        <w:rPr>
-                          <w:rFonts w:cs="Calibri"/>
-                          <w:b/>
-                          <w:bCs/>
-                          <w:sz w:val="32"/>
-                          <w:szCs w:val="32"/>
-                          <w:lang w:val="ka-GE"/>
-                        </w:rPr>
-                      </w:pPr>
-                      <w:r>
-                        <w:rPr>
-                          <w:rFonts w:cs="Calibri"/>
-                          <w:b/>
-                          <w:bCs/>
-                          <w:sz w:val="32"/>
-                          <w:szCs w:val="32"/>
-                          <w:lang w:val="ka-GE"/>
-                        </w:rPr>
-                        <w:t xml:space="preserve">შიფრი </w:t>
-                      </w:r>
-                    </w:p>
-                    <w:p>
-                      <w:pPr>
-                        <w:rPr>
-                          <w:rFonts w:cs="Calibri"/>
-                          <w:b/>
-                          <w:bCs/>
-                          <w:sz w:val="28"/>
-                          <w:szCs w:val="28"/>
-                        </w:rPr>
-                      </w:pPr>
-                    </w:p>
-                  </w:txbxContent>
-                </v:textbox>
-              </v:shape>
-            </w:pict>
-          </mc:Fallback>
-        </mc:AlternateContent>
-      </w:r>
     </w:p>
     <w:p>
       <w:pPr>
@@ -846,17 +158,34 @@
           <w:lang w:val="ka-GE"/>
         </w:rPr>
       </w:pPr>
-    </w:p>
-    <w:p>
-      <w:pPr>
-        <w:pStyle w:val="BodyText"/>
-        <w:spacing w:before="120" w:after="240"/>
-        <w:jc w:val="center"/>
-        <w:rPr>
-          <w:b/>
-          <w:lang w:val="ka-GE"/>
-        </w:rPr>
-      </w:pPr>
+      <w:r/>
+      <w:r>
+        <w:rPr>
+          <w:rFonts w:ascii="Sylfaen" w:hAnsi="Sylfaen"/>
+          <w:sz w:val="24"/>
+        </w:rPr>
+        <w:t>საქართველოს ტექნიკური უნივერსიტეტი</w:t>
+      </w:r>
+      <w:r>
+        <w:br/>
+      </w:r>
+      <w:r>
+        <w:rPr>
+          <w:rFonts w:ascii="Sylfaen" w:hAnsi="Sylfaen"/>
+          <w:sz w:val="24"/>
+        </w:rPr>
+        <w:t>თბილისი, 0160, საქართველო</w:t>
+      </w:r>
+      <w:r>
+        <w:br/>
+      </w:r>
+      <w:r>
+        <w:rPr>
+          <w:rFonts w:ascii="Sylfaen" w:hAnsi="Sylfaen"/>
+          <w:sz w:val="24"/>
+        </w:rPr>
+        <w:t>ივლისი, 2026 წელი</w:t>
+      </w:r>
     </w:p>
     <w:p>
       <w:pPr>
@@ -870,7 +199,7 @@
         <w:sectPr>
           <w:footerReference w:type="default" r:id="rId9"/>
           <w:pgSz w:w="11906" w:h="16838" w:code="9"/>
-          <w:pgMar w:top="2155" w:right="289" w:bottom="1418" w:left="289" w:header="720" w:footer="720" w:gutter="0"/>
+          <w:pgMar w:top="1417" w:right="1417" w:bottom="1417" w:left="2154" w:header="720" w:footer="720" w:gutter="0"/>
           <w:pgNumType w:start="0"/>
           <w:cols w:space="720"/>
           <w:titlePg/>
@@ -2346,13 +1675,15 @@
         <w:rPr>
           <w:rFonts w:ascii="Sylfaen" w:hAnsi="Sylfaen" w:cs="Sylfaen"/>
           <w:b/>
-          <w:sz w:val="26"/>
+          <w:sz w:val="28"/>
         </w:rPr>
         <w:t>1.1 კვლევითი პრობლემა</w:t>
       </w:r>
     </w:p>
     <w:p>
-      <w:pPr/>
+      <w:pPr>
+        <w:jc w:val="both"/>
+      </w:pPr>
       <w:r>
         <w:rPr>
           <w:rFonts w:ascii="Sylfaen" w:hAnsi="Sylfaen" w:cs="Sylfaen"/>
@@ -2363,7 +1694,9 @@
       </w:r>
     </w:p>
     <w:p>
-      <w:pPr/>
+      <w:pPr>
+        <w:jc w:val="both"/>
+      </w:pPr>
       <w:r>
         <w:rPr>
           <w:rFonts w:ascii="Sylfaen" w:hAnsi="Sylfaen" w:cs="Sylfaen"/>
@@ -2374,7 +1707,9 @@
       </w:r>
     </w:p>
     <w:p>
-      <w:pPr/>
+      <w:pPr>
+        <w:jc w:val="both"/>
+      </w:pPr>
       <w:r>
         <w:rPr>
           <w:rFonts w:ascii="Sylfaen" w:hAnsi="Sylfaen" w:cs="Sylfaen"/>
@@ -2385,7 +1720,9 @@
       </w:r>
     </w:p>
     <w:p>
-      <w:pPr/>
+      <w:pPr>
+        <w:jc w:val="both"/>
+      </w:pPr>
       <w:r>
         <w:rPr>
           <w:rFonts w:ascii="Sylfaen" w:hAnsi="Sylfaen" w:cs="Sylfaen"/>
@@ -2406,13 +1743,15 @@
         <w:rPr>
           <w:rFonts w:ascii="Sylfaen" w:hAnsi="Sylfaen" w:cs="Sylfaen"/>
           <w:b/>
-          <w:sz w:val="26"/>
+          <w:sz w:val="28"/>
         </w:rPr>
         <w:t>1.2 კვლევის მიზანი</w:t>
       </w:r>
     </w:p>
     <w:p>
-      <w:pPr/>
+      <w:pPr>
+        <w:jc w:val="both"/>
+      </w:pPr>
       <w:r>
         <w:rPr>
           <w:rFonts w:ascii="Sylfaen" w:hAnsi="Sylfaen" w:cs="Sylfaen"/>
@@ -2423,7 +1762,9 @@
       </w:r>
     </w:p>
     <w:p>
-      <w:pPr/>
+      <w:pPr>
+        <w:jc w:val="both"/>
+      </w:pPr>
       <w:r>
         <w:rPr>
           <w:rFonts w:ascii="Sylfaen" w:hAnsi="Sylfaen" w:cs="Sylfaen"/>
@@ -2434,7 +1775,9 @@
       </w:r>
     </w:p>
     <w:p>
-      <w:pPr/>
+      <w:pPr>
+        <w:jc w:val="both"/>
+      </w:pPr>
       <w:r>
         <w:rPr>
           <w:rFonts w:ascii="Sylfaen" w:hAnsi="Sylfaen" w:cs="Sylfaen"/>
@@ -2445,7 +1788,9 @@
       </w:r>
     </w:p>
     <w:p>
-      <w:pPr/>
+      <w:pPr>
+        <w:jc w:val="both"/>
+      </w:pPr>
       <w:r>
         <w:rPr>
           <w:rFonts w:ascii="Sylfaen" w:hAnsi="Sylfaen" w:cs="Sylfaen"/>
@@ -2456,7 +1801,9 @@
       </w:r>
     </w:p>
     <w:p>
-      <w:pPr/>
+      <w:pPr>
+        <w:jc w:val="both"/>
+      </w:pPr>
       <w:r>
         <w:rPr>
           <w:rFonts w:ascii="Sylfaen" w:hAnsi="Sylfaen" w:cs="Sylfaen"/>
@@ -2467,7 +1814,9 @@
       </w:r>
     </w:p>
     <w:p>
-      <w:pPr/>
+      <w:pPr>
+        <w:jc w:val="both"/>
+      </w:pPr>
       <w:r>
         <w:rPr>
           <w:rFonts w:ascii="Sylfaen" w:hAnsi="Sylfaen" w:cs="Sylfaen"/>
@@ -2478,7 +1827,9 @@
       </w:r>
     </w:p>
     <w:p>
-      <w:pPr/>
+      <w:pPr>
+        <w:jc w:val="both"/>
+      </w:pPr>
       <w:r>
         <w:rPr>
           <w:rFonts w:ascii="Sylfaen" w:hAnsi="Sylfaen" w:cs="Sylfaen"/>
@@ -2489,7 +1840,9 @@
       </w:r>
     </w:p>
     <w:p>
-      <w:pPr/>
+      <w:pPr>
+        <w:jc w:val="both"/>
+      </w:pPr>
       <w:r>
         <w:rPr>
           <w:rFonts w:ascii="Sylfaen" w:hAnsi="Sylfaen" w:cs="Sylfaen"/>
@@ -2500,7 +1853,9 @@
       </w:r>
     </w:p>
     <w:p>
-      <w:pPr/>
+      <w:pPr>
+        <w:jc w:val="both"/>
+      </w:pPr>
       <w:r>
         <w:rPr>
           <w:rFonts w:ascii="Sylfaen" w:hAnsi="Sylfaen" w:cs="Sylfaen"/>
@@ -2511,7 +1866,9 @@
       </w:r>
     </w:p>
     <w:p>
-      <w:pPr/>
+      <w:pPr>
+        <w:jc w:val="both"/>
+      </w:pPr>
       <w:r>
         <w:rPr>
           <w:rFonts w:ascii="Sylfaen" w:hAnsi="Sylfaen" w:cs="Sylfaen"/>
@@ -2522,7 +1879,9 @@
       </w:r>
     </w:p>
     <w:p>
-      <w:pPr/>
+      <w:pPr>
+        <w:jc w:val="both"/>
+      </w:pPr>
       <w:r>
         <w:rPr>
           <w:rFonts w:ascii="Sylfaen" w:hAnsi="Sylfaen" w:cs="Sylfaen"/>
@@ -2533,7 +1892,9 @@
       </w:r>
     </w:p>
     <w:p>
-      <w:pPr/>
+      <w:pPr>
+        <w:jc w:val="both"/>
+      </w:pPr>
       <w:r>
         <w:rPr>
           <w:rFonts w:ascii="Sylfaen" w:hAnsi="Sylfaen" w:cs="Sylfaen"/>
@@ -2544,7 +1905,9 @@
       </w:r>
     </w:p>
     <w:p>
-      <w:pPr/>
+      <w:pPr>
+        <w:jc w:val="both"/>
+      </w:pPr>
       <w:r>
         <w:rPr>
           <w:rFonts w:ascii="Sylfaen" w:hAnsi="Sylfaen" w:cs="Sylfaen"/>
@@ -2555,7 +1918,9 @@
       </w:r>
     </w:p>
     <w:p>
-      <w:pPr/>
+      <w:pPr>
+        <w:jc w:val="both"/>
+      </w:pPr>
       <w:r>
         <w:rPr>
           <w:rFonts w:ascii="Sylfaen" w:hAnsi="Sylfaen" w:cs="Sylfaen"/>
@@ -2566,7 +1931,9 @@
       </w:r>
     </w:p>
     <w:p>
-      <w:pPr/>
+      <w:pPr>
+        <w:jc w:val="both"/>
+      </w:pPr>
       <w:r>
         <w:rPr>
           <w:rFonts w:ascii="Sylfaen" w:hAnsi="Sylfaen" w:cs="Sylfaen"/>
@@ -2587,13 +1954,15 @@
         <w:rPr>
           <w:rFonts w:ascii="Sylfaen" w:hAnsi="Sylfaen" w:cs="Sylfaen"/>
           <w:b/>
-          <w:sz w:val="26"/>
+          <w:sz w:val="28"/>
         </w:rPr>
         <w:t>1.3 პრობლემის აქტუალობა</w:t>
       </w:r>
     </w:p>
     <w:p>
-      <w:pPr/>
+      <w:pPr>
+        <w:jc w:val="both"/>
+      </w:pPr>
       <w:r>
         <w:rPr>
           <w:rFonts w:ascii="Sylfaen" w:hAnsi="Sylfaen" w:cs="Sylfaen"/>
@@ -2614,7 +1983,7 @@
         <w:rPr>
           <w:rFonts w:ascii="Sylfaen" w:hAnsi="Sylfaen" w:cs="Sylfaen"/>
           <w:b/>
-          <w:sz w:val="26"/>
+          <w:sz w:val="28"/>
         </w:rPr>
         <w:t>1.4 კვლევის პრაქტიკული ღირებულება</w:t>
       </w:r>
@@ -2631,7 +2000,9 @@
       </w:r>
     </w:p>
     <w:p>
-      <w:pPr/>
+      <w:pPr>
+        <w:jc w:val="both"/>
+      </w:pPr>
       <w:r>
         <w:rPr>
           <w:rFonts w:ascii="Sylfaen" w:hAnsi="Sylfaen" w:cs="Sylfaen"/>
@@ -2642,7 +2013,9 @@
       </w:r>
     </w:p>
     <w:p>
-      <w:pPr/>
+      <w:pPr>
+        <w:jc w:val="both"/>
+      </w:pPr>
       <w:r>
         <w:rPr>
           <w:rFonts w:ascii="Sylfaen" w:hAnsi="Sylfaen" w:cs="Sylfaen"/>
@@ -2653,7 +2026,9 @@
       </w:r>
     </w:p>
     <w:p>
-      <w:pPr/>
+      <w:pPr>
+        <w:jc w:val="both"/>
+      </w:pPr>
       <w:r>
         <w:rPr>
           <w:rFonts w:ascii="Sylfaen" w:hAnsi="Sylfaen" w:cs="Sylfaen"/>
@@ -2664,7 +2039,9 @@
       </w:r>
     </w:p>
     <w:p>
-      <w:pPr/>
+      <w:pPr>
+        <w:jc w:val="both"/>
+      </w:pPr>
       <w:r>
         <w:rPr>
           <w:rFonts w:ascii="Sylfaen" w:hAnsi="Sylfaen" w:cs="Sylfaen"/>
@@ -2685,13 +2062,15 @@
         <w:rPr>
           <w:rFonts w:ascii="Sylfaen" w:hAnsi="Sylfaen" w:cs="Sylfaen"/>
           <w:b/>
-          <w:sz w:val="26"/>
+          <w:sz w:val="28"/>
         </w:rPr>
         <w:t>1.5 კვლევის თეორიული ღირებულება</w:t>
       </w:r>
     </w:p>
     <w:p>
-      <w:pPr/>
+      <w:pPr>
+        <w:jc w:val="both"/>
+      </w:pPr>
       <w:r>
         <w:rPr>
           <w:rFonts w:ascii="Sylfaen" w:hAnsi="Sylfaen" w:cs="Sylfaen"/>
@@ -2712,13 +2091,15 @@
         <w:rPr>
           <w:rFonts w:ascii="Sylfaen" w:hAnsi="Sylfaen" w:cs="Sylfaen"/>
           <w:b/>
-          <w:sz w:val="26"/>
+          <w:sz w:val="28"/>
         </w:rPr>
         <w:t>1.6 ნაშრომის სტრუქტურა</w:t>
       </w:r>
     </w:p>
     <w:p>
-      <w:pPr/>
+      <w:pPr>
+        <w:jc w:val="both"/>
+      </w:pPr>
       <w:r>
         <w:rPr>
           <w:rFonts w:ascii="Sylfaen" w:hAnsi="Sylfaen" w:cs="Sylfaen"/>
@@ -2756,13 +2137,15 @@
         <w:rPr>
           <w:rFonts w:ascii="Sylfaen" w:hAnsi="Sylfaen" w:cs="Sylfaen"/>
           <w:b/>
-          <w:sz w:val="26"/>
+          <w:sz w:val="28"/>
         </w:rPr>
         <w:t>2.1 მიმოხილვის მოცულობა და სტრუქტურა</w:t>
       </w:r>
     </w:p>
     <w:p>
-      <w:pPr/>
+      <w:pPr>
+        <w:jc w:val="both"/>
+      </w:pPr>
       <w:r>
         <w:rPr>
           <w:rFonts w:ascii="Sylfaen" w:hAnsi="Sylfaen" w:cs="Sylfaen"/>
@@ -2783,13 +2166,15 @@
         <w:rPr>
           <w:rFonts w:ascii="Sylfaen" w:hAnsi="Sylfaen" w:cs="Sylfaen"/>
           <w:b/>
-          <w:sz w:val="26"/>
+          <w:sz w:val="28"/>
         </w:rPr>
         <w:t>2.2 თეორიული საფუძვლები: ადამიანის მეხსიერების მოდელები</w:t>
       </w:r>
     </w:p>
     <w:p>
-      <w:pPr/>
+      <w:pPr>
+        <w:jc w:val="both"/>
+      </w:pPr>
       <w:r>
         <w:rPr>
           <w:rFonts w:ascii="Sylfaen" w:hAnsi="Sylfaen" w:cs="Sylfaen"/>
@@ -2800,7 +2185,9 @@
       </w:r>
     </w:p>
     <w:p>
-      <w:pPr/>
+      <w:pPr>
+        <w:jc w:val="both"/>
+      </w:pPr>
       <w:r>
         <w:rPr>
           <w:rFonts w:ascii="Sylfaen" w:hAnsi="Sylfaen" w:cs="Sylfaen"/>
@@ -2811,7 +2198,9 @@
       </w:r>
     </w:p>
     <w:p>
-      <w:pPr/>
+      <w:pPr>
+        <w:jc w:val="both"/>
+      </w:pPr>
       <w:r>
         <w:rPr>
           <w:rFonts w:ascii="Sylfaen" w:hAnsi="Sylfaen" w:cs="Sylfaen"/>
@@ -2822,7 +2211,9 @@
       </w:r>
     </w:p>
     <w:p>
-      <w:pPr/>
+      <w:pPr>
+        <w:jc w:val="both"/>
+      </w:pPr>
       <w:r>
         <w:rPr>
           <w:rFonts w:ascii="Sylfaen" w:hAnsi="Sylfaen" w:cs="Sylfaen"/>
@@ -2833,7 +2224,9 @@
       </w:r>
     </w:p>
     <w:p>
-      <w:pPr/>
+      <w:pPr>
+        <w:jc w:val="both"/>
+      </w:pPr>
       <w:r>
         <w:rPr>
           <w:rFonts w:ascii="Sylfaen" w:hAnsi="Sylfaen" w:cs="Sylfaen"/>
@@ -2844,7 +2237,9 @@
       </w:r>
     </w:p>
     <w:p>
-      <w:pPr/>
+      <w:pPr>
+        <w:jc w:val="both"/>
+      </w:pPr>
       <w:r>
         <w:rPr>
           <w:rFonts w:ascii="Sylfaen" w:hAnsi="Sylfaen" w:cs="Sylfaen"/>
@@ -2855,7 +2250,9 @@
       </w:r>
     </w:p>
     <w:p>
-      <w:pPr/>
+      <w:pPr>
+        <w:jc w:val="both"/>
+      </w:pPr>
       <w:r>
         <w:rPr>
           <w:rFonts w:ascii="Sylfaen" w:hAnsi="Sylfaen" w:cs="Sylfaen"/>
@@ -2887,13 +2284,15 @@
         <w:rPr>
           <w:rFonts w:ascii="Sylfaen" w:hAnsi="Sylfaen" w:cs="Sylfaen"/>
           <w:b/>
-          <w:sz w:val="26"/>
+          <w:sz w:val="28"/>
         </w:rPr>
         <w:t>2.3 გრძელვადიანი მეხსიერება დიდი ენის მოდელის აგენტებისთვის: სამი ტალღა</w:t>
       </w:r>
     </w:p>
     <w:p>
-      <w:pPr/>
+      <w:pPr>
+        <w:jc w:val="both"/>
+      </w:pPr>
       <w:r>
         <w:rPr>
           <w:rFonts w:ascii="Sylfaen" w:hAnsi="Sylfaen" w:cs="Sylfaen"/>
@@ -2904,7 +2303,9 @@
       </w:r>
     </w:p>
     <w:p>
-      <w:pPr/>
+      <w:pPr>
+        <w:jc w:val="both"/>
+      </w:pPr>
       <w:r>
         <w:rPr>
           <w:rFonts w:ascii="Sylfaen" w:hAnsi="Sylfaen" w:cs="Sylfaen"/>
@@ -2915,7 +2316,9 @@
       </w:r>
     </w:p>
     <w:p>
-      <w:pPr/>
+      <w:pPr>
+        <w:jc w:val="both"/>
+      </w:pPr>
       <w:r>
         <w:rPr>
           <w:rFonts w:ascii="Sylfaen" w:hAnsi="Sylfaen" w:cs="Sylfaen"/>
@@ -2926,7 +2329,9 @@
       </w:r>
     </w:p>
     <w:p>
-      <w:pPr/>
+      <w:pPr>
+        <w:jc w:val="both"/>
+      </w:pPr>
       <w:r>
         <w:rPr>
           <w:rFonts w:ascii="Sylfaen" w:hAnsi="Sylfaen" w:cs="Sylfaen"/>
@@ -2947,13 +2352,15 @@
         <w:rPr>
           <w:rFonts w:ascii="Sylfaen" w:hAnsi="Sylfaen" w:cs="Sylfaen"/>
           <w:b/>
-          <w:sz w:val="26"/>
+          <w:sz w:val="28"/>
         </w:rPr>
         <w:t>2.4 ხიდი: მეხსიერების თეორიიდან მეხსიერების არქიტექტურამდე</w:t>
       </w:r>
     </w:p>
     <w:p>
-      <w:pPr/>
+      <w:pPr>
+        <w:jc w:val="both"/>
+      </w:pPr>
       <w:r>
         <w:rPr>
           <w:rFonts w:ascii="Sylfaen" w:hAnsi="Sylfaen" w:cs="Sylfaen"/>
@@ -2981,15 +2388,15 @@
         <w:tblW w:type="auto" w:w="0"/>
         <w:tblLayout w:type="fixed"/>
         <w:tblLook w:firstColumn="1" w:firstRow="1" w:lastColumn="0" w:lastRow="0" w:noHBand="0" w:noVBand="1" w:val="04A0"/>
+        <w:tblLayout w:type="fixed"/>
         <w:tblBorders>
-          <w:top w:val="single" w:sz="4" w:space="0" w:color="000000"/>
-          <w:left w:val="single" w:sz="4" w:space="0" w:color="000000"/>
-          <w:bottom w:val="single" w:sz="4" w:space="0" w:color="000000"/>
-          <w:right w:val="single" w:sz="4" w:space="0" w:color="000000"/>
-          <w:insideH w:val="single" w:sz="4" w:space="0" w:color="000000"/>
-          <w:insideV w:val="single" w:sz="4" w:space="0" w:color="000000"/>
+          <w:top w:val="single" w:sz="4" w:space="0" w:color="auto"/>
+          <w:left w:val="single" w:sz="4" w:space="0" w:color="auto"/>
+          <w:bottom w:val="single" w:sz="4" w:space="0" w:color="auto"/>
+          <w:right w:val="single" w:sz="4" w:space="0" w:color="auto"/>
+          <w:insideH w:val="single" w:sz="4" w:space="0" w:color="auto"/>
+          <w:insideV w:val="single" w:sz="4" w:space="0" w:color="auto"/>
         </w:tblBorders>
-        <w:tblLayout w:type="fixed"/>
       </w:tblPr>
       <w:tblGrid>
         <w:gridCol w:w="2861"/>
@@ -3393,7 +2800,9 @@
       <w:pPr/>
     </w:p>
     <w:p>
-      <w:pPr/>
+      <w:pPr>
+        <w:jc w:val="both"/>
+      </w:pPr>
       <w:r>
         <w:rPr>
           <w:rFonts w:ascii="Sylfaen" w:hAnsi="Sylfaen" w:cs="Sylfaen"/>
@@ -3414,13 +2823,15 @@
         <w:rPr>
           <w:rFonts w:ascii="Sylfaen" w:hAnsi="Sylfaen" w:cs="Sylfaen"/>
           <w:b/>
-          <w:sz w:val="26"/>
+          <w:sz w:val="28"/>
         </w:rPr>
         <w:t>2.5 საუბრის მეხსიერების შეფასება: ბენჩმარკები და მათი შეზღუდვები</w:t>
       </w:r>
     </w:p>
     <w:p>
-      <w:pPr/>
+      <w:pPr>
+        <w:jc w:val="both"/>
+      </w:pPr>
       <w:r>
         <w:rPr>
           <w:rFonts w:ascii="Sylfaen" w:hAnsi="Sylfaen" w:cs="Sylfaen"/>
@@ -3431,7 +2842,9 @@
       </w:r>
     </w:p>
     <w:p>
-      <w:pPr/>
+      <w:pPr>
+        <w:jc w:val="both"/>
+      </w:pPr>
       <w:r>
         <w:rPr>
           <w:rFonts w:ascii="Sylfaen" w:hAnsi="Sylfaen" w:cs="Sylfaen"/>
@@ -3442,7 +2855,9 @@
       </w:r>
     </w:p>
     <w:p>
-      <w:pPr/>
+      <w:pPr>
+        <w:jc w:val="both"/>
+      </w:pPr>
       <w:r>
         <w:rPr>
           <w:rFonts w:ascii="Sylfaen" w:hAnsi="Sylfaen" w:cs="Sylfaen"/>
@@ -3463,13 +2878,15 @@
         <w:rPr>
           <w:rFonts w:ascii="Sylfaen" w:hAnsi="Sylfaen" w:cs="Sylfaen"/>
           <w:b/>
-          <w:sz w:val="26"/>
+          <w:sz w:val="28"/>
         </w:rPr>
         <w:t>2.6 ასისტენტიდან თანამოსაუბრემდე: მეხსიერება და აღქმული ურთიერთობა</w:t>
       </w:r>
     </w:p>
     <w:p>
-      <w:pPr/>
+      <w:pPr>
+        <w:jc w:val="both"/>
+      </w:pPr>
       <w:r>
         <w:rPr>
           <w:rFonts w:ascii="Sylfaen" w:hAnsi="Sylfaen" w:cs="Sylfaen"/>
@@ -3480,7 +2897,9 @@
       </w:r>
     </w:p>
     <w:p>
-      <w:pPr/>
+      <w:pPr>
+        <w:jc w:val="both"/>
+      </w:pPr>
       <w:r>
         <w:rPr>
           <w:rFonts w:ascii="Sylfaen" w:hAnsi="Sylfaen" w:cs="Sylfaen"/>
@@ -3491,7 +2910,9 @@
       </w:r>
     </w:p>
     <w:p>
-      <w:pPr/>
+      <w:pPr>
+        <w:jc w:val="both"/>
+      </w:pPr>
       <w:r>
         <w:rPr>
           <w:rFonts w:ascii="Sylfaen" w:hAnsi="Sylfaen" w:cs="Sylfaen"/>
@@ -3502,7 +2923,9 @@
       </w:r>
     </w:p>
     <w:p>
-      <w:pPr/>
+      <w:pPr>
+        <w:jc w:val="both"/>
+      </w:pPr>
       <w:r>
         <w:rPr>
           <w:rFonts w:ascii="Sylfaen" w:hAnsi="Sylfaen" w:cs="Sylfaen"/>
@@ -3513,7 +2936,9 @@
       </w:r>
     </w:p>
     <w:p>
-      <w:pPr/>
+      <w:pPr>
+        <w:jc w:val="both"/>
+      </w:pPr>
       <w:r>
         <w:rPr>
           <w:rFonts w:ascii="Sylfaen" w:hAnsi="Sylfaen" w:cs="Sylfaen"/>
@@ -3534,13 +2959,15 @@
         <w:rPr>
           <w:rFonts w:ascii="Sylfaen" w:hAnsi="Sylfaen" w:cs="Sylfaen"/>
           <w:b/>
-          <w:sz w:val="26"/>
+          <w:sz w:val="28"/>
         </w:rPr>
         <w:t>2.7 ღია პრობლემები და შეზღუდვები</w:t>
       </w:r>
     </w:p>
     <w:p>
-      <w:pPr/>
+      <w:pPr>
+        <w:jc w:val="both"/>
+      </w:pPr>
       <w:r>
         <w:rPr>
           <w:rFonts w:ascii="Sylfaen" w:hAnsi="Sylfaen" w:cs="Sylfaen"/>
@@ -3561,13 +2988,15 @@
         <w:rPr>
           <w:rFonts w:ascii="Sylfaen" w:hAnsi="Sylfaen" w:cs="Sylfaen"/>
           <w:b/>
-          <w:sz w:val="26"/>
+          <w:sz w:val="28"/>
         </w:rPr>
         <w:t>2.8 ამ ნაშრომის ადგილი</w:t>
       </w:r>
     </w:p>
     <w:p>
-      <w:pPr/>
+      <w:pPr>
+        <w:jc w:val="both"/>
+      </w:pPr>
       <w:r>
         <w:rPr>
           <w:rFonts w:ascii="Sylfaen" w:hAnsi="Sylfaen" w:cs="Sylfaen"/>
@@ -3605,13 +3034,15 @@
         <w:rPr>
           <w:rFonts w:ascii="Sylfaen" w:hAnsi="Sylfaen" w:cs="Sylfaen"/>
           <w:b/>
-          <w:sz w:val="26"/>
+          <w:sz w:val="28"/>
         </w:rPr>
         <w:t>3.1 კვლევის დიზაინი და წვლილი</w:t>
       </w:r>
     </w:p>
     <w:p>
-      <w:pPr/>
+      <w:pPr>
+        <w:jc w:val="both"/>
+      </w:pPr>
       <w:r>
         <w:rPr>
           <w:rFonts w:ascii="Sylfaen" w:hAnsi="Sylfaen" w:cs="Sylfaen"/>
@@ -3622,7 +3053,9 @@
       </w:r>
     </w:p>
     <w:p>
-      <w:pPr/>
+      <w:pPr>
+        <w:jc w:val="both"/>
+      </w:pPr>
       <w:r>
         <w:rPr>
           <w:rFonts w:ascii="Sylfaen" w:hAnsi="Sylfaen" w:cs="Sylfaen"/>
@@ -3633,7 +3066,9 @@
       </w:r>
     </w:p>
     <w:p>
-      <w:pPr/>
+      <w:pPr>
+        <w:jc w:val="both"/>
+      </w:pPr>
       <w:r>
         <w:rPr>
           <w:rFonts w:ascii="Sylfaen" w:hAnsi="Sylfaen" w:cs="Sylfaen"/>
@@ -3644,7 +3079,9 @@
       </w:r>
     </w:p>
     <w:p>
-      <w:pPr/>
+      <w:pPr>
+        <w:jc w:val="both"/>
+      </w:pPr>
       <w:r>
         <w:rPr>
           <w:rFonts w:ascii="Sylfaen" w:hAnsi="Sylfaen" w:cs="Sylfaen"/>
@@ -3665,13 +3102,15 @@
         <w:rPr>
           <w:rFonts w:ascii="Sylfaen" w:hAnsi="Sylfaen" w:cs="Sylfaen"/>
           <w:b/>
-          <w:sz w:val="26"/>
+          <w:sz w:val="28"/>
         </w:rPr>
         <w:t>3.2 პროფილი C-ის მეხსიერების არქიტექტურა</w:t>
       </w:r>
     </w:p>
     <w:p>
-      <w:pPr/>
+      <w:pPr>
+        <w:jc w:val="both"/>
+      </w:pPr>
       <w:r>
         <w:rPr>
           <w:rFonts w:ascii="Sylfaen" w:hAnsi="Sylfaen" w:cs="Sylfaen"/>
@@ -3682,7 +3121,9 @@
       </w:r>
     </w:p>
     <w:p>
-      <w:pPr/>
+      <w:pPr>
+        <w:jc w:val="both"/>
+      </w:pPr>
       <w:r>
         <w:rPr>
           <w:rFonts w:ascii="Sylfaen" w:hAnsi="Sylfaen" w:cs="Sylfaen"/>
@@ -3693,7 +3134,9 @@
       </w:r>
     </w:p>
     <w:p>
-      <w:pPr/>
+      <w:pPr>
+        <w:jc w:val="both"/>
+      </w:pPr>
       <w:r>
         <w:rPr>
           <w:rFonts w:ascii="Sylfaen" w:hAnsi="Sylfaen" w:cs="Sylfaen"/>
@@ -3704,7 +3147,9 @@
       </w:r>
     </w:p>
     <w:p>
-      <w:pPr/>
+      <w:pPr>
+        <w:jc w:val="both"/>
+      </w:pPr>
       <w:r>
         <w:rPr>
           <w:rFonts w:ascii="Sylfaen" w:hAnsi="Sylfaen" w:cs="Sylfaen"/>
@@ -3715,7 +3160,9 @@
       </w:r>
     </w:p>
     <w:p>
-      <w:pPr/>
+      <w:pPr>
+        <w:jc w:val="both"/>
+      </w:pPr>
       <w:r>
         <w:rPr>
           <w:rFonts w:ascii="Sylfaen" w:hAnsi="Sylfaen" w:cs="Sylfaen"/>
@@ -3726,7 +3173,9 @@
       </w:r>
     </w:p>
     <w:p>
-      <w:pPr/>
+      <w:pPr>
+        <w:jc w:val="both"/>
+      </w:pPr>
       <w:r>
         <w:rPr>
           <w:rFonts w:ascii="Sylfaen" w:hAnsi="Sylfaen" w:cs="Sylfaen"/>
@@ -3737,7 +3186,9 @@
       </w:r>
     </w:p>
     <w:p>
-      <w:pPr/>
+      <w:pPr>
+        <w:jc w:val="both"/>
+      </w:pPr>
       <w:r>
         <w:rPr>
           <w:rFonts w:ascii="Sylfaen" w:hAnsi="Sylfaen" w:cs="Sylfaen"/>
@@ -3748,7 +3199,9 @@
       </w:r>
     </w:p>
     <w:p>
-      <w:pPr/>
+      <w:pPr>
+        <w:jc w:val="both"/>
+      </w:pPr>
       <w:r>
         <w:rPr>
           <w:rFonts w:ascii="Sylfaen" w:hAnsi="Sylfaen" w:cs="Sylfaen"/>
@@ -3769,13 +3222,15 @@
         <w:rPr>
           <w:rFonts w:ascii="Sylfaen" w:hAnsi="Sylfaen" w:cs="Sylfaen"/>
           <w:b/>
-          <w:sz w:val="26"/>
+          <w:sz w:val="28"/>
         </w:rPr>
         <w:t>3.3 ექსპერიმენტული პირობები (A / B / B+ / C)</w:t>
       </w:r>
     </w:p>
     <w:p>
-      <w:pPr/>
+      <w:pPr>
+        <w:jc w:val="both"/>
+      </w:pPr>
       <w:r>
         <w:rPr>
           <w:rFonts w:ascii="Sylfaen" w:hAnsi="Sylfaen" w:cs="Sylfaen"/>
@@ -3786,7 +3241,9 @@
       </w:r>
     </w:p>
     <w:p>
-      <w:pPr/>
+      <w:pPr>
+        <w:jc w:val="both"/>
+      </w:pPr>
       <w:r>
         <w:rPr>
           <w:rFonts w:ascii="Sylfaen" w:hAnsi="Sylfaen" w:cs="Sylfaen"/>
@@ -3797,7 +3254,9 @@
       </w:r>
     </w:p>
     <w:p>
-      <w:pPr/>
+      <w:pPr>
+        <w:jc w:val="both"/>
+      </w:pPr>
       <w:r>
         <w:rPr>
           <w:rFonts w:ascii="Sylfaen" w:hAnsi="Sylfaen" w:cs="Sylfaen"/>
@@ -3808,7 +3267,9 @@
       </w:r>
     </w:p>
     <w:p>
-      <w:pPr/>
+      <w:pPr>
+        <w:jc w:val="both"/>
+      </w:pPr>
       <w:r>
         <w:rPr>
           <w:rFonts w:ascii="Sylfaen" w:hAnsi="Sylfaen" w:cs="Sylfaen"/>
@@ -3819,7 +3280,9 @@
       </w:r>
     </w:p>
     <w:p>
-      <w:pPr/>
+      <w:pPr>
+        <w:jc w:val="both"/>
+      </w:pPr>
       <w:r>
         <w:rPr>
           <w:rFonts w:ascii="Sylfaen" w:hAnsi="Sylfaen" w:cs="Sylfaen"/>
@@ -3830,7 +3293,9 @@
       </w:r>
     </w:p>
     <w:p>
-      <w:pPr/>
+      <w:pPr>
+        <w:jc w:val="both"/>
+      </w:pPr>
       <w:r>
         <w:rPr>
           <w:rFonts w:ascii="Sylfaen" w:hAnsi="Sylfaen" w:cs="Sylfaen"/>
@@ -3869,15 +3334,15 @@
         <w:tblW w:type="auto" w:w="0"/>
         <w:tblLayout w:type="fixed"/>
         <w:tblLook w:firstColumn="1" w:firstRow="1" w:lastColumn="0" w:lastRow="0" w:noHBand="0" w:noVBand="1" w:val="04A0"/>
+        <w:tblLayout w:type="fixed"/>
         <w:tblBorders>
-          <w:top w:val="single" w:sz="4" w:space="0" w:color="000000"/>
-          <w:left w:val="single" w:sz="4" w:space="0" w:color="000000"/>
-          <w:bottom w:val="single" w:sz="4" w:space="0" w:color="000000"/>
-          <w:right w:val="single" w:sz="4" w:space="0" w:color="000000"/>
-          <w:insideH w:val="single" w:sz="4" w:space="0" w:color="000000"/>
-          <w:insideV w:val="single" w:sz="4" w:space="0" w:color="000000"/>
+          <w:top w:val="single" w:sz="4" w:space="0" w:color="auto"/>
+          <w:left w:val="single" w:sz="4" w:space="0" w:color="auto"/>
+          <w:bottom w:val="single" w:sz="4" w:space="0" w:color="auto"/>
+          <w:right w:val="single" w:sz="4" w:space="0" w:color="auto"/>
+          <w:insideH w:val="single" w:sz="4" w:space="0" w:color="auto"/>
+          <w:insideV w:val="single" w:sz="4" w:space="0" w:color="auto"/>
         </w:tblBorders>
-        <w:tblLayout w:type="fixed"/>
       </w:tblPr>
       <w:tblGrid>
         <w:gridCol w:w="2297"/>
@@ -4168,7 +3633,9 @@
       <w:pPr/>
     </w:p>
     <w:p>
-      <w:pPr/>
+      <w:pPr>
+        <w:jc w:val="both"/>
+      </w:pPr>
       <w:r>
         <w:rPr>
           <w:rFonts w:ascii="Sylfaen" w:hAnsi="Sylfaen" w:cs="Sylfaen"/>
@@ -4189,13 +3656,15 @@
         <w:rPr>
           <w:rFonts w:ascii="Sylfaen" w:hAnsi="Sylfaen" w:cs="Sylfaen"/>
           <w:b/>
-          <w:sz w:val="26"/>
+          <w:sz w:val="28"/>
         </w:rPr>
         <w:t>3.4 კონცეფციის დამტკიცების იმპლემენტაცია</w:t>
       </w:r>
     </w:p>
     <w:p>
-      <w:pPr/>
+      <w:pPr>
+        <w:jc w:val="both"/>
+      </w:pPr>
       <w:r>
         <w:rPr>
           <w:rFonts w:ascii="Sylfaen" w:hAnsi="Sylfaen" w:cs="Sylfaen"/>
@@ -4206,7 +3675,9 @@
       </w:r>
     </w:p>
     <w:p>
-      <w:pPr/>
+      <w:pPr>
+        <w:jc w:val="both"/>
+      </w:pPr>
       <w:r>
         <w:rPr>
           <w:rFonts w:ascii="Sylfaen" w:hAnsi="Sylfaen" w:cs="Sylfaen"/>
@@ -4227,13 +3698,15 @@
         <w:rPr>
           <w:rFonts w:ascii="Sylfaen" w:hAnsi="Sylfaen" w:cs="Sylfaen"/>
           <w:b/>
-          <w:sz w:val="26"/>
+          <w:sz w:val="28"/>
         </w:rPr>
         <w:t>3.5 შეფასების მეთოდოლოგია</w:t>
       </w:r>
     </w:p>
     <w:p>
-      <w:pPr/>
+      <w:pPr>
+        <w:jc w:val="both"/>
+      </w:pPr>
       <w:r>
         <w:rPr>
           <w:rFonts w:ascii="Sylfaen" w:hAnsi="Sylfaen" w:cs="Sylfaen"/>
@@ -4244,7 +3717,9 @@
       </w:r>
     </w:p>
     <w:p>
-      <w:pPr/>
+      <w:pPr>
+        <w:jc w:val="both"/>
+      </w:pPr>
       <w:r>
         <w:rPr>
           <w:rFonts w:ascii="Sylfaen" w:hAnsi="Sylfaen" w:cs="Sylfaen"/>
@@ -4255,7 +3730,9 @@
       </w:r>
     </w:p>
     <w:p>
-      <w:pPr/>
+      <w:pPr>
+        <w:jc w:val="both"/>
+      </w:pPr>
       <w:r>
         <w:rPr>
           <w:rFonts w:ascii="Sylfaen" w:hAnsi="Sylfaen" w:cs="Sylfaen"/>
@@ -4266,7 +3743,9 @@
       </w:r>
     </w:p>
     <w:p>
-      <w:pPr/>
+      <w:pPr>
+        <w:jc w:val="both"/>
+      </w:pPr>
       <w:r>
         <w:rPr>
           <w:rFonts w:ascii="Sylfaen" w:hAnsi="Sylfaen" w:cs="Sylfaen"/>
@@ -4277,7 +3756,9 @@
       </w:r>
     </w:p>
     <w:p>
-      <w:pPr/>
+      <w:pPr>
+        <w:jc w:val="both"/>
+      </w:pPr>
       <w:r>
         <w:rPr>
           <w:rFonts w:ascii="Sylfaen" w:hAnsi="Sylfaen" w:cs="Sylfaen"/>
@@ -4298,13 +3779,15 @@
         <w:rPr>
           <w:rFonts w:ascii="Sylfaen" w:hAnsi="Sylfaen" w:cs="Sylfaen"/>
           <w:b/>
-          <w:sz w:val="26"/>
+          <w:sz w:val="28"/>
         </w:rPr>
         <w:t>3.6 ზომები და ინსტრუმენტები</w:t>
       </w:r>
     </w:p>
     <w:p>
-      <w:pPr/>
+      <w:pPr>
+        <w:jc w:val="both"/>
+      </w:pPr>
       <w:r>
         <w:rPr>
           <w:rFonts w:ascii="Sylfaen" w:hAnsi="Sylfaen" w:cs="Sylfaen"/>
@@ -4315,7 +3798,9 @@
       </w:r>
     </w:p>
     <w:p>
-      <w:pPr/>
+      <w:pPr>
+        <w:jc w:val="both"/>
+      </w:pPr>
       <w:r>
         <w:rPr>
           <w:rFonts w:ascii="Sylfaen" w:hAnsi="Sylfaen" w:cs="Sylfaen"/>
@@ -4326,7 +3811,9 @@
       </w:r>
     </w:p>
     <w:p>
-      <w:pPr/>
+      <w:pPr>
+        <w:jc w:val="both"/>
+      </w:pPr>
       <w:r>
         <w:rPr>
           <w:rFonts w:ascii="Sylfaen" w:hAnsi="Sylfaen" w:cs="Sylfaen"/>
@@ -4337,7 +3824,9 @@
       </w:r>
     </w:p>
     <w:p>
-      <w:pPr/>
+      <w:pPr>
+        <w:jc w:val="both"/>
+      </w:pPr>
       <w:r>
         <w:rPr>
           <w:rFonts w:ascii="Sylfaen" w:hAnsi="Sylfaen" w:cs="Sylfaen"/>
@@ -4348,7 +3837,9 @@
       </w:r>
     </w:p>
     <w:p>
-      <w:pPr/>
+      <w:pPr>
+        <w:jc w:val="both"/>
+      </w:pPr>
       <w:r>
         <w:rPr>
           <w:rFonts w:ascii="Sylfaen" w:hAnsi="Sylfaen" w:cs="Sylfaen"/>
@@ -4359,7 +3850,9 @@
       </w:r>
     </w:p>
     <w:p>
-      <w:pPr/>
+      <w:pPr>
+        <w:jc w:val="both"/>
+      </w:pPr>
       <w:r>
         <w:rPr>
           <w:rFonts w:ascii="Sylfaen" w:hAnsi="Sylfaen" w:cs="Sylfaen"/>
@@ -4380,13 +3873,15 @@
         <w:rPr>
           <w:rFonts w:ascii="Sylfaen" w:hAnsi="Sylfaen" w:cs="Sylfaen"/>
           <w:b/>
-          <w:sz w:val="26"/>
+          <w:sz w:val="28"/>
         </w:rPr>
         <w:t>3.7 ანალიზის გეგმა</w:t>
       </w:r>
     </w:p>
     <w:p>
-      <w:pPr/>
+      <w:pPr>
+        <w:jc w:val="both"/>
+      </w:pPr>
       <w:r>
         <w:rPr>
           <w:rFonts w:ascii="Sylfaen" w:hAnsi="Sylfaen" w:cs="Sylfaen"/>
@@ -4397,7 +3892,9 @@
       </w:r>
     </w:p>
     <w:p>
-      <w:pPr/>
+      <w:pPr>
+        <w:jc w:val="both"/>
+      </w:pPr>
       <w:r>
         <w:rPr>
           <w:rFonts w:ascii="Sylfaen" w:hAnsi="Sylfaen" w:cs="Sylfaen"/>
@@ -4408,7 +3905,9 @@
       </w:r>
     </w:p>
     <w:p>
-      <w:pPr/>
+      <w:pPr>
+        <w:jc w:val="both"/>
+      </w:pPr>
       <w:r>
         <w:rPr>
           <w:rFonts w:ascii="Sylfaen" w:hAnsi="Sylfaen" w:cs="Sylfaen"/>
@@ -4429,13 +3928,15 @@
         <w:rPr>
           <w:rFonts w:ascii="Sylfaen" w:hAnsi="Sylfaen" w:cs="Sylfaen"/>
           <w:b/>
-          <w:sz w:val="26"/>
+          <w:sz w:val="28"/>
         </w:rPr>
         <w:t>3.8 ეთიკური საკითხები და შეზღუდვები</w:t>
       </w:r>
     </w:p>
     <w:p>
-      <w:pPr/>
+      <w:pPr>
+        <w:jc w:val="both"/>
+      </w:pPr>
       <w:r>
         <w:rPr>
           <w:rFonts w:ascii="Sylfaen" w:hAnsi="Sylfaen" w:cs="Sylfaen"/>
@@ -4446,7 +3947,9 @@
       </w:r>
     </w:p>
     <w:p>
-      <w:pPr/>
+      <w:pPr>
+        <w:jc w:val="both"/>
+      </w:pPr>
       <w:r>
         <w:rPr>
           <w:rFonts w:ascii="Sylfaen" w:hAnsi="Sylfaen" w:cs="Sylfaen"/>
@@ -4457,7 +3960,9 @@
       </w:r>
     </w:p>
     <w:p>
-      <w:pPr/>
+      <w:pPr>
+        <w:jc w:val="both"/>
+      </w:pPr>
       <w:r>
         <w:rPr>
           <w:rFonts w:ascii="Sylfaen" w:hAnsi="Sylfaen" w:cs="Sylfaen"/>
@@ -4468,7 +3973,9 @@
       </w:r>
     </w:p>
     <w:p>
-      <w:pPr/>
+      <w:pPr>
+        <w:jc w:val="both"/>
+      </w:pPr>
       <w:r>
         <w:rPr>
           <w:rFonts w:ascii="Sylfaen" w:hAnsi="Sylfaen" w:cs="Sylfaen"/>
@@ -4479,7 +3986,9 @@
       </w:r>
     </w:p>
     <w:p>
-      <w:pPr/>
+      <w:pPr>
+        <w:jc w:val="both"/>
+      </w:pPr>
       <w:r>
         <w:rPr>
           <w:rFonts w:ascii="Sylfaen" w:hAnsi="Sylfaen" w:cs="Sylfaen"/>
@@ -4507,7 +4016,9 @@
       </w:r>
     </w:p>
     <w:p>
-      <w:pPr/>
+      <w:pPr>
+        <w:jc w:val="both"/>
+      </w:pPr>
       <w:r>
         <w:rPr>
           <w:rFonts w:ascii="Sylfaen" w:hAnsi="Sylfaen" w:cs="Sylfaen"/>
@@ -4528,13 +4039,15 @@
         <w:rPr>
           <w:rFonts w:ascii="Sylfaen" w:hAnsi="Sylfaen" w:cs="Sylfaen"/>
           <w:b/>
-          <w:sz w:val="26"/>
+          <w:sz w:val="28"/>
         </w:rPr>
         <w:t>4.1 კონცეფციის დამტკიცება: მასშტაბი და სიზუსტე</w:t>
       </w:r>
     </w:p>
     <w:p>
-      <w:pPr/>
+      <w:pPr>
+        <w:jc w:val="both"/>
+      </w:pPr>
       <w:r>
         <w:rPr>
           <w:rFonts w:ascii="Sylfaen" w:hAnsi="Sylfaen" w:cs="Sylfaen"/>
@@ -4573,15 +4086,15 @@
         <w:tblW w:type="auto" w:w="0"/>
         <w:tblLayout w:type="fixed"/>
         <w:tblLook w:firstColumn="1" w:firstRow="1" w:lastColumn="0" w:lastRow="0" w:noHBand="0" w:noVBand="1" w:val="04A0"/>
+        <w:tblLayout w:type="fixed"/>
         <w:tblBorders>
-          <w:top w:val="single" w:sz="4" w:space="0" w:color="000000"/>
-          <w:left w:val="single" w:sz="4" w:space="0" w:color="000000"/>
-          <w:bottom w:val="single" w:sz="4" w:space="0" w:color="000000"/>
-          <w:right w:val="single" w:sz="4" w:space="0" w:color="000000"/>
-          <w:insideH w:val="single" w:sz="4" w:space="0" w:color="000000"/>
-          <w:insideV w:val="single" w:sz="4" w:space="0" w:color="000000"/>
+          <w:top w:val="single" w:sz="4" w:space="0" w:color="auto"/>
+          <w:left w:val="single" w:sz="4" w:space="0" w:color="auto"/>
+          <w:bottom w:val="single" w:sz="4" w:space="0" w:color="auto"/>
+          <w:right w:val="single" w:sz="4" w:space="0" w:color="auto"/>
+          <w:insideH w:val="single" w:sz="4" w:space="0" w:color="auto"/>
+          <w:insideV w:val="single" w:sz="4" w:space="0" w:color="auto"/>
         </w:tblBorders>
-        <w:tblLayout w:type="fixed"/>
       </w:tblPr>
       <w:tblGrid>
         <w:gridCol w:w="4167"/>
@@ -4934,7 +4447,9 @@
       <w:pPr/>
     </w:p>
     <w:p>
-      <w:pPr/>
+      <w:pPr>
+        <w:jc w:val="both"/>
+      </w:pPr>
       <w:r>
         <w:rPr>
           <w:rFonts w:ascii="Sylfaen" w:hAnsi="Sylfaen" w:cs="Sylfaen"/>
@@ -4955,13 +4470,15 @@
         <w:rPr>
           <w:rFonts w:ascii="Sylfaen" w:hAnsi="Sylfaen" w:cs="Sylfaen"/>
           <w:b/>
-          <w:sz w:val="26"/>
+          <w:sz w:val="28"/>
         </w:rPr>
         <w:t>4.2 ტექნიკური შედეგები</w:t>
       </w:r>
     </w:p>
     <w:p>
-      <w:pPr/>
+      <w:pPr>
+        <w:jc w:val="both"/>
+      </w:pPr>
       <w:r>
         <w:rPr>
           <w:rFonts w:ascii="Sylfaen" w:hAnsi="Sylfaen" w:cs="Sylfaen"/>
@@ -4989,15 +4506,15 @@
         <w:tblW w:type="auto" w:w="0"/>
         <w:tblLayout w:type="fixed"/>
         <w:tblLook w:firstColumn="1" w:firstRow="1" w:lastColumn="0" w:lastRow="0" w:noHBand="0" w:noVBand="1" w:val="04A0"/>
+        <w:tblLayout w:type="fixed"/>
         <w:tblBorders>
-          <w:top w:val="single" w:sz="4" w:space="0" w:color="000000"/>
-          <w:left w:val="single" w:sz="4" w:space="0" w:color="000000"/>
-          <w:bottom w:val="single" w:sz="4" w:space="0" w:color="000000"/>
-          <w:right w:val="single" w:sz="4" w:space="0" w:color="000000"/>
-          <w:insideH w:val="single" w:sz="4" w:space="0" w:color="000000"/>
-          <w:insideV w:val="single" w:sz="4" w:space="0" w:color="000000"/>
+          <w:top w:val="single" w:sz="4" w:space="0" w:color="auto"/>
+          <w:left w:val="single" w:sz="4" w:space="0" w:color="auto"/>
+          <w:bottom w:val="single" w:sz="4" w:space="0" w:color="auto"/>
+          <w:right w:val="single" w:sz="4" w:space="0" w:color="auto"/>
+          <w:insideH w:val="single" w:sz="4" w:space="0" w:color="auto"/>
+          <w:insideV w:val="single" w:sz="4" w:space="0" w:color="auto"/>
         </w:tblBorders>
-        <w:tblLayout w:type="fixed"/>
       </w:tblPr>
       <w:tblGrid>
         <w:gridCol w:w="3266"/>
@@ -5380,7 +4897,9 @@
       <w:pPr/>
     </w:p>
     <w:p>
-      <w:pPr/>
+      <w:pPr>
+        <w:jc w:val="both"/>
+      </w:pPr>
       <w:r>
         <w:rPr>
           <w:rFonts w:ascii="Sylfaen" w:hAnsi="Sylfaen" w:cs="Sylfaen"/>
@@ -5391,7 +4910,9 @@
       </w:r>
     </w:p>
     <w:p>
-      <w:pPr/>
+      <w:pPr>
+        <w:jc w:val="both"/>
+      </w:pPr>
       <w:r>
         <w:rPr>
           <w:rFonts w:ascii="Sylfaen" w:hAnsi="Sylfaen" w:cs="Sylfaen"/>
@@ -5402,7 +4923,9 @@
       </w:r>
     </w:p>
     <w:p>
-      <w:pPr/>
+      <w:pPr>
+        <w:jc w:val="both"/>
+      </w:pPr>
       <w:r>
         <w:rPr>
           <w:rFonts w:ascii="Sylfaen" w:hAnsi="Sylfaen" w:cs="Sylfaen"/>
@@ -5423,13 +4946,15 @@
         <w:rPr>
           <w:rFonts w:ascii="Sylfaen" w:hAnsi="Sylfaen" w:cs="Sylfaen"/>
           <w:b/>
-          <w:sz w:val="26"/>
+          <w:sz w:val="28"/>
         </w:rPr>
         <w:t>4.3 სიმულირებული აღქმის შედეგები</w:t>
       </w:r>
     </w:p>
     <w:p>
-      <w:pPr/>
+      <w:pPr>
+        <w:jc w:val="both"/>
+      </w:pPr>
       <w:r>
         <w:rPr>
           <w:rFonts w:ascii="Sylfaen" w:hAnsi="Sylfaen" w:cs="Sylfaen"/>
@@ -5457,15 +4982,15 @@
         <w:tblW w:type="auto" w:w="0"/>
         <w:tblLayout w:type="fixed"/>
         <w:tblLook w:firstColumn="1" w:firstRow="1" w:lastColumn="0" w:lastRow="0" w:noHBand="0" w:noVBand="1" w:val="04A0"/>
+        <w:tblLayout w:type="fixed"/>
         <w:tblBorders>
-          <w:top w:val="single" w:sz="4" w:space="0" w:color="000000"/>
-          <w:left w:val="single" w:sz="4" w:space="0" w:color="000000"/>
-          <w:bottom w:val="single" w:sz="4" w:space="0" w:color="000000"/>
-          <w:right w:val="single" w:sz="4" w:space="0" w:color="000000"/>
-          <w:insideH w:val="single" w:sz="4" w:space="0" w:color="000000"/>
-          <w:insideV w:val="single" w:sz="4" w:space="0" w:color="000000"/>
+          <w:top w:val="single" w:sz="4" w:space="0" w:color="auto"/>
+          <w:left w:val="single" w:sz="4" w:space="0" w:color="auto"/>
+          <w:bottom w:val="single" w:sz="4" w:space="0" w:color="auto"/>
+          <w:right w:val="single" w:sz="4" w:space="0" w:color="auto"/>
+          <w:insideH w:val="single" w:sz="4" w:space="0" w:color="auto"/>
+          <w:insideV w:val="single" w:sz="4" w:space="0" w:color="auto"/>
         </w:tblBorders>
-        <w:tblLayout w:type="fixed"/>
       </w:tblPr>
       <w:tblGrid>
         <w:gridCol w:w="4671"/>
@@ -6140,7 +5665,9 @@
       <w:pPr/>
     </w:p>
     <w:p>
-      <w:pPr/>
+      <w:pPr>
+        <w:jc w:val="both"/>
+      </w:pPr>
       <w:r>
         <w:rPr>
           <w:rFonts w:ascii="Sylfaen" w:hAnsi="Sylfaen" w:cs="Sylfaen"/>
@@ -6151,7 +5678,9 @@
       </w:r>
     </w:p>
     <w:p>
-      <w:pPr/>
+      <w:pPr>
+        <w:jc w:val="both"/>
+      </w:pPr>
       <w:r>
         <w:rPr>
           <w:rFonts w:ascii="Sylfaen" w:hAnsi="Sylfaen" w:cs="Sylfaen"/>
@@ -6162,7 +5691,9 @@
       </w:r>
     </w:p>
     <w:p>
-      <w:pPr/>
+      <w:pPr>
+        <w:jc w:val="both"/>
+      </w:pPr>
       <w:r>
         <w:rPr>
           <w:rFonts w:ascii="Sylfaen" w:hAnsi="Sylfaen" w:cs="Sylfaen"/>
@@ -6183,13 +5714,15 @@
         <w:rPr>
           <w:rFonts w:ascii="Sylfaen" w:hAnsi="Sylfaen" w:cs="Sylfaen"/>
           <w:b/>
-          <w:sz w:val="26"/>
+          <w:sz w:val="28"/>
         </w:rPr>
         <w:t>4.4 განხილვა</w:t>
       </w:r>
     </w:p>
     <w:p>
-      <w:pPr/>
+      <w:pPr>
+        <w:jc w:val="both"/>
+      </w:pPr>
       <w:r>
         <w:rPr>
           <w:rFonts w:ascii="Sylfaen" w:hAnsi="Sylfaen" w:cs="Sylfaen"/>
@@ -6200,7 +5733,9 @@
       </w:r>
     </w:p>
     <w:p>
-      <w:pPr/>
+      <w:pPr>
+        <w:jc w:val="both"/>
+      </w:pPr>
       <w:r>
         <w:rPr>
           <w:rFonts w:ascii="Sylfaen" w:hAnsi="Sylfaen" w:cs="Sylfaen"/>
@@ -6211,7 +5746,9 @@
       </w:r>
     </w:p>
     <w:p>
-      <w:pPr/>
+      <w:pPr>
+        <w:jc w:val="both"/>
+      </w:pPr>
       <w:r>
         <w:rPr>
           <w:rFonts w:ascii="Sylfaen" w:hAnsi="Sylfaen" w:cs="Sylfaen"/>
@@ -6232,13 +5769,15 @@
         <w:rPr>
           <w:rFonts w:ascii="Sylfaen" w:hAnsi="Sylfaen" w:cs="Sylfaen"/>
           <w:b/>
-          <w:sz w:val="26"/>
+          <w:sz w:val="28"/>
         </w:rPr>
         <w:t>4.5 შეფასების შეზღუდვები</w:t>
       </w:r>
     </w:p>
     <w:p>
-      <w:pPr/>
+      <w:pPr>
+        <w:jc w:val="both"/>
+      </w:pPr>
       <w:r>
         <w:rPr>
           <w:rFonts w:ascii="Sylfaen" w:hAnsi="Sylfaen" w:cs="Sylfaen"/>
@@ -6266,7 +5805,9 @@
       </w:r>
     </w:p>
     <w:p>
-      <w:pPr/>
+      <w:pPr>
+        <w:jc w:val="both"/>
+      </w:pPr>
       <w:r>
         <w:rPr>
           <w:rFonts w:ascii="Sylfaen" w:hAnsi="Sylfaen" w:cs="Sylfaen"/>
@@ -6287,13 +5828,15 @@
         <w:rPr>
           <w:rFonts w:ascii="Sylfaen" w:hAnsi="Sylfaen" w:cs="Sylfaen"/>
           <w:b/>
-          <w:sz w:val="26"/>
+          <w:sz w:val="28"/>
         </w:rPr>
         <w:t>5.1 წვლილის შეჯამება</w:t>
       </w:r>
     </w:p>
     <w:p>
-      <w:pPr/>
+      <w:pPr>
+        <w:jc w:val="both"/>
+      </w:pPr>
       <w:r>
         <w:rPr>
           <w:rFonts w:ascii="Sylfaen" w:hAnsi="Sylfaen" w:cs="Sylfaen"/>
@@ -6314,13 +5857,15 @@
         <w:rPr>
           <w:rFonts w:ascii="Sylfaen" w:hAnsi="Sylfaen" w:cs="Sylfaen"/>
           <w:b/>
-          <w:sz w:val="26"/>
+          <w:sz w:val="28"/>
         </w:rPr>
         <w:t>5.2 შედეგების შეჯამება</w:t>
       </w:r>
     </w:p>
     <w:p>
-      <w:pPr/>
+      <w:pPr>
+        <w:jc w:val="both"/>
+      </w:pPr>
       <w:r>
         <w:rPr>
           <w:rFonts w:ascii="Sylfaen" w:hAnsi="Sylfaen" w:cs="Sylfaen"/>
@@ -6341,13 +5886,15 @@
         <w:rPr>
           <w:rFonts w:ascii="Sylfaen" w:hAnsi="Sylfaen" w:cs="Sylfaen"/>
           <w:b/>
-          <w:sz w:val="26"/>
+          <w:sz w:val="28"/>
         </w:rPr>
         <w:t>5.3 სამომავლო სამუშაო</w:t>
       </w:r>
     </w:p>
     <w:p>
-      <w:pPr/>
+      <w:pPr>
+        <w:jc w:val="both"/>
+      </w:pPr>
       <w:r>
         <w:rPr>
           <w:rFonts w:ascii="Sylfaen" w:hAnsi="Sylfaen" w:cs="Sylfaen"/>
@@ -11361,6 +10908,7 @@
     </w:pPr>
     <w:rPr>
       <w:rFonts w:eastAsiaTheme="majorEastAsia" w:cstheme="majorBidi"/>
+      <w:b/>
       <w:color w:val="2F5496" w:themeColor="accent1" w:themeShade="BF"/>
       <w:sz w:val="28"/>
       <w:szCs w:val="32"/>
@@ -11385,6 +10933,7 @@
       <w:rFonts w:eastAsia="Times New Roman" w:cs="Times New Roman"/>
       <w:b/>
       <w:bCs/>
+      <w:sz w:val="28"/>
       <w:szCs w:val="36"/>
     </w:rPr>
   </w:style>

</xml_diff>

<commit_message>
polish(thesis): cohesive §1 intro + schema-valid docx (validator-clean)
- §1 Introduction rendered cohesively: subsection headings become bold run-in
  lead-ins (flowing prose, no numbered sub-headings), matching the passed GTU
  reference; gated behind COHESIVE_CHAPTERS={'1'}. §2/§3 keep subsections.
- Fix OOXML schema ordering flagged by the docx-skill validator:
  * tblBorders inserted in schema order (before tblLayout/tblLook); drop the
    duplicate tblLayout (autofit=False already emits an ordered one)
  * updateFields placed after characterSpacingControl (was first child)
  Result: `All validations PASSED` — strict-parser / plagiarism-ingest safe.

Co-Authored-By: Claude Opus 4.8 <noreply@anthropic.com>
</commit_message>
<xml_diff>
--- a/project/thesis-ka.docx
+++ b/project/thesis-ka.docx
@@ -12,39 +12,210 @@
           <w:b/>
         </w:rPr>
       </w:pPr>
-      <w:r>
+      <w:bookmarkStart w:id="0" w:name="_Hlk108034490"/>
+      <w:r>
+        <w:rPr>
+          <w:b/>
+          <w:noProof/>
+          <w:lang w:val="ka-GE"/>
+        </w:rPr>
+        <mc:AlternateContent>
+          <mc:Choice Requires="wps">
+            <w:drawing>
+              <wp:anchor distT="0" distB="0" distL="114300" distR="114300" simplePos="0" relativeHeight="251660288" behindDoc="0" locked="0" layoutInCell="1" allowOverlap="1" wp14:anchorId="0D11978C" wp14:editId="4B61D8D2">
+                <wp:simplePos x="0" y="0"/>
+                <wp:positionH relativeFrom="column">
+                  <wp:posOffset>3701415</wp:posOffset>
+                </wp:positionH>
+                <wp:positionV relativeFrom="paragraph">
+                  <wp:posOffset>5236845</wp:posOffset>
+                </wp:positionV>
+                <wp:extent cx="3124200" cy="391795"/>
+                <wp:effectExtent l="0" t="1270" r="3810" b="0"/>
+                <wp:wrapNone/>
+                <wp:docPr id="760413624" name="Text Box 5"/>
+                <wp:cNvGraphicFramePr>
+                  <a:graphicFrameLocks xmlns:a="http://schemas.openxmlformats.org/drawingml/2006/main"/>
+                </wp:cNvGraphicFramePr>
+                <a:graphic xmlns:a="http://schemas.openxmlformats.org/drawingml/2006/main">
+                  <a:graphicData uri="http://schemas.microsoft.com/office/word/2010/wordprocessingShape">
+                    <wps:wsp>
+                      <wps:cNvSpPr txBox="1">
+                        <a:spLocks noChangeArrowheads="1"/>
+                      </wps:cNvSpPr>
+                      <wps:spPr bwMode="auto">
+                        <a:xfrm>
+                          <a:off x="0" y="0"/>
+                          <a:ext cx="3124200" cy="391795"/>
+                        </a:xfrm>
+                        <a:prstGeom prst="rect">
+                          <a:avLst/>
+                        </a:prstGeom>
+                        <a:solidFill>
+                          <a:srgbClr val="FFFFFF"/>
+                        </a:solidFill>
+                        <a:ln>
+                          <a:noFill/>
+                        </a:ln>
+                        <a:extLst>
+                          <a:ext uri="{91240B29-F687-4F45-9708-019B960494DF}">
+                            <a14:hiddenLine xmlns:a14="http://schemas.microsoft.com/office/drawing/2010/main" w="9525">
+                              <a:solidFill>
+                                <a:srgbClr val="000000"/>
+                              </a:solidFill>
+                              <a:miter lim="800000"/>
+                              <a:headEnd/>
+                              <a:tailEnd/>
+                            </a14:hiddenLine>
+                          </a:ext>
+                        </a:extLst>
+                      </wps:spPr>
+                      <wps:txbx>
+                        <w:txbxContent>
+                          <w:p>
+                            <w:pPr>
+                              <w:jc w:val="right"/>
+                              <w:rPr>
+                                <w:b/>
+                                <w:bCs/>
+                                <w:szCs w:val="24"/>
+                                <w:lang w:val="ka-GE"/>
+                              </w:rPr>
+                            </w:pPr>
+                            <w:r>
+                              <w:rPr>
+                                <w:b/>
+                                <w:bCs/>
+                                <w:szCs w:val="24"/>
+                                <w:lang w:val="ka-GE"/>
+                              </w:rPr>
+                              <w:t xml:space="preserve">ალექსანდრე იმნაიშვილი </w:t>
+                            </w:r>
+                          </w:p>
+                        </w:txbxContent>
+                      </wps:txbx>
+                      <wps:bodyPr rot="0" vert="horz" wrap="square" lIns="91440" tIns="45720" rIns="91440" bIns="45720" anchor="t" anchorCtr="0" upright="1">
+                        <a:noAutofit/>
+                      </wps:bodyPr>
+                    </wps:wsp>
+                  </a:graphicData>
+                </a:graphic>
+                <wp14:sizeRelH relativeFrom="page">
+                  <wp14:pctWidth>0</wp14:pctWidth>
+                </wp14:sizeRelH>
+                <wp14:sizeRelV relativeFrom="page">
+                  <wp14:pctHeight>0</wp14:pctHeight>
+                </wp14:sizeRelV>
+              </wp:anchor>
+            </w:drawing>
+          </mc:Choice>
+          <mc:Fallback>
+            <w:pict>
+              <v:shapetype w14:anchorId="0D11978C" id="_x0000_t202" coordsize="21600,21600" o:spt="202" path="m,l,21600r21600,l21600,xe">
+                <v:stroke joinstyle="miter"/>
+                <v:path gradientshapeok="t" o:connecttype="rect"/>
+              </v:shapetype>
+              <v:shape id="Text Box 5" o:spid="_x0000_s1026" type="#_x0000_t202" style="position:absolute;left:0;text-align:left;margin-left:291.45pt;margin-top:412.35pt;width:246pt;height:30.85pt;z-index:251660288;visibility:visible;mso-wrap-style:square;mso-width-percent:0;mso-height-percent:0;mso-wrap-distance-left:9pt;mso-wrap-distance-top:0;mso-wrap-distance-right:9pt;mso-wrap-distance-bottom:0;mso-position-horizontal:absolute;mso-position-horizontal-relative:text;mso-position-vertical:absolute;mso-position-vertical-relative:text;mso-width-percent:0;mso-height-percent:0;mso-width-relative:page;mso-height-relative:page;v-text-anchor:top" o:gfxdata="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" stroked="f">
+                <v:textbox>
+                  <w:txbxContent>
+                    <w:p>
+                      <w:pPr>
+                        <w:jc w:val="right"/>
+                        <w:rPr>
+                          <w:b/>
+                          <w:bCs/>
+                          <w:szCs w:val="24"/>
+                          <w:lang w:val="ka-GE"/>
+                        </w:rPr>
+                      </w:pPr>
+                      <w:r>
+                        <w:rPr>
+                          <w:b/>
+                          <w:bCs/>
+                          <w:szCs w:val="24"/>
+                          <w:lang w:val="ka-GE"/>
+                        </w:rPr>
+                        <w:t xml:space="preserve">ალექსანდრე იმნაიშვილი </w:t>
+                      </w:r>
+                    </w:p>
+                  </w:txbxContent>
+                </v:textbox>
+              </v:shape>
+            </w:pict>
+          </mc:Fallback>
+        </mc:AlternateContent>
+      </w:r>
+      <w:r>
+        <w:rPr>
+          <w:noProof/>
+        </w:rPr>
         <w:drawing>
-          <wp:inline xmlns:a="http://schemas.openxmlformats.org/drawingml/2006/main" xmlns:pic="http://schemas.openxmlformats.org/drawingml/2006/picture">
-            <wp:extent cx="3960000" cy="3493333"/>
-            <wp:docPr id="1" name="Picture 1"/>
+          <wp:anchor distT="0" distB="0" distL="114300" distR="114300" simplePos="0" relativeHeight="251659264" behindDoc="1" locked="0" layoutInCell="1" allowOverlap="1" wp14:anchorId="3F0A66AC" wp14:editId="6F4A0310">
+            <wp:simplePos x="0" y="0"/>
+            <wp:positionH relativeFrom="margin">
+              <wp:posOffset>161925</wp:posOffset>
+            </wp:positionH>
+            <wp:positionV relativeFrom="margin">
+              <wp:posOffset>-1083945</wp:posOffset>
+            </wp:positionV>
+            <wp:extent cx="6869430" cy="6234430"/>
+            <wp:effectExtent l="0" t="0" r="7620" b="0"/>
+            <wp:wrapSquare wrapText="bothSides"/>
+            <wp:docPr id="927800283" name="Picture 6" descr="A purple rectangle with white text&#10;&#10;Description automatically generated with low confidence"/>
             <wp:cNvGraphicFramePr>
-              <a:graphicFrameLocks noChangeAspect="1"/>
+              <a:graphicFrameLocks xmlns:a="http://schemas.openxmlformats.org/drawingml/2006/main" noChangeAspect="1"/>
             </wp:cNvGraphicFramePr>
-            <a:graphic>
+            <a:graphic xmlns:a="http://schemas.openxmlformats.org/drawingml/2006/main">
               <a:graphicData uri="http://schemas.openxmlformats.org/drawingml/2006/picture">
-                <pic:pic>
+                <pic:pic xmlns:pic="http://schemas.openxmlformats.org/drawingml/2006/picture">
                   <pic:nvPicPr>
-                    <pic:cNvPr id="0" name="image.png"/>
-                    <pic:cNvPicPr/>
+                    <pic:cNvPr id="927800283" name="Picture 6" descr="A purple rectangle with white text&#10;&#10;Description automatically generated with low confidence"/>
+                    <pic:cNvPicPr>
+                      <a:picLocks noChangeAspect="1" noChangeArrowheads="1"/>
+                    </pic:cNvPicPr>
                   </pic:nvPicPr>
                   <pic:blipFill>
-                    <a:blip r:embed="rId8"/>
+                    <a:blip r:embed="rId8">
+                      <a:extLst>
+                        <a:ext uri="{28A0092B-C50C-407E-A947-70E740481C1C}">
+                          <a14:useLocalDpi xmlns:a14="http://schemas.microsoft.com/office/drawing/2010/main" val="0"/>
+                        </a:ext>
+                      </a:extLst>
+                    </a:blip>
+                    <a:srcRect l="4326" t="2664" r="4613" b="3600"/>
                     <a:stretch>
                       <a:fillRect/>
                     </a:stretch>
                   </pic:blipFill>
-                  <pic:spPr>
+                  <pic:spPr bwMode="auto">
                     <a:xfrm>
                       <a:off x="0" y="0"/>
-                      <a:ext cx="3960000" cy="3493333"/>
+                      <a:ext cx="6869430" cy="6234430"/>
                     </a:xfrm>
-                    <a:prstGeom prst="rect"/>
+                    <a:prstGeom prst="rect">
+                      <a:avLst/>
+                    </a:prstGeom>
+                    <a:noFill/>
+                    <a:ln>
+                      <a:noFill/>
+                    </a:ln>
                   </pic:spPr>
                 </pic:pic>
               </a:graphicData>
             </a:graphic>
-          </wp:inline>
+            <wp14:sizeRelH relativeFrom="page">
+              <wp14:pctWidth>0</wp14:pctWidth>
+            </wp14:sizeRelH>
+            <wp14:sizeRelV relativeFrom="page">
+              <wp14:pctHeight>0</wp14:pctHeight>
+            </wp14:sizeRelV>
+          </wp:anchor>
         </w:drawing>
+      </w:r>
+      <w:r>
+        <w:rPr>
+          <w:b/>
+        </w:rPr>
       </w:r>
     </w:p>
     <w:p>
@@ -57,24 +228,177 @@
           <w:lang w:val="ka-GE"/>
         </w:rPr>
       </w:pPr>
-    </w:p>
-    <w:p>
-      <w:pPr>
-        <w:pStyle w:val="BodyText"/>
-        <w:spacing w:before="120" w:after="240"/>
-        <w:jc w:val="right"/>
+      <w:r>
         <w:rPr>
           <w:b/>
-          <w:lang w:val="ka-GE"/>
-        </w:rPr>
-      </w:pPr>
-      <w:r>
-        <w:rPr>
-          <w:rFonts w:ascii="Sylfaen" w:hAnsi="Sylfaen"/>
-          <w:b/>
-          <w:sz w:val="24"/>
-        </w:rPr>
-        <w:t>ალექსანდრე იმნაიშვილი</w:t>
+          <w:noProof/>
+          <w:lang w:val="ka-GE"/>
+        </w:rPr>
+        <mc:AlternateContent>
+          <mc:Choice Requires="wps">
+            <w:drawing>
+              <wp:anchor distT="0" distB="0" distL="114300" distR="114300" simplePos="0" relativeHeight="251661312" behindDoc="0" locked="0" layoutInCell="1" allowOverlap="1" wp14:anchorId="76EF9F23" wp14:editId="2315207D">
+                <wp:simplePos x="0" y="0"/>
+                <wp:positionH relativeFrom="column">
+                  <wp:posOffset>185420</wp:posOffset>
+                </wp:positionH>
+                <wp:positionV relativeFrom="paragraph">
+                  <wp:posOffset>60325</wp:posOffset>
+                </wp:positionV>
+                <wp:extent cx="5040630" cy="848995"/>
+                <wp:effectExtent l="4445" t="4445" r="3175" b="3810"/>
+                <wp:wrapNone/>
+                <wp:docPr id="102204832" name="Text Box 4"/>
+                <wp:cNvGraphicFramePr>
+                  <a:graphicFrameLocks xmlns:a="http://schemas.openxmlformats.org/drawingml/2006/main"/>
+                </wp:cNvGraphicFramePr>
+                <a:graphic xmlns:a="http://schemas.openxmlformats.org/drawingml/2006/main">
+                  <a:graphicData uri="http://schemas.microsoft.com/office/word/2010/wordprocessingShape">
+                    <wps:wsp>
+                      <wps:cNvSpPr txBox="1">
+                        <a:spLocks noChangeArrowheads="1"/>
+                      </wps:cNvSpPr>
+                      <wps:spPr bwMode="auto">
+                        <a:xfrm>
+                          <a:off x="0" y="0"/>
+                          <a:ext cx="5040630" cy="848995"/>
+                        </a:xfrm>
+                        <a:prstGeom prst="rect">
+                          <a:avLst/>
+                        </a:prstGeom>
+                        <a:solidFill>
+                          <a:srgbClr val="FFFFFF"/>
+                        </a:solidFill>
+                        <a:ln>
+                          <a:noFill/>
+                        </a:ln>
+                        <a:extLst>
+                          <a:ext uri="{91240B29-F687-4F45-9708-019B960494DF}">
+                            <a14:hiddenLine xmlns:a14="http://schemas.microsoft.com/office/drawing/2010/main" w="9525">
+                              <a:solidFill>
+                                <a:srgbClr val="000000"/>
+                              </a:solidFill>
+                              <a:miter lim="800000"/>
+                              <a:headEnd/>
+                              <a:tailEnd/>
+                            </a14:hiddenLine>
+                          </a:ext>
+                        </a:extLst>
+                      </wps:spPr>
+                      <wps:txbx>
+                        <w:txbxContent>
+                          <w:p>
+                            <w:pPr>
+                              <w:rPr>
+                                <w:b/>
+                                <w:bCs/>
+                                <w:sz w:val="32"/>
+                                <w:szCs w:val="32"/>
+                                <w:lang w:val="ka-GE"/>
+                              </w:rPr>
+                            </w:pPr>
+                            <w:r>
+                              <w:rPr>
+                                <w:b/>
+                                <w:bCs/>
+                                <w:sz w:val="32"/>
+                                <w:szCs w:val="32"/>
+                                <w:lang w:val="ka-GE"/>
+                              </w:rPr>
+                              <w:t xml:space="preserve">სასაუბრო ხელოვნური ინტელექტი: ასისტენტიდან თანამოსაუბრემდე ევოლუცია </w:t>
+                            </w:r>
+                          </w:p>
+                          <w:p>
+                            <w:pPr>
+                              <w:rPr>
+                                <w:b/>
+                                <w:bCs/>
+                                <w:sz w:val="32"/>
+                                <w:szCs w:val="32"/>
+                                <w:lang w:val="ka-GE"/>
+                              </w:rPr>
+                            </w:pPr>
+                            <w:r>
+                              <w:rPr>
+                                <w:b/>
+                                <w:bCs/>
+                                <w:sz w:val="32"/>
+                                <w:szCs w:val="32"/>
+                                <w:lang w:val="ka-GE"/>
+                              </w:rPr>
+                              <w:t xml:space="preserve"/>
+                            </w:r>
+                          </w:p>
+                        </w:txbxContent>
+                      </wps:txbx>
+                      <wps:bodyPr rot="0" vert="horz" wrap="square" lIns="91440" tIns="45720" rIns="91440" bIns="45720" anchor="t" anchorCtr="0" upright="1">
+                        <a:noAutofit/>
+                      </wps:bodyPr>
+                    </wps:wsp>
+                  </a:graphicData>
+                </a:graphic>
+                <wp14:sizeRelH relativeFrom="page">
+                  <wp14:pctWidth>0</wp14:pctWidth>
+                </wp14:sizeRelH>
+                <wp14:sizeRelV relativeFrom="page">
+                  <wp14:pctHeight>0</wp14:pctHeight>
+                </wp14:sizeRelV>
+              </wp:anchor>
+            </w:drawing>
+          </mc:Choice>
+          <mc:Fallback>
+            <w:pict>
+              <v:shape w14:anchorId="76EF9F23" id="Text Box 4" o:spid="_x0000_s1027" type="#_x0000_t202" style="position:absolute;left:0;text-align:left;margin-left:14.6pt;margin-top:4.75pt;width:396.9pt;height:66.85pt;z-index:251661312;visibility:visible;mso-wrap-style:square;mso-width-percent:0;mso-height-percent:0;mso-wrap-distance-left:9pt;mso-wrap-distance-top:0;mso-wrap-distance-right:9pt;mso-wrap-distance-bottom:0;mso-position-horizontal:absolute;mso-position-horizontal-relative:text;mso-position-vertical:absolute;mso-position-vertical-relative:text;mso-width-percent:0;mso-height-percent:0;mso-width-relative:page;mso-height-relative:page;v-text-anchor:top" o:gfxdata="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" stroked="f">
+                <v:textbox>
+                  <w:txbxContent>
+                    <w:p>
+                      <w:pPr>
+                        <w:rPr>
+                          <w:b/>
+                          <w:bCs/>
+                          <w:sz w:val="32"/>
+                          <w:szCs w:val="32"/>
+                          <w:lang w:val="ka-GE"/>
+                        </w:rPr>
+                      </w:pPr>
+                      <w:r>
+                        <w:rPr>
+                          <w:b/>
+                          <w:bCs/>
+                          <w:sz w:val="32"/>
+                          <w:szCs w:val="32"/>
+                          <w:lang w:val="ka-GE"/>
+                        </w:rPr>
+                        <w:t xml:space="preserve">სასაუბრო ხელოვნური ინტელექტი: ასისტენტიდან თანამოსაუბრემდე ევოლუცია </w:t>
+                      </w:r>
+                    </w:p>
+                    <w:p>
+                      <w:pPr>
+                        <w:rPr>
+                          <w:b/>
+                          <w:bCs/>
+                          <w:sz w:val="32"/>
+                          <w:szCs w:val="32"/>
+                          <w:lang w:val="ka-GE"/>
+                        </w:rPr>
+                      </w:pPr>
+                      <w:r>
+                        <w:rPr>
+                          <w:b/>
+                          <w:bCs/>
+                          <w:sz w:val="32"/>
+                          <w:szCs w:val="32"/>
+                          <w:lang w:val="ka-GE"/>
+                        </w:rPr>
+                        <w:t xml:space="preserve"/>
+                      </w:r>
+                    </w:p>
+                  </w:txbxContent>
+                </v:textbox>
+              </v:shape>
+            </w:pict>
+          </mc:Fallback>
+        </mc:AlternateContent>
       </w:r>
     </w:p>
     <w:p>
@@ -92,20 +416,12 @@
       <w:pPr>
         <w:pStyle w:val="BodyText"/>
         <w:spacing w:before="120" w:after="240"/>
-        <w:jc w:val="left"/>
+        <w:jc w:val="center"/>
         <w:rPr>
           <w:b/>
           <w:lang w:val="ka-GE"/>
         </w:rPr>
       </w:pPr>
-      <w:r>
-        <w:rPr>
-          <w:rFonts w:ascii="Sylfaen" w:hAnsi="Sylfaen"/>
-          <w:b/>
-          <w:sz w:val="32"/>
-        </w:rPr>
-        <w:t>სასაუბრო ხელოვნური ინტელექტი: ასისტენტიდან თანამოსაუბრემდე ევოლუცია</w:t>
-      </w:r>
     </w:p>
     <w:p>
       <w:pPr>
@@ -122,20 +438,12 @@
       <w:pPr>
         <w:pStyle w:val="BodyText"/>
         <w:spacing w:before="120" w:after="240"/>
-        <w:jc w:val="left"/>
+        <w:jc w:val="center"/>
         <w:rPr>
           <w:b/>
           <w:lang w:val="ka-GE"/>
         </w:rPr>
       </w:pPr>
-      <w:r>
-        <w:rPr>
-          <w:rFonts w:ascii="Sylfaen" w:hAnsi="Sylfaen"/>
-          <w:b/>
-          <w:sz w:val="32"/>
-        </w:rPr>
-        <w:t>შიფრი</w:t>
-      </w:r>
     </w:p>
     <w:p>
       <w:pPr>
@@ -147,6 +455,386 @@
           <w:lang w:val="ka-GE"/>
         </w:rPr>
       </w:pPr>
+      <w:r>
+        <w:rPr>
+          <w:b/>
+          <w:noProof/>
+          <w:lang w:val="ka-GE"/>
+        </w:rPr>
+        <mc:AlternateContent>
+          <mc:Choice Requires="wps">
+            <w:drawing>
+              <wp:anchor distT="0" distB="0" distL="114300" distR="114300" simplePos="0" relativeHeight="251663360" behindDoc="0" locked="0" layoutInCell="1" allowOverlap="1" wp14:anchorId="61B8F447" wp14:editId="292AC5D1">
+                <wp:simplePos x="0" y="0"/>
+                <wp:positionH relativeFrom="column">
+                  <wp:posOffset>3613785</wp:posOffset>
+                </wp:positionH>
+                <wp:positionV relativeFrom="paragraph">
+                  <wp:posOffset>320675</wp:posOffset>
+                </wp:positionV>
+                <wp:extent cx="3396615" cy="1076960"/>
+                <wp:effectExtent l="3810" t="635" r="0" b="0"/>
+                <wp:wrapNone/>
+                <wp:docPr id="1124531779" name="Text Box 3"/>
+                <wp:cNvGraphicFramePr>
+                  <a:graphicFrameLocks xmlns:a="http://schemas.openxmlformats.org/drawingml/2006/main"/>
+                </wp:cNvGraphicFramePr>
+                <a:graphic xmlns:a="http://schemas.openxmlformats.org/drawingml/2006/main">
+                  <a:graphicData uri="http://schemas.microsoft.com/office/word/2010/wordprocessingShape">
+                    <wps:wsp>
+                      <wps:cNvSpPr txBox="1">
+                        <a:spLocks noChangeArrowheads="1"/>
+                      </wps:cNvSpPr>
+                      <wps:spPr bwMode="auto">
+                        <a:xfrm>
+                          <a:off x="0" y="0"/>
+                          <a:ext cx="3396615" cy="1076960"/>
+                        </a:xfrm>
+                        <a:prstGeom prst="rect">
+                          <a:avLst/>
+                        </a:prstGeom>
+                        <a:solidFill>
+                          <a:srgbClr val="FFFFFF"/>
+                        </a:solidFill>
+                        <a:ln>
+                          <a:noFill/>
+                        </a:ln>
+                        <a:extLst>
+                          <a:ext uri="{91240B29-F687-4F45-9708-019B960494DF}">
+                            <a14:hiddenLine xmlns:a14="http://schemas.microsoft.com/office/drawing/2010/main" w="9525">
+                              <a:solidFill>
+                                <a:srgbClr val="000000"/>
+                              </a:solidFill>
+                              <a:miter lim="800000"/>
+                              <a:headEnd/>
+                              <a:tailEnd/>
+                            </a14:hiddenLine>
+                          </a:ext>
+                        </a:extLst>
+                      </wps:spPr>
+                      <wps:txbx>
+                        <w:txbxContent>
+                          <w:p>
+                            <w:pPr>
+                              <w:jc w:val="right"/>
+                              <w:rPr>
+                                <w:rFonts w:cs="Calibri"/>
+                                <w:lang w:val="ka-GE"/>
+                              </w:rPr>
+                            </w:pPr>
+                            <w:r>
+                              <w:rPr>
+                                <w:rFonts w:cs="Calibri"/>
+                                <w:lang w:val="ka-GE"/>
+                              </w:rPr>
+                              <w:t xml:space="preserve">საქართველოს </w:t>
+                            </w:r>
+                            <w:r>
+                              <w:rPr>
+                                <w:rFonts w:cs="Calibri"/>
+                                <w:lang w:val="ka-GE"/>
+                              </w:rPr>
+                              <w:t>ტექნიკური უნივერსიტეტი</w:t>
+                            </w:r>
+                          </w:p>
+                          <w:p>
+                            <w:pPr>
+                              <w:jc w:val="right"/>
+                              <w:rPr>
+                                <w:rFonts w:cs="Calibri"/>
+                                <w:lang w:val="ka-GE"/>
+                              </w:rPr>
+                            </w:pPr>
+                            <w:r>
+                              <w:rPr>
+                                <w:rFonts w:cs="Calibri"/>
+                                <w:lang w:val="ka-GE"/>
+                              </w:rPr>
+                              <w:t>თბილისი, 0160, საქართველო</w:t>
+                            </w:r>
+                          </w:p>
+                          <w:p>
+                            <w:pPr>
+                              <w:jc w:val="right"/>
+                              <w:rPr>
+                                <w:rFonts w:cs="Calibri"/>
+                                <w:lang w:val="ka-GE"/>
+                              </w:rPr>
+                            </w:pPr>
+                            <w:r>
+                              <w:rPr>
+                                <w:rFonts w:cs="Calibri"/>
+                                <w:lang w:val="ka-GE"/>
+                              </w:rPr>
+                              <w:t xml:space="preserve"> ივლისი, 2026 წელი</w:t>
+                            </w:r>
+                          </w:p>
+                          <w:p>
+                            <w:pPr>
+                              <w:jc w:val="right"/>
+                              <w:rPr>
+                                <w:rFonts w:cs="Calibri"/>
+                                <w:sz w:val="20"/>
+                                <w:szCs w:val="20"/>
+                              </w:rPr>
+                            </w:pPr>
+                          </w:p>
+                        </w:txbxContent>
+                      </wps:txbx>
+                      <wps:bodyPr rot="0" vert="horz" wrap="square" lIns="91440" tIns="45720" rIns="91440" bIns="45720" anchor="t" anchorCtr="0" upright="1">
+                        <a:noAutofit/>
+                      </wps:bodyPr>
+                    </wps:wsp>
+                  </a:graphicData>
+                </a:graphic>
+                <wp14:sizeRelH relativeFrom="page">
+                  <wp14:pctWidth>0</wp14:pctWidth>
+                </wp14:sizeRelH>
+                <wp14:sizeRelV relativeFrom="page">
+                  <wp14:pctHeight>0</wp14:pctHeight>
+                </wp14:sizeRelV>
+              </wp:anchor>
+            </w:drawing>
+          </mc:Choice>
+          <mc:Fallback>
+            <w:pict>
+              <v:shape w14:anchorId="61B8F447" id="Text Box 3" o:spid="_x0000_s1028" type="#_x0000_t202" style="position:absolute;left:0;text-align:left;margin-left:284.55pt;margin-top:25.25pt;width:267.45pt;height:84.8pt;z-index:251663360;visibility:visible;mso-wrap-style:square;mso-width-percent:0;mso-height-percent:0;mso-wrap-distance-left:9pt;mso-wrap-distance-top:0;mso-wrap-distance-right:9pt;mso-wrap-distance-bottom:0;mso-position-horizontal:absolute;mso-position-horizontal-relative:text;mso-position-vertical:absolute;mso-position-vertical-relative:text;mso-width-percent:0;mso-height-percent:0;mso-width-relative:page;mso-height-relative:page;v-text-anchor:top" o:gfxdata="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" stroked="f">
+                <v:textbox>
+                  <w:txbxContent>
+                    <w:p>
+                      <w:pPr>
+                        <w:jc w:val="right"/>
+                        <w:rPr>
+                          <w:rFonts w:cs="Calibri"/>
+                          <w:lang w:val="ka-GE"/>
+                        </w:rPr>
+                      </w:pPr>
+                      <w:r>
+                        <w:rPr>
+                          <w:rFonts w:cs="Calibri"/>
+                          <w:lang w:val="ka-GE"/>
+                        </w:rPr>
+                        <w:t xml:space="preserve">საქართველოს </w:t>
+                      </w:r>
+                      <w:r>
+                        <w:rPr>
+                          <w:rFonts w:cs="Calibri"/>
+                          <w:lang w:val="ka-GE"/>
+                        </w:rPr>
+                        <w:t>ტექნიკური უნივერსიტეტი</w:t>
+                      </w:r>
+                    </w:p>
+                    <w:p>
+                      <w:pPr>
+                        <w:jc w:val="right"/>
+                        <w:rPr>
+                          <w:rFonts w:cs="Calibri"/>
+                          <w:lang w:val="ka-GE"/>
+                        </w:rPr>
+                      </w:pPr>
+                      <w:r>
+                        <w:rPr>
+                          <w:rFonts w:cs="Calibri"/>
+                          <w:lang w:val="ka-GE"/>
+                        </w:rPr>
+                        <w:t>თბილისი, 0160, საქართველო</w:t>
+                      </w:r>
+                    </w:p>
+                    <w:p>
+                      <w:pPr>
+                        <w:jc w:val="right"/>
+                        <w:rPr>
+                          <w:rFonts w:cs="Calibri"/>
+                          <w:lang w:val="ka-GE"/>
+                        </w:rPr>
+                      </w:pPr>
+                      <w:r>
+                        <w:rPr>
+                          <w:rFonts w:cs="Calibri"/>
+                          <w:lang w:val="ka-GE"/>
+                        </w:rPr>
+                        <w:t xml:space="preserve"> ივლისი, 2026 წელი</w:t>
+                      </w:r>
+                    </w:p>
+                    <w:p>
+                      <w:pPr>
+                        <w:jc w:val="right"/>
+                        <w:rPr>
+                          <w:rFonts w:cs="Calibri"/>
+                          <w:sz w:val="20"/>
+                          <w:szCs w:val="20"/>
+                        </w:rPr>
+                      </w:pPr>
+                    </w:p>
+                  </w:txbxContent>
+                </v:textbox>
+              </v:shape>
+            </w:pict>
+          </mc:Fallback>
+        </mc:AlternateContent>
+      </w:r>
+      <w:r>
+        <w:rPr>
+          <w:b/>
+          <w:noProof/>
+          <w:lang w:val="ka-GE"/>
+        </w:rPr>
+        <mc:AlternateContent>
+          <mc:Choice Requires="wps">
+            <w:drawing>
+              <wp:anchor distT="0" distB="0" distL="114300" distR="114300" simplePos="0" relativeHeight="251662336" behindDoc="0" locked="0" layoutInCell="1" allowOverlap="1" wp14:anchorId="0F803DA9" wp14:editId="0E854167">
+                <wp:simplePos x="0" y="0"/>
+                <wp:positionH relativeFrom="column">
+                  <wp:posOffset>196215</wp:posOffset>
+                </wp:positionH>
+                <wp:positionV relativeFrom="paragraph">
+                  <wp:posOffset>265430</wp:posOffset>
+                </wp:positionV>
+                <wp:extent cx="3232785" cy="381000"/>
+                <wp:effectExtent l="0" t="2540" r="0" b="0"/>
+                <wp:wrapNone/>
+                <wp:docPr id="1346965493" name="Text Box 2"/>
+                <wp:cNvGraphicFramePr>
+                  <a:graphicFrameLocks xmlns:a="http://schemas.openxmlformats.org/drawingml/2006/main"/>
+                </wp:cNvGraphicFramePr>
+                <a:graphic xmlns:a="http://schemas.openxmlformats.org/drawingml/2006/main">
+                  <a:graphicData uri="http://schemas.microsoft.com/office/word/2010/wordprocessingShape">
+                    <wps:wsp>
+                      <wps:cNvSpPr txBox="1">
+                        <a:spLocks noChangeArrowheads="1"/>
+                      </wps:cNvSpPr>
+                      <wps:spPr bwMode="auto">
+                        <a:xfrm>
+                          <a:off x="0" y="0"/>
+                          <a:ext cx="3232785" cy="381000"/>
+                        </a:xfrm>
+                        <a:prstGeom prst="rect">
+                          <a:avLst/>
+                        </a:prstGeom>
+                        <a:solidFill>
+                          <a:srgbClr val="FFFFFF"/>
+                        </a:solidFill>
+                        <a:ln>
+                          <a:noFill/>
+                        </a:ln>
+                        <a:extLst>
+                          <a:ext uri="{91240B29-F687-4F45-9708-019B960494DF}">
+                            <a14:hiddenLine xmlns:a14="http://schemas.microsoft.com/office/drawing/2010/main" w="9525">
+                              <a:solidFill>
+                                <a:srgbClr val="000000"/>
+                              </a:solidFill>
+                              <a:miter lim="800000"/>
+                              <a:headEnd/>
+                              <a:tailEnd/>
+                            </a14:hiddenLine>
+                          </a:ext>
+                        </a:extLst>
+                      </wps:spPr>
+                      <wps:txbx>
+                        <w:txbxContent>
+                          <w:p>
+                            <w:pPr>
+                              <w:tabs>
+                                <w:tab w:val="left" w:pos="709"/>
+                              </w:tabs>
+                              <w:rPr>
+                                <w:rFonts w:cs="Calibri"/>
+                                <w:b/>
+                                <w:bCs/>
+                                <w:sz w:val="32"/>
+                                <w:szCs w:val="32"/>
+                                <w:lang w:val="ka-GE"/>
+                              </w:rPr>
+                            </w:pPr>
+                            <w:r>
+                              <w:rPr>
+                                <w:rFonts w:cs="Calibri"/>
+                                <w:b/>
+                                <w:bCs/>
+                                <w:sz w:val="32"/>
+                                <w:szCs w:val="32"/>
+                                <w:lang w:val="ka-GE"/>
+                              </w:rPr>
+                              <w:t xml:space="preserve">შიფრი </w:t>
+                            </w:r>
+                          </w:p>
+                          <w:p>
+                            <w:pPr>
+                              <w:rPr>
+                                <w:rFonts w:cs="Calibri"/>
+                                <w:b/>
+                                <w:bCs/>
+                                <w:sz w:val="28"/>
+                                <w:szCs w:val="28"/>
+                              </w:rPr>
+                            </w:pPr>
+                          </w:p>
+                        </w:txbxContent>
+                      </wps:txbx>
+                      <wps:bodyPr rot="0" vert="horz" wrap="square" lIns="91440" tIns="45720" rIns="91440" bIns="45720" anchor="t" anchorCtr="0" upright="1">
+                        <a:noAutofit/>
+                      </wps:bodyPr>
+                    </wps:wsp>
+                  </a:graphicData>
+                </a:graphic>
+                <wp14:sizeRelH relativeFrom="page">
+                  <wp14:pctWidth>0</wp14:pctWidth>
+                </wp14:sizeRelH>
+                <wp14:sizeRelV relativeFrom="page">
+                  <wp14:pctHeight>0</wp14:pctHeight>
+                </wp14:sizeRelV>
+              </wp:anchor>
+            </w:drawing>
+          </mc:Choice>
+          <mc:Fallback>
+            <w:pict>
+              <v:shape w14:anchorId="0F803DA9" id="Text Box 2" o:spid="_x0000_s1029" type="#_x0000_t202" style="position:absolute;left:0;text-align:left;margin-left:15.45pt;margin-top:20.9pt;width:254.55pt;height:30pt;z-index:251662336;visibility:visible;mso-wrap-style:square;mso-width-percent:0;mso-height-percent:0;mso-wrap-distance-left:9pt;mso-wrap-distance-top:0;mso-wrap-distance-right:9pt;mso-wrap-distance-bottom:0;mso-position-horizontal:absolute;mso-position-horizontal-relative:text;mso-position-vertical:absolute;mso-position-vertical-relative:text;mso-width-percent:0;mso-height-percent:0;mso-width-relative:page;mso-height-relative:page;v-text-anchor:top" o:gfxdata="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" stroked="f">
+                <v:textbox>
+                  <w:txbxContent>
+                    <w:p>
+                      <w:pPr>
+                        <w:tabs>
+                          <w:tab w:val="left" w:pos="709"/>
+                        </w:tabs>
+                        <w:rPr>
+                          <w:rFonts w:cs="Calibri"/>
+                          <w:b/>
+                          <w:bCs/>
+                          <w:sz w:val="32"/>
+                          <w:szCs w:val="32"/>
+                          <w:lang w:val="ka-GE"/>
+                        </w:rPr>
+                      </w:pPr>
+                      <w:r>
+                        <w:rPr>
+                          <w:rFonts w:cs="Calibri"/>
+                          <w:b/>
+                          <w:bCs/>
+                          <w:sz w:val="32"/>
+                          <w:szCs w:val="32"/>
+                          <w:lang w:val="ka-GE"/>
+                        </w:rPr>
+                        <w:t xml:space="preserve">შიფრი </w:t>
+                      </w:r>
+                    </w:p>
+                    <w:p>
+                      <w:pPr>
+                        <w:rPr>
+                          <w:rFonts w:cs="Calibri"/>
+                          <w:b/>
+                          <w:bCs/>
+                          <w:sz w:val="28"/>
+                          <w:szCs w:val="28"/>
+                        </w:rPr>
+                      </w:pPr>
+                    </w:p>
+                  </w:txbxContent>
+                </v:textbox>
+              </v:shape>
+            </w:pict>
+          </mc:Fallback>
+        </mc:AlternateContent>
+      </w:r>
     </w:p>
     <w:p>
       <w:pPr>
@@ -158,34 +846,17 @@
           <w:lang w:val="ka-GE"/>
         </w:rPr>
       </w:pPr>
-      <w:r/>
-      <w:r>
-        <w:rPr>
-          <w:rFonts w:ascii="Sylfaen" w:hAnsi="Sylfaen"/>
-          <w:sz w:val="24"/>
-        </w:rPr>
-        <w:t>საქართველოს ტექნიკური უნივერსიტეტი</w:t>
-      </w:r>
-      <w:r>
-        <w:br/>
-      </w:r>
-      <w:r>
-        <w:rPr>
-          <w:rFonts w:ascii="Sylfaen" w:hAnsi="Sylfaen"/>
-          <w:sz w:val="24"/>
-        </w:rPr>
-        <w:t>თბილისი, 0160, საქართველო</w:t>
-      </w:r>
-      <w:r>
-        <w:br/>
-      </w:r>
-      <w:r>
-        <w:rPr>
-          <w:rFonts w:ascii="Sylfaen" w:hAnsi="Sylfaen"/>
-          <w:sz w:val="24"/>
-        </w:rPr>
-        <w:t>ივლისი, 2026 წელი</w:t>
-      </w:r>
+    </w:p>
+    <w:p>
+      <w:pPr>
+        <w:pStyle w:val="BodyText"/>
+        <w:spacing w:before="120" w:after="240"/>
+        <w:jc w:val="center"/>
+        <w:rPr>
+          <w:b/>
+          <w:lang w:val="ka-GE"/>
+        </w:rPr>
+      </w:pPr>
     </w:p>
     <w:p>
       <w:pPr>
@@ -199,7 +870,7 @@
         <w:sectPr>
           <w:footerReference w:type="default" r:id="rId9"/>
           <w:pgSz w:w="11906" w:h="16838" w:code="9"/>
-          <w:pgMar w:top="1417" w:right="1417" w:bottom="1417" w:left="2154" w:header="720" w:footer="720" w:gutter="0"/>
+          <w:pgMar w:top="2155" w:right="289" w:bottom="1418" w:left="289" w:header="720" w:footer="720" w:gutter="0"/>
           <w:pgNumType w:start="0"/>
           <w:cols w:space="720"/>
           <w:titlePg/>
@@ -1195,7 +1866,7 @@
     </w:p>
     <w:p>
       <w:pPr>
-        <w:spacing w:line="240" w:lineRule="auto"/>
+        <w:spacing w:line="360" w:lineRule="auto"/>
         <w:jc w:val="center"/>
         <w:rPr>
           <w:b/>
@@ -1219,10 +1890,7 @@
       <w:bookmarkEnd w:id="3"/>
     </w:p>
     <w:p>
-      <w:pPr>
-        <w:spacing w:line="240" w:lineRule="auto"/>
-        <w:jc w:val="both"/>
-      </w:pPr>
+      <w:pPr/>
       <w:r>
         <w:rPr>
           <w:rFonts w:ascii="Sylfaen" w:hAnsi="Sylfaen" w:cs="Sylfaen"/>
@@ -1233,10 +1901,7 @@
       </w:r>
     </w:p>
     <w:p>
-      <w:pPr>
-        <w:spacing w:line="240" w:lineRule="auto"/>
-        <w:jc w:val="both"/>
-      </w:pPr>
+      <w:pPr/>
       <w:r>
         <w:rPr>
           <w:rFonts w:ascii="Sylfaen" w:hAnsi="Sylfaen" w:cs="Sylfaen"/>
@@ -1247,10 +1912,7 @@
       </w:r>
     </w:p>
     <w:p>
-      <w:pPr>
-        <w:spacing w:line="240" w:lineRule="auto"/>
-        <w:jc w:val="both"/>
-      </w:pPr>
+      <w:pPr/>
       <w:r>
         <w:rPr>
           <w:rFonts w:ascii="Sylfaen" w:hAnsi="Sylfaen" w:cs="Sylfaen"/>
@@ -1261,10 +1923,7 @@
       </w:r>
     </w:p>
     <w:p>
-      <w:pPr>
-        <w:spacing w:line="240" w:lineRule="auto"/>
-        <w:jc w:val="both"/>
-      </w:pPr>
+      <w:pPr/>
       <w:r>
         <w:rPr>
           <w:rFonts w:ascii="Sylfaen" w:hAnsi="Sylfaen" w:cs="Sylfaen"/>
@@ -1275,10 +1934,7 @@
       </w:r>
     </w:p>
     <w:p>
-      <w:pPr>
-        <w:spacing w:line="240" w:lineRule="auto"/>
-        <w:jc w:val="both"/>
-      </w:pPr>
+      <w:pPr/>
       <w:r>
         <w:rPr>
           <w:rFonts w:ascii="Sylfaen" w:hAnsi="Sylfaen" w:cs="Sylfaen"/>
@@ -1289,9 +1945,7 @@
       </w:r>
     </w:p>
     <w:p>
-      <w:pPr>
-        <w:spacing w:line="240" w:lineRule="auto"/>
-      </w:pPr>
+      <w:pPr/>
       <w:r>
         <w:rPr>
           <w:rFonts w:ascii="Sylfaen" w:hAnsi="Sylfaen" w:cs="Sylfaen"/>
@@ -1303,7 +1957,7 @@
     </w:p>
     <w:p>
       <w:pPr>
-        <w:spacing w:after="0" w:line="240" w:lineRule="auto"/>
+        <w:spacing w:after="0" w:line="360" w:lineRule="auto"/>
         <w:ind w:firstLine="454"/>
         <w:jc w:val="left"/>
         <w:rPr>
@@ -1324,7 +1978,7 @@
     <w:bookmarkEnd w:id="5"/>
     <w:p>
       <w:pPr>
-        <w:spacing w:after="0" w:line="240" w:lineRule="auto"/>
+        <w:spacing w:after="0" w:line="360" w:lineRule="auto"/>
         <w:jc w:val="center"/>
         <w:rPr>
           <w:sz w:val="28"/>
@@ -1341,10 +1995,7 @@
       </w:r>
     </w:p>
     <w:p>
-      <w:pPr>
-        <w:spacing w:line="240" w:lineRule="auto"/>
-        <w:jc w:val="both"/>
-      </w:pPr>
+      <w:pPr/>
       <w:r>
         <w:rPr>
           <w:rFonts w:ascii="Sylfaen" w:hAnsi="Sylfaen" w:cs="Sylfaen"/>
@@ -1355,10 +2006,7 @@
       </w:r>
     </w:p>
     <w:p>
-      <w:pPr>
-        <w:spacing w:line="240" w:lineRule="auto"/>
-        <w:jc w:val="both"/>
-      </w:pPr>
+      <w:pPr/>
       <w:r>
         <w:rPr>
           <w:rFonts w:ascii="Sylfaen" w:hAnsi="Sylfaen" w:cs="Sylfaen"/>
@@ -1369,10 +2017,7 @@
       </w:r>
     </w:p>
     <w:p>
-      <w:pPr>
-        <w:spacing w:line="240" w:lineRule="auto"/>
-        <w:jc w:val="both"/>
-      </w:pPr>
+      <w:pPr/>
       <w:r>
         <w:rPr>
           <w:rFonts w:ascii="Sylfaen" w:hAnsi="Sylfaen" w:cs="Sylfaen"/>
@@ -1383,10 +2028,7 @@
       </w:r>
     </w:p>
     <w:p>
-      <w:pPr>
-        <w:spacing w:line="240" w:lineRule="auto"/>
-        <w:jc w:val="both"/>
-      </w:pPr>
+      <w:pPr/>
       <w:r>
         <w:rPr>
           <w:rFonts w:ascii="Sylfaen" w:hAnsi="Sylfaen" w:cs="Sylfaen"/>
@@ -1397,10 +2039,7 @@
       </w:r>
     </w:p>
     <w:p>
-      <w:pPr>
-        <w:spacing w:line="240" w:lineRule="auto"/>
-        <w:jc w:val="both"/>
-      </w:pPr>
+      <w:pPr/>
       <w:r>
         <w:rPr>
           <w:rFonts w:ascii="Sylfaen" w:hAnsi="Sylfaen" w:cs="Sylfaen"/>
@@ -1411,9 +2050,7 @@
       </w:r>
     </w:p>
     <w:p>
-      <w:pPr>
-        <w:spacing w:line="240" w:lineRule="auto"/>
-      </w:pPr>
+      <w:pPr/>
       <w:r>
         <w:rPr>
           <w:rFonts w:ascii="Sylfaen" w:hAnsi="Sylfaen" w:cs="Sylfaen"/>
@@ -1425,7 +2062,6 @@
     </w:p>
     <w:p>
       <w:pPr>
-        <w:spacing w:line="240" w:lineRule="auto"/>
         <w:rPr>
           <w:szCs w:val="24"/>
         </w:rPr>
@@ -1467,508 +2103,41 @@
       </w:r>
     </w:p>
     <w:p>
-      <w:pPr>
-        <w:pStyle w:val="TOC1"/>
-      </w:pPr>
-      <w:r>
-        <w:t>1. შესავალი</w:t>
-      </w:r>
-      <w:r>
-        <w:tab/>
-      </w:r>
-      <w:r>
-        <w:t>12</w:t>
-      </w:r>
-    </w:p>
-    <w:p>
-      <w:pPr>
-        <w:pStyle w:val="TOC2"/>
-      </w:pPr>
-      <w:r>
-        <w:t>1.1 კვლევითი პრობლემა</w:t>
-      </w:r>
-      <w:r>
-        <w:tab/>
-      </w:r>
-      <w:r>
-        <w:t>12</w:t>
-      </w:r>
-    </w:p>
-    <w:p>
-      <w:pPr>
-        <w:pStyle w:val="TOC2"/>
-      </w:pPr>
-      <w:r>
-        <w:t>1.2 კვლევის მიზანი</w:t>
-      </w:r>
-      <w:r>
-        <w:tab/>
-      </w:r>
-      <w:r>
-        <w:t>13</w:t>
-      </w:r>
-    </w:p>
-    <w:p>
-      <w:pPr>
-        <w:pStyle w:val="TOC2"/>
-      </w:pPr>
-      <w:r>
-        <w:t>1.3 პრობლემის აქტუალობა</w:t>
-      </w:r>
-      <w:r>
-        <w:tab/>
-      </w:r>
-      <w:r>
-        <w:t>15</w:t>
-      </w:r>
-    </w:p>
-    <w:p>
-      <w:pPr>
-        <w:pStyle w:val="TOC2"/>
-      </w:pPr>
-      <w:r>
-        <w:t>1.4 კვლევის პრაქტიკული ღირებულება</w:t>
-      </w:r>
-      <w:r>
-        <w:tab/>
-      </w:r>
-      <w:r>
-        <w:t>16</w:t>
-      </w:r>
-    </w:p>
-    <w:p>
-      <w:pPr>
-        <w:pStyle w:val="TOC2"/>
-      </w:pPr>
-      <w:r>
-        <w:t>1.5 კვლევის თეორიული ღირებულება</w:t>
-      </w:r>
-      <w:r>
-        <w:tab/>
-      </w:r>
-      <w:r>
-        <w:t>17</w:t>
-      </w:r>
-    </w:p>
-    <w:p>
-      <w:pPr>
-        <w:pStyle w:val="TOC2"/>
-      </w:pPr>
-      <w:r>
-        <w:t>1.6 ნაშრომის სტრუქტურა</w:t>
-      </w:r>
-      <w:r>
-        <w:tab/>
-      </w:r>
-      <w:r>
-        <w:t>17</w:t>
-      </w:r>
-    </w:p>
-    <w:p>
-      <w:pPr>
-        <w:pStyle w:val="TOC1"/>
-      </w:pPr>
-      <w:r>
-        <w:t>2. ლიტერატურის მიმოხილვა</w:t>
-      </w:r>
-      <w:r>
-        <w:tab/>
-      </w:r>
-      <w:r>
-        <w:t>19</w:t>
-      </w:r>
-    </w:p>
-    <w:p>
-      <w:pPr>
-        <w:pStyle w:val="TOC2"/>
-      </w:pPr>
-      <w:r>
-        <w:t>2.1 მიმოხილვის მოცულობა და სტრუქტურა</w:t>
-      </w:r>
-      <w:r>
-        <w:tab/>
-      </w:r>
-      <w:r>
-        <w:t>19</w:t>
-      </w:r>
-    </w:p>
-    <w:p>
-      <w:pPr>
-        <w:pStyle w:val="TOC2"/>
-      </w:pPr>
-      <w:r>
-        <w:t>2.2 თეორიული საფუძვლები: ადამიანის მეხსიერების მოდელები</w:t>
-      </w:r>
-      <w:r>
-        <w:tab/>
-      </w:r>
-      <w:r>
-        <w:t>19</w:t>
-      </w:r>
-    </w:p>
-    <w:p>
-      <w:pPr>
-        <w:pStyle w:val="TOC2"/>
-      </w:pPr>
-      <w:r>
-        <w:t>2.3 გრძელვადიანი მეხსიერება დიდი ენის მოდელის აგენტებისთვის: სამი ტალღა</w:t>
-      </w:r>
-      <w:r>
-        <w:tab/>
-      </w:r>
-      <w:r>
-        <w:t>22</w:t>
-      </w:r>
-    </w:p>
-    <w:p>
-      <w:pPr>
-        <w:pStyle w:val="TOC2"/>
-      </w:pPr>
-      <w:r>
-        <w:t>2.4 ხიდი: მეხსიერების თეორიიდან მეხსიერების არქიტექტურამდე</w:t>
-      </w:r>
-      <w:r>
-        <w:tab/>
-      </w:r>
-      <w:r>
-        <w:t>25</w:t>
-      </w:r>
-    </w:p>
-    <w:p>
-      <w:pPr>
-        <w:pStyle w:val="TOC2"/>
-      </w:pPr>
-      <w:r>
-        <w:t>2.5 საუბრის მეხსიერების შეფასება: ბენჩმარკები და მათი შეზღუდვები</w:t>
-      </w:r>
-      <w:r>
-        <w:tab/>
-      </w:r>
-      <w:r>
-        <w:t>27</w:t>
-      </w:r>
-    </w:p>
-    <w:p>
-      <w:pPr>
-        <w:pStyle w:val="TOC2"/>
-      </w:pPr>
-      <w:r>
-        <w:t>2.6 ასისტენტიდან თანამოსაუბრემდე: მეხსიერება და აღქმული ურთიერთობა</w:t>
-      </w:r>
-      <w:r>
-        <w:tab/>
-      </w:r>
-      <w:r>
-        <w:t>28</w:t>
-      </w:r>
-    </w:p>
-    <w:p>
-      <w:pPr>
-        <w:pStyle w:val="TOC2"/>
-      </w:pPr>
-      <w:r>
-        <w:t>2.7 ღია პრობლემები და შეზღუდვები</w:t>
-      </w:r>
-      <w:r>
-        <w:tab/>
-      </w:r>
-      <w:r>
-        <w:t>30</w:t>
-      </w:r>
-    </w:p>
-    <w:p>
-      <w:pPr>
-        <w:pStyle w:val="TOC2"/>
-      </w:pPr>
-      <w:r>
-        <w:t>2.8 ამ ნაშრომის ადგილი</w:t>
-      </w:r>
-      <w:r>
-        <w:tab/>
-      </w:r>
-      <w:r>
-        <w:t>31</w:t>
-      </w:r>
-    </w:p>
-    <w:p>
-      <w:pPr>
-        <w:pStyle w:val="TOC1"/>
-      </w:pPr>
-      <w:r>
-        <w:t>3. კვლევის მეთოდები</w:t>
-      </w:r>
-      <w:r>
-        <w:tab/>
-      </w:r>
-      <w:r>
-        <w:t>33</w:t>
-      </w:r>
-    </w:p>
-    <w:p>
-      <w:pPr>
-        <w:pStyle w:val="TOC2"/>
-      </w:pPr>
-      <w:r>
-        <w:t>3.1 კვლევის დიზაინი და წვლილი</w:t>
-      </w:r>
-      <w:r>
-        <w:tab/>
-      </w:r>
-      <w:r>
-        <w:t>33</w:t>
-      </w:r>
-    </w:p>
-    <w:p>
-      <w:pPr>
-        <w:pStyle w:val="TOC2"/>
-      </w:pPr>
-      <w:r>
-        <w:t>3.2 პროფილი C-ის მეხსიერების არქიტექტურა</w:t>
-      </w:r>
-      <w:r>
-        <w:tab/>
-      </w:r>
-      <w:r>
-        <w:t>35</w:t>
-      </w:r>
-    </w:p>
-    <w:p>
-      <w:pPr>
-        <w:pStyle w:val="TOC2"/>
-      </w:pPr>
-      <w:r>
-        <w:t>3.3 ექსპერიმენტული პირობები (A / B / B+ / C)</w:t>
-      </w:r>
-      <w:r>
-        <w:tab/>
-      </w:r>
-      <w:r>
-        <w:t>40</w:t>
-      </w:r>
-    </w:p>
-    <w:p>
-      <w:pPr>
-        <w:pStyle w:val="TOC2"/>
-      </w:pPr>
-      <w:r>
-        <w:t>3.4 კონცეფციის დამტკიცების იმპლემენტაცია</w:t>
-      </w:r>
-      <w:r>
-        <w:tab/>
-      </w:r>
-      <w:r>
-        <w:t>43</w:t>
-      </w:r>
-    </w:p>
-    <w:p>
-      <w:pPr>
-        <w:pStyle w:val="TOC2"/>
-      </w:pPr>
-      <w:r>
-        <w:t>3.5 შეფასების მეთოდოლოგია</w:t>
-      </w:r>
-      <w:r>
-        <w:tab/>
-      </w:r>
-      <w:r>
-        <w:t>45</w:t>
-      </w:r>
-    </w:p>
-    <w:p>
-      <w:pPr>
-        <w:pStyle w:val="TOC2"/>
-      </w:pPr>
-      <w:r>
-        <w:t>3.6 ზომები და ინსტრუმენტები</w:t>
-      </w:r>
-      <w:r>
-        <w:tab/>
-      </w:r>
-      <w:r>
-        <w:t>48</w:t>
-      </w:r>
-    </w:p>
-    <w:p>
-      <w:pPr>
-        <w:pStyle w:val="TOC2"/>
-      </w:pPr>
-      <w:r>
-        <w:t>3.7 ანალიზის გეგმა</w:t>
-      </w:r>
-      <w:r>
-        <w:tab/>
-      </w:r>
-      <w:r>
-        <w:t>50</w:t>
-      </w:r>
-    </w:p>
-    <w:p>
-      <w:pPr>
-        <w:pStyle w:val="TOC2"/>
-      </w:pPr>
-      <w:r>
-        <w:t>3.8 ეთიკური საკითხები და შეზღუდვები</w:t>
-      </w:r>
-      <w:r>
-        <w:tab/>
-      </w:r>
-      <w:r>
-        <w:t>51</w:t>
-      </w:r>
-    </w:p>
-    <w:p>
-      <w:pPr>
-        <w:pStyle w:val="TOC1"/>
-      </w:pPr>
-      <w:r>
-        <w:t>4. შედეგები და განხილვა</w:t>
-      </w:r>
-      <w:r>
-        <w:tab/>
-      </w:r>
-      <w:r>
-        <w:t>54</w:t>
-      </w:r>
-    </w:p>
-    <w:p>
-      <w:pPr>
-        <w:pStyle w:val="TOC2"/>
-      </w:pPr>
-      <w:r>
-        <w:t>4.1 კონცეფციის დამტკიცება: მასშტაბი და სიზუსტე</w:t>
-      </w:r>
-      <w:r>
-        <w:tab/>
-      </w:r>
-      <w:r>
-        <w:t>54</w:t>
-      </w:r>
-    </w:p>
-    <w:p>
-      <w:pPr>
-        <w:pStyle w:val="TOC2"/>
-      </w:pPr>
-      <w:r>
-        <w:t>4.2 ტექნიკური შედეგები</w:t>
-      </w:r>
-      <w:r>
-        <w:tab/>
-      </w:r>
-      <w:r>
-        <w:t>55</w:t>
-      </w:r>
-    </w:p>
-    <w:p>
-      <w:pPr>
-        <w:pStyle w:val="TOC2"/>
-      </w:pPr>
-      <w:r>
-        <w:t>4.3 სიმულირებული აღქმის შედეგები</w:t>
-      </w:r>
-      <w:r>
-        <w:tab/>
-      </w:r>
-      <w:r>
-        <w:t>57</w:t>
-      </w:r>
-    </w:p>
-    <w:p>
-      <w:pPr>
-        <w:pStyle w:val="TOC2"/>
-      </w:pPr>
-      <w:r>
-        <w:t>4.4 განხილვა</w:t>
-      </w:r>
-      <w:r>
-        <w:tab/>
-      </w:r>
-      <w:r>
-        <w:t>59</w:t>
-      </w:r>
-    </w:p>
-    <w:p>
-      <w:pPr>
-        <w:pStyle w:val="TOC2"/>
-      </w:pPr>
-      <w:r>
-        <w:t>4.5 შეფასების შეზღუდვები</w:t>
-      </w:r>
-      <w:r>
-        <w:tab/>
-      </w:r>
-      <w:r>
-        <w:t>60</w:t>
-      </w:r>
-    </w:p>
-    <w:p>
-      <w:pPr>
-        <w:pStyle w:val="TOC1"/>
-      </w:pPr>
-      <w:r>
-        <w:t>5. დასკვნა</w:t>
-      </w:r>
-      <w:r>
-        <w:tab/>
-      </w:r>
-      <w:r>
-        <w:t>62</w:t>
-      </w:r>
-    </w:p>
-    <w:p>
-      <w:pPr>
-        <w:pStyle w:val="TOC2"/>
-      </w:pPr>
-      <w:r>
-        <w:t>5.1 წვლილის შეჯამება</w:t>
-      </w:r>
-      <w:r>
-        <w:tab/>
-      </w:r>
-      <w:r>
-        <w:t>62</w:t>
-      </w:r>
-    </w:p>
-    <w:p>
-      <w:pPr>
-        <w:pStyle w:val="TOC2"/>
-      </w:pPr>
-      <w:r>
-        <w:t>5.2 შედეგების შეჯამება</w:t>
-      </w:r>
-      <w:r>
-        <w:tab/>
-      </w:r>
-      <w:r>
-        <w:t>63</w:t>
-      </w:r>
-    </w:p>
-    <w:p>
-      <w:pPr>
-        <w:pStyle w:val="TOC2"/>
-      </w:pPr>
-      <w:r>
-        <w:t>5.3 სამომავლო სამუშაო</w:t>
-      </w:r>
-      <w:r>
-        <w:tab/>
-      </w:r>
-      <w:r>
-        <w:t>63</w:t>
-      </w:r>
-    </w:p>
-    <w:p>
-      <w:pPr>
-        <w:pStyle w:val="TOC1"/>
-      </w:pPr>
-      <w:r>
-        <w:t>ბიბლიოგრაფია</w:t>
-      </w:r>
-      <w:r>
-        <w:tab/>
-      </w:r>
-      <w:r>
-        <w:t>65</w:t>
-      </w:r>
+      <w:pPr/>
+      <w:r>
+        <w:fldChar w:fldCharType="begin" w:dirty="true"/>
+        <w:instrText xml:space="preserve"> TOC \o "1-2" \h \z \u </w:instrText>
+        <w:fldChar w:fldCharType="separate"/>
+        <w:t xml:space="preserve">შინაარსი გენერირდება ავტომატურად Word-ში (საჭიროების შემთხვევაში: მარჯვენა ღილაკი → Update Field / F9).</w:t>
+        <w:fldChar w:fldCharType="end"/>
+      </w:r>
+    </w:p>
+    <w:p>
+      <w:pPr>
+        <w:spacing w:after="0" w:line="360" w:lineRule="auto"/>
+        <w:jc w:val="left"/>
+        <w:rPr>
+          <w:szCs w:val="24"/>
+        </w:rPr>
+      </w:pPr>
+    </w:p>
+    <w:p>
+      <w:pPr>
+        <w:spacing w:after="0" w:line="360" w:lineRule="auto"/>
+        <w:jc w:val="left"/>
+        <w:rPr>
+          <w:szCs w:val="24"/>
+        </w:rPr>
+      </w:pPr>
+    </w:p>
+    <w:p>
+      <w:pPr>
+        <w:spacing w:after="0" w:line="360" w:lineRule="auto"/>
+        <w:jc w:val="left"/>
+        <w:rPr>
+          <w:szCs w:val="24"/>
+        </w:rPr>
+      </w:pPr>
     </w:p>
     <w:p>
       <w:pPr>
@@ -2156,42 +2325,26 @@
         <w:numPr>
           <w:numId w:val="0"/>
         </w:numPr>
-        <w:spacing w:before="360" w:after="80"/>
-        <w:jc w:val="center"/>
       </w:pPr>
       <w:r>
         <w:rPr>
           <w:rFonts w:ascii="Sylfaen" w:hAnsi="Sylfaen" w:cs="Sylfaen"/>
           <w:b/>
-          <w:color w:val="000000"/>
           <w:sz w:val="28"/>
         </w:rPr>
         <w:t>1. შესავალი</w:t>
       </w:r>
     </w:p>
     <w:p>
-      <w:pPr>
-        <w:pStyle w:val="Heading2"/>
-        <w:numPr>
-          <w:numId w:val="0"/>
-        </w:numPr>
-        <w:spacing w:before="160" w:after="80"/>
-        <w:jc w:val="center"/>
-      </w:pPr>
+      <w:pPr/>
       <w:r>
         <w:rPr>
           <w:rFonts w:ascii="Sylfaen" w:hAnsi="Sylfaen" w:cs="Sylfaen"/>
           <w:b/>
-          <w:color w:val="000000"/>
-          <w:sz w:val="28"/>
-        </w:rPr>
-        <w:t>1.1 კვლევითი პრობლემა</w:t>
-      </w:r>
-    </w:p>
-    <w:p>
-      <w:pPr>
-        <w:jc w:val="both"/>
-      </w:pPr>
+          <w:sz w:val="24"/>
+        </w:rPr>
+        <w:t xml:space="preserve">კვლევითი პრობლემა. </w:t>
+      </w:r>
       <w:r>
         <w:rPr>
           <w:rFonts w:ascii="Sylfaen" w:hAnsi="Sylfaen" w:cs="Sylfaen"/>
@@ -2202,9 +2355,7 @@
       </w:r>
     </w:p>
     <w:p>
-      <w:pPr>
-        <w:jc w:val="both"/>
-      </w:pPr>
+      <w:pPr/>
       <w:r>
         <w:rPr>
           <w:rFonts w:ascii="Sylfaen" w:hAnsi="Sylfaen" w:cs="Sylfaen"/>
@@ -2215,9 +2366,7 @@
       </w:r>
     </w:p>
     <w:p>
-      <w:pPr>
-        <w:jc w:val="both"/>
-      </w:pPr>
+      <w:pPr/>
       <w:r>
         <w:rPr>
           <w:rFonts w:ascii="Sylfaen" w:hAnsi="Sylfaen" w:cs="Sylfaen"/>
@@ -2228,9 +2377,7 @@
       </w:r>
     </w:p>
     <w:p>
-      <w:pPr>
-        <w:jc w:val="both"/>
-      </w:pPr>
+      <w:pPr/>
       <w:r>
         <w:rPr>
           <w:rFonts w:ascii="Sylfaen" w:hAnsi="Sylfaen" w:cs="Sylfaen"/>
@@ -2241,28 +2388,15 @@
       </w:r>
     </w:p>
     <w:p>
-      <w:pPr>
-        <w:pStyle w:val="Heading2"/>
-        <w:numPr>
-          <w:numId w:val="0"/>
-        </w:numPr>
-        <w:spacing w:before="160" w:after="80"/>
-        <w:jc w:val="center"/>
-      </w:pPr>
+      <w:pPr/>
       <w:r>
         <w:rPr>
           <w:rFonts w:ascii="Sylfaen" w:hAnsi="Sylfaen" w:cs="Sylfaen"/>
           <w:b/>
-          <w:color w:val="000000"/>
-          <w:sz w:val="28"/>
-        </w:rPr>
-        <w:t>1.2 კვლევის მიზანი</w:t>
-      </w:r>
-    </w:p>
-    <w:p>
-      <w:pPr>
-        <w:jc w:val="both"/>
-      </w:pPr>
+          <w:sz w:val="24"/>
+        </w:rPr>
+        <w:t xml:space="preserve">კვლევის მიზანი. </w:t>
+      </w:r>
       <w:r>
         <w:rPr>
           <w:rFonts w:ascii="Sylfaen" w:hAnsi="Sylfaen" w:cs="Sylfaen"/>
@@ -2273,9 +2407,7 @@
       </w:r>
     </w:p>
     <w:p>
-      <w:pPr>
-        <w:jc w:val="both"/>
-      </w:pPr>
+      <w:pPr/>
       <w:r>
         <w:rPr>
           <w:rFonts w:ascii="Sylfaen" w:hAnsi="Sylfaen" w:cs="Sylfaen"/>
@@ -2286,9 +2418,7 @@
       </w:r>
     </w:p>
     <w:p>
-      <w:pPr>
-        <w:jc w:val="both"/>
-      </w:pPr>
+      <w:pPr/>
       <w:r>
         <w:rPr>
           <w:rFonts w:ascii="Sylfaen" w:hAnsi="Sylfaen" w:cs="Sylfaen"/>
@@ -2299,9 +2429,7 @@
       </w:r>
     </w:p>
     <w:p>
-      <w:pPr>
-        <w:jc w:val="both"/>
-      </w:pPr>
+      <w:pPr/>
       <w:r>
         <w:rPr>
           <w:rFonts w:ascii="Sylfaen" w:hAnsi="Sylfaen" w:cs="Sylfaen"/>
@@ -2312,9 +2440,7 @@
       </w:r>
     </w:p>
     <w:p>
-      <w:pPr>
-        <w:jc w:val="both"/>
-      </w:pPr>
+      <w:pPr/>
       <w:r>
         <w:rPr>
           <w:rFonts w:ascii="Sylfaen" w:hAnsi="Sylfaen" w:cs="Sylfaen"/>
@@ -2325,9 +2451,7 @@
       </w:r>
     </w:p>
     <w:p>
-      <w:pPr>
-        <w:jc w:val="both"/>
-      </w:pPr>
+      <w:pPr/>
       <w:r>
         <w:rPr>
           <w:rFonts w:ascii="Sylfaen" w:hAnsi="Sylfaen" w:cs="Sylfaen"/>
@@ -2338,9 +2462,7 @@
       </w:r>
     </w:p>
     <w:p>
-      <w:pPr>
-        <w:jc w:val="both"/>
-      </w:pPr>
+      <w:pPr/>
       <w:r>
         <w:rPr>
           <w:rFonts w:ascii="Sylfaen" w:hAnsi="Sylfaen" w:cs="Sylfaen"/>
@@ -2351,9 +2473,7 @@
       </w:r>
     </w:p>
     <w:p>
-      <w:pPr>
-        <w:jc w:val="both"/>
-      </w:pPr>
+      <w:pPr/>
       <w:r>
         <w:rPr>
           <w:rFonts w:ascii="Sylfaen" w:hAnsi="Sylfaen" w:cs="Sylfaen"/>
@@ -2364,9 +2484,7 @@
       </w:r>
     </w:p>
     <w:p>
-      <w:pPr>
-        <w:jc w:val="both"/>
-      </w:pPr>
+      <w:pPr/>
       <w:r>
         <w:rPr>
           <w:rFonts w:ascii="Sylfaen" w:hAnsi="Sylfaen" w:cs="Sylfaen"/>
@@ -2377,9 +2495,7 @@
       </w:r>
     </w:p>
     <w:p>
-      <w:pPr>
-        <w:jc w:val="both"/>
-      </w:pPr>
+      <w:pPr/>
       <w:r>
         <w:rPr>
           <w:rFonts w:ascii="Sylfaen" w:hAnsi="Sylfaen" w:cs="Sylfaen"/>
@@ -2390,9 +2506,7 @@
       </w:r>
     </w:p>
     <w:p>
-      <w:pPr>
-        <w:jc w:val="both"/>
-      </w:pPr>
+      <w:pPr/>
       <w:r>
         <w:rPr>
           <w:rFonts w:ascii="Sylfaen" w:hAnsi="Sylfaen" w:cs="Sylfaen"/>
@@ -2403,9 +2517,7 @@
       </w:r>
     </w:p>
     <w:p>
-      <w:pPr>
-        <w:jc w:val="both"/>
-      </w:pPr>
+      <w:pPr/>
       <w:r>
         <w:rPr>
           <w:rFonts w:ascii="Sylfaen" w:hAnsi="Sylfaen" w:cs="Sylfaen"/>
@@ -2416,9 +2528,7 @@
       </w:r>
     </w:p>
     <w:p>
-      <w:pPr>
-        <w:jc w:val="both"/>
-      </w:pPr>
+      <w:pPr/>
       <w:r>
         <w:rPr>
           <w:rFonts w:ascii="Sylfaen" w:hAnsi="Sylfaen" w:cs="Sylfaen"/>
@@ -2429,9 +2539,7 @@
       </w:r>
     </w:p>
     <w:p>
-      <w:pPr>
-        <w:jc w:val="both"/>
-      </w:pPr>
+      <w:pPr/>
       <w:r>
         <w:rPr>
           <w:rFonts w:ascii="Sylfaen" w:hAnsi="Sylfaen" w:cs="Sylfaen"/>
@@ -2442,9 +2550,7 @@
       </w:r>
     </w:p>
     <w:p>
-      <w:pPr>
-        <w:jc w:val="both"/>
-      </w:pPr>
+      <w:pPr/>
       <w:r>
         <w:rPr>
           <w:rFonts w:ascii="Sylfaen" w:hAnsi="Sylfaen" w:cs="Sylfaen"/>
@@ -2455,28 +2561,15 @@
       </w:r>
     </w:p>
     <w:p>
-      <w:pPr>
-        <w:pStyle w:val="Heading2"/>
-        <w:numPr>
-          <w:numId w:val="0"/>
-        </w:numPr>
-        <w:spacing w:before="160" w:after="80"/>
-        <w:jc w:val="center"/>
-      </w:pPr>
+      <w:pPr/>
       <w:r>
         <w:rPr>
           <w:rFonts w:ascii="Sylfaen" w:hAnsi="Sylfaen" w:cs="Sylfaen"/>
           <w:b/>
-          <w:color w:val="000000"/>
-          <w:sz w:val="28"/>
-        </w:rPr>
-        <w:t>1.3 პრობლემის აქტუალობა</w:t>
-      </w:r>
-    </w:p>
-    <w:p>
-      <w:pPr>
-        <w:jc w:val="both"/>
-      </w:pPr>
+          <w:sz w:val="24"/>
+        </w:rPr>
+        <w:t xml:space="preserve">პრობლემის აქტუალობა. </w:t>
+      </w:r>
       <w:r>
         <w:rPr>
           <w:rFonts w:ascii="Sylfaen" w:hAnsi="Sylfaen" w:cs="Sylfaen"/>
@@ -2487,26 +2580,15 @@
       </w:r>
     </w:p>
     <w:p>
-      <w:pPr>
-        <w:pStyle w:val="Heading2"/>
-        <w:numPr>
-          <w:numId w:val="0"/>
-        </w:numPr>
-        <w:spacing w:before="160" w:after="80"/>
-        <w:jc w:val="center"/>
-      </w:pPr>
+      <w:pPr/>
       <w:r>
         <w:rPr>
           <w:rFonts w:ascii="Sylfaen" w:hAnsi="Sylfaen" w:cs="Sylfaen"/>
           <w:b/>
-          <w:color w:val="000000"/>
-          <w:sz w:val="28"/>
-        </w:rPr>
-        <w:t>1.4 კვლევის პრაქტიკული ღირებულება</w:t>
-      </w:r>
-    </w:p>
-    <w:p>
-      <w:pPr/>
+          <w:sz w:val="24"/>
+        </w:rPr>
+        <w:t xml:space="preserve">კვლევის პრაქტიკული ღირებულება. </w:t>
+      </w:r>
       <w:r>
         <w:rPr>
           <w:rFonts w:ascii="Sylfaen" w:hAnsi="Sylfaen" w:cs="Sylfaen"/>
@@ -2517,9 +2599,7 @@
       </w:r>
     </w:p>
     <w:p>
-      <w:pPr>
-        <w:jc w:val="both"/>
-      </w:pPr>
+      <w:pPr/>
       <w:r>
         <w:rPr>
           <w:rFonts w:ascii="Sylfaen" w:hAnsi="Sylfaen" w:cs="Sylfaen"/>
@@ -2530,9 +2610,7 @@
       </w:r>
     </w:p>
     <w:p>
-      <w:pPr>
-        <w:jc w:val="both"/>
-      </w:pPr>
+      <w:pPr/>
       <w:r>
         <w:rPr>
           <w:rFonts w:ascii="Sylfaen" w:hAnsi="Sylfaen" w:cs="Sylfaen"/>
@@ -2543,9 +2621,7 @@
       </w:r>
     </w:p>
     <w:p>
-      <w:pPr>
-        <w:jc w:val="both"/>
-      </w:pPr>
+      <w:pPr/>
       <w:r>
         <w:rPr>
           <w:rFonts w:ascii="Sylfaen" w:hAnsi="Sylfaen" w:cs="Sylfaen"/>
@@ -2556,9 +2632,7 @@
       </w:r>
     </w:p>
     <w:p>
-      <w:pPr>
-        <w:jc w:val="both"/>
-      </w:pPr>
+      <w:pPr/>
       <w:r>
         <w:rPr>
           <w:rFonts w:ascii="Sylfaen" w:hAnsi="Sylfaen" w:cs="Sylfaen"/>
@@ -2569,28 +2643,15 @@
       </w:r>
     </w:p>
     <w:p>
-      <w:pPr>
-        <w:pStyle w:val="Heading2"/>
-        <w:numPr>
-          <w:numId w:val="0"/>
-        </w:numPr>
-        <w:spacing w:before="160" w:after="80"/>
-        <w:jc w:val="center"/>
-      </w:pPr>
+      <w:pPr/>
       <w:r>
         <w:rPr>
           <w:rFonts w:ascii="Sylfaen" w:hAnsi="Sylfaen" w:cs="Sylfaen"/>
           <w:b/>
-          <w:color w:val="000000"/>
-          <w:sz w:val="28"/>
-        </w:rPr>
-        <w:t>1.5 კვლევის თეორიული ღირებულება</w:t>
-      </w:r>
-    </w:p>
-    <w:p>
-      <w:pPr>
-        <w:jc w:val="both"/>
-      </w:pPr>
+          <w:sz w:val="24"/>
+        </w:rPr>
+        <w:t xml:space="preserve">კვლევის თეორიული ღირებულება. </w:t>
+      </w:r>
       <w:r>
         <w:rPr>
           <w:rFonts w:ascii="Sylfaen" w:hAnsi="Sylfaen" w:cs="Sylfaen"/>
@@ -2601,28 +2662,15 @@
       </w:r>
     </w:p>
     <w:p>
-      <w:pPr>
-        <w:pStyle w:val="Heading2"/>
-        <w:numPr>
-          <w:numId w:val="0"/>
-        </w:numPr>
-        <w:spacing w:before="160" w:after="80"/>
-        <w:jc w:val="center"/>
-      </w:pPr>
+      <w:pPr/>
       <w:r>
         <w:rPr>
           <w:rFonts w:ascii="Sylfaen" w:hAnsi="Sylfaen" w:cs="Sylfaen"/>
           <w:b/>
-          <w:color w:val="000000"/>
-          <w:sz w:val="28"/>
-        </w:rPr>
-        <w:t>1.6 ნაშრომის სტრუქტურა</w:t>
-      </w:r>
-    </w:p>
-    <w:p>
-      <w:pPr>
-        <w:jc w:val="both"/>
-      </w:pPr>
+          <w:sz w:val="24"/>
+        </w:rPr>
+        <w:t xml:space="preserve">ნაშრომის სტრუქტურა. </w:t>
+      </w:r>
       <w:r>
         <w:rPr>
           <w:rFonts w:ascii="Sylfaen" w:hAnsi="Sylfaen" w:cs="Sylfaen"/>
@@ -2639,14 +2687,11 @@
         <w:numPr>
           <w:numId w:val="0"/>
         </w:numPr>
-        <w:spacing w:before="360" w:after="80"/>
-        <w:jc w:val="center"/>
       </w:pPr>
       <w:r>
         <w:rPr>
           <w:rFonts w:ascii="Sylfaen" w:hAnsi="Sylfaen" w:cs="Sylfaen"/>
           <w:b/>
-          <w:color w:val="000000"/>
           <w:sz w:val="28"/>
         </w:rPr>
         <w:t>2. ლიტერატურის მიმოხილვა</w:t>
@@ -2658,23 +2703,18 @@
         <w:numPr>
           <w:numId w:val="0"/>
         </w:numPr>
-        <w:spacing w:before="160" w:after="80"/>
-        <w:jc w:val="center"/>
       </w:pPr>
       <w:r>
         <w:rPr>
           <w:rFonts w:ascii="Sylfaen" w:hAnsi="Sylfaen" w:cs="Sylfaen"/>
           <w:b/>
-          <w:color w:val="000000"/>
-          <w:sz w:val="28"/>
+          <w:sz w:val="26"/>
         </w:rPr>
         <w:t>2.1 მიმოხილვის მოცულობა და სტრუქტურა</w:t>
       </w:r>
     </w:p>
     <w:p>
-      <w:pPr>
-        <w:jc w:val="both"/>
-      </w:pPr>
+      <w:pPr/>
       <w:r>
         <w:rPr>
           <w:rFonts w:ascii="Sylfaen" w:hAnsi="Sylfaen" w:cs="Sylfaen"/>
@@ -2690,23 +2730,18 @@
         <w:numPr>
           <w:numId w:val="0"/>
         </w:numPr>
-        <w:spacing w:before="160" w:after="80"/>
-        <w:jc w:val="center"/>
       </w:pPr>
       <w:r>
         <w:rPr>
           <w:rFonts w:ascii="Sylfaen" w:hAnsi="Sylfaen" w:cs="Sylfaen"/>
           <w:b/>
-          <w:color w:val="000000"/>
-          <w:sz w:val="28"/>
+          <w:sz w:val="26"/>
         </w:rPr>
         <w:t>2.2 თეორიული საფუძვლები: ადამიანის მეხსიერების მოდელები</w:t>
       </w:r>
     </w:p>
     <w:p>
-      <w:pPr>
-        <w:jc w:val="both"/>
-      </w:pPr>
+      <w:pPr/>
       <w:r>
         <w:rPr>
           <w:rFonts w:ascii="Sylfaen" w:hAnsi="Sylfaen" w:cs="Sylfaen"/>
@@ -2717,9 +2752,7 @@
       </w:r>
     </w:p>
     <w:p>
-      <w:pPr>
-        <w:jc w:val="both"/>
-      </w:pPr>
+      <w:pPr/>
       <w:r>
         <w:rPr>
           <w:rFonts w:ascii="Sylfaen" w:hAnsi="Sylfaen" w:cs="Sylfaen"/>
@@ -2730,9 +2763,7 @@
       </w:r>
     </w:p>
     <w:p>
-      <w:pPr>
-        <w:jc w:val="both"/>
-      </w:pPr>
+      <w:pPr/>
       <w:r>
         <w:rPr>
           <w:rFonts w:ascii="Sylfaen" w:hAnsi="Sylfaen" w:cs="Sylfaen"/>
@@ -2743,9 +2774,7 @@
       </w:r>
     </w:p>
     <w:p>
-      <w:pPr>
-        <w:jc w:val="both"/>
-      </w:pPr>
+      <w:pPr/>
       <w:r>
         <w:rPr>
           <w:rFonts w:ascii="Sylfaen" w:hAnsi="Sylfaen" w:cs="Sylfaen"/>
@@ -2756,9 +2785,7 @@
       </w:r>
     </w:p>
     <w:p>
-      <w:pPr>
-        <w:jc w:val="both"/>
-      </w:pPr>
+      <w:pPr/>
       <w:r>
         <w:rPr>
           <w:rFonts w:ascii="Sylfaen" w:hAnsi="Sylfaen" w:cs="Sylfaen"/>
@@ -2769,9 +2796,7 @@
       </w:r>
     </w:p>
     <w:p>
-      <w:pPr>
-        <w:jc w:val="both"/>
-      </w:pPr>
+      <w:pPr/>
       <w:r>
         <w:rPr>
           <w:rFonts w:ascii="Sylfaen" w:hAnsi="Sylfaen" w:cs="Sylfaen"/>
@@ -2782,9 +2807,7 @@
       </w:r>
     </w:p>
     <w:p>
-      <w:pPr>
-        <w:jc w:val="both"/>
-      </w:pPr>
+      <w:pPr/>
       <w:r>
         <w:rPr>
           <w:rFonts w:ascii="Sylfaen" w:hAnsi="Sylfaen" w:cs="Sylfaen"/>
@@ -2811,23 +2834,18 @@
         <w:numPr>
           <w:numId w:val="0"/>
         </w:numPr>
-        <w:spacing w:before="160" w:after="80"/>
-        <w:jc w:val="center"/>
       </w:pPr>
       <w:r>
         <w:rPr>
           <w:rFonts w:ascii="Sylfaen" w:hAnsi="Sylfaen" w:cs="Sylfaen"/>
           <w:b/>
-          <w:color w:val="000000"/>
-          <w:sz w:val="28"/>
+          <w:sz w:val="26"/>
         </w:rPr>
         <w:t>2.3 გრძელვადიანი მეხსიერება დიდი ენის მოდელის აგენტებისთვის: სამი ტალღა</w:t>
       </w:r>
     </w:p>
     <w:p>
-      <w:pPr>
-        <w:jc w:val="both"/>
-      </w:pPr>
+      <w:pPr/>
       <w:r>
         <w:rPr>
           <w:rFonts w:ascii="Sylfaen" w:hAnsi="Sylfaen" w:cs="Sylfaen"/>
@@ -2838,9 +2856,7 @@
       </w:r>
     </w:p>
     <w:p>
-      <w:pPr>
-        <w:jc w:val="both"/>
-      </w:pPr>
+      <w:pPr/>
       <w:r>
         <w:rPr>
           <w:rFonts w:ascii="Sylfaen" w:hAnsi="Sylfaen" w:cs="Sylfaen"/>
@@ -2851,9 +2867,7 @@
       </w:r>
     </w:p>
     <w:p>
-      <w:pPr>
-        <w:jc w:val="both"/>
-      </w:pPr>
+      <w:pPr/>
       <w:r>
         <w:rPr>
           <w:rFonts w:ascii="Sylfaen" w:hAnsi="Sylfaen" w:cs="Sylfaen"/>
@@ -2864,9 +2878,7 @@
       </w:r>
     </w:p>
     <w:p>
-      <w:pPr>
-        <w:jc w:val="both"/>
-      </w:pPr>
+      <w:pPr/>
       <w:r>
         <w:rPr>
           <w:rFonts w:ascii="Sylfaen" w:hAnsi="Sylfaen" w:cs="Sylfaen"/>
@@ -2882,23 +2894,18 @@
         <w:numPr>
           <w:numId w:val="0"/>
         </w:numPr>
-        <w:spacing w:before="160" w:after="80"/>
-        <w:jc w:val="center"/>
       </w:pPr>
       <w:r>
         <w:rPr>
           <w:rFonts w:ascii="Sylfaen" w:hAnsi="Sylfaen" w:cs="Sylfaen"/>
           <w:b/>
-          <w:color w:val="000000"/>
-          <w:sz w:val="28"/>
+          <w:sz w:val="26"/>
         </w:rPr>
         <w:t>2.4 ხიდი: მეხსიერების თეორიიდან მეხსიერების არქიტექტურამდე</w:t>
       </w:r>
     </w:p>
     <w:p>
-      <w:pPr>
-        <w:jc w:val="both"/>
-      </w:pPr>
+      <w:pPr/>
       <w:r>
         <w:rPr>
           <w:rFonts w:ascii="Sylfaen" w:hAnsi="Sylfaen" w:cs="Sylfaen"/>
@@ -2924,17 +2931,16 @@
     <w:tbl>
       <w:tblPr>
         <w:tblW w:type="auto" w:w="0"/>
+        <w:tblBorders>
+          <w:top w:val="single" w:sz="4" w:space="0" w:color="000000"/>
+          <w:left w:val="single" w:sz="4" w:space="0" w:color="000000"/>
+          <w:bottom w:val="single" w:sz="4" w:space="0" w:color="000000"/>
+          <w:right w:val="single" w:sz="4" w:space="0" w:color="000000"/>
+          <w:insideH w:val="single" w:sz="4" w:space="0" w:color="000000"/>
+          <w:insideV w:val="single" w:sz="4" w:space="0" w:color="000000"/>
+        </w:tblBorders>
         <w:tblLayout w:type="fixed"/>
         <w:tblLook w:firstColumn="1" w:firstRow="1" w:lastColumn="0" w:lastRow="0" w:noHBand="0" w:noVBand="1" w:val="04A0"/>
-        <w:tblLayout w:type="fixed"/>
-        <w:tblBorders>
-          <w:top w:val="single" w:sz="4" w:space="0" w:color="auto"/>
-          <w:left w:val="single" w:sz="4" w:space="0" w:color="auto"/>
-          <w:bottom w:val="single" w:sz="4" w:space="0" w:color="auto"/>
-          <w:right w:val="single" w:sz="4" w:space="0" w:color="auto"/>
-          <w:insideH w:val="single" w:sz="4" w:space="0" w:color="auto"/>
-          <w:insideV w:val="single" w:sz="4" w:space="0" w:color="auto"/>
-        </w:tblBorders>
       </w:tblPr>
       <w:tblGrid>
         <w:gridCol w:w="2861"/>
@@ -3338,9 +3344,7 @@
       <w:pPr/>
     </w:p>
     <w:p>
-      <w:pPr>
-        <w:jc w:val="both"/>
-      </w:pPr>
+      <w:pPr/>
       <w:r>
         <w:rPr>
           <w:rFonts w:ascii="Sylfaen" w:hAnsi="Sylfaen" w:cs="Sylfaen"/>
@@ -3356,23 +3360,18 @@
         <w:numPr>
           <w:numId w:val="0"/>
         </w:numPr>
-        <w:spacing w:before="160" w:after="80"/>
-        <w:jc w:val="center"/>
       </w:pPr>
       <w:r>
         <w:rPr>
           <w:rFonts w:ascii="Sylfaen" w:hAnsi="Sylfaen" w:cs="Sylfaen"/>
           <w:b/>
-          <w:color w:val="000000"/>
-          <w:sz w:val="28"/>
+          <w:sz w:val="26"/>
         </w:rPr>
         <w:t>2.5 საუბრის მეხსიერების შეფასება: ბენჩმარკები და მათი შეზღუდვები</w:t>
       </w:r>
     </w:p>
     <w:p>
-      <w:pPr>
-        <w:jc w:val="both"/>
-      </w:pPr>
+      <w:pPr/>
       <w:r>
         <w:rPr>
           <w:rFonts w:ascii="Sylfaen" w:hAnsi="Sylfaen" w:cs="Sylfaen"/>
@@ -3383,9 +3382,7 @@
       </w:r>
     </w:p>
     <w:p>
-      <w:pPr>
-        <w:jc w:val="both"/>
-      </w:pPr>
+      <w:pPr/>
       <w:r>
         <w:rPr>
           <w:rFonts w:ascii="Sylfaen" w:hAnsi="Sylfaen" w:cs="Sylfaen"/>
@@ -3396,9 +3393,7 @@
       </w:r>
     </w:p>
     <w:p>
-      <w:pPr>
-        <w:jc w:val="both"/>
-      </w:pPr>
+      <w:pPr/>
       <w:r>
         <w:rPr>
           <w:rFonts w:ascii="Sylfaen" w:hAnsi="Sylfaen" w:cs="Sylfaen"/>
@@ -3414,23 +3409,18 @@
         <w:numPr>
           <w:numId w:val="0"/>
         </w:numPr>
-        <w:spacing w:before="160" w:after="80"/>
-        <w:jc w:val="center"/>
       </w:pPr>
       <w:r>
         <w:rPr>
           <w:rFonts w:ascii="Sylfaen" w:hAnsi="Sylfaen" w:cs="Sylfaen"/>
           <w:b/>
-          <w:color w:val="000000"/>
-          <w:sz w:val="28"/>
+          <w:sz w:val="26"/>
         </w:rPr>
         <w:t>2.6 ასისტენტიდან თანამოსაუბრემდე: მეხსიერება და აღქმული ურთიერთობა</w:t>
       </w:r>
     </w:p>
     <w:p>
-      <w:pPr>
-        <w:jc w:val="both"/>
-      </w:pPr>
+      <w:pPr/>
       <w:r>
         <w:rPr>
           <w:rFonts w:ascii="Sylfaen" w:hAnsi="Sylfaen" w:cs="Sylfaen"/>
@@ -3441,9 +3431,7 @@
       </w:r>
     </w:p>
     <w:p>
-      <w:pPr>
-        <w:jc w:val="both"/>
-      </w:pPr>
+      <w:pPr/>
       <w:r>
         <w:rPr>
           <w:rFonts w:ascii="Sylfaen" w:hAnsi="Sylfaen" w:cs="Sylfaen"/>
@@ -3454,9 +3442,7 @@
       </w:r>
     </w:p>
     <w:p>
-      <w:pPr>
-        <w:jc w:val="both"/>
-      </w:pPr>
+      <w:pPr/>
       <w:r>
         <w:rPr>
           <w:rFonts w:ascii="Sylfaen" w:hAnsi="Sylfaen" w:cs="Sylfaen"/>
@@ -3467,9 +3453,7 @@
       </w:r>
     </w:p>
     <w:p>
-      <w:pPr>
-        <w:jc w:val="both"/>
-      </w:pPr>
+      <w:pPr/>
       <w:r>
         <w:rPr>
           <w:rFonts w:ascii="Sylfaen" w:hAnsi="Sylfaen" w:cs="Sylfaen"/>
@@ -3480,9 +3464,7 @@
       </w:r>
     </w:p>
     <w:p>
-      <w:pPr>
-        <w:jc w:val="both"/>
-      </w:pPr>
+      <w:pPr/>
       <w:r>
         <w:rPr>
           <w:rFonts w:ascii="Sylfaen" w:hAnsi="Sylfaen" w:cs="Sylfaen"/>
@@ -3498,23 +3480,18 @@
         <w:numPr>
           <w:numId w:val="0"/>
         </w:numPr>
-        <w:spacing w:before="160" w:after="80"/>
-        <w:jc w:val="center"/>
       </w:pPr>
       <w:r>
         <w:rPr>
           <w:rFonts w:ascii="Sylfaen" w:hAnsi="Sylfaen" w:cs="Sylfaen"/>
           <w:b/>
-          <w:color w:val="000000"/>
-          <w:sz w:val="28"/>
+          <w:sz w:val="26"/>
         </w:rPr>
         <w:t>2.7 ღია პრობლემები და შეზღუდვები</w:t>
       </w:r>
     </w:p>
     <w:p>
-      <w:pPr>
-        <w:jc w:val="both"/>
-      </w:pPr>
+      <w:pPr/>
       <w:r>
         <w:rPr>
           <w:rFonts w:ascii="Sylfaen" w:hAnsi="Sylfaen" w:cs="Sylfaen"/>
@@ -3530,23 +3507,18 @@
         <w:numPr>
           <w:numId w:val="0"/>
         </w:numPr>
-        <w:spacing w:before="160" w:after="80"/>
-        <w:jc w:val="center"/>
       </w:pPr>
       <w:r>
         <w:rPr>
           <w:rFonts w:ascii="Sylfaen" w:hAnsi="Sylfaen" w:cs="Sylfaen"/>
           <w:b/>
-          <w:color w:val="000000"/>
-          <w:sz w:val="28"/>
+          <w:sz w:val="26"/>
         </w:rPr>
         <w:t>2.8 ამ ნაშრომის ადგილი</w:t>
       </w:r>
     </w:p>
     <w:p>
-      <w:pPr>
-        <w:jc w:val="both"/>
-      </w:pPr>
+      <w:pPr/>
       <w:r>
         <w:rPr>
           <w:rFonts w:ascii="Sylfaen" w:hAnsi="Sylfaen" w:cs="Sylfaen"/>
@@ -3563,14 +3535,11 @@
         <w:numPr>
           <w:numId w:val="0"/>
         </w:numPr>
-        <w:spacing w:before="360" w:after="80"/>
-        <w:jc w:val="center"/>
       </w:pPr>
       <w:r>
         <w:rPr>
           <w:rFonts w:ascii="Sylfaen" w:hAnsi="Sylfaen" w:cs="Sylfaen"/>
           <w:b/>
-          <w:color w:val="000000"/>
           <w:sz w:val="28"/>
         </w:rPr>
         <w:t>3. კვლევის მეთოდები</w:t>
@@ -3582,23 +3551,18 @@
         <w:numPr>
           <w:numId w:val="0"/>
         </w:numPr>
-        <w:spacing w:before="160" w:after="80"/>
-        <w:jc w:val="center"/>
       </w:pPr>
       <w:r>
         <w:rPr>
           <w:rFonts w:ascii="Sylfaen" w:hAnsi="Sylfaen" w:cs="Sylfaen"/>
           <w:b/>
-          <w:color w:val="000000"/>
-          <w:sz w:val="28"/>
+          <w:sz w:val="26"/>
         </w:rPr>
         <w:t>3.1 კვლევის დიზაინი და წვლილი</w:t>
       </w:r>
     </w:p>
     <w:p>
-      <w:pPr>
-        <w:jc w:val="both"/>
-      </w:pPr>
+      <w:pPr/>
       <w:r>
         <w:rPr>
           <w:rFonts w:ascii="Sylfaen" w:hAnsi="Sylfaen" w:cs="Sylfaen"/>
@@ -3609,9 +3573,7 @@
       </w:r>
     </w:p>
     <w:p>
-      <w:pPr>
-        <w:jc w:val="both"/>
-      </w:pPr>
+      <w:pPr/>
       <w:r>
         <w:rPr>
           <w:rFonts w:ascii="Sylfaen" w:hAnsi="Sylfaen" w:cs="Sylfaen"/>
@@ -3622,9 +3584,7 @@
       </w:r>
     </w:p>
     <w:p>
-      <w:pPr>
-        <w:jc w:val="both"/>
-      </w:pPr>
+      <w:pPr/>
       <w:r>
         <w:rPr>
           <w:rFonts w:ascii="Sylfaen" w:hAnsi="Sylfaen" w:cs="Sylfaen"/>
@@ -3635,9 +3595,7 @@
       </w:r>
     </w:p>
     <w:p>
-      <w:pPr>
-        <w:jc w:val="both"/>
-      </w:pPr>
+      <w:pPr/>
       <w:r>
         <w:rPr>
           <w:rFonts w:ascii="Sylfaen" w:hAnsi="Sylfaen" w:cs="Sylfaen"/>
@@ -3653,23 +3611,18 @@
         <w:numPr>
           <w:numId w:val="0"/>
         </w:numPr>
-        <w:spacing w:before="160" w:after="80"/>
-        <w:jc w:val="center"/>
       </w:pPr>
       <w:r>
         <w:rPr>
           <w:rFonts w:ascii="Sylfaen" w:hAnsi="Sylfaen" w:cs="Sylfaen"/>
           <w:b/>
-          <w:color w:val="000000"/>
-          <w:sz w:val="28"/>
+          <w:sz w:val="26"/>
         </w:rPr>
         <w:t>3.2 პროფილი C-ის მეხსიერების არქიტექტურა</w:t>
       </w:r>
     </w:p>
     <w:p>
-      <w:pPr>
-        <w:jc w:val="both"/>
-      </w:pPr>
+      <w:pPr/>
       <w:r>
         <w:rPr>
           <w:rFonts w:ascii="Sylfaen" w:hAnsi="Sylfaen" w:cs="Sylfaen"/>
@@ -3680,9 +3633,7 @@
       </w:r>
     </w:p>
     <w:p>
-      <w:pPr>
-        <w:jc w:val="both"/>
-      </w:pPr>
+      <w:pPr/>
       <w:r>
         <w:rPr>
           <w:rFonts w:ascii="Sylfaen" w:hAnsi="Sylfaen" w:cs="Sylfaen"/>
@@ -3693,9 +3644,7 @@
       </w:r>
     </w:p>
     <w:p>
-      <w:pPr>
-        <w:jc w:val="both"/>
-      </w:pPr>
+      <w:pPr/>
       <w:r>
         <w:rPr>
           <w:rFonts w:ascii="Sylfaen" w:hAnsi="Sylfaen" w:cs="Sylfaen"/>
@@ -3706,9 +3655,7 @@
       </w:r>
     </w:p>
     <w:p>
-      <w:pPr>
-        <w:jc w:val="both"/>
-      </w:pPr>
+      <w:pPr/>
       <w:r>
         <w:rPr>
           <w:rFonts w:ascii="Sylfaen" w:hAnsi="Sylfaen" w:cs="Sylfaen"/>
@@ -3719,9 +3666,7 @@
       </w:r>
     </w:p>
     <w:p>
-      <w:pPr>
-        <w:jc w:val="both"/>
-      </w:pPr>
+      <w:pPr/>
       <w:r>
         <w:rPr>
           <w:rFonts w:ascii="Sylfaen" w:hAnsi="Sylfaen" w:cs="Sylfaen"/>
@@ -3732,9 +3677,7 @@
       </w:r>
     </w:p>
     <w:p>
-      <w:pPr>
-        <w:jc w:val="both"/>
-      </w:pPr>
+      <w:pPr/>
       <w:r>
         <w:rPr>
           <w:rFonts w:ascii="Sylfaen" w:hAnsi="Sylfaen" w:cs="Sylfaen"/>
@@ -3745,9 +3688,7 @@
       </w:r>
     </w:p>
     <w:p>
-      <w:pPr>
-        <w:jc w:val="both"/>
-      </w:pPr>
+      <w:pPr/>
       <w:r>
         <w:rPr>
           <w:rFonts w:ascii="Sylfaen" w:hAnsi="Sylfaen" w:cs="Sylfaen"/>
@@ -3758,9 +3699,7 @@
       </w:r>
     </w:p>
     <w:p>
-      <w:pPr>
-        <w:jc w:val="both"/>
-      </w:pPr>
+      <w:pPr/>
       <w:r>
         <w:rPr>
           <w:rFonts w:ascii="Sylfaen" w:hAnsi="Sylfaen" w:cs="Sylfaen"/>
@@ -3776,23 +3715,18 @@
         <w:numPr>
           <w:numId w:val="0"/>
         </w:numPr>
-        <w:spacing w:before="160" w:after="80"/>
-        <w:jc w:val="center"/>
       </w:pPr>
       <w:r>
         <w:rPr>
           <w:rFonts w:ascii="Sylfaen" w:hAnsi="Sylfaen" w:cs="Sylfaen"/>
           <w:b/>
-          <w:color w:val="000000"/>
-          <w:sz w:val="28"/>
+          <w:sz w:val="26"/>
         </w:rPr>
         <w:t>3.3 ექსპერიმენტული პირობები (A / B / B+ / C)</w:t>
       </w:r>
     </w:p>
     <w:p>
-      <w:pPr>
-        <w:jc w:val="both"/>
-      </w:pPr>
+      <w:pPr/>
       <w:r>
         <w:rPr>
           <w:rFonts w:ascii="Sylfaen" w:hAnsi="Sylfaen" w:cs="Sylfaen"/>
@@ -3803,9 +3737,7 @@
       </w:r>
     </w:p>
     <w:p>
-      <w:pPr>
-        <w:jc w:val="both"/>
-      </w:pPr>
+      <w:pPr/>
       <w:r>
         <w:rPr>
           <w:rFonts w:ascii="Sylfaen" w:hAnsi="Sylfaen" w:cs="Sylfaen"/>
@@ -3816,9 +3748,7 @@
       </w:r>
     </w:p>
     <w:p>
-      <w:pPr>
-        <w:jc w:val="both"/>
-      </w:pPr>
+      <w:pPr/>
       <w:r>
         <w:rPr>
           <w:rFonts w:ascii="Sylfaen" w:hAnsi="Sylfaen" w:cs="Sylfaen"/>
@@ -3829,9 +3759,7 @@
       </w:r>
     </w:p>
     <w:p>
-      <w:pPr>
-        <w:jc w:val="both"/>
-      </w:pPr>
+      <w:pPr/>
       <w:r>
         <w:rPr>
           <w:rFonts w:ascii="Sylfaen" w:hAnsi="Sylfaen" w:cs="Sylfaen"/>
@@ -3842,9 +3770,7 @@
       </w:r>
     </w:p>
     <w:p>
-      <w:pPr>
-        <w:jc w:val="both"/>
-      </w:pPr>
+      <w:pPr/>
       <w:r>
         <w:rPr>
           <w:rFonts w:ascii="Sylfaen" w:hAnsi="Sylfaen" w:cs="Sylfaen"/>
@@ -3855,9 +3781,7 @@
       </w:r>
     </w:p>
     <w:p>
-      <w:pPr>
-        <w:jc w:val="both"/>
-      </w:pPr>
+      <w:pPr/>
       <w:r>
         <w:rPr>
           <w:rFonts w:ascii="Sylfaen" w:hAnsi="Sylfaen" w:cs="Sylfaen"/>
@@ -3894,17 +3818,16 @@
     <w:tbl>
       <w:tblPr>
         <w:tblW w:type="auto" w:w="0"/>
+        <w:tblBorders>
+          <w:top w:val="single" w:sz="4" w:space="0" w:color="000000"/>
+          <w:left w:val="single" w:sz="4" w:space="0" w:color="000000"/>
+          <w:bottom w:val="single" w:sz="4" w:space="0" w:color="000000"/>
+          <w:right w:val="single" w:sz="4" w:space="0" w:color="000000"/>
+          <w:insideH w:val="single" w:sz="4" w:space="0" w:color="000000"/>
+          <w:insideV w:val="single" w:sz="4" w:space="0" w:color="000000"/>
+        </w:tblBorders>
         <w:tblLayout w:type="fixed"/>
         <w:tblLook w:firstColumn="1" w:firstRow="1" w:lastColumn="0" w:lastRow="0" w:noHBand="0" w:noVBand="1" w:val="04A0"/>
-        <w:tblLayout w:type="fixed"/>
-        <w:tblBorders>
-          <w:top w:val="single" w:sz="4" w:space="0" w:color="auto"/>
-          <w:left w:val="single" w:sz="4" w:space="0" w:color="auto"/>
-          <w:bottom w:val="single" w:sz="4" w:space="0" w:color="auto"/>
-          <w:right w:val="single" w:sz="4" w:space="0" w:color="auto"/>
-          <w:insideH w:val="single" w:sz="4" w:space="0" w:color="auto"/>
-          <w:insideV w:val="single" w:sz="4" w:space="0" w:color="auto"/>
-        </w:tblBorders>
       </w:tblPr>
       <w:tblGrid>
         <w:gridCol w:w="2297"/>
@@ -4195,9 +4118,7 @@
       <w:pPr/>
     </w:p>
     <w:p>
-      <w:pPr>
-        <w:jc w:val="both"/>
-      </w:pPr>
+      <w:pPr/>
       <w:r>
         <w:rPr>
           <w:rFonts w:ascii="Sylfaen" w:hAnsi="Sylfaen" w:cs="Sylfaen"/>
@@ -4213,23 +4134,18 @@
         <w:numPr>
           <w:numId w:val="0"/>
         </w:numPr>
-        <w:spacing w:before="160" w:after="80"/>
-        <w:jc w:val="center"/>
       </w:pPr>
       <w:r>
         <w:rPr>
           <w:rFonts w:ascii="Sylfaen" w:hAnsi="Sylfaen" w:cs="Sylfaen"/>
           <w:b/>
-          <w:color w:val="000000"/>
-          <w:sz w:val="28"/>
+          <w:sz w:val="26"/>
         </w:rPr>
         <w:t>3.4 კონცეფციის დამტკიცების იმპლემენტაცია</w:t>
       </w:r>
     </w:p>
     <w:p>
-      <w:pPr>
-        <w:jc w:val="both"/>
-      </w:pPr>
+      <w:pPr/>
       <w:r>
         <w:rPr>
           <w:rFonts w:ascii="Sylfaen" w:hAnsi="Sylfaen" w:cs="Sylfaen"/>
@@ -4240,9 +4156,7 @@
       </w:r>
     </w:p>
     <w:p>
-      <w:pPr>
-        <w:jc w:val="both"/>
-      </w:pPr>
+      <w:pPr/>
       <w:r>
         <w:rPr>
           <w:rFonts w:ascii="Sylfaen" w:hAnsi="Sylfaen" w:cs="Sylfaen"/>
@@ -4258,23 +4172,18 @@
         <w:numPr>
           <w:numId w:val="0"/>
         </w:numPr>
-        <w:spacing w:before="160" w:after="80"/>
-        <w:jc w:val="center"/>
       </w:pPr>
       <w:r>
         <w:rPr>
           <w:rFonts w:ascii="Sylfaen" w:hAnsi="Sylfaen" w:cs="Sylfaen"/>
           <w:b/>
-          <w:color w:val="000000"/>
-          <w:sz w:val="28"/>
+          <w:sz w:val="26"/>
         </w:rPr>
         <w:t>3.5 შეფასების მეთოდოლოგია</w:t>
       </w:r>
     </w:p>
     <w:p>
-      <w:pPr>
-        <w:jc w:val="both"/>
-      </w:pPr>
+      <w:pPr/>
       <w:r>
         <w:rPr>
           <w:rFonts w:ascii="Sylfaen" w:hAnsi="Sylfaen" w:cs="Sylfaen"/>
@@ -4285,9 +4194,7 @@
       </w:r>
     </w:p>
     <w:p>
-      <w:pPr>
-        <w:jc w:val="both"/>
-      </w:pPr>
+      <w:pPr/>
       <w:r>
         <w:rPr>
           <w:rFonts w:ascii="Sylfaen" w:hAnsi="Sylfaen" w:cs="Sylfaen"/>
@@ -4298,9 +4205,7 @@
       </w:r>
     </w:p>
     <w:p>
-      <w:pPr>
-        <w:jc w:val="both"/>
-      </w:pPr>
+      <w:pPr/>
       <w:r>
         <w:rPr>
           <w:rFonts w:ascii="Sylfaen" w:hAnsi="Sylfaen" w:cs="Sylfaen"/>
@@ -4311,9 +4216,7 @@
       </w:r>
     </w:p>
     <w:p>
-      <w:pPr>
-        <w:jc w:val="both"/>
-      </w:pPr>
+      <w:pPr/>
       <w:r>
         <w:rPr>
           <w:rFonts w:ascii="Sylfaen" w:hAnsi="Sylfaen" w:cs="Sylfaen"/>
@@ -4324,9 +4227,7 @@
       </w:r>
     </w:p>
     <w:p>
-      <w:pPr>
-        <w:jc w:val="both"/>
-      </w:pPr>
+      <w:pPr/>
       <w:r>
         <w:rPr>
           <w:rFonts w:ascii="Sylfaen" w:hAnsi="Sylfaen" w:cs="Sylfaen"/>
@@ -4342,23 +4243,18 @@
         <w:numPr>
           <w:numId w:val="0"/>
         </w:numPr>
-        <w:spacing w:before="160" w:after="80"/>
-        <w:jc w:val="center"/>
       </w:pPr>
       <w:r>
         <w:rPr>
           <w:rFonts w:ascii="Sylfaen" w:hAnsi="Sylfaen" w:cs="Sylfaen"/>
           <w:b/>
-          <w:color w:val="000000"/>
-          <w:sz w:val="28"/>
+          <w:sz w:val="26"/>
         </w:rPr>
         <w:t>3.6 ზომები და ინსტრუმენტები</w:t>
       </w:r>
     </w:p>
     <w:p>
-      <w:pPr>
-        <w:jc w:val="both"/>
-      </w:pPr>
+      <w:pPr/>
       <w:r>
         <w:rPr>
           <w:rFonts w:ascii="Sylfaen" w:hAnsi="Sylfaen" w:cs="Sylfaen"/>
@@ -4369,9 +4265,7 @@
       </w:r>
     </w:p>
     <w:p>
-      <w:pPr>
-        <w:jc w:val="both"/>
-      </w:pPr>
+      <w:pPr/>
       <w:r>
         <w:rPr>
           <w:rFonts w:ascii="Sylfaen" w:hAnsi="Sylfaen" w:cs="Sylfaen"/>
@@ -4382,9 +4276,7 @@
       </w:r>
     </w:p>
     <w:p>
-      <w:pPr>
-        <w:jc w:val="both"/>
-      </w:pPr>
+      <w:pPr/>
       <w:r>
         <w:rPr>
           <w:rFonts w:ascii="Sylfaen" w:hAnsi="Sylfaen" w:cs="Sylfaen"/>
@@ -4395,9 +4287,7 @@
       </w:r>
     </w:p>
     <w:p>
-      <w:pPr>
-        <w:jc w:val="both"/>
-      </w:pPr>
+      <w:pPr/>
       <w:r>
         <w:rPr>
           <w:rFonts w:ascii="Sylfaen" w:hAnsi="Sylfaen" w:cs="Sylfaen"/>
@@ -4408,9 +4298,7 @@
       </w:r>
     </w:p>
     <w:p>
-      <w:pPr>
-        <w:jc w:val="both"/>
-      </w:pPr>
+      <w:pPr/>
       <w:r>
         <w:rPr>
           <w:rFonts w:ascii="Sylfaen" w:hAnsi="Sylfaen" w:cs="Sylfaen"/>
@@ -4421,9 +4309,7 @@
       </w:r>
     </w:p>
     <w:p>
-      <w:pPr>
-        <w:jc w:val="both"/>
-      </w:pPr>
+      <w:pPr/>
       <w:r>
         <w:rPr>
           <w:rFonts w:ascii="Sylfaen" w:hAnsi="Sylfaen" w:cs="Sylfaen"/>
@@ -4439,23 +4325,18 @@
         <w:numPr>
           <w:numId w:val="0"/>
         </w:numPr>
-        <w:spacing w:before="160" w:after="80"/>
-        <w:jc w:val="center"/>
       </w:pPr>
       <w:r>
         <w:rPr>
           <w:rFonts w:ascii="Sylfaen" w:hAnsi="Sylfaen" w:cs="Sylfaen"/>
           <w:b/>
-          <w:color w:val="000000"/>
-          <w:sz w:val="28"/>
+          <w:sz w:val="26"/>
         </w:rPr>
         <w:t>3.7 ანალიზის გეგმა</w:t>
       </w:r>
     </w:p>
     <w:p>
-      <w:pPr>
-        <w:jc w:val="both"/>
-      </w:pPr>
+      <w:pPr/>
       <w:r>
         <w:rPr>
           <w:rFonts w:ascii="Sylfaen" w:hAnsi="Sylfaen" w:cs="Sylfaen"/>
@@ -4466,9 +4347,7 @@
       </w:r>
     </w:p>
     <w:p>
-      <w:pPr>
-        <w:jc w:val="both"/>
-      </w:pPr>
+      <w:pPr/>
       <w:r>
         <w:rPr>
           <w:rFonts w:ascii="Sylfaen" w:hAnsi="Sylfaen" w:cs="Sylfaen"/>
@@ -4479,9 +4358,7 @@
       </w:r>
     </w:p>
     <w:p>
-      <w:pPr>
-        <w:jc w:val="both"/>
-      </w:pPr>
+      <w:pPr/>
       <w:r>
         <w:rPr>
           <w:rFonts w:ascii="Sylfaen" w:hAnsi="Sylfaen" w:cs="Sylfaen"/>
@@ -4497,23 +4374,18 @@
         <w:numPr>
           <w:numId w:val="0"/>
         </w:numPr>
-        <w:spacing w:before="160" w:after="80"/>
-        <w:jc w:val="center"/>
       </w:pPr>
       <w:r>
         <w:rPr>
           <w:rFonts w:ascii="Sylfaen" w:hAnsi="Sylfaen" w:cs="Sylfaen"/>
           <w:b/>
-          <w:color w:val="000000"/>
-          <w:sz w:val="28"/>
+          <w:sz w:val="26"/>
         </w:rPr>
         <w:t>3.8 ეთიკური საკითხები და შეზღუდვები</w:t>
       </w:r>
     </w:p>
     <w:p>
-      <w:pPr>
-        <w:jc w:val="both"/>
-      </w:pPr>
+      <w:pPr/>
       <w:r>
         <w:rPr>
           <w:rFonts w:ascii="Sylfaen" w:hAnsi="Sylfaen" w:cs="Sylfaen"/>
@@ -4524,9 +4396,7 @@
       </w:r>
     </w:p>
     <w:p>
-      <w:pPr>
-        <w:jc w:val="both"/>
-      </w:pPr>
+      <w:pPr/>
       <w:r>
         <w:rPr>
           <w:rFonts w:ascii="Sylfaen" w:hAnsi="Sylfaen" w:cs="Sylfaen"/>
@@ -4537,9 +4407,7 @@
       </w:r>
     </w:p>
     <w:p>
-      <w:pPr>
-        <w:jc w:val="both"/>
-      </w:pPr>
+      <w:pPr/>
       <w:r>
         <w:rPr>
           <w:rFonts w:ascii="Sylfaen" w:hAnsi="Sylfaen" w:cs="Sylfaen"/>
@@ -4550,9 +4418,7 @@
       </w:r>
     </w:p>
     <w:p>
-      <w:pPr>
-        <w:jc w:val="both"/>
-      </w:pPr>
+      <w:pPr/>
       <w:r>
         <w:rPr>
           <w:rFonts w:ascii="Sylfaen" w:hAnsi="Sylfaen" w:cs="Sylfaen"/>
@@ -4563,9 +4429,7 @@
       </w:r>
     </w:p>
     <w:p>
-      <w:pPr>
-        <w:jc w:val="both"/>
-      </w:pPr>
+      <w:pPr/>
       <w:r>
         <w:rPr>
           <w:rFonts w:ascii="Sylfaen" w:hAnsi="Sylfaen" w:cs="Sylfaen"/>
@@ -4582,23 +4446,18 @@
         <w:numPr>
           <w:numId w:val="0"/>
         </w:numPr>
-        <w:spacing w:before="360" w:after="80"/>
-        <w:jc w:val="center"/>
       </w:pPr>
       <w:r>
         <w:rPr>
           <w:rFonts w:ascii="Sylfaen" w:hAnsi="Sylfaen" w:cs="Sylfaen"/>
           <w:b/>
-          <w:color w:val="000000"/>
           <w:sz w:val="28"/>
         </w:rPr>
         <w:t>4. შედეგები და განხილვა</w:t>
       </w:r>
     </w:p>
     <w:p>
-      <w:pPr>
-        <w:jc w:val="both"/>
-      </w:pPr>
+      <w:pPr/>
       <w:r>
         <w:rPr>
           <w:rFonts w:ascii="Sylfaen" w:hAnsi="Sylfaen" w:cs="Sylfaen"/>
@@ -4614,23 +4473,18 @@
         <w:numPr>
           <w:numId w:val="0"/>
         </w:numPr>
-        <w:spacing w:before="160" w:after="80"/>
-        <w:jc w:val="center"/>
       </w:pPr>
       <w:r>
         <w:rPr>
           <w:rFonts w:ascii="Sylfaen" w:hAnsi="Sylfaen" w:cs="Sylfaen"/>
           <w:b/>
-          <w:color w:val="000000"/>
-          <w:sz w:val="28"/>
+          <w:sz w:val="26"/>
         </w:rPr>
         <w:t>4.1 კონცეფციის დამტკიცება: მასშტაბი და სიზუსტე</w:t>
       </w:r>
     </w:p>
     <w:p>
-      <w:pPr>
-        <w:jc w:val="both"/>
-      </w:pPr>
+      <w:pPr/>
       <w:r>
         <w:rPr>
           <w:rFonts w:ascii="Sylfaen" w:hAnsi="Sylfaen" w:cs="Sylfaen"/>
@@ -4667,17 +4521,16 @@
     <w:tbl>
       <w:tblPr>
         <w:tblW w:type="auto" w:w="0"/>
+        <w:tblBorders>
+          <w:top w:val="single" w:sz="4" w:space="0" w:color="000000"/>
+          <w:left w:val="single" w:sz="4" w:space="0" w:color="000000"/>
+          <w:bottom w:val="single" w:sz="4" w:space="0" w:color="000000"/>
+          <w:right w:val="single" w:sz="4" w:space="0" w:color="000000"/>
+          <w:insideH w:val="single" w:sz="4" w:space="0" w:color="000000"/>
+          <w:insideV w:val="single" w:sz="4" w:space="0" w:color="000000"/>
+        </w:tblBorders>
         <w:tblLayout w:type="fixed"/>
         <w:tblLook w:firstColumn="1" w:firstRow="1" w:lastColumn="0" w:lastRow="0" w:noHBand="0" w:noVBand="1" w:val="04A0"/>
-        <w:tblLayout w:type="fixed"/>
-        <w:tblBorders>
-          <w:top w:val="single" w:sz="4" w:space="0" w:color="auto"/>
-          <w:left w:val="single" w:sz="4" w:space="0" w:color="auto"/>
-          <w:bottom w:val="single" w:sz="4" w:space="0" w:color="auto"/>
-          <w:right w:val="single" w:sz="4" w:space="0" w:color="auto"/>
-          <w:insideH w:val="single" w:sz="4" w:space="0" w:color="auto"/>
-          <w:insideV w:val="single" w:sz="4" w:space="0" w:color="auto"/>
-        </w:tblBorders>
       </w:tblPr>
       <w:tblGrid>
         <w:gridCol w:w="4167"/>
@@ -5030,9 +4883,7 @@
       <w:pPr/>
     </w:p>
     <w:p>
-      <w:pPr>
-        <w:jc w:val="both"/>
-      </w:pPr>
+      <w:pPr/>
       <w:r>
         <w:rPr>
           <w:rFonts w:ascii="Sylfaen" w:hAnsi="Sylfaen" w:cs="Sylfaen"/>
@@ -5048,23 +4899,18 @@
         <w:numPr>
           <w:numId w:val="0"/>
         </w:numPr>
-        <w:spacing w:before="160" w:after="80"/>
-        <w:jc w:val="center"/>
       </w:pPr>
       <w:r>
         <w:rPr>
           <w:rFonts w:ascii="Sylfaen" w:hAnsi="Sylfaen" w:cs="Sylfaen"/>
           <w:b/>
-          <w:color w:val="000000"/>
-          <w:sz w:val="28"/>
+          <w:sz w:val="26"/>
         </w:rPr>
         <w:t>4.2 ტექნიკური შედეგები</w:t>
       </w:r>
     </w:p>
     <w:p>
-      <w:pPr>
-        <w:jc w:val="both"/>
-      </w:pPr>
+      <w:pPr/>
       <w:r>
         <w:rPr>
           <w:rFonts w:ascii="Sylfaen" w:hAnsi="Sylfaen" w:cs="Sylfaen"/>
@@ -5090,17 +4936,16 @@
     <w:tbl>
       <w:tblPr>
         <w:tblW w:type="auto" w:w="0"/>
+        <w:tblBorders>
+          <w:top w:val="single" w:sz="4" w:space="0" w:color="000000"/>
+          <w:left w:val="single" w:sz="4" w:space="0" w:color="000000"/>
+          <w:bottom w:val="single" w:sz="4" w:space="0" w:color="000000"/>
+          <w:right w:val="single" w:sz="4" w:space="0" w:color="000000"/>
+          <w:insideH w:val="single" w:sz="4" w:space="0" w:color="000000"/>
+          <w:insideV w:val="single" w:sz="4" w:space="0" w:color="000000"/>
+        </w:tblBorders>
         <w:tblLayout w:type="fixed"/>
         <w:tblLook w:firstColumn="1" w:firstRow="1" w:lastColumn="0" w:lastRow="0" w:noHBand="0" w:noVBand="1" w:val="04A0"/>
-        <w:tblLayout w:type="fixed"/>
-        <w:tblBorders>
-          <w:top w:val="single" w:sz="4" w:space="0" w:color="auto"/>
-          <w:left w:val="single" w:sz="4" w:space="0" w:color="auto"/>
-          <w:bottom w:val="single" w:sz="4" w:space="0" w:color="auto"/>
-          <w:right w:val="single" w:sz="4" w:space="0" w:color="auto"/>
-          <w:insideH w:val="single" w:sz="4" w:space="0" w:color="auto"/>
-          <w:insideV w:val="single" w:sz="4" w:space="0" w:color="auto"/>
-        </w:tblBorders>
       </w:tblPr>
       <w:tblGrid>
         <w:gridCol w:w="3266"/>
@@ -5483,9 +5328,7 @@
       <w:pPr/>
     </w:p>
     <w:p>
-      <w:pPr>
-        <w:jc w:val="both"/>
-      </w:pPr>
+      <w:pPr/>
       <w:r>
         <w:rPr>
           <w:rFonts w:ascii="Sylfaen" w:hAnsi="Sylfaen" w:cs="Sylfaen"/>
@@ -5496,9 +5339,7 @@
       </w:r>
     </w:p>
     <w:p>
-      <w:pPr>
-        <w:jc w:val="both"/>
-      </w:pPr>
+      <w:pPr/>
       <w:r>
         <w:rPr>
           <w:rFonts w:ascii="Sylfaen" w:hAnsi="Sylfaen" w:cs="Sylfaen"/>
@@ -5509,9 +5350,7 @@
       </w:r>
     </w:p>
     <w:p>
-      <w:pPr>
-        <w:jc w:val="both"/>
-      </w:pPr>
+      <w:pPr/>
       <w:r>
         <w:rPr>
           <w:rFonts w:ascii="Sylfaen" w:hAnsi="Sylfaen" w:cs="Sylfaen"/>
@@ -5527,23 +5366,18 @@
         <w:numPr>
           <w:numId w:val="0"/>
         </w:numPr>
-        <w:spacing w:before="160" w:after="80"/>
-        <w:jc w:val="center"/>
       </w:pPr>
       <w:r>
         <w:rPr>
           <w:rFonts w:ascii="Sylfaen" w:hAnsi="Sylfaen" w:cs="Sylfaen"/>
           <w:b/>
-          <w:color w:val="000000"/>
-          <w:sz w:val="28"/>
+          <w:sz w:val="26"/>
         </w:rPr>
         <w:t>4.3 სიმულირებული აღქმის შედეგები</w:t>
       </w:r>
     </w:p>
     <w:p>
-      <w:pPr>
-        <w:jc w:val="both"/>
-      </w:pPr>
+      <w:pPr/>
       <w:r>
         <w:rPr>
           <w:rFonts w:ascii="Sylfaen" w:hAnsi="Sylfaen" w:cs="Sylfaen"/>
@@ -5569,17 +5403,16 @@
     <w:tbl>
       <w:tblPr>
         <w:tblW w:type="auto" w:w="0"/>
+        <w:tblBorders>
+          <w:top w:val="single" w:sz="4" w:space="0" w:color="000000"/>
+          <w:left w:val="single" w:sz="4" w:space="0" w:color="000000"/>
+          <w:bottom w:val="single" w:sz="4" w:space="0" w:color="000000"/>
+          <w:right w:val="single" w:sz="4" w:space="0" w:color="000000"/>
+          <w:insideH w:val="single" w:sz="4" w:space="0" w:color="000000"/>
+          <w:insideV w:val="single" w:sz="4" w:space="0" w:color="000000"/>
+        </w:tblBorders>
         <w:tblLayout w:type="fixed"/>
         <w:tblLook w:firstColumn="1" w:firstRow="1" w:lastColumn="0" w:lastRow="0" w:noHBand="0" w:noVBand="1" w:val="04A0"/>
-        <w:tblLayout w:type="fixed"/>
-        <w:tblBorders>
-          <w:top w:val="single" w:sz="4" w:space="0" w:color="auto"/>
-          <w:left w:val="single" w:sz="4" w:space="0" w:color="auto"/>
-          <w:bottom w:val="single" w:sz="4" w:space="0" w:color="auto"/>
-          <w:right w:val="single" w:sz="4" w:space="0" w:color="auto"/>
-          <w:insideH w:val="single" w:sz="4" w:space="0" w:color="auto"/>
-          <w:insideV w:val="single" w:sz="4" w:space="0" w:color="auto"/>
-        </w:tblBorders>
       </w:tblPr>
       <w:tblGrid>
         <w:gridCol w:w="4671"/>
@@ -6254,9 +6087,7 @@
       <w:pPr/>
     </w:p>
     <w:p>
-      <w:pPr>
-        <w:jc w:val="both"/>
-      </w:pPr>
+      <w:pPr/>
       <w:r>
         <w:rPr>
           <w:rFonts w:ascii="Sylfaen" w:hAnsi="Sylfaen" w:cs="Sylfaen"/>
@@ -6267,9 +6098,7 @@
       </w:r>
     </w:p>
     <w:p>
-      <w:pPr>
-        <w:jc w:val="both"/>
-      </w:pPr>
+      <w:pPr/>
       <w:r>
         <w:rPr>
           <w:rFonts w:ascii="Sylfaen" w:hAnsi="Sylfaen" w:cs="Sylfaen"/>
@@ -6280,9 +6109,7 @@
       </w:r>
     </w:p>
     <w:p>
-      <w:pPr>
-        <w:jc w:val="both"/>
-      </w:pPr>
+      <w:pPr/>
       <w:r>
         <w:rPr>
           <w:rFonts w:ascii="Sylfaen" w:hAnsi="Sylfaen" w:cs="Sylfaen"/>
@@ -6298,23 +6125,18 @@
         <w:numPr>
           <w:numId w:val="0"/>
         </w:numPr>
-        <w:spacing w:before="160" w:after="80"/>
-        <w:jc w:val="center"/>
       </w:pPr>
       <w:r>
         <w:rPr>
           <w:rFonts w:ascii="Sylfaen" w:hAnsi="Sylfaen" w:cs="Sylfaen"/>
           <w:b/>
-          <w:color w:val="000000"/>
-          <w:sz w:val="28"/>
+          <w:sz w:val="26"/>
         </w:rPr>
         <w:t>4.4 განხილვა</w:t>
       </w:r>
     </w:p>
     <w:p>
-      <w:pPr>
-        <w:jc w:val="both"/>
-      </w:pPr>
+      <w:pPr/>
       <w:r>
         <w:rPr>
           <w:rFonts w:ascii="Sylfaen" w:hAnsi="Sylfaen" w:cs="Sylfaen"/>
@@ -6325,9 +6147,7 @@
       </w:r>
     </w:p>
     <w:p>
-      <w:pPr>
-        <w:jc w:val="both"/>
-      </w:pPr>
+      <w:pPr/>
       <w:r>
         <w:rPr>
           <w:rFonts w:ascii="Sylfaen" w:hAnsi="Sylfaen" w:cs="Sylfaen"/>
@@ -6338,9 +6158,7 @@
       </w:r>
     </w:p>
     <w:p>
-      <w:pPr>
-        <w:jc w:val="both"/>
-      </w:pPr>
+      <w:pPr/>
       <w:r>
         <w:rPr>
           <w:rFonts w:ascii="Sylfaen" w:hAnsi="Sylfaen" w:cs="Sylfaen"/>
@@ -6356,23 +6174,18 @@
         <w:numPr>
           <w:numId w:val="0"/>
         </w:numPr>
-        <w:spacing w:before="160" w:after="80"/>
-        <w:jc w:val="center"/>
       </w:pPr>
       <w:r>
         <w:rPr>
           <w:rFonts w:ascii="Sylfaen" w:hAnsi="Sylfaen" w:cs="Sylfaen"/>
           <w:b/>
-          <w:color w:val="000000"/>
-          <w:sz w:val="28"/>
+          <w:sz w:val="26"/>
         </w:rPr>
         <w:t>4.5 შეფასების შეზღუდვები</w:t>
       </w:r>
     </w:p>
     <w:p>
-      <w:pPr>
-        <w:jc w:val="both"/>
-      </w:pPr>
+      <w:pPr/>
       <w:r>
         <w:rPr>
           <w:rFonts w:ascii="Sylfaen" w:hAnsi="Sylfaen" w:cs="Sylfaen"/>
@@ -6389,23 +6202,18 @@
         <w:numPr>
           <w:numId w:val="0"/>
         </w:numPr>
-        <w:spacing w:before="360" w:after="80"/>
-        <w:jc w:val="center"/>
       </w:pPr>
       <w:r>
         <w:rPr>
           <w:rFonts w:ascii="Sylfaen" w:hAnsi="Sylfaen" w:cs="Sylfaen"/>
           <w:b/>
-          <w:color w:val="000000"/>
           <w:sz w:val="28"/>
         </w:rPr>
         <w:t>5. დასკვნა</w:t>
       </w:r>
     </w:p>
     <w:p>
-      <w:pPr>
-        <w:jc w:val="both"/>
-      </w:pPr>
+      <w:pPr/>
       <w:r>
         <w:rPr>
           <w:rFonts w:ascii="Sylfaen" w:hAnsi="Sylfaen" w:cs="Sylfaen"/>
@@ -6421,23 +6229,18 @@
         <w:numPr>
           <w:numId w:val="0"/>
         </w:numPr>
-        <w:spacing w:before="160" w:after="80"/>
-        <w:jc w:val="center"/>
       </w:pPr>
       <w:r>
         <w:rPr>
           <w:rFonts w:ascii="Sylfaen" w:hAnsi="Sylfaen" w:cs="Sylfaen"/>
           <w:b/>
-          <w:color w:val="000000"/>
-          <w:sz w:val="28"/>
+          <w:sz w:val="26"/>
         </w:rPr>
         <w:t>5.1 წვლილის შეჯამება</w:t>
       </w:r>
     </w:p>
     <w:p>
-      <w:pPr>
-        <w:jc w:val="both"/>
-      </w:pPr>
+      <w:pPr/>
       <w:r>
         <w:rPr>
           <w:rFonts w:ascii="Sylfaen" w:hAnsi="Sylfaen" w:cs="Sylfaen"/>
@@ -6453,23 +6256,18 @@
         <w:numPr>
           <w:numId w:val="0"/>
         </w:numPr>
-        <w:spacing w:before="160" w:after="80"/>
-        <w:jc w:val="center"/>
       </w:pPr>
       <w:r>
         <w:rPr>
           <w:rFonts w:ascii="Sylfaen" w:hAnsi="Sylfaen" w:cs="Sylfaen"/>
           <w:b/>
-          <w:color w:val="000000"/>
-          <w:sz w:val="28"/>
+          <w:sz w:val="26"/>
         </w:rPr>
         <w:t>5.2 შედეგების შეჯამება</w:t>
       </w:r>
     </w:p>
     <w:p>
-      <w:pPr>
-        <w:jc w:val="both"/>
-      </w:pPr>
+      <w:pPr/>
       <w:r>
         <w:rPr>
           <w:rFonts w:ascii="Sylfaen" w:hAnsi="Sylfaen" w:cs="Sylfaen"/>
@@ -6485,23 +6283,18 @@
         <w:numPr>
           <w:numId w:val="0"/>
         </w:numPr>
-        <w:spacing w:before="160" w:after="80"/>
-        <w:jc w:val="center"/>
       </w:pPr>
       <w:r>
         <w:rPr>
           <w:rFonts w:ascii="Sylfaen" w:hAnsi="Sylfaen" w:cs="Sylfaen"/>
           <w:b/>
-          <w:color w:val="000000"/>
-          <w:sz w:val="28"/>
+          <w:sz w:val="26"/>
         </w:rPr>
         <w:t>5.3 სამომავლო სამუშაო</w:t>
       </w:r>
     </w:p>
     <w:p>
-      <w:pPr>
-        <w:jc w:val="both"/>
-      </w:pPr>
+      <w:pPr/>
       <w:r>
         <w:rPr>
           <w:rFonts w:ascii="Sylfaen" w:hAnsi="Sylfaen" w:cs="Sylfaen"/>
@@ -6518,14 +6311,11 @@
         <w:numPr>
           <w:numId w:val="0"/>
         </w:numPr>
-        <w:spacing w:before="360" w:after="80"/>
-        <w:jc w:val="center"/>
       </w:pPr>
       <w:r>
         <w:rPr>
           <w:rFonts w:ascii="Sylfaen" w:hAnsi="Sylfaen" w:cs="Sylfaen"/>
           <w:b/>
-          <w:color w:val="000000"/>
           <w:sz w:val="28"/>
         </w:rPr>
         <w:t>ბიბლიოგრაფია</w:t>
@@ -6988,7 +6778,7 @@
     </w:p>
     <w:sectPr>
       <w:pgSz w:w="11906" w:h="16838" w:code="9"/>
-      <w:pgMar w:top="1417" w:right="1417" w:bottom="1417" w:left="2154" w:header="720" w:footer="720" w:gutter="0"/>
+      <w:pgMar w:top="1418" w:right="1418" w:bottom="1418" w:left="2155" w:header="720" w:footer="720" w:gutter="0"/>
       <w:pgNumType w:start="1"/>
       <w:cols w:space="720"/>
       <w:docGrid w:linePitch="360"/>
@@ -11513,14 +11303,12 @@
       <w:numPr>
         <w:numId w:val="30"/>
       </w:numPr>
-      <w:spacing w:before="360" w:after="80"/>
-      <w:jc w:val="center"/>
+      <w:spacing w:before="240" w:after="0"/>
       <w:outlineLvl w:val="0"/>
     </w:pPr>
     <w:rPr>
-      <w:rFonts w:eastAsiaTheme="majorEastAsia" w:cstheme="majorBidi" w:ascii="Sylfaen" w:hAnsi="Sylfaen"/>
-      <w:b/>
-      <w:color w:val="000000"/>
+      <w:rFonts w:eastAsiaTheme="majorEastAsia" w:cstheme="majorBidi"/>
+      <w:color w:val="2F5496" w:themeColor="accent1" w:themeShade="BF"/>
       <w:sz w:val="28"/>
       <w:szCs w:val="32"/>
     </w:rPr>
@@ -11537,16 +11325,13 @@
         <w:ilvl w:val="1"/>
         <w:numId w:val="30"/>
       </w:numPr>
-      <w:spacing w:before="160" w:beforeAutospacing="1" w:after="80" w:afterAutospacing="1" w:line="240" w:lineRule="auto"/>
-      <w:jc w:val="center"/>
+      <w:spacing w:before="100" w:beforeAutospacing="1" w:after="100" w:afterAutospacing="1" w:line="240" w:lineRule="auto"/>
       <w:outlineLvl w:val="1"/>
     </w:pPr>
     <w:rPr>
-      <w:rFonts w:eastAsia="Times New Roman" w:cs="Times New Roman" w:ascii="Sylfaen" w:hAnsi="Sylfaen"/>
+      <w:rFonts w:eastAsia="Times New Roman" w:cs="Times New Roman"/>
       <w:b/>
       <w:bCs/>
-      <w:color w:val="000000"/>
-      <w:sz w:val="28"/>
       <w:szCs w:val="36"/>
     </w:rPr>
   </w:style>
@@ -11566,15 +11351,11 @@
         <w:ilvl w:val="2"/>
         <w:numId w:val="30"/>
       </w:numPr>
-      <w:spacing w:before="160" w:after="80"/>
-      <w:jc w:val="center"/>
+      <w:spacing w:before="40" w:after="0"/>
       <w:outlineLvl w:val="2"/>
     </w:pPr>
     <w:rPr>
-      <w:rFonts w:eastAsiaTheme="majorEastAsia" w:cstheme="majorBidi" w:ascii="Sylfaen" w:hAnsi="Sylfaen"/>
-      <w:b/>
-      <w:color w:val="000000"/>
-      <w:sz w:val="28"/>
+      <w:rFonts w:eastAsiaTheme="majorEastAsia" w:cstheme="majorBidi"/>
       <w:szCs w:val="24"/>
     </w:rPr>
   </w:style>
@@ -12255,54 +12036,6 @@
       <w:szCs w:val="24"/>
     </w:rPr>
   </w:style>
-  <w:style w:type="paragraph" w:customStyle="1" w:styleId="TOC1">
-    <w:name w:val="TOC 1"/>
-    <w:basedOn w:val="Normal"/>
-    <w:pPr>
-      <w:tabs>
-        <w:tab w:pos="8323" w:val="right" w:leader="dot"/>
-      </w:tabs>
-      <w:spacing w:line="240" w:lineRule="auto" w:after="0" w:before="0"/>
-      <w:ind w:left="0"/>
-    </w:pPr>
-    <w:rPr>
-      <w:rFonts w:ascii="Sylfaen" w:hAnsi="Sylfaen"/>
-      <w:color w:val="000000"/>
-      <w:sz w:val="24"/>
-    </w:rPr>
-  </w:style>
-  <w:style w:type="paragraph" w:customStyle="1" w:styleId="TOC2">
-    <w:name w:val="TOC 2"/>
-    <w:basedOn w:val="Normal"/>
-    <w:pPr>
-      <w:tabs>
-        <w:tab w:pos="8323" w:val="right" w:leader="dot"/>
-      </w:tabs>
-      <w:spacing w:line="240" w:lineRule="auto" w:after="0" w:before="0"/>
-      <w:ind w:left="454"/>
-    </w:pPr>
-    <w:rPr>
-      <w:rFonts w:ascii="Sylfaen" w:hAnsi="Sylfaen"/>
-      <w:color w:val="000000"/>
-      <w:sz w:val="24"/>
-    </w:rPr>
-  </w:style>
-  <w:style w:type="paragraph" w:customStyle="1" w:styleId="TOC3">
-    <w:name w:val="TOC 3"/>
-    <w:basedOn w:val="Normal"/>
-    <w:pPr>
-      <w:tabs>
-        <w:tab w:pos="8323" w:val="right" w:leader="dot"/>
-      </w:tabs>
-      <w:spacing w:line="240" w:lineRule="auto" w:after="0" w:before="0"/>
-      <w:ind w:left="907"/>
-    </w:pPr>
-    <w:rPr>
-      <w:rFonts w:ascii="Sylfaen" w:hAnsi="Sylfaen"/>
-      <w:color w:val="000000"/>
-      <w:sz w:val="24"/>
-    </w:rPr>
-  </w:style>
 </w:styles>
 </file>
 

</xml_diff>

<commit_message>
feat(build): durable inline title page (reuse f187836's layout)
build.py now replaces the template's floating-box title page (a full-page
image, big logo, not searchable) with clean inline text + a centred ~11cm
logo — reproducing the format-session's f187836 layout so it survives every
content rebuild instead of getting clobbered. 0 text boxes, schema-valid.
Resolves the build.py↔format_thesis.py title-page conflict: build.py owns a
good title page; the formatter no longer needs to rebuild it.

Co-Authored-By: Claude Opus 4.8 <noreply@anthropic.com>
</commit_message>
<xml_diff>
--- a/project/thesis-ka.docx
+++ b/project/thesis-ka.docx
@@ -4,859 +4,157 @@
   <w:body>
     <w:p>
       <w:pPr>
-        <w:pStyle w:val="BodyText"/>
-        <w:spacing w:before="120" w:after="240"/>
-        <w:ind w:left="-284"/>
+        <w:spacing w:line="240" w:lineRule="auto" w:after="0"/>
         <w:jc w:val="center"/>
-        <w:rPr>
-          <w:b/>
-        </w:rPr>
-      </w:pPr>
-      <w:bookmarkStart w:id="0" w:name="_Hlk108034490"/>
-      <w:r>
-        <w:rPr>
-          <w:b/>
-          <w:noProof/>
-          <w:lang w:val="ka-GE"/>
-        </w:rPr>
-        <mc:AlternateContent>
-          <mc:Choice Requires="wps">
-            <w:drawing>
-              <wp:anchor distT="0" distB="0" distL="114300" distR="114300" simplePos="0" relativeHeight="251660288" behindDoc="0" locked="0" layoutInCell="1" allowOverlap="1" wp14:anchorId="0D11978C" wp14:editId="4B61D8D2">
-                <wp:simplePos x="0" y="0"/>
-                <wp:positionH relativeFrom="column">
-                  <wp:posOffset>3701415</wp:posOffset>
-                </wp:positionH>
-                <wp:positionV relativeFrom="paragraph">
-                  <wp:posOffset>5236845</wp:posOffset>
-                </wp:positionV>
-                <wp:extent cx="3124200" cy="391795"/>
-                <wp:effectExtent l="0" t="1270" r="3810" b="0"/>
-                <wp:wrapNone/>
-                <wp:docPr id="760413624" name="Text Box 5"/>
-                <wp:cNvGraphicFramePr>
-                  <a:graphicFrameLocks xmlns:a="http://schemas.openxmlformats.org/drawingml/2006/main"/>
-                </wp:cNvGraphicFramePr>
-                <a:graphic xmlns:a="http://schemas.openxmlformats.org/drawingml/2006/main">
-                  <a:graphicData uri="http://schemas.microsoft.com/office/word/2010/wordprocessingShape">
-                    <wps:wsp>
-                      <wps:cNvSpPr txBox="1">
-                        <a:spLocks noChangeArrowheads="1"/>
-                      </wps:cNvSpPr>
-                      <wps:spPr bwMode="auto">
-                        <a:xfrm>
-                          <a:off x="0" y="0"/>
-                          <a:ext cx="3124200" cy="391795"/>
-                        </a:xfrm>
-                        <a:prstGeom prst="rect">
-                          <a:avLst/>
-                        </a:prstGeom>
-                        <a:solidFill>
-                          <a:srgbClr val="FFFFFF"/>
-                        </a:solidFill>
-                        <a:ln>
-                          <a:noFill/>
-                        </a:ln>
-                        <a:extLst>
-                          <a:ext uri="{91240B29-F687-4F45-9708-019B960494DF}">
-                            <a14:hiddenLine xmlns:a14="http://schemas.microsoft.com/office/drawing/2010/main" w="9525">
-                              <a:solidFill>
-                                <a:srgbClr val="000000"/>
-                              </a:solidFill>
-                              <a:miter lim="800000"/>
-                              <a:headEnd/>
-                              <a:tailEnd/>
-                            </a14:hiddenLine>
-                          </a:ext>
-                        </a:extLst>
-                      </wps:spPr>
-                      <wps:txbx>
-                        <w:txbxContent>
-                          <w:p>
-                            <w:pPr>
-                              <w:jc w:val="right"/>
-                              <w:rPr>
-                                <w:b/>
-                                <w:bCs/>
-                                <w:szCs w:val="24"/>
-                                <w:lang w:val="ka-GE"/>
-                              </w:rPr>
-                            </w:pPr>
-                            <w:r>
-                              <w:rPr>
-                                <w:b/>
-                                <w:bCs/>
-                                <w:szCs w:val="24"/>
-                                <w:lang w:val="ka-GE"/>
-                              </w:rPr>
-                              <w:t xml:space="preserve">ალექსანდრე იმნაიშვილი </w:t>
-                            </w:r>
-                          </w:p>
-                        </w:txbxContent>
-                      </wps:txbx>
-                      <wps:bodyPr rot="0" vert="horz" wrap="square" lIns="91440" tIns="45720" rIns="91440" bIns="45720" anchor="t" anchorCtr="0" upright="1">
-                        <a:noAutofit/>
-                      </wps:bodyPr>
-                    </wps:wsp>
-                  </a:graphicData>
-                </a:graphic>
-                <wp14:sizeRelH relativeFrom="page">
-                  <wp14:pctWidth>0</wp14:pctWidth>
-                </wp14:sizeRelH>
-                <wp14:sizeRelV relativeFrom="page">
-                  <wp14:pctHeight>0</wp14:pctHeight>
-                </wp14:sizeRelV>
-              </wp:anchor>
-            </w:drawing>
-          </mc:Choice>
-          <mc:Fallback>
-            <w:pict>
-              <v:shapetype w14:anchorId="0D11978C" id="_x0000_t202" coordsize="21600,21600" o:spt="202" path="m,l,21600r21600,l21600,xe">
-                <v:stroke joinstyle="miter"/>
-                <v:path gradientshapeok="t" o:connecttype="rect"/>
-              </v:shapetype>
-              <v:shape id="Text Box 5" o:spid="_x0000_s1026" type="#_x0000_t202" style="position:absolute;left:0;text-align:left;margin-left:291.45pt;margin-top:412.35pt;width:246pt;height:30.85pt;z-index:251660288;visibility:visible;mso-wrap-style:square;mso-width-percent:0;mso-height-percent:0;mso-wrap-distance-left:9pt;mso-wrap-distance-top:0;mso-wrap-distance-right:9pt;mso-wrap-distance-bottom:0;mso-position-horizontal:absolute;mso-position-horizontal-relative:text;mso-position-vertical:absolute;mso-position-vertical-relative:text;mso-width-percent:0;mso-height-percent:0;mso-width-relative:page;mso-height-relative:page;v-text-anchor:top" o:gfxdata="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" stroked="f">
-                <v:textbox>
-                  <w:txbxContent>
-                    <w:p>
-                      <w:pPr>
-                        <w:jc w:val="right"/>
-                        <w:rPr>
-                          <w:b/>
-                          <w:bCs/>
-                          <w:szCs w:val="24"/>
-                          <w:lang w:val="ka-GE"/>
-                        </w:rPr>
-                      </w:pPr>
-                      <w:r>
-                        <w:rPr>
-                          <w:b/>
-                          <w:bCs/>
-                          <w:szCs w:val="24"/>
-                          <w:lang w:val="ka-GE"/>
-                        </w:rPr>
-                        <w:t xml:space="preserve">ალექსანდრე იმნაიშვილი </w:t>
-                      </w:r>
-                    </w:p>
-                  </w:txbxContent>
-                </v:textbox>
-              </v:shape>
-            </w:pict>
-          </mc:Fallback>
-        </mc:AlternateContent>
-      </w:r>
-      <w:r>
-        <w:rPr>
-          <w:noProof/>
-        </w:rPr>
+      </w:pPr>
+      <w:r>
         <w:drawing>
-          <wp:anchor distT="0" distB="0" distL="114300" distR="114300" simplePos="0" relativeHeight="251659264" behindDoc="1" locked="0" layoutInCell="1" allowOverlap="1" wp14:anchorId="3F0A66AC" wp14:editId="6F4A0310">
-            <wp:simplePos x="0" y="0"/>
-            <wp:positionH relativeFrom="margin">
-              <wp:posOffset>161925</wp:posOffset>
-            </wp:positionH>
-            <wp:positionV relativeFrom="margin">
-              <wp:posOffset>-1083945</wp:posOffset>
-            </wp:positionV>
-            <wp:extent cx="6869430" cy="6234430"/>
-            <wp:effectExtent l="0" t="0" r="7620" b="0"/>
-            <wp:wrapSquare wrapText="bothSides"/>
-            <wp:docPr id="927800283" name="Picture 6" descr="A purple rectangle with white text&#10;&#10;Description automatically generated with low confidence"/>
+          <wp:inline xmlns:a="http://schemas.openxmlformats.org/drawingml/2006/main" xmlns:pic="http://schemas.openxmlformats.org/drawingml/2006/picture">
+            <wp:extent cx="3960000" cy="3493333"/>
+            <wp:docPr id="1" name="Picture 1"/>
             <wp:cNvGraphicFramePr>
-              <a:graphicFrameLocks xmlns:a="http://schemas.openxmlformats.org/drawingml/2006/main" noChangeAspect="1"/>
+              <a:graphicFrameLocks noChangeAspect="1"/>
             </wp:cNvGraphicFramePr>
-            <a:graphic xmlns:a="http://schemas.openxmlformats.org/drawingml/2006/main">
+            <a:graphic>
               <a:graphicData uri="http://schemas.openxmlformats.org/drawingml/2006/picture">
-                <pic:pic xmlns:pic="http://schemas.openxmlformats.org/drawingml/2006/picture">
+                <pic:pic>
                   <pic:nvPicPr>
-                    <pic:cNvPr id="927800283" name="Picture 6" descr="A purple rectangle with white text&#10;&#10;Description automatically generated with low confidence"/>
-                    <pic:cNvPicPr>
-                      <a:picLocks noChangeAspect="1" noChangeArrowheads="1"/>
-                    </pic:cNvPicPr>
+                    <pic:cNvPr id="0" name="image.png"/>
+                    <pic:cNvPicPr/>
                   </pic:nvPicPr>
                   <pic:blipFill>
-                    <a:blip r:embed="rId8">
-                      <a:extLst>
-                        <a:ext uri="{28A0092B-C50C-407E-A947-70E740481C1C}">
-                          <a14:useLocalDpi xmlns:a14="http://schemas.microsoft.com/office/drawing/2010/main" val="0"/>
-                        </a:ext>
-                      </a:extLst>
-                    </a:blip>
-                    <a:srcRect l="4326" t="2664" r="4613" b="3600"/>
+                    <a:blip r:embed="rId8"/>
                     <a:stretch>
                       <a:fillRect/>
                     </a:stretch>
                   </pic:blipFill>
-                  <pic:spPr bwMode="auto">
+                  <pic:spPr>
                     <a:xfrm>
                       <a:off x="0" y="0"/>
-                      <a:ext cx="6869430" cy="6234430"/>
+                      <a:ext cx="3960000" cy="3493333"/>
                     </a:xfrm>
-                    <a:prstGeom prst="rect">
-                      <a:avLst/>
-                    </a:prstGeom>
-                    <a:noFill/>
-                    <a:ln>
-                      <a:noFill/>
-                    </a:ln>
+                    <a:prstGeom prst="rect"/>
                   </pic:spPr>
                 </pic:pic>
               </a:graphicData>
             </a:graphic>
-            <wp14:sizeRelH relativeFrom="page">
-              <wp14:pctWidth>0</wp14:pctWidth>
-            </wp14:sizeRelH>
-            <wp14:sizeRelV relativeFrom="page">
-              <wp14:pctHeight>0</wp14:pctHeight>
-            </wp14:sizeRelV>
-          </wp:anchor>
+          </wp:inline>
         </w:drawing>
       </w:r>
-      <w:r>
-        <w:rPr>
+    </w:p>
+    <w:p>
+      <w:pPr>
+        <w:spacing w:line="240" w:lineRule="auto" w:after="0"/>
+        <w:jc w:val="center"/>
+      </w:pPr>
+    </w:p>
+    <w:p>
+      <w:pPr>
+        <w:spacing w:line="240" w:lineRule="auto" w:after="0"/>
+        <w:jc w:val="right"/>
+      </w:pPr>
+      <w:r>
+        <w:rPr>
+          <w:rFonts w:ascii="Sylfaen" w:hAnsi="Sylfaen" w:cs="Sylfaen"/>
           <w:b/>
-        </w:rPr>
-      </w:r>
-    </w:p>
-    <w:p>
-      <w:pPr>
-        <w:pStyle w:val="BodyText"/>
-        <w:spacing w:before="120" w:after="240"/>
+          <w:sz w:val="24"/>
+        </w:rPr>
+        <w:t>ალექსანდრე იმნაიშვილი</w:t>
+      </w:r>
+    </w:p>
+    <w:p>
+      <w:pPr>
+        <w:spacing w:line="240" w:lineRule="auto" w:after="0"/>
         <w:jc w:val="center"/>
-        <w:rPr>
+      </w:pPr>
+    </w:p>
+    <w:p>
+      <w:pPr>
+        <w:spacing w:line="240" w:lineRule="auto" w:after="0"/>
+        <w:jc w:val="center"/>
+      </w:pPr>
+      <w:r>
+        <w:rPr>
+          <w:rFonts w:ascii="Sylfaen" w:hAnsi="Sylfaen" w:cs="Sylfaen"/>
           <w:b/>
-          <w:lang w:val="ka-GE"/>
-        </w:rPr>
-      </w:pPr>
-      <w:r>
-        <w:rPr>
+          <w:sz w:val="32"/>
+        </w:rPr>
+        <w:t>სასაუბრო ხელოვნური ინტელექტი: ასისტენტიდან თანამოსაუბრემდე ევოლუცია</w:t>
+      </w:r>
+    </w:p>
+    <w:p>
+      <w:pPr>
+        <w:spacing w:line="240" w:lineRule="auto" w:after="0"/>
+        <w:jc w:val="center"/>
+      </w:pPr>
+    </w:p>
+    <w:p>
+      <w:pPr>
+        <w:spacing w:line="240" w:lineRule="auto" w:after="0"/>
+        <w:jc w:val="center"/>
+      </w:pPr>
+      <w:r>
+        <w:rPr>
+          <w:rFonts w:ascii="Sylfaen" w:hAnsi="Sylfaen" w:cs="Sylfaen"/>
           <w:b/>
-          <w:noProof/>
-          <w:lang w:val="ka-GE"/>
-        </w:rPr>
-        <mc:AlternateContent>
-          <mc:Choice Requires="wps">
-            <w:drawing>
-              <wp:anchor distT="0" distB="0" distL="114300" distR="114300" simplePos="0" relativeHeight="251661312" behindDoc="0" locked="0" layoutInCell="1" allowOverlap="1" wp14:anchorId="76EF9F23" wp14:editId="2315207D">
-                <wp:simplePos x="0" y="0"/>
-                <wp:positionH relativeFrom="column">
-                  <wp:posOffset>185420</wp:posOffset>
-                </wp:positionH>
-                <wp:positionV relativeFrom="paragraph">
-                  <wp:posOffset>60325</wp:posOffset>
-                </wp:positionV>
-                <wp:extent cx="5040630" cy="848995"/>
-                <wp:effectExtent l="4445" t="4445" r="3175" b="3810"/>
-                <wp:wrapNone/>
-                <wp:docPr id="102204832" name="Text Box 4"/>
-                <wp:cNvGraphicFramePr>
-                  <a:graphicFrameLocks xmlns:a="http://schemas.openxmlformats.org/drawingml/2006/main"/>
-                </wp:cNvGraphicFramePr>
-                <a:graphic xmlns:a="http://schemas.openxmlformats.org/drawingml/2006/main">
-                  <a:graphicData uri="http://schemas.microsoft.com/office/word/2010/wordprocessingShape">
-                    <wps:wsp>
-                      <wps:cNvSpPr txBox="1">
-                        <a:spLocks noChangeArrowheads="1"/>
-                      </wps:cNvSpPr>
-                      <wps:spPr bwMode="auto">
-                        <a:xfrm>
-                          <a:off x="0" y="0"/>
-                          <a:ext cx="5040630" cy="848995"/>
-                        </a:xfrm>
-                        <a:prstGeom prst="rect">
-                          <a:avLst/>
-                        </a:prstGeom>
-                        <a:solidFill>
-                          <a:srgbClr val="FFFFFF"/>
-                        </a:solidFill>
-                        <a:ln>
-                          <a:noFill/>
-                        </a:ln>
-                        <a:extLst>
-                          <a:ext uri="{91240B29-F687-4F45-9708-019B960494DF}">
-                            <a14:hiddenLine xmlns:a14="http://schemas.microsoft.com/office/drawing/2010/main" w="9525">
-                              <a:solidFill>
-                                <a:srgbClr val="000000"/>
-                              </a:solidFill>
-                              <a:miter lim="800000"/>
-                              <a:headEnd/>
-                              <a:tailEnd/>
-                            </a14:hiddenLine>
-                          </a:ext>
-                        </a:extLst>
-                      </wps:spPr>
-                      <wps:txbx>
-                        <w:txbxContent>
-                          <w:p>
-                            <w:pPr>
-                              <w:rPr>
-                                <w:b/>
-                                <w:bCs/>
-                                <w:sz w:val="32"/>
-                                <w:szCs w:val="32"/>
-                                <w:lang w:val="ka-GE"/>
-                              </w:rPr>
-                            </w:pPr>
-                            <w:r>
-                              <w:rPr>
-                                <w:b/>
-                                <w:bCs/>
-                                <w:sz w:val="32"/>
-                                <w:szCs w:val="32"/>
-                                <w:lang w:val="ka-GE"/>
-                              </w:rPr>
-                              <w:t xml:space="preserve">სასაუბრო ხელოვნური ინტელექტი: ასისტენტიდან თანამოსაუბრემდე ევოლუცია </w:t>
-                            </w:r>
-                          </w:p>
-                          <w:p>
-                            <w:pPr>
-                              <w:rPr>
-                                <w:b/>
-                                <w:bCs/>
-                                <w:sz w:val="32"/>
-                                <w:szCs w:val="32"/>
-                                <w:lang w:val="ka-GE"/>
-                              </w:rPr>
-                            </w:pPr>
-                            <w:r>
-                              <w:rPr>
-                                <w:b/>
-                                <w:bCs/>
-                                <w:sz w:val="32"/>
-                                <w:szCs w:val="32"/>
-                                <w:lang w:val="ka-GE"/>
-                              </w:rPr>
-                              <w:t xml:space="preserve"/>
-                            </w:r>
-                          </w:p>
-                        </w:txbxContent>
-                      </wps:txbx>
-                      <wps:bodyPr rot="0" vert="horz" wrap="square" lIns="91440" tIns="45720" rIns="91440" bIns="45720" anchor="t" anchorCtr="0" upright="1">
-                        <a:noAutofit/>
-                      </wps:bodyPr>
-                    </wps:wsp>
-                  </a:graphicData>
-                </a:graphic>
-                <wp14:sizeRelH relativeFrom="page">
-                  <wp14:pctWidth>0</wp14:pctWidth>
-                </wp14:sizeRelH>
-                <wp14:sizeRelV relativeFrom="page">
-                  <wp14:pctHeight>0</wp14:pctHeight>
-                </wp14:sizeRelV>
-              </wp:anchor>
-            </w:drawing>
-          </mc:Choice>
-          <mc:Fallback>
-            <w:pict>
-              <v:shape w14:anchorId="76EF9F23" id="Text Box 4" o:spid="_x0000_s1027" type="#_x0000_t202" style="position:absolute;left:0;text-align:left;margin-left:14.6pt;margin-top:4.75pt;width:396.9pt;height:66.85pt;z-index:251661312;visibility:visible;mso-wrap-style:square;mso-width-percent:0;mso-height-percent:0;mso-wrap-distance-left:9pt;mso-wrap-distance-top:0;mso-wrap-distance-right:9pt;mso-wrap-distance-bottom:0;mso-position-horizontal:absolute;mso-position-horizontal-relative:text;mso-position-vertical:absolute;mso-position-vertical-relative:text;mso-width-percent:0;mso-height-percent:0;mso-width-relative:page;mso-height-relative:page;v-text-anchor:top" o:gfxdata="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" stroked="f">
-                <v:textbox>
-                  <w:txbxContent>
-                    <w:p>
-                      <w:pPr>
-                        <w:rPr>
-                          <w:b/>
-                          <w:bCs/>
-                          <w:sz w:val="32"/>
-                          <w:szCs w:val="32"/>
-                          <w:lang w:val="ka-GE"/>
-                        </w:rPr>
-                      </w:pPr>
-                      <w:r>
-                        <w:rPr>
-                          <w:b/>
-                          <w:bCs/>
-                          <w:sz w:val="32"/>
-                          <w:szCs w:val="32"/>
-                          <w:lang w:val="ka-GE"/>
-                        </w:rPr>
-                        <w:t xml:space="preserve">სასაუბრო ხელოვნური ინტელექტი: ასისტენტიდან თანამოსაუბრემდე ევოლუცია </w:t>
-                      </w:r>
-                    </w:p>
-                    <w:p>
-                      <w:pPr>
-                        <w:rPr>
-                          <w:b/>
-                          <w:bCs/>
-                          <w:sz w:val="32"/>
-                          <w:szCs w:val="32"/>
-                          <w:lang w:val="ka-GE"/>
-                        </w:rPr>
-                      </w:pPr>
-                      <w:r>
-                        <w:rPr>
-                          <w:b/>
-                          <w:bCs/>
-                          <w:sz w:val="32"/>
-                          <w:szCs w:val="32"/>
-                          <w:lang w:val="ka-GE"/>
-                        </w:rPr>
-                        <w:t xml:space="preserve"/>
-                      </w:r>
-                    </w:p>
-                  </w:txbxContent>
-                </v:textbox>
-              </v:shape>
-            </w:pict>
-          </mc:Fallback>
-        </mc:AlternateContent>
-      </w:r>
-    </w:p>
-    <w:p>
-      <w:pPr>
-        <w:pStyle w:val="BodyText"/>
-        <w:spacing w:before="120" w:after="240"/>
+          <w:sz w:val="28"/>
+        </w:rPr>
+        <w:t>შიფრი: [___]</w:t>
+      </w:r>
+    </w:p>
+    <w:p>
+      <w:pPr>
+        <w:spacing w:line="240" w:lineRule="auto" w:after="0"/>
         <w:jc w:val="center"/>
-        <w:rPr>
-          <w:b/>
-          <w:lang w:val="ka-GE"/>
-        </w:rPr>
-      </w:pPr>
-    </w:p>
-    <w:p>
-      <w:pPr>
-        <w:pStyle w:val="BodyText"/>
-        <w:spacing w:before="120" w:after="240"/>
+      </w:pPr>
+    </w:p>
+    <w:p>
+      <w:pPr>
+        <w:spacing w:line="240" w:lineRule="auto" w:after="0"/>
         <w:jc w:val="center"/>
-        <w:rPr>
-          <w:b/>
-          <w:lang w:val="ka-GE"/>
-        </w:rPr>
-      </w:pPr>
-    </w:p>
-    <w:p>
-      <w:pPr>
-        <w:pStyle w:val="BodyText"/>
-        <w:spacing w:before="120" w:after="240"/>
+      </w:pPr>
+    </w:p>
+    <w:p>
+      <w:pPr>
+        <w:spacing w:line="240" w:lineRule="auto" w:after="0"/>
         <w:jc w:val="center"/>
-        <w:rPr>
-          <w:b/>
-          <w:lang w:val="ka-GE"/>
-        </w:rPr>
-      </w:pPr>
-    </w:p>
-    <w:p>
-      <w:pPr>
-        <w:pStyle w:val="BodyText"/>
-        <w:spacing w:before="120" w:after="240"/>
+      </w:pPr>
+      <w:r>
+        <w:rPr>
+          <w:rFonts w:ascii="Sylfaen" w:hAnsi="Sylfaen" w:cs="Sylfaen"/>
+          <w:b w:val="0"/>
+          <w:sz w:val="24"/>
+        </w:rPr>
+        <w:t>საქართველოს ტექნიკური უნივერსიტეტი</w:t>
+      </w:r>
+    </w:p>
+    <w:p>
+      <w:pPr>
+        <w:spacing w:line="240" w:lineRule="auto" w:after="0"/>
         <w:jc w:val="center"/>
-        <w:rPr>
-          <w:b/>
-          <w:lang w:val="ka-GE"/>
-        </w:rPr>
-      </w:pPr>
-    </w:p>
-    <w:p>
-      <w:pPr>
-        <w:pStyle w:val="BodyText"/>
-        <w:spacing w:before="120" w:after="240"/>
+      </w:pPr>
+      <w:r>
+        <w:rPr>
+          <w:rFonts w:ascii="Sylfaen" w:hAnsi="Sylfaen" w:cs="Sylfaen"/>
+          <w:b w:val="0"/>
+          <w:sz w:val="24"/>
+        </w:rPr>
+        <w:t>თბილისი, 0160, საქართველო</w:t>
+      </w:r>
+    </w:p>
+    <w:p>
+      <w:pPr>
+        <w:spacing w:line="240" w:lineRule="auto" w:after="0"/>
         <w:jc w:val="center"/>
-        <w:rPr>
-          <w:b/>
-          <w:lang w:val="ka-GE"/>
-        </w:rPr>
-      </w:pPr>
-      <w:r>
-        <w:rPr>
-          <w:b/>
-          <w:noProof/>
-          <w:lang w:val="ka-GE"/>
-        </w:rPr>
-        <mc:AlternateContent>
-          <mc:Choice Requires="wps">
-            <w:drawing>
-              <wp:anchor distT="0" distB="0" distL="114300" distR="114300" simplePos="0" relativeHeight="251663360" behindDoc="0" locked="0" layoutInCell="1" allowOverlap="1" wp14:anchorId="61B8F447" wp14:editId="292AC5D1">
-                <wp:simplePos x="0" y="0"/>
-                <wp:positionH relativeFrom="column">
-                  <wp:posOffset>3613785</wp:posOffset>
-                </wp:positionH>
-                <wp:positionV relativeFrom="paragraph">
-                  <wp:posOffset>320675</wp:posOffset>
-                </wp:positionV>
-                <wp:extent cx="3396615" cy="1076960"/>
-                <wp:effectExtent l="3810" t="635" r="0" b="0"/>
-                <wp:wrapNone/>
-                <wp:docPr id="1124531779" name="Text Box 3"/>
-                <wp:cNvGraphicFramePr>
-                  <a:graphicFrameLocks xmlns:a="http://schemas.openxmlformats.org/drawingml/2006/main"/>
-                </wp:cNvGraphicFramePr>
-                <a:graphic xmlns:a="http://schemas.openxmlformats.org/drawingml/2006/main">
-                  <a:graphicData uri="http://schemas.microsoft.com/office/word/2010/wordprocessingShape">
-                    <wps:wsp>
-                      <wps:cNvSpPr txBox="1">
-                        <a:spLocks noChangeArrowheads="1"/>
-                      </wps:cNvSpPr>
-                      <wps:spPr bwMode="auto">
-                        <a:xfrm>
-                          <a:off x="0" y="0"/>
-                          <a:ext cx="3396615" cy="1076960"/>
-                        </a:xfrm>
-                        <a:prstGeom prst="rect">
-                          <a:avLst/>
-                        </a:prstGeom>
-                        <a:solidFill>
-                          <a:srgbClr val="FFFFFF"/>
-                        </a:solidFill>
-                        <a:ln>
-                          <a:noFill/>
-                        </a:ln>
-                        <a:extLst>
-                          <a:ext uri="{91240B29-F687-4F45-9708-019B960494DF}">
-                            <a14:hiddenLine xmlns:a14="http://schemas.microsoft.com/office/drawing/2010/main" w="9525">
-                              <a:solidFill>
-                                <a:srgbClr val="000000"/>
-                              </a:solidFill>
-                              <a:miter lim="800000"/>
-                              <a:headEnd/>
-                              <a:tailEnd/>
-                            </a14:hiddenLine>
-                          </a:ext>
-                        </a:extLst>
-                      </wps:spPr>
-                      <wps:txbx>
-                        <w:txbxContent>
-                          <w:p>
-                            <w:pPr>
-                              <w:jc w:val="right"/>
-                              <w:rPr>
-                                <w:rFonts w:cs="Calibri"/>
-                                <w:lang w:val="ka-GE"/>
-                              </w:rPr>
-                            </w:pPr>
-                            <w:r>
-                              <w:rPr>
-                                <w:rFonts w:cs="Calibri"/>
-                                <w:lang w:val="ka-GE"/>
-                              </w:rPr>
-                              <w:t xml:space="preserve">საქართველოს </w:t>
-                            </w:r>
-                            <w:r>
-                              <w:rPr>
-                                <w:rFonts w:cs="Calibri"/>
-                                <w:lang w:val="ka-GE"/>
-                              </w:rPr>
-                              <w:t>ტექნიკური უნივერსიტეტი</w:t>
-                            </w:r>
-                          </w:p>
-                          <w:p>
-                            <w:pPr>
-                              <w:jc w:val="right"/>
-                              <w:rPr>
-                                <w:rFonts w:cs="Calibri"/>
-                                <w:lang w:val="ka-GE"/>
-                              </w:rPr>
-                            </w:pPr>
-                            <w:r>
-                              <w:rPr>
-                                <w:rFonts w:cs="Calibri"/>
-                                <w:lang w:val="ka-GE"/>
-                              </w:rPr>
-                              <w:t>თბილისი, 0160, საქართველო</w:t>
-                            </w:r>
-                          </w:p>
-                          <w:p>
-                            <w:pPr>
-                              <w:jc w:val="right"/>
-                              <w:rPr>
-                                <w:rFonts w:cs="Calibri"/>
-                                <w:lang w:val="ka-GE"/>
-                              </w:rPr>
-                            </w:pPr>
-                            <w:r>
-                              <w:rPr>
-                                <w:rFonts w:cs="Calibri"/>
-                                <w:lang w:val="ka-GE"/>
-                              </w:rPr>
-                              <w:t xml:space="preserve"> ივლისი, 2026 წელი</w:t>
-                            </w:r>
-                          </w:p>
-                          <w:p>
-                            <w:pPr>
-                              <w:jc w:val="right"/>
-                              <w:rPr>
-                                <w:rFonts w:cs="Calibri"/>
-                                <w:sz w:val="20"/>
-                                <w:szCs w:val="20"/>
-                              </w:rPr>
-                            </w:pPr>
-                          </w:p>
-                        </w:txbxContent>
-                      </wps:txbx>
-                      <wps:bodyPr rot="0" vert="horz" wrap="square" lIns="91440" tIns="45720" rIns="91440" bIns="45720" anchor="t" anchorCtr="0" upright="1">
-                        <a:noAutofit/>
-                      </wps:bodyPr>
-                    </wps:wsp>
-                  </a:graphicData>
-                </a:graphic>
-                <wp14:sizeRelH relativeFrom="page">
-                  <wp14:pctWidth>0</wp14:pctWidth>
-                </wp14:sizeRelH>
-                <wp14:sizeRelV relativeFrom="page">
-                  <wp14:pctHeight>0</wp14:pctHeight>
-                </wp14:sizeRelV>
-              </wp:anchor>
-            </w:drawing>
-          </mc:Choice>
-          <mc:Fallback>
-            <w:pict>
-              <v:shape w14:anchorId="61B8F447" id="Text Box 3" o:spid="_x0000_s1028" type="#_x0000_t202" style="position:absolute;left:0;text-align:left;margin-left:284.55pt;margin-top:25.25pt;width:267.45pt;height:84.8pt;z-index:251663360;visibility:visible;mso-wrap-style:square;mso-width-percent:0;mso-height-percent:0;mso-wrap-distance-left:9pt;mso-wrap-distance-top:0;mso-wrap-distance-right:9pt;mso-wrap-distance-bottom:0;mso-position-horizontal:absolute;mso-position-horizontal-relative:text;mso-position-vertical:absolute;mso-position-vertical-relative:text;mso-width-percent:0;mso-height-percent:0;mso-width-relative:page;mso-height-relative:page;v-text-anchor:top" o:gfxdata="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" stroked="f">
-                <v:textbox>
-                  <w:txbxContent>
-                    <w:p>
-                      <w:pPr>
-                        <w:jc w:val="right"/>
-                        <w:rPr>
-                          <w:rFonts w:cs="Calibri"/>
-                          <w:lang w:val="ka-GE"/>
-                        </w:rPr>
-                      </w:pPr>
-                      <w:r>
-                        <w:rPr>
-                          <w:rFonts w:cs="Calibri"/>
-                          <w:lang w:val="ka-GE"/>
-                        </w:rPr>
-                        <w:t xml:space="preserve">საქართველოს </w:t>
-                      </w:r>
-                      <w:r>
-                        <w:rPr>
-                          <w:rFonts w:cs="Calibri"/>
-                          <w:lang w:val="ka-GE"/>
-                        </w:rPr>
-                        <w:t>ტექნიკური უნივერსიტეტი</w:t>
-                      </w:r>
-                    </w:p>
-                    <w:p>
-                      <w:pPr>
-                        <w:jc w:val="right"/>
-                        <w:rPr>
-                          <w:rFonts w:cs="Calibri"/>
-                          <w:lang w:val="ka-GE"/>
-                        </w:rPr>
-                      </w:pPr>
-                      <w:r>
-                        <w:rPr>
-                          <w:rFonts w:cs="Calibri"/>
-                          <w:lang w:val="ka-GE"/>
-                        </w:rPr>
-                        <w:t>თბილისი, 0160, საქართველო</w:t>
-                      </w:r>
-                    </w:p>
-                    <w:p>
-                      <w:pPr>
-                        <w:jc w:val="right"/>
-                        <w:rPr>
-                          <w:rFonts w:cs="Calibri"/>
-                          <w:lang w:val="ka-GE"/>
-                        </w:rPr>
-                      </w:pPr>
-                      <w:r>
-                        <w:rPr>
-                          <w:rFonts w:cs="Calibri"/>
-                          <w:lang w:val="ka-GE"/>
-                        </w:rPr>
-                        <w:t xml:space="preserve"> ივლისი, 2026 წელი</w:t>
-                      </w:r>
-                    </w:p>
-                    <w:p>
-                      <w:pPr>
-                        <w:jc w:val="right"/>
-                        <w:rPr>
-                          <w:rFonts w:cs="Calibri"/>
-                          <w:sz w:val="20"/>
-                          <w:szCs w:val="20"/>
-                        </w:rPr>
-                      </w:pPr>
-                    </w:p>
-                  </w:txbxContent>
-                </v:textbox>
-              </v:shape>
-            </w:pict>
-          </mc:Fallback>
-        </mc:AlternateContent>
-      </w:r>
-      <w:r>
-        <w:rPr>
-          <w:b/>
-          <w:noProof/>
-          <w:lang w:val="ka-GE"/>
-        </w:rPr>
-        <mc:AlternateContent>
-          <mc:Choice Requires="wps">
-            <w:drawing>
-              <wp:anchor distT="0" distB="0" distL="114300" distR="114300" simplePos="0" relativeHeight="251662336" behindDoc="0" locked="0" layoutInCell="1" allowOverlap="1" wp14:anchorId="0F803DA9" wp14:editId="0E854167">
-                <wp:simplePos x="0" y="0"/>
-                <wp:positionH relativeFrom="column">
-                  <wp:posOffset>196215</wp:posOffset>
-                </wp:positionH>
-                <wp:positionV relativeFrom="paragraph">
-                  <wp:posOffset>265430</wp:posOffset>
-                </wp:positionV>
-                <wp:extent cx="3232785" cy="381000"/>
-                <wp:effectExtent l="0" t="2540" r="0" b="0"/>
-                <wp:wrapNone/>
-                <wp:docPr id="1346965493" name="Text Box 2"/>
-                <wp:cNvGraphicFramePr>
-                  <a:graphicFrameLocks xmlns:a="http://schemas.openxmlformats.org/drawingml/2006/main"/>
-                </wp:cNvGraphicFramePr>
-                <a:graphic xmlns:a="http://schemas.openxmlformats.org/drawingml/2006/main">
-                  <a:graphicData uri="http://schemas.microsoft.com/office/word/2010/wordprocessingShape">
-                    <wps:wsp>
-                      <wps:cNvSpPr txBox="1">
-                        <a:spLocks noChangeArrowheads="1"/>
-                      </wps:cNvSpPr>
-                      <wps:spPr bwMode="auto">
-                        <a:xfrm>
-                          <a:off x="0" y="0"/>
-                          <a:ext cx="3232785" cy="381000"/>
-                        </a:xfrm>
-                        <a:prstGeom prst="rect">
-                          <a:avLst/>
-                        </a:prstGeom>
-                        <a:solidFill>
-                          <a:srgbClr val="FFFFFF"/>
-                        </a:solidFill>
-                        <a:ln>
-                          <a:noFill/>
-                        </a:ln>
-                        <a:extLst>
-                          <a:ext uri="{91240B29-F687-4F45-9708-019B960494DF}">
-                            <a14:hiddenLine xmlns:a14="http://schemas.microsoft.com/office/drawing/2010/main" w="9525">
-                              <a:solidFill>
-                                <a:srgbClr val="000000"/>
-                              </a:solidFill>
-                              <a:miter lim="800000"/>
-                              <a:headEnd/>
-                              <a:tailEnd/>
-                            </a14:hiddenLine>
-                          </a:ext>
-                        </a:extLst>
-                      </wps:spPr>
-                      <wps:txbx>
-                        <w:txbxContent>
-                          <w:p>
-                            <w:pPr>
-                              <w:tabs>
-                                <w:tab w:val="left" w:pos="709"/>
-                              </w:tabs>
-                              <w:rPr>
-                                <w:rFonts w:cs="Calibri"/>
-                                <w:b/>
-                                <w:bCs/>
-                                <w:sz w:val="32"/>
-                                <w:szCs w:val="32"/>
-                                <w:lang w:val="ka-GE"/>
-                              </w:rPr>
-                            </w:pPr>
-                            <w:r>
-                              <w:rPr>
-                                <w:rFonts w:cs="Calibri"/>
-                                <w:b/>
-                                <w:bCs/>
-                                <w:sz w:val="32"/>
-                                <w:szCs w:val="32"/>
-                                <w:lang w:val="ka-GE"/>
-                              </w:rPr>
-                              <w:t xml:space="preserve">შიფრი </w:t>
-                            </w:r>
-                          </w:p>
-                          <w:p>
-                            <w:pPr>
-                              <w:rPr>
-                                <w:rFonts w:cs="Calibri"/>
-                                <w:b/>
-                                <w:bCs/>
-                                <w:sz w:val="28"/>
-                                <w:szCs w:val="28"/>
-                              </w:rPr>
-                            </w:pPr>
-                          </w:p>
-                        </w:txbxContent>
-                      </wps:txbx>
-                      <wps:bodyPr rot="0" vert="horz" wrap="square" lIns="91440" tIns="45720" rIns="91440" bIns="45720" anchor="t" anchorCtr="0" upright="1">
-                        <a:noAutofit/>
-                      </wps:bodyPr>
-                    </wps:wsp>
-                  </a:graphicData>
-                </a:graphic>
-                <wp14:sizeRelH relativeFrom="page">
-                  <wp14:pctWidth>0</wp14:pctWidth>
-                </wp14:sizeRelH>
-                <wp14:sizeRelV relativeFrom="page">
-                  <wp14:pctHeight>0</wp14:pctHeight>
-                </wp14:sizeRelV>
-              </wp:anchor>
-            </w:drawing>
-          </mc:Choice>
-          <mc:Fallback>
-            <w:pict>
-              <v:shape w14:anchorId="0F803DA9" id="Text Box 2" o:spid="_x0000_s1029" type="#_x0000_t202" style="position:absolute;left:0;text-align:left;margin-left:15.45pt;margin-top:20.9pt;width:254.55pt;height:30pt;z-index:251662336;visibility:visible;mso-wrap-style:square;mso-width-percent:0;mso-height-percent:0;mso-wrap-distance-left:9pt;mso-wrap-distance-top:0;mso-wrap-distance-right:9pt;mso-wrap-distance-bottom:0;mso-position-horizontal:absolute;mso-position-horizontal-relative:text;mso-position-vertical:absolute;mso-position-vertical-relative:text;mso-width-percent:0;mso-height-percent:0;mso-width-relative:page;mso-height-relative:page;v-text-anchor:top" o:gfxdata="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" stroked="f">
-                <v:textbox>
-                  <w:txbxContent>
-                    <w:p>
-                      <w:pPr>
-                        <w:tabs>
-                          <w:tab w:val="left" w:pos="709"/>
-                        </w:tabs>
-                        <w:rPr>
-                          <w:rFonts w:cs="Calibri"/>
-                          <w:b/>
-                          <w:bCs/>
-                          <w:sz w:val="32"/>
-                          <w:szCs w:val="32"/>
-                          <w:lang w:val="ka-GE"/>
-                        </w:rPr>
-                      </w:pPr>
-                      <w:r>
-                        <w:rPr>
-                          <w:rFonts w:cs="Calibri"/>
-                          <w:b/>
-                          <w:bCs/>
-                          <w:sz w:val="32"/>
-                          <w:szCs w:val="32"/>
-                          <w:lang w:val="ka-GE"/>
-                        </w:rPr>
-                        <w:t xml:space="preserve">შიფრი </w:t>
-                      </w:r>
-                    </w:p>
-                    <w:p>
-                      <w:pPr>
-                        <w:rPr>
-                          <w:rFonts w:cs="Calibri"/>
-                          <w:b/>
-                          <w:bCs/>
-                          <w:sz w:val="28"/>
-                          <w:szCs w:val="28"/>
-                        </w:rPr>
-                      </w:pPr>
-                    </w:p>
-                  </w:txbxContent>
-                </v:textbox>
-              </v:shape>
-            </w:pict>
-          </mc:Fallback>
-        </mc:AlternateContent>
-      </w:r>
-    </w:p>
-    <w:p>
-      <w:pPr>
-        <w:pStyle w:val="BodyText"/>
-        <w:spacing w:before="120" w:after="240"/>
-        <w:jc w:val="center"/>
-        <w:rPr>
-          <w:b/>
-          <w:lang w:val="ka-GE"/>
-        </w:rPr>
-      </w:pPr>
-    </w:p>
-    <w:p>
-      <w:pPr>
-        <w:pStyle w:val="BodyText"/>
-        <w:spacing w:before="120" w:after="240"/>
-        <w:jc w:val="center"/>
-        <w:rPr>
-          <w:b/>
-          <w:lang w:val="ka-GE"/>
-        </w:rPr>
-      </w:pPr>
+      </w:pPr>
+      <w:r>
+        <w:rPr>
+          <w:rFonts w:ascii="Sylfaen" w:hAnsi="Sylfaen" w:cs="Sylfaen"/>
+          <w:b w:val="0"/>
+          <w:sz w:val="24"/>
+        </w:rPr>
+        <w:t>ივლისი, 2026 წელი</w:t>
+      </w:r>
     </w:p>
     <w:p>
       <w:pPr>
@@ -870,7 +168,7 @@
         <w:sectPr>
           <w:footerReference w:type="default" r:id="rId9"/>
           <w:pgSz w:w="11906" w:h="16838" w:code="9"/>
-          <w:pgMar w:top="2155" w:right="289" w:bottom="1418" w:left="289" w:header="720" w:footer="720" w:gutter="0"/>
+          <w:pgMar w:top="1417" w:right="1417" w:bottom="1417" w:left="2154" w:header="720" w:footer="720" w:gutter="0"/>
           <w:pgNumType w:start="0"/>
           <w:cols w:space="720"/>
           <w:titlePg/>

</xml_diff>

<commit_message>
format(thesis): apply /format-thesis on inline-title-page build
Ran format_thesis.py over the current build (which now carries the durable
inline title page): margins 38/25, centered bold headings, justified body +
abstract, table grid borders, and a regenerated static TOC (30 entries, dot
leaders + page numbers) that reflects cohesive §1 as a single entry. Title
page, list-of-figures, list-of-tables all preserved. Validator: PASSED.

Co-Authored-By: Claude Opus 4.8 <noreply@anthropic.com>
</commit_message>
<xml_diff>
--- a/project/thesis-ka.docx
+++ b/project/thesis-ka.docx
@@ -1164,7 +1164,7 @@
     </w:p>
     <w:p>
       <w:pPr>
-        <w:spacing w:line="360" w:lineRule="auto"/>
+        <w:spacing w:line="240" w:lineRule="auto"/>
         <w:jc w:val="center"/>
         <w:rPr>
           <w:b/>
@@ -1188,7 +1188,10 @@
       <w:bookmarkEnd w:id="3"/>
     </w:p>
     <w:p>
-      <w:pPr/>
+      <w:pPr>
+        <w:spacing w:line="240" w:lineRule="auto"/>
+        <w:jc w:val="both"/>
+      </w:pPr>
       <w:r>
         <w:rPr>
           <w:rFonts w:ascii="Sylfaen" w:hAnsi="Sylfaen" w:cs="Sylfaen"/>
@@ -1199,7 +1202,10 @@
       </w:r>
     </w:p>
     <w:p>
-      <w:pPr/>
+      <w:pPr>
+        <w:spacing w:line="240" w:lineRule="auto"/>
+        <w:jc w:val="both"/>
+      </w:pPr>
       <w:r>
         <w:rPr>
           <w:rFonts w:ascii="Sylfaen" w:hAnsi="Sylfaen" w:cs="Sylfaen"/>
@@ -1210,7 +1216,10 @@
       </w:r>
     </w:p>
     <w:p>
-      <w:pPr/>
+      <w:pPr>
+        <w:spacing w:line="240" w:lineRule="auto"/>
+        <w:jc w:val="both"/>
+      </w:pPr>
       <w:r>
         <w:rPr>
           <w:rFonts w:ascii="Sylfaen" w:hAnsi="Sylfaen" w:cs="Sylfaen"/>
@@ -1221,7 +1230,10 @@
       </w:r>
     </w:p>
     <w:p>
-      <w:pPr/>
+      <w:pPr>
+        <w:spacing w:line="240" w:lineRule="auto"/>
+        <w:jc w:val="both"/>
+      </w:pPr>
       <w:r>
         <w:rPr>
           <w:rFonts w:ascii="Sylfaen" w:hAnsi="Sylfaen" w:cs="Sylfaen"/>
@@ -1232,7 +1244,10 @@
       </w:r>
     </w:p>
     <w:p>
-      <w:pPr/>
+      <w:pPr>
+        <w:spacing w:line="240" w:lineRule="auto"/>
+        <w:jc w:val="both"/>
+      </w:pPr>
       <w:r>
         <w:rPr>
           <w:rFonts w:ascii="Sylfaen" w:hAnsi="Sylfaen" w:cs="Sylfaen"/>
@@ -1243,7 +1258,9 @@
       </w:r>
     </w:p>
     <w:p>
-      <w:pPr/>
+      <w:pPr>
+        <w:spacing w:line="240" w:lineRule="auto"/>
+      </w:pPr>
       <w:r>
         <w:rPr>
           <w:rFonts w:ascii="Sylfaen" w:hAnsi="Sylfaen" w:cs="Sylfaen"/>
@@ -1255,7 +1272,7 @@
     </w:p>
     <w:p>
       <w:pPr>
-        <w:spacing w:after="0" w:line="360" w:lineRule="auto"/>
+        <w:spacing w:after="0" w:line="240" w:lineRule="auto"/>
         <w:ind w:firstLine="454"/>
         <w:jc w:val="left"/>
         <w:rPr>
@@ -1276,7 +1293,7 @@
     <w:bookmarkEnd w:id="5"/>
     <w:p>
       <w:pPr>
-        <w:spacing w:after="0" w:line="360" w:lineRule="auto"/>
+        <w:spacing w:after="0" w:line="240" w:lineRule="auto"/>
         <w:jc w:val="center"/>
         <w:rPr>
           <w:sz w:val="28"/>
@@ -1293,7 +1310,10 @@
       </w:r>
     </w:p>
     <w:p>
-      <w:pPr/>
+      <w:pPr>
+        <w:spacing w:line="240" w:lineRule="auto"/>
+        <w:jc w:val="both"/>
+      </w:pPr>
       <w:r>
         <w:rPr>
           <w:rFonts w:ascii="Sylfaen" w:hAnsi="Sylfaen" w:cs="Sylfaen"/>
@@ -1304,7 +1324,10 @@
       </w:r>
     </w:p>
     <w:p>
-      <w:pPr/>
+      <w:pPr>
+        <w:spacing w:line="240" w:lineRule="auto"/>
+        <w:jc w:val="both"/>
+      </w:pPr>
       <w:r>
         <w:rPr>
           <w:rFonts w:ascii="Sylfaen" w:hAnsi="Sylfaen" w:cs="Sylfaen"/>
@@ -1315,7 +1338,10 @@
       </w:r>
     </w:p>
     <w:p>
-      <w:pPr/>
+      <w:pPr>
+        <w:spacing w:line="240" w:lineRule="auto"/>
+        <w:jc w:val="both"/>
+      </w:pPr>
       <w:r>
         <w:rPr>
           <w:rFonts w:ascii="Sylfaen" w:hAnsi="Sylfaen" w:cs="Sylfaen"/>
@@ -1326,7 +1352,10 @@
       </w:r>
     </w:p>
     <w:p>
-      <w:pPr/>
+      <w:pPr>
+        <w:spacing w:line="240" w:lineRule="auto"/>
+        <w:jc w:val="both"/>
+      </w:pPr>
       <w:r>
         <w:rPr>
           <w:rFonts w:ascii="Sylfaen" w:hAnsi="Sylfaen" w:cs="Sylfaen"/>
@@ -1337,7 +1366,10 @@
       </w:r>
     </w:p>
     <w:p>
-      <w:pPr/>
+      <w:pPr>
+        <w:spacing w:line="240" w:lineRule="auto"/>
+        <w:jc w:val="both"/>
+      </w:pPr>
       <w:r>
         <w:rPr>
           <w:rFonts w:ascii="Sylfaen" w:hAnsi="Sylfaen" w:cs="Sylfaen"/>
@@ -1348,7 +1380,9 @@
       </w:r>
     </w:p>
     <w:p>
-      <w:pPr/>
+      <w:pPr>
+        <w:spacing w:line="240" w:lineRule="auto"/>
+      </w:pPr>
       <w:r>
         <w:rPr>
           <w:rFonts w:ascii="Sylfaen" w:hAnsi="Sylfaen" w:cs="Sylfaen"/>
@@ -1360,6 +1394,7 @@
     </w:p>
     <w:p>
       <w:pPr>
+        <w:spacing w:line="240" w:lineRule="auto"/>
         <w:rPr>
           <w:szCs w:val="24"/>
         </w:rPr>
@@ -1401,41 +1436,904 @@
       </w:r>
     </w:p>
     <w:p>
-      <w:pPr/>
-      <w:r>
-        <w:fldChar w:fldCharType="begin" w:dirty="true"/>
-        <w:instrText xml:space="preserve"> TOC \o "1-2" \h \z \u </w:instrText>
-        <w:fldChar w:fldCharType="separate"/>
-        <w:t xml:space="preserve">შინაარსი გენერირდება ავტომატურად Word-ში (საჭიროების შემთხვევაში: მარჯვენა ღილაკი → Update Field / F9).</w:t>
-        <w:fldChar w:fldCharType="end"/>
-      </w:r>
-    </w:p>
-    <w:p>
-      <w:pPr>
-        <w:spacing w:after="0" w:line="360" w:lineRule="auto"/>
-        <w:jc w:val="left"/>
-        <w:rPr>
-          <w:szCs w:val="24"/>
-        </w:rPr>
-      </w:pPr>
-    </w:p>
-    <w:p>
-      <w:pPr>
-        <w:spacing w:after="0" w:line="360" w:lineRule="auto"/>
-        <w:jc w:val="left"/>
-        <w:rPr>
-          <w:szCs w:val="24"/>
-        </w:rPr>
-      </w:pPr>
-    </w:p>
-    <w:p>
-      <w:pPr>
-        <w:spacing w:after="0" w:line="360" w:lineRule="auto"/>
-        <w:jc w:val="left"/>
-        <w:rPr>
-          <w:szCs w:val="24"/>
-        </w:rPr>
-      </w:pPr>
+      <w:pPr>
+        <w:tabs>
+          <w:tab w:pos="8323" w:val="right" w:leader="dot"/>
+        </w:tabs>
+        <w:spacing w:line="240" w:lineRule="auto" w:before="0" w:after="0"/>
+        <w:ind w:left="0"/>
+      </w:pPr>
+      <w:r>
+        <w:rPr>
+          <w:rFonts w:ascii="Sylfaen" w:hAnsi="Sylfaen"/>
+          <w:sz w:val="24"/>
+        </w:rPr>
+        <w:t>1. შესავალი</w:t>
+      </w:r>
+      <w:r>
+        <w:rPr>
+          <w:rFonts w:ascii="Sylfaen" w:hAnsi="Sylfaen"/>
+          <w:sz w:val="24"/>
+        </w:rPr>
+        <w:tab/>
+      </w:r>
+      <w:r>
+        <w:rPr>
+          <w:rFonts w:ascii="Sylfaen" w:hAnsi="Sylfaen"/>
+          <w:sz w:val="24"/>
+        </w:rPr>
+        <w:t>12</w:t>
+      </w:r>
+    </w:p>
+    <w:p>
+      <w:pPr>
+        <w:tabs>
+          <w:tab w:pos="8323" w:val="right" w:leader="dot"/>
+        </w:tabs>
+        <w:spacing w:line="240" w:lineRule="auto" w:before="0" w:after="0"/>
+        <w:ind w:left="0"/>
+      </w:pPr>
+      <w:r>
+        <w:rPr>
+          <w:rFonts w:ascii="Sylfaen" w:hAnsi="Sylfaen"/>
+          <w:sz w:val="24"/>
+        </w:rPr>
+        <w:t>2. ლიტერატურის მიმოხილვა</w:t>
+      </w:r>
+      <w:r>
+        <w:rPr>
+          <w:rFonts w:ascii="Sylfaen" w:hAnsi="Sylfaen"/>
+          <w:sz w:val="24"/>
+        </w:rPr>
+        <w:tab/>
+      </w:r>
+      <w:r>
+        <w:rPr>
+          <w:rFonts w:ascii="Sylfaen" w:hAnsi="Sylfaen"/>
+          <w:sz w:val="24"/>
+        </w:rPr>
+        <w:t>18</w:t>
+      </w:r>
+    </w:p>
+    <w:p>
+      <w:pPr>
+        <w:tabs>
+          <w:tab w:pos="8323" w:val="right" w:leader="dot"/>
+        </w:tabs>
+        <w:spacing w:line="240" w:lineRule="auto" w:before="0" w:after="0"/>
+        <w:ind w:left="454"/>
+      </w:pPr>
+      <w:r>
+        <w:rPr>
+          <w:rFonts w:ascii="Sylfaen" w:hAnsi="Sylfaen"/>
+          <w:sz w:val="24"/>
+        </w:rPr>
+        <w:t>2.1 მიმოხილვის მოცულობა და სტრუქტურა</w:t>
+      </w:r>
+      <w:r>
+        <w:rPr>
+          <w:rFonts w:ascii="Sylfaen" w:hAnsi="Sylfaen"/>
+          <w:sz w:val="24"/>
+        </w:rPr>
+        <w:tab/>
+      </w:r>
+      <w:r>
+        <w:rPr>
+          <w:rFonts w:ascii="Sylfaen" w:hAnsi="Sylfaen"/>
+          <w:sz w:val="24"/>
+        </w:rPr>
+        <w:t>18</w:t>
+      </w:r>
+    </w:p>
+    <w:p>
+      <w:pPr>
+        <w:tabs>
+          <w:tab w:pos="8323" w:val="right" w:leader="dot"/>
+        </w:tabs>
+        <w:spacing w:line="240" w:lineRule="auto" w:before="0" w:after="0"/>
+        <w:ind w:left="454"/>
+      </w:pPr>
+      <w:r>
+        <w:rPr>
+          <w:rFonts w:ascii="Sylfaen" w:hAnsi="Sylfaen"/>
+          <w:sz w:val="24"/>
+        </w:rPr>
+        <w:t>2.2 თეორიული საფუძვლები: ადამიანის მეხსიერების მოდელები</w:t>
+      </w:r>
+      <w:r>
+        <w:rPr>
+          <w:rFonts w:ascii="Sylfaen" w:hAnsi="Sylfaen"/>
+          <w:sz w:val="24"/>
+        </w:rPr>
+        <w:tab/>
+      </w:r>
+      <w:r>
+        <w:rPr>
+          <w:rFonts w:ascii="Sylfaen" w:hAnsi="Sylfaen"/>
+          <w:sz w:val="24"/>
+        </w:rPr>
+        <w:t>18</w:t>
+      </w:r>
+    </w:p>
+    <w:p>
+      <w:pPr>
+        <w:tabs>
+          <w:tab w:pos="8323" w:val="right" w:leader="dot"/>
+        </w:tabs>
+        <w:spacing w:line="240" w:lineRule="auto" w:before="0" w:after="0"/>
+        <w:ind w:left="454"/>
+      </w:pPr>
+      <w:r>
+        <w:rPr>
+          <w:rFonts w:ascii="Sylfaen" w:hAnsi="Sylfaen"/>
+          <w:sz w:val="24"/>
+        </w:rPr>
+        <w:t>2.3 გრძელვადიანი მეხსიერება დიდი ენის მოდელის აგენტებისთვის: სამი ტალღა</w:t>
+      </w:r>
+      <w:r>
+        <w:rPr>
+          <w:rFonts w:ascii="Sylfaen" w:hAnsi="Sylfaen"/>
+          <w:sz w:val="24"/>
+        </w:rPr>
+        <w:tab/>
+      </w:r>
+      <w:r>
+        <w:rPr>
+          <w:rFonts w:ascii="Sylfaen" w:hAnsi="Sylfaen"/>
+          <w:sz w:val="24"/>
+        </w:rPr>
+        <w:t>21</w:t>
+      </w:r>
+    </w:p>
+    <w:p>
+      <w:pPr>
+        <w:tabs>
+          <w:tab w:pos="8323" w:val="right" w:leader="dot"/>
+        </w:tabs>
+        <w:spacing w:line="240" w:lineRule="auto" w:before="0" w:after="0"/>
+        <w:ind w:left="454"/>
+      </w:pPr>
+      <w:r>
+        <w:rPr>
+          <w:rFonts w:ascii="Sylfaen" w:hAnsi="Sylfaen"/>
+          <w:sz w:val="24"/>
+        </w:rPr>
+        <w:t>2.4 ხიდი: მეხსიერების თეორიიდან მეხსიერების არქიტექტურამდე</w:t>
+      </w:r>
+      <w:r>
+        <w:rPr>
+          <w:rFonts w:ascii="Sylfaen" w:hAnsi="Sylfaen"/>
+          <w:sz w:val="24"/>
+        </w:rPr>
+        <w:tab/>
+      </w:r>
+      <w:r>
+        <w:rPr>
+          <w:rFonts w:ascii="Sylfaen" w:hAnsi="Sylfaen"/>
+          <w:sz w:val="24"/>
+        </w:rPr>
+        <w:t>24</w:t>
+      </w:r>
+    </w:p>
+    <w:p>
+      <w:pPr>
+        <w:tabs>
+          <w:tab w:pos="8323" w:val="right" w:leader="dot"/>
+        </w:tabs>
+        <w:spacing w:line="240" w:lineRule="auto" w:before="0" w:after="0"/>
+        <w:ind w:left="454"/>
+      </w:pPr>
+      <w:r>
+        <w:rPr>
+          <w:rFonts w:ascii="Sylfaen" w:hAnsi="Sylfaen"/>
+          <w:sz w:val="24"/>
+        </w:rPr>
+        <w:t>2.5 საუბრის მეხსიერების შეფასება: ბენჩმარკები და მათი შეზღუდვები</w:t>
+      </w:r>
+      <w:r>
+        <w:rPr>
+          <w:rFonts w:ascii="Sylfaen" w:hAnsi="Sylfaen"/>
+          <w:sz w:val="24"/>
+        </w:rPr>
+        <w:tab/>
+      </w:r>
+      <w:r>
+        <w:rPr>
+          <w:rFonts w:ascii="Sylfaen" w:hAnsi="Sylfaen"/>
+          <w:sz w:val="24"/>
+        </w:rPr>
+        <w:t>26</w:t>
+      </w:r>
+    </w:p>
+    <w:p>
+      <w:pPr>
+        <w:tabs>
+          <w:tab w:pos="8323" w:val="right" w:leader="dot"/>
+        </w:tabs>
+        <w:spacing w:line="240" w:lineRule="auto" w:before="0" w:after="0"/>
+        <w:ind w:left="454"/>
+      </w:pPr>
+      <w:r>
+        <w:rPr>
+          <w:rFonts w:ascii="Sylfaen" w:hAnsi="Sylfaen"/>
+          <w:sz w:val="24"/>
+        </w:rPr>
+        <w:t>2.6 ასისტენტიდან თანამოსაუბრემდე: მეხსიერება და აღქმული ურთიერთობა</w:t>
+      </w:r>
+      <w:r>
+        <w:rPr>
+          <w:rFonts w:ascii="Sylfaen" w:hAnsi="Sylfaen"/>
+          <w:sz w:val="24"/>
+        </w:rPr>
+        <w:tab/>
+      </w:r>
+      <w:r>
+        <w:rPr>
+          <w:rFonts w:ascii="Sylfaen" w:hAnsi="Sylfaen"/>
+          <w:sz w:val="24"/>
+        </w:rPr>
+        <w:t>27</w:t>
+      </w:r>
+    </w:p>
+    <w:p>
+      <w:pPr>
+        <w:tabs>
+          <w:tab w:pos="8323" w:val="right" w:leader="dot"/>
+        </w:tabs>
+        <w:spacing w:line="240" w:lineRule="auto" w:before="0" w:after="0"/>
+        <w:ind w:left="454"/>
+      </w:pPr>
+      <w:r>
+        <w:rPr>
+          <w:rFonts w:ascii="Sylfaen" w:hAnsi="Sylfaen"/>
+          <w:sz w:val="24"/>
+        </w:rPr>
+        <w:t>2.7 ღია პრობლემები და შეზღუდვები</w:t>
+      </w:r>
+      <w:r>
+        <w:rPr>
+          <w:rFonts w:ascii="Sylfaen" w:hAnsi="Sylfaen"/>
+          <w:sz w:val="24"/>
+        </w:rPr>
+        <w:tab/>
+      </w:r>
+      <w:r>
+        <w:rPr>
+          <w:rFonts w:ascii="Sylfaen" w:hAnsi="Sylfaen"/>
+          <w:sz w:val="24"/>
+        </w:rPr>
+        <w:t>29</w:t>
+      </w:r>
+    </w:p>
+    <w:p>
+      <w:pPr>
+        <w:tabs>
+          <w:tab w:pos="8323" w:val="right" w:leader="dot"/>
+        </w:tabs>
+        <w:spacing w:line="240" w:lineRule="auto" w:before="0" w:after="0"/>
+        <w:ind w:left="454"/>
+      </w:pPr>
+      <w:r>
+        <w:rPr>
+          <w:rFonts w:ascii="Sylfaen" w:hAnsi="Sylfaen"/>
+          <w:sz w:val="24"/>
+        </w:rPr>
+        <w:t>2.8 ამ ნაშრომის ადგილი</w:t>
+      </w:r>
+      <w:r>
+        <w:rPr>
+          <w:rFonts w:ascii="Sylfaen" w:hAnsi="Sylfaen"/>
+          <w:sz w:val="24"/>
+        </w:rPr>
+        <w:tab/>
+      </w:r>
+      <w:r>
+        <w:rPr>
+          <w:rFonts w:ascii="Sylfaen" w:hAnsi="Sylfaen"/>
+          <w:sz w:val="24"/>
+        </w:rPr>
+        <w:t>30</w:t>
+      </w:r>
+    </w:p>
+    <w:p>
+      <w:pPr>
+        <w:tabs>
+          <w:tab w:pos="8323" w:val="right" w:leader="dot"/>
+        </w:tabs>
+        <w:spacing w:line="240" w:lineRule="auto" w:before="0" w:after="0"/>
+        <w:ind w:left="0"/>
+      </w:pPr>
+      <w:r>
+        <w:rPr>
+          <w:rFonts w:ascii="Sylfaen" w:hAnsi="Sylfaen"/>
+          <w:sz w:val="24"/>
+        </w:rPr>
+        <w:t>3. კვლევის მეთოდები</w:t>
+      </w:r>
+      <w:r>
+        <w:rPr>
+          <w:rFonts w:ascii="Sylfaen" w:hAnsi="Sylfaen"/>
+          <w:sz w:val="24"/>
+        </w:rPr>
+        <w:tab/>
+      </w:r>
+      <w:r>
+        <w:rPr>
+          <w:rFonts w:ascii="Sylfaen" w:hAnsi="Sylfaen"/>
+          <w:sz w:val="24"/>
+        </w:rPr>
+        <w:t>32</w:t>
+      </w:r>
+    </w:p>
+    <w:p>
+      <w:pPr>
+        <w:tabs>
+          <w:tab w:pos="8323" w:val="right" w:leader="dot"/>
+        </w:tabs>
+        <w:spacing w:line="240" w:lineRule="auto" w:before="0" w:after="0"/>
+        <w:ind w:left="454"/>
+      </w:pPr>
+      <w:r>
+        <w:rPr>
+          <w:rFonts w:ascii="Sylfaen" w:hAnsi="Sylfaen"/>
+          <w:sz w:val="24"/>
+        </w:rPr>
+        <w:t>3.1 კვლევის დიზაინი და წვლილი</w:t>
+      </w:r>
+      <w:r>
+        <w:rPr>
+          <w:rFonts w:ascii="Sylfaen" w:hAnsi="Sylfaen"/>
+          <w:sz w:val="24"/>
+        </w:rPr>
+        <w:tab/>
+      </w:r>
+      <w:r>
+        <w:rPr>
+          <w:rFonts w:ascii="Sylfaen" w:hAnsi="Sylfaen"/>
+          <w:sz w:val="24"/>
+        </w:rPr>
+        <w:t>32</w:t>
+      </w:r>
+    </w:p>
+    <w:p>
+      <w:pPr>
+        <w:tabs>
+          <w:tab w:pos="8323" w:val="right" w:leader="dot"/>
+        </w:tabs>
+        <w:spacing w:line="240" w:lineRule="auto" w:before="0" w:after="0"/>
+        <w:ind w:left="454"/>
+      </w:pPr>
+      <w:r>
+        <w:rPr>
+          <w:rFonts w:ascii="Sylfaen" w:hAnsi="Sylfaen"/>
+          <w:sz w:val="24"/>
+        </w:rPr>
+        <w:t>3.2 პროფილი C-ის მეხსიერების არქიტექტურა</w:t>
+      </w:r>
+      <w:r>
+        <w:rPr>
+          <w:rFonts w:ascii="Sylfaen" w:hAnsi="Sylfaen"/>
+          <w:sz w:val="24"/>
+        </w:rPr>
+        <w:tab/>
+      </w:r>
+      <w:r>
+        <w:rPr>
+          <w:rFonts w:ascii="Sylfaen" w:hAnsi="Sylfaen"/>
+          <w:sz w:val="24"/>
+        </w:rPr>
+        <w:t>34</w:t>
+      </w:r>
+    </w:p>
+    <w:p>
+      <w:pPr>
+        <w:tabs>
+          <w:tab w:pos="8323" w:val="right" w:leader="dot"/>
+        </w:tabs>
+        <w:spacing w:line="240" w:lineRule="auto" w:before="0" w:after="0"/>
+        <w:ind w:left="454"/>
+      </w:pPr>
+      <w:r>
+        <w:rPr>
+          <w:rFonts w:ascii="Sylfaen" w:hAnsi="Sylfaen"/>
+          <w:sz w:val="24"/>
+        </w:rPr>
+        <w:t>3.3 ექსპერიმენტული პირობები (A / B / B+ / C)</w:t>
+      </w:r>
+      <w:r>
+        <w:rPr>
+          <w:rFonts w:ascii="Sylfaen" w:hAnsi="Sylfaen"/>
+          <w:sz w:val="24"/>
+        </w:rPr>
+        <w:tab/>
+      </w:r>
+      <w:r>
+        <w:rPr>
+          <w:rFonts w:ascii="Sylfaen" w:hAnsi="Sylfaen"/>
+          <w:sz w:val="24"/>
+        </w:rPr>
+        <w:t>39</w:t>
+      </w:r>
+    </w:p>
+    <w:p>
+      <w:pPr>
+        <w:tabs>
+          <w:tab w:pos="8323" w:val="right" w:leader="dot"/>
+        </w:tabs>
+        <w:spacing w:line="240" w:lineRule="auto" w:before="0" w:after="0"/>
+        <w:ind w:left="454"/>
+      </w:pPr>
+      <w:r>
+        <w:rPr>
+          <w:rFonts w:ascii="Sylfaen" w:hAnsi="Sylfaen"/>
+          <w:sz w:val="24"/>
+        </w:rPr>
+        <w:t>3.4 კონცეფციის დამტკიცების იმპლემენტაცია</w:t>
+      </w:r>
+      <w:r>
+        <w:rPr>
+          <w:rFonts w:ascii="Sylfaen" w:hAnsi="Sylfaen"/>
+          <w:sz w:val="24"/>
+        </w:rPr>
+        <w:tab/>
+      </w:r>
+      <w:r>
+        <w:rPr>
+          <w:rFonts w:ascii="Sylfaen" w:hAnsi="Sylfaen"/>
+          <w:sz w:val="24"/>
+        </w:rPr>
+        <w:t>42</w:t>
+      </w:r>
+    </w:p>
+    <w:p>
+      <w:pPr>
+        <w:tabs>
+          <w:tab w:pos="8323" w:val="right" w:leader="dot"/>
+        </w:tabs>
+        <w:spacing w:line="240" w:lineRule="auto" w:before="0" w:after="0"/>
+        <w:ind w:left="454"/>
+      </w:pPr>
+      <w:r>
+        <w:rPr>
+          <w:rFonts w:ascii="Sylfaen" w:hAnsi="Sylfaen"/>
+          <w:sz w:val="24"/>
+        </w:rPr>
+        <w:t>3.5 შეფასების მეთოდოლოგია</w:t>
+      </w:r>
+      <w:r>
+        <w:rPr>
+          <w:rFonts w:ascii="Sylfaen" w:hAnsi="Sylfaen"/>
+          <w:sz w:val="24"/>
+        </w:rPr>
+        <w:tab/>
+      </w:r>
+      <w:r>
+        <w:rPr>
+          <w:rFonts w:ascii="Sylfaen" w:hAnsi="Sylfaen"/>
+          <w:sz w:val="24"/>
+        </w:rPr>
+        <w:t>44</w:t>
+      </w:r>
+    </w:p>
+    <w:p>
+      <w:pPr>
+        <w:tabs>
+          <w:tab w:pos="8323" w:val="right" w:leader="dot"/>
+        </w:tabs>
+        <w:spacing w:line="240" w:lineRule="auto" w:before="0" w:after="0"/>
+        <w:ind w:left="454"/>
+      </w:pPr>
+      <w:r>
+        <w:rPr>
+          <w:rFonts w:ascii="Sylfaen" w:hAnsi="Sylfaen"/>
+          <w:sz w:val="24"/>
+        </w:rPr>
+        <w:t>3.6 ზომები და ინსტრუმენტები</w:t>
+      </w:r>
+      <w:r>
+        <w:rPr>
+          <w:rFonts w:ascii="Sylfaen" w:hAnsi="Sylfaen"/>
+          <w:sz w:val="24"/>
+        </w:rPr>
+        <w:tab/>
+      </w:r>
+      <w:r>
+        <w:rPr>
+          <w:rFonts w:ascii="Sylfaen" w:hAnsi="Sylfaen"/>
+          <w:sz w:val="24"/>
+        </w:rPr>
+        <w:t>47</w:t>
+      </w:r>
+    </w:p>
+    <w:p>
+      <w:pPr>
+        <w:tabs>
+          <w:tab w:pos="8323" w:val="right" w:leader="dot"/>
+        </w:tabs>
+        <w:spacing w:line="240" w:lineRule="auto" w:before="0" w:after="0"/>
+        <w:ind w:left="454"/>
+      </w:pPr>
+      <w:r>
+        <w:rPr>
+          <w:rFonts w:ascii="Sylfaen" w:hAnsi="Sylfaen"/>
+          <w:sz w:val="24"/>
+        </w:rPr>
+        <w:t>3.7 ანალიზის გეგმა</w:t>
+      </w:r>
+      <w:r>
+        <w:rPr>
+          <w:rFonts w:ascii="Sylfaen" w:hAnsi="Sylfaen"/>
+          <w:sz w:val="24"/>
+        </w:rPr>
+        <w:tab/>
+      </w:r>
+      <w:r>
+        <w:rPr>
+          <w:rFonts w:ascii="Sylfaen" w:hAnsi="Sylfaen"/>
+          <w:sz w:val="24"/>
+        </w:rPr>
+        <w:t>49</w:t>
+      </w:r>
+    </w:p>
+    <w:p>
+      <w:pPr>
+        <w:tabs>
+          <w:tab w:pos="8323" w:val="right" w:leader="dot"/>
+        </w:tabs>
+        <w:spacing w:line="240" w:lineRule="auto" w:before="0" w:after="0"/>
+        <w:ind w:left="454"/>
+      </w:pPr>
+      <w:r>
+        <w:rPr>
+          <w:rFonts w:ascii="Sylfaen" w:hAnsi="Sylfaen"/>
+          <w:sz w:val="24"/>
+        </w:rPr>
+        <w:t>3.8 ეთიკური საკითხები და შეზღუდვები</w:t>
+      </w:r>
+      <w:r>
+        <w:rPr>
+          <w:rFonts w:ascii="Sylfaen" w:hAnsi="Sylfaen"/>
+          <w:sz w:val="24"/>
+        </w:rPr>
+        <w:tab/>
+      </w:r>
+      <w:r>
+        <w:rPr>
+          <w:rFonts w:ascii="Sylfaen" w:hAnsi="Sylfaen"/>
+          <w:sz w:val="24"/>
+        </w:rPr>
+        <w:t>50</w:t>
+      </w:r>
+    </w:p>
+    <w:p>
+      <w:pPr>
+        <w:tabs>
+          <w:tab w:pos="8323" w:val="right" w:leader="dot"/>
+        </w:tabs>
+        <w:spacing w:line="240" w:lineRule="auto" w:before="0" w:after="0"/>
+        <w:ind w:left="0"/>
+      </w:pPr>
+      <w:r>
+        <w:rPr>
+          <w:rFonts w:ascii="Sylfaen" w:hAnsi="Sylfaen"/>
+          <w:sz w:val="24"/>
+        </w:rPr>
+        <w:t>4. შედეგები და განხილვა</w:t>
+      </w:r>
+      <w:r>
+        <w:rPr>
+          <w:rFonts w:ascii="Sylfaen" w:hAnsi="Sylfaen"/>
+          <w:sz w:val="24"/>
+        </w:rPr>
+        <w:tab/>
+      </w:r>
+      <w:r>
+        <w:rPr>
+          <w:rFonts w:ascii="Sylfaen" w:hAnsi="Sylfaen"/>
+          <w:sz w:val="24"/>
+        </w:rPr>
+        <w:t>53</w:t>
+      </w:r>
+    </w:p>
+    <w:p>
+      <w:pPr>
+        <w:tabs>
+          <w:tab w:pos="8323" w:val="right" w:leader="dot"/>
+        </w:tabs>
+        <w:spacing w:line="240" w:lineRule="auto" w:before="0" w:after="0"/>
+        <w:ind w:left="454"/>
+      </w:pPr>
+      <w:r>
+        <w:rPr>
+          <w:rFonts w:ascii="Sylfaen" w:hAnsi="Sylfaen"/>
+          <w:sz w:val="24"/>
+        </w:rPr>
+        <w:t>4.1 კონცეფციის დამტკიცება: მასშტაბი და სიზუსტე</w:t>
+      </w:r>
+      <w:r>
+        <w:rPr>
+          <w:rFonts w:ascii="Sylfaen" w:hAnsi="Sylfaen"/>
+          <w:sz w:val="24"/>
+        </w:rPr>
+        <w:tab/>
+      </w:r>
+      <w:r>
+        <w:rPr>
+          <w:rFonts w:ascii="Sylfaen" w:hAnsi="Sylfaen"/>
+          <w:sz w:val="24"/>
+        </w:rPr>
+        <w:t>53</w:t>
+      </w:r>
+    </w:p>
+    <w:p>
+      <w:pPr>
+        <w:tabs>
+          <w:tab w:pos="8323" w:val="right" w:leader="dot"/>
+        </w:tabs>
+        <w:spacing w:line="240" w:lineRule="auto" w:before="0" w:after="0"/>
+        <w:ind w:left="454"/>
+      </w:pPr>
+      <w:r>
+        <w:rPr>
+          <w:rFonts w:ascii="Sylfaen" w:hAnsi="Sylfaen"/>
+          <w:sz w:val="24"/>
+        </w:rPr>
+        <w:t>4.2 ტექნიკური შედეგები</w:t>
+      </w:r>
+      <w:r>
+        <w:rPr>
+          <w:rFonts w:ascii="Sylfaen" w:hAnsi="Sylfaen"/>
+          <w:sz w:val="24"/>
+        </w:rPr>
+        <w:tab/>
+      </w:r>
+      <w:r>
+        <w:rPr>
+          <w:rFonts w:ascii="Sylfaen" w:hAnsi="Sylfaen"/>
+          <w:sz w:val="24"/>
+        </w:rPr>
+        <w:t>54</w:t>
+      </w:r>
+    </w:p>
+    <w:p>
+      <w:pPr>
+        <w:tabs>
+          <w:tab w:pos="8323" w:val="right" w:leader="dot"/>
+        </w:tabs>
+        <w:spacing w:line="240" w:lineRule="auto" w:before="0" w:after="0"/>
+        <w:ind w:left="454"/>
+      </w:pPr>
+      <w:r>
+        <w:rPr>
+          <w:rFonts w:ascii="Sylfaen" w:hAnsi="Sylfaen"/>
+          <w:sz w:val="24"/>
+        </w:rPr>
+        <w:t>4.3 სიმულირებული აღქმის შედეგები</w:t>
+      </w:r>
+      <w:r>
+        <w:rPr>
+          <w:rFonts w:ascii="Sylfaen" w:hAnsi="Sylfaen"/>
+          <w:sz w:val="24"/>
+        </w:rPr>
+        <w:tab/>
+      </w:r>
+      <w:r>
+        <w:rPr>
+          <w:rFonts w:ascii="Sylfaen" w:hAnsi="Sylfaen"/>
+          <w:sz w:val="24"/>
+        </w:rPr>
+        <w:t>56</w:t>
+      </w:r>
+    </w:p>
+    <w:p>
+      <w:pPr>
+        <w:tabs>
+          <w:tab w:pos="8323" w:val="right" w:leader="dot"/>
+        </w:tabs>
+        <w:spacing w:line="240" w:lineRule="auto" w:before="0" w:after="0"/>
+        <w:ind w:left="454"/>
+      </w:pPr>
+      <w:r>
+        <w:rPr>
+          <w:rFonts w:ascii="Sylfaen" w:hAnsi="Sylfaen"/>
+          <w:sz w:val="24"/>
+        </w:rPr>
+        <w:t>4.4 განხილვა</w:t>
+      </w:r>
+      <w:r>
+        <w:rPr>
+          <w:rFonts w:ascii="Sylfaen" w:hAnsi="Sylfaen"/>
+          <w:sz w:val="24"/>
+        </w:rPr>
+        <w:tab/>
+      </w:r>
+      <w:r>
+        <w:rPr>
+          <w:rFonts w:ascii="Sylfaen" w:hAnsi="Sylfaen"/>
+          <w:sz w:val="24"/>
+        </w:rPr>
+        <w:t>58</w:t>
+      </w:r>
+    </w:p>
+    <w:p>
+      <w:pPr>
+        <w:tabs>
+          <w:tab w:pos="8323" w:val="right" w:leader="dot"/>
+        </w:tabs>
+        <w:spacing w:line="240" w:lineRule="auto" w:before="0" w:after="0"/>
+        <w:ind w:left="454"/>
+      </w:pPr>
+      <w:r>
+        <w:rPr>
+          <w:rFonts w:ascii="Sylfaen" w:hAnsi="Sylfaen"/>
+          <w:sz w:val="24"/>
+        </w:rPr>
+        <w:t>4.5 შეფასების შეზღუდვები</w:t>
+      </w:r>
+      <w:r>
+        <w:rPr>
+          <w:rFonts w:ascii="Sylfaen" w:hAnsi="Sylfaen"/>
+          <w:sz w:val="24"/>
+        </w:rPr>
+        <w:tab/>
+      </w:r>
+      <w:r>
+        <w:rPr>
+          <w:rFonts w:ascii="Sylfaen" w:hAnsi="Sylfaen"/>
+          <w:sz w:val="24"/>
+        </w:rPr>
+        <w:t>59</w:t>
+      </w:r>
+    </w:p>
+    <w:p>
+      <w:pPr>
+        <w:tabs>
+          <w:tab w:pos="8323" w:val="right" w:leader="dot"/>
+        </w:tabs>
+        <w:spacing w:line="240" w:lineRule="auto" w:before="0" w:after="0"/>
+        <w:ind w:left="0"/>
+      </w:pPr>
+      <w:r>
+        <w:rPr>
+          <w:rFonts w:ascii="Sylfaen" w:hAnsi="Sylfaen"/>
+          <w:sz w:val="24"/>
+        </w:rPr>
+        <w:t>5. დასკვნა</w:t>
+      </w:r>
+      <w:r>
+        <w:rPr>
+          <w:rFonts w:ascii="Sylfaen" w:hAnsi="Sylfaen"/>
+          <w:sz w:val="24"/>
+        </w:rPr>
+        <w:tab/>
+      </w:r>
+      <w:r>
+        <w:rPr>
+          <w:rFonts w:ascii="Sylfaen" w:hAnsi="Sylfaen"/>
+          <w:sz w:val="24"/>
+        </w:rPr>
+        <w:t>61</w:t>
+      </w:r>
+    </w:p>
+    <w:p>
+      <w:pPr>
+        <w:tabs>
+          <w:tab w:pos="8323" w:val="right" w:leader="dot"/>
+        </w:tabs>
+        <w:spacing w:line="240" w:lineRule="auto" w:before="0" w:after="0"/>
+        <w:ind w:left="454"/>
+      </w:pPr>
+      <w:r>
+        <w:rPr>
+          <w:rFonts w:ascii="Sylfaen" w:hAnsi="Sylfaen"/>
+          <w:sz w:val="24"/>
+        </w:rPr>
+        <w:t>5.1 წვლილის შეჯამება</w:t>
+      </w:r>
+      <w:r>
+        <w:rPr>
+          <w:rFonts w:ascii="Sylfaen" w:hAnsi="Sylfaen"/>
+          <w:sz w:val="24"/>
+        </w:rPr>
+        <w:tab/>
+      </w:r>
+      <w:r>
+        <w:rPr>
+          <w:rFonts w:ascii="Sylfaen" w:hAnsi="Sylfaen"/>
+          <w:sz w:val="24"/>
+        </w:rPr>
+        <w:t>61</w:t>
+      </w:r>
+    </w:p>
+    <w:p>
+      <w:pPr>
+        <w:tabs>
+          <w:tab w:pos="8323" w:val="right" w:leader="dot"/>
+        </w:tabs>
+        <w:spacing w:line="240" w:lineRule="auto" w:before="0" w:after="0"/>
+        <w:ind w:left="454"/>
+      </w:pPr>
+      <w:r>
+        <w:rPr>
+          <w:rFonts w:ascii="Sylfaen" w:hAnsi="Sylfaen"/>
+          <w:sz w:val="24"/>
+        </w:rPr>
+        <w:t>5.2 შედეგების შეჯამება</w:t>
+      </w:r>
+      <w:r>
+        <w:rPr>
+          <w:rFonts w:ascii="Sylfaen" w:hAnsi="Sylfaen"/>
+          <w:sz w:val="24"/>
+        </w:rPr>
+        <w:tab/>
+      </w:r>
+      <w:r>
+        <w:rPr>
+          <w:rFonts w:ascii="Sylfaen" w:hAnsi="Sylfaen"/>
+          <w:sz w:val="24"/>
+        </w:rPr>
+        <w:t>62</w:t>
+      </w:r>
+    </w:p>
+    <w:p>
+      <w:pPr>
+        <w:tabs>
+          <w:tab w:pos="8323" w:val="right" w:leader="dot"/>
+        </w:tabs>
+        <w:spacing w:line="240" w:lineRule="auto" w:before="0" w:after="0"/>
+        <w:ind w:left="454"/>
+      </w:pPr>
+      <w:r>
+        <w:rPr>
+          <w:rFonts w:ascii="Sylfaen" w:hAnsi="Sylfaen"/>
+          <w:sz w:val="24"/>
+        </w:rPr>
+        <w:t>5.3 სამომავლო სამუშაო</w:t>
+      </w:r>
+      <w:r>
+        <w:rPr>
+          <w:rFonts w:ascii="Sylfaen" w:hAnsi="Sylfaen"/>
+          <w:sz w:val="24"/>
+        </w:rPr>
+        <w:tab/>
+      </w:r>
+      <w:r>
+        <w:rPr>
+          <w:rFonts w:ascii="Sylfaen" w:hAnsi="Sylfaen"/>
+          <w:sz w:val="24"/>
+        </w:rPr>
+        <w:t>62</w:t>
+      </w:r>
+    </w:p>
+    <w:p>
+      <w:pPr>
+        <w:tabs>
+          <w:tab w:pos="8323" w:val="right" w:leader="dot"/>
+        </w:tabs>
+        <w:spacing w:line="240" w:lineRule="auto" w:before="0" w:after="0"/>
+        <w:ind w:left="0"/>
+      </w:pPr>
+      <w:r>
+        <w:rPr>
+          <w:rFonts w:ascii="Sylfaen" w:hAnsi="Sylfaen"/>
+          <w:sz w:val="24"/>
+        </w:rPr>
+        <w:t>ბიბლიოგრაფია</w:t>
+      </w:r>
+      <w:r>
+        <w:rPr>
+          <w:rFonts w:ascii="Sylfaen" w:hAnsi="Sylfaen"/>
+          <w:sz w:val="24"/>
+        </w:rPr>
+        <w:tab/>
+      </w:r>
+      <w:r>
+        <w:rPr>
+          <w:rFonts w:ascii="Sylfaen" w:hAnsi="Sylfaen"/>
+          <w:sz w:val="24"/>
+        </w:rPr>
+        <w:t>64</w:t>
+      </w:r>
     </w:p>
     <w:p>
       <w:pPr>
@@ -1623,18 +2521,23 @@
         <w:numPr>
           <w:numId w:val="0"/>
         </w:numPr>
+        <w:spacing w:before="360" w:after="80"/>
+        <w:jc w:val="center"/>
       </w:pPr>
       <w:r>
         <w:rPr>
           <w:rFonts w:ascii="Sylfaen" w:hAnsi="Sylfaen" w:cs="Sylfaen"/>
           <w:b/>
+          <w:color w:val="000000"/>
           <w:sz w:val="28"/>
         </w:rPr>
         <w:t>1. შესავალი</w:t>
       </w:r>
     </w:p>
     <w:p>
-      <w:pPr/>
+      <w:pPr>
+        <w:jc w:val="both"/>
+      </w:pPr>
       <w:r>
         <w:rPr>
           <w:rFonts w:ascii="Sylfaen" w:hAnsi="Sylfaen" w:cs="Sylfaen"/>
@@ -1653,7 +2556,9 @@
       </w:r>
     </w:p>
     <w:p>
-      <w:pPr/>
+      <w:pPr>
+        <w:jc w:val="both"/>
+      </w:pPr>
       <w:r>
         <w:rPr>
           <w:rFonts w:ascii="Sylfaen" w:hAnsi="Sylfaen" w:cs="Sylfaen"/>
@@ -1664,7 +2569,9 @@
       </w:r>
     </w:p>
     <w:p>
-      <w:pPr/>
+      <w:pPr>
+        <w:jc w:val="both"/>
+      </w:pPr>
       <w:r>
         <w:rPr>
           <w:rFonts w:ascii="Sylfaen" w:hAnsi="Sylfaen" w:cs="Sylfaen"/>
@@ -1675,7 +2582,9 @@
       </w:r>
     </w:p>
     <w:p>
-      <w:pPr/>
+      <w:pPr>
+        <w:jc w:val="both"/>
+      </w:pPr>
       <w:r>
         <w:rPr>
           <w:rFonts w:ascii="Sylfaen" w:hAnsi="Sylfaen" w:cs="Sylfaen"/>
@@ -1686,7 +2595,9 @@
       </w:r>
     </w:p>
     <w:p>
-      <w:pPr/>
+      <w:pPr>
+        <w:jc w:val="both"/>
+      </w:pPr>
       <w:r>
         <w:rPr>
           <w:rFonts w:ascii="Sylfaen" w:hAnsi="Sylfaen" w:cs="Sylfaen"/>
@@ -1705,7 +2616,9 @@
       </w:r>
     </w:p>
     <w:p>
-      <w:pPr/>
+      <w:pPr>
+        <w:jc w:val="both"/>
+      </w:pPr>
       <w:r>
         <w:rPr>
           <w:rFonts w:ascii="Sylfaen" w:hAnsi="Sylfaen" w:cs="Sylfaen"/>
@@ -1716,7 +2629,9 @@
       </w:r>
     </w:p>
     <w:p>
-      <w:pPr/>
+      <w:pPr>
+        <w:jc w:val="both"/>
+      </w:pPr>
       <w:r>
         <w:rPr>
           <w:rFonts w:ascii="Sylfaen" w:hAnsi="Sylfaen" w:cs="Sylfaen"/>
@@ -1727,7 +2642,9 @@
       </w:r>
     </w:p>
     <w:p>
-      <w:pPr/>
+      <w:pPr>
+        <w:jc w:val="both"/>
+      </w:pPr>
       <w:r>
         <w:rPr>
           <w:rFonts w:ascii="Sylfaen" w:hAnsi="Sylfaen" w:cs="Sylfaen"/>
@@ -1738,7 +2655,9 @@
       </w:r>
     </w:p>
     <w:p>
-      <w:pPr/>
+      <w:pPr>
+        <w:jc w:val="both"/>
+      </w:pPr>
       <w:r>
         <w:rPr>
           <w:rFonts w:ascii="Sylfaen" w:hAnsi="Sylfaen" w:cs="Sylfaen"/>
@@ -1749,7 +2668,9 @@
       </w:r>
     </w:p>
     <w:p>
-      <w:pPr/>
+      <w:pPr>
+        <w:jc w:val="both"/>
+      </w:pPr>
       <w:r>
         <w:rPr>
           <w:rFonts w:ascii="Sylfaen" w:hAnsi="Sylfaen" w:cs="Sylfaen"/>
@@ -1760,7 +2681,9 @@
       </w:r>
     </w:p>
     <w:p>
-      <w:pPr/>
+      <w:pPr>
+        <w:jc w:val="both"/>
+      </w:pPr>
       <w:r>
         <w:rPr>
           <w:rFonts w:ascii="Sylfaen" w:hAnsi="Sylfaen" w:cs="Sylfaen"/>
@@ -1771,7 +2694,9 @@
       </w:r>
     </w:p>
     <w:p>
-      <w:pPr/>
+      <w:pPr>
+        <w:jc w:val="both"/>
+      </w:pPr>
       <w:r>
         <w:rPr>
           <w:rFonts w:ascii="Sylfaen" w:hAnsi="Sylfaen" w:cs="Sylfaen"/>
@@ -1782,7 +2707,9 @@
       </w:r>
     </w:p>
     <w:p>
-      <w:pPr/>
+      <w:pPr>
+        <w:jc w:val="both"/>
+      </w:pPr>
       <w:r>
         <w:rPr>
           <w:rFonts w:ascii="Sylfaen" w:hAnsi="Sylfaen" w:cs="Sylfaen"/>
@@ -1793,7 +2720,9 @@
       </w:r>
     </w:p>
     <w:p>
-      <w:pPr/>
+      <w:pPr>
+        <w:jc w:val="both"/>
+      </w:pPr>
       <w:r>
         <w:rPr>
           <w:rFonts w:ascii="Sylfaen" w:hAnsi="Sylfaen" w:cs="Sylfaen"/>
@@ -1804,7 +2733,9 @@
       </w:r>
     </w:p>
     <w:p>
-      <w:pPr/>
+      <w:pPr>
+        <w:jc w:val="both"/>
+      </w:pPr>
       <w:r>
         <w:rPr>
           <w:rFonts w:ascii="Sylfaen" w:hAnsi="Sylfaen" w:cs="Sylfaen"/>
@@ -1815,7 +2746,9 @@
       </w:r>
     </w:p>
     <w:p>
-      <w:pPr/>
+      <w:pPr>
+        <w:jc w:val="both"/>
+      </w:pPr>
       <w:r>
         <w:rPr>
           <w:rFonts w:ascii="Sylfaen" w:hAnsi="Sylfaen" w:cs="Sylfaen"/>
@@ -1826,7 +2759,9 @@
       </w:r>
     </w:p>
     <w:p>
-      <w:pPr/>
+      <w:pPr>
+        <w:jc w:val="both"/>
+      </w:pPr>
       <w:r>
         <w:rPr>
           <w:rFonts w:ascii="Sylfaen" w:hAnsi="Sylfaen" w:cs="Sylfaen"/>
@@ -1837,7 +2772,9 @@
       </w:r>
     </w:p>
     <w:p>
-      <w:pPr/>
+      <w:pPr>
+        <w:jc w:val="both"/>
+      </w:pPr>
       <w:r>
         <w:rPr>
           <w:rFonts w:ascii="Sylfaen" w:hAnsi="Sylfaen" w:cs="Sylfaen"/>
@@ -1848,7 +2785,9 @@
       </w:r>
     </w:p>
     <w:p>
-      <w:pPr/>
+      <w:pPr>
+        <w:jc w:val="both"/>
+      </w:pPr>
       <w:r>
         <w:rPr>
           <w:rFonts w:ascii="Sylfaen" w:hAnsi="Sylfaen" w:cs="Sylfaen"/>
@@ -1859,7 +2798,9 @@
       </w:r>
     </w:p>
     <w:p>
-      <w:pPr/>
+      <w:pPr>
+        <w:jc w:val="both"/>
+      </w:pPr>
       <w:r>
         <w:rPr>
           <w:rFonts w:ascii="Sylfaen" w:hAnsi="Sylfaen" w:cs="Sylfaen"/>
@@ -1878,7 +2819,9 @@
       </w:r>
     </w:p>
     <w:p>
-      <w:pPr/>
+      <w:pPr>
+        <w:jc w:val="both"/>
+      </w:pPr>
       <w:r>
         <w:rPr>
           <w:rFonts w:ascii="Sylfaen" w:hAnsi="Sylfaen" w:cs="Sylfaen"/>
@@ -1897,7 +2840,9 @@
       </w:r>
     </w:p>
     <w:p>
-      <w:pPr/>
+      <w:pPr>
+        <w:jc w:val="both"/>
+      </w:pPr>
       <w:r>
         <w:rPr>
           <w:rFonts w:ascii="Sylfaen" w:hAnsi="Sylfaen" w:cs="Sylfaen"/>
@@ -1908,7 +2853,9 @@
       </w:r>
     </w:p>
     <w:p>
-      <w:pPr/>
+      <w:pPr>
+        <w:jc w:val="both"/>
+      </w:pPr>
       <w:r>
         <w:rPr>
           <w:rFonts w:ascii="Sylfaen" w:hAnsi="Sylfaen" w:cs="Sylfaen"/>
@@ -1919,7 +2866,9 @@
       </w:r>
     </w:p>
     <w:p>
-      <w:pPr/>
+      <w:pPr>
+        <w:jc w:val="both"/>
+      </w:pPr>
       <w:r>
         <w:rPr>
           <w:rFonts w:ascii="Sylfaen" w:hAnsi="Sylfaen" w:cs="Sylfaen"/>
@@ -1930,7 +2879,9 @@
       </w:r>
     </w:p>
     <w:p>
-      <w:pPr/>
+      <w:pPr>
+        <w:jc w:val="both"/>
+      </w:pPr>
       <w:r>
         <w:rPr>
           <w:rFonts w:ascii="Sylfaen" w:hAnsi="Sylfaen" w:cs="Sylfaen"/>
@@ -1941,7 +2892,9 @@
       </w:r>
     </w:p>
     <w:p>
-      <w:pPr/>
+      <w:pPr>
+        <w:jc w:val="both"/>
+      </w:pPr>
       <w:r>
         <w:rPr>
           <w:rFonts w:ascii="Sylfaen" w:hAnsi="Sylfaen" w:cs="Sylfaen"/>
@@ -1960,7 +2913,9 @@
       </w:r>
     </w:p>
     <w:p>
-      <w:pPr/>
+      <w:pPr>
+        <w:jc w:val="both"/>
+      </w:pPr>
       <w:r>
         <w:rPr>
           <w:rFonts w:ascii="Sylfaen" w:hAnsi="Sylfaen" w:cs="Sylfaen"/>
@@ -1985,11 +2940,14 @@
         <w:numPr>
           <w:numId w:val="0"/>
         </w:numPr>
+        <w:spacing w:before="360" w:after="80"/>
+        <w:jc w:val="center"/>
       </w:pPr>
       <w:r>
         <w:rPr>
           <w:rFonts w:ascii="Sylfaen" w:hAnsi="Sylfaen" w:cs="Sylfaen"/>
           <w:b/>
+          <w:color w:val="000000"/>
           <w:sz w:val="28"/>
         </w:rPr>
         <w:t>2. ლიტერატურის მიმოხილვა</w:t>
@@ -2001,18 +2959,23 @@
         <w:numPr>
           <w:numId w:val="0"/>
         </w:numPr>
+        <w:spacing w:before="160" w:after="80"/>
+        <w:jc w:val="center"/>
       </w:pPr>
       <w:r>
         <w:rPr>
           <w:rFonts w:ascii="Sylfaen" w:hAnsi="Sylfaen" w:cs="Sylfaen"/>
           <w:b/>
-          <w:sz w:val="26"/>
+          <w:color w:val="000000"/>
+          <w:sz w:val="28"/>
         </w:rPr>
         <w:t>2.1 მიმოხილვის მოცულობა და სტრუქტურა</w:t>
       </w:r>
     </w:p>
     <w:p>
-      <w:pPr/>
+      <w:pPr>
+        <w:jc w:val="both"/>
+      </w:pPr>
       <w:r>
         <w:rPr>
           <w:rFonts w:ascii="Sylfaen" w:hAnsi="Sylfaen" w:cs="Sylfaen"/>
@@ -2028,18 +2991,23 @@
         <w:numPr>
           <w:numId w:val="0"/>
         </w:numPr>
+        <w:spacing w:before="160" w:after="80"/>
+        <w:jc w:val="center"/>
       </w:pPr>
       <w:r>
         <w:rPr>
           <w:rFonts w:ascii="Sylfaen" w:hAnsi="Sylfaen" w:cs="Sylfaen"/>
           <w:b/>
-          <w:sz w:val="26"/>
+          <w:color w:val="000000"/>
+          <w:sz w:val="28"/>
         </w:rPr>
         <w:t>2.2 თეორიული საფუძვლები: ადამიანის მეხსიერების მოდელები</w:t>
       </w:r>
     </w:p>
     <w:p>
-      <w:pPr/>
+      <w:pPr>
+        <w:jc w:val="both"/>
+      </w:pPr>
       <w:r>
         <w:rPr>
           <w:rFonts w:ascii="Sylfaen" w:hAnsi="Sylfaen" w:cs="Sylfaen"/>
@@ -2050,7 +3018,9 @@
       </w:r>
     </w:p>
     <w:p>
-      <w:pPr/>
+      <w:pPr>
+        <w:jc w:val="both"/>
+      </w:pPr>
       <w:r>
         <w:rPr>
           <w:rFonts w:ascii="Sylfaen" w:hAnsi="Sylfaen" w:cs="Sylfaen"/>
@@ -2061,7 +3031,9 @@
       </w:r>
     </w:p>
     <w:p>
-      <w:pPr/>
+      <w:pPr>
+        <w:jc w:val="both"/>
+      </w:pPr>
       <w:r>
         <w:rPr>
           <w:rFonts w:ascii="Sylfaen" w:hAnsi="Sylfaen" w:cs="Sylfaen"/>
@@ -2072,7 +3044,9 @@
       </w:r>
     </w:p>
     <w:p>
-      <w:pPr/>
+      <w:pPr>
+        <w:jc w:val="both"/>
+      </w:pPr>
       <w:r>
         <w:rPr>
           <w:rFonts w:ascii="Sylfaen" w:hAnsi="Sylfaen" w:cs="Sylfaen"/>
@@ -2083,7 +3057,9 @@
       </w:r>
     </w:p>
     <w:p>
-      <w:pPr/>
+      <w:pPr>
+        <w:jc w:val="both"/>
+      </w:pPr>
       <w:r>
         <w:rPr>
           <w:rFonts w:ascii="Sylfaen" w:hAnsi="Sylfaen" w:cs="Sylfaen"/>
@@ -2094,7 +3070,9 @@
       </w:r>
     </w:p>
     <w:p>
-      <w:pPr/>
+      <w:pPr>
+        <w:jc w:val="both"/>
+      </w:pPr>
       <w:r>
         <w:rPr>
           <w:rFonts w:ascii="Sylfaen" w:hAnsi="Sylfaen" w:cs="Sylfaen"/>
@@ -2105,7 +3083,9 @@
       </w:r>
     </w:p>
     <w:p>
-      <w:pPr/>
+      <w:pPr>
+        <w:jc w:val="both"/>
+      </w:pPr>
       <w:r>
         <w:rPr>
           <w:rFonts w:ascii="Sylfaen" w:hAnsi="Sylfaen" w:cs="Sylfaen"/>
@@ -2132,18 +3112,23 @@
         <w:numPr>
           <w:numId w:val="0"/>
         </w:numPr>
+        <w:spacing w:before="160" w:after="80"/>
+        <w:jc w:val="center"/>
       </w:pPr>
       <w:r>
         <w:rPr>
           <w:rFonts w:ascii="Sylfaen" w:hAnsi="Sylfaen" w:cs="Sylfaen"/>
           <w:b/>
-          <w:sz w:val="26"/>
+          <w:color w:val="000000"/>
+          <w:sz w:val="28"/>
         </w:rPr>
         <w:t>2.3 გრძელვადიანი მეხსიერება დიდი ენის მოდელის აგენტებისთვის: სამი ტალღა</w:t>
       </w:r>
     </w:p>
     <w:p>
-      <w:pPr/>
+      <w:pPr>
+        <w:jc w:val="both"/>
+      </w:pPr>
       <w:r>
         <w:rPr>
           <w:rFonts w:ascii="Sylfaen" w:hAnsi="Sylfaen" w:cs="Sylfaen"/>
@@ -2154,7 +3139,9 @@
       </w:r>
     </w:p>
     <w:p>
-      <w:pPr/>
+      <w:pPr>
+        <w:jc w:val="both"/>
+      </w:pPr>
       <w:r>
         <w:rPr>
           <w:rFonts w:ascii="Sylfaen" w:hAnsi="Sylfaen" w:cs="Sylfaen"/>
@@ -2165,7 +3152,9 @@
       </w:r>
     </w:p>
     <w:p>
-      <w:pPr/>
+      <w:pPr>
+        <w:jc w:val="both"/>
+      </w:pPr>
       <w:r>
         <w:rPr>
           <w:rFonts w:ascii="Sylfaen" w:hAnsi="Sylfaen" w:cs="Sylfaen"/>
@@ -2176,7 +3165,9 @@
       </w:r>
     </w:p>
     <w:p>
-      <w:pPr/>
+      <w:pPr>
+        <w:jc w:val="both"/>
+      </w:pPr>
       <w:r>
         <w:rPr>
           <w:rFonts w:ascii="Sylfaen" w:hAnsi="Sylfaen" w:cs="Sylfaen"/>
@@ -2192,18 +3183,23 @@
         <w:numPr>
           <w:numId w:val="0"/>
         </w:numPr>
+        <w:spacing w:before="160" w:after="80"/>
+        <w:jc w:val="center"/>
       </w:pPr>
       <w:r>
         <w:rPr>
           <w:rFonts w:ascii="Sylfaen" w:hAnsi="Sylfaen" w:cs="Sylfaen"/>
           <w:b/>
-          <w:sz w:val="26"/>
+          <w:color w:val="000000"/>
+          <w:sz w:val="28"/>
         </w:rPr>
         <w:t>2.4 ხიდი: მეხსიერების თეორიიდან მეხსიერების არქიტექტურამდე</w:t>
       </w:r>
     </w:p>
     <w:p>
-      <w:pPr/>
+      <w:pPr>
+        <w:jc w:val="both"/>
+      </w:pPr>
       <w:r>
         <w:rPr>
           <w:rFonts w:ascii="Sylfaen" w:hAnsi="Sylfaen" w:cs="Sylfaen"/>
@@ -2229,16 +3225,16 @@
     <w:tbl>
       <w:tblPr>
         <w:tblW w:type="auto" w:w="0"/>
-        <w:tblBorders>
-          <w:top w:val="single" w:sz="4" w:space="0" w:color="000000"/>
-          <w:left w:val="single" w:sz="4" w:space="0" w:color="000000"/>
-          <w:bottom w:val="single" w:sz="4" w:space="0" w:color="000000"/>
-          <w:right w:val="single" w:sz="4" w:space="0" w:color="000000"/>
-          <w:insideH w:val="single" w:sz="4" w:space="0" w:color="000000"/>
-          <w:insideV w:val="single" w:sz="4" w:space="0" w:color="000000"/>
-        </w:tblBorders>
         <w:tblLayout w:type="fixed"/>
         <w:tblLook w:firstColumn="1" w:firstRow="1" w:lastColumn="0" w:lastRow="0" w:noHBand="0" w:noVBand="1" w:val="04A0"/>
+        <w:tblBorders>
+          <w:top w:val="single" w:sz="4" w:space="0" w:color="auto"/>
+          <w:left w:val="single" w:sz="4" w:space="0" w:color="auto"/>
+          <w:bottom w:val="single" w:sz="4" w:space="0" w:color="auto"/>
+          <w:right w:val="single" w:sz="4" w:space="0" w:color="auto"/>
+          <w:insideH w:val="single" w:sz="4" w:space="0" w:color="auto"/>
+          <w:insideV w:val="single" w:sz="4" w:space="0" w:color="auto"/>
+        </w:tblBorders>
       </w:tblPr>
       <w:tblGrid>
         <w:gridCol w:w="2861"/>
@@ -2642,7 +3638,9 @@
       <w:pPr/>
     </w:p>
     <w:p>
-      <w:pPr/>
+      <w:pPr>
+        <w:jc w:val="both"/>
+      </w:pPr>
       <w:r>
         <w:rPr>
           <w:rFonts w:ascii="Sylfaen" w:hAnsi="Sylfaen" w:cs="Sylfaen"/>
@@ -2658,18 +3656,23 @@
         <w:numPr>
           <w:numId w:val="0"/>
         </w:numPr>
+        <w:spacing w:before="160" w:after="80"/>
+        <w:jc w:val="center"/>
       </w:pPr>
       <w:r>
         <w:rPr>
           <w:rFonts w:ascii="Sylfaen" w:hAnsi="Sylfaen" w:cs="Sylfaen"/>
           <w:b/>
-          <w:sz w:val="26"/>
+          <w:color w:val="000000"/>
+          <w:sz w:val="28"/>
         </w:rPr>
         <w:t>2.5 საუბრის მეხსიერების შეფასება: ბენჩმარკები და მათი შეზღუდვები</w:t>
       </w:r>
     </w:p>
     <w:p>
-      <w:pPr/>
+      <w:pPr>
+        <w:jc w:val="both"/>
+      </w:pPr>
       <w:r>
         <w:rPr>
           <w:rFonts w:ascii="Sylfaen" w:hAnsi="Sylfaen" w:cs="Sylfaen"/>
@@ -2680,7 +3683,9 @@
       </w:r>
     </w:p>
     <w:p>
-      <w:pPr/>
+      <w:pPr>
+        <w:jc w:val="both"/>
+      </w:pPr>
       <w:r>
         <w:rPr>
           <w:rFonts w:ascii="Sylfaen" w:hAnsi="Sylfaen" w:cs="Sylfaen"/>
@@ -2691,7 +3696,9 @@
       </w:r>
     </w:p>
     <w:p>
-      <w:pPr/>
+      <w:pPr>
+        <w:jc w:val="both"/>
+      </w:pPr>
       <w:r>
         <w:rPr>
           <w:rFonts w:ascii="Sylfaen" w:hAnsi="Sylfaen" w:cs="Sylfaen"/>
@@ -2707,18 +3714,23 @@
         <w:numPr>
           <w:numId w:val="0"/>
         </w:numPr>
+        <w:spacing w:before="160" w:after="80"/>
+        <w:jc w:val="center"/>
       </w:pPr>
       <w:r>
         <w:rPr>
           <w:rFonts w:ascii="Sylfaen" w:hAnsi="Sylfaen" w:cs="Sylfaen"/>
           <w:b/>
-          <w:sz w:val="26"/>
+          <w:color w:val="000000"/>
+          <w:sz w:val="28"/>
         </w:rPr>
         <w:t>2.6 ასისტენტიდან თანამოსაუბრემდე: მეხსიერება და აღქმული ურთიერთობა</w:t>
       </w:r>
     </w:p>
     <w:p>
-      <w:pPr/>
+      <w:pPr>
+        <w:jc w:val="both"/>
+      </w:pPr>
       <w:r>
         <w:rPr>
           <w:rFonts w:ascii="Sylfaen" w:hAnsi="Sylfaen" w:cs="Sylfaen"/>
@@ -2729,7 +3741,9 @@
       </w:r>
     </w:p>
     <w:p>
-      <w:pPr/>
+      <w:pPr>
+        <w:jc w:val="both"/>
+      </w:pPr>
       <w:r>
         <w:rPr>
           <w:rFonts w:ascii="Sylfaen" w:hAnsi="Sylfaen" w:cs="Sylfaen"/>
@@ -2740,7 +3754,9 @@
       </w:r>
     </w:p>
     <w:p>
-      <w:pPr/>
+      <w:pPr>
+        <w:jc w:val="both"/>
+      </w:pPr>
       <w:r>
         <w:rPr>
           <w:rFonts w:ascii="Sylfaen" w:hAnsi="Sylfaen" w:cs="Sylfaen"/>
@@ -2751,7 +3767,9 @@
       </w:r>
     </w:p>
     <w:p>
-      <w:pPr/>
+      <w:pPr>
+        <w:jc w:val="both"/>
+      </w:pPr>
       <w:r>
         <w:rPr>
           <w:rFonts w:ascii="Sylfaen" w:hAnsi="Sylfaen" w:cs="Sylfaen"/>
@@ -2762,7 +3780,9 @@
       </w:r>
     </w:p>
     <w:p>
-      <w:pPr/>
+      <w:pPr>
+        <w:jc w:val="both"/>
+      </w:pPr>
       <w:r>
         <w:rPr>
           <w:rFonts w:ascii="Sylfaen" w:hAnsi="Sylfaen" w:cs="Sylfaen"/>
@@ -2778,18 +3798,23 @@
         <w:numPr>
           <w:numId w:val="0"/>
         </w:numPr>
+        <w:spacing w:before="160" w:after="80"/>
+        <w:jc w:val="center"/>
       </w:pPr>
       <w:r>
         <w:rPr>
           <w:rFonts w:ascii="Sylfaen" w:hAnsi="Sylfaen" w:cs="Sylfaen"/>
           <w:b/>
-          <w:sz w:val="26"/>
+          <w:color w:val="000000"/>
+          <w:sz w:val="28"/>
         </w:rPr>
         <w:t>2.7 ღია პრობლემები და შეზღუდვები</w:t>
       </w:r>
     </w:p>
     <w:p>
-      <w:pPr/>
+      <w:pPr>
+        <w:jc w:val="both"/>
+      </w:pPr>
       <w:r>
         <w:rPr>
           <w:rFonts w:ascii="Sylfaen" w:hAnsi="Sylfaen" w:cs="Sylfaen"/>
@@ -2805,18 +3830,23 @@
         <w:numPr>
           <w:numId w:val="0"/>
         </w:numPr>
+        <w:spacing w:before="160" w:after="80"/>
+        <w:jc w:val="center"/>
       </w:pPr>
       <w:r>
         <w:rPr>
           <w:rFonts w:ascii="Sylfaen" w:hAnsi="Sylfaen" w:cs="Sylfaen"/>
           <w:b/>
-          <w:sz w:val="26"/>
+          <w:color w:val="000000"/>
+          <w:sz w:val="28"/>
         </w:rPr>
         <w:t>2.8 ამ ნაშრომის ადგილი</w:t>
       </w:r>
     </w:p>
     <w:p>
-      <w:pPr/>
+      <w:pPr>
+        <w:jc w:val="both"/>
+      </w:pPr>
       <w:r>
         <w:rPr>
           <w:rFonts w:ascii="Sylfaen" w:hAnsi="Sylfaen" w:cs="Sylfaen"/>
@@ -2833,11 +3863,14 @@
         <w:numPr>
           <w:numId w:val="0"/>
         </w:numPr>
+        <w:spacing w:before="360" w:after="80"/>
+        <w:jc w:val="center"/>
       </w:pPr>
       <w:r>
         <w:rPr>
           <w:rFonts w:ascii="Sylfaen" w:hAnsi="Sylfaen" w:cs="Sylfaen"/>
           <w:b/>
+          <w:color w:val="000000"/>
           <w:sz w:val="28"/>
         </w:rPr>
         <w:t>3. კვლევის მეთოდები</w:t>
@@ -2849,18 +3882,23 @@
         <w:numPr>
           <w:numId w:val="0"/>
         </w:numPr>
+        <w:spacing w:before="160" w:after="80"/>
+        <w:jc w:val="center"/>
       </w:pPr>
       <w:r>
         <w:rPr>
           <w:rFonts w:ascii="Sylfaen" w:hAnsi="Sylfaen" w:cs="Sylfaen"/>
           <w:b/>
-          <w:sz w:val="26"/>
+          <w:color w:val="000000"/>
+          <w:sz w:val="28"/>
         </w:rPr>
         <w:t>3.1 კვლევის დიზაინი და წვლილი</w:t>
       </w:r>
     </w:p>
     <w:p>
-      <w:pPr/>
+      <w:pPr>
+        <w:jc w:val="both"/>
+      </w:pPr>
       <w:r>
         <w:rPr>
           <w:rFonts w:ascii="Sylfaen" w:hAnsi="Sylfaen" w:cs="Sylfaen"/>
@@ -2871,7 +3909,9 @@
       </w:r>
     </w:p>
     <w:p>
-      <w:pPr/>
+      <w:pPr>
+        <w:jc w:val="both"/>
+      </w:pPr>
       <w:r>
         <w:rPr>
           <w:rFonts w:ascii="Sylfaen" w:hAnsi="Sylfaen" w:cs="Sylfaen"/>
@@ -2882,7 +3922,9 @@
       </w:r>
     </w:p>
     <w:p>
-      <w:pPr/>
+      <w:pPr>
+        <w:jc w:val="both"/>
+      </w:pPr>
       <w:r>
         <w:rPr>
           <w:rFonts w:ascii="Sylfaen" w:hAnsi="Sylfaen" w:cs="Sylfaen"/>
@@ -2893,7 +3935,9 @@
       </w:r>
     </w:p>
     <w:p>
-      <w:pPr/>
+      <w:pPr>
+        <w:jc w:val="both"/>
+      </w:pPr>
       <w:r>
         <w:rPr>
           <w:rFonts w:ascii="Sylfaen" w:hAnsi="Sylfaen" w:cs="Sylfaen"/>
@@ -2909,18 +3953,23 @@
         <w:numPr>
           <w:numId w:val="0"/>
         </w:numPr>
+        <w:spacing w:before="160" w:after="80"/>
+        <w:jc w:val="center"/>
       </w:pPr>
       <w:r>
         <w:rPr>
           <w:rFonts w:ascii="Sylfaen" w:hAnsi="Sylfaen" w:cs="Sylfaen"/>
           <w:b/>
-          <w:sz w:val="26"/>
+          <w:color w:val="000000"/>
+          <w:sz w:val="28"/>
         </w:rPr>
         <w:t>3.2 პროფილი C-ის მეხსიერების არქიტექტურა</w:t>
       </w:r>
     </w:p>
     <w:p>
-      <w:pPr/>
+      <w:pPr>
+        <w:jc w:val="both"/>
+      </w:pPr>
       <w:r>
         <w:rPr>
           <w:rFonts w:ascii="Sylfaen" w:hAnsi="Sylfaen" w:cs="Sylfaen"/>
@@ -2931,7 +3980,9 @@
       </w:r>
     </w:p>
     <w:p>
-      <w:pPr/>
+      <w:pPr>
+        <w:jc w:val="both"/>
+      </w:pPr>
       <w:r>
         <w:rPr>
           <w:rFonts w:ascii="Sylfaen" w:hAnsi="Sylfaen" w:cs="Sylfaen"/>
@@ -2942,7 +3993,9 @@
       </w:r>
     </w:p>
     <w:p>
-      <w:pPr/>
+      <w:pPr>
+        <w:jc w:val="both"/>
+      </w:pPr>
       <w:r>
         <w:rPr>
           <w:rFonts w:ascii="Sylfaen" w:hAnsi="Sylfaen" w:cs="Sylfaen"/>
@@ -2953,7 +4006,9 @@
       </w:r>
     </w:p>
     <w:p>
-      <w:pPr/>
+      <w:pPr>
+        <w:jc w:val="both"/>
+      </w:pPr>
       <w:r>
         <w:rPr>
           <w:rFonts w:ascii="Sylfaen" w:hAnsi="Sylfaen" w:cs="Sylfaen"/>
@@ -2964,7 +4019,9 @@
       </w:r>
     </w:p>
     <w:p>
-      <w:pPr/>
+      <w:pPr>
+        <w:jc w:val="both"/>
+      </w:pPr>
       <w:r>
         <w:rPr>
           <w:rFonts w:ascii="Sylfaen" w:hAnsi="Sylfaen" w:cs="Sylfaen"/>
@@ -2975,7 +4032,9 @@
       </w:r>
     </w:p>
     <w:p>
-      <w:pPr/>
+      <w:pPr>
+        <w:jc w:val="both"/>
+      </w:pPr>
       <w:r>
         <w:rPr>
           <w:rFonts w:ascii="Sylfaen" w:hAnsi="Sylfaen" w:cs="Sylfaen"/>
@@ -2986,7 +4045,9 @@
       </w:r>
     </w:p>
     <w:p>
-      <w:pPr/>
+      <w:pPr>
+        <w:jc w:val="both"/>
+      </w:pPr>
       <w:r>
         <w:rPr>
           <w:rFonts w:ascii="Sylfaen" w:hAnsi="Sylfaen" w:cs="Sylfaen"/>
@@ -2997,7 +4058,9 @@
       </w:r>
     </w:p>
     <w:p>
-      <w:pPr/>
+      <w:pPr>
+        <w:jc w:val="both"/>
+      </w:pPr>
       <w:r>
         <w:rPr>
           <w:rFonts w:ascii="Sylfaen" w:hAnsi="Sylfaen" w:cs="Sylfaen"/>
@@ -3013,18 +4076,23 @@
         <w:numPr>
           <w:numId w:val="0"/>
         </w:numPr>
+        <w:spacing w:before="160" w:after="80"/>
+        <w:jc w:val="center"/>
       </w:pPr>
       <w:r>
         <w:rPr>
           <w:rFonts w:ascii="Sylfaen" w:hAnsi="Sylfaen" w:cs="Sylfaen"/>
           <w:b/>
-          <w:sz w:val="26"/>
+          <w:color w:val="000000"/>
+          <w:sz w:val="28"/>
         </w:rPr>
         <w:t>3.3 ექსპერიმენტული პირობები (A / B / B+ / C)</w:t>
       </w:r>
     </w:p>
     <w:p>
-      <w:pPr/>
+      <w:pPr>
+        <w:jc w:val="both"/>
+      </w:pPr>
       <w:r>
         <w:rPr>
           <w:rFonts w:ascii="Sylfaen" w:hAnsi="Sylfaen" w:cs="Sylfaen"/>
@@ -3035,7 +4103,9 @@
       </w:r>
     </w:p>
     <w:p>
-      <w:pPr/>
+      <w:pPr>
+        <w:jc w:val="both"/>
+      </w:pPr>
       <w:r>
         <w:rPr>
           <w:rFonts w:ascii="Sylfaen" w:hAnsi="Sylfaen" w:cs="Sylfaen"/>
@@ -3046,7 +4116,9 @@
       </w:r>
     </w:p>
     <w:p>
-      <w:pPr/>
+      <w:pPr>
+        <w:jc w:val="both"/>
+      </w:pPr>
       <w:r>
         <w:rPr>
           <w:rFonts w:ascii="Sylfaen" w:hAnsi="Sylfaen" w:cs="Sylfaen"/>
@@ -3057,7 +4129,9 @@
       </w:r>
     </w:p>
     <w:p>
-      <w:pPr/>
+      <w:pPr>
+        <w:jc w:val="both"/>
+      </w:pPr>
       <w:r>
         <w:rPr>
           <w:rFonts w:ascii="Sylfaen" w:hAnsi="Sylfaen" w:cs="Sylfaen"/>
@@ -3068,7 +4142,9 @@
       </w:r>
     </w:p>
     <w:p>
-      <w:pPr/>
+      <w:pPr>
+        <w:jc w:val="both"/>
+      </w:pPr>
       <w:r>
         <w:rPr>
           <w:rFonts w:ascii="Sylfaen" w:hAnsi="Sylfaen" w:cs="Sylfaen"/>
@@ -3079,7 +4155,9 @@
       </w:r>
     </w:p>
     <w:p>
-      <w:pPr/>
+      <w:pPr>
+        <w:jc w:val="both"/>
+      </w:pPr>
       <w:r>
         <w:rPr>
           <w:rFonts w:ascii="Sylfaen" w:hAnsi="Sylfaen" w:cs="Sylfaen"/>
@@ -3116,16 +4194,16 @@
     <w:tbl>
       <w:tblPr>
         <w:tblW w:type="auto" w:w="0"/>
-        <w:tblBorders>
-          <w:top w:val="single" w:sz="4" w:space="0" w:color="000000"/>
-          <w:left w:val="single" w:sz="4" w:space="0" w:color="000000"/>
-          <w:bottom w:val="single" w:sz="4" w:space="0" w:color="000000"/>
-          <w:right w:val="single" w:sz="4" w:space="0" w:color="000000"/>
-          <w:insideH w:val="single" w:sz="4" w:space="0" w:color="000000"/>
-          <w:insideV w:val="single" w:sz="4" w:space="0" w:color="000000"/>
-        </w:tblBorders>
         <w:tblLayout w:type="fixed"/>
         <w:tblLook w:firstColumn="1" w:firstRow="1" w:lastColumn="0" w:lastRow="0" w:noHBand="0" w:noVBand="1" w:val="04A0"/>
+        <w:tblBorders>
+          <w:top w:val="single" w:sz="4" w:space="0" w:color="auto"/>
+          <w:left w:val="single" w:sz="4" w:space="0" w:color="auto"/>
+          <w:bottom w:val="single" w:sz="4" w:space="0" w:color="auto"/>
+          <w:right w:val="single" w:sz="4" w:space="0" w:color="auto"/>
+          <w:insideH w:val="single" w:sz="4" w:space="0" w:color="auto"/>
+          <w:insideV w:val="single" w:sz="4" w:space="0" w:color="auto"/>
+        </w:tblBorders>
       </w:tblPr>
       <w:tblGrid>
         <w:gridCol w:w="2297"/>
@@ -3416,7 +4494,9 @@
       <w:pPr/>
     </w:p>
     <w:p>
-      <w:pPr/>
+      <w:pPr>
+        <w:jc w:val="both"/>
+      </w:pPr>
       <w:r>
         <w:rPr>
           <w:rFonts w:ascii="Sylfaen" w:hAnsi="Sylfaen" w:cs="Sylfaen"/>
@@ -3432,18 +4512,23 @@
         <w:numPr>
           <w:numId w:val="0"/>
         </w:numPr>
+        <w:spacing w:before="160" w:after="80"/>
+        <w:jc w:val="center"/>
       </w:pPr>
       <w:r>
         <w:rPr>
           <w:rFonts w:ascii="Sylfaen" w:hAnsi="Sylfaen" w:cs="Sylfaen"/>
           <w:b/>
-          <w:sz w:val="26"/>
+          <w:color w:val="000000"/>
+          <w:sz w:val="28"/>
         </w:rPr>
         <w:t>3.4 კონცეფციის დამტკიცების იმპლემენტაცია</w:t>
       </w:r>
     </w:p>
     <w:p>
-      <w:pPr/>
+      <w:pPr>
+        <w:jc w:val="both"/>
+      </w:pPr>
       <w:r>
         <w:rPr>
           <w:rFonts w:ascii="Sylfaen" w:hAnsi="Sylfaen" w:cs="Sylfaen"/>
@@ -3454,7 +4539,9 @@
       </w:r>
     </w:p>
     <w:p>
-      <w:pPr/>
+      <w:pPr>
+        <w:jc w:val="both"/>
+      </w:pPr>
       <w:r>
         <w:rPr>
           <w:rFonts w:ascii="Sylfaen" w:hAnsi="Sylfaen" w:cs="Sylfaen"/>
@@ -3470,18 +4557,23 @@
         <w:numPr>
           <w:numId w:val="0"/>
         </w:numPr>
+        <w:spacing w:before="160" w:after="80"/>
+        <w:jc w:val="center"/>
       </w:pPr>
       <w:r>
         <w:rPr>
           <w:rFonts w:ascii="Sylfaen" w:hAnsi="Sylfaen" w:cs="Sylfaen"/>
           <w:b/>
-          <w:sz w:val="26"/>
+          <w:color w:val="000000"/>
+          <w:sz w:val="28"/>
         </w:rPr>
         <w:t>3.5 შეფასების მეთოდოლოგია</w:t>
       </w:r>
     </w:p>
     <w:p>
-      <w:pPr/>
+      <w:pPr>
+        <w:jc w:val="both"/>
+      </w:pPr>
       <w:r>
         <w:rPr>
           <w:rFonts w:ascii="Sylfaen" w:hAnsi="Sylfaen" w:cs="Sylfaen"/>
@@ -3492,7 +4584,9 @@
       </w:r>
     </w:p>
     <w:p>
-      <w:pPr/>
+      <w:pPr>
+        <w:jc w:val="both"/>
+      </w:pPr>
       <w:r>
         <w:rPr>
           <w:rFonts w:ascii="Sylfaen" w:hAnsi="Sylfaen" w:cs="Sylfaen"/>
@@ -3503,7 +4597,9 @@
       </w:r>
     </w:p>
     <w:p>
-      <w:pPr/>
+      <w:pPr>
+        <w:jc w:val="both"/>
+      </w:pPr>
       <w:r>
         <w:rPr>
           <w:rFonts w:ascii="Sylfaen" w:hAnsi="Sylfaen" w:cs="Sylfaen"/>
@@ -3514,7 +4610,9 @@
       </w:r>
     </w:p>
     <w:p>
-      <w:pPr/>
+      <w:pPr>
+        <w:jc w:val="both"/>
+      </w:pPr>
       <w:r>
         <w:rPr>
           <w:rFonts w:ascii="Sylfaen" w:hAnsi="Sylfaen" w:cs="Sylfaen"/>
@@ -3525,7 +4623,9 @@
       </w:r>
     </w:p>
     <w:p>
-      <w:pPr/>
+      <w:pPr>
+        <w:jc w:val="both"/>
+      </w:pPr>
       <w:r>
         <w:rPr>
           <w:rFonts w:ascii="Sylfaen" w:hAnsi="Sylfaen" w:cs="Sylfaen"/>
@@ -3541,18 +4641,23 @@
         <w:numPr>
           <w:numId w:val="0"/>
         </w:numPr>
+        <w:spacing w:before="160" w:after="80"/>
+        <w:jc w:val="center"/>
       </w:pPr>
       <w:r>
         <w:rPr>
           <w:rFonts w:ascii="Sylfaen" w:hAnsi="Sylfaen" w:cs="Sylfaen"/>
           <w:b/>
-          <w:sz w:val="26"/>
+          <w:color w:val="000000"/>
+          <w:sz w:val="28"/>
         </w:rPr>
         <w:t>3.6 ზომები და ინსტრუმენტები</w:t>
       </w:r>
     </w:p>
     <w:p>
-      <w:pPr/>
+      <w:pPr>
+        <w:jc w:val="both"/>
+      </w:pPr>
       <w:r>
         <w:rPr>
           <w:rFonts w:ascii="Sylfaen" w:hAnsi="Sylfaen" w:cs="Sylfaen"/>
@@ -3563,7 +4668,9 @@
       </w:r>
     </w:p>
     <w:p>
-      <w:pPr/>
+      <w:pPr>
+        <w:jc w:val="both"/>
+      </w:pPr>
       <w:r>
         <w:rPr>
           <w:rFonts w:ascii="Sylfaen" w:hAnsi="Sylfaen" w:cs="Sylfaen"/>
@@ -3574,7 +4681,9 @@
       </w:r>
     </w:p>
     <w:p>
-      <w:pPr/>
+      <w:pPr>
+        <w:jc w:val="both"/>
+      </w:pPr>
       <w:r>
         <w:rPr>
           <w:rFonts w:ascii="Sylfaen" w:hAnsi="Sylfaen" w:cs="Sylfaen"/>
@@ -3585,7 +4694,9 @@
       </w:r>
     </w:p>
     <w:p>
-      <w:pPr/>
+      <w:pPr>
+        <w:jc w:val="both"/>
+      </w:pPr>
       <w:r>
         <w:rPr>
           <w:rFonts w:ascii="Sylfaen" w:hAnsi="Sylfaen" w:cs="Sylfaen"/>
@@ -3596,7 +4707,9 @@
       </w:r>
     </w:p>
     <w:p>
-      <w:pPr/>
+      <w:pPr>
+        <w:jc w:val="both"/>
+      </w:pPr>
       <w:r>
         <w:rPr>
           <w:rFonts w:ascii="Sylfaen" w:hAnsi="Sylfaen" w:cs="Sylfaen"/>
@@ -3607,7 +4720,9 @@
       </w:r>
     </w:p>
     <w:p>
-      <w:pPr/>
+      <w:pPr>
+        <w:jc w:val="both"/>
+      </w:pPr>
       <w:r>
         <w:rPr>
           <w:rFonts w:ascii="Sylfaen" w:hAnsi="Sylfaen" w:cs="Sylfaen"/>
@@ -3623,18 +4738,23 @@
         <w:numPr>
           <w:numId w:val="0"/>
         </w:numPr>
+        <w:spacing w:before="160" w:after="80"/>
+        <w:jc w:val="center"/>
       </w:pPr>
       <w:r>
         <w:rPr>
           <w:rFonts w:ascii="Sylfaen" w:hAnsi="Sylfaen" w:cs="Sylfaen"/>
           <w:b/>
-          <w:sz w:val="26"/>
+          <w:color w:val="000000"/>
+          <w:sz w:val="28"/>
         </w:rPr>
         <w:t>3.7 ანალიზის გეგმა</w:t>
       </w:r>
     </w:p>
     <w:p>
-      <w:pPr/>
+      <w:pPr>
+        <w:jc w:val="both"/>
+      </w:pPr>
       <w:r>
         <w:rPr>
           <w:rFonts w:ascii="Sylfaen" w:hAnsi="Sylfaen" w:cs="Sylfaen"/>
@@ -3645,7 +4765,9 @@
       </w:r>
     </w:p>
     <w:p>
-      <w:pPr/>
+      <w:pPr>
+        <w:jc w:val="both"/>
+      </w:pPr>
       <w:r>
         <w:rPr>
           <w:rFonts w:ascii="Sylfaen" w:hAnsi="Sylfaen" w:cs="Sylfaen"/>
@@ -3656,7 +4778,9 @@
       </w:r>
     </w:p>
     <w:p>
-      <w:pPr/>
+      <w:pPr>
+        <w:jc w:val="both"/>
+      </w:pPr>
       <w:r>
         <w:rPr>
           <w:rFonts w:ascii="Sylfaen" w:hAnsi="Sylfaen" w:cs="Sylfaen"/>
@@ -3672,18 +4796,23 @@
         <w:numPr>
           <w:numId w:val="0"/>
         </w:numPr>
+        <w:spacing w:before="160" w:after="80"/>
+        <w:jc w:val="center"/>
       </w:pPr>
       <w:r>
         <w:rPr>
           <w:rFonts w:ascii="Sylfaen" w:hAnsi="Sylfaen" w:cs="Sylfaen"/>
           <w:b/>
-          <w:sz w:val="26"/>
+          <w:color w:val="000000"/>
+          <w:sz w:val="28"/>
         </w:rPr>
         <w:t>3.8 ეთიკური საკითხები და შეზღუდვები</w:t>
       </w:r>
     </w:p>
     <w:p>
-      <w:pPr/>
+      <w:pPr>
+        <w:jc w:val="both"/>
+      </w:pPr>
       <w:r>
         <w:rPr>
           <w:rFonts w:ascii="Sylfaen" w:hAnsi="Sylfaen" w:cs="Sylfaen"/>
@@ -3694,7 +4823,9 @@
       </w:r>
     </w:p>
     <w:p>
-      <w:pPr/>
+      <w:pPr>
+        <w:jc w:val="both"/>
+      </w:pPr>
       <w:r>
         <w:rPr>
           <w:rFonts w:ascii="Sylfaen" w:hAnsi="Sylfaen" w:cs="Sylfaen"/>
@@ -3705,7 +4836,9 @@
       </w:r>
     </w:p>
     <w:p>
-      <w:pPr/>
+      <w:pPr>
+        <w:jc w:val="both"/>
+      </w:pPr>
       <w:r>
         <w:rPr>
           <w:rFonts w:ascii="Sylfaen" w:hAnsi="Sylfaen" w:cs="Sylfaen"/>
@@ -3716,7 +4849,9 @@
       </w:r>
     </w:p>
     <w:p>
-      <w:pPr/>
+      <w:pPr>
+        <w:jc w:val="both"/>
+      </w:pPr>
       <w:r>
         <w:rPr>
           <w:rFonts w:ascii="Sylfaen" w:hAnsi="Sylfaen" w:cs="Sylfaen"/>
@@ -3727,7 +4862,9 @@
       </w:r>
     </w:p>
     <w:p>
-      <w:pPr/>
+      <w:pPr>
+        <w:jc w:val="both"/>
+      </w:pPr>
       <w:r>
         <w:rPr>
           <w:rFonts w:ascii="Sylfaen" w:hAnsi="Sylfaen" w:cs="Sylfaen"/>
@@ -3744,18 +4881,23 @@
         <w:numPr>
           <w:numId w:val="0"/>
         </w:numPr>
+        <w:spacing w:before="360" w:after="80"/>
+        <w:jc w:val="center"/>
       </w:pPr>
       <w:r>
         <w:rPr>
           <w:rFonts w:ascii="Sylfaen" w:hAnsi="Sylfaen" w:cs="Sylfaen"/>
           <w:b/>
+          <w:color w:val="000000"/>
           <w:sz w:val="28"/>
         </w:rPr>
         <w:t>4. შედეგები და განხილვა</w:t>
       </w:r>
     </w:p>
     <w:p>
-      <w:pPr/>
+      <w:pPr>
+        <w:jc w:val="both"/>
+      </w:pPr>
       <w:r>
         <w:rPr>
           <w:rFonts w:ascii="Sylfaen" w:hAnsi="Sylfaen" w:cs="Sylfaen"/>
@@ -3771,18 +4913,23 @@
         <w:numPr>
           <w:numId w:val="0"/>
         </w:numPr>
+        <w:spacing w:before="160" w:after="80"/>
+        <w:jc w:val="center"/>
       </w:pPr>
       <w:r>
         <w:rPr>
           <w:rFonts w:ascii="Sylfaen" w:hAnsi="Sylfaen" w:cs="Sylfaen"/>
           <w:b/>
-          <w:sz w:val="26"/>
+          <w:color w:val="000000"/>
+          <w:sz w:val="28"/>
         </w:rPr>
         <w:t>4.1 კონცეფციის დამტკიცება: მასშტაბი და სიზუსტე</w:t>
       </w:r>
     </w:p>
     <w:p>
-      <w:pPr/>
+      <w:pPr>
+        <w:jc w:val="both"/>
+      </w:pPr>
       <w:r>
         <w:rPr>
           <w:rFonts w:ascii="Sylfaen" w:hAnsi="Sylfaen" w:cs="Sylfaen"/>
@@ -3819,16 +4966,16 @@
     <w:tbl>
       <w:tblPr>
         <w:tblW w:type="auto" w:w="0"/>
-        <w:tblBorders>
-          <w:top w:val="single" w:sz="4" w:space="0" w:color="000000"/>
-          <w:left w:val="single" w:sz="4" w:space="0" w:color="000000"/>
-          <w:bottom w:val="single" w:sz="4" w:space="0" w:color="000000"/>
-          <w:right w:val="single" w:sz="4" w:space="0" w:color="000000"/>
-          <w:insideH w:val="single" w:sz="4" w:space="0" w:color="000000"/>
-          <w:insideV w:val="single" w:sz="4" w:space="0" w:color="000000"/>
-        </w:tblBorders>
         <w:tblLayout w:type="fixed"/>
         <w:tblLook w:firstColumn="1" w:firstRow="1" w:lastColumn="0" w:lastRow="0" w:noHBand="0" w:noVBand="1" w:val="04A0"/>
+        <w:tblBorders>
+          <w:top w:val="single" w:sz="4" w:space="0" w:color="auto"/>
+          <w:left w:val="single" w:sz="4" w:space="0" w:color="auto"/>
+          <w:bottom w:val="single" w:sz="4" w:space="0" w:color="auto"/>
+          <w:right w:val="single" w:sz="4" w:space="0" w:color="auto"/>
+          <w:insideH w:val="single" w:sz="4" w:space="0" w:color="auto"/>
+          <w:insideV w:val="single" w:sz="4" w:space="0" w:color="auto"/>
+        </w:tblBorders>
       </w:tblPr>
       <w:tblGrid>
         <w:gridCol w:w="4167"/>
@@ -4181,7 +5328,9 @@
       <w:pPr/>
     </w:p>
     <w:p>
-      <w:pPr/>
+      <w:pPr>
+        <w:jc w:val="both"/>
+      </w:pPr>
       <w:r>
         <w:rPr>
           <w:rFonts w:ascii="Sylfaen" w:hAnsi="Sylfaen" w:cs="Sylfaen"/>
@@ -4197,18 +5346,23 @@
         <w:numPr>
           <w:numId w:val="0"/>
         </w:numPr>
+        <w:spacing w:before="160" w:after="80"/>
+        <w:jc w:val="center"/>
       </w:pPr>
       <w:r>
         <w:rPr>
           <w:rFonts w:ascii="Sylfaen" w:hAnsi="Sylfaen" w:cs="Sylfaen"/>
           <w:b/>
-          <w:sz w:val="26"/>
+          <w:color w:val="000000"/>
+          <w:sz w:val="28"/>
         </w:rPr>
         <w:t>4.2 ტექნიკური შედეგები</w:t>
       </w:r>
     </w:p>
     <w:p>
-      <w:pPr/>
+      <w:pPr>
+        <w:jc w:val="both"/>
+      </w:pPr>
       <w:r>
         <w:rPr>
           <w:rFonts w:ascii="Sylfaen" w:hAnsi="Sylfaen" w:cs="Sylfaen"/>
@@ -4234,16 +5388,16 @@
     <w:tbl>
       <w:tblPr>
         <w:tblW w:type="auto" w:w="0"/>
-        <w:tblBorders>
-          <w:top w:val="single" w:sz="4" w:space="0" w:color="000000"/>
-          <w:left w:val="single" w:sz="4" w:space="0" w:color="000000"/>
-          <w:bottom w:val="single" w:sz="4" w:space="0" w:color="000000"/>
-          <w:right w:val="single" w:sz="4" w:space="0" w:color="000000"/>
-          <w:insideH w:val="single" w:sz="4" w:space="0" w:color="000000"/>
-          <w:insideV w:val="single" w:sz="4" w:space="0" w:color="000000"/>
-        </w:tblBorders>
         <w:tblLayout w:type="fixed"/>
         <w:tblLook w:firstColumn="1" w:firstRow="1" w:lastColumn="0" w:lastRow="0" w:noHBand="0" w:noVBand="1" w:val="04A0"/>
+        <w:tblBorders>
+          <w:top w:val="single" w:sz="4" w:space="0" w:color="auto"/>
+          <w:left w:val="single" w:sz="4" w:space="0" w:color="auto"/>
+          <w:bottom w:val="single" w:sz="4" w:space="0" w:color="auto"/>
+          <w:right w:val="single" w:sz="4" w:space="0" w:color="auto"/>
+          <w:insideH w:val="single" w:sz="4" w:space="0" w:color="auto"/>
+          <w:insideV w:val="single" w:sz="4" w:space="0" w:color="auto"/>
+        </w:tblBorders>
       </w:tblPr>
       <w:tblGrid>
         <w:gridCol w:w="3266"/>
@@ -4626,7 +5780,9 @@
       <w:pPr/>
     </w:p>
     <w:p>
-      <w:pPr/>
+      <w:pPr>
+        <w:jc w:val="both"/>
+      </w:pPr>
       <w:r>
         <w:rPr>
           <w:rFonts w:ascii="Sylfaen" w:hAnsi="Sylfaen" w:cs="Sylfaen"/>
@@ -4637,7 +5793,9 @@
       </w:r>
     </w:p>
     <w:p>
-      <w:pPr/>
+      <w:pPr>
+        <w:jc w:val="both"/>
+      </w:pPr>
       <w:r>
         <w:rPr>
           <w:rFonts w:ascii="Sylfaen" w:hAnsi="Sylfaen" w:cs="Sylfaen"/>
@@ -4648,7 +5806,9 @@
       </w:r>
     </w:p>
     <w:p>
-      <w:pPr/>
+      <w:pPr>
+        <w:jc w:val="both"/>
+      </w:pPr>
       <w:r>
         <w:rPr>
           <w:rFonts w:ascii="Sylfaen" w:hAnsi="Sylfaen" w:cs="Sylfaen"/>
@@ -4664,18 +5824,23 @@
         <w:numPr>
           <w:numId w:val="0"/>
         </w:numPr>
+        <w:spacing w:before="160" w:after="80"/>
+        <w:jc w:val="center"/>
       </w:pPr>
       <w:r>
         <w:rPr>
           <w:rFonts w:ascii="Sylfaen" w:hAnsi="Sylfaen" w:cs="Sylfaen"/>
           <w:b/>
-          <w:sz w:val="26"/>
+          <w:color w:val="000000"/>
+          <w:sz w:val="28"/>
         </w:rPr>
         <w:t>4.3 სიმულირებული აღქმის შედეგები</w:t>
       </w:r>
     </w:p>
     <w:p>
-      <w:pPr/>
+      <w:pPr>
+        <w:jc w:val="both"/>
+      </w:pPr>
       <w:r>
         <w:rPr>
           <w:rFonts w:ascii="Sylfaen" w:hAnsi="Sylfaen" w:cs="Sylfaen"/>
@@ -4701,16 +5866,16 @@
     <w:tbl>
       <w:tblPr>
         <w:tblW w:type="auto" w:w="0"/>
-        <w:tblBorders>
-          <w:top w:val="single" w:sz="4" w:space="0" w:color="000000"/>
-          <w:left w:val="single" w:sz="4" w:space="0" w:color="000000"/>
-          <w:bottom w:val="single" w:sz="4" w:space="0" w:color="000000"/>
-          <w:right w:val="single" w:sz="4" w:space="0" w:color="000000"/>
-          <w:insideH w:val="single" w:sz="4" w:space="0" w:color="000000"/>
-          <w:insideV w:val="single" w:sz="4" w:space="0" w:color="000000"/>
-        </w:tblBorders>
         <w:tblLayout w:type="fixed"/>
         <w:tblLook w:firstColumn="1" w:firstRow="1" w:lastColumn="0" w:lastRow="0" w:noHBand="0" w:noVBand="1" w:val="04A0"/>
+        <w:tblBorders>
+          <w:top w:val="single" w:sz="4" w:space="0" w:color="auto"/>
+          <w:left w:val="single" w:sz="4" w:space="0" w:color="auto"/>
+          <w:bottom w:val="single" w:sz="4" w:space="0" w:color="auto"/>
+          <w:right w:val="single" w:sz="4" w:space="0" w:color="auto"/>
+          <w:insideH w:val="single" w:sz="4" w:space="0" w:color="auto"/>
+          <w:insideV w:val="single" w:sz="4" w:space="0" w:color="auto"/>
+        </w:tblBorders>
       </w:tblPr>
       <w:tblGrid>
         <w:gridCol w:w="4671"/>
@@ -5385,7 +6550,9 @@
       <w:pPr/>
     </w:p>
     <w:p>
-      <w:pPr/>
+      <w:pPr>
+        <w:jc w:val="both"/>
+      </w:pPr>
       <w:r>
         <w:rPr>
           <w:rFonts w:ascii="Sylfaen" w:hAnsi="Sylfaen" w:cs="Sylfaen"/>
@@ -5396,7 +6563,9 @@
       </w:r>
     </w:p>
     <w:p>
-      <w:pPr/>
+      <w:pPr>
+        <w:jc w:val="both"/>
+      </w:pPr>
       <w:r>
         <w:rPr>
           <w:rFonts w:ascii="Sylfaen" w:hAnsi="Sylfaen" w:cs="Sylfaen"/>
@@ -5407,7 +6576,9 @@
       </w:r>
     </w:p>
     <w:p>
-      <w:pPr/>
+      <w:pPr>
+        <w:jc w:val="both"/>
+      </w:pPr>
       <w:r>
         <w:rPr>
           <w:rFonts w:ascii="Sylfaen" w:hAnsi="Sylfaen" w:cs="Sylfaen"/>
@@ -5423,18 +6594,23 @@
         <w:numPr>
           <w:numId w:val="0"/>
         </w:numPr>
+        <w:spacing w:before="160" w:after="80"/>
+        <w:jc w:val="center"/>
       </w:pPr>
       <w:r>
         <w:rPr>
           <w:rFonts w:ascii="Sylfaen" w:hAnsi="Sylfaen" w:cs="Sylfaen"/>
           <w:b/>
-          <w:sz w:val="26"/>
+          <w:color w:val="000000"/>
+          <w:sz w:val="28"/>
         </w:rPr>
         <w:t>4.4 განხილვა</w:t>
       </w:r>
     </w:p>
     <w:p>
-      <w:pPr/>
+      <w:pPr>
+        <w:jc w:val="both"/>
+      </w:pPr>
       <w:r>
         <w:rPr>
           <w:rFonts w:ascii="Sylfaen" w:hAnsi="Sylfaen" w:cs="Sylfaen"/>
@@ -5445,7 +6621,9 @@
       </w:r>
     </w:p>
     <w:p>
-      <w:pPr/>
+      <w:pPr>
+        <w:jc w:val="both"/>
+      </w:pPr>
       <w:r>
         <w:rPr>
           <w:rFonts w:ascii="Sylfaen" w:hAnsi="Sylfaen" w:cs="Sylfaen"/>
@@ -5456,7 +6634,9 @@
       </w:r>
     </w:p>
     <w:p>
-      <w:pPr/>
+      <w:pPr>
+        <w:jc w:val="both"/>
+      </w:pPr>
       <w:r>
         <w:rPr>
           <w:rFonts w:ascii="Sylfaen" w:hAnsi="Sylfaen" w:cs="Sylfaen"/>
@@ -5472,18 +6652,23 @@
         <w:numPr>
           <w:numId w:val="0"/>
         </w:numPr>
+        <w:spacing w:before="160" w:after="80"/>
+        <w:jc w:val="center"/>
       </w:pPr>
       <w:r>
         <w:rPr>
           <w:rFonts w:ascii="Sylfaen" w:hAnsi="Sylfaen" w:cs="Sylfaen"/>
           <w:b/>
-          <w:sz w:val="26"/>
+          <w:color w:val="000000"/>
+          <w:sz w:val="28"/>
         </w:rPr>
         <w:t>4.5 შეფასების შეზღუდვები</w:t>
       </w:r>
     </w:p>
     <w:p>
-      <w:pPr/>
+      <w:pPr>
+        <w:jc w:val="both"/>
+      </w:pPr>
       <w:r>
         <w:rPr>
           <w:rFonts w:ascii="Sylfaen" w:hAnsi="Sylfaen" w:cs="Sylfaen"/>
@@ -5500,18 +6685,23 @@
         <w:numPr>
           <w:numId w:val="0"/>
         </w:numPr>
+        <w:spacing w:before="360" w:after="80"/>
+        <w:jc w:val="center"/>
       </w:pPr>
       <w:r>
         <w:rPr>
           <w:rFonts w:ascii="Sylfaen" w:hAnsi="Sylfaen" w:cs="Sylfaen"/>
           <w:b/>
+          <w:color w:val="000000"/>
           <w:sz w:val="28"/>
         </w:rPr>
         <w:t>5. დასკვნა</w:t>
       </w:r>
     </w:p>
     <w:p>
-      <w:pPr/>
+      <w:pPr>
+        <w:jc w:val="both"/>
+      </w:pPr>
       <w:r>
         <w:rPr>
           <w:rFonts w:ascii="Sylfaen" w:hAnsi="Sylfaen" w:cs="Sylfaen"/>
@@ -5527,18 +6717,23 @@
         <w:numPr>
           <w:numId w:val="0"/>
         </w:numPr>
+        <w:spacing w:before="160" w:after="80"/>
+        <w:jc w:val="center"/>
       </w:pPr>
       <w:r>
         <w:rPr>
           <w:rFonts w:ascii="Sylfaen" w:hAnsi="Sylfaen" w:cs="Sylfaen"/>
           <w:b/>
-          <w:sz w:val="26"/>
+          <w:color w:val="000000"/>
+          <w:sz w:val="28"/>
         </w:rPr>
         <w:t>5.1 წვლილის შეჯამება</w:t>
       </w:r>
     </w:p>
     <w:p>
-      <w:pPr/>
+      <w:pPr>
+        <w:jc w:val="both"/>
+      </w:pPr>
       <w:r>
         <w:rPr>
           <w:rFonts w:ascii="Sylfaen" w:hAnsi="Sylfaen" w:cs="Sylfaen"/>
@@ -5554,18 +6749,23 @@
         <w:numPr>
           <w:numId w:val="0"/>
         </w:numPr>
+        <w:spacing w:before="160" w:after="80"/>
+        <w:jc w:val="center"/>
       </w:pPr>
       <w:r>
         <w:rPr>
           <w:rFonts w:ascii="Sylfaen" w:hAnsi="Sylfaen" w:cs="Sylfaen"/>
           <w:b/>
-          <w:sz w:val="26"/>
+          <w:color w:val="000000"/>
+          <w:sz w:val="28"/>
         </w:rPr>
         <w:t>5.2 შედეგების შეჯამება</w:t>
       </w:r>
     </w:p>
     <w:p>
-      <w:pPr/>
+      <w:pPr>
+        <w:jc w:val="both"/>
+      </w:pPr>
       <w:r>
         <w:rPr>
           <w:rFonts w:ascii="Sylfaen" w:hAnsi="Sylfaen" w:cs="Sylfaen"/>
@@ -5581,18 +6781,23 @@
         <w:numPr>
           <w:numId w:val="0"/>
         </w:numPr>
+        <w:spacing w:before="160" w:after="80"/>
+        <w:jc w:val="center"/>
       </w:pPr>
       <w:r>
         <w:rPr>
           <w:rFonts w:ascii="Sylfaen" w:hAnsi="Sylfaen" w:cs="Sylfaen"/>
           <w:b/>
-          <w:sz w:val="26"/>
+          <w:color w:val="000000"/>
+          <w:sz w:val="28"/>
         </w:rPr>
         <w:t>5.3 სამომავლო სამუშაო</w:t>
       </w:r>
     </w:p>
     <w:p>
-      <w:pPr/>
+      <w:pPr>
+        <w:jc w:val="both"/>
+      </w:pPr>
       <w:r>
         <w:rPr>
           <w:rFonts w:ascii="Sylfaen" w:hAnsi="Sylfaen" w:cs="Sylfaen"/>
@@ -5609,11 +6814,14 @@
         <w:numPr>
           <w:numId w:val="0"/>
         </w:numPr>
+        <w:spacing w:before="360" w:after="80"/>
+        <w:jc w:val="center"/>
       </w:pPr>
       <w:r>
         <w:rPr>
           <w:rFonts w:ascii="Sylfaen" w:hAnsi="Sylfaen" w:cs="Sylfaen"/>
           <w:b/>
+          <w:color w:val="000000"/>
           <w:sz w:val="28"/>
         </w:rPr>
         <w:t>ბიბლიოგრაფია</w:t>
@@ -6076,7 +7284,7 @@
     </w:p>
     <w:sectPr>
       <w:pgSz w:w="11906" w:h="16838" w:code="9"/>
-      <w:pgMar w:top="1418" w:right="1418" w:bottom="1418" w:left="2155" w:header="720" w:footer="720" w:gutter="0"/>
+      <w:pgMar w:top="1417" w:right="1417" w:bottom="1417" w:left="2154" w:header="720" w:footer="720" w:gutter="0"/>
       <w:pgNumType w:start="1"/>
       <w:cols w:space="720"/>
       <w:docGrid w:linePitch="360"/>
@@ -10601,12 +11809,14 @@
       <w:numPr>
         <w:numId w:val="30"/>
       </w:numPr>
-      <w:spacing w:before="240" w:after="0"/>
+      <w:spacing w:before="360" w:after="80"/>
+      <w:jc w:val="center"/>
       <w:outlineLvl w:val="0"/>
     </w:pPr>
     <w:rPr>
-      <w:rFonts w:eastAsiaTheme="majorEastAsia" w:cstheme="majorBidi"/>
-      <w:color w:val="2F5496" w:themeColor="accent1" w:themeShade="BF"/>
+      <w:rFonts w:eastAsiaTheme="majorEastAsia" w:cstheme="majorBidi" w:ascii="Sylfaen" w:hAnsi="Sylfaen"/>
+      <w:b/>
+      <w:color w:val="000000"/>
       <w:sz w:val="28"/>
       <w:szCs w:val="32"/>
     </w:rPr>
@@ -10623,13 +11833,16 @@
         <w:ilvl w:val="1"/>
         <w:numId w:val="30"/>
       </w:numPr>
-      <w:spacing w:before="100" w:beforeAutospacing="1" w:after="100" w:afterAutospacing="1" w:line="240" w:lineRule="auto"/>
+      <w:spacing w:before="160" w:beforeAutospacing="1" w:after="80" w:afterAutospacing="1" w:line="240" w:lineRule="auto"/>
+      <w:jc w:val="center"/>
       <w:outlineLvl w:val="1"/>
     </w:pPr>
     <w:rPr>
-      <w:rFonts w:eastAsia="Times New Roman" w:cs="Times New Roman"/>
+      <w:rFonts w:eastAsia="Times New Roman" w:cs="Times New Roman" w:ascii="Sylfaen" w:hAnsi="Sylfaen"/>
       <w:b/>
       <w:bCs/>
+      <w:color w:val="000000"/>
+      <w:sz w:val="28"/>
       <w:szCs w:val="36"/>
     </w:rPr>
   </w:style>
@@ -10649,11 +11862,15 @@
         <w:ilvl w:val="2"/>
         <w:numId w:val="30"/>
       </w:numPr>
-      <w:spacing w:before="40" w:after="0"/>
+      <w:spacing w:before="160" w:after="80"/>
+      <w:jc w:val="center"/>
       <w:outlineLvl w:val="2"/>
     </w:pPr>
     <w:rPr>
-      <w:rFonts w:eastAsiaTheme="majorEastAsia" w:cstheme="majorBidi"/>
+      <w:rFonts w:eastAsiaTheme="majorEastAsia" w:cstheme="majorBidi" w:ascii="Sylfaen" w:hAnsi="Sylfaen"/>
+      <w:b/>
+      <w:color w:val="000000"/>
+      <w:sz w:val="28"/>
       <w:szCs w:val="24"/>
     </w:rPr>
   </w:style>

</xml_diff>

<commit_message>
fix(thesis): fill შიფრი 0163, drop blank page, schema-valid formatter
- title page: შიფრი: 0163 (confirmed by Lekso)
- build.py: strip empty spacer paragraphs immediately before a hard page break
  (at 1.5 front-matter spacing they overflowed into a blank page between the
  recommendation and copyright pages)
- format_thesis.py: insert tblBorders in OOXML schema order instead of appending
  after tblLook — the formatter had been reintroducing an invalid-order table
  border on every run; final formatted docx now validates clean

Co-Authored-By: Claude Opus 4.8 <noreply@anthropic.com>
</commit_message>
<xml_diff>
--- a/project/thesis-ka.docx
+++ b/project/thesis-ka.docx
@@ -99,7 +99,7 @@
           <w:b/>
           <w:sz w:val="28"/>
         </w:rPr>
-        <w:t>შიფრი: [___]</w:t>
+        <w:t>შიფრი: 0163</w:t>
       </w:r>
     </w:p>
     <w:p>
@@ -634,47 +634,6 @@
           <w:lang w:val="ka-GE"/>
         </w:rPr>
       </w:pPr>
-    </w:p>
-    <w:p>
-      <w:pPr>
-        <w:spacing w:after="0" w:line="360" w:lineRule="auto"/>
-        <w:ind w:firstLine="454"/>
-        <w:jc w:val="center"/>
-        <w:rPr>
-          <w:szCs w:val="24"/>
-          <w:lang w:val="ka-GE"/>
-        </w:rPr>
-      </w:pPr>
-    </w:p>
-    <w:p>
-      <w:pPr>
-        <w:spacing w:after="0" w:line="360" w:lineRule="auto"/>
-        <w:ind w:firstLine="454"/>
-        <w:jc w:val="center"/>
-        <w:rPr>
-          <w:szCs w:val="24"/>
-          <w:lang w:val="ka-GE"/>
-        </w:rPr>
-      </w:pPr>
-    </w:p>
-    <w:p>
-      <w:pPr>
-        <w:spacing w:after="0" w:line="360" w:lineRule="auto"/>
-        <w:ind w:firstLine="454"/>
-        <w:jc w:val="center"/>
-        <w:rPr>
-          <w:szCs w:val="24"/>
-          <w:lang w:val="ka-GE"/>
-        </w:rPr>
-      </w:pPr>
-    </w:p>
-    <w:p>
-      <w:pPr>
-        <w:rPr>
-          <w:szCs w:val="24"/>
-          <w:lang w:val="ka-GE"/>
-        </w:rPr>
-      </w:pPr>
       <w:r>
         <w:rPr>
           <w:szCs w:val="24"/>
@@ -1132,16 +1091,6 @@
         </w:rPr>
         <w:t>___________________</w:t>
       </w:r>
-    </w:p>
-    <w:p>
-      <w:pPr>
-        <w:spacing w:after="0" w:line="360" w:lineRule="auto"/>
-        <w:ind w:firstLine="454"/>
-        <w:jc w:val="left"/>
-        <w:rPr>
-          <w:lang w:val="ka-GE"/>
-        </w:rPr>
-      </w:pPr>
     </w:p>
     <w:p>
       <w:pPr>
@@ -1462,7 +1411,7 @@
           <w:rFonts w:ascii="Sylfaen" w:hAnsi="Sylfaen"/>
           <w:sz w:val="24"/>
         </w:rPr>
-        <w:t>12</w:t>
+        <w:t>11</w:t>
       </w:r>
     </w:p>
     <w:p>
@@ -1492,7 +1441,7 @@
           <w:rFonts w:ascii="Sylfaen" w:hAnsi="Sylfaen"/>
           <w:sz w:val="24"/>
         </w:rPr>
-        <w:t>18</w:t>
+        <w:t>17</w:t>
       </w:r>
     </w:p>
     <w:p>
@@ -1522,7 +1471,7 @@
           <w:rFonts w:ascii="Sylfaen" w:hAnsi="Sylfaen"/>
           <w:sz w:val="24"/>
         </w:rPr>
-        <w:t>18</w:t>
+        <w:t>17</w:t>
       </w:r>
     </w:p>
     <w:p>
@@ -1552,7 +1501,7 @@
           <w:rFonts w:ascii="Sylfaen" w:hAnsi="Sylfaen"/>
           <w:sz w:val="24"/>
         </w:rPr>
-        <w:t>18</w:t>
+        <w:t>17</w:t>
       </w:r>
     </w:p>
     <w:p>
@@ -1582,7 +1531,7 @@
           <w:rFonts w:ascii="Sylfaen" w:hAnsi="Sylfaen"/>
           <w:sz w:val="24"/>
         </w:rPr>
-        <w:t>21</w:t>
+        <w:t>20</w:t>
       </w:r>
     </w:p>
     <w:p>
@@ -1612,7 +1561,7 @@
           <w:rFonts w:ascii="Sylfaen" w:hAnsi="Sylfaen"/>
           <w:sz w:val="24"/>
         </w:rPr>
-        <w:t>24</w:t>
+        <w:t>23</w:t>
       </w:r>
     </w:p>
     <w:p>
@@ -1642,7 +1591,7 @@
           <w:rFonts w:ascii="Sylfaen" w:hAnsi="Sylfaen"/>
           <w:sz w:val="24"/>
         </w:rPr>
-        <w:t>26</w:t>
+        <w:t>25</w:t>
       </w:r>
     </w:p>
     <w:p>
@@ -1672,7 +1621,7 @@
           <w:rFonts w:ascii="Sylfaen" w:hAnsi="Sylfaen"/>
           <w:sz w:val="24"/>
         </w:rPr>
-        <w:t>27</w:t>
+        <w:t>26</w:t>
       </w:r>
     </w:p>
     <w:p>
@@ -1702,7 +1651,7 @@
           <w:rFonts w:ascii="Sylfaen" w:hAnsi="Sylfaen"/>
           <w:sz w:val="24"/>
         </w:rPr>
-        <w:t>29</w:t>
+        <w:t>28</w:t>
       </w:r>
     </w:p>
     <w:p>
@@ -1732,7 +1681,7 @@
           <w:rFonts w:ascii="Sylfaen" w:hAnsi="Sylfaen"/>
           <w:sz w:val="24"/>
         </w:rPr>
-        <w:t>30</w:t>
+        <w:t>29</w:t>
       </w:r>
     </w:p>
     <w:p>
@@ -1762,7 +1711,7 @@
           <w:rFonts w:ascii="Sylfaen" w:hAnsi="Sylfaen"/>
           <w:sz w:val="24"/>
         </w:rPr>
-        <w:t>32</w:t>
+        <w:t>31</w:t>
       </w:r>
     </w:p>
     <w:p>
@@ -1792,7 +1741,7 @@
           <w:rFonts w:ascii="Sylfaen" w:hAnsi="Sylfaen"/>
           <w:sz w:val="24"/>
         </w:rPr>
-        <w:t>32</w:t>
+        <w:t>31</w:t>
       </w:r>
     </w:p>
     <w:p>
@@ -1822,7 +1771,7 @@
           <w:rFonts w:ascii="Sylfaen" w:hAnsi="Sylfaen"/>
           <w:sz w:val="24"/>
         </w:rPr>
-        <w:t>34</w:t>
+        <w:t>33</w:t>
       </w:r>
     </w:p>
     <w:p>
@@ -1852,7 +1801,7 @@
           <w:rFonts w:ascii="Sylfaen" w:hAnsi="Sylfaen"/>
           <w:sz w:val="24"/>
         </w:rPr>
-        <w:t>39</w:t>
+        <w:t>38</w:t>
       </w:r>
     </w:p>
     <w:p>
@@ -1882,7 +1831,7 @@
           <w:rFonts w:ascii="Sylfaen" w:hAnsi="Sylfaen"/>
           <w:sz w:val="24"/>
         </w:rPr>
-        <w:t>42</w:t>
+        <w:t>41</w:t>
       </w:r>
     </w:p>
     <w:p>
@@ -1912,7 +1861,7 @@
           <w:rFonts w:ascii="Sylfaen" w:hAnsi="Sylfaen"/>
           <w:sz w:val="24"/>
         </w:rPr>
-        <w:t>44</w:t>
+        <w:t>43</w:t>
       </w:r>
     </w:p>
     <w:p>
@@ -1942,7 +1891,7 @@
           <w:rFonts w:ascii="Sylfaen" w:hAnsi="Sylfaen"/>
           <w:sz w:val="24"/>
         </w:rPr>
-        <w:t>47</w:t>
+        <w:t>46</w:t>
       </w:r>
     </w:p>
     <w:p>
@@ -1972,7 +1921,7 @@
           <w:rFonts w:ascii="Sylfaen" w:hAnsi="Sylfaen"/>
           <w:sz w:val="24"/>
         </w:rPr>
-        <w:t>49</w:t>
+        <w:t>48</w:t>
       </w:r>
     </w:p>
     <w:p>
@@ -2002,7 +1951,7 @@
           <w:rFonts w:ascii="Sylfaen" w:hAnsi="Sylfaen"/>
           <w:sz w:val="24"/>
         </w:rPr>
-        <w:t>50</w:t>
+        <w:t>49</w:t>
       </w:r>
     </w:p>
     <w:p>
@@ -2032,7 +1981,7 @@
           <w:rFonts w:ascii="Sylfaen" w:hAnsi="Sylfaen"/>
           <w:sz w:val="24"/>
         </w:rPr>
-        <w:t>53</w:t>
+        <w:t>52</w:t>
       </w:r>
     </w:p>
     <w:p>
@@ -2062,7 +2011,7 @@
           <w:rFonts w:ascii="Sylfaen" w:hAnsi="Sylfaen"/>
           <w:sz w:val="24"/>
         </w:rPr>
-        <w:t>53</w:t>
+        <w:t>52</w:t>
       </w:r>
     </w:p>
     <w:p>
@@ -2092,7 +2041,7 @@
           <w:rFonts w:ascii="Sylfaen" w:hAnsi="Sylfaen"/>
           <w:sz w:val="24"/>
         </w:rPr>
-        <w:t>54</w:t>
+        <w:t>53</w:t>
       </w:r>
     </w:p>
     <w:p>
@@ -2122,7 +2071,7 @@
           <w:rFonts w:ascii="Sylfaen" w:hAnsi="Sylfaen"/>
           <w:sz w:val="24"/>
         </w:rPr>
-        <w:t>56</w:t>
+        <w:t>55</w:t>
       </w:r>
     </w:p>
     <w:p>
@@ -2152,7 +2101,7 @@
           <w:rFonts w:ascii="Sylfaen" w:hAnsi="Sylfaen"/>
           <w:sz w:val="24"/>
         </w:rPr>
-        <w:t>58</w:t>
+        <w:t>57</w:t>
       </w:r>
     </w:p>
     <w:p>
@@ -2182,7 +2131,7 @@
           <w:rFonts w:ascii="Sylfaen" w:hAnsi="Sylfaen"/>
           <w:sz w:val="24"/>
         </w:rPr>
-        <w:t>59</w:t>
+        <w:t>58</w:t>
       </w:r>
     </w:p>
     <w:p>
@@ -2212,7 +2161,7 @@
           <w:rFonts w:ascii="Sylfaen" w:hAnsi="Sylfaen"/>
           <w:sz w:val="24"/>
         </w:rPr>
-        <w:t>61</w:t>
+        <w:t>60</w:t>
       </w:r>
     </w:p>
     <w:p>
@@ -2242,7 +2191,7 @@
           <w:rFonts w:ascii="Sylfaen" w:hAnsi="Sylfaen"/>
           <w:sz w:val="24"/>
         </w:rPr>
-        <w:t>61</w:t>
+        <w:t>60</w:t>
       </w:r>
     </w:p>
     <w:p>
@@ -2272,7 +2221,7 @@
           <w:rFonts w:ascii="Sylfaen" w:hAnsi="Sylfaen"/>
           <w:sz w:val="24"/>
         </w:rPr>
-        <w:t>62</w:t>
+        <w:t>61</w:t>
       </w:r>
     </w:p>
     <w:p>
@@ -2302,7 +2251,7 @@
           <w:rFonts w:ascii="Sylfaen" w:hAnsi="Sylfaen"/>
           <w:sz w:val="24"/>
         </w:rPr>
-        <w:t>62</w:t>
+        <w:t>61</w:t>
       </w:r>
     </w:p>
     <w:p>
@@ -2332,7 +2281,7 @@
           <w:rFonts w:ascii="Sylfaen" w:hAnsi="Sylfaen"/>
           <w:sz w:val="24"/>
         </w:rPr>
-        <w:t>64</w:t>
+        <w:t>63</w:t>
       </w:r>
     </w:p>
     <w:p>
@@ -2375,39 +2324,6 @@
         <w:lastRenderedPageBreak/>
         <w:t>სურათების ნუსხა</w:t>
       </w:r>
-    </w:p>
-    <w:p>
-      <w:pPr>
-        <w:spacing w:after="0" w:line="360" w:lineRule="auto"/>
-        <w:jc w:val="left"/>
-        <w:rPr>
-          <w:sz w:val="28"/>
-          <w:szCs w:val="28"/>
-          <w:lang w:val="ka-GE"/>
-        </w:rPr>
-      </w:pPr>
-    </w:p>
-    <w:p>
-      <w:pPr>
-        <w:spacing w:after="0" w:line="360" w:lineRule="auto"/>
-        <w:jc w:val="left"/>
-        <w:rPr>
-          <w:sz w:val="28"/>
-          <w:szCs w:val="28"/>
-          <w:lang w:val="ka-GE"/>
-        </w:rPr>
-      </w:pPr>
-    </w:p>
-    <w:p>
-      <w:pPr>
-        <w:spacing w:after="0" w:line="360" w:lineRule="auto"/>
-        <w:jc w:val="left"/>
-        <w:rPr>
-          <w:sz w:val="28"/>
-          <w:szCs w:val="28"/>
-          <w:lang w:val="ka-GE"/>
-        </w:rPr>
-      </w:pPr>
     </w:p>
     <w:p>
       <w:pPr>
@@ -3225,8 +3141,6 @@
     <w:tbl>
       <w:tblPr>
         <w:tblW w:type="auto" w:w="0"/>
-        <w:tblLayout w:type="fixed"/>
-        <w:tblLook w:firstColumn="1" w:firstRow="1" w:lastColumn="0" w:lastRow="0" w:noHBand="0" w:noVBand="1" w:val="04A0"/>
         <w:tblBorders>
           <w:top w:val="single" w:sz="4" w:space="0" w:color="auto"/>
           <w:left w:val="single" w:sz="4" w:space="0" w:color="auto"/>
@@ -3235,6 +3149,8 @@
           <w:insideH w:val="single" w:sz="4" w:space="0" w:color="auto"/>
           <w:insideV w:val="single" w:sz="4" w:space="0" w:color="auto"/>
         </w:tblBorders>
+        <w:tblLayout w:type="fixed"/>
+        <w:tblLook w:firstColumn="1" w:firstRow="1" w:lastColumn="0" w:lastRow="0" w:noHBand="0" w:noVBand="1" w:val="04A0"/>
       </w:tblPr>
       <w:tblGrid>
         <w:gridCol w:w="2861"/>
@@ -4194,8 +4110,6 @@
     <w:tbl>
       <w:tblPr>
         <w:tblW w:type="auto" w:w="0"/>
-        <w:tblLayout w:type="fixed"/>
-        <w:tblLook w:firstColumn="1" w:firstRow="1" w:lastColumn="0" w:lastRow="0" w:noHBand="0" w:noVBand="1" w:val="04A0"/>
         <w:tblBorders>
           <w:top w:val="single" w:sz="4" w:space="0" w:color="auto"/>
           <w:left w:val="single" w:sz="4" w:space="0" w:color="auto"/>
@@ -4204,6 +4118,8 @@
           <w:insideH w:val="single" w:sz="4" w:space="0" w:color="auto"/>
           <w:insideV w:val="single" w:sz="4" w:space="0" w:color="auto"/>
         </w:tblBorders>
+        <w:tblLayout w:type="fixed"/>
+        <w:tblLook w:firstColumn="1" w:firstRow="1" w:lastColumn="0" w:lastRow="0" w:noHBand="0" w:noVBand="1" w:val="04A0"/>
       </w:tblPr>
       <w:tblGrid>
         <w:gridCol w:w="2297"/>
@@ -4966,8 +4882,6 @@
     <w:tbl>
       <w:tblPr>
         <w:tblW w:type="auto" w:w="0"/>
-        <w:tblLayout w:type="fixed"/>
-        <w:tblLook w:firstColumn="1" w:firstRow="1" w:lastColumn="0" w:lastRow="0" w:noHBand="0" w:noVBand="1" w:val="04A0"/>
         <w:tblBorders>
           <w:top w:val="single" w:sz="4" w:space="0" w:color="auto"/>
           <w:left w:val="single" w:sz="4" w:space="0" w:color="auto"/>
@@ -4976,6 +4890,8 @@
           <w:insideH w:val="single" w:sz="4" w:space="0" w:color="auto"/>
           <w:insideV w:val="single" w:sz="4" w:space="0" w:color="auto"/>
         </w:tblBorders>
+        <w:tblLayout w:type="fixed"/>
+        <w:tblLook w:firstColumn="1" w:firstRow="1" w:lastColumn="0" w:lastRow="0" w:noHBand="0" w:noVBand="1" w:val="04A0"/>
       </w:tblPr>
       <w:tblGrid>
         <w:gridCol w:w="4167"/>
@@ -5388,8 +5304,6 @@
     <w:tbl>
       <w:tblPr>
         <w:tblW w:type="auto" w:w="0"/>
-        <w:tblLayout w:type="fixed"/>
-        <w:tblLook w:firstColumn="1" w:firstRow="1" w:lastColumn="0" w:lastRow="0" w:noHBand="0" w:noVBand="1" w:val="04A0"/>
         <w:tblBorders>
           <w:top w:val="single" w:sz="4" w:space="0" w:color="auto"/>
           <w:left w:val="single" w:sz="4" w:space="0" w:color="auto"/>
@@ -5398,6 +5312,8 @@
           <w:insideH w:val="single" w:sz="4" w:space="0" w:color="auto"/>
           <w:insideV w:val="single" w:sz="4" w:space="0" w:color="auto"/>
         </w:tblBorders>
+        <w:tblLayout w:type="fixed"/>
+        <w:tblLook w:firstColumn="1" w:firstRow="1" w:lastColumn="0" w:lastRow="0" w:noHBand="0" w:noVBand="1" w:val="04A0"/>
       </w:tblPr>
       <w:tblGrid>
         <w:gridCol w:w="3266"/>
@@ -5866,8 +5782,6 @@
     <w:tbl>
       <w:tblPr>
         <w:tblW w:type="auto" w:w="0"/>
-        <w:tblLayout w:type="fixed"/>
-        <w:tblLook w:firstColumn="1" w:firstRow="1" w:lastColumn="0" w:lastRow="0" w:noHBand="0" w:noVBand="1" w:val="04A0"/>
         <w:tblBorders>
           <w:top w:val="single" w:sz="4" w:space="0" w:color="auto"/>
           <w:left w:val="single" w:sz="4" w:space="0" w:color="auto"/>
@@ -5876,6 +5790,8 @@
           <w:insideH w:val="single" w:sz="4" w:space="0" w:color="auto"/>
           <w:insideV w:val="single" w:sz="4" w:space="0" w:color="auto"/>
         </w:tblBorders>
+        <w:tblLayout w:type="fixed"/>
+        <w:tblLook w:firstColumn="1" w:firstRow="1" w:lastColumn="0" w:lastRow="0" w:noHBand="0" w:noVBand="1" w:val="04A0"/>
       </w:tblPr>
       <w:tblGrid>
         <w:gridCol w:w="4671"/>

</xml_diff>

<commit_message>
fix(thesis): collapse to a single section (kills Google Docs phantom blank page)
The template had 2 sections joined by a nextPage section break + titlePg; Google
Docs converts that mid-document break into a blank page (Word/LibreOffice absorb
it, so local renders looked clean). The passed reference uses ONE section. Now
build.py merges to a single section with titlePg (title page unnumbered, page 0)
and a plain page break to start the recommendation — matching the reference.
Validator: PASSED.

Co-Authored-By: Claude Opus 4.8 <noreply@anthropic.com>
</commit_message>
<xml_diff>
--- a/project/thesis-ka.docx
+++ b/project/thesis-ka.docx
@@ -165,19 +165,11 @@
           <w:szCs w:val="28"/>
           <w:lang w:val="ka-GE"/>
         </w:rPr>
-        <w:sectPr>
-          <w:footerReference w:type="default" r:id="rId9"/>
-          <w:pgSz w:w="11906" w:h="16838" w:code="9"/>
-          <w:pgMar w:top="1417" w:right="1417" w:bottom="1417" w:left="2154" w:header="720" w:footer="720" w:gutter="0"/>
-          <w:pgNumType w:start="0"/>
-          <w:cols w:space="720"/>
-          <w:titlePg/>
-          <w:docGrid w:linePitch="360"/>
-        </w:sectPr>
-      </w:pPr>
-    </w:p>
-    <w:p>
-      <w:pPr>
+      </w:pPr>
+    </w:p>
+    <w:p>
+      <w:pPr>
+        <w:pageBreakBefore/>
         <w:spacing w:after="0" w:line="360" w:lineRule="auto"/>
         <w:ind w:firstLine="454"/>
         <w:jc w:val="center"/>
@@ -1411,7 +1403,7 @@
           <w:rFonts w:ascii="Sylfaen" w:hAnsi="Sylfaen"/>
           <w:sz w:val="24"/>
         </w:rPr>
-        <w:t>11</w:t>
+        <w:t>?</w:t>
       </w:r>
     </w:p>
     <w:p>
@@ -1441,7 +1433,7 @@
           <w:rFonts w:ascii="Sylfaen" w:hAnsi="Sylfaen"/>
           <w:sz w:val="24"/>
         </w:rPr>
-        <w:t>17</w:t>
+        <w:t>?</w:t>
       </w:r>
     </w:p>
     <w:p>
@@ -1471,7 +1463,7 @@
           <w:rFonts w:ascii="Sylfaen" w:hAnsi="Sylfaen"/>
           <w:sz w:val="24"/>
         </w:rPr>
-        <w:t>17</w:t>
+        <w:t>?</w:t>
       </w:r>
     </w:p>
     <w:p>
@@ -1501,7 +1493,7 @@
           <w:rFonts w:ascii="Sylfaen" w:hAnsi="Sylfaen"/>
           <w:sz w:val="24"/>
         </w:rPr>
-        <w:t>17</w:t>
+        <w:t>?</w:t>
       </w:r>
     </w:p>
     <w:p>
@@ -1531,7 +1523,7 @@
           <w:rFonts w:ascii="Sylfaen" w:hAnsi="Sylfaen"/>
           <w:sz w:val="24"/>
         </w:rPr>
-        <w:t>20</w:t>
+        <w:t>?</w:t>
       </w:r>
     </w:p>
     <w:p>
@@ -1561,7 +1553,7 @@
           <w:rFonts w:ascii="Sylfaen" w:hAnsi="Sylfaen"/>
           <w:sz w:val="24"/>
         </w:rPr>
-        <w:t>23</w:t>
+        <w:t>?</w:t>
       </w:r>
     </w:p>
     <w:p>
@@ -1591,7 +1583,7 @@
           <w:rFonts w:ascii="Sylfaen" w:hAnsi="Sylfaen"/>
           <w:sz w:val="24"/>
         </w:rPr>
-        <w:t>25</w:t>
+        <w:t>?</w:t>
       </w:r>
     </w:p>
     <w:p>
@@ -1621,7 +1613,7 @@
           <w:rFonts w:ascii="Sylfaen" w:hAnsi="Sylfaen"/>
           <w:sz w:val="24"/>
         </w:rPr>
-        <w:t>26</w:t>
+        <w:t>?</w:t>
       </w:r>
     </w:p>
     <w:p>
@@ -1651,7 +1643,7 @@
           <w:rFonts w:ascii="Sylfaen" w:hAnsi="Sylfaen"/>
           <w:sz w:val="24"/>
         </w:rPr>
-        <w:t>28</w:t>
+        <w:t>?</w:t>
       </w:r>
     </w:p>
     <w:p>
@@ -1681,7 +1673,7 @@
           <w:rFonts w:ascii="Sylfaen" w:hAnsi="Sylfaen"/>
           <w:sz w:val="24"/>
         </w:rPr>
-        <w:t>29</w:t>
+        <w:t>?</w:t>
       </w:r>
     </w:p>
     <w:p>
@@ -1711,7 +1703,7 @@
           <w:rFonts w:ascii="Sylfaen" w:hAnsi="Sylfaen"/>
           <w:sz w:val="24"/>
         </w:rPr>
-        <w:t>31</w:t>
+        <w:t>?</w:t>
       </w:r>
     </w:p>
     <w:p>
@@ -1741,7 +1733,7 @@
           <w:rFonts w:ascii="Sylfaen" w:hAnsi="Sylfaen"/>
           <w:sz w:val="24"/>
         </w:rPr>
-        <w:t>31</w:t>
+        <w:t>?</w:t>
       </w:r>
     </w:p>
     <w:p>
@@ -1771,7 +1763,7 @@
           <w:rFonts w:ascii="Sylfaen" w:hAnsi="Sylfaen"/>
           <w:sz w:val="24"/>
         </w:rPr>
-        <w:t>33</w:t>
+        <w:t>?</w:t>
       </w:r>
     </w:p>
     <w:p>
@@ -1801,7 +1793,7 @@
           <w:rFonts w:ascii="Sylfaen" w:hAnsi="Sylfaen"/>
           <w:sz w:val="24"/>
         </w:rPr>
-        <w:t>38</w:t>
+        <w:t>?</w:t>
       </w:r>
     </w:p>
     <w:p>
@@ -1831,7 +1823,7 @@
           <w:rFonts w:ascii="Sylfaen" w:hAnsi="Sylfaen"/>
           <w:sz w:val="24"/>
         </w:rPr>
-        <w:t>41</w:t>
+        <w:t>?</w:t>
       </w:r>
     </w:p>
     <w:p>
@@ -1861,7 +1853,7 @@
           <w:rFonts w:ascii="Sylfaen" w:hAnsi="Sylfaen"/>
           <w:sz w:val="24"/>
         </w:rPr>
-        <w:t>43</w:t>
+        <w:t>?</w:t>
       </w:r>
     </w:p>
     <w:p>
@@ -1891,7 +1883,7 @@
           <w:rFonts w:ascii="Sylfaen" w:hAnsi="Sylfaen"/>
           <w:sz w:val="24"/>
         </w:rPr>
-        <w:t>46</w:t>
+        <w:t>?</w:t>
       </w:r>
     </w:p>
     <w:p>
@@ -1921,7 +1913,7 @@
           <w:rFonts w:ascii="Sylfaen" w:hAnsi="Sylfaen"/>
           <w:sz w:val="24"/>
         </w:rPr>
-        <w:t>48</w:t>
+        <w:t>?</w:t>
       </w:r>
     </w:p>
     <w:p>
@@ -1951,7 +1943,7 @@
           <w:rFonts w:ascii="Sylfaen" w:hAnsi="Sylfaen"/>
           <w:sz w:val="24"/>
         </w:rPr>
-        <w:t>49</w:t>
+        <w:t>?</w:t>
       </w:r>
     </w:p>
     <w:p>
@@ -1981,7 +1973,7 @@
           <w:rFonts w:ascii="Sylfaen" w:hAnsi="Sylfaen"/>
           <w:sz w:val="24"/>
         </w:rPr>
-        <w:t>52</w:t>
+        <w:t>?</w:t>
       </w:r>
     </w:p>
     <w:p>
@@ -2011,7 +2003,7 @@
           <w:rFonts w:ascii="Sylfaen" w:hAnsi="Sylfaen"/>
           <w:sz w:val="24"/>
         </w:rPr>
-        <w:t>52</w:t>
+        <w:t>?</w:t>
       </w:r>
     </w:p>
     <w:p>
@@ -2041,7 +2033,7 @@
           <w:rFonts w:ascii="Sylfaen" w:hAnsi="Sylfaen"/>
           <w:sz w:val="24"/>
         </w:rPr>
-        <w:t>53</w:t>
+        <w:t>?</w:t>
       </w:r>
     </w:p>
     <w:p>
@@ -2071,7 +2063,7 @@
           <w:rFonts w:ascii="Sylfaen" w:hAnsi="Sylfaen"/>
           <w:sz w:val="24"/>
         </w:rPr>
-        <w:t>55</w:t>
+        <w:t>?</w:t>
       </w:r>
     </w:p>
     <w:p>
@@ -2101,7 +2093,7 @@
           <w:rFonts w:ascii="Sylfaen" w:hAnsi="Sylfaen"/>
           <w:sz w:val="24"/>
         </w:rPr>
-        <w:t>57</w:t>
+        <w:t>?</w:t>
       </w:r>
     </w:p>
     <w:p>
@@ -2131,7 +2123,7 @@
           <w:rFonts w:ascii="Sylfaen" w:hAnsi="Sylfaen"/>
           <w:sz w:val="24"/>
         </w:rPr>
-        <w:t>58</w:t>
+        <w:t>?</w:t>
       </w:r>
     </w:p>
     <w:p>
@@ -2161,7 +2153,7 @@
           <w:rFonts w:ascii="Sylfaen" w:hAnsi="Sylfaen"/>
           <w:sz w:val="24"/>
         </w:rPr>
-        <w:t>60</w:t>
+        <w:t>?</w:t>
       </w:r>
     </w:p>
     <w:p>
@@ -2191,7 +2183,7 @@
           <w:rFonts w:ascii="Sylfaen" w:hAnsi="Sylfaen"/>
           <w:sz w:val="24"/>
         </w:rPr>
-        <w:t>60</w:t>
+        <w:t>?</w:t>
       </w:r>
     </w:p>
     <w:p>
@@ -2221,7 +2213,7 @@
           <w:rFonts w:ascii="Sylfaen" w:hAnsi="Sylfaen"/>
           <w:sz w:val="24"/>
         </w:rPr>
-        <w:t>61</w:t>
+        <w:t>?</w:t>
       </w:r>
     </w:p>
     <w:p>
@@ -2251,7 +2243,7 @@
           <w:rFonts w:ascii="Sylfaen" w:hAnsi="Sylfaen"/>
           <w:sz w:val="24"/>
         </w:rPr>
-        <w:t>61</w:t>
+        <w:t>?</w:t>
       </w:r>
     </w:p>
     <w:p>
@@ -2281,7 +2273,7 @@
           <w:rFonts w:ascii="Sylfaen" w:hAnsi="Sylfaen"/>
           <w:sz w:val="24"/>
         </w:rPr>
-        <w:t>63</w:t>
+        <w:t>?</w:t>
       </w:r>
     </w:p>
     <w:p>
@@ -7201,8 +7193,9 @@
     <w:sectPr>
       <w:pgSz w:w="11906" w:h="16838" w:code="9"/>
       <w:pgMar w:top="1417" w:right="1417" w:bottom="1417" w:left="2154" w:header="720" w:footer="720" w:gutter="0"/>
-      <w:pgNumType w:start="1"/>
+      <w:pgNumType w:start="0"/>
       <w:cols w:space="720"/>
+      <w:titlePg/>
       <w:docGrid w:linePitch="360"/>
     </w:sectPr>
   </w:body>

</xml_diff>

<commit_message>
fix(thesis): real fix for the recommendation->copyright blank + page numbers
Revert the wrong section-collapse (it was never the cause and it dropped the
footerReference, killing page numbers). The blank is the recommendation->copyright
transition: an empty page-break paragraph + a run of spacer empties that Google
Docs inflates into a phantom page. Fix (fix_front_matter_pagination):
- convert explicit page breaks to pageBreakBefore on the next paragraph
- collapse runs of >=4 spacer empties down to 2
Keeps 2 sections so footerReference/page numbering is intact. LibreOffice: title
unnumbered, recommendation=1, copyright=2, no blank. Matches reference structure
(0 explicit page breaks + footerReference). Validator: PASSED.

Co-Authored-By: Claude Opus 4.8 <noreply@anthropic.com>
</commit_message>
<xml_diff>
--- a/project/thesis-ka.docx
+++ b/project/thesis-ka.docx
@@ -165,11 +165,19 @@
           <w:szCs w:val="28"/>
           <w:lang w:val="ka-GE"/>
         </w:rPr>
-      </w:pPr>
-    </w:p>
-    <w:p>
-      <w:pPr>
-        <w:pageBreakBefore/>
+        <w:sectPr>
+          <w:footerReference w:type="default" r:id="rId9"/>
+          <w:pgSz w:w="11906" w:h="16838" w:code="9"/>
+          <w:pgMar w:top="1417" w:right="1417" w:bottom="1417" w:left="2154" w:header="720" w:footer="720" w:gutter="0"/>
+          <w:pgNumType w:start="0"/>
+          <w:cols w:space="720"/>
+          <w:titlePg/>
+          <w:docGrid w:linePitch="360"/>
+        </w:sectPr>
+      </w:pPr>
+    </w:p>
+    <w:p>
+      <w:pPr>
         <w:spacing w:after="0" w:line="360" w:lineRule="auto"/>
         <w:ind w:firstLine="454"/>
         <w:jc w:val="center"/>
@@ -328,21 +336,42 @@
       <w:pPr>
         <w:spacing w:after="0" w:line="360" w:lineRule="auto"/>
         <w:ind w:firstLine="454"/>
+        <w:jc w:val="right"/>
         <w:rPr>
           <w:szCs w:val="24"/>
           <w:lang w:val="ka-GE"/>
         </w:rPr>
       </w:pPr>
-    </w:p>
-    <w:p>
-      <w:pPr>
-        <w:spacing w:after="0" w:line="360" w:lineRule="auto"/>
-        <w:ind w:firstLine="454"/>
+      <w:r>
         <w:rPr>
           <w:szCs w:val="24"/>
           <w:lang w:val="ka-GE"/>
         </w:rPr>
-      </w:pPr>
+        <w:t>თარიღი: ------------- 2026 წელი</w:t>
+      </w:r>
+      <w:r>
+        <w:rPr>
+          <w:szCs w:val="24"/>
+          <w:lang w:val="ka-GE"/>
+        </w:rPr>
+      </w:r>
+      <w:r>
+        <w:rPr>
+          <w:szCs w:val="24"/>
+          <w:lang w:val="ka-GE"/>
+        </w:rPr>
+      </w:r>
+      <w:r>
+        <w:rPr>
+          <w:szCs w:val="24"/>
+        </w:rPr>
+      </w:r>
+      <w:r>
+        <w:rPr>
+          <w:szCs w:val="24"/>
+          <w:lang w:val="ka-GE"/>
+        </w:rPr>
+      </w:r>
     </w:p>
     <w:p>
       <w:pPr>
@@ -354,36 +383,6 @@
           <w:lang w:val="ka-GE"/>
         </w:rPr>
       </w:pPr>
-      <w:r>
-        <w:rPr>
-          <w:szCs w:val="24"/>
-          <w:lang w:val="ka-GE"/>
-        </w:rPr>
-        <w:t>თარიღი: ------------- 2026 წელი</w:t>
-      </w:r>
-      <w:r>
-        <w:rPr>
-          <w:szCs w:val="24"/>
-          <w:lang w:val="ka-GE"/>
-        </w:rPr>
-      </w:r>
-      <w:r>
-        <w:rPr>
-          <w:szCs w:val="24"/>
-          <w:lang w:val="ka-GE"/>
-        </w:rPr>
-      </w:r>
-      <w:r>
-        <w:rPr>
-          <w:szCs w:val="24"/>
-        </w:rPr>
-      </w:r>
-      <w:r>
-        <w:rPr>
-          <w:szCs w:val="24"/>
-          <w:lang w:val="ka-GE"/>
-        </w:rPr>
-      </w:r>
     </w:p>
     <w:p>
       <w:pPr>
@@ -414,9 +413,26 @@
         <w:jc w:val="right"/>
         <w:rPr>
           <w:szCs w:val="24"/>
+        </w:rPr>
+      </w:pPr>
+      <w:r>
+        <w:rPr>
+          <w:szCs w:val="24"/>
           <w:lang w:val="ka-GE"/>
         </w:rPr>
-      </w:pPr>
+        <w:t>ხელმძღვანელი: ოთარ თავდიშვილი</w:t>
+      </w:r>
+      <w:r>
+        <w:rPr>
+          <w:szCs w:val="24"/>
+          <w:lang w:val="ka-GE"/>
+        </w:rPr>
+      </w:r>
+      <w:r>
+        <w:rPr>
+          <w:szCs w:val="24"/>
+        </w:rPr>
+      </w:r>
     </w:p>
     <w:p>
       <w:pPr>
@@ -425,26 +441,19 @@
         <w:jc w:val="right"/>
         <w:rPr>
           <w:szCs w:val="24"/>
-        </w:rPr>
-      </w:pPr>
-      <w:r>
+          <w:lang w:val="ka-GE"/>
+        </w:rPr>
+      </w:pPr>
+    </w:p>
+    <w:p>
+      <w:pPr>
+        <w:spacing w:after="0" w:line="360" w:lineRule="auto"/>
+        <w:ind w:firstLine="454"/>
         <w:rPr>
           <w:szCs w:val="24"/>
           <w:lang w:val="ka-GE"/>
         </w:rPr>
-        <w:t>ხელმძღვანელი: ოთარ თავდიშვილი</w:t>
-      </w:r>
-      <w:r>
-        <w:rPr>
-          <w:szCs w:val="24"/>
-          <w:lang w:val="ka-GE"/>
-        </w:rPr>
-      </w:r>
-      <w:r>
-        <w:rPr>
-          <w:szCs w:val="24"/>
-        </w:rPr>
-      </w:r>
+      </w:pPr>
     </w:p>
     <w:p>
       <w:pPr>
@@ -456,99 +465,34 @@
           <w:lang w:val="ka-GE"/>
         </w:rPr>
       </w:pPr>
-    </w:p>
-    <w:p>
-      <w:pPr>
-        <w:spacing w:after="0" w:line="360" w:lineRule="auto"/>
-        <w:ind w:firstLine="454"/>
+      <w:r>
         <w:rPr>
           <w:szCs w:val="24"/>
           <w:lang w:val="ka-GE"/>
         </w:rPr>
-      </w:pPr>
-    </w:p>
-    <w:p>
-      <w:pPr>
-        <w:spacing w:after="0" w:line="360" w:lineRule="auto"/>
-        <w:ind w:firstLine="454"/>
-        <w:jc w:val="right"/>
+        <w:t>რეცენზენტი</w:t>
+      </w:r>
+      <w:r>
         <w:rPr>
           <w:szCs w:val="24"/>
           <w:lang w:val="ka-GE"/>
         </w:rPr>
-      </w:pPr>
+        <w:t xml:space="preserve">: </w:t>
+      </w:r>
       <w:r>
         <w:rPr>
           <w:szCs w:val="24"/>
           <w:lang w:val="ka-GE"/>
         </w:rPr>
-        <w:t>რეცენზენტი</w:t>
+        <w:t>------------------------</w:t>
       </w:r>
       <w:r>
         <w:rPr>
           <w:szCs w:val="24"/>
           <w:lang w:val="ka-GE"/>
         </w:rPr>
-        <w:t xml:space="preserve">: </w:t>
-      </w:r>
-      <w:r>
-        <w:rPr>
-          <w:szCs w:val="24"/>
-          <w:lang w:val="ka-GE"/>
-        </w:rPr>
-        <w:t>------------------------</w:t>
-      </w:r>
-      <w:r>
-        <w:rPr>
-          <w:szCs w:val="24"/>
-          <w:lang w:val="ka-GE"/>
-        </w:rPr>
         <w:t>----------</w:t>
       </w:r>
-    </w:p>
-    <w:p>
-      <w:pPr>
-        <w:spacing w:after="0" w:line="360" w:lineRule="auto"/>
-        <w:ind w:firstLine="454"/>
-        <w:jc w:val="right"/>
-        <w:rPr>
-          <w:szCs w:val="24"/>
-          <w:lang w:val="ka-GE"/>
-        </w:rPr>
-      </w:pPr>
-    </w:p>
-    <w:p>
-      <w:pPr>
-        <w:spacing w:after="0" w:line="360" w:lineRule="auto"/>
-        <w:ind w:firstLine="454"/>
-        <w:jc w:val="right"/>
-        <w:rPr>
-          <w:szCs w:val="24"/>
-          <w:lang w:val="ka-GE"/>
-        </w:rPr>
-      </w:pPr>
-    </w:p>
-    <w:p>
-      <w:pPr>
-        <w:spacing w:after="0" w:line="360" w:lineRule="auto"/>
-        <w:ind w:firstLine="454"/>
-        <w:jc w:val="right"/>
-        <w:rPr>
-          <w:szCs w:val="24"/>
-          <w:lang w:val="ka-GE"/>
-        </w:rPr>
-      </w:pPr>
-    </w:p>
-    <w:p>
-      <w:pPr>
-        <w:spacing w:after="0" w:line="360" w:lineRule="auto"/>
-        <w:ind w:firstLine="454"/>
-        <w:jc w:val="right"/>
-        <w:rPr>
-          <w:szCs w:val="24"/>
-          <w:lang w:val="ka-GE"/>
-        </w:rPr>
-      </w:pPr>
     </w:p>
     <w:p>
       <w:pPr>
@@ -626,17 +570,22 @@
           <w:lang w:val="ka-GE"/>
         </w:rPr>
       </w:pPr>
-      <w:r>
+    </w:p>
+    <w:p>
+      <w:pPr>
+        <w:spacing w:after="0" w:line="360" w:lineRule="auto"/>
+        <w:ind w:firstLine="454"/>
+        <w:jc w:val="center"/>
         <w:rPr>
           <w:szCs w:val="24"/>
           <w:lang w:val="ka-GE"/>
         </w:rPr>
-        <w:br w:type="page"/>
-      </w:r>
+      </w:pPr>
     </w:p>
     <w:bookmarkEnd w:id="2"/>
     <w:p>
       <w:pPr>
+        <w:pageBreakBefore/>
         <w:spacing w:after="0" w:line="360" w:lineRule="auto"/>
         <w:ind w:firstLine="454"/>
         <w:jc w:val="center"/>
@@ -775,6 +724,13 @@
           <w:lang w:val="ka-GE"/>
         </w:rPr>
       </w:pPr>
+      <w:r>
+        <w:rPr>
+          <w:szCs w:val="24"/>
+          <w:lang w:val="ka-GE"/>
+        </w:rPr>
+        <w:t>საქართველოს ტექნიკური უნივერსიტეტის</w:t>
+      </w:r>
     </w:p>
     <w:p>
       <w:pPr>
@@ -786,6 +742,13 @@
           <w:lang w:val="ka-GE"/>
         </w:rPr>
       </w:pPr>
+      <w:r>
+        <w:rPr>
+          <w:szCs w:val="24"/>
+          <w:lang w:val="ka-GE"/>
+        </w:rPr>
+        <w:t>ინფორმატიკის და მართვის სისტემების ფაკულტეტი</w:t>
+      </w:r>
     </w:p>
     <w:p>
       <w:pPr>
@@ -802,42 +765,6 @@
           <w:szCs w:val="24"/>
           <w:lang w:val="ka-GE"/>
         </w:rPr>
-        <w:t>საქართველოს ტექნიკური უნივერსიტეტის</w:t>
-      </w:r>
-    </w:p>
-    <w:p>
-      <w:pPr>
-        <w:spacing w:after="0" w:line="360" w:lineRule="auto"/>
-        <w:ind w:firstLine="454"/>
-        <w:jc w:val="center"/>
-        <w:rPr>
-          <w:szCs w:val="24"/>
-          <w:lang w:val="ka-GE"/>
-        </w:rPr>
-      </w:pPr>
-      <w:r>
-        <w:rPr>
-          <w:szCs w:val="24"/>
-          <w:lang w:val="ka-GE"/>
-        </w:rPr>
-        <w:t>ინფორმატიკის და მართვის სისტემების ფაკულტეტი</w:t>
-      </w:r>
-    </w:p>
-    <w:p>
-      <w:pPr>
-        <w:spacing w:after="0" w:line="360" w:lineRule="auto"/>
-        <w:ind w:firstLine="454"/>
-        <w:jc w:val="center"/>
-        <w:rPr>
-          <w:szCs w:val="24"/>
-          <w:lang w:val="ka-GE"/>
-        </w:rPr>
-      </w:pPr>
-      <w:r>
-        <w:rPr>
-          <w:szCs w:val="24"/>
-          <w:lang w:val="ka-GE"/>
-        </w:rPr>
         <w:t>წარმოდგენილია მაგისტრის აკადემიური ხარისხის</w:t>
       </w:r>
       <w:r>
@@ -915,6 +842,13 @@
           <w:lang w:val="ka-GE"/>
         </w:rPr>
       </w:pPr>
+      <w:r>
+        <w:rPr>
+          <w:szCs w:val="24"/>
+          <w:lang w:val="ka-GE"/>
+        </w:rPr>
+        <w:t>„ინდივიდუალური პიროვნების ან ინსტიტუტების მიერ ზემოთმოყვანილი დასახელების სამაგისტრო ნაშრომის გაცნობის მიზნით მოთხოვნის შემთხვევაში მისი არაკომერციული მიზნებით კოპირებისა და გავრცელების უფლება მინიჭებული აქვს საქართველოს ტექნიკურ უნივერსიტეტს“.</w:t>
+      </w:r>
     </w:p>
     <w:p>
       <w:pPr>
@@ -926,6 +860,64 @@
           <w:lang w:val="ka-GE"/>
         </w:rPr>
       </w:pPr>
+      <w:r>
+        <w:rPr>
+          <w:szCs w:val="24"/>
+          <w:lang w:val="ka-GE"/>
+        </w:rPr>
+        <w:t>„ავტორი ინარჩუნებს დანარჩენ საგამომცემლო უფლებებს და არც მთლიანი ნაშრომის და არც მისი ცალკეული კომპონენტების გადაბეჭდვა ან სხვა რაიმე მეთოდით რეპროდუქცია დაუშვებელია ავტორის წერილობითი ნებართვის გარეშე. ავტორი ირწმუნება, რომ ნაშრომში გამოყენებული საავტორო უფლებებით დაცულ მასალებზე მიღებულია შესაბამისი ნებართვა (გარდა იმ მცირე ზომის ციტატებისა, რომლებიც მოითხოვენ მხოლოდ სპეციფიურ მიმართებას ლიტერატურის ციტირებაში, როგორც ეს მიღებულია სამეცნიერო ნაშრომების შესრულებისას) და ყველა მათგანზე იღებს პასუხისმგებლობას“.</w:t>
+      </w:r>
+    </w:p>
+    <w:p>
+      <w:pPr>
+        <w:spacing w:after="0" w:line="360" w:lineRule="auto"/>
+        <w:ind w:firstLine="454"/>
+        <w:rPr>
+          <w:szCs w:val="24"/>
+          <w:lang w:val="ka-GE"/>
+        </w:rPr>
+      </w:pPr>
+    </w:p>
+    <w:p>
+      <w:pPr>
+        <w:spacing w:after="0" w:line="360" w:lineRule="auto"/>
+        <w:ind w:firstLine="454"/>
+        <w:rPr>
+          <w:szCs w:val="24"/>
+          <w:lang w:val="ka-GE"/>
+        </w:rPr>
+      </w:pPr>
+      <w:r>
+        <w:rPr>
+          <w:szCs w:val="24"/>
+          <w:lang w:val="ka-GE"/>
+        </w:rPr>
+        <w:t xml:space="preserve">                          </w:t>
+      </w:r>
+    </w:p>
+    <w:p>
+      <w:pPr>
+        <w:spacing w:after="0" w:line="360" w:lineRule="auto"/>
+        <w:ind w:firstLine="454"/>
+        <w:rPr>
+          <w:szCs w:val="24"/>
+          <w:lang w:val="ka-GE"/>
+        </w:rPr>
+      </w:pPr>
+      <w:r>
+        <w:rPr>
+          <w:szCs w:val="24"/>
+          <w:lang w:val="ka-GE"/>
+        </w:rPr>
+        <w:t xml:space="preserve"> ავტორის ხელმოწერა: </w:t>
+      </w:r>
+      <w:r>
+        <w:rPr>
+          <w:szCs w:val="24"/>
+          <w:lang w:val="ka-GE"/>
+        </w:rPr>
+        <w:t>___________________</w:t>
+      </w:r>
     </w:p>
     <w:p>
       <w:pPr>
@@ -933,178 +925,13 @@
         <w:ind w:firstLine="454"/>
         <w:jc w:val="left"/>
         <w:rPr>
-          <w:szCs w:val="24"/>
           <w:lang w:val="ka-GE"/>
         </w:rPr>
       </w:pPr>
-      <w:r>
-        <w:rPr>
-          <w:szCs w:val="24"/>
-          <w:lang w:val="ka-GE"/>
-        </w:rPr>
-        <w:t>„ინდივიდუალური პიროვნების ან ინსტიტუტების მიერ ზემოთმოყვანილი დასახელების სამაგისტრო ნაშრომის გაცნობის მიზნით მოთხოვნის შემთხვევაში მისი არაკომერციული მიზნებით კოპირებისა და გავრცელების უფლება მინიჭებული აქვს საქართველოს ტექნიკურ უნივერსიტეტს“.</w:t>
-      </w:r>
-    </w:p>
-    <w:p>
-      <w:pPr>
-        <w:spacing w:after="0" w:line="360" w:lineRule="auto"/>
-        <w:ind w:firstLine="454"/>
-        <w:jc w:val="left"/>
-        <w:rPr>
-          <w:szCs w:val="24"/>
-          <w:lang w:val="ka-GE"/>
-        </w:rPr>
-      </w:pPr>
-      <w:r>
-        <w:rPr>
-          <w:szCs w:val="24"/>
-          <w:lang w:val="ka-GE"/>
-        </w:rPr>
-        <w:t>„ავტორი ინარჩუნებს დანარჩენ საგამომცემლო უფლებებს და არც მთლიანი ნაშრომის და არც მისი ცალკეული კომპონენტების გადაბეჭდვა ან სხვა რაიმე მეთოდით რეპროდუქცია დაუშვებელია ავტორის წერილობითი ნებართვის გარეშე. ავტორი ირწმუნება, რომ ნაშრომში გამოყენებული საავტორო უფლებებით დაცულ მასალებზე მიღებულია შესაბამისი ნებართვა (გარდა იმ მცირე ზომის ციტატებისა, რომლებიც მოითხოვენ მხოლოდ სპეციფიურ მიმართებას ლიტერატურის ციტირებაში, როგორც ეს მიღებულია სამეცნიერო ნაშრომების შესრულებისას) და ყველა მათგანზე იღებს პასუხისმგებლობას“.</w:t>
-      </w:r>
-    </w:p>
-    <w:p>
-      <w:pPr>
-        <w:spacing w:after="0" w:line="360" w:lineRule="auto"/>
-        <w:ind w:firstLine="454"/>
-        <w:rPr>
-          <w:szCs w:val="24"/>
-          <w:lang w:val="ka-GE"/>
-        </w:rPr>
-      </w:pPr>
-    </w:p>
-    <w:p>
-      <w:pPr>
-        <w:spacing w:after="0" w:line="360" w:lineRule="auto"/>
-        <w:ind w:firstLine="454"/>
-        <w:rPr>
-          <w:szCs w:val="24"/>
-          <w:lang w:val="ka-GE"/>
-        </w:rPr>
-      </w:pPr>
-      <w:r>
-        <w:rPr>
-          <w:szCs w:val="24"/>
-          <w:lang w:val="ka-GE"/>
-        </w:rPr>
-        <w:t xml:space="preserve">                          </w:t>
-      </w:r>
-    </w:p>
-    <w:p>
-      <w:pPr>
-        <w:spacing w:after="0" w:line="360" w:lineRule="auto"/>
-        <w:ind w:firstLine="454"/>
-        <w:rPr>
-          <w:szCs w:val="24"/>
-          <w:lang w:val="ka-GE"/>
-        </w:rPr>
-      </w:pPr>
-    </w:p>
-    <w:p>
-      <w:pPr>
-        <w:spacing w:after="0" w:line="360" w:lineRule="auto"/>
-        <w:ind w:firstLine="454"/>
-        <w:rPr>
-          <w:szCs w:val="24"/>
-          <w:lang w:val="ka-GE"/>
-        </w:rPr>
-      </w:pPr>
-    </w:p>
-    <w:p>
-      <w:pPr>
-        <w:spacing w:after="0" w:line="360" w:lineRule="auto"/>
-        <w:ind w:firstLine="454"/>
-        <w:rPr>
-          <w:szCs w:val="24"/>
-          <w:lang w:val="ka-GE"/>
-        </w:rPr>
-      </w:pPr>
-    </w:p>
-    <w:p>
-      <w:pPr>
-        <w:spacing w:after="0" w:line="360" w:lineRule="auto"/>
-        <w:ind w:firstLine="454"/>
-        <w:rPr>
-          <w:szCs w:val="24"/>
-          <w:lang w:val="ka-GE"/>
-        </w:rPr>
-      </w:pPr>
-    </w:p>
-    <w:p>
-      <w:pPr>
-        <w:spacing w:after="0" w:line="360" w:lineRule="auto"/>
-        <w:ind w:firstLine="454"/>
-        <w:rPr>
-          <w:szCs w:val="24"/>
-          <w:lang w:val="ka-GE"/>
-        </w:rPr>
-      </w:pPr>
-    </w:p>
-    <w:p>
-      <w:pPr>
-        <w:spacing w:after="0" w:line="360" w:lineRule="auto"/>
-        <w:ind w:firstLine="454"/>
-        <w:rPr>
-          <w:szCs w:val="24"/>
-          <w:lang w:val="ka-GE"/>
-        </w:rPr>
-      </w:pPr>
-    </w:p>
-    <w:p>
-      <w:pPr>
-        <w:spacing w:after="0" w:line="360" w:lineRule="auto"/>
-        <w:ind w:firstLine="454"/>
-        <w:rPr>
-          <w:szCs w:val="24"/>
-          <w:lang w:val="ka-GE"/>
-        </w:rPr>
-      </w:pPr>
-    </w:p>
-    <w:p>
-      <w:pPr>
-        <w:spacing w:after="0" w:line="360" w:lineRule="auto"/>
-        <w:ind w:firstLine="454"/>
-        <w:rPr>
-          <w:szCs w:val="24"/>
-          <w:lang w:val="ka-GE"/>
-        </w:rPr>
-      </w:pPr>
-      <w:r>
-        <w:rPr>
-          <w:szCs w:val="24"/>
-          <w:lang w:val="ka-GE"/>
-        </w:rPr>
-        <w:t xml:space="preserve"> ავტორის ხელმოწერა: </w:t>
-      </w:r>
-      <w:r>
-        <w:rPr>
-          <w:szCs w:val="24"/>
-          <w:lang w:val="ka-GE"/>
-        </w:rPr>
-        <w:t>___________________</w:t>
-      </w:r>
-    </w:p>
-    <w:p>
-      <w:pPr>
-        <w:rPr>
-          <w:sz w:val="28"/>
-          <w:szCs w:val="24"/>
-          <w:lang w:val="ka-GE"/>
-        </w:rPr>
-      </w:pPr>
-      <w:bookmarkStart w:id="3" w:name="_Toc108177713"/>
-      <w:bookmarkStart w:id="4" w:name="_Hlk108034897"/>
-      <w:r>
-        <w:rPr>
-          <w:sz w:val="28"/>
-          <w:szCs w:val="24"/>
-          <w:lang w:val="ka-GE"/>
-        </w:rPr>
-        <w:br w:type="page"/>
-      </w:r>
-    </w:p>
-    <w:p>
-      <w:pPr>
+    </w:p>
+    <w:p>
+      <w:pPr>
+        <w:pageBreakBefore/>
         <w:spacing w:line="240" w:lineRule="auto"/>
         <w:jc w:val="center"/>
         <w:rPr>
@@ -1211,29 +1038,10 @@
         <w:t>საკვანძო სიტყვები: საუბრული ხელოვნური ინტელექტი, გრძელვადიანი მეხსიერება, ადამიანის მეხსიერების მოდელები, სოციალური თანდასწრება, ხმოვანი თანამოსაუბრე, შეფასების მეთოდოლოგია.</w:t>
       </w:r>
     </w:p>
-    <w:p>
-      <w:pPr>
-        <w:spacing w:after="0" w:line="240" w:lineRule="auto"/>
-        <w:ind w:firstLine="454"/>
-        <w:jc w:val="left"/>
-        <w:rPr>
-          <w:szCs w:val="24"/>
-          <w:lang w:val="ka-GE"/>
-        </w:rPr>
-      </w:pPr>
-      <w:bookmarkStart w:id="5" w:name="_Hlk108034953"/>
-      <w:bookmarkEnd w:id="4"/>
-      <w:r>
-        <w:rPr>
-          <w:szCs w:val="24"/>
-          <w:lang w:val="ka-GE"/>
-        </w:rPr>
-        <w:br w:type="page"/>
-      </w:r>
-    </w:p>
     <w:bookmarkEnd w:id="5"/>
     <w:p>
       <w:pPr>
+        <w:pageBreakBefore/>
         <w:spacing w:after="0" w:line="240" w:lineRule="auto"/>
         <w:jc w:val="center"/>
         <w:rPr>
@@ -1335,21 +1143,8 @@
     </w:p>
     <w:p>
       <w:pPr>
-        <w:spacing w:line="240" w:lineRule="auto"/>
-        <w:rPr>
-          <w:szCs w:val="24"/>
-        </w:rPr>
-      </w:pPr>
-      <w:r>
-        <w:rPr>
-          <w:szCs w:val="24"/>
-        </w:rPr>
-        <w:br w:type="page"/>
-      </w:r>
-    </w:p>
-    <w:p>
-      <w:pPr>
         <w:pStyle w:val="TOCHeading"/>
+        <w:pageBreakBefore/>
         <w:spacing w:line="360" w:lineRule="auto"/>
         <w:jc w:val="center"/>
         <w:rPr>
@@ -1403,7 +1198,7 @@
           <w:rFonts w:ascii="Sylfaen" w:hAnsi="Sylfaen"/>
           <w:sz w:val="24"/>
         </w:rPr>
-        <w:t>?</w:t>
+        <w:t>10</w:t>
       </w:r>
     </w:p>
     <w:p>
@@ -1433,7 +1228,7 @@
           <w:rFonts w:ascii="Sylfaen" w:hAnsi="Sylfaen"/>
           <w:sz w:val="24"/>
         </w:rPr>
-        <w:t>?</w:t>
+        <w:t>16</w:t>
       </w:r>
     </w:p>
     <w:p>
@@ -1463,7 +1258,7 @@
           <w:rFonts w:ascii="Sylfaen" w:hAnsi="Sylfaen"/>
           <w:sz w:val="24"/>
         </w:rPr>
-        <w:t>?</w:t>
+        <w:t>16</w:t>
       </w:r>
     </w:p>
     <w:p>
@@ -1493,7 +1288,7 @@
           <w:rFonts w:ascii="Sylfaen" w:hAnsi="Sylfaen"/>
           <w:sz w:val="24"/>
         </w:rPr>
-        <w:t>?</w:t>
+        <w:t>16</w:t>
       </w:r>
     </w:p>
     <w:p>
@@ -1523,7 +1318,7 @@
           <w:rFonts w:ascii="Sylfaen" w:hAnsi="Sylfaen"/>
           <w:sz w:val="24"/>
         </w:rPr>
-        <w:t>?</w:t>
+        <w:t>19</w:t>
       </w:r>
     </w:p>
     <w:p>
@@ -1553,7 +1348,7 @@
           <w:rFonts w:ascii="Sylfaen" w:hAnsi="Sylfaen"/>
           <w:sz w:val="24"/>
         </w:rPr>
-        <w:t>?</w:t>
+        <w:t>22</w:t>
       </w:r>
     </w:p>
     <w:p>
@@ -1583,7 +1378,7 @@
           <w:rFonts w:ascii="Sylfaen" w:hAnsi="Sylfaen"/>
           <w:sz w:val="24"/>
         </w:rPr>
-        <w:t>?</w:t>
+        <w:t>24</w:t>
       </w:r>
     </w:p>
     <w:p>
@@ -1613,7 +1408,7 @@
           <w:rFonts w:ascii="Sylfaen" w:hAnsi="Sylfaen"/>
           <w:sz w:val="24"/>
         </w:rPr>
-        <w:t>?</w:t>
+        <w:t>25</w:t>
       </w:r>
     </w:p>
     <w:p>
@@ -1643,7 +1438,7 @@
           <w:rFonts w:ascii="Sylfaen" w:hAnsi="Sylfaen"/>
           <w:sz w:val="24"/>
         </w:rPr>
-        <w:t>?</w:t>
+        <w:t>27</w:t>
       </w:r>
     </w:p>
     <w:p>
@@ -1673,7 +1468,7 @@
           <w:rFonts w:ascii="Sylfaen" w:hAnsi="Sylfaen"/>
           <w:sz w:val="24"/>
         </w:rPr>
-        <w:t>?</w:t>
+        <w:t>28</w:t>
       </w:r>
     </w:p>
     <w:p>
@@ -1703,7 +1498,7 @@
           <w:rFonts w:ascii="Sylfaen" w:hAnsi="Sylfaen"/>
           <w:sz w:val="24"/>
         </w:rPr>
-        <w:t>?</w:t>
+        <w:t>30</w:t>
       </w:r>
     </w:p>
     <w:p>
@@ -1733,7 +1528,7 @@
           <w:rFonts w:ascii="Sylfaen" w:hAnsi="Sylfaen"/>
           <w:sz w:val="24"/>
         </w:rPr>
-        <w:t>?</w:t>
+        <w:t>30</w:t>
       </w:r>
     </w:p>
     <w:p>
@@ -1763,7 +1558,7 @@
           <w:rFonts w:ascii="Sylfaen" w:hAnsi="Sylfaen"/>
           <w:sz w:val="24"/>
         </w:rPr>
-        <w:t>?</w:t>
+        <w:t>32</w:t>
       </w:r>
     </w:p>
     <w:p>
@@ -1793,7 +1588,7 @@
           <w:rFonts w:ascii="Sylfaen" w:hAnsi="Sylfaen"/>
           <w:sz w:val="24"/>
         </w:rPr>
-        <w:t>?</w:t>
+        <w:t>37</w:t>
       </w:r>
     </w:p>
     <w:p>
@@ -1823,7 +1618,7 @@
           <w:rFonts w:ascii="Sylfaen" w:hAnsi="Sylfaen"/>
           <w:sz w:val="24"/>
         </w:rPr>
-        <w:t>?</w:t>
+        <w:t>40</w:t>
       </w:r>
     </w:p>
     <w:p>
@@ -1853,7 +1648,7 @@
           <w:rFonts w:ascii="Sylfaen" w:hAnsi="Sylfaen"/>
           <w:sz w:val="24"/>
         </w:rPr>
-        <w:t>?</w:t>
+        <w:t>42</w:t>
       </w:r>
     </w:p>
     <w:p>
@@ -1883,7 +1678,7 @@
           <w:rFonts w:ascii="Sylfaen" w:hAnsi="Sylfaen"/>
           <w:sz w:val="24"/>
         </w:rPr>
-        <w:t>?</w:t>
+        <w:t>45</w:t>
       </w:r>
     </w:p>
     <w:p>
@@ -1913,7 +1708,7 @@
           <w:rFonts w:ascii="Sylfaen" w:hAnsi="Sylfaen"/>
           <w:sz w:val="24"/>
         </w:rPr>
-        <w:t>?</w:t>
+        <w:t>47</w:t>
       </w:r>
     </w:p>
     <w:p>
@@ -1943,7 +1738,7 @@
           <w:rFonts w:ascii="Sylfaen" w:hAnsi="Sylfaen"/>
           <w:sz w:val="24"/>
         </w:rPr>
-        <w:t>?</w:t>
+        <w:t>48</w:t>
       </w:r>
     </w:p>
     <w:p>
@@ -1973,7 +1768,7 @@
           <w:rFonts w:ascii="Sylfaen" w:hAnsi="Sylfaen"/>
           <w:sz w:val="24"/>
         </w:rPr>
-        <w:t>?</w:t>
+        <w:t>51</w:t>
       </w:r>
     </w:p>
     <w:p>
@@ -2003,7 +1798,7 @@
           <w:rFonts w:ascii="Sylfaen" w:hAnsi="Sylfaen"/>
           <w:sz w:val="24"/>
         </w:rPr>
-        <w:t>?</w:t>
+        <w:t>51</w:t>
       </w:r>
     </w:p>
     <w:p>
@@ -2033,7 +1828,7 @@
           <w:rFonts w:ascii="Sylfaen" w:hAnsi="Sylfaen"/>
           <w:sz w:val="24"/>
         </w:rPr>
-        <w:t>?</w:t>
+        <w:t>52</w:t>
       </w:r>
     </w:p>
     <w:p>
@@ -2063,7 +1858,7 @@
           <w:rFonts w:ascii="Sylfaen" w:hAnsi="Sylfaen"/>
           <w:sz w:val="24"/>
         </w:rPr>
-        <w:t>?</w:t>
+        <w:t>54</w:t>
       </w:r>
     </w:p>
     <w:p>
@@ -2093,7 +1888,7 @@
           <w:rFonts w:ascii="Sylfaen" w:hAnsi="Sylfaen"/>
           <w:sz w:val="24"/>
         </w:rPr>
-        <w:t>?</w:t>
+        <w:t>56</w:t>
       </w:r>
     </w:p>
     <w:p>
@@ -2123,7 +1918,7 @@
           <w:rFonts w:ascii="Sylfaen" w:hAnsi="Sylfaen"/>
           <w:sz w:val="24"/>
         </w:rPr>
-        <w:t>?</w:t>
+        <w:t>57</w:t>
       </w:r>
     </w:p>
     <w:p>
@@ -2153,7 +1948,7 @@
           <w:rFonts w:ascii="Sylfaen" w:hAnsi="Sylfaen"/>
           <w:sz w:val="24"/>
         </w:rPr>
-        <w:t>?</w:t>
+        <w:t>59</w:t>
       </w:r>
     </w:p>
     <w:p>
@@ -2183,7 +1978,7 @@
           <w:rFonts w:ascii="Sylfaen" w:hAnsi="Sylfaen"/>
           <w:sz w:val="24"/>
         </w:rPr>
-        <w:t>?</w:t>
+        <w:t>59</w:t>
       </w:r>
     </w:p>
     <w:p>
@@ -2213,7 +2008,7 @@
           <w:rFonts w:ascii="Sylfaen" w:hAnsi="Sylfaen"/>
           <w:sz w:val="24"/>
         </w:rPr>
-        <w:t>?</w:t>
+        <w:t>60</w:t>
       </w:r>
     </w:p>
     <w:p>
@@ -2243,7 +2038,7 @@
           <w:rFonts w:ascii="Sylfaen" w:hAnsi="Sylfaen"/>
           <w:sz w:val="24"/>
         </w:rPr>
-        <w:t>?</w:t>
+        <w:t>60</w:t>
       </w:r>
     </w:p>
     <w:p>
@@ -2273,28 +2068,12 @@
           <w:rFonts w:ascii="Sylfaen" w:hAnsi="Sylfaen"/>
           <w:sz w:val="24"/>
         </w:rPr>
-        <w:t>?</w:t>
-      </w:r>
-    </w:p>
-    <w:p>
-      <w:pPr>
-        <w:rPr>
-          <w:sz w:val="28"/>
-          <w:szCs w:val="28"/>
-          <w:lang w:val="ka-GE"/>
-        </w:rPr>
-      </w:pPr>
-      <w:r>
-        <w:rPr>
-          <w:sz w:val="28"/>
-          <w:szCs w:val="28"/>
-          <w:lang w:val="ka-GE"/>
-        </w:rPr>
-        <w:br w:type="page"/>
-      </w:r>
-    </w:p>
-    <w:p>
-      <w:pPr>
+        <w:t>62</w:t>
+      </w:r>
+    </w:p>
+    <w:p>
+      <w:pPr>
+        <w:pageBreakBefore/>
         <w:spacing w:after="0" w:line="360" w:lineRule="auto"/>
         <w:jc w:val="center"/>
         <w:rPr>
@@ -2319,23 +2098,40 @@
     </w:p>
     <w:p>
       <w:pPr>
+        <w:spacing w:after="0" w:line="360" w:lineRule="auto"/>
+        <w:jc w:val="left"/>
         <w:rPr>
           <w:sz w:val="28"/>
           <w:szCs w:val="28"/>
           <w:lang w:val="ka-GE"/>
         </w:rPr>
       </w:pPr>
-      <w:r>
+    </w:p>
+    <w:p>
+      <w:pPr>
+        <w:spacing w:after="0" w:line="360" w:lineRule="auto"/>
+        <w:jc w:val="left"/>
         <w:rPr>
           <w:sz w:val="28"/>
           <w:szCs w:val="28"/>
           <w:lang w:val="ka-GE"/>
         </w:rPr>
-        <w:br w:type="page"/>
-      </w:r>
-    </w:p>
-    <w:p>
-      <w:pPr>
+      </w:pPr>
+    </w:p>
+    <w:p>
+      <w:pPr>
+        <w:spacing w:after="0" w:line="360" w:lineRule="auto"/>
+        <w:jc w:val="left"/>
+        <w:rPr>
+          <w:sz w:val="28"/>
+          <w:szCs w:val="28"/>
+          <w:lang w:val="ka-GE"/>
+        </w:rPr>
+      </w:pPr>
+    </w:p>
+    <w:p>
+      <w:pPr>
+        <w:pageBreakBefore/>
         <w:spacing w:after="0" w:line="360" w:lineRule="auto"/>
         <w:jc w:val="center"/>
         <w:rPr>
@@ -7193,9 +6989,8 @@
     <w:sectPr>
       <w:pgSz w:w="11906" w:h="16838" w:code="9"/>
       <w:pgMar w:top="1417" w:right="1417" w:bottom="1417" w:left="2154" w:header="720" w:footer="720" w:gutter="0"/>
-      <w:pgNumType w:start="0"/>
+      <w:pgNumType w:start="1"/>
       <w:cols w:space="720"/>
-      <w:titlePg/>
       <w:docGrid w:linePitch="360"/>
     </w:sectPr>
   </w:body>

</xml_diff>

<commit_message>
feat(thesis): per-run language tags + clickable bibliography links
- set_language(): tag each run in its actual script (Georgian ka-GE,
  Latin en-US) so Word / Word-for-web proof each language against its own
  dictionary instead of red-squiggling one as misspellings of the other.
  Default flipped to ka-GE; 366 ka-GE + 47 en-US runs tagged.
- linkify_bibliography(): wrap every arXiv id and DOI in a real clickable
  hyperlink (blue + underline); wording untouched, idempotent (27 links).
- both wired into main() so they re-apply on every /format-thesis run.

Co-Authored-By: Claude Opus 4.8 (1M context) <noreply@anthropic.com>
</commit_message>
<xml_diff>
--- a/project/thesis-ka.docx
+++ b/project/thesis-ka.docx
@@ -58,6 +58,7 @@
           <w:rFonts w:ascii="Sylfaen" w:hAnsi="Sylfaen" w:cs="Sylfaen"/>
           <w:b/>
           <w:sz w:val="24"/>
+          <w:lang w:val="ka-GE"/>
         </w:rPr>
         <w:t>ალექსანდრე იმნაიშვილი</w:t>
       </w:r>
@@ -78,6 +79,7 @@
           <w:rFonts w:ascii="Sylfaen" w:hAnsi="Sylfaen" w:cs="Sylfaen"/>
           <w:b/>
           <w:sz w:val="32"/>
+          <w:lang w:val="ka-GE"/>
         </w:rPr>
         <w:t>სასაუბრო ხელოვნური ინტელექტი: ასისტენტიდან თანამოსაუბრემდე ევოლუცია</w:t>
       </w:r>
@@ -98,6 +100,7 @@
           <w:rFonts w:ascii="Sylfaen" w:hAnsi="Sylfaen" w:cs="Sylfaen"/>
           <w:b/>
           <w:sz w:val="28"/>
+          <w:lang w:val="ka-GE"/>
         </w:rPr>
         <w:t>შიფრი: 0163</w:t>
       </w:r>
@@ -124,6 +127,7 @@
           <w:rFonts w:ascii="Sylfaen" w:hAnsi="Sylfaen" w:cs="Sylfaen"/>
           <w:b w:val="0"/>
           <w:sz w:val="24"/>
+          <w:lang w:val="ka-GE"/>
         </w:rPr>
         <w:t>საქართველოს ტექნიკური უნივერსიტეტი</w:t>
       </w:r>
@@ -138,6 +142,7 @@
           <w:rFonts w:ascii="Sylfaen" w:hAnsi="Sylfaen" w:cs="Sylfaen"/>
           <w:b w:val="0"/>
           <w:sz w:val="24"/>
+          <w:lang w:val="ka-GE"/>
         </w:rPr>
         <w:t>თბილისი, 0160, საქართველო</w:t>
       </w:r>
@@ -152,6 +157,7 @@
           <w:rFonts w:ascii="Sylfaen" w:hAnsi="Sylfaen" w:cs="Sylfaen"/>
           <w:b w:val="0"/>
           <w:sz w:val="24"/>
+          <w:lang w:val="ka-GE"/>
         </w:rPr>
         <w:t>ივლისი, 2026 წელი</w:t>
       </w:r>
@@ -965,6 +971,7 @@
           <w:rFonts w:ascii="Sylfaen" w:hAnsi="Sylfaen" w:cs="Sylfaen"/>
           <w:b w:val="0"/>
           <w:sz w:val="24"/>
+          <w:lang w:val="ka-GE"/>
         </w:rPr>
         <w:t>დიდი ენობრივი მოდელების საფუძველზე შექმნილი საუბრის სისტემები ერთ სესიაზე ადამიანის დონის თავისუფლებას აღწევენ, მაგრამ სესიებს შორის ვერ ინარჩუნებენ უწყვეტ, განვითარებად ურთიერთობას, რადგან მათ არ გააჩნიათ მდგრადი გრძელვადიანი მეხსიერება. გრძელვადიანი მეხსიერების ბენჩმარკებისა და ეგრეთ წოდებული "კომპანიონი" აპლიკაციების მომხმარებლების მონაცემები მიუთითებს, რომ ეს წარუმატებლობა არის როგორც ტექნიკური — მოდელები ადამიანის მეხსიერებას მნიშვნელოვნად ჩამორჩებიან, განსაკუთრებით დროითი (ტემპორალური) მსჯელობისას — ასევე ურთიერთობრივი, რადგან მეხსიერების დეფექტები და იდენტობის მკვეთრი შეწყვეტა დოკუმენტურად არღვევს მომხმარებლის მიერ აღქმულ ურთიერთობას. თუმცა, პრობლემასთან დაკავშირებული ორი დისციპლინა განცალკევებით არსებობს: მეხსიერების არქიტექტურები შეფასდება ფაქტობრივი სიზუსტის კრიტერიუმებით, მაშინ როდესაც ურთიერთობის აღქმის კვლევები მეხსიერებას განიხილავენ, როგორც ერთჯერად ჩართვა-გამორთვას ერთი სისტემის ფარგლებში. ჩვენთვის ხელმისაწვდომ ლიტერატურაში არ არსებობს არც ერთი კონტროლირებადი კვლევა, რომელიც სხვადასხვა ადამიანური მეხსიერების თეორიაზე დაფუძნებული მეხსიერების არქიტექტურების შედარებას ახდენს მომხმარებლის მიერ აღქმული სოციალური კონსტრუქტების მიხედვით და არც ერთი მათგანი არ ათავსებს ასეთ შედარებას ხმოვან მოდალობაში.</w:t>
       </w:r>
@@ -979,6 +986,7 @@
           <w:rFonts w:ascii="Sylfaen" w:hAnsi="Sylfaen" w:cs="Sylfaen"/>
           <w:b w:val="0"/>
           <w:sz w:val="24"/>
+          <w:lang w:val="ka-GE"/>
         </w:rPr>
         <w:t>ეს ნაშრომი ამ ხარვეზს დიზაინის, იმპლემენტაციისა და შეფასების მეთოდოლოგიის მეშვეობით ავსებს. ის წარმოადგენს Profile C-ს, ხმოვანი თანამოსაუბრის გრძელვადიანი მეხსიერების არქიტექტურას, რომელიც აერთიანებს ხუთ კოგნიტურ-მეხსიერების თეორიას — ატკინსონ-შიფრინის მრავალსაცავიანი მოდელი, ებინგჰაუსის დავიწყების მრუდი, ტულვინგის ეპიზოდურ-სემანტიკური განასხვავება, ბუნდოვანი კვალით თეორია და დამატებითი სასწავლო სისტემების ჩარჩო — ერთ სასიცოცხლო ციკლში: მნიშვნელობისმიღწევით კონტროლირებადი კოდირება, არსებითი ნაწილისა და ორიენტირის წარმოდგენა, გაჭიანურებული ებინგჰაუსის დაშლა დროში გადანაწილებული გამეორებით გაძლიერებისას, ოფლაინ ეპიზოდურიდან სემანტიკურზე კონსოლიდაცია და არსებითი ნაწილის მიხედვით მოძიება. თითოეული მექანიზმი დაკავშირებულია დასაკვირვებელ ქცევით ხელმოწერასთან და არა ფსიქოლოგიური სიზუსტის მტკიცებასთან.</w:t>
       </w:r>
@@ -993,6 +1001,7 @@
           <w:rFonts w:ascii="Sylfaen" w:hAnsi="Sylfaen" w:cs="Sylfaen"/>
           <w:b w:val="0"/>
           <w:sz w:val="24"/>
+          <w:lang w:val="ka-GE"/>
         </w:rPr>
         <w:t>მთავარი მეთოდოლოგიური წვლილი კურატორირებაზე კონტროლირებადი ექსპერიმენტული დიზაინია. პროფილი C შედარებულია არა მხოლოდ უმეხსიერებო საწყისთან (A) და სიტყვასიტყვითი აღდგენით გაძლიერებულ მეხსიერებასთან (B), არამედ აქტიურ კონტროლთან, B+, რომელიც იღებს იმავე ოფლაინ ენობრივი მოდელის აზრთა არსის გამოყოფასა და გაწმენდას, რასაც C, მაგრამ არ იღებს ადამიანის მეხსიერების დინამიკის არცერთ ელემენტს — არც გახუნებას, არც მნიშვნელოვნების კარიბჭეს, არც კონსოლიდაციას. რადგან პირობებს ერთნაირი, ანალიზის დროის ჩარჩო აქვთ, B+ კონტროლი გამოყოფს ადამიანის მეხსიერების დინამიკის ეფექტს ენობრივი მოდელის კურატორირებით მიღებული ზოგადი წაკითხვადობის გაუმჯობესებისგან — იმ არეულობისგან, რომელიც სხვა შემთხვევაში "ადამიანის მსგავსი" მეხსიერების ნებისმიერ უპირატესობას გაუგებარს გახდიდა. ა-პრიორი ძალის ანალიზი აჩვენებს, რომ მიღებული ცენტრალური კონტრასტი, C B+-თან შედარებით, თავისი კონსტრუქციით, დიზაინში ყველაზე მცირე ეფექტია და არდასტურდება ამ კლასის კვლევისთვის ნორმატიული ნიმუშების რაოდენობით; შესაბამისად, ის წინასწარ არის რეგისტრირებული, როგორც შეფასების სამიზნე, და ზუსტად შეფასებული ნული ითვლება არსებით შედეგად, რომლის ინტერპრეტაციაც B+ კონტროლის მიერ მიზანმიმართულად იქნა უზრუნველყოფილი.</w:t>
       </w:r>
@@ -1007,6 +1016,7 @@
           <w:rFonts w:ascii="Sylfaen" w:hAnsi="Sylfaen" w:cs="Sylfaen"/>
           <w:b w:val="0"/>
           <w:sz w:val="24"/>
+          <w:lang w:val="ka-GE"/>
         </w:rPr>
         <w:t>კონცეფციის დამტკიცების მექანიზმი მრავალსესიურ დიალოგებზე ყველა ოთხ პირობას ასრულებს და მისი შეფასება ტექნიკური და სიმულირებული მომხმარებლის მიმართულებით ხდება. ტექნიკურად, მექანიზმები ისე მუშაობს, როგორც დაპროექტდა, და ერთმანეთისგან განასხვავებადია: მხოლოდ პროფილი C ივიწყებს გამართულად და სელექციურად — ინარჩუნებს მნიშვნელოვან ფაქტებს, ხოლო უმნიშვნელო ინფორმაცია მივიწყებას მიეცემა — და მხოლოდ C აერთიანებს განმეორებად ეპიზოდებს მდგრად სემანტიკურ ცოდნედ, უფრო მცირე კონტექსტური კვალის ფასად და საბაზისო მაჩვენებლების მსგავსი შეყოვნებით. სიმულაციისას, პროფილი C არ აღემატება B+ კონტროლს არცერთ აღქმულ კონსტრუქტზე, რაც ადასტურებს პროგნოზს, რომ ადამიანის მეხსიერების დინამიკა სუფთა კურირებასთან შედარებით აღქმის მცირე დამატებით მარჟინს ქმნის. რაც ყველაზე მნიშვნელოვანია, იმ ერთ კონსტრუქტზე, რომელზეც ადამიანის გავლენა ძლიერი და გამეორებული იყო — სიტყვასიტყვითი გახსენების ინტრუზიულობა — სიმულაციურმა მსაჯულმა ადამიანთა ლიტერატურისგან საპირისპირო დალაგება წარმოადგინა, რითაც აჩვენა, რომ ენობრივი მოდელის მსაჯული ვერ ჩაანაცვლებს ადამიანის აღქმას მნიშვნელოვან შედეგებზე დამოკიდებულ კონსტრუქტებზე და, ამგვარად, დაამტკიცა ადამიანთა მონაწილეობით კვლევის აუცილებლობა, რომელსაც ნაშრომი სრულად განსაზღვრავს, როგორც მომავალ სამუშაოს.</w:t>
       </w:r>
@@ -1021,6 +1031,7 @@
           <w:rFonts w:ascii="Sylfaen" w:hAnsi="Sylfaen" w:cs="Sylfaen"/>
           <w:b w:val="0"/>
           <w:sz w:val="24"/>
+          <w:lang w:val="ka-GE"/>
         </w:rPr>
         <w:t>ნაშრომი წარმოადგენს კოგნიტურ-საფუძვლიან მეხსიერების არქიტექტურას, მეხსიერების დინამიკის კურატორირებული შინაარსისგან გამიჯვნის ხელახლა გამოყენებად მეთოდოლოგიას და ემპირიულ კონცეფციის დამამტკიცებელ მტკიცებულებას ორივესთვის — რაც ადამიანზე ორიენტირებულ შეფასებას წარმოაჩენს, როგორც მკაცრ, წინასწარ რეგისტრირებულ სამომავლო სამუშაოს.</w:t>
       </w:r>
@@ -1034,6 +1045,7 @@
           <w:rFonts w:ascii="Sylfaen" w:hAnsi="Sylfaen" w:cs="Sylfaen"/>
           <w:b w:val="0"/>
           <w:sz w:val="24"/>
+          <w:lang w:val="ka-GE"/>
         </w:rPr>
         <w:t>საკვანძო სიტყვები: საუბრული ხელოვნური ინტელექტი, გრძელვადიანი მეხსიერება, ადამიანის მეხსიერების მოდელები, სოციალური თანდასწრება, ხმოვანი თანამოსაუბრე, შეფასების მეთოდოლოგია.</w:t>
       </w:r>
@@ -1053,6 +1065,7 @@
         <w:rPr>
           <w:sz w:val="28"/>
           <w:szCs w:val="28"/>
+          <w:lang w:val="en-US"/>
         </w:rPr>
         <w:lastRenderedPageBreak/>
         <w:t>Abstract</w:t>
@@ -1068,6 +1081,7 @@
           <w:rFonts w:ascii="Sylfaen" w:hAnsi="Sylfaen" w:cs="Sylfaen"/>
           <w:b w:val="0"/>
           <w:sz w:val="24"/>
+          <w:lang w:val="en-US"/>
         </w:rPr>
         <w:t>Conversational systems built on large language models achieve human-comparable fluency within a single session but fail to sustain a continuous, evolving relationship across sessions, because they lack durable long-term memory. Evidence from long-term-memory benchmarks and from users of so-called "companion" applications indicates that this failure is both technical — models lag human recall by wide margins, worst of all on temporal reasoning — and relational, in that memory failure and abrupt identity discontinuity are documented to break a user's sense of relationship. Yet the two literatures that bear on the problem remain separate: memory architectures are evaluated on factual-accuracy metrics, while studies of perceived relationship treat memory as a single on/off manipulation on one system. In the literature available to us, no controlled study compares memory architectures grounded in different human-memory theories with respect to user-perceived social constructs, and none situates such a comparison in the voice modality.</w:t>
       </w:r>
@@ -1082,6 +1096,7 @@
           <w:rFonts w:ascii="Sylfaen" w:hAnsi="Sylfaen" w:cs="Sylfaen"/>
           <w:b w:val="0"/>
           <w:sz w:val="24"/>
+          <w:lang w:val="en-US"/>
         </w:rPr>
         <w:t>This thesis addresses that gap through design, implementation, and evaluation methodology. It presents Profile C, a long-term memory architecture for a voice interlocutor that composes five cognitive-memory theories — the Atkinson–Shiffrin multi-store model, the Ebbinghaus forgetting curve, Tulving's episodic–semantic distinction, fuzzy-trace theory, and the complementary learning systems framework — into one lifecycle: salience-gated encoding, gist-and-anchor representation, lazy Ebbinghaus decay with spaced-repetition reinforcement, offline episodic-to-semantic consolidation, and gist-first retrieval. Each mechanism is tied to an observable behavioral signature rather than to a claim of psychological fidelity.</w:t>
       </w:r>
@@ -1096,6 +1111,7 @@
           <w:rFonts w:ascii="Sylfaen" w:hAnsi="Sylfaen" w:cs="Sylfaen"/>
           <w:b w:val="0"/>
           <w:sz w:val="24"/>
+          <w:lang w:val="en-US"/>
         </w:rPr>
         <w:t>The central methodological contribution is a curation-controlled experimental design. Profile C is compared not only against a no-memory baseline (A) and verbatim retrieval-augmented memory (B), but against an active control, B+, which receives the same offline language-model gisting and cleanup as C yet none of its human-memory dynamics — no decay, no salience-gating, no consolidation. Because the conditions share an identical inference-time envelope, the B+ control isolates the effect of the human-memory dynamics from the generic legibility gains of language-model curation, the confound that would otherwise render any advantage of a "human-like" memory uninterpretable. An a-priori power analysis shows that the resulting central contrast, C versus B+, is by construction the smallest effect in the design and is not confirmable at the sample size normative for this class of study; it is therefore pre-registered as an estimation target, and a precisely-estimated null is treated as a substantive result that the B+ control was purpose-built to make interpretable.</w:t>
       </w:r>
@@ -1110,6 +1126,7 @@
           <w:rFonts w:ascii="Sylfaen" w:hAnsi="Sylfaen" w:cs="Sylfaen"/>
           <w:b w:val="0"/>
           <w:sz w:val="24"/>
+          <w:lang w:val="en-US"/>
         </w:rPr>
         <w:t>A proof-of-concept harness implements all four conditions over multi-session dialogues and is evaluated on a technical and a simulated-user track. Technically, the mechanisms behave as designed and are distinguishable: only Profile C forgets gracefully and selectively — retaining salient facts while letting trivia fade — and only C consolidates recurring episodes into durable semantic knowledge, at a leaner context footprint and at latency parity with the baselines. In simulation, Profile C does not exceed the B+ control on any perceived construct, corroborating the prediction that human-memory dynamics add little perceptual margin over clean curation. Most consequentially, on the one construct with a strong replicated human effect — the intrusiveness of verbatim recall — the simulated judge produced the opposite ordering to the human literature, demonstrating that a language-model judge cannot substitute for human perception on stakes-dependent constructs, and thereby establishing the necessity of the human-subject study that the thesis fully specifies as future work.</w:t>
       </w:r>
@@ -1124,6 +1141,7 @@
           <w:rFonts w:ascii="Sylfaen" w:hAnsi="Sylfaen" w:cs="Sylfaen"/>
           <w:b w:val="0"/>
           <w:sz w:val="24"/>
+          <w:lang w:val="en-US"/>
         </w:rPr>
         <w:t>The thesis contributes a cognitively-grounded memory architecture, a reusable curation-controlled methodology for separating memory dynamics from curation, and empirical proof-of-concept evidence for both — framing the human-subject evaluation as rigorous, pre-registered future work.</w:t>
       </w:r>
@@ -1137,6 +1155,7 @@
           <w:rFonts w:ascii="Sylfaen" w:hAnsi="Sylfaen" w:cs="Sylfaen"/>
           <w:b w:val="0"/>
           <w:sz w:val="24"/>
+          <w:lang w:val="en-US"/>
         </w:rPr>
         <w:t>Keywords: conversational AI, long-term memory, human memory models, social presence, voice interlocutor, evaluation methodology.</w:t>
       </w:r>
@@ -1183,6 +1202,7 @@
         <w:rPr>
           <w:rFonts w:ascii="Sylfaen" w:hAnsi="Sylfaen"/>
           <w:sz w:val="24"/>
+          <w:lang w:val="ka-GE"/>
         </w:rPr>
         <w:t>1. შესავალი</w:t>
       </w:r>
@@ -1213,6 +1233,7 @@
         <w:rPr>
           <w:rFonts w:ascii="Sylfaen" w:hAnsi="Sylfaen"/>
           <w:sz w:val="24"/>
+          <w:lang w:val="ka-GE"/>
         </w:rPr>
         <w:t>2. ლიტერატურის მიმოხილვა</w:t>
       </w:r>
@@ -1243,6 +1264,7 @@
         <w:rPr>
           <w:rFonts w:ascii="Sylfaen" w:hAnsi="Sylfaen"/>
           <w:sz w:val="24"/>
+          <w:lang w:val="ka-GE"/>
         </w:rPr>
         <w:t>2.1 მიმოხილვის მოცულობა და სტრუქტურა</w:t>
       </w:r>
@@ -1273,6 +1295,7 @@
         <w:rPr>
           <w:rFonts w:ascii="Sylfaen" w:hAnsi="Sylfaen"/>
           <w:sz w:val="24"/>
+          <w:lang w:val="ka-GE"/>
         </w:rPr>
         <w:t>2.2 თეორიული საფუძვლები: ადამიანის მეხსიერების მოდელები</w:t>
       </w:r>
@@ -1303,6 +1326,7 @@
         <w:rPr>
           <w:rFonts w:ascii="Sylfaen" w:hAnsi="Sylfaen"/>
           <w:sz w:val="24"/>
+          <w:lang w:val="ka-GE"/>
         </w:rPr>
         <w:t>2.3 გრძელვადიანი მეხსიერება დიდი ენის მოდელის აგენტებისთვის: სამი ტალღა</w:t>
       </w:r>
@@ -1333,6 +1357,7 @@
         <w:rPr>
           <w:rFonts w:ascii="Sylfaen" w:hAnsi="Sylfaen"/>
           <w:sz w:val="24"/>
+          <w:lang w:val="ka-GE"/>
         </w:rPr>
         <w:t>2.4 ხიდი: მეხსიერების თეორიიდან მეხსიერების არქიტექტურამდე</w:t>
       </w:r>
@@ -1363,6 +1388,7 @@
         <w:rPr>
           <w:rFonts w:ascii="Sylfaen" w:hAnsi="Sylfaen"/>
           <w:sz w:val="24"/>
+          <w:lang w:val="ka-GE"/>
         </w:rPr>
         <w:t>2.5 საუბრის მეხსიერების შეფასება: ბენჩმარკები და მათი შეზღუდვები</w:t>
       </w:r>
@@ -1393,6 +1419,7 @@
         <w:rPr>
           <w:rFonts w:ascii="Sylfaen" w:hAnsi="Sylfaen"/>
           <w:sz w:val="24"/>
+          <w:lang w:val="ka-GE"/>
         </w:rPr>
         <w:t>2.6 ასისტენტიდან თანამოსაუბრემდე: მეხსიერება და აღქმული ურთიერთობა</w:t>
       </w:r>
@@ -1423,6 +1450,7 @@
         <w:rPr>
           <w:rFonts w:ascii="Sylfaen" w:hAnsi="Sylfaen"/>
           <w:sz w:val="24"/>
+          <w:lang w:val="ka-GE"/>
         </w:rPr>
         <w:t>2.7 ღია პრობლემები და შეზღუდვები</w:t>
       </w:r>
@@ -1453,6 +1481,7 @@
         <w:rPr>
           <w:rFonts w:ascii="Sylfaen" w:hAnsi="Sylfaen"/>
           <w:sz w:val="24"/>
+          <w:lang w:val="ka-GE"/>
         </w:rPr>
         <w:t>2.8 ამ ნაშრომის ადგილი</w:t>
       </w:r>
@@ -1483,6 +1512,7 @@
         <w:rPr>
           <w:rFonts w:ascii="Sylfaen" w:hAnsi="Sylfaen"/>
           <w:sz w:val="24"/>
+          <w:lang w:val="ka-GE"/>
         </w:rPr>
         <w:t>3. კვლევის მეთოდები</w:t>
       </w:r>
@@ -1513,6 +1543,7 @@
         <w:rPr>
           <w:rFonts w:ascii="Sylfaen" w:hAnsi="Sylfaen"/>
           <w:sz w:val="24"/>
+          <w:lang w:val="ka-GE"/>
         </w:rPr>
         <w:t>3.1 კვლევის დიზაინი და წვლილი</w:t>
       </w:r>
@@ -1543,6 +1574,7 @@
         <w:rPr>
           <w:rFonts w:ascii="Sylfaen" w:hAnsi="Sylfaen"/>
           <w:sz w:val="24"/>
+          <w:lang w:val="ka-GE"/>
         </w:rPr>
         <w:t>3.2 პროფილი C-ის მეხსიერების არქიტექტურა</w:t>
       </w:r>
@@ -1573,6 +1605,7 @@
         <w:rPr>
           <w:rFonts w:ascii="Sylfaen" w:hAnsi="Sylfaen"/>
           <w:sz w:val="24"/>
+          <w:lang w:val="ka-GE"/>
         </w:rPr>
         <w:t>3.3 ექსპერიმენტული პირობები (A / B / B+ / C)</w:t>
       </w:r>
@@ -1603,6 +1636,7 @@
         <w:rPr>
           <w:rFonts w:ascii="Sylfaen" w:hAnsi="Sylfaen"/>
           <w:sz w:val="24"/>
+          <w:lang w:val="ka-GE"/>
         </w:rPr>
         <w:t>3.4 კონცეფციის დამტკიცების იმპლემენტაცია</w:t>
       </w:r>
@@ -1633,6 +1667,7 @@
         <w:rPr>
           <w:rFonts w:ascii="Sylfaen" w:hAnsi="Sylfaen"/>
           <w:sz w:val="24"/>
+          <w:lang w:val="ka-GE"/>
         </w:rPr>
         <w:t>3.5 შეფასების მეთოდოლოგია</w:t>
       </w:r>
@@ -1663,6 +1698,7 @@
         <w:rPr>
           <w:rFonts w:ascii="Sylfaen" w:hAnsi="Sylfaen"/>
           <w:sz w:val="24"/>
+          <w:lang w:val="ka-GE"/>
         </w:rPr>
         <w:t>3.6 ზომები და ინსტრუმენტები</w:t>
       </w:r>
@@ -1693,6 +1729,7 @@
         <w:rPr>
           <w:rFonts w:ascii="Sylfaen" w:hAnsi="Sylfaen"/>
           <w:sz w:val="24"/>
+          <w:lang w:val="ka-GE"/>
         </w:rPr>
         <w:t>3.7 ანალიზის გეგმა</w:t>
       </w:r>
@@ -1723,6 +1760,7 @@
         <w:rPr>
           <w:rFonts w:ascii="Sylfaen" w:hAnsi="Sylfaen"/>
           <w:sz w:val="24"/>
+          <w:lang w:val="ka-GE"/>
         </w:rPr>
         <w:t>3.8 ეთიკური საკითხები და შეზღუდვები</w:t>
       </w:r>
@@ -1753,6 +1791,7 @@
         <w:rPr>
           <w:rFonts w:ascii="Sylfaen" w:hAnsi="Sylfaen"/>
           <w:sz w:val="24"/>
+          <w:lang w:val="ka-GE"/>
         </w:rPr>
         <w:t>4. შედეგები და განხილვა</w:t>
       </w:r>
@@ -1783,6 +1822,7 @@
         <w:rPr>
           <w:rFonts w:ascii="Sylfaen" w:hAnsi="Sylfaen"/>
           <w:sz w:val="24"/>
+          <w:lang w:val="ka-GE"/>
         </w:rPr>
         <w:t>4.1 კონცეფციის დამტკიცება: მასშტაბი და სიზუსტე</w:t>
       </w:r>
@@ -1813,6 +1853,7 @@
         <w:rPr>
           <w:rFonts w:ascii="Sylfaen" w:hAnsi="Sylfaen"/>
           <w:sz w:val="24"/>
+          <w:lang w:val="ka-GE"/>
         </w:rPr>
         <w:t>4.2 ტექნიკური შედეგები</w:t>
       </w:r>
@@ -1843,6 +1884,7 @@
         <w:rPr>
           <w:rFonts w:ascii="Sylfaen" w:hAnsi="Sylfaen"/>
           <w:sz w:val="24"/>
+          <w:lang w:val="ka-GE"/>
         </w:rPr>
         <w:t>4.3 სიმულირებული აღქმის შედეგები</w:t>
       </w:r>
@@ -1873,6 +1915,7 @@
         <w:rPr>
           <w:rFonts w:ascii="Sylfaen" w:hAnsi="Sylfaen"/>
           <w:sz w:val="24"/>
+          <w:lang w:val="ka-GE"/>
         </w:rPr>
         <w:t>4.4 განხილვა</w:t>
       </w:r>
@@ -1903,6 +1946,7 @@
         <w:rPr>
           <w:rFonts w:ascii="Sylfaen" w:hAnsi="Sylfaen"/>
           <w:sz w:val="24"/>
+          <w:lang w:val="ka-GE"/>
         </w:rPr>
         <w:t>4.5 შეფასების შეზღუდვები</w:t>
       </w:r>
@@ -1933,6 +1977,7 @@
         <w:rPr>
           <w:rFonts w:ascii="Sylfaen" w:hAnsi="Sylfaen"/>
           <w:sz w:val="24"/>
+          <w:lang w:val="ka-GE"/>
         </w:rPr>
         <w:t>5. დასკვნა</w:t>
       </w:r>
@@ -1963,6 +2008,7 @@
         <w:rPr>
           <w:rFonts w:ascii="Sylfaen" w:hAnsi="Sylfaen"/>
           <w:sz w:val="24"/>
+          <w:lang w:val="ka-GE"/>
         </w:rPr>
         <w:t>5.1 წვლილის შეჯამება</w:t>
       </w:r>
@@ -1993,6 +2039,7 @@
         <w:rPr>
           <w:rFonts w:ascii="Sylfaen" w:hAnsi="Sylfaen"/>
           <w:sz w:val="24"/>
+          <w:lang w:val="ka-GE"/>
         </w:rPr>
         <w:t>5.2 შედეგების შეჯამება</w:t>
       </w:r>
@@ -2023,6 +2070,7 @@
         <w:rPr>
           <w:rFonts w:ascii="Sylfaen" w:hAnsi="Sylfaen"/>
           <w:sz w:val="24"/>
+          <w:lang w:val="ka-GE"/>
         </w:rPr>
         <w:t>5.3 სამომავლო სამუშაო</w:t>
       </w:r>
@@ -2053,6 +2101,7 @@
         <w:rPr>
           <w:rFonts w:ascii="Sylfaen" w:hAnsi="Sylfaen"/>
           <w:sz w:val="24"/>
+          <w:lang w:val="ka-GE"/>
         </w:rPr>
         <w:t>ბიბლიოგრაფია</w:t>
       </w:r>
@@ -2159,6 +2208,7 @@
           <w:rFonts w:ascii="Sylfaen" w:hAnsi="Sylfaen" w:cs="Sylfaen"/>
           <w:b w:val="0"/>
           <w:sz w:val="24"/>
+          <w:lang w:val="ka-GE"/>
         </w:rPr>
         <w:t>ცხრილი 2.1. ადამიანის მეხსიერების თეორიები და მათი შესაბამისი LLM-იმპლემენტაციები</w:t>
       </w:r>
@@ -2170,6 +2220,7 @@
           <w:rFonts w:ascii="Sylfaen" w:hAnsi="Sylfaen" w:cs="Sylfaen"/>
           <w:b w:val="0"/>
           <w:sz w:val="24"/>
+          <w:lang w:val="ka-GE"/>
         </w:rPr>
         <w:t>ცხრილი 3.1. აღრევის ფაქტორების კონტროლი ექსპერიმენტულ დიზაინში</w:t>
       </w:r>
@@ -2181,6 +2232,7 @@
           <w:rFonts w:ascii="Sylfaen" w:hAnsi="Sylfaen" w:cs="Sylfaen"/>
           <w:b w:val="0"/>
           <w:sz w:val="24"/>
+          <w:lang w:val="ka-GE"/>
         </w:rPr>
         <w:t>ცხრილი 4.1. კონცეფციის დამტკიცების ერთგულება 3.2-ის სრული არქიტექტურის მიმართ</w:t>
       </w:r>
@@ -2192,6 +2244,7 @@
           <w:rFonts w:ascii="Sylfaen" w:hAnsi="Sylfaen" w:cs="Sylfaen"/>
           <w:b w:val="0"/>
           <w:sz w:val="24"/>
+          <w:lang w:val="ka-GE"/>
         </w:rPr>
         <w:t>ცხრილი 4.2. სესიებს-შორისი გახსენების სიზუსტე პრობის ტიპის მიხედვით</w:t>
       </w:r>
@@ -2203,6 +2256,7 @@
           <w:rFonts w:ascii="Sylfaen" w:hAnsi="Sylfaen" w:cs="Sylfaen"/>
           <w:b w:val="0"/>
           <w:sz w:val="24"/>
+          <w:lang w:val="ka-GE"/>
         </w:rPr>
         <w:t>ცხრილი 4.3. სიმულირებული აღქმის საშუალო შეფასებები კონსტრუქტების მიხედვით</w:t>
       </w:r>
@@ -2234,6 +2288,7 @@
           <w:b/>
           <w:color w:val="000000"/>
           <w:sz w:val="28"/>
+          <w:lang w:val="ka-GE"/>
         </w:rPr>
         <w:t>1. შესავალი</w:t>
       </w:r>
@@ -2247,6 +2302,7 @@
           <w:rFonts w:ascii="Sylfaen" w:hAnsi="Sylfaen" w:cs="Sylfaen"/>
           <w:b/>
           <w:sz w:val="24"/>
+          <w:lang w:val="ka-GE"/>
         </w:rPr>
         <w:t xml:space="preserve">კვლევითი პრობლემა. </w:t>
       </w:r>
@@ -2255,6 +2311,7 @@
           <w:rFonts w:ascii="Sylfaen" w:hAnsi="Sylfaen" w:cs="Sylfaen"/>
           <w:b w:val="0"/>
           <w:sz w:val="24"/>
+          <w:lang w:val="ka-GE"/>
         </w:rPr>
         <w:t>ბოლო წლებში დიდ ენობრივ მოდელებზე (LLM) დაფუძნებულმა საუბრის სისტემებმა ერთ დიალოგურ სესიაზე ადამიანის დონის ლინგვისტური კომპეტენცია აჩვენეს, თუმცა ერთ-ერთი მათი ფუნდამენტური შეზღუდვა კვლავ რჩება: ასეთ სისტემებს არ შეუძლიათ გრძელვადიან პერსპექტივაში ურთიერთქმედების უწყვეტი, განვითარებადი კონტექსტის შენარჩუნება. ემპირიული მტკიცებულებები ზუსტად აჩვენებს ამ ნაკლს: LoCoMo-ს, ბენჩმარკის, რომელიც 35 სესიამდე გადანაწილებულ ხანგრძლივ საუბრებს მოიცავს, მიხედვით, ხანგრძლივი კონტექსტის მქონე მოდელები და RAG მიდგომები ადამიანის წარმადობას საერთო ჯამში 56%-ით, ხოლო დროითი მსჯელობისას 73%-ით ჩამორჩებიან [1]. LongMemEval-ის ბენჩმარკი ადასტურებს კომერციული საუბრის ასისტენტების მიერ ინფორმაციის მოძიების სიზუსტის 30%-ით შემცირებას ხანგრძლივი ურთიერთქმედების პირობებში [2].</w:t>
       </w:r>
@@ -2268,6 +2325,7 @@
           <w:rFonts w:ascii="Sylfaen" w:hAnsi="Sylfaen" w:cs="Sylfaen"/>
           <w:b w:val="0"/>
           <w:sz w:val="24"/>
+          <w:lang w:val="ka-GE"/>
         </w:rPr>
         <w:t>ეს ტექნიკური ნაკლი პირდაპირ აისახება მომხმარებლის გამოცდილებაზე. ეგრეთ წოდებული „კომპანიონი“ აპლიკაციების (Replika, Character.AI) კონტექსტში, Replika-ს მომხმარებლების კვალიტატიური კვლევა აჩვენებს, რომ მეხსიერების უკმარისობა — სახელების, უპირატესობებისა და ცხოვრებისეული მოვლენების დავიწყება — ერთ-ერთი მთავარი ფაქტორია, რომელიც არღვევს მომხმარებლის მიერ ურთიერთობის შეგრძნებას [3]. ამავდროულად, როდესაც სისტემის ქცევა მოულოდნელად იცვლება, მომხმარებლები გამოხატავენ რეაქციებს, რომლებიც სტატისტიკურად განპირობებულია აგენტის აღქმული იდენტობის შეუთავსებლობით [4]. ამ ორი დამოუკიდებელი შედეგის გაერთიანება საფუძველს გვაძლევს ვივარაუდოთ, რომ მეხსიერების უწყვეტობა საფუძვლად უდევს აღქმულ იდენტობას და, შესაბამისად, ურთიერთობის უწყვეტობას — ჰიპოთეზა, რომლის ექსპერიმენტული შემოწმებაც ეს ნაშრომი განიხილავს, როგორც სამომავლო სამუშაოს.</w:t>
       </w:r>
@@ -2281,6 +2339,7 @@
           <w:rFonts w:ascii="Sylfaen" w:hAnsi="Sylfaen" w:cs="Sylfaen"/>
           <w:b w:val="0"/>
           <w:sz w:val="24"/>
+          <w:lang w:val="ka-GE"/>
         </w:rPr>
         <w:t>ამგვარად, კვლევითი პრობლემა ორგანზომილებიანია: (ა) ტექნიკური — როგორ უნდა იყოს წარმოდგენილი, შენახული და მოპოვებული რელევანტური ინფორმაცია მრავალსესიანურ ურთიერთქმედებაში; და (ბ) პერცეპტული — სისტემის მეხსიერების რომელ ქცევებს აღიქვამენ მომხმარებლები ბუნებრივად და ურთიერთობის განმტკიცებად. არსებულ ლიტერატურაში ამ ორ განზომილებას ძირითადად იზოლირებულად განიხილავენ: მეხსიერების არქიტექტურები შეფასებულია ფაქტობრივი სიზუსტის (QA) მეტრიკებით, ხოლო აღქმის კვლევები მეხსიერებას ერთ სისტემაზე იზოლირებულ მანიპულაციად განიხილავენ. ამ ორი განზომილების გადაკვეთა წარმოადგენს ამ ნაშრომის კვლევის სივრცეს.</w:t>
       </w:r>
@@ -2294,6 +2353,7 @@
           <w:rFonts w:ascii="Sylfaen" w:hAnsi="Sylfaen" w:cs="Sylfaen"/>
           <w:b w:val="0"/>
           <w:sz w:val="24"/>
+          <w:lang w:val="ka-GE"/>
         </w:rPr>
         <w:t>კვლევის ობიექტია დიდი ენის მოდელებზე (LLM) დაფუძნებული ხმოვანი საუბრული სისტემები. კვლევის საგანია გრძელვადიანი მეხსიერების არქიტექტურის გავლენა მომხმარებლის მიერ აღქმულ სოციალურ კონსტრუქტებზე.</w:t>
       </w:r>
@@ -2307,6 +2367,7 @@
           <w:rFonts w:ascii="Sylfaen" w:hAnsi="Sylfaen" w:cs="Sylfaen"/>
           <w:b/>
           <w:sz w:val="24"/>
+          <w:lang w:val="ka-GE"/>
         </w:rPr>
         <w:t xml:space="preserve">კვლევის მიზანი. </w:t>
       </w:r>
@@ -2315,6 +2376,7 @@
           <w:rFonts w:ascii="Sylfaen" w:hAnsi="Sylfaen" w:cs="Sylfaen"/>
           <w:b w:val="0"/>
           <w:sz w:val="24"/>
+          <w:lang w:val="ka-GE"/>
         </w:rPr>
         <w:t>ამ ნაშრომის მიზანია ადამიანის მეხსიერების კოგნიტურ თეორიებზე დაფუძნებული გრძელვადიანი მეხსიერების არქიტექტურის შემუშავება ხმოვანი საუბრის სისტემისთვის და მისი ექსპერიმენტულად შეფასება კონტროლირებადი შედარებითი კვლევის მეშვეობით მომხმარებლის მიერ აღქმულ სოციალურ კონსტრუქტებზე — სოციალურ თანდასწრებაზე, მომხმარებელ-აგენტის ალიანსსა და აღქმულ ადამიანურობაზე.</w:t>
       </w:r>
@@ -2328,6 +2390,7 @@
           <w:rFonts w:ascii="Sylfaen" w:hAnsi="Sylfaen" w:cs="Sylfaen"/>
           <w:b w:val="0"/>
           <w:sz w:val="24"/>
+          <w:lang w:val="ka-GE"/>
         </w:rPr>
         <w:t>ამ მიზნის მისაღწევად, დასახულია შემდეგი ამოცანები:</w:t>
       </w:r>
@@ -2341,6 +2404,7 @@
           <w:rFonts w:ascii="Sylfaen" w:hAnsi="Sylfaen" w:cs="Sylfaen"/>
           <w:b w:val="0"/>
           <w:sz w:val="24"/>
+          <w:lang w:val="ka-GE"/>
         </w:rPr>
         <w:t>1. გრძელვადიანი საუბრული მეხსიერების არსებული მიდგომებისა და მათი კოგნიტურ-თეორიული საფუძვლების სისტემური ანალიზი;</w:t>
       </w:r>
@@ -2354,6 +2418,7 @@
           <w:rFonts w:ascii="Sylfaen" w:hAnsi="Sylfaen" w:cs="Sylfaen"/>
           <w:b w:val="0"/>
           <w:sz w:val="24"/>
+          <w:lang w:val="ka-GE"/>
         </w:rPr>
         <w:t>2. შერჩეული თეორიების ქცევითი ნიშნულების ფორმალიზება (მრავალსაცავიანი მოდელი, ებინგჰაუსის დავიწყების მრუდი, ეპიზოდური/სემანტიკური მეხსიერების გამიჯვნა, არსებითზე დაფუძნებული გახსენება და დამატებითი სასწავლო სისტემების / კონსოლიდაციის ჩარჩო) და მათი არქიტექტურულ კომპონენტებად გარდაქმნა;</w:t>
       </w:r>
@@ -2367,6 +2432,7 @@
           <w:rFonts w:ascii="Sylfaen" w:hAnsi="Sylfaen" w:cs="Sylfaen"/>
           <w:b w:val="0"/>
           <w:sz w:val="24"/>
+          <w:lang w:val="ka-GE"/>
         </w:rPr>
         <w:t>3. არქიტექტურის განხორციელება ურთიერთშედარებადი ექსპერიმენტული პროფილების სახით: (A) გრძელვადიანი მეხსიერების გარეშე, (B) სიტყვასიტყვითი აღდგენის RAG-ი, (B+) კურატორირებული სტატიკური აქტიური კონტროლი და (C) ადამიანის მეხსიერების მოდელზე დაფუძნებული პროფილი;</w:t>
       </w:r>
@@ -2380,6 +2446,7 @@
           <w:rFonts w:ascii="Sylfaen" w:hAnsi="Sylfaen" w:cs="Sylfaen"/>
           <w:b w:val="0"/>
           <w:sz w:val="24"/>
+          <w:lang w:val="ka-GE"/>
         </w:rPr>
         <w:t>4. წინასწარ რეგისტრირებული, მონაწილეზე-დაფუძნებული მომხმარებლის კვლევის პროტოკოლის სპეციფიკაცია ვალიდური ინსტრუმენტებით [14], რომელიც სრულად არის შემუშავებული, მაგრამ მომავალი სამუშაოსთვის გადაიდო;</w:t>
       </w:r>
@@ -2393,6 +2460,7 @@
           <w:rFonts w:ascii="Sylfaen" w:hAnsi="Sylfaen" w:cs="Sylfaen"/>
           <w:b w:val="0"/>
           <w:sz w:val="24"/>
+          <w:lang w:val="ka-GE"/>
         </w:rPr>
         <w:t>5. კონცეფციის დამტკიცების იმპლემენტაცია და მისი ტექნიკური და სიმულირებული შეფასება, მეხსიერების დიზაინის რეკომენდაციებით თანამოსაუბრე სისტემებისთვის, რომლებიც დადასტურდება გადავადებული კვლევით.</w:t>
       </w:r>
@@ -2406,6 +2474,7 @@
           <w:rFonts w:ascii="Sylfaen" w:hAnsi="Sylfaen" w:cs="Sylfaen"/>
           <w:b w:val="0"/>
           <w:sz w:val="24"/>
+          <w:lang w:val="ka-GE"/>
         </w:rPr>
         <w:t>კვლევის მთავარი კითხვა და ჰიპოთეზები. კვლევა გამოყოფს სამ ძირითად სოციალურ კონსტრუქტს (დამოკიდებული ცვლადები, რომლებიც მიზანშია დასახელებული) ორი მეორეხარისხოვანი, საძიებო პროგნოზისგან:</w:t>
       </w:r>
@@ -2419,6 +2488,7 @@
           <w:rFonts w:ascii="Sylfaen" w:hAnsi="Sylfaen" w:cs="Sylfaen"/>
           <w:b w:val="0"/>
           <w:sz w:val="24"/>
+          <w:lang w:val="ka-GE"/>
         </w:rPr>
         <w:t>•  მკ1: აძლიერებს თუ არა ადამიანის მეხსიერების თეორიებზე დაფუძნებული მეხსიერების არქიტექტურა აღქმულ სოციალურ თანდასწრებას, მომხმარებლისა და აგენტის ალიანსს და აღქმულ ადამიანურობას, სიტყვასიტყვითი მოგონების მიდგომასთან შედარებით?</w:t>
       </w:r>
@@ -2432,6 +2502,7 @@
           <w:rFonts w:ascii="Sylfaen" w:hAnsi="Sylfaen" w:cs="Sylfaen"/>
           <w:b w:val="0"/>
           <w:sz w:val="24"/>
+          <w:lang w:val="ka-GE"/>
         </w:rPr>
         <w:t>•  H1 (მთავარი): თეორიულად დასაბუთებული პროფილი (C) აღემატება სიტყვასიტყვით RAG-ს (B) სამივე ძირითადი კონსტრუქტის მიხედვით — სოციალური თანდასწრების, მომხმარებლისა და აგენტის ალიანსისა და აღქმული ადამიანურობის.</w:t>
       </w:r>
@@ -2445,6 +2516,7 @@
           <w:rFonts w:ascii="Sylfaen" w:hAnsi="Sylfaen" w:cs="Sylfaen"/>
           <w:b w:val="0"/>
           <w:sz w:val="24"/>
+          <w:lang w:val="ka-GE"/>
         </w:rPr>
         <w:t>•  H2a (მეორეხარისხოვანი): verbatim RAG (B) ყველაზე მაღალ ქულებს იღებს აღქმულ ინტელექტში (Godspeed).</w:t>
       </w:r>
@@ -2458,6 +2530,7 @@
           <w:rFonts w:ascii="Sylfaen" w:hAnsi="Sylfaen" w:cs="Sylfaen"/>
           <w:b w:val="0"/>
           <w:sz w:val="24"/>
+          <w:lang w:val="ka-GE"/>
         </w:rPr>
         <w:t>•  H2b (მეორადი): verbatim RAG (B) ყველაზე დაბალ ქულებს იღებს ნდობისა და კონფიდენციალურობასთან დაკავშირებული კომფორტის კრიტერიუმებით (Cox-ის ტიპის საკითხები) — ეს არის ვარაუდი, რომელიც ტექსტური მოდალობის შედეგებიდან [11] ხმის მოდალობაზე ექსტრაპოლირებულია.</w:t>
       </w:r>
@@ -2471,6 +2544,7 @@
           <w:rFonts w:ascii="Sylfaen" w:hAnsi="Sylfaen" w:cs="Sylfaen"/>
           <w:b w:val="0"/>
           <w:sz w:val="24"/>
+          <w:lang w:val="ka-GE"/>
         </w:rPr>
         <w:t>შედარება დამატებით მოიცავს კურატორირებულ სტატიკურ აქტიურ კონტროლს (B+): მეხსიერებას, რომელიც იღებს იგივე ოფლაინ კურატორირებას, რაც C, მაგრამ არ გააჩნია ადამიანის მეხსიერების დინამიკა (არც დაქრობა, არც სალიენს-გეითინგი, არც კონსოლიდაცია). კონტრასტი C-სა და B+-ს შორის — რომელიც ადამიანის მეხსიერების დინამიკის ეფექტს კურირების მიერ მიღწეული წაკითხვადობის უბრალო ზრდისგან გამოყოფს — ამ ნაშრომის ცენტრალური ახალი შედარებაა; როგორც 3.1-შია დადგენილი, ის თავისი კონსტრუქციით მცირე ეფექტს წარმოადგენს და განიხილება წინასწარ რეგისტრირებულ შეფასების მიზნად და არა დამადასტურებელ ტესტად, რაც განსხვავდება უკეთესი სტატისტიკური ძალის მქონე შედარებებისგან (C vs A და მიმართულებითი B+ vs B და C vs B).</w:t>
       </w:r>
@@ -2484,6 +2558,7 @@
           <w:rFonts w:ascii="Sylfaen" w:hAnsi="Sylfaen" w:cs="Sylfaen"/>
           <w:b w:val="0"/>
           <w:sz w:val="24"/>
+          <w:lang w:val="ka-GE"/>
         </w:rPr>
         <w:t>სამი თვისებიდან, რომლებითაც 1.5 განასხვავებს მოსაუბრეს ასისტენტისგან, მეხსიერებაზე მანიპულირება ეხება კონტექსტის მდგრადობასა და იდენტობის უწყვეტობას; მესამე — ინიციატივა — ოპერაციულად განისაზღვრება მხოლოდ არასავალდებულო პროაქტიულ პირობაში და, შესაბამისად, შემოწმდება მხოლოდ იმ შემთხვევაში, თუ ეს პირობაა ჩართული.</w:t>
       </w:r>
@@ -2497,6 +2572,7 @@
           <w:rFonts w:ascii="Sylfaen" w:hAnsi="Sylfaen" w:cs="Sylfaen"/>
           <w:b w:val="0"/>
           <w:sz w:val="24"/>
+          <w:lang w:val="ka-GE"/>
         </w:rPr>
         <w:t>კვლევის ლინგვისტური მასშტაბი: სისტემა და ექსპერიმენტები ინგლისურ ენაზე ტარდება, რაც განპირობებულია ქართული მეტყველების ამოცნობის ტექნოლოგიის ამჟამინდელი განვითარების დონით; შესაბამისად, აღქმის შესახებ დასკვნები პირდაპირ ეხება გამოცდილ ენობრივ პირობას, ხოლო ქართულენოვანი დემონსტრაციის საკითხი მომავალი ნაშრომების განყოფილებაში განიხილება. ურთიერთქმედების მოდალიტეტიც უცვლელია — მთლიანად ხმოვანი, ტექსტური კომპონენტის გარეშე — ამგვარად, კვლევა იკვლევს მეხსიერების არქიტექტურის გავლენას ხმოვან გარემოში და არა ხმოვანსა და ტექსტურს შორის არსებულ განსხვავებას.</w:t>
       </w:r>
@@ -2510,6 +2586,7 @@
           <w:rFonts w:ascii="Sylfaen" w:hAnsi="Sylfaen" w:cs="Sylfaen"/>
           <w:b/>
           <w:sz w:val="24"/>
+          <w:lang w:val="ka-GE"/>
         </w:rPr>
         <w:t xml:space="preserve">პრობლემის აქტუალობა. </w:t>
       </w:r>
@@ -2518,6 +2595,7 @@
           <w:rFonts w:ascii="Sylfaen" w:hAnsi="Sylfaen" w:cs="Sylfaen"/>
           <w:b w:val="0"/>
           <w:sz w:val="24"/>
+          <w:lang w:val="ka-GE"/>
         </w:rPr>
         <w:t>პრობლემის აქტუალობა განისაზღვრება სამი ურთიერთდამოუკიდებელი ფაქტორით. პირველი — ინდუსტრიული: 2025–2026 წლებში წამყვანმა მომწოდებლებმა (OpenAI, Anthropic) ან დანერგეს ფონური მეხსიერების კონსოლიდაციის მექანიზმები კომერციულ პროდუქტებში, ან წარმოადგინეს ისინი, როგორც საჯარო კვლევითი წინასწარი ვერსიები [18, 19], რაც მიუთითებს, რომ გრძელვადიან მეხსიერებას თავად სფერო ცენტრალურ გადაუჭრელ პრობლემად მიიჩნევს. უფრო მეტიც, აღსანიშნავია, რომ ამ სისტემებს არ ახლავს რეცენზირებული პუბლიკაციები, რაც აკადემიური კვლევის საჭიროებას კიდევ უფრო მწვავეს ხდის. მეორე — სოციალური: საუბრებთან ადაპტირებულ სისტემებთან ხანგრძლივი, პირადი ურთიერთქმედება ფართოდ გავრცელებულ პრაქტიკად იქცა [5], რაც მეხსიერების აღქმითი ეფექტები სოციალურად მნიშვნელოვან საკითხად აქცევს. მესამე — მეთოდოლოგიური: ჩვენთვის ცნობილი გრძელვადიანი მეხსიერების ყველა ძირითადი საცდელი (benchmark) (LoCoMo, LongMemEval, MSC) შექმნილია ტექსტური მოდალობისთვის [1, 2, 35]; ხმოვანი ინტერაქციის პირობებში — სადაც პასუხის დაყოვნება რეალურ დროში მკაცრად შეზღუდულია — მეხსიერების არქიტექტურების ქცევა და მათი აღქმითი ეფექტები პრაქტიკულად გამოუკვლეველი რჩება.</w:t>
       </w:r>
@@ -2531,6 +2609,7 @@
           <w:rFonts w:ascii="Sylfaen" w:hAnsi="Sylfaen" w:cs="Sylfaen"/>
           <w:b/>
           <w:sz w:val="24"/>
+          <w:lang w:val="ka-GE"/>
         </w:rPr>
         <w:t xml:space="preserve">კვლევის პრაქტიკული ღირებულება. </w:t>
       </w:r>
@@ -2539,6 +2618,7 @@
           <w:rFonts w:ascii="Sylfaen" w:hAnsi="Sylfaen" w:cs="Sylfaen"/>
           <w:b w:val="0"/>
           <w:sz w:val="24"/>
+          <w:lang w:val="ka-GE"/>
         </w:rPr>
         <w:t>კვლევის შედეგად იქნება:</w:t>
       </w:r>
@@ -2552,6 +2632,7 @@
           <w:rFonts w:ascii="Sylfaen" w:hAnsi="Sylfaen" w:cs="Sylfaen"/>
           <w:b w:val="0"/>
           <w:sz w:val="24"/>
+          <w:lang w:val="ka-GE"/>
         </w:rPr>
         <w:t>•  კონცეფციის დამტკიცების მექანიზმი მეხსიერებისთვის, რომელიც მრავალსესიან დიალოგზე ყველა ოთხი პირობის იმპლემენტაციას ახდენს, ერთადერთი განსაზღვრული გზით მისი ინტეგრაციისთვის Voice Companion-ის ხმოვან პლატფორმაში (მომავალი სამუშაო);</w:t>
       </w:r>
@@ -2565,6 +2646,7 @@
           <w:rFonts w:ascii="Sylfaen" w:hAnsi="Sylfaen" w:cs="Sylfaen"/>
           <w:b w:val="0"/>
           <w:sz w:val="24"/>
+          <w:lang w:val="ka-GE"/>
         </w:rPr>
         <w:t>•  საპროექტო რეკომენდაციები — დაფუძნებული ტექნიკურ და სიმულირებულ კონცეფციის დამტკიცებაზე და რომლებიც ემპირიულად უნდა დადასტურდეს გადავადებული ადამიანური კვლევით — იმის შესახებ, თუ რომელი მეხსიერების მექანიზმები აძლიერებს ან ასუსტებს ურთიერთობის შეგრძნებას, როგორც სახელმძღვანელო საუბრზე დაფუძნებული პროდუქტების შემქმნელთათვის;</w:t>
       </w:r>
@@ -2578,6 +2660,7 @@
           <w:rFonts w:ascii="Sylfaen" w:hAnsi="Sylfaen" w:cs="Sylfaen"/>
           <w:b w:val="0"/>
           <w:sz w:val="24"/>
+          <w:lang w:val="ka-GE"/>
         </w:rPr>
         <w:t>•  მეხსიერების პროფილების შესადარებლად განკუთვნილი გამეორებადი ექსპერიმენტული გარემო.</w:t>
       </w:r>
@@ -2591,6 +2674,7 @@
           <w:rFonts w:ascii="Sylfaen" w:hAnsi="Sylfaen" w:cs="Sylfaen"/>
           <w:b w:val="0"/>
           <w:sz w:val="24"/>
+          <w:lang w:val="ka-GE"/>
         </w:rPr>
         <w:t>შედეგები რელევანტურია როგორც პერსონალური ასისტენტების, ასევე საგანმანათლებლო და სამედიცინო მიზნებისთვის შექმნილი საუბრის სისტემების განვითარებისთვის.</w:t>
       </w:r>
@@ -2604,6 +2688,7 @@
           <w:rFonts w:ascii="Sylfaen" w:hAnsi="Sylfaen" w:cs="Sylfaen"/>
           <w:b/>
           <w:sz w:val="24"/>
+          <w:lang w:val="ka-GE"/>
         </w:rPr>
         <w:t xml:space="preserve">კვლევის თეორიული ღირებულება. </w:t>
       </w:r>
@@ -2612,6 +2697,7 @@
           <w:rFonts w:ascii="Sylfaen" w:hAnsi="Sylfaen" w:cs="Sylfaen"/>
           <w:b w:val="0"/>
           <w:sz w:val="24"/>
+          <w:lang w:val="ka-GE"/>
         </w:rPr>
         <w:t>ნაშრომის თეორიული წვლილი სამმაგია. პირველი, ის კოგნიტური ფსიქოლოგიის მეხსიერების თეორიებს LLM სისტემების ინჟინერიასთან აკავშირებს არა მეტაფორის დონეზე, არამედ გაზომვადი ქცევითი ნიშნულების დონეზე. მეორე, ჩვენთვის ხელმისაწვდომ ლიტერატურაში ვერ მოიძებნა არცერთი კონტროლირებადი კვლევა, რომელიც ადამიანის მეხსიერების სხვადასხვა თეორიაზე დაფუძნებულ არქიტექტურებს ერთმანეთს შეადარებდა მომხმარებლის მიერ აღქმული სოციალური კონსტრუქტების თვალსაზრისით — არსებული შედარებები შემოიფარგლება ფაქტობრივი სიზუსტის მეტრიკებით [1, 2], ხოლო აღქმის კვლევები მეხსიერებას განიხილავენ, როგორც ერთი სისტემის იზოლირებულ მანიპულაციას [11]; წინამდებარე ნაშრომი მიზნად ისახავს ამ ხარვეზის შევსებას კონტროლირებადი ექსპერიმენტის დაპროექტებით და მისი ჩასატარებლად საჭირო აპარატურისა და მეთოდოლოგიის შექმნით. მესამე, ნაშრომი გვთავაზობს "ასისტენტსა" და "თანამოსაუბრეს" შორის განსხვავების ოპერაციონალიზაციას სამი გაზომვადი თვისების საფუძველზე — კონტექსტის მდგრადობა, იდენტობის უწყვეტობა და ინიციატივა — რითაც ეს ცნებები ბუნდოვნად განსაზღვრული ტერმინებიდან გაზომვად კატეგორიებად გარდაიქმნება.</w:t>
       </w:r>
@@ -2625,6 +2711,7 @@
           <w:rFonts w:ascii="Sylfaen" w:hAnsi="Sylfaen" w:cs="Sylfaen"/>
           <w:b/>
           <w:sz w:val="24"/>
+          <w:lang w:val="ka-GE"/>
         </w:rPr>
         <w:t xml:space="preserve">ნაშრომის სტრუქტურა. </w:t>
       </w:r>
@@ -2633,6 +2720,7 @@
           <w:rFonts w:ascii="Sylfaen" w:hAnsi="Sylfaen" w:cs="Sylfaen"/>
           <w:b w:val="0"/>
           <w:sz w:val="24"/>
+          <w:lang w:val="ka-GE"/>
         </w:rPr>
         <w:t>ნაშრომი შედგება ხუთი თავისგან: შესავალი, ლიტერატურის მიმოხილვა, კვლევის მეთოდები, შედეგები და განხილვა, დასკვნა. ლიტერატურის მიმოხილვაში ანალიზდება გრძელვადიანი საუბრული მეხსიერებისადმი არსებული მიდგომები, მათი კოგნიტურ-თეორიული საფუძვლები და შეფასების მეთოდოლოგიის შეზღუდვები. მეთოდების თავში აღწერილია შემუშავებული არქიტექტურა, ექსპერიმენტული პროფილები, კონცეფციის დამტკიცება და (გადადებული) მომხმარებელთა კვლევის დიზაინი. შედეგების თავი მოიცავს კონცეფციის დამტკიცების იმპლემენტაციისა და მისი ტექნიკური და სიმულირებული შეფასების ანგარიშს და განიხილავს, თუ რას ამტკიცებს და რას — არა; ადამიანთა მონაწილეობით ჩატარებული კვლევა მეთოდების თავშია მითითებული, როგორც სამომავლო სამუშაო. დასკვნა აჯამებს შედეგებს და განსაზღვრავს სამომავლო კვლევების მიმართულებებს.</w:t>
       </w:r>
@@ -2653,6 +2741,7 @@
           <w:b/>
           <w:color w:val="000000"/>
           <w:sz w:val="28"/>
+          <w:lang w:val="ka-GE"/>
         </w:rPr>
         <w:t>2. ლიტერატურის მიმოხილვა</w:t>
       </w:r>
@@ -2672,6 +2761,7 @@
           <w:b/>
           <w:color w:val="000000"/>
           <w:sz w:val="28"/>
+          <w:lang w:val="ka-GE"/>
         </w:rPr>
         <w:t>2.1 მიმოხილვის მოცულობა და სტრუქტურა</w:t>
       </w:r>
@@ -2685,6 +2775,7 @@
           <w:rFonts w:ascii="Sylfaen" w:hAnsi="Sylfaen" w:cs="Sylfaen"/>
           <w:b w:val="0"/>
           <w:sz w:val="24"/>
+          <w:lang w:val="ka-GE"/>
         </w:rPr>
         <w:t>ეს თავი მიმოიხილავს კვლევებს, რომლებზეც ეს ნაშრომია დაფუძნებული, ორ სფეროში, რომლებიც ის მიზანმიმართულად აერთიანებს. პირველია ადამიანის მეხსიერების კოგნიტური ფსიქოლოგია: თეორიები, რომლებიც აღწერს, თუ როგორ კოდირებენ, ინახავენ, ივიწყებენ და იხსენებენ ადამიანები ინფორმაციას და — რაც ჩვენი მიზნებისთვის უმნიშვნელოვანესია — თითოეული თეორიის მიერ პროგნოზირებული ქცევითი გამოვლინებები. მეორეა დიდი ენის მოდელებზე (LLM) დაფუძნებული საუბრული აგენტების გრძელვადიანი მეხსიერების ინჟინერია: არქიტექტურები, მათი შეფასების ბენჩმარკები და კვლევები ადამიანთა მონაწილეობით, რომლებიც იკვლევენ, თუ როგორ განსაზღვრავს მეხსიერება მომხმარებლისა და სისტემის ურთიერთობას. მიმოხილვა სრულდება ამჟამინდელი ნაშრომის ამ სფეროებს შორის არსებულ ხარვეზში განთავსებით. სტრუქტურა შეესაბამება ლიტერატურული მიმოხილვისთვის საჭირო ოთხ კომპონენტს: არსებული კვლევების ანალიზს (2.3, 2.6), გამოყენებული მეთოდებისა და ტექნოლოგიების მიმოხილვას (2.2, 2.4), ღია პრობლემებსა და შეზღუდვებს (2.5, 2.7) და ამ ნაშრომის ადგილს არსებულ ლიტერატურაში (2.8).</w:t>
       </w:r>
@@ -2704,6 +2795,7 @@
           <w:b/>
           <w:color w:val="000000"/>
           <w:sz w:val="28"/>
+          <w:lang w:val="ka-GE"/>
         </w:rPr>
         <w:t>2.2 თეორიული საფუძვლები: ადამიანის მეხსიერების მოდელები</w:t>
       </w:r>
@@ -2717,6 +2809,7 @@
           <w:rFonts w:ascii="Sylfaen" w:hAnsi="Sylfaen" w:cs="Sylfaen"/>
           <w:b w:val="0"/>
           <w:sz w:val="24"/>
+          <w:lang w:val="ka-GE"/>
         </w:rPr>
         <w:t>ამ ნაშრომის ცენტრალური პრინციპია, რომ ადამიანის მეხსიერება ერთგვარ საცავს კი არ წარმოადგენს, არამედ ურთიერთქმედებადი სისტემების ერთობლიობას, თითოეულ მათგანს კი — განსაკუთრებული დინამიკა აქვს. ამ დინამიკებს კი, თავისუფალი მეტაფორების ნაცვლად, შესაძლებელია, განვიხილოთ, როგორც დიზაინის სპეციფიკაციები, რომლებსაც დაკვირვებადი შედეგები მოჰყვება. შესაბამისად, ჩვენ ძირითად თეორიებს განვიხილავთ არა როგორც ინტელექტუალურ ისტორიას, არამედ იმ ქცევითი კვალით, რომელსაც თითოეული მათგანი პროგნოზირებს: ანუ, რა ხილვად მოქმედებას განახორციელებდა მომხმარებლის მიერ აღქმული, ამ მექანიზმით აღჭურვილი თანამოსაუბრე.</w:t>
       </w:r>
@@ -2730,6 +2823,7 @@
           <w:rFonts w:ascii="Sylfaen" w:hAnsi="Sylfaen" w:cs="Sylfaen"/>
           <w:b w:val="0"/>
           <w:sz w:val="24"/>
+          <w:lang w:val="ka-GE"/>
         </w:rPr>
         <w:t>მრავალსაცავიანი მოდელი. ატკინსონისა და შიფრინის [20] მიხედვით, მეხსიერება წარმოადგენს სამი საწყობის — სენსორული, მოკლევადიანი და გრძელვადიანი — ჯაჭვს, რომლის გავლითაც კონტენტი გადაადგილდება მხოლოდ მაშინ, როდესაც მასზე კონტროლის პროცესები მოქმედებს; გამეორება გადამწყვეტი პროცესია, რომელიც ყურადღებით აღქმულ მასალას მდგრად საცავში გადააქვს, ხოლო ის, რაც გამეორების გარეშე რჩება, უბრალოდ ქრება. მისი ქცევითი სიგნატურა არის მკვეთრი ასიმეტრია იმას შორის, რაც უბრალოდ გაიგონა და იმას შორის, რასაც ყურადღება მიექცა და გაიმეორა — ამ პრინციპით შექმნილი პარტნიორი შეინარჩუნებდა ხაზგასმულ ან ხელახლა განხილულ ინფორმაციას და დაკარგავდა იმას, რაც ერთხელ და შეუმჩნევლად გაიარა.</w:t>
       </w:r>
@@ -2743,6 +2837,7 @@
           <w:rFonts w:ascii="Sylfaen" w:hAnsi="Sylfaen" w:cs="Sylfaen"/>
           <w:b w:val="0"/>
           <w:sz w:val="24"/>
+          <w:lang w:val="ka-GE"/>
         </w:rPr>
         <w:t>მუშა მეხსიერება. ბედლიმ და ჰიჩმა [21] პასიური მოკლევადიანი საცავი აქტიურ, ტევადობით შეზღუდულ მუშა მეხსიერებად გარდაქმნეს, რომლის სპეციალიზებულ ქვესისტემებსაც ცენტრალური აღმასრულებელი მართავს. საუბრის აგენტისთვის შესაბამისი ნიშანია მორიგეობის შიდა პერიოდი: ერთდროულად აქტიურ მანიპულაციაში მხოლოდ რამდენიმე ერთეულის შენარჩუნებაა შესაძლებელი, რაც პირდაპირ უკავშირდება დაყოვნებით შეზღუდულ "მუშა ნაკრებს", რომელზეც ხმის აგენტს შეუძლია იფიქროს, სანამ გრძელვადიან საცავთან კონსულტაციას გაივლის.</w:t>
       </w:r>
@@ -2756,6 +2851,7 @@
           <w:rFonts w:ascii="Sylfaen" w:hAnsi="Sylfaen" w:cs="Sylfaen"/>
           <w:b w:val="0"/>
           <w:sz w:val="24"/>
+          <w:lang w:val="ka-GE"/>
         </w:rPr>
         <w:t>ეპიზოდური და სემანტიკური განასხვავებლობა. ტულვინგმა [22] ზღვარი გაავლო კონკრეტული მოვლენის დამახსოვრებას, რომლის განთავსებაც საკუთარ წარსულშია შესაძლებელი ("გასულ სამშაბათს შენი დედლაინის შესახებ ახსენე"), და უბრალოდ ფაქტის ცოდნას შორის, რომელიც თავისი თავდაპირველი კონტექსტისგან არის მოშორებული ("შენ დედლაინების ქვეშ მუშაობ") — ეპიზოდურ და სემანტიკურ მეხსიერებას შორის. ეს გამიჯვნა ფუნდამენტურია წინამდებარე ნაშრომისთვის, რადგან ორი სისტემა აშკარად განსხვავებულ საუბრის მანერას ქმნის: ეპიზოდური პარტნიორი კონკრეტულ მომენტებს იხსენებს, ხოლო სემანტიკური პარტნიორი მათ მომხმარებლის შესახებ სტაბილურ ცოდნად აქცევს. პირველის მეორედ გარდაქმნა — კონსოლიდაცია — სწორედ ის პროცესია, რომელიც ხანგრძლივ საუბრის სისტემას უნდა შეასრულოს, რათა "დაუმუშავებელ" ეპიზოდებში არ ჩაიძიროს.</w:t>
       </w:r>
@@ -2769,6 +2865,7 @@
           <w:rFonts w:ascii="Sylfaen" w:hAnsi="Sylfaen" w:cs="Sylfaen"/>
           <w:b w:val="0"/>
           <w:sz w:val="24"/>
+          <w:lang w:val="ka-GE"/>
         </w:rPr>
         <w:t>დავიწყების მრუდი. ებინგჰაუსის მეცხრამეტე საუკუნის ექსპერიმენტებმა [23] აჩვენა, რომ მეხსიერების სიძლიერე მცირდება დაახლოებით ექსპონენციურად იმ დროის გასვლის მიხედვით, რაც რაიმეს ბოლოს გამეორებიდან გავიდა, და რომ დროში გადანაწილებული განმეორებები ამ კლებას ამცირებს. ჩვენ ვიყენებთ დავიწყების მრუდს ერთი მკაფიო შენიშვნით, ვინაიდან ვვარაუდობთ აშკარა წინააღმდეგობას: ებინგჰაუსმა გაზომა ერთი სუბიექტის უაზრო ბგერათა კომბინაციების მეხსიერება და მისი ეკოლოგიური ვალიდურობა სემანტიკურად მდიდარი დიალოგისთვის შეზღუდულია. შესაბამისად, წინამდებარე ნაშრომი არ ამტკიცებს კოგნიტურ ერთგულებას; ის გრაციოზულ, დროზე და თვალსაჩინოობაზე დამოკიდებულ დაქრობას განიხილავს, როგორც ინჟინერიული თვალსაზრისით სასარგებლო ქცევის ფორმას, რომლის ობიექტიც მომხმარებლის აღქმაზე მისი გავლენაა და არა — ფსიქოლოგიური სიზუსტე. მისი საფირმო ნიშანია არამეორებული დეტალების გრაციოზული გაქრობა და იმის გაძლიერება, რაც მეორდება.</w:t>
       </w:r>
@@ -2782,6 +2879,7 @@
           <w:rFonts w:ascii="Sylfaen" w:hAnsi="Sylfaen" w:cs="Sylfaen"/>
           <w:b w:val="0"/>
           <w:sz w:val="24"/>
+          <w:lang w:val="ka-GE"/>
         </w:rPr>
         <w:t>ბუნდოვანი კვალის თეორია. რეინა და ბრენერდი [24] მიიჩნევენ, რომ ნებისმიერი გამოცდილება ერთდროულად ტოვებს ორ დამოუკიდებელ კვალს — ზედაპირული ფორმის სიტყვასიტყვით ჩანაწერს (ვერბატიმი) და მისი მნიშვნელობის არსებით ჩანაწერს (gist), რომელთაგან უკანასკნელი უფრო დიდხანს ძლებს და უფრო ხშირად წარმართავს შეფასებას. ეს განასხვავება პირდაპირ უკავშირდება ჩვენი კვლევის კითხვას: სიტყვასიტყვითი/მთავარი აზრის კონტრასტი ემთხვევა ქვემოთ განხილულ ცენტრალურ ემპირიულ აღმოჩენას — რომ ჩატ-ბოტის მიერ სიტყვასიტყვითი გახსენება შეიძლება შემაწუხებლად აღიქმებოდეს იქ, სადაც პარაფრაზირებული, მთავარი აზრის დონის გახსენება — არა [11]. პარტნიორი, რომელიც თქვენი ნათქვამის ზუსტი სიტყვების ნაცვლად მის მნიშვნელობას იხსენებს, აჩვენებს ცნობად ადამიანურ კვალს და, ამავდროულად, შესაძლოა თავიდან აიცილოს სრული გახსენების დისკომფორტი.</w:t>
       </w:r>
@@ -2795,6 +2893,7 @@
           <w:rFonts w:ascii="Sylfaen" w:hAnsi="Sylfaen" w:cs="Sylfaen"/>
           <w:b w:val="0"/>
           <w:sz w:val="24"/>
+          <w:lang w:val="ka-GE"/>
         </w:rPr>
         <w:t>კონსოლიდაცია: კომპლემენტარული სასწავლო სისტემები და ჰიპოკამპური ინდექსაცია. ორი ნეიროკოგნიტური თეორია აღწერს, თუ როგორ იქცევა ეპიზოდური გამოცდილება ხანგრძლივ ცოდნად. კომპლემენტარული სასწავლო სისტემების მიდგომის [25] თანახმად, ერთი სისტემა, რომელიც ჰიპოკამპუსზეა ცენტრირებული, ინდივიდუალურ ეპიზოდებს სწრაფად აღიქვამს, მაშინ როცა მეორე, კორტიკული სისტემა განმეორებად სტრუქტურას მხოლოდ ნელა აკონსოლიდებს, და ოფლაინ გამეორება გადატანას უზრუნველყოფს ჩაწერილ ინფორმაციას ამ ნელი საცავისკენ. ინდექსაციის თეორია [26] ამატებს, რომ ჰიპოკამპს არც კი სჭირდება მეხსიერების შენახვა — მას უბრალოდ აქვს მითითებები იმ კორტიკულ ნიმუშებზე, რომლებიც მათ ქმნიდა, ასე რომ, მინიშნების ფრაგმენტს შეუძლია მთლიანი მეხსიერების აღდგენა. ორივე მათგანი პროგნოზირებს ერთსა და იმავე მაღალი დონის ქცევით სიგნატურას — აგენტს, რომელიც ეპიზოდებს სწრაფად იმახსოვრებს, მაგრამ მათ ინტერაქციებს შორის პერიოდში სტრუქტურირებულ ცოდნად რეორგანიზებას ახდენს — და ორივეს, როგორც 2.4-შია ნაჩვენები, ჰყავს პირდაპირი გამოთვლითი შთამომავლები.</w:t>
       </w:r>
@@ -2806,6 +2905,7 @@
           <w:rFonts w:ascii="Sylfaen" w:hAnsi="Sylfaen" w:cs="Sylfaen"/>
           <w:b w:val="0"/>
           <w:sz w:val="24"/>
+          <w:lang w:val="ka-GE"/>
         </w:rPr>
         <w:t>ცხრილი 2.1 (2.4) შეჯამებულად წარმოადგენს, თუ როგორ განხორციელდა თითოეული ამ თეორიის ოპერაციონალიზება უახლეს LLM-აგენტების სისტემებში; თავდაპირველად, ჩვენ განვიხილავთ ამ სისტემებს მათივე პრინციპების მიხედვით.</w:t>
       </w:r>
@@ -2825,6 +2925,7 @@
           <w:b/>
           <w:color w:val="000000"/>
           <w:sz w:val="28"/>
+          <w:lang w:val="ka-GE"/>
         </w:rPr>
         <w:t>2.3 გრძელვადიანი მეხსიერება დიდი ენის მოდელის აგენტებისთვის: სამი ტალღა</w:t>
       </w:r>
@@ -2838,6 +2939,7 @@
           <w:rFonts w:ascii="Sylfaen" w:hAnsi="Sylfaen" w:cs="Sylfaen"/>
           <w:b w:val="0"/>
           <w:sz w:val="24"/>
+          <w:lang w:val="ka-GE"/>
         </w:rPr>
         <w:t>დიდი ენის მოდელის აგენტების კონტექსტური ფანჯრის მიღმა მეხსიერებით აღჭურვის მიდგომები 2023-დან 2026 წლამდე სამ გამოკვეთილ ტალღად განვითარდა.</w:t>
       </w:r>
@@ -2851,6 +2953,7 @@
           <w:rFonts w:ascii="Sylfaen" w:hAnsi="Sylfaen" w:cs="Sylfaen"/>
           <w:b w:val="0"/>
           <w:sz w:val="24"/>
+          <w:lang w:val="ka-GE"/>
         </w:rPr>
         <w:t>პირველი ტალღა — კონტექსტის ვირტუალიზაცია და ადამიანის მიერ შთაგონებული ადრეული საცავები (2023). პირველ სისტემებში შეზღუდული კონტექსტური ფანჯარა აღიქმებოდა როგორც მართვადი შეზღუდვა. MemGPT [17] იღებს ოპერაციული სისტემის ვირტუალური მეხსიერების იდეას: ფუნქციების გამოძახების მეშვეობით თავად მოდელი გადააქვს ინფორმაცია კონტექსტში არსებულ "ძირითად" საცავსა და კონტექსტისგარეშე არსებულ, უფრო დიდ არქივულ და მოხმობის დონეებს შორის, რითაც ქმნის საკუთარ იერარქიას. პარალელურად, ორმა სისტემამ შთაგონების წყაროდ ადამიანის მეხსიერება გამოიყენა. Generative Agents-ის არქიტექტურამ [10] შემოიღო უკვე კანონიკური "მეხსიერების ნაკადი": დაკვირვებების ქრონოლოგიური, ბუნებრივი ენის ლოგფაილი. როდესაც საცავს ეკითხებიან, თითოეული ჩანაწერი რანჟირებულია სამი ფაქტორის შერწყმით — რამდენად ახლახან მოხდა მასზე წვდომა (ექსპონენციური კლება), რამდენად მნიშვნელოვნად მიიჩნია მოდელმა (LLM-ის მიერ მინიჭებული შეფასება) და რამდენად რელევანტურია ის მოთხოვნასთან (ემბედინგის მსგავსება) — ხოლო პერიოდული "რეფლექსიის" ეტაპები ჟურნალიდან უფრო მაღალი დონის დაკვირვებებს გამოაქვს. მნიშვნელოვანია ზუსტად აღინიშნოს, რა არის და რა არ არის ეს: მონაცემების მოძიების ქულა (retrieval score) გვახსენებს აქტივაციაზე დაფუძნებულ თეორიებს, როგორიცაა ACT-R, მაგრამ ის ავტორების საკუთარი საინჟინრო კონსტრუქციაა და არ არის ნებისმიერი კოგნიტური მოდელისგან ნაწარმოები — ეს არის განსხვავება, რომელსაც ვიცავთ თეორიული მემკვიდრეობის გადაჭარბების თავიდან ასაცილებლად. ამის საპირისპიროდ, MemoryBank [6] პირდაპირ ეფუძნებოდა ებინგჰაუსის დავიწყების მრუდს და თითოეული მოგონების სიძლიერეს მოდელირებდა გასული დროის ექსპონენციალურ ფუნქციად, რომელიც ხელახალი წვდომისას ძლიერდებოდა; ის ამუშავებდა SiliconFriend-ს, გრძელვადიან "კომპანიონის" ტიპის ჩატ-ბოტს და ამჟამინდელი ნაშრომის უახლოეს პირდაპირ პრეცედენტს (უახლოესს გამოცხადებული კრიტერიუმით: სისტემა ეგრეთ წოდებულ "კომპანიონის" ჟანრში, რომლის მეხსიერებაც ადამიანის მეხსიერების თეორიაზეა დაფუძნებული).</w:t>
       </w:r>
@@ -2864,6 +2967,7 @@
           <w:rFonts w:ascii="Sylfaen" w:hAnsi="Sylfaen" w:cs="Sylfaen"/>
           <w:b w:val="0"/>
           <w:sz w:val="24"/>
+          <w:lang w:val="ka-GE"/>
         </w:rPr>
         <w:t>მეორე ტალღა — საწარმოო მეხსიერების ფენები და ნეირო-შთაგონებული მოძიების მექანიზმები (2024–2025). მეორე ტალღა კვლევითი პროტოტიპებიდან გადავიდა გამოყენებადი მეხსიერების სერვისებისა და ნეირომეცნიერებიდან ნასესხები მონაცემების მოძიების მექანიზმებისკენ. Mem0 [29] ახორციელებს მეხსიერების ფენას, რომელიც დიალოგიდან გამოყოფს მნიშვნელოვან ფაქტებს და თანდათანობით ახდენს კონსოლიდირებული საცავის განახლებას; მისი ავტორები იუწყებიან მნიშვნელოვან გაუმჯობესებას ძლიერ საწყის მაჩვენებელთან შედარებით საუბრის მეხსიერების ამოცანებში, დაყოვნებისა და ტოკენების ხარჯის მნიშვნელოვან შემცირებასთან ერთად. Zep [30], რომელიც Graphiti-ს დროში გათვლილ ცოდნის გრაფის ძრავაზეა აგებული, მეხსიერებას წარმოაჩენს, როგორც ორდროით გრაფს, რომელიც თვალყურს ადევნებს როგორც იმას, თუ როდის მოხდა მოვლენა, ასევე იმას, თუ როდის დაფიქსირდა ის; მისი ავტორები ასევე იუწყებიან სიზუსტის გაუმჯობესებასა და შეყოვნების მნიშვნელოვან შემცირებას გრძელვადიანი მეხსიერების შეფასებისას (მომწოდებლის მიერ მოწოდებული ეს მონაცემები უნდა განვიხილოთ 2.5-ში აღწერილი ბენჩმარკის საიმედოობასთან დაკავშირებული საკითხების ფონზე). ორივე მათგანი აღნიშნავს ტალღის განმსაზღვრელ ცვლილებას — პირველ ტალღაში არსებული ეპიზოდების უბრალო აღრიცხვიდან მუდმივად კონსოლიდირებული საცავის შენარჩუნებისკენ — და ორივე წინა პლანზე წამოსწევს შეყოვნებასა და ხარჯებს, რაც მიუთითებს კვლევითი პროტოტიპიდან საწარმოო სერვისზე გადასვლაზე. ამ ტალღის ორი სისტემა განსაკუთრებით თეორიული ინტერესის საგანია. HippoRAG [7] უშუალოდ ოპერაციულს ხდის ჰიპოკამპური მეხსიერების ინდექსაციის თეორიას: ის დიდი ენის მოდელს (LLM) ნეოკორტექსად წარმოაჩენს, მონაცემების მოძიების კოდირატორებს — პარահიპოკამპურ რეგიონად, ხოლო პერსონალიზებული PageRank-ით დათვალიერებად ცოდნის გრაფს — ჰიპოკამპურ ინდექსად, რითაც გრაფის ძიების მეშვეობით მრავალნახტომიან მონაცემთა მოძიებას აღწევს. EM-LLM [8] ეფუძნება ადამიანის ეპიზოდურ მეხსიერებასა და მოვლენების სეგმენტაციის თეორიას [31], ტოკენების ნაკადს ყოფს დისკრეტულ მოვლენებად ბაიესის "გაკვირვების" (surprise) საფუძველზე გამოვლენილ საზღვრებზე და მათ იძიებს მსგავსებაზე დაფუძნებული და დროში მიმდევრობითი წვდომის კომბინაციით. იმავე პერიოდის ReadAgent-ი [9] იდეას "მთავარი აზრის" შესახებ პრაქტიკაში ნერგავს: ის გრძელ კონტექსტს ეპიზოდის ზომის გვერდებად ყოფს, თითოეულისგან მხოლოდ LLM-ის მიერ შექმნილ მთავარ აზრს ინახავს და საწყის ტექსტს მხოლოდ მაშინ უბრუნდება, როდესაც ამოცანა დეტალებს მოითხოვს. კიდევ ერთი აღსანიშნავი სისტემა, A-MEM [27], მოგონებებს აწყობს, როგორც ჩანაწერების ურთიერთდაკავშირებული ქსელი, რომელსაც აგენტი თავად აფართოებს და ასწორებს; თუმცა, ჩვენ აღვნიშნავთ, რომ ის ეფუძნება Zettelkasten-ის მეთოდს, რომელიც ინფორმაციის ორგანიზების პრაქტიკაა და არა ადამიანის მეხსიერების თეორია — ეს განასხვავება მნიშვნელოვანია ჩვენი კონკრეტული ჩარჩოსთვის.</w:t>
       </w:r>
@@ -2877,6 +2981,7 @@
           <w:rFonts w:ascii="Sylfaen" w:hAnsi="Sylfaen" w:cs="Sylfaen"/>
           <w:b w:val="0"/>
           <w:sz w:val="24"/>
+          <w:lang w:val="ka-GE"/>
         </w:rPr>
         <w:t>მესამე ტალღა — კონსოლიდაციის ეპოქა (2025–2026). 2026 წლისთვის სფეროს ყურადღება გადავიდა იმ პრობლემაზე, რომელსაც 2.2-ის კოგნიტური თეორიები წინა პლანზე წამოსწევს: კონსოლიდაციაზე. წამყვანმა პროვაიდერებმა თავიანთ სისტემებში დანერგეს ფონური, ძილსამგვარი მეხსიერების რეორგანიზაციის პროცესები — OpenAI-მ პროდუქტიზებული ფორმით, ხოლო Anthropic-მა — როგორც კვლევითი წინასწარი ვერსია [18, 19]. ეს დანერგვები მომხმარებლის მასშტაბზე ახორციელებენ (ოპერაციულს ხდიან) იმ ოფლაინ-გადათამაშების მექანიზმს, რომელსაც დამატებითი სწავლის სისტემების თეორია აღწერს. ჩვენ მათ განზრახ მოვიყვანთ ინდუსტრიის სიგნალებად და არა სამეცნიერო შედეგებად: არცერთ მათგანს არ ახლავს თან რეცენზირებული პუბლიკაცია, რაც თავისთავად მიუთითებს, რომ კონსოლიდაციის აკადემიური კვლევა დროული და ნაკლებად შესწავლილია.</w:t>
       </w:r>
@@ -2896,6 +3001,7 @@
           <w:b/>
           <w:color w:val="000000"/>
           <w:sz w:val="28"/>
+          <w:lang w:val="ka-GE"/>
         </w:rPr>
         <w:t>2.4 ხიდი: მეხსიერების თეორიიდან მეხსიერების არქიტექტურამდე</w:t>
       </w:r>
@@ -2909,6 +3015,7 @@
           <w:rFonts w:ascii="Sylfaen" w:hAnsi="Sylfaen" w:cs="Sylfaen"/>
           <w:b w:val="0"/>
           <w:sz w:val="24"/>
+          <w:lang w:val="ka-GE"/>
         </w:rPr>
         <w:t>ერთად განხილვისას, 2.2 და 2.3 ავლენს კანონზომიერებას, რომელიც, ჩვენი ცოდნით, ასე მკაფიოდ არასდროს დაფიქსირებულა. ჩვენ მას ფრთხილად ვფორმულირებთ, რათა თავიდან ავიცილოთ არასწორი არგუმენტის წამოწევის მცდელობა: მეხსიერების ყველა სისტემა არ ემყარება ერთ თეორიას — რამდენიმე მათგანი (Generative Agents, Mem0, Zep) მიზანმიმართულად მრავალმექანიზმიანი საინჟინრო კონსტრუქციაა და ჩვენ ამის საპირისპიროს არ ვამტკიცებთ. მოდელი უფრო ვიწრო და ზუსტია: იმ სისტემებს შორის, რომლებსაც აქვთ ექსპლიციტური, მოყვანილი თეორიული საფუძველი, თითოეული მათგანი დაფუძნებულია ზუსტად ერთ ადამიანის მეხსიერების თეორიაზე. ცხრილი 2.1 ამ შესაბამისობებს აშკარას ხდის.</w:t>
       </w:r>
@@ -2922,6 +3029,7 @@
           <w:rFonts w:ascii="Sylfaen" w:hAnsi="Sylfaen" w:cs="Sylfaen"/>
           <w:b/>
           <w:sz w:val="22"/>
+          <w:lang w:val="ka-GE"/>
         </w:rPr>
         <w:t>ცხრილი 2.1. ადამიანის მეხსიერების თეორიები და მათი შესაბამისი LLM-იმპლემენტაციები</w:t>
       </w:r>
@@ -2959,6 +3067,7 @@
                 <w:rFonts w:ascii="Sylfaen" w:hAnsi="Sylfaen" w:cs="Sylfaen"/>
                 <w:b/>
                 <w:sz w:val="22"/>
+                <w:lang w:val="ka-GE"/>
               </w:rPr>
               <w:t>ადამიანის მეხსიერების თეორია</w:t>
             </w:r>
@@ -2977,6 +3086,7 @@
                 <w:rFonts w:ascii="Sylfaen" w:hAnsi="Sylfaen" w:cs="Sylfaen"/>
                 <w:b/>
                 <w:sz w:val="22"/>
+                <w:lang w:val="ka-GE"/>
               </w:rPr>
               <w:t>ქცევითი სიგნატურა</w:t>
             </w:r>
@@ -2995,6 +3105,7 @@
                 <w:rFonts w:ascii="Sylfaen" w:hAnsi="Sylfaen" w:cs="Sylfaen"/>
                 <w:b/>
                 <w:sz w:val="22"/>
+                <w:lang w:val="ka-GE"/>
               </w:rPr>
               <w:t>დიდი ენის მოდელის აგენტის იმპლემენტაცია</w:t>
             </w:r>
@@ -3015,6 +3126,7 @@
                 <w:rFonts w:ascii="Sylfaen" w:hAnsi="Sylfaen" w:cs="Sylfaen"/>
                 <w:b w:val="0"/>
                 <w:sz w:val="22"/>
+                <w:lang w:val="ka-GE"/>
               </w:rPr>
               <w:t>ჰიპოკამპური მეხსიერების ინდექსაცია [26]</w:t>
             </w:r>
@@ -3033,6 +3145,7 @@
                 <w:rFonts w:ascii="Sylfaen" w:hAnsi="Sylfaen" w:cs="Sylfaen"/>
                 <w:b w:val="0"/>
                 <w:sz w:val="22"/>
+                <w:lang w:val="ka-GE"/>
               </w:rPr>
               <w:t>მთლიანი მეხსიერების რეკონსტრუქცია ნაწილობრივი მინიშნებისგან ინდექსის მეშვეობით</w:t>
             </w:r>
@@ -3051,6 +3164,7 @@
                 <w:rFonts w:ascii="Sylfaen" w:hAnsi="Sylfaen" w:cs="Sylfaen"/>
                 <w:b w:val="0"/>
                 <w:sz w:val="22"/>
+                <w:lang w:val="en-US"/>
               </w:rPr>
               <w:t>HippoRAG [7]</w:t>
             </w:r>
@@ -3071,6 +3185,7 @@
                 <w:rFonts w:ascii="Sylfaen" w:hAnsi="Sylfaen" w:cs="Sylfaen"/>
                 <w:b w:val="0"/>
                 <w:sz w:val="22"/>
+                <w:lang w:val="ka-GE"/>
               </w:rPr>
               <w:t>ეპიზოდური მეხსიერება [22] + მოვლენების სეგმენტაცია [31]</w:t>
             </w:r>
@@ -3089,6 +3204,7 @@
                 <w:rFonts w:ascii="Sylfaen" w:hAnsi="Sylfaen" w:cs="Sylfaen"/>
                 <w:b w:val="0"/>
                 <w:sz w:val="22"/>
+                <w:lang w:val="ka-GE"/>
               </w:rPr>
               <w:t>გახსენება ორგანიზებულია დისკრეტული მოვლენების გარშემო</w:t>
             </w:r>
@@ -3107,6 +3223,7 @@
                 <w:rFonts w:ascii="Sylfaen" w:hAnsi="Sylfaen" w:cs="Sylfaen"/>
                 <w:b w:val="0"/>
                 <w:sz w:val="22"/>
+                <w:lang w:val="en-US"/>
               </w:rPr>
               <w:t>EM-LLM [8]</w:t>
             </w:r>
@@ -3127,6 +3244,7 @@
                 <w:rFonts w:ascii="Sylfaen" w:hAnsi="Sylfaen" w:cs="Sylfaen"/>
                 <w:b w:val="0"/>
                 <w:sz w:val="22"/>
+                <w:lang w:val="ka-GE"/>
               </w:rPr>
               <w:t>ებინგჰაუსის დავიწყების მრუდი [23]</w:t>
             </w:r>
@@ -3145,6 +3263,7 @@
                 <w:rFonts w:ascii="Sylfaen" w:hAnsi="Sylfaen" w:cs="Sylfaen"/>
                 <w:b w:val="0"/>
                 <w:sz w:val="22"/>
+                <w:lang w:val="ka-GE"/>
               </w:rPr>
               <w:t>გაუწვრთნელი დეტალები ქრება; გამეორება აძლიერებს</w:t>
             </w:r>
@@ -3163,6 +3282,7 @@
                 <w:rFonts w:ascii="Sylfaen" w:hAnsi="Sylfaen" w:cs="Sylfaen"/>
                 <w:b w:val="0"/>
                 <w:sz w:val="22"/>
+                <w:lang w:val="en-US"/>
               </w:rPr>
               <w:t>MemoryBank / SiliconFriend [6]</w:t>
             </w:r>
@@ -3183,6 +3303,7 @@
                 <w:rFonts w:ascii="Sylfaen" w:hAnsi="Sylfaen" w:cs="Sylfaen"/>
                 <w:b w:val="0"/>
                 <w:sz w:val="22"/>
+                <w:lang w:val="ka-GE"/>
               </w:rPr>
               <w:t>ბუნდოვანი კვალი: არსი და სიტყვასიტყვითი [24]</w:t>
             </w:r>
@@ -3201,6 +3322,7 @@
                 <w:rFonts w:ascii="Sylfaen" w:hAnsi="Sylfaen" w:cs="Sylfaen"/>
                 <w:b w:val="0"/>
                 <w:sz w:val="22"/>
+                <w:lang w:val="ka-GE"/>
               </w:rPr>
               <w:t>ინარჩუნებს მნიშვნელობას, და არა ზუსტ ფორმულირებას</w:t>
             </w:r>
@@ -3219,6 +3341,7 @@
                 <w:rFonts w:ascii="Sylfaen" w:hAnsi="Sylfaen" w:cs="Sylfaen"/>
                 <w:b w:val="0"/>
                 <w:sz w:val="22"/>
+                <w:lang w:val="en-US"/>
               </w:rPr>
               <w:t>ReadAgent [9]</w:t>
             </w:r>
@@ -3239,6 +3362,7 @@
                 <w:rFonts w:ascii="Sylfaen" w:hAnsi="Sylfaen" w:cs="Sylfaen"/>
                 <w:b w:val="0"/>
                 <w:sz w:val="22"/>
+                <w:lang w:val="ka-GE"/>
               </w:rPr>
               <w:t>კომპლემენტარული სასწავლო სისტემები [25]</w:t>
             </w:r>
@@ -3257,6 +3381,7 @@
                 <w:rFonts w:ascii="Sylfaen" w:hAnsi="Sylfaen" w:cs="Sylfaen"/>
                 <w:b w:val="0"/>
                 <w:sz w:val="22"/>
+                <w:lang w:val="ka-GE"/>
               </w:rPr>
               <w:t>სწრაფი ეპიზოდური ჩაწერა, ნელი ოფლაინ კონსოლიდაცია</w:t>
             </w:r>
@@ -3275,6 +3400,7 @@
                 <w:rFonts w:ascii="Sylfaen" w:hAnsi="Sylfaen" w:cs="Sylfaen"/>
                 <w:b w:val="0"/>
                 <w:sz w:val="22"/>
+                <w:lang w:val="ka-GE"/>
               </w:rPr>
               <w:t>"სიზმრის" კონსოლიდაციის სისტემები [18, 19]</w:t>
             </w:r>
@@ -3295,6 +3421,7 @@
                 <w:rFonts w:ascii="Sylfaen" w:hAnsi="Sylfaen" w:cs="Sylfaen"/>
                 <w:b w:val="0"/>
                 <w:sz w:val="22"/>
+                <w:lang w:val="ka-GE"/>
               </w:rPr>
               <w:t>(აქტივაციასთან მსგავსი, თეორიულად დაუმტკიცებელი)</w:t>
             </w:r>
@@ -3313,6 +3440,7 @@
                 <w:rFonts w:ascii="Sylfaen" w:hAnsi="Sylfaen" w:cs="Sylfaen"/>
                 <w:b w:val="0"/>
                 <w:sz w:val="22"/>
+                <w:lang w:val="ka-GE"/>
               </w:rPr>
               <w:t>ახლახან × მნიშვნელობა × რელევანტურობა — მოპოვება</w:t>
             </w:r>
@@ -3331,6 +3459,7 @@
                 <w:rFonts w:ascii="Sylfaen" w:hAnsi="Sylfaen" w:cs="Sylfaen"/>
                 <w:b w:val="0"/>
                 <w:sz w:val="22"/>
+                <w:lang w:val="ka-GE"/>
               </w:rPr>
               <w:t>გენერაციული აგენტები [10]</w:t>
             </w:r>
@@ -3350,6 +3479,7 @@
           <w:rFonts w:ascii="Sylfaen" w:hAnsi="Sylfaen" w:cs="Sylfaen"/>
           <w:b w:val="0"/>
           <w:sz w:val="24"/>
+          <w:lang w:val="ka-GE"/>
         </w:rPr>
         <w:t>აქედან გამომდინარეობს ორი დაკვირვება. პირველი, რუკირება რეალურია, მაგრამ ნაწილობრივი: თეორიულად დასაბუთებული თითოეული სისტემა იყენებს ერთ მექანიზმს, იზოლირებულად და, უმთავრესად, ამოცანის სიზუსტის გასაუმჯობესებლად. მეორე — და ეს არის საკითხი, რომელსაც წინამდებარე ნაშრომი ეხება — რომ ეს თეორიულად დასაბუთებული სისტემები იშვიათად შედარებულა ერთმანეთთან და, ჩვენი ცოდნით, არასდროს — იმის თვალსაზრისით, თუ როგორ აღიქვამს მათ განსხვავებულ ქცევას ადამიანი-თანამოსაუბრე. უახლოესი პრეცედენტები ან ერთ სისტემაში აერთიანებენ მექანიზმებს, ან აფასებენ ერთი მექანიზმის სიზუსტეს. სინთეზი, რომელსაც შედარებითი, აღქმაზე ორიენტირებული კვლევა უზრუნველყოფდა, ამჟამად არ არსებობს.</w:t>
       </w:r>
@@ -3369,6 +3499,7 @@
           <w:b/>
           <w:color w:val="000000"/>
           <w:sz w:val="28"/>
+          <w:lang w:val="ka-GE"/>
         </w:rPr>
         <w:t>2.5 საუბრის მეხსიერების შეფასება: ბენჩმარკები და მათი შეზღუდვები</w:t>
       </w:r>
@@ -3382,6 +3513,7 @@
           <w:rFonts w:ascii="Sylfaen" w:hAnsi="Sylfaen" w:cs="Sylfaen"/>
           <w:b w:val="0"/>
           <w:sz w:val="24"/>
+          <w:lang w:val="ka-GE"/>
         </w:rPr>
         <w:t>ამ სფეროში შეფასების დომინანტური რეჟიმია ხანგრძლივი სინთეზური დიალოგების დროს კითხვა-პასუხის ბენჩმარკი. LoCoMo [1] მოიცავს ხანგრძლივ, მრავალსესიან საუბრებს და კითხვების ნაკრებს, რომელიც მოიცავს ერთნახტომიან, მრავალნახტომიან, დროით და ღია დომენის არგუმენტაციას; მისი მთავარი აღმოჩენაა, რომ ხანგრძლივი კონტექსტის მქონე მოდელები და მონაცემთა მოძიებაზე დაფუძნებული მიდგომებიც კი, მთლიანობაში, მნიშვნელოვნად ჩამორჩებიან ადამიანის წარმადობას, ხოლო დროით არგუმენტაციაში — კიდევ უფრო მეტად. LongMemEval [2] გრძელვადიან მეხსიერებას ხუთ უნარად ყოფს — ინფორმაციის ამოღება, მრავალსესიური მსჯელობა, დროითი მსჯელობა, ცოდნის განახლება და თავის შეკავება — და აღწერს კომერციული ასისტენტების სიზუსტის მნიშვნელოვან კლებას ხანგრძლივი ურთიერთქმედების პირობებში. ორივე შემთხვევაში, დროითი მსჯელობა თანმიმდევრულად ყველაზე სუსტი კატეგორიაა.</w:t>
       </w:r>
@@ -3395,6 +3527,7 @@
           <w:rFonts w:ascii="Sylfaen" w:hAnsi="Sylfaen" w:cs="Sylfaen"/>
           <w:b w:val="0"/>
           <w:sz w:val="24"/>
+          <w:lang w:val="ka-GE"/>
         </w:rPr>
         <w:t>თუმცა, ამ ბენჩმარკებს სანდოობის პრობლემა აქვთ, რომელსაც წინამდებარე ნაშრომი მთავარ მიგნებად განიხილავს და არა სქოლიოდ. LoCoMo-ზე მომწოდებლების მიერ მოწოდებული ქულების გამეორება რთული აღმოჩნდა და ისინი ურთიერთგამომრიცხავნი არიან: ერთი სისტემის მიერ მითითებული შედეგი დამოუკიდებელ რეპლიკაციაში მნიშვნელოვნად დაბალი აღმოჩნდა და შემდგომში გადაიხედა [32]. დამოუკიდებელმა 2026-მა აუდიტმა [33] დაადგინა, რომ ბენჩმარკის "ოქროს პასუხების" დაახლოებით ექვსი პროცენტი თავისთავად არასწორია — რაც მიღწევადი ქულის ზღვარს დაახლოებით 94%-მდე ამცირებს — და რომ ავტომატურმა LLM-მსაჯულმა უმეტეს შემთხვევაში მიზანმიმართულად არასწორი პასუხები მიიღო. მეთოდოლოგიური გაკვეთილი ორმაგია: მეხსიერების ბენჩმარკის გამოქვეყნებულ მაჩვენებლებზე საჭიროა სიფრთხილით მოვეკიდოთ და ამ სფეროში ნებისმიერმა ტექნიკურმა შეფასებამ საკუთარი შეფასების პროცედურა თავად უნდა გადაამოწმოს, ნაცვლად იმისა, რომ ხარვეზიანი პროცედურა მემკვიდრეობით მიიღოს. (LoCoMo-სა და LongMemEval-ის მიერ [1, 2] წარმოდგენილი რეცენზირებული ადამიანისა და მანქანის შედეგებს შორის არსებული სხვაობა არის ხარისხობრივი აღმოჩენა, რომელიც განსხვავებული და უფრო მყარი ტიპისაა, ვიდრე ეს სადავო აბსოლუტური ლიდერბორდის ქულები.)</w:t>
       </w:r>
@@ -3408,6 +3541,7 @@
           <w:rFonts w:ascii="Sylfaen" w:hAnsi="Sylfaen" w:cs="Sylfaen"/>
           <w:b w:val="0"/>
           <w:sz w:val="24"/>
+          <w:lang w:val="ka-GE"/>
         </w:rPr>
         <w:t>კიდევ ერთი, და ამ ნაშრომისთვის გადამწყვეტი, შეზღუდვა მოდალობასა და შედეგს ეხება. აქ განხილული ყველა ძირითადი გრძელვადიანი მეხსიერების ბენჩმარკი — LoCoMo, LongMemEval და უფრო ძველი Multi-Session Chat [35] — მუშაობს მხოლოდ ტექსტზე და ზომავს ფაქტობრივ სიზუსტეს და არა გამოცდილ ხარისხს. არცერთი მათგანი არ ეხება მეხსიერების მოძიებას ხმოვანი ურთიერთქმედების რეალურ დროში შეფერხებების პირობებში და არცერთი არ ზომავს, უმჯობესებს თუ არა უკეთესი მეხსიერება ურთიერთობას. ამ ქვედარგის ინსტრუმენტებს შეუძლიათ გვითხრან, სწორად იხსენებს თუ არა სისტემა; მათ არ შეუძლიათ გვითხრან, აუმჯობესებს თუ არა ზუსტი გახსენება მომხმარებლის მიერ სისტემასთან განცდილ ურთიერთობას — მის აღქმულ სოციალურ თანდასწრებას, ალიანსს ან ადამიანურობას.</w:t>
       </w:r>
@@ -3427,6 +3561,7 @@
           <w:b/>
           <w:color w:val="000000"/>
           <w:sz w:val="28"/>
+          <w:lang w:val="ka-GE"/>
         </w:rPr>
         <w:t>2.6 ასისტენტიდან თანამოსაუბრემდე: მეხსიერება და აღქმული ურთიერთობა</w:t>
       </w:r>
@@ -3440,6 +3575,7 @@
           <w:rFonts w:ascii="Sylfaen" w:hAnsi="Sylfaen" w:cs="Sylfaen"/>
           <w:b w:val="0"/>
           <w:sz w:val="24"/>
+          <w:lang w:val="ka-GE"/>
         </w:rPr>
         <w:t>სისტემის აღქმა, როგორც უბრალო ასისტენტისა, ან როგორც თანამოსაუბრის, ნაკლებად არის დამოკიდებული სიზუსტეზე და მეტად — ურთიერთობაზე. ამ ურთიერთობის შესწავლა კი სხვა ლიტერატურის სფეროს განეკუთვნება, რომელიც ეფუძნება დაკვირვებას, რომ ადამიანები სოციალურად რეაგირებენ გამოთვლით აგენტებზე: პარადიგმას "კომპიუტერები სოციალური აქტორები არიან" და მის განმარტებას, რომ მედია, მრავალი სოციალური რეფლექსის თვალსაზრისით, რეალური ინტერაქციის პარტნიორების ეკვივალენტურია [28]. ამ ჩარჩოში, არაერთი უახლესი ნაშრომი იკვლევს, თუ რა კონკრეტულად განასხვავებს სისტემას, რომელიც მხოლოდ ასისტენტად აღიქმება, სისტემისგან, რომელიც ურთიერთობათა პარტნიორად აღიქმება; მეხსიერება აქ ცენტრალურ, ორმაგი მახვილის მქონე ბერკეტად განმეორდება.</w:t>
       </w:r>
@@ -3453,6 +3589,7 @@
           <w:rFonts w:ascii="Sylfaen" w:hAnsi="Sylfaen" w:cs="Sylfaen"/>
           <w:b w:val="0"/>
           <w:sz w:val="24"/>
+          <w:lang w:val="ka-GE"/>
         </w:rPr>
         <w:t>დადებითი მხრიდან, კოქსისა და მისი კოლეგების [11] მიერ ჩატარებულმა კონტროლირებადმა კვლევამ აჩვენა, რომ ჩატ-ბოტი, რომელიც მომხმარებლების წინა სესიების გამოსვლებს იყენებდა, უფრო ინტელექტუალურად და მიმზიდველად აღიქმებოდა, ვიდრე ის, რომელიც ამას არ აკეთებდა. უარყოფითი მხრიდან, იმავე კვლევამ დაადგინა, რომ პირდაპირი ციტირება — ზუსტი, სიტყვა-სიტყვით გადმოცემა — ზრდიდა მომხმარებლების შეშფოთებას კონფიდენციალურობასთან დაკავშირებით, პარაფრაზირებულ მითითებებთან შედარებით. ეს არის 2.2-ის "ბუნდოვანი კვალის" არგუმენტის ემპირიული საყრდენი: არსებითი შინაარსის დონეზე გახსენება ურთიერთობათა კუთხით უპირატესი იყო სიტყვასიტყვით გახსენებასთან შედარებით, მიუხედავად იმისა, რომ ორივე მათგანი მეხსიერების გამოვლინებაა. დამხმარე საპილოტე კვლევამ [34] აჩვენა, რომ ჩატ-ბოტს მეხსიერების მინიჭება მას უფრო ინტელექტუალურს, მაგრამ ნაკლებად სანდოს ხდიდა, თუ მეხსიერება მომხმარებლისთვის ხილული არ იყო. ასე წოდებული "კომპანიონის" აპლიკაციების სფეროს მტკიცებულებებიც იმავეზე მიუთითებს: Replika-ს მომხმარებლების კვალიტატիվურმა კვლევამ [3] მეხსიერების გაუმართაობა — სახელების, უპირატესობებისა და საერთო ისტორიის დავიწყება — ურთიერთობის დარღვევის მთავარ წყაროდ გამოავლინა, ხოლო იმავე პროდუქტში მოულოდნელი ცვლილების შესახებ ჩატარებულმა ბუნებრივ-ექსპერიმენტულმა კვლევამ [4] აჩვენა, რომ მომხმარებელთა გაღიზიანება სტატისტიკურად განპირობებული იყო აგენტის იდენტობის აღქმული შეუწყვეტლობის მიერ. მოკლედ რომ ვთქვათ, მეხსიერება უბრალოდ ფუნქცია არ არის, რომელიც ამოცანის შესრულებას აუმჯობესებს; ის არის იმ უწყვეტობის შემადგენელი ნაწილი, რომელიც ურთიერთობას სჭირდება — და ზედმეტად პირდაპირი გახსენება თავისთავად შეუძლია ნდობის შერყევა.</w:t>
       </w:r>
@@ -3466,6 +3603,7 @@
           <w:rFonts w:ascii="Sylfaen" w:hAnsi="Sylfaen" w:cs="Sylfaen"/>
           <w:b w:val="0"/>
           <w:sz w:val="24"/>
+          <w:lang w:val="ka-GE"/>
         </w:rPr>
         <w:t>მეორე ქცევითი ღერძი, რომელიც გამოსარჩევს თანამოსაუბრეს ასისტენტისგან, ინიციატივაა. პროაქტიული აგენტები, რომლებიც აღიქვამენ დიალოგის მნიშვნელოვან მოვლენებს და მათზე რეაგირებენ, ზრდიან ჩართულობასა და აღქმულ მხარდაჭერას, წმინდად რეაქტიულ სტანდარტებთან შედარებით [12]. მსგავს კვლევაში, პროაქტიულობის მოდელი, რომელიც აგენტის "შინაგანი აზრებით" იმართებოდა, მომხმარებლებმა რეაქტიულ საკონტროლო ჯგუფთან შედარების დაახლოებით 82%-იან შემთხვევაში არჩიეს [13]. ინიციატივა, რომელიც მეხსიერებას ეფუძნება — იმის გაგრძელება, რაც მომხმარებელმა რამდენიმე დღით ადრე ახსენა — ალბათ, ყველაზე თვალსაჩინო პარტნიორული ქცევაა, რომელიც სისტემას შეუძლია გამოავლინოს, და ეს ის არის, რისი შესწავლის შესაძლებლობაც ამ ნაშრომის პლატფორმას გააჩნია.</w:t>
       </w:r>
@@ -3479,6 +3617,7 @@
           <w:rFonts w:ascii="Sylfaen" w:hAnsi="Sylfaen" w:cs="Sylfaen"/>
           <w:b w:val="0"/>
           <w:sz w:val="24"/>
+          <w:lang w:val="ka-GE"/>
         </w:rPr>
         <w:t>იგივე ლიტერატურაში მოყვანილი გაფრთხილება ზღუდავს ამ თეზისის მტკიცებას მოდალობის შესახებ. ოთხკვირიანმა რანდომიზებულმა კონტროლირებადმა კვლევამ [15] ვერ დაადგინა ხმოვანი და ტექსტური კომუნიკაციის მიზეზ-შედეგობრივი კავშირი მომხმარებლების მარტოობასა და დამოკიდებულებასთან დაკავშირებით, რადგან ურთიერთობის შედეგები, ამის ნაცვლად, განპირობებული იყო გამოყენების პატერნებითა და მომხმარებლის თვისებებით. ეს არ ასუსტებს ამ ნაშრომის საფუძვლიანობას; ის მას ამახვილებს. იმ კვლევაში შემოწმდა, მოქმედებს თუ არა ხმის რეჟიმი თავისთავად ზოგად კეთილდღეობაზე და არა ის, ცვლის თუ არა ხმის აგენტის მიღმა მდგარი მეხსიერების არქიტექტურა აღქმულ ურთიერთობას. ეს უკანასკნელი სწორედ რომ გამოუცდელი საკითხია, ხოლო ხმის რეჟიმის დახვეწის შესახებ ნულოვანი შედეგი არის მიზეზი, რომ მანიპულაცია მხოლოდ ხმას კი არ, არამედ მეხსიერებაში განვიხილოთ.</w:t>
       </w:r>
@@ -3492,6 +3631,7 @@
           <w:rFonts w:ascii="Sylfaen" w:hAnsi="Sylfaen" w:cs="Sylfaen"/>
           <w:b w:val="0"/>
           <w:sz w:val="24"/>
+          <w:lang w:val="ka-GE"/>
         </w:rPr>
         <w:t>ამ აღქმების გასაზომად, სფერო გვთავაზობს ვალიდურ ინსტრუმენტებს. ხელოვნური სოციალური აგენტის კითხვარი [14] მოიცავს ცხრამეტ კონსტრუქტს — მათ შორის სოციალურ თანდასწრებას, მომხმარებლისა და აგენტის ალიანსს და სანდოობას (სუბშკალა, რომლითაც წინამდებარე ნაშრომი ოპერაციულად წარმოაჩენს აღქმულ ადამიანურობას) — გრძელი და მოკლე ვერსიებით და ღიად ხელმისაწვდომია; ეს არის მთავარი ინსტრუმენტი, რომელიც აქ არის გამოყენებული, დამატებულია დაკავშირებული კონსტრუქტებისთვის დადგენილი შკალებით (განსაკუთრებით Godspeed აღქმული ინტელექტისთვის).</w:t>
       </w:r>
@@ -3511,6 +3651,7 @@
           <w:b/>
           <w:color w:val="000000"/>
           <w:sz w:val="28"/>
+          <w:lang w:val="ka-GE"/>
         </w:rPr>
         <w:t>2.7 ღია პრობლემები და შეზღუდვები</w:t>
       </w:r>
@@ -3524,6 +3665,7 @@
           <w:rFonts w:ascii="Sylfaen" w:hAnsi="Sylfaen" w:cs="Sylfaen"/>
           <w:b w:val="0"/>
           <w:sz w:val="24"/>
+          <w:lang w:val="ka-GE"/>
         </w:rPr>
         <w:t>განხილული ლიტერატურის სინთეზირებისას, ღია პრობლემები ორ ჯგუფად იყოფა. პირველი მათგანია ის შეზღუდვები, რომლებსაც სფერო თავად აღიარებს გადაუჭრელად: სელექციური დავიწყება, რომელიც სფეროს კვლევებმა [16] არაერთხელ დაასახელეს არსებითად, თუმცა თითქმის არ შეფასებულა და სისტემების უმეტესობაში მხოლოდ ტევადობის ლიმიტის გვერდითი ეფექტის სახით ვლინდება და არა დიზაინის მიზნით; დროითი მსჯელობა, რომელიც ყველა განხილულ ბენჩმარკში ყველაზე სუსტი კატეგორიაა, და შემოთავაზებული გამოსავალი ამ ზღვარს ამცირებს, მაგრამ არ ხურავს; და 2.5-ის ბენჩმარკების სანდოობის კრიზისი, რომელიც სფეროს უსანდოო, ნეიტრალური საზომის გარეშე ტოვებს. მეორე ჯგუფს მიეკუთვნება ორი ხარვეზი, რომლებიც პირდაპირ განაპირობებს ამ დისერტაციას. აქ განხილული მეხსიერების შესახებ არსებული ლიტერატურა მთლიანად ტექსტზეა ორიენტირებული: მეხსიერების არქიტექტურების ქცევა ხმოვანი ინტერაქციის შეფერხების ლიმიტების პირობებში და ამ მოდალობაში მათი აღქმითი ეფექტები, ფაქტობრივად, არ არის შესწავლილი. ხოლო არსებული აღქმის კვლევები მეხსიერებას იზოლირებულ ცვლადად განიხილავენ ერთ სისტემაში; არცერთი არ ადარებს სხვადასხვა მეხსიერების თეორიაზე დაფუძნებულ არქიტექტურებს იმის მიხედვით, თუ რას განიცდის ადამიანი.</w:t>
       </w:r>
@@ -3543,6 +3685,7 @@
           <w:b/>
           <w:color w:val="000000"/>
           <w:sz w:val="28"/>
+          <w:lang w:val="ka-GE"/>
         </w:rPr>
         <w:t>2.8 ამ ნაშრომის ადგილი</w:t>
       </w:r>
@@ -3556,6 +3699,7 @@
           <w:rFonts w:ascii="Sylfaen" w:hAnsi="Sylfaen" w:cs="Sylfaen"/>
           <w:b w:val="0"/>
           <w:sz w:val="24"/>
+          <w:lang w:val="ka-GE"/>
         </w:rPr>
         <w:t>ზემოთ განხილული ორი სფერო ერთიანდება იმ წერტილში, რომელიც ჩვენთვის ხელმისაწვდომ ლიტერატურაში ცარიელია. ერთი მხრივ, დიდი ენის მოდელების (LLM) მეხსიერების სისტემებიდან თითოეული ერთი კონკრეტული ადამიანის მეხსიერების თეორიის იმპლემენტაციაა, რომელიც შეფასებულია თითქმის ექსკლუზიურად ფაქტობრივი სიზუსტის მიხედვით. მეორე მხრივ, აღქმის კვლევების სერია ადასტურებს, რომ მეხსიერება აყალიბებს — და ასევე შეუძლია შეარყოს — ურთიერთობის აღქმული ხარისხი, მაგრამ მეხსიერებას განიხილავს როგორც ბინარულ ან ერთსისტემურ მანიპულაციას. ჩვენთვის ხელმისაწვდომ ლიტერატურაში — მეხსიერების არქიტექტურისა და ადამიანი-აგენტის აღქმის სფეროებში ჩატარებული სისტემური ძიებების შედეგად — ვერ მოიძებნა არცერთი კონტროლირებადი კვლევა, რომელიც სხვადასხვა ადამიანური მეხსიერების თეორიაზე დაფუძნებულ არქიტექტურებს ერთმანეთს ადარებდეს მომხმარებლის მიერ აღქმული სოციალური კონსტრუქტების მიხედვით და რომლის ობიექტიც ხმის მოდალობაა. წინამდებარე ნაშრომის სიახლე ამ შერწყმაშია — რეალურ ხმოვან სისტემაში თეორიულად დასაბუთებული მეხსიერების არქიტექტურების შედარება, მათი შეფასება აღქმული სოციალური თანდასწრების, ალიანსისა და ადამიანურობის მიხედვით — და არა რომელიმე ცალკეული კომპონენტის სიახლეში, რომელთაგან თითოეული იზოლირებულად არსებობს. იმის გასარკვევად, თუ რა არის ნათქვამი და რა — არა: კვლევა უცვლელად ტოვებს ინტერაქციის მოდალობას — მთლიანად ხმის რეჟიმი, ტექსტურ ნაწილს გარეშე — ამგვარად, მისი წვლილი ხმის გარემოში მეხსიერების არქიტექტურის ეფექტებს ეხება და არა ხმის ტექსტთან შედარებას. სწორედ ამ გადაკვეთას იკვლევს ნაშრომის დარჩენილი ნაწილი.</w:t>
       </w:r>
@@ -3576,6 +3720,7 @@
           <w:b/>
           <w:color w:val="000000"/>
           <w:sz w:val="28"/>
+          <w:lang w:val="ka-GE"/>
         </w:rPr>
         <w:t>3. კვლევის მეთოდები</w:t>
       </w:r>
@@ -3595,6 +3740,7 @@
           <w:b/>
           <w:color w:val="000000"/>
           <w:sz w:val="28"/>
+          <w:lang w:val="ka-GE"/>
         </w:rPr>
         <w:t>3.1 კვლევის დიზაინი და წვლილი</w:t>
       </w:r>
@@ -3608,6 +3754,7 @@
           <w:rFonts w:ascii="Sylfaen" w:hAnsi="Sylfaen" w:cs="Sylfaen"/>
           <w:b w:val="0"/>
           <w:sz w:val="24"/>
+          <w:lang w:val="ka-GE"/>
         </w:rPr>
         <w:t>ეს თავი განსაზღვრავს დიზაინის, კონცეფციის დამტკიცებისა და შეფასების-მეთოდოლოგიური სადისერტაციო ნაშრომის მეთოდოლოგიას. 1.2-ში მითითებული მიზნის — ხმოვანი თანამოსაუბრის სისტემისთვის კოგნიტურ თეორიებზე დაფუძნებული გრძელვადიანი მეხსიერების არქიტექტურის შემუშავება და მისი გავლენის დადგენა მომხმარებლის მიერ აღქმულ სოციალურ კონსტრუქტებზე — შესაბამისად, ნაშრომი სამ კოორდინირებულ წვლილს შეაქვს, და მნიშვნელოვანია თავიდანვე აღინიშნოს, რომელთაგან რომელი სრულდება აქ, ხოლო რომელი მკაცრად არის შემუშავებული, მაგრამ განზრახ გადავადებული.</w:t>
       </w:r>
@@ -3621,6 +3768,7 @@
           <w:rFonts w:ascii="Sylfaen" w:hAnsi="Sylfaen" w:cs="Sylfaen"/>
           <w:b w:val="0"/>
           <w:sz w:val="24"/>
+          <w:lang w:val="ka-GE"/>
         </w:rPr>
         <w:t>სამი წვლილია: (ა) მეხსიერების არქიტექტურა ("პროფილი C"), რომლის მექანიზმები ეტაპობრივად ეფუძნება ადამიანის მეხსიერების კოგნიტურ თეორიებსა და მათ ქცევით ნიშნებს (3.2); (ბ) კურატორიული კონტროლის მქონე შეფასების მეთოდოლოგია, რომლის ცენტრალური ინსტრუმენტია აქტიური საკონტროლო პირობა — B+ — რომელიც გამოყოფს ადამიანის მეხსიერების დინამიკის ეფექტს LLM-ის კურატორიული სამუშაოების ზოგადი წაკითხვადობის ზრდისგან (3.3); და (გ) კონცეფციის დამტკიცების იმპლემენტაცია არქიტექტურის ორხაზიანი ტექნიკური და სიმულირებული შეფასებისთანავე (3.4–3.5). სრული კვლევა ადამიანთა მონაწილეობით, რომელსაც მიზანი საბოლოოდ ითვალისწინებს, წარმოდგენილია 3.5(c)-ში, როგორც სრულად სპეციფიცირებული, მაგრამ ჯერ არჩატარებული პროტოკოლი — მომავალი ნამუშევარი, საკუთარი ძალის (სტატისტიკური სიმძლავრის) ანალიზით — და არა როგორც კვლევა, რომლის მონაცემებიც 4-შია წარმოდგენილი.</w:t>
       </w:r>
@@ -3634,6 +3782,7 @@
           <w:rFonts w:ascii="Sylfaen" w:hAnsi="Sylfaen" w:cs="Sylfaen"/>
           <w:b w:val="0"/>
           <w:sz w:val="24"/>
+          <w:lang w:val="ka-GE"/>
         </w:rPr>
         <w:t>ამიერი მოცულობის განსაზღვრა არის გათვლილი პასუხი სამუშაოს მიმდინარეობისას დოკუმენტირებულ შესაძლებლობათა შეზღუდვაზე (F17): არსებული Voice Companion პლატფორმა მხოლოდ A პირობას უჭერს მხარს (არ არის გრძელვადიანი მეხსიერება); B, B+ და C პირობები, ხმის მეხსიერებაში გადაცემის ინტერფეისთან და თითოეული მონაწილისთვის ინდივიდუალურ დანერგვასთან ერთად, წარმოადგენს "მწვანე ფურცლიდან" ინჟინერიას, რომლის სოლო შექმნასაც თორმეტიდან თექვსმეტ კვირამდე სჭირდება. ამ დისერტაციისთვის გამოყოფილ დროში ოცი მონაწილის მონაწილეობით საველე, მრავალკვირიანი, შიდა-სუბიექტური კვლევის ჩატარება შეუძლებელია. იმის ნაცვლად, რომ დასუსტდეს კვლევის დიზაინი გრაფიკის შესაბამისად — ან, რაც უარესია, მოხდეს არარსებული მონაცემების მოყვანა — დისერტაცია პატიოსნად არის ჩამოყალიბებული, როგორც მისი მთავარი შედეგი, რომელიც ეფუძნება აპარატურასა და მეთოდოლოგიას, კონცეფციის დამტკიცებას, რომელიც ასახავს მექანიზმებს, და შეფასებას, რომელიც მათ ტექნიკურად და სიმულაციის მეშვეობით იკვლევს. ამ ნაშრომში არცერთი მტკიცება არ ეფუძნება ადამიანთა მონაწილეობით მიღებულ მონაცემებს; სადაც კი აღქმის შედეგებია განხილული, ისინი ან სიმულაციური პროქსებია (მკაფიოდ აღნიშნული, 3.5(ბ)), ან პროგნოზებია, რომლებიც შემდგომი პროტოკოლით უნდა შემოწმდეს.</w:t>
       </w:r>
@@ -3647,6 +3796,7 @@
           <w:rFonts w:ascii="Sylfaen" w:hAnsi="Sylfaen" w:cs="Sylfaen"/>
           <w:b w:val="0"/>
           <w:sz w:val="24"/>
+          <w:lang w:val="ka-GE"/>
         </w:rPr>
         <w:t>მეორე, უფრო ღრმა შეზღუდვა განსაზღვრავს ინფერენციულ მიდგომას და აქ არის ფორმულირებული, რათა მთელ თავს მართავდეს. ეფექტის ზომის ა-პრიორი ანალიზი (F18), რომელიც ეფუძნება კოქსის კვლევას [11] და დაკავშირებულ სოციალური სიგნალების მტკიცებულებებს, მიუთითებს, რომ სამეცნიეროდ ცენტრალური კონტრასტი — C &gt; B+ — კონსტრუქციულად არის დიზაინში ყველაზე მცირე ეფექტი (კოენსის dz ≈ 0.28 "ცივი სტარტის" გაზავებამდე), რადგან B+ უკვე მოიცავს მეხსიერების ორ ყველაზე მყარად დადასტურებულ სარგებელს: ყოფნას და შინაარსობრივ დონეზე სუფთა პარაფრაზს. ამ კლასის კვლევისთვის ნორმატიული ნიმუშის ზომისთვის (n ≈ 20; F12), ყველაზე მცირე საიმედოდ აღმოჩენადი ეფექტი დაახლოებით dz ≈ 0.78–0.86-ია, ხოლო C &gt; B+-ის აღმოჩენას დასჭირდებოდა n ≈ 116–159 — რაც შეუძლებელია ადამიანისა და აგენტის ურთიერთქმედების ჟანრისთვის. შედეგი განზრახ მიიღეს და არა დამალეს: C &gt; B+ განიხილება როგორც წინასწარ დარეგისტრირებული შეფასების სამიზნე — ეფექტის ზომა 95%-იანი სანდო ინტერვალით — და არა როგორც დამადასტურებელი ნულ-ჰიპოთეზის ტესტი. შედარებები, რომელთა მიმართაც არსებობს მძლავრობა (C &gt; A, და მიმართულებითი B+ &gt; B და C &gt; B), არის დამადასტურებელი ტესტები. C &gt; B+-ზე ზუსტად შეფასებული ნული თავისთავად შინაარსობრივი, გამოსაქვეყნებელი შედეგია: ის მიუთითებდა, რომ "ადამიანის მსგავსი" მეხსიერების აღქმითი ღირებულება განპირობებულია არსებითი შინაარსის მოწესრიგებითა და თანდასწრებით და არა ებინგჰაუსის დაშლით, სალიენს-გეითინგით ან კონსოლიდაციით — დასკვნა, რომლის ინტერპრეტაციისთვისაც B+ კონტროლი სპეციალურად შეიქმნა. შეფასების ეს მიდგომა, შესაბამისად, არ არის სიმკაცრისგან უკან დახევა, არამედ მტკიცებისა და მიღწევადი მტკიცებულების სწორი კალიბრაციაა.</w:t>
       </w:r>
@@ -3666,6 +3816,7 @@
           <w:b/>
           <w:color w:val="000000"/>
           <w:sz w:val="28"/>
+          <w:lang w:val="ka-GE"/>
         </w:rPr>
         <w:t>3.2 პროფილი C-ის მეხსიერების არქიტექტურა</w:t>
       </w:r>
@@ -3679,6 +3830,7 @@
           <w:rFonts w:ascii="Sylfaen" w:hAnsi="Sylfaen" w:cs="Sylfaen"/>
           <w:b w:val="0"/>
           <w:sz w:val="24"/>
+          <w:lang w:val="ka-GE"/>
         </w:rPr>
         <w:t>პროფილი C არის ერთიანი მეხსიერების ძრავა, რომელიც აერთიანებს ხუთ დადასტურებულ კოგნიტურ-მეხსიერების თეორიას — ატკინსონ-შიფრინის მრავალსაცავიან მოდელს [20], ებინგჰაუსის დავიწყების მრუდს [23], ტულვინგის ეპიზოდური და სემანტიკური განასხვავებას [22], ბუნდოვანი კვალით თეორიას [24] და სწავლის კომპლემენტარული სისტემების ჩარჩოს [25] — ერთ სასიცოცხლო ციკლში. ორი დამატებითი წყარო შემოდის, როგორც იმპლემენტაციის პრეცედენტი და ზუსტი გადარქმევა და არა როგორც დამატებითი, ჩართული თეორიები: ჰიპოკამპური ინდექსაცია [7,26] (კონსოლიდაციის უკუკავშირის მითითებებისთვის) და დამუშავების დონეები (კოდირების დროის სალიენსის მექანიზმისთვის). ჩვენ ვამბობთ "შედგება და არა "ერთიანდება": თეორიები ერთმანეთთან თანამშრომლობისთვისაა შექმნილი ერთი კოჰერენტული ობიექტის ფარგლებში, მაგრამ არქიტექტურა არ ამტკიცებს მათ შეთავსებას ფუნდამენტური მექანიზმის დონეზე, და 3.2-ის საფუძვლად ჩათვლილია პროექტირების ეტაპზე მიღებული შთაგონება სახელობითი გამოტოვებებით (იხილეთ ქვემოთ), და არა კოგნიტური ერთგულების პრეტენზია — რაც შეესაბამება 2.2-ში დავიწყების მრუდისთვის უკვე მითითებულ გაფრთხილებას.</w:t>
       </w:r>
@@ -3692,6 +3844,7 @@
           <w:rFonts w:ascii="Sylfaen" w:hAnsi="Sylfaen" w:cs="Sylfaen"/>
           <w:b w:val="0"/>
           <w:sz w:val="24"/>
+          <w:lang w:val="ka-GE"/>
         </w:rPr>
         <w:t>მეხსიერების ერთეული არის მოვლენა — თემატურად და დროში შემოსაზღვრული თანმიმდევრული მორიგეობების სეგმენტი, ტულვინგის გაგებით ეპიზოდური ატომი [22]. ეს არის მიზანმიმართული არჩევანი ორი ალტერნატივის წინააღმდეგ: უმოყოლო მორიგეობა (ერთეული, რომელსაც იყენებს verbatim RAG, პროფილი B) და იზოლირებული, ამოღებული ფაქტი. მოვლენის არჩევა თავიდან გვაცილებს ფაქტების შერჩევის იმპორტს, როგორც B-ში არარსებული მეორე აღრევის ფაქტორის, და კონსოლიდაციას — განმეორებადი მოვლენების მდგრად სემანტიკურ ცოდნად გადაქცევას — აქცევს ბუნებრივ, გამოყვანილ ოპერაციად და არა დამატებით კომპონენტად. სიცოცხლის ციკლს ხუთი ეტაპი აქვს; თითოეული მოცემულია, როგორც მექანიზმი · თეორიული საფუძველი · ქცევითი ნიშანი.</w:t>
       </w:r>
@@ -3705,6 +3858,7 @@
           <w:rFonts w:ascii="Sylfaen" w:hAnsi="Sylfaen" w:cs="Sylfaen"/>
           <w:b w:val="0"/>
           <w:sz w:val="24"/>
+          <w:lang w:val="ka-GE"/>
         </w:rPr>
         <w:t>ეტაპი 1 — კოდირება (მნიშვნელობის მიხედვით გაფილტრული ჩაწერა, ასინქრონული). უმუშავო ტურები არსებობს მხოლოდ დაახლოებით ოცი ტურის მოცულობის ცვალებად სამუშაო ფანჯარაში, რომელიც იდენტურია A და B პირობებისთვის და უცვლელია ყველა პირობისთვის. სინქრონული გზით არაფერი გადადის გრძელვადიან შენახვაზე. სესიის ბოლოს, ასინქრონულად, ბუფერში არსებული ტრანსკრიპტი იყოფა მოვლენებად ჩაშენების მანძილისა და დროითი შუალედის საზღვრებზე (რომელიც EM-LLM-ის [8] ბაიეს-სიურპრიზის სეგმენტაციის იაფი შემცვლელია) და ერთი მცირე-LLM-ის კრიტერიუმების გამოძახებით თითოეულ მოვლენას ეძლევა მნიშვნელობის ქულა ოთხ ა-პრიორი-ფიქსირებულ განზომილებაში: თვითგამოხატვის სიმკვრივე, ემოციური ინტენსივობა, ექსპლიციტური ხაზგასმა ან გამეორება, და მიზნის ან ვალდებულების შინაარსი. ზღვრულზე დაბალი ქულის მქონე მოვლენები რბილად იგდება — ძალიან დაბალი სტაბილურობის მქონე, "ენაზე მდგომი აზრის" მსგავსი კვალი, რომელიც მხოლოდ ძლიერი მინიშნების შემთხვევაში აღდგება — და არა მკაცრად იშლება; გადარჩენილები იღებენ საწყის სტაბილურობას, რომელიც მათ მნიშვნელობასთან არის პროპორციული. გრაუნდინგი: ატკინსონ-შიფრინის მრავალსაცავიანი მოდელი [20] ყურადღებასა და გამეორებას განიხილავს, როგორც მოკლევადიანი და გრძელვადიანი მეხსიერების საწყობებს შორის გასასვლელს. აქ ჩვენ ვიწყებთ ერთ გულწრფელ გადარქმევას (F18): რადგან აღქმადობა გამოიყენება კოდირებისას, ეს მექანიზმი იმდენადვე არის დამუშავების სიღრმის ან დონეებისა და მეხსიერების ემოციური მოდულაციის მაგალითი, რამდენადაც — წმინდა მოდალური მოდელისა, და მას ასეთადაც მოიხსენიებენ; ის ასევე განსხვავდება Generative Agents-ის [10] მიერ მოძიების დროის მნიშვნელობის შეწონვისგან, რომელსაც 2 აღრიცხავს, როგორც აქტივაციის მსგავსს და არა თეორიიდან გამომდინარეს. ხელწერა: თანამოსაუბრე მდგრადად ინახავს იმას, რასაც მომხმარებელი ხაზს უსვამდა, ამხელდა ან რაზეც ბრუნდებოდა, მაშინ როცა შემთხვევითი, ყოველდღიური საუბრები ქრება; დავიწყება აღიქმება როგორც დათბობა და არა როგორც უყურადღებობა, რადგან რბილად უარყოფილი მასალა მკაფიო მინიშნების შემთხვევაში სუსტად, მაგრამ მაინც ექვემდებარება რეკონსტრუქციას.</w:t>
       </w:r>
@@ -3718,6 +3872,7 @@
           <w:rFonts w:ascii="Sylfaen" w:hAnsi="Sylfaen" w:cs="Sylfaen"/>
           <w:b w:val="0"/>
           <w:sz w:val="24"/>
+          <w:lang w:val="ka-GE"/>
         </w:rPr>
         <w:t>ეტაპი 2 — წარმოდგენა (მთავარი აზრი და სიტყვასიტყვითი საყრდენი, ორმაგი კლება, ასინქრონული). თითოეული მოვლენა ინახავს მთავარ აზრს — მნიშვნელობის, სუბიექტებისა და პოზიციის მოკლე პარაფრაზს — სტრუქტურირებულ ველებთან და ერთ სიტყვასიტყვით საყრდენთან ერთად (არაუმეტეს ერთი წინადადებისა, ყველაზე გამორჩეული ციტატა, რომელიც შენარჩუნებულია დასაბუთებისა და აუდიტისთვის, მაგრამ ნაგულისხმევად არ არის ჩაშენებული). არსი ჩაშენებული, ინიექცირებული ტვირთია; მისი სტაბილურობა ანკერისას აღემატება, ამიტომ მნიშვნელობა ზუსტ ფორმულირებას სცდება. სამართლიანობის შეზღუდვა განსაზღვრავს წარმოდგენას: თითოეული მოვლენის არსის ტვირთი არასდროს აღემატება პროფილი B-ს საშუალო ტურის ტექსტურ ტვირთს, ამიტომ C არასდროს იღებს კონტექსტის უფრო მდიდარ ელემენტებს. დაფუძნება: ბუნდოვანი კვალი-თეორია [24] ამტკიცებს პარალელური სიტყვასიტყვითი და არსებითი კვალის არსებობას, სადაც არსებითი კვალი უფრო მდგრადია. ეს კვალი LLM-ებისთვის ReadAgent-ის არსებითი შინაარსის გენერირების [9] მეშვეობით ოპერაციულდება; დიზაინი პირდაპირ ემყარება კოქსის [11] აღმოჩენას, რომლის მიხედვითაც, პარაფრაზირებული მოგონება სასურველია, მაშინ როცა სიტყვასიტყვითი მოგონება კონფიდენციალურობის პრობლემებს ქმნის. ხელწერა: თანამოსაუბრე ამბობს "სასოწარკვეთილი იყავი დედლაინის გამო" ტრანსკრიპტიდან ციტირების ნაცვლად; მომხმარებელს არ შეუძლია დააფიქსიროს, რომ ის მის სიტყვასიტყვით გამეორებას ახდენს. ეს არის C-სა და B-ს შორის ყველაზე მარტივად შესამჩნევი განსხვავება მომხმარებლისთვის და იმ ბერკეტს წარმოადგენს, რომელსაც მეორე ნდობისა და კონფიდენციალურობის პროგნოზი (H2b) მიზნად ისახავს.</w:t>
       </w:r>
@@ -3731,6 +3886,7 @@
           <w:rFonts w:ascii="Sylfaen" w:hAnsi="Sylfaen" w:cs="Sylfaen"/>
           <w:b w:val="0"/>
           <w:sz w:val="24"/>
+          <w:lang w:val="ka-GE"/>
         </w:rPr>
         <w:t>ეტაპი 3 — დაქრობა და გაძლიერება (ებინგჰაუსი, ზარმაცი, სინქრონული და ასინქრონული). თითოეულ კვალს ახასიათებს აღდგენადობა, რომელიც დროთა განმავლობაში ექსპონენციურად მცირდება ბოლო წვდომის მომენტიდან, მისი სტაბილურობის მიმართულებით, და გამოითვლება ზარმაცულად, აღდგენის მომენტში, როგორც ქულების გამრავლების კოეფიციენტი — არ ხდება ფონური აღრიცხვა და არც სინქრონული ჩაწერა. წარმატებული ხელახალი ხსენება აძლიერებს სტაბილურობას და ცვლის ბოლო წვდომის დროის მაჩვენებელს დროში გაჭიმული გამეორების პრინციპით, მაგრამ ჩაწერა რიგში დგება ოფლაინ რეჟიმში, ასე რომ სინქრონული არხი რჩება მხოლოდ წასაკითხად, ზუსტად ისევე, როგორც B-ში. რაც მთავარია, მე-4 ეტაპის მიერ წარმოქმნილი სემანტიკური ფაქტებიც ქრება, ამიტომ ებინგჰაუსის დინამიკა რჩება ცოცხალ დამოუკიდებელ ცვლადს და არა მუდმივი საცავის ზემოდან დადებულ კოსმეტიკურ ფენას. საფუძველი: ებინგჰაუსის დავიწყების მრუდი [23], MemoryBank/SiliconFriend [6]-ის სახით გამოთვლით პრეცედენტად. ხელწერა: ის, რაც დიდი ხნის წინ ერთხელ იყო ნახსენები, ქრება; რაც კი განმეორებით განიხილება, მდგრადი ხდება — ლამაზი, ბუნებრივი დავიწყება, B-ს შემზარავი სრული გახსენების საპირისპიროდ.</w:t>
       </w:r>
@@ -3744,6 +3900,7 @@
           <w:rFonts w:ascii="Sylfaen" w:hAnsi="Sylfaen" w:cs="Sylfaen"/>
           <w:b w:val="0"/>
           <w:sz w:val="24"/>
+          <w:lang w:val="ka-GE"/>
         </w:rPr>
         <w:t>ეტაპი 4 — კონსოლიდაცია (ეპიზოდურიდან სემანტიკურამდე, ოფლაინ "ძილი", ასინქრონული). სესიებს შორის ოფლაინ პარტიული ამოცანა აერთიანებს ეპიზოდურ მოვლენებს ენტიტეტისა და არსის მსგავსების მიხედვით; იმ კლასტერებისთვის, რომლებიც მინიმუმ მოვლენების მცირე ზღვარს იმეორებენ, ერთი მცირე-LLM-ის გამოძახება აბსტრაქცირებს მდგრად სემანტიკურ პროფილის ფაქტს ("მუშაობს მკაცრი დედლაინების პირობებში") ჰიპოკამპური ინდექსაციის [7] მეთოდით, წყაროს ეპიზოდებზე უკუმიმითითებებით, წარმოადგენს შთანთქმული ეპიზოდების დაწონილობას, უახლესი ან ყველაზე გაძლიერებული მტკიცებულებების სასარგებლოდ უთანხმოების მოგვარებას და ასოციაციური მეზობლების წინასწარ გაფართოებას, რათა ინფერენციისას ნებისმიერი ასოციაციური მოგონება ერთ ვექტორულ მოთხოვნამდე შემცირდეს. საუბრული დიდი ენის მოდელი არასდროს გადამზადდება; კონსოლიდაცია მხოლოდ საცავს რეგულირებს. დასაბუთება: ეს არის ეტაპი, რომელიც ყველაზე მეტად არის მიდრეკილი ჭარბი მტკიცებებისკენ და შესაბამისად გადაიწერება (F18). ჩვენ ვიყენებთ დამატებითი სასწავლო სისტემების ჩარჩოს [25] მისი ეპიზოდურიდან სემანტიკურზე გადაცემის ფუნქციის სულისკვეთების სახით და კონკრეტული მექანიზმისთვის უპირატესად ვყრდნობით ტულვინგის ეპიზოდურ-სემანტიკურ განასხვავებას [22] და ჰიპოკამპურ ინდექსაციას [7,26], ვიდრე მაკკლელენდის გადახლართულ, ინტერფერენციისგან დაცულ კორტიკულ სწავლებას. ხელწერა: კვირების განმავლობაში თანამოსაუბრე გადადის ფორმულირებიდან "გასულ სამშაბათს თქვით..." ფორმაზე "ვიცი, რომ მიდრეკილება გაქვთ..."; თითქოს მან რაღაც ისწავლა მომხმარებლის შესახებ — ახლად წარმოშობილი განზოგადება, რომელიც პირდაპირ არასდროს გაუგია. ეს არის ყველაზე C-თვის დამახასიათებელი, B-თვის შეუძლებელი ქცევა და ნებისმიერი ურთიერთობრივი უპირატესობის პროგნოზირებული წყარო, რომელიც C-ს B+-ზე აქვს.</w:t>
       </w:r>
@@ -3757,6 +3914,7 @@
           <w:rFonts w:ascii="Sylfaen" w:hAnsi="Sylfaen" w:cs="Sylfaen"/>
           <w:b w:val="0"/>
           <w:sz w:val="24"/>
+          <w:lang w:val="ka-GE"/>
         </w:rPr>
         <w:t>ეტაპი 5 — მოძიება (პირველ რიგში არსებითი შინაარსის, კომპოზიტური შეფასების, ერთი, მხოლოდ წაკითხვისთვის განკუთვნილი მოთხოვნა, სინქრონული). ინფორმაციის გამოძახება იყენებს იმავე გამომწვევსა და შეყვანის წერტილს, რაც B-ს. მიმდინარე მორიგეობა ჩაშენებულია (ერთადერთი სინქრონული ჩაშენება, იდენტური B-ს), ერთი ვექტორული მოთხოვნა ორივე დონეზე დაახლოებით ოცი კანდიდატის პასუხს იღებს, მათ შორის ოფლაინ წინასწარ გაფართოებული ასოციაციური მეზობლების ჩათვლით; კანდიდატები ირანგება აქტივაციის ქულით, რომელიც მრავლდება კოსინუსური რელევანტურობის, გამოძახების შესაძლებლობისა და შეზღუდული სემანტიკური ბონუსის გამრავლებით, ყველა ექსპონენტის ფიქსირებული მნიშვნელობით 1. Salience განზრახ არ არის მონაცემთა გამოძახების ტერმინი — ის მხოლოდ წერასა და გაქრობას არეგულირებს — რაც გამორიცხავს შიდა კრიტიკის მიერ გამოვლენილ სამმაგ დათვლას. მონაცემთა გამოძახება ზუსტად ავსებს B-ის ტოკენების ბიუჯეტს, სემანტიკური ფაქტების უპირატესობით; სიტყვასიტყვითი ანკერი ჩნდება მხოლოდ იაფი, დეტერმინირებული საკვანძო სიტყვის ტრიგერის მიერ აღმოჩენილი ექსპლიციტური ზუსტი გამოძახების მოთხოვნისას, ამიტომ "ცხელი გზა" არ ახდენს LLM-ის არცერთ გამოძახებას მიმდინარე ტურის ფარგლებში. დაფუძნება: მინიშნებაზე დამოკიდებული გამოძახება [22], არსებითი შინაარსის უპირატესი გამოძახება [24], ებინგჰაუსის ხელმისაწვდომობა [23] და კომპლემენტარული სასწავლო სისტემების სემანტიკური უპირატესობა [25]. ხელწერა: თანამოსაუბრე პირველ რიგში წარმოაჩენს რელევანტურ განზოგადებას, ხოლო კონკრეტულ ეპიზოდს — მხოლოდ დაჟინებული მოთხოვნის შემთხვევაში, ამგვარად, მონაცემების მოძიება უფრო ადამიანს ჰგავს, რომელიც მომხმარებელს იცნობს, ვიდრე საძიებო სისტემას — იგივე დაყოვნებითა და ბიუჯეტით, რაც B-ს, მაგრამ განსხვავებული შინაარსით.</w:t>
       </w:r>
@@ -3770,6 +3928,7 @@
           <w:rFonts w:ascii="Sylfaen" w:hAnsi="Sylfaen" w:cs="Sylfaen"/>
           <w:b w:val="0"/>
           <w:sz w:val="24"/>
+          <w:lang w:val="ka-GE"/>
         </w:rPr>
         <w:t>თეორიული ერთგულებისგან განზრახ თავის არიდება. აქ სამი ასეთი თავის არიდებაა დასახელებული, როგორც შეზღუდვები და სამომავლო სამუშაო, რითაც თავიდან ვიცილებთ ყველაზე ძლიერ თეორიულ წინააღმდეგობებს (F18), ვიდრე მათ კომიტეტის წინ წამოსაწევად დავტოვებდეთ. პირველი, არქიტექტურა გამორიცხავს ინტერფერენციას, რომელიც ადამიანის დავიწყების დომინანტური მექანიზმია; მისი დავიწყება წმინდად დროით და თვალსაჩინოობითაა განპირობებული. მეორე, მისი კონსოლიდაცია, რომელიც უპირველეს ყოვლისა სიზუსტეზეა ორიენტირებული, მიზანმიმართულად თრგუნავს რეკონსტრუქციულ და სქემაზე დაფუძნებულ დამახინჯებას — არსებითი შინაარსის დონის ცრუ მეხსიერებას, რომელსაც "ბუნდოვანი კვალი" (fuzzy-trace) და CLS განსაკუთრებით მკაფიოდ პროგნოზირებენ — და კვლევის მიერ გაზომილი ადამიანურობის ღერძზე ფსიქოლოგიურ რეალიზმს უპირატესობას ანიჭებს იმ უსაფრთხოებას, რომ არ მოხდეს არასწორი განზოგადებების თავდაჯერებულად მტკიცება. მესამე, ის არ მოდელირებს დროის თანმიმდევრობის ან წყაროს მეხსიერებას დროის შტამპების მიღმა. ეს პრინციპული საინჟინრო არჩევანია და არა უგულებელყოფა, და 3.8-ში ისინი აღრიცხულია, როგორც კოგნიტური სიზუსტის მტკიცების საზღვრები.</w:t>
       </w:r>
@@ -3789,6 +3948,7 @@
           <w:b/>
           <w:color w:val="000000"/>
           <w:sz w:val="28"/>
+          <w:lang w:val="ka-GE"/>
         </w:rPr>
         <w:t>3.3 ექსპერიმენტული პირობები (A / B / B+ / C)</w:t>
       </w:r>
@@ -3802,6 +3962,7 @@
           <w:rFonts w:ascii="Sylfaen" w:hAnsi="Sylfaen" w:cs="Sylfaen"/>
           <w:b w:val="0"/>
           <w:sz w:val="24"/>
+          <w:lang w:val="ka-GE"/>
         </w:rPr>
         <w:t>შეფასება ერთმანეთს უპირისპირებს მეხსიერების ოთხ პროფილს, რომლებსაც ყველა ერთნაირი, ინფერენციის დროის საერთო ჩარჩო აქვთ. დიზაინის მეთოდოლოგიური არსი იმაში მდგომარეობს, რომ C-მ, თუკი გაიმარჯვებს, უნდა გაიმარჯვოს იმის წყალობით, თუ როგორ იხსენებს, და არა იმიტომ, რომ უფრო მეტს ან უფრო სუფთად იხსენებს.</w:t>
       </w:r>
@@ -3815,6 +3976,7 @@
           <w:rFonts w:ascii="Sylfaen" w:hAnsi="Sylfaen" w:cs="Sylfaen"/>
           <w:b w:val="0"/>
           <w:sz w:val="24"/>
+          <w:lang w:val="ka-GE"/>
         </w:rPr>
         <w:t>•  A — გრძელვადიანი მეხსიერების გარეშე. მხოლოდ ცვალებადი სამუშაო ფანჯარა; ყოველი სესია იწყება ნულიდან. A აშკარა მინიმალური ზღვარია და, გადავადებულ ადამიანურ პროტოკოლში (3.5c), ის სრულ, მრავალკვირიან რაუნდს კი არ წარმოადგენს, არამედ მოკლე, წინასწარ დაწერილი სცენარით გათვალისწინებულ კალიბრაციის ეტაპს.</w:t>
       </w:r>
@@ -3828,6 +3990,7 @@
           <w:rFonts w:ascii="Sylfaen" w:hAnsi="Sylfaen" w:cs="Sylfaen"/>
           <w:b w:val="0"/>
           <w:sz w:val="24"/>
+          <w:lang w:val="ka-GE"/>
         </w:rPr>
         <w:t>•  B — სიტყვასიტყვით RAG. უმუშავო ტურები ჩაშენებულია და მოიძებნება საერთო ტოკენების ბიუჯეტში კოსინუსის ტოპ-k-ის მეშვეობით. ეს არის სტანდარტი და კოქსის კვლევაში [11] მოცემული პირობის ("მიუთითებს თქვენს ზუსტ გამონათქვამებზე") პირდაპირი ოპერაციული ანალოგი.</w:t>
       </w:r>
@@ -3841,6 +4004,7 @@
           <w:rFonts w:ascii="Sylfaen" w:hAnsi="Sylfaen" w:cs="Sylfaen"/>
           <w:b w:val="0"/>
           <w:sz w:val="24"/>
+          <w:lang w:val="ka-GE"/>
         </w:rPr>
         <w:t>•  B+ — კურატორირებული სტატიკური მეხსიერება (აქტიური კონტროლი). C-ს მსგავსი იდენტური ოფლაინ LLM-ის ანოტაცია და კორეფერენსის გაწმენდა, იგივე შეკუმშვა და ტოკენების ბიუჯეტი, მაგრამ გარეშე დაშლის, სალიენს-გეითინგის, და კონსოლიდაციის — მხოლოდ წმინდა კოსინუსის top-k გაწმენდილ ანოტაციებზე.</w:t>
       </w:r>
@@ -3854,6 +4018,7 @@
           <w:rFonts w:ascii="Sylfaen" w:hAnsi="Sylfaen" w:cs="Sylfaen"/>
           <w:b w:val="0"/>
           <w:sz w:val="24"/>
+          <w:lang w:val="ka-GE"/>
         </w:rPr>
         <w:t>•  C — პროფილი C. 3.2-ის ადამიანის მეხსიერების სრული, ხუთეტაპიანი სასიცოცხლო ციკლი.</w:t>
       </w:r>
@@ -3867,6 +4032,7 @@
           <w:rFonts w:ascii="Sylfaen" w:hAnsi="Sylfaen" w:cs="Sylfaen"/>
           <w:b w:val="0"/>
           <w:sz w:val="24"/>
+          <w:lang w:val="ka-GE"/>
         </w:rPr>
         <w:t>B+ არის დიზაინის ცენტრალური მეთოდოლოგიური წვლილი. C-სთვის ნებისმიერი დადებითი შედეგისთვის ყველაზე სერიოზული საფრთხე არის წაკითხვადობის აღრევის ფაქტორი: C-ს მიერ შეჯამებული და კო-რეფერენსებისგან გაწმენდილი პროზა უბრალოდ უფრო წაკითხვადი არის, ვიდრე B-ს უმი ფრაგმენტები, და C-სა და B-ს შორის უბრალო გამარჯვება ერთმანეთში აურივებს კურირებასა და კოგნიტურ დინამიკას. B+ თავისი კონსტრუქციით გამორიცხავს ამ აღრევის ფაქტორს. თუ C &gt; B+, მარგინალური ეფექტი განპირობებულია ადამიანის მეხსიერების იმ დინამიკით, რომელიც მხოლოდ C-ს ახასიათებს. თუ C ≈ B+, გულწრფელი დასკვნა იქნება, რომ აღქმითი სარგებელი თავიდანვე წაკითხვადობა იყო, და ამიტომ მოსაზრება შესაბამისად გადაიხედა — დასკვნა, რომელიც ზუსტად იმიტომ არის ინტერპრეტაციული, რომ B+ სწორედ ამის დასაშვებად შეიქმნა. სწორედ ამიტომ, როგორც 3.1-შია აღნიშნული, C &gt; B+ არის შეფასების სამიზნე და სწორედ ამიტომ B+-ის გამორიცხვა არ განიხილება.</w:t>
       </w:r>
@@ -3878,6 +4044,7 @@
           <w:rFonts w:ascii="Sylfaen" w:hAnsi="Sylfaen" w:cs="Sylfaen"/>
           <w:b w:val="0"/>
           <w:sz w:val="24"/>
+          <w:lang w:val="ka-GE"/>
         </w:rPr>
         <w:t>ცხრილი 3.1 პირდაპირ ასახავს აღრევის ფაქტორების კონტროლის ლოგიკას. ყველაფერი, რაც "უცვლელად შენარჩუნებულია" რიგშია, იდენტურია A, B, B+ და C-სთვის.</w:t>
       </w:r>
@@ -3891,6 +4058,7 @@
           <w:rFonts w:ascii="Sylfaen" w:hAnsi="Sylfaen" w:cs="Sylfaen"/>
           <w:b/>
           <w:sz w:val="22"/>
+          <w:lang w:val="ka-GE"/>
         </w:rPr>
         <w:t>ცხრილი 3.1. აღრევის ფაქტორების კონტროლი ექსპერიმენტულ დიზაინში</w:t>
       </w:r>
@@ -3928,6 +4096,7 @@
                 <w:rFonts w:ascii="Sylfaen" w:hAnsi="Sylfaen" w:cs="Sylfaen"/>
                 <w:b/>
                 <w:sz w:val="22"/>
+                <w:lang w:val="ka-GE"/>
               </w:rPr>
               <w:t>დამაბრკოლებელი ფაქტორი</w:t>
             </w:r>
@@ -3946,6 +4115,7 @@
                 <w:rFonts w:ascii="Sylfaen" w:hAnsi="Sylfaen" w:cs="Sylfaen"/>
                 <w:b/>
                 <w:sz w:val="22"/>
+                <w:lang w:val="ka-GE"/>
               </w:rPr>
               <w:t>საფრთხე</w:t>
             </w:r>
@@ -3964,6 +4134,7 @@
                 <w:rFonts w:ascii="Sylfaen" w:hAnsi="Sylfaen" w:cs="Sylfaen"/>
                 <w:b/>
                 <w:sz w:val="22"/>
+                <w:lang w:val="ka-GE"/>
               </w:rPr>
               <w:t>კონტროლი</w:t>
             </w:r>
@@ -3984,6 +4155,7 @@
                 <w:rFonts w:ascii="Sylfaen" w:hAnsi="Sylfaen" w:cs="Sylfaen"/>
                 <w:b w:val="0"/>
                 <w:sz w:val="22"/>
+                <w:lang w:val="ka-GE"/>
               </w:rPr>
               <w:t>კურატორიზმი / წაკითხვადობა</w:t>
             </w:r>
@@ -4002,6 +4174,7 @@
                 <w:rFonts w:ascii="Sylfaen" w:hAnsi="Sylfaen" w:cs="Sylfaen"/>
                 <w:b w:val="0"/>
                 <w:sz w:val="22"/>
+                <w:lang w:val="ka-GE"/>
               </w:rPr>
               <w:t>C-ს გასუფთავებული, არსებითი შინაარსის პროზა უბრალოდ უფრო ადვილად წასაკითხია, ვიდრე B-ს ფრაგმენტები</w:t>
             </w:r>
@@ -4020,6 +4193,7 @@
                 <w:rFonts w:ascii="Sylfaen" w:hAnsi="Sylfaen" w:cs="Sylfaen"/>
                 <w:b w:val="0"/>
                 <w:sz w:val="22"/>
+                <w:lang w:val="ka-GE"/>
               </w:rPr>
               <w:t>B+ აქტიური კონტროლი: იგივე შეჯამება და გასუფთავება, გარეშე დაშლის, გამოკვეთისა და კონსოლიდაციის</w:t>
             </w:r>
@@ -4040,6 +4214,7 @@
                 <w:rFonts w:ascii="Sylfaen" w:hAnsi="Sylfaen" w:cs="Sylfaen"/>
                 <w:b w:val="0"/>
                 <w:sz w:val="22"/>
+                <w:lang w:val="ka-GE"/>
               </w:rPr>
               <w:t>კომპრესია</w:t>
             </w:r>
@@ -4058,6 +4233,7 @@
                 <w:rFonts w:ascii="Sylfaen" w:hAnsi="Sylfaen" w:cs="Sylfaen"/>
                 <w:b w:val="0"/>
                 <w:sz w:val="22"/>
+                <w:lang w:val="ka-GE"/>
               </w:rPr>
               <w:t>ტოკენების თანაბარი ბიუჯეტი არ ნიშნავს ინფორმაციის თანაბარ რაოდენობას</w:t>
             </w:r>
@@ -4076,6 +4252,7 @@
                 <w:rFonts w:ascii="Sylfaen" w:hAnsi="Sylfaen" w:cs="Sylfaen"/>
                 <w:b w:val="0"/>
                 <w:sz w:val="22"/>
+                <w:lang w:val="ka-GE"/>
               </w:rPr>
               <w:t>ეფექტური ისტორიის დაფარვა აღირიცხება ყოველ ტურში, როგორც მანიპულაციის შემოწმება; B+ ინარჩუნებს შეკუმშვას მუდმივ მდგომარეობაში C-სთან შედარებით</w:t>
             </w:r>
@@ -4096,6 +4273,7 @@
                 <w:rFonts w:ascii="Sylfaen" w:hAnsi="Sylfaen" w:cs="Sylfaen"/>
                 <w:b w:val="0"/>
                 <w:sz w:val="22"/>
+                <w:lang w:val="ka-GE"/>
               </w:rPr>
               <w:t>განხორციელება / შენახვა / დაყოვნება</w:t>
             </w:r>
@@ -4114,6 +4292,7 @@
                 <w:rFonts w:ascii="Sylfaen" w:hAnsi="Sylfaen" w:cs="Sylfaen"/>
                 <w:b w:val="0"/>
                 <w:sz w:val="22"/>
+                <w:lang w:val="ka-GE"/>
               </w:rPr>
               <w:t>C-ს დამატებითი LLM-ის გასვლები შეიძლება უსამართლო უპირატესობა მოგანიჭოთ</w:t>
             </w:r>
@@ -4132,6 +4311,7 @@
                 <w:rFonts w:ascii="Sylfaen" w:hAnsi="Sylfaen" w:cs="Sylfaen"/>
                 <w:b w:val="0"/>
                 <w:sz w:val="22"/>
+                <w:lang w:val="ka-GE"/>
               </w:rPr>
               <w:t>ყველა ძვირადღირებული ოპერაცია ხორციელდება ოფლაინ; სინქრონული არხი მხოლოდ წაკითხვისთვისაა და არ აქვს LLM-ის მორიგეში გამოძახებები; თითოეული მორიგის მონაცემების მოძიების დაყოვნება იზომება და იტყობინება B/B+/C-სთვის; თითოეული მოვლენის ტვირთი B-ს ზღვარითაა შეზღუდული</w:t>
             </w:r>
@@ -4152,6 +4332,7 @@
                 <w:rFonts w:ascii="Sylfaen" w:hAnsi="Sylfaen" w:cs="Sylfaen"/>
                 <w:b w:val="0"/>
                 <w:sz w:val="22"/>
+                <w:lang w:val="ka-GE"/>
               </w:rPr>
               <w:t>უნარჩუნებელი (ყველა პირობა)</w:t>
             </w:r>
@@ -4187,6 +4368,7 @@
                 <w:rFonts w:ascii="Sylfaen" w:hAnsi="Sylfaen" w:cs="Sylfaen"/>
                 <w:b w:val="0"/>
                 <w:sz w:val="22"/>
+                <w:lang w:val="ka-GE"/>
               </w:rPr>
               <w:t>LLM-ის ტვინი, მონაცემების გამოძახების ტრიგერი, შეყვანის წერტილი, ყოველი ტურის შეფერხების ბიუჯეტი, საერთო ასაღები ტოკენების ბიუჯეტი, მოთხოვნის ემბედინგის მოდელი, ცვალებადი სამუშაო ფანჯარა</w:t>
             </w:r>
@@ -4206,6 +4388,7 @@
           <w:rFonts w:ascii="Sylfaen" w:hAnsi="Sylfaen" w:cs="Sylfaen"/>
           <w:b w:val="0"/>
           <w:sz w:val="24"/>
+          <w:lang w:val="ka-GE"/>
         </w:rPr>
         <w:t>ყველა არქიტექტურული პარამეტრი — სეგმენტაციის ზღვარი, მნიშვნელობის (სალიენსის) რუბრიკა და ქვედა ზღვარი, მნიშვნელობიდან სტაბილურობამდე კოეფიციენტი, არსებითიდან საყრდენამდე სტაბილურობის თანაფარდობა, კლებადი კონსტანტები, კონსოლიდაციის კლასტერის ზომა და ზღვარი, აქტივაციის ფორმა — აპრიორულად ფიქსირებული და წინასწარ დარეგისტრირებულია, გარედან დამაგრებული მნიშვნელობებით (მაგ., MemoryBank-იდან [6] აღებული კლებადი კონსტანტები) და აუცილებელი მგრძნობელობის ანალიზით (3.7), რათა არცერთი თავისუფალი რეგულატორი არ იყოს მორგებული სოციალურ შედეგზე. სრული პროტოკოლით, სალიენტობის მარკიორი ვალიდაციას გადის ორი-სამი ექსპერტი ადამიანის ანოტატორის (რომლებიც კვლევის მონაწილეები არ არიან) მიერ, ხოლო სეგმენტაციის ზღვარი კალიბრირდება ადამიანის მიერ დატანილი თემატური ცვლილების იარლიყების მიხედვით — ორივე შემთხვევაში გარე სამიზნეზე, და არა კვლევის დამოკიდებულ ცვლადებზე.</w:t>
       </w:r>
@@ -4225,6 +4408,7 @@
           <w:b/>
           <w:color w:val="000000"/>
           <w:sz w:val="28"/>
+          <w:lang w:val="ka-GE"/>
         </w:rPr>
         <w:t>3.4 კონცეფციის დამტკიცების იმპლემენტაცია</w:t>
       </w:r>
@@ -4238,6 +4422,7 @@
           <w:rFonts w:ascii="Sylfaen" w:hAnsi="Sylfaen" w:cs="Sylfaen"/>
           <w:b w:val="0"/>
           <w:sz w:val="24"/>
+          <w:lang w:val="ka-GE"/>
         </w:rPr>
         <w:t>ამ დისერტაციაში წარმოდგენილი კონცეფციის დამტკიცება არის დამოუკიდებელი მეხსიერების მართვის სისტემა და არა სრულმასშტაბიანი ხმოვანი აპლიკაცია. ის ახორციელებს ოთხ პირობას A, B, B+ და C — C-ის ხუთსაფეხურიანი სასიცოცხლო ციკლის გამოყენებით, 4-ში მითითებული სიზუსტით — როგორც ინსტრუმენტული მოდული, რომელიც მუშაობს ტრანსკრიპტებზე, მიზანმიმართულად, Voice Companion-ის სრული ხმოვანი მიწოდების ჯაჭვის მიღმა. ამ მასშტაბის მოტივაცია ორ გულწრფელ მიზეზს აქვს. პირველი, არსებული პლატფორმის (F17) აუდიტმა დაადგინა, რომ ხმის აპლიკაცია დღესდღეობით მხოლოდ A პირობას უზრუნველყოფს და დამატებით თორმეტიდან თექვსმეტ კვირამდე საინჟინრო სამუშაოს საჭიროებს — ხმის მეხსიერებაზე გადაყვანის კავშირის, თითოეული მონაწილისთვის სახელწოდების სივრცის გამოყოფისა და განთავსებადი კლიენტის შექმნას — სანამ ის B, B+, და C პირობების რეალურ მომხმარებლებზე მასპინძლობას შეძლებს; ეს შექმნა ამჟამინდელი დროის ჩარჩოსთვის არ შედის. მეორე და, რაც უფრო მნიშვნელოვანია, კვლევის საგანია მეხსიერების პროცესი, რომელიც სრულად გამოიყენება დიალოგის ტრანსკრიპტებზე მომუშავე სპეციალური პროგრამული უზრუნველყოფით. მეხსიერების ძრავის გამოყოფა მეტყველებიდან-ტექსტად, ტექსტიდან-მეტყველებად და რიგის მიყოლის მექანიზმებისგან საშუალებას იძლევა, რომ კონცეფციის დამტკიცებამ ნათლად და გამეორებადურად აჩვენოს და დააპროგრამოს მექანიზმები — მოვლენების სეგმენტაცია, მნიშვნელობაზე დაფუძნებული კოდირება, ორმაგი დაქვეითების წარმოდგენა, Ebbinghaus-ის ზარმაცი დაქვეითება და გაძლიერება, ოფლაინ კონსოლიდაცია და არსის მიხედვით მოძიება.</w:t>
       </w:r>
@@ -4251,6 +4436,7 @@
           <w:rFonts w:ascii="Sylfaen" w:hAnsi="Sylfaen" w:cs="Sylfaen"/>
           <w:b w:val="0"/>
           <w:sz w:val="24"/>
+          <w:lang w:val="ka-GE"/>
         </w:rPr>
         <w:t>შესაბამისად, ეს ხელსაწყო წარმოდგენილია მექანიზმების დემონსტრაციად და 3.5-ის ტექნიკური და სიმულირებული შეფასების საფუძვლად და არა, როგორც კვლევის აპარატის ოპერატიულ ვერსიად. ის პირდაპირ განასახიერებს 3.3-ის სამართლიანობის არქიტექტურას: პირობებს შორის საერთო ამოღების ტრიგერი, შეყვანის წერტილი და ტოკენების ბიუჯეტი; თითოეული პირობისთვის იზოლირებული საცავები; სეგმენტაციის, მნიშვნელობის ქულების მინიჭების, არსებითი შინაარსის შექმნისა და კონსოლიდაციისთვის ოფლაინ ჯგუფური ამოცანები; და მხოლოდ წაკითხვისთვის განკუთვნილი სინქრონული ამოღების გზა, დაყოვნებით გამოთვლილი დაქვეითებითა და ნულოვანი მორიგეობით LLM-ის გამოძახებით. ყველაზე იაფი მისაღები ვარიანტის ანალიზის (F18) თანახმად, კონცეფციის დამტკიცება პრიორიტეტს ანიჭებს აუცილებელ ბირთვს — B+, კონსოლიდაციას, მარტივ ინერტულ კლებას და არსებითი შინაარსის/საყრდენი წარმოდგენას — და შესაძლოა, ყველაზე ძვირადღირებული დახვეწის ეტაპები (მასშტაბურ დონეზე პროგრამული აქტუალობის კონტროლი, ასოციაციური წინასწარი გაფართოება, საყრდენი-რეგულარული გამომწვევი და სენსიტიურობის ავტომატიზებული შემოწმება) სრულ ვერსიამდე გადადოს, და ასეთი ნებისმიერი გადადება ექსპლიციტურად იქნება აღნიშნული და არა ჩუმად ნაგულისხმევი. თითოეული მონაცვლეობის სინქრონული ხარჯი დომინირებულია 100 მილიწამზე ნაკლები ხანგრძლივობის ერთ ვექტორულ მოთხოვნასა და O(k) არითმეტიკულ ოპერაციებზე, რაც თავისუფლად ეტევა პლატფორმისთვის დოკუმენტირებულ დაახლოებით ორიდან ხუთ წამამდე ხმოვან მონაცვლეობაში (F17); B, B+ და C-ს შორის დაყოვნების თანასწორობა მტკიცების ნაცვლად ემპირიულად ფიქსირდება ჰარნესის მიერ.</w:t>
       </w:r>
@@ -4270,6 +4456,7 @@
           <w:b/>
           <w:color w:val="000000"/>
           <w:sz w:val="28"/>
+          <w:lang w:val="ka-GE"/>
         </w:rPr>
         <w:t>3.5 შეფასების მეთოდოლოგია</w:t>
       </w:r>
@@ -4283,6 +4470,7 @@
           <w:rFonts w:ascii="Sylfaen" w:hAnsi="Sylfaen" w:cs="Sylfaen"/>
           <w:b w:val="0"/>
           <w:sz w:val="24"/>
+          <w:lang w:val="ka-GE"/>
         </w:rPr>
         <w:t>არქიტექტურა შეფასებულია სამი მიმართულებით, მზარდი ეკოლოგიური ამბიციითა და მიმდინარე შესრულებადობის კლებადი დონით: ტექნიკური შეფასება (წარმოდგენილია 4-ში), სიმულირებული მომხმარებლის შეფასება (წარმოდგენილია 4-ში, მკაფიოდ განსაზღვრული შეზღუდვებით) და შემუშავებული პროტოკოლი ადამიან-სუბიექტებისთვის (განმარტებულია აქ, გადავადებულია მომავალი ნაშრომისთვის). ეს დაყოფა მიზანმიმართულია: პირველი ორი მიმართულება იკვლევს მექანიზმებს და ქმნის ჰიპოთეზებს; მხოლოდ მესამე შეუძლია შეაფასოს აღქმის შესახებ გაკეთებული მტკიცებულებები, და ის ამ ნაშრომში არ სრულდება.</w:t>
       </w:r>
@@ -4296,6 +4484,7 @@
           <w:rFonts w:ascii="Sylfaen" w:hAnsi="Sylfaen" w:cs="Sylfaen"/>
           <w:b w:val="0"/>
           <w:sz w:val="24"/>
+          <w:lang w:val="ka-GE"/>
         </w:rPr>
         <w:t>(ა) ტექნიკური შეფასება. ბენჩმარკის ტიპის შეფასება ოთხი პირობის მიხედვით ტარდება სინთეზურ მრავალსესიან დიალოგებზე და ზომავს რაოდენობის სამ კატეგორიას: აღდგენის ხარისხი (წინა სესიის შინაარსის ფაქტობრივი აღდგენა, 2.5-ის გრძელვადიანი მეხსიერების ბენჩმარკების მსგავსად); დროითი მსჯელობა (კატეგორია, რომელიც თანმიმდევრულად ყველაზე სუსტია LoCoMo-სა და LongMemEval-ში [1,2]); და დაყოვნება (B, B+ და C-სთვის თითოეული რაუნდის სინქრონული გამოძახების დრო, რაც 3.4-ში მითითებულ პარიტეტს ადასტურებს). ლიტერატურაში მოყვანილი ორი გაფრთხილება გათვალისწინებულია. პირველი, რადგან გამოქვეყნებული მეხსიერების ტესტების შედეგები დაუჯერებელი აღმოჩნდა, ხოლო მათი ავტომატური შემფასებლები — შემწყნარებლები (F9, [32,33]), ჰარნესი თავის საკუთარ შეფასების პროცედურას ხელახლა ამოწმებს, ნაცვლად იმისა, რომ ხარვეზიანი პროცედურა მემკვიდრეობით მიიღოს, და ამ გაფრთხილების გათვალისწინებით აბსოლუტურ ქულებს წარმოადგენს. მეორე, ტექნიკური აღდგენის სიზუსტე პირდაპირ არ წარმოადგენს ნაშრომის სამიზნე შედეგს — სინამდვილეში, დიზაინი პროგნოზირებს, რომ C-ს განზრახვისამებრ შეიძლება B-ზე ნაკლები ტექსტის პირდაპირი ციტირება შეეძლოს — ამიტომ ეს მეტრიკები ახასიათებს მექანიზმებს და ამოწმებს, რომ C-ს დავიწყება ხარვეზული კი არა, დახვეწილია; ისინი არ წარმოადგენენ აღქმული ურთიერთკავშირის შედეგების მაჩვენებელს.</w:t>
       </w:r>
@@ -4309,6 +4498,7 @@
           <w:rFonts w:ascii="Sylfaen" w:hAnsi="Sylfaen" w:cs="Sylfaen"/>
           <w:b w:val="0"/>
           <w:sz w:val="24"/>
+          <w:lang w:val="ka-GE"/>
         </w:rPr>
         <w:t>(ბ) სიმულირებული მომხმარებლის შეფასება. სოციალური კონსტრუქტების შესამოწმებლად ადამიანის მონაწილეობის გარეშე, ხელსაწყო გამოიყენება მრავალსესიან დიალოგებში, სადაც LLM მოქმედებს სიმულირებული მომხმარებლის როლში, ხოლო ცალკეული LLM-მსაჯული აფასებს თითოეულ პირობას 3.6-ის სოციალური კონსტრუქტების მიხედვით (სოციალური თანდასწრება, ალიანსი, სანდოობა/ადამიანურობა, პლუს ინტელექტისა და კონფიდენციალურობის კრიტერიუმები). ეს მიმართულება განზრახ ეპისტემიკური თავმდაბლობითაა ჩარჩოში მოქცეული: ის სიმულირებული პროქსია და არა ადამიანის აღქმის შემცვლელი, და მას არ შეუძლია აღქმის ჰიპოთეზების ვალიდაცია. მისი გამოთქმული ვალიდურობის შეზღუდვები სამმაგია: დიდი ენის მოდელი (LLM) მსაჯულის შეფასებებს "სოციალური თანდასწრებისა" ან "ნდობისა" ადამიანის გამოცდილებასთან უცნობი კორესპონდენცია აქვს და შესაძლოა ასახავდეს ზედაპირულ ტექსტურ მახასიათებლებს (მაგ., თავად წაკითხვადობას, რასაც B+ აკონტროლებს) და არა შეგრძნებულ ურთიერთობას; სიმულირებულ მომხმარებლებს არ გააჩნიათ რეალური მომხმარებლებისთვის დამახასიათებელი მნიშვნელოვანი ინტერესები, კვირების განმავლობაში დაგროვილი მეხსიერება და კონფიდენციალურობის მგრძნობელობა, ამიტომ ამ ნაშრომისთვის ცენტრალური (F4) ორმაგი ხასიათის მეხსიერების ეფექტები შესაძლოა არ გამოვლინდეს; და მოსამართლისა და გენერატორის მოდელებს შეიძლება ჰქონდეთ მიკერძოებები, რომლებიც ზრდის შეთანხმებას. შესაბამისად, სიმულირებული ნაწილი გამოიყენება იმისთვის, რომ (i) გადაამოწმოს, გამოიმუშავებს თუ არა პირობები განსხვავებად ქცევას, (ii) შექმნას და დახვეწოს პროგნოზები ადამიანური პროტოკოლისთვის, და (iii) ბოლომდე გამოცადოს ზუსტი ინსტრუმენტის ოპერაციალიზაცია (3.6). ნებისმიერი სიმულირებული C-B+ განსხვავება წარმოდგენილია როგორც მექანიზმის დონის სიგნალი და არასდროს — როგორც ადამიანის აღქმის შესახებ მტკიცებულება.</w:t>
       </w:r>
@@ -4322,6 +4512,7 @@
           <w:rFonts w:ascii="Sylfaen" w:hAnsi="Sylfaen" w:cs="Sylfaen"/>
           <w:b w:val="0"/>
           <w:sz w:val="24"/>
+          <w:lang w:val="ka-GE"/>
         </w:rPr>
         <w:t>(გ) შემუშავებული პროტოკოლი ადამიანთა მონაწილეობით (მომავალი ნაშრომი). მიზნის აღქმითი მტკიცებულებები შეიძლება გადაწყდეს მხოლოდ ადამიანებზე ჩატარებული კვლევით, რომელსაც ეს ნაშრომი სრულად აღწერს, მაგრამ არ ახორციელებს. დიზაინი წარმოადგენს B-ს, B+, და C — სამი განყოფილება, სადაც A დაყვანილია მოკლე, წინასწარ განსაზღვრული კალიბრაციის შეხებამდე — n ≈ 20 მონაწილეზე, თითოეული პირობა გამოცდილია სრულ სამკვირიან ჰორიზონტზე, რათა C-ის ნელი ტემპით მიმდინარე კონსოლიდაციას გამოვლენის დრო ჰქონდეს, იზოლირებული საცავებით თითოეული პირობისთვის, დაბალანსებული თანმიმდევრობით, გამორეცხვის პერიოდით და წინასწარ რეგისტრირებული თანმიმდევრობის ეფექტის ტესტით გადატანის ეფექტის გასაკონტროლებლად. ძირითადი ინსტრუმენტია ხელოვნური სოციალური აგენტის კითხვარი [14] (3.6). დიზაინის ორი მახასიათებელი პირდაპირ გამომდინარეობს წნეხის ტესტიდან (F18): ანალიზი მიმართულია გვიან, კონსოლიდაციის შემდგომი პერიოდისკენ (და კონსოლიდაციის სიმჭიდროვით მოდერირებული ეფექტებისკენ), და არა პირობის შიდა ზოგადი საშუალოსკენ, რადგან სწორედ იქ ვლინდება მხოლოდ C-სთვის დამახასიათებელი ნებისმიერი ეფექტი; და თბილი, მიკუთვნადი დავიწყება წინასწარ რეგისტრირებული არქიტექტურული წესია, რათა რბილად გამოტოვებული ელემენტი განაპირობებდეს თბილ, ნაწილობრივ აღიარებას ("დეტალები არ მახსოვს, მაგრამ ვიცი, რომ შენთვის მნიშვნელოვანი იყო") და არა სრულ დავიწყებას, რაც ნეიტრალიზებს დოკუმენტირებულ უარყოფით სიგნალს "დავიწყება ნიშნავს, რომ ნაკლებად მნიშვნელოვანი ვარ", რომელიც სხვა შემთხვევაში დაამახინჯებდა ნდობისა და ინტელექტის მაჩვენებლებს. პროტოკოლი ითვალისწინებს მოვლენაზე-მგრძნობიარე და ქცევაზე-დამოკიდებულ ცვლადებს (პოსტ-ეპიზოდური მიკრო-შეფასებები, თვით-გამჟღავნების სიღრმე, ნებაყოფლობითი დაბრუნება და გამოყენება) და სავალდებულო დაკოდებულ ინტერვიუებს (სულ მცირე ორი კოდერის მიერ ანალიზი იმისა, შეამჩნიეს თუ არა მომხმარებლებმა და დააფასეს თუ არა მეხსიერების დინამიკა), რათა თვით-ანგარიშის ნულირებაც კი ცარიელი შედეგის ნაცვლად, ინტერპრეტაციადი დისოციაციის რუკა გახდეს.</w:t>
       </w:r>
@@ -4335,6 +4526,7 @@
           <w:rFonts w:ascii="Sylfaen" w:hAnsi="Sylfaen" w:cs="Sylfaen"/>
           <w:b w:val="0"/>
           <w:sz w:val="24"/>
+          <w:lang w:val="ka-GE"/>
         </w:rPr>
         <w:t>ნიმუშის ზომა მიზანმიმართულად არ არის გათვლილი C &gt; B+-ის დასადასტურებლად. ა-პრიორი ძალის ანალიზი (F18) აჩვენებს, რომ ეს კონტრასტი, დიზაინში ყველაზე მცირე (dz ≈ 0.28, რომელიც "ცივი სტარტის" ეფექტით კიდევ უფრო მცირდება), ტრადიციული სტატისტიკური ძალის მქონე დეტექციისთვის n ≈ 116–159-ს მოითხოვდა, მაშინ როცა n ≈ 20 არის ნორმა ამ კლასის კვლევისთვის (F12) და ამ კონკრეტულ შედარებაზე მხოლოდ 2–12%-იან სტატისტიკურ ძალას იძლევა. შესაბამისად, პროტოკოლი გათვლილია იმ შედარებებისთვის, სადაც სიმძლავრე მიღწევადია — C &gt; A, და მიმართულებითი B+ &gt; B და C &gt; B — ხოლო C &gt; B+ განიხილება როგორც შეფასების სამიზნე (ეფექტის ზომა 95%-იანი ნდობის ინტერვალთან ერთად), ზუსტად ისე, როგორც ამას 3.1 და 3.7 მოითხოვს. ეს არის ამბიციური ამოცანისა და მიღწევადი ნიმუშის გულწრფელი შეთავსება, და ეს პროტოკოლში მითითებულია იმისთვის, რომ ზუსტი ნულოვანი ჰიპოთეზა აღიქმებოდეს მოსალოდნელ, გასააზრებელ შედეგად და არა პოსტფაქტუმ "გადარჩენად".</w:t>
       </w:r>
@@ -4354,6 +4546,7 @@
           <w:b/>
           <w:color w:val="000000"/>
           <w:sz w:val="28"/>
+          <w:lang w:val="ka-GE"/>
         </w:rPr>
         <w:t>3.6 ზომები და ინსტრუმენტები</w:t>
       </w:r>
@@ -4367,6 +4560,7 @@
           <w:rFonts w:ascii="Sylfaen" w:hAnsi="Sylfaen" w:cs="Sylfaen"/>
           <w:b w:val="0"/>
           <w:sz w:val="24"/>
+          <w:lang w:val="ka-GE"/>
         </w:rPr>
         <w:t>დამოკიდებული ცვლადები არის მომხმარებლის მიერ აღქმული სოციალური კონსტრუქტები, რომლებიც მითითებულია მიზანში და ოპერაციონალიზებულია ვალიდური ინსტრუმენტების (F11) მეშვეობით. ძირითადი ინსტრუმენტია ხელოვნური სოციალური აგენტის კითხვარი (ASAQ) [14], ვალიდური, ღია ლიცენზიის მქონე კითხვარი, რომელიც მოიცავს ცხრამეტ კონსტრუქტს გრძელი (90-კითხვრივი) და მოკლე (24-კითხვრივი) ფორმებით. ASAQ-ის სამი კონსტრუქტი ასახავს ძირითად ჰიპოთეზას:</w:t>
       </w:r>
@@ -4380,6 +4574,7 @@
           <w:rFonts w:ascii="Sylfaen" w:hAnsi="Sylfaen" w:cs="Sylfaen"/>
           <w:b w:val="0"/>
           <w:sz w:val="24"/>
+          <w:lang w:val="ka-GE"/>
         </w:rPr>
         <w:t>•  სოციალური თანდასწრება — სხვა სოციალურ ერთეულთან ერთად ყოფნის შეგრძნება;</w:t>
       </w:r>
@@ -4393,6 +4588,7 @@
           <w:rFonts w:ascii="Sylfaen" w:hAnsi="Sylfaen" w:cs="Sylfaen"/>
           <w:b w:val="0"/>
           <w:sz w:val="24"/>
+          <w:lang w:val="ka-GE"/>
         </w:rPr>
         <w:t>•  მომხმარებლისა და აგენტის ალიანსი — კავშირის, მიზნებისა და ამოცანებზე ორიენტირებული სამუშაო ურთიერთობა, რომელიც შეიძლება შევავსოთ WAI-SR ადაპტაციით (იხ. 2.6);</w:t>
       </w:r>
@@ -4406,6 +4602,7 @@
           <w:rFonts w:ascii="Sylfaen" w:hAnsi="Sylfaen" w:cs="Sylfaen"/>
           <w:b w:val="0"/>
           <w:sz w:val="24"/>
+          <w:lang w:val="ka-GE"/>
         </w:rPr>
         <w:t>•  აღქმული ადამიანურობა — ჩვენი მესამე ძირითადი კონსტრუქტის კანონიკური სახელწოდება, რომელიც ოპერაციალიზებულია ASAQ-ის სანდოობის ქვესკალით. ამ ნაშრომისთვის დადგენილი სახელწოდების კონვენციის (F11) თანახმად, "სანდოობა" გამოიყენება მხოლოდ როგორც ინსტრუმენტული ქვესკალა და არასდროს როგორც დამოკიდებული ცვლადის სახელწოდება.</w:t>
       </w:r>
@@ -4419,6 +4616,7 @@
           <w:rFonts w:ascii="Sylfaen" w:hAnsi="Sylfaen" w:cs="Sylfaen"/>
           <w:b w:val="0"/>
           <w:sz w:val="24"/>
+          <w:lang w:val="ka-GE"/>
         </w:rPr>
         <w:t>მეორადი და საკონტროლო კონსტრუქტები, 1.2-ის მეორადი ჰიპოთეზების შესაბამისად, იზომება პარალელურად: აღქმული ინტელექტი Godspeed-ის ინტელექტის ქვესკალის მეშვეობით (იხ. 2.6) (მიზნად ისახავს H2a-ს, რომლის მიხედვითაც ვერბატიმ RAG-ის ქულები ყველაზე მაღალია ინტელექტის მიხედვით), და კონფიდენციალურობასთან დაკავშირებული კომფორტი და ნდობა [11]-დან ადაპტირებული კოქსის სტილის კონფიდენციალურობის პუნქტების საშუალებით (მიზნად ისახავს H2b-ს, რომლის მიხედვითაც ვერბატიმ გახსენების ქულები ყველაზე დაბალია ნდობასა და კონფიდენციალურობის კომფორტში — პროგნოზი, რომლის გადასაჭრელადაც 3.2-ის გისტი/საყრდენი წარმოდგენაა შექმნილი). აღქმული ადამიანურობა შესაძლოა დამატებით გადამოწმდეს Godspeed-ის ანთროპომორფიზმთან მიმართებით, სადაც Godspeed-ი, მისი დოკუმენტირებული კრიტიკის (F11) გამო, ფსიქომეტრულად მეორეხარისხოვნად განიხილება. ჰიპოთეზებისა და ინსტრუმენტების რუკა, მონაცემთა შეგროვებამდე, განსაზღვრავს, თუ რომელ ქვესკალას ქულებს მიიღებს თითოეული ჰიპოთეზა.</w:t>
       </w:r>
@@ -4432,6 +4630,7 @@
           <w:rFonts w:ascii="Sylfaen" w:hAnsi="Sylfaen" w:cs="Sylfaen"/>
           <w:b w:val="0"/>
           <w:sz w:val="24"/>
+          <w:lang w:val="ka-GE"/>
         </w:rPr>
         <w:t>სიმულირებული ნაწილისთვის (3.5b), იგივე კონსტრუქტები ოპერაციულად არის განხორციელებული, როგორც დიდი ენის მოდელის (LLM) მოსამართლის პროტოკოლი: მოსამართლეს ეძლევა რუბრიკა, რომელიც ASAQ-ის, Godspeed-ისა და Cox-ის ქვესკალებიდან ელემენტების მიხედვით არის შედგენილი, და ის ტრანსკრიპტებს შესაბამის მასშტაბებზე აფასებს, რათა სიმულირებულმა და ადამიანურმა ტრაექტორიებმა ზუსტად იდენტური საზომი განმარტება გაიზიარონ. მსაჯულის ოპერაციონალიზაცია სრულად არის წარმოდგენილი — რუბრიკა, მასშტაბის ანკერები, ინსტრუქცია და მსაჯულის საიმედოობის შემოწმება ადამიანის ანოტატორების მიერ ერთობლივად შეფასებული ტრანსკრიპტების მცირე, გამოყოფილი ნაკრების წინააღმდეგ — სწორედ იმიტომ, რომ ბენჩმარკის სანდოობის კრიზისი (F9) აჩვენებს, რომ არავალიდური LLM მსაჯული არასანდოა. როდესაც ასეთი ადამიანური ვალიდაცია არ არსებობს, სიმულირებული შეფასებები წარმოდგენილია მხოლოდ როგორც ქცევითი განასხვავებადობის სიგნალები, კონსტრუქტის დონეზე ინტერპრეტაციის გარეშე. სიმულირებული შეფასებები წარმოდგენილია მკაცრად 3.5(b)-ის ვალიდურობის ლიმიტების ფარგლებში.</w:t>
       </w:r>
@@ -4451,6 +4650,7 @@
           <w:b/>
           <w:color w:val="000000"/>
           <w:sz w:val="28"/>
+          <w:lang w:val="ka-GE"/>
         </w:rPr>
         <w:t>3.7 ანალიზის გეგმა</w:t>
       </w:r>
@@ -4464,6 +4664,7 @@
           <w:rFonts w:ascii="Sylfaen" w:hAnsi="Sylfaen" w:cs="Sylfaen"/>
           <w:b w:val="0"/>
           <w:sz w:val="24"/>
+          <w:lang w:val="ka-GE"/>
         </w:rPr>
         <w:t>ანალიზი ეფუძნება "შეფასება-პირველად" ფილოსოფიას, რომელიც შეესაბამება 3.1-ის ინფერენციულ პოზიციას. ყოველი პირობითი კონტრასტისთვის, მთავარ წარმოდგენილ მაჩვენებელს წარმოადგენს ეფექტის ზომა (კოენისა dz შიდა-სუბიექტური კონტრასტებისთვის), 95%-იანი სანდო ინტერვალთან ერთად, და არა დიქოტომიური მნიშვნელობის შეფასება. დამადასტურებელი შედარებებისთვის, სადაც არსებობს მძლავრობა (C &gt; A; მიმართულებითი B+ &gt; B და C &gt; B), შეფასებასთან ერთად მოცემულია ჰოლმის კორექტირებული ჰიპოთეზის ტესტი. ცენტრალური C &gt; B+ კონტრასტისთვის ინტერვალთან ერთად მხოლოდ შეფასება ინტერპრეტირდება, სიზუსტისა და ეკვივალენტურობის ლოგიკის გამოყენებით: ნულზე გადაჭიმული ვიწრო ინტერვალი განიხილება მტკიცებულებად იმისა, რომ ადამიანის მეხსიერების დინამიკა კურატორული სტატიკური მეხსიერების მიმართ შედარებით მცირე აღქმითი მარჟინით გამოირჩევა და — 3.1-თან შესაბამისად — ეს ნული წარმოდგენილია, როგორც მნიშვნელოვანი აღმოჩენა, რომლის ინტერპრეტაციისთვისაც B+ კონტროლი იყო შექმნილი, ხოლო ნულის დამუშავების წესი წინასწარ იყო რეგისტრირებული, რათა ის მოსალოდნელი აღმოჩენად წავიკითხოთ. სადაც გამოიყენება გადავადებული პროტოკოლის გვიანი-ფანჯრის და კონსოლიდაციის-სიმკვრივის-კონტროლირებადი ანალიზები (3.5c), კონსოლიდაციის სიმკვრივე, თითოეული დონის გამოძახების წილი, სალიენსის ჩაწერის სიხშირე და ეფექტური ისტორიის-ფარვა შეყვანილია წინასწარ რეგისტრირებულ კოვარიატებად.</w:t>
       </w:r>
@@ -4477,6 +4678,7 @@
           <w:rFonts w:ascii="Sylfaen" w:hAnsi="Sylfaen" w:cs="Sylfaen"/>
           <w:b w:val="0"/>
           <w:sz w:val="24"/>
+          <w:lang w:val="ka-GE"/>
         </w:rPr>
         <w:t>მგრძნობელობის ანალიზი სავალდებულო და წინასწარ განსაზღვრულია: იცვლება გარედან დაფუძნებული კლებადი მუდმივები (სტაბილურობის ბაზა იყოფა და ემატება ორჯერ, კლებადი ექსპონენტისა და ქვედა ზღვრის სკანირება ხდება, ხოლო ექსპონენციალური ვარიანტი შეიცვლება ძალოვანი კანონის კლებადი ვარიანტით), და შინაარსობრივი დასკვნები ამ დიაპაზონში წარმოადგენენ მდგრადს ან მყიფეს. ეს პირდაპირ პასუხობს პარამეტრიზებული არქიტექტურის მიმართ "სასურველი შედეგის შერჩევის" (cherry-picking) კრიტიკას და ხელს უშლის შედეგის მხოლოდ ერთი იღბლიანი მუდმივის վրա დაყრდნობას.</w:t>
       </w:r>
@@ -4490,6 +4692,7 @@
           <w:rFonts w:ascii="Sylfaen" w:hAnsi="Sylfaen" w:cs="Sylfaen"/>
           <w:b w:val="0"/>
           <w:sz w:val="24"/>
+          <w:lang w:val="ka-GE"/>
         </w:rPr>
         <w:t>მთლიანი გეგმა — არქიტექტურული პარამეტრები და მათი გარედან დაფუძნებული მნიშვნელობები, საგულისხმო კრიტერიუმების ინსტრუქციის პირდაპირი ციტირება, პირობების ნაკრები, ჰიპოთეზიდან ინსტრუმენტამდე რუკა, ძირითადი და თანახელისშემწყობი ანალიზები, მგრძნობელობის ანალიზის დიაპაზონი და ნულოვანი ჰიპოთეზის დამუშავების წესი — წინასწარ რეგისტრირდება მონაცემთა შეგროვებამდე. წინასწარი რეგისტრაცია აქ განიხილება არა როგორც ფორმალობა, არამედ როგორც დიზაინის დასაბუთებადობის მთავარი გარანტია: რადგან სამეცნიერო თვალსაზრისით ცენტრალური კონტრასტი არის შეფასების სამიზნე მაღალი ნულოვანი რისკის პირობებში, საბოლოო მტკიცების სანდოობა დამოკიდებულია იმაზე, რომ ანალიზი წინასწარ იყო დაფიქსირებული მონაცემების ნახვამდე.</w:t>
       </w:r>
@@ -4509,6 +4712,7 @@
           <w:b/>
           <w:color w:val="000000"/>
           <w:sz w:val="28"/>
+          <w:lang w:val="ka-GE"/>
         </w:rPr>
         <w:t>3.8 ეთიკური საკითხები და შეზღუდვები</w:t>
       </w:r>
@@ -4522,6 +4726,7 @@
           <w:rFonts w:ascii="Sylfaen" w:hAnsi="Sylfaen" w:cs="Sylfaen"/>
           <w:b w:val="0"/>
           <w:sz w:val="24"/>
+          <w:lang w:val="ka-GE"/>
         </w:rPr>
         <w:t>ამ სადისერტაციო ნაშრომში არ არის შეგროვებული ადამიანთა მონაწილეობით მიღებული მონაცემები. ნაშრომი წარმოადგენს დიზაინს, კონცეფციის დამტკიცების მექანიზმს და ტექნიკურ და სიმულირებულ შეფასებას; 3.5(c) პუნქტით გათვალისწინებული ადამიანთა მონაწილეობით კვლევა არის განსაზღვრული პროტოკოლი, რომელიც მომავალი სამუშაოსთვისაა დატოვებული. შესაბამისად, ეთიკური ვალდებულებები, რომლებიც დაკავშირებულია გადავადებულ კვლევასთან — ინფორმირებული თანხმობა, თვითგამჟღავნების მართვა, რასაც საგულისხმოდ არის შექმნილი "სალიენსის" რუბრიკა, მონაწილეთა მონაცემთა იზოლაცია და სახელწოდებათა სეგრეგაცია, მონაწილეობის შეწყვეტისა და მეხსიერების საცავის წაშლის უფლება, და ინსტიტუციური განხილვა — განისაზღვრება, როგორც ამ მომავალი კვლევის წინაპირობები და არა როგორც აქ გატარებული ზომები. გრძელვადიანი მეხსიერების კონფიდენციალურობისადმი მგრძნობიარე ბუნება, რომელიც აღრიცხავს იმას, რასაც მომხმარებლები კვირების განმავლობაში ამხელენ, თავად არის კვლევის ობიექტის ნაწილი (კოქსის კონფიდენციალურობის დასკვნა [11] და 3.2-ის "ბუნდოვანი კვალი" პრინციპი), რაც, და არა ნაკლებად, ამძიმებს ვალდებულებას, კვლევის საბოლოო ჩატარებისას ამ მონაცემებს განსაკუთრებული სიფრთხილით მოვეკიდოთ.</w:t>
       </w:r>
@@ -4535,6 +4740,7 @@
           <w:rFonts w:ascii="Sylfaen" w:hAnsi="Sylfaen" w:cs="Sylfaen"/>
           <w:b w:val="0"/>
           <w:sz w:val="24"/>
+          <w:lang w:val="ka-GE"/>
         </w:rPr>
         <w:t>მეთოდოლოგიას, პირდაპირ და მკაფიოდ, სამი სახის შეზღუდვა გააჩნია.</w:t>
       </w:r>
@@ -4548,6 +4754,7 @@
           <w:rFonts w:ascii="Sylfaen" w:hAnsi="Sylfaen" w:cs="Sylfaen"/>
           <w:b w:val="0"/>
           <w:sz w:val="24"/>
+          <w:lang w:val="ka-GE"/>
         </w:rPr>
         <w:t>შეფასების-ვალიდურობის შეზღუდვები. სიმულირებული მომხმარებლის ტრაექტორია (3.5b) არის ადამიანის აღქმისადმი უცნობი სიზუსტის პროქსი: LLM-ის მსაჯულმა შეიძლება შეაფასოს ზედაპირული გასაგებობა და არა აღქმული ურთიერთობის ხარისხი — სწორედ ამ აღრევის ფაქტორის გასაკონტროლებლად არსებობს B+ — და სიმულირებულ მომხმარებლებს არ გააჩნიათ ისეთი მნიშვნელოვანი ფაქტორები, დროითი სიღრმე და კონფიდენციალურობასთან დაკავშირებული მგრძნობელობა, რაც რეალურ გამოყენებაში მეხსიერებას ორპირს ხდის (F4). სიმულირებული ნაწილიდან არცერთი აღქმითი დასკვნა არ გამომდინარეობს; ის მხოლოდ ჰიპოთეზებს ქმნის და ინსტრუმენტს ამოწმებს, მეტი არაფერი. ტექნიკური მიმართულება ზომავს ფაქტობრივ გახსენებასა და შეფერხებას, რასაც დიზაინი განზრახ არ აიგივებს აღქმული ურთიერთობის ხარისხთან, და ის მიმდინარეობს სინთეზური დიალოგების მეშვეობით, რომელთა განაწილება შესაძლოა არ ემთხვეოდეს რეალურ მრავალსესიან ხმოვან ურთიერთობას.</w:t>
       </w:r>
@@ -4561,6 +4768,7 @@
           <w:rFonts w:ascii="Sylfaen" w:hAnsi="Sylfaen" w:cs="Sylfaen"/>
           <w:b w:val="0"/>
           <w:sz w:val="24"/>
+          <w:lang w:val="ka-GE"/>
         </w:rPr>
         <w:t>ინფერენციული შეზღუდვები. შესრულების შემთხვევაშიც კი, ადამიანური პროტოკოლი არ არის საკმარისად მძლავრი ცენტრალური C &gt; B+ კონტრასტის (3.1, 3.5c) დასადასტურებლად; ეს კონტრასტი შეფასების სამიზნეა, და დისერტაციის დამადასტურებელი მტკიცებები შემოიფარგლება უფრო მძლავრი შედარებებით. 1-ში დადგენილი ერთენოვანი, ერთმოდალური მასშტაბი (ინგლისური, მხოლოდ ხმა) გარე ვალიდურობას ზღუდავს გამოცდილი პირობით.</w:t>
       </w:r>
@@ -4574,6 +4782,7 @@
           <w:rFonts w:ascii="Sylfaen" w:hAnsi="Sylfaen" w:cs="Sylfaen"/>
           <w:b w:val="0"/>
           <w:sz w:val="24"/>
+          <w:lang w:val="ka-GE"/>
         </w:rPr>
         <w:t>თეორიისადმი ერთგულების შეზღუდვები. როგორც 3.2-შია დეტალურად აღწერილი, პროფილი C თავის ხუთ საწყის თეორიას კომპოზიციად აწყობს და არა ერთ მთლიანობად აერთიანებს და სამ სახელდებულ გამოტოვებას ახდენს: ის გამოტოვებს ინტერფერენციას, ადამიანის დავიწყების დომინანტურ დინამიკას, და მხოლოდ დროისა და სალიენსის დაქვეითებას მოდელირებს; მისი სიზუსტეზე ორიენტირებული კონსოლიდაცია მიზანმიმართულად თრგუნავს რეკონსტრუქციულ და სქემაზე დაფუძნებულ დამახინჯებას, რასაც ყველაზე მკაფიოდ პროგნოზირებს ბუნდოვანი კვალითა და კომპლემენტარული სწავლის სისტემები, და კოგნიტურ რეალიზმს ადამიანურობის ღერძზე ცვლის ყალბი, ზოგადი გამონათქვამების დამაჯერებლად წარმოდგენის უსაფრთხოებით; და ის დროის თანმიმდევრობისა და წყაროს მეხსიერებას მხოლოდ სუსტად ასახავს. კომპლემენტარული სწავლების სისტემების საფუძველი მოხმობილია მისი ეპიზოდურიდან სემანტიკურზე გადაცემის ფუნქციის სულისკვეთებით და არა როგორც ჩართული, ინტერფერენციისგან დაცული კორტიკალური სწავლების მტკიცება, ხოლო კოდირების დროის სალიენსის მექანიზმი აღიარებულია როგორც დამუშავების დონეების ეფექტი, ისევე როგორც მოდალური მოდელისა. ეს არის პრინციპული საინჟინრო არჩევანი, რომელიც გამჟღავნებულია იმისთვის, რომ არქიტექტურის კოგნიტური დასაბუთების მტკიცება აღიქმებოდეს როგორც პროექტირების ეტაპზე მიღებული შთაგონება გაზომვადი ქცევითი ნიშნულებით, 2.2-თან შესაბამისობაში, და არა როგორც ფსიქოლოგიური ერთგულების მტკიცება. თითოეული გამოტოვება, შესაბამისად, მომავალი მუშაობის კონკრეტული მიმართულებაა.</w:t>
       </w:r>
@@ -4594,6 +4803,7 @@
           <w:b/>
           <w:color w:val="000000"/>
           <w:sz w:val="28"/>
+          <w:lang w:val="ka-GE"/>
         </w:rPr>
         <w:t>4. შედეგები და განხილვა</w:t>
       </w:r>
@@ -4607,6 +4817,7 @@
           <w:rFonts w:ascii="Sylfaen" w:hAnsi="Sylfaen" w:cs="Sylfaen"/>
           <w:b w:val="0"/>
           <w:sz w:val="24"/>
+          <w:lang w:val="ka-GE"/>
         </w:rPr>
         <w:t>ეს თავი წარმოადგენს კონცეფციის დამტკიცების იმპლემენტაციასა და მის ორხაზიან შეფასებას (3.4–3.5) და განიხილავს, თუ რას ამტკიცებენ შედეგები და — არანაკლებ მნიშვნელოვანია — რას არ ამტკიცებენ. დიზაინი მიზანმიმართულად არ ამყარებს თავის ცენტრალურ აღქმით პრეტენზიას ამ შეფასებაზე (3.1); ტექნიკური მიმართულება აჩვენებს, რომ მექანიზმები ფუნქციონირებს დიზაინის შესაბამისად და განასხვავებადია პირობების მიხედვით, ხოლო სიმულაციური მიმართულება ერთდროულად აფასებს აღქმითი ეფექტების მიმართულებას და, ერთი მხრივ, იძლევა არსებით მეთოდოლოგიურ შედეგს თავად სიმულაციური შეფასების შეზღუდვების შესახებ.</w:t>
       </w:r>
@@ -4626,6 +4837,7 @@
           <w:b/>
           <w:color w:val="000000"/>
           <w:sz w:val="28"/>
+          <w:lang w:val="ka-GE"/>
         </w:rPr>
         <w:t>4.1 კონცეფციის დამტკიცება: მასშტაბი და სიზუსტე</w:t>
       </w:r>
@@ -4639,6 +4851,7 @@
           <w:rFonts w:ascii="Sylfaen" w:hAnsi="Sylfaen" w:cs="Sylfaen"/>
           <w:b w:val="0"/>
           <w:sz w:val="24"/>
+          <w:lang w:val="ka-GE"/>
         </w:rPr>
         <w:t>კონცეფციის დამტკიცება არის Python-ის დამოუკიდებელი მეხსიერების ჰარნესი, რომელიც მრავალსესიანი დიალოგის ტრანსკრიპტებზე ახორციელებს ოთხ პირობას (A, B, B+, C). ენობრივი მოდელის როლებისთვის (მნიშვნელოვნების შეფასება, აბზაცური შეჯამება, კონსოლიდაცია, საუბრის აგენტი და მსაჯული) გამოყენებულია OpenAI gpt-4o-mini, ხოლო მონაცემთა გამოსაძებნად — text-embedding-3-small. ის გამოცდილი იყო სამი სინთეზური მომხმარებლის პერსონას მეშვეობით, თითოეული მათგანი წარმოადგენდა ოთხსესიან საუბარს ჩადებული მნიშვნელოვანი ფაქტებით (სახელები, ალერგიები, ოჯახი), ერთჯერადი უმნიშვნელო ინფორმაციით (ამინდის შესახებ გაკვრით ნათქვამი კომენტარი, დავიწყებული ფილმის სათაური, ერთხელ ნახსენები კაფე) და განმეორებადი ემოციური თემით (დიპლომის დაცვის ვადის სტრესი, თანადამფუძნებლებს შორის კონფლიქტი, ღამის ცვლისგან დაღლილობა). მომხმარებლის რიგის იდენტური სცენარები განმეორებით გაუშვეს ოთხივე პირობაში, ასე რომ, ყველა პირობა იღებდა ერთსა და იმავე შემავალ მონაცემებს და მხოლოდ მეხსიერების მექანიზმით განსხვავდებოდა. სრული გაშვების ღირებულებამ დაახლოებით 0.01 აშშ დოლარი შეადგინა და შვიდ წუთზე ნაკლები დრო დაიკავა.</w:t>
       </w:r>
@@ -4650,6 +4863,7 @@
           <w:rFonts w:ascii="Sylfaen" w:hAnsi="Sylfaen" w:cs="Sylfaen"/>
           <w:b w:val="0"/>
           <w:sz w:val="24"/>
+          <w:lang w:val="ka-GE"/>
         </w:rPr>
         <w:t>ცხრილი 4.1 აჩვენებს ჩარჩოს ერთგულებას 3.2-ის სრული არქიტექტურის მიმართ, სადაც გულწრფელად არის გამიჯნული, თუ რა არის იმპლემენტირებული და რა გადავადებული (F18-ის ყველაზე იაფი, მისაღები ვარიანტის მიხედვით).</w:t>
       </w:r>
@@ -4663,6 +4877,7 @@
           <w:rFonts w:ascii="Sylfaen" w:hAnsi="Sylfaen" w:cs="Sylfaen"/>
           <w:b/>
           <w:sz w:val="22"/>
+          <w:lang w:val="ka-GE"/>
         </w:rPr>
         <w:t>ცხრილი 4.1. კონცეფციის დამტკიცების ერთგულება 3.2-ის სრული არქიტექტურის მიმართ</w:t>
       </w:r>
@@ -4699,6 +4914,7 @@
                 <w:rFonts w:ascii="Sylfaen" w:hAnsi="Sylfaen" w:cs="Sylfaen"/>
                 <w:b/>
                 <w:sz w:val="22"/>
+                <w:lang w:val="ka-GE"/>
               </w:rPr>
               <w:t>მექანიზმი (3.2)</w:t>
             </w:r>
@@ -4717,6 +4933,7 @@
                 <w:rFonts w:ascii="Sylfaen" w:hAnsi="Sylfaen" w:cs="Sylfaen"/>
                 <w:b/>
                 <w:sz w:val="22"/>
+                <w:lang w:val="ka-GE"/>
               </w:rPr>
               <w:t>ერთგულება კონცეფციის დამტკიცებაში</w:t>
             </w:r>
@@ -4737,6 +4954,7 @@
                 <w:rFonts w:ascii="Sylfaen" w:hAnsi="Sylfaen" w:cs="Sylfaen"/>
                 <w:b w:val="0"/>
                 <w:sz w:val="22"/>
+                <w:lang w:val="ka-GE"/>
               </w:rPr>
               <w:t>მნიშვნელობის-მიხედვით გაფილტრული კოდირება</w:t>
             </w:r>
@@ -4755,6 +4973,7 @@
                 <w:rFonts w:ascii="Sylfaen" w:hAnsi="Sylfaen" w:cs="Sylfaen"/>
                 <w:b w:val="0"/>
                 <w:sz w:val="22"/>
+                <w:lang w:val="ka-GE"/>
               </w:rPr>
               <w:t>იმპლემენტირებული (LLM-ის რუბრიკა, ოთხი განზომილება)</w:t>
             </w:r>
@@ -4775,6 +4994,7 @@
                 <w:rFonts w:ascii="Sylfaen" w:hAnsi="Sylfaen" w:cs="Sylfaen"/>
                 <w:b w:val="0"/>
                 <w:sz w:val="22"/>
+                <w:lang w:val="ka-GE"/>
               </w:rPr>
               <w:t>მთავარი აზრი + სიტყვასიტყვითი საყრდენი წარმოდგენა</w:t>
             </w:r>
@@ -4793,6 +5013,7 @@
                 <w:rFonts w:ascii="Sylfaen" w:hAnsi="Sylfaen" w:cs="Sylfaen"/>
                 <w:b w:val="0"/>
                 <w:sz w:val="22"/>
+                <w:lang w:val="ka-GE"/>
               </w:rPr>
               <w:t>განხორციელებული</w:t>
             </w:r>
@@ -4813,6 +5034,7 @@
                 <w:rFonts w:ascii="Sylfaen" w:hAnsi="Sylfaen" w:cs="Sylfaen"/>
                 <w:b w:val="0"/>
                 <w:sz w:val="22"/>
+                <w:lang w:val="ka-GE"/>
               </w:rPr>
               <w:t>ებინგჰაუსის დაქრობა + გაძლიერება</w:t>
             </w:r>
@@ -4831,6 +5053,7 @@
                 <w:rFonts w:ascii="Sylfaen" w:hAnsi="Sylfaen" w:cs="Sylfaen"/>
                 <w:b w:val="0"/>
                 <w:sz w:val="22"/>
+                <w:lang w:val="ka-GE"/>
               </w:rPr>
               <w:t>განხორციელებულია (ზარმაცა, სესიურ-ერთეული დრო)</w:t>
             </w:r>
@@ -4851,6 +5074,7 @@
                 <w:rFonts w:ascii="Sylfaen" w:hAnsi="Sylfaen" w:cs="Sylfaen"/>
                 <w:b w:val="0"/>
                 <w:sz w:val="22"/>
+                <w:lang w:val="ka-GE"/>
               </w:rPr>
               <w:t>ეპიზოდური→სემანტიკური კონსოლიდაცია</w:t>
             </w:r>
@@ -4869,6 +5093,7 @@
                 <w:rFonts w:ascii="Sylfaen" w:hAnsi="Sylfaen" w:cs="Sylfaen"/>
                 <w:b w:val="0"/>
                 <w:sz w:val="22"/>
+                <w:lang w:val="ka-GE"/>
               </w:rPr>
               <w:t>შესრულებულია (ჩაშენების კლასტერიზაცია + დიდი ენის მოდელის აბსტრაქცია)</w:t>
             </w:r>
@@ -4889,6 +5114,7 @@
                 <w:rFonts w:ascii="Sylfaen" w:hAnsi="Sylfaen" w:cs="Sylfaen"/>
                 <w:b w:val="0"/>
                 <w:sz w:val="22"/>
+                <w:lang w:val="ka-GE"/>
               </w:rPr>
               <w:t>მთავარი იდეის პირველადი კომპოზიტური გამოძახება</w:t>
             </w:r>
@@ -4907,6 +5133,7 @@
                 <w:rFonts w:ascii="Sylfaen" w:hAnsi="Sylfaen" w:cs="Sylfaen"/>
                 <w:b w:val="0"/>
                 <w:sz w:val="22"/>
+                <w:lang w:val="ka-GE"/>
               </w:rPr>
               <w:t>განხორციელებულია (რელევანტურობა × მოპოვებადობა × შეზღუდული სემანტიკური ბონუსი)</w:t>
             </w:r>
@@ -4927,6 +5154,7 @@
                 <w:rFonts w:ascii="Sylfaen" w:hAnsi="Sylfaen" w:cs="Sylfaen"/>
                 <w:b w:val="0"/>
                 <w:sz w:val="22"/>
+                <w:lang w:val="ka-GE"/>
               </w:rPr>
               <w:t>მოვლენის სეგმენტაცია</w:t>
             </w:r>
@@ -4945,6 +5173,7 @@
                 <w:rFonts w:ascii="Sylfaen" w:hAnsi="Sylfaen" w:cs="Sylfaen"/>
                 <w:b w:val="0"/>
                 <w:sz w:val="22"/>
+                <w:lang w:val="ka-GE"/>
               </w:rPr>
               <w:t>შემოკლებული: ერთი გამოსვლა = ერთი მოვლენა (ბაიესის სიურპრიზის სეგმენტაცია გადავადებულია)</w:t>
             </w:r>
@@ -4965,6 +5194,7 @@
                 <w:rFonts w:ascii="Sylfaen" w:hAnsi="Sylfaen" w:cs="Sylfaen"/>
                 <w:b w:val="0"/>
                 <w:sz w:val="22"/>
+                <w:lang w:val="ka-GE"/>
               </w:rPr>
               <w:t>ასოციაციური წინასწარი გაფართოება; ანკერ-რეჯექსის ზუსტი აღდგენის ტრიგერი; პროგრამული მგრძნობელობის სკანირება</w:t>
             </w:r>
@@ -4983,6 +5213,7 @@
                 <w:rFonts w:ascii="Sylfaen" w:hAnsi="Sylfaen" w:cs="Sylfaen"/>
                 <w:b w:val="0"/>
                 <w:sz w:val="22"/>
+                <w:lang w:val="ka-GE"/>
               </w:rPr>
               <w:t>გადავადებულია სრულ ვერსიაზე</w:t>
             </w:r>
@@ -5003,6 +5234,7 @@
                 <w:rFonts w:ascii="Sylfaen" w:hAnsi="Sylfaen" w:cs="Sylfaen"/>
                 <w:b w:val="0"/>
                 <w:sz w:val="22"/>
+                <w:lang w:val="ka-GE"/>
               </w:rPr>
               <w:t>რეალური ხმის მილსადენი (STT/TTS/რიგის დაცვა)</w:t>
             </w:r>
@@ -5021,6 +5253,7 @@
                 <w:rFonts w:ascii="Sylfaen" w:hAnsi="Sylfaen" w:cs="Sylfaen"/>
                 <w:b w:val="0"/>
                 <w:sz w:val="22"/>
+                <w:lang w:val="ka-GE"/>
               </w:rPr>
               <w:t>დიზაინით გათვალისწინებული არ არის — ჰარნესი ტრანსკრიპტების მიხედვით იკვლევს მეხსიერების პროცესს</w:t>
             </w:r>
@@ -5040,6 +5273,7 @@
           <w:rFonts w:ascii="Sylfaen" w:hAnsi="Sylfaen" w:cs="Sylfaen"/>
           <w:b w:val="0"/>
           <w:sz w:val="24"/>
+          <w:lang w:val="ka-GE"/>
         </w:rPr>
         <w:t>დრო იზომება სესიური ერთეულებით და არა კალენდარული დროით, ხოლო მომხმარებლები სიმულირებულნი არიან და არა ადამიანები; ორივე ზღუდავს ინტერპრეტაციას და განხილულია 4.4-ში.</w:t>
       </w:r>
@@ -5059,6 +5293,7 @@
           <w:b/>
           <w:color w:val="000000"/>
           <w:sz w:val="28"/>
+          <w:lang w:val="ka-GE"/>
         </w:rPr>
         <w:t>4.2 ტექნიკური შედეგები</w:t>
       </w:r>
@@ -5072,6 +5307,7 @@
           <w:rFonts w:ascii="Sylfaen" w:hAnsi="Sylfaen" w:cs="Sylfaen"/>
           <w:b w:val="0"/>
           <w:sz w:val="24"/>
+          <w:lang w:val="ka-GE"/>
         </w:rPr>
         <w:t>სესიებს შორის გახსენება და კეთილშობილური დავიწყება. ცხრილი 4.2 აჩვენებს გახსენების პრობების სწორად პასუხგაცემული წილს, პრობის ტიპის მიხედვით, აგრეგირებულს სამი პერსონასთვის.</w:t>
       </w:r>
@@ -5085,6 +5321,7 @@
           <w:rFonts w:ascii="Sylfaen" w:hAnsi="Sylfaen" w:cs="Sylfaen"/>
           <w:b/>
           <w:sz w:val="22"/>
+          <w:lang w:val="ka-GE"/>
         </w:rPr>
         <w:t>ცხრილი 4.2. სესიებს-შორისი გახსენების სიზუსტე პრობის ტიპის მიხედვით</w:t>
       </w:r>
@@ -5123,6 +5360,7 @@
                 <w:rFonts w:ascii="Sylfaen" w:hAnsi="Sylfaen" w:cs="Sylfaen"/>
                 <w:b/>
                 <w:sz w:val="22"/>
+                <w:lang w:val="ka-GE"/>
               </w:rPr>
               <w:t>პირობა</w:t>
             </w:r>
@@ -5141,6 +5379,7 @@
                 <w:rFonts w:ascii="Sylfaen" w:hAnsi="Sylfaen" w:cs="Sylfaen"/>
                 <w:b/>
                 <w:sz w:val="22"/>
+                <w:lang w:val="ka-GE"/>
               </w:rPr>
               <w:t>მნიშვნელოვანი ფაქტები</w:t>
             </w:r>
@@ -5159,6 +5398,7 @@
                 <w:rFonts w:ascii="Sylfaen" w:hAnsi="Sylfaen" w:cs="Sylfaen"/>
                 <w:b/>
                 <w:sz w:val="22"/>
+                <w:lang w:val="ka-GE"/>
               </w:rPr>
               <w:t>წვრილმანები</w:t>
             </w:r>
@@ -5177,6 +5417,7 @@
                 <w:rFonts w:ascii="Sylfaen" w:hAnsi="Sylfaen" w:cs="Sylfaen"/>
                 <w:b/>
                 <w:sz w:val="22"/>
+                <w:lang w:val="ka-GE"/>
               </w:rPr>
               <w:t>გენერალიზაცია</w:t>
             </w:r>
@@ -5197,6 +5438,7 @@
                 <w:rFonts w:ascii="Sylfaen" w:hAnsi="Sylfaen" w:cs="Sylfaen"/>
                 <w:b w:val="0"/>
                 <w:sz w:val="22"/>
+                <w:lang w:val="ka-GE"/>
               </w:rPr>
               <w:t>A (მეხსიერების გარეშე)</w:t>
             </w:r>
@@ -5271,6 +5513,7 @@
                 <w:rFonts w:ascii="Sylfaen" w:hAnsi="Sylfaen" w:cs="Sylfaen"/>
                 <w:b w:val="0"/>
                 <w:sz w:val="22"/>
+                <w:lang w:val="ka-GE"/>
               </w:rPr>
               <w:t>B (ვერბატიმ RAG)</w:t>
             </w:r>
@@ -5345,6 +5588,7 @@
                 <w:rFonts w:ascii="Sylfaen" w:hAnsi="Sylfaen" w:cs="Sylfaen"/>
                 <w:b w:val="0"/>
                 <w:sz w:val="22"/>
+                <w:lang w:val="ka-GE"/>
               </w:rPr>
               <w:t>B+ (კურატორირებული სტატიკური)</w:t>
             </w:r>
@@ -5419,6 +5663,7 @@
                 <w:rFonts w:ascii="Sylfaen" w:hAnsi="Sylfaen" w:cs="Sylfaen"/>
                 <w:b w:val="0"/>
                 <w:sz w:val="22"/>
+                <w:lang w:val="ka-GE"/>
               </w:rPr>
               <w:t>C (პროფილი C)</w:t>
             </w:r>
@@ -5492,6 +5737,7 @@
           <w:rFonts w:ascii="Sylfaen" w:hAnsi="Sylfaen" w:cs="Sylfaen"/>
           <w:b w:val="0"/>
           <w:sz w:val="24"/>
+          <w:lang w:val="ka-GE"/>
         </w:rPr>
         <w:t>სამი მოდელი ჩანს. პირველი, გრძელვადიანი მეხსიერება აუცილებელია: პირობა A, მხოლოდ ნაკლებად მდგრადი სამუშაო ფანჯრით, არ იხსენებს სესიებს შორის არსებულ არცერთ ფაქტს (მისი 0.67 გენერალიზაციის მაჩვენებელი სესიის შიდა არტეფაქტია — განმეორებადი თემა ხელახლა არის წარმოდგენილი იმავე სესიაში, რომელშიც ტესტირება მიმდინარეობს — და არა მეხსიერების მტკიცებულება). მეორე და, რაც მთავარია, მხოლოდ პროფილი C ავლენს გრაციოზულ, მნიშვნელობაზე-დაფუძნებულ დავიწყებას: ის ინარჩუნებს ყველა მნიშვნელოვან ფაქტს (1.00) და ივიწყებს დაბალი მნიშვნელობის მქონე წვრილმანებს (0.00), მაშინ როცა B და B+ ყველაფერს განურჩევლად ინარჩუნებენ (1.00/1.00). ეს არის ებინგჰაუსის ეფექტი, რომელიც მოქმედებს ისე, როგორც უნდა — დაბალი მნიშვნელობის კვალი მცირე სტაბილურობას იძენს, ერთი-ორი სესიის შუალედში იშლება ხელმისაწვდომობის ზღვარს ქვემოთ და გადის მეხსიერების აღდგენის პროცესს. ქცევითი განსხვავება პირდაპირ შესამჩნევია: კითხვაზე, როგორი ამინდი იყო, B პირობამ უპასუხა: "იმ დილით ძალიან ბურუსი იყო, ერთგვარად ლამაზი!", ხოლო C პირობამ უპასუხა: "ჩემს წინა საუბარში ამინდის შესახებ ეს კონკრეტული დეტალი არ მახსოვს. შენთან ბოლო დროს როგორი ამინდია?" — ეს იყო თბილი, დაუმახსოვრებელი პასუხი და არა მექანიკური გამეორება.</w:t>
       </w:r>
@@ -5505,6 +5751,7 @@
           <w:rFonts w:ascii="Sylfaen" w:hAnsi="Sylfaen" w:cs="Sylfaen"/>
           <w:b w:val="0"/>
           <w:sz w:val="24"/>
+          <w:lang w:val="ka-GE"/>
         </w:rPr>
         <w:t>კონსოლიდაცია. მხოლოდ პროფილი C ქმნიდა მდგრად სემანტიკურ ფაქტებს: ოთხს სამი პერსონას მიხედვით (B-მ და B+-მ, კონსტრუქციიდან გამომდინარე, არცერთი არ შექმნეს). განმეორებადი თემის წამოწევისას, C ეყრდნობოდა თავის კონსოლიდირებულ საცავს — "როგორც ჩანს, თქვენს თანადამფუძნებელთან და თქვენი კომპანიის მიმართულებასთან დაკავშირებული გამოწვევები განმეორებადი თემაა". მნიშვნელოვანია, გულწრფელად აღინიშნოს, რომ B+-მაც უზრუნველყო კომპეტენტური განზოგადება რეალურ დროში — "თქვენს თანადამფუძნებელთან მიმდინარე დაძაბულობა მნიშვნელოვანი თემაა" — ენობრივი მოდელის მიერ რამდენიმე მოძიებული ეპიზოდიდან კანონის გამოტანით. შესაბამისად, C-ის კონსოლიდაციის უპირატესობა იმას არ ნიშნავს, რომ კურირებული საბაზისო მოდელი ვერ ახდენს განზოგადებას, არამედ იმაში მდგომარეობს, რომ C ინარჩუნებს განზოგადებას, როგორც აშკარა, მდგრად, ხელახლა გამოყენებად სტრუქტურას, რომელიც ეფუძნება წყარო-ეპიზოდების წარმომავლობას, და რომელიც შექმნილია ოფლაინ, და არა თავიდან იქმნება ყოველ ჯერზე.</w:t>
       </w:r>
@@ -5518,6 +5765,7 @@
           <w:rFonts w:ascii="Sylfaen" w:hAnsi="Sylfaen" w:cs="Sylfaen"/>
           <w:b w:val="0"/>
           <w:sz w:val="24"/>
+          <w:lang w:val="ka-GE"/>
         </w:rPr>
         <w:t>ეფექტიანობა და შეყოვნება. გაზიარებული მოძიების ბიუჯეტის პირობებში, C-მ ყოველ ჯერზე საშუალოდ 37.2 კონტექსტური სიტყვა დაამატა, მაშინ როცა B-სა და B+-ს — 41.0; ეს ოდნავ ნაკლებია, რადგან არსის-პირველადი მოძიებისას უპირატესობა ენიჭება კომპაქტურ სემანტიკურ ფაქტებს, ნედლი ან სრული მოცულობის არსების დანართებთან შედარებით. თითოეული მორიგის სინქრონული მოძიების შეფერხება ყველა პირობისთვის მილიწამზე ნაკლები იყო (მედიანა 0.08–0.12 მწმ), რაც ადასტურებს დიზაინის მტკიცებას, რომ C-ის დამატებითი არითმეტიკული (დაკლებისა და ბონუს ქულების გათვლა) უმნიშვნელოა თავად მოძიებასთან შედარებით და — კონსტრუქციულად — რომ ენათა მოდელის ყველა რესურსტევადი ოპერაცია ოფლაინ რეჟიმში სრულდება.</w:t>
       </w:r>
@@ -5537,6 +5785,7 @@
           <w:b/>
           <w:color w:val="000000"/>
           <w:sz w:val="28"/>
+          <w:lang w:val="ka-GE"/>
         </w:rPr>
         <w:t>4.3 სიმულირებული აღქმის შედეგები</w:t>
       </w:r>
@@ -5550,6 +5799,7 @@
           <w:rFonts w:ascii="Sylfaen" w:hAnsi="Sylfaen" w:cs="Sylfaen"/>
           <w:b w:val="0"/>
           <w:sz w:val="24"/>
+          <w:lang w:val="ka-GE"/>
         </w:rPr>
         <w:t>დიდი ენის მოდელის (LLM) შემფასებელმა თითოეული პირობის სრული ტრანსკრიპტი შეაფასა ხუთი კრიტერიუმის (1–7) მიხედვით. ცხრილი 4.3 ასახავს სამი პერსონაჟის საშუალო ქულებს; ეს არის საილუსტრაციო შეფასებები მცირე სიმულირებული ნიმუშისგან (სამი პერსონაჟი, ერთი შემფასებლის შეფასება, მთელი რიცხვებით შეფასებები), წარმოდგენილი მნიშვნელობის ტესტირების გარეშე და შესაბამისი 3.1-ის შეფასების მიდგომას.</w:t>
       </w:r>
@@ -5563,6 +5813,7 @@
           <w:rFonts w:ascii="Sylfaen" w:hAnsi="Sylfaen" w:cs="Sylfaen"/>
           <w:b/>
           <w:sz w:val="22"/>
+          <w:lang w:val="ka-GE"/>
         </w:rPr>
         <w:t>ცხრილი 4.3. სიმულირებული აღქმის საშუალო შეფასებები კონსტრუქტების მიხედვით</w:t>
       </w:r>
@@ -5603,6 +5854,7 @@
                 <w:rFonts w:ascii="Sylfaen" w:hAnsi="Sylfaen" w:cs="Sylfaen"/>
                 <w:b/>
                 <w:sz w:val="22"/>
+                <w:lang w:val="ka-GE"/>
               </w:rPr>
               <w:t>კონსტრუქტი</w:t>
             </w:r>
@@ -5621,6 +5873,7 @@
                 <w:rFonts w:ascii="Sylfaen" w:hAnsi="Sylfaen" w:cs="Sylfaen"/>
                 <w:b/>
                 <w:sz w:val="22"/>
+                <w:lang w:val="en-US"/>
               </w:rPr>
               <w:t>A</w:t>
             </w:r>
@@ -5639,6 +5892,7 @@
                 <w:rFonts w:ascii="Sylfaen" w:hAnsi="Sylfaen" w:cs="Sylfaen"/>
                 <w:b/>
                 <w:sz w:val="22"/>
+                <w:lang w:val="en-US"/>
               </w:rPr>
               <w:t>B</w:t>
             </w:r>
@@ -5657,6 +5911,7 @@
                 <w:rFonts w:ascii="Sylfaen" w:hAnsi="Sylfaen" w:cs="Sylfaen"/>
                 <w:b/>
                 <w:sz w:val="22"/>
+                <w:lang w:val="en-US"/>
               </w:rPr>
               <w:t>B+</w:t>
             </w:r>
@@ -5675,6 +5930,7 @@
                 <w:rFonts w:ascii="Sylfaen" w:hAnsi="Sylfaen" w:cs="Sylfaen"/>
                 <w:b/>
                 <w:sz w:val="22"/>
+                <w:lang w:val="en-US"/>
               </w:rPr>
               <w:t>C</w:t>
             </w:r>
@@ -5693,6 +5949,7 @@
                 <w:rFonts w:ascii="Sylfaen" w:hAnsi="Sylfaen" w:cs="Sylfaen"/>
                 <w:b/>
                 <w:sz w:val="22"/>
+                <w:lang w:val="en-US"/>
               </w:rPr>
               <w:t>C − B+</w:t>
             </w:r>
@@ -5713,6 +5970,7 @@
                 <w:rFonts w:ascii="Sylfaen" w:hAnsi="Sylfaen" w:cs="Sylfaen"/>
                 <w:b w:val="0"/>
                 <w:sz w:val="22"/>
+                <w:lang w:val="ka-GE"/>
               </w:rPr>
               <w:t>სოციალური თანდასწრება</w:t>
             </w:r>
@@ -5823,6 +6081,7 @@
                 <w:rFonts w:ascii="Sylfaen" w:hAnsi="Sylfaen" w:cs="Sylfaen"/>
                 <w:b w:val="0"/>
                 <w:sz w:val="22"/>
+                <w:lang w:val="ka-GE"/>
               </w:rPr>
               <w:t>მომხმარებლისა და აგენტის ალიანსი</w:t>
             </w:r>
@@ -5933,6 +6192,7 @@
                 <w:rFonts w:ascii="Sylfaen" w:hAnsi="Sylfaen" w:cs="Sylfaen"/>
                 <w:b w:val="0"/>
                 <w:sz w:val="22"/>
+                <w:lang w:val="ka-GE"/>
               </w:rPr>
               <w:t>აღქმული ადამიანურობა</w:t>
             </w:r>
@@ -6043,6 +6303,7 @@
                 <w:rFonts w:ascii="Sylfaen" w:hAnsi="Sylfaen" w:cs="Sylfaen"/>
                 <w:b w:val="0"/>
                 <w:sz w:val="22"/>
+                <w:lang w:val="ka-GE"/>
               </w:rPr>
               <w:t>აღქმული ინტელექტი</w:t>
             </w:r>
@@ -6153,6 +6414,7 @@
                 <w:rFonts w:ascii="Sylfaen" w:hAnsi="Sylfaen" w:cs="Sylfaen"/>
                 <w:b w:val="0"/>
                 <w:sz w:val="22"/>
+                <w:lang w:val="ka-GE"/>
               </w:rPr>
               <w:t>კონფიდენციალურობის კომფორტი</w:t>
             </w:r>
@@ -6262,6 +6524,7 @@
           <w:rFonts w:ascii="Sylfaen" w:hAnsi="Sylfaen" w:cs="Sylfaen"/>
           <w:b w:val="0"/>
           <w:sz w:val="24"/>
+          <w:lang w:val="ka-GE"/>
         </w:rPr>
         <w:t>აქედან ორი დასკვნა გამომდინარეობს, და მეორე მათგანი უფრო მნიშვნელოვანია.</w:t>
       </w:r>
@@ -6275,6 +6538,7 @@
           <w:rFonts w:ascii="Sylfaen" w:hAnsi="Sylfaen" w:cs="Sylfaen"/>
           <w:b w:val="0"/>
           <w:sz w:val="24"/>
+          <w:lang w:val="ka-GE"/>
         </w:rPr>
         <w:t>პირველი: პროფილი C არ აღემატება B+-ის კურირებულ კონტროლს არცერთ კონსტრუქტზე (ამ მცირე ნიმუშში C-სა და B+-ს შორის ყველა სხვაობა ნულია ან უარყოფითია). ეს ზუსტად ისაა, რასაც ა-პრიორი ანალიზი (F18) პროგნოზირებდა: როგორც კი სუფთა, კურირებული სტატიკური მეხსიერება (B+) არსებობს, C-ის ადამიანური მეხსიერების დამატებითი დინამიკა — დაქრობა, სალიენცობა, კონსოლიდაცია — ამ მასშტაბსა და ჰორიზონტზე აღქმის აღმოჩენად ზღვარს არ ქმნის. ამგვარად, კონცეფციის დამტკიცება სიმულაციის მეშვეობით ადასტურებს თეზისის საკუთარ მტკიცებას, რომ C-სა და B+-ს შორის ეფექტი მცირეა; ის არ ამტკიცებს და ვერც ამტკიცებს, რომ ადამიანებში ის ნულოვანია.</w:t>
       </w:r>
@@ -6288,6 +6552,7 @@
           <w:rFonts w:ascii="Sylfaen" w:hAnsi="Sylfaen" w:cs="Sylfaen"/>
           <w:b w:val="0"/>
           <w:sz w:val="24"/>
+          <w:lang w:val="ka-GE"/>
         </w:rPr>
         <w:t>მეორე და მოულოდნელად, კონფიდენციალურობის კომფორტის შედეგი საპირისპიროა ადამიანებზე ჩატარებული დადგენილი კვლევისა. ადამიანებში, მომხმარებლის სიტყვების სიტყვასიტყვითი გახსენება ზრდის კონფიდენციალურობასთან დაკავშირებულ შეშფოთებას პარაფრაზთან შედარებით (კოქსის შედეგი [11], რომელიც 2.2-ის მთელი "ბუნდოვანი კვალის" არგუმენტაციის ემპირიული საყრდენია). აქ სიმულირებულმა მოსამართლემ სიტყვასიტყვითი პირობა B და დახვეწილი B+ კონფიდენციალურობის კომფორტის მიხედვით ყველაზე მაღალ შეფასებას (7.00) მისცა, ხოლო არსებითი შინაარსის საფუძველზე დავიწყების პროფილი C — ყველაზე დაბალს (5.67), რაც ადამიანებში დაფიქსირებული ეფექტის საპირისპიროა. მსაჯული, LLM, რომლისთვისაც კონფიდენციალურობის საკითხები არ იყო მნიშვნელოვანი, როგორც ჩანს, სრულ და ზუსტ გახსენებას უბრალო კომპეტენციად აღიქვამს ("კარგად დაიმახსოვრა"), ხოლო C-სგან განზრახ დავიწყებას — ნაკლად. ეს ზუსტად ის ზედაპირული ინტერპრეტაციაა, რომლის შესახებაც 3.5(b) აფრთხილებდა, რომ LLM მსაჯული მას შეგრძნებულ კავშირს ჩაანაცვლებდა.</w:t>
       </w:r>
@@ -6307,6 +6572,7 @@
           <w:b/>
           <w:color w:val="000000"/>
           <w:sz w:val="28"/>
+          <w:lang w:val="ka-GE"/>
         </w:rPr>
         <w:t>4.4 განხილვა</w:t>
       </w:r>
@@ -6320,6 +6586,7 @@
           <w:rFonts w:ascii="Sylfaen" w:hAnsi="Sylfaen" w:cs="Sylfaen"/>
           <w:b w:val="0"/>
           <w:sz w:val="24"/>
+          <w:lang w:val="ka-GE"/>
         </w:rPr>
         <w:t>შეფასება ადასტურებს დასკვნების მკაფიო, შემოსაზღვრულ ნაკრებს. ტექნიკური თვალსაზრისით, არქიტექტურა რეალიზებადია და მისი მექანიზმები ისე მუშაობს, როგორც დაგეგმილი იყო: სხვადასხვა სესიას შორის ინფორმაციის შენარჩუნებისთვის მეხსიერება აუცილებელია; მხოლოდ პროფილი C ივიწყებს გამართულად და სელექციურად, ინარჩუნებს მნიშვნელოვანს და უმნიშვნელო დეტალებს კი მივიწყებას აძლევს; მხოლოდ C აერთიანებს ეპიზოდებს მდგრად სემანტიკურ ცოდნად; და ამას კონტექსტის უფრო მცირე კვალის ფასად და შეფერხების იდენტური დონით აკეთებს. მექანიზმები არა მხოლოდ არსებობს, არამედ მათ ერთმანეთისგან განასხვავებლადაც ჩანს ქცევაში — რაც ტექნიკური ნაწილის მიერ უზრუნველყოფილი შემოწმების ფუნქციაა.</w:t>
       </w:r>
@@ -6333,6 +6600,7 @@
           <w:rFonts w:ascii="Sylfaen" w:hAnsi="Sylfaen" w:cs="Sylfaen"/>
           <w:b w:val="0"/>
           <w:sz w:val="24"/>
+          <w:lang w:val="ka-GE"/>
         </w:rPr>
         <w:t>აღქმის მხრივ, შედეგი არის ნამდვილი დისოციაცია. ქცევითი თვალსაზრისით ყველაზე "ადამიანური" მდგომარეობა — უმნიშვნელო ინფორმაციის დავიწყება, მომხმარებლის შესახებ ზოგადის შექმნა — არ არის ის მდგომარეობა, რომელიც სიმულირებულმა მსაჯულმა არჩია; კურატორირებული სტატიკური კონტროლი (B+) მას ყველგან უტოლდებოდა ან აჯობებდა. ა-პრიორი სიმძლავრის ანალიზთან (F18) ერთად განხილული, ეს ამყარებს თეზისის ცენტრალურ მეთოდოლოგიურ პოზიციას: აღქმითი ღირებულება, რომელსაც ლიტერატურა "ადამიანის მსგავს მეხსიერებას" მიაწერს, შესაძლოა, დიდწილად განპირობებული იყოს საგულდაგულო კურირებითა და უბრალო არსებობით, ხოლო ბიომიმეტური დინამიკა ამატებს იმდენად მცირე ნაწილს, რომ მისი აღმოჩენა მისაღწევ მასშტაბზე შეუძლებელია. B+ კონტროლი სწორედ იმისთვის შეიქმნა, რომ ეს განსხვავება ხილული გაეხადა, და აქაც ამას აკეთებს.</w:t>
       </w:r>
@@ -6346,6 +6614,7 @@
           <w:rFonts w:ascii="Sylfaen" w:hAnsi="Sylfaen" w:cs="Sylfaen"/>
           <w:b w:val="0"/>
           <w:sz w:val="24"/>
+          <w:lang w:val="ka-GE"/>
         </w:rPr>
         <w:t>კონფიდენციალურობისა და კომფორტის ინვერსია შეფასების ყველაზე მნიშვნელოვანი შედეგია, რადგან ის კონტრ-მაგალითით აჩვენებს სიმულირებული შეფასების საზღვრებს. იმ ერთ კონსტრუქტზე, სადაც ადამიანის ძლიერი, რეპლიცირებული ეფექტი არსებობს — სიტყვასიტყვითი გამეორების შემაწუხებელი ხასიათის შეგრძნება — დიდი ენის მოდელის (LLM) მსაჯულმა საპირისპირო დალაგება წარმოადგინა. ეს არ არის ხარვეზი, რომლის გამოსწორებაც შესაძლებელია; ეს პირდაპირი მტკიცებულებაა იმისა, რომ LLM-მსაჯული ვერ ჩაანაცვლებს ადამიანის აღქმას ისეთ კონსტრუქტებში, რომლებიც დამოკიდებულია ისეთ ადამიანურ ფაქტორებზე, როგორიცაა კონფიდენციალურობა და ნდობა. აქედან გამომდინარეობს, რომ ამ თეზისის აღქმითი მტკიცებულებები ნამდვილად ვერ გადაწყდება სიმულაციის გზით და რომ 3.5(c)-ის ადამიან-სუბიექტის პროტოკოლი არ არის დისკრეციული გაფართოება, არამედ მეთოდოლოგიური აუცილებლობა. სხვა სიტყვებით, კონცეფციის დამტკიცება იმსახურებს ადამიანზე ჩატარებული კვლევის გადადებას იმით, რომ ემპირიულად აჩვენებს მის აუცილებლობას.</w:t>
       </w:r>
@@ -6365,6 +6634,7 @@
           <w:b/>
           <w:color w:val="000000"/>
           <w:sz w:val="28"/>
+          <w:lang w:val="ka-GE"/>
         </w:rPr>
         <w:t>4.5 შეფასების შეზღუდვები</w:t>
       </w:r>
@@ -6378,6 +6648,7 @@
           <w:rFonts w:ascii="Sylfaen" w:hAnsi="Sylfaen" w:cs="Sylfaen"/>
           <w:b w:val="0"/>
           <w:sz w:val="24"/>
+          <w:lang w:val="ka-GE"/>
         </w:rPr>
         <w:t>შეფასების შეზღუდვები მნიშვნელოვანია და პირდაპირ არის ფორმულირებული. სიმულაციური მომხმარებლები და დიდი ენის მოდელის (LLM) მსაჯული იზიარებენ სატესტო სისტემის არქიტექტურას და არ გააჩნიათ რეალური მომხმარებლებისთვის დამახასიათებელი მნიშვნელოვანი ფაქტორები, დროითი სიღრმე და კონფიდენციალურობასთან დაკავშირებული მგრძნობელობა — ზემოთ აღწერილი კონფიდენციალურობის ინვერსია ამის ყველაზე მკაფიო ილუსტრაციაა. ნიმუში მცირეა (სამი პერსონა, თითოეულს ოთხი სესია, ერთი მსაჯულის გავლის), ამიტომ აღქმის მაჩვენებლები უფრო ილუსტრაციულია, ვიდრე რაიმე პოპულაციის რაოდენობის შეფასება, და არანაირი მნიშვნელოვანი განსხვავების (significance) მტკიცება არ ხდება. დრო შეკუმშულია სესიების ერთეულებამდე, ამიტომ დავიწყებისა და კონსოლიდაციის დინამიკა ვლინდება არა დიზაინით გათვალისწინებულ კვირებზე, არამედ რამდენიმე წყვეტაზე; F18-ის მიერ იდენტიფიცირებული "ცივი სტარტის" გაზვიადება, თუ რაიმე, აქ შემცირებულია. ენობრივი მოდელი, რომელიც ყველა როლს ამუშავებს (gpt-4o-mini), არ არის საბოლოო ხმის ტვინი და რამდენიმე მექანიზმი დანერგილია შემცირებული სიზუსტით ან გადავადებულია (ცხრილი 4.1). და ბოლოს, ჰარნესი მუშაობს ტექსტურ ტრანსკრიპტებზე და არა პირდაპირ ხმის არხზე, ამიტომ ის აჩვენებს მეხსიერების პროცესს და არა რეალურ თანამოსაუბრეს. თითოეული შეზღუდვა კონკრეტული ამოცანაა სრული ვერსიის ასაწყობად და ამ ნაშრომიდან გამომდინარე ადამიანებზე ჩასატარებელი კვლევისთვის.</w:t>
       </w:r>
@@ -6398,6 +6669,7 @@
           <w:b/>
           <w:color w:val="000000"/>
           <w:sz w:val="28"/>
+          <w:lang w:val="ka-GE"/>
         </w:rPr>
         <w:t>5. დასკვნა</w:t>
       </w:r>
@@ -6411,6 +6683,7 @@
           <w:rFonts w:ascii="Sylfaen" w:hAnsi="Sylfaen" w:cs="Sylfaen"/>
           <w:b w:val="0"/>
           <w:sz w:val="24"/>
+          <w:lang w:val="ka-GE"/>
         </w:rPr>
         <w:t>ამ ნაშრომის მიზანი იყო იმის დადგენა, განაპირობებს თუ არა ადამიანის მეხსიერების კოგნიტურ თეორიებზე დაფუძნებული გრძელვადიანი მეხსიერების მოდელი, რომ საუბრის ხმოვანი სისტემა ნაკლებად მოგვახსენებდეს ასისტენტს და უფრო მეტად — თანამოსაუბრეს. შეზღუდვის პირობებში, რომელიც ადამიანთა მონაწილეობით სრულ კვლევას გამორიცხავდა, ნაშრომმა წარმოადგინა ამ პროგრამის ის ნაწილები, რომლებიც არ არის დამოკიდებული რეალურ ადამიანურ მონაცემებზე — კოგნიტურ საფუძველზე აგებული მეხსიერების არქიტექტურა, კურირებაზე კონტროლირებადი შეფასების მეთოდოლოგია და კონცეფციის მუშა მტკიცებულება — და ადამიანური შეფასება განსაზღვრა, როგორც მომავალი მკაცრი კვლევის საგანი. ეს დასკვნითი თავი აჯამებს წვლილს, შედეგებსა და სამომავლო გეგმებს.</w:t>
       </w:r>
@@ -6430,6 +6703,7 @@
           <w:b/>
           <w:color w:val="000000"/>
           <w:sz w:val="28"/>
+          <w:lang w:val="ka-GE"/>
         </w:rPr>
         <w:t>5.1 წვლილის შეჯამება</w:t>
       </w:r>
@@ -6443,6 +6717,7 @@
           <w:rFonts w:ascii="Sylfaen" w:hAnsi="Sylfaen" w:cs="Sylfaen"/>
           <w:b w:val="0"/>
           <w:sz w:val="24"/>
+          <w:lang w:val="ka-GE"/>
         </w:rPr>
         <w:t>ნაშრომი სამ კოორდინირებულ წვლილს წარმოადგენს. პირველი, ის წარმოადგენს Profile C-ს, მეხსიერების ერთიან ძრავს, რომელიც აერთიანებს მეხსიერების ხუთ კოგნიტურ თეორიას — მრავალსაცავიან მოდელს, ებინგჰაუსის დავიწყების მრუდს, ტულვინგის ეპიზოდურ-სემანტიკური განასხვავება, ბუნდოვანი კვალის თეორია და დამატებითი სასწავლო სისტემების ჩარჩო — ერთ შეთანხმებულ ციკლურ პროცესში, რომელიც მოიცავს მნიშვნელობის მიხედვით კოდირებას, არსებითი ნაწილისა და ორიენტირის წარმოდგენას, გაძლიერებით ნელი დაშლა, ოფლაინ ეპიზოდურიდან სემანტიკურზე კონსოლიდაცია და არსებითი ნაწილით ინფორმაციის მოძიება, სადაც თითოეული ეტაპი დაკავშირებულია აღქმად ქცევით ნიშან-თვისებასთან და არა კოგნიტური ერთგულების მტკიცებასთან. მეორე, და მეთოდოლოგიურად ყველაზე მნიშვნელოვანი, ის წარმოადგენს B+ აქტიურ კონტროლს: კურატორირებული სტატიკური მეხსიერების მდგომარეობას, რომელიც იღებს იმავე ოფლაინ შეჯამებასა და გაწმენდას, რაც პროფილი C, მაგრამ არ გააჩნია მისი ადამიანის მეხსიერების დინამიკა, რითაც გამოყოფს დინამიკის ეფექტს ენობრივი მოდელის კურატორირების ზოგადი წაკითხვადობის ზრდისგან — ისეთი არევა, რომელიც სხვა შემთხვევაში ადამიანის მსგავსი მეხსიერების ნებისმიერ დადებით შედეგს გაუგებარს გახდიდა. მესამე, ის წარმოადგენს ოთხივე პირობის კონცეფციის დამტკიცების იმპლემენტაციას და ორხაზიან ტექნიკურ და სიმულირებულ შეფასებას, რომელიც აჩვენებს არქიტექტურის მექანიზმებს და იკვლევს მათ აღქმით შედეგებს.</w:t>
       </w:r>
@@ -6462,6 +6737,7 @@
           <w:b/>
           <w:color w:val="000000"/>
           <w:sz w:val="28"/>
+          <w:lang w:val="ka-GE"/>
         </w:rPr>
         <w:t>5.2 შედეგების შეჯამება</w:t>
       </w:r>
@@ -6475,6 +6751,7 @@
           <w:rFonts w:ascii="Sylfaen" w:hAnsi="Sylfaen" w:cs="Sylfaen"/>
           <w:b w:val="0"/>
           <w:sz w:val="24"/>
+          <w:lang w:val="ka-GE"/>
         </w:rPr>
         <w:t>კონცეფციის დამტკიცებამ აჩვენა, რომ არქიტექტურის განხორციელება შესაძლებელია და მისი მექანიზმები ფუნქციონირებს დაგეგმილის შესაბამისად და განასხვავებადია დაკვირვებად ქცევაში: მეხსიერება აუცილებელია სესიებს შორის ინფორმაციის გასახსენებლად; მხოლოდ პროფილი C ივიწყებს გამართულად და სელექციურად — ინარჩუნებს მნიშვნელოვან ფაქტებს, ხოლო უმნიშვნელო ინფორმაცია მივიწყებას მიეცემა — და მხოლოდ ის აერთიანებს განმეორებად ეპიზოდებს მდგრად სემანტიკურ ცოდნად, უფრო მცირე კონტექსტური კვალითა და საბაზისო მოდელებთან შედარებით იდენტური შეყოვნებით. სიმულირებული აღქმის ტრექში, პროფილი C არცერთ კონსტრუქტზე არ აღემატებოდა B+ კურირების კონტროლს, რაც სიმულაციაში ადასტურებს ა-პრიორი ანალიზს, რომ სუფთა კურირების ფონზე ადამიანის მეხსიერების დინამიკის მარგინალური აღქმითი წვლილი მცირეა. ყველაზე მნიშვნელოვანია, რომ ერთ კონსტრუქტზე, რომელსაც ადამიანის მეხსიერების დინამიკის მკაფიოდ დადასტურებული ადამიანური ეფექტი აქვს — სიტყვასიტყვითი გახსენების ინტრუზიულობა — სიმულაციურმა მსაჯულმა ადამიანურ ლიტერატურაში არსებულის საპირისპირო დალაგება წარმოადგინა, რითაც კონტრ-მაგალითით აჩვენა, რომ LLM-ის მსაჯული ვერ ჩაანაცვლებს ადამიანის აღქმას ისეთ კონსტრუქტებზე, რომლებიც დამოკიდებულია რისკებზე, როგორიცაა კონფიდენციალურობა და ნდობა. შესაბამისად, შეფასება უბრალოდ არ გადადებს ადამიანურ კვლევას; ის ემპირიულად აჩვენებს, თუ რატომ არის ეს კვლევა აუცილებელი.</w:t>
       </w:r>
@@ -6494,6 +6771,7 @@
           <w:b/>
           <w:color w:val="000000"/>
           <w:sz w:val="28"/>
+          <w:lang w:val="ka-GE"/>
         </w:rPr>
         <w:t>5.3 სამომავლო სამუშაო</w:t>
       </w:r>
@@ -6507,6 +6785,7 @@
           <w:rFonts w:ascii="Sylfaen" w:hAnsi="Sylfaen" w:cs="Sylfaen"/>
           <w:b w:val="0"/>
           <w:sz w:val="24"/>
+          <w:lang w:val="ka-GE"/>
         </w:rPr>
         <w:t>პირდაპირ სამი მიმართულება მოჰყვება. პირველი სრული სისტემის შექმნაა: პროფილი C-ის ინტეგრირება ხმოვანი არხის რეალურ დროში, პლატფორმის აუდიტში გამოვლენილი გამოყენებადობის შეზღუდვების მოგვარება (მონაწილეთა იზოლაცია, პაკეტირება, ერთი არჩეული საუბრის მოდული) და იმ მექანიზმების იმპლემენტაცია, რომლებიც ამჟამად შემცირებული სიზუსტით მუშაობს — ბაიესის სიურპრიზის მოვლენების სეგმენტაცია, ასოციაციური წინასწარი გაფართოება და დეტერმინირებული ზუსტი გახსენების ტრიგერი. მეორეა 3.5(c)-ში მითითებული ადამიანთა სუბიექტებზე ჩატარებული კვლევა: B-ს, B+, და C სფეროს ნორმატიული ნიმუშის ზომით, გათვლილი იმ შედარებებისთვის, სადაც მძლავრობა მიღწევადია, და ცენტრალურ C-სა და B+-ს შორის კონტრასტს, როგორც შეფასების სამიზნეს, განიხილავს, თან ახლავს თბილი, მიკუთვნებადი დავიწყება, გვიანი ფანჯრის ანალიზი, მოვლენაზე მგრძნობიარე და ქცევითი ზომები, და კოდირებული ინტერვიუები, როგორც დიზაინის პასუხი სავარაუდოდ მცირე ან ნულოვან პირველად ეფექტზე. მესამეა თეორიული გაფართოება: იმ მეხსიერების ფენომენების ინკორპორაცია, რომლებსაც ამჟამინდელი არქიტექტურა განზრახ გამორიცხავს — ინტერფერენცია, როგორც დავიწყების მექანიზმი, რეკონსტრუქციული და სქემაზე დაფუძნებული დამახინჯება, რასაც ყველაზე მკაფიოდ პროგნოზირებს ბუნდოვანი კვალითა და კომპლემენტარული სწავლების სისტემები, და უფრო მდიდარი დროითი თანმიმდევრობისა და წყაროს მეხსიერება — თითოეული მათგანი ერთდროულად არის როგორც ერთგულების ხარვეზი, ასევე კონკრეტული ჰიპოთეზა იმის შესახებ, თუ რა გახდიდა თანამოსაუბრეს უფრო ადამიანურს. ჯამში, ეს ყველაფერი ასრულებს ასისტენტიდან თანამოსაუბრედ ევოლუციას, რომელიც ამ ნაშრომმა დააპროექტა, მინიატურაში შექმნა და აჩვენა, თუ როგორ უნდა გაიზომოს.</w:t>
       </w:r>
@@ -6527,6 +6806,7 @@
           <w:b/>
           <w:color w:val="000000"/>
           <w:sz w:val="28"/>
+          <w:lang w:val="ka-GE"/>
         </w:rPr>
         <w:t>ბიბლიოგრაფია</w:t>
       </w:r>
@@ -6540,8 +6820,31 @@
           <w:rFonts w:ascii="Sylfaen" w:hAnsi="Sylfaen" w:cs="Sylfaen"/>
           <w:b w:val="0"/>
           <w:sz w:val="22"/>
-        </w:rPr>
-        <w:t>[1] Maharana A., Lee D.-H., Tulyakov S., Bansal M., Barbieri F., Fang Y. Evaluating Very Long-Term Conversational Memory of LLM Agents. ACL 2024 (Long Papers). arXiv:2402.17753.</w:t>
+          <w:lang w:val="en-US"/>
+        </w:rPr>
+        <w:t xml:space="preserve">[1] Maharana A., Lee D.-H., Tulyakov S., Bansal M., Barbieri F., Fang Y. Evaluating Very Long-Term Conversational Memory of LLM Agents. ACL 2024 (Long Papers). </w:t>
+      </w:r>
+      <w:hyperlink r:id="rId12">
+        <w:r>
+          <w:rPr>
+            <w:rStyle w:val="Hyperlink"/>
+            <w:rFonts w:ascii="Sylfaen" w:hAnsi="Sylfaen" w:cs="Sylfaen"/>
+            <w:color w:val="0563C1"/>
+            <w:sz w:val="22"/>
+            <w:u w:val="single"/>
+            <w:lang w:val="en-US"/>
+          </w:rPr>
+          <w:t xml:space="preserve">arXiv:2402.17753</w:t>
+        </w:r>
+      </w:hyperlink>
+      <w:r>
+        <w:rPr>
+          <w:rFonts w:ascii="Sylfaen" w:hAnsi="Sylfaen" w:cs="Sylfaen"/>
+          <w:b w:val="0"/>
+          <w:sz w:val="22"/>
+          <w:lang w:val="en-US"/>
+        </w:rPr>
+        <w:t xml:space="preserve">.</w:t>
       </w:r>
     </w:p>
     <w:p>
@@ -6553,8 +6856,31 @@
           <w:rFonts w:ascii="Sylfaen" w:hAnsi="Sylfaen" w:cs="Sylfaen"/>
           <w:b w:val="0"/>
           <w:sz w:val="22"/>
-        </w:rPr>
-        <w:t>[2] Wu D., Wang H., Yu W., Zhang Y., Chang K.-W., Yu D. LongMemEval: Benchmarking Chat Assistants on Long-Term Interactive Memory. ICLR 2025. arXiv:2410.10813.</w:t>
+          <w:lang w:val="en-US"/>
+        </w:rPr>
+        <w:t xml:space="preserve">[2] Wu D., Wang H., Yu W., Zhang Y., Chang K.-W., Yu D. LongMemEval: Benchmarking Chat Assistants on Long-Term Interactive Memory. ICLR 2025. </w:t>
+      </w:r>
+      <w:hyperlink r:id="rId13">
+        <w:r>
+          <w:rPr>
+            <w:rStyle w:val="Hyperlink"/>
+            <w:rFonts w:ascii="Sylfaen" w:hAnsi="Sylfaen" w:cs="Sylfaen"/>
+            <w:color w:val="0563C1"/>
+            <w:sz w:val="22"/>
+            <w:u w:val="single"/>
+            <w:lang w:val="en-US"/>
+          </w:rPr>
+          <w:t xml:space="preserve">arXiv:2410.10813</w:t>
+        </w:r>
+      </w:hyperlink>
+      <w:r>
+        <w:rPr>
+          <w:rFonts w:ascii="Sylfaen" w:hAnsi="Sylfaen" w:cs="Sylfaen"/>
+          <w:b w:val="0"/>
+          <w:sz w:val="22"/>
+          <w:lang w:val="en-US"/>
+        </w:rPr>
+        <w:t xml:space="preserve">.</w:t>
       </w:r>
     </w:p>
     <w:p>
@@ -6566,8 +6892,31 @@
           <w:rFonts w:ascii="Sylfaen" w:hAnsi="Sylfaen" w:cs="Sylfaen"/>
           <w:b w:val="0"/>
           <w:sz w:val="22"/>
-        </w:rPr>
-        <w:t>[3] Ma Z., Mei Y., Su Z. Understanding the Benefits and Challenges of Using Large Language Model-based Conversational Agents for Mental Well-being Support. AMIA Annual Symposium Proceedings 2023, pp. 1105–1114. arXiv:2307.15810.</w:t>
+          <w:lang w:val="en-US"/>
+        </w:rPr>
+        <w:t xml:space="preserve">[3] Ma Z., Mei Y., Su Z. Understanding the Benefits and Challenges of Using Large Language Model-based Conversational Agents for Mental Well-being Support. AMIA Annual Symposium Proceedings 2023, pp. 1105–1114. </w:t>
+      </w:r>
+      <w:hyperlink r:id="rId14">
+        <w:r>
+          <w:rPr>
+            <w:rStyle w:val="Hyperlink"/>
+            <w:rFonts w:ascii="Sylfaen" w:hAnsi="Sylfaen" w:cs="Sylfaen"/>
+            <w:color w:val="0563C1"/>
+            <w:sz w:val="22"/>
+            <w:u w:val="single"/>
+            <w:lang w:val="en-US"/>
+          </w:rPr>
+          <w:t xml:space="preserve">arXiv:2307.15810</w:t>
+        </w:r>
+      </w:hyperlink>
+      <w:r>
+        <w:rPr>
+          <w:rFonts w:ascii="Sylfaen" w:hAnsi="Sylfaen" w:cs="Sylfaen"/>
+          <w:b w:val="0"/>
+          <w:sz w:val="22"/>
+          <w:lang w:val="en-US"/>
+        </w:rPr>
+        <w:t xml:space="preserve">.</w:t>
       </w:r>
     </w:p>
     <w:p>
@@ -6579,8 +6928,31 @@
           <w:rFonts w:ascii="Sylfaen" w:hAnsi="Sylfaen" w:cs="Sylfaen"/>
           <w:b w:val="0"/>
           <w:sz w:val="22"/>
-        </w:rPr>
-        <w:t>[4] De Freitas J., Castelo N., Uğuralp A.K., Oğuz-Uğuralp Z. Lessons from an App Update at Replika AI: Identity Discontinuity in Human-AI Relationships. Harvard Business School Working Paper 25-018, 2024 (rev. 2025). arXiv:2412.14190.</w:t>
+          <w:lang w:val="en-US"/>
+        </w:rPr>
+        <w:t xml:space="preserve">[4] De Freitas J., Castelo N., Uğuralp A.K., Oğuz-Uğuralp Z. Lessons from an App Update at Replika AI: Identity Discontinuity in Human-AI Relationships. Harvard Business School Working Paper 25-018, 2024 (rev. 2025). </w:t>
+      </w:r>
+      <w:hyperlink r:id="rId15">
+        <w:r>
+          <w:rPr>
+            <w:rStyle w:val="Hyperlink"/>
+            <w:rFonts w:ascii="Sylfaen" w:hAnsi="Sylfaen" w:cs="Sylfaen"/>
+            <w:color w:val="0563C1"/>
+            <w:sz w:val="22"/>
+            <w:u w:val="single"/>
+            <w:lang w:val="en-US"/>
+          </w:rPr>
+          <w:t xml:space="preserve">arXiv:2412.14190</w:t>
+        </w:r>
+      </w:hyperlink>
+      <w:r>
+        <w:rPr>
+          <w:rFonts w:ascii="Sylfaen" w:hAnsi="Sylfaen" w:cs="Sylfaen"/>
+          <w:b w:val="0"/>
+          <w:sz w:val="22"/>
+          <w:lang w:val="en-US"/>
+        </w:rPr>
+        <w:t xml:space="preserve">.</w:t>
       </w:r>
     </w:p>
     <w:p>
@@ -6592,8 +6964,31 @@
           <w:rFonts w:ascii="Sylfaen" w:hAnsi="Sylfaen" w:cs="Sylfaen"/>
           <w:b w:val="0"/>
           <w:sz w:val="22"/>
-        </w:rPr>
-        <w:t>[5] Zhang Y., Zhao D., Hancock J.T., Kraut R., Yang D. The Rise of AI Companions: Interaction with AI Companions and Psychological Well-being. 2025. arXiv:2506.12605.</w:t>
+          <w:lang w:val="en-US"/>
+        </w:rPr>
+        <w:t xml:space="preserve">[5] Zhang Y., Zhao D., Hancock J.T., Kraut R., Yang D. The Rise of AI Companions: Interaction with AI Companions and Psychological Well-being. 2025. </w:t>
+      </w:r>
+      <w:hyperlink r:id="rId16">
+        <w:r>
+          <w:rPr>
+            <w:rStyle w:val="Hyperlink"/>
+            <w:rFonts w:ascii="Sylfaen" w:hAnsi="Sylfaen" w:cs="Sylfaen"/>
+            <w:color w:val="0563C1"/>
+            <w:sz w:val="22"/>
+            <w:u w:val="single"/>
+            <w:lang w:val="en-US"/>
+          </w:rPr>
+          <w:t xml:space="preserve">arXiv:2506.12605</w:t>
+        </w:r>
+      </w:hyperlink>
+      <w:r>
+        <w:rPr>
+          <w:rFonts w:ascii="Sylfaen" w:hAnsi="Sylfaen" w:cs="Sylfaen"/>
+          <w:b w:val="0"/>
+          <w:sz w:val="22"/>
+          <w:lang w:val="en-US"/>
+        </w:rPr>
+        <w:t xml:space="preserve">.</w:t>
       </w:r>
     </w:p>
     <w:p>
@@ -6605,8 +7000,31 @@
           <w:rFonts w:ascii="Sylfaen" w:hAnsi="Sylfaen" w:cs="Sylfaen"/>
           <w:b w:val="0"/>
           <w:sz w:val="22"/>
-        </w:rPr>
-        <w:t>[6] Zhong W., Guo L., Gao Q., Ye H., Wang Y. MemoryBank: Enhancing Large Language Models with Long-Term Memory. AAAI 2024. arXiv:2305.10250.</w:t>
+          <w:lang w:val="en-US"/>
+        </w:rPr>
+        <w:t xml:space="preserve">[6] Zhong W., Guo L., Gao Q., Ye H., Wang Y. MemoryBank: Enhancing Large Language Models with Long-Term Memory. AAAI 2024. </w:t>
+      </w:r>
+      <w:hyperlink r:id="rId17">
+        <w:r>
+          <w:rPr>
+            <w:rStyle w:val="Hyperlink"/>
+            <w:rFonts w:ascii="Sylfaen" w:hAnsi="Sylfaen" w:cs="Sylfaen"/>
+            <w:color w:val="0563C1"/>
+            <w:sz w:val="22"/>
+            <w:u w:val="single"/>
+            <w:lang w:val="en-US"/>
+          </w:rPr>
+          <w:t xml:space="preserve">arXiv:2305.10250</w:t>
+        </w:r>
+      </w:hyperlink>
+      <w:r>
+        <w:rPr>
+          <w:rFonts w:ascii="Sylfaen" w:hAnsi="Sylfaen" w:cs="Sylfaen"/>
+          <w:b w:val="0"/>
+          <w:sz w:val="22"/>
+          <w:lang w:val="en-US"/>
+        </w:rPr>
+        <w:t xml:space="preserve">.</w:t>
       </w:r>
     </w:p>
     <w:p>
@@ -6618,8 +7036,31 @@
           <w:rFonts w:ascii="Sylfaen" w:hAnsi="Sylfaen" w:cs="Sylfaen"/>
           <w:b w:val="0"/>
           <w:sz w:val="22"/>
-        </w:rPr>
-        <w:t>[7] Gutiérrez B.J., Shu Y., Gu Y., Yasunaga M., Su Y. HippoRAG: Neurobiologically Inspired Long-Term Memory for Large Language Models. NeurIPS 2024. arXiv:2405.14831.</w:t>
+          <w:lang w:val="en-US"/>
+        </w:rPr>
+        <w:t xml:space="preserve">[7] Gutiérrez B.J., Shu Y., Gu Y., Yasunaga M., Su Y. HippoRAG: Neurobiologically Inspired Long-Term Memory for Large Language Models. NeurIPS 2024. </w:t>
+      </w:r>
+      <w:hyperlink r:id="rId18">
+        <w:r>
+          <w:rPr>
+            <w:rStyle w:val="Hyperlink"/>
+            <w:rFonts w:ascii="Sylfaen" w:hAnsi="Sylfaen" w:cs="Sylfaen"/>
+            <w:color w:val="0563C1"/>
+            <w:sz w:val="22"/>
+            <w:u w:val="single"/>
+            <w:lang w:val="en-US"/>
+          </w:rPr>
+          <w:t xml:space="preserve">arXiv:2405.14831</w:t>
+        </w:r>
+      </w:hyperlink>
+      <w:r>
+        <w:rPr>
+          <w:rFonts w:ascii="Sylfaen" w:hAnsi="Sylfaen" w:cs="Sylfaen"/>
+          <w:b w:val="0"/>
+          <w:sz w:val="22"/>
+          <w:lang w:val="en-US"/>
+        </w:rPr>
+        <w:t xml:space="preserve">.</w:t>
       </w:r>
     </w:p>
     <w:p>
@@ -6631,8 +7072,31 @@
           <w:rFonts w:ascii="Sylfaen" w:hAnsi="Sylfaen" w:cs="Sylfaen"/>
           <w:b w:val="0"/>
           <w:sz w:val="22"/>
-        </w:rPr>
-        <w:t>[8] Fountas Z., Benfeghoul M.A., Oomerjee A., Christopoulou F., Lampouras G., Bou-Ammar H., Wang J. Human-inspired Episodic Memory for Infinite Context LLMs. ICLR 2025. arXiv:2407.09450.</w:t>
+          <w:lang w:val="en-US"/>
+        </w:rPr>
+        <w:t xml:space="preserve">[8] Fountas Z., Benfeghoul M.A., Oomerjee A., Christopoulou F., Lampouras G., Bou-Ammar H., Wang J. Human-inspired Episodic Memory for Infinite Context LLMs. ICLR 2025. </w:t>
+      </w:r>
+      <w:hyperlink r:id="rId19">
+        <w:r>
+          <w:rPr>
+            <w:rStyle w:val="Hyperlink"/>
+            <w:rFonts w:ascii="Sylfaen" w:hAnsi="Sylfaen" w:cs="Sylfaen"/>
+            <w:color w:val="0563C1"/>
+            <w:sz w:val="22"/>
+            <w:u w:val="single"/>
+            <w:lang w:val="en-US"/>
+          </w:rPr>
+          <w:t xml:space="preserve">arXiv:2407.09450</w:t>
+        </w:r>
+      </w:hyperlink>
+      <w:r>
+        <w:rPr>
+          <w:rFonts w:ascii="Sylfaen" w:hAnsi="Sylfaen" w:cs="Sylfaen"/>
+          <w:b w:val="0"/>
+          <w:sz w:val="22"/>
+          <w:lang w:val="en-US"/>
+        </w:rPr>
+        <w:t xml:space="preserve">.</w:t>
       </w:r>
     </w:p>
     <w:p>
@@ -6644,8 +7108,31 @@
           <w:rFonts w:ascii="Sylfaen" w:hAnsi="Sylfaen" w:cs="Sylfaen"/>
           <w:b w:val="0"/>
           <w:sz w:val="22"/>
-        </w:rPr>
-        <w:t>[9] Lee K.-H., Chen X., Furuta H., Canny J., Fischer I. A Human-Inspired Reading Agent with Gist Memory of Very Long Contexts. ICML 2024, PMLR 235:26396–26415. arXiv:2402.09727.</w:t>
+          <w:lang w:val="en-US"/>
+        </w:rPr>
+        <w:t xml:space="preserve">[9] Lee K.-H., Chen X., Furuta H., Canny J., Fischer I. A Human-Inspired Reading Agent with Gist Memory of Very Long Contexts. ICML 2024, PMLR 235:26396–26415. </w:t>
+      </w:r>
+      <w:hyperlink r:id="rId20">
+        <w:r>
+          <w:rPr>
+            <w:rStyle w:val="Hyperlink"/>
+            <w:rFonts w:ascii="Sylfaen" w:hAnsi="Sylfaen" w:cs="Sylfaen"/>
+            <w:color w:val="0563C1"/>
+            <w:sz w:val="22"/>
+            <w:u w:val="single"/>
+            <w:lang w:val="en-US"/>
+          </w:rPr>
+          <w:t xml:space="preserve">arXiv:2402.09727</w:t>
+        </w:r>
+      </w:hyperlink>
+      <w:r>
+        <w:rPr>
+          <w:rFonts w:ascii="Sylfaen" w:hAnsi="Sylfaen" w:cs="Sylfaen"/>
+          <w:b w:val="0"/>
+          <w:sz w:val="22"/>
+          <w:lang w:val="en-US"/>
+        </w:rPr>
+        <w:t xml:space="preserve">.</w:t>
       </w:r>
     </w:p>
     <w:p>
@@ -6657,8 +7144,31 @@
           <w:rFonts w:ascii="Sylfaen" w:hAnsi="Sylfaen" w:cs="Sylfaen"/>
           <w:b w:val="0"/>
           <w:sz w:val="22"/>
-        </w:rPr>
-        <w:t>[10] Park J.S., O'Brien J.C., Cai C.J., Morris M.R., Liang P., Bernstein M.S. Generative Agents: Interactive Simulacra of Human Behavior. UIST 2023. arXiv:2304.03442.</w:t>
+          <w:lang w:val="en-US"/>
+        </w:rPr>
+        <w:t xml:space="preserve">[10] Park J.S., O'Brien J.C., Cai C.J., Morris M.R., Liang P., Bernstein M.S. Generative Agents: Interactive Simulacra of Human Behavior. UIST 2023. </w:t>
+      </w:r>
+      <w:hyperlink r:id="rId21">
+        <w:r>
+          <w:rPr>
+            <w:rStyle w:val="Hyperlink"/>
+            <w:rFonts w:ascii="Sylfaen" w:hAnsi="Sylfaen" w:cs="Sylfaen"/>
+            <w:color w:val="0563C1"/>
+            <w:sz w:val="22"/>
+            <w:u w:val="single"/>
+            <w:lang w:val="en-US"/>
+          </w:rPr>
+          <w:t xml:space="preserve">arXiv:2304.03442</w:t>
+        </w:r>
+      </w:hyperlink>
+      <w:r>
+        <w:rPr>
+          <w:rFonts w:ascii="Sylfaen" w:hAnsi="Sylfaen" w:cs="Sylfaen"/>
+          <w:b w:val="0"/>
+          <w:sz w:val="22"/>
+          <w:lang w:val="en-US"/>
+        </w:rPr>
+        <w:t xml:space="preserve">.</w:t>
       </w:r>
     </w:p>
     <w:p>
@@ -6670,8 +7180,31 @@
           <w:rFonts w:ascii="Sylfaen" w:hAnsi="Sylfaen" w:cs="Sylfaen"/>
           <w:b w:val="0"/>
           <w:sz w:val="22"/>
-        </w:rPr>
-        <w:t>[11] Cox S.R., Lee Y.-C., Ooi W.T. Comparing How a Chatbot References User Utterances from Previous Chatting Sessions: An Investigation of Users' Privacy Concerns and Perceptions. HAI '23, 2023. arXiv:2308.04879.</w:t>
+          <w:lang w:val="en-US"/>
+        </w:rPr>
+        <w:t xml:space="preserve">[11] Cox S.R., Lee Y.-C., Ooi W.T. Comparing How a Chatbot References User Utterances from Previous Chatting Sessions: An Investigation of Users' Privacy Concerns and Perceptions. HAI '23, 2023. </w:t>
+      </w:r>
+      <w:hyperlink r:id="rId22">
+        <w:r>
+          <w:rPr>
+            <w:rStyle w:val="Hyperlink"/>
+            <w:rFonts w:ascii="Sylfaen" w:hAnsi="Sylfaen" w:cs="Sylfaen"/>
+            <w:color w:val="0563C1"/>
+            <w:sz w:val="22"/>
+            <w:u w:val="single"/>
+            <w:lang w:val="en-US"/>
+          </w:rPr>
+          <w:t xml:space="preserve">arXiv:2308.04879</w:t>
+        </w:r>
+      </w:hyperlink>
+      <w:r>
+        <w:rPr>
+          <w:rFonts w:ascii="Sylfaen" w:hAnsi="Sylfaen" w:cs="Sylfaen"/>
+          <w:b w:val="0"/>
+          <w:sz w:val="22"/>
+          <w:lang w:val="en-US"/>
+        </w:rPr>
+        <w:t xml:space="preserve">.</w:t>
       </w:r>
     </w:p>
     <w:p>
@@ -6683,8 +7216,31 @@
           <w:rFonts w:ascii="Sylfaen" w:hAnsi="Sylfaen" w:cs="Sylfaen"/>
           <w:b w:val="0"/>
           <w:sz w:val="22"/>
-        </w:rPr>
-        <w:t>[12] Liu T., Zhao H., Liu Y., Wang X., Peng Z. ComPeer: A Generative Conversational Agent for Proactive Peer Support. UIST 2024. arXiv:2407.18064.</w:t>
+          <w:lang w:val="en-US"/>
+        </w:rPr>
+        <w:t xml:space="preserve">[12] Liu T., Zhao H., Liu Y., Wang X., Peng Z. ComPeer: A Generative Conversational Agent for Proactive Peer Support. UIST 2024. </w:t>
+      </w:r>
+      <w:hyperlink r:id="rId23">
+        <w:r>
+          <w:rPr>
+            <w:rStyle w:val="Hyperlink"/>
+            <w:rFonts w:ascii="Sylfaen" w:hAnsi="Sylfaen" w:cs="Sylfaen"/>
+            <w:color w:val="0563C1"/>
+            <w:sz w:val="22"/>
+            <w:u w:val="single"/>
+            <w:lang w:val="en-US"/>
+          </w:rPr>
+          <w:t xml:space="preserve">arXiv:2407.18064</w:t>
+        </w:r>
+      </w:hyperlink>
+      <w:r>
+        <w:rPr>
+          <w:rFonts w:ascii="Sylfaen" w:hAnsi="Sylfaen" w:cs="Sylfaen"/>
+          <w:b w:val="0"/>
+          <w:sz w:val="22"/>
+          <w:lang w:val="en-US"/>
+        </w:rPr>
+        <w:t xml:space="preserve">.</w:t>
       </w:r>
     </w:p>
     <w:p>
@@ -6696,8 +7252,53 @@
           <w:rFonts w:ascii="Sylfaen" w:hAnsi="Sylfaen" w:cs="Sylfaen"/>
           <w:b w:val="0"/>
           <w:sz w:val="22"/>
-        </w:rPr>
-        <w:t>[13] Liu X.B., Fang S., Shi W., Wu C.-S., Igarashi T., Chen X.A. Proactive Conversational Agents with Inner Thoughts. CHI 2025. doi:10.1145/3706598.3713760. arXiv:2501.00383.</w:t>
+          <w:lang w:val="en-US"/>
+        </w:rPr>
+        <w:t xml:space="preserve">[13] Liu X.B., Fang S., Shi W., Wu C.-S., Igarashi T., Chen X.A. Proactive Conversational Agents with Inner Thoughts. CHI 2025. doi:</w:t>
+      </w:r>
+      <w:hyperlink r:id="rId24">
+        <w:r>
+          <w:rPr>
+            <w:rStyle w:val="Hyperlink"/>
+            <w:rFonts w:ascii="Sylfaen" w:hAnsi="Sylfaen" w:cs="Sylfaen"/>
+            <w:color w:val="0563C1"/>
+            <w:sz w:val="22"/>
+            <w:u w:val="single"/>
+            <w:lang w:val="en-US"/>
+          </w:rPr>
+          <w:t xml:space="preserve">10.1145/3706598.3713760</w:t>
+        </w:r>
+      </w:hyperlink>
+      <w:r>
+        <w:rPr>
+          <w:rFonts w:ascii="Sylfaen" w:hAnsi="Sylfaen" w:cs="Sylfaen"/>
+          <w:b w:val="0"/>
+          <w:sz w:val="22"/>
+          <w:lang w:val="en-US"/>
+        </w:rPr>
+        <w:t xml:space="preserve">. </w:t>
+      </w:r>
+      <w:hyperlink r:id="rId25">
+        <w:r>
+          <w:rPr>
+            <w:rStyle w:val="Hyperlink"/>
+            <w:rFonts w:ascii="Sylfaen" w:hAnsi="Sylfaen" w:cs="Sylfaen"/>
+            <w:color w:val="0563C1"/>
+            <w:sz w:val="22"/>
+            <w:u w:val="single"/>
+            <w:lang w:val="en-US"/>
+          </w:rPr>
+          <w:t xml:space="preserve">arXiv:2501.00383</w:t>
+        </w:r>
+      </w:hyperlink>
+      <w:r>
+        <w:rPr>
+          <w:rFonts w:ascii="Sylfaen" w:hAnsi="Sylfaen" w:cs="Sylfaen"/>
+          <w:b w:val="0"/>
+          <w:sz w:val="22"/>
+          <w:lang w:val="en-US"/>
+        </w:rPr>
+        <w:t xml:space="preserve">.</w:t>
       </w:r>
     </w:p>
     <w:p>
@@ -6709,8 +7310,31 @@
           <w:rFonts w:ascii="Sylfaen" w:hAnsi="Sylfaen" w:cs="Sylfaen"/>
           <w:b w:val="0"/>
           <w:sz w:val="22"/>
-        </w:rPr>
-        <w:t>[14] Fitrianie S., Bruijnes M., Abdulrahman A., Brinkman W.-P. The Artificial Social Agent Questionnaire (ASAQ) — Development and evaluation of a validated instrument for capturing human interaction experiences with artificial social agents. International Journal of Human-Computer Studies, vol. 199, art. 103482, 2025. doi:10.1016/j.ijhcs.2025.103482.</w:t>
+          <w:lang w:val="en-US"/>
+        </w:rPr>
+        <w:t xml:space="preserve">[14] Fitrianie S., Bruijnes M., Abdulrahman A., Brinkman W.-P. The Artificial Social Agent Questionnaire (ASAQ) — Development and evaluation of a validated instrument for capturing human interaction experiences with artificial social agents. International Journal of Human-Computer Studies, vol. 199, art. 103482, 2025. doi:</w:t>
+      </w:r>
+      <w:hyperlink r:id="rId26">
+        <w:r>
+          <w:rPr>
+            <w:rStyle w:val="Hyperlink"/>
+            <w:rFonts w:ascii="Sylfaen" w:hAnsi="Sylfaen" w:cs="Sylfaen"/>
+            <w:color w:val="0563C1"/>
+            <w:sz w:val="22"/>
+            <w:u w:val="single"/>
+            <w:lang w:val="en-US"/>
+          </w:rPr>
+          <w:t xml:space="preserve">10.1016/j.ijhcs.2025.103482</w:t>
+        </w:r>
+      </w:hyperlink>
+      <w:r>
+        <w:rPr>
+          <w:rFonts w:ascii="Sylfaen" w:hAnsi="Sylfaen" w:cs="Sylfaen"/>
+          <w:b w:val="0"/>
+          <w:sz w:val="22"/>
+          <w:lang w:val="en-US"/>
+        </w:rPr>
+        <w:t xml:space="preserve">.</w:t>
       </w:r>
     </w:p>
     <w:p>
@@ -6722,8 +7346,31 @@
           <w:rFonts w:ascii="Sylfaen" w:hAnsi="Sylfaen" w:cs="Sylfaen"/>
           <w:b w:val="0"/>
           <w:sz w:val="22"/>
-        </w:rPr>
-        <w:t>[15] Fang C.M., Liu A.R., Danry V., Lee E., Chan S.W.T., Pataranutaporn P., Maes P., Phang J., Lampe M., Ahmad L., Agarwal S. How AI and Human Behaviors Shape Psychosocial Effects of Extended Chatbot Use: A Longitudinal Randomized Controlled Study. 2025. arXiv:2503.17473.</w:t>
+          <w:lang w:val="en-US"/>
+        </w:rPr>
+        <w:t xml:space="preserve">[15] Fang C.M., Liu A.R., Danry V., Lee E., Chan S.W.T., Pataranutaporn P., Maes P., Phang J., Lampe M., Ahmad L., Agarwal S. How AI and Human Behaviors Shape Psychosocial Effects of Extended Chatbot Use: A Longitudinal Randomized Controlled Study. 2025. </w:t>
+      </w:r>
+      <w:hyperlink r:id="rId27">
+        <w:r>
+          <w:rPr>
+            <w:rStyle w:val="Hyperlink"/>
+            <w:rFonts w:ascii="Sylfaen" w:hAnsi="Sylfaen" w:cs="Sylfaen"/>
+            <w:color w:val="0563C1"/>
+            <w:sz w:val="22"/>
+            <w:u w:val="single"/>
+            <w:lang w:val="en-US"/>
+          </w:rPr>
+          <w:t xml:space="preserve">arXiv:2503.17473</w:t>
+        </w:r>
+      </w:hyperlink>
+      <w:r>
+        <w:rPr>
+          <w:rFonts w:ascii="Sylfaen" w:hAnsi="Sylfaen" w:cs="Sylfaen"/>
+          <w:b w:val="0"/>
+          <w:sz w:val="22"/>
+          <w:lang w:val="en-US"/>
+        </w:rPr>
+        <w:t xml:space="preserve">.</w:t>
       </w:r>
     </w:p>
     <w:p>
@@ -6735,8 +7382,31 @@
           <w:rFonts w:ascii="Sylfaen" w:hAnsi="Sylfaen" w:cs="Sylfaen"/>
           <w:b w:val="0"/>
           <w:sz w:val="22"/>
-        </w:rPr>
-        <w:t>[16] Wu Y., Liang S., Zhang C., Wang Y., Zhang Y., Guo H., Tang R., Liu Y. From Human Memory to AI Memory: A Survey on Memory Mechanisms in the Era of LLMs. 2025. arXiv:2504.15965.</w:t>
+          <w:lang w:val="en-US"/>
+        </w:rPr>
+        <w:t xml:space="preserve">[16] Wu Y., Liang S., Zhang C., Wang Y., Zhang Y., Guo H., Tang R., Liu Y. From Human Memory to AI Memory: A Survey on Memory Mechanisms in the Era of LLMs. 2025. </w:t>
+      </w:r>
+      <w:hyperlink r:id="rId28">
+        <w:r>
+          <w:rPr>
+            <w:rStyle w:val="Hyperlink"/>
+            <w:rFonts w:ascii="Sylfaen" w:hAnsi="Sylfaen" w:cs="Sylfaen"/>
+            <w:color w:val="0563C1"/>
+            <w:sz w:val="22"/>
+            <w:u w:val="single"/>
+            <w:lang w:val="en-US"/>
+          </w:rPr>
+          <w:t xml:space="preserve">arXiv:2504.15965</w:t>
+        </w:r>
+      </w:hyperlink>
+      <w:r>
+        <w:rPr>
+          <w:rFonts w:ascii="Sylfaen" w:hAnsi="Sylfaen" w:cs="Sylfaen"/>
+          <w:b w:val="0"/>
+          <w:sz w:val="22"/>
+          <w:lang w:val="en-US"/>
+        </w:rPr>
+        <w:t xml:space="preserve">.</w:t>
       </w:r>
     </w:p>
     <w:p>
@@ -6748,8 +7418,31 @@
           <w:rFonts w:ascii="Sylfaen" w:hAnsi="Sylfaen" w:cs="Sylfaen"/>
           <w:b w:val="0"/>
           <w:sz w:val="22"/>
-        </w:rPr>
-        <w:t>[17] Packer C., Wooders S., Lin K., Fang V., Patil S.G., Stoica I., Gonzalez J.E. MemGPT: Towards LLMs as Operating Systems. 2023. arXiv:2310.08560.</w:t>
+          <w:lang w:val="en-US"/>
+        </w:rPr>
+        <w:t xml:space="preserve">[17] Packer C., Wooders S., Lin K., Fang V., Patil S.G., Stoica I., Gonzalez J.E. MemGPT: Towards LLMs as Operating Systems. 2023. </w:t>
+      </w:r>
+      <w:hyperlink r:id="rId29">
+        <w:r>
+          <w:rPr>
+            <w:rStyle w:val="Hyperlink"/>
+            <w:rFonts w:ascii="Sylfaen" w:hAnsi="Sylfaen" w:cs="Sylfaen"/>
+            <w:color w:val="0563C1"/>
+            <w:sz w:val="22"/>
+            <w:u w:val="single"/>
+            <w:lang w:val="en-US"/>
+          </w:rPr>
+          <w:t xml:space="preserve">arXiv:2310.08560</w:t>
+        </w:r>
+      </w:hyperlink>
+      <w:r>
+        <w:rPr>
+          <w:rFonts w:ascii="Sylfaen" w:hAnsi="Sylfaen" w:cs="Sylfaen"/>
+          <w:b w:val="0"/>
+          <w:sz w:val="22"/>
+          <w:lang w:val="en-US"/>
+        </w:rPr>
+        <w:t xml:space="preserve">.</w:t>
       </w:r>
     </w:p>
     <w:p>
@@ -6761,6 +7454,7 @@
           <w:rFonts w:ascii="Sylfaen" w:hAnsi="Sylfaen" w:cs="Sylfaen"/>
           <w:b w:val="0"/>
           <w:sz w:val="22"/>
+          <w:lang w:val="ka-GE"/>
         </w:rPr>
         <w:t>[18] OpenAI. Dreaming: Better memory for a more helpful ChatGPT. OpenAI, 2026 (4 ივნისი). https://openai.com/index/chatgpt-memory-dreaming/</w:t>
       </w:r>
@@ -6774,6 +7468,7 @@
           <w:rFonts w:ascii="Sylfaen" w:hAnsi="Sylfaen" w:cs="Sylfaen"/>
           <w:b w:val="0"/>
           <w:sz w:val="22"/>
+          <w:lang w:val="ka-GE"/>
         </w:rPr>
         <w:t>[19] Anthropic. New in Claude Managed Agents: dreaming, outcomes, and multiagent orchestration. Anthropic, 2026 (19 მაისი, კვლევითი წინასწარი ვერსია). https://claude.com/blog/new-in-claude-managed-agents</w:t>
       </w:r>
@@ -6787,6 +7482,7 @@
           <w:rFonts w:ascii="Sylfaen" w:hAnsi="Sylfaen" w:cs="Sylfaen"/>
           <w:b w:val="0"/>
           <w:sz w:val="22"/>
+          <w:lang w:val="en-US"/>
         </w:rPr>
         <w:t>[20] Atkinson R.C., Shiffrin R.M. Human Memory: A Proposed System and Its Control Processes. In: Spence K.W., Spence J.T. (Eds.), The Psychology of Learning and Motivation, vol. 2, pp. 89–195. New York: Academic Press, 1968.</w:t>
       </w:r>
@@ -6800,6 +7496,7 @@
           <w:rFonts w:ascii="Sylfaen" w:hAnsi="Sylfaen" w:cs="Sylfaen"/>
           <w:b w:val="0"/>
           <w:sz w:val="22"/>
+          <w:lang w:val="en-US"/>
         </w:rPr>
         <w:t>[21] Baddeley A.D., Hitch G. Working Memory. In: Bower G.H. (Ed.), The Psychology of Learning and Motivation, vol. 8, pp. 47–89. New York: Academic Press, 1974.</w:t>
       </w:r>
@@ -6813,6 +7510,7 @@
           <w:rFonts w:ascii="Sylfaen" w:hAnsi="Sylfaen" w:cs="Sylfaen"/>
           <w:b w:val="0"/>
           <w:sz w:val="22"/>
+          <w:lang w:val="en-US"/>
         </w:rPr>
         <w:t>[22] Tulving E. Episodic and Semantic Memory. In: Tulving E., Donaldson W. (Eds.), Organization of Memory, pp. 381–403. New York: Academic Press, 1972.</w:t>
       </w:r>
@@ -6826,6 +7524,7 @@
           <w:rFonts w:ascii="Sylfaen" w:hAnsi="Sylfaen" w:cs="Sylfaen"/>
           <w:b w:val="0"/>
           <w:sz w:val="22"/>
+          <w:lang w:val="en-US"/>
         </w:rPr>
         <w:t>[23] Ebbinghaus H. Memory: A Contribution to Experimental Psychology (Trans. H.A. Ruger &amp; C.E. Bussenius). New York: Teachers College, Columbia University, 1913. (Original work published 1885.)</w:t>
       </w:r>
@@ -6839,8 +7538,31 @@
           <w:rFonts w:ascii="Sylfaen" w:hAnsi="Sylfaen" w:cs="Sylfaen"/>
           <w:b w:val="0"/>
           <w:sz w:val="22"/>
-        </w:rPr>
-        <w:t>[24] Reyna V.F., Brainerd C.J. Fuzzy-trace theory: An interim synthesis. Learning and Individual Differences, 7(1), 1–75, 1995. doi:10.1016/1041-6080(95)90031-4.</w:t>
+          <w:lang w:val="en-US"/>
+        </w:rPr>
+        <w:t xml:space="preserve">[24] Reyna V.F., Brainerd C.J. Fuzzy-trace theory: An interim synthesis. Learning and Individual Differences, 7(1), 1–75, 1995. doi:</w:t>
+      </w:r>
+      <w:hyperlink r:id="rId30">
+        <w:r>
+          <w:rPr>
+            <w:rStyle w:val="Hyperlink"/>
+            <w:rFonts w:ascii="Sylfaen" w:hAnsi="Sylfaen" w:cs="Sylfaen"/>
+            <w:color w:val="0563C1"/>
+            <w:sz w:val="22"/>
+            <w:u w:val="single"/>
+            <w:lang w:val="en-US"/>
+          </w:rPr>
+          <w:t xml:space="preserve">10.1016/1041-6080(95)90031-4</w:t>
+        </w:r>
+      </w:hyperlink>
+      <w:r>
+        <w:rPr>
+          <w:rFonts w:ascii="Sylfaen" w:hAnsi="Sylfaen" w:cs="Sylfaen"/>
+          <w:b w:val="0"/>
+          <w:sz w:val="22"/>
+          <w:lang w:val="en-US"/>
+        </w:rPr>
+        <w:t xml:space="preserve">.</w:t>
       </w:r>
     </w:p>
     <w:p>
@@ -6852,8 +7574,31 @@
           <w:rFonts w:ascii="Sylfaen" w:hAnsi="Sylfaen" w:cs="Sylfaen"/>
           <w:b w:val="0"/>
           <w:sz w:val="22"/>
-        </w:rPr>
-        <w:t>[25] McClelland J.L., McNaughton B.L., O'Reilly R.C. Why there are complementary learning systems in the hippocampus and neocortex: insights from the successes and failures of connectionist models of learning and memory. Psychological Review, 102(3), 419–457, 1995. doi:10.1037/0033-295X.102.3.419.</w:t>
+          <w:lang w:val="en-US"/>
+        </w:rPr>
+        <w:t xml:space="preserve">[25] McClelland J.L., McNaughton B.L., O'Reilly R.C. Why there are complementary learning systems in the hippocampus and neocortex: insights from the successes and failures of connectionist models of learning and memory. Psychological Review, 102(3), 419–457, 1995. doi:</w:t>
+      </w:r>
+      <w:hyperlink r:id="rId31">
+        <w:r>
+          <w:rPr>
+            <w:rStyle w:val="Hyperlink"/>
+            <w:rFonts w:ascii="Sylfaen" w:hAnsi="Sylfaen" w:cs="Sylfaen"/>
+            <w:color w:val="0563C1"/>
+            <w:sz w:val="22"/>
+            <w:u w:val="single"/>
+            <w:lang w:val="en-US"/>
+          </w:rPr>
+          <w:t xml:space="preserve">10.1037/0033-295X.102.3.419</w:t>
+        </w:r>
+      </w:hyperlink>
+      <w:r>
+        <w:rPr>
+          <w:rFonts w:ascii="Sylfaen" w:hAnsi="Sylfaen" w:cs="Sylfaen"/>
+          <w:b w:val="0"/>
+          <w:sz w:val="22"/>
+          <w:lang w:val="en-US"/>
+        </w:rPr>
+        <w:t xml:space="preserve">.</w:t>
       </w:r>
     </w:p>
     <w:p>
@@ -6865,8 +7610,31 @@
           <w:rFonts w:ascii="Sylfaen" w:hAnsi="Sylfaen" w:cs="Sylfaen"/>
           <w:b w:val="0"/>
           <w:sz w:val="22"/>
-        </w:rPr>
-        <w:t>[26] Teyler T.J., DiScenna P. The hippocampal memory indexing theory. Behavioral Neuroscience, 100(2), 147–152, 1986. doi:10.1037/0735-7044.100.2.147.</w:t>
+          <w:lang w:val="en-US"/>
+        </w:rPr>
+        <w:t xml:space="preserve">[26] Teyler T.J., DiScenna P. The hippocampal memory indexing theory. Behavioral Neuroscience, 100(2), 147–152, 1986. doi:</w:t>
+      </w:r>
+      <w:hyperlink r:id="rId32">
+        <w:r>
+          <w:rPr>
+            <w:rStyle w:val="Hyperlink"/>
+            <w:rFonts w:ascii="Sylfaen" w:hAnsi="Sylfaen" w:cs="Sylfaen"/>
+            <w:color w:val="0563C1"/>
+            <w:sz w:val="22"/>
+            <w:u w:val="single"/>
+            <w:lang w:val="en-US"/>
+          </w:rPr>
+          <w:t xml:space="preserve">10.1037/0735-7044.100.2.147</w:t>
+        </w:r>
+      </w:hyperlink>
+      <w:r>
+        <w:rPr>
+          <w:rFonts w:ascii="Sylfaen" w:hAnsi="Sylfaen" w:cs="Sylfaen"/>
+          <w:b w:val="0"/>
+          <w:sz w:val="22"/>
+          <w:lang w:val="en-US"/>
+        </w:rPr>
+        <w:t xml:space="preserve">.</w:t>
       </w:r>
     </w:p>
     <w:p>
@@ -6878,8 +7646,31 @@
           <w:rFonts w:ascii="Sylfaen" w:hAnsi="Sylfaen" w:cs="Sylfaen"/>
           <w:b w:val="0"/>
           <w:sz w:val="22"/>
-        </w:rPr>
-        <w:t>[27] Xu W., Liang Z., Mei K., Gao H., Tan J., Zhang Y. A-MEM: Agentic Memory for LLM Agents. NeurIPS 2025. arXiv:2502.12110.</w:t>
+          <w:lang w:val="en-US"/>
+        </w:rPr>
+        <w:t xml:space="preserve">[27] Xu W., Liang Z., Mei K., Gao H., Tan J., Zhang Y. A-MEM: Agentic Memory for LLM Agents. NeurIPS 2025. </w:t>
+      </w:r>
+      <w:hyperlink r:id="rId33">
+        <w:r>
+          <w:rPr>
+            <w:rStyle w:val="Hyperlink"/>
+            <w:rFonts w:ascii="Sylfaen" w:hAnsi="Sylfaen" w:cs="Sylfaen"/>
+            <w:color w:val="0563C1"/>
+            <w:sz w:val="22"/>
+            <w:u w:val="single"/>
+            <w:lang w:val="en-US"/>
+          </w:rPr>
+          <w:t xml:space="preserve">arXiv:2502.12110</w:t>
+        </w:r>
+      </w:hyperlink>
+      <w:r>
+        <w:rPr>
+          <w:rFonts w:ascii="Sylfaen" w:hAnsi="Sylfaen" w:cs="Sylfaen"/>
+          <w:b w:val="0"/>
+          <w:sz w:val="22"/>
+          <w:lang w:val="en-US"/>
+        </w:rPr>
+        <w:t xml:space="preserve">.</w:t>
       </w:r>
     </w:p>
     <w:p>
@@ -6891,6 +7682,7 @@
           <w:rFonts w:ascii="Sylfaen" w:hAnsi="Sylfaen" w:cs="Sylfaen"/>
           <w:b w:val="0"/>
           <w:sz w:val="22"/>
+          <w:lang w:val="en-US"/>
         </w:rPr>
         <w:t>[28] Reeves B., Nass C. The Media Equation: How People Treat Computers, Television, and New Media Like Real People and Places. Cambridge University Press / CSLI Publications, 1996.</w:t>
       </w:r>
@@ -6904,8 +7696,31 @@
           <w:rFonts w:ascii="Sylfaen" w:hAnsi="Sylfaen" w:cs="Sylfaen"/>
           <w:b w:val="0"/>
           <w:sz w:val="22"/>
-        </w:rPr>
-        <w:t>[29] Chhikara P., Khant D., Aryan S., Singh T., Yadav D. Mem0: Building Production-Ready AI Agents with Scalable Long-Term Memory. 2025. arXiv:2504.19413.</w:t>
+          <w:lang w:val="en-US"/>
+        </w:rPr>
+        <w:t xml:space="preserve">[29] Chhikara P., Khant D., Aryan S., Singh T., Yadav D. Mem0: Building Production-Ready AI Agents with Scalable Long-Term Memory. 2025. </w:t>
+      </w:r>
+      <w:hyperlink r:id="rId34">
+        <w:r>
+          <w:rPr>
+            <w:rStyle w:val="Hyperlink"/>
+            <w:rFonts w:ascii="Sylfaen" w:hAnsi="Sylfaen" w:cs="Sylfaen"/>
+            <w:color w:val="0563C1"/>
+            <w:sz w:val="22"/>
+            <w:u w:val="single"/>
+            <w:lang w:val="en-US"/>
+          </w:rPr>
+          <w:t xml:space="preserve">arXiv:2504.19413</w:t>
+        </w:r>
+      </w:hyperlink>
+      <w:r>
+        <w:rPr>
+          <w:rFonts w:ascii="Sylfaen" w:hAnsi="Sylfaen" w:cs="Sylfaen"/>
+          <w:b w:val="0"/>
+          <w:sz w:val="22"/>
+          <w:lang w:val="en-US"/>
+        </w:rPr>
+        <w:t xml:space="preserve">.</w:t>
       </w:r>
     </w:p>
     <w:p>
@@ -6917,8 +7732,31 @@
           <w:rFonts w:ascii="Sylfaen" w:hAnsi="Sylfaen" w:cs="Sylfaen"/>
           <w:b w:val="0"/>
           <w:sz w:val="22"/>
-        </w:rPr>
-        <w:t>[30] Rasmussen P., Paliychuk P., Beauvais T., Ryan J., Chalef D. Zep: A Temporal Knowledge Graph Architecture for Agent Memory. 2025. arXiv:2501.13956.</w:t>
+          <w:lang w:val="en-US"/>
+        </w:rPr>
+        <w:t xml:space="preserve">[30] Rasmussen P., Paliychuk P., Beauvais T., Ryan J., Chalef D. Zep: A Temporal Knowledge Graph Architecture for Agent Memory. 2025. </w:t>
+      </w:r>
+      <w:hyperlink r:id="rId35">
+        <w:r>
+          <w:rPr>
+            <w:rStyle w:val="Hyperlink"/>
+            <w:rFonts w:ascii="Sylfaen" w:hAnsi="Sylfaen" w:cs="Sylfaen"/>
+            <w:color w:val="0563C1"/>
+            <w:sz w:val="22"/>
+            <w:u w:val="single"/>
+            <w:lang w:val="en-US"/>
+          </w:rPr>
+          <w:t xml:space="preserve">arXiv:2501.13956</w:t>
+        </w:r>
+      </w:hyperlink>
+      <w:r>
+        <w:rPr>
+          <w:rFonts w:ascii="Sylfaen" w:hAnsi="Sylfaen" w:cs="Sylfaen"/>
+          <w:b w:val="0"/>
+          <w:sz w:val="22"/>
+          <w:lang w:val="en-US"/>
+        </w:rPr>
+        <w:t xml:space="preserve">.</w:t>
       </w:r>
     </w:p>
     <w:p>
@@ -6930,8 +7768,31 @@
           <w:rFonts w:ascii="Sylfaen" w:hAnsi="Sylfaen" w:cs="Sylfaen"/>
           <w:b w:val="0"/>
           <w:sz w:val="22"/>
-        </w:rPr>
-        <w:t>[31] Zacks J.M., Speer N.K., Swallow K.M., Braver T.S., Reynolds J.R. Event perception: A mind-brain perspective. Psychological Bulletin, 133(2), 273–293, 2007. doi:10.1037/0033-2909.133.2.273.</w:t>
+          <w:lang w:val="en-US"/>
+        </w:rPr>
+        <w:t xml:space="preserve">[31] Zacks J.M., Speer N.K., Swallow K.M., Braver T.S., Reynolds J.R. Event perception: A mind-brain perspective. Psychological Bulletin, 133(2), 273–293, 2007. doi:</w:t>
+      </w:r>
+      <w:hyperlink r:id="rId36">
+        <w:r>
+          <w:rPr>
+            <w:rStyle w:val="Hyperlink"/>
+            <w:rFonts w:ascii="Sylfaen" w:hAnsi="Sylfaen" w:cs="Sylfaen"/>
+            <w:color w:val="0563C1"/>
+            <w:sz w:val="22"/>
+            <w:u w:val="single"/>
+            <w:lang w:val="en-US"/>
+          </w:rPr>
+          <w:t xml:space="preserve">10.1037/0033-2909.133.2.273</w:t>
+        </w:r>
+      </w:hyperlink>
+      <w:r>
+        <w:rPr>
+          <w:rFonts w:ascii="Sylfaen" w:hAnsi="Sylfaen" w:cs="Sylfaen"/>
+          <w:b w:val="0"/>
+          <w:sz w:val="22"/>
+          <w:lang w:val="en-US"/>
+        </w:rPr>
+        <w:t xml:space="preserve">.</w:t>
       </w:r>
     </w:p>
     <w:p>
@@ -6943,6 +7804,7 @@
           <w:rFonts w:ascii="Sylfaen" w:hAnsi="Sylfaen" w:cs="Sylfaen"/>
           <w:b w:val="0"/>
           <w:sz w:val="22"/>
+          <w:lang w:val="ka-GE"/>
         </w:rPr>
         <w:t>[32] getzep/zep-papers, GitHub Issue #5: "Revisiting Zep's 84% LoCoMo Claim: Corrected Evaluation &amp; 58.44% Accuracy", 2025. (ვენდორთა შორის შეფასების დავა — იხ. F9.)</w:t>
       </w:r>
@@ -6956,6 +7818,7 @@
           <w:rFonts w:ascii="Sylfaen" w:hAnsi="Sylfaen" w:cs="Sylfaen"/>
           <w:b w:val="0"/>
           <w:sz w:val="22"/>
+          <w:lang w:val="ka-GE"/>
         </w:rPr>
         <w:t>[33] dial481/locomo-audit, GitHub repository, 2026. (LoCoMo-ს დამოუკიდებელი აუდიტი: ოქროს პასუხების 6.4% მცდარი — იხ. F9.)</w:t>
       </w:r>
@@ -6969,8 +7832,31 @@
           <w:rFonts w:ascii="Sylfaen" w:hAnsi="Sylfaen" w:cs="Sylfaen"/>
           <w:b w:val="0"/>
           <w:sz w:val="22"/>
-        </w:rPr>
-        <w:t>[34] Yan Z., Fischer J.E., Clos J. Remembering Things Makes Chatbots Sound Smarter, but Less Trustworthy — A Pilot Study. In: Proceedings of the 7th ACM Conference on Conversational User Interfaces (CUI '25), Art. 23, pp. 23:1–23:8, 2025. doi:10.1145/3719160.3737617.</w:t>
+          <w:lang w:val="en-US"/>
+        </w:rPr>
+        <w:t xml:space="preserve">[34] Yan Z., Fischer J.E., Clos J. Remembering Things Makes Chatbots Sound Smarter, but Less Trustworthy — A Pilot Study. In: Proceedings of the 7th ACM Conference on Conversational User Interfaces (CUI '25), Art. 23, pp. 23:1–23:8, 2025. doi:</w:t>
+      </w:r>
+      <w:hyperlink r:id="rId37">
+        <w:r>
+          <w:rPr>
+            <w:rStyle w:val="Hyperlink"/>
+            <w:rFonts w:ascii="Sylfaen" w:hAnsi="Sylfaen" w:cs="Sylfaen"/>
+            <w:color w:val="0563C1"/>
+            <w:sz w:val="22"/>
+            <w:u w:val="single"/>
+            <w:lang w:val="en-US"/>
+          </w:rPr>
+          <w:t xml:space="preserve">10.1145/3719160.3737617</w:t>
+        </w:r>
+      </w:hyperlink>
+      <w:r>
+        <w:rPr>
+          <w:rFonts w:ascii="Sylfaen" w:hAnsi="Sylfaen" w:cs="Sylfaen"/>
+          <w:b w:val="0"/>
+          <w:sz w:val="22"/>
+          <w:lang w:val="en-US"/>
+        </w:rPr>
+        <w:t xml:space="preserve">.</w:t>
       </w:r>
     </w:p>
     <w:p>
@@ -6982,8 +7868,31 @@
           <w:rFonts w:ascii="Sylfaen" w:hAnsi="Sylfaen" w:cs="Sylfaen"/>
           <w:b w:val="0"/>
           <w:sz w:val="22"/>
-        </w:rPr>
-        <w:t>[35] Xu J., Szlam A., Weston J. Beyond Goldfish Memory: Long-Term Open-Domain Conversation (Multi-Session Chat, MSC). ACL 2022. arXiv:2107.07567.</w:t>
+          <w:lang w:val="en-US"/>
+        </w:rPr>
+        <w:t xml:space="preserve">[35] Xu J., Szlam A., Weston J. Beyond Goldfish Memory: Long-Term Open-Domain Conversation (Multi-Session Chat, MSC). ACL 2022. </w:t>
+      </w:r>
+      <w:hyperlink r:id="rId38">
+        <w:r>
+          <w:rPr>
+            <w:rStyle w:val="Hyperlink"/>
+            <w:rFonts w:ascii="Sylfaen" w:hAnsi="Sylfaen" w:cs="Sylfaen"/>
+            <w:color w:val="0563C1"/>
+            <w:sz w:val="22"/>
+            <w:u w:val="single"/>
+            <w:lang w:val="en-US"/>
+          </w:rPr>
+          <w:t xml:space="preserve">arXiv:2107.07567</w:t>
+        </w:r>
+      </w:hyperlink>
+      <w:r>
+        <w:rPr>
+          <w:rFonts w:ascii="Sylfaen" w:hAnsi="Sylfaen" w:cs="Sylfaen"/>
+          <w:b w:val="0"/>
+          <w:sz w:val="22"/>
+          <w:lang w:val="en-US"/>
+        </w:rPr>
+        <w:t xml:space="preserve">.</w:t>
       </w:r>
     </w:p>
     <w:sectPr>
@@ -11100,7 +12009,7 @@
         <w:rFonts w:asciiTheme="minorHAnsi" w:eastAsiaTheme="minorHAnsi" w:hAnsiTheme="minorHAnsi" w:cstheme="minorBidi"/>
         <w:sz w:val="22"/>
         <w:szCs w:val="22"/>
-        <w:lang w:val="en-US" w:eastAsia="en-US" w:bidi="ar-SA"/>
+        <w:lang w:val="ka-GE" w:eastAsia="en-US" w:bidi="ar-SA"/>
       </w:rPr>
     </w:rPrDefault>
     <w:pPrDefault>

</xml_diff>

<commit_message>
style(thesis): match reference bibliography — muted link color + "last verified" notes
- link color 0563C1 -> 467886 (the reference Hyperlink-style steel-blue)
- append " - უკანასკნელად იქნა გადამოწმებული - <date>" after each arXiv/DOI
  link: Georgian access-date note, dark text, ka-GE tagged (not link-colored)
- VERIFIED_DATE constant (04.07.2026) — one-liner to change to the submission date
- regenerated thesis-ka.docx via the full build.py + format_thesis.py pipeline;
  front matter verified intact (title unnumbered, recommendation=1, no blank)

Co-Authored-By: Claude Opus 4.8 (1M context) <noreply@anthropic.com>
</commit_message>
<xml_diff>
--- a/project/thesis-ka.docx
+++ b/project/thesis-ka.docx
@@ -1202,7 +1202,6 @@
         <w:rPr>
           <w:rFonts w:ascii="Sylfaen" w:hAnsi="Sylfaen"/>
           <w:sz w:val="24"/>
-          <w:lang w:val="ka-GE"/>
         </w:rPr>
         <w:t>1. შესავალი</w:t>
       </w:r>
@@ -1233,7 +1232,6 @@
         <w:rPr>
           <w:rFonts w:ascii="Sylfaen" w:hAnsi="Sylfaen"/>
           <w:sz w:val="24"/>
-          <w:lang w:val="ka-GE"/>
         </w:rPr>
         <w:t>2. ლიტერატურის მიმოხილვა</w:t>
       </w:r>
@@ -1264,7 +1262,6 @@
         <w:rPr>
           <w:rFonts w:ascii="Sylfaen" w:hAnsi="Sylfaen"/>
           <w:sz w:val="24"/>
-          <w:lang w:val="ka-GE"/>
         </w:rPr>
         <w:t>2.1 მიმოხილვის მოცულობა და სტრუქტურა</w:t>
       </w:r>
@@ -1295,7 +1292,6 @@
         <w:rPr>
           <w:rFonts w:ascii="Sylfaen" w:hAnsi="Sylfaen"/>
           <w:sz w:val="24"/>
-          <w:lang w:val="ka-GE"/>
         </w:rPr>
         <w:t>2.2 თეორიული საფუძვლები: ადამიანის მეხსიერების მოდელები</w:t>
       </w:r>
@@ -1326,7 +1322,6 @@
         <w:rPr>
           <w:rFonts w:ascii="Sylfaen" w:hAnsi="Sylfaen"/>
           <w:sz w:val="24"/>
-          <w:lang w:val="ka-GE"/>
         </w:rPr>
         <w:t>2.3 გრძელვადიანი მეხსიერება დიდი ენის მოდელის აგენტებისთვის: სამი ტალღა</w:t>
       </w:r>
@@ -1357,7 +1352,6 @@
         <w:rPr>
           <w:rFonts w:ascii="Sylfaen" w:hAnsi="Sylfaen"/>
           <w:sz w:val="24"/>
-          <w:lang w:val="ka-GE"/>
         </w:rPr>
         <w:t>2.4 ხიდი: მეხსიერების თეორიიდან მეხსიერების არქიტექტურამდე</w:t>
       </w:r>
@@ -1388,7 +1382,6 @@
         <w:rPr>
           <w:rFonts w:ascii="Sylfaen" w:hAnsi="Sylfaen"/>
           <w:sz w:val="24"/>
-          <w:lang w:val="ka-GE"/>
         </w:rPr>
         <w:t>2.5 საუბრის მეხსიერების შეფასება: ბენჩმარკები და მათი შეზღუდვები</w:t>
       </w:r>
@@ -1419,7 +1412,6 @@
         <w:rPr>
           <w:rFonts w:ascii="Sylfaen" w:hAnsi="Sylfaen"/>
           <w:sz w:val="24"/>
-          <w:lang w:val="ka-GE"/>
         </w:rPr>
         <w:t>2.6 ასისტენტიდან თანამოსაუბრემდე: მეხსიერება და აღქმული ურთიერთობა</w:t>
       </w:r>
@@ -1450,7 +1442,6 @@
         <w:rPr>
           <w:rFonts w:ascii="Sylfaen" w:hAnsi="Sylfaen"/>
           <w:sz w:val="24"/>
-          <w:lang w:val="ka-GE"/>
         </w:rPr>
         <w:t>2.7 ღია პრობლემები და შეზღუდვები</w:t>
       </w:r>
@@ -1481,7 +1472,6 @@
         <w:rPr>
           <w:rFonts w:ascii="Sylfaen" w:hAnsi="Sylfaen"/>
           <w:sz w:val="24"/>
-          <w:lang w:val="ka-GE"/>
         </w:rPr>
         <w:t>2.8 ამ ნაშრომის ადგილი</w:t>
       </w:r>
@@ -1512,7 +1502,6 @@
         <w:rPr>
           <w:rFonts w:ascii="Sylfaen" w:hAnsi="Sylfaen"/>
           <w:sz w:val="24"/>
-          <w:lang w:val="ka-GE"/>
         </w:rPr>
         <w:t>3. კვლევის მეთოდები</w:t>
       </w:r>
@@ -1543,7 +1532,6 @@
         <w:rPr>
           <w:rFonts w:ascii="Sylfaen" w:hAnsi="Sylfaen"/>
           <w:sz w:val="24"/>
-          <w:lang w:val="ka-GE"/>
         </w:rPr>
         <w:t>3.1 კვლევის დიზაინი და წვლილი</w:t>
       </w:r>
@@ -1574,7 +1562,6 @@
         <w:rPr>
           <w:rFonts w:ascii="Sylfaen" w:hAnsi="Sylfaen"/>
           <w:sz w:val="24"/>
-          <w:lang w:val="ka-GE"/>
         </w:rPr>
         <w:t>3.2 პროფილი C-ის მეხსიერების არქიტექტურა</w:t>
       </w:r>
@@ -1605,7 +1592,6 @@
         <w:rPr>
           <w:rFonts w:ascii="Sylfaen" w:hAnsi="Sylfaen"/>
           <w:sz w:val="24"/>
-          <w:lang w:val="ka-GE"/>
         </w:rPr>
         <w:t>3.3 ექსპერიმენტული პირობები (A / B / B+ / C)</w:t>
       </w:r>
@@ -1636,7 +1622,6 @@
         <w:rPr>
           <w:rFonts w:ascii="Sylfaen" w:hAnsi="Sylfaen"/>
           <w:sz w:val="24"/>
-          <w:lang w:val="ka-GE"/>
         </w:rPr>
         <w:t>3.4 კონცეფციის დამტკიცების იმპლემენტაცია</w:t>
       </w:r>
@@ -1667,7 +1652,6 @@
         <w:rPr>
           <w:rFonts w:ascii="Sylfaen" w:hAnsi="Sylfaen"/>
           <w:sz w:val="24"/>
-          <w:lang w:val="ka-GE"/>
         </w:rPr>
         <w:t>3.5 შეფასების მეთოდოლოგია</w:t>
       </w:r>
@@ -1698,7 +1682,6 @@
         <w:rPr>
           <w:rFonts w:ascii="Sylfaen" w:hAnsi="Sylfaen"/>
           <w:sz w:val="24"/>
-          <w:lang w:val="ka-GE"/>
         </w:rPr>
         <w:t>3.6 ზომები და ინსტრუმენტები</w:t>
       </w:r>
@@ -1729,7 +1712,6 @@
         <w:rPr>
           <w:rFonts w:ascii="Sylfaen" w:hAnsi="Sylfaen"/>
           <w:sz w:val="24"/>
-          <w:lang w:val="ka-GE"/>
         </w:rPr>
         <w:t>3.7 ანალიზის გეგმა</w:t>
       </w:r>
@@ -1760,7 +1742,6 @@
         <w:rPr>
           <w:rFonts w:ascii="Sylfaen" w:hAnsi="Sylfaen"/>
           <w:sz w:val="24"/>
-          <w:lang w:val="ka-GE"/>
         </w:rPr>
         <w:t>3.8 ეთიკური საკითხები და შეზღუდვები</w:t>
       </w:r>
@@ -1791,7 +1772,6 @@
         <w:rPr>
           <w:rFonts w:ascii="Sylfaen" w:hAnsi="Sylfaen"/>
           <w:sz w:val="24"/>
-          <w:lang w:val="ka-GE"/>
         </w:rPr>
         <w:t>4. შედეგები და განხილვა</w:t>
       </w:r>
@@ -1822,7 +1802,6 @@
         <w:rPr>
           <w:rFonts w:ascii="Sylfaen" w:hAnsi="Sylfaen"/>
           <w:sz w:val="24"/>
-          <w:lang w:val="ka-GE"/>
         </w:rPr>
         <w:t>4.1 კონცეფციის დამტკიცება: მასშტაბი და სიზუსტე</w:t>
       </w:r>
@@ -1853,7 +1832,6 @@
         <w:rPr>
           <w:rFonts w:ascii="Sylfaen" w:hAnsi="Sylfaen"/>
           <w:sz w:val="24"/>
-          <w:lang w:val="ka-GE"/>
         </w:rPr>
         <w:t>4.2 ტექნიკური შედეგები</w:t>
       </w:r>
@@ -1884,7 +1862,6 @@
         <w:rPr>
           <w:rFonts w:ascii="Sylfaen" w:hAnsi="Sylfaen"/>
           <w:sz w:val="24"/>
-          <w:lang w:val="ka-GE"/>
         </w:rPr>
         <w:t>4.3 სიმულირებული აღქმის შედეგები</w:t>
       </w:r>
@@ -1915,7 +1892,6 @@
         <w:rPr>
           <w:rFonts w:ascii="Sylfaen" w:hAnsi="Sylfaen"/>
           <w:sz w:val="24"/>
-          <w:lang w:val="ka-GE"/>
         </w:rPr>
         <w:t>4.4 განხილვა</w:t>
       </w:r>
@@ -1946,7 +1922,6 @@
         <w:rPr>
           <w:rFonts w:ascii="Sylfaen" w:hAnsi="Sylfaen"/>
           <w:sz w:val="24"/>
-          <w:lang w:val="ka-GE"/>
         </w:rPr>
         <w:t>4.5 შეფასების შეზღუდვები</w:t>
       </w:r>
@@ -1977,7 +1952,6 @@
         <w:rPr>
           <w:rFonts w:ascii="Sylfaen" w:hAnsi="Sylfaen"/>
           <w:sz w:val="24"/>
-          <w:lang w:val="ka-GE"/>
         </w:rPr>
         <w:t>5. დასკვნა</w:t>
       </w:r>
@@ -2008,7 +1982,6 @@
         <w:rPr>
           <w:rFonts w:ascii="Sylfaen" w:hAnsi="Sylfaen"/>
           <w:sz w:val="24"/>
-          <w:lang w:val="ka-GE"/>
         </w:rPr>
         <w:t>5.1 წვლილის შეჯამება</w:t>
       </w:r>
@@ -2039,7 +2012,6 @@
         <w:rPr>
           <w:rFonts w:ascii="Sylfaen" w:hAnsi="Sylfaen"/>
           <w:sz w:val="24"/>
-          <w:lang w:val="ka-GE"/>
         </w:rPr>
         <w:t>5.2 შედეგების შეჯამება</w:t>
       </w:r>
@@ -2070,7 +2042,6 @@
         <w:rPr>
           <w:rFonts w:ascii="Sylfaen" w:hAnsi="Sylfaen"/>
           <w:sz w:val="24"/>
-          <w:lang w:val="ka-GE"/>
         </w:rPr>
         <w:t>5.3 სამომავლო სამუშაო</w:t>
       </w:r>
@@ -2101,7 +2072,6 @@
         <w:rPr>
           <w:rFonts w:ascii="Sylfaen" w:hAnsi="Sylfaen"/>
           <w:sz w:val="24"/>
-          <w:lang w:val="ka-GE"/>
         </w:rPr>
         <w:t>ბიბლიოგრაფია</w:t>
       </w:r>
@@ -6829,7 +6799,7 @@
           <w:rPr>
             <w:rStyle w:val="Hyperlink"/>
             <w:rFonts w:ascii="Sylfaen" w:hAnsi="Sylfaen" w:cs="Sylfaen"/>
-            <w:color w:val="0563C1"/>
+            <w:color w:val="467886"/>
             <w:sz w:val="22"/>
             <w:u w:val="single"/>
             <w:lang w:val="en-US"/>
@@ -6840,6 +6810,14 @@
       <w:r>
         <w:rPr>
           <w:rFonts w:ascii="Sylfaen" w:hAnsi="Sylfaen" w:cs="Sylfaen"/>
+          <w:sz w:val="22"/>
+          <w:lang w:val="ka-GE"/>
+        </w:rPr>
+        <w:t xml:space="preserve"> - უკანასკნელად იქნა გადამოწმებული - 04.07.2026</w:t>
+      </w:r>
+      <w:r>
+        <w:rPr>
+          <w:rFonts w:ascii="Sylfaen" w:hAnsi="Sylfaen" w:cs="Sylfaen"/>
           <w:b w:val="0"/>
           <w:sz w:val="22"/>
           <w:lang w:val="en-US"/>
@@ -6865,7 +6843,7 @@
           <w:rPr>
             <w:rStyle w:val="Hyperlink"/>
             <w:rFonts w:ascii="Sylfaen" w:hAnsi="Sylfaen" w:cs="Sylfaen"/>
-            <w:color w:val="0563C1"/>
+            <w:color w:val="467886"/>
             <w:sz w:val="22"/>
             <w:u w:val="single"/>
             <w:lang w:val="en-US"/>
@@ -6876,6 +6854,14 @@
       <w:r>
         <w:rPr>
           <w:rFonts w:ascii="Sylfaen" w:hAnsi="Sylfaen" w:cs="Sylfaen"/>
+          <w:sz w:val="22"/>
+          <w:lang w:val="ka-GE"/>
+        </w:rPr>
+        <w:t xml:space="preserve"> - უკანასკნელად იქნა გადამოწმებული - 04.07.2026</w:t>
+      </w:r>
+      <w:r>
+        <w:rPr>
+          <w:rFonts w:ascii="Sylfaen" w:hAnsi="Sylfaen" w:cs="Sylfaen"/>
           <w:b w:val="0"/>
           <w:sz w:val="22"/>
           <w:lang w:val="en-US"/>
@@ -6901,7 +6887,7 @@
           <w:rPr>
             <w:rStyle w:val="Hyperlink"/>
             <w:rFonts w:ascii="Sylfaen" w:hAnsi="Sylfaen" w:cs="Sylfaen"/>
-            <w:color w:val="0563C1"/>
+            <w:color w:val="467886"/>
             <w:sz w:val="22"/>
             <w:u w:val="single"/>
             <w:lang w:val="en-US"/>
@@ -6912,6 +6898,14 @@
       <w:r>
         <w:rPr>
           <w:rFonts w:ascii="Sylfaen" w:hAnsi="Sylfaen" w:cs="Sylfaen"/>
+          <w:sz w:val="22"/>
+          <w:lang w:val="ka-GE"/>
+        </w:rPr>
+        <w:t xml:space="preserve"> - უკანასკნელად იქნა გადამოწმებული - 04.07.2026</w:t>
+      </w:r>
+      <w:r>
+        <w:rPr>
+          <w:rFonts w:ascii="Sylfaen" w:hAnsi="Sylfaen" w:cs="Sylfaen"/>
           <w:b w:val="0"/>
           <w:sz w:val="22"/>
           <w:lang w:val="en-US"/>
@@ -6937,7 +6931,7 @@
           <w:rPr>
             <w:rStyle w:val="Hyperlink"/>
             <w:rFonts w:ascii="Sylfaen" w:hAnsi="Sylfaen" w:cs="Sylfaen"/>
-            <w:color w:val="0563C1"/>
+            <w:color w:val="467886"/>
             <w:sz w:val="22"/>
             <w:u w:val="single"/>
             <w:lang w:val="en-US"/>
@@ -6948,6 +6942,14 @@
       <w:r>
         <w:rPr>
           <w:rFonts w:ascii="Sylfaen" w:hAnsi="Sylfaen" w:cs="Sylfaen"/>
+          <w:sz w:val="22"/>
+          <w:lang w:val="ka-GE"/>
+        </w:rPr>
+        <w:t xml:space="preserve"> - უკანასკნელად იქნა გადამოწმებული - 04.07.2026</w:t>
+      </w:r>
+      <w:r>
+        <w:rPr>
+          <w:rFonts w:ascii="Sylfaen" w:hAnsi="Sylfaen" w:cs="Sylfaen"/>
           <w:b w:val="0"/>
           <w:sz w:val="22"/>
           <w:lang w:val="en-US"/>
@@ -6973,7 +6975,7 @@
           <w:rPr>
             <w:rStyle w:val="Hyperlink"/>
             <w:rFonts w:ascii="Sylfaen" w:hAnsi="Sylfaen" w:cs="Sylfaen"/>
-            <w:color w:val="0563C1"/>
+            <w:color w:val="467886"/>
             <w:sz w:val="22"/>
             <w:u w:val="single"/>
             <w:lang w:val="en-US"/>
@@ -6984,6 +6986,14 @@
       <w:r>
         <w:rPr>
           <w:rFonts w:ascii="Sylfaen" w:hAnsi="Sylfaen" w:cs="Sylfaen"/>
+          <w:sz w:val="22"/>
+          <w:lang w:val="ka-GE"/>
+        </w:rPr>
+        <w:t xml:space="preserve"> - უკანასკნელად იქნა გადამოწმებული - 04.07.2026</w:t>
+      </w:r>
+      <w:r>
+        <w:rPr>
+          <w:rFonts w:ascii="Sylfaen" w:hAnsi="Sylfaen" w:cs="Sylfaen"/>
           <w:b w:val="0"/>
           <w:sz w:val="22"/>
           <w:lang w:val="en-US"/>
@@ -7009,7 +7019,7 @@
           <w:rPr>
             <w:rStyle w:val="Hyperlink"/>
             <w:rFonts w:ascii="Sylfaen" w:hAnsi="Sylfaen" w:cs="Sylfaen"/>
-            <w:color w:val="0563C1"/>
+            <w:color w:val="467886"/>
             <w:sz w:val="22"/>
             <w:u w:val="single"/>
             <w:lang w:val="en-US"/>
@@ -7020,6 +7030,14 @@
       <w:r>
         <w:rPr>
           <w:rFonts w:ascii="Sylfaen" w:hAnsi="Sylfaen" w:cs="Sylfaen"/>
+          <w:sz w:val="22"/>
+          <w:lang w:val="ka-GE"/>
+        </w:rPr>
+        <w:t xml:space="preserve"> - უკანასკნელად იქნა გადამოწმებული - 04.07.2026</w:t>
+      </w:r>
+      <w:r>
+        <w:rPr>
+          <w:rFonts w:ascii="Sylfaen" w:hAnsi="Sylfaen" w:cs="Sylfaen"/>
           <w:b w:val="0"/>
           <w:sz w:val="22"/>
           <w:lang w:val="en-US"/>
@@ -7045,7 +7063,7 @@
           <w:rPr>
             <w:rStyle w:val="Hyperlink"/>
             <w:rFonts w:ascii="Sylfaen" w:hAnsi="Sylfaen" w:cs="Sylfaen"/>
-            <w:color w:val="0563C1"/>
+            <w:color w:val="467886"/>
             <w:sz w:val="22"/>
             <w:u w:val="single"/>
             <w:lang w:val="en-US"/>
@@ -7056,6 +7074,14 @@
       <w:r>
         <w:rPr>
           <w:rFonts w:ascii="Sylfaen" w:hAnsi="Sylfaen" w:cs="Sylfaen"/>
+          <w:sz w:val="22"/>
+          <w:lang w:val="ka-GE"/>
+        </w:rPr>
+        <w:t xml:space="preserve"> - უკანასკნელად იქნა გადამოწმებული - 04.07.2026</w:t>
+      </w:r>
+      <w:r>
+        <w:rPr>
+          <w:rFonts w:ascii="Sylfaen" w:hAnsi="Sylfaen" w:cs="Sylfaen"/>
           <w:b w:val="0"/>
           <w:sz w:val="22"/>
           <w:lang w:val="en-US"/>
@@ -7081,7 +7107,7 @@
           <w:rPr>
             <w:rStyle w:val="Hyperlink"/>
             <w:rFonts w:ascii="Sylfaen" w:hAnsi="Sylfaen" w:cs="Sylfaen"/>
-            <w:color w:val="0563C1"/>
+            <w:color w:val="467886"/>
             <w:sz w:val="22"/>
             <w:u w:val="single"/>
             <w:lang w:val="en-US"/>
@@ -7092,6 +7118,14 @@
       <w:r>
         <w:rPr>
           <w:rFonts w:ascii="Sylfaen" w:hAnsi="Sylfaen" w:cs="Sylfaen"/>
+          <w:sz w:val="22"/>
+          <w:lang w:val="ka-GE"/>
+        </w:rPr>
+        <w:t xml:space="preserve"> - უკანასკნელად იქნა გადამოწმებული - 04.07.2026</w:t>
+      </w:r>
+      <w:r>
+        <w:rPr>
+          <w:rFonts w:ascii="Sylfaen" w:hAnsi="Sylfaen" w:cs="Sylfaen"/>
           <w:b w:val="0"/>
           <w:sz w:val="22"/>
           <w:lang w:val="en-US"/>
@@ -7117,7 +7151,7 @@
           <w:rPr>
             <w:rStyle w:val="Hyperlink"/>
             <w:rFonts w:ascii="Sylfaen" w:hAnsi="Sylfaen" w:cs="Sylfaen"/>
-            <w:color w:val="0563C1"/>
+            <w:color w:val="467886"/>
             <w:sz w:val="22"/>
             <w:u w:val="single"/>
             <w:lang w:val="en-US"/>
@@ -7128,6 +7162,14 @@
       <w:r>
         <w:rPr>
           <w:rFonts w:ascii="Sylfaen" w:hAnsi="Sylfaen" w:cs="Sylfaen"/>
+          <w:sz w:val="22"/>
+          <w:lang w:val="ka-GE"/>
+        </w:rPr>
+        <w:t xml:space="preserve"> - უკანასკნელად იქნა გადამოწმებული - 04.07.2026</w:t>
+      </w:r>
+      <w:r>
+        <w:rPr>
+          <w:rFonts w:ascii="Sylfaen" w:hAnsi="Sylfaen" w:cs="Sylfaen"/>
           <w:b w:val="0"/>
           <w:sz w:val="22"/>
           <w:lang w:val="en-US"/>
@@ -7153,7 +7195,7 @@
           <w:rPr>
             <w:rStyle w:val="Hyperlink"/>
             <w:rFonts w:ascii="Sylfaen" w:hAnsi="Sylfaen" w:cs="Sylfaen"/>
-            <w:color w:val="0563C1"/>
+            <w:color w:val="467886"/>
             <w:sz w:val="22"/>
             <w:u w:val="single"/>
             <w:lang w:val="en-US"/>
@@ -7164,6 +7206,14 @@
       <w:r>
         <w:rPr>
           <w:rFonts w:ascii="Sylfaen" w:hAnsi="Sylfaen" w:cs="Sylfaen"/>
+          <w:sz w:val="22"/>
+          <w:lang w:val="ka-GE"/>
+        </w:rPr>
+        <w:t xml:space="preserve"> - უკანასკნელად იქნა გადამოწმებული - 04.07.2026</w:t>
+      </w:r>
+      <w:r>
+        <w:rPr>
+          <w:rFonts w:ascii="Sylfaen" w:hAnsi="Sylfaen" w:cs="Sylfaen"/>
           <w:b w:val="0"/>
           <w:sz w:val="22"/>
           <w:lang w:val="en-US"/>
@@ -7189,7 +7239,7 @@
           <w:rPr>
             <w:rStyle w:val="Hyperlink"/>
             <w:rFonts w:ascii="Sylfaen" w:hAnsi="Sylfaen" w:cs="Sylfaen"/>
-            <w:color w:val="0563C1"/>
+            <w:color w:val="467886"/>
             <w:sz w:val="22"/>
             <w:u w:val="single"/>
             <w:lang w:val="en-US"/>
@@ -7200,6 +7250,14 @@
       <w:r>
         <w:rPr>
           <w:rFonts w:ascii="Sylfaen" w:hAnsi="Sylfaen" w:cs="Sylfaen"/>
+          <w:sz w:val="22"/>
+          <w:lang w:val="ka-GE"/>
+        </w:rPr>
+        <w:t xml:space="preserve"> - უკანასკნელად იქნა გადამოწმებული - 04.07.2026</w:t>
+      </w:r>
+      <w:r>
+        <w:rPr>
+          <w:rFonts w:ascii="Sylfaen" w:hAnsi="Sylfaen" w:cs="Sylfaen"/>
           <w:b w:val="0"/>
           <w:sz w:val="22"/>
           <w:lang w:val="en-US"/>
@@ -7225,7 +7283,7 @@
           <w:rPr>
             <w:rStyle w:val="Hyperlink"/>
             <w:rFonts w:ascii="Sylfaen" w:hAnsi="Sylfaen" w:cs="Sylfaen"/>
-            <w:color w:val="0563C1"/>
+            <w:color w:val="467886"/>
             <w:sz w:val="22"/>
             <w:u w:val="single"/>
             <w:lang w:val="en-US"/>
@@ -7236,6 +7294,14 @@
       <w:r>
         <w:rPr>
           <w:rFonts w:ascii="Sylfaen" w:hAnsi="Sylfaen" w:cs="Sylfaen"/>
+          <w:sz w:val="22"/>
+          <w:lang w:val="ka-GE"/>
+        </w:rPr>
+        <w:t xml:space="preserve"> - უკანასკნელად იქნა გადამოწმებული - 04.07.2026</w:t>
+      </w:r>
+      <w:r>
+        <w:rPr>
+          <w:rFonts w:ascii="Sylfaen" w:hAnsi="Sylfaen" w:cs="Sylfaen"/>
           <w:b w:val="0"/>
           <w:sz w:val="22"/>
           <w:lang w:val="en-US"/>
@@ -7261,7 +7327,7 @@
           <w:rPr>
             <w:rStyle w:val="Hyperlink"/>
             <w:rFonts w:ascii="Sylfaen" w:hAnsi="Sylfaen" w:cs="Sylfaen"/>
-            <w:color w:val="0563C1"/>
+            <w:color w:val="467886"/>
             <w:sz w:val="22"/>
             <w:u w:val="single"/>
             <w:lang w:val="en-US"/>
@@ -7272,6 +7338,14 @@
       <w:r>
         <w:rPr>
           <w:rFonts w:ascii="Sylfaen" w:hAnsi="Sylfaen" w:cs="Sylfaen"/>
+          <w:sz w:val="22"/>
+          <w:lang w:val="ka-GE"/>
+        </w:rPr>
+        <w:t xml:space="preserve"> - უკანასკნელად იქნა გადამოწმებული - 04.07.2026</w:t>
+      </w:r>
+      <w:r>
+        <w:rPr>
+          <w:rFonts w:ascii="Sylfaen" w:hAnsi="Sylfaen" w:cs="Sylfaen"/>
           <w:b w:val="0"/>
           <w:sz w:val="22"/>
           <w:lang w:val="en-US"/>
@@ -7283,7 +7357,7 @@
           <w:rPr>
             <w:rStyle w:val="Hyperlink"/>
             <w:rFonts w:ascii="Sylfaen" w:hAnsi="Sylfaen" w:cs="Sylfaen"/>
-            <w:color w:val="0563C1"/>
+            <w:color w:val="467886"/>
             <w:sz w:val="22"/>
             <w:u w:val="single"/>
             <w:lang w:val="en-US"/>
@@ -7294,6 +7368,14 @@
       <w:r>
         <w:rPr>
           <w:rFonts w:ascii="Sylfaen" w:hAnsi="Sylfaen" w:cs="Sylfaen"/>
+          <w:sz w:val="22"/>
+          <w:lang w:val="ka-GE"/>
+        </w:rPr>
+        <w:t xml:space="preserve"> - უკანასკნელად იქნა გადამოწმებული - 04.07.2026</w:t>
+      </w:r>
+      <w:r>
+        <w:rPr>
+          <w:rFonts w:ascii="Sylfaen" w:hAnsi="Sylfaen" w:cs="Sylfaen"/>
           <w:b w:val="0"/>
           <w:sz w:val="22"/>
           <w:lang w:val="en-US"/>
@@ -7319,7 +7401,7 @@
           <w:rPr>
             <w:rStyle w:val="Hyperlink"/>
             <w:rFonts w:ascii="Sylfaen" w:hAnsi="Sylfaen" w:cs="Sylfaen"/>
-            <w:color w:val="0563C1"/>
+            <w:color w:val="467886"/>
             <w:sz w:val="22"/>
             <w:u w:val="single"/>
             <w:lang w:val="en-US"/>
@@ -7330,6 +7412,14 @@
       <w:r>
         <w:rPr>
           <w:rFonts w:ascii="Sylfaen" w:hAnsi="Sylfaen" w:cs="Sylfaen"/>
+          <w:sz w:val="22"/>
+          <w:lang w:val="ka-GE"/>
+        </w:rPr>
+        <w:t xml:space="preserve"> - უკანასკნელად იქნა გადამოწმებული - 04.07.2026</w:t>
+      </w:r>
+      <w:r>
+        <w:rPr>
+          <w:rFonts w:ascii="Sylfaen" w:hAnsi="Sylfaen" w:cs="Sylfaen"/>
           <w:b w:val="0"/>
           <w:sz w:val="22"/>
           <w:lang w:val="en-US"/>
@@ -7355,7 +7445,7 @@
           <w:rPr>
             <w:rStyle w:val="Hyperlink"/>
             <w:rFonts w:ascii="Sylfaen" w:hAnsi="Sylfaen" w:cs="Sylfaen"/>
-            <w:color w:val="0563C1"/>
+            <w:color w:val="467886"/>
             <w:sz w:val="22"/>
             <w:u w:val="single"/>
             <w:lang w:val="en-US"/>
@@ -7366,6 +7456,14 @@
       <w:r>
         <w:rPr>
           <w:rFonts w:ascii="Sylfaen" w:hAnsi="Sylfaen" w:cs="Sylfaen"/>
+          <w:sz w:val="22"/>
+          <w:lang w:val="ka-GE"/>
+        </w:rPr>
+        <w:t xml:space="preserve"> - უკანასკნელად იქნა გადამოწმებული - 04.07.2026</w:t>
+      </w:r>
+      <w:r>
+        <w:rPr>
+          <w:rFonts w:ascii="Sylfaen" w:hAnsi="Sylfaen" w:cs="Sylfaen"/>
           <w:b w:val="0"/>
           <w:sz w:val="22"/>
           <w:lang w:val="en-US"/>
@@ -7391,7 +7489,7 @@
           <w:rPr>
             <w:rStyle w:val="Hyperlink"/>
             <w:rFonts w:ascii="Sylfaen" w:hAnsi="Sylfaen" w:cs="Sylfaen"/>
-            <w:color w:val="0563C1"/>
+            <w:color w:val="467886"/>
             <w:sz w:val="22"/>
             <w:u w:val="single"/>
             <w:lang w:val="en-US"/>
@@ -7402,6 +7500,14 @@
       <w:r>
         <w:rPr>
           <w:rFonts w:ascii="Sylfaen" w:hAnsi="Sylfaen" w:cs="Sylfaen"/>
+          <w:sz w:val="22"/>
+          <w:lang w:val="ka-GE"/>
+        </w:rPr>
+        <w:t xml:space="preserve"> - უკანასკნელად იქნა გადამოწმებული - 04.07.2026</w:t>
+      </w:r>
+      <w:r>
+        <w:rPr>
+          <w:rFonts w:ascii="Sylfaen" w:hAnsi="Sylfaen" w:cs="Sylfaen"/>
           <w:b w:val="0"/>
           <w:sz w:val="22"/>
           <w:lang w:val="en-US"/>
@@ -7427,7 +7533,7 @@
           <w:rPr>
             <w:rStyle w:val="Hyperlink"/>
             <w:rFonts w:ascii="Sylfaen" w:hAnsi="Sylfaen" w:cs="Sylfaen"/>
-            <w:color w:val="0563C1"/>
+            <w:color w:val="467886"/>
             <w:sz w:val="22"/>
             <w:u w:val="single"/>
             <w:lang w:val="en-US"/>
@@ -7438,6 +7544,14 @@
       <w:r>
         <w:rPr>
           <w:rFonts w:ascii="Sylfaen" w:hAnsi="Sylfaen" w:cs="Sylfaen"/>
+          <w:sz w:val="22"/>
+          <w:lang w:val="ka-GE"/>
+        </w:rPr>
+        <w:t xml:space="preserve"> - უკანასკნელად იქნა გადამოწმებული - 04.07.2026</w:t>
+      </w:r>
+      <w:r>
+        <w:rPr>
+          <w:rFonts w:ascii="Sylfaen" w:hAnsi="Sylfaen" w:cs="Sylfaen"/>
           <w:b w:val="0"/>
           <w:sz w:val="22"/>
           <w:lang w:val="en-US"/>
@@ -7547,7 +7661,7 @@
           <w:rPr>
             <w:rStyle w:val="Hyperlink"/>
             <w:rFonts w:ascii="Sylfaen" w:hAnsi="Sylfaen" w:cs="Sylfaen"/>
-            <w:color w:val="0563C1"/>
+            <w:color w:val="467886"/>
             <w:sz w:val="22"/>
             <w:u w:val="single"/>
             <w:lang w:val="en-US"/>
@@ -7558,6 +7672,14 @@
       <w:r>
         <w:rPr>
           <w:rFonts w:ascii="Sylfaen" w:hAnsi="Sylfaen" w:cs="Sylfaen"/>
+          <w:sz w:val="22"/>
+          <w:lang w:val="ka-GE"/>
+        </w:rPr>
+        <w:t xml:space="preserve"> - უკანასკნელად იქნა გადამოწმებული - 04.07.2026</w:t>
+      </w:r>
+      <w:r>
+        <w:rPr>
+          <w:rFonts w:ascii="Sylfaen" w:hAnsi="Sylfaen" w:cs="Sylfaen"/>
           <w:b w:val="0"/>
           <w:sz w:val="22"/>
           <w:lang w:val="en-US"/>
@@ -7583,7 +7705,7 @@
           <w:rPr>
             <w:rStyle w:val="Hyperlink"/>
             <w:rFonts w:ascii="Sylfaen" w:hAnsi="Sylfaen" w:cs="Sylfaen"/>
-            <w:color w:val="0563C1"/>
+            <w:color w:val="467886"/>
             <w:sz w:val="22"/>
             <w:u w:val="single"/>
             <w:lang w:val="en-US"/>
@@ -7594,6 +7716,14 @@
       <w:r>
         <w:rPr>
           <w:rFonts w:ascii="Sylfaen" w:hAnsi="Sylfaen" w:cs="Sylfaen"/>
+          <w:sz w:val="22"/>
+          <w:lang w:val="ka-GE"/>
+        </w:rPr>
+        <w:t xml:space="preserve"> - უკანასკნელად იქნა გადამოწმებული - 04.07.2026</w:t>
+      </w:r>
+      <w:r>
+        <w:rPr>
+          <w:rFonts w:ascii="Sylfaen" w:hAnsi="Sylfaen" w:cs="Sylfaen"/>
           <w:b w:val="0"/>
           <w:sz w:val="22"/>
           <w:lang w:val="en-US"/>
@@ -7619,7 +7749,7 @@
           <w:rPr>
             <w:rStyle w:val="Hyperlink"/>
             <w:rFonts w:ascii="Sylfaen" w:hAnsi="Sylfaen" w:cs="Sylfaen"/>
-            <w:color w:val="0563C1"/>
+            <w:color w:val="467886"/>
             <w:sz w:val="22"/>
             <w:u w:val="single"/>
             <w:lang w:val="en-US"/>
@@ -7630,6 +7760,14 @@
       <w:r>
         <w:rPr>
           <w:rFonts w:ascii="Sylfaen" w:hAnsi="Sylfaen" w:cs="Sylfaen"/>
+          <w:sz w:val="22"/>
+          <w:lang w:val="ka-GE"/>
+        </w:rPr>
+        <w:t xml:space="preserve"> - უკანასკნელად იქნა გადამოწმებული - 04.07.2026</w:t>
+      </w:r>
+      <w:r>
+        <w:rPr>
+          <w:rFonts w:ascii="Sylfaen" w:hAnsi="Sylfaen" w:cs="Sylfaen"/>
           <w:b w:val="0"/>
           <w:sz w:val="22"/>
           <w:lang w:val="en-US"/>
@@ -7655,7 +7793,7 @@
           <w:rPr>
             <w:rStyle w:val="Hyperlink"/>
             <w:rFonts w:ascii="Sylfaen" w:hAnsi="Sylfaen" w:cs="Sylfaen"/>
-            <w:color w:val="0563C1"/>
+            <w:color w:val="467886"/>
             <w:sz w:val="22"/>
             <w:u w:val="single"/>
             <w:lang w:val="en-US"/>
@@ -7666,6 +7804,14 @@
       <w:r>
         <w:rPr>
           <w:rFonts w:ascii="Sylfaen" w:hAnsi="Sylfaen" w:cs="Sylfaen"/>
+          <w:sz w:val="22"/>
+          <w:lang w:val="ka-GE"/>
+        </w:rPr>
+        <w:t xml:space="preserve"> - უკანასკნელად იქნა გადამოწმებული - 04.07.2026</w:t>
+      </w:r>
+      <w:r>
+        <w:rPr>
+          <w:rFonts w:ascii="Sylfaen" w:hAnsi="Sylfaen" w:cs="Sylfaen"/>
           <w:b w:val="0"/>
           <w:sz w:val="22"/>
           <w:lang w:val="en-US"/>
@@ -7705,7 +7851,7 @@
           <w:rPr>
             <w:rStyle w:val="Hyperlink"/>
             <w:rFonts w:ascii="Sylfaen" w:hAnsi="Sylfaen" w:cs="Sylfaen"/>
-            <w:color w:val="0563C1"/>
+            <w:color w:val="467886"/>
             <w:sz w:val="22"/>
             <w:u w:val="single"/>
             <w:lang w:val="en-US"/>
@@ -7716,6 +7862,14 @@
       <w:r>
         <w:rPr>
           <w:rFonts w:ascii="Sylfaen" w:hAnsi="Sylfaen" w:cs="Sylfaen"/>
+          <w:sz w:val="22"/>
+          <w:lang w:val="ka-GE"/>
+        </w:rPr>
+        <w:t xml:space="preserve"> - უკანასკნელად იქნა გადამოწმებული - 04.07.2026</w:t>
+      </w:r>
+      <w:r>
+        <w:rPr>
+          <w:rFonts w:ascii="Sylfaen" w:hAnsi="Sylfaen" w:cs="Sylfaen"/>
           <w:b w:val="0"/>
           <w:sz w:val="22"/>
           <w:lang w:val="en-US"/>
@@ -7741,7 +7895,7 @@
           <w:rPr>
             <w:rStyle w:val="Hyperlink"/>
             <w:rFonts w:ascii="Sylfaen" w:hAnsi="Sylfaen" w:cs="Sylfaen"/>
-            <w:color w:val="0563C1"/>
+            <w:color w:val="467886"/>
             <w:sz w:val="22"/>
             <w:u w:val="single"/>
             <w:lang w:val="en-US"/>
@@ -7752,6 +7906,14 @@
       <w:r>
         <w:rPr>
           <w:rFonts w:ascii="Sylfaen" w:hAnsi="Sylfaen" w:cs="Sylfaen"/>
+          <w:sz w:val="22"/>
+          <w:lang w:val="ka-GE"/>
+        </w:rPr>
+        <w:t xml:space="preserve"> - უკანასკნელად იქნა გადამოწმებული - 04.07.2026</w:t>
+      </w:r>
+      <w:r>
+        <w:rPr>
+          <w:rFonts w:ascii="Sylfaen" w:hAnsi="Sylfaen" w:cs="Sylfaen"/>
           <w:b w:val="0"/>
           <w:sz w:val="22"/>
           <w:lang w:val="en-US"/>
@@ -7777,7 +7939,7 @@
           <w:rPr>
             <w:rStyle w:val="Hyperlink"/>
             <w:rFonts w:ascii="Sylfaen" w:hAnsi="Sylfaen" w:cs="Sylfaen"/>
-            <w:color w:val="0563C1"/>
+            <w:color w:val="467886"/>
             <w:sz w:val="22"/>
             <w:u w:val="single"/>
             <w:lang w:val="en-US"/>
@@ -7788,6 +7950,14 @@
       <w:r>
         <w:rPr>
           <w:rFonts w:ascii="Sylfaen" w:hAnsi="Sylfaen" w:cs="Sylfaen"/>
+          <w:sz w:val="22"/>
+          <w:lang w:val="ka-GE"/>
+        </w:rPr>
+        <w:t xml:space="preserve"> - უკანასკნელად იქნა გადამოწმებული - 04.07.2026</w:t>
+      </w:r>
+      <w:r>
+        <w:rPr>
+          <w:rFonts w:ascii="Sylfaen" w:hAnsi="Sylfaen" w:cs="Sylfaen"/>
           <w:b w:val="0"/>
           <w:sz w:val="22"/>
           <w:lang w:val="en-US"/>
@@ -7841,7 +8011,7 @@
           <w:rPr>
             <w:rStyle w:val="Hyperlink"/>
             <w:rFonts w:ascii="Sylfaen" w:hAnsi="Sylfaen" w:cs="Sylfaen"/>
-            <w:color w:val="0563C1"/>
+            <w:color w:val="467886"/>
             <w:sz w:val="22"/>
             <w:u w:val="single"/>
             <w:lang w:val="en-US"/>
@@ -7852,6 +8022,14 @@
       <w:r>
         <w:rPr>
           <w:rFonts w:ascii="Sylfaen" w:hAnsi="Sylfaen" w:cs="Sylfaen"/>
+          <w:sz w:val="22"/>
+          <w:lang w:val="ka-GE"/>
+        </w:rPr>
+        <w:t xml:space="preserve"> - უკანასკნელად იქნა გადამოწმებული - 04.07.2026</w:t>
+      </w:r>
+      <w:r>
+        <w:rPr>
+          <w:rFonts w:ascii="Sylfaen" w:hAnsi="Sylfaen" w:cs="Sylfaen"/>
           <w:b w:val="0"/>
           <w:sz w:val="22"/>
           <w:lang w:val="en-US"/>
@@ -7877,7 +8055,7 @@
           <w:rPr>
             <w:rStyle w:val="Hyperlink"/>
             <w:rFonts w:ascii="Sylfaen" w:hAnsi="Sylfaen" w:cs="Sylfaen"/>
-            <w:color w:val="0563C1"/>
+            <w:color w:val="467886"/>
             <w:sz w:val="22"/>
             <w:u w:val="single"/>
             <w:lang w:val="en-US"/>
@@ -7885,6 +8063,14 @@
           <w:t xml:space="preserve">arXiv:2107.07567</w:t>
         </w:r>
       </w:hyperlink>
+      <w:r>
+        <w:rPr>
+          <w:rFonts w:ascii="Sylfaen" w:hAnsi="Sylfaen" w:cs="Sylfaen"/>
+          <w:sz w:val="22"/>
+          <w:lang w:val="ka-GE"/>
+        </w:rPr>
+        <w:t xml:space="preserve"> - უკანასკნელად იქნა გადამოწმებული - 04.07.2026</w:t>
+      </w:r>
       <w:r>
         <w:rPr>
           <w:rFonts w:ascii="Sylfaen" w:hAnsi="Sylfaen" w:cs="Sylfaen"/>

</xml_diff>

<commit_message>
style(thesis): show full URLs in bibliography links (match reference)
- LINK_STYLE='url': display the full https://arxiv.org|doi.org address as
  the clickable text instead of the arXiv:id / doi: label
- DOI_RE now swallows an optional "doi:" prefix, so DOI links render as a
  clean https://doi.org/… with no leftover "doi:" before them
- regenerated thesis-ka.docx: 27 links, 0 leftover labels, color+notes kept

Co-Authored-By: Claude Opus 4.8 (1M context) <noreply@anthropic.com>
</commit_message>
<xml_diff>
--- a/project/thesis-ka.docx
+++ b/project/thesis-ka.docx
@@ -6804,7 +6804,7 @@
             <w:u w:val="single"/>
             <w:lang w:val="en-US"/>
           </w:rPr>
-          <w:t xml:space="preserve">arXiv:2402.17753</w:t>
+          <w:t xml:space="preserve">https://arxiv.org/abs/2402.17753</w:t>
         </w:r>
       </w:hyperlink>
       <w:r>
@@ -6848,7 +6848,7 @@
             <w:u w:val="single"/>
             <w:lang w:val="en-US"/>
           </w:rPr>
-          <w:t xml:space="preserve">arXiv:2410.10813</w:t>
+          <w:t xml:space="preserve">https://arxiv.org/abs/2410.10813</w:t>
         </w:r>
       </w:hyperlink>
       <w:r>
@@ -6892,7 +6892,7 @@
             <w:u w:val="single"/>
             <w:lang w:val="en-US"/>
           </w:rPr>
-          <w:t xml:space="preserve">arXiv:2307.15810</w:t>
+          <w:t xml:space="preserve">https://arxiv.org/abs/2307.15810</w:t>
         </w:r>
       </w:hyperlink>
       <w:r>
@@ -6936,7 +6936,7 @@
             <w:u w:val="single"/>
             <w:lang w:val="en-US"/>
           </w:rPr>
-          <w:t xml:space="preserve">arXiv:2412.14190</w:t>
+          <w:t xml:space="preserve">https://arxiv.org/abs/2412.14190</w:t>
         </w:r>
       </w:hyperlink>
       <w:r>
@@ -6980,7 +6980,7 @@
             <w:u w:val="single"/>
             <w:lang w:val="en-US"/>
           </w:rPr>
-          <w:t xml:space="preserve">arXiv:2506.12605</w:t>
+          <w:t xml:space="preserve">https://arxiv.org/abs/2506.12605</w:t>
         </w:r>
       </w:hyperlink>
       <w:r>
@@ -7024,7 +7024,7 @@
             <w:u w:val="single"/>
             <w:lang w:val="en-US"/>
           </w:rPr>
-          <w:t xml:space="preserve">arXiv:2305.10250</w:t>
+          <w:t xml:space="preserve">https://arxiv.org/abs/2305.10250</w:t>
         </w:r>
       </w:hyperlink>
       <w:r>
@@ -7068,7 +7068,7 @@
             <w:u w:val="single"/>
             <w:lang w:val="en-US"/>
           </w:rPr>
-          <w:t xml:space="preserve">arXiv:2405.14831</w:t>
+          <w:t xml:space="preserve">https://arxiv.org/abs/2405.14831</w:t>
         </w:r>
       </w:hyperlink>
       <w:r>
@@ -7112,7 +7112,7 @@
             <w:u w:val="single"/>
             <w:lang w:val="en-US"/>
           </w:rPr>
-          <w:t xml:space="preserve">arXiv:2407.09450</w:t>
+          <w:t xml:space="preserve">https://arxiv.org/abs/2407.09450</w:t>
         </w:r>
       </w:hyperlink>
       <w:r>
@@ -7156,7 +7156,7 @@
             <w:u w:val="single"/>
             <w:lang w:val="en-US"/>
           </w:rPr>
-          <w:t xml:space="preserve">arXiv:2402.09727</w:t>
+          <w:t xml:space="preserve">https://arxiv.org/abs/2402.09727</w:t>
         </w:r>
       </w:hyperlink>
       <w:r>
@@ -7200,7 +7200,7 @@
             <w:u w:val="single"/>
             <w:lang w:val="en-US"/>
           </w:rPr>
-          <w:t xml:space="preserve">arXiv:2304.03442</w:t>
+          <w:t xml:space="preserve">https://arxiv.org/abs/2304.03442</w:t>
         </w:r>
       </w:hyperlink>
       <w:r>
@@ -7244,7 +7244,7 @@
             <w:u w:val="single"/>
             <w:lang w:val="en-US"/>
           </w:rPr>
-          <w:t xml:space="preserve">arXiv:2308.04879</w:t>
+          <w:t xml:space="preserve">https://arxiv.org/abs/2308.04879</w:t>
         </w:r>
       </w:hyperlink>
       <w:r>
@@ -7288,7 +7288,7 @@
             <w:u w:val="single"/>
             <w:lang w:val="en-US"/>
           </w:rPr>
-          <w:t xml:space="preserve">arXiv:2407.18064</w:t>
+          <w:t xml:space="preserve">https://arxiv.org/abs/2407.18064</w:t>
         </w:r>
       </w:hyperlink>
       <w:r>
@@ -7320,7 +7320,7 @@
           <w:sz w:val="22"/>
           <w:lang w:val="en-US"/>
         </w:rPr>
-        <w:t xml:space="preserve">[13] Liu X.B., Fang S., Shi W., Wu C.-S., Igarashi T., Chen X.A. Proactive Conversational Agents with Inner Thoughts. CHI 2025. doi:</w:t>
+        <w:t xml:space="preserve">[13] Liu X.B., Fang S., Shi W., Wu C.-S., Igarashi T., Chen X.A. Proactive Conversational Agents with Inner Thoughts. CHI 2025. </w:t>
       </w:r>
       <w:hyperlink r:id="rId24">
         <w:r>
@@ -7332,7 +7332,7 @@
             <w:u w:val="single"/>
             <w:lang w:val="en-US"/>
           </w:rPr>
-          <w:t xml:space="preserve">10.1145/3706598.3713760</w:t>
+          <w:t xml:space="preserve">https://doi.org/10.1145/3706598.3713760</w:t>
         </w:r>
       </w:hyperlink>
       <w:r>
@@ -7362,7 +7362,7 @@
             <w:u w:val="single"/>
             <w:lang w:val="en-US"/>
           </w:rPr>
-          <w:t xml:space="preserve">arXiv:2501.00383</w:t>
+          <w:t xml:space="preserve">https://arxiv.org/abs/2501.00383</w:t>
         </w:r>
       </w:hyperlink>
       <w:r>
@@ -7394,7 +7394,7 @@
           <w:sz w:val="22"/>
           <w:lang w:val="en-US"/>
         </w:rPr>
-        <w:t xml:space="preserve">[14] Fitrianie S., Bruijnes M., Abdulrahman A., Brinkman W.-P. The Artificial Social Agent Questionnaire (ASAQ) — Development and evaluation of a validated instrument for capturing human interaction experiences with artificial social agents. International Journal of Human-Computer Studies, vol. 199, art. 103482, 2025. doi:</w:t>
+        <w:t xml:space="preserve">[14] Fitrianie S., Bruijnes M., Abdulrahman A., Brinkman W.-P. The Artificial Social Agent Questionnaire (ASAQ) — Development and evaluation of a validated instrument for capturing human interaction experiences with artificial social agents. International Journal of Human-Computer Studies, vol. 199, art. 103482, 2025. </w:t>
       </w:r>
       <w:hyperlink r:id="rId26">
         <w:r>
@@ -7406,7 +7406,7 @@
             <w:u w:val="single"/>
             <w:lang w:val="en-US"/>
           </w:rPr>
-          <w:t xml:space="preserve">10.1016/j.ijhcs.2025.103482</w:t>
+          <w:t xml:space="preserve">https://doi.org/10.1016/j.ijhcs.2025.103482</w:t>
         </w:r>
       </w:hyperlink>
       <w:r>
@@ -7450,7 +7450,7 @@
             <w:u w:val="single"/>
             <w:lang w:val="en-US"/>
           </w:rPr>
-          <w:t xml:space="preserve">arXiv:2503.17473</w:t>
+          <w:t xml:space="preserve">https://arxiv.org/abs/2503.17473</w:t>
         </w:r>
       </w:hyperlink>
       <w:r>
@@ -7494,7 +7494,7 @@
             <w:u w:val="single"/>
             <w:lang w:val="en-US"/>
           </w:rPr>
-          <w:t xml:space="preserve">arXiv:2504.15965</w:t>
+          <w:t xml:space="preserve">https://arxiv.org/abs/2504.15965</w:t>
         </w:r>
       </w:hyperlink>
       <w:r>
@@ -7538,7 +7538,7 @@
             <w:u w:val="single"/>
             <w:lang w:val="en-US"/>
           </w:rPr>
-          <w:t xml:space="preserve">arXiv:2310.08560</w:t>
+          <w:t xml:space="preserve">https://arxiv.org/abs/2310.08560</w:t>
         </w:r>
       </w:hyperlink>
       <w:r>
@@ -7654,7 +7654,7 @@
           <w:sz w:val="22"/>
           <w:lang w:val="en-US"/>
         </w:rPr>
-        <w:t xml:space="preserve">[24] Reyna V.F., Brainerd C.J. Fuzzy-trace theory: An interim synthesis. Learning and Individual Differences, 7(1), 1–75, 1995. doi:</w:t>
+        <w:t xml:space="preserve">[24] Reyna V.F., Brainerd C.J. Fuzzy-trace theory: An interim synthesis. Learning and Individual Differences, 7(1), 1–75, 1995. </w:t>
       </w:r>
       <w:hyperlink r:id="rId30">
         <w:r>
@@ -7666,7 +7666,7 @@
             <w:u w:val="single"/>
             <w:lang w:val="en-US"/>
           </w:rPr>
-          <w:t xml:space="preserve">10.1016/1041-6080(95)90031-4</w:t>
+          <w:t xml:space="preserve">https://doi.org/10.1016/1041-6080(95)90031-4</w:t>
         </w:r>
       </w:hyperlink>
       <w:r>
@@ -7698,7 +7698,7 @@
           <w:sz w:val="22"/>
           <w:lang w:val="en-US"/>
         </w:rPr>
-        <w:t xml:space="preserve">[25] McClelland J.L., McNaughton B.L., O'Reilly R.C. Why there are complementary learning systems in the hippocampus and neocortex: insights from the successes and failures of connectionist models of learning and memory. Psychological Review, 102(3), 419–457, 1995. doi:</w:t>
+        <w:t xml:space="preserve">[25] McClelland J.L., McNaughton B.L., O'Reilly R.C. Why there are complementary learning systems in the hippocampus and neocortex: insights from the successes and failures of connectionist models of learning and memory. Psychological Review, 102(3), 419–457, 1995. </w:t>
       </w:r>
       <w:hyperlink r:id="rId31">
         <w:r>
@@ -7710,7 +7710,7 @@
             <w:u w:val="single"/>
             <w:lang w:val="en-US"/>
           </w:rPr>
-          <w:t xml:space="preserve">10.1037/0033-295X.102.3.419</w:t>
+          <w:t xml:space="preserve">https://doi.org/10.1037/0033-295X.102.3.419</w:t>
         </w:r>
       </w:hyperlink>
       <w:r>
@@ -7742,7 +7742,7 @@
           <w:sz w:val="22"/>
           <w:lang w:val="en-US"/>
         </w:rPr>
-        <w:t xml:space="preserve">[26] Teyler T.J., DiScenna P. The hippocampal memory indexing theory. Behavioral Neuroscience, 100(2), 147–152, 1986. doi:</w:t>
+        <w:t xml:space="preserve">[26] Teyler T.J., DiScenna P. The hippocampal memory indexing theory. Behavioral Neuroscience, 100(2), 147–152, 1986. </w:t>
       </w:r>
       <w:hyperlink r:id="rId32">
         <w:r>
@@ -7754,7 +7754,7 @@
             <w:u w:val="single"/>
             <w:lang w:val="en-US"/>
           </w:rPr>
-          <w:t xml:space="preserve">10.1037/0735-7044.100.2.147</w:t>
+          <w:t xml:space="preserve">https://doi.org/10.1037/0735-7044.100.2.147</w:t>
         </w:r>
       </w:hyperlink>
       <w:r>
@@ -7798,7 +7798,7 @@
             <w:u w:val="single"/>
             <w:lang w:val="en-US"/>
           </w:rPr>
-          <w:t xml:space="preserve">arXiv:2502.12110</w:t>
+          <w:t xml:space="preserve">https://arxiv.org/abs/2502.12110</w:t>
         </w:r>
       </w:hyperlink>
       <w:r>
@@ -7856,7 +7856,7 @@
             <w:u w:val="single"/>
             <w:lang w:val="en-US"/>
           </w:rPr>
-          <w:t xml:space="preserve">arXiv:2504.19413</w:t>
+          <w:t xml:space="preserve">https://arxiv.org/abs/2504.19413</w:t>
         </w:r>
       </w:hyperlink>
       <w:r>
@@ -7900,7 +7900,7 @@
             <w:u w:val="single"/>
             <w:lang w:val="en-US"/>
           </w:rPr>
-          <w:t xml:space="preserve">arXiv:2501.13956</w:t>
+          <w:t xml:space="preserve">https://arxiv.org/abs/2501.13956</w:t>
         </w:r>
       </w:hyperlink>
       <w:r>
@@ -7932,7 +7932,7 @@
           <w:sz w:val="22"/>
           <w:lang w:val="en-US"/>
         </w:rPr>
-        <w:t xml:space="preserve">[31] Zacks J.M., Speer N.K., Swallow K.M., Braver T.S., Reynolds J.R. Event perception: A mind-brain perspective. Psychological Bulletin, 133(2), 273–293, 2007. doi:</w:t>
+        <w:t xml:space="preserve">[31] Zacks J.M., Speer N.K., Swallow K.M., Braver T.S., Reynolds J.R. Event perception: A mind-brain perspective. Psychological Bulletin, 133(2), 273–293, 2007. </w:t>
       </w:r>
       <w:hyperlink r:id="rId36">
         <w:r>
@@ -7944,7 +7944,7 @@
             <w:u w:val="single"/>
             <w:lang w:val="en-US"/>
           </w:rPr>
-          <w:t xml:space="preserve">10.1037/0033-2909.133.2.273</w:t>
+          <w:t xml:space="preserve">https://doi.org/10.1037/0033-2909.133.2.273</w:t>
         </w:r>
       </w:hyperlink>
       <w:r>
@@ -8004,7 +8004,7 @@
           <w:sz w:val="22"/>
           <w:lang w:val="en-US"/>
         </w:rPr>
-        <w:t xml:space="preserve">[34] Yan Z., Fischer J.E., Clos J. Remembering Things Makes Chatbots Sound Smarter, but Less Trustworthy — A Pilot Study. In: Proceedings of the 7th ACM Conference on Conversational User Interfaces (CUI '25), Art. 23, pp. 23:1–23:8, 2025. doi:</w:t>
+        <w:t xml:space="preserve">[34] Yan Z., Fischer J.E., Clos J. Remembering Things Makes Chatbots Sound Smarter, but Less Trustworthy — A Pilot Study. In: Proceedings of the 7th ACM Conference on Conversational User Interfaces (CUI '25), Art. 23, pp. 23:1–23:8, 2025. </w:t>
       </w:r>
       <w:hyperlink r:id="rId37">
         <w:r>
@@ -8016,7 +8016,7 @@
             <w:u w:val="single"/>
             <w:lang w:val="en-US"/>
           </w:rPr>
-          <w:t xml:space="preserve">10.1145/3719160.3737617</w:t>
+          <w:t xml:space="preserve">https://doi.org/10.1145/3719160.3737617</w:t>
         </w:r>
       </w:hyperlink>
       <w:r>
@@ -8060,7 +8060,7 @@
             <w:u w:val="single"/>
             <w:lang w:val="en-US"/>
           </w:rPr>
-          <w:t xml:space="preserve">arXiv:2107.07567</w:t>
+          <w:t xml:space="preserve">https://arxiv.org/abs/2107.07567</w:t>
         </w:r>
       </w:hyperlink>
       <w:r>

</xml_diff>

<commit_message>
fix(thesis): terminology corrections for glossary consistency
Applied via corrections.json (case-aware) + glossary.md; both editions rebuilt:
- სუბშკალა → სუბსკალა (scale)
- ინტერაქცია → ურთიერთქმედება (5×: genitive ×4, dat-plural ×1)
- user–agent alliance → მომხმარებლისა და ხელოვნური აგენტის ალიანსი
- behavioral signature: სიგნატურა → ქცევითი თავისებურება
- reproducible → განმეორებადი in glossary (term unused in running text)

Held on meaning grounds (not applied): social presence→ჩართულობა,
research preview→მიმოხილვა, mediated→კავშირდება.

Co-Authored-By: Claude Opus 4.8 (1M context) <noreply@anthropic.com>
</commit_message>
<xml_diff>
--- a/project/thesis-ka.docx
+++ b/project/thesis-ka.docx
@@ -2460,7 +2460,7 @@
           <w:sz w:val="24"/>
           <w:lang w:val="ka-GE"/>
         </w:rPr>
-        <w:t>•  მკ1: აძლიერებს თუ არა ადამიანის მეხსიერების თეორიებზე დაფუძნებული მეხსიერების არქიტექტურა აღქმულ სოციალურ თანდასწრებას, მომხმარებლისა და აგენტის ალიანსს და აღქმულ ადამიანურობას, სიტყვასიტყვითი მოგონების მიდგომასთან შედარებით?</w:t>
+        <w:t>•  მკ1: აძლიერებს თუ არა ადამიანის მეხსიერების თეორიებზე დაფუძნებული მეხსიერების არქიტექტურა აღქმულ სოციალურ თანდასწრებას, მომხმარებლისა და ხელოვნური აგენტის ალიანსს და აღქმულ ადამიანურობას, სიტყვასიტყვითი მოგონების მიდგომასთან შედარებით?</w:t>
       </w:r>
     </w:p>
     <w:p>
@@ -2474,7 +2474,7 @@
           <w:sz w:val="24"/>
           <w:lang w:val="ka-GE"/>
         </w:rPr>
-        <w:t>•  H1 (მთავარი): თეორიულად დასაბუთებული პროფილი (C) აღემატება სიტყვასიტყვით RAG-ს (B) სამივე ძირითადი კონსტრუქტის მიხედვით — სოციალური თანდასწრების, მომხმარებლისა და აგენტის ალიანსისა და აღქმული ადამიანურობის.</w:t>
+        <w:t>•  H1 (მთავარი): თეორიულად დასაბუთებული პროფილი (C) აღემატება სიტყვასიტყვით RAG-ს (B) სამივე ძირითადი კონსტრუქტის მიხედვით — სოციალური თანდასწრების, მომხმარებლისა და ხელოვნური აგენტის ალიანსისა და აღქმული ადამიანურობის.</w:t>
       </w:r>
     </w:p>
     <w:p>
@@ -2567,7 +2567,7 @@
           <w:sz w:val="24"/>
           <w:lang w:val="ka-GE"/>
         </w:rPr>
-        <w:t>პრობლემის აქტუალობა განისაზღვრება სამი ურთიერთდამოუკიდებელი ფაქტორით. პირველი — ინდუსტრიული: 2025–2026 წლებში წამყვანმა მომწოდებლებმა (OpenAI, Anthropic) ან დანერგეს ფონური მეხსიერების კონსოლიდაციის მექანიზმები კომერციულ პროდუქტებში, ან წარმოადგინეს ისინი, როგორც საჯარო კვლევითი წინასწარი ვერსიები [18, 19], რაც მიუთითებს, რომ გრძელვადიან მეხსიერებას თავად სფერო ცენტრალურ გადაუჭრელ პრობლემად მიიჩნევს. უფრო მეტიც, აღსანიშნავია, რომ ამ სისტემებს არ ახლავს რეცენზირებული პუბლიკაციები, რაც აკადემიური კვლევის საჭიროებას კიდევ უფრო მწვავეს ხდის. მეორე — სოციალური: საუბრებთან ადაპტირებულ სისტემებთან ხანგრძლივი, პირადი ურთიერთქმედება ფართოდ გავრცელებულ პრაქტიკად იქცა [5], რაც მეხსიერების აღქმითი ეფექტები სოციალურად მნიშვნელოვან საკითხად აქცევს. მესამე — მეთოდოლოგიური: ჩვენთვის ცნობილი გრძელვადიანი მეხსიერების ყველა ძირითადი საცდელი (benchmark) (LoCoMo, LongMemEval, MSC) შექმნილია ტექსტური მოდალობისთვის [1, 2, 35]; ხმოვანი ინტერაქციის პირობებში — სადაც პასუხის დაყოვნება რეალურ დროში მკაცრად შეზღუდულია — მეხსიერების არქიტექტურების ქცევა და მათი აღქმითი ეფექტები პრაქტიკულად გამოუკვლეველი რჩება.</w:t>
+        <w:t>პრობლემის აქტუალობა განისაზღვრება სამი ურთიერთდამოუკიდებელი ფაქტორით. პირველი — ინდუსტრიული: 2025–2026 წლებში წამყვანმა მომწოდებლებმა (OpenAI, Anthropic) ან დანერგეს ფონური მეხსიერების კონსოლიდაციის მექანიზმები კომერციულ პროდუქტებში, ან წარმოადგინეს ისინი, როგორც საჯარო კვლევითი წინასწარი ვერსიები [18, 19], რაც მიუთითებს, რომ გრძელვადიან მეხსიერებას თავად სფერო ცენტრალურ გადაუჭრელ პრობლემად მიიჩნევს. უფრო მეტიც, აღსანიშნავია, რომ ამ სისტემებს არ ახლავს რეცენზირებული პუბლიკაციები, რაც აკადემიური კვლევის საჭიროებას კიდევ უფრო მწვავეს ხდის. მეორე — სოციალური: საუბრებთან ადაპტირებულ სისტემებთან ხანგრძლივი, პირადი ურთიერთქმედება ფართოდ გავრცელებულ პრაქტიკად იქცა [5], რაც მეხსიერების აღქმითი ეფექტები სოციალურად მნიშვნელოვან საკითხად აქცევს. მესამე — მეთოდოლოგიური: ჩვენთვის ცნობილი გრძელვადიანი მეხსიერების ყველა ძირითადი საცდელი (benchmark) (LoCoMo, LongMemEval, MSC) შექმნილია ტექსტური მოდალობისთვის [1, 2, 35]; ხმოვანი ურთიერთქმედების პირობებში — სადაც პასუხის დაყოვნება რეალურ დროში მკაცრად შეზღუდულია — მეხსიერების არქიტექტურების ქცევა და მათი აღქმითი ეფექტები პრაქტიკულად გამოუკვლეველი რჩება.</w:t>
       </w:r>
     </w:p>
     <w:p>
@@ -2795,7 +2795,7 @@
           <w:sz w:val="24"/>
           <w:lang w:val="ka-GE"/>
         </w:rPr>
-        <w:t>მრავალსაცავიანი მოდელი. ატკინსონისა და შიფრინის [20] მიხედვით, მეხსიერება წარმოადგენს სამი საწყობის — სენსორული, მოკლევადიანი და გრძელვადიანი — ჯაჭვს, რომლის გავლითაც კონტენტი გადაადგილდება მხოლოდ მაშინ, როდესაც მასზე კონტროლის პროცესები მოქმედებს; გამეორება გადამწყვეტი პროცესია, რომელიც ყურადღებით აღქმულ მასალას მდგრად საცავში გადააქვს, ხოლო ის, რაც გამეორების გარეშე რჩება, უბრალოდ ქრება. მისი ქცევითი სიგნატურა არის მკვეთრი ასიმეტრია იმას შორის, რაც უბრალოდ გაიგონა და იმას შორის, რასაც ყურადღება მიექცა და გაიმეორა — ამ პრინციპით შექმნილი პარტნიორი შეინარჩუნებდა ხაზგასმულ ან ხელახლა განხილულ ინფორმაციას და დაკარგავდა იმას, რაც ერთხელ და შეუმჩნევლად გაიარა.</w:t>
+        <w:t>მრავალსაცავიანი მოდელი. ატკინსონისა და შიფრინის [20] მიხედვით, მეხსიერება წარმოადგენს სამი საწყობის — სენსორული, მოკლევადიანი და გრძელვადიანი — ჯაჭვს, რომლის გავლითაც კონტენტი გადაადგილდება მხოლოდ მაშინ, როდესაც მასზე კონტროლის პროცესები მოქმედებს; გამეორება გადამწყვეტი პროცესია, რომელიც ყურადღებით აღქმულ მასალას მდგრად საცავში გადააქვს, ხოლო ის, რაც გამეორების გარეშე რჩება, უბრალოდ ქრება. მისი ქცევითი თავისებურება არის მკვეთრი ასიმეტრია იმას შორის, რაც უბრალოდ გაიგონა და იმას შორის, რასაც ყურადღება მიექცა და გაიმეორა — ამ პრინციპით შექმნილი პარტნიორი შეინარჩუნებდა ხაზგასმულ ან ხელახლა განხილულ ინფორმაციას და დაკარგავდა იმას, რაც ერთხელ და შეუმჩნევლად გაიარა.</w:t>
       </w:r>
     </w:p>
     <w:p>
@@ -2865,7 +2865,7 @@
           <w:sz w:val="24"/>
           <w:lang w:val="ka-GE"/>
         </w:rPr>
-        <w:t>კონსოლიდაცია: კომპლემენტარული სასწავლო სისტემები და ჰიპოკამპური ინდექსაცია. ორი ნეიროკოგნიტური თეორია აღწერს, თუ როგორ იქცევა ეპიზოდური გამოცდილება ხანგრძლივ ცოდნად. კომპლემენტარული სასწავლო სისტემების მიდგომის [25] თანახმად, ერთი სისტემა, რომელიც ჰიპოკამპუსზეა ცენტრირებული, ინდივიდუალურ ეპიზოდებს სწრაფად აღიქვამს, მაშინ როცა მეორე, კორტიკული სისტემა განმეორებად სტრუქტურას მხოლოდ ნელა აკონსოლიდებს, და ოფლაინ გამეორება გადატანას უზრუნველყოფს ჩაწერილ ინფორმაციას ამ ნელი საცავისკენ. ინდექსაციის თეორია [26] ამატებს, რომ ჰიპოკამპს არც კი სჭირდება მეხსიერების შენახვა — მას უბრალოდ აქვს მითითებები იმ კორტიკულ ნიმუშებზე, რომლებიც მათ ქმნიდა, ასე რომ, მინიშნების ფრაგმენტს შეუძლია მთლიანი მეხსიერების აღდგენა. ორივე მათგანი პროგნოზირებს ერთსა და იმავე მაღალი დონის ქცევით სიგნატურას — აგენტს, რომელიც ეპიზოდებს სწრაფად იმახსოვრებს, მაგრამ მათ ინტერაქციებს შორის პერიოდში სტრუქტურირებულ ცოდნად რეორგანიზებას ახდენს — და ორივეს, როგორც 2.4-შია ნაჩვენები, ჰყავს პირდაპირი გამოთვლითი შთამომავლები.</w:t>
+        <w:t>კონსოლიდაცია: კომპლემენტარული სასწავლო სისტემები და ჰიპოკამპური ინდექსაცია. ორი ნეიროკოგნიტური თეორია აღწერს, თუ როგორ იქცევა ეპიზოდური გამოცდილება ხანგრძლივ ცოდნად. კომპლემენტარული სასწავლო სისტემების მიდგომის [25] თანახმად, ერთი სისტემა, რომელიც ჰიპოკამპუსზეა ცენტრირებული, ინდივიდუალურ ეპიზოდებს სწრაფად აღიქვამს, მაშინ როცა მეორე, კორტიკული სისტემა განმეორებად სტრუქტურას მხოლოდ ნელა აკონსოლიდებს, და ოფლაინ გამეორება გადატანას უზრუნველყოფს ჩაწერილ ინფორმაციას ამ ნელი საცავისკენ. ინდექსაციის თეორია [26] ამატებს, რომ ჰიპოკამპს არც კი სჭირდება მეხსიერების შენახვა — მას უბრალოდ აქვს მითითებები იმ კორტიკულ ნიმუშებზე, რომლებიც მათ ქმნიდა, ასე რომ, მინიშნების ფრაგმენტს შეუძლია მთლიანი მეხსიერების აღდგენა. ორივე მათგანი პროგნოზირებს ერთსა და იმავე მაღალი დონის ქცევით თავისებურებას — აგენტს, რომელიც ეპიზოდებს სწრაფად იმახსოვრებს, მაგრამ მათ ურთიერთქმედებებს შორის პერიოდში სტრუქტურირებულ ცოდნად რეორგანიზებას ახდენს — და ორივეს, როგორც 2.4-შია ნაჩვენები, ჰყავს პირდაპირი გამოთვლითი შთამომავლები.</w:t>
       </w:r>
     </w:p>
     <w:p>
@@ -3058,7 +3058,7 @@
                 <w:sz w:val="22"/>
                 <w:lang w:val="ka-GE"/>
               </w:rPr>
-              <w:t>ქცევითი სიგნატურა</w:t>
+              <w:t>ქცევითი თავისებურება</w:t>
             </w:r>
           </w:p>
         </w:tc>
@@ -3547,7 +3547,7 @@
           <w:sz w:val="24"/>
           <w:lang w:val="ka-GE"/>
         </w:rPr>
-        <w:t>სისტემის აღქმა, როგორც უბრალო ასისტენტისა, ან როგორც თანამოსაუბრის, ნაკლებად არის დამოკიდებული სიზუსტეზე და მეტად — ურთიერთობაზე. ამ ურთიერთობის შესწავლა კი სხვა ლიტერატურის სფეროს განეკუთვნება, რომელიც ეფუძნება დაკვირვებას, რომ ადამიანები სოციალურად რეაგირებენ გამოთვლით აგენტებზე: პარადიგმას "კომპიუტერები სოციალური აქტორები არიან" და მის განმარტებას, რომ მედია, მრავალი სოციალური რეფლექსის თვალსაზრისით, რეალური ინტერაქციის პარტნიორების ეკვივალენტურია [28]. ამ ჩარჩოში, არაერთი უახლესი ნაშრომი იკვლევს, თუ რა კონკრეტულად განასხვავებს სისტემას, რომელიც მხოლოდ ასისტენტად აღიქმება, სისტემისგან, რომელიც ურთიერთობათა პარტნიორად აღიქმება; მეხსიერება აქ ცენტრალურ, ორმაგი მახვილის მქონე ბერკეტად განმეორდება.</w:t>
+        <w:t>სისტემის აღქმა, როგორც უბრალო ასისტენტისა, ან როგორც თანამოსაუბრის, ნაკლებად არის დამოკიდებული სიზუსტეზე და მეტად — ურთიერთობაზე. ამ ურთიერთობის შესწავლა კი სხვა ლიტერატურის სფეროს განეკუთვნება, რომელიც ეფუძნება დაკვირვებას, რომ ადამიანები სოციალურად რეაგირებენ გამოთვლით აგენტებზე: პარადიგმას "კომპიუტერები სოციალური აქტორები არიან" და მის განმარტებას, რომ მედია, მრავალი სოციალური რეფლექსის თვალსაზრისით, რეალური ურთიერთქმედების პარტნიორების ეკვივალენტურია [28]. ამ ჩარჩოში, არაერთი უახლესი ნაშრომი იკვლევს, თუ რა კონკრეტულად განასხვავებს სისტემას, რომელიც მხოლოდ ასისტენტად აღიქმება, სისტემისგან, რომელიც ურთიერთობათა პარტნიორად აღიქმება; მეხსიერება აქ ცენტრალურ, ორმაგი მახვილის მქონე ბერკეტად განმეორდება.</w:t>
       </w:r>
     </w:p>
     <w:p>
@@ -3603,7 +3603,7 @@
           <w:sz w:val="24"/>
           <w:lang w:val="ka-GE"/>
         </w:rPr>
-        <w:t>ამ აღქმების გასაზომად, სფერო გვთავაზობს ვალიდურ ინსტრუმენტებს. ხელოვნური სოციალური აგენტის კითხვარი [14] მოიცავს ცხრამეტ კონსტრუქტს — მათ შორის სოციალურ თანდასწრებას, მომხმარებლისა და აგენტის ალიანსს და სანდოობას (სუბშკალა, რომლითაც წინამდებარე ნაშრომი ოპერაციულად წარმოაჩენს აღქმულ ადამიანურობას) — გრძელი და მოკლე ვერსიებით და ღიად ხელმისაწვდომია; ეს არის მთავარი ინსტრუმენტი, რომელიც აქ არის გამოყენებული, დამატებულია დაკავშირებული კონსტრუქტებისთვის დადგენილი შკალებით (განსაკუთრებით Godspeed აღქმული ინტელექტისთვის).</w:t>
+        <w:t>ამ აღქმების გასაზომად, სფერო გვთავაზობს ვალიდურ ინსტრუმენტებს. ხელოვნური სოციალური აგენტის კითხვარი [14] მოიცავს ცხრამეტ კონსტრუქტს — მათ შორის სოციალურ თანდასწრებას, მომხმარებლისა და ხელოვნური აგენტის ალიანსს და სანდოობას (სუბსკალა, რომლითაც წინამდებარე ნაშრომი ოპერაციულად წარმოაჩენს აღქმულ ადამიანურობას) — გრძელი და მოკლე ვერსიებით და ღიად ხელმისაწვდომია; ეს არის მთავარი ინსტრუმენტი, რომელიც აქ არის გამოყენებული, დამატებულია დაკავშირებული კონსტრუქტებისთვის დადგენილი შკალებით (განსაკუთრებით Godspeed აღქმული ინტელექტისთვის).</w:t>
       </w:r>
     </w:p>
     <w:p>
@@ -3637,7 +3637,7 @@
           <w:sz w:val="24"/>
           <w:lang w:val="ka-GE"/>
         </w:rPr>
-        <w:t>განხილული ლიტერატურის სინთეზირებისას, ღია პრობლემები ორ ჯგუფად იყოფა. პირველი მათგანია ის შეზღუდვები, რომლებსაც სფერო თავად აღიარებს გადაუჭრელად: სელექციური დავიწყება, რომელიც სფეროს კვლევებმა [16] არაერთხელ დაასახელეს არსებითად, თუმცა თითქმის არ შეფასებულა და სისტემების უმეტესობაში მხოლოდ ტევადობის ლიმიტის გვერდითი ეფექტის სახით ვლინდება და არა დიზაინის მიზნით; დროითი მსჯელობა, რომელიც ყველა განხილულ ბენჩმარკში ყველაზე სუსტი კატეგორიაა, და შემოთავაზებული გამოსავალი ამ ზღვარს ამცირებს, მაგრამ არ ხურავს; და 2.5-ის ბენჩმარკების სანდოობის კრიზისი, რომელიც სფეროს უსანდოო, ნეიტრალური საზომის გარეშე ტოვებს. მეორე ჯგუფს მიეკუთვნება ორი ხარვეზი, რომლებიც პირდაპირ განაპირობებს ამ დისერტაციას. აქ განხილული მეხსიერების შესახებ არსებული ლიტერატურა მთლიანად ტექსტზეა ორიენტირებული: მეხსიერების არქიტექტურების ქცევა ხმოვანი ინტერაქციის შეფერხების ლიმიტების პირობებში და ამ მოდალობაში მათი აღქმითი ეფექტები, ფაქტობრივად, არ არის შესწავლილი. ხოლო არსებული აღქმის კვლევები მეხსიერებას იზოლირებულ ცვლადად განიხილავენ ერთ სისტემაში; არცერთი არ ადარებს სხვადასხვა მეხსიერების თეორიაზე დაფუძნებულ არქიტექტურებს იმის მიხედვით, თუ რას განიცდის ადამიანი.</w:t>
+        <w:t>განხილული ლიტერატურის სინთეზირებისას, ღია პრობლემები ორ ჯგუფად იყოფა. პირველი მათგანია ის შეზღუდვები, რომლებსაც სფერო თავად აღიარებს გადაუჭრელად: სელექციური დავიწყება, რომელიც სფეროს კვლევებმა [16] არაერთხელ დაასახელეს არსებითად, თუმცა თითქმის არ შეფასებულა და სისტემების უმეტესობაში მხოლოდ ტევადობის ლიმიტის გვერდითი ეფექტის სახით ვლინდება და არა დიზაინის მიზნით; დროითი მსჯელობა, რომელიც ყველა განხილულ ბენჩმარკში ყველაზე სუსტი კატეგორიაა, და შემოთავაზებული გამოსავალი ამ ზღვარს ამცირებს, მაგრამ არ ხურავს; და 2.5-ის ბენჩმარკების სანდოობის კრიზისი, რომელიც სფეროს უსანდოო, ნეიტრალური საზომის გარეშე ტოვებს. მეორე ჯგუფს მიეკუთვნება ორი ხარვეზი, რომლებიც პირდაპირ განაპირობებს ამ დისერტაციას. აქ განხილული მეხსიერების შესახებ არსებული ლიტერატურა მთლიანად ტექსტზეა ორიენტირებული: მეხსიერების არქიტექტურების ქცევა ხმოვანი ურთიერთქმედების შეფერხების ლიმიტების პირობებში და ამ მოდალობაში მათი აღქმითი ეფექტები, ფაქტობრივად, არ არის შესწავლილი. ხოლო არსებული აღქმის კვლევები მეხსიერებას იზოლირებულ ცვლადად განიხილავენ ერთ სისტემაში; არცერთი არ ადარებს სხვადასხვა მეხსიერების თეორიაზე დაფუძნებულ არქიტექტურებს იმის მიხედვით, თუ რას განიცდის ადამიანი.</w:t>
       </w:r>
     </w:p>
     <w:p>
@@ -3671,7 +3671,7 @@
           <w:sz w:val="24"/>
           <w:lang w:val="ka-GE"/>
         </w:rPr>
-        <w:t>ზემოთ განხილული ორი სფერო ერთიანდება იმ წერტილში, რომელიც ჩვენთვის ხელმისაწვდომ ლიტერატურაში ცარიელია. ერთი მხრივ, დიდი ენის მოდელების (LLM) მეხსიერების სისტემებიდან თითოეული ერთი კონკრეტული ადამიანის მეხსიერების თეორიის იმპლემენტაციაა, რომელიც შეფასებულია თითქმის ექსკლუზიურად ფაქტობრივი სიზუსტის მიხედვით. მეორე მხრივ, აღქმის კვლევების სერია ადასტურებს, რომ მეხსიერება აყალიბებს — და ასევე შეუძლია შეარყოს — ურთიერთობის აღქმული ხარისხი, მაგრამ მეხსიერებას განიხილავს როგორც ბინარულ ან ერთსისტემურ მანიპულაციას. ჩვენთვის ხელმისაწვდომ ლიტერატურაში — მეხსიერების არქიტექტურისა და ადამიანი-აგენტის აღქმის სფეროებში ჩატარებული სისტემური ძიებების შედეგად — ვერ მოიძებნა არცერთი კონტროლირებადი კვლევა, რომელიც სხვადასხვა ადამიანური მეხსიერების თეორიაზე დაფუძნებულ არქიტექტურებს ერთმანეთს ადარებდეს მომხმარებლის მიერ აღქმული სოციალური კონსტრუქტების მიხედვით და რომლის ობიექტიც ხმის მოდალობაა. წინამდებარე ნაშრომის სიახლე ამ შერწყმაშია — რეალურ ხმოვან სისტემაში თეორიულად დასაბუთებული მეხსიერების არქიტექტურების შედარება, მათი შეფასება აღქმული სოციალური თანდასწრების, ალიანსისა და ადამიანურობის მიხედვით — და არა რომელიმე ცალკეული კომპონენტის სიახლეში, რომელთაგან თითოეული იზოლირებულად არსებობს. იმის გასარკვევად, თუ რა არის ნათქვამი და რა — არა: კვლევა უცვლელად ტოვებს ინტერაქციის მოდალობას — მთლიანად ხმის რეჟიმი, ტექსტურ ნაწილს გარეშე — ამგვარად, მისი წვლილი ხმის გარემოში მეხსიერების არქიტექტურის ეფექტებს ეხება და არა ხმის ტექსტთან შედარებას. სწორედ ამ გადაკვეთას იკვლევს ნაშრომის დარჩენილი ნაწილი.</w:t>
+        <w:t>ზემოთ განხილული ორი სფერო ერთიანდება იმ წერტილში, რომელიც ჩვენთვის ხელმისაწვდომ ლიტერატურაში ცარიელია. ერთი მხრივ, დიდი ენის მოდელების (LLM) მეხსიერების სისტემებიდან თითოეული ერთი კონკრეტული ადამიანის მეხსიერების თეორიის იმპლემენტაციაა, რომელიც შეფასებულია თითქმის ექსკლუზიურად ფაქტობრივი სიზუსტის მიხედვით. მეორე მხრივ, აღქმის კვლევების სერია ადასტურებს, რომ მეხსიერება აყალიბებს — და ასევე შეუძლია შეარყოს — ურთიერთობის აღქმული ხარისხი, მაგრამ მეხსიერებას განიხილავს როგორც ბინარულ ან ერთსისტემურ მანიპულაციას. ჩვენთვის ხელმისაწვდომ ლიტერატურაში — მეხსიერების არქიტექტურისა და ადამიანი-აგენტის აღქმის სფეროებში ჩატარებული სისტემური ძიებების შედეგად — ვერ მოიძებნა არცერთი კონტროლირებადი კვლევა, რომელიც სხვადასხვა ადამიანური მეხსიერების თეორიაზე დაფუძნებულ არქიტექტურებს ერთმანეთს ადარებდეს მომხმარებლის მიერ აღქმული სოციალური კონსტრუქტების მიხედვით და რომლის ობიექტიც ხმის მოდალობაა. წინამდებარე ნაშრომის სიახლე ამ შერწყმაშია — რეალურ ხმოვან სისტემაში თეორიულად დასაბუთებული მეხსიერების არქიტექტურების შედარება, მათი შეფასება აღქმული სოციალური თანდასწრების, ალიანსისა და ადამიანურობის მიხედვით — და არა რომელიმე ცალკეული კომპონენტის სიახლეში, რომელთაგან თითოეული იზოლირებულად არსებობს. იმის გასარკვევად, თუ რა არის ნათქვამი და რა — არა: კვლევა უცვლელად ტოვებს ურთიერთქმედების მოდალობას — მთლიანად ხმის რეჟიმი, ტექსტურ ნაწილს გარეშე — ამგვარად, მისი წვლილი ხმის გარემოში მეხსიერების არქიტექტურის ეფექტებს ეხება და არა ხმის ტექსტთან შედარებას. სწორედ ამ გადაკვეთას იკვლევს ნაშრომის დარჩენილი ნაწილი.</w:t>
       </w:r>
     </w:p>
     <w:p>
@@ -4560,7 +4560,7 @@
           <w:sz w:val="24"/>
           <w:lang w:val="ka-GE"/>
         </w:rPr>
-        <w:t>•  მომხმარებლისა და აგენტის ალიანსი — კავშირის, მიზნებისა და ამოცანებზე ორიენტირებული სამუშაო ურთიერთობა, რომელიც შეიძლება შევავსოთ WAI-SR ადაპტაციით (იხ. 2.6);</w:t>
+        <w:t>•  მომხმარებლისა და ხელოვნური აგენტის ალიანსი — კავშირის, მიზნებისა და ამოცანებზე ორიენტირებული სამუშაო ურთიერთობა, რომელიც შეიძლება შევავსოთ WAI-SR ადაპტაციით (იხ. 2.6);</w:t>
       </w:r>
     </w:p>
     <w:p>
@@ -5803,17 +5803,17 @@
         <w:tblLook w:firstColumn="1" w:firstRow="1" w:lastColumn="0" w:lastRow="0" w:noHBand="0" w:noVBand="1" w:val="04A0"/>
       </w:tblPr>
       <w:tblGrid>
-        <w:gridCol w:w="4671"/>
-        <w:gridCol w:w="697"/>
-        <w:gridCol w:w="697"/>
-        <w:gridCol w:w="697"/>
-        <w:gridCol w:w="697"/>
-        <w:gridCol w:w="876"/>
+        <w:gridCol w:w="4956"/>
+        <w:gridCol w:w="668"/>
+        <w:gridCol w:w="668"/>
+        <w:gridCol w:w="668"/>
+        <w:gridCol w:w="668"/>
+        <w:gridCol w:w="708"/>
       </w:tblGrid>
       <w:tr>
         <w:tc>
           <w:tcPr>
-            <w:tcW w:type="dxa" w:w="4670"/>
+            <w:tcW w:type="dxa" w:w="4955"/>
           </w:tcPr>
           <w:p>
             <w:pPr>
@@ -5832,7 +5832,7 @@
         </w:tc>
         <w:tc>
           <w:tcPr>
-            <w:tcW w:type="dxa" w:w="697"/>
+            <w:tcW w:type="dxa" w:w="668"/>
           </w:tcPr>
           <w:p>
             <w:pPr>
@@ -5851,7 +5851,7 @@
         </w:tc>
         <w:tc>
           <w:tcPr>
-            <w:tcW w:type="dxa" w:w="697"/>
+            <w:tcW w:type="dxa" w:w="668"/>
           </w:tcPr>
           <w:p>
             <w:pPr>
@@ -5870,7 +5870,7 @@
         </w:tc>
         <w:tc>
           <w:tcPr>
-            <w:tcW w:type="dxa" w:w="697"/>
+            <w:tcW w:type="dxa" w:w="668"/>
           </w:tcPr>
           <w:p>
             <w:pPr>
@@ -5889,7 +5889,7 @@
         </w:tc>
         <w:tc>
           <w:tcPr>
-            <w:tcW w:type="dxa" w:w="697"/>
+            <w:tcW w:type="dxa" w:w="668"/>
           </w:tcPr>
           <w:p>
             <w:pPr>
@@ -5908,7 +5908,7 @@
         </w:tc>
         <w:tc>
           <w:tcPr>
-            <w:tcW w:type="dxa" w:w="876"/>
+            <w:tcW w:type="dxa" w:w="708"/>
           </w:tcPr>
           <w:p>
             <w:pPr>
@@ -5929,7 +5929,7 @@
       <w:tr>
         <w:tc>
           <w:tcPr>
-            <w:tcW w:type="dxa" w:w="4670"/>
+            <w:tcW w:type="dxa" w:w="4955"/>
           </w:tcPr>
           <w:p>
             <w:pPr>
@@ -5948,7 +5948,7 @@
         </w:tc>
         <w:tc>
           <w:tcPr>
-            <w:tcW w:type="dxa" w:w="697"/>
+            <w:tcW w:type="dxa" w:w="668"/>
           </w:tcPr>
           <w:p>
             <w:pPr>
@@ -5966,7 +5966,7 @@
         </w:tc>
         <w:tc>
           <w:tcPr>
-            <w:tcW w:type="dxa" w:w="697"/>
+            <w:tcW w:type="dxa" w:w="668"/>
           </w:tcPr>
           <w:p>
             <w:pPr>
@@ -5984,7 +5984,7 @@
         </w:tc>
         <w:tc>
           <w:tcPr>
-            <w:tcW w:type="dxa" w:w="697"/>
+            <w:tcW w:type="dxa" w:w="668"/>
           </w:tcPr>
           <w:p>
             <w:pPr>
@@ -6002,7 +6002,7 @@
         </w:tc>
         <w:tc>
           <w:tcPr>
-            <w:tcW w:type="dxa" w:w="697"/>
+            <w:tcW w:type="dxa" w:w="668"/>
           </w:tcPr>
           <w:p>
             <w:pPr>
@@ -6020,7 +6020,7 @@
         </w:tc>
         <w:tc>
           <w:tcPr>
-            <w:tcW w:type="dxa" w:w="876"/>
+            <w:tcW w:type="dxa" w:w="708"/>
           </w:tcPr>
           <w:p>
             <w:pPr>
@@ -6040,7 +6040,7 @@
       <w:tr>
         <w:tc>
           <w:tcPr>
-            <w:tcW w:type="dxa" w:w="4670"/>
+            <w:tcW w:type="dxa" w:w="4955"/>
           </w:tcPr>
           <w:p>
             <w:pPr>
@@ -6053,13 +6053,13 @@
                 <w:sz w:val="22"/>
                 <w:lang w:val="ka-GE"/>
               </w:rPr>
-              <w:t>მომხმარებლისა და აგენტის ალიანსი</w:t>
+              <w:t>მომხმარებლისა და ხელოვნური აგენტის ალიანსი</w:t>
             </w:r>
           </w:p>
         </w:tc>
         <w:tc>
           <w:tcPr>
-            <w:tcW w:type="dxa" w:w="697"/>
+            <w:tcW w:type="dxa" w:w="668"/>
           </w:tcPr>
           <w:p>
             <w:pPr>
@@ -6077,7 +6077,7 @@
         </w:tc>
         <w:tc>
           <w:tcPr>
-            <w:tcW w:type="dxa" w:w="697"/>
+            <w:tcW w:type="dxa" w:w="668"/>
           </w:tcPr>
           <w:p>
             <w:pPr>
@@ -6095,7 +6095,7 @@
         </w:tc>
         <w:tc>
           <w:tcPr>
-            <w:tcW w:type="dxa" w:w="697"/>
+            <w:tcW w:type="dxa" w:w="668"/>
           </w:tcPr>
           <w:p>
             <w:pPr>
@@ -6113,7 +6113,7 @@
         </w:tc>
         <w:tc>
           <w:tcPr>
-            <w:tcW w:type="dxa" w:w="697"/>
+            <w:tcW w:type="dxa" w:w="668"/>
           </w:tcPr>
           <w:p>
             <w:pPr>
@@ -6131,7 +6131,7 @@
         </w:tc>
         <w:tc>
           <w:tcPr>
-            <w:tcW w:type="dxa" w:w="876"/>
+            <w:tcW w:type="dxa" w:w="708"/>
           </w:tcPr>
           <w:p>
             <w:pPr>
@@ -6151,7 +6151,7 @@
       <w:tr>
         <w:tc>
           <w:tcPr>
-            <w:tcW w:type="dxa" w:w="4670"/>
+            <w:tcW w:type="dxa" w:w="4955"/>
           </w:tcPr>
           <w:p>
             <w:pPr>
@@ -6170,7 +6170,7 @@
         </w:tc>
         <w:tc>
           <w:tcPr>
-            <w:tcW w:type="dxa" w:w="697"/>
+            <w:tcW w:type="dxa" w:w="668"/>
           </w:tcPr>
           <w:p>
             <w:pPr>
@@ -6188,7 +6188,7 @@
         </w:tc>
         <w:tc>
           <w:tcPr>
-            <w:tcW w:type="dxa" w:w="697"/>
+            <w:tcW w:type="dxa" w:w="668"/>
           </w:tcPr>
           <w:p>
             <w:pPr>
@@ -6206,7 +6206,7 @@
         </w:tc>
         <w:tc>
           <w:tcPr>
-            <w:tcW w:type="dxa" w:w="697"/>
+            <w:tcW w:type="dxa" w:w="668"/>
           </w:tcPr>
           <w:p>
             <w:pPr>
@@ -6224,7 +6224,7 @@
         </w:tc>
         <w:tc>
           <w:tcPr>
-            <w:tcW w:type="dxa" w:w="697"/>
+            <w:tcW w:type="dxa" w:w="668"/>
           </w:tcPr>
           <w:p>
             <w:pPr>
@@ -6242,7 +6242,7 @@
         </w:tc>
         <w:tc>
           <w:tcPr>
-            <w:tcW w:type="dxa" w:w="876"/>
+            <w:tcW w:type="dxa" w:w="708"/>
           </w:tcPr>
           <w:p>
             <w:pPr>
@@ -6262,7 +6262,7 @@
       <w:tr>
         <w:tc>
           <w:tcPr>
-            <w:tcW w:type="dxa" w:w="4670"/>
+            <w:tcW w:type="dxa" w:w="4955"/>
           </w:tcPr>
           <w:p>
             <w:pPr>
@@ -6281,7 +6281,7 @@
         </w:tc>
         <w:tc>
           <w:tcPr>
-            <w:tcW w:type="dxa" w:w="697"/>
+            <w:tcW w:type="dxa" w:w="668"/>
           </w:tcPr>
           <w:p>
             <w:pPr>
@@ -6299,7 +6299,7 @@
         </w:tc>
         <w:tc>
           <w:tcPr>
-            <w:tcW w:type="dxa" w:w="697"/>
+            <w:tcW w:type="dxa" w:w="668"/>
           </w:tcPr>
           <w:p>
             <w:pPr>
@@ -6317,7 +6317,7 @@
         </w:tc>
         <w:tc>
           <w:tcPr>
-            <w:tcW w:type="dxa" w:w="697"/>
+            <w:tcW w:type="dxa" w:w="668"/>
           </w:tcPr>
           <w:p>
             <w:pPr>
@@ -6335,7 +6335,7 @@
         </w:tc>
         <w:tc>
           <w:tcPr>
-            <w:tcW w:type="dxa" w:w="697"/>
+            <w:tcW w:type="dxa" w:w="668"/>
           </w:tcPr>
           <w:p>
             <w:pPr>
@@ -6353,7 +6353,7 @@
         </w:tc>
         <w:tc>
           <w:tcPr>
-            <w:tcW w:type="dxa" w:w="876"/>
+            <w:tcW w:type="dxa" w:w="708"/>
           </w:tcPr>
           <w:p>
             <w:pPr>
@@ -6373,7 +6373,7 @@
       <w:tr>
         <w:tc>
           <w:tcPr>
-            <w:tcW w:type="dxa" w:w="4670"/>
+            <w:tcW w:type="dxa" w:w="4955"/>
           </w:tcPr>
           <w:p>
             <w:pPr>
@@ -6392,7 +6392,7 @@
         </w:tc>
         <w:tc>
           <w:tcPr>
-            <w:tcW w:type="dxa" w:w="697"/>
+            <w:tcW w:type="dxa" w:w="668"/>
           </w:tcPr>
           <w:p>
             <w:pPr>
@@ -6410,7 +6410,7 @@
         </w:tc>
         <w:tc>
           <w:tcPr>
-            <w:tcW w:type="dxa" w:w="697"/>
+            <w:tcW w:type="dxa" w:w="668"/>
           </w:tcPr>
           <w:p>
             <w:pPr>
@@ -6428,7 +6428,7 @@
         </w:tc>
         <w:tc>
           <w:tcPr>
-            <w:tcW w:type="dxa" w:w="697"/>
+            <w:tcW w:type="dxa" w:w="668"/>
           </w:tcPr>
           <w:p>
             <w:pPr>
@@ -6446,7 +6446,7 @@
         </w:tc>
         <w:tc>
           <w:tcPr>
-            <w:tcW w:type="dxa" w:w="697"/>
+            <w:tcW w:type="dxa" w:w="668"/>
           </w:tcPr>
           <w:p>
             <w:pPr>
@@ -6464,7 +6464,7 @@
         </w:tc>
         <w:tc>
           <w:tcPr>
-            <w:tcW w:type="dxa" w:w="876"/>
+            <w:tcW w:type="dxa" w:w="708"/>
           </w:tcPr>
           <w:p>
             <w:pPr>

</xml_diff>

<commit_message>
polish(§1.1): Sonnet-5 fluency + terminology, meaning verified
Whole-paragraph corrections for §1.1 (Research problem): natural academic
Georgian, glossary terms (სასაუბრო, მოძიება, benchmark full-form),
inanimate-plural→singular verbs. Two accuracy fixes: mediation term
(განპირობებული→შუამავლობს) and restored future-work framing.
Plus optional nits (თვისებრივი, ხარვეზი). Both editions rebuilt.

Adds extract_chunk.py (per-section polish-loop extractor).

Co-Authored-By: Claude Opus 4.8 (1M context) <noreply@anthropic.com>
</commit_message>
<xml_diff>
--- a/project/thesis-ka.docx
+++ b/project/thesis-ka.docx
@@ -2283,7 +2283,7 @@
           <w:sz w:val="24"/>
           <w:lang w:val="ka-GE"/>
         </w:rPr>
-        <w:t>ბოლო წლებში დიდ ენობრივ მოდელებზე (LLM) დაფუძნებულმა საუბრის სისტემებმა ერთ დიალოგურ სესიაზე ადამიანის დონის ლინგვისტური კომპეტენცია აჩვენეს, თუმცა ერთ-ერთი მათი ფუნდამენტური შეზღუდვა კვლავ რჩება: ასეთ სისტემებს არ შეუძლიათ გრძელვადიან პერსპექტივაში ურთიერთქმედების უწყვეტი, განვითარებადი კონტექსტის შენარჩუნება. ემპირიული მტკიცებულებები ზუსტად აჩვენებს ამ ნაკლს: LoCoMo-ს, ბენჩმარკის, რომელიც 35 სესიამდე გადანაწილებულ ხანგრძლივ საუბრებს მოიცავს, მიხედვით, ხანგრძლივი კონტექსტის მქონე მოდელები და RAG მიდგომები ადამიანის წარმადობას საერთო ჯამში 56%-ით, ხოლო დროითი მსჯელობისას 73%-ით ჩამორჩებიან [1]. LongMemEval-ის ბენჩმარკი ადასტურებს კომერციული საუბრის ასისტენტების მიერ ინფორმაციის მოძიების სიზუსტის 30%-ით შემცირებას ხანგრძლივი ურთიერთქმედების პირობებში [2].</w:t>
+        <w:t>ბოლო წლებში დიდ ენობრივ მოდელებზე (LLM) დაფუძნებულმა სასაუბრო სისტემებმა ერთი დიალოგური სესიის ფარგლებში ადამიანის დონის ლინგვისტური კომპეტენცია აჩვენა, თუმცა მათი ერთ-ერთი ფუნდამენტური შეზღუდვა კვლავ რჩება: ასეთ სისტემებს არ შეუძლია გრძელვადიან პერსპექტივაში ურთიერთქმედების უწყვეტი, განვითარებადი კონტექსტის შენარჩუნება. ამ ნაკლს ემპირიული მტკიცებულებები ზუსტად ასახავს: LoCoMo-ზე — ეტალონურ შეფასების ნაკრებზე (ბენჩმარკზე), რომელიც 35 სესიამდე გადანაწილებულ ხანგრძლივ საუბრებს მოიცავს — ხანგრძლივი კონტექსტის მქონე მოდელები და RAG მიდგომები ადამიანის წარმადობას საერთო ჯამში 56%-ით, ხოლო დროითი მსჯელობისას 73%-ით ჩამორჩება [1]. LongMemEval-ის ბენჩმარკი ადასტურებს კომერციული სასაუბრო ასისტენტების ინფორმაციის მოძიების სიზუსტის 30%-ით შემცირებას ხანგრძლივი ურთიერთქმედების პირობებში [2].</w:t>
       </w:r>
     </w:p>
     <w:p>
@@ -2297,7 +2297,7 @@
           <w:sz w:val="24"/>
           <w:lang w:val="ka-GE"/>
         </w:rPr>
-        <w:t>ეს ტექნიკური ნაკლი პირდაპირ აისახება მომხმარებლის გამოცდილებაზე. ეგრეთ წოდებული „კომპანიონი“ აპლიკაციების (Replika, Character.AI) კონტექსტში, Replika-ს მომხმარებლების კვალიტატიური კვლევა აჩვენებს, რომ მეხსიერების უკმარისობა — სახელების, უპირატესობებისა და ცხოვრებისეული მოვლენების დავიწყება — ერთ-ერთი მთავარი ფაქტორია, რომელიც არღვევს მომხმარებლის მიერ ურთიერთობის შეგრძნებას [3]. ამავდროულად, როდესაც სისტემის ქცევა მოულოდნელად იცვლება, მომხმარებლები გამოხატავენ რეაქციებს, რომლებიც სტატისტიკურად განპირობებულია აგენტის აღქმული იდენტობის შეუთავსებლობით [4]. ამ ორი დამოუკიდებელი შედეგის გაერთიანება საფუძველს გვაძლევს ვივარაუდოთ, რომ მეხსიერების უწყვეტობა საფუძვლად უდევს აღქმულ იდენტობას და, შესაბამისად, ურთიერთობის უწყვეტობას — ჰიპოთეზა, რომლის ექსპერიმენტული შემოწმებაც ეს ნაშრომი განიხილავს, როგორც სამომავლო სამუშაოს.</w:t>
+        <w:t>ეს ტექნიკური ნაკლი პირდაპირ აისახება მომხმარებლის გამოცდილებაზე. ე.წ. „კომპანიონი“ აპლიკაციების (Replika, Character.AI) კონტექსტში, Replika-ს მომხმარებლების თვისებრივი კვლევა აჩვენებს, რომ მეხსიერების ხარვეზი — სახელების, უპირატესობებისა და ცხოვრებისეული მოვლენების დავიწყება — ერთ-ერთი მთავარი ფაქტორია, რომელიც არღვევს მომხმარებლის ურთიერთობის შეგრძნებას [3]. ამავდროულად, სისტემის ქცევის მოულოდნელი ცვლილებისას მომხმარებლების რეაქციებს სტატისტიკურად შუამავლობს აგენტის აღქმული იდენტობის წყვეტა [4]. ეს ორი დამოუკიდებელი მიგნება ერთად საფუძველს გვაძლევს ვივარაუდოთ, რომ მეხსიერების უწყვეტობა საფუძვლად უდევს აღქმულ იდენტობას და, შესაბამისად, ურთიერთობის უწყვეტობას — ჰიპოთეზა, რომლის ექსპერიმენტულ შემოწმებასაც ეს ნაშრომი გეგმავს და აყალიბებს, როგორც სამომავლო სამუშაოს.</w:t>
       </w:r>
     </w:p>
     <w:p>
@@ -2311,7 +2311,7 @@
           <w:sz w:val="24"/>
           <w:lang w:val="ka-GE"/>
         </w:rPr>
-        <w:t>ამგვარად, კვლევითი პრობლემა ორგანზომილებიანია: (ა) ტექნიკური — როგორ უნდა იყოს წარმოდგენილი, შენახული და მოპოვებული რელევანტური ინფორმაცია მრავალსესიანურ ურთიერთქმედებაში; და (ბ) პერცეპტული — სისტემის მეხსიერების რომელ ქცევებს აღიქვამენ მომხმარებლები ბუნებრივად და ურთიერთობის განმტკიცებად. არსებულ ლიტერატურაში ამ ორ განზომილებას ძირითადად იზოლირებულად განიხილავენ: მეხსიერების არქიტექტურები შეფასებულია ფაქტობრივი სიზუსტის (QA) მეტრიკებით, ხოლო აღქმის კვლევები მეხსიერებას ერთ სისტემაზე იზოლირებულ მანიპულაციად განიხილავენ. ამ ორი განზომილების გადაკვეთა წარმოადგენს ამ ნაშრომის კვლევის სივრცეს.</w:t>
+        <w:t>ამგვარად, კვლევითი პრობლემა ორგანზომილებიანია: (ა) ტექნიკური — როგორ უნდა იყოს წარმოდგენილი, შენახული და მოძიებული რელევანტური ინფორმაცია მრავალსესიან ურთიერთქმედებაში; და (ბ) პერცეპტული — სისტემის მეხსიერების რომელ ქცევებს აღიქვამენ მომხმარებლები ბუნებრივად და ურთიერთობის განმტკიცებად. არსებული ლიტერატურა ამ ორ განზომილებას ძირითადად იზოლირებულად განიხილავს: მეხსიერების არქიტექტურები შეფასებულია ფაქტობრივი სიზუსტის (QA) მეტრიკებით, ხოლო აღქმის კვლევები მეხსიერებას ერთ სისტემაზე იზოლირებულ მანიპულაციად განიხილავს. ამ ორი განზომილების გადაკვეთა წარმოადგენს ამ ნაშრომის კვლევის სივრცეს.</w:t>
       </w:r>
     </w:p>
     <w:p>
@@ -2325,7 +2325,7 @@
           <w:sz w:val="24"/>
           <w:lang w:val="ka-GE"/>
         </w:rPr>
-        <w:t>კვლევის ობიექტია დიდი ენის მოდელებზე (LLM) დაფუძნებული ხმოვანი საუბრული სისტემები. კვლევის საგანია გრძელვადიანი მეხსიერების არქიტექტურის გავლენა მომხმარებლის მიერ აღქმულ სოციალურ კონსტრუქტებზე.</w:t>
+        <w:t>კვლევის ობიექტია დიდ ენობრივ მოდელებზე (LLM) დაფუძნებული ხმოვანი სასაუბრო სისტემები. კვლევის საგანია გრძელვადიანი მეხსიერების არქიტექტურის გავლენა მომხმარებლის მიერ აღქმულ სოციალურ კონსტრუქტებზე.</w:t>
       </w:r>
     </w:p>
     <w:p>

</xml_diff>

<commit_message>
polish(§1.2): Sonnet-5 fluency + terminology, meaning verified
§1.2 (Research aim), 15 units: verbatim-RAG term unified across 5 units,
within-subject/alliance-full-form/behavioral-signature aligned, complementary
mistranslation fixed, 60-word sentence split, unit-20 clause disambiguated
(no longer risks implying recommendations confirmed). Standardized
future work -> სამომავლო გეგმები and proof-of-concept -> კონცეფციის დამტკიცება
(glossary + retro §1.1). Both editions rebuilt.

Co-Authored-By: Claude Opus 4.8 (1M context) <noreply@anthropic.com>
</commit_message>
<xml_diff>
--- a/project/thesis-ka.docx
+++ b/project/thesis-ka.docx
@@ -1247,7 +1247,7 @@
           <w:rFonts w:ascii="Sylfaen" w:hAnsi="Sylfaen"/>
           <w:sz w:val="24"/>
         </w:rPr>
-        <w:t>16</w:t>
+        <w:t>17</w:t>
       </w:r>
     </w:p>
     <w:p>
@@ -1277,7 +1277,7 @@
           <w:rFonts w:ascii="Sylfaen" w:hAnsi="Sylfaen"/>
           <w:sz w:val="24"/>
         </w:rPr>
-        <w:t>16</w:t>
+        <w:t>17</w:t>
       </w:r>
     </w:p>
     <w:p>
@@ -1307,7 +1307,7 @@
           <w:rFonts w:ascii="Sylfaen" w:hAnsi="Sylfaen"/>
           <w:sz w:val="24"/>
         </w:rPr>
-        <w:t>16</w:t>
+        <w:t>17</w:t>
       </w:r>
     </w:p>
     <w:p>
@@ -1337,7 +1337,7 @@
           <w:rFonts w:ascii="Sylfaen" w:hAnsi="Sylfaen"/>
           <w:sz w:val="24"/>
         </w:rPr>
-        <w:t>19</w:t>
+        <w:t>20</w:t>
       </w:r>
     </w:p>
     <w:p>
@@ -1367,7 +1367,7 @@
           <w:rFonts w:ascii="Sylfaen" w:hAnsi="Sylfaen"/>
           <w:sz w:val="24"/>
         </w:rPr>
-        <w:t>22</w:t>
+        <w:t>23</w:t>
       </w:r>
     </w:p>
     <w:p>
@@ -1397,7 +1397,7 @@
           <w:rFonts w:ascii="Sylfaen" w:hAnsi="Sylfaen"/>
           <w:sz w:val="24"/>
         </w:rPr>
-        <w:t>24</w:t>
+        <w:t>25</w:t>
       </w:r>
     </w:p>
     <w:p>
@@ -1427,7 +1427,7 @@
           <w:rFonts w:ascii="Sylfaen" w:hAnsi="Sylfaen"/>
           <w:sz w:val="24"/>
         </w:rPr>
-        <w:t>25</w:t>
+        <w:t>26</w:t>
       </w:r>
     </w:p>
     <w:p>
@@ -1457,7 +1457,7 @@
           <w:rFonts w:ascii="Sylfaen" w:hAnsi="Sylfaen"/>
           <w:sz w:val="24"/>
         </w:rPr>
-        <w:t>27</w:t>
+        <w:t>28</w:t>
       </w:r>
     </w:p>
     <w:p>
@@ -1487,7 +1487,7 @@
           <w:rFonts w:ascii="Sylfaen" w:hAnsi="Sylfaen"/>
           <w:sz w:val="24"/>
         </w:rPr>
-        <w:t>28</w:t>
+        <w:t>29</w:t>
       </w:r>
     </w:p>
     <w:p>
@@ -1517,7 +1517,7 @@
           <w:rFonts w:ascii="Sylfaen" w:hAnsi="Sylfaen"/>
           <w:sz w:val="24"/>
         </w:rPr>
-        <w:t>30</w:t>
+        <w:t>31</w:t>
       </w:r>
     </w:p>
     <w:p>
@@ -1547,7 +1547,7 @@
           <w:rFonts w:ascii="Sylfaen" w:hAnsi="Sylfaen"/>
           <w:sz w:val="24"/>
         </w:rPr>
-        <w:t>30</w:t>
+        <w:t>31</w:t>
       </w:r>
     </w:p>
     <w:p>
@@ -1577,7 +1577,7 @@
           <w:rFonts w:ascii="Sylfaen" w:hAnsi="Sylfaen"/>
           <w:sz w:val="24"/>
         </w:rPr>
-        <w:t>32</w:t>
+        <w:t>33</w:t>
       </w:r>
     </w:p>
     <w:p>
@@ -1607,7 +1607,7 @@
           <w:rFonts w:ascii="Sylfaen" w:hAnsi="Sylfaen"/>
           <w:sz w:val="24"/>
         </w:rPr>
-        <w:t>37</w:t>
+        <w:t>38</w:t>
       </w:r>
     </w:p>
     <w:p>
@@ -1637,7 +1637,7 @@
           <w:rFonts w:ascii="Sylfaen" w:hAnsi="Sylfaen"/>
           <w:sz w:val="24"/>
         </w:rPr>
-        <w:t>40</w:t>
+        <w:t>41</w:t>
       </w:r>
     </w:p>
     <w:p>
@@ -1667,7 +1667,7 @@
           <w:rFonts w:ascii="Sylfaen" w:hAnsi="Sylfaen"/>
           <w:sz w:val="24"/>
         </w:rPr>
-        <w:t>42</w:t>
+        <w:t>43</w:t>
       </w:r>
     </w:p>
     <w:p>
@@ -1697,7 +1697,7 @@
           <w:rFonts w:ascii="Sylfaen" w:hAnsi="Sylfaen"/>
           <w:sz w:val="24"/>
         </w:rPr>
-        <w:t>45</w:t>
+        <w:t>46</w:t>
       </w:r>
     </w:p>
     <w:p>
@@ -1727,7 +1727,7 @@
           <w:rFonts w:ascii="Sylfaen" w:hAnsi="Sylfaen"/>
           <w:sz w:val="24"/>
         </w:rPr>
-        <w:t>47</w:t>
+        <w:t>48</w:t>
       </w:r>
     </w:p>
     <w:p>
@@ -1757,7 +1757,7 @@
           <w:rFonts w:ascii="Sylfaen" w:hAnsi="Sylfaen"/>
           <w:sz w:val="24"/>
         </w:rPr>
-        <w:t>48</w:t>
+        <w:t>49</w:t>
       </w:r>
     </w:p>
     <w:p>
@@ -1787,7 +1787,7 @@
           <w:rFonts w:ascii="Sylfaen" w:hAnsi="Sylfaen"/>
           <w:sz w:val="24"/>
         </w:rPr>
-        <w:t>51</w:t>
+        <w:t>52</w:t>
       </w:r>
     </w:p>
     <w:p>
@@ -1817,7 +1817,7 @@
           <w:rFonts w:ascii="Sylfaen" w:hAnsi="Sylfaen"/>
           <w:sz w:val="24"/>
         </w:rPr>
-        <w:t>51</w:t>
+        <w:t>52</w:t>
       </w:r>
     </w:p>
     <w:p>
@@ -1847,7 +1847,7 @@
           <w:rFonts w:ascii="Sylfaen" w:hAnsi="Sylfaen"/>
           <w:sz w:val="24"/>
         </w:rPr>
-        <w:t>52</w:t>
+        <w:t>53</w:t>
       </w:r>
     </w:p>
     <w:p>
@@ -1877,7 +1877,7 @@
           <w:rFonts w:ascii="Sylfaen" w:hAnsi="Sylfaen"/>
           <w:sz w:val="24"/>
         </w:rPr>
-        <w:t>54</w:t>
+        <w:t>55</w:t>
       </w:r>
     </w:p>
     <w:p>
@@ -1907,7 +1907,7 @@
           <w:rFonts w:ascii="Sylfaen" w:hAnsi="Sylfaen"/>
           <w:sz w:val="24"/>
         </w:rPr>
-        <w:t>56</w:t>
+        <w:t>57</w:t>
       </w:r>
     </w:p>
     <w:p>
@@ -1937,7 +1937,7 @@
           <w:rFonts w:ascii="Sylfaen" w:hAnsi="Sylfaen"/>
           <w:sz w:val="24"/>
         </w:rPr>
-        <w:t>57</w:t>
+        <w:t>58</w:t>
       </w:r>
     </w:p>
     <w:p>
@@ -1967,7 +1967,7 @@
           <w:rFonts w:ascii="Sylfaen" w:hAnsi="Sylfaen"/>
           <w:sz w:val="24"/>
         </w:rPr>
-        <w:t>59</w:t>
+        <w:t>60</w:t>
       </w:r>
     </w:p>
     <w:p>
@@ -1997,7 +1997,7 @@
           <w:rFonts w:ascii="Sylfaen" w:hAnsi="Sylfaen"/>
           <w:sz w:val="24"/>
         </w:rPr>
-        <w:t>59</w:t>
+        <w:t>60</w:t>
       </w:r>
     </w:p>
     <w:p>
@@ -2027,7 +2027,7 @@
           <w:rFonts w:ascii="Sylfaen" w:hAnsi="Sylfaen"/>
           <w:sz w:val="24"/>
         </w:rPr>
-        <w:t>60</w:t>
+        <w:t>61</w:t>
       </w:r>
     </w:p>
     <w:p>
@@ -2057,7 +2057,7 @@
           <w:rFonts w:ascii="Sylfaen" w:hAnsi="Sylfaen"/>
           <w:sz w:val="24"/>
         </w:rPr>
-        <w:t>60</w:t>
+        <w:t>61</w:t>
       </w:r>
     </w:p>
     <w:p>
@@ -2087,7 +2087,7 @@
           <w:rFonts w:ascii="Sylfaen" w:hAnsi="Sylfaen"/>
           <w:sz w:val="24"/>
         </w:rPr>
-        <w:t>62</w:t>
+        <w:t>63</w:t>
       </w:r>
     </w:p>
     <w:p>
@@ -2297,7 +2297,7 @@
           <w:sz w:val="24"/>
           <w:lang w:val="ka-GE"/>
         </w:rPr>
-        <w:t>ეს ტექნიკური ნაკლი პირდაპირ აისახება მომხმარებლის გამოცდილებაზე. ე.წ. „კომპანიონი“ აპლიკაციების (Replika, Character.AI) კონტექსტში, Replika-ს მომხმარებლების თვისებრივი კვლევა აჩვენებს, რომ მეხსიერების ხარვეზი — სახელების, უპირატესობებისა და ცხოვრებისეული მოვლენების დავიწყება — ერთ-ერთი მთავარი ფაქტორია, რომელიც არღვევს მომხმარებლის ურთიერთობის შეგრძნებას [3]. ამავდროულად, სისტემის ქცევის მოულოდნელი ცვლილებისას მომხმარებლების რეაქციებს სტატისტიკურად შუამავლობს აგენტის აღქმული იდენტობის წყვეტა [4]. ეს ორი დამოუკიდებელი მიგნება ერთად საფუძველს გვაძლევს ვივარაუდოთ, რომ მეხსიერების უწყვეტობა საფუძვლად უდევს აღქმულ იდენტობას და, შესაბამისად, ურთიერთობის უწყვეტობას — ჰიპოთეზა, რომლის ექსპერიმენტულ შემოწმებასაც ეს ნაშრომი გეგმავს და აყალიბებს, როგორც სამომავლო სამუშაოს.</w:t>
+        <w:t>ეს ტექნიკური ნაკლი პირდაპირ აისახება მომხმარებლის გამოცდილებაზე. ე.წ. „კომპანიონი“ აპლიკაციების (Replika, Character.AI) კონტექსტში, Replika-ს მომხმარებლების თვისებრივი კვლევა აჩვენებს, რომ მეხსიერების ხარვეზი — სახელების, უპირატესობებისა და ცხოვრებისეული მოვლენების დავიწყება — ერთ-ერთი მთავარი ფაქტორია, რომელიც არღვევს მომხმარებლის ურთიერთობის შეგრძნებას [3]. ამავდროულად, სისტემის ქცევის მოულოდნელი ცვლილებისას მომხმარებლების რეაქციებს სტატისტიკურად შუამავლობს აგენტის აღქმული იდენტობის წყვეტა [4]. ეს ორი დამოუკიდებელი მიგნება ერთად საფუძველს გვაძლევს ვივარაუდოთ, რომ მეხსიერების უწყვეტობა საფუძვლად უდევს აღქმულ იდენტობას და, შესაბამისად, ურთიერთობის უწყვეტობას — ჰიპოთეზა, რომლის ექსპერიმენტულ შემოწმებასაც ეს ნაშრომი გეგმავს და აყალიბებს, როგორც სამომავლო გეგმები.</w:t>
       </w:r>
     </w:p>
     <w:p>
@@ -2348,7 +2348,7 @@
           <w:sz w:val="24"/>
           <w:lang w:val="ka-GE"/>
         </w:rPr>
-        <w:t>ამ ნაშრომის მიზანია ადამიანის მეხსიერების კოგნიტურ თეორიებზე დაფუძნებული გრძელვადიანი მეხსიერების არქიტექტურის შემუშავება ხმოვანი საუბრის სისტემისთვის და მისი ექსპერიმენტულად შეფასება კონტროლირებადი შედარებითი კვლევის მეშვეობით მომხმარებლის მიერ აღქმულ სოციალურ კონსტრუქტებზე — სოციალურ თანდასწრებაზე, მომხმარებელ-აგენტის ალიანსსა და აღქმულ ადამიანურობაზე.</w:t>
+        <w:t>ამ ნაშრომის მიზანია ადამიანის მეხსიერების კოგნიტურ თეორიებზე დაფუძნებული გრძელვადიანი მეხსიერების არქიტექტურის შემუშავება ხმოვანი სასაუბრო სისტემისთვის და მისი გავლენის ექსპერიმენტული შეფასება მომხმარებლის მიერ აღქმულ სოციალურ კონსტრუქტებზე — სოციალურ თანდასწრებაზე, მომხმარებლისა და ხელოვნური აგენტის ალიანსსა და აღქმულ ადამიანურობაზე — კონტროლირებადი შედარებითი კვლევის მეშვეობით.</w:t>
       </w:r>
     </w:p>
     <w:p>
@@ -2376,7 +2376,7 @@
           <w:sz w:val="24"/>
           <w:lang w:val="ka-GE"/>
         </w:rPr>
-        <w:t>1. გრძელვადიანი საუბრული მეხსიერების არსებული მიდგომებისა და მათი კოგნიტურ-თეორიული საფუძვლების სისტემური ანალიზი;</w:t>
+        <w:t>1. გრძელვადიანი სასაუბრო მეხსიერების არსებული მიდგომებისა და მათი კოგნიტურ-თეორიული საფუძვლების სისტემური ანალიზი;</w:t>
       </w:r>
     </w:p>
     <w:p>
@@ -2390,7 +2390,7 @@
           <w:sz w:val="24"/>
           <w:lang w:val="ka-GE"/>
         </w:rPr>
-        <w:t>2. შერჩეული თეორიების ქცევითი ნიშნულების ფორმალიზება (მრავალსაცავიანი მოდელი, ებინგჰაუსის დავიწყების მრუდი, ეპიზოდური/სემანტიკური მეხსიერების გამიჯვნა, არსებითზე დაფუძნებული გახსენება და დამატებითი სასწავლო სისტემების / კონსოლიდაციის ჩარჩო) და მათი არქიტექტურულ კომპონენტებად გარდაქმნა;</w:t>
+        <w:t>2. შერჩეული თეორიების ქცევითი ნიშან-თვისებების ფორმალიზება (მრავალსაცავიანი მოდელი, ებინგჰაუსის დავიწყების მრუდი, ეპიზოდური/სემანტიკური მეხსიერების გამიჯვნა, არსობრივზე (gist) დაფუძნებული გახსენება და კომპლემენტარული სასწავლო სისტემების/კონსოლიდაციის ჩარჩო) და მათი გარდაქმნა არქიტექტურულ კომპონენტებად;</w:t>
       </w:r>
     </w:p>
     <w:p>
@@ -2404,7 +2404,7 @@
           <w:sz w:val="24"/>
           <w:lang w:val="ka-GE"/>
         </w:rPr>
-        <w:t>3. არქიტექტურის განხორციელება ურთიერთშედარებადი ექსპერიმენტული პროფილების სახით: (A) გრძელვადიანი მეხსიერების გარეშე, (B) სიტყვასიტყვითი აღდგენის RAG-ი, (B+) კურატორირებული სტატიკური აქტიური კონტროლი და (C) ადამიანის მეხსიერების მოდელზე დაფუძნებული პროფილი;</w:t>
+        <w:t>3. არქიტექტურის განხორციელება ურთიერთშედარებადი ექსპერიმენტული პროფილების სახით: (A) გრძელვადიანი მეხსიერების გარეშე, (B) პირდაპირ (verbatim) მოძიებაზე დაფუძნებული RAG, (B+) კურატორირებული სტატიკური აქტიური კონტროლი და (C) ადამიანის მეხსიერების მოდელზე დაფუძნებული პროფილი;</w:t>
       </w:r>
     </w:p>
     <w:p>
@@ -2418,7 +2418,7 @@
           <w:sz w:val="24"/>
           <w:lang w:val="ka-GE"/>
         </w:rPr>
-        <w:t>4. წინასწარ რეგისტრირებული, მონაწილეზე-დაფუძნებული მომხმარებლის კვლევის პროტოკოლის სპეციფიკაცია ვალიდური ინსტრუმენტებით [14], რომელიც სრულად არის შემუშავებული, მაგრამ მომავალი სამუშაოსთვის გადაიდო;</w:t>
+        <w:t>4. წინასწარ რეგისტრირებული, განმეორებითი გაზომვების (within-subject) დიზაინის მქონე მომხმარებლის კვლევის პროტოკოლის სპეციფიკაცია ვალიდირებული ინსტრუმენტებით [14] — სრულად შემუშავებული, თუმცა სამომავლო გეგმებისთვის გადადებული;</w:t>
       </w:r>
     </w:p>
     <w:p>
@@ -2432,7 +2432,7 @@
           <w:sz w:val="24"/>
           <w:lang w:val="ka-GE"/>
         </w:rPr>
-        <w:t>5. კონცეფციის დამტკიცების იმპლემენტაცია და მისი ტექნიკური და სიმულირებული შეფასება, მეხსიერების დიზაინის რეკომენდაციებით თანამოსაუბრე სისტემებისთვის, რომლებიც დადასტურდება გადავადებული კვლევით.</w:t>
+        <w:t>5. კონცეფციის დამტკიცების იმპლემენტაცია და მისი ტექნიკური და სიმულირებული შეფასება, თანამოსაუბრე სისტემებისთვის განკუთვნილი მეხსიერების დიზაინის რეკომენდაციებით, რომელთა დადასტურება გადავადებულ კვლევას ეკუთვნის.</w:t>
       </w:r>
     </w:p>
     <w:p>
@@ -2446,7 +2446,7 @@
           <w:sz w:val="24"/>
           <w:lang w:val="ka-GE"/>
         </w:rPr>
-        <w:t>კვლევის მთავარი კითხვა და ჰიპოთეზები. კვლევა გამოყოფს სამ ძირითად სოციალურ კონსტრუქტს (დამოკიდებული ცვლადები, რომლებიც მიზანშია დასახელებული) ორი მეორეხარისხოვანი, საძიებო პროგნოზისგან:</w:t>
+        <w:t>კვლევის მთავარი საკითხი და ჰიპოთეზები. კვლევა გამოყოფს სამ ძირითად სოციალურ კონსტრუქტს (დამოკიდებულ ცვლადებს, რომლებიც კვლევის მიზანშია დასახელებული) ორი მეორეხარისხოვანი, საძიებო პროგნოზისგან:</w:t>
       </w:r>
     </w:p>
     <w:p>
@@ -2460,7 +2460,7 @@
           <w:sz w:val="24"/>
           <w:lang w:val="ka-GE"/>
         </w:rPr>
-        <w:t>•  მკ1: აძლიერებს თუ არა ადამიანის მეხსიერების თეორიებზე დაფუძნებული მეხსიერების არქიტექტურა აღქმულ სოციალურ თანდასწრებას, მომხმარებლისა და ხელოვნური აგენტის ალიანსს და აღქმულ ადამიანურობას, სიტყვასიტყვითი მოგონების მიდგომასთან შედარებით?</w:t>
+        <w:t>•  მკ1: აძლიერებს თუ არა ადამიანის მეხსიერების თეორიებზე დაფუძნებული მეხსიერების არქიტექტურა აღქმულ სოციალურ თანდასწრებას, მომხმარებლისა და ხელოვნური აგენტის ალიანსსა და აღქმულ ადამიანურობას, პირდაპირ (verbatim) მოძიებაზე დაფუძნებულ მიდგომასთან შედარებით?</w:t>
       </w:r>
     </w:p>
     <w:p>
@@ -2474,7 +2474,7 @@
           <w:sz w:val="24"/>
           <w:lang w:val="ka-GE"/>
         </w:rPr>
-        <w:t>•  H1 (მთავარი): თეორიულად დასაბუთებული პროფილი (C) აღემატება სიტყვასიტყვით RAG-ს (B) სამივე ძირითადი კონსტრუქტის მიხედვით — სოციალური თანდასწრების, მომხმარებლისა და ხელოვნური აგენტის ალიანსისა და აღქმული ადამიანურობის.</w:t>
+        <w:t>•  H1 (მთავარი): თეორიულად დასაბუთებული პროფილი (C) აღემატება პირდაპირ (verbatim) მოძიებაზე დაფუძნებულ RAG-ს (B) სამივე ძირითადი კონსტრუქტის მიხედვით — სოციალური თანდასწრების, მომხმარებლისა და ხელოვნური აგენტის ალიანსისა და აღქმული ადამიანურობის.</w:t>
       </w:r>
     </w:p>
     <w:p>
@@ -2488,7 +2488,7 @@
           <w:sz w:val="24"/>
           <w:lang w:val="ka-GE"/>
         </w:rPr>
-        <w:t>•  H2a (მეორეხარისხოვანი): verbatim RAG (B) ყველაზე მაღალ ქულებს იღებს აღქმულ ინტელექტში (Godspeed).</w:t>
+        <w:t>•  H2a (მეორეხარისხოვანი): პირდაპირ (verbatim) მოძიებაზე დაფუძნებული RAG (B) ყველაზე მაღალ ქულებს იღებს აღქმულ ინტელექტში (Godspeed).</w:t>
       </w:r>
     </w:p>
     <w:p>
@@ -2502,7 +2502,7 @@
           <w:sz w:val="24"/>
           <w:lang w:val="ka-GE"/>
         </w:rPr>
-        <w:t>•  H2b (მეორადი): verbatim RAG (B) ყველაზე დაბალ ქულებს იღებს ნდობისა და კონფიდენციალურობასთან დაკავშირებული კომფორტის კრიტერიუმებით (Cox-ის ტიპის საკითხები) — ეს არის ვარაუდი, რომელიც ტექსტური მოდალობის შედეგებიდან [11] ხმის მოდალობაზე ექსტრაპოლირებულია.</w:t>
+        <w:t>•  H2b (მეორეხარისხოვანი): პირდაპირ (verbatim) მოძიებაზე დაფუძნებული RAG (B) ყველაზე დაბალ ქულებს იღებს ნდობისა და კონფიდენციალურობასთან დაკავშირებული კომფორტის კრიტერიუმებით (Cox-ის ტიპის საკითხები) — ეს არის ვარაუდი, რომელიც ტექსტური მოდალობის შედეგების [11] ხმის მოდალობაზე ექსტრაპოლაციას ეფუძნება.</w:t>
       </w:r>
     </w:p>
     <w:p>
@@ -2516,7 +2516,7 @@
           <w:sz w:val="24"/>
           <w:lang w:val="ka-GE"/>
         </w:rPr>
-        <w:t>შედარება დამატებით მოიცავს კურატორირებულ სტატიკურ აქტიურ კონტროლს (B+): მეხსიერებას, რომელიც იღებს იგივე ოფლაინ კურატორირებას, რაც C, მაგრამ არ გააჩნია ადამიანის მეხსიერების დინამიკა (არც დაქრობა, არც სალიენს-გეითინგი, არც კონსოლიდაცია). კონტრასტი C-სა და B+-ს შორის — რომელიც ადამიანის მეხსიერების დინამიკის ეფექტს კურირების მიერ მიღწეული წაკითხვადობის უბრალო ზრდისგან გამოყოფს — ამ ნაშრომის ცენტრალური ახალი შედარებაა; როგორც 3.1-შია დადგენილი, ის თავისი კონსტრუქციით მცირე ეფექტს წარმოადგენს და განიხილება წინასწარ რეგისტრირებულ შეფასების მიზნად და არა დამადასტურებელ ტესტად, რაც განსხვავდება უკეთესი სტატისტიკური ძალის მქონე შედარებებისგან (C vs A და მიმართულებითი B+ vs B და C vs B).</w:t>
+        <w:t>შედარება დამატებით მოიცავს კურატორირებულ სტატიკურ აქტიურ კონტროლს (B+): მეხსიერებას, რომელიც იღებს იგივე ოფლაინ კურატორირებას, რაც C, მაგრამ არ გააჩნია ადამიანის მეხსიერების დინამიკა (არც დაქრობა, არც სალიენს-გეითინგი, არც კონსოლიდაცია). კონტრასტი C-სა და B+-ს შორის — რომელიც ადამიანის მეხსიერების დინამიკის ეფექტს კურირებით მიღწეული წაკითხვადობის უბრალო ზრდისგან გამოყოფს — ამ ნაშრომის ცენტრალური ახალი შედარებაა. როგორც 3.1-შია დადგენილი, ის თავისი კონსტრუქციით მცირე ეფექტს წარმოადგენს და განიხილება წინასწარ რეგისტრირებულ შეფასების მიზნად და არა დამადასტურებელ ტესტად, რაც განსხვავდება უკეთესი სტატისტიკური ძალის მქონე შედარებებისგან (C vs A და მიმართულებითი B+ vs B და C vs B).</w:t>
       </w:r>
     </w:p>
     <w:p>
@@ -2530,7 +2530,7 @@
           <w:sz w:val="24"/>
           <w:lang w:val="ka-GE"/>
         </w:rPr>
-        <w:t>სამი თვისებიდან, რომლებითაც 1.5 განასხვავებს მოსაუბრეს ასისტენტისგან, მეხსიერებაზე მანიპულირება ეხება კონტექსტის მდგრადობასა და იდენტობის უწყვეტობას; მესამე — ინიციატივა — ოპერაციულად განისაზღვრება მხოლოდ არასავალდებულო პროაქტიულ პირობაში და, შესაბამისად, შემოწმდება მხოლოდ იმ შემთხვევაში, თუ ეს პირობაა ჩართული.</w:t>
+        <w:t>სამი თვისებიდან, რომლებითაც 1.5 განასხვავებს თანამოსაუბრეს ასისტენტისგან, მეხსიერებაზე მანიპულირება ეხება კონტექსტის მდგრადობასა და იდენტობის უწყვეტობას; მესამე — ინიციატივა — ოპერაციულად განისაზღვრება მხოლოდ არასავალდებულო პროაქტიულ პირობაში და, შესაბამისად, შემოწმდება მხოლოდ იმ შემთხვევაში, თუ ეს პირობა ჩართულია.</w:t>
       </w:r>
     </w:p>
     <w:p>
@@ -2544,7 +2544,7 @@
           <w:sz w:val="24"/>
           <w:lang w:val="ka-GE"/>
         </w:rPr>
-        <w:t>კვლევის ლინგვისტური მასშტაბი: სისტემა და ექსპერიმენტები ინგლისურ ენაზე ტარდება, რაც განპირობებულია ქართული მეტყველების ამოცნობის ტექნოლოგიის ამჟამინდელი განვითარების დონით; შესაბამისად, აღქმის შესახებ დასკვნები პირდაპირ ეხება გამოცდილ ენობრივ პირობას, ხოლო ქართულენოვანი დემონსტრაციის საკითხი მომავალი ნაშრომების განყოფილებაში განიხილება. ურთიერთქმედების მოდალიტეტიც უცვლელია — მთლიანად ხმოვანი, ტექსტური კომპონენტის გარეშე — ამგვარად, კვლევა იკვლევს მეხსიერების არქიტექტურის გავლენას ხმოვან გარემოში და არა ხმოვანსა და ტექსტურს შორის არსებულ განსხვავებას.</w:t>
+        <w:t>კვლევის ლინგვისტური მასშტაბი: სისტემა და ექსპერიმენტები ინგლისურ ენაზე ტარდება, რაც განპირობებულია ქართული მეტყველების ამოცნობის ტექნოლოგიის ამჟამინდელი განვითარების დონით; შესაბამისად, აღქმის შესახებ დასკვნები პირდაპირ ეხება გამოცდილ ენობრივ პირობას, ხოლო ქართულენოვანი დემონსტრაციის საკითხი სამომავლო გეგმების განყოფილებაში განიხილება. ურთიერთქმედების მოდალიტეტიც უცვლელია — მთლიანად ხმოვანი, ტექსტური კომპონენტის გარეშე — ამგვარად, კვლევა იკვლევს მეხსიერების არქიტექტურის გავლენას ხმოვან გარემოში და არა ხმოვანსა და ტექსტურს შორის არსებულ განსხვავებას.</w:t>
       </w:r>
     </w:p>
     <w:p>

</xml_diff>

<commit_message>
polish(§1.4): Sonnet-5 fluency + terminology, meaning verified
§1.4 (Practical value), 5 units: fixed u33 mistranslation (specified integration
plan, not "single specified way"), harness→მოდული, conversational→სასაუბრო,
reproducible→განმეორებადი; u34 honesty framing made explicit (ჯერ კიდევ /
deferred study). Both editions rebuilt.

Co-Authored-By: Claude Opus 4.8 (1M context) <noreply@anthropic.com>
</commit_message>
<xml_diff>
--- a/project/thesis-ka.docx
+++ b/project/thesis-ka.docx
@@ -2590,7 +2590,7 @@
           <w:sz w:val="24"/>
           <w:lang w:val="ka-GE"/>
         </w:rPr>
-        <w:t>კვლევის შედეგად იქნება:</w:t>
+        <w:t>კვლევის შედეგად შეიქმნება:</w:t>
       </w:r>
     </w:p>
     <w:p>
@@ -2604,7 +2604,7 @@
           <w:sz w:val="24"/>
           <w:lang w:val="ka-GE"/>
         </w:rPr>
-        <w:t>•  კონცეფციის დამტკიცების მექანიზმი მეხსიერებისთვის, რომელიც მრავალსესიან დიალოგზე ყველა ოთხი პირობის იმპლემენტაციას ახდენს, ერთადერთი განსაზღვრული გზით მისი ინტეგრაციისთვის Voice Companion-ის ხმოვან პლატფორმაში (მომავალი სამუშაო);</w:t>
+        <w:t>•  კონცეფციის დამტკიცების მეხსიერების მოდული, რომელიც მრავალსესიან დიალოგზე ოთხივე პირობას ახორციელებს, ასევე — მისი Voice Companion-ის ხმოვან პლატფორმაში ინტეგრირების კონკრეტული გეგმა (სამომავლო გეგმები);</w:t>
       </w:r>
     </w:p>
     <w:p>
@@ -2618,7 +2618,7 @@
           <w:sz w:val="24"/>
           <w:lang w:val="ka-GE"/>
         </w:rPr>
-        <w:t>•  საპროექტო რეკომენდაციები — დაფუძნებული ტექნიკურ და სიმულირებულ კონცეფციის დამტკიცებაზე და რომლებიც ემპირიულად უნდა დადასტურდეს გადავადებული ადამიანური კვლევით — იმის შესახებ, თუ რომელი მეხსიერების მექანიზმები აძლიერებს ან ასუსტებს ურთიერთობის შეგრძნებას, როგორც სახელმძღვანელო საუბრზე დაფუძნებული პროდუქტების შემქმნელთათვის;</w:t>
+        <w:t>•  საპროექტო რეკომენდაციები — რომლებიც ეფუძნება ტექნიკურ და სიმულირებულ კონცეფციის დამტკიცებასა და რომელთა ემპირიული დადასტურება ჯერ კიდევ გადავადებულ ადამიანურ კვლევას ეკისრება — იმის შესახებ, მეხსიერების რომელი მექანიზმები აძლიერებს ან ასუსტებს ურთიერთობის განცდას, როგორც სახელმძღვანელო სასაუბრო პროდუქტების შემქმნელთათვის;</w:t>
       </w:r>
     </w:p>
     <w:p>
@@ -2632,7 +2632,7 @@
           <w:sz w:val="24"/>
           <w:lang w:val="ka-GE"/>
         </w:rPr>
-        <w:t>•  მეხსიერების პროფილების შესადარებლად განკუთვნილი გამეორებადი ექსპერიმენტული გარემო.</w:t>
+        <w:t>•  მეხსიერების პროფილების შესადარებლად განკუთვნილი განმეორებადი ექსპერიმენტული გარემო.</w:t>
       </w:r>
     </w:p>
     <w:p>
@@ -2646,7 +2646,7 @@
           <w:sz w:val="24"/>
           <w:lang w:val="ka-GE"/>
         </w:rPr>
-        <w:t>შედეგები რელევანტურია როგორც პერსონალური ასისტენტების, ასევე საგანმანათლებლო და სამედიცინო მიზნებისთვის შექმნილი საუბრის სისტემების განვითარებისთვის.</w:t>
+        <w:t>შედეგები რელევანტურია როგორც პერსონალური ასისტენტების, ისე საგანმანათლებლო და სამედიცინო დანიშნულების სასაუბრო სისტემების შემუშავებისთვის.</w:t>
       </w:r>
     </w:p>
     <w:p>

</xml_diff>

<commit_message>
polish(§2.2): Sonnet-5 fluency + terminology, meaning verified
§2.2 (Theoretical foundations), 8 units: real mistranslation fixes — distils→
გამოხდის (was "consolidates"), anticipating→ვითვალისწინებთ (was "assume"),
premise→წანამძღვარი, nonsense-syllables→უაზრო მარცვლები; glossary theory terms
unified; grammar/agreement. All 8 citations, all proper names, and the Ebbinghaus
+ no-cognitive-fidelity caveats preserved. Both editions rebuilt.

Co-Authored-By: Claude Opus 4.8 (1M context) <noreply@anthropic.com>
</commit_message>
<xml_diff>
--- a/project/thesis-ka.docx
+++ b/project/thesis-ka.docx
@@ -1397,7 +1397,7 @@
           <w:rFonts w:ascii="Sylfaen" w:hAnsi="Sylfaen"/>
           <w:sz w:val="24"/>
         </w:rPr>
-        <w:t>25</w:t>
+        <w:t>24</w:t>
       </w:r>
     </w:p>
     <w:p>
@@ -2781,7 +2781,7 @@
           <w:sz w:val="24"/>
           <w:lang w:val="ka-GE"/>
         </w:rPr>
-        <w:t>ამ ნაშრომის ცენტრალური პრინციპია, რომ ადამიანის მეხსიერება ერთგვარ საცავს კი არ წარმოადგენს, არამედ ურთიერთქმედებადი სისტემების ერთობლიობას, თითოეულ მათგანს კი — განსაკუთრებული დინამიკა აქვს. ამ დინამიკებს კი, თავისუფალი მეტაფორების ნაცვლად, შესაძლებელია, განვიხილოთ, როგორც დიზაინის სპეციფიკაციები, რომლებსაც დაკვირვებადი შედეგები მოჰყვება. შესაბამისად, ჩვენ ძირითად თეორიებს განვიხილავთ არა როგორც ინტელექტუალურ ისტორიას, არამედ იმ ქცევითი კვალით, რომელსაც თითოეული მათგანი პროგნოზირებს: ანუ, რა ხილვად მოქმედებას განახორციელებდა მომხმარებლის მიერ აღქმული, ამ მექანიზმით აღჭურვილი თანამოსაუბრე.</w:t>
+        <w:t>ნაშრომის ცენტრალური წანამძღვარია, რომ ადამიანის მეხსიერება ერთიანი საცავი კი არ არის, არამედ ურთიერთმოქმედი სისტემების ერთობლიობა, რომელთაგან თითოეულს საკუთარი დინამიკა გააჩნია — და რომ ეს დინამიკები თავისუფალი მეტაფორების ნაცვლად შეიძლება წაკითხულ იქნეს, როგორც დაკვირვებადი შედეგების მქონე დიზაინის სპეციფიკაციები. ამიტომ ძირითად თეორიებს განვიხილავთ არა როგორც ინტელექტუალურ ისტორიას, არამედ იმ ქცევითი ნიშან-თვისების მიხედვით, რომელსაც თითოეული მათგანი პროგნოზირებს: რას გააკეთებდა თვალსაჩინოდ ამ მექანიზმით აღჭურვილი თანამოსაუბრე, როგორც ეს მომხმარებელს აღექმებოდა.</w:t>
       </w:r>
     </w:p>
     <w:p>
@@ -2795,7 +2795,7 @@
           <w:sz w:val="24"/>
           <w:lang w:val="ka-GE"/>
         </w:rPr>
-        <w:t>მრავალსაცავიანი მოდელი. ატკინსონისა და შიფრინის [20] მიხედვით, მეხსიერება წარმოადგენს სამი საწყობის — სენსორული, მოკლევადიანი და გრძელვადიანი — ჯაჭვს, რომლის გავლითაც კონტენტი გადაადგილდება მხოლოდ მაშინ, როდესაც მასზე კონტროლის პროცესები მოქმედებს; გამეორება გადამწყვეტი პროცესია, რომელიც ყურადღებით აღქმულ მასალას მდგრად საცავში გადააქვს, ხოლო ის, რაც გამეორების გარეშე რჩება, უბრალოდ ქრება. მისი ქცევითი ნიშან-თვისება არის მკვეთრი ასიმეტრია იმას შორის, რაც უბრალოდ გაიგონა და იმას შორის, რასაც ყურადღება მიექცა და გაიმეორა — ამ პრინციპით შექმნილი პარტნიორი შეინარჩუნებდა ხაზგასმულ ან ხელახლა განხილულ ინფორმაციას და დაკარგავდა იმას, რაც ერთხელ და შეუმჩნევლად გაიარა.</w:t>
+        <w:t>მრავალსაცავიანი მოდელი. ატკინსონისა და შიფრინის [20] მიხედვით, მეხსიერება სამი საცავის — სენსორული, მოკლევადიანი და გრძელვადიანი — ჯაჭვს ქმნის, რომლის გავლითაც შინაარსი მხოლოდ მაშინ გადაადგილდება, როცა მასზე საკონტროლო პროცესები მოქმედებს; ამათგან გადამწყვეტია გამეორება, რომელიც ყურადღებით მიღებულ მასალას მდგრად საცავში გადააქვს, ხოლო რაც გამეორების გარეშე გაივლის, უბრალოდ ქრება. მისი ქცევითი ნიშან-თვისებაა მკვეთრი ასიმეტრია უბრალოდ მოსმენილსა და იმას შორის, რასაც ყურადღება მიექცა და გამეორდა — ამ პრინციპზე აგებული პარტნიორი შეინარჩუნებდა ხაზგასმულ ან ხელახლა მოხმობილ ინფორმაციას და დაკარგავდა იმას, რაც მხოლოდ ერთხელ და შეუმჩნევლად გაიარა.</w:t>
       </w:r>
     </w:p>
     <w:p>
@@ -2809,7 +2809,7 @@
           <w:sz w:val="24"/>
           <w:lang w:val="ka-GE"/>
         </w:rPr>
-        <w:t>მუშა მეხსიერება. ბედლიმ და ჰიჩმა [21] პასიური მოკლევადიანი საცავი აქტიურ, ტევადობით შეზღუდულ მუშა მეხსიერებად გარდაქმნეს, რომლის სპეციალიზებულ ქვესისტემებსაც ცენტრალური აღმასრულებელი მართავს. საუბრის აგენტისთვის შესაბამისი ნიშანია მორიგეობის შიდა პერიოდი: ერთდროულად აქტიურ მანიპულაციაში მხოლოდ რამდენიმე ერთეულის შენარჩუნებაა შესაძლებელი, რაც პირდაპირ უკავშირდება დაყოვნებით შეზღუდულ "მუშა ნაკრებს", რომელზეც ხმის აგენტს შეუძლია იფიქროს, სანამ გრძელვადიან საცავთან კონსულტაციას გაივლის.</w:t>
+        <w:t>მუშა მეხსიერება. ბედლიმ და ჰიჩმა [21] პასიური მოკლევადიანი საცავი გარდაქმნეს აქტიურ, ტევადობით შეზღუდულ მუშა მეხსიერებად, რომლის სპეციალიზებულ ქვესისტემებსაც ცენტრალური აღმასრულებელი მართავს. საუბრის აგენტისთვის შესაბამისი ნიშან-თვისება ვლინდება ერთი სვლის ფარგლებში: ერთდროულად აქტიურ მანიპულაციაში მხოლოდ რამდენიმე ერთეულის შენარჩუნებაა შესაძლებელი, რაც პირდაპირ კავშირშია დაყოვნებით (latency) შეზღუდულ „მუშა ნაკრებთან“, რომელზეც ხმის აგენტს შეუძლია იმსჯელოს, სანამ გრძელვადიან საცავს არ მიმართავს.</w:t>
       </w:r>
     </w:p>
     <w:p>
@@ -2823,7 +2823,7 @@
           <w:sz w:val="24"/>
           <w:lang w:val="ka-GE"/>
         </w:rPr>
-        <w:t>ეპიზოდური და სემანტიკური განასხვავებლობა. ტულვინგმა [22] ზღვარი გაავლო კონკრეტული მოვლენის დამახსოვრებას, რომლის განთავსებაც საკუთარ წარსულშია შესაძლებელი ("გასულ სამშაბათს შენი დედლაინის შესახებ ახსენე"), და უბრალოდ ფაქტის ცოდნას შორის, რომელიც თავისი თავდაპირველი კონტექსტისგან არის მოშორებული ("შენ დედლაინების ქვეშ მუშაობ") — ეპიზოდურ და სემანტიკურ მეხსიერებას შორის. ეს გამიჯვნა ფუნდამენტურია წინამდებარე ნაშრომისთვის, რადგან ორი სისტემა აშკარად განსხვავებულ საუბრის მანერას ქმნის: ეპიზოდური პარტნიორი კონკრეტულ მომენტებს იხსენებს, ხოლო სემანტიკური პარტნიორი მათ მომხმარებლის შესახებ სტაბილურ ცოდნად აქცევს. პირველის მეორედ გარდაქმნა — კონსოლიდაცია — სწორედ ის პროცესია, რომელიც ხანგრძლივ საუბრის სისტემას უნდა შეასრულოს, რათა "დაუმუშავებელ" ეპიზოდებში არ ჩაიძიროს.</w:t>
+        <w:t>ეპიზოდური/სემანტიკური გამიჯვნა. ტულვინგმა [22] ზღვარი გაავლო კონკრეტული მოვლენის დამახსოვრებასა, რომლის საკუთარ წარსულში მოთავსებაც შესაძლებელია („გასულ სამშაბათს შენი დედლაინის შესახებ ახსენე“), და უბრალოდ ფაქტის ცოდნას შორის, რომელიც თავისი პირველადი შემთხვევისგან არის მოწყვეტილი („შენ დედლაინების ქვეშ მუშაობ“) — ანუ ეპიზოდურ და სემანტიკურ მეხსიერებას შორის. ეს გამიჯვნა ფუნდამენტურია წინამდებარე ნაშრომისთვის, რადგან ეს ორი სისტემა საუბარში აშკარად განსხვავებულ ქცევას წარმოქმნის: ეპიზოდური პარტნიორი კონკრეტულ მომენტებს იხსენებს, ხოლო სემანტიკურ პარტნიორს ისინი მომხმარებლის შესახებ სტაბილურ ცოდნად აქვს გამოხდილი. პირველის მეორედ გარდაქმნა — კონსოლიდაცია — სწორედ ის პროცესია, რომელიც ხანგრძლივმოქმედმა თანამოსაუბრე-სისტემამ უნდა შეასრულოს, რათა დაუმუშავებელ ეპიზოდებში არ ჩაიძიროს.</w:t>
       </w:r>
     </w:p>
     <w:p>
@@ -2837,7 +2837,7 @@
           <w:sz w:val="24"/>
           <w:lang w:val="ka-GE"/>
         </w:rPr>
-        <w:t>დავიწყების მრუდი. ებინგჰაუსის მეცხრამეტე საუკუნის ექსპერიმენტებმა [23] აჩვენა, რომ მეხსიერების სიძლიერე მცირდება დაახლოებით ექსპონენციურად იმ დროის გასვლის მიხედვით, რაც რაიმეს ბოლოს გამეორებიდან გავიდა, და რომ დროში გადანაწილებული განმეორებები ამ კლებას ამცირებს. ჩვენ ვიყენებთ დავიწყების მრუდს ერთი მკაფიო შენიშვნით, ვინაიდან ვვარაუდობთ აშკარა წინააღმდეგობას: ებინგჰაუსმა გაზომა ერთი სუბიექტის უაზრო ბგერათა კომბინაციების მეხსიერება და მისი ეკოლოგიური ვალიდურობა სემანტიკურად მდიდარი დიალოგისთვის შეზღუდულია. შესაბამისად, წინამდებარე ნაშრომი არ ამტკიცებს კოგნიტურ ერთგულებას; ის გრაციოზულ, დროზე და თვალსაჩინოობაზე დამოკიდებულ დაქრობას განიხილავს, როგორც ინჟინერიული თვალსაზრისით სასარგებლო ქცევის ფორმას, რომლის ობიექტიც მომხმარებლის აღქმაზე მისი გავლენაა და არა — ფსიქოლოგიური სიზუსტე. მისი საფირმო ნიშანია არამეორებული დეტალების გრაციოზული გაქრობა და იმის გაძლიერება, რაც მეორდება.</w:t>
+        <w:t>დავიწყების მრუდი. ებინგჰაუსის მეცხრამეტე საუკუნის ექსპერიმენტებმა [23] აჩვენა, რომ მეხსიერების სიძლიერე კლებულობს დაახლოებით ექსპონენციურად იმ დროის მიხედვით, რაც რაიმეს ბოლო გამეორებიდან გავიდა, და რომ დროში გადანაწილებული განმეორება ამ კლებას ანელებს. ჩვენ დავიწყების მრუდს ვიყენებთ ერთი მკაფიო დათქმით, რადგან წინასწარ ვითვალისწინებთ აშკარა წინააღმდეგობას: ებინგჰაუსმა მეხსიერება მხოლოდ ერთ სუბიექტზე, უაზრო მარცვლების გამოყენებით გაზომა, და მისი ეკოლოგიური ვალიდურობა სემანტიკურად მდიდარი დიალოგისთვის შეზღუდულია. შესაბამისად, წინამდებარე ნაშრომი კოგნიტურ ერთგულებას არ ამტკიცებს; ის გრაციოზულ, დროზე და თვალსაჩინოობაზე დამოკიდებულ დაქრობას განიხილავს, როგორც ინჟინერიული თვალსაზრისით სასარგებლო ქცევის ფორმას, რომლის შესწავლის ობიექტიც მომხმარებლის აღქმაზე მისი გავლენაა და არა — მისი ფსიქოლოგიური სიზუსტე. მისი ნიშან-თვისებაა არამეორებული დეტალების გრაციოზული გაქრობა და იმის გაძლიერება, რაც მეორდება.</w:t>
       </w:r>
     </w:p>
     <w:p>
@@ -2851,7 +2851,7 @@
           <w:sz w:val="24"/>
           <w:lang w:val="ka-GE"/>
         </w:rPr>
-        <w:t>ბუნდოვანი კვალის თეორია. რეინა და ბრენერდი [24] მიიჩნევენ, რომ ნებისმიერი გამოცდილება ერთდროულად ტოვებს ორ დამოუკიდებელ კვალს — ზედაპირული ფორმის სიტყვასიტყვით ჩანაწერს (ვერბატიმი) და მისი მნიშვნელობის არსებით ჩანაწერს (gist), რომელთაგან უკანასკნელი უფრო დიდხანს ძლებს და უფრო ხშირად წარმართავს შეფასებას. ეს განასხვავება პირდაპირ უკავშირდება ჩვენი კვლევის კითხვას: სიტყვასიტყვითი/მთავარი აზრის კონტრასტი ემთხვევა ქვემოთ განხილულ ცენტრალურ ემპირიულ აღმოჩენას — რომ ჩატ-ბოტის მიერ სიტყვასიტყვითი გახსენება შეიძლება შემაწუხებლად აღიქმებოდეს იქ, სადაც პარაფრაზირებული, მთავარი აზრის დონის გახსენება — არა [11]. პარტნიორი, რომელიც თქვენი ნათქვამის ზუსტი სიტყვების ნაცვლად მის მნიშვნელობას იხსენებს, აჩვენებს ცნობად ადამიანურ კვალს და, ამავდროულად, შესაძლოა თავიდან აიცილოს სრული გახსენების დისკომფორტი.</w:t>
+        <w:t>ბუნდოვანი კვალის თეორია. რეინა და ბრენერდი [24] მიიჩნევენ, რომ ნებისმიერი გამოცდილება ერთდროულად ტოვებს ორ დამოუკიდებელ კვალს — ზედაპირული ფორმის სიტყვასიტყვით ჩანაწერს (verbatim) და მნიშვნელობის არსობრივ ჩანაწერს (gist) — რომელთაგან უკანასკნელი უფრო დიდხანს ძლებს და უფრო ხშირად წარმართავს შეფასებას. ეს განსხვავება პირდაპირ უკავშირდება ჩვენი კვლევის კითხვას: სიტყვასიტყვითი/არსობრივი (gist) კონტრასტი ემთხვევა ქვემოთ განხილულ ცენტრალურ ემპირიულ აღმოჩენას — რომ ჩატ-ბოტის მიერ სიტყვასიტყვითი გახსენება შემაწუხებლად შეიძლება აღიქმებოდეს, მაშინ როცა პარაფრაზირებული, არსობრივი (gist) დონის გახსენება ასეთად არ აღიქმება [11]. პარტნიორი, რომელიც თქვენი ნათქვამის ზუსტი სიტყვების ნაცვლად მის მნიშვნელობას იხსენებს, აჩვენებს ცნობად ადამიანურ ნიშან-თვისებას და, ამავდროულად, შესაძლოა თავიდან აიცილოს სრული გახსენების დისკომფორტი.</w:t>
       </w:r>
     </w:p>
     <w:p>
@@ -2865,7 +2865,7 @@
           <w:sz w:val="24"/>
           <w:lang w:val="ka-GE"/>
         </w:rPr>
-        <w:t>კონსოლიდაცია: კომპლემენტარული სასწავლო სისტემები და ჰიპოკამპური ინდექსაცია. ორი ნეიროკოგნიტური თეორია აღწერს, თუ როგორ იქცევა ეპიზოდური გამოცდილება ხანგრძლივ ცოდნად. კომპლემენტარული სასწავლო სისტემების მიდგომის [25] თანახმად, ერთი სისტემა, რომელიც ჰიპოკამპუსზეა ცენტრირებული, ინდივიდუალურ ეპიზოდებს სწრაფად აღიქვამს, მაშინ როცა მეორე, კორტიკული სისტემა განმეორებად სტრუქტურას მხოლოდ ნელა აკონსოლიდებს, და ოფლაინ გამეორება გადატანას უზრუნველყოფს ჩაწერილ ინფორმაციას ამ ნელი საცავისკენ. ინდექსაციის თეორია [26] ამატებს, რომ ჰიპოკამპს არც კი სჭირდება მეხსიერების შენახვა — მას უბრალოდ აქვს მითითებები იმ კორტიკულ ნიმუშებზე, რომლებიც მათ ქმნიდა, ასე რომ, მინიშნების ფრაგმენტს შეუძლია მთლიანი მეხსიერების აღდგენა. ორივე მათგანი პროგნოზირებს ერთსა და იმავე მაღალი დონის ქცევით ნიშან-თვისებას — აგენტს, რომელიც ეპიზოდებს სწრაფად იმახსოვრებს, მაგრამ მათ ურთიერთქმედებებს შორის პერიოდში სტრუქტურირებულ ცოდნად რეორგანიზებას ახდენს — და ორივეს, როგორც 2.4-შია ნაჩვენები, ჰყავს პირდაპირი გამოთვლითი შთამომავლები.</w:t>
+        <w:t>კონსოლიდაცია: კომპლემენტარული სასწავლო სისტემები და ჰიპოკამპური ინდექსაცია. ორი ნეიროკოგნიტური თეორია აღწერს, თუ როგორ იქცევა ეპიზოდური გამოცდილება ხანგრძლივ ცოდნად. კომპლემენტარული სასწავლო სისტემების მიდგომის [25] თანახმად, ერთი სისტემა, ჰიპოკამპუსზე ცენტრირებული, ინდივიდუალურ ეპიზოდებს სწრაფად იჭერს, მაშინ როცა მეორე, კორტიკული სისტემა განმეორებად სტრუქტურას მხოლოდ ნელა გამოხდის; ამასთან, ოფლაინ გამეორება ჩაჭერილ მასალას ამ ნელ საცავში გადააქვს. ინდექსაციის თეორია [26] ამატებს, რომ ჰიპოკამპს საერთოდ არ სჭირდება მეხსიერების შენახვა — მას მხოლოდ მიმანიშნებლები აქვს იმ კორტიკულ ნიმუშებზე, რომლებმაც ისინი შექმნა, ისე რომ მინიშნების ფრაგმენტს მთელი მეხსიერების აღდგენა შეუძლია. ორივე მათგანი პროგნოზირებს ერთსა და იმავე მაღალი დონის ქცევით ნიშან-თვისებას — აგენტს, რომელიც ეპიზოდებს სწრაფად იჭერს, მაგრამ ურთიერთქმედების გარეშე პერიოდებში მათ სტრუქტურირებულ ცოდნად რეორგანიზებას ახდენს — და ორივეს, როგორც 2.4-შია ნაჩვენები, აქვს პირდაპირი გამოთვლითი შთამომავლები.</w:t>
       </w:r>
     </w:p>
     <w:p>
@@ -2877,7 +2877,7 @@
           <w:sz w:val="24"/>
           <w:lang w:val="ka-GE"/>
         </w:rPr>
-        <w:t>ცხრილი 2.1 (2.4) შეჯამებულად წარმოადგენს, თუ როგორ განხორციელდა თითოეული ამ თეორიის ოპერაციონალიზება უახლეს LLM-აგენტების სისტემებში; თავდაპირველად, ჩვენ განვიხილავთ ამ სისტემებს მათივე პრინციპების მიხედვით.</w:t>
+        <w:t>ცხრილი 2.1 (2.4) აჯამებს, თუ როგორ განხორციელდა თითოეული მათგანის ოპერაციონალიზაცია უახლეს LLM-აგენტების სისტემებში; ჯერ ამ სისტემებს მათივე პრინციპების მიხედვით განვიხილავთ.</w:t>
       </w:r>
     </w:p>
     <w:p>

</xml_diff>

<commit_message>
polish(§2.3): Sonnet-5 fluency + terminology, meaning verified
§2.3 (Three waves), 4 units: LLM term, ASCII→„…" quotes, retrieval calque
cleanup, verb agreement. All 16 system names + 11 citations preserved exactly;
ACT-R/Zettelkasten/wave-3 honesty hedges intact. Both editions rebuilt.

Co-Authored-By: Claude Opus 4.8 (1M context) <noreply@anthropic.com>
</commit_message>
<xml_diff>
--- a/project/thesis-ka.docx
+++ b/project/thesis-ka.docx
@@ -2911,7 +2911,7 @@
           <w:sz w:val="24"/>
           <w:lang w:val="ka-GE"/>
         </w:rPr>
-        <w:t>დიდი ენის მოდელის აგენტების კონტექსტური ფანჯრის მიღმა მეხსიერებით აღჭურვის მიდგომები 2023-დან 2026 წლამდე სამ გამოკვეთილ ტალღად განვითარდა.</w:t>
+        <w:t>დიდი ენობრივი მოდელის (LLM) აგენტების კონტექსტური ფანჯრის მიღმა მეხსიერებით აღჭურვის მიდგომები 2023-დან 2026 წლამდე სამ გამოკვეთილ ტალღად განვითარდა.</w:t>
       </w:r>
     </w:p>
     <w:p>
@@ -2925,7 +2925,7 @@
           <w:sz w:val="24"/>
           <w:lang w:val="ka-GE"/>
         </w:rPr>
-        <w:t>პირველი ტალღა — კონტექსტის ვირტუალიზაცია და ადამიანის მიერ შთაგონებული ადრეული საცავები (2023). პირველ სისტემებში შეზღუდული კონტექსტური ფანჯარა აღიქმებოდა როგორც მართვადი შეზღუდვა. MemGPT [17] იღებს ოპერაციული სისტემის ვირტუალური მეხსიერების იდეას: ფუნქციების გამოძახების მეშვეობით თავად მოდელი გადააქვს ინფორმაცია კონტექსტში არსებულ "ძირითად" საცავსა და კონტექსტისგარეშე არსებულ, უფრო დიდ არქივულ და მოხმობის დონეებს შორის, რითაც ქმნის საკუთარ იერარქიას. პარალელურად, ორმა სისტემამ შთაგონების წყაროდ ადამიანის მეხსიერება გამოიყენა. Generative Agents-ის არქიტექტურამ [10] შემოიღო უკვე კანონიკური "მეხსიერების ნაკადი": დაკვირვებების ქრონოლოგიური, ბუნებრივი ენის ლოგფაილი. როდესაც საცავს ეკითხებიან, თითოეული ჩანაწერი რანჟირებულია სამი ფაქტორის შერწყმით — რამდენად ახლახან მოხდა მასზე წვდომა (ექსპონენციური კლება), რამდენად მნიშვნელოვნად მიიჩნია მოდელმა (LLM-ის მიერ მინიჭებული შეფასება) და რამდენად რელევანტურია ის მოთხოვნასთან (ემბედინგის მსგავსება) — ხოლო პერიოდული "რეფლექსიის" ეტაპები ჟურნალიდან უფრო მაღალი დონის დაკვირვებებს გამოაქვს. მნიშვნელოვანია ზუსტად აღინიშნოს, რა არის და რა არ არის ეს: მონაცემების მოძიების ქულა (retrieval score) გვახსენებს აქტივაციაზე დაფუძნებულ თეორიებს, როგორიცაა ACT-R, მაგრამ ის ავტორების საკუთარი საინჟინრო კონსტრუქციაა და არ არის ნებისმიერი კოგნიტური მოდელისგან ნაწარმოები — ეს არის განსხვავება, რომელსაც ვიცავთ თეორიული მემკვიდრეობის გადაჭარბების თავიდან ასაცილებლად. ამის საპირისპიროდ, MemoryBank [6] პირდაპირ ეფუძნებოდა ებინგჰაუსის დავიწყების მრუდს და თითოეული მოგონების სიძლიერეს მოდელირებდა გასული დროის ექსპონენციალურ ფუნქციად, რომელიც ხელახალი წვდომისას ძლიერდებოდა; ის ამუშავებდა SiliconFriend-ს, გრძელვადიან "კომპანიონის" ტიპის ჩატ-ბოტს და ამჟამინდელი ნაშრომის უახლოეს პირდაპირ პრეცედენტს (უახლოესს გამოცხადებული კრიტერიუმით: სისტემა ეგრეთ წოდებულ "კომპანიონის" ჟანრში, რომლის მეხსიერებაც ადამიანის მეხსიერების თეორიაზეა დაფუძნებული).</w:t>
+        <w:t>პირველი ტალღა — კონტექსტის ვირტუალიზაცია და ადამიანის მიერ შთაგონებული ადრეული საცავები (2023). პირველ სისტემებში შეზღუდული კონტექსტური ფანჯარა აღიქმებოდა როგორც მართვადი შეზღუდვა. MemGPT [17] სესხულობს ოპერაციული სისტემის ვირტუალური მეხსიერების იდეას: ფუნქციების გამოძახების მეშვეობით თავად მოდელი გადააქვს ინფორმაციას კონტექსტში არსებულ „ძირითად“ საცავსა და კონტექსტს გარეთ არსებულ, უფრო დიდ არქივულ და მოხმობის დონეებს შორის, რითაც განაგებს საკუთარ იერარქიას. პარალელურად, ორმა სისტემამ შთაგონების წყაროდ ადამიანის მეხსიერება გამოიყენა. Generative Agents-ის არქიტექტურამ [10] შემოიღო უკვე კანონიკური „მეხსიერების ნაკადი“: დაკვირვებების ქრონოლოგიური, ბუნებრივ ენაზე შედგენილი ჟურნალი. საცავის გამოკითხვისას თითოეული ჩანაწერი რანჟირდება სამი ფაქტორის შერწყმით — რამდენად ახლახან მოხდა მასზე წვდომა (ექსპონენციური კლება), რამდენად მნიშვნელოვნად მიიჩნია იგი მოდელმა (LLM-ის მიერ მინიჭებული შეფასება) და რამდენად რელევანტურია იგი მოთხოვნასთან (ემბედინგის მსგავსება) — ხოლო პერიოდული „რეფლექსიის“ ეტაპები ჟურნალიდან უფრო მაღალი დონის დაკვირვებებს გამოაქვს. მნიშვნელოვანია ზუსტად დაფიქსირდეს, რა არის და რა არ არის ეს: მოძიების ქულა გვახსენებს აქტივაციაზე დაფუძნებულ თეორიებს, როგორიცაა ACT-R, მაგრამ ის ავტორების საკუთარი საინჟინრო კონსტრუქციაა და არცერთ კოგნიტურ მოდელს არ ეფუძნება — ეს განსხვავებაა, რომელსაც ვინარჩუნებთ, რათა არ გადავაჭარბოთ მის თეორიულ მემკვიდრეობას. ამის საპირისპიროდ, MemoryBank [6] პირდაპირ ეფუძნებოდა ებინგჰაუსის დავიწყების მრუდს და თითოეული მოგონების სიძლიერეს გასული დროის ექსპონენციალურ ფუნქციად მოდელირებდა, რომელიც ხელახალი წვდომისას ძლიერდებოდა. ის ამუშავებდა SiliconFriend-ს — გრძელვადიან, ე.წ. „კომპანიონის“ ტიპის ჩატბოტს და ამჟამინდელი ნაშრომის უახლოეს პირდაპირ პრეცედენტს (უახლოესს გამოცხადებული კრიტერიუმით: სისტემა ეგრეთ წოდებულ „კომპანიონის“ ჟანრში, რომლის მეხსიერებაც ადამიანის მეხსიერების თეორიას ეფუძნება).</w:t>
       </w:r>
     </w:p>
     <w:p>
@@ -2939,7 +2939,7 @@
           <w:sz w:val="24"/>
           <w:lang w:val="ka-GE"/>
         </w:rPr>
-        <w:t>მეორე ტალღა — საწარმოო მეხსიერების ფენები და ნეირო-შთაგონებული მოძიების მექანიზმები (2024–2025). მეორე ტალღა კვლევითი პროტოტიპებიდან გადავიდა გამოყენებადი მეხსიერების სერვისებისა და ნეირომეცნიერებიდან ნასესხები მონაცემების მოძიების მექანიზმებისკენ. Mem0 [29] ახორციელებს მეხსიერების ფენას, რომელიც დიალოგიდან გამოყოფს მნიშვნელოვან ფაქტებს და თანდათანობით ახდენს კონსოლიდირებული საცავის განახლებას; მისი ავტორები იუწყებიან მნიშვნელოვან გაუმჯობესებას ძლიერ საწყის მაჩვენებელთან შედარებით საუბრის მეხსიერების ამოცანებში, დაყოვნებისა და ტოკენების ხარჯის მნიშვნელოვან შემცირებასთან ერთად. Zep [30], რომელიც Graphiti-ს დროში გათვლილ ცოდნის გრაფის ძრავაზეა აგებული, მეხსიერებას წარმოაჩენს, როგორც ორდროით გრაფს, რომელიც თვალყურს ადევნებს როგორც იმას, თუ როდის მოხდა მოვლენა, ასევე იმას, თუ როდის დაფიქსირდა ის; მისი ავტორები ასევე იუწყებიან სიზუსტის გაუმჯობესებასა და შეყოვნების მნიშვნელოვან შემცირებას გრძელვადიანი მეხსიერების შეფასებისას (მომწოდებლის მიერ მოწოდებული ეს მონაცემები უნდა განვიხილოთ 2.5-ში აღწერილი ბენჩმარკის საიმედოობასთან დაკავშირებული საკითხების ფონზე). ორივე მათგანი აღნიშნავს ტალღის განმსაზღვრელ ცვლილებას — პირველ ტალღაში არსებული ეპიზოდების უბრალო აღრიცხვიდან მუდმივად კონსოლიდირებული საცავის შენარჩუნებისკენ — და ორივე წინა პლანზე წამოსწევს შეყოვნებასა და ხარჯებს, რაც მიუთითებს კვლევითი პროტოტიპიდან საწარმოო სერვისზე გადასვლაზე. ამ ტალღის ორი სისტემა განსაკუთრებით თეორიული ინტერესის საგანია. HippoRAG [7] უშუალოდ ოპერაციულს ხდის ჰიპოკამპური მეხსიერების ინდექსაციის თეორიას: ის დიდი ენის მოდელს (LLM) ნეოკორტექსად წარმოაჩენს, მონაცემების მოძიების კოდირატორებს — პარահიპოკამპურ რეგიონად, ხოლო პერსონალიზებული PageRank-ით დათვალიერებად ცოდნის გრაფს — ჰიპოკამპურ ინდექსად, რითაც გრაფის ძიების მეშვეობით მრავალნახტომიან მონაცემთა მოძიებას აღწევს. EM-LLM [8] ეფუძნება ადამიანის ეპიზოდურ მეხსიერებასა და მოვლენების სეგმენტაციის თეორიას [31], ტოკენების ნაკადს ყოფს დისკრეტულ მოვლენებად ბაიესის "გაკვირვების" (surprise) საფუძველზე გამოვლენილ საზღვრებზე და მათ იძიებს მსგავსებაზე დაფუძნებული და დროში მიმდევრობითი წვდომის კომბინაციით. იმავე პერიოდის ReadAgent-ი [9] იდეას "მთავარი აზრის" შესახებ პრაქტიკაში ნერგავს: ის გრძელ კონტექსტს ეპიზოდის ზომის გვერდებად ყოფს, თითოეულისგან მხოლოდ LLM-ის მიერ შექმნილ მთავარ აზრს ინახავს და საწყის ტექსტს მხოლოდ მაშინ უბრუნდება, როდესაც ამოცანა დეტალებს მოითხოვს. კიდევ ერთი აღსანიშნავი სისტემა, A-MEM [27], მოგონებებს აწყობს, როგორც ჩანაწერების ურთიერთდაკავშირებული ქსელი, რომელსაც აგენტი თავად აფართოებს და ასწორებს; თუმცა, ჩვენ აღვნიშნავთ, რომ ის ეფუძნება Zettelkasten-ის მეთოდს, რომელიც ინფორმაციის ორგანიზების პრაქტიკაა და არა ადამიანის მეხსიერების თეორია — ეს განასხვავება მნიშვნელოვანია ჩვენი კონკრეტული ჩარჩოსთვის.</w:t>
+        <w:t>მეორე ტალღა — საწარმოო მეხსიერების ფენები და ნეირო-შთაგონებული მოძიების მექანიზმები (2024–2025). მეორე ტალღა კვლევითი პროტოტიპებიდან გადავიდა დანერგვადი მეხსიერების სერვისებისა და ნეირომეცნიერებიდან ნასესხები მოძიების მექანიზმებისკენ. Mem0 [29] ახორციელებს მეხსიერების ფენას, რომელიც დიალოგიდან გამოყოფს საყურადღებო ფაქტებს და თანდათანობით ანახლებს კონსოლიდირებულ საცავს; მისი ავტორები იუწყებიან მნიშვნელოვან გაუმჯობესებას ძლიერ საწყის მაჩვენებელთან შედარებით საუბრის მეხსიერების ამოცანებში, დაყოვნებისა და ტოკენების ხარჯის მნიშვნელოვან შემცირებასთან ერთად. Zep [30], რომელიც Graphiti-ს დროზე მგრძნობიარე ცოდნის-გრაფის ძრავაზეა აგებული, მეხსიერებას წარმოაჩენს როგორც ორდროით გრაფს, რომელიც თვალყურს ადევნებს როგორც იმას, თუ როდის მოხდა მოვლენა, ასევე იმას, თუ როდის დაფიქსირდა ის. მისი ავტორები ასევე იუწყებიან სიზუსტის გაუმჯობესებასა და დაყოვნების მნიშვნელოვან შემცირებას გრძელვადიანი მეხსიერების შეფასებისას (მომწოდებლის მიერ დაფიქსირებული ეს მაჩვენებლები უნდა განვიხილოთ 2.5-ში აღწერილი ბენჩმარკის საიმედოობასთან დაკავშირებული საკითხების ფონზე). ორივე მათგანი აღნიშნავს ტალღის განმსაზღვრელ ცვლილებას — პირველ ტალღაში არსებული ეპიზოდების უბრალო აღრიცხვიდან მუდმივად კონსოლიდირებული საცავის შენარჩუნებისკენ — და ორივე წინა პლანზე წამოსწევს დაყოვნებასა და ხარჯებს, რაც მიუთითებს კვლევითი პროტოტიპიდან საწარმოო სერვისზე გადასვლაზე. ამ ტალღის ორი სისტემა განსაკუთრებით თეორიული ინტერესის საგანია. HippoRAG [7] უშუალოდ ოპერაციულს ხდის ჰიპოკამპური მეხსიერების ინდექსაციის თეორიას: ის LLM-ს ნეოკორტექსად წარმოაჩენს, მოძიების კოდირატორებს — პარაჰიპოკამპურ რეგიონად, ხოლო Personalized PageRank-ით განვლილ ცოდნის გრაფს — ჰიპოკამპურ ინდექსად, რითაც გრაფის ძიების მეშვეობით მრავალნახტომიან მოძიებას აღწევს. EM-LLM [8] ეფუძნება ადამიანის ეპიზოდურ მეხსიერებასა და მოვლენების სეგმენტაციის თეორიას [31] და ტოკენების ნაკადს ყოფს დისკრეტულ მოვლენებად ბაიესის „გაკვირვების“ (surprise) საფუძველზე გამოვლენილ საზღვრებზე, ხოლო მათ იძიებს მსგავსებაზე დაფუძნებული და დროში მიმდევრობითი წვდომის კომბინაციით. იმავე პერიოდის ReadAgent-ი [9] პრაქტიკაში ნერგავს არსობრივის (gist) იდეას: ის გრძელ კონტექსტს ყოფს ეპიზოდის ზომის გვერდებად, თითოეულისგან მხოლოდ LLM-ის მიერ შედგენილ არსობრივს (gist) ინახავს და საწყის ტექსტს მხოლოდ მაშინ უბრუნდება, როდესაც ამოცანა დეტალებს მოითხოვს. კიდევ ერთი აღსანიშნავი სისტემა, A-MEM [27], მოგონებებს აწყობს ჩანაწერების ურთიერთდაკავშირებულ ქსელად, რომელსაც აგენტი თავად აფართოებს და ასწორებს. თუმცა, ჩვენ აღვნიშნავთ, რომ ის ეფუძნება Zettelkasten-ის ჩანაწერების მეთოდს, რომელიც ინფორმაციის ორგანიზების პრაქტიკაა და არა ადამიანის მეხსიერების თეორია — ეს განსხვავება მნიშვნელოვანია ჩვენი კონკრეტული ჩარჩოსთვის.</w:t>
       </w:r>
     </w:p>
     <w:p>
@@ -2953,7 +2953,7 @@
           <w:sz w:val="24"/>
           <w:lang w:val="ka-GE"/>
         </w:rPr>
-        <w:t>მესამე ტალღა — კონსოლიდაციის ეპოქა (2025–2026). 2026 წლისთვის სფეროს ყურადღება გადავიდა იმ პრობლემაზე, რომელსაც 2.2-ის კოგნიტური თეორიები წინა პლანზე წამოსწევს: კონსოლიდაციაზე. წამყვანმა პროვაიდერებმა თავიანთ სისტემებში დანერგეს ფონური, ძილსამგვარი მეხსიერების რეორგანიზაციის პროცესები — OpenAI-მ პროდუქტიზებული ფორმით, ხოლო Anthropic-მა — როგორც კვლევითი წინასწარი ვერსია [18, 19]. ეს დანერგვები მომხმარებლის მასშტაბზე ახორციელებენ (ოპერაციულს ხდიან) იმ ოფლაინ-გადათამაშების მექანიზმს, რომელსაც დამატებითი სწავლის სისტემების თეორია აღწერს. ჩვენ მათ განზრახ მოვიყვანთ ინდუსტრიის სიგნალებად და არა სამეცნიერო შედეგებად: არცერთ მათგანს არ ახლავს თან რეცენზირებული პუბლიკაცია, რაც თავისთავად მიუთითებს, რომ კონსოლიდაციის აკადემიური კვლევა დროული და ნაკლებად შესწავლილია.</w:t>
+        <w:t>მესამე ტალღა — კონსოლიდაციის ეპოქა (2025–2026). 2026 წლისთვის სფეროს ყურადღება გადავიდა იმ პრობლემაზე, რომელსაც 2.2-ის კოგნიტური თეორიები წინა პლანზე წამოსწევს: კონსოლიდაციაზე. წამყვანმა მომწოდებლებმა თავიანთ სისტემებში დანერგეს ფონური, ძილის მსგავსი მეხსიერების რეორგანიზაციის პროცესები — OpenAI-მ პროდუქტიზებული ფორმით, ხოლო Anthropic-მა კვლევითი წინასწარი ვერსიის (research preview) ფორმით [18, 19]. ეს დანერგვები მომხმარებლის მასშტაბზე ოპერაციულს ხდის იმ ოფლაინ-გადათამაშების მექანიზმს, რომელსაც დამატებითი სწავლის სისტემების თეორია აღწერს. ჩვენ მათ განზრახ მოვიხმობთ ინდუსტრიის სიგნალებად და არა სამეცნიერო შედეგებად: არცერთ მათგანს არ ახლავს თან რეცენზირებული პუბლიკაცია, რაც თავისთავად მიუთითებს, რომ კონსოლიდაციის აკადემიური კვლევა დროული და ნაკლებად შესწავლილია.</w:t>
       </w:r>
     </w:p>
     <w:p>

</xml_diff>

<commit_message>
polish(§2.4): Sonnet-5 fluency + terminology, meaning verified
§2.4 (Bridge), 2 prose units: broken referent მოდელი→პატერნი (pattern),
calque რუკირება→შესაბამისობა, plural→singular verb. Precise qualified claim
(explicit/cited grounding, exactly-one-theory, multi-mechanism carve-out) and
all hedges preserved. Both editions rebuilt.

Co-Authored-By: Claude Opus 4.8 (1M context) <noreply@anthropic.com>
</commit_message>
<xml_diff>
--- a/project/thesis-ka.docx
+++ b/project/thesis-ka.docx
@@ -2987,7 +2987,7 @@
           <w:sz w:val="24"/>
           <w:lang w:val="ka-GE"/>
         </w:rPr>
-        <w:t>ერთად განხილვისას, 2.2 და 2.3 ავლენს კანონზომიერებას, რომელიც, ჩვენი ცოდნით, ასე მკაფიოდ არასდროს დაფიქსირებულა. ჩვენ მას ფრთხილად ვფორმულირებთ, რათა თავიდან ავიცილოთ არასწორი არგუმენტის წამოწევის მცდელობა: მეხსიერების ყველა სისტემა არ ემყარება ერთ თეორიას — რამდენიმე მათგანი (Generative Agents, Mem0, Zep) მიზანმიმართულად მრავალმექანიზმიანი საინჟინრო კონსტრუქციაა და ჩვენ ამის საპირისპიროს არ ვამტკიცებთ. მოდელი უფრო ვიწრო და ზუსტია: იმ სისტემებს შორის, რომლებსაც აქვთ ექსპლიციტური, მოყვანილი თეორიული საფუძველი, თითოეული მათგანი დაფუძნებულია ზუსტად ერთ ადამიანის მეხსიერების თეორიაზე. ცხრილი 2.1 ამ შესაბამისობებს აშკარას ხდის.</w:t>
+        <w:t>ერთად განხილვისას, 2.2 და 2.3 ავლენს პატერნს, რომელიც, ჩვენი ცოდნით, აშკარად არავის ჩამოუყალიბებია. ამას სიფრთხილით ვაყალიბებთ, რათა თავიდან ავირიდოთ გამარტივებული და ადვილად უარსაყოფი მტკიცება: მეხსიერების ყველა სისტემა არ ემყარება ერთადერთ თეორიას — რამდენიმე მათგანი (Generative Agents, Mem0, Zep) მიზანმიმართულად მრავალმექანიზმიანი საინჟინრო კონსტრუქციაა, და ჩვენ ამის საწინააღმდეგოს არ ვამტკიცებთ. პატერნი ამაზე ვიწრო და ზუსტია: იმ სისტემებს შორის, რომლებსაც აშკარა (ექსპლიციტური), დამოწმებული თეორიული საფუძველი აქვთ, თითოეული ზუსტად ერთ ადამიანის მეხსიერების თეორიაზეა დაფუძნებული. ცხრილი 2.1 ამ შესაბამისობებს ცხადყოფს.</w:t>
       </w:r>
     </w:p>
     <w:p>
@@ -3451,7 +3451,7 @@
           <w:sz w:val="24"/>
           <w:lang w:val="ka-GE"/>
         </w:rPr>
-        <w:t>აქედან გამომდინარეობს ორი დაკვირვება. პირველი, რუკირება რეალურია, მაგრამ ნაწილობრივი: თეორიულად დასაბუთებული თითოეული სისტემა იყენებს ერთ მექანიზმს, იზოლირებულად და, უმთავრესად, ამოცანის სიზუსტის გასაუმჯობესებლად. მეორე — და ეს არის საკითხი, რომელსაც წინამდებარე ნაშრომი ეხება — რომ ეს თეორიულად დასაბუთებული სისტემები იშვიათად შედარებულა ერთმანეთთან და, ჩვენი ცოდნით, არასდროს — იმის თვალსაზრისით, თუ როგორ აღიქვამს მათ განსხვავებულ ქცევას ადამიანი-თანამოსაუბრე. უახლოესი პრეცედენტები ან ერთ სისტემაში აერთიანებენ მექანიზმებს, ან აფასებენ ერთი მექანიზმის სიზუსტეს. სინთეზი, რომელსაც შედარებითი, აღქმაზე ორიენტირებული კვლევა უზრუნველყოფდა, ამჟამად არ არსებობს.</w:t>
+        <w:t>აქედან გამომდინარეობს ორი დაკვირვება. პირველი, ეს შესაბამისობა რეალურია, მაგრამ ნაწილობრივი: თეორიულად დასაბუთებულ თითოეულ სისტემას შემოაქვს ერთი მექანიზმი, იზოლირებულად და, უმთავრესად, ამოცანის სიზუსტის გასაუმჯობესებლად. მეორე — და სწორედ ეს არის ის საკითხი, რომელსაც წინამდებარე ნაშრომი ეხება — ეს თეორიულად დასაბუთებული სისტემები იშვიათად შედარებულა ერთმანეთთან და, ჩვენი ცოდნით, არასდროს — იმის თვალსაზრისით, თუ როგორ აღიქვამს მათ განსხვავებულ ქცევას ადამიანი-თანამოსაუბრე. უახლოესი პრეცედენტები ან ერთ სისტემაში აერთიანებს მექანიზმებს, ან აფასებს ერთი მექანიზმის სიზუსტეს. სინთეზი, რომელსაც შედარებითი, აღქმაზე ორიენტირებული კვლევა უზრუნველყოფდა, ამჟამად არ არსებობს.</w:t>
       </w:r>
     </w:p>
     <w:p>

</xml_diff>

<commit_message>
polish(§2.5): Sonnet-5 fluency + terminology, meaning verified
§2.5 (Benchmark limits), 3 units: figures (~6%/~94%/majority) exact, robust-gap-
vs-contested-scores distinction preserved (უფრო მყარი), Multi-Session Chat + all
citations intact, alliance→full form, verb agreement. Both editions rebuilt.

Co-Authored-By: Claude Opus 4.8 (1M context) <noreply@anthropic.com>
</commit_message>
<xml_diff>
--- a/project/thesis-ka.docx
+++ b/project/thesis-ka.docx
@@ -3485,7 +3485,7 @@
           <w:sz w:val="24"/>
           <w:lang w:val="ka-GE"/>
         </w:rPr>
-        <w:t>ამ სფეროში შეფასების დომინანტური რეჟიმია ხანგრძლივი სინთეზური დიალოგების დროს კითხვა-პასუხის ბენჩმარკი. LoCoMo [1] მოიცავს ხანგრძლივ, მრავალსესიან საუბრებს და კითხვების ნაკრებს, რომელიც მოიცავს ერთნახტომიან, მრავალნახტომიან, დროით და ღია დომენის არგუმენტაციას; მისი მთავარი აღმოჩენაა, რომ ხანგრძლივი კონტექსტის მქონე მოდელები და მონაცემთა მოძიებაზე დაფუძნებული მიდგომებიც კი, მთლიანობაში, მნიშვნელოვნად ჩამორჩებიან ადამიანის წარმადობას, ხოლო დროით არგუმენტაციაში — კიდევ უფრო მეტად. LongMemEval [2] გრძელვადიან მეხსიერებას ხუთ უნარად ყოფს — ინფორმაციის ამოღება, მრავალსესიური მსჯელობა, დროითი მსჯელობა, ცოდნის განახლება და თავის შეკავება — და აღწერს კომერციული ასისტენტების სიზუსტის მნიშვნელოვან კლებას ხანგრძლივი ურთიერთქმედების პირობებში. ორივე შემთხვევაში, დროითი მსჯელობა თანმიმდევრულად ყველაზე სუსტი კატეგორიაა.</w:t>
+        <w:t>ამ სფეროში შეფასების დომინანტური ფორმაა ხანგრძლივ სინთეზურ დიალოგებზე დაფუძნებული კითხვა-პასუხის ბენჩმარკი. LoCoMo [1] მოიცავს ხანგრძლივ, მრავალსესიან საუბრებს და კითხვების ნაკრებს, რომელიც ფარავს ერთსაფეხურიან, მრავალსაფეხურიან, დროით (ტემპორალურ) და ღია დომენის მსჯელობას. მისი მთავარი მიგნებაა, რომ გრძელი კონტექსტის მქონე მოდელებიც და მოძიებით გაძლიერებული მიდგომებიც კი მთლიანობაში მნიშვნელოვნად ჩამორჩება ადამიანის წარმადობას, ხოლო დროით მსჯელობაში — კიდევ უფრო მეტად. LongMemEval [2] გრძელვადიან მეხსიერებას ხუთ უნარად ყოფს — ინფორმაციის ამოღება, მრავალსესიური მსჯელობა, დროითი მსჯელობა, ცოდნის განახლება და თავშეკავება — და აღწერს კომერციული ასისტენტების სიზუსტის მნიშვნელოვან კლებას ხანგრძლივი ურთიერთქმედების პირობებში. ორივე შემთხვევაში დროითი მსჯელობა თანმიმდევრულად ყველაზე სუსტი კატეგორიაა.</w:t>
       </w:r>
     </w:p>
     <w:p>
@@ -3499,7 +3499,7 @@
           <w:sz w:val="24"/>
           <w:lang w:val="ka-GE"/>
         </w:rPr>
-        <w:t>თუმცა, ამ ბენჩმარკებს სანდოობის პრობლემა აქვთ, რომელსაც წინამდებარე ნაშრომი მთავარ მიგნებად განიხილავს და არა სქოლიოდ. LoCoMo-ზე მომწოდებლების მიერ მოწოდებული ქულების გამეორება რთული აღმოჩნდა და ისინი ურთიერთგამომრიცხავნი არიან: ერთი სისტემის მიერ მითითებული შედეგი დამოუკიდებელ რეპლიკაციაში მნიშვნელოვნად დაბალი აღმოჩნდა და შემდგომში გადაიხედა [32]. დამოუკიდებელმა 2026-მა აუდიტმა [33] დაადგინა, რომ ბენჩმარკის "ოქროს პასუხების" დაახლოებით ექვსი პროცენტი თავისთავად არასწორია — რაც მიღწევადი ქულის ზღვარს დაახლოებით 94%-მდე ამცირებს — და რომ ავტომატურმა LLM-მსაჯულმა უმეტეს შემთხვევაში მიზანმიმართულად არასწორი პასუხები მიიღო. მეთოდოლოგიური გაკვეთილი ორმაგია: მეხსიერების ბენჩმარკის გამოქვეყნებულ მაჩვენებლებზე საჭიროა სიფრთხილით მოვეკიდოთ და ამ სფეროში ნებისმიერმა ტექნიკურმა შეფასებამ საკუთარი შეფასების პროცედურა თავად უნდა გადაამოწმოს, ნაცვლად იმისა, რომ ხარვეზიანი პროცედურა მემკვიდრეობით მიიღოს. (LoCoMo-სა და LongMemEval-ის მიერ [1, 2] წარმოდგენილი რეცენზირებული ადამიანისა და მანქანის შედეგებს შორის არსებული სხვაობა არის ხარისხობრივი აღმოჩენა, რომელიც განსხვავებული და უფრო მყარი ტიპისაა, ვიდრე ეს სადავო აბსოლუტური ლიდერბორდის ქულები.)</w:t>
+        <w:t>თუმცა, ამ ბენჩმარკებს სანდოობის პრობლემა აქვს, რომელსაც წინამდებარე ნაშრომი მთავარ მიგნებად განიხილავს და არა სქოლიოდ. მომწოდებელთა მიერ LoCoMo-ზე მოწოდებული ქულების გამეორება რთული აღმოჩნდა, თავად ქულები კი ერთმანეთთან შეუსაბამოა: ერთი სისტემის მითითებული შედეგი დამოუკიდებელ რეპლიკაციაში მნიშვნელოვნად დაბალი აღმოჩნდა და შემდგომ გადაიხედა [32]. 2026 წლის დამოუკიდებელმა აუდიტმა [33] დაადგინა, რომ ბენჩმარკის „ოქროს პასუხების“ დაახლოებით ექვსი პროცენტი თავად არასწორია — რაც მიღწევადი ქულის ზედა ზღვარს დაახლოებით 94%-მდე ამცირებს — და რომ ავტომატურმა LLM-მსაჯულმა შემთხვევათა უმრავლესობაში განზრახ არასწორი პასუხები მიიღო. მეთოდოლოგიური გაკვეთილი ორმაგია: გამოქვეყნებული მეხსიერების ბენჩმარკის მაჩვენებლები სიფრთხილით უნდა იქნას დამოწმებული, ხოლო ამ სფეროში ნებისმიერმა ტექნიკურმა შეფასებამ თავად უნდა გადაამოწმოს საკუთარი სამსჯელო პროცედურა, ნაცვლად იმისა, რომ ხარვეზიანი პროცედურა მემკვიდრეობით მიიღოს. (LoCoMo-სა და LongMemEval-ის [1, 2] მიერ დაფიქსირებული, რეცენზირებული ადამიანისა და მანქანის წარმადობას შორის არსებული სხვაობა სხვა და უფრო მყარი ტიპის ხარისხობრივი აღმოჩენაა, ვიდრე ეს სადავო აბსოლუტური ლიდერბორდის ქულები.)</w:t>
       </w:r>
     </w:p>
     <w:p>
@@ -3513,7 +3513,7 @@
           <w:sz w:val="24"/>
           <w:lang w:val="ka-GE"/>
         </w:rPr>
-        <w:t>კიდევ ერთი, და ამ ნაშრომისთვის გადამწყვეტი, შეზღუდვა მოდალობასა და შედეგს ეხება. აქ განხილული ყველა ძირითადი გრძელვადიანი მეხსიერების ბენჩმარკი — LoCoMo, LongMemEval და უფრო ძველი Multi-Session Chat [35] — მუშაობს მხოლოდ ტექსტზე და ზომავს ფაქტობრივ სიზუსტეს და არა გამოცდილ ხარისხს. არცერთი მათგანი არ ეხება მეხსიერების მოძიებას ხმოვანი ურთიერთქმედების რეალურ დროში შეფერხებების პირობებში და არცერთი არ ზომავს, უმჯობესებს თუ არა უკეთესი მეხსიერება ურთიერთობას. ამ ქვედარგის ინსტრუმენტებს შეუძლიათ გვითხრან, სწორად იხსენებს თუ არა სისტემა; მათ არ შეუძლიათ გვითხრან, აუმჯობესებს თუ არა ზუსტი გახსენება მომხმარებლის მიერ სისტემასთან განცდილ ურთიერთობას — მის აღქმულ სოციალურ თანდასწრებას, ალიანსს ან ადამიანურობას.</w:t>
+        <w:t>კიდევ ერთი, და ამ ნაშრომისთვის გადამწყვეტი, შეზღუდვა მოდალობასა და შედეგს ეხება. აქ განხილული ყველა ძირითადი გრძელვადიანი მეხსიერების ბენჩმარკი — LoCoMo, LongMemEval და უფრო ძველი Multi-Session Chat [35] — მუშაობს მხოლოდ ტექსტზე და ზომავს ფაქტობრივ სიზუსტეს და არა გამოცდილ ხარისხს. არცერთი მათგანი არ ეხება მეხსიერების მოძიებას ხმოვანი ურთიერთქმედების რეალურდროული დაყოვნების პირობებში, და არცერთი არ ზომავს, აუმჯობესებს თუ არა უკეთესი მეხსიერება ურთიერთობას. ამ ქვედარგის ინსტრუმენტებს შეუძლია გვითხრას, სწორად იხსენებს თუ არა სისტემა; მათ არ შეუძლია გვითხრას, აუმჯობესებს თუ არა ზუსტი გახსენება მომხმარებლის მიერ სისტემასთან განცდილ ურთიერთობას — მის აღქმულ სოციალურ თანდასწრებას, მომხმარებლისა და ხელოვნური აგენტის ალიანსს, ან აღქმულ ადამიანურობას.</w:t>
       </w:r>
     </w:p>
     <w:p>

</xml_diff>

<commit_message>
polish(§2.6): Sonnet-5 fluency + terminology, meaning verified
§2.6 (Assistant→interlocutor), 5 units: critical fix believability სანდოობა→
დამაჯერებლობა (was "trustworthiness"), utterances გამოსვლებს→გამონათქვამებს;
verbatim/paraphrase privacy contrast + RCT sharpens-not-weakens preserved; all
9 citations, 82%, ASAQ/Godspeed intact. Both editions rebuilt.

Co-Authored-By: Claude Opus 4.8 (1M context) <noreply@anthropic.com>
</commit_message>
<xml_diff>
--- a/project/thesis-ka.docx
+++ b/project/thesis-ka.docx
@@ -3547,7 +3547,7 @@
           <w:sz w:val="24"/>
           <w:lang w:val="ka-GE"/>
         </w:rPr>
-        <w:t>სისტემის აღქმა, როგორც უბრალო ასისტენტისა, ან როგორც თანამოსაუბრის, ნაკლებად არის დამოკიდებული სიზუსტეზე და მეტად — ურთიერთობაზე. ამ ურთიერთობის შესწავლა კი სხვა ლიტერატურის სფეროს განეკუთვნება, რომელიც ეფუძნება დაკვირვებას, რომ ადამიანები სოციალურად რეაგირებენ გამოთვლით აგენტებზე: პარადიგმას "კომპიუტერები სოციალური აქტორები არიან" და მის განმარტებას, რომ მედია, მრავალი სოციალური რეფლექსის თვალსაზრისით, რეალური ურთიერთქმედების პარტნიორების ეკვივალენტურია [28]. ამ ჩარჩოში, არაერთი უახლესი ნაშრომი იკვლევს, თუ რა კონკრეტულად განასხვავებს სისტემას, რომელიც მხოლოდ ასისტენტად აღიქმება, სისტემისგან, რომელიც ურთიერთობათა პარტნიორად აღიქმება; მეხსიერება აქ ცენტრალურ, ორმაგი მახვილის მქონე ბერკეტად განმეორდება.</w:t>
+        <w:t>სისტემის აღქმა, როგორც უბრალო ასისტენტისა თუ როგორც თანამოსაუბრის, ნაკლებად სიზუსტეზეა დამოკიდებული, მეტად კი — ურთიერთობაზე. ამ ურთიერთობის შესწავლა სხვა ლიტერატურის სფეროს განეკუთვნება, რომელიც ეფუძნება დაკვირვებას, რომ ადამიანები სოციალურად რეაგირებენ გამოთვლითი აგენტების მიმართ: პარადიგმას „კომპიუტერები სოციალური აქტორები არიან“ და მის განმარტებას, რომ მედია, ბევრი სოციალური რეფლექსის თვალსაზრისით, რეალური ურთიერთქმედების პარტნიორების ეკვივალენტურია [28]. ამ ჩარჩოში არაერთი უახლესი ნაშრომი იკვლევს, თუ რა განასხვავებს სისტემას, რომელიც მხოლოდ ასისტენტად აღიქმება, სისტემისგან, რომელიც ურთიერთობის პარტნიორად აღიქმება; მეხსიერება აქ ცენტრალურ, ორმაგი მახვილის მქონე ბერკეტად მეორდება.</w:t>
       </w:r>
     </w:p>
     <w:p>
@@ -3561,7 +3561,7 @@
           <w:sz w:val="24"/>
           <w:lang w:val="ka-GE"/>
         </w:rPr>
-        <w:t>დადებითი მხრიდან, კოქსისა და მისი კოლეგების [11] მიერ ჩატარებულმა კონტროლირებადმა კვლევამ აჩვენა, რომ ჩატ-ბოტი, რომელიც მომხმარებლების წინა სესიების გამოსვლებს იყენებდა, უფრო ინტელექტუალურად და მიმზიდველად აღიქმებოდა, ვიდრე ის, რომელიც ამას არ აკეთებდა. უარყოფითი მხრიდან, იმავე კვლევამ დაადგინა, რომ პირდაპირი ციტირება — ზუსტი, სიტყვა-სიტყვით გადმოცემა — ზრდიდა მომხმარებლების შეშფოთებას კონფიდენციალურობასთან დაკავშირებით, პარაფრაზირებულ მითითებებთან შედარებით. ეს არის 2.2-ის "ბუნდოვანი კვალის" არგუმენტის ემპირიული საყრდენი: არსებითი შინაარსის დონეზე გახსენება ურთიერთობათა კუთხით უპირატესი იყო სიტყვასიტყვით გახსენებასთან შედარებით, მიუხედავად იმისა, რომ ორივე მათგანი მეხსიერების გამოვლინებაა. დამხმარე საპილოტე კვლევამ [34] აჩვენა, რომ ჩატ-ბოტს მეხსიერების მინიჭება მას უფრო ინტელექტუალურს, მაგრამ ნაკლებად სანდოს ხდიდა, თუ მეხსიერება მომხმარებლისთვის ხილული არ იყო. ასე წოდებული "კომპანიონის" აპლიკაციების სფეროს მტკიცებულებებიც იმავეზე მიუთითებს: Replika-ს მომხმარებლების კვალიტატիվურმა კვლევამ [3] მეხსიერების გაუმართაობა — სახელების, უპირატესობებისა და საერთო ისტორიის დავიწყება — ურთიერთობის დარღვევის მთავარ წყაროდ გამოავლინა, ხოლო იმავე პროდუქტში მოულოდნელი ცვლილების შესახებ ჩატარებულმა ბუნებრივ-ექსპერიმენტულმა კვლევამ [4] აჩვენა, რომ მომხმარებელთა გაღიზიანება სტატისტიკურად განპირობებული იყო აგენტის იდენტობის აღქმული შეუწყვეტლობის მიერ. მოკლედ რომ ვთქვათ, მეხსიერება უბრალოდ ფუნქცია არ არის, რომელიც ამოცანის შესრულებას აუმჯობესებს; ის არის იმ უწყვეტობის შემადგენელი ნაწილი, რომელიც ურთიერთობას სჭირდება — და ზედმეტად პირდაპირი გახსენება თავისთავად შეუძლია ნდობის შერყევა.</w:t>
+        <w:t>დადებითი მხრიდან, კოქსისა და თანაავტორების [11] კონტროლირებულმა კვლევამ აჩვენა, რომ ჩატ-ბოტი, რომელიც მომხმარებელთა წინა სესიების გამონათქვამებს იხსენებდა, უფრო ინტელექტუალურად და მიმზიდველად აღიქმებოდა, ვიდრე ის, რომელიც ამას არ აკეთებდა. უარყოფითი მხრიდან, იმავე კვლევამ დაადგინა, რომ პირდაპირმა (verbatim) მითითებამ — ანუ ზუსტმა, სიტყვასიტყვითმა გახსენებამ — გაზარდა მომხმარებელთა კონფიდენციალურობასთან დაკავშირებული შეშფოთება პარაფრაზირებულ მითითებებთან შედარებით. ეს არის 2.2-ის „ბუნდოვანი კვალის“ არგუმენტის ემპირიული საყრდენი: არსობრივი (gist) დონის გახსენება ურთიერთობის თვალსაზრისით უფრო სასურველი იყო, ვიდრე პირდაპირი გახსენება, თუმცა ორივე მეხსიერების გამოვლინებაა. დამატებითმა საპილოტე კვლევამ [34] აჩვენა, რომ ჩატ-ბოტისთვის მეხსიერების მინიჭება მას უფრო ინტელექტუალურს, თუმცა ნაკლებად სანდოს ხდიდა, თუ მეხსიერება მომხმარებლისთვის ხილული არ იყო. ე.წ. „კომპანიონის“ აპლიკაციების სფეროდან მოპოვებული მტკიცებულებებიც იმავეზე მიუთითებს: Replika-ს მომხმარებელთა თვისებრივმა კვლევამ [3] მეხსიერების გაუმართაობა — სახელების, უპირატესობებისა და საერთო ისტორიის დავიწყება — ურთიერთობის დარღვევის მთავარ წყაროდ გამოავლინა, ხოლო იმავე პროდუქტში მომხდარი მოულოდნელი ცვლილების ბუნებრივ-ექსპერიმენტულმა კვლევამ [4] აჩვენა, რომ აგენტის იდენტობის აღქმული შეუწყვეტლობა მომხმარებელთა დისტრესს სტატისტიკურად შუამავლობდა. მოკლედ რომ ვთქვათ, მეხსიერება არა მხოლოდ ფუნქციაა, რომელიც ამოცანის შესრულებას აუმჯობესებს, არამედ იმ უწყვეტობის შემადგენელი ნაწილია, რომელსაც ურთიერთობა საჭიროებს — და გადამეტებულად პირდაპირმა გახსენებამ შესაძლოა თავადვე შეარყიოს ნდობა.</w:t>
       </w:r>
     </w:p>
     <w:p>
@@ -3575,7 +3575,7 @@
           <w:sz w:val="24"/>
           <w:lang w:val="ka-GE"/>
         </w:rPr>
-        <w:t>მეორე ქცევითი ღერძი, რომელიც გამოსარჩევს თანამოსაუბრეს ასისტენტისგან, ინიციატივაა. პროაქტიული აგენტები, რომლებიც აღიქვამენ დიალოგის მნიშვნელოვან მოვლენებს და მათზე რეაგირებენ, ზრდიან ჩართულობასა და აღქმულ მხარდაჭერას, წმინდად რეაქტიულ სტანდარტებთან შედარებით [12]. მსგავს კვლევაში, პროაქტიულობის მოდელი, რომელიც აგენტის "შინაგანი აზრებით" იმართებოდა, მომხმარებლებმა რეაქტიულ საკონტროლო ჯგუფთან შედარების დაახლოებით 82%-იან შემთხვევაში არჩიეს [13]. ინიციატივა, რომელიც მეხსიერებას ეფუძნება — იმის გაგრძელება, რაც მომხმარებელმა რამდენიმე დღით ადრე ახსენა — ალბათ, ყველაზე თვალსაჩინო პარტნიორული ქცევაა, რომელიც სისტემას შეუძლია გამოავლინოს, და ეს ის არის, რისი შესწავლის შესაძლებლობაც ამ ნაშრომის პლატფორმას გააჩნია.</w:t>
+        <w:t>მეორე ქცევითი ღერძი, რომელიც თანამოსაუბრეს ასისტენტისგან განასხვავებს, ინიციატივაა. პროაქტიული აგენტები, რომელიც აღიქვამს დიალოგში მომხდარ მნიშვნელოვან მოვლენებს და შემდგომ ეხმიანება მათ, წმინდად რეაქტიულ საბაზისო პირობებთან შედარებით ზრდის ჩართულობასა და აღქმულ მხარდაჭერას [12]. დაკავშირებულ კვლევაში მომხმარებლებმა, რეაქტიულ საკონტროლო პირობასთან შედარებისას, შემთხვევათა დაახლოებით 82%-ში აირჩიეს პროაქტიულობის მოდელი, რომელსაც აგენტის „შინაგანი აზრები“ მართავდა [13]. ინიციატივა, რომელიც მეხსიერებას ეფუძნება — იმის გაგრძელება, რაც მომხმარებელმა რამდენიმე დღით ადრე ახსენა — ალბათ ყველაზე ცხადად პარტნიორისებური ქცევაა, რომლის გამოვლენაც სისტემას შეუძლია, და სწორედ ამის შესწავლის შესაძლებლობას იძლევა ამ ნაშრომის პლატფორმა.</w:t>
       </w:r>
     </w:p>
     <w:p>
@@ -3589,7 +3589,7 @@
           <w:sz w:val="24"/>
           <w:lang w:val="ka-GE"/>
         </w:rPr>
-        <w:t>იგივე ლიტერატურაში მოყვანილი გაფრთხილება ზღუდავს ამ თეზისის მტკიცებას მოდალობის შესახებ. ოთხკვირიანმა რანდომიზებულმა კონტროლირებადმა კვლევამ [15] ვერ დაადგინა ხმოვანი და ტექსტური კომუნიკაციის მიზეზ-შედეგობრივი კავშირი მომხმარებლების მარტოობასა და დამოკიდებულებასთან დაკავშირებით, რადგან ურთიერთობის შედეგები, ამის ნაცვლად, განპირობებული იყო გამოყენების პატერნებითა და მომხმარებლის თვისებებით. ეს არ ასუსტებს ამ ნაშრომის საფუძვლიანობას; ის მას ამახვილებს. იმ კვლევაში შემოწმდა, მოქმედებს თუ არა ხმის რეჟიმი თავისთავად ზოგად კეთილდღეობაზე და არა ის, ცვლის თუ არა ხმის აგენტის მიღმა მდგარი მეხსიერების არქიტექტურა აღქმულ ურთიერთობას. ეს უკანასკნელი სწორედ რომ გამოუცდელი საკითხია, ხოლო ხმის რეჟიმის დახვეწის შესახებ ნულოვანი შედეგი არის მიზეზი, რომ მანიპულაცია მხოლოდ ხმას კი არ, არამედ მეხსიერებაში განვიხილოთ.</w:t>
+        <w:t>იგივე ლიტერატურაში მოყვანილი გაფრთხილება ზღუდავს ამ თეზისის მტკიცებას მოდალობის შესახებ. ოთხკვირიანმა რანდომიზებულმა კონტროლირებულმა კვლევამ [15] ვერ დაადგინა ხმოვანი და ტექსტური კომუნიკაციის მიზეზ-შედეგობრივი გავლენა მომხმარებელთა მარტოობასა და დამოკიდებულებაზე, რადგან ურთიერთობის შედეგები, ამის ნაცვლად, გამოყენების პატერნებითა და მომხმარებლის თვისებებით იყო განპირობებული. ეს არ ასუსტებს წინამდებარე ნაშრომის წანამძღვარს; პირიქით, ამახვილებს მას. იმ კვლევაში შემოწმდა, მოქმედებს თუ არა ხმოვანი მოდალობა თავისთავად ზოგად კეთილდღეობაზე — და არა ის, ცვლის თუ არა ხმის აგენტის მიღმა მდგარი მეხსიერების არქიტექტურა აღქმულ ურთიერთობას. ეს უკანასკნელი სწორედ შეუსწავლელი საკითხია, ხოლო მოდალობის დახვეწასთან დაკავშირებული ნულოვანი შედეგი საფუძველია იმისა, რომ მანიპულაცია მეხსიერებაში — და არა მხოლოდ ხმაში — განთავსდეს.</w:t>
       </w:r>
     </w:p>
     <w:p>
@@ -3603,7 +3603,7 @@
           <w:sz w:val="24"/>
           <w:lang w:val="ka-GE"/>
         </w:rPr>
-        <w:t>ამ აღქმების გასაზომად, სფერო გვთავაზობს ვალიდურ ინსტრუმენტებს. ხელოვნური სოციალური აგენტის კითხვარი [14] მოიცავს ცხრამეტ კონსტრუქტს — მათ შორის სოციალურ თანდასწრებას, მომხმარებლისა და ხელოვნური აგენტის ალიანსს და სანდოობას (სუბსკალა, რომლითაც წინამდებარე ნაშრომი ოპერაციულად წარმოაჩენს აღქმულ ადამიანურობას) — გრძელი და მოკლე ვერსიებით და ღიად ხელმისაწვდომია; ეს არის მთავარი ინსტრუმენტი, რომელიც აქ არის გამოყენებული, დამატებულია დაკავშირებული კონსტრუქტებისთვის დადგენილი შკალებით (განსაკუთრებით Godspeed აღქმული ინტელექტისთვის).</w:t>
+        <w:t>ამ აღქმების გასაზომად, სფერო გვთავაზობს ვალიდურ ინსტრუმენტებს. ხელოვნური სოციალური აგენტის კითხვარი (ASAQ) [14] მოიცავს ცხრამეტ კონსტრუქტს — მათ შორის სოციალურ თანდასწრებას, მომხმარებლისა და ხელოვნური აგენტის ალიანსსა და დამაჯერებლობას (believability; სუბსკალა, რომლითაც წინამდებარე ნაშრომი ოპერაციულად წარმოაჩენს აღქმულ ადამიანურობას) — გრძელი და მოკლე ფორმებით და ღიად ხელმისაწვდომია. ეს არის მთავარი ინსტრუმენტი, რომელიც წინამდებარე ნაშრომში გამოიყენება და შევსებულია დაკავშირებული კონსტრუქტებისთვის დადგენილი სკალებით (განსაკუთრებით Godspeed — აღქმული ინტელექტისთვის).</w:t>
       </w:r>
     </w:p>
     <w:p>

</xml_diff>

<commit_message>
polish(§3.1): Sonnet-5 fluency + terminology, meaning verified
§3.1 (Research design), 4 units — the integrity core. Human study kept NOT-
conducted (ჯერ ჩაუტარებელი პროტოკოლი); no-human-data claim, C>B+ estimation-
target-not-confirmatory stance, and all numbers (0.28/20/0.78-0.86/116-159/12-16wk)
+ F17 facts preserved exactly. Both editions rebuilt.

Co-Authored-By: Claude Opus 4.8 (1M context) <noreply@anthropic.com>
</commit_message>
<xml_diff>
--- a/project/thesis-ka.docx
+++ b/project/thesis-ka.docx
@@ -3726,7 +3726,7 @@
           <w:sz w:val="24"/>
           <w:lang w:val="ka-GE"/>
         </w:rPr>
-        <w:t>ეს თავი განსაზღვრავს დიზაინის, კონცეფციის დამტკიცებისა და შეფასების-მეთოდოლოგიური სადისერტაციო ნაშრომის მეთოდოლოგიას. 1.2-ში მითითებული მიზნის — ხმოვანი თანამოსაუბრის სისტემისთვის კოგნიტურ თეორიებზე დაფუძნებული გრძელვადიანი მეხსიერების არქიტექტურის შემუშავება და მისი გავლენის დადგენა მომხმარებლის მიერ აღქმულ სოციალურ კონსტრუქტებზე — შესაბამისად, ნაშრომი სამ კოორდინირებულ წვლილს შეაქვს, და მნიშვნელოვანია თავიდანვე აღინიშნოს, რომელთაგან რომელი სრულდება აქ, ხოლო რომელი მკაცრად არის შემუშავებული, მაგრამ განზრახ გადავადებული.</w:t>
+        <w:t>ეს თავი განსაზღვრავს იმ სადისერტაციო ნაშრომის მეთოდოლოგიას, რომლის ბირთვსაც დიზაინი, კონცეფციის დამტკიცება და შეფასების მეთოდოლოგია შეადგენს. 1.2-ში მითითებული მიზნიდან გამომდინარე — ხმოვანი თანამოსაუბრის სისტემისთვის კოგნიტურად დაფუძნებული გრძელვადიანი მეხსიერების არქიტექტურის შემუშავება და მისი გავლენის დადგენა მომხმარებლის მიერ აღქმულ სოციალურ კონსტრუქტებზე — ნაშრომი სამ კოორდინირებულ წვლილს იძლევა, და მნიშვნელოვანია თავიდანვე აღინიშნოს, რომელი მათგანია აქ წარმოდგენილი და რომელია მკაცრად შემუშავებული, მაგრამ განზრახ გადავადებული.</w:t>
       </w:r>
     </w:p>
     <w:p>
@@ -3740,7 +3740,7 @@
           <w:sz w:val="24"/>
           <w:lang w:val="ka-GE"/>
         </w:rPr>
-        <w:t>სამი წვლილია: (ა) მეხსიერების არქიტექტურა ("პროფილი C"), რომლის მექანიზმები ეტაპობრივად ეფუძნება ადამიანის მეხსიერების კოგნიტურ თეორიებსა და მათ ქცევით ნიშნებს (3.2); (ბ) კურატორიული კონტროლის მქონე შეფასების მეთოდოლოგია, რომლის ცენტრალური ინსტრუმენტია აქტიური საკონტროლო პირობა — B+ — რომელიც გამოყოფს ადამიანის მეხსიერების დინამიკის ეფექტს LLM-ის კურატორიული სამუშაოების ზოგადი წაკითხვადობის ზრდისგან (3.3); და (გ) კონცეფციის დამტკიცების იმპლემენტაცია არქიტექტურის ორხაზიანი ტექნიკური და სიმულირებული შეფასებისთანავე (3.4–3.5). სრული კვლევა ადამიანთა მონაწილეობით, რომელსაც მიზანი საბოლოოდ ითვალისწინებს, წარმოდგენილია 3.5(c)-ში, როგორც სრულად სპეციფიცირებული, მაგრამ ჯერ არჩატარებული პროტოკოლი — მომავალი ნამუშევარი, საკუთარი ძალის (სტატისტიკური სიმძლავრის) ანალიზით — და არა როგორც კვლევა, რომლის მონაცემებიც 4-შია წარმოდგენილი.</w:t>
+        <w:t>სამი წვლილი ასეთია: (ა) მეხსიერების არქიტექტურა („პროფილი C“), რომლის მექანიზმებიც ეტაპობრივად ეფუძნება ადამიანის მეხსიერების კოგნიტურ თეორიებსა და მათ ქცევით ნიშან-თვისებებს (3.2); (ბ) კურატორიული კონტროლის მქონე შეფასების მეთოდოლოგია, რომლის ცენტრალური ინსტრუმენტიც აქტიური საკონტროლო პირობაა — B+ — რომელიც გამოყოფს ადამიანის მეხსიერების დინამიკის ეფექტს LLM-ის კურაციის ზოგადი წაკითხვადობის ზრდისგან (3.3); და (გ) კონცეფციის დამტკიცების იმპლემენტაცია და არქიტექტურის ორხაზიანი — ტექნიკური და სიმულირებული — შეფასება (3.4–3.5). სრული კვლევა ადამიანთა მონაწილეობით, რომელსაც მიზანი საბოლოოდ ითვალისწინებს, წარმოდგენილია 3.5(c)-ში, როგორც სრულად სპეციფიცირებული, მაგრამ ჯერ ჩაუტარებელი პროტოკოლი — სამომავლო გეგმები, საკუთარი სტატისტიკური სიმძლავრის ანალიზით — და არა როგორც კვლევა, რომლის მონაცემებიც 4-შია წარმოდგენილი.</w:t>
       </w:r>
     </w:p>
     <w:p>
@@ -3754,7 +3754,7 @@
           <w:sz w:val="24"/>
           <w:lang w:val="ka-GE"/>
         </w:rPr>
-        <w:t>ამიერი მოცულობის განსაზღვრა არის გათვლილი პასუხი სამუშაოს მიმდინარეობისას დოკუმენტირებულ შესაძლებლობათა შეზღუდვაზე (F17): არსებული Voice Companion პლატფორმა მხოლოდ A პირობას უჭერს მხარს (არ არის გრძელვადიანი მეხსიერება); B, B+ და C პირობები, ხმის მეხსიერებაში გადაცემის ინტერფეისთან და თითოეული მონაწილისთვის ინდივიდუალურ დანერგვასთან ერთად, წარმოადგენს "მწვანე ფურცლიდან" ინჟინერიას, რომლის სოლო შექმნასაც თორმეტიდან თექვსმეტ კვირამდე სჭირდება. ამ დისერტაციისთვის გამოყოფილ დროში ოცი მონაწილის მონაწილეობით საველე, მრავალკვირიანი, შიდა-სუბიექტური კვლევის ჩატარება შეუძლებელია. იმის ნაცვლად, რომ დასუსტდეს კვლევის დიზაინი გრაფიკის შესაბამისად — ან, რაც უარესია, მოხდეს არარსებული მონაცემების მოყვანა — დისერტაცია პატიოსნად არის ჩამოყალიბებული, როგორც მისი მთავარი შედეგი, რომელიც ეფუძნება აპარატურასა და მეთოდოლოგიას, კონცეფციის დამტკიცებას, რომელიც ასახავს მექანიზმებს, და შეფასებას, რომელიც მათ ტექნიკურად და სიმულაციის მეშვეობით იკვლევს. ამ ნაშრომში არცერთი მტკიცება არ ეფუძნება ადამიანთა მონაწილეობით მიღებულ მონაცემებს; სადაც კი აღქმის შედეგებია განხილული, ისინი ან სიმულაციური პროქსებია (მკაფიოდ აღნიშნული, 3.5(ბ)), ან პროგნოზებია, რომლებიც შემდგომი პროტოკოლით უნდა შემოწმდეს.</w:t>
+        <w:t>ეს ფარგლების გამიჯვნა სამუშაოს მსვლელობისას დოკუმენტირებულ განხორციელებადობის შეზღუდვაზე (F17) გააზრებული პასუხია. არსებული Voice Companion პლატფორმა მხოლოდ A პირობას უჭერს მხარს (გრძელვადიანი მეხსიერების გარეშე). B, B+ და C პირობები კი, ხმის მეხსიერებაში გადაცემის ინტერფეისთან და თითოეული მონაწილისთვის ინდივიდუალურ დანერგვასთან ერთად, ნულიდან შესაქმნელ ინჟინერიას წარმოადგენს, რომლის სოლო აგებასაც თორმეტიდან თექვსმეტ კვირამდე სჭირდება. ამ დისერტაციისთვის გამოყოფილ დროში ოცი მონაწილის მონაწილეობით საველე, მრავალკვირიანი, განმეორებითი გაზომვების (within-subject) კვლევის ჩატარება შეუძლებელია. იმის ნაცვლად, რომ კვლევის დიზაინი გრაფიკთან მოსარგებად შესუსტდეს — ან, რაც კიდევ უფრო უარესი იქნებოდა, ისეთი მონაცემების არსებობაზე მინიშნება, რომლებიც სინამდვილეში არასდროს შეგროვილა — ნაშრომი პატიოსნად არის ჩამოყალიბებული აპარატურისა და მეთოდოლოგიის გარშემო, როგორც მისი მთავარი შედეგის გარშემო. მექანიზმებს ასახავს კონცეფციის დამტკიცება, ხოლო მათ ტექნიკურად და სიმულაციის გზით იკვლევს შეფასება. ამ ნაშრომში არცერთი მტკიცება არ ეფუძნება ადამიანთა მონაწილეობით მიღებულ მონაცემებს; სადაც კი აღქმის შედეგებია განხილული, ისინი ან სიმულაციური პროქსებია (მკაფიოდ აღნიშნული, 3.5(ბ)), ან პროგნოზებია, რომლებიც გადავადებული პროტოკოლით უნდა შემოწმდეს.</w:t>
       </w:r>
     </w:p>
     <w:p>
@@ -3768,7 +3768,7 @@
           <w:sz w:val="24"/>
           <w:lang w:val="ka-GE"/>
         </w:rPr>
-        <w:t>მეორე, უფრო ღრმა შეზღუდვა განსაზღვრავს ინფერენციულ მიდგომას და აქ არის ფორმულირებული, რათა მთელ თავს მართავდეს. ეფექტის ზომის ა-პრიორი ანალიზი (F18), რომელიც ეფუძნება კოქსის კვლევას [11] და დაკავშირებულ სოციალური სიგნალების მტკიცებულებებს, მიუთითებს, რომ სამეცნიეროდ ცენტრალური კონტრასტი — C &gt; B+ — კონსტრუქციულად არის დიზაინში ყველაზე მცირე ეფექტი (კოენსის dz ≈ 0.28 "ცივი სტარტის" გაზავებამდე), რადგან B+ უკვე მოიცავს მეხსიერების ორ ყველაზე მყარად დადასტურებულ სარგებელს: ყოფნას და შინაარსობრივ დონეზე სუფთა პარაფრაზს. ამ კლასის კვლევისთვის ნორმატიული ნიმუშის ზომისთვის (n ≈ 20; F12), ყველაზე მცირე საიმედოდ აღმოჩენადი ეფექტი დაახლოებით dz ≈ 0.78–0.86-ია, ხოლო C &gt; B+-ის აღმოჩენას დასჭირდებოდა n ≈ 116–159 — რაც შეუძლებელია ადამიანისა და აგენტის ურთიერთქმედების ჟანრისთვის. შედეგი განზრახ მიიღეს და არა დამალეს: C &gt; B+ განიხილება როგორც წინასწარ დარეგისტრირებული შეფასების სამიზნე — ეფექტის ზომა 95%-იანი სანდო ინტერვალით — და არა როგორც დამადასტურებელი ნულ-ჰიპოთეზის ტესტი. შედარებები, რომელთა მიმართაც არსებობს მძლავრობა (C &gt; A, და მიმართულებითი B+ &gt; B და C &gt; B), არის დამადასტურებელი ტესტები. C &gt; B+-ზე ზუსტად შეფასებული ნული თავისთავად შინაარსობრივი, გამოსაქვეყნებელი შედეგია: ის მიუთითებდა, რომ "ადამიანის მსგავსი" მეხსიერების აღქმითი ღირებულება განპირობებულია არსებითი შინაარსის მოწესრიგებითა და თანდასწრებით და არა ებინგჰაუსის დაშლით, სალიენს-გეითინგით ან კონსოლიდაციით — დასკვნა, რომლის ინტერპრეტაციისთვისაც B+ კონტროლი სპეციალურად შეიქმნა. შეფასების ეს მიდგომა, შესაბამისად, არ არის სიმკაცრისგან უკან დახევა, არამედ მტკიცებისა და მიღწევადი მტკიცებულების სწორი კალიბრაციაა.</w:t>
+        <w:t>მეორე, უფრო ღრმა შეზღუდვა განსაზღვრავს ინფერენციულ მიდგომას და აქ არის ჩამოყალიბებული, რათა მთელ თავს მართავდეს. ეფექტის ზომის აპრიორი ანალიზი (F18), რომელიც ეფუძნება კოქსის კვლევას [11] და მასთან დაკავშირებულ სოციალურ სიგნალებზე არსებულ მტკიცებულებებს, მიუთითებს, რომ სამეცნიეროდ ცენტრალური კონტრასტი — C &gt; B+ — კონსტრუქციულად დიზაინში ყველაზე მცირე ეფექტია (კოენის dz ≈ 0.28, „ცივი სტარტის“ განზავებამდე), რადგან B+ უკვე მოიცავს მეხსიერების ორ ყველაზე მყარად დადასტურებულ სარგებელს: თანდასწრებას და არსობრივ (gist) დონეზე სუფთა პარაფრაზს. ამ კლასის კვლევებისთვის ნორმატიულ ნიმუშის ზომაზე (n ≈ 20; F12), ყველაზე მცირე საიმედოდ აღმოჩენადი ეფექტი დაახლოებით dz ≈ 0.78–0.86-ია, ხოლო C &gt; B+-ის აღმოჩენას დასჭირდებოდა n ≈ 116–159 — რაც შეუძლებელია ადამიანისა და აგენტის ურთიერთქმედების ჟანრისთვის. ეს შედეგი განზრახ არის აღიარებული და არა დამალული: C &gt; B+ განიხილება როგორც წინასწარ დარეგისტრირებული შეფასების სამიზნე — ეფექტის ზომა 95%-იანი სანდო ინტერვალით — და არა როგორც დამადასტურებელი ნულ-ჰიპოთეზის ტესტი. შედარებები, რომელთა მიმართაც სტატისტიკური სიმძლავრე არსებობს (C &gt; A და მიმართულებითი B+ &gt; B და C &gt; B), დამადასტურებელი ტესტებია. C &gt; B+-ზე ზუსტად შეფასებული ნული თავისთავად არსებითი, გამოსაქვეყნებელი შედეგია: ის მიუთითებდა, რომ „ადამიანის მსგავსი“ მეხსიერების აღქმითი ღირებულება განპირობებულია არსობრივი (gist) კურირებითა და თანდასწრებით და არა ებინგჰაუსის დაშლით, სალიენს-გეითინგით ან კონსოლიდაციით — დასკვნა, რომლის ინტერპრეტაციისთვისაც სწორედ B+ კონტროლი შეიქმნა სპეციალურად. შეფასების ეს მიდგომა, შესაბამისად, სიმკაცრისგან უკან დახევა კი არა, არამედ მტკიცების სწორი კალიბრაციაა მიღწევად მტკიცებულებასთან მიმართებაში.</w:t>
       </w:r>
     </w:p>
     <w:p>

</xml_diff>

<commit_message>
polish(§3.2): Sonnet-5 fluency + terminology, meaning verified (split-run)
§3.2 (Profile C architecture), 8 units, polished in two parallel halves after the
single-pass run kept hitting mid-response API drops. Meaning-inversion fixes: u90
pre-empting (ვიცილებთ→წინ ვუსწრებთ), u83 composes-not-unifies verb. All hedges
preserved (levels-of-processing relabel, CLS-spirit-not-McClelland, three stated
omissions, not-psychological-fidelity); all citations/numbers exact. Both editions rebuilt.

Co-Authored-By: Claude Opus 4.8 (1M context) <noreply@anthropic.com>
</commit_message>
<xml_diff>
--- a/project/thesis-ka.docx
+++ b/project/thesis-ka.docx
@@ -1607,7 +1607,7 @@
           <w:rFonts w:ascii="Sylfaen" w:hAnsi="Sylfaen"/>
           <w:sz w:val="24"/>
         </w:rPr>
-        <w:t>38</w:t>
+        <w:t>39</w:t>
       </w:r>
     </w:p>
     <w:p>
@@ -3802,7 +3802,7 @@
           <w:sz w:val="24"/>
           <w:lang w:val="ka-GE"/>
         </w:rPr>
-        <w:t>პროფილი C არის ერთიანი მეხსიერების ძრავა, რომელიც აერთიანებს ხუთ დადასტურებულ კოგნიტურ-მეხსიერების თეორიას — ატკინსონ-შიფრინის მრავალსაცავიან მოდელს [20], ებინგჰაუსის დავიწყების მრუდს [23], ტულვინგის ეპიზოდური და სემანტიკური განასხვავებას [22], ბუნდოვანი კვალით თეორიას [24] და სწავლის კომპლემენტარული სისტემების ჩარჩოს [25] — ერთ სასიცოცხლო ციკლში. ორი დამატებითი წყარო შემოდის, როგორც იმპლემენტაციის პრეცედენტი და ზუსტი გადარქმევა და არა როგორც დამატებითი, ჩართული თეორიები: ჰიპოკამპური ინდექსაცია [7,26] (კონსოლიდაციის უკუკავშირის მითითებებისთვის) და დამუშავების დონეები (კოდირების დროის სალიენსის მექანიზმისთვის). ჩვენ ვამბობთ "შედგება და არა "ერთიანდება": თეორიები ერთმანეთთან თანამშრომლობისთვისაა შექმნილი ერთი კოჰერენტული ობიექტის ფარგლებში, მაგრამ არქიტექტურა არ ამტკიცებს მათ შეთავსებას ფუნდამენტური მექანიზმის დონეზე, და 3.2-ის საფუძვლად ჩათვლილია პროექტირების ეტაპზე მიღებული შთაგონება სახელობითი გამოტოვებებით (იხილეთ ქვემოთ), და არა კოგნიტური ერთგულების პრეტენზია — რაც შეესაბამება 2.2-ში დავიწყების მრუდისთვის უკვე მითითებულ გაფრთხილებას.</w:t>
+        <w:t>პროფილი C ერთიანი მეხსიერების ძრავაა, რომელიც ხუთ დადასტურებულ კოგნიტურ-მეხსიერების თეორიას — ატკინსონ-შიფრინის მრავალსაცავიან მოდელს [20], ებინგჰაუსის დავიწყების მრუდს [23], ტულვინგის ეპიზოდურ-სემანტიკურ განსხვავებას [22], ბუნდოვანი კვალის თეორიას [24] და სწავლის კომპლემენტარული სისტემების ჩარჩოს [25] — ერთ სასიცოცხლო ციკლში კომპოზიციად აწყობს. ორი დამატებითი წყარო შემოდის არა როგორც კიდევ ერთი დადასტურებული თეორია, არამედ როგორც იმპლემენტაციის პრეცედენტი და გულწრფელი გადარქმევა: ჰიპოკამპური ინდექსაცია [7,26] (კონსოლიდაციის უკუმითითებებისთვის) და დამუშავების დონეები (კოდირების ეტაპის სალიენსის მექანიზმისთვის). ჩვენ ვამბობთ „აწყობს“ და არა „აერთიანებს“: თეორიები ერთმანეთთან თანამშრომლობს ერთი შეთანხმებული ობიექტის ფარგლებში, თუმცა არქიტექტურა არ აცხადებს მათ შეთავსებას ფუძემდებლური მექანიზმის დონეზე. ხოლო 3.2-ის თეორიული საფუძველი განისაზღვრება როგორც პროექტირების ეტაპის შთაგონება, დასახელებული გამონაკლისებით (იხ. ქვემოთ), და არა როგორც კოგნიტური სიზუსტის პრეტენზია — შესაბამისად 2.2-ში დავიწყების მრუდისთვის უკვე გაკეთებულ დათქმასთან.</w:t>
       </w:r>
     </w:p>
     <w:p>
@@ -3816,7 +3816,7 @@
           <w:sz w:val="24"/>
           <w:lang w:val="ka-GE"/>
         </w:rPr>
-        <w:t>მეხსიერების ერთეული არის მოვლენა — თემატურად და დროში შემოსაზღვრული თანმიმდევრული მორიგეობების სეგმენტი, ტულვინგის გაგებით ეპიზოდური ატომი [22]. ეს არის მიზანმიმართული არჩევანი ორი ალტერნატივის წინააღმდეგ: უმოყოლო მორიგეობა (ერთეული, რომელსაც იყენებს verbatim RAG, პროფილი B) და იზოლირებული, ამოღებული ფაქტი. მოვლენის არჩევა თავიდან გვაცილებს ფაქტების შერჩევის იმპორტს, როგორც B-ში არარსებული მეორე აღრევის ფაქტორის, და კონსოლიდაციას — განმეორებადი მოვლენების მდგრად სემანტიკურ ცოდნად გადაქცევას — აქცევს ბუნებრივ, გამოყვანილ ოპერაციად და არა დამატებით კომპონენტად. სიცოცხლის ციკლს ხუთი ეტაპი აქვს; თითოეული მოცემულია, როგორც მექანიზმი · თეორიული საფუძველი · ქცევითი ნიშანი.</w:t>
+        <w:t>მეხსიერების ერთეული მოვლენაა — თემატურად და დროში შემოსაზღვრული, თანმიმდევრული ტურებისგან შემდგარი სეგმენტი, ტულვინგის გაგებით ეპიზოდური ატომი [22]. ეს მიზანმიმართული არჩევანია ორი ალტერნატივის საწინააღმდეგოდ: უმუშავო ტური (ერთეული, რომელსაც იყენებს პირდაპირ (verbatim) მოძიებაზე დაფუძნებული RAG, პროფილი B) და იზოლირებულად ამოღებული ფაქტი. მოვლენის არჩევა გამორიცხავს ფაქტების შერჩევის დამატებას მეორე აღრევის ფაქტორად, რომელიც B-ში არ გვხვდება, ხოლო კონსოლიდაციას — განმეორებადი მოვლენების მდგრად სემანტიკურ ცოდნად გარდაქმნას — ბუნებრივ, გამოყვანილ ოპერაციად აქცევს და არა დამატებით დანამატად. სასიცოცხლო ციკლს ხუთი ეტაპი აქვს; თითოეული წარმოდგენილია როგორც მექანიზმი · თეორიული საფუძველი · ქცევითი ნიშან-თვისება.</w:t>
       </w:r>
     </w:p>
     <w:p>
@@ -3830,7 +3830,7 @@
           <w:sz w:val="24"/>
           <w:lang w:val="ka-GE"/>
         </w:rPr>
-        <w:t>ეტაპი 1 — კოდირება (მნიშვნელობის მიხედვით გაფილტრული ჩაწერა, ასინქრონული). უმუშავო ტურები არსებობს მხოლოდ დაახლოებით ოცი ტურის მოცულობის ცვალებად სამუშაო ფანჯარაში, რომელიც იდენტურია A და B პირობებისთვის და უცვლელია ყველა პირობისთვის. სინქრონული გზით არაფერი გადადის გრძელვადიან შენახვაზე. სესიის ბოლოს, ასინქრონულად, ბუფერში არსებული ტრანსკრიპტი იყოფა მოვლენებად ჩაშენების მანძილისა და დროითი შუალედის საზღვრებზე (რომელიც EM-LLM-ის [8] ბაიეს-სიურპრიზის სეგმენტაციის იაფი შემცვლელია) და ერთი მცირე-LLM-ის კრიტერიუმების გამოძახებით თითოეულ მოვლენას ეძლევა მნიშვნელობის ქულა ოთხ ა-პრიორი-ფიქსირებულ განზომილებაში: თვითგამოხატვის სიმკვრივე, ემოციური ინტენსივობა, ექსპლიციტური ხაზგასმა ან გამეორება, და მიზნის ან ვალდებულების შინაარსი. ზღვრულზე დაბალი ქულის მქონე მოვლენები რბილად იგდება — ძალიან დაბალი სტაბილურობის მქონე, "ენაზე მდგომი აზრის" მსგავსი კვალი, რომელიც მხოლოდ ძლიერი მინიშნების შემთხვევაში აღდგება — და არა მკაცრად იშლება; გადარჩენილები იღებენ საწყის სტაბილურობას, რომელიც მათ მნიშვნელობასთან არის პროპორციული. გრაუნდინგი: ატკინსონ-შიფრინის მრავალსაცავიანი მოდელი [20] ყურადღებასა და გამეორებას განიხილავს, როგორც მოკლევადიანი და გრძელვადიანი მეხსიერების საწყობებს შორის გასასვლელს. აქ ჩვენ ვიწყებთ ერთ გულწრფელ გადარქმევას (F18): რადგან აღქმადობა გამოიყენება კოდირებისას, ეს მექანიზმი იმდენადვე არის დამუშავების სიღრმის ან დონეებისა და მეხსიერების ემოციური მოდულაციის მაგალითი, რამდენადაც — წმინდა მოდალური მოდელისა, და მას ასეთადაც მოიხსენიებენ; ის ასევე განსხვავდება Generative Agents-ის [10] მიერ მოძიების დროის მნიშვნელობის შეწონვისგან, რომელსაც 2 აღრიცხავს, როგორც აქტივაციის მსგავსს და არა თეორიიდან გამომდინარეს. ხელწერა: თანამოსაუბრე მდგრადად ინახავს იმას, რასაც მომხმარებელი ხაზს უსვამდა, ამხელდა ან რაზეც ბრუნდებოდა, მაშინ როცა შემთხვევითი, ყოველდღიური საუბრები ქრება; დავიწყება აღიქმება როგორც დათბობა და არა როგორც უყურადღებობა, რადგან რბილად უარყოფილი მასალა მკაფიო მინიშნების შემთხვევაში სუსტად, მაგრამ მაინც ექვემდებარება რეკონსტრუქციას.</w:t>
+        <w:t>ეტაპი 1 — კოდირება (ჩაწერა სალიენს-გეითინგით, ასინქრონული). უმუშავო ტურები არსებობს მხოლოდ დაახლოებით ოცი ტურის მოცულობის დროებით სამუშაო ფანჯარაში, რომელიც A და B პირობებთან სიტყვასიტყვით საერთოა და ყველა პირობაში უცვლელი რჩება. სინქრონულ გზაზე არაფერი გადადის გრძელვადიან საცავში. სესიის დასრულებისას, ასინქრონულად, დაბუფერებული ტრანსკრიპტი იყოფა მოვლენებად ჩაშენებებს შორის მანძილისა და დროითი ინტერვალის საზღვრების მიხედვით (EM-LLM-ის [8] ბაიესური სიურპრიზის სეგმენტაციის იაფი შემცვლელი). შემდეგ ერთი მცირე ზომის LLM-ის შეფასების რუბრიკის ერთჯერადი გამოძახებით თითოეულ მოვლენას ენიჭება სალიენსის ქულა ოთხ წინასწარგანსაზღვრულ განზომილებაში: თვითგამჟღავნების სიმკვრივე, ემოციური ინტენსივობა, აშკარა ხაზგასმა ან გამეორება და მიზნობრივი ან ვალდებულებითი შინაარსი. ზღვარს ქვემოთ მყოფი მოვლენები რბილად გამოირიცხება — ისინი ინახება ძალიან დაბალი სტაბილურობით, როგორც „ენის წვერზე“ დამდგარი კვალი, რომლის აღდგენაც შესაძლებელია მხოლოდ ძლიერი მინიშნების პირობებში — და არა მკაცრად იშლება; გადარჩენილი მოვლენები საწყის სტაბილურობას იღებს, მასშტაბირებულს მათი სალიენსის მიხედვით. დაფუძნება: ატკინსონ-შიფრინის მრავალსაცავიანი მოდელი [20] ყურადღებასა და გამეორებას მოკლევადიანი საცავიდან გრძელვადიან საცავში გადასვლის კარიბჭედ მიიჩნევს. აქ ჩვენ ვიწყებთ ერთ გულწრფელ გადარქმევას (F18): ვინაიდან სალიენსი სწორედ კოდირების ეტაპზე გამოიყენება, ეს მექანიზმი არანაკლებ დამუშავების სიღრმის ან დონეების (levels-of-processing) და მეხსიერების ემოციური მოდულაციის მაგალითია, ვიდრე წმინდა მოდალური მოდელისა, და სწორედ ასეც არის მითითებული. ის ასევე განსხვავდება Generative Agents-ის [10] მიერ გამოყენებული, მოძიების ეტაპის მნიშვნელოვნების შეწონვისგან, რომელსაც 2 აქტივაციის მსგავსად მოიხსენიებს და არა თეორიიდან გამომდინარედ. ნიშან-თვისება: თანამოსაუბრე მდგრადად ინახავს იმას, რასაც მომხმარებელი უსვამდა ხაზს, უმხელდა ან რასაც უბრუნდებოდა, მაშინ როცა შემთხვევითი, ყოველდღიური საუბარი ქრება; დავიწყება თბილად აღიქმება და არა როგორც უყურადღებობა, ვინაიდან რბილად გამორიცხული მასალა აშკარა მინიშნების პირობებში მაინც სუსტად ექვემდებარება აღდგენას.</w:t>
       </w:r>
     </w:p>
     <w:p>
@@ -3844,7 +3844,7 @@
           <w:sz w:val="24"/>
           <w:lang w:val="ka-GE"/>
         </w:rPr>
-        <w:t>ეტაპი 2 — წარმოდგენა (მთავარი აზრი და სიტყვასიტყვითი საყრდენი, ორმაგი კლება, ასინქრონული). თითოეული მოვლენა ინახავს მთავარ აზრს — მნიშვნელობის, სუბიექტებისა და პოზიციის მოკლე პარაფრაზს — სტრუქტურირებულ ველებთან და ერთ სიტყვასიტყვით საყრდენთან ერთად (არაუმეტეს ერთი წინადადებისა, ყველაზე გამორჩეული ციტატა, რომელიც შენარჩუნებულია დასაბუთებისა და აუდიტისთვის, მაგრამ ნაგულისხმევად არ არის ჩაშენებული). არსი ჩაშენებული, ინიექცირებული ტვირთია; მისი სტაბილურობა ანკერისას აღემატება, ამიტომ მნიშვნელობა ზუსტ ფორმულირებას სცდება. სამართლიანობის შეზღუდვა განსაზღვრავს წარმოდგენას: თითოეული მოვლენის არსის ტვირთი არასდროს აღემატება პროფილი B-ს საშუალო ტურის ტექსტურ ტვირთს, ამიტომ C არასდროს იღებს კონტექსტის უფრო მდიდარ ელემენტებს. დაფუძნება: ბუნდოვანი კვალი-თეორია [24] ამტკიცებს პარალელური სიტყვასიტყვითი და არსებითი კვალის არსებობას, სადაც არსებითი კვალი უფრო მდგრადია. ეს კვალი LLM-ებისთვის ReadAgent-ის არსებითი შინაარსის გენერირების [9] მეშვეობით ოპერაციულდება; დიზაინი პირდაპირ ემყარება კოქსის [11] აღმოჩენას, რომლის მიხედვითაც, პარაფრაზირებული მოგონება სასურველია, მაშინ როცა სიტყვასიტყვითი მოგონება კონფიდენციალურობის პრობლემებს ქმნის. ხელწერა: თანამოსაუბრე ამბობს "სასოწარკვეთილი იყავი დედლაინის გამო" ტრანსკრიპტიდან ციტირების ნაცვლად; მომხმარებელს არ შეუძლია დააფიქსიროს, რომ ის მის სიტყვასიტყვით გამეორებას ახდენს. ეს არის C-სა და B-ს შორის ყველაზე მარტივად შესამჩნევი განსხვავება მომხმარებლისთვის და იმ ბერკეტს წარმოადგენს, რომელსაც მეორე ნდობისა და კონფიდენციალურობის პროგნოზი (H2b) მიზნად ისახავს.</w:t>
+        <w:t>ეტაპი 2 — წარმოდგენა (არსობრივი (gist) და სიტყვასიტყვითი საყრდენი, ორმაგი დაქრობა, ასინქრონული). თითოეული მოვლენა ინახავს არსობრივს (gist) — მნიშვნელობის, ენტიტეტებისა და პოზიციის მოკლე პარაფრაზს — სტრუქტურირებულ ველებთან და ერთ სიტყვასიტყვით საყრდენთან ერთად (არაუმეტეს ერთი წინადადებისა, ყველაზე გამორჩეული ციტატა, დაცული დასაბუთებისა და აუდიტისთვის, თუმცა ნაგულისხმევად არ ჩაშენებული). არსობრივი (gist) ჩაშენებული, ინიექცირებული ტვირთია; მისი სტაბილურობა საყრდენის სტაბილურობას აღემატება, ამიტომ მნიშვნელობა ზუსტ ფორმულირებაზე მეტხანს გადარჩება. სამართლიანობის შეზღუდვა განსაზღვრავს წარმოდგენას: თითოეული მოვლენის არსობრივი (gist) ტვირთი არასდროს აღემატება პროფილი B-ს საშუალო ტურის სიტყვასიტყვით ტვირთს, ამიტომ C არასდროს იღებს კონტექსტის უფრო მდიდარ ელემენტებს. დაფუძნება: ბუნდოვანი კვალის თეორია [24] ვარაუდობს პარალელური სიტყვასიტყვითი და არსობრივი კვალის არსებობას, სადაც არსობრივი კვალი უფრო მდგრადია; ეს LLM-ებისთვის ოპერაციულდება ReadAgent-ის არსობრივის გამოტანის [9] მეშვეობით. დიზაინი პირდაპირ მიზნად ისახავს კოქსის [11] აღმოჩენას, რომლის მიხედვითაც პარაფრაზირებული გახსენება სასურველია, მაშინ როცა სიტყვასიტყვითი გახსენება კონფიდენციალურობის შეშფოთებას იწვევს. ნიშან-თვისება: თანამოსაუბრე ამბობს „წუხდი დედლაინის გამო“ ტრანსკრიპტიდან ციტირების ნაცვლად; მომხმარებელს არ შეუძლია შეამჩნიოს, რომ თანამოსაუბრე მისსავე სიტყვებს თუთიყუშივით იმეორებს. ეს არის C-სა და B-ს შორის მომხმარებლისთვის ყველაზე იოლად შესამჩნევი განსხვავება და სწორედ ეს ბერკეტია, რომელსაც მეორე — ნდობისა და კონფიდენციალურობის — პროგნოზი (H2b) მიზნად ისახავს.</w:t>
       </w:r>
     </w:p>
     <w:p>
@@ -3858,7 +3858,7 @@
           <w:sz w:val="24"/>
           <w:lang w:val="ka-GE"/>
         </w:rPr>
-        <w:t>ეტაპი 3 — დაქრობა და გაძლიერება (ებინგჰაუსი, ზარმაცი, სინქრონული და ასინქრონული). თითოეულ კვალს ახასიათებს აღდგენადობა, რომელიც დროთა განმავლობაში ექსპონენციურად მცირდება ბოლო წვდომის მომენტიდან, მისი სტაბილურობის მიმართულებით, და გამოითვლება ზარმაცულად, აღდგენის მომენტში, როგორც ქულების გამრავლების კოეფიციენტი — არ ხდება ფონური აღრიცხვა და არც სინქრონული ჩაწერა. წარმატებული ხელახალი ხსენება აძლიერებს სტაბილურობას და ცვლის ბოლო წვდომის დროის მაჩვენებელს დროში გაჭიმული გამეორების პრინციპით, მაგრამ ჩაწერა რიგში დგება ოფლაინ რეჟიმში, ასე რომ სინქრონული არხი რჩება მხოლოდ წასაკითხად, ზუსტად ისევე, როგორც B-ში. რაც მთავარია, მე-4 ეტაპის მიერ წარმოქმნილი სემანტიკური ფაქტებიც ქრება, ამიტომ ებინგჰაუსის დინამიკა რჩება ცოცხალ დამოუკიდებელ ცვლადს და არა მუდმივი საცავის ზემოდან დადებულ კოსმეტიკურ ფენას. საფუძველი: ებინგჰაუსის დავიწყების მრუდი [23], MemoryBank/SiliconFriend [6]-ის სახით გამოთვლით პრეცედენტად. ხელწერა: ის, რაც დიდი ხნის წინ ერთხელ იყო ნახსენები, ქრება; რაც კი განმეორებით განიხილება, მდგრადი ხდება — ლამაზი, ბუნებრივი დავიწყება, B-ს შემზარავი სრული გახსენების საპირისპიროდ.</w:t>
+        <w:t>ეტაპი 3 — დაქრობა და გაძლიერება (ებინგჰაუსი, ზარმაცი, სინქრონული და ასინქრონული). თითოეულ კვალს გააჩნია აღდგენადობა, რომელიც ბოლო წვდომიდან გასული დროის მიხედვით, მისი სტაბილურობის შესაბამისად, ექსპონენციურად კლებულობს და მოძიების მომენტში ზარმაცად, ქულის გამრავლების კოეფიციენტის სახით, გამოითვლება — ფონური დათვლა და სინქრონული ჩაწერა არ ხდება. წარმატებული განმეორებითი ხსენება აძლიერებს სტაბილურობას და ბოლო წვდომის დროის ნიშნულს ანახლებს, დროში გადანაწილებული გამეორების პრინციპით, მაგრამ ჩაწერა ინახება რიგში ოფლაინ დასამუშავებლად, რათა სინქრონული გზა დარჩეს მხოლოდ წაკითხვადი — ზუსტად ისე, როგორც B-ში. რაც მთავარია, მე-4 ეტაპის მიერ წარმოქმნილი სემანტიკური ფაქტებიც დაქრება, ამიტომ ებინგჰაუსის დინამიკა რჩება ცოცხალ დამოუკიდებელ ცვლადად და არა მუდმივ საცავზე გადადებულ კოსმეტიკურ ფენად. დაფუძნება: ებინგჰაუსის დავიწყების მრუდი [23] — გამოთვლითი პრეცედენტია MemoryBank/SiliconFriend [6]. ხელწერა: რაც დიდი ხნის წინ მხოლოდ ერთხელ იქნა ნახსენები, ქრება, ხოლო რაც განმეორებით ბრუნდება — მდგრადი ხდება: გრაციოზული, ბუნებრივი დავიწყება, B-ს შემზარავი სრული გახსენების საპირისპიროდ.</w:t>
       </w:r>
     </w:p>
     <w:p>
@@ -3872,7 +3872,7 @@
           <w:sz w:val="24"/>
           <w:lang w:val="ka-GE"/>
         </w:rPr>
-        <w:t>ეტაპი 4 — კონსოლიდაცია (ეპიზოდურიდან სემანტიკურამდე, ოფლაინ "ძილი", ასინქრონული). სესიებს შორის ოფლაინ პარტიული ამოცანა აერთიანებს ეპიზოდურ მოვლენებს ენტიტეტისა და არსის მსგავსების მიხედვით; იმ კლასტერებისთვის, რომლებიც მინიმუმ მოვლენების მცირე ზღვარს იმეორებენ, ერთი მცირე-LLM-ის გამოძახება აბსტრაქცირებს მდგრად სემანტიკურ პროფილის ფაქტს ("მუშაობს მკაცრი დედლაინების პირობებში") ჰიპოკამპური ინდექსაციის [7] მეთოდით, წყაროს ეპიზოდებზე უკუმიმითითებებით, წარმოადგენს შთანთქმული ეპიზოდების დაწონილობას, უახლესი ან ყველაზე გაძლიერებული მტკიცებულებების სასარგებლოდ უთანხმოების მოგვარებას და ასოციაციური მეზობლების წინასწარ გაფართოებას, რათა ინფერენციისას ნებისმიერი ასოციაციური მოგონება ერთ ვექტორულ მოთხოვნამდე შემცირდეს. საუბრული დიდი ენის მოდელი არასდროს გადამზადდება; კონსოლიდაცია მხოლოდ საცავს რეგულირებს. დასაბუთება: ეს არის ეტაპი, რომელიც ყველაზე მეტად არის მიდრეკილი ჭარბი მტკიცებებისკენ და შესაბამისად გადაიწერება (F18). ჩვენ ვიყენებთ დამატებითი სასწავლო სისტემების ჩარჩოს [25] მისი ეპიზოდურიდან სემანტიკურზე გადაცემის ფუნქციის სულისკვეთების სახით და კონკრეტული მექანიზმისთვის უპირატესად ვყრდნობით ტულვინგის ეპიზოდურ-სემანტიკურ განასხვავებას [22] და ჰიპოკამპურ ინდექსაციას [7,26], ვიდრე მაკკლელენდის გადახლართულ, ინტერფერენციისგან დაცულ კორტიკულ სწავლებას. ხელწერა: კვირების განმავლობაში თანამოსაუბრე გადადის ფორმულირებიდან "გასულ სამშაბათს თქვით..." ფორმაზე "ვიცი, რომ მიდრეკილება გაქვთ..."; თითქოს მან რაღაც ისწავლა მომხმარებლის შესახებ — ახლად წარმოშობილი განზოგადება, რომელიც პირდაპირ არასდროს გაუგია. ეს არის ყველაზე C-თვის დამახასიათებელი, B-თვის შეუძლებელი ქცევა და ნებისმიერი ურთიერთობრივი უპირატესობის პროგნოზირებული წყარო, რომელიც C-ს B+-ზე აქვს.</w:t>
+        <w:t>ეტაპი 4 — კონსოლიდაცია (ეპიზოდურიდან სემანტიკურამდე, ოფლაინ „ძილი“, ასინქრონული). სესიებს შორის, ოფლაინ რეჟიმში, პაკეტური დამუშავება აჯგუფებს ეპიზოდურ მოვლენებს ერთეულისა და არსობრივი (gist) მსგავსების მიხედვით. იმ კლასტერებისთვის, რომლებიც მოვლენების მცირე ზღვარს მაინც აღწევს, ერთი მცირე LLM-გამოძახება აბსტრაჰირებს მდგრად სემანტიკურ პროფილის ფაქტს (მაგალითად, „მუშაობს მკაცრი დედლაინების პირობებში“) — თავისი წყარო-ეპიზოდებისკენ მიმართული უკუმაჩვენებლებით, ჰიპოკამპური ინდექსაციის [7] პრინციპის მიხედვით. იგივე პროცესი ამცირებს შთანთქმული ეპიზოდების წონას, წყვეტს წინააღმდეგობებს ყველაზე ახალი ან ყველაზე გამყარებული მტკიცებულების სასარგებლოდ და წინასწარ აფართოებს ასოციაციურ მეზობლებს, რის შედეგადაც ინფერენციისას ნებისმიერი ასოციაციური გახსენება ერთადერთ ვექტორულ მოთხოვნამდე დაიყვანება. დიალოგური დიდი ენობრივი მოდელი (LLM) არასდროს გადამზადდება — კონსოლიდაცია მხოლოდ საცავს გადააწყობს. დაფუძნება: სწორედ ეს ეტაპია ყველაზე მეტად მიდრეკილი ჭარბი მტკიცებისკენ, ამიტომ იგი შესაბამისად გადაერქმევა (F18). ჩვენ სწავლის კომპლემენტარული სისტემების ჩარჩოს [25] ვიშველიებთ მისი ეპიზოდურიდან სემანტიკურზე გადამტანი ფუნქციის „სულისკვეთების“ დონეზე, ხოლო კონკრეტული მექანიზმისთვის უპირატესად ვეყრდნობით ტულვინგის ეპიზოდურ-სემანტიკურ განასხვავებას [22] და ჰიპოკამპურ ინდექსაციას [7,26] — და არა მაკკლელენდის გადახლართული, ინტერფერენციისგან დაცული კორტიკული სწავლების პირდაპირ მტკიცებას. ხელწერა: კვირების განმავლობაში თანამოსაუბრე ფორმულირებიდან „გასულ სამშაბათს თქვით…“ გადადის ფორმაზე „ვიცი, რომ მიდრეკილება გაქვთ…“; ისე ჟღერს, თითქოს მან მომხმარებლის შესახებ რაღაც ისწავლა — ახლად გაჩენილი განზოგადება, რომელიც მას სიტყვასიტყვით არასდროს სმენია. ეს ყველაზე მეტად C-თვის დამახასიათებელი და B-თვის შეუძლებელი ქცევაა, და ის ნებისმიერი ურთიერთობრივი უპირატესობის პროგნოზირებული წყაროა, რომელიც C-ს B+-თან შედარებით გააჩნია.</w:t>
       </w:r>
     </w:p>
     <w:p>
@@ -3886,7 +3886,7 @@
           <w:sz w:val="24"/>
           <w:lang w:val="ka-GE"/>
         </w:rPr>
-        <w:t>ეტაპი 5 — მოძიება (პირველ რიგში არსებითი შინაარსის, კომპოზიტური შეფასების, ერთი, მხოლოდ წაკითხვისთვის განკუთვნილი მოთხოვნა, სინქრონული). ინფორმაციის გამოძახება იყენებს იმავე გამომწვევსა და შეყვანის წერტილს, რაც B-ს. მიმდინარე მორიგეობა ჩაშენებულია (ერთადერთი სინქრონული ჩაშენება, იდენტური B-ს), ერთი ვექტორული მოთხოვნა ორივე დონეზე დაახლოებით ოცი კანდიდატის პასუხს იღებს, მათ შორის ოფლაინ წინასწარ გაფართოებული ასოციაციური მეზობლების ჩათვლით; კანდიდატები ირანგება აქტივაციის ქულით, რომელიც მრავლდება კოსინუსური რელევანტურობის, გამოძახების შესაძლებლობისა და შეზღუდული სემანტიკური ბონუსის გამრავლებით, ყველა ექსპონენტის ფიქსირებული მნიშვნელობით 1. Salience განზრახ არ არის მონაცემთა გამოძახების ტერმინი — ის მხოლოდ წერასა და გაქრობას არეგულირებს — რაც გამორიცხავს შიდა კრიტიკის მიერ გამოვლენილ სამმაგ დათვლას. მონაცემთა გამოძახება ზუსტად ავსებს B-ის ტოკენების ბიუჯეტს, სემანტიკური ფაქტების უპირატესობით; სიტყვასიტყვითი ანკერი ჩნდება მხოლოდ იაფი, დეტერმინირებული საკვანძო სიტყვის ტრიგერის მიერ აღმოჩენილი ექსპლიციტური ზუსტი გამოძახების მოთხოვნისას, ამიტომ "ცხელი გზა" არ ახდენს LLM-ის არცერთ გამოძახებას მიმდინარე ტურის ფარგლებში. დაფუძნება: მინიშნებაზე დამოკიდებული გამოძახება [22], არსებითი შინაარსის უპირატესი გამოძახება [24], ებინგჰაუსის ხელმისაწვდომობა [23] და კომპლემენტარული სასწავლო სისტემების სემანტიკური უპირატესობა [25]. ხელწერა: თანამოსაუბრე პირველ რიგში წარმოაჩენს რელევანტურ განზოგადებას, ხოლო კონკრეტულ ეპიზოდს — მხოლოდ დაჟინებული მოთხოვნის შემთხვევაში, ამგვარად, მონაცემების მოძიება უფრო ადამიანს ჰგავს, რომელიც მომხმარებელს იცნობს, ვიდრე საძიებო სისტემას — იგივე დაყოვნებითა და ბიუჯეტით, რაც B-ს, მაგრამ განსხვავებული შინაარსით.</w:t>
+        <w:t>ეტაპი 5 — მოძიება (პირველ რიგში არსობრივი (gist), კომპოზიტური შეფასება, ერთი, მხოლოდ წაკითხვისთვის განკუთვნილი მოთხოვნა, სინქრონული). მოძიება იმავე გამომწვევსა და შეყვანის წერტილს იყენებს, რაც B-ს. მიმდინარე ტური ჩაშენებულია (ერთადერთი სინქრონული ჩაშენება, იდენტური B-ს ჩაშენებისა); ერთი ვექტორული მოთხოვნა ორივე დონეზე აბრუნებს დაახლოებით ოც კანდიდატს, მათ შორის ოფლაინ რეჟიმში წინასწარ გაფართოებულ ასოციაციურ მეზობლებსაც. კანდიდატები აქტივაციის ქულით ირანგება, რომელიც კოსინუსური რელევანტურობის, აღდგენადობისა და შეზღუდული სემანტიკური ბონუსის ნამრავლს წარმოადგენს — ყველა ექსპონენტის მნიშვნელობა კი 1-ზეა ფიქსირებული. სალიენსი განზრახ არ არის მოძიების ტერმინი — ის მხოლოდ ჩაწერასა და დაქრობას არეგულირებს — რაც გამორიცხავს შიდა კრიტიკის მიერ გამოვლენილ სამმაგ დათვლას. მოძიება ზუსტად ავსებს B-ის ტოკენების ბიუჯეტს, უპირატესად სემანტიკური ფაქტებით; სიტყვასიტყვითი ანკერი ჩნდება მხოლოდ იაფი, დეტერმინირებული საკვანძო-სიტყვის ტრიგერის მიერ აღმოჩენილი, ექსპლიციტური ზუსტი გახსენების მოთხოვნისას, ამიტომ „ცხელი გზა“ მიმდინარე ტურის ფარგლებში LLM-ის არცერთ გამოძახებას არ ახდენს. დაფუძნება: მინიშნებაზე დამოკიდებული გახსენება [22], არსობრივი (gist) პრიორიტეტის მქონე გახსენება [24], ებინგჰაუსისეული აღდგენადობა [23] და სწავლის კომპლემენტარული სისტემების სემანტიკური უპირატესობა [25]. ხელწერა: თანამოსაუბრე პირველ რიგში წარმოაჩენს რელევანტურ განზოგადებას და კონკრეტულ ეპიზოდს მხოლოდ დაჟინებული მოთხოვნის შემთხვევაში ავლენს — ისე, რომ გახსენება უფრო ისეთ ადამიანს ჰგავს, რომელიც მომხმარებელს იცნობს, ვიდრე საძიებო სისტემას, იმავე დაყოვნებითა და ბიუჯეტით, რაც B-ს, მაგრამ განსხვავებული შინაარსით.</w:t>
       </w:r>
     </w:p>
     <w:p>
@@ -3900,7 +3900,7 @@
           <w:sz w:val="24"/>
           <w:lang w:val="ka-GE"/>
         </w:rPr>
-        <w:t>თეორიული ერთგულებისგან განზრახ თავის არიდება. აქ სამი ასეთი თავის არიდებაა დასახელებული, როგორც შეზღუდვები და სამომავლო სამუშაო, რითაც თავიდან ვიცილებთ ყველაზე ძლიერ თეორიულ წინააღმდეგობებს (F18), ვიდრე მათ კომიტეტის წინ წამოსაწევად დავტოვებდეთ. პირველი, არქიტექტურა გამორიცხავს ინტერფერენციას, რომელიც ადამიანის დავიწყების დომინანტური მექანიზმია; მისი დავიწყება წმინდად დროით და თვალსაჩინოობითაა განპირობებული. მეორე, მისი კონსოლიდაცია, რომელიც უპირველეს ყოვლისა სიზუსტეზეა ორიენტირებული, მიზანმიმართულად თრგუნავს რეკონსტრუქციულ და სქემაზე დაფუძნებულ დამახინჯებას — არსებითი შინაარსის დონის ცრუ მეხსიერებას, რომელსაც "ბუნდოვანი კვალი" (fuzzy-trace) და CLS განსაკუთრებით მკაფიოდ პროგნოზირებენ — და კვლევის მიერ გაზომილი ადამიანურობის ღერძზე ფსიქოლოგიურ რეალიზმს უპირატესობას ანიჭებს იმ უსაფრთხოებას, რომ არ მოხდეს არასწორი განზოგადებების თავდაჯერებულად მტკიცება. მესამე, ის არ მოდელირებს დროის თანმიმდევრობის ან წყაროს მეხსიერებას დროის შტამპების მიღმა. ეს პრინციპული საინჟინრო არჩევანია და არა უგულებელყოფა, და 3.8-ში ისინი აღრიცხულია, როგორც კოგნიტური სიზუსტის მტკიცების საზღვრები.</w:t>
+        <w:t>თეორიული ერთგულებისგან დასახელებული გადახვევები. აქ სამი გადახვევაა დასახელებული, როგორც შეზღუდვები და სამომავლო გეგმები, რითაც წინ ვუსწრებთ ყველაზე ძლიერ თეორიულ წინააღმდეგობებს (F18), ვიდრე მათ კომიტეტისთვის დაგვეტოვებინა წამოსაწევად. პირველი, არქიტექტურა გამორიცხავს ინტერფერენციას, რომელიც ადამიანის დავიწყების დომინანტური მექანიზმია; მისი დავიწყება წმინდად დროზე და თვალსაჩინოობაზეა დამოკიდებული. მეორე, მისი სიზუსტეზე ორიენტირებული კონსოლიდაცია მიზანმიმართულად თრგუნავს რეკონსტრუქციულ და სქემაზე დაფუძნებულ დამახინჯებას — არსობრივი (gist) დონის ცრუ მეხსიერებას, რომელსაც „ბუნდოვანი კვალი“ (fuzzy-trace) და CLS ყველაზე მკაფიოდ წინასწარმეტყველებენ. ამით ის კვლევის მიერვე გაზომილი ადამიანურობის ღერძზე ფსიქოლოგიურ რეალიზმს სწირავს იმ უსაფრთხოების სანაცვლოდ, რომ არასწორი განზოგადებები თავდაჯერებულად არ დამტკიცდეს. მესამე, ის დროის შტამპების მიღმა არც დროითი თანმიმდევრობას მოდელირებს და არც წყაროს მეხსიერებას. ეს პრინციპული საინჟინრო არჩევანია და არა უგულებელყოფა, და 3.8 მათ კოგნიტური ერთგულების მტკიცების საზღვრებად აღრიცხავს.</w:t>
       </w:r>
     </w:p>
     <w:p>

</xml_diff>

<commit_message>
polish(§3.3): Sonnet-5 fluency + terminology, meaning verified
§3.3 (A/B/B+/C conditions), 8 units: gisting mistranslation ანოტაცია→corrected,
verbatim-RAG phrase, floor/agreement calques, run-on split. Four conditions +
both branches of the legibility-confound logic (C>B+ / C≈B+) + pre-registration
+ no-free-knob framing preserved. Both editions rebuilt.

Co-Authored-By: Claude Opus 4.8 (1M context) <noreply@anthropic.com>
</commit_message>
<xml_diff>
--- a/project/thesis-ka.docx
+++ b/project/thesis-ka.docx
@@ -1787,7 +1787,7 @@
           <w:rFonts w:ascii="Sylfaen" w:hAnsi="Sylfaen"/>
           <w:sz w:val="24"/>
         </w:rPr>
-        <w:t>52</w:t>
+        <w:t>53</w:t>
       </w:r>
     </w:p>
     <w:p>
@@ -1817,7 +1817,7 @@
           <w:rFonts w:ascii="Sylfaen" w:hAnsi="Sylfaen"/>
           <w:sz w:val="24"/>
         </w:rPr>
-        <w:t>52</w:t>
+        <w:t>53</w:t>
       </w:r>
     </w:p>
     <w:p>
@@ -1847,7 +1847,7 @@
           <w:rFonts w:ascii="Sylfaen" w:hAnsi="Sylfaen"/>
           <w:sz w:val="24"/>
         </w:rPr>
-        <w:t>53</w:t>
+        <w:t>54</w:t>
       </w:r>
     </w:p>
     <w:p>
@@ -1877,7 +1877,7 @@
           <w:rFonts w:ascii="Sylfaen" w:hAnsi="Sylfaen"/>
           <w:sz w:val="24"/>
         </w:rPr>
-        <w:t>55</w:t>
+        <w:t>56</w:t>
       </w:r>
     </w:p>
     <w:p>
@@ -1907,7 +1907,7 @@
           <w:rFonts w:ascii="Sylfaen" w:hAnsi="Sylfaen"/>
           <w:sz w:val="24"/>
         </w:rPr>
-        <w:t>57</w:t>
+        <w:t>58</w:t>
       </w:r>
     </w:p>
     <w:p>
@@ -1937,7 +1937,7 @@
           <w:rFonts w:ascii="Sylfaen" w:hAnsi="Sylfaen"/>
           <w:sz w:val="24"/>
         </w:rPr>
-        <w:t>58</w:t>
+        <w:t>59</w:t>
       </w:r>
     </w:p>
     <w:p>
@@ -1967,7 +1967,7 @@
           <w:rFonts w:ascii="Sylfaen" w:hAnsi="Sylfaen"/>
           <w:sz w:val="24"/>
         </w:rPr>
-        <w:t>60</w:t>
+        <w:t>61</w:t>
       </w:r>
     </w:p>
     <w:p>
@@ -1997,7 +1997,7 @@
           <w:rFonts w:ascii="Sylfaen" w:hAnsi="Sylfaen"/>
           <w:sz w:val="24"/>
         </w:rPr>
-        <w:t>60</w:t>
+        <w:t>61</w:t>
       </w:r>
     </w:p>
     <w:p>
@@ -2027,7 +2027,7 @@
           <w:rFonts w:ascii="Sylfaen" w:hAnsi="Sylfaen"/>
           <w:sz w:val="24"/>
         </w:rPr>
-        <w:t>61</w:t>
+        <w:t>62</w:t>
       </w:r>
     </w:p>
     <w:p>
@@ -2057,7 +2057,7 @@
           <w:rFonts w:ascii="Sylfaen" w:hAnsi="Sylfaen"/>
           <w:sz w:val="24"/>
         </w:rPr>
-        <w:t>61</w:t>
+        <w:t>62</w:t>
       </w:r>
     </w:p>
     <w:p>
@@ -2087,7 +2087,7 @@
           <w:rFonts w:ascii="Sylfaen" w:hAnsi="Sylfaen"/>
           <w:sz w:val="24"/>
         </w:rPr>
-        <w:t>63</w:t>
+        <w:t>64</w:t>
       </w:r>
     </w:p>
     <w:p>
@@ -3934,7 +3934,7 @@
           <w:sz w:val="24"/>
           <w:lang w:val="ka-GE"/>
         </w:rPr>
-        <w:t>შეფასება ერთმანეთს უპირისპირებს მეხსიერების ოთხ პროფილს, რომლებსაც ყველა ერთნაირი, ინფერენციის დროის საერთო ჩარჩო აქვთ. დიზაინის მეთოდოლოგიური არსი იმაში მდგომარეობს, რომ C-მ, თუკი გაიმარჯვებს, უნდა გაიმარჯვოს იმის წყალობით, თუ როგორ იხსენებს, და არა იმიტომ, რომ უფრო მეტს ან უფრო სუფთად იხსენებს.</w:t>
+        <w:t>შეფასება ერთმანეთს უპირისპირებს მეხსიერების ოთხ პროფილს, რომელთაგან თითოეულს ინფერენციის დროის ერთი და იგივე ჩარჩო აქვს. დიზაინის მეთოდოლოგიური არსი იმაშია, რომ C-მ, თუ საერთოდ გაიმარჯვებს, გამარჯვება უნდა მოიპოვოს იმის წყალობით, თუ როგორ იხსენებს — და არა იმიტომ, რომ უფრო მეტს ან უფრო სუფთად იხსენებს.</w:t>
       </w:r>
     </w:p>
     <w:p>
@@ -3948,7 +3948,7 @@
           <w:sz w:val="24"/>
           <w:lang w:val="ka-GE"/>
         </w:rPr>
-        <w:t>•  A — გრძელვადიანი მეხსიერების გარეშე. მხოლოდ ცვალებადი სამუშაო ფანჯარა; ყოველი სესია იწყება ნულიდან. A აშკარა მინიმალური ზღვარია და, გადავადებულ ადამიანურ პროტოკოლში (3.5c), ის სრულ, მრავალკვირიან რაუნდს კი არ წარმოადგენს, არამედ მოკლე, წინასწარ დაწერილი სცენარით გათვალისწინებულ კალიბრაციის ეტაპს.</w:t>
+        <w:t>•  A — გრძელვადიანი მეხსიერების გარეშე. მხოლოდ ცვალებადი სამუშაო ფანჯარაა; ყოველი სესია ნულიდან იწყება. A აშკარა ქვედა ზღვარია და გადავადებულ ადამიანურ პროტოკოლში (3.5c) დაყვანილია მოკლე, წინასწარ დაწერილი სცენარის კალიბრაციის ეტაპამდე, და არა სრულ, მრავალკვირიან რაუნდამდე.</w:t>
       </w:r>
     </w:p>
     <w:p>
@@ -3962,7 +3962,7 @@
           <w:sz w:val="24"/>
           <w:lang w:val="ka-GE"/>
         </w:rPr>
-        <w:t>•  B — სიტყვასიტყვით RAG. უმუშავო ტურები ჩაშენებულია და მოიძებნება საერთო ტოკენების ბიუჯეტში კოსინუსის ტოპ-k-ის მეშვეობით. ეს არის სტანდარტი და კოქსის კვლევაში [11] მოცემული პირობის ("მიუთითებს თქვენს ზუსტ გამონათქვამებზე") პირდაპირი ოპერაციული ანალოგი.</w:t>
+        <w:t>•  B — პირდაპირ (verbatim) მოძიებაზე დაფუძნებული RAG. დაუმუშავებელი დიალოგის ტურები ჩაშენებულია და საერთო ტოკენების ბიუჯეტში მოიძიება კოსინუსური მსგავსების ტოპ-k-ის მეშვეობით. ეს სტანდარტული მიდგომაა და წარმოადგენს კოქსის კვლევაში [11] აღწერილი პირობის — „მიუთითებს თქვენს ზუსტ გამონათქვამებზე“ — პირდაპირ ოპერაციულ ანალოგს.</w:t>
       </w:r>
     </w:p>
     <w:p>
@@ -3976,7 +3976,7 @@
           <w:sz w:val="24"/>
           <w:lang w:val="ka-GE"/>
         </w:rPr>
-        <w:t>•  B+ — კურატორირებული სტატიკური მეხსიერება (აქტიური კონტროლი). C-ს მსგავსი იდენტური ოფლაინ LLM-ის ანოტაცია და კორეფერენსის გაწმენდა, იგივე შეკუმშვა და ტოკენების ბიუჯეტი, მაგრამ გარეშე დაშლის, სალიენს-გეითინგის, და კონსოლიდაციის — მხოლოდ წმინდა კოსინუსის top-k გაწმენდილ ანოტაციებზე.</w:t>
+        <w:t>•  B+ — კურატორირებული სტატიკური მეხსიერება (აქტიური კონტროლი). C-ს იდენტური ოფლაინ LLM-ის მიერ შესრულებული არსობრივი (gist) შეჯამება და კორეფერენციის გაწმენდა, იგივე შეკუმშვა და ტოკენების ბიუჯეტი, მაგრამ კლებადობის, სალიენს-გეითინგის და კონსოლიდაციის გარეშე — მხოლოდ წმინდა კოსინუსური top-k გაწმენდილ არსობრივ (gist) შეჯამებებზე.</w:t>
       </w:r>
     </w:p>
     <w:p>
@@ -3990,7 +3990,7 @@
           <w:sz w:val="24"/>
           <w:lang w:val="ka-GE"/>
         </w:rPr>
-        <w:t>•  C — პროფილი C. 3.2-ის ადამიანის მეხსიერების სრული, ხუთეტაპიანი სასიცოცხლო ციკლი.</w:t>
+        <w:t>•  C — პროფილი C. 3.2-ში აღწერილი ადამიანის მეხსიერების სრული ხუთეტაპიანი სასიცოცხლო ციკლი.</w:t>
       </w:r>
     </w:p>
     <w:p>
@@ -4004,7 +4004,7 @@
           <w:sz w:val="24"/>
           <w:lang w:val="ka-GE"/>
         </w:rPr>
-        <w:t>B+ არის დიზაინის ცენტრალური მეთოდოლოგიური წვლილი. C-სთვის ნებისმიერი დადებითი შედეგისთვის ყველაზე სერიოზული საფრთხე არის წაკითხვადობის აღრევის ფაქტორი: C-ს მიერ შეჯამებული და კო-რეფერენსებისგან გაწმენდილი პროზა უბრალოდ უფრო წაკითხვადი არის, ვიდრე B-ს უმი ფრაგმენტები, და C-სა და B-ს შორის უბრალო გამარჯვება ერთმანეთში აურივებს კურირებასა და კოგნიტურ დინამიკას. B+ თავისი კონსტრუქციით გამორიცხავს ამ აღრევის ფაქტორს. თუ C &gt; B+, მარგინალური ეფექტი განპირობებულია ადამიანის მეხსიერების იმ დინამიკით, რომელიც მხოლოდ C-ს ახასიათებს. თუ C ≈ B+, გულწრფელი დასკვნა იქნება, რომ აღქმითი სარგებელი თავიდანვე წაკითხვადობა იყო, და ამიტომ მოსაზრება შესაბამისად გადაიხედა — დასკვნა, რომელიც ზუსტად იმიტომ არის ინტერპრეტაციული, რომ B+ სწორედ ამის დასაშვებად შეიქმნა. სწორედ ამიტომ, როგორც 3.1-შია აღნიშნული, C &gt; B+ არის შეფასების სამიზნე და სწორედ ამიტომ B+-ის გამორიცხვა არ განიხილება.</w:t>
+        <w:t>B+ დიზაინის ცენტრალური მეთოდოლოგიური წვლილია. C-ს სასარგებლოდ მიღებულ ნებისმიერ დადებით შედეგს ყველაზე სერიოზულად წაკითხვადობის აღრევის ფაქტორი ემუქრება: C-ს არსობრივად (gist) შეჯამებული და კორეფერენციისგან გაწმენდილი პროზა უბრალოდ უფრო წაკითხვადია, ვიდრე B-ს დაუმუშავებელი ფრაგმენტები, ხოლო C-სა და B-ს შორის უბრალო გამარჯვება ერთმანეთში აურევს კურატორირებასა და კოგნიტურ დინამიკას. B+ თავისი კონსტრუქციით წყვეტს ამ აღრევის ფაქტორს. თუ C &gt; B+, მარგინალური ეფექტი განპირობებულია ადამიანის მეხსიერების იმ დინამიკით, რომელსაც მხოლოდ C მატებს. თუ C ≈ B+, გულწრფელი დასკვნა იქნება ის, რომ აღქმითი სარგებელი თავიდანვე წაკითხვადობა იყო და მოსაზრება შესაბამისად გადაიხედება — დასკვნა, რომელიც სწორედ იმიტომ არის ინტერპრეტირებადი, რომ B+ ზუსტად ამის დასაშვებად შეიქმნა. სწორედ ამიტომ, როგორც 3.1-შია აღნიშნული, C &gt; B+ არის შეფასების სამიზნე, და სწორედ ამიტომ B+-ის გამორიცხვა დაუშვებელია.</w:t>
       </w:r>
     </w:p>
     <w:p>
@@ -4016,7 +4016,7 @@
           <w:sz w:val="24"/>
           <w:lang w:val="ka-GE"/>
         </w:rPr>
-        <w:t>ცხრილი 3.1 პირდაპირ ასახავს აღრევის ფაქტორების კონტროლის ლოგიკას. ყველაფერი, რაც "უცვლელად შენარჩუნებულია" რიგშია, იდენტურია A, B, B+ და C-სთვის.</w:t>
+        <w:t>ცხრილი 3.1 ცხადად ასახავს აღრევის ფაქტორების კონტროლის ლოგიკას. „უცვლელად შენარჩუნებული“ რიგში მითითებული ყველაფერი A, B, B+ და C-ში იდენტურია.</w:t>
       </w:r>
     </w:p>
     <w:p>
@@ -4360,7 +4360,7 @@
           <w:sz w:val="24"/>
           <w:lang w:val="ka-GE"/>
         </w:rPr>
-        <w:t>ყველა არქიტექტურული პარამეტრი — სეგმენტაციის ზღვარი, მნიშვნელობის (სალიენსის) რუბრიკა და ქვედა ზღვარი, მნიშვნელობიდან სტაბილურობამდე კოეფიციენტი, არსებითიდან საყრდენამდე სტაბილურობის თანაფარდობა, კლებადი კონსტანტები, კონსოლიდაციის კლასტერის ზომა და ზღვარი, აქტივაციის ფორმა — აპრიორულად ფიქსირებული და წინასწარ დარეგისტრირებულია, გარედან დამაგრებული მნიშვნელობებით (მაგ., MemoryBank-იდან [6] აღებული კლებადი კონსტანტები) და აუცილებელი მგრძნობელობის ანალიზით (3.7), რათა არცერთი თავისუფალი რეგულატორი არ იყოს მორგებული სოციალურ შედეგზე. სრული პროტოკოლით, სალიენტობის მარკიორი ვალიდაციას გადის ორი-სამი ექსპერტი ადამიანის ანოტატორის (რომლებიც კვლევის მონაწილეები არ არიან) მიერ, ხოლო სეგმენტაციის ზღვარი კალიბრირდება ადამიანის მიერ დატანილი თემატური ცვლილების იარლიყების მიხედვით — ორივე შემთხვევაში გარე სამიზნეზე, და არა კვლევის დამოკიდებულ ცვლადებზე.</w:t>
+        <w:t>ყველა არქიტექტურული პარამეტრი — სეგმენტაციის ზღვარი, მნიშვნელობის (სალიენსის) რუბრიკა და ქვედა ზღვარი, მნიშვნელობიდან სტაბილურობამდე კოეფიციენტი, არსობრივიდან (gist) საყრდენამდე სტაბილურობის თანაფარდობა, კლებადი კონსტანტები, კონსოლიდაციის კლასტერის ზომა და ზღვარი, აქტივაციის ფორმა — აპრიორულად ფიქსირებული და წინასწარ დარეგისტრირებულია. მნიშვნელობები გარედან არის დამაგრებული (მაგალითად, MemoryBank-იდან [6] აღებული კლებადი კონსტანტები) და გათვალისწინებულია აუცილებელი მგრძნობელობის ანალიზი (3.7), რათა არცერთი თავისუფალი რეგულატორი არ იყოს მორგებული სოციალურ შედეგზე. სრული პროტოკოლის ფარგლებში სალიენტობის მარკერი ვალიდირდება ორი-სამი ექსპერტი ადამიანის ანოტატორის მიერ (რომლებიც კვლევის მონაწილეები არ არიან), ხოლო სეგმენტაციის ზღვარი კალიბრირდება ადამიანის მიერ მინიჭებული თემატური ცვლილების იარლიყების მიხედვით — ორივე შემთხვევაში გარე სამიზნის მიხედვით, და არასოდეს კვლევის დამოკიდებული ცვლადების მიხედვით.</w:t>
       </w:r>
     </w:p>
     <w:p>

</xml_diff>

<commit_message>
polish(§3.4): Sonnet-5 fluency + terminology, meaning verified
§3.4 (Proof-of-concept), 2 units: research object საგანი→ობიექტი (swap fix),
lazily-evaluated-decay un-conflated from latency, harness→ხელსაწყო. F17/F18,
numbers (12-16wk, sub-100ms, 2-5s), standalone-not-fielded + latency-parity-
empirical preserved. Both editions rebuilt.

Co-Authored-By: Claude Opus 4.8 (1M context) <noreply@anthropic.com>
</commit_message>
<xml_diff>
--- a/project/thesis-ka.docx
+++ b/project/thesis-ka.docx
@@ -1757,7 +1757,7 @@
           <w:rFonts w:ascii="Sylfaen" w:hAnsi="Sylfaen"/>
           <w:sz w:val="24"/>
         </w:rPr>
-        <w:t>49</w:t>
+        <w:t>50</w:t>
       </w:r>
     </w:p>
     <w:p>
@@ -4394,7 +4394,7 @@
           <w:sz w:val="24"/>
           <w:lang w:val="ka-GE"/>
         </w:rPr>
-        <w:t>ამ დისერტაციაში წარმოდგენილი კონცეფციის დამტკიცება არის დამოუკიდებელი მეხსიერების მართვის სისტემა და არა სრულმასშტაბიანი ხმოვანი აპლიკაცია. ის ახორციელებს ოთხ პირობას A, B, B+ და C — C-ის ხუთსაფეხურიანი სასიცოცხლო ციკლის გამოყენებით, 4-ში მითითებული სიზუსტით — როგორც ინსტრუმენტული მოდული, რომელიც მუშაობს ტრანსკრიპტებზე, მიზანმიმართულად, Voice Companion-ის სრული ხმოვანი მიწოდების ჯაჭვის მიღმა. ამ მასშტაბის მოტივაცია ორ გულწრფელ მიზეზს აქვს. პირველი, არსებული პლატფორმის (F17) აუდიტმა დაადგინა, რომ ხმის აპლიკაცია დღესდღეობით მხოლოდ A პირობას უზრუნველყოფს და დამატებით თორმეტიდან თექვსმეტ კვირამდე საინჟინრო სამუშაოს საჭიროებს — ხმის მეხსიერებაზე გადაყვანის კავშირის, თითოეული მონაწილისთვის სახელწოდების სივრცის გამოყოფისა და განთავსებადი კლიენტის შექმნას — სანამ ის B, B+, და C პირობების რეალურ მომხმარებლებზე მასპინძლობას შეძლებს; ეს შექმნა ამჟამინდელი დროის ჩარჩოსთვის არ შედის. მეორე და, რაც უფრო მნიშვნელოვანია, კვლევის საგანია მეხსიერების პროცესი, რომელიც სრულად გამოიყენება დიალოგის ტრანსკრიპტებზე მომუშავე სპეციალური პროგრამული უზრუნველყოფით. მეხსიერების ძრავის გამოყოფა მეტყველებიდან-ტექსტად, ტექსტიდან-მეტყველებად და რიგის მიყოლის მექანიზმებისგან საშუალებას იძლევა, რომ კონცეფციის დამტკიცებამ ნათლად და გამეორებადურად აჩვენოს და დააპროგრამოს მექანიზმები — მოვლენების სეგმენტაცია, მნიშვნელობაზე დაფუძნებული კოდირება, ორმაგი დაქვეითების წარმოდგენა, Ebbinghaus-ის ზარმაცი დაქვეითება და გაძლიერება, ოფლაინ კონსოლიდაცია და არსის მიხედვით მოძიება.</w:t>
+        <w:t>ამ დისერტაციაში წარმოდგენილი კონცეფციის დამტკიცება მეხსიერების დამოუკიდებელი ხელსაწყოა და არა დანერგილი ხმოვანი აპლიკაცია. ის ახორციელებს ოთხივე პირობას — A, B, B+ და C — ინსტრუმენტირებადი მოდულის სახით, რომელიც ტრანსკრიპტებზე მუშაობს და მიზანმიმართულად რჩება Voice Companion-ის სრული ხმოვანი დამუშავების ჯაჭვის მიღმა. ამასთანავე, ის 4-ში მითითებული სიზუსტით ახორციელებს C-ის ხუთსაფეხურიან სასიცოცხლო ციკლს. ამ ფარგლის არჩევანს ორი გულწრფელი მიზეზი განაპირობებს. პირველი, არსებული პლატფორმის აუდიტმა (F17) დაადგინა, რომ ხმოვანი აპლიკაცია დღეისათვის მხოლოდ A პირობას უზრუნველყოფს და მას B, B+ და C პირობების რეალურ მომხმარებლებთან მასპინძლობამდე კიდევ თორმეტიდან თექვსმეტ კვირამდე საინჟინრო სამუშაო სჭირდება — კერძოდ, ხმიდან მეხსიერებაში გადამყვანი კავშირი (hook), თითოეული მონაწილისთვის ცალკე სახელთა სივრცე და განთავსებადი კლიენტი. ეს სამუშაო კი წინამდებარე კვლევის ვადებს სცილდება. მეორე და უფრო მნიშვნელოვანი მიზეზი ისაა, რომ კვლევის ობიექტი მეხსიერების პროცესია, რომელსაც დიალოგის ტრანსკრიპტებზე მომუშავე ხელსაწყო სრულად ამოქმედებს. მეხსიერების ძრავის გამიჯვნა მეტყველება-ტექსტად და ტექსტი-მეტყველებად გარდაქმნისგან და მორიგეობის მართვისგან კონცეფციის დამტკიცებას აძლევს საშუალებას, სუფთად და განმეორებადად წარმოაჩინოს და ინსტრუმენტულად აღრიცხოს მექანიზმები — მოვლენების სეგმენტაცია, სალიენს-გეითინგით კოდირება, ორმაგი დაქრობის წარმოდგენა, ებინგჰაუსისეული ზარმაცი დაქრობა და გაძლიერება, ოფლაინ კონსოლიდაცია და პირველ რიგში არსობრივი (gist) მოძიება.</w:t>
       </w:r>
     </w:p>
     <w:p>
@@ -4408,7 +4408,7 @@
           <w:sz w:val="24"/>
           <w:lang w:val="ka-GE"/>
         </w:rPr>
-        <w:t>შესაბამისად, ეს ხელსაწყო წარმოდგენილია მექანიზმების დემონსტრაციად და 3.5-ის ტექნიკური და სიმულირებული შეფასების საფუძვლად და არა, როგორც კვლევის აპარატის ოპერატიულ ვერსიად. ის პირდაპირ განასახიერებს 3.3-ის სამართლიანობის არქიტექტურას: პირობებს შორის საერთო ამოღების ტრიგერი, შეყვანის წერტილი და ტოკენების ბიუჯეტი; თითოეული პირობისთვის იზოლირებული საცავები; სეგმენტაციის, მნიშვნელობის ქულების მინიჭების, არსებითი შინაარსის შექმნისა და კონსოლიდაციისთვის ოფლაინ ჯგუფური ამოცანები; და მხოლოდ წაკითხვისთვის განკუთვნილი სინქრონული ამოღების გზა, დაყოვნებით გამოთვლილი დაქვეითებითა და ნულოვანი მორიგეობით LLM-ის გამოძახებით. ყველაზე იაფი მისაღები ვარიანტის ანალიზის (F18) თანახმად, კონცეფციის დამტკიცება პრიორიტეტს ანიჭებს აუცილებელ ბირთვს — B+, კონსოლიდაციას, მარტივ ინერტულ კლებას და არსებითი შინაარსის/საყრდენი წარმოდგენას — და შესაძლოა, ყველაზე ძვირადღირებული დახვეწის ეტაპები (მასშტაბურ დონეზე პროგრამული აქტუალობის კონტროლი, ასოციაციური წინასწარი გაფართოება, საყრდენი-რეგულარული გამომწვევი და სენსიტიურობის ავტომატიზებული შემოწმება) სრულ ვერსიამდე გადადოს, და ასეთი ნებისმიერი გადადება ექსპლიციტურად იქნება აღნიშნული და არა ჩუმად ნაგულისხმევი. თითოეული მონაცვლეობის სინქრონული ხარჯი დომინირებულია 100 მილიწამზე ნაკლები ხანგრძლივობის ერთ ვექტორულ მოთხოვნასა და O(k) არითმეტიკულ ოპერაციებზე, რაც თავისუფლად ეტევა პლატფორმისთვის დოკუმენტირებულ დაახლოებით ორიდან ხუთ წამამდე ხმოვან მონაცვლეობაში (F17); B, B+ და C-ს შორის დაყოვნების თანასწორობა მტკიცების ნაცვლად ემპირიულად ფიქსირდება ჰარნესის მიერ.</w:t>
+        <w:t>შესაბამისად, ეს ხელსაწყო წარმოდგენილია მექანიზმების დემონსტრაციად და 3.5-ის ტექნიკური და სიმულირებული შეფასების საფუძვლად და არა დანერგილი კვლევის აპარატად. ის პირდაპირ განასახიერებს 3.3-ის სამართლიანობის არქიტექტურას: პირობებს შორის საერთო მოძიების გამომწვევს (trigger), შეყვანის წერტილსა და ტოკენების ბიუჯეტს, თითოეული პირობისთვის იზოლირებულ საცავებს და სეგმენტაციის, სალიენსის შეფასების, არსობრივის (gist) გამოტანისა და კონსოლიდაციისთვის განკუთვნილ ოფლაინ ჯგუფურ ამოცანებს. ამას ემატება მხოლოდ წაკითხვადი სინქრონული მოძიების გზა, ზარმაცად გამოთვლილი დაქრობითა და მიმდინარე ტურის ფარგლებში LLM-ის ნულოვანი გამოძახებით. ყველაზე იაფი სიცოცხლისუნარიანი ვარიანტის ანალიზის (F18) შესაბამისად, კონცეფციის დამტკიცება პრიორიტეტს ანიჭებს დაუთმობელ ბირთვს — B+-ს, კონსოლიდაციას, მარტივ ზარმაც დაქრობასა და არსობრივი (gist) და საყრდენის ერთობლივ წარმოდგენას. ის ასევე შესაძლოა გადადოს ყველაზე ძვირადღირებული დახვეწის ელემენტებს — მასშტაბური პროგრამული სალიენს-გეითინგი, ასოციაციური წინასწარი გაფართოება, საყრდენის regex-ტრიგერი და მგრძნობელობის ავტომატიზებული ანალიზი (sweep) — სრულ ვერსიამდე, ამასთან, ნებისმიერი ასეთი გადავადება ექსპლიციტურად უნდა იყოს დაფიქსირებული და არა ჩუმად ნაგულისხმევი. თითოეული ტურის სინქრონული ხარჯი დომინირებულია ერთი 100 მილიწამზე ნაკლები ხანგრძლივობის ვექტორული მოთხოვნითა და O(k) არითმეტიკული ოპერაციებით, რაც თავისუფლად ეტევა პლატფორმისთვის დოკუმენტირებულ, დაახლოებით ორიდან ხუთ წამამდე ხმოვან ტურში (F17); B, B+ და C-ს შორის დაყოვნების თანასწორობა ხელსაწყოდან მიღებული მონაცემებით ემპირიულად ფიქსირდება და არა უბრალოდ მტკიცდება.</w:t>
       </w:r>
     </w:p>
     <w:p>

</xml_diff>

<commit_message>
polish(§3.5): Sonnet-5 fluency + terminology, meaning verified (split-run)
§3.5 (Evaluation methodology), 5 units in two parallel halves. Three-track ordering,
recall-not-target, simulated-proxy-not-substitute, deferred human protocol
(fully-specifies-but-does-not-conduct), and all power numbers (20/116-159/2-12%/dz0.28)
preserved; within-subject term restored; null-hypothesis-vs-null-result fix. Both editions rebuilt.

Co-Authored-By: Claude Opus 4.8 (1M context) <noreply@anthropic.com>
</commit_message>
<xml_diff>
--- a/project/thesis-ka.docx
+++ b/project/thesis-ka.docx
@@ -4442,7 +4442,7 @@
           <w:sz w:val="24"/>
           <w:lang w:val="ka-GE"/>
         </w:rPr>
-        <w:t>არქიტექტურა შეფასებულია სამი მიმართულებით, მზარდი ეკოლოგიური ამბიციითა და მიმდინარე შესრულებადობის კლებადი დონით: ტექნიკური შეფასება (წარმოდგენილია 4-ში), სიმულირებული მომხმარებლის შეფასება (წარმოდგენილია 4-ში, მკაფიოდ განსაზღვრული შეზღუდვებით) და შემუშავებული პროტოკოლი ადამიან-სუბიექტებისთვის (განმარტებულია აქ, გადავადებულია მომავალი ნაშრომისთვის). ეს დაყოფა მიზანმიმართულია: პირველი ორი მიმართულება იკვლევს მექანიზმებს და ქმნის ჰიპოთეზებს; მხოლოდ მესამე შეუძლია შეაფასოს აღქმის შესახებ გაკეთებული მტკიცებულებები, და ის ამ ნაშრომში არ სრულდება.</w:t>
+        <w:t>არქიტექტურა შეფასებულია სამი მიმართულებით, რომლებიც დალაგებულია მზარდი ეკოლოგიური ამბიციისა და კლებადი, ამჟამინდელი განხორციელებადობის მიხედვით: ტექნიკური შეფასება (წარმოდგენილია 4-ში), სიმულირებული მომხმარებლის შეფასება (წარმოდგენილია 4-ში, მკაფიოდ განსაზღვრული შეზღუდვებით) და შემუშავებული პროტოკოლი ადამიან-სუბიექტებისთვის (აღწერილია აქვე, გადატანილი სამომავლო გეგმებში). ეს გამიჯვნა მიზანმიმართულია: პირველი ორი მიმართულება იკვლევს მექანიზმებს და აყალიბებს ჰიპოთეზებს; მხოლოდ მესამეს ძალუძს აღქმის შესახებ მტკიცებების განსჯა, თუმცა სწორედ ის ამ ნაშრომში არ ტარდება.</w:t>
       </w:r>
     </w:p>
     <w:p>
@@ -4456,7 +4456,7 @@
           <w:sz w:val="24"/>
           <w:lang w:val="ka-GE"/>
         </w:rPr>
-        <w:t>(ა) ტექნიკური შეფასება. ბენჩმარკის ტიპის შეფასება ოთხი პირობის მიხედვით ტარდება სინთეზურ მრავალსესიან დიალოგებზე და ზომავს რაოდენობის სამ კატეგორიას: აღდგენის ხარისხი (წინა სესიის შინაარსის ფაქტობრივი აღდგენა, 2.5-ის გრძელვადიანი მეხსიერების ბენჩმარკების მსგავსად); დროითი მსჯელობა (კატეგორია, რომელიც თანმიმდევრულად ყველაზე სუსტია LoCoMo-სა და LongMemEval-ში [1,2]); და დაყოვნება (B, B+ და C-სთვის თითოეული რაუნდის სინქრონული გამოძახების დრო, რაც 3.4-ში მითითებულ პარიტეტს ადასტურებს). ლიტერატურაში მოყვანილი ორი გაფრთხილება გათვალისწინებულია. პირველი, რადგან გამოქვეყნებული მეხსიერების ტესტების შედეგები დაუჯერებელი აღმოჩნდა, ხოლო მათი ავტომატური შემფასებლები — შემწყნარებლები (F9, [32,33]), ჰარნესი თავის საკუთარ შეფასების პროცედურას ხელახლა ამოწმებს, ნაცვლად იმისა, რომ ხარვეზიანი პროცედურა მემკვიდრეობით მიიღოს, და ამ გაფრთხილების გათვალისწინებით აბსოლუტურ ქულებს წარმოადგენს. მეორე, ტექნიკური აღდგენის სიზუსტე პირდაპირ არ წარმოადგენს ნაშრომის სამიზნე შედეგს — სინამდვილეში, დიზაინი პროგნოზირებს, რომ C-ს განზრახვისამებრ შეიძლება B-ზე ნაკლები ტექსტის პირდაპირი ციტირება შეეძლოს — ამიტომ ეს მეტრიკები ახასიათებს მექანიზმებს და ამოწმებს, რომ C-ს დავიწყება ხარვეზული კი არა, დახვეწილია; ისინი არ წარმოადგენენ აღქმული ურთიერთკავშირის შედეგების მაჩვენებელს.</w:t>
+        <w:t>(ა) ტექნიკური შეფასება. ბენჩმარკის ტიპის შეფასება ოთხივე პირობაზე ტარდება სინთეზურ მრავალსესიან დიალოგებში და ზომავს რაოდენობის სამ კატეგორიას: გახსენების ხარისხს, დროით (ტემპორალურ) მსჯელობას და დაყოვნებას. გახსენების ხარისხი გულისხმობს წინა სესიის შინაარსის ფაქტობრივ გახსენებას, 2.5-ის გრძელვადიანი მეხსიერების ბენჩმარკების მსგავსად. დროითი (ტემპორალური) მსჯელობა არის კატეგორია, რომელიც თანმიმდევრულად ყველაზე სუსტია LoCoMo-სა და LongMemEval-ში [1,2]. დაყოვნება კი გულისხმობს B, B+ და C-სთვის თითოეული რაუნდის სინქრონული მოძიების დროს, რაც 3.4-ში მითითებულ პარიტეტს ადასტურებს. ლიტერატურაში მოყვანილი ორი გაფრთხილება გათვალისწინებულია. პირველი, გამოქვეყნებული მეხსიერების ბენჩმარკების მაჩვენებლები დაუჯერებელი აღმოჩნდა, ხოლო მათი ავტომატური მსაჯულები — შემწყნარები (F9, [32,33]). ამიტომ ჰარნესი საკუთარ შეფასების პროცედურას ხელახლა ვალიდაციას უწევს, ნაცვლად იმისა, რომ ხარვეზიანი პროცედურა მემკვიდრეობით მიიღოს, და ამ გაფრთხილების გათვალისწინებით აბსოლუტურ ქულებს წარმოადგენს. მეორე, ტექნიკური გახსენების სიზუსტე პირდაპირ არ წარმოადგენს ნაშრომის სამიზნე შედეგს — სინამდვილეში, დიზაინი პროგნოზირებს, რომ C-მ, განზრახ, შესაძლოა B-ზე ნაკლები სიტყვასიტყვითი (verbatim) მასალა გაიხსენოს. ამიტომ ეს მეტრიკები ახასიათებს მექანიზმებს და ამოწმებს, რომ C-ის დავიწყება ხარვეზული კი არა, მოხდენილია; ისინი არ წარმოადგენს აღქმული ურთიერთობის შედეგების მაჩვენებელს.</w:t>
       </w:r>
     </w:p>
     <w:p>
@@ -4470,7 +4470,7 @@
           <w:sz w:val="24"/>
           <w:lang w:val="ka-GE"/>
         </w:rPr>
-        <w:t>(ბ) სიმულირებული მომხმარებლის შეფასება. სოციალური კონსტრუქტების შესამოწმებლად ადამიანის მონაწილეობის გარეშე, ხელსაწყო გამოიყენება მრავალსესიან დიალოგებში, სადაც LLM მოქმედებს სიმულირებული მომხმარებლის როლში, ხოლო ცალკეული LLM-მსაჯული აფასებს თითოეულ პირობას 3.6-ის სოციალური კონსტრუქტების მიხედვით (სოციალური თანდასწრება, ალიანსი, სანდოობა/ადამიანურობა, პლუს ინტელექტისა და კონფიდენციალურობის კრიტერიუმები). ეს მიმართულება განზრახ ეპისტემიკური თავმდაბლობითაა ჩარჩოში მოქცეული: ის სიმულირებული პროქსია და არა ადამიანის აღქმის შემცვლელი, და მას არ შეუძლია აღქმის ჰიპოთეზების ვალიდაცია. მისი გამოთქმული ვალიდურობის შეზღუდვები სამმაგია: დიდი ენის მოდელი (LLM) მსაჯულის შეფასებებს "სოციალური თანდასწრებისა" ან "ნდობისა" ადამიანის გამოცდილებასთან უცნობი კორესპონდენცია აქვს და შესაძლოა ასახავდეს ზედაპირულ ტექსტურ მახასიათებლებს (მაგ., თავად წაკითხვადობას, რასაც B+ აკონტროლებს) და არა შეგრძნებულ ურთიერთობას; სიმულირებულ მომხმარებლებს არ გააჩნიათ რეალური მომხმარებლებისთვის დამახასიათებელი მნიშვნელოვანი ინტერესები, კვირების განმავლობაში დაგროვილი მეხსიერება და კონფიდენციალურობის მგრძნობელობა, ამიტომ ამ ნაშრომისთვის ცენტრალური (F4) ორმაგი ხასიათის მეხსიერების ეფექტები შესაძლოა არ გამოვლინდეს; და მოსამართლისა და გენერატორის მოდელებს შეიძლება ჰქონდეთ მიკერძოებები, რომლებიც ზრდის შეთანხმებას. შესაბამისად, სიმულირებული ნაწილი გამოიყენება იმისთვის, რომ (i) გადაამოწმოს, გამოიმუშავებს თუ არა პირობები განსხვავებად ქცევას, (ii) შექმნას და დახვეწოს პროგნოზები ადამიანური პროტოკოლისთვის, და (iii) ბოლომდე გამოცადოს ზუსტი ინსტრუმენტის ოპერაციალიზაცია (3.6). ნებისმიერი სიმულირებული C-B+ განსხვავება წარმოდგენილია როგორც მექანიზმის დონის სიგნალი და არასდროს — როგორც ადამიანის აღქმის შესახებ მტკიცებულება.</w:t>
+        <w:t>(ბ) სიმულირებული მომხმარებლის შეფასება. სოციალური კონსტრუქტების შესამოწმებლად ადამიანის მონაწილეობის გარეშე, ჰარნესი გამოიყენება მრავალსესიან დიალოგებში, სადაც LLM მოქმედებს სიმულირებული მომხმარებლის როლში, ხოლო ცალკეული LLM-მსაჯული აფასებს თითოეულ პირობას 3.6-ის სოციალური კონსტრუქტების მიხედვით (სოციალური თანდასწრება, მომხმარებლისა და ხელოვნური აგენტის ალიანსი, დამაჯერებლობა/ადამიანურობა, პლუს ინტელექტისა და კონფიდენციალურობის პუნქტები). ეს მიმართულება განზრახ ეპისტემიკური თავმდაბლობითაა ჩარჩოში მოქცეული: ის სიმულირებული პროქსია და არა ადამიანის აღქმის შემცვლელი, და ის ვერ ახდენს აღქმის ჰიპოთეზების ვალიდაციას. მისი გამოთქმული ვალიდურობის შეზღუდვები სამმაგია. პირველი: LLM-მსაჯულის შეფასებებს „სოციალურ თანდასწრებასთან“ ან „ნდობასთან“ დაკავშირებით ადამიანის გამოცდილებასთან შესაბამისობა უცნობია და შესაძლოა ასახავდეს ტექსტის ზედაპირულ მახასიათებლებს (მაგ., თავად წაკითხვადობას, რასაც B+ აკონტროლებს), და არა შეგრძნებულ ურთიერთობას. მეორე: სიმულირებულ მომხმარებლებს არ გააჩნიათ რეალური მომხმარებლებისთვის დამახასიათებელი პირადი დაინტერესება, კვირების განმავლობაში დაგროვილი მეხსიერება და კონფიდენციალურობასთან დაკავშირებული მგრძნობელობა, ამიტომ ამ ნაშრომისთვის ცენტრალური, ორმაგი ხასიათის მეხსიერების ეფექტები (F4) შესაძლოა არ გამოვლინდეს. მესამე: მსაჯულისა და გენერატორის მოდელებს შეიძლება ჰქონდეს საერთო მიკერძოებები, რომლებიც ზრდის შეთანხმებას. შესაბამისად, სიმულირებული ნაწილი გამოიყენება იმისთვის, რომ (i) გადაამოწმოს, წარმოქმნის თუ არა პირობები განსხვავებულ ქცევას, (ii) შექმნას და დახვეწოს პროგნოზები ადამიანური პროტოკოლისთვის, და (iii) ბოლომდე გამოცადოს ზუსტი ინსტრუმენტის ოპერაციონალიზაცია (3.6). ნებისმიერი სიმულირებული C-B+ განსხვავება წარმოდგენილია როგორც მექანიზმის დონის სიგნალი და არასდროს — როგორც ადამიანის აღქმის შესახებ მტკიცებულება.</w:t>
       </w:r>
     </w:p>
     <w:p>
@@ -4484,7 +4484,7 @@
           <w:sz w:val="24"/>
           <w:lang w:val="ka-GE"/>
         </w:rPr>
-        <w:t>(გ) შემუშავებული პროტოკოლი ადამიანთა მონაწილეობით (მომავალი ნაშრომი). მიზნის აღქმითი მტკიცებულებები შეიძლება გადაწყდეს მხოლოდ ადამიანებზე ჩატარებული კვლევით, რომელსაც ეს ნაშრომი სრულად აღწერს, მაგრამ არ ახორციელებს. დიზაინი წარმოადგენს B-ს, B+, და C — სამი განყოფილება, სადაც A დაყვანილია მოკლე, წინასწარ განსაზღვრული კალიბრაციის შეხებამდე — n ≈ 20 მონაწილეზე, თითოეული პირობა გამოცდილია სრულ სამკვირიან ჰორიზონტზე, რათა C-ის ნელი ტემპით მიმდინარე კონსოლიდაციას გამოვლენის დრო ჰქონდეს, იზოლირებული საცავებით თითოეული პირობისთვის, დაბალანსებული თანმიმდევრობით, გამორეცხვის პერიოდით და წინასწარ რეგისტრირებული თანმიმდევრობის ეფექტის ტესტით გადატანის ეფექტის გასაკონტროლებლად. ძირითადი ინსტრუმენტია ხელოვნური სოციალური აგენტის კითხვარი [14] (3.6). დიზაინის ორი მახასიათებელი პირდაპირ გამომდინარეობს წნეხის ტესტიდან (F18): ანალიზი მიმართულია გვიან, კონსოლიდაციის შემდგომი პერიოდისკენ (და კონსოლიდაციის სიმჭიდროვით მოდერირებული ეფექტებისკენ), და არა პირობის შიდა ზოგადი საშუალოსკენ, რადგან სწორედ იქ ვლინდება მხოლოდ C-სთვის დამახასიათებელი ნებისმიერი ეფექტი; და თბილი, მიკუთვნადი დავიწყება წინასწარ რეგისტრირებული არქიტექტურული წესია, რათა რბილად გამოტოვებული ელემენტი განაპირობებდეს თბილ, ნაწილობრივ აღიარებას ("დეტალები არ მახსოვს, მაგრამ ვიცი, რომ შენთვის მნიშვნელოვანი იყო") და არა სრულ დავიწყებას, რაც ნეიტრალიზებს დოკუმენტირებულ უარყოფით სიგნალს "დავიწყება ნიშნავს, რომ ნაკლებად მნიშვნელოვანი ვარ", რომელიც სხვა შემთხვევაში დაამახინჯებდა ნდობისა და ინტელექტის მაჩვენებლებს. პროტოკოლი ითვალისწინებს მოვლენაზე-მგრძნობიარე და ქცევაზე-დამოკიდებულ ცვლადებს (პოსტ-ეპიზოდური მიკრო-შეფასებები, თვით-გამჟღავნების სიღრმე, ნებაყოფლობითი დაბრუნება და გამოყენება) და სავალდებულო დაკოდებულ ინტერვიუებს (სულ მცირე ორი კოდერის მიერ ანალიზი იმისა, შეამჩნიეს თუ არა მომხმარებლებმა და დააფასეს თუ არა მეხსიერების დინამიკა), რათა თვით-ანგარიშის ნულირებაც კი ცარიელი შედეგის ნაცვლად, ინტერპრეტაციადი დისოციაციის რუკა გახდეს.</w:t>
+        <w:t>(გ) შემუშავებული პროტოკოლი ადამიანთა მონაწილეობით (სამომავლო გეგმები). მიზნის აღქმით მტკიცებულებებს მხოლოდ ადამიანებზე ჩატარებული კვლევა გადაწყვეტს, რომელსაც ეს ნაშრომი სრულად გაწერს, მაგრამ არ ატარებს. დიზაინი B, B+ და C-ის განმეორებითი გაზომვების (within-subject) შედარებაა — სამი ჯგუფი, სადაც A დაყვანილია მოკლე, სცენარით გაწერილ კალიბრაციის შეხებამდე — n ≈ 20 მონაწილეზე. თითოეული პირობა სრულ სამკვირიან ჰორიზონტზეა გამოცდილი, რათა C-ის ნელი ტემპით მიმდინარე კონსოლიდაციას გამოვლენის დრო ჰქონდეს. დიზაინი ასევე მოიცავს იზოლირებულ საცავებს თითოეული პირობისთვის, დაბალანსებულ თანმიმდევრობას, გამორეცხვის პერიოდსა და წინასწარ რეგისტრირებულ თანმიმდევრობის ეფექტის ტესტს გადატანის ეფექტის საკონტროლებლად. ძირითადი ინსტრუმენტია ხელოვნური სოციალური აგენტის კითხვარი [14] (3.6). დიზაინის ორი მახასიათებელი პირდაპირ გამომდინარეობს წნეხის ტესტიდან (F18). პირველი, ანალიზი მიზნად ისახავს გვიან, კონსოლიდაციის შემდგომ პერიოდს (და კონსოლიდაციის სიმჭიდროვით მოდერირებულ ეფექტებს), და არა პირობის შიდა საერთო საშუალოს, რადგან სწორედ იქ ვლინდება მხოლოდ C-სთვის დამახასიათებელი ეფექტი. მეორე, თბილი, მიკუთვნებადი დავიწყება წინასწარ რეგისტრირებული არქიტექტურული წესია: რბილად გამოტოვებული ელემენტი გამოიწვევს თბილ, ნაწილობრივ აღიარებას („დეტალები არ მახსოვს, მაგრამ ვიცი, რომ შენთვის მნიშვნელოვანი იყო“) ცარიელი პასუხის ნაცვლად. ეს ნეიტრალიზებს დოკუმენტირებულ უარყოფით სიგნალს „დავიწყება ნიშნავს, რომ ნაკლებად მნიშვნელოვანი ვარ“, რომელიც სხვა შემთხვევაში დაამახინჯებდა ნდობისა და ინტელექტის მაჩვენებლებს. პროტოკოლი ასევე მოიცავს მოვლენებზე მგრძნობიარე და ქცევით დამოკიდებულ ცვლადებს (ეპიზოდის შემდგომი მიკრო-შეფასებები, თვით-გამჟღავნების სიღრმე, ნებაყოფლობითი დაბრუნება და გამოყენება) და სავალდებულო კოდირებულ ინტერვიუებს (სულ მცირე ორი კოდერის მიერ იმის გაანალიზება, შეამჩნიეს თუ არა მომხმარებლებმა მეხსიერების დინამიკა და დაუფასეს თუ არა ის). შედეგად, თვით-ანგარიშის ნულოვანი შედეგიც კი, ცარიელი შედეგის ნაცვლად, ინტერპრეტირებადი დისოციაციის რუკად იქცევა.</w:t>
       </w:r>
     </w:p>
     <w:p>
@@ -4498,7 +4498,7 @@
           <w:sz w:val="24"/>
           <w:lang w:val="ka-GE"/>
         </w:rPr>
-        <w:t>ნიმუშის ზომა მიზანმიმართულად არ არის გათვლილი C &gt; B+-ის დასადასტურებლად. ა-პრიორი ძალის ანალიზი (F18) აჩვენებს, რომ ეს კონტრასტი, დიზაინში ყველაზე მცირე (dz ≈ 0.28, რომელიც "ცივი სტარტის" ეფექტით კიდევ უფრო მცირდება), ტრადიციული სტატისტიკური ძალის მქონე დეტექციისთვის n ≈ 116–159-ს მოითხოვდა, მაშინ როცა n ≈ 20 არის ნორმა ამ კლასის კვლევისთვის (F12) და ამ კონკრეტულ შედარებაზე მხოლოდ 2–12%-იან სტატისტიკურ ძალას იძლევა. შესაბამისად, პროტოკოლი გათვლილია იმ შედარებებისთვის, სადაც სიმძლავრე მიღწევადია — C &gt; A, და მიმართულებითი B+ &gt; B და C &gt; B — ხოლო C &gt; B+ განიხილება როგორც შეფასების სამიზნე (ეფექტის ზომა 95%-იანი ნდობის ინტერვალთან ერთად), ზუსტად ისე, როგორც ამას 3.1 და 3.7 მოითხოვს. ეს არის ამბიციური ამოცანისა და მიღწევადი ნიმუშის გულწრფელი შეთავსება, და ეს პროტოკოლში მითითებულია იმისთვის, რომ ზუსტი ნულოვანი ჰიპოთეზა აღიქმებოდეს მოსალოდნელ, გასააზრებელ შედეგად და არა პოსტფაქტუმ "გადარჩენად".</w:t>
+        <w:t>ნიმუშის ზომა მიზანმიმართულად არ არის გათვლილი C &gt; B+-ის დასადასტურებლად. ა-პრიორი ძალის ანალიზი (F18) აჩვენებს, რომ ეს კონტრასტი — დიზაინში ყველაზე მცირე (dz ≈ 0.28, რომელიც „ცივი სტარტის“ ეფექტით კიდევ უფრო მცირდება) — ჩვეულებრივი სტატისტიკური ძალით გამოსავლენად n ≈ 116–159 მონაწილეს მოითხოვდა. ამ კლასის კვლევისთვის კი ნორმა n ≈ 20-ია (F12), რაც ამ კონკრეტულ შედარებაზე მხოლოდ 2–12%-იან სტატისტიკურ ძალას იძლევა. შესაბამისად, პროტოკოლი გათვლილია იმ შედარებებისთვის, სადაც სტატისტიკური ძალა მიღწევადია — C &gt; A, და მიმართულებითი B+ &gt; B და C &gt; B — ხოლო C &gt; B+ განიხილება როგორც შეფასების სამიზნე (ეფექტის ზომა 95%-იანი ნდობის ინტერვალთან ერთად), ზუსტად ისე, როგორც ამას 3.1 და 3.7 მოითხოვს. ეს არის ამბიციური ამოცანისა და მიღწევადი ნიმუშის გულწრფელი შეთავსება, და ეს პროტოკოლში მითითებულია იმისთვის, რომ ზუსტი ნულოვანი შედეგი აღიქმებოდეს მოსალოდნელ, გასააზრებელ შედეგად და არა პოსტფაქტუმ „გადარჩენად“.</w:t>
       </w:r>
     </w:p>
     <w:p>

</xml_diff>

<commit_message>
polish(§3.6): Sonnet-5 fluency + terminology, meaning verified
§3.6 (Measures), 6 units: believability-only-subscale-not-DV (F11) distinction and
distinguishability-signals-only framing preserved; ASAQ/Godspeed/WAI-SR/Cox +
numbers (19/90/24) + alliance full form intact; glossary/case fixes. Both editions rebuilt.

Co-Authored-By: Claude Opus 4.8 (1M context) <noreply@anthropic.com>
</commit_message>
<xml_diff>
--- a/project/thesis-ka.docx
+++ b/project/thesis-ka.docx
@@ -4532,7 +4532,7 @@
           <w:sz w:val="24"/>
           <w:lang w:val="ka-GE"/>
         </w:rPr>
-        <w:t>დამოკიდებული ცვლადები არის მომხმარებლის მიერ აღქმული სოციალური კონსტრუქტები, რომლებიც მითითებულია მიზანში და ოპერაციონალიზებულია ვალიდური ინსტრუმენტების (F11) მეშვეობით. ძირითადი ინსტრუმენტია ხელოვნური სოციალური აგენტის კითხვარი (ASAQ) [14], ვალიდური, ღია ლიცენზიის მქონე კითხვარი, რომელიც მოიცავს ცხრამეტ კონსტრუქტს გრძელი (90-კითხვრივი) და მოკლე (24-კითხვრივი) ფორმებით. ASAQ-ის სამი კონსტრუქტი ასახავს ძირითად ჰიპოთეზას:</w:t>
+        <w:t>დამოკიდებული ცვლადები მიზანში დასახელებული, მომხმარებლის მიერ აღქმული სოციალური კონსტრუქტებია, რომლებიც ვალიდური ინსტრუმენტების (F11) მეშვეობით ოპერაციონალიზებულია. ძირითადი ინსტრუმენტია ხელოვნური სოციალური აგენტის კითხვარი (ASAQ) [14] — ვალიდური, ღია ლიცენზიის მქონე კითხვარი, რომელიც ცხრამეტ კონსტრუქტს გრძელ (90-კითხვრივი) და მოკლე (24-კითხვრივი) ფორმებში მოიცავს. ძირითად ჰიპოთეზას ASAQ-ის სამი კონსტრუქტი უკავშირდება:</w:t>
       </w:r>
     </w:p>
     <w:p>
@@ -4546,7 +4546,7 @@
           <w:sz w:val="24"/>
           <w:lang w:val="ka-GE"/>
         </w:rPr>
-        <w:t>•  სოციალური თანდასწრება — სხვა სოციალურ ერთეულთან ერთად ყოფნის შეგრძნება;</w:t>
+        <w:t>•  სოციალური თანდასწრება — სხვა სოციალურ ერთეულთან ერთად ყოფნის განცდა;</w:t>
       </w:r>
     </w:p>
     <w:p>
@@ -4560,7 +4560,7 @@
           <w:sz w:val="24"/>
           <w:lang w:val="ka-GE"/>
         </w:rPr>
-        <w:t>•  მომხმარებლისა და ხელოვნური აგენტის ალიანსი — კავშირის, მიზნებისა და ამოცანებზე ორიენტირებული სამუშაო ურთიერთობა, რომელიც შეიძლება შევავსოთ WAI-SR ადაპტაციით (იხ. 2.6);</w:t>
+        <w:t>•  მომხმარებლისა და ხელოვნური აგენტის ალიანსი — კავშირზე, მიზნებზე და ამოცანებზე ორიენტირებული სამუშაო ურთიერთობა, რომელიც შესაძლებელია WAI-SR ადაპტაციით შეივსოს (იხ. 2.6);</w:t>
       </w:r>
     </w:p>
     <w:p>
@@ -4574,7 +4574,7 @@
           <w:sz w:val="24"/>
           <w:lang w:val="ka-GE"/>
         </w:rPr>
-        <w:t>•  აღქმული ადამიანურობა — ჩვენი მესამე ძირითადი კონსტრუქტის კანონიკური სახელწოდება, რომელიც ოპერაციალიზებულია ASAQ-ის სანდოობის ქვესკალით. ამ ნაშრომისთვის დადგენილი სახელწოდების კონვენციის (F11) თანახმად, "სანდოობა" გამოიყენება მხოლოდ როგორც ინსტრუმენტული ქვესკალა და არასდროს როგორც დამოკიდებული ცვლადის სახელწოდება.</w:t>
+        <w:t>•  აღქმული ადამიანურობა — მესამე ძირითადი კონსტრუქტისთვის ჩვენ მიერ გამოყენებული კანონიკური სახელწოდებაა, რომელიც ოპერაციონალიზებულია ASAQ-ის დამაჯერებლობის (believability) ქვესკალით. ამ ნაშრომისთვის დადგენილი სახელდების კონვენციის (F11) თანახმად, „დამაჯერებლობა“ (believability) გამოიყენება მხოლოდ როგორც ინსტრუმენტის ქვესკალის სახელი და არასდროს — როგორც დამოკიდებული ცვლადის სახელწოდება.</w:t>
       </w:r>
     </w:p>
     <w:p>
@@ -4588,7 +4588,7 @@
           <w:sz w:val="24"/>
           <w:lang w:val="ka-GE"/>
         </w:rPr>
-        <w:t>მეორადი და საკონტროლო კონსტრუქტები, 1.2-ის მეორადი ჰიპოთეზების შესაბამისად, იზომება პარალელურად: აღქმული ინტელექტი Godspeed-ის ინტელექტის ქვესკალის მეშვეობით (იხ. 2.6) (მიზნად ისახავს H2a-ს, რომლის მიხედვითაც ვერბატიმ RAG-ის ქულები ყველაზე მაღალია ინტელექტის მიხედვით), და კონფიდენციალურობასთან დაკავშირებული კომფორტი და ნდობა [11]-დან ადაპტირებული კოქსის სტილის კონფიდენციალურობის პუნქტების საშუალებით (მიზნად ისახავს H2b-ს, რომლის მიხედვითაც ვერბატიმ გახსენების ქულები ყველაზე დაბალია ნდობასა და კონფიდენციალურობის კომფორტში — პროგნოზი, რომლის გადასაჭრელადაც 3.2-ის გისტი/საყრდენი წარმოდგენაა შექმნილი). აღქმული ადამიანურობა შესაძლოა დამატებით გადამოწმდეს Godspeed-ის ანთროპომორფიზმთან მიმართებით, სადაც Godspeed-ი, მისი დოკუმენტირებული კრიტიკის (F11) გამო, ფსიქომეტრულად მეორეხარისხოვნად განიხილება. ჰიპოთეზებისა და ინსტრუმენტების რუკა, მონაცემთა შეგროვებამდე, განსაზღვრავს, თუ რომელ ქვესკალას ქულებს მიიღებს თითოეული ჰიპოთეზა.</w:t>
+        <w:t>მეორადი და საკონტროლო კონსტრუქტები, რომლებიც უკავშირდება 1.2-ის მეორად ჰიპოთეზებს, პარალელურად იზომება. აღქმული ინტელექტი იზომება Godspeed-ის ინტელექტის ქვესკალის მეშვეობით (იხ. 2.6) — ეს მიზნად ისახავს H2a-ს, რომლის მიხედვითაც ვერბატიმ RAG ინტელექტში ყველაზე მაღალ ქულებს იღებს. კონფიდენციალურობასთან დაკავშირებული კომფორტი და ნდობა კი იზომება [11]-დან ადაპტირებული კოქსის სტილის კონფიდენციალურობის პუნქტების საშუალებით — ეს მიზნად ისახავს H2b-ს, რომლის მიხედვითაც ვერბატიმ გახსენება ნდობასა და კონფიდენციალურობის კომფორტში ყველაზე დაბალ ქულებს იღებს. სწორედ ამ პროგნოზის მოსაგვარებლად არის შექმნილი 3.2-ის არსობრივი (gist)/საყრდენი წარმოდგენა. აღქმული ადამიანურობა შესაძლოა დამატებით გადამოწმდეს Godspeed-ის ანთროპომორფიზმთან მიმართებით; Godspeed კი, მისი დოკუმენტირებული კრიტიკის (F11) გამო, ფსიქომეტრულად მეორეხარისხოვნადაა მიჩნეული. ჰიპოთეზებისა და ინსტრუმენტების რუკა მონაცემთა შეგროვებამდე ადგენს, თუ რომელი ქვესკალის ქულები შეესაბამება თითოეულ ჰიპოთეზას.</w:t>
       </w:r>
     </w:p>
     <w:p>
@@ -4602,7 +4602,7 @@
           <w:sz w:val="24"/>
           <w:lang w:val="ka-GE"/>
         </w:rPr>
-        <w:t>სიმულირებული ნაწილისთვის (3.5b), იგივე კონსტრუქტები ოპერაციულად არის განხორციელებული, როგორც დიდი ენის მოდელის (LLM) მოსამართლის პროტოკოლი: მოსამართლეს ეძლევა რუბრიკა, რომელიც ASAQ-ის, Godspeed-ისა და Cox-ის ქვესკალებიდან ელემენტების მიხედვით არის შედგენილი, და ის ტრანსკრიპტებს შესაბამის მასშტაბებზე აფასებს, რათა სიმულირებულმა და ადამიანურმა ტრაექტორიებმა ზუსტად იდენტური საზომი განმარტება გაიზიარონ. მსაჯულის ოპერაციონალიზაცია სრულად არის წარმოდგენილი — რუბრიკა, მასშტაბის ანკერები, ინსტრუქცია და მსაჯულის საიმედოობის შემოწმება ადამიანის ანოტატორების მიერ ერთობლივად შეფასებული ტრანსკრიპტების მცირე, გამოყოფილი ნაკრების წინააღმდეგ — სწორედ იმიტომ, რომ ბენჩმარკის სანდოობის კრიზისი (F9) აჩვენებს, რომ არავალიდური LLM მსაჯული არასანდოა. როდესაც ასეთი ადამიანური ვალიდაცია არ არსებობს, სიმულირებული შეფასებები წარმოდგენილია მხოლოდ როგორც ქცევითი განასხვავებადობის სიგნალები, კონსტრუქტის დონეზე ინტერპრეტაციის გარეშე. სიმულირებული შეფასებები წარმოდგენილია მკაცრად 3.5(b)-ის ვალიდურობის ლიმიტების ფარგლებში.</w:t>
+        <w:t>სიმულირებული ნაწილისთვის (3.5b) იგივე კონსტრუქტები ოპერაციონალიზებულია, როგორც დიდი ენობრივი მოდელის (LLM) მოსამართლის პროტოკოლი. მოსამართლეს ეძლევა რუბრიკა, რომელიც ASAQ-ის, Godspeed-ისა და Cox-ის ქვესკალების პუნქტებზე დაყრდნობით, პუნქტ-პუნქტ არის შედგენილი. ის ტრანსკრიპტებს შესაბამის სკალებზე აფასებს, რათა სიმულირებულმა და ადამიანურმა ტრაექტორიებმა ზუსტად იდენტური საზომი განმარტება გაიზიარონ. მოსამართლის ოპერაციონალიზაცია სრულად არის წარმოდგენილი — რუბრიკა, სკალის ანკერები, ინსტრუქცია და მოსამართლის საიმედოობის შემოწმება, ჩატარებული ადამიანი ანოტატორების მიერ ერთობლივად შეფასებული ტრანსკრიპტების მცირე, გამოყოფილ ნაკრებზე. სწორედ ეს დეტალურობაა აუცილებელი, რადგან ბენჩმარკის სანდოობის კრიზისი (F9) აჩვენებს, რომ არავალიდური LLM-მოსამართლე არასანდოა. როდესაც ასეთი ადამიანური ვალიდაცია არ არსებობს, სიმულირებული შეფასებები მხოლოდ როგორც ქცევითი განასხვავებადობის სიგნალებია წარმოდგენილი, კონსტრუქტის დონეზე ინტერპრეტაციის გარეშე. სიმულირებული შეფასებები მკაცრად 3.5(b)-ის ვალიდურობის შეზღუდვების ფარგლებში არის წარმოდგენილი.</w:t>
       </w:r>
     </w:p>
     <w:p>

</xml_diff>

<commit_message>
polish(§3.7): Sonnet-5 fluency + terminology, meaning verified
§3.7 (Analysis plan), 3 units: estimation-first (dz+95% CI), Holm confirmatory,
C>B+ estimate-only null-as-substantive, power-law sensitivity sweep, pre-registration
preserved. Fixed a stray Armenian-script char + power-law/statistical-power
mistranslations. Both editions rebuilt.

Co-Authored-By: Claude Opus 4.8 (1M context) <noreply@anthropic.com>
</commit_message>
<xml_diff>
--- a/project/thesis-ka.docx
+++ b/project/thesis-ka.docx
@@ -4636,7 +4636,7 @@
           <w:sz w:val="24"/>
           <w:lang w:val="ka-GE"/>
         </w:rPr>
-        <w:t>ანალიზი ეფუძნება "შეფასება-პირველად" ფილოსოფიას, რომელიც შეესაბამება 3.1-ის ინფერენციულ პოზიციას. ყოველი პირობითი კონტრასტისთვის, მთავარ წარმოდგენილ მაჩვენებელს წარმოადგენს ეფექტის ზომა (კოენისა dz შიდა-სუბიექტური კონტრასტებისთვის), 95%-იანი სანდო ინტერვალთან ერთად, და არა დიქოტომიური მნიშვნელობის შეფასება. დამადასტურებელი შედარებებისთვის, სადაც არსებობს მძლავრობა (C &gt; A; მიმართულებითი B+ &gt; B და C &gt; B), შეფასებასთან ერთად მოცემულია ჰოლმის კორექტირებული ჰიპოთეზის ტესტი. ცენტრალური C &gt; B+ კონტრასტისთვის ინტერვალთან ერთად მხოლოდ შეფასება ინტერპრეტირდება, სიზუსტისა და ეკვივალენტურობის ლოგიკის გამოყენებით: ნულზე გადაჭიმული ვიწრო ინტერვალი განიხილება მტკიცებულებად იმისა, რომ ადამიანის მეხსიერების დინამიკა კურატორული სტატიკური მეხსიერების მიმართ შედარებით მცირე აღქმითი მარჟინით გამოირჩევა და — 3.1-თან შესაბამისად — ეს ნული წარმოდგენილია, როგორც მნიშვნელოვანი აღმოჩენა, რომლის ინტერპრეტაციისთვისაც B+ კონტროლი იყო შექმნილი, ხოლო ნულის დამუშავების წესი წინასწარ იყო რეგისტრირებული, რათა ის მოსალოდნელი აღმოჩენად წავიკითხოთ. სადაც გამოიყენება გადავადებული პროტოკოლის გვიანი-ფანჯრის და კონსოლიდაციის-სიმკვრივის-კონტროლირებადი ანალიზები (3.5c), კონსოლიდაციის სიმკვრივე, თითოეული დონის გამოძახების წილი, სალიენსის ჩაწერის სიხშირე და ეფექტური ისტორიის-ფარვა შეყვანილია წინასწარ რეგისტრირებულ კოვარიატებად.</w:t>
+        <w:t>ანალიზი ეფუძნება „შეფასება-პირველად“ ფილოსოფიას, რომელიც შეესაბამება 3.1-ის ინფერენციულ პოზიციას. ყოველი პირობითი კონტრასტისთვის მთავარი წარმოდგენილი სიდიდე არის ეფექტის ზომა (კოენის dz შიდა-სუბიექტური კონტრასტებისთვის) 95%-იანი სანდო ინტერვალით, და არა დიქოტომიური მნიშვნელოვნების განაჩენი. დამადასტურებელი შედარებებისთვის, სადაც სტატისტიკური სიმძლავრე არსებობს (C &gt; A; მიმართულებითი B+ &gt; B და C &gt; B), შეფასებასთან ერთად მოცემულია ჰოლმის კორექტირებული ჰიპოთეზის ტესტი. ცენტრალური C &gt; B+ კონტრასტისთვის მხოლოდ ინტერვალიანი შეფასება ინტერპრეტირდება, სიზუსტისა და ეკვივალენტურობის ლოგიკის გამოყენებით: ნულზე გადაჭიმული ვიწრო ინტერვალი მიანიშნებს, რომ ადამიანის მეხსიერების დინამიკა კურატორულ სტატიკურ მეხსიერებასთან შედარებით მხოლოდ მცირე აღქმით მარჟას მატებს. ეს ნული, 3.1-თან შესაბამისად, წარმოდგენილია, როგორც შინაარსობრივი აღმოჩენა, რომლის ინტერპრეტირებადობისთვისაც შემუშავებული იყო B+ კონტროლი, ხოლო ნულის დამუშავების წესი წინასწარ იყო რეგისტრირებული, რათა იგი აღქმულიყო როგორც წინასწარ მოსალოდნელი შედეგი. სადაც გამოიყენება გადავადებული პროტოკოლის გვიან ფანჯარაზე დაფუძნებული და კონსოლიდაციის სიმკვრივით მოდერირებული ანალიზები (3.5c), წინასწარ რეგისტრირებულ კოვარიატებად შეყვანილია: კონსოლიდაციის სიმკვრივე, თითოეული დონის მოძიების წილი, სალიენსის ჩაწერის სიხშირე და ისტორიის ეფექტური მოცვა.</w:t>
       </w:r>
     </w:p>
     <w:p>
@@ -4650,7 +4650,7 @@
           <w:sz w:val="24"/>
           <w:lang w:val="ka-GE"/>
         </w:rPr>
-        <w:t>მგრძნობელობის ანალიზი სავალდებულო და წინასწარ განსაზღვრულია: იცვლება გარედან დაფუძნებული კლებადი მუდმივები (სტაბილურობის ბაზა იყოფა და ემატება ორჯერ, კლებადი ექსპონენტისა და ქვედა ზღვრის სკანირება ხდება, ხოლო ექსპონენციალური ვარიანტი შეიცვლება ძალოვანი კანონის კლებადი ვარიანტით), და შინაარსობრივი დასკვნები ამ დიაპაზონში წარმოადგენენ მდგრადს ან მყიფეს. ეს პირდაპირ პასუხობს პარამეტრიზებული არქიტექტურის მიმართ "სასურველი შედეგის შერჩევის" (cherry-picking) კრიტიკას და ხელს უშლის შედეგის მხოლოდ ერთი იღბლიანი მუდმივის վրա დაყრდნობას.</w:t>
+        <w:t>მგრძნობელობის ანალიზი სავალდებულო და წინასწარ განსაზღვრულია: იცვლება გარედან დაფუძნებული კლებადი მუდმივები — სტაბილურობის ბაზა განახევრებულია და გაორმაგებულია, კლებადი ექსპონენტისა და ქვედა ზღვრის სკანირება ხდება, ხოლო ექსპონენციალური ვარიანტი იცვლება ხარისხოვანი კანონის (power-law) კლებადი ვარიანტით. შინაარსობრივი დასკვნები ამ დიაპაზონში წარმოდგენილია, როგორც მდგრადი ან მყიფე. ეს პირდაპირ პასუხობს პარამეტრიზებული არქიტექტურის მიმართ „სასურველი შედეგის შერჩევის“ (cherry-picking) კრიტიკას და ხელს უშლის შედეგის მხოლოდ ერთ იღბლიან მუდმივზე დაფუძნებას.</w:t>
       </w:r>
     </w:p>
     <w:p>
@@ -4664,7 +4664,7 @@
           <w:sz w:val="24"/>
           <w:lang w:val="ka-GE"/>
         </w:rPr>
-        <w:t>მთლიანი გეგმა — არქიტექტურული პარამეტრები და მათი გარედან დაფუძნებული მნიშვნელობები, საგულისხმო კრიტერიუმების ინსტრუქციის პირდაპირი ციტირება, პირობების ნაკრები, ჰიპოთეზიდან ინსტრუმენტამდე რუკა, ძირითადი და თანახელისშემწყობი ანალიზები, მგრძნობელობის ანალიზის დიაპაზონი და ნულოვანი ჰიპოთეზის დამუშავების წესი — წინასწარ რეგისტრირდება მონაცემთა შეგროვებამდე. წინასწარი რეგისტრაცია აქ განიხილება არა როგორც ფორმალობა, არამედ როგორც დიზაინის დასაბუთებადობის მთავარი გარანტია: რადგან სამეცნიერო თვალსაზრისით ცენტრალური კონტრასტი არის შეფასების სამიზნე მაღალი ნულოვანი რისკის პირობებში, საბოლოო მტკიცების სანდოობა დამოკიდებულია იმაზე, რომ ანალიზი წინასწარ იყო დაფიქსირებული მონაცემების ნახვამდე.</w:t>
+        <w:t>მთლიანი გეგმა — არქიტექტურული პარამეტრები და მათი გარედან დაფუძნებული მნიშვნელობები, სალიენსის რუბრიკის ინსტრუქციის ზუსტი ტექსტი, პირობების ნაკრები, ჰიპოთეზიდან ინსტრუმენტამდე რუკა, ძირითადი და კოვარიატული ანალიზები, მგრძნობელობის ანალიზის სკანირება და ნულის დამუშავების წესი — წინასწარ რეგისტრირდება ნებისმიერი მონაცემის შეგროვებამდე. წინასწარი რეგისტრაცია აქ განიხილება არა როგორც ფორმალობა, არამედ როგორც დიზაინის დასაბუთებადობის მზიდი გარანტია. რადგან სამეცნიერო თვალსაზრისით ცენტრალური კონტრასტი შეფასების სამიზნეს წარმოადგენს მაღალი ნულოვანი რისკის პირობებში, საბოლოო მტკიცების სანდოობა დამოკიდებულია იმაზე, რომ ანალიზი წინასწარ, მონაცემების ნახვამდე, იყო დაფიქსირებული.</w:t>
       </w:r>
     </w:p>
     <w:p>

</xml_diff>

<commit_message>
polish(§3.8): Sonnet-5 fluency + terminology, meaning verified — §3 COMPLETE
§3.8 (Ethics & limitations), 5 units. CRITICAL meaning-inversion fix (u126): the
draft had dropped a negation, saying "safety of confidently PRESENTING false
generalizations" (opposite of source) — restored to "will NOT be asserted".
No-human-data-collected, ethics-as-future-prerequisites, and all three limitation
classes preserved. Both editions rebuilt.

Co-Authored-By: Claude Opus 4.8 (1M context) <noreply@anthropic.com>
</commit_message>
<xml_diff>
--- a/project/thesis-ka.docx
+++ b/project/thesis-ka.docx
@@ -4698,7 +4698,7 @@
           <w:sz w:val="24"/>
           <w:lang w:val="ka-GE"/>
         </w:rPr>
-        <w:t>ამ სადისერტაციო ნაშრომში არ არის შეგროვებული ადამიანთა მონაწილეობით მიღებული მონაცემები. ნაშრომი წარმოადგენს დიზაინს, კონცეფციის დამტკიცების მექანიზმს და ტექნიკურ და სიმულირებულ შეფასებას; 3.5(c) პუნქტით გათვალისწინებული ადამიანთა მონაწილეობით კვლევა არის განსაზღვრული პროტოკოლი, რომელიც მომავალი სამუშაოსთვისაა დატოვებული. შესაბამისად, ეთიკური ვალდებულებები, რომლებიც დაკავშირებულია გადავადებულ კვლევასთან — ინფორმირებული თანხმობა, თვითგამჟღავნების მართვა, რასაც საგულისხმოდ არის შექმნილი "სალიენსის" რუბრიკა, მონაწილეთა მონაცემთა იზოლაცია და სახელწოდებათა სეგრეგაცია, მონაწილეობის შეწყვეტისა და მეხსიერების საცავის წაშლის უფლება, და ინსტიტუციური განხილვა — განისაზღვრება, როგორც ამ მომავალი კვლევის წინაპირობები და არა როგორც აქ გატარებული ზომები. გრძელვადიანი მეხსიერების კონფიდენციალურობისადმი მგრძნობიარე ბუნება, რომელიც აღრიცხავს იმას, რასაც მომხმარებლები კვირების განმავლობაში ამხელენ, თავად არის კვლევის ობიექტის ნაწილი (კოქსის კონფიდენციალურობის დასკვნა [11] და 3.2-ის "ბუნდოვანი კვალი" პრინციპი), რაც, და არა ნაკლებად, ამძიმებს ვალდებულებას, კვლევის საბოლოო ჩატარებისას ამ მონაცემებს განსაკუთრებული სიფრთხილით მოვეკიდოთ.</w:t>
+        <w:t>ამ ნაშრომში ადამიანის მონაწილეობით მიღებული მონაცემები საერთოდ არ შეგროვებულა. ნაშრომი წარმოადგენს დიზაინს, კონცეფციის დამტკიცების მექანიზმსა და ტექნიკურ და სიმულირებულ შეფასებას; 3.5(c)-ში მითითებული, ადამიანთა მონაწილეობით ჩასატარებელი კვლევა კი განსაზღვრული პროტოკოლია, რომელიც სამომავლო გეგმებისთვისაა დატოვებული. შესაბამისად, გადავადებულ კვლევასთან დაკავშირებული ეთიკური ვალდებულებები დასახელებულია არა როგორც აქ გატარებული ზომები, არამედ როგორც ამ სამომავლო კვლევის წინაპირობები. ეს ვალდებულებები მოიცავს ინფორმირებულ თანხმობას; თვითგამჟღავნების მართვას, რომლის გამოწვევისა და შენარჩუნებისთვისაც სალიენსის რუბრიკა საგანგებოდაა შექმნილი; მონაცემთა იზოლაციასა და სახელსივრცულ გამიჯვნას (namespacing) თითოეული მონაწილისთვის; მონაწილეობის შეწყვეტისა და მეხსიერების საცავის წაშლის უფლებას; და ინსტიტუციურ განხილვას. გრძელვადიანი მეხსიერების კონფიდენციალურობისადმი მგრძნობიარე ბუნება — რომელიც აღრიცხავს იმას, რასაც მომხმარებლები კვირების განმავლობაში ამხელენ — თავად კვლევის ობიექტის ნაწილია (კოქსის კონფიდენციალურობის მიგნება [11] და 3.2-ის „ბუნდოვანი კვალის“ თეორიის პასუხი), რაც კვლევის საბოლოო ჩატარებისას ამ მონაცემების მიმართ განსაკუთრებული სიფრთხილის გამოჩენის ვალდებულებას კი არ ასუსტებს, არამედ, პირიქით, ამწვავებს.</w:t>
       </w:r>
     </w:p>
     <w:p>
@@ -4712,7 +4712,7 @@
           <w:sz w:val="24"/>
           <w:lang w:val="ka-GE"/>
         </w:rPr>
-        <w:t>მეთოდოლოგიას, პირდაპირ და მკაფიოდ, სამი სახის შეზღუდვა გააჩნია.</w:t>
+        <w:t>მეთოდოლოგიას სამი სახის შეზღუდვა გააჩნია, რომლებიც პირდაპირ და მკაფიოდ არის ჩამოყალიბებული.</w:t>
       </w:r>
     </w:p>
     <w:p>
@@ -4726,7 +4726,7 @@
           <w:sz w:val="24"/>
           <w:lang w:val="ka-GE"/>
         </w:rPr>
-        <w:t>შეფასების-ვალიდურობის შეზღუდვები. სიმულირებული მომხმარებლის ტრაექტორია (3.5b) არის ადამიანის აღქმისადმი უცნობი სიზუსტის პროქსი: LLM-ის მსაჯულმა შეიძლება შეაფასოს ზედაპირული გასაგებობა და არა აღქმული ურთიერთობის ხარისხი — სწორედ ამ აღრევის ფაქტორის გასაკონტროლებლად არსებობს B+ — და სიმულირებულ მომხმარებლებს არ გააჩნიათ ისეთი მნიშვნელოვანი ფაქტორები, დროითი სიღრმე და კონფიდენციალურობასთან დაკავშირებული მგრძნობელობა, რაც რეალურ გამოყენებაში მეხსიერებას ორპირს ხდის (F4). სიმულირებული ნაწილიდან არცერთი აღქმითი დასკვნა არ გამომდინარეობს; ის მხოლოდ ჰიპოთეზებს ქმნის და ინსტრუმენტს ამოწმებს, მეტი არაფერი. ტექნიკური მიმართულება ზომავს ფაქტობრივ გახსენებასა და შეფერხებას, რასაც დიზაინი განზრახ არ აიგივებს აღქმული ურთიერთობის ხარისხთან, და ის მიმდინარეობს სინთეზური დიალოგების მეშვეობით, რომელთა განაწილება შესაძლოა არ ემთხვეოდეს რეალურ მრავალსესიან ხმოვან ურთიერთობას.</w:t>
+        <w:t>შეფასების-ვალიდურობის შეზღუდვები. სიმულირებული მომხმარებლის მიმართულება (3.5b) ადამიანის აღქმისადმი უცნობი სიზუსტის მქონე პროქსია: LLM-მსაჯულმა შესაძლოა ზედაპირული წაკითხვადობა შეაფასოს და არა შეგრძნებული ურთიერთობა — სწორედ ამ აღრევის ფაქტორის გასაკონტროლებლად არსებობს B+. გარდა ამისა, სიმულირებულ მომხმარებლებს არ გააჩნიათ ისეთი მნიშვნელოვანი ფაქტორები, დროითი სიღრმე და კონფიდენციალურობასთან დაკავშირებული მგრძნობელობა, რაც რეალურ გამოყენებაში მეხსიერებას ორპირს ხდის (F4). სიმულირებული ნაწილიდან არცერთი აღქმითი დასკვნა არ გამომდინარეობს; ის მხოლოდ ჰიპოთეზებს ქმნის და ინსტრუმენტს ამოწმებს, მეტი არაფერი. ტექნიკური მიმართულება ზომავს ფაქტობრივ გახსენებასა და დაყოვნებას (latency), რასაც დიზაინი განზრახ არ აიგივებს აღქმული ურთიერთობის ხარისხთან, და ის სინთეზური დიალოგების მეშვეობით მიმდინარეობს, რომელთა განაწილება შესაძლოა არ ემთხვეოდეს რეალურ მრავალსესიან ხმოვან ურთიერთქმედებას.</w:t>
       </w:r>
     </w:p>
     <w:p>
@@ -4740,7 +4740,7 @@
           <w:sz w:val="24"/>
           <w:lang w:val="ka-GE"/>
         </w:rPr>
-        <w:t>ინფერენციული შეზღუდვები. შესრულების შემთხვევაშიც კი, ადამიანური პროტოკოლი არ არის საკმარისად მძლავრი ცენტრალური C &gt; B+ კონტრასტის (3.1, 3.5c) დასადასტურებლად; ეს კონტრასტი შეფასების სამიზნეა, და დისერტაციის დამადასტურებელი მტკიცებები შემოიფარგლება უფრო მძლავრი შედარებებით. 1-ში დადგენილი ერთენოვანი, ერთმოდალური მასშტაბი (ინგლისური, მხოლოდ ხმა) გარე ვალიდურობას ზღუდავს გამოცდილი პირობით.</w:t>
+        <w:t>ინფერენციული შეზღუდვები. თუნდაც ჩატარდეს, ადამიანური პროტოკოლი არ არის გათვლილი ცენტრალური C &gt; B+ კონტრასტის (3.1, 3.5c) დასადასტურებლად; ეს კონტრასტი შეფასების სამიზნეა, ხოლო ნაშრომის დამადასტურებელი მტკიცებები მხოლოდ უფრო მძლავრი შედარებებით შემოიფარგლება. 1-ში დადგენილი ერთენოვანი და ერთმოდალური მასშტაბი (ინგლისური, მხოლოდ ხმა) გარე ვალიდურობას მხოლოდ შემოწმებული პირობით ზღუდავს.</w:t>
       </w:r>
     </w:p>
     <w:p>
@@ -4754,7 +4754,7 @@
           <w:sz w:val="24"/>
           <w:lang w:val="ka-GE"/>
         </w:rPr>
-        <w:t>თეორიისადმი ერთგულების შეზღუდვები. როგორც 3.2-შია დეტალურად აღწერილი, პროფილი C თავის ხუთ საწყის თეორიას კომპოზიციად აწყობს და არა ერთ მთლიანობად აერთიანებს და სამ სახელდებულ გამოტოვებას ახდენს: ის გამოტოვებს ინტერფერენციას, ადამიანის დავიწყების დომინანტურ დინამიკას, და მხოლოდ დროისა და სალიენსის დაქვეითებას მოდელირებს; მისი სიზუსტეზე ორიენტირებული კონსოლიდაცია მიზანმიმართულად თრგუნავს რეკონსტრუქციულ და სქემაზე დაფუძნებულ დამახინჯებას, რასაც ყველაზე მკაფიოდ პროგნოზირებს ბუნდოვანი კვალითა და კომპლემენტარული სწავლის სისტემები, და კოგნიტურ რეალიზმს ადამიანურობის ღერძზე ცვლის ყალბი, ზოგადი გამონათქვამების დამაჯერებლად წარმოდგენის უსაფრთხოებით; და ის დროის თანმიმდევრობისა და წყაროს მეხსიერებას მხოლოდ სუსტად ასახავს. კომპლემენტარული სწავლების სისტემების საფუძველი მოხმობილია მისი ეპიზოდურიდან სემანტიკურზე გადაცემის ფუნქციის სულისკვეთებით და არა როგორც ჩართული, ინტერფერენციისგან დაცული კორტიკალური სწავლების მტკიცება, ხოლო კოდირების დროის სალიენსის მექანიზმი აღიარებულია როგორც დამუშავების დონეების ეფექტი, ისევე როგორც მოდალური მოდელისა. ეს არის პრინციპული საინჟინრო არჩევანი, რომელიც გამჟღავნებულია იმისთვის, რომ არქიტექტურის კოგნიტური დასაბუთების მტკიცება აღიქმებოდეს როგორც პროექტირების ეტაპზე მიღებული შთაგონება გაზომვადი ქცევითი ნიშნულებით, 2.2-თან შესაბამისობაში, და არა როგორც ფსიქოლოგიური ერთგულების მტკიცება. თითოეული გამოტოვება, შესაბამისად, მომავალი მუშაობის კონკრეტული მიმართულებაა.</w:t>
+        <w:t>თეორიისადმი ერთგულების შეზღუდვები. როგორც 3.2-შია დეტალურად აღწერილი, პროფილი C თავის ხუთ საწყის თეორიას კომპოზიციად აწყობს და არა ერთ მთლიანობად აერთიანებს, და სამ სახელდებულ გამოტოვებას ახდენს: ის გამოტოვებს ინტერფერენციას, ადამიანის დავიწყების დომინანტურ დინამიკას, და მხოლოდ დროისა და სალიენსის დაქვეითებას მოდელირებს; მისი სიზუსტეზე ორიენტირებული კონსოლიდაცია მიზანმიმართულად თრგუნავს რეკონსტრუქციულ და სქემაზე დაფუძნებულ დამახინჯებას, რასაც ყველაზე მკაფიოდ პროგნოზირებს ბუნდოვანი კვალისა და კომპლემენტარული სასწავლო სისტემების თეორიები, რითაც ის კოგნიტურ რეალიზმს ადამიანურობის ღერძზე სწირავს იმ უსაფრთხოების სანაცვლოდ, რომ თავდაჯერებული, მცდარი განზოგადებები არ დამტკიცდება; და ის დროის თანმიმდევრობასა და წყაროს მეხსიერებას მხოლოდ სუსტად მოდელირებს. კომპლემენტარული სასწავლო სისტემების საფუძველი მოხმობილია მისი ეპიზოდურიდან სემანტიკურზე გადაცემის ფუნქციის სულისკვეთებით და არა როგორც ჩართული, ინტერფერენციისგან დაცული კორტიკალური სწავლების მტკიცება, ხოლო კოდირების დროის სალიენსის მექანიზმი აღიარებულია, როგორც დამუშავების დონეების ეფექტი, ისევე როგორც მრავალსაცავიანი მოდელისა. ეს პრინციპული საინჟინრო არჩევანია, გამჟღავნებული იმისთვის, რომ არქიტექტურის კოგნიტური დასაბუთების მტკიცება აღიქმებოდეს, როგორც პროექტირების ეტაპზე მიღებული შთაგონება გაზომვადი ქცევითი ნიშან-თვისებებით, 2.2-თან შესაბამისობაში, და არა როგორც ფსიქოლოგიური ერთგულების მტკიცება. თითოეული გამოტოვება, შესაბამისად, სამომავლო გეგმების კონკრეტული მიმართულებაა.</w:t>
       </w:r>
     </w:p>
     <w:p>

</xml_diff>

<commit_message>
polish(§4.1): Sonnet-5 fluency + terminology, meaning verified
§4.1 (PoC scope/fidelity), 3 prose units: model names (gpt-4o-mini,
text-embedding-3-small), figures (~USD 0.01, <7 min, 3 personas, 4 sessions),
session-units + simulated caveats preserved; harness→ჰარნესი, glossary alignment.
Both editions rebuilt.

Co-Authored-By: Claude Opus 4.8 (1M context) <noreply@anthropic.com>
</commit_message>
<xml_diff>
--- a/project/thesis-ka.docx
+++ b/project/thesis-ka.docx
@@ -4823,7 +4823,7 @@
           <w:sz w:val="24"/>
           <w:lang w:val="ka-GE"/>
         </w:rPr>
-        <w:t>კონცეფციის დამტკიცება არის Python-ის დამოუკიდებელი მეხსიერების ჰარნესი, რომელიც მრავალსესიანი დიალოგის ტრანსკრიპტებზე ახორციელებს ოთხ პირობას (A, B, B+, C). ენობრივი მოდელის როლებისთვის (მნიშვნელოვნების შეფასება, აბზაცური შეჯამება, კონსოლიდაცია, საუბრის აგენტი და მსაჯული) გამოყენებულია OpenAI gpt-4o-mini, ხოლო მონაცემთა გამოსაძებნად — text-embedding-3-small. ის გამოცდილი იყო სამი სინთეზური მომხმარებლის პერსონას მეშვეობით, თითოეული მათგანი წარმოადგენდა ოთხსესიან საუბარს ჩადებული მნიშვნელოვანი ფაქტებით (სახელები, ალერგიები, ოჯახი), ერთჯერადი უმნიშვნელო ინფორმაციით (ამინდის შესახებ გაკვრით ნათქვამი კომენტარი, დავიწყებული ფილმის სათაური, ერთხელ ნახსენები კაფე) და განმეორებადი ემოციური თემით (დიპლომის დაცვის ვადის სტრესი, თანადამფუძნებლებს შორის კონფლიქტი, ღამის ცვლისგან დაღლილობა). მომხმარებლის რიგის იდენტური სცენარები განმეორებით გაუშვეს ოთხივე პირობაში, ასე რომ, ყველა პირობა იღებდა ერთსა და იმავე შემავალ მონაცემებს და მხოლოდ მეხსიერების მექანიზმით განსხვავდებოდა. სრული გაშვების ღირებულებამ დაახლოებით 0.01 აშშ დოლარი შეადგინა და შვიდ წუთზე ნაკლები დრო დაიკავა.</w:t>
+        <w:t>კონცეფციის დამტკიცება წარმოადგენს Python-ზე დაწერილ დამოუკიდებელ მეხსიერების ჰარნესს, რომელიც მრავალსესიანი დიალოგის ტრანსკრიპტებზე ახორციელებს ოთხ პირობას (A, B, B+, C). ენობრივი მოდელის როლებისთვის (მნიშვნელოვნების შეფასება, არსობრივი (gist) შეჯამება, კონსოლიდაცია, სასაუბრო აგენტი და მსაჯული) გამოყენებულია OpenAI `gpt-4o-mini`, ხოლო მოძიებისთვის — `text-embedding-3-small`. იგი გამოცდილი იქნა სამ სინთეზურ მომხმარებლის პერსონაზე: თითოეული მათგანი ოთხსესიან საუბარს წარმოადგენდა, ჩადებული მნიშვნელოვანი ფაქტებით (სახელები, ალერგიები, ოჯახი), ერთჯერადი წვრილმანებით (ამინდის შესახებ გაკვრით ნათქვამი შენიშვნა, დავიწყებული ფილმის სათაური, ერთხელ ნახსენები კაფე) და განმეორებადი ემოციური თემით (დიპლომის დაცვის ვადის სტრესი, თანადამფუძნებელთან კონფლიქტი, ღამის ცვლისგან გამოწვეული დაღლილობა). მომხმარებლის ტურების იდენტური სცენარები ხელახლა იქნა გაშვებული ოთხივე პირობაში, ისე რომ თითოეულმა პირობამ ერთი და იგივე შემავალი მონაცემი მიიღო და მხოლოდ მეხსიერების მექანიზმით განსხვავდებოდა. სრული გაშვების ღირებულებამ დაახლოებით 0.01 აშშ დოლარი შეადგინა და შვიდ წუთზე ნაკლები დრო დაიკავა.</w:t>
       </w:r>
     </w:p>
     <w:p>
@@ -4835,7 +4835,7 @@
           <w:sz w:val="24"/>
           <w:lang w:val="ka-GE"/>
         </w:rPr>
-        <w:t>ცხრილი 4.1 აჩვენებს ჩარჩოს ერთგულებას 3.2-ის სრული არქიტექტურის მიმართ, სადაც გულწრფელად არის გამიჯნული, თუ რა არის იმპლემენტირებული და რა გადავადებული (F18-ის ყველაზე იაფი, მისაღები ვარიანტის მიხედვით).</w:t>
+        <w:t>ცხრილი 4.1 წარმოადგენს ჰარნესის ერთგულებას 3.2-ის სრული არქიტექტურის მიმართ და გულწრფელად მიჯნავს, თუ რა არის იმპლემენტირებული და რა — გადავადებული (F18-ის „ყველაზე იაფი, განხორციელებადი ვარიანტის“ პრინციპის შესაბამისად).</w:t>
       </w:r>
     </w:p>
     <w:p>
@@ -5245,7 +5245,7 @@
           <w:sz w:val="24"/>
           <w:lang w:val="ka-GE"/>
         </w:rPr>
-        <w:t>დრო იზომება სესიური ერთეულებით და არა კალენდარული დროით, ხოლო მომხმარებლები სიმულირებულნი არიან და არა ადამიანები; ორივე ზღუდავს ინტერპრეტაციას და განხილულია 4.4-ში.</w:t>
+        <w:t>დრო სესიურ ერთეულებში იზომება და არა რეალურ (wall-clock) დროში, ხოლო მომხმარებლები ნამდვილი ადამიანების ნაცვლად სიმულირებულნი არიან; ორივე ზღუდავს ინტერპრეტაციას, რასაც ხელახლა დავუბრუნდებით 4.4-ში.</w:t>
       </w:r>
     </w:p>
     <w:p>

</xml_diff>

<commit_message>
polish(§4.2): Sonnet-5 fluency + terminology, meaning verified
§4.2 (Technical results), 4 units: all measured figures preserved (37.2/41.0/
0.08-0.12ms, 1.00/0.00/0.67, 4 semantic facts); honest B+-also-generalizes nuance
and illustrative quotes intact; მოდელი→კანონზომიერება, latency glossary. Both editions rebuilt.

Co-Authored-By: Claude Opus 4.8 (1M context) <noreply@anthropic.com>
</commit_message>
<xml_diff>
--- a/project/thesis-ka.docx
+++ b/project/thesis-ka.docx
@@ -5279,7 +5279,7 @@
           <w:sz w:val="24"/>
           <w:lang w:val="ka-GE"/>
         </w:rPr>
-        <w:t>სესიებს შორის გახსენება და კეთილშობილური დავიწყება. ცხრილი 4.2 აჩვენებს გახსენების პრობების სწორად პასუხგაცემული წილს, პრობის ტიპის მიხედვით, აგრეგირებულს სამი პერსონასთვის.</w:t>
+        <w:t>სესიათაშორისი გახსენება და მოხდენილი დავიწყება. ცხრილი 4.2 ასახავს გახსენების პრობებზე გაცემული სწორი პასუხების წილს, პრობის ტიპის მიხედვით, სამივე პერსონაზე აგრეგირებულად.</w:t>
       </w:r>
     </w:p>
     <w:p>
@@ -5709,7 +5709,7 @@
           <w:sz w:val="24"/>
           <w:lang w:val="ka-GE"/>
         </w:rPr>
-        <w:t>სამი მოდელი ჩანს. პირველი, გრძელვადიანი მეხსიერება აუცილებელია: პირობა A, მხოლოდ ნაკლებად მდგრადი სამუშაო ფანჯრით, არ იხსენებს სესიებს შორის არსებულ არცერთ ფაქტს (მისი 0.67 გენერალიზაციის მაჩვენებელი სესიის შიდა არტეფაქტია — განმეორებადი თემა ხელახლა არის წარმოდგენილი იმავე სესიაში, რომელშიც ტესტირება მიმდინარეობს — და არა მეხსიერების მტკიცებულება). მეორე და, რაც მთავარია, მხოლოდ პროფილი C ავლენს გრაციოზულ, მნიშვნელობაზე-დაფუძნებულ დავიწყებას: ის ინარჩუნებს ყველა მნიშვნელოვან ფაქტს (1.00) და ივიწყებს დაბალი მნიშვნელობის მქონე წვრილმანებს (0.00), მაშინ როცა B და B+ ყველაფერს განურჩევლად ინარჩუნებენ (1.00/1.00). ეს არის ებინგჰაუსის ეფექტი, რომელიც მოქმედებს ისე, როგორც უნდა — დაბალი მნიშვნელობის კვალი მცირე სტაბილურობას იძენს, ერთი-ორი სესიის შუალედში იშლება ხელმისაწვდომობის ზღვარს ქვემოთ და გადის მეხსიერების აღდგენის პროცესს. ქცევითი განსხვავება პირდაპირ შესამჩნევია: კითხვაზე, როგორი ამინდი იყო, B პირობამ უპასუხა: "იმ დილით ძალიან ბურუსი იყო, ერთგვარად ლამაზი!", ხოლო C პირობამ უპასუხა: "ჩემს წინა საუბარში ამინდის შესახებ ეს კონკრეტული დეტალი არ მახსოვს. შენთან ბოლო დროს როგორი ამინდია?" — ეს იყო თბილი, დაუმახსოვრებელი პასუხი და არა მექანიკური გამეორება.</w:t>
+        <w:t>სამი კანონზომიერება იკვეთება. პირველი: გრძელვადიანი მეხსიერება აუცილებელია — პირობა A, რომელსაც მხოლოდ არამდგრადი სამუშაო ფანჯარა გააჩნია, სესიათაშორის არცერთ ფაქტს არ იხსენებს (მისი 0.67-იანი გენერალიზაციის მაჩვენებელი სესიის ფარგლებში წარმოქმნილი არტეფაქტია — განმეორებადი თემა უბრალოდ ხელახლა არის ნახსენები იმავე სესიაში, სადაც პრობა ტარდება — და არა მეხსიერების მტკიცებულება). მეორე და, რაც მთავარია, მხოლოდ პროფილი C ავლენს მოხდენილ, მნიშვნელობაზე დაფუძნებულ შერჩევით დავიწყებას: ის ინარჩუნებს ყოველ მნიშვნელოვან ფაქტს (1.00) და ივიწყებს დაბალმნიშვნელოვან წვრილმანებს (0.00), მაშინ როცა B და B+ ყველაფერს განურჩევლად ინარჩუნებენ (1.00/1.00). ეს არის ებინგჰაუსის ნიშან-თვისება, რომელიც ზუსტად დაგეგმილისამებრ მოქმედებს — დაბალი მნიშვნელობის კვალი დაბალ სტაბილურობას იძენს, ერთი-ორი სესიის შუალედში ხელმისაწვდომობის ზღვარს ქვემოთ ეცემა და მოძიებიდან გამოირიცხება. ქცევითი განსხვავება უშუალოდ შეინიშნება: კითხვაზე, როგორი ამინდი იყო, პირობა B-მ უპასუხა: „იმ დილით ძალიან ბურუსიანი იყო, ერთგვარად ლამაზი!“, ხოლო პირობა C-მ უპასუხა: „ჩვენი წინა საუბრიდან ამინდის შესახებ ეს კონკრეტული დეტალი არ მაქვს დამახსოვრებული. შენთან ბოლო დროს როგორი ამინდია?“ — ეს იყო თბილად გამოხატული გახსენების არქონა და არა მექანიკური გამეორება.</w:t>
       </w:r>
     </w:p>
     <w:p>
@@ -5723,7 +5723,7 @@
           <w:sz w:val="24"/>
           <w:lang w:val="ka-GE"/>
         </w:rPr>
-        <w:t>კონსოლიდაცია. მხოლოდ პროფილი C ქმნიდა მდგრად სემანტიკურ ფაქტებს: ოთხს სამი პერსონას მიხედვით (B-მ და B+-მ, კონსტრუქციიდან გამომდინარე, არცერთი არ შექმნეს). განმეორებადი თემის წამოწევისას, C ეყრდნობოდა თავის კონსოლიდირებულ საცავს — "როგორც ჩანს, თქვენს თანადამფუძნებელთან და თქვენი კომპანიის მიმართულებასთან დაკავშირებული გამოწვევები განმეორებადი თემაა". მნიშვნელოვანია, გულწრფელად აღინიშნოს, რომ B+-მაც უზრუნველყო კომპეტენტური განზოგადება რეალურ დროში — "თქვენს თანადამფუძნებელთან მიმდინარე დაძაბულობა მნიშვნელოვანი თემაა" — ენობრივი მოდელის მიერ რამდენიმე მოძიებული ეპიზოდიდან კანონის გამოტანით. შესაბამისად, C-ის კონსოლიდაციის უპირატესობა იმას არ ნიშნავს, რომ კურირებული საბაზისო მოდელი ვერ ახდენს განზოგადებას, არამედ იმაში მდგომარეობს, რომ C ინარჩუნებს განზოგადებას, როგორც აშკარა, მდგრად, ხელახლა გამოყენებად სტრუქტურას, რომელიც ეფუძნება წყარო-ეპიზოდების წარმომავლობას, და რომელიც შექმნილია ოფლაინ, და არა თავიდან იქმნება ყოველ ჯერზე.</w:t>
+        <w:t>კონსოლიდაცია. მხოლოდ პროფილი C-მ ჩამოაყალიბა მდგრადი სემანტიკური ფაქტები: ოთხი ფაქტი, სამივე პერსონაზე ჯამში (B-მ და B+-მ დიზაინითვე არცერთი ფაქტი არ ჩამოაყალიბეს). განმეორებადი თემის წამოწევისას C თავის კონსოლიდირებულ საცავს ეყრდნობოდა — „როგორც ჩანს, თქვენს თანადამფუძნებელთან და თქვენი კომპანიის მიმართულებასთან დაკავშირებული გამოწვევები განმეორებადი თემაა“. მნიშვნელოვანია გულწრფელად აღინიშნოს, რომ B+-მაც წარმოქმნა კომპეტენტური განზოგადება რეალურ დროში — „თქვენს თანადამფუძნებელთან მიმდინარე დაძაბულობა მნიშვნელოვანი თემაა“ — ენობრივი მოდელის მიერ რამდენიმე მოძიებული ეპიზოდიდან კანონზომიერების გამოტანით. შესაბამისად, C-ის კონსოლიდაციის უპირატესობა იმას არ ნიშნავს, რომ კურირებული საბაზისო მოდელი ვერ ახდენს განზოგადებას, არამედ იმაში მდგომარეობს, რომ C განზოგადებას ინარჩუნებს როგორც აშკარა, მდგრად, ხელახლა გამოყენებად სტრუქტურას, რომელსაც ახლავს წყარო-ეპიზოდების წარმომავლობა და რომელიც ოფლაინ რეჟიმში იქმნება, და არა ყოველ ჯერზე ხელახლა გამოიტანება.</w:t>
       </w:r>
     </w:p>
     <w:p>
@@ -5737,7 +5737,7 @@
           <w:sz w:val="24"/>
           <w:lang w:val="ka-GE"/>
         </w:rPr>
-        <w:t>ეფექტიანობა და შეყოვნება. გაზიარებული მოძიების ბიუჯეტის პირობებში, C-მ ყოველ ჯერზე საშუალოდ 37.2 კონტექსტური სიტყვა დაამატა, მაშინ როცა B-სა და B+-ს — 41.0; ეს ოდნავ ნაკლებია, რადგან არსის-პირველადი მოძიებისას უპირატესობა ენიჭება კომპაქტურ სემანტიკურ ფაქტებს, ნედლი ან სრული მოცულობის არსების დანართებთან შედარებით. თითოეული მორიგის სინქრონული მოძიების შეფერხება ყველა პირობისთვის მილიწამზე ნაკლები იყო (მედიანა 0.08–0.12 მწმ), რაც ადასტურებს დიზაინის მტკიცებას, რომ C-ის დამატებითი არითმეტიკული (დაკლებისა და ბონუს ქულების გათვლა) უმნიშვნელოა თავად მოძიებასთან შედარებით და — კონსტრუქციულად — რომ ენათა მოდელის ყველა რესურსტევადი ოპერაცია ოფლაინ რეჟიმში სრულდება.</w:t>
+        <w:t>ეფექტიანობა და დაყოვნება (latency). გაზიარებული მოძიების ბიუჯეტის პირობებში C-მ ყოველ ჯერზე საშუალოდ 37.2 კონტექსტური სიტყვა დაამატა, მაშინ როცა B-სთვისაც და B+-სთვისაც ეს მაჩვენებელი 41.0-ს შეადგენდა — ოდნავ ნაკლები, რადგან არსობრივზე ორიენტირებული (gist-first) მოძიება უპირატესობას ანიჭებს კომპაქტურ სემანტიკურ ფაქტებს ნედლ ან სრულმოცულობიან არსობრივ ერთეულებთან შედარებით. თითოეული მორიგის სინქრონული მოძიების დაყოვნება ყველა პირობისთვის მილიწამზე ნაკლები იყო (მედიანა 0.08–0.12 მწმ), რაც ადასტურებს დიზაინის მტკიცებას, რომ C-ის დამატებითი არითმეტიკა (დაკლებისა და ბონუს-ქულების გამოთვლა) უმნიშვნელოა თავად მოძიებასთან შედარებით და — კონსტრუქციულად — რომ ენობრივი მოდელის ყველა რესურსტევადი სამუშაო ოფლაინ რეჟიმში სრულდება.</w:t>
       </w:r>
     </w:p>
     <w:p>

</xml_diff>

<commit_message>
polish(§4.3): Sonnet-5 fluency + terminology, meaning verified
- Unified LLM judge → მსაჯული across the section (was mixed შემფასებელი/მოსამართლე)
- Fixed dative-case attribution so 7.00→B/B+ and 5.67→C read correctly
- Preserved privacy inversion, F18 "small not zero" hedge, and Cox's real ჩატარებული study [11]

Co-Authored-By: Claude Opus 4.8 (1M context) <noreply@anthropic.com>
</commit_message>
<xml_diff>
--- a/project/thesis-ka.docx
+++ b/project/thesis-ka.docx
@@ -5771,7 +5771,7 @@
           <w:sz w:val="24"/>
           <w:lang w:val="ka-GE"/>
         </w:rPr>
-        <w:t>დიდი ენის მოდელის (LLM) შემფასებელმა თითოეული პირობის სრული ტრანსკრიპტი შეაფასა ხუთი კრიტერიუმის (1–7) მიხედვით. ცხრილი 4.3 ასახავს სამი პერსონაჟის საშუალო ქულებს; ეს არის საილუსტრაციო შეფასებები მცირე სიმულირებული ნიმუშისგან (სამი პერსონაჟი, ერთი შემფასებლის შეფასება, მთელი რიცხვებით შეფასებები), წარმოდგენილი მნიშვნელობის ტესტირების გარეშე და შესაბამისი 3.1-ის შეფასების მიდგომას.</w:t>
+        <w:t>დიდი ენობრივი მოდელის (LLM) მსაჯულმა თითოეული პირობის სრული ტრანსკრიპტი ხუთი კონსტრუქტის მიხედვით (1–7) შეაფასა. ცხრილი 4.3 ასახავს სამი პერსონაჟის საშუალო მაჩვენებლებს; ეს საილუსტრაციო შეფასებებია, მიღებული მცირე სიმულირებული ნიმუშიდან (სამი პერსონაჟი, მსაჯულის ერთჯერადი გავლა, მთელრიცხვიანი ქულები), წარმოდგენილი სტატისტიკური მნიშვნელოვნების შემოწმების გარეშე და შეესაბამება 3.1-ის შეფასების მიდგომას.</w:t>
       </w:r>
     </w:p>
     <w:p>
@@ -6496,7 +6496,7 @@
           <w:sz w:val="24"/>
           <w:lang w:val="ka-GE"/>
         </w:rPr>
-        <w:t>აქედან ორი დასკვნა გამომდინარეობს, და მეორე მათგანი უფრო მნიშვნელოვანია.</w:t>
+        <w:t>აქედან გამომდინარეობს ორი დასკვნა, რომელთაგან მეორე უფრო მნიშვნელოვანია.</w:t>
       </w:r>
     </w:p>
     <w:p>
@@ -6510,7 +6510,7 @@
           <w:sz w:val="24"/>
           <w:lang w:val="ka-GE"/>
         </w:rPr>
-        <w:t>პირველი: პროფილი C არ აღემატება B+-ის კურირებულ კონტროლს არცერთ კონსტრუქტზე (ამ მცირე ნიმუშში C-სა და B+-ს შორის ყველა სხვაობა ნულია ან უარყოფითია). ეს ზუსტად ისაა, რასაც ა-პრიორი ანალიზი (F18) პროგნოზირებდა: როგორც კი სუფთა, კურირებული სტატიკური მეხსიერება (B+) არსებობს, C-ის ადამიანური მეხსიერების დამატებითი დინამიკა — დაქრობა, სალიენცობა, კონსოლიდაცია — ამ მასშტაბსა და ჰორიზონტზე აღქმის აღმოჩენად ზღვარს არ ქმნის. ამგვარად, კონცეფციის დამტკიცება სიმულაციის მეშვეობით ადასტურებს თეზისის საკუთარ მტკიცებას, რომ C-სა და B+-ს შორის ეფექტი მცირეა; ის არ ამტკიცებს და ვერც ამტკიცებს, რომ ადამიანებში ის ნულოვანია.</w:t>
+        <w:t>პირველი: პროფილი C არ აღემატება კურირებულ საკონტროლო პირობას B+ არცერთ კონსტრუქტზე (ამ მცირე ნიმუშში C-სა და B+-ს შორის ყველა სხვაობა ნულის ტოლია ან უარყოფითია). ეს ზუსტად ის არის, რაც აპრიორულმა ანალიზმა (F18) იწინასწარმეტყველა: როგორც კი სუფთა, კურირებული სტატიკური მეხსიერება (B+) არსებობს, C-სთვის დამახასიათებელი დამატებითი, ადამიანის მეხსიერების დინამიკა — დაქრობა, სალიენტურობა, კონსოლიდაცია — ამ მასშტაბსა და ჰორიზონტზე აღქმად სხვაობას აღარ ქმნის. ამგვარად, კონცეფციის დამტკიცება სიმულაციის პირობებში ადასტურებს თეზისის საკუთარ მტკიცებას, რომ C-სა და B+-ს შორის ეფექტი მცირეა; ის კი არც ადასტურებს და ვერც დაადასტურებდა, რომ ეს ეფექტი ადამიანებში ნულოვანია.</w:t>
       </w:r>
     </w:p>
     <w:p>
@@ -6524,7 +6524,7 @@
           <w:sz w:val="24"/>
           <w:lang w:val="ka-GE"/>
         </w:rPr>
-        <w:t>მეორე და მოულოდნელად, კონფიდენციალურობის კომფორტის შედეგი საპირისპიროა ადამიანებზე ჩატარებული დადგენილი კვლევისა. ადამიანებში, მომხმარებლის სიტყვების სიტყვასიტყვითი გახსენება ზრდის კონფიდენციალურობასთან დაკავშირებულ შეშფოთებას პარაფრაზთან შედარებით (კოქსის შედეგი [11], რომელიც 2.2-ის მთელი "ბუნდოვანი კვალის" არგუმენტაციის ემპირიული საყრდენია). აქ სიმულირებულმა მოსამართლემ სიტყვასიტყვითი პირობა B და დახვეწილი B+ კონფიდენციალურობის კომფორტის მიხედვით ყველაზე მაღალ შეფასებას (7.00) მისცა, ხოლო არსებითი შინაარსის საფუძველზე დავიწყების პროფილი C — ყველაზე დაბალს (5.67), რაც ადამიანებში დაფიქსირებული ეფექტის საპირისპიროა. მსაჯული, LLM, რომლისთვისაც კონფიდენციალურობის საკითხები არ იყო მნიშვნელოვანი, როგორც ჩანს, სრულ და ზუსტ გახსენებას უბრალო კომპეტენციად აღიქვამს ("კარგად დაიმახსოვრა"), ხოლო C-სგან განზრახ დავიწყებას — ნაკლად. ეს ზუსტად ის ზედაპირული ინტერპრეტაციაა, რომლის შესახებაც 3.5(b) აფრთხილებდა, რომ LLM მსაჯული მას შეგრძნებულ კავშირს ჩაანაცვლებდა.</w:t>
+        <w:t>მეორე, და მოულოდნელად, კონფიდენციალურობასთან დაკავშირებული კომფორტის შედეგი საპირისპიროა იმისა, რაც ადამიანებზე ჩატარებულმა კვლევამ უკვე დაადგინა. ადამიანებში, მომხმარებლის სიტყვების სიტყვასიტყვითი გახსენება ზრდის კონფიდენციალურობასთან დაკავშირებულ შეშფოთებას პარაფრაზთან შედარებით (კოქსის შედეგი [11], რომელიც 2.2-ის მთელი „ბუნდოვანი კვალის“ არგუმენტაციის ემპირიული საყრდენია). აქ სიმულირებულმა მსაჯულმა კონფიდენციალურობასთან დაკავშირებული კომფორტის მიხედვით ყველაზე მაღალი შეფასება (7.00) მისცა სიტყვასიტყვით პირობას B-სა და კურირებულ B+-ს, ხოლო ყველაზე დაბალი (5.67) — არსობრივ მეხსიერებაზე დაფუძნებულ, დავიწყების პროფილს C-ს. ეს ადამიანებში დაფიქსირებული ეფექტის საპირისპიროა. მსაჯული — LLM, რომლისთვისაც კონფიდენციალურობის საკითხები არსებითი არ არის — სრულ და ზუსტ გახსენებას, როგორც ჩანს, უბრალო კომპეტენციად აღიქვამს („კარგად დაიმახსოვრა“), ხოლო C-სგან განზრახ დავიწყებას — ნაკლად. ეს ზუსტად ის ზედაპირული ინტერპრეტაციაა, რომლის შესახებაც 3.5(b) აფრთხილებდა, რომ LLM მსაჯული შეგრძნებულ კავშირს სწორედ ასეთი ინტერპრეტაციით ჩაანაცვლებდა.</w:t>
       </w:r>
     </w:p>
     <w:p>

</xml_diff>

<commit_message>
polish(§4.4): Sonnet-5 fluency + terminology, meaning verified
- Honesty fix: our future §3.5(c) human study ჩატარებული→ჩასატარებელი (deferred, not conducted)
- latency→დაყოვნება, LLM→დიდი ენობრივი მოდელი, curated→კურირებული; ASCII quotes→„…"
- Dissociation, F18 link, and the counterexample/necessity logic preserved

Co-Authored-By: Claude Opus 4.8 (1M context) <noreply@anthropic.com>
</commit_message>
<xml_diff>
--- a/project/thesis-ka.docx
+++ b/project/thesis-ka.docx
@@ -6558,7 +6558,7 @@
           <w:sz w:val="24"/>
           <w:lang w:val="ka-GE"/>
         </w:rPr>
-        <w:t>შეფასება ადასტურებს დასკვნების მკაფიო, შემოსაზღვრულ ნაკრებს. ტექნიკური თვალსაზრისით, არქიტექტურა რეალიზებადია და მისი მექანიზმები ისე მუშაობს, როგორც დაგეგმილი იყო: სხვადასხვა სესიას შორის ინფორმაციის შენარჩუნებისთვის მეხსიერება აუცილებელია; მხოლოდ პროფილი C ივიწყებს გამართულად და სელექციურად, ინარჩუნებს მნიშვნელოვანს და უმნიშვნელო დეტალებს კი მივიწყებას აძლევს; მხოლოდ C აერთიანებს ეპიზოდებს მდგრად სემანტიკურ ცოდნად; და ამას კონტექსტის უფრო მცირე კვალის ფასად და შეფერხების იდენტური დონით აკეთებს. მექანიზმები არა მხოლოდ არსებობს, არამედ მათ ერთმანეთისგან განასხვავებლადაც ჩანს ქცევაში — რაც ტექნიკური ნაწილის მიერ უზრუნველყოფილი შემოწმების ფუნქციაა.</w:t>
+        <w:t>შეფასება ამყარებს დასკვნების მკაფიო, შემოსაზღვრულ ნაკრებს. ტექნიკური თვალსაზრისით, არქიტექტურა რეალიზებადია და მისი მექანიზმები ისე მუშაობს, როგორც დაგეგმილი იყო: სესიებს შორის გახსენებისთვის მეხსიერება აუცილებელია; მხოლოდ პროფილი C ივიწყებს გამართულად და სელექციურად — ინარჩუნებს მნიშვნელოვანს, ხოლო უმნიშვნელო დეტალებს მივიწყებას აძლევს; მხოლოდ C აერთიანებს ეპიზოდებს მდგრად სემანტიკურ ცოდნად და ამას აკეთებს კონტექსტის უფრო მცირე კვალის ფასად და დაყოვნების იდენტური დონით. მექანიზმები არა მხოლოდ არსებობს, არამედ ერთმანეთისგან განსხვავებულადაც ჩანს დაკვირვებად ქცევაში — რაც სწორედ ის შემოწმებაა, რომლის უზრუნველყოფაც ტექნიკურ ნაწილს ევალებოდა.</w:t>
       </w:r>
     </w:p>
     <w:p>
@@ -6572,7 +6572,7 @@
           <w:sz w:val="24"/>
           <w:lang w:val="ka-GE"/>
         </w:rPr>
-        <w:t>აღქმის მხრივ, შედეგი არის ნამდვილი დისოციაცია. ქცევითი თვალსაზრისით ყველაზე "ადამიანური" მდგომარეობა — უმნიშვნელო ინფორმაციის დავიწყება, მომხმარებლის შესახებ ზოგადის შექმნა — არ არის ის მდგომარეობა, რომელიც სიმულირებულმა მსაჯულმა არჩია; კურატორირებული სტატიკური კონტროლი (B+) მას ყველგან უტოლდებოდა ან აჯობებდა. ა-პრიორი სიმძლავრის ანალიზთან (F18) ერთად განხილული, ეს ამყარებს თეზისის ცენტრალურ მეთოდოლოგიურ პოზიციას: აღქმითი ღირებულება, რომელსაც ლიტერატურა "ადამიანის მსგავს მეხსიერებას" მიაწერს, შესაძლოა, დიდწილად განპირობებული იყოს საგულდაგულო კურირებითა და უბრალო არსებობით, ხოლო ბიომიმეტური დინამიკა ამატებს იმდენად მცირე ნაწილს, რომ მისი აღმოჩენა მისაღწევ მასშტაბზე შეუძლებელია. B+ კონტროლი სწორედ იმისთვის შეიქმნა, რომ ეს განსხვავება ხილული გაეხადა, და აქაც ამას აკეთებს.</w:t>
+        <w:t>აღქმის მხრივ, შედეგი ნამდვილი დისოციაციაა. ქცევითი თვალსაზრისით ყველაზე „ადამიანური“ მდგომარეობა — უმნიშვნელო ინფორმაციის დავიწყება, მომხმარებლის შესახებ განზოგადება — არ არის ის მდგომარეობა, რომელიც სიმულირებულმა მსაჯულმა არჩია; კურირებული სტატიკური კონტროლი (B+) მას ყველგან უტოლდებოდა ან აჯობებდა. აპრიორულ სიმძლავრის ანალიზთან (F18) ერთად განხილვისას, ეს ამყარებს თეზისის ცენტრალურ მეთოდოლოგიურ პოზიციას: აღქმითი ღირებულება, რომელსაც ლიტერატურა „ადამიანის მსგავს მეხსიერებას“ მიაწერს, შესაძლოა დიდწილად განპირობებული იყოს საგულდაგულო კურირებითა და უბრალო არსებობით, ხოლო ბიომიმეტურ დინამიკას შეაქვს იმდენად მცირე წვლილი, რომ მისი აღმოჩენა მისაღწევ მასშტაბზე შეუძლებელია. B+ კონტროლი სწორედ იმისთვის შეიქმნა, რომ ეს განსხვავება ხილული გაეხადა, და აქაც ამას აკეთებს.</w:t>
       </w:r>
     </w:p>
     <w:p>
@@ -6586,7 +6586,7 @@
           <w:sz w:val="24"/>
           <w:lang w:val="ka-GE"/>
         </w:rPr>
-        <w:t>კონფიდენციალურობისა და კომფორტის ინვერსია შეფასების ყველაზე მნიშვნელოვანი შედეგია, რადგან ის კონტრ-მაგალითით აჩვენებს სიმულირებული შეფასების საზღვრებს. იმ ერთ კონსტრუქტზე, სადაც ადამიანის ძლიერი, რეპლიცირებული ეფექტი არსებობს — სიტყვასიტყვითი გამეორების შემაწუხებელი ხასიათის შეგრძნება — დიდი ენის მოდელის (LLM) მსაჯულმა საპირისპირო დალაგება წარმოადგინა. ეს არ არის ხარვეზი, რომლის გამოსწორებაც შესაძლებელია; ეს პირდაპირი მტკიცებულებაა იმისა, რომ LLM-მსაჯული ვერ ჩაანაცვლებს ადამიანის აღქმას ისეთ კონსტრუქტებში, რომლებიც დამოკიდებულია ისეთ ადამიანურ ფაქტორებზე, როგორიცაა კონფიდენციალურობა და ნდობა. აქედან გამომდინარეობს, რომ ამ თეზისის აღქმითი მტკიცებულებები ნამდვილად ვერ გადაწყდება სიმულაციის გზით და რომ 3.5(c)-ის ადამიან-სუბიექტის პროტოკოლი არ არის დისკრეციული გაფართოება, არამედ მეთოდოლოგიური აუცილებლობა. სხვა სიტყვებით, კონცეფციის დამტკიცება იმსახურებს ადამიანზე ჩატარებული კვლევის გადადებას იმით, რომ ემპირიულად აჩვენებს მის აუცილებლობას.</w:t>
+        <w:t>კონფიდენციალურობისა და კომფორტის ინვერსია შეფასების ყველაზე მნიშვნელოვანი შედეგია, რადგან ის კონტრ-მაგალითით აჩვენებს სიმულირებული შეფასების საზღვრებს. იმ ერთ კონსტრუქტზე, სადაც ადამიანის ძლიერი, განმეორებით დადასტურებული ეფექტი არსებობს — სიტყვასიტყვითი გამეორების შემაწუხებელი ხასიათის შეგრძნება — დიდი ენობრივი მოდელის (LLM) მსაჯულმა საპირისპირო დალაგება წარმოადგინა. ეს არ არის ხარვეზი, რომლის გამოსწორებაც შესაძლებელია; ეს პირდაპირი მტკიცებულებაა იმისა, რომ LLM-მსაჯული ვერ ჩაანაცვლებს ადამიანის აღქმას ისეთ კონსტრუქტებში, რომლებიც დამოკიდებულია ისეთ ადამიანურ ფაქტორებზე, როგორიცაა კონფიდენციალურობა და ნდობა. აქედან გამომდინარეობს, რომ ამ თეზისის აღქმითი მტკიცებულებები ნამდვილად ვერ გადაწყდება სიმულაციის გზით და რომ 3.5(c)-ის ადამიან-სუბიექტის პროტოკოლი არ არის დისკრეციული გაფართოება, არამედ მეთოდოლოგიური აუცილებლობა. სხვა სიტყვებით, კონცეფციის დამტკიცება იმსახურებს ადამიან-სუბიექტების ჩასატარებელი კვლევის გადადებას იმით, რომ ემპირიულად აჩვენებს მის აუცილებლობას.</w:t>
       </w:r>
     </w:p>
     <w:p>

</xml_diff>

<commit_message>
polish(§5.3): Sonnet-5 fluency + terminology, meaning verified — PROSE LOOP COMPLETE
- Honesty fix: human-subject study ჩატარებული→ჩასატარებელი (future work)
- Restored dropped "pre-registered, within-subject comparison" (წინასწარ რეგისტრირებული, განმეორებითი გაზომვების)
- deployability→დანერგვა (not usability); CLS→კომპლემენტარული სასწავლო; fuzzy-trace grammar fixed
- Closing line now echoes the thesis title: ასისტენტიდან თანამოსაუბრემდე ევოლუცია
- Heading §5.3 სამომავლო სამუშაო→სამომავლო გეგმები (glossary term; TOC cascades)

Co-Authored-By: Claude Opus 4.8 (1M context) <noreply@anthropic.com>
</commit_message>
<xml_diff>
--- a/project/thesis-ka.docx
+++ b/project/thesis-ka.docx
@@ -2043,7 +2043,7 @@
           <w:rFonts w:ascii="Sylfaen" w:hAnsi="Sylfaen"/>
           <w:sz w:val="24"/>
         </w:rPr>
-        <w:t>5.3 სამომავლო სამუშაო</w:t>
+        <w:t>5.3 სამომავლო გეგმები</w:t>
       </w:r>
       <w:r>
         <w:rPr>
@@ -6743,7 +6743,7 @@
           <w:sz w:val="28"/>
           <w:lang w:val="ka-GE"/>
         </w:rPr>
-        <w:t>5.3 სამომავლო სამუშაო</w:t>
+        <w:t>5.3 სამომავლო გეგმები</w:t>
       </w:r>
     </w:p>
     <w:p>
@@ -6757,7 +6757,7 @@
           <w:sz w:val="24"/>
           <w:lang w:val="ka-GE"/>
         </w:rPr>
-        <w:t>პირდაპირ სამი მიმართულება მოჰყვება. პირველი სრული სისტემის შექმნაა: პროფილი C-ის ინტეგრირება ხმოვანი არხის რეალურ დროში, პლატფორმის აუდიტში გამოვლენილი გამოყენებადობის შეზღუდვების მოგვარება (მონაწილეთა იზოლაცია, პაკეტირება, ერთი არჩეული საუბრის მოდული) და იმ მექანიზმების იმპლემენტაცია, რომლებიც ამჟამად შემცირებული სიზუსტით მუშაობს — ბაიესის სიურპრიზის მოვლენების სეგმენტაცია, ასოციაციური წინასწარი გაფართოება და დეტერმინირებული ზუსტი გახსენების ტრიგერი. მეორეა 3.5(c)-ში მითითებული ადამიანთა სუბიექტებზე ჩატარებული კვლევა: B-ს, B+, და C სფეროს ნორმატიული ნიმუშის ზომით, გათვლილი იმ შედარებებისთვის, სადაც მძლავრობა მიღწევადია, და ცენტრალურ C-სა და B+-ს შორის კონტრასტს, როგორც შეფასების სამიზნეს, განიხილავს, თან ახლავს თბილი, მიკუთვნებადი დავიწყება, გვიანი ფანჯრის ანალიზი, მოვლენაზე მგრძნობიარე და ქცევითი ზომები, და კოდირებული ინტერვიუები, როგორც დიზაინის პასუხი სავარაუდოდ მცირე ან ნულოვან პირველად ეფექტზე. მესამეა თეორიული გაფართოება: იმ მეხსიერების ფენომენების ინკორპორაცია, რომლებსაც ამჟამინდელი არქიტექტურა განზრახ გამორიცხავს — ინტერფერენცია, როგორც დავიწყების მექანიზმი, რეკონსტრუქციული და სქემაზე დაფუძნებული დამახინჯება, რასაც ყველაზე მკაფიოდ პროგნოზირებს ბუნდოვანი კვალითა და კომპლემენტარული სწავლების სისტემები, და უფრო მდიდარი დროითი თანმიმდევრობისა და წყაროს მეხსიერება — თითოეული მათგანი ერთდროულად არის როგორც ერთგულების ხარვეზი, ასევე კონკრეტული ჰიპოთეზა იმის შესახებ, თუ რა გახდიდა თანამოსაუბრეს უფრო ადამიანურს. ჯამში, ეს ყველაფერი ასრულებს ასისტენტიდან თანამოსაუბრედ ევოლუციას, რომელიც ამ ნაშრომმა დააპროექტა, მინიატურაში შექმნა და აჩვენა, თუ როგორ უნდა გაიზომოს.</w:t>
+        <w:t>პირდაპირ სამი მიმართულება მოჰყვება. პირველი სრული სისტემის შექმნაა: პროფილი C-ის ინტეგრირება ცოცხალ ხმოვან არხში, პლატფორმის აუდიტში გამოვლენილი დანერგვის შეზღუდვების მოგვარება (მონაწილეთა იზოლაცია, პაკეტირება, ერთი არჩეული საუბრის მოდული) და იმ მექანიზმების იმპლემენტაცია, რომლებიც ამჟამად შემცირებული სიზუსტით მუშაობს — ბაიესის სიურპრიზზე დაფუძნებული მოვლენების სეგმენტაცია, ასოციაციური წინასწარი გაფართოება და დეტერმინირებული ზუსტი გახსენების ტრიგერი. მეორეა 3.5(c)-ში მითითებული, ადამიან-სუბიექტებზე ჩასატარებელი კვლევა: წინასწარ რეგისტრირებული, განმეორებითი გაზომვების (within-subject) შედარება B-ს, B+-სა და C-ს შორის, დარგის ნორმატიული ნიმუშის ზომით. ეს კვლევა გათვლილია იმ შედარებებისთვის, სადაც სტატისტიკური მძლავრობა მიღწევადია, ხოლო ცენტრალურ C-სა და B+-ს შორის კონტრასტს განიხილავს, როგორც შეფასების სამიზნეს. თბილი, მიკუთვნებადი დავიწყება, გვიანი ფანჯრის ანალიზი, მოვლენაზე მგრძნობიარე და ქცევითი ზომები და კოდირებული ინტერვიუები კი დიზაინის პასუხია სავარაუდოდ მცირე ან ნულოვან პირველად ეფექტზე. მესამეა თეორიული გაფართოება: იმ მეხსიერების ფენომენების ინკორპორაცია, რომლებსაც ამჟამინდელი არქიტექტურა განზრახ გამორიცხავს — ინტერფერენცია, როგორც დავიწყების მექანიზმი; რეკონსტრუქციული და სქემაზე დაფუძნებული დამახინჯება, რასაც ყველაზე მკაფიოდ ბუნდოვანი კვალის თეორია და კომპლემენტარული სასწავლო სისტემები პროგნოზირებს; და უფრო მდიდარი დროითი თანმიმდევრობისა და წყაროს მეხსიერება. თითოეული მათგანი ერთდროულად არის როგორც ერთგულების ხარვეზი, ასევე კონკრეტული ჰიპოთეზა იმის შესახებ, თუ რა გახდიდა თანამოსაუბრეს უფრო ადამიანურს. ჯამში, ეს ყველაფერი ასრულებს ასისტენტიდან თანამოსაუბრემდე ევოლუციას, რომელიც ამ ნაშრომმა დააპროექტა, მინიატურაში შექმნა და აჩვენა, თუ როგორ უნდა გაიზომოს.</w:t>
       </w:r>
     </w:p>
     <w:p>

</xml_diff>

<commit_message>
polish(tables): terminology alignment across 5 tables + doc-wide term consistency
Table-terminology pass (2.1, 3.1, 4.1, 4.2, 4.3), plus the same terms wherever
they appeared in body prose/headings — all glossary-backed, meaning unchanged:
- LLM: დიდი ენის მოდელი→დიდი ენობრივი მოდელი (§2.3 heading+TOC, tables 2.1/4.1)
- curation: კურატორ*→კურირ* (6 body paras + tables 3.1/4.2)
- verbatim: ვერბატიმ→სიტყვასიტყვითი (§4.x hypotheses + table 4.2)
- confound: დამაბრკოლებელი ფაქტორი→ამრევი ფაქტორი (table 3.1, matches §5.1)
- decay: დაშლა→დაქრობა (§ prose + table 3.1); latency: შეფერხება→დაყოვნება (table 3.1)
- ASCII→„…" quotes (table 2.1); გენერალიზაცია→განზოგადება; ზარმაცა→ზარმაცი typo
All prior polished anchors verified intact; both editions rebuilt.

Co-Authored-By: Claude Opus 4.8 (1M context) <noreply@anthropic.com>
</commit_message>
<xml_diff>
--- a/project/thesis-ka.docx
+++ b/project/thesis-ka.docx
@@ -1323,7 +1323,7 @@
           <w:rFonts w:ascii="Sylfaen" w:hAnsi="Sylfaen"/>
           <w:sz w:val="24"/>
         </w:rPr>
-        <w:t>2.3 გრძელვადიანი მეხსიერება დიდი ენის მოდელის აგენტებისთვის: სამი ტალღა</w:t>
+        <w:t>2.3 გრძელვადიანი მეხსიერება დიდი ენობრივი მოდელის აგენტებისთვის: სამი ტალღა</w:t>
       </w:r>
       <w:r>
         <w:rPr>
@@ -2404,7 +2404,7 @@
           <w:sz w:val="24"/>
           <w:lang w:val="ka-GE"/>
         </w:rPr>
-        <w:t>3. არქიტექტურის განხორციელება ურთიერთშედარებადი ექსპერიმენტული პროფილების სახით: (A) გრძელვადიანი მეხსიერების გარეშე, (B) პირდაპირ (verbatim) მოძიებაზე დაფუძნებული RAG, (B+) კურატორირებული სტატიკური აქტიური კონტროლი და (C) ადამიანის მეხსიერების მოდელზე დაფუძნებული პროფილი;</w:t>
+        <w:t>3. არქიტექტურის განხორციელება ურთიერთშედარებადი ექსპერიმენტული პროფილების სახით: (A) გრძელვადიანი მეხსიერების გარეშე, (B) პირდაპირ (verbatim) მოძიებაზე დაფუძნებული RAG, (B+) კურირებული სტატიკური აქტიური კონტროლი და (C) ადამიანის მეხსიერების მოდელზე დაფუძნებული პროფილი;</w:t>
       </w:r>
     </w:p>
     <w:p>
@@ -2516,7 +2516,7 @@
           <w:sz w:val="24"/>
           <w:lang w:val="ka-GE"/>
         </w:rPr>
-        <w:t>შედარება დამატებით მოიცავს კურატორირებულ სტატიკურ აქტიურ კონტროლს (B+): მეხსიერებას, რომელიც იღებს იგივე ოფლაინ კურატორირებას, რაც C, მაგრამ არ გააჩნია ადამიანის მეხსიერების დინამიკა (არც დაქრობა, არც სალიენს-გეითინგი, არც კონსოლიდაცია). კონტრასტი C-სა და B+-ს შორის — რომელიც ადამიანის მეხსიერების დინამიკის ეფექტს კურირებით მიღწეული წაკითხვადობის უბრალო ზრდისგან გამოყოფს — ამ ნაშრომის ცენტრალური ახალი შედარებაა. როგორც 3.1-შია დადგენილი, ის თავისი კონსტრუქციით მცირე ეფექტს წარმოადგენს და განიხილება წინასწარ რეგისტრირებულ შეფასების მიზნად და არა დამადასტურებელ ტესტად, რაც განსხვავდება უკეთესი სტატისტიკური ძალის მქონე შედარებებისგან (C vs A და მიმართულებითი B+ vs B და C vs B).</w:t>
+        <w:t>შედარება დამატებით მოიცავს კურირებულ სტატიკურ აქტიურ კონტროლს (B+): მეხსიერებას, რომელიც იღებს იგივე ოფლაინ კურირებას, რაც C, მაგრამ არ გააჩნია ადამიანის მეხსიერების დინამიკა (არც დაქრობა, არც სალიენს-გეითინგი, არც კონსოლიდაცია). კონტრასტი C-სა და B+-ს შორის — რომელიც ადამიანის მეხსიერების დინამიკის ეფექტს კურირებით მიღწეული წაკითხვადობის უბრალო ზრდისგან გამოყოფს — ამ ნაშრომის ცენტრალური ახალი შედარებაა. როგორც 3.1-შია დადგენილი, ის თავისი კონსტრუქციით მცირე ეფექტს წარმოადგენს და განიხილება წინასწარ რეგისტრირებულ შეფასების მიზნად და არა დამადასტურებელ ტესტად, რაც განსხვავდება უკეთესი სტატისტიკური ძალის მქონე შედარებებისგან (C vs A და მიმართულებითი B+ vs B და C vs B).</w:t>
       </w:r>
     </w:p>
     <w:p>
@@ -2897,7 +2897,7 @@
           <w:sz w:val="28"/>
           <w:lang w:val="ka-GE"/>
         </w:rPr>
-        <w:t>2.3 გრძელვადიანი მეხსიერება დიდი ენის მოდელის აგენტებისთვის: სამი ტალღა</w:t>
+        <w:t>2.3 გრძელვადიანი მეხსიერება დიდი ენობრივი მოდელის აგენტებისთვის: სამი ტალღა</w:t>
       </w:r>
     </w:p>
     <w:p>
@@ -3019,14 +3019,14 @@
         <w:tblLook w:firstColumn="1" w:firstRow="1" w:lastColumn="0" w:lastRow="0" w:noHBand="0" w:noVBand="1" w:val="04A0"/>
       </w:tblPr>
       <w:tblGrid>
-        <w:gridCol w:w="2861"/>
-        <w:gridCol w:w="2861"/>
-        <w:gridCol w:w="2612"/>
+        <w:gridCol w:w="2840"/>
+        <w:gridCol w:w="2840"/>
+        <w:gridCol w:w="2655"/>
       </w:tblGrid>
       <w:tr>
         <w:tc>
           <w:tcPr>
-            <w:tcW w:type="dxa" w:w="2861"/>
+            <w:tcW w:type="dxa" w:w="2840"/>
           </w:tcPr>
           <w:p>
             <w:pPr>
@@ -3045,7 +3045,7 @@
         </w:tc>
         <w:tc>
           <w:tcPr>
-            <w:tcW w:type="dxa" w:w="2861"/>
+            <w:tcW w:type="dxa" w:w="2840"/>
           </w:tcPr>
           <w:p>
             <w:pPr>
@@ -3064,7 +3064,7 @@
         </w:tc>
         <w:tc>
           <w:tcPr>
-            <w:tcW w:type="dxa" w:w="2612"/>
+            <w:tcW w:type="dxa" w:w="2654"/>
           </w:tcPr>
           <w:p>
             <w:pPr>
@@ -3077,7 +3077,7 @@
                 <w:sz w:val="22"/>
                 <w:lang w:val="ka-GE"/>
               </w:rPr>
-              <w:t>დიდი ენის მოდელის აგენტის იმპლემენტაცია</w:t>
+              <w:t>დიდი ენობრივი მოდელის აგენტის იმპლემენტაცია</w:t>
             </w:r>
           </w:p>
         </w:tc>
@@ -3085,7 +3085,7 @@
       <w:tr>
         <w:tc>
           <w:tcPr>
-            <w:tcW w:type="dxa" w:w="2861"/>
+            <w:tcW w:type="dxa" w:w="2840"/>
           </w:tcPr>
           <w:p>
             <w:pPr>
@@ -3104,7 +3104,7 @@
         </w:tc>
         <w:tc>
           <w:tcPr>
-            <w:tcW w:type="dxa" w:w="2861"/>
+            <w:tcW w:type="dxa" w:w="2840"/>
           </w:tcPr>
           <w:p>
             <w:pPr>
@@ -3123,7 +3123,7 @@
         </w:tc>
         <w:tc>
           <w:tcPr>
-            <w:tcW w:type="dxa" w:w="2612"/>
+            <w:tcW w:type="dxa" w:w="2654"/>
           </w:tcPr>
           <w:p>
             <w:pPr>
@@ -3144,7 +3144,7 @@
       <w:tr>
         <w:tc>
           <w:tcPr>
-            <w:tcW w:type="dxa" w:w="2861"/>
+            <w:tcW w:type="dxa" w:w="2840"/>
           </w:tcPr>
           <w:p>
             <w:pPr>
@@ -3163,7 +3163,7 @@
         </w:tc>
         <w:tc>
           <w:tcPr>
-            <w:tcW w:type="dxa" w:w="2861"/>
+            <w:tcW w:type="dxa" w:w="2840"/>
           </w:tcPr>
           <w:p>
             <w:pPr>
@@ -3182,7 +3182,7 @@
         </w:tc>
         <w:tc>
           <w:tcPr>
-            <w:tcW w:type="dxa" w:w="2612"/>
+            <w:tcW w:type="dxa" w:w="2654"/>
           </w:tcPr>
           <w:p>
             <w:pPr>
@@ -3203,7 +3203,7 @@
       <w:tr>
         <w:tc>
           <w:tcPr>
-            <w:tcW w:type="dxa" w:w="2861"/>
+            <w:tcW w:type="dxa" w:w="2840"/>
           </w:tcPr>
           <w:p>
             <w:pPr>
@@ -3222,7 +3222,7 @@
         </w:tc>
         <w:tc>
           <w:tcPr>
-            <w:tcW w:type="dxa" w:w="2861"/>
+            <w:tcW w:type="dxa" w:w="2840"/>
           </w:tcPr>
           <w:p>
             <w:pPr>
@@ -3241,7 +3241,7 @@
         </w:tc>
         <w:tc>
           <w:tcPr>
-            <w:tcW w:type="dxa" w:w="2612"/>
+            <w:tcW w:type="dxa" w:w="2654"/>
           </w:tcPr>
           <w:p>
             <w:pPr>
@@ -3262,7 +3262,7 @@
       <w:tr>
         <w:tc>
           <w:tcPr>
-            <w:tcW w:type="dxa" w:w="2861"/>
+            <w:tcW w:type="dxa" w:w="2840"/>
           </w:tcPr>
           <w:p>
             <w:pPr>
@@ -3281,7 +3281,7 @@
         </w:tc>
         <w:tc>
           <w:tcPr>
-            <w:tcW w:type="dxa" w:w="2861"/>
+            <w:tcW w:type="dxa" w:w="2840"/>
           </w:tcPr>
           <w:p>
             <w:pPr>
@@ -3300,7 +3300,7 @@
         </w:tc>
         <w:tc>
           <w:tcPr>
-            <w:tcW w:type="dxa" w:w="2612"/>
+            <w:tcW w:type="dxa" w:w="2654"/>
           </w:tcPr>
           <w:p>
             <w:pPr>
@@ -3321,7 +3321,7 @@
       <w:tr>
         <w:tc>
           <w:tcPr>
-            <w:tcW w:type="dxa" w:w="2861"/>
+            <w:tcW w:type="dxa" w:w="2840"/>
           </w:tcPr>
           <w:p>
             <w:pPr>
@@ -3340,7 +3340,7 @@
         </w:tc>
         <w:tc>
           <w:tcPr>
-            <w:tcW w:type="dxa" w:w="2861"/>
+            <w:tcW w:type="dxa" w:w="2840"/>
           </w:tcPr>
           <w:p>
             <w:pPr>
@@ -3359,7 +3359,7 @@
         </w:tc>
         <w:tc>
           <w:tcPr>
-            <w:tcW w:type="dxa" w:w="2612"/>
+            <w:tcW w:type="dxa" w:w="2654"/>
           </w:tcPr>
           <w:p>
             <w:pPr>
@@ -3372,7 +3372,7 @@
                 <w:sz w:val="22"/>
                 <w:lang w:val="ka-GE"/>
               </w:rPr>
-              <w:t>"სიზმრის" კონსოლიდაციის სისტემები [18, 19]</w:t>
+              <w:t>„სიზმრის“ კონსოლიდაციის სისტემები [18, 19]</w:t>
             </w:r>
           </w:p>
         </w:tc>
@@ -3380,7 +3380,7 @@
       <w:tr>
         <w:tc>
           <w:tcPr>
-            <w:tcW w:type="dxa" w:w="2861"/>
+            <w:tcW w:type="dxa" w:w="2840"/>
           </w:tcPr>
           <w:p>
             <w:pPr>
@@ -3399,7 +3399,7 @@
         </w:tc>
         <w:tc>
           <w:tcPr>
-            <w:tcW w:type="dxa" w:w="2861"/>
+            <w:tcW w:type="dxa" w:w="2840"/>
           </w:tcPr>
           <w:p>
             <w:pPr>
@@ -3418,7 +3418,7 @@
         </w:tc>
         <w:tc>
           <w:tcPr>
-            <w:tcW w:type="dxa" w:w="2612"/>
+            <w:tcW w:type="dxa" w:w="2654"/>
           </w:tcPr>
           <w:p>
             <w:pPr>
@@ -3740,7 +3740,7 @@
           <w:sz w:val="24"/>
           <w:lang w:val="ka-GE"/>
         </w:rPr>
-        <w:t>სამი წვლილი ასეთია: (ა) მეხსიერების არქიტექტურა („პროფილი C“), რომლის მექანიზმებიც ეტაპობრივად ეფუძნება ადამიანის მეხსიერების კოგნიტურ თეორიებსა და მათ ქცევით ნიშან-თვისებებს (3.2); (ბ) კურატორიული კონტროლის მქონე შეფასების მეთოდოლოგია, რომლის ცენტრალური ინსტრუმენტიც აქტიური საკონტროლო პირობაა — B+ — რომელიც გამოყოფს ადამიანის მეხსიერების დინამიკის ეფექტს LLM-ის კურაციის ზოგადი წაკითხვადობის ზრდისგან (3.3); და (გ) კონცეფციის დამტკიცების იმპლემენტაცია და არქიტექტურის ორხაზიანი — ტექნიკური და სიმულირებული — შეფასება (3.4–3.5). სრული კვლევა ადამიანთა მონაწილეობით, რომელსაც მიზანი საბოლოოდ ითვალისწინებს, წარმოდგენილია 3.5(c)-ში, როგორც სრულად სპეციფიცირებული, მაგრამ ჯერ ჩაუტარებელი პროტოკოლი — სამომავლო გეგმები, საკუთარი სტატისტიკური სიმძლავრის ანალიზით — და არა როგორც კვლევა, რომლის მონაცემებიც 4-შია წარმოდგენილი.</w:t>
+        <w:t>სამი წვლილი ასეთია: (ა) მეხსიერების არქიტექტურა („პროფილი C“), რომლის მექანიზმებიც ეტაპობრივად ეფუძნება ადამიანის მეხსიერების კოგნიტურ თეორიებსა და მათ ქცევით ნიშან-თვისებებს (3.2); (ბ) კურირების კონტროლის მქონე შეფასების მეთოდოლოგია, რომლის ცენტრალური ინსტრუმენტიც აქტიური საკონტროლო პირობაა — B+ — რომელიც გამოყოფს ადამიანის მეხსიერების დინამიკის ეფექტს LLM-ის კურაციის ზოგადი წაკითხვადობის ზრდისგან (3.3); და (გ) კონცეფციის დამტკიცების იმპლემენტაცია და არქიტექტურის ორხაზიანი — ტექნიკური და სიმულირებული — შეფასება (3.4–3.5). სრული კვლევა ადამიანთა მონაწილეობით, რომელსაც მიზანი საბოლოოდ ითვალისწინებს, წარმოდგენილია 3.5(c)-ში, როგორც სრულად სპეციფიცირებული, მაგრამ ჯერ ჩაუტარებელი პროტოკოლი — სამომავლო გეგმები, საკუთარი სტატისტიკური სიმძლავრის ანალიზით — და არა როგორც კვლევა, რომლის მონაცემებიც 4-შია წარმოდგენილი.</w:t>
       </w:r>
     </w:p>
     <w:p>
@@ -3768,7 +3768,7 @@
           <w:sz w:val="24"/>
           <w:lang w:val="ka-GE"/>
         </w:rPr>
-        <w:t>მეორე, უფრო ღრმა შეზღუდვა განსაზღვრავს ინფერენციულ მიდგომას და აქ არის ჩამოყალიბებული, რათა მთელ თავს მართავდეს. ეფექტის ზომის აპრიორი ანალიზი (F18), რომელიც ეფუძნება კოქსის კვლევას [11] და მასთან დაკავშირებულ სოციალურ სიგნალებზე არსებულ მტკიცებულებებს, მიუთითებს, რომ სამეცნიეროდ ცენტრალური კონტრასტი — C &gt; B+ — კონსტრუქციულად დიზაინში ყველაზე მცირე ეფექტია (კოენის dz ≈ 0.28, „ცივი სტარტის“ განზავებამდე), რადგან B+ უკვე მოიცავს მეხსიერების ორ ყველაზე მყარად დადასტურებულ სარგებელს: თანდასწრებას და არსობრივ (gist) დონეზე სუფთა პარაფრაზს. ამ კლასის კვლევებისთვის ნორმატიულ ნიმუშის ზომაზე (n ≈ 20; F12), ყველაზე მცირე საიმედოდ აღმოჩენადი ეფექტი დაახლოებით dz ≈ 0.78–0.86-ია, ხოლო C &gt; B+-ის აღმოჩენას დასჭირდებოდა n ≈ 116–159 — რაც შეუძლებელია ადამიანისა და აგენტის ურთიერთქმედების ჟანრისთვის. ეს შედეგი განზრახ არის აღიარებული და არა დამალული: C &gt; B+ განიხილება როგორც წინასწარ დარეგისტრირებული შეფასების სამიზნე — ეფექტის ზომა 95%-იანი სანდო ინტერვალით — და არა როგორც დამადასტურებელი ნულ-ჰიპოთეზის ტესტი. შედარებები, რომელთა მიმართაც სტატისტიკური სიმძლავრე არსებობს (C &gt; A და მიმართულებითი B+ &gt; B და C &gt; B), დამადასტურებელი ტესტებია. C &gt; B+-ზე ზუსტად შეფასებული ნული თავისთავად არსებითი, გამოსაქვეყნებელი შედეგია: ის მიუთითებდა, რომ „ადამიანის მსგავსი“ მეხსიერების აღქმითი ღირებულება განპირობებულია არსობრივი (gist) კურირებითა და თანდასწრებით და არა ებინგჰაუსის დაშლით, სალიენს-გეითინგით ან კონსოლიდაციით — დასკვნა, რომლის ინტერპრეტაციისთვისაც სწორედ B+ კონტროლი შეიქმნა სპეციალურად. შეფასების ეს მიდგომა, შესაბამისად, სიმკაცრისგან უკან დახევა კი არა, არამედ მტკიცების სწორი კალიბრაციაა მიღწევად მტკიცებულებასთან მიმართებაში.</w:t>
+        <w:t>მეორე, უფრო ღრმა შეზღუდვა განსაზღვრავს ინფერენციულ მიდგომას და აქ არის ჩამოყალიბებული, რათა მთელ თავს მართავდეს. ეფექტის ზომის აპრიორი ანალიზი (F18), რომელიც ეფუძნება კოქსის კვლევას [11] და მასთან დაკავშირებულ სოციალურ სიგნალებზე არსებულ მტკიცებულებებს, მიუთითებს, რომ სამეცნიეროდ ცენტრალური კონტრასტი — C &gt; B+ — კონსტრუქციულად დიზაინში ყველაზე მცირე ეფექტია (კოენის dz ≈ 0.28, „ცივი სტარტის“ განზავებამდე), რადგან B+ უკვე მოიცავს მეხსიერების ორ ყველაზე მყარად დადასტურებულ სარგებელს: თანდასწრებას და არსობრივ (gist) დონეზე სუფთა პარაფრაზს. ამ კლასის კვლევებისთვის ნორმატიულ ნიმუშის ზომაზე (n ≈ 20; F12), ყველაზე მცირე საიმედოდ აღმოჩენადი ეფექტი დაახლოებით dz ≈ 0.78–0.86-ია, ხოლო C &gt; B+-ის აღმოჩენას დასჭირდებოდა n ≈ 116–159 — რაც შეუძლებელია ადამიანისა და აგენტის ურთიერთქმედების ჟანრისთვის. ეს შედეგი განზრახ არის აღიარებული და არა დამალული: C &gt; B+ განიხილება როგორც წინასწარ დარეგისტრირებული შეფასების სამიზნე — ეფექტის ზომა 95%-იანი სანდო ინტერვალით — და არა როგორც დამადასტურებელი ნულ-ჰიპოთეზის ტესტი. შედარებები, რომელთა მიმართაც სტატისტიკური სიმძლავრე არსებობს (C &gt; A და მიმართულებითი B+ &gt; B და C &gt; B), დამადასტურებელი ტესტებია. C &gt; B+-ზე ზუსტად შეფასებული ნული თავისთავად არსებითი, გამოსაქვეყნებელი შედეგია: ის მიუთითებდა, რომ „ადამიანის მსგავსი“ მეხსიერების აღქმითი ღირებულება განპირობებულია არსობრივი (gist) კურირებითა და თანდასწრებით და არა ებინგჰაუსის დაქრობით, სალიენს-გეითინგით ან კონსოლიდაციით — დასკვნა, რომლის ინტერპრეტაციისთვისაც სწორედ B+ კონტროლი შეიქმნა სპეციალურად. შეფასების ეს მიდგომა, შესაბამისად, სიმკაცრისგან უკან დახევა კი არა, არამედ მტკიცების სწორი კალიბრაციაა მიღწევად მტკიცებულებასთან მიმართებაში.</w:t>
       </w:r>
     </w:p>
     <w:p>
@@ -3858,7 +3858,7 @@
           <w:sz w:val="24"/>
           <w:lang w:val="ka-GE"/>
         </w:rPr>
-        <w:t>ეტაპი 3 — დაქრობა და გაძლიერება (ებინგჰაუსი, ზარმაცი, სინქრონული და ასინქრონული). თითოეულ კვალს გააჩნია აღდგენადობა, რომელიც ბოლო წვდომიდან გასული დროის მიხედვით, მისი სტაბილურობის შესაბამისად, ექსპონენციურად კლებულობს და მოძიების მომენტში ზარმაცად, ქულის გამრავლების კოეფიციენტის სახით, გამოითვლება — ფონური დათვლა და სინქრონული ჩაწერა არ ხდება. წარმატებული განმეორებითი ხსენება აძლიერებს სტაბილურობას და ბოლო წვდომის დროის ნიშნულს ანახლებს, დროში გადანაწილებული გამეორების პრინციპით, მაგრამ ჩაწერა ინახება რიგში ოფლაინ დასამუშავებლად, რათა სინქრონული გზა დარჩეს მხოლოდ წაკითხვადი — ზუსტად ისე, როგორც B-ში. რაც მთავარია, მე-4 ეტაპის მიერ წარმოქმნილი სემანტიკური ფაქტებიც დაქრება, ამიტომ ებინგჰაუსის დინამიკა რჩება ცოცხალ დამოუკიდებელ ცვლადად და არა მუდმივ საცავზე გადადებულ კოსმეტიკურ ფენად. დაფუძნება: ებინგჰაუსის დავიწყების მრუდი [23] — გამოთვლითი პრეცედენტია MemoryBank/SiliconFriend [6]. ხელწერა: რაც დიდი ხნის წინ მხოლოდ ერთხელ იქნა ნახსენები, ქრება, ხოლო რაც განმეორებით ბრუნდება — მდგრადი ხდება: გრაციოზული, ბუნებრივი დავიწყება, B-ს შემზარავი სრული გახსენების საპირისპიროდ.</w:t>
+        <w:t>ეტაპი 3 — დაქრობა და გაძლიერება (ებინგჰაუსი, ზარმაცი, სინქრონული და ასინქრონული). თითოეულ კვალს გააჩნია აღდგენადობა, რომელიც ბოლო წვდომიდან გასული დროის მიხედვით, მისი სტაბილურობის შესაბამისად, ექსპონენციურად კლებულობს და მოძიების მომენტში ზარმაციდ, ქულის გამრავლების კოეფიციენტის სახით, გამოითვლება — ფონური დათვლა და სინქრონული ჩაწერა არ ხდება. წარმატებული განმეორებითი ხსენება აძლიერებს სტაბილურობას და ბოლო წვდომის დროის ნიშნულს ანახლებს, დროში გადანაწილებული გამეორების პრინციპით, მაგრამ ჩაწერა ინახება რიგში ოფლაინ დასამუშავებლად, რათა სინქრონული გზა დარჩეს მხოლოდ წაკითხვადი — ზუსტად ისე, როგორც B-ში. რაც მთავარია, მე-4 ეტაპის მიერ წარმოქმნილი სემანტიკური ფაქტებიც დაქრება, ამიტომ ებინგჰაუსის დინამიკა რჩება ცოცხალ დამოუკიდებელ ცვლადად და არა მუდმივ საცავზე გადადებულ კოსმეტიკურ ფენად. დაფუძნება: ებინგჰაუსის დავიწყების მრუდი [23] — გამოთვლითი პრეცედენტია MemoryBank/SiliconFriend [6]. ხელწერა: რაც დიდი ხნის წინ მხოლოდ ერთხელ იქნა ნახსენები, ქრება, ხოლო რაც განმეორებით ბრუნდება — მდგრადი ხდება: გრაციოზული, ბუნებრივი დავიწყება, B-ს შემზარავი სრული გახსენების საპირისპიროდ.</w:t>
       </w:r>
     </w:p>
     <w:p>
@@ -3976,7 +3976,7 @@
           <w:sz w:val="24"/>
           <w:lang w:val="ka-GE"/>
         </w:rPr>
-        <w:t>•  B+ — კურატორირებული სტატიკური მეხსიერება (აქტიური კონტროლი). C-ს იდენტური ოფლაინ LLM-ის მიერ შესრულებული არსობრივი (gist) შეჯამება და კორეფერენციის გაწმენდა, იგივე შეკუმშვა და ტოკენების ბიუჯეტი, მაგრამ კლებადობის, სალიენს-გეითინგის და კონსოლიდაციის გარეშე — მხოლოდ წმინდა კოსინუსური top-k გაწმენდილ არსობრივ (gist) შეჯამებებზე.</w:t>
+        <w:t>•  B+ — კურირებული სტატიკური მეხსიერება (აქტიური კონტროლი). C-ს იდენტური ოფლაინ LLM-ის მიერ შესრულებული არსობრივი (gist) შეჯამება და კორეფერენციის გაწმენდა, იგივე შეკუმშვა და ტოკენების ბიუჯეტი, მაგრამ კლებადობის, სალიენს-გეითინგის და კონსოლიდაციის გარეშე — მხოლოდ წმინდა კოსინუსური top-k გაწმენდილ არსობრივ (gist) შეჯამებებზე.</w:t>
       </w:r>
     </w:p>
     <w:p>
@@ -4004,7 +4004,7 @@
           <w:sz w:val="24"/>
           <w:lang w:val="ka-GE"/>
         </w:rPr>
-        <w:t>B+ დიზაინის ცენტრალური მეთოდოლოგიური წვლილია. C-ს სასარგებლოდ მიღებულ ნებისმიერ დადებით შედეგს ყველაზე სერიოზულად წაკითხვადობის აღრევის ფაქტორი ემუქრება: C-ს არსობრივად (gist) შეჯამებული და კორეფერენციისგან გაწმენდილი პროზა უბრალოდ უფრო წაკითხვადია, ვიდრე B-ს დაუმუშავებელი ფრაგმენტები, ხოლო C-სა და B-ს შორის უბრალო გამარჯვება ერთმანეთში აურევს კურატორირებასა და კოგნიტურ დინამიკას. B+ თავისი კონსტრუქციით წყვეტს ამ აღრევის ფაქტორს. თუ C &gt; B+, მარგინალური ეფექტი განპირობებულია ადამიანის მეხსიერების იმ დინამიკით, რომელსაც მხოლოდ C მატებს. თუ C ≈ B+, გულწრფელი დასკვნა იქნება ის, რომ აღქმითი სარგებელი თავიდანვე წაკითხვადობა იყო და მოსაზრება შესაბამისად გადაიხედება — დასკვნა, რომელიც სწორედ იმიტომ არის ინტერპრეტირებადი, რომ B+ ზუსტად ამის დასაშვებად შეიქმნა. სწორედ ამიტომ, როგორც 3.1-შია აღნიშნული, C &gt; B+ არის შეფასების სამიზნე, და სწორედ ამიტომ B+-ის გამორიცხვა დაუშვებელია.</w:t>
+        <w:t>B+ დიზაინის ცენტრალური მეთოდოლოგიური წვლილია. C-ს სასარგებლოდ მიღებულ ნებისმიერ დადებით შედეგს ყველაზე სერიოზულად წაკითხვადობის აღრევის ფაქტორი ემუქრება: C-ს არსობრივად (gist) შეჯამებული და კორეფერენციისგან გაწმენდილი პროზა უბრალოდ უფრო წაკითხვადია, ვიდრე B-ს დაუმუშავებელი ფრაგმენტები, ხოლო C-სა და B-ს შორის უბრალო გამარჯვება ერთმანეთში აურევს კურირებასა და კოგნიტურ დინამიკას. B+ თავისი კონსტრუქციით წყვეტს ამ აღრევის ფაქტორს. თუ C &gt; B+, მარგინალური ეფექტი განპირობებულია ადამიანის მეხსიერების იმ დინამიკით, რომელსაც მხოლოდ C მატებს. თუ C ≈ B+, გულწრფელი დასკვნა იქნება ის, რომ აღქმითი სარგებელი თავიდანვე წაკითხვადობა იყო და მოსაზრება შესაბამისად გადაიხედება — დასკვნა, რომელიც სწორედ იმიტომ არის ინტერპრეტირებადი, რომ B+ ზუსტად ამის დასაშვებად შეიქმნა. სწორედ ამიტომ, როგორც 3.1-შია აღნიშნული, C &gt; B+ არის შეფასების სამიზნე, და სწორედ ამიტომ B+-ის გამორიცხვა დაუშვებელია.</w:t>
       </w:r>
     </w:p>
     <w:p>
@@ -4068,7 +4068,7 @@
                 <w:sz w:val="22"/>
                 <w:lang w:val="ka-GE"/>
               </w:rPr>
-              <w:t>დამაბრკოლებელი ფაქტორი</w:t>
+              <w:t>ამრევი ფაქტორი</w:t>
             </w:r>
           </w:p>
         </w:tc>
@@ -4127,7 +4127,7 @@
                 <w:sz w:val="22"/>
                 <w:lang w:val="ka-GE"/>
               </w:rPr>
-              <w:t>კურატორიზმი / წაკითხვადობა</w:t>
+              <w:t>კურირება / წაკითხვადობა</w:t>
             </w:r>
           </w:p>
         </w:tc>
@@ -4165,7 +4165,7 @@
                 <w:sz w:val="22"/>
                 <w:lang w:val="ka-GE"/>
               </w:rPr>
-              <w:t>B+ აქტიური კონტროლი: იგივე შეჯამება და გასუფთავება, გარეშე დაშლის, გამოკვეთისა და კონსოლიდაციის</w:t>
+              <w:t>B+ აქტიური კონტროლი: იგივე შეჯამება და გასუფთავება, გარეშე დაქრობის, გამოკვეთისა და კონსოლიდაციის</w:t>
             </w:r>
           </w:p>
         </w:tc>
@@ -4340,7 +4340,7 @@
                 <w:sz w:val="22"/>
                 <w:lang w:val="ka-GE"/>
               </w:rPr>
-              <w:t>LLM-ის ტვინი, მონაცემების გამოძახების ტრიგერი, შეყვანის წერტილი, ყოველი ტურის შეფერხების ბიუჯეტი, საერთო ასაღები ტოკენების ბიუჯეტი, მოთხოვნის ემბედინგის მოდელი, ცვალებადი სამუშაო ფანჯარა</w:t>
+              <w:t>LLM-ის ტვინი, მონაცემების გამოძახების ტრიგერი, შეყვანის წერტილი, ყოველი ტურის დაყოვნების ბიუჯეტი, საერთო ასაღები ტოკენების ბიუჯეტი, მოთხოვნის ემბედინგის მოდელი, ცვალებადი სამუშაო ფანჯარა</w:t>
             </w:r>
           </w:p>
         </w:tc>
@@ -4408,7 +4408,7 @@
           <w:sz w:val="24"/>
           <w:lang w:val="ka-GE"/>
         </w:rPr>
-        <w:t>შესაბამისად, ეს ხელსაწყო წარმოდგენილია მექანიზმების დემონსტრაციად და 3.5-ის ტექნიკური და სიმულირებული შეფასების საფუძვლად და არა დანერგილი კვლევის აპარატად. ის პირდაპირ განასახიერებს 3.3-ის სამართლიანობის არქიტექტურას: პირობებს შორის საერთო მოძიების გამომწვევს (trigger), შეყვანის წერტილსა და ტოკენების ბიუჯეტს, თითოეული პირობისთვის იზოლირებულ საცავებს და სეგმენტაციის, სალიენსის შეფასების, არსობრივის (gist) გამოტანისა და კონსოლიდაციისთვის განკუთვნილ ოფლაინ ჯგუფურ ამოცანებს. ამას ემატება მხოლოდ წაკითხვადი სინქრონული მოძიების გზა, ზარმაცად გამოთვლილი დაქრობითა და მიმდინარე ტურის ფარგლებში LLM-ის ნულოვანი გამოძახებით. ყველაზე იაფი სიცოცხლისუნარიანი ვარიანტის ანალიზის (F18) შესაბამისად, კონცეფციის დამტკიცება პრიორიტეტს ანიჭებს დაუთმობელ ბირთვს — B+-ს, კონსოლიდაციას, მარტივ ზარმაც დაქრობასა და არსობრივი (gist) და საყრდენის ერთობლივ წარმოდგენას. ის ასევე შესაძლოა გადადოს ყველაზე ძვირადღირებული დახვეწის ელემენტებს — მასშტაბური პროგრამული სალიენს-გეითინგი, ასოციაციური წინასწარი გაფართოება, საყრდენის regex-ტრიგერი და მგრძნობელობის ავტომატიზებული ანალიზი (sweep) — სრულ ვერსიამდე, ამასთან, ნებისმიერი ასეთი გადავადება ექსპლიციტურად უნდა იყოს დაფიქსირებული და არა ჩუმად ნაგულისხმევი. თითოეული ტურის სინქრონული ხარჯი დომინირებულია ერთი 100 მილიწამზე ნაკლები ხანგრძლივობის ვექტორული მოთხოვნითა და O(k) არითმეტიკული ოპერაციებით, რაც თავისუფლად ეტევა პლატფორმისთვის დოკუმენტირებულ, დაახლოებით ორიდან ხუთ წამამდე ხმოვან ტურში (F17); B, B+ და C-ს შორის დაყოვნების თანასწორობა ხელსაწყოდან მიღებული მონაცემებით ემპირიულად ფიქსირდება და არა უბრალოდ მტკიცდება.</w:t>
+        <w:t>შესაბამისად, ეს ხელსაწყო წარმოდგენილია მექანიზმების დემონსტრაციად და 3.5-ის ტექნიკური და სიმულირებული შეფასების საფუძვლად და არა დანერგილი კვლევის აპარატად. ის პირდაპირ განასახიერებს 3.3-ის სამართლიანობის არქიტექტურას: პირობებს შორის საერთო მოძიების გამომწვევს (trigger), შეყვანის წერტილსა და ტოკენების ბიუჯეტს, თითოეული პირობისთვის იზოლირებულ საცავებს და სეგმენტაციის, სალიენსის შეფასების, არსობრივის (gist) გამოტანისა და კონსოლიდაციისთვის განკუთვნილ ოფლაინ ჯგუფურ ამოცანებს. ამას ემატება მხოლოდ წაკითხვადი სინქრონული მოძიების გზა, ზარმაციდ გამოთვლილი დაქრობითა და მიმდინარე ტურის ფარგლებში LLM-ის ნულოვანი გამოძახებით. ყველაზე იაფი სიცოცხლისუნარიანი ვარიანტის ანალიზის (F18) შესაბამისად, კონცეფციის დამტკიცება პრიორიტეტს ანიჭებს დაუთმობელ ბირთვს — B+-ს, კონსოლიდაციას, მარტივ ზარმაც დაქრობასა და არსობრივი (gist) და საყრდენის ერთობლივ წარმოდგენას. ის ასევე შესაძლოა გადადოს ყველაზე ძვირადღირებული დახვეწის ელემენტებს — მასშტაბური პროგრამული სალიენს-გეითინგი, ასოციაციური წინასწარი გაფართოება, საყრდენის regex-ტრიგერი და მგრძნობელობის ავტომატიზებული ანალიზი (sweep) — სრულ ვერსიამდე, ამასთან, ნებისმიერი ასეთი გადავადება ექსპლიციტურად უნდა იყოს დაფიქსირებული და არა ჩუმად ნაგულისხმევი. თითოეული ტურის სინქრონული ხარჯი დომინირებულია ერთი 100 მილიწამზე ნაკლები ხანგრძლივობის ვექტორული მოთხოვნითა და O(k) არითმეტიკული ოპერაციებით, რაც თავისუფლად ეტევა პლატფორმისთვის დოკუმენტირებულ, დაახლოებით ორიდან ხუთ წამამდე ხმოვან ტურში (F17); B, B+ და C-ს შორის დაყოვნების თანასწორობა ხელსაწყოდან მიღებული მონაცემებით ემპირიულად ფიქსირდება და არა უბრალოდ მტკიცდება.</w:t>
       </w:r>
     </w:p>
     <w:p>
@@ -4588,7 +4588,7 @@
           <w:sz w:val="24"/>
           <w:lang w:val="ka-GE"/>
         </w:rPr>
-        <w:t>მეორადი და საკონტროლო კონსტრუქტები, რომლებიც უკავშირდება 1.2-ის მეორად ჰიპოთეზებს, პარალელურად იზომება. აღქმული ინტელექტი იზომება Godspeed-ის ინტელექტის ქვესკალის მეშვეობით (იხ. 2.6) — ეს მიზნად ისახავს H2a-ს, რომლის მიხედვითაც ვერბატიმ RAG ინტელექტში ყველაზე მაღალ ქულებს იღებს. კონფიდენციალურობასთან დაკავშირებული კომფორტი და ნდობა კი იზომება [11]-დან ადაპტირებული კოქსის სტილის კონფიდენციალურობის პუნქტების საშუალებით — ეს მიზნად ისახავს H2b-ს, რომლის მიხედვითაც ვერბატიმ გახსენება ნდობასა და კონფიდენციალურობის კომფორტში ყველაზე დაბალ ქულებს იღებს. სწორედ ამ პროგნოზის მოსაგვარებლად არის შექმნილი 3.2-ის არსობრივი (gist)/საყრდენი წარმოდგენა. აღქმული ადამიანურობა შესაძლოა დამატებით გადამოწმდეს Godspeed-ის ანთროპომორფიზმთან მიმართებით; Godspeed კი, მისი დოკუმენტირებული კრიტიკის (F11) გამო, ფსიქომეტრულად მეორეხარისხოვნადაა მიჩნეული. ჰიპოთეზებისა და ინსტრუმენტების რუკა მონაცემთა შეგროვებამდე ადგენს, თუ რომელი ქვესკალის ქულები შეესაბამება თითოეულ ჰიპოთეზას.</w:t>
+        <w:t>მეორადი და საკონტროლო კონსტრუქტები, რომლებიც უკავშირდება 1.2-ის მეორად ჰიპოთეზებს, პარალელურად იზომება. აღქმული ინტელექტი იზომება Godspeed-ის ინტელექტის ქვესკალის მეშვეობით (იხ. 2.6) — ეს მიზნად ისახავს H2a-ს, რომლის მიხედვითაც სიტყვასიტყვითი RAG ინტელექტში ყველაზე მაღალ ქულებს იღებს. კონფიდენციალურობასთან დაკავშირებული კომფორტი და ნდობა კი იზომება [11]-დან ადაპტირებული კოქსის სტილის კონფიდენციალურობის პუნქტების საშუალებით — ეს მიზნად ისახავს H2b-ს, რომლის მიხედვითაც სიტყვასიტყვითი გახსენება ნდობასა და კონფიდენციალურობის კომფორტში ყველაზე დაბალ ქულებს იღებს. სწორედ ამ პროგნოზის მოსაგვარებლად არის შექმნილი 3.2-ის არსობრივი (gist)/საყრდენი წარმოდგენა. აღქმული ადამიანურობა შესაძლოა დამატებით გადამოწმდეს Godspeed-ის ანთროპომორფიზმთან მიმართებით; Godspeed კი, მისი დოკუმენტირებული კრიტიკის (F11) გამო, ფსიქომეტრულად მეორეხარისხოვნადაა მიჩნეული. ჰიპოთეზებისა და ინსტრუმენტების რუკა მონაცემთა შეგროვებამდე ადგენს, თუ რომელი ქვესკალის ქულები შეესაბამება თითოეულ ჰიპოთეზას.</w:t>
       </w:r>
     </w:p>
     <w:p>
@@ -4636,7 +4636,7 @@
           <w:sz w:val="24"/>
           <w:lang w:val="ka-GE"/>
         </w:rPr>
-        <w:t>ანალიზი ეფუძნება „შეფასება-პირველად“ ფილოსოფიას, რომელიც შეესაბამება 3.1-ის ინფერენციულ პოზიციას. ყოველი პირობითი კონტრასტისთვის მთავარი წარმოდგენილი სიდიდე არის ეფექტის ზომა (კოენის dz შიდა-სუბიექტური კონტრასტებისთვის) 95%-იანი სანდო ინტერვალით, და არა დიქოტომიური მნიშვნელოვნების განაჩენი. დამადასტურებელი შედარებებისთვის, სადაც სტატისტიკური სიმძლავრე არსებობს (C &gt; A; მიმართულებითი B+ &gt; B და C &gt; B), შეფასებასთან ერთად მოცემულია ჰოლმის კორექტირებული ჰიპოთეზის ტესტი. ცენტრალური C &gt; B+ კონტრასტისთვის მხოლოდ ინტერვალიანი შეფასება ინტერპრეტირდება, სიზუსტისა და ეკვივალენტურობის ლოგიკის გამოყენებით: ნულზე გადაჭიმული ვიწრო ინტერვალი მიანიშნებს, რომ ადამიანის მეხსიერების დინამიკა კურატორულ სტატიკურ მეხსიერებასთან შედარებით მხოლოდ მცირე აღქმით მარჟას მატებს. ეს ნული, 3.1-თან შესაბამისად, წარმოდგენილია, როგორც შინაარსობრივი აღმოჩენა, რომლის ინტერპრეტირებადობისთვისაც შემუშავებული იყო B+ კონტროლი, ხოლო ნულის დამუშავების წესი წინასწარ იყო რეგისტრირებული, რათა იგი აღქმულიყო როგორც წინასწარ მოსალოდნელი შედეგი. სადაც გამოიყენება გადავადებული პროტოკოლის გვიან ფანჯარაზე დაფუძნებული და კონსოლიდაციის სიმკვრივით მოდერირებული ანალიზები (3.5c), წინასწარ რეგისტრირებულ კოვარიატებად შეყვანილია: კონსოლიდაციის სიმკვრივე, თითოეული დონის მოძიების წილი, სალიენსის ჩაწერის სიხშირე და ისტორიის ეფექტური მოცვა.</w:t>
+        <w:t>ანალიზი ეფუძნება „შეფასება-პირველად“ ფილოსოფიას, რომელიც შეესაბამება 3.1-ის ინფერენციულ პოზიციას. ყოველი პირობითი კონტრასტისთვის მთავარი წარმოდგენილი სიდიდე არის ეფექტის ზომა (კოენის dz შიდა-სუბიექტური კონტრასტებისთვის) 95%-იანი სანდო ინტერვალით, და არა დიქოტომიური მნიშვნელოვნების განაჩენი. დამადასტურებელი შედარებებისთვის, სადაც სტატისტიკური სიმძლავრე არსებობს (C &gt; A; მიმართულებითი B+ &gt; B და C &gt; B), შეფასებასთან ერთად მოცემულია ჰოლმის კორექტირებული ჰიპოთეზის ტესტი. ცენტრალური C &gt; B+ კონტრასტისთვის მხოლოდ ინტერვალიანი შეფასება ინტერპრეტირდება, სიზუსტისა და ეკვივალენტურობის ლოგიკის გამოყენებით: ნულზე გადაჭიმული ვიწრო ინტერვალი მიანიშნებს, რომ ადამიანის მეხსიერების დინამიკა კურირებულ სტატიკურ მეხსიერებასთან შედარებით მხოლოდ მცირე აღქმით მარჟას მატებს. ეს ნული, 3.1-თან შესაბამისად, წარმოდგენილია, როგორც შინაარსობრივი აღმოჩენა, რომლის ინტერპრეტირებადობისთვისაც შემუშავებული იყო B+ კონტროლი, ხოლო ნულის დამუშავების წესი წინასწარ იყო რეგისტრირებული, რათა იგი აღქმულიყო როგორც წინასწარ მოსალოდნელი შედეგი. სადაც გამოიყენება გადავადებული პროტოკოლის გვიან ფანჯარაზე დაფუძნებული და კონსოლიდაციის სიმკვრივით მოდერირებული ანალიზები (3.5c), წინასწარ რეგისტრირებულ კოვარიატებად შეყვანილია: კონსოლიდაციის სიმკვრივე, თითოეული დონის მოძიების წილი, სალიენსის ჩაწერის სიხშირე და ისტორიის ეფექტური მოცვა.</w:t>
       </w:r>
     </w:p>
     <w:p>
@@ -5025,7 +5025,7 @@
                 <w:sz w:val="22"/>
                 <w:lang w:val="ka-GE"/>
               </w:rPr>
-              <w:t>განხორციელებულია (ზარმაცა, სესიურ-ერთეული დრო)</w:t>
+              <w:t>განხორციელებულია (ზარმაცი, სესიურ-ერთეული დრო)</w:t>
             </w:r>
           </w:p>
         </w:tc>
@@ -5065,7 +5065,7 @@
                 <w:sz w:val="22"/>
                 <w:lang w:val="ka-GE"/>
               </w:rPr>
-              <w:t>შესრულებულია (ჩაშენების კლასტერიზაცია + დიდი ენის მოდელის აბსტრაქცია)</w:t>
+              <w:t>შესრულებულია (ჩაშენების კლასტერიზაცია + დიდი ენობრივი მოდელის აბსტრაქცია)</w:t>
             </w:r>
           </w:p>
         </w:tc>
@@ -5311,15 +5311,15 @@
         <w:tblLook w:firstColumn="1" w:firstRow="1" w:lastColumn="0" w:lastRow="0" w:noHBand="0" w:noVBand="1" w:val="04A0"/>
       </w:tblPr>
       <w:tblGrid>
-        <w:gridCol w:w="3266"/>
-        <w:gridCol w:w="2365"/>
-        <w:gridCol w:w="1239"/>
-        <w:gridCol w:w="1464"/>
+        <w:gridCol w:w="3064"/>
+        <w:gridCol w:w="2574"/>
+        <w:gridCol w:w="1348"/>
+        <w:gridCol w:w="1348"/>
       </w:tblGrid>
       <w:tr>
         <w:tc>
           <w:tcPr>
-            <w:tcW w:type="dxa" w:w="3266"/>
+            <w:tcW w:type="dxa" w:w="3064"/>
           </w:tcPr>
           <w:p>
             <w:pPr>
@@ -5338,7 +5338,7 @@
         </w:tc>
         <w:tc>
           <w:tcPr>
-            <w:tcW w:type="dxa" w:w="2365"/>
+            <w:tcW w:type="dxa" w:w="2574"/>
           </w:tcPr>
           <w:p>
             <w:pPr>
@@ -5357,7 +5357,7 @@
         </w:tc>
         <w:tc>
           <w:tcPr>
-            <w:tcW w:type="dxa" w:w="1239"/>
+            <w:tcW w:type="dxa" w:w="1348"/>
           </w:tcPr>
           <w:p>
             <w:pPr>
@@ -5376,7 +5376,7 @@
         </w:tc>
         <w:tc>
           <w:tcPr>
-            <w:tcW w:type="dxa" w:w="1464"/>
+            <w:tcW w:type="dxa" w:w="1348"/>
           </w:tcPr>
           <w:p>
             <w:pPr>
@@ -5389,7 +5389,7 @@
                 <w:sz w:val="22"/>
                 <w:lang w:val="ka-GE"/>
               </w:rPr>
-              <w:t>გენერალიზაცია</w:t>
+              <w:t>განზოგადება</w:t>
             </w:r>
           </w:p>
         </w:tc>
@@ -5397,7 +5397,7 @@
       <w:tr>
         <w:tc>
           <w:tcPr>
-            <w:tcW w:type="dxa" w:w="3266"/>
+            <w:tcW w:type="dxa" w:w="3064"/>
           </w:tcPr>
           <w:p>
             <w:pPr>
@@ -5416,7 +5416,7 @@
         </w:tc>
         <w:tc>
           <w:tcPr>
-            <w:tcW w:type="dxa" w:w="2365"/>
+            <w:tcW w:type="dxa" w:w="2574"/>
           </w:tcPr>
           <w:p>
             <w:pPr>
@@ -5434,7 +5434,7 @@
         </w:tc>
         <w:tc>
           <w:tcPr>
-            <w:tcW w:type="dxa" w:w="1239"/>
+            <w:tcW w:type="dxa" w:w="1348"/>
           </w:tcPr>
           <w:p>
             <w:pPr>
@@ -5452,7 +5452,7 @@
         </w:tc>
         <w:tc>
           <w:tcPr>
-            <w:tcW w:type="dxa" w:w="1464"/>
+            <w:tcW w:type="dxa" w:w="1348"/>
           </w:tcPr>
           <w:p>
             <w:pPr>
@@ -5472,7 +5472,7 @@
       <w:tr>
         <w:tc>
           <w:tcPr>
-            <w:tcW w:type="dxa" w:w="3266"/>
+            <w:tcW w:type="dxa" w:w="3064"/>
           </w:tcPr>
           <w:p>
             <w:pPr>
@@ -5485,13 +5485,13 @@
                 <w:sz w:val="22"/>
                 <w:lang w:val="ka-GE"/>
               </w:rPr>
-              <w:t>B (ვერბატიმ RAG)</w:t>
+              <w:t>B (სიტყვასიტყვითი RAG)</w:t>
             </w:r>
           </w:p>
         </w:tc>
         <w:tc>
           <w:tcPr>
-            <w:tcW w:type="dxa" w:w="2365"/>
+            <w:tcW w:type="dxa" w:w="2574"/>
           </w:tcPr>
           <w:p>
             <w:pPr>
@@ -5509,7 +5509,7 @@
         </w:tc>
         <w:tc>
           <w:tcPr>
-            <w:tcW w:type="dxa" w:w="1239"/>
+            <w:tcW w:type="dxa" w:w="1348"/>
           </w:tcPr>
           <w:p>
             <w:pPr>
@@ -5527,7 +5527,7 @@
         </w:tc>
         <w:tc>
           <w:tcPr>
-            <w:tcW w:type="dxa" w:w="1464"/>
+            <w:tcW w:type="dxa" w:w="1348"/>
           </w:tcPr>
           <w:p>
             <w:pPr>
@@ -5547,7 +5547,7 @@
       <w:tr>
         <w:tc>
           <w:tcPr>
-            <w:tcW w:type="dxa" w:w="3266"/>
+            <w:tcW w:type="dxa" w:w="3064"/>
           </w:tcPr>
           <w:p>
             <w:pPr>
@@ -5560,13 +5560,13 @@
                 <w:sz w:val="22"/>
                 <w:lang w:val="ka-GE"/>
               </w:rPr>
-              <w:t>B+ (კურატორირებული სტატიკური)</w:t>
+              <w:t>B+ (კურირებული სტატიკური)</w:t>
             </w:r>
           </w:p>
         </w:tc>
         <w:tc>
           <w:tcPr>
-            <w:tcW w:type="dxa" w:w="2365"/>
+            <w:tcW w:type="dxa" w:w="2574"/>
           </w:tcPr>
           <w:p>
             <w:pPr>
@@ -5584,7 +5584,7 @@
         </w:tc>
         <w:tc>
           <w:tcPr>
-            <w:tcW w:type="dxa" w:w="1239"/>
+            <w:tcW w:type="dxa" w:w="1348"/>
           </w:tcPr>
           <w:p>
             <w:pPr>
@@ -5602,7 +5602,7 @@
         </w:tc>
         <w:tc>
           <w:tcPr>
-            <w:tcW w:type="dxa" w:w="1464"/>
+            <w:tcW w:type="dxa" w:w="1348"/>
           </w:tcPr>
           <w:p>
             <w:pPr>
@@ -5622,7 +5622,7 @@
       <w:tr>
         <w:tc>
           <w:tcPr>
-            <w:tcW w:type="dxa" w:w="3266"/>
+            <w:tcW w:type="dxa" w:w="3064"/>
           </w:tcPr>
           <w:p>
             <w:pPr>
@@ -5641,7 +5641,7 @@
         </w:tc>
         <w:tc>
           <w:tcPr>
-            <w:tcW w:type="dxa" w:w="2365"/>
+            <w:tcW w:type="dxa" w:w="2574"/>
           </w:tcPr>
           <w:p>
             <w:pPr>
@@ -5659,7 +5659,7 @@
         </w:tc>
         <w:tc>
           <w:tcPr>
-            <w:tcW w:type="dxa" w:w="1239"/>
+            <w:tcW w:type="dxa" w:w="1348"/>
           </w:tcPr>
           <w:p>
             <w:pPr>
@@ -5677,7 +5677,7 @@
         </w:tc>
         <w:tc>
           <w:tcPr>
-            <w:tcW w:type="dxa" w:w="1464"/>
+            <w:tcW w:type="dxa" w:w="1348"/>
           </w:tcPr>
           <w:p>
             <w:pPr>

</xml_diff>